<commit_message>
feat: Background paragraph 2 written
</commit_message>
<xml_diff>
--- a/Report.docx
+++ b/Report.docx
@@ -501,6 +501,14 @@
         </w:rPr>
         <w:t>1.1</w:t>
       </w:r>
+      <w:r>
+        <w:rPr>
+          <w:color w:val="4C94D8" w:themeColor="text2" w:themeTint="80"/>
+          <w:sz w:val="28"/>
+          <w:szCs w:val="28"/>
+        </w:rPr>
+        <w:t xml:space="preserve"> Background</w:t>
+      </w:r>
     </w:p>
     <w:p>
       <w:r>
@@ -520,6 +528,11 @@
       </w:r>
       <w:r>
         <w:br/>
+      </w:r>
+    </w:p>
+    <w:p>
+      <w:r>
+        <w:t>This project has been designed with the intention to create a game that will fit in the 4X and Turn-Based genre. It will include many features such as a randomly generated world for the player to explore, expand, exploit and exterminate any resources/players they come across, support for up to 6 players/computers. This game will have a visually appealing art style that is designed to stay unified between structure pieces, world pieces and units.</w:t>
       </w:r>
       <w:r>
         <w:br/>

</xml_diff>

<commit_message>
feat: background paragraph 3 written
</commit_message>
<xml_diff>
--- a/Report.docx
+++ b/Report.docx
@@ -533,6 +533,15 @@
     <w:p>
       <w:r>
         <w:t>This project has been designed with the intention to create a game that will fit in the 4X and Turn-Based genre. It will include many features such as a randomly generated world for the player to explore, expand, exploit and exterminate any resources/players they come across, support for up to 6 players/computers. This game will have a visually appealing art style that is designed to stay unified between structure pieces, world pieces and units.</w:t>
+      </w:r>
+    </w:p>
+    <w:p/>
+    <w:p>
+      <w:r>
+        <w:t>The game will start the player off in a randomly generated world on a roughly equidistant tile from any and all other players, giving them the freedom to settle their first city immediately or to move them around to somewhere that may be more suited to their playstyle.</w:t>
+      </w:r>
+      <w:r>
+        <w:t xml:space="preserve"> The player will then be able to farm the lands resources to stimulate city growth, population growth and overall production. I have designed the game in this way to hopefully create a replay-able and fun game for players to enjoy and come back to.</w:t>
       </w:r>
       <w:r>
         <w:br/>

</xml_diff>

<commit_message>
feat: inserted table of contents
</commit_message>
<xml_diff>
--- a/Report.docx
+++ b/Report.docx
@@ -242,315 +242,637 @@
         <w:t>Table of Contents</w:t>
       </w:r>
     </w:p>
-    <w:p>
-      <w:r>
-        <w:t xml:space="preserve">Chapter 1 – </w:t>
+    <w:sdt>
+      <w:sdtPr>
+        <w:id w:val="1909112241"/>
+        <w:docPartObj>
+          <w:docPartGallery w:val="Table of Contents"/>
+          <w:docPartUnique/>
+        </w:docPartObj>
+      </w:sdtPr>
+      <w:sdtEndPr>
+        <w:rPr>
+          <w:rFonts w:asciiTheme="minorHAnsi" w:eastAsiaTheme="minorHAnsi" w:hAnsiTheme="minorHAnsi" w:cstheme="minorBidi"/>
+          <w:b/>
+          <w:bCs/>
+          <w:noProof/>
+          <w:color w:val="auto"/>
+          <w:kern w:val="2"/>
+          <w:sz w:val="24"/>
+          <w:szCs w:val="24"/>
+          <w:lang w:val="en-GB"/>
+          <w14:ligatures w14:val="standardContextual"/>
+        </w:rPr>
+      </w:sdtEndPr>
+      <w:sdtContent>
+        <w:p>
+          <w:pPr>
+            <w:pStyle w:val="TOCHeading"/>
+          </w:pPr>
+          <w:r>
+            <w:t>Table of Contents</w:t>
+          </w:r>
+        </w:p>
+        <w:p>
+          <w:pPr>
+            <w:pStyle w:val="TOC1"/>
+            <w:tabs>
+              <w:tab w:val="right" w:leader="dot" w:pos="9016"/>
+            </w:tabs>
+            <w:rPr>
+              <w:rFonts w:cstheme="minorBidi"/>
+              <w:noProof/>
+              <w:kern w:val="2"/>
+              <w:sz w:val="24"/>
+              <w:szCs w:val="24"/>
+              <w:lang w:val="en-GB" w:eastAsia="en-GB"/>
+              <w14:ligatures w14:val="standardContextual"/>
+            </w:rPr>
+          </w:pPr>
+          <w:r>
+            <w:fldChar w:fldCharType="begin"/>
+          </w:r>
+          <w:r>
+            <w:instrText xml:space="preserve"> TOC \o "1-3" \h \z \u </w:instrText>
+          </w:r>
+          <w:r>
+            <w:fldChar w:fldCharType="separate"/>
+          </w:r>
+          <w:hyperlink w:anchor="_Toc221275627" w:history="1">
+            <w:r>
+              <w:rPr>
+                <w:rStyle w:val="Hyperlink"/>
+                <w:noProof/>
+              </w:rPr>
+              <w:t>Chapter 1 – Intr</w:t>
+            </w:r>
+            <w:r>
+              <w:rPr>
+                <w:rStyle w:val="Hyperlink"/>
+                <w:noProof/>
+              </w:rPr>
+              <w:t>o</w:t>
+            </w:r>
+            <w:r>
+              <w:rPr>
+                <w:rStyle w:val="Hyperlink"/>
+                <w:noProof/>
+              </w:rPr>
+              <w:t>duction</w:t>
+            </w:r>
+            <w:r>
+              <w:rPr>
+                <w:noProof/>
+                <w:webHidden/>
+              </w:rPr>
+              <w:tab/>
+            </w:r>
+            <w:r>
+              <w:rPr>
+                <w:noProof/>
+                <w:webHidden/>
+              </w:rPr>
+              <w:fldChar w:fldCharType="begin"/>
+            </w:r>
+            <w:r>
+              <w:rPr>
+                <w:noProof/>
+                <w:webHidden/>
+              </w:rPr>
+              <w:instrText xml:space="preserve"> PAGEREF _Toc221275627 \h </w:instrText>
+            </w:r>
+            <w:r>
+              <w:rPr>
+                <w:noProof/>
+                <w:webHidden/>
+              </w:rPr>
+            </w:r>
+            <w:r>
+              <w:rPr>
+                <w:noProof/>
+                <w:webHidden/>
+              </w:rPr>
+              <w:fldChar w:fldCharType="separate"/>
+            </w:r>
+            <w:r>
+              <w:rPr>
+                <w:noProof/>
+                <w:webHidden/>
+              </w:rPr>
+              <w:t>3</w:t>
+            </w:r>
+            <w:r>
+              <w:rPr>
+                <w:noProof/>
+                <w:webHidden/>
+              </w:rPr>
+              <w:fldChar w:fldCharType="end"/>
+            </w:r>
+          </w:hyperlink>
+        </w:p>
+        <w:p>
+          <w:pPr>
+            <w:pStyle w:val="TOC2"/>
+            <w:tabs>
+              <w:tab w:val="right" w:leader="dot" w:pos="9016"/>
+            </w:tabs>
+            <w:rPr>
+              <w:rFonts w:cstheme="minorBidi"/>
+              <w:noProof/>
+              <w:kern w:val="2"/>
+              <w:sz w:val="24"/>
+              <w:szCs w:val="24"/>
+              <w:lang w:val="en-GB" w:eastAsia="en-GB"/>
+              <w14:ligatures w14:val="standardContextual"/>
+            </w:rPr>
+          </w:pPr>
+          <w:hyperlink w:anchor="_Toc221275628" w:history="1">
+            <w:r>
+              <w:rPr>
+                <w:rStyle w:val="Hyperlink"/>
+                <w:noProof/>
+              </w:rPr>
+              <w:t>1.1 Background</w:t>
+            </w:r>
+            <w:r>
+              <w:rPr>
+                <w:noProof/>
+                <w:webHidden/>
+              </w:rPr>
+              <w:tab/>
+            </w:r>
+            <w:r>
+              <w:rPr>
+                <w:noProof/>
+                <w:webHidden/>
+              </w:rPr>
+              <w:fldChar w:fldCharType="begin"/>
+            </w:r>
+            <w:r>
+              <w:rPr>
+                <w:noProof/>
+                <w:webHidden/>
+              </w:rPr>
+              <w:instrText xml:space="preserve"> PAGEREF _Toc221275628 \h </w:instrText>
+            </w:r>
+            <w:r>
+              <w:rPr>
+                <w:noProof/>
+                <w:webHidden/>
+              </w:rPr>
+            </w:r>
+            <w:r>
+              <w:rPr>
+                <w:noProof/>
+                <w:webHidden/>
+              </w:rPr>
+              <w:fldChar w:fldCharType="separate"/>
+            </w:r>
+            <w:r>
+              <w:rPr>
+                <w:noProof/>
+                <w:webHidden/>
+              </w:rPr>
+              <w:t>3</w:t>
+            </w:r>
+            <w:r>
+              <w:rPr>
+                <w:noProof/>
+                <w:webHidden/>
+              </w:rPr>
+              <w:fldChar w:fldCharType="end"/>
+            </w:r>
+          </w:hyperlink>
+        </w:p>
+        <w:p>
+          <w:pPr>
+            <w:pStyle w:val="TOC2"/>
+            <w:tabs>
+              <w:tab w:val="right" w:leader="dot" w:pos="9016"/>
+            </w:tabs>
+            <w:rPr>
+              <w:rFonts w:cstheme="minorBidi"/>
+              <w:noProof/>
+              <w:kern w:val="2"/>
+              <w:sz w:val="24"/>
+              <w:szCs w:val="24"/>
+              <w:lang w:val="en-GB" w:eastAsia="en-GB"/>
+              <w14:ligatures w14:val="standardContextual"/>
+            </w:rPr>
+          </w:pPr>
+          <w:hyperlink w:anchor="_Toc221275629" w:history="1">
+            <w:r>
+              <w:rPr>
+                <w:rStyle w:val="Hyperlink"/>
+                <w:noProof/>
+              </w:rPr>
+              <w:t>1.2 Aim</w:t>
+            </w:r>
+            <w:r>
+              <w:rPr>
+                <w:rStyle w:val="Hyperlink"/>
+                <w:noProof/>
+              </w:rPr>
+              <w:t>s</w:t>
+            </w:r>
+            <w:r>
+              <w:rPr>
+                <w:noProof/>
+                <w:webHidden/>
+              </w:rPr>
+              <w:tab/>
+            </w:r>
+            <w:r>
+              <w:rPr>
+                <w:noProof/>
+                <w:webHidden/>
+              </w:rPr>
+              <w:fldChar w:fldCharType="begin"/>
+            </w:r>
+            <w:r>
+              <w:rPr>
+                <w:noProof/>
+                <w:webHidden/>
+              </w:rPr>
+              <w:instrText xml:space="preserve"> PAGEREF _Toc221275629 \h </w:instrText>
+            </w:r>
+            <w:r>
+              <w:rPr>
+                <w:noProof/>
+                <w:webHidden/>
+              </w:rPr>
+            </w:r>
+            <w:r>
+              <w:rPr>
+                <w:noProof/>
+                <w:webHidden/>
+              </w:rPr>
+              <w:fldChar w:fldCharType="separate"/>
+            </w:r>
+            <w:r>
+              <w:rPr>
+                <w:noProof/>
+                <w:webHidden/>
+              </w:rPr>
+              <w:t>3</w:t>
+            </w:r>
+            <w:r>
+              <w:rPr>
+                <w:noProof/>
+                <w:webHidden/>
+              </w:rPr>
+              <w:fldChar w:fldCharType="end"/>
+            </w:r>
+          </w:hyperlink>
+        </w:p>
+        <w:p>
+          <w:pPr>
+            <w:pStyle w:val="TOC2"/>
+            <w:tabs>
+              <w:tab w:val="right" w:leader="dot" w:pos="9016"/>
+            </w:tabs>
+            <w:rPr>
+              <w:rFonts w:cstheme="minorBidi"/>
+              <w:noProof/>
+              <w:kern w:val="2"/>
+              <w:sz w:val="24"/>
+              <w:szCs w:val="24"/>
+              <w:lang w:val="en-GB" w:eastAsia="en-GB"/>
+              <w14:ligatures w14:val="standardContextual"/>
+            </w:rPr>
+          </w:pPr>
+          <w:hyperlink w:anchor="_Toc221275630" w:history="1">
+            <w:r>
+              <w:rPr>
+                <w:rStyle w:val="Hyperlink"/>
+                <w:noProof/>
+              </w:rPr>
+              <w:t>1.2.1 Main Aim</w:t>
+            </w:r>
+            <w:r>
+              <w:rPr>
+                <w:noProof/>
+                <w:webHidden/>
+              </w:rPr>
+              <w:tab/>
+            </w:r>
+            <w:r>
+              <w:rPr>
+                <w:noProof/>
+                <w:webHidden/>
+              </w:rPr>
+              <w:fldChar w:fldCharType="begin"/>
+            </w:r>
+            <w:r>
+              <w:rPr>
+                <w:noProof/>
+                <w:webHidden/>
+              </w:rPr>
+              <w:instrText xml:space="preserve"> PAGEREF _Toc221275630 \h </w:instrText>
+            </w:r>
+            <w:r>
+              <w:rPr>
+                <w:noProof/>
+                <w:webHidden/>
+              </w:rPr>
+            </w:r>
+            <w:r>
+              <w:rPr>
+                <w:noProof/>
+                <w:webHidden/>
+              </w:rPr>
+              <w:fldChar w:fldCharType="separate"/>
+            </w:r>
+            <w:r>
+              <w:rPr>
+                <w:noProof/>
+                <w:webHidden/>
+              </w:rPr>
+              <w:t>3</w:t>
+            </w:r>
+            <w:r>
+              <w:rPr>
+                <w:noProof/>
+                <w:webHidden/>
+              </w:rPr>
+              <w:fldChar w:fldCharType="end"/>
+            </w:r>
+          </w:hyperlink>
+        </w:p>
+        <w:p>
+          <w:r>
+            <w:rPr>
+              <w:b/>
+              <w:bCs/>
+              <w:noProof/>
+            </w:rPr>
+            <w:fldChar w:fldCharType="end"/>
+          </w:r>
+        </w:p>
+      </w:sdtContent>
+    </w:sdt>
+    <w:p>
+      <w:pPr>
+        <w:rPr>
+          <w:sz w:val="36"/>
+          <w:szCs w:val="36"/>
+          <w:u w:val="single"/>
+        </w:rPr>
+      </w:pPr>
+      <w:r>
+        <w:rPr>
+          <w:sz w:val="36"/>
+          <w:szCs w:val="36"/>
+          <w:u w:val="single"/>
+        </w:rPr>
+        <w:t>Table of Figures</w:t>
+      </w:r>
+    </w:p>
+    <w:p>
+      <w:pPr>
+        <w:jc w:val="center"/>
+        <w:rPr>
+          <w:sz w:val="36"/>
+          <w:szCs w:val="36"/>
+          <w:u w:val="single"/>
+        </w:rPr>
+      </w:pPr>
+    </w:p>
+    <w:p>
+      <w:pPr>
+        <w:rPr>
+          <w:sz w:val="36"/>
+          <w:szCs w:val="36"/>
+          <w:u w:val="single"/>
+        </w:rPr>
+      </w:pPr>
+      <w:r>
+        <w:rPr>
+          <w:sz w:val="36"/>
+          <w:szCs w:val="36"/>
+          <w:u w:val="single"/>
+        </w:rPr>
+        <w:br/>
+      </w:r>
+    </w:p>
+    <w:p>
+      <w:pPr>
+        <w:rPr>
+          <w:sz w:val="36"/>
+          <w:szCs w:val="36"/>
+          <w:u w:val="single"/>
+        </w:rPr>
+      </w:pPr>
+    </w:p>
+    <w:p>
+      <w:pPr>
+        <w:rPr>
+          <w:sz w:val="36"/>
+          <w:szCs w:val="36"/>
+          <w:u w:val="single"/>
+        </w:rPr>
+      </w:pPr>
+    </w:p>
+    <w:p>
+      <w:pPr>
+        <w:rPr>
+          <w:sz w:val="36"/>
+          <w:szCs w:val="36"/>
+          <w:u w:val="single"/>
+        </w:rPr>
+      </w:pPr>
+    </w:p>
+    <w:p>
+      <w:pPr>
+        <w:rPr>
+          <w:sz w:val="36"/>
+          <w:szCs w:val="36"/>
+          <w:u w:val="single"/>
+        </w:rPr>
+      </w:pPr>
+    </w:p>
+    <w:p>
+      <w:pPr>
+        <w:rPr>
+          <w:sz w:val="36"/>
+          <w:szCs w:val="36"/>
+          <w:u w:val="single"/>
+        </w:rPr>
+      </w:pPr>
+    </w:p>
+    <w:p>
+      <w:pPr>
+        <w:rPr>
+          <w:sz w:val="36"/>
+          <w:szCs w:val="36"/>
+          <w:u w:val="single"/>
+        </w:rPr>
+      </w:pPr>
+    </w:p>
+    <w:p>
+      <w:pPr>
+        <w:rPr>
+          <w:sz w:val="36"/>
+          <w:szCs w:val="36"/>
+          <w:u w:val="single"/>
+        </w:rPr>
+      </w:pPr>
+    </w:p>
+    <w:p>
+      <w:pPr>
+        <w:rPr>
+          <w:sz w:val="36"/>
+          <w:szCs w:val="36"/>
+          <w:u w:val="single"/>
+        </w:rPr>
+      </w:pPr>
+    </w:p>
+    <w:p>
+      <w:pPr>
+        <w:rPr>
+          <w:sz w:val="36"/>
+          <w:szCs w:val="36"/>
+          <w:u w:val="single"/>
+        </w:rPr>
+      </w:pPr>
+    </w:p>
+    <w:p>
+      <w:pPr>
+        <w:rPr>
+          <w:sz w:val="36"/>
+          <w:szCs w:val="36"/>
+          <w:u w:val="single"/>
+        </w:rPr>
+      </w:pPr>
+    </w:p>
+    <w:p>
+      <w:pPr>
+        <w:rPr>
+          <w:sz w:val="36"/>
+          <w:szCs w:val="36"/>
+          <w:u w:val="single"/>
+        </w:rPr>
+      </w:pPr>
+    </w:p>
+    <w:p>
+      <w:pPr>
+        <w:rPr>
+          <w:sz w:val="36"/>
+          <w:szCs w:val="36"/>
+          <w:u w:val="single"/>
+        </w:rPr>
+      </w:pPr>
+    </w:p>
+    <w:p>
+      <w:pPr>
+        <w:pStyle w:val="Heading1"/>
+        <w:jc w:val="center"/>
+      </w:pPr>
+      <w:bookmarkStart w:id="0" w:name="_Toc221275627"/>
+      <w:r>
+        <w:lastRenderedPageBreak/>
+        <w:t>Chapter 1</w:t>
+      </w:r>
+      <w:r>
+        <w:t xml:space="preserve"> </w:t>
+      </w:r>
+      <w:r>
+        <w:t>–</w:t>
+      </w:r>
+      <w:r>
+        <w:t xml:space="preserve"> </w:t>
       </w:r>
       <w:r>
         <w:t>Introduction</w:t>
       </w:r>
-      <w:r>
-        <w:t>:.</w:t>
-      </w:r>
-      <w:r>
-        <w:t>…</w:t>
-      </w:r>
-      <w:r>
-        <w:t>………………………………………………………………………………..</w:t>
-      </w:r>
-      <w:r>
-        <w:br/>
-        <w:t xml:space="preserve">      1.1 Background……………………………………………………………………………………………</w:t>
-      </w:r>
-      <w:r>
-        <w:t>.</w:t>
-      </w:r>
-      <w:r>
-        <w:br/>
-        <w:t xml:space="preserve">      1.2 Aims………………………………………………………………………………………………………</w:t>
+      <w:bookmarkEnd w:id="0"/>
+    </w:p>
+    <w:p>
+      <w:pPr>
+        <w:pStyle w:val="Heading2"/>
+        <w:rPr>
+          <w:color w:val="auto"/>
+          <w:sz w:val="48"/>
+          <w:szCs w:val="48"/>
+          <w:u w:val="single"/>
+        </w:rPr>
+      </w:pPr>
+      <w:bookmarkStart w:id="1" w:name="_Toc221275628"/>
+      <w:r>
+        <w:t>1.1</w:t>
+      </w:r>
+      <w:r>
+        <w:t xml:space="preserve"> Background</w:t>
+      </w:r>
+      <w:bookmarkEnd w:id="1"/>
+    </w:p>
+    <w:p>
+      <w:r>
+        <w:t>In this report, I will follow the design, creation, implementation and thought process behind **insert title here**. The game will be designed so the player will be gradually pushed into playing better moves to stay ahead of the AI enemy</w:t>
+      </w:r>
+      <w:r>
+        <w:t xml:space="preserve"> </w:t>
+      </w:r>
+      <w:r>
+        <w:t xml:space="preserve">through tasks such as putting the AI on the backfoot, </w:t>
+      </w:r>
+      <w:r>
+        <w:t xml:space="preserve">pressuring the AI into making mistakes and attacking the AI into submission. The player will be able to play the AI in 5-9 games in which the AI will learn previous player moves and begin to cover them off. For example, if the player attacks early to win game 1, the AI will </w:t>
+      </w:r>
+      <w:r>
+        <w:t>prioritize the defence of their units and structures.</w:t>
+      </w:r>
+      <w:r>
+        <w:br/>
+      </w:r>
+    </w:p>
+    <w:p>
+      <w:r>
+        <w:t>This project has been designed with the intention to create a game that will fit in the 4X and Turn-Based genre. It will include many features such as a randomly generated world for the player to explore, expand, exploit and exterminate any resources/players they come across, support for up to 6 players/computers. This game will have a visually appealing art style that is designed to stay unified between structure pieces, world pieces and units.</w:t>
       </w:r>
     </w:p>
     <w:p/>
     <w:p>
-      <w:pPr>
-        <w:rPr>
-          <w:sz w:val="36"/>
-          <w:szCs w:val="36"/>
-          <w:u w:val="single"/>
-        </w:rPr>
-      </w:pPr>
-      <w:r>
-        <w:rPr>
-          <w:sz w:val="36"/>
-          <w:szCs w:val="36"/>
-          <w:u w:val="single"/>
-        </w:rPr>
-        <w:t>Table of Figures</w:t>
-      </w:r>
-    </w:p>
-    <w:p>
-      <w:pPr>
-        <w:jc w:val="center"/>
-        <w:rPr>
-          <w:sz w:val="36"/>
-          <w:szCs w:val="36"/>
-          <w:u w:val="single"/>
-        </w:rPr>
-      </w:pPr>
-    </w:p>
-    <w:p>
-      <w:pPr>
-        <w:rPr>
-          <w:sz w:val="36"/>
-          <w:szCs w:val="36"/>
-          <w:u w:val="single"/>
-        </w:rPr>
-      </w:pPr>
-    </w:p>
-    <w:p>
-      <w:pPr>
-        <w:rPr>
-          <w:sz w:val="36"/>
-          <w:szCs w:val="36"/>
-          <w:u w:val="single"/>
-        </w:rPr>
-      </w:pPr>
-    </w:p>
-    <w:p>
-      <w:pPr>
-        <w:rPr>
-          <w:sz w:val="36"/>
-          <w:szCs w:val="36"/>
-          <w:u w:val="single"/>
-        </w:rPr>
-      </w:pPr>
-    </w:p>
-    <w:p>
-      <w:pPr>
-        <w:rPr>
-          <w:sz w:val="36"/>
-          <w:szCs w:val="36"/>
-          <w:u w:val="single"/>
-        </w:rPr>
-      </w:pPr>
-    </w:p>
-    <w:p>
-      <w:pPr>
-        <w:rPr>
-          <w:sz w:val="36"/>
-          <w:szCs w:val="36"/>
-          <w:u w:val="single"/>
-        </w:rPr>
-      </w:pPr>
-    </w:p>
-    <w:p>
-      <w:pPr>
-        <w:rPr>
-          <w:sz w:val="36"/>
-          <w:szCs w:val="36"/>
-          <w:u w:val="single"/>
-        </w:rPr>
-      </w:pPr>
-    </w:p>
-    <w:p>
-      <w:pPr>
-        <w:rPr>
-          <w:sz w:val="36"/>
-          <w:szCs w:val="36"/>
-          <w:u w:val="single"/>
-        </w:rPr>
-      </w:pPr>
-    </w:p>
-    <w:p>
-      <w:pPr>
-        <w:rPr>
-          <w:sz w:val="36"/>
-          <w:szCs w:val="36"/>
-          <w:u w:val="single"/>
-        </w:rPr>
-      </w:pPr>
-    </w:p>
-    <w:p>
-      <w:pPr>
-        <w:rPr>
-          <w:sz w:val="36"/>
-          <w:szCs w:val="36"/>
-          <w:u w:val="single"/>
-        </w:rPr>
-      </w:pPr>
-    </w:p>
-    <w:p>
-      <w:pPr>
-        <w:rPr>
-          <w:sz w:val="36"/>
-          <w:szCs w:val="36"/>
-          <w:u w:val="single"/>
-        </w:rPr>
-      </w:pPr>
-    </w:p>
-    <w:p>
-      <w:pPr>
-        <w:rPr>
-          <w:sz w:val="36"/>
-          <w:szCs w:val="36"/>
-          <w:u w:val="single"/>
-        </w:rPr>
-      </w:pPr>
-    </w:p>
-    <w:p>
-      <w:pPr>
-        <w:rPr>
-          <w:sz w:val="36"/>
-          <w:szCs w:val="36"/>
-          <w:u w:val="single"/>
-        </w:rPr>
-      </w:pPr>
-    </w:p>
-    <w:p>
-      <w:pPr>
-        <w:rPr>
-          <w:sz w:val="36"/>
-          <w:szCs w:val="36"/>
-          <w:u w:val="single"/>
-        </w:rPr>
-      </w:pPr>
-    </w:p>
-    <w:p>
-      <w:pPr>
-        <w:rPr>
-          <w:sz w:val="36"/>
-          <w:szCs w:val="36"/>
-          <w:u w:val="single"/>
-        </w:rPr>
-      </w:pPr>
-    </w:p>
-    <w:p>
-      <w:pPr>
-        <w:rPr>
-          <w:sz w:val="36"/>
-          <w:szCs w:val="36"/>
-          <w:u w:val="single"/>
-        </w:rPr>
-      </w:pPr>
-    </w:p>
-    <w:p>
-      <w:pPr>
-        <w:rPr>
-          <w:sz w:val="36"/>
-          <w:szCs w:val="36"/>
-          <w:u w:val="single"/>
-        </w:rPr>
-      </w:pPr>
-    </w:p>
-    <w:p>
-      <w:pPr>
-        <w:rPr>
-          <w:sz w:val="36"/>
-          <w:szCs w:val="36"/>
-          <w:u w:val="single"/>
-        </w:rPr>
-      </w:pPr>
-    </w:p>
-    <w:p>
-      <w:pPr>
-        <w:jc w:val="center"/>
-        <w:rPr>
-          <w:sz w:val="44"/>
-          <w:szCs w:val="44"/>
-          <w:u w:val="single"/>
-        </w:rPr>
-      </w:pPr>
-      <w:r>
-        <w:rPr>
-          <w:sz w:val="44"/>
-          <w:szCs w:val="44"/>
-          <w:u w:val="single"/>
-        </w:rPr>
-        <w:t>Chapter 1</w:t>
-      </w:r>
-      <w:r>
-        <w:rPr>
-          <w:sz w:val="44"/>
-          <w:szCs w:val="44"/>
-          <w:u w:val="single"/>
-        </w:rPr>
-        <w:t xml:space="preserve"> - </w:t>
-      </w:r>
-      <w:r>
-        <w:rPr>
-          <w:sz w:val="44"/>
-          <w:szCs w:val="44"/>
-          <w:u w:val="single"/>
-        </w:rPr>
-        <w:t>Introduction</w:t>
-      </w:r>
-    </w:p>
-    <w:p>
-      <w:pPr>
-        <w:rPr>
-          <w:color w:val="4C94D8" w:themeColor="text2" w:themeTint="80"/>
-          <w:sz w:val="28"/>
-          <w:szCs w:val="28"/>
-        </w:rPr>
-      </w:pPr>
-      <w:r>
-        <w:rPr>
-          <w:color w:val="4C94D8" w:themeColor="text2" w:themeTint="80"/>
-          <w:sz w:val="28"/>
-          <w:szCs w:val="28"/>
-        </w:rPr>
-        <w:t>1.1</w:t>
-      </w:r>
-      <w:r>
-        <w:rPr>
-          <w:color w:val="4C94D8" w:themeColor="text2" w:themeTint="80"/>
-          <w:sz w:val="28"/>
-          <w:szCs w:val="28"/>
-        </w:rPr>
-        <w:t xml:space="preserve"> Background</w:t>
-      </w:r>
-    </w:p>
-    <w:p>
-      <w:r>
-        <w:t>In this report, I will follow the design, creation, implementation and thought process behind **insert title here**. The game will be designed so the player will be gradually pushed into playing better moves to stay ahead of the AI enemy</w:t>
-      </w:r>
-      <w:r>
-        <w:t xml:space="preserve"> </w:t>
-      </w:r>
-      <w:r>
-        <w:t xml:space="preserve">through tasks such as putting the AI on the backfoot, </w:t>
-      </w:r>
-      <w:r>
-        <w:t xml:space="preserve">pressuring the AI into making mistakes and attacking the AI into submission. The player will be able to play the AI in 5-9 games in which the AI will learn previous player moves and begin to cover them off. For example, if the player attacks early to win game 1, the AI will </w:t>
-      </w:r>
-      <w:r>
-        <w:t>prioritize the defence of their units and structures.</w:t>
-      </w:r>
-      <w:r>
-        <w:br/>
-      </w:r>
-    </w:p>
-    <w:p>
-      <w:r>
-        <w:t>This project has been designed with the intention to create a game that will fit in the 4X and Turn-Based genre. It will include many features such as a randomly generated world for the player to explore, expand, exploit and exterminate any resources/players they come across, support for up to 6 players/computers. This game will have a visually appealing art style that is designed to stay unified between structure pieces, world pieces and units.</w:t>
+      <w:r>
+        <w:t xml:space="preserve">The game will start the player off in a randomly generated world on a roughly equidistant tile from </w:t>
+      </w:r>
+      <w:proofErr w:type="gramStart"/>
+      <w:r>
+        <w:t>any and all</w:t>
+      </w:r>
+      <w:proofErr w:type="gramEnd"/>
+      <w:r>
+        <w:t xml:space="preserve"> other players, giving them the freedom to settle their first city immediately or to move them around to somewhere that may be more suited to their playstyle.</w:t>
+      </w:r>
+      <w:r>
+        <w:t xml:space="preserve"> The player will then be able to farm the lands resources to stimulate city growth, population growth and overall production. I have designed the game in this way to hopefully create a replay-able and fun game for players to enjoy and come back to.</w:t>
       </w:r>
     </w:p>
     <w:p/>
     <w:p>
-      <w:r>
-        <w:t>The game will start the player off in a randomly generated world on a roughly equidistant tile from any and all other players, giving them the freedom to settle their first city immediately or to move them around to somewhere that may be more suited to their playstyle.</w:t>
-      </w:r>
-      <w:r>
-        <w:t xml:space="preserve"> The player will then be able to farm the lands resources to stimulate city growth, population growth and overall production. I have designed the game in this way to hopefully create a replay-able and fun game for players to enjoy and come back to.</w:t>
-      </w:r>
-      <w:r>
-        <w:br/>
-      </w:r>
-      <w:r>
-        <w:t xml:space="preserve"> </w:t>
-      </w:r>
-      <w:r>
-        <w:t xml:space="preserve"> </w:t>
+      <w:pPr>
+        <w:pStyle w:val="Heading2"/>
+      </w:pPr>
+      <w:bookmarkStart w:id="2" w:name="_Toc221275629"/>
+      <w:r>
+        <w:t>1.2 Aims</w:t>
+      </w:r>
+      <w:bookmarkEnd w:id="2"/>
+    </w:p>
+    <w:p>
+      <w:pPr>
+        <w:pStyle w:val="Heading2"/>
+      </w:pPr>
+      <w:bookmarkStart w:id="3" w:name="_Toc221275630"/>
+      <w:r>
+        <w:rPr>
+          <w:rStyle w:val="Heading3Char"/>
+        </w:rPr>
+        <w:t>1.2.1 Main Aim</w:t>
+      </w:r>
+      <w:bookmarkEnd w:id="3"/>
+      <w:r>
+        <w:br/>
       </w:r>
     </w:p>
     <w:sectPr>
@@ -991,7 +1313,6 @@
     <w:next w:val="Normal"/>
     <w:link w:val="Heading2Char"/>
     <w:uiPriority w:val="9"/>
-    <w:semiHidden/>
     <w:unhideWhenUsed/>
     <w:qFormat/>
     <w:rsid w:val="00DC7DB9"/>
@@ -1014,7 +1335,6 @@
     <w:next w:val="Normal"/>
     <w:link w:val="Heading3Char"/>
     <w:uiPriority w:val="9"/>
-    <w:semiHidden/>
     <w:unhideWhenUsed/>
     <w:qFormat/>
     <w:rsid w:val="00DC7DB9"/>
@@ -1208,7 +1528,6 @@
     <w:basedOn w:val="DefaultParagraphFont"/>
     <w:link w:val="Heading2"/>
     <w:uiPriority w:val="9"/>
-    <w:semiHidden/>
     <w:rsid w:val="00DC7DB9"/>
     <w:rPr>
       <w:rFonts w:asciiTheme="majorHAnsi" w:eastAsiaTheme="majorEastAsia" w:hAnsiTheme="majorHAnsi" w:cstheme="majorBidi"/>
@@ -1222,7 +1541,6 @@
     <w:basedOn w:val="DefaultParagraphFont"/>
     <w:link w:val="Heading3"/>
     <w:uiPriority w:val="9"/>
-    <w:semiHidden/>
     <w:rsid w:val="00DC7DB9"/>
     <w:rPr>
       <w:rFonts w:eastAsiaTheme="majorEastAsia" w:cstheme="majorBidi"/>
@@ -1478,6 +1796,107 @@
       <w:smallCaps/>
       <w:color w:val="0F4761" w:themeColor="accent1" w:themeShade="BF"/>
       <w:spacing w:val="5"/>
+    </w:rPr>
+  </w:style>
+  <w:style w:type="character" w:styleId="LineNumber">
+    <w:name w:val="line number"/>
+    <w:basedOn w:val="DefaultParagraphFont"/>
+    <w:uiPriority w:val="99"/>
+    <w:semiHidden/>
+    <w:unhideWhenUsed/>
+    <w:rsid w:val="00295E75"/>
+  </w:style>
+  <w:style w:type="paragraph" w:styleId="TOCHeading">
+    <w:name w:val="TOC Heading"/>
+    <w:basedOn w:val="Heading1"/>
+    <w:next w:val="Normal"/>
+    <w:uiPriority w:val="39"/>
+    <w:unhideWhenUsed/>
+    <w:qFormat/>
+    <w:rsid w:val="00295E75"/>
+    <w:pPr>
+      <w:spacing w:before="240" w:after="0" w:line="259" w:lineRule="auto"/>
+      <w:outlineLvl w:val="9"/>
+    </w:pPr>
+    <w:rPr>
+      <w:kern w:val="0"/>
+      <w:sz w:val="32"/>
+      <w:szCs w:val="32"/>
+      <w:lang w:val="en-US"/>
+      <w14:ligatures w14:val="none"/>
+    </w:rPr>
+  </w:style>
+  <w:style w:type="paragraph" w:styleId="TOC2">
+    <w:name w:val="toc 2"/>
+    <w:basedOn w:val="Normal"/>
+    <w:next w:val="Normal"/>
+    <w:autoRedefine/>
+    <w:uiPriority w:val="39"/>
+    <w:unhideWhenUsed/>
+    <w:rsid w:val="00295E75"/>
+    <w:pPr>
+      <w:spacing w:after="100" w:line="259" w:lineRule="auto"/>
+      <w:ind w:left="220"/>
+    </w:pPr>
+    <w:rPr>
+      <w:rFonts w:eastAsiaTheme="minorEastAsia" w:cs="Times New Roman"/>
+      <w:kern w:val="0"/>
+      <w:sz w:val="22"/>
+      <w:szCs w:val="22"/>
+      <w:lang w:val="en-US"/>
+      <w14:ligatures w14:val="none"/>
+    </w:rPr>
+  </w:style>
+  <w:style w:type="paragraph" w:styleId="TOC1">
+    <w:name w:val="toc 1"/>
+    <w:basedOn w:val="Normal"/>
+    <w:next w:val="Normal"/>
+    <w:autoRedefine/>
+    <w:uiPriority w:val="39"/>
+    <w:unhideWhenUsed/>
+    <w:rsid w:val="00295E75"/>
+    <w:pPr>
+      <w:spacing w:after="100" w:line="259" w:lineRule="auto"/>
+    </w:pPr>
+    <w:rPr>
+      <w:rFonts w:eastAsiaTheme="minorEastAsia" w:cs="Times New Roman"/>
+      <w:kern w:val="0"/>
+      <w:sz w:val="22"/>
+      <w:szCs w:val="22"/>
+      <w:lang w:val="en-US"/>
+      <w14:ligatures w14:val="none"/>
+    </w:rPr>
+  </w:style>
+  <w:style w:type="paragraph" w:styleId="TOC3">
+    <w:name w:val="toc 3"/>
+    <w:basedOn w:val="Normal"/>
+    <w:next w:val="Normal"/>
+    <w:autoRedefine/>
+    <w:uiPriority w:val="39"/>
+    <w:unhideWhenUsed/>
+    <w:rsid w:val="00295E75"/>
+    <w:pPr>
+      <w:spacing w:after="100" w:line="259" w:lineRule="auto"/>
+      <w:ind w:left="440"/>
+    </w:pPr>
+    <w:rPr>
+      <w:rFonts w:eastAsiaTheme="minorEastAsia" w:cs="Times New Roman"/>
+      <w:kern w:val="0"/>
+      <w:sz w:val="22"/>
+      <w:szCs w:val="22"/>
+      <w:lang w:val="en-US"/>
+      <w14:ligatures w14:val="none"/>
+    </w:rPr>
+  </w:style>
+  <w:style w:type="character" w:styleId="Hyperlink">
+    <w:name w:val="Hyperlink"/>
+    <w:basedOn w:val="DefaultParagraphFont"/>
+    <w:uiPriority w:val="99"/>
+    <w:unhideWhenUsed/>
+    <w:rsid w:val="00295E75"/>
+    <w:rPr>
+      <w:color w:val="467886" w:themeColor="hyperlink"/>
+      <w:u w:val="single"/>
     </w:rPr>
   </w:style>
 </w:styles>
@@ -1796,4 +2215,16 @@
     </a:ext>
   </a:extLst>
 </a:theme>
+</file>
+
+<file path=customXml/item1.xml><?xml version="1.0" encoding="utf-8"?>
+<b:Sources xmlns:b="http://schemas.openxmlformats.org/officeDocument/2006/bibliography" xmlns="http://schemas.openxmlformats.org/officeDocument/2006/bibliography" SelectedStyle="\APASixthEditionOfficeOnline.xsl" StyleName="APA" Version="6"/>
+</file>
+
+<file path=customXml/itemProps1.xml><?xml version="1.0" encoding="utf-8"?>
+<ds:datastoreItem xmlns:ds="http://schemas.openxmlformats.org/officeDocument/2006/customXml" ds:itemID="{AE742842-5E75-4103-A8F8-1833411D09B7}">
+  <ds:schemaRefs>
+    <ds:schemaRef ds:uri="http://schemas.openxmlformats.org/officeDocument/2006/bibliography"/>
+  </ds:schemaRefs>
+</ds:datastoreItem>
 </file>
</xml_diff>

<commit_message>
feat: Main aim written
</commit_message>
<xml_diff>
--- a/Report.docx
+++ b/Report.docx
@@ -244,6 +244,15 @@
     </w:p>
     <w:sdt>
       <w:sdtPr>
+        <w:rPr>
+          <w:rFonts w:asciiTheme="minorHAnsi" w:eastAsiaTheme="minorHAnsi" w:hAnsiTheme="minorHAnsi" w:cstheme="minorBidi"/>
+          <w:color w:val="auto"/>
+          <w:kern w:val="2"/>
+          <w:sz w:val="24"/>
+          <w:szCs w:val="24"/>
+          <w:lang w:val="en-GB"/>
+          <w14:ligatures w14:val="standardContextual"/>
+        </w:rPr>
         <w:id w:val="1909112241"/>
         <w:docPartObj>
           <w:docPartGallery w:val="Table of Contents"/>
@@ -252,16 +261,9 @@
       </w:sdtPr>
       <w:sdtEndPr>
         <w:rPr>
-          <w:rFonts w:asciiTheme="minorHAnsi" w:eastAsiaTheme="minorHAnsi" w:hAnsiTheme="minorHAnsi" w:cstheme="minorBidi"/>
           <w:b/>
           <w:bCs/>
           <w:noProof/>
-          <w:color w:val="auto"/>
-          <w:kern w:val="2"/>
-          <w:sz w:val="24"/>
-          <w:szCs w:val="24"/>
-          <w:lang w:val="en-GB"/>
-          <w14:ligatures w14:val="standardContextual"/>
         </w:rPr>
       </w:sdtEndPr>
       <w:sdtContent>
@@ -298,27 +300,13 @@
           <w:r>
             <w:fldChar w:fldCharType="separate"/>
           </w:r>
-          <w:hyperlink w:anchor="_Toc221275627" w:history="1">
+          <w:hyperlink w:anchor="_Toc225874235" w:history="1">
             <w:r>
               <w:rPr>
                 <w:rStyle w:val="Hyperlink"/>
                 <w:noProof/>
               </w:rPr>
-              <w:t>Chapter 1 – Intr</w:t>
-            </w:r>
-            <w:r>
-              <w:rPr>
-                <w:rStyle w:val="Hyperlink"/>
-                <w:noProof/>
-              </w:rPr>
-              <w:t>o</w:t>
-            </w:r>
-            <w:r>
-              <w:rPr>
-                <w:rStyle w:val="Hyperlink"/>
-                <w:noProof/>
-              </w:rPr>
-              <w:t>duction</w:t>
+              <w:t>Chapter 1 – Introduction</w:t>
             </w:r>
             <w:r>
               <w:rPr>
@@ -339,7 +327,7 @@
                 <w:noProof/>
                 <w:webHidden/>
               </w:rPr>
-              <w:instrText xml:space="preserve"> PAGEREF _Toc221275627 \h </w:instrText>
+              <w:instrText xml:space="preserve"> PAGEREF _Toc225874235 \h </w:instrText>
             </w:r>
             <w:r>
               <w:rPr>
@@ -386,7 +374,7 @@
               <w14:ligatures w14:val="standardContextual"/>
             </w:rPr>
           </w:pPr>
-          <w:hyperlink w:anchor="_Toc221275628" w:history="1">
+          <w:hyperlink w:anchor="_Toc225874236" w:history="1">
             <w:r>
               <w:rPr>
                 <w:rStyle w:val="Hyperlink"/>
@@ -413,7 +401,81 @@
                 <w:noProof/>
                 <w:webHidden/>
               </w:rPr>
-              <w:instrText xml:space="preserve"> PAGEREF _Toc221275628 \h </w:instrText>
+              <w:instrText xml:space="preserve"> PAGEREF _Toc225874236 \h </w:instrText>
+            </w:r>
+            <w:r>
+              <w:rPr>
+                <w:noProof/>
+                <w:webHidden/>
+              </w:rPr>
+            </w:r>
+            <w:r>
+              <w:rPr>
+                <w:noProof/>
+                <w:webHidden/>
+              </w:rPr>
+              <w:fldChar w:fldCharType="separate"/>
+            </w:r>
+            <w:r>
+              <w:rPr>
+                <w:noProof/>
+                <w:webHidden/>
+              </w:rPr>
+              <w:t>3</w:t>
+            </w:r>
+            <w:r>
+              <w:rPr>
+                <w:noProof/>
+                <w:webHidden/>
+              </w:rPr>
+              <w:fldChar w:fldCharType="end"/>
+            </w:r>
+          </w:hyperlink>
+        </w:p>
+        <w:p>
+          <w:pPr>
+            <w:pStyle w:val="TOC1"/>
+            <w:tabs>
+              <w:tab w:val="right" w:leader="dot" w:pos="9016"/>
+            </w:tabs>
+            <w:rPr>
+              <w:rFonts w:cstheme="minorBidi"/>
+              <w:noProof/>
+              <w:kern w:val="2"/>
+              <w:sz w:val="24"/>
+              <w:szCs w:val="24"/>
+              <w:lang w:val="en-GB" w:eastAsia="en-GB"/>
+              <w14:ligatures w14:val="standardContextual"/>
+            </w:rPr>
+          </w:pPr>
+          <w:hyperlink w:anchor="_Toc225874237" w:history="1">
+            <w:r>
+              <w:rPr>
+                <w:rStyle w:val="Hyperlink"/>
+                <w:noProof/>
+              </w:rPr>
+              <w:t>1.2 Aims</w:t>
+            </w:r>
+            <w:r>
+              <w:rPr>
+                <w:noProof/>
+                <w:webHidden/>
+              </w:rPr>
+              <w:tab/>
+            </w:r>
+            <w:r>
+              <w:rPr>
+                <w:noProof/>
+                <w:webHidden/>
+              </w:rPr>
+              <w:fldChar w:fldCharType="begin"/>
+            </w:r>
+            <w:r>
+              <w:rPr>
+                <w:noProof/>
+                <w:webHidden/>
+              </w:rPr>
+              <w:instrText xml:space="preserve"> PAGEREF _Toc225874237 \h </w:instrText>
             </w:r>
             <w:r>
               <w:rPr>
@@ -460,20 +522,13 @@
               <w14:ligatures w14:val="standardContextual"/>
             </w:rPr>
           </w:pPr>
-          <w:hyperlink w:anchor="_Toc221275629" w:history="1">
+          <w:hyperlink w:anchor="_Toc225874238" w:history="1">
             <w:r>
               <w:rPr>
                 <w:rStyle w:val="Hyperlink"/>
                 <w:noProof/>
               </w:rPr>
-              <w:t>1.2 Aim</w:t>
-            </w:r>
-            <w:r>
-              <w:rPr>
-                <w:rStyle w:val="Hyperlink"/>
-                <w:noProof/>
-              </w:rPr>
-              <w:t>s</w:t>
+              <w:t>1.2.1 Main Aim</w:t>
             </w:r>
             <w:r>
               <w:rPr>
@@ -494,81 +549,7 @@
                 <w:noProof/>
                 <w:webHidden/>
               </w:rPr>
-              <w:instrText xml:space="preserve"> PAGEREF _Toc221275629 \h </w:instrText>
-            </w:r>
-            <w:r>
-              <w:rPr>
-                <w:noProof/>
-                <w:webHidden/>
-              </w:rPr>
-            </w:r>
-            <w:r>
-              <w:rPr>
-                <w:noProof/>
-                <w:webHidden/>
-              </w:rPr>
-              <w:fldChar w:fldCharType="separate"/>
-            </w:r>
-            <w:r>
-              <w:rPr>
-                <w:noProof/>
-                <w:webHidden/>
-              </w:rPr>
-              <w:t>3</w:t>
-            </w:r>
-            <w:r>
-              <w:rPr>
-                <w:noProof/>
-                <w:webHidden/>
-              </w:rPr>
-              <w:fldChar w:fldCharType="end"/>
-            </w:r>
-          </w:hyperlink>
-        </w:p>
-        <w:p>
-          <w:pPr>
-            <w:pStyle w:val="TOC2"/>
-            <w:tabs>
-              <w:tab w:val="right" w:leader="dot" w:pos="9016"/>
-            </w:tabs>
-            <w:rPr>
-              <w:rFonts w:cstheme="minorBidi"/>
-              <w:noProof/>
-              <w:kern w:val="2"/>
-              <w:sz w:val="24"/>
-              <w:szCs w:val="24"/>
-              <w:lang w:val="en-GB" w:eastAsia="en-GB"/>
-              <w14:ligatures w14:val="standardContextual"/>
-            </w:rPr>
-          </w:pPr>
-          <w:hyperlink w:anchor="_Toc221275630" w:history="1">
-            <w:r>
-              <w:rPr>
-                <w:rStyle w:val="Hyperlink"/>
-                <w:noProof/>
-              </w:rPr>
-              <w:t>1.2.1 Main Aim</w:t>
-            </w:r>
-            <w:r>
-              <w:rPr>
-                <w:noProof/>
-                <w:webHidden/>
-              </w:rPr>
-              <w:tab/>
-            </w:r>
-            <w:r>
-              <w:rPr>
-                <w:noProof/>
-                <w:webHidden/>
-              </w:rPr>
-              <w:fldChar w:fldCharType="begin"/>
-            </w:r>
-            <w:r>
-              <w:rPr>
-                <w:noProof/>
-                <w:webHidden/>
-              </w:rPr>
-              <w:instrText xml:space="preserve"> PAGEREF _Toc221275630 \h </w:instrText>
+              <w:instrText xml:space="preserve"> PAGEREF _Toc225874238 \h </w:instrText>
             </w:r>
             <w:r>
               <w:rPr>
@@ -768,7 +749,7 @@
         <w:pStyle w:val="Heading1"/>
         <w:jc w:val="center"/>
       </w:pPr>
-      <w:bookmarkStart w:id="0" w:name="_Toc221275627"/>
+      <w:bookmarkStart w:id="0" w:name="_Toc225874235"/>
       <w:r>
         <w:lastRenderedPageBreak/>
         <w:t>Chapter 1</w:t>
@@ -797,7 +778,7 @@
           <w:u w:val="single"/>
         </w:rPr>
       </w:pPr>
-      <w:bookmarkStart w:id="1" w:name="_Toc221275628"/>
+      <w:bookmarkStart w:id="1" w:name="_Toc225874236"/>
       <w:r>
         <w:t>1.1</w:t>
       </w:r>
@@ -834,45 +815,58 @@
     <w:p/>
     <w:p>
       <w:r>
-        <w:t xml:space="preserve">The game will start the player off in a randomly generated world on a roughly equidistant tile from </w:t>
-      </w:r>
-      <w:proofErr w:type="gramStart"/>
-      <w:r>
-        <w:t>any and all</w:t>
-      </w:r>
-      <w:proofErr w:type="gramEnd"/>
-      <w:r>
-        <w:t xml:space="preserve"> other players, giving them the freedom to settle their first city immediately or to move them around to somewhere that may be more suited to their playstyle.</w:t>
-      </w:r>
-      <w:r>
-        <w:t xml:space="preserve"> The player will then be able to farm the lands resources to stimulate city growth, population growth and overall production. I have designed the game in this way to hopefully create a replay-able and fun game for players to enjoy and come back to.</w:t>
+        <w:t>The game will start the player off in a randomly generated world on a roughly equidistant tile from any other players, giving them the freedom to settle their first city immediately or to move them around to somewhere that may be more suited to their playstyle. The player will then be able to farm the lands resources to stimulate city growth, population growth and overall production. I have designed the game in this way to hopefully create a replay-able and fun game for players to enjoy and come back to.</w:t>
       </w:r>
     </w:p>
     <w:p/>
     <w:p>
       <w:pPr>
-        <w:pStyle w:val="Heading2"/>
-      </w:pPr>
-      <w:bookmarkStart w:id="2" w:name="_Toc221275629"/>
+        <w:pStyle w:val="Heading1"/>
+      </w:pPr>
+      <w:bookmarkStart w:id="2" w:name="_Toc225874237"/>
       <w:r>
         <w:t>1.2 Aims</w:t>
       </w:r>
       <w:bookmarkEnd w:id="2"/>
     </w:p>
     <w:p>
-      <w:pPr>
-        <w:pStyle w:val="Heading2"/>
-      </w:pPr>
-      <w:bookmarkStart w:id="3" w:name="_Toc221275630"/>
-      <w:r>
-        <w:rPr>
-          <w:rStyle w:val="Heading3Char"/>
+      <w:bookmarkStart w:id="3" w:name="_Toc225874238"/>
+      <w:r>
+        <w:rPr>
+          <w:rStyle w:val="Heading2Char"/>
         </w:rPr>
         <w:t>1.2.1 Main Aim</w:t>
       </w:r>
       <w:bookmarkEnd w:id="3"/>
       <w:r>
         <w:br/>
+      </w:r>
+      <w:r>
+        <w:t>The main aim for this project is to investigate and explore the usage of machine learning models for real time gaming uses</w:t>
+      </w:r>
+      <w:r>
+        <w:t>, primarily for opponent AI</w:t>
+      </w:r>
+      <w:r>
+        <w:t>, allowing users to have a unique experience each time the</w:t>
+      </w:r>
+      <w:r>
+        <w:t>y</w:t>
+      </w:r>
+      <w:r>
+        <w:t xml:space="preserve"> play the game without the need for a significant </w:t>
+      </w:r>
+      <w:r>
+        <w:t>number</w:t>
+      </w:r>
+      <w:r>
+        <w:t xml:space="preserve"> of diverging paths. This will be implemented in a way that doesn’t overwhelm the player through difficulty and create a situation where the player </w:t>
+      </w:r>
+      <w:r>
+        <w:t>manages</w:t>
+      </w:r>
+      <w:r>
+        <w:t xml:space="preserve"> to enjoy the game and win against the AI.</w:t>
       </w:r>
     </w:p>
     <w:sectPr>
@@ -883,6 +877,359 @@
     </w:sectPr>
   </w:body>
 </w:document>
+</file>
+
+<file path=word/numbering.xml><?xml version="1.0" encoding="utf-8"?>
+<w:numbering xmlns:wpc="http://schemas.microsoft.com/office/word/2010/wordprocessingCanvas" xmlns:cx="http://schemas.microsoft.com/office/drawing/2014/chartex" xmlns:cx1="http://schemas.microsoft.com/office/drawing/2015/9/8/chartex" xmlns:cx2="http://schemas.microsoft.com/office/drawing/2015/10/21/chartex" xmlns:cx3="http://schemas.microsoft.com/office/drawing/2016/5/9/chartex" xmlns:cx4="http://schemas.microsoft.com/office/drawing/2016/5/10/chartex" xmlns:cx5="http://schemas.microsoft.com/office/drawing/2016/5/11/chartex" xmlns:cx6="http://schemas.microsoft.com/office/drawing/2016/5/12/chartex" xmlns:cx7="http://schemas.microsoft.com/office/drawing/2016/5/13/chartex" xmlns:cx8="http://schemas.microsoft.com/office/drawing/2016/5/14/chartex" xmlns:mc="http://schemas.openxmlformats.org/markup-compatibility/2006" xmlns:aink="http://schemas.microsoft.com/office/drawing/2016/ink" xmlns:am3d="http://schemas.microsoft.com/office/drawing/2017/model3d" xmlns:o="urn:schemas-microsoft-com:office:office" xmlns:oel="http://schemas.microsoft.com/office/2019/extlst" xmlns:r="http://schemas.openxmlformats.org/officeDocument/2006/relationships" xmlns:m="http://schemas.openxmlformats.org/officeDocument/2006/math" xmlns:v="urn:schemas-microsoft-com:vml" xmlns:wp14="http://schemas.microsoft.com/office/word/2010/wordprocessingDrawing" xmlns:wp="http://schemas.openxmlformats.org/drawingml/2006/wordprocessingDrawing" xmlns:w10="urn:schemas-microsoft-com:office:word" xmlns:w="http://schemas.openxmlformats.org/wordprocessingml/2006/main" xmlns:w14="http://schemas.microsoft.com/office/word/2010/wordml" xmlns:w15="http://schemas.microsoft.com/office/word/2012/wordml" xmlns:w16cex="http://schemas.microsoft.com/office/word/2018/wordml/cex" xmlns:w16cid="http://schemas.microsoft.com/office/word/2016/wordml/cid" xmlns:w16="http://schemas.microsoft.com/office/word/2018/wordml" xmlns:w16du="http://schemas.microsoft.com/office/word/2023/wordml/word16du" xmlns:w16sdtdh="http://schemas.microsoft.com/office/word/2020/wordml/sdtdatahash" xmlns:w16sdtfl="http://schemas.microsoft.com/office/word/2024/wordml/sdtformatlock" xmlns:w16se="http://schemas.microsoft.com/office/word/2015/wordml/symex" xmlns:wpg="http://schemas.microsoft.com/office/word/2010/wordprocessingGroup" xmlns:wpi="http://schemas.microsoft.com/office/word/2010/wordprocessingInk" xmlns:wne="http://schemas.microsoft.com/office/word/2006/wordml" xmlns:wps="http://schemas.microsoft.com/office/word/2010/wordprocessingShape" mc:Ignorable="w14 w15 w16se w16cid w16 w16cex w16sdtdh w16sdtfl w16du wp14">
+  <w:abstractNum w:abstractNumId="0" w15:restartNumberingAfterBreak="0">
+    <w:nsid w:val="2AAA6573"/>
+    <w:multiLevelType w:val="hybridMultilevel"/>
+    <w:tmpl w:val="792ABFEC"/>
+    <w:lvl w:ilvl="0" w:tplc="08090001">
+      <w:start w:val="1"/>
+      <w:numFmt w:val="bullet"/>
+      <w:lvlText w:val=""/>
+      <w:lvlJc w:val="left"/>
+      <w:pPr>
+        <w:ind w:left="720" w:hanging="360"/>
+      </w:pPr>
+      <w:rPr>
+        <w:rFonts w:ascii="Symbol" w:hAnsi="Symbol" w:hint="default"/>
+      </w:rPr>
+    </w:lvl>
+    <w:lvl w:ilvl="1" w:tplc="08090003" w:tentative="1">
+      <w:start w:val="1"/>
+      <w:numFmt w:val="bullet"/>
+      <w:lvlText w:val="o"/>
+      <w:lvlJc w:val="left"/>
+      <w:pPr>
+        <w:ind w:left="1440" w:hanging="360"/>
+      </w:pPr>
+      <w:rPr>
+        <w:rFonts w:ascii="Courier New" w:hAnsi="Courier New" w:cs="Courier New" w:hint="default"/>
+      </w:rPr>
+    </w:lvl>
+    <w:lvl w:ilvl="2" w:tplc="08090005" w:tentative="1">
+      <w:start w:val="1"/>
+      <w:numFmt w:val="bullet"/>
+      <w:lvlText w:val=""/>
+      <w:lvlJc w:val="left"/>
+      <w:pPr>
+        <w:ind w:left="2160" w:hanging="360"/>
+      </w:pPr>
+      <w:rPr>
+        <w:rFonts w:ascii="Wingdings" w:hAnsi="Wingdings" w:hint="default"/>
+      </w:rPr>
+    </w:lvl>
+    <w:lvl w:ilvl="3" w:tplc="08090001" w:tentative="1">
+      <w:start w:val="1"/>
+      <w:numFmt w:val="bullet"/>
+      <w:lvlText w:val=""/>
+      <w:lvlJc w:val="left"/>
+      <w:pPr>
+        <w:ind w:left="2880" w:hanging="360"/>
+      </w:pPr>
+      <w:rPr>
+        <w:rFonts w:ascii="Symbol" w:hAnsi="Symbol" w:hint="default"/>
+      </w:rPr>
+    </w:lvl>
+    <w:lvl w:ilvl="4" w:tplc="08090003" w:tentative="1">
+      <w:start w:val="1"/>
+      <w:numFmt w:val="bullet"/>
+      <w:lvlText w:val="o"/>
+      <w:lvlJc w:val="left"/>
+      <w:pPr>
+        <w:ind w:left="3600" w:hanging="360"/>
+      </w:pPr>
+      <w:rPr>
+        <w:rFonts w:ascii="Courier New" w:hAnsi="Courier New" w:cs="Courier New" w:hint="default"/>
+      </w:rPr>
+    </w:lvl>
+    <w:lvl w:ilvl="5" w:tplc="08090005" w:tentative="1">
+      <w:start w:val="1"/>
+      <w:numFmt w:val="bullet"/>
+      <w:lvlText w:val=""/>
+      <w:lvlJc w:val="left"/>
+      <w:pPr>
+        <w:ind w:left="4320" w:hanging="360"/>
+      </w:pPr>
+      <w:rPr>
+        <w:rFonts w:ascii="Wingdings" w:hAnsi="Wingdings" w:hint="default"/>
+      </w:rPr>
+    </w:lvl>
+    <w:lvl w:ilvl="6" w:tplc="08090001" w:tentative="1">
+      <w:start w:val="1"/>
+      <w:numFmt w:val="bullet"/>
+      <w:lvlText w:val=""/>
+      <w:lvlJc w:val="left"/>
+      <w:pPr>
+        <w:ind w:left="5040" w:hanging="360"/>
+      </w:pPr>
+      <w:rPr>
+        <w:rFonts w:ascii="Symbol" w:hAnsi="Symbol" w:hint="default"/>
+      </w:rPr>
+    </w:lvl>
+    <w:lvl w:ilvl="7" w:tplc="08090003" w:tentative="1">
+      <w:start w:val="1"/>
+      <w:numFmt w:val="bullet"/>
+      <w:lvlText w:val="o"/>
+      <w:lvlJc w:val="left"/>
+      <w:pPr>
+        <w:ind w:left="5760" w:hanging="360"/>
+      </w:pPr>
+      <w:rPr>
+        <w:rFonts w:ascii="Courier New" w:hAnsi="Courier New" w:cs="Courier New" w:hint="default"/>
+      </w:rPr>
+    </w:lvl>
+    <w:lvl w:ilvl="8" w:tplc="08090005" w:tentative="1">
+      <w:start w:val="1"/>
+      <w:numFmt w:val="bullet"/>
+      <w:lvlText w:val=""/>
+      <w:lvlJc w:val="left"/>
+      <w:pPr>
+        <w:ind w:left="6480" w:hanging="360"/>
+      </w:pPr>
+      <w:rPr>
+        <w:rFonts w:ascii="Wingdings" w:hAnsi="Wingdings" w:hint="default"/>
+      </w:rPr>
+    </w:lvl>
+  </w:abstractNum>
+  <w:abstractNum w:abstractNumId="1" w15:restartNumberingAfterBreak="0">
+    <w:nsid w:val="2CAE47EC"/>
+    <w:multiLevelType w:val="hybridMultilevel"/>
+    <w:tmpl w:val="B3C2CD1A"/>
+    <w:lvl w:ilvl="0" w:tplc="08090001">
+      <w:start w:val="1"/>
+      <w:numFmt w:val="bullet"/>
+      <w:lvlText w:val=""/>
+      <w:lvlJc w:val="left"/>
+      <w:pPr>
+        <w:ind w:left="720" w:hanging="360"/>
+      </w:pPr>
+      <w:rPr>
+        <w:rFonts w:ascii="Symbol" w:hAnsi="Symbol" w:hint="default"/>
+      </w:rPr>
+    </w:lvl>
+    <w:lvl w:ilvl="1" w:tplc="08090003" w:tentative="1">
+      <w:start w:val="1"/>
+      <w:numFmt w:val="bullet"/>
+      <w:lvlText w:val="o"/>
+      <w:lvlJc w:val="left"/>
+      <w:pPr>
+        <w:ind w:left="1440" w:hanging="360"/>
+      </w:pPr>
+      <w:rPr>
+        <w:rFonts w:ascii="Courier New" w:hAnsi="Courier New" w:cs="Courier New" w:hint="default"/>
+      </w:rPr>
+    </w:lvl>
+    <w:lvl w:ilvl="2" w:tplc="08090005" w:tentative="1">
+      <w:start w:val="1"/>
+      <w:numFmt w:val="bullet"/>
+      <w:lvlText w:val=""/>
+      <w:lvlJc w:val="left"/>
+      <w:pPr>
+        <w:ind w:left="2160" w:hanging="360"/>
+      </w:pPr>
+      <w:rPr>
+        <w:rFonts w:ascii="Wingdings" w:hAnsi="Wingdings" w:hint="default"/>
+      </w:rPr>
+    </w:lvl>
+    <w:lvl w:ilvl="3" w:tplc="08090001" w:tentative="1">
+      <w:start w:val="1"/>
+      <w:numFmt w:val="bullet"/>
+      <w:lvlText w:val=""/>
+      <w:lvlJc w:val="left"/>
+      <w:pPr>
+        <w:ind w:left="2880" w:hanging="360"/>
+      </w:pPr>
+      <w:rPr>
+        <w:rFonts w:ascii="Symbol" w:hAnsi="Symbol" w:hint="default"/>
+      </w:rPr>
+    </w:lvl>
+    <w:lvl w:ilvl="4" w:tplc="08090003" w:tentative="1">
+      <w:start w:val="1"/>
+      <w:numFmt w:val="bullet"/>
+      <w:lvlText w:val="o"/>
+      <w:lvlJc w:val="left"/>
+      <w:pPr>
+        <w:ind w:left="3600" w:hanging="360"/>
+      </w:pPr>
+      <w:rPr>
+        <w:rFonts w:ascii="Courier New" w:hAnsi="Courier New" w:cs="Courier New" w:hint="default"/>
+      </w:rPr>
+    </w:lvl>
+    <w:lvl w:ilvl="5" w:tplc="08090005" w:tentative="1">
+      <w:start w:val="1"/>
+      <w:numFmt w:val="bullet"/>
+      <w:lvlText w:val=""/>
+      <w:lvlJc w:val="left"/>
+      <w:pPr>
+        <w:ind w:left="4320" w:hanging="360"/>
+      </w:pPr>
+      <w:rPr>
+        <w:rFonts w:ascii="Wingdings" w:hAnsi="Wingdings" w:hint="default"/>
+      </w:rPr>
+    </w:lvl>
+    <w:lvl w:ilvl="6" w:tplc="08090001" w:tentative="1">
+      <w:start w:val="1"/>
+      <w:numFmt w:val="bullet"/>
+      <w:lvlText w:val=""/>
+      <w:lvlJc w:val="left"/>
+      <w:pPr>
+        <w:ind w:left="5040" w:hanging="360"/>
+      </w:pPr>
+      <w:rPr>
+        <w:rFonts w:ascii="Symbol" w:hAnsi="Symbol" w:hint="default"/>
+      </w:rPr>
+    </w:lvl>
+    <w:lvl w:ilvl="7" w:tplc="08090003" w:tentative="1">
+      <w:start w:val="1"/>
+      <w:numFmt w:val="bullet"/>
+      <w:lvlText w:val="o"/>
+      <w:lvlJc w:val="left"/>
+      <w:pPr>
+        <w:ind w:left="5760" w:hanging="360"/>
+      </w:pPr>
+      <w:rPr>
+        <w:rFonts w:ascii="Courier New" w:hAnsi="Courier New" w:cs="Courier New" w:hint="default"/>
+      </w:rPr>
+    </w:lvl>
+    <w:lvl w:ilvl="8" w:tplc="08090005" w:tentative="1">
+      <w:start w:val="1"/>
+      <w:numFmt w:val="bullet"/>
+      <w:lvlText w:val=""/>
+      <w:lvlJc w:val="left"/>
+      <w:pPr>
+        <w:ind w:left="6480" w:hanging="360"/>
+      </w:pPr>
+      <w:rPr>
+        <w:rFonts w:ascii="Wingdings" w:hAnsi="Wingdings" w:hint="default"/>
+      </w:rPr>
+    </w:lvl>
+  </w:abstractNum>
+  <w:abstractNum w:abstractNumId="2" w15:restartNumberingAfterBreak="0">
+    <w:nsid w:val="6F4C07D3"/>
+    <w:multiLevelType w:val="hybridMultilevel"/>
+    <w:tmpl w:val="C00ADDF0"/>
+    <w:lvl w:ilvl="0" w:tplc="08090001">
+      <w:start w:val="1"/>
+      <w:numFmt w:val="bullet"/>
+      <w:lvlText w:val=""/>
+      <w:lvlJc w:val="left"/>
+      <w:pPr>
+        <w:ind w:left="720" w:hanging="360"/>
+      </w:pPr>
+      <w:rPr>
+        <w:rFonts w:ascii="Symbol" w:hAnsi="Symbol" w:hint="default"/>
+      </w:rPr>
+    </w:lvl>
+    <w:lvl w:ilvl="1" w:tplc="08090003" w:tentative="1">
+      <w:start w:val="1"/>
+      <w:numFmt w:val="bullet"/>
+      <w:lvlText w:val="o"/>
+      <w:lvlJc w:val="left"/>
+      <w:pPr>
+        <w:ind w:left="1440" w:hanging="360"/>
+      </w:pPr>
+      <w:rPr>
+        <w:rFonts w:ascii="Courier New" w:hAnsi="Courier New" w:cs="Courier New" w:hint="default"/>
+      </w:rPr>
+    </w:lvl>
+    <w:lvl w:ilvl="2" w:tplc="08090005" w:tentative="1">
+      <w:start w:val="1"/>
+      <w:numFmt w:val="bullet"/>
+      <w:lvlText w:val=""/>
+      <w:lvlJc w:val="left"/>
+      <w:pPr>
+        <w:ind w:left="2160" w:hanging="360"/>
+      </w:pPr>
+      <w:rPr>
+        <w:rFonts w:ascii="Wingdings" w:hAnsi="Wingdings" w:hint="default"/>
+      </w:rPr>
+    </w:lvl>
+    <w:lvl w:ilvl="3" w:tplc="08090001" w:tentative="1">
+      <w:start w:val="1"/>
+      <w:numFmt w:val="bullet"/>
+      <w:lvlText w:val=""/>
+      <w:lvlJc w:val="left"/>
+      <w:pPr>
+        <w:ind w:left="2880" w:hanging="360"/>
+      </w:pPr>
+      <w:rPr>
+        <w:rFonts w:ascii="Symbol" w:hAnsi="Symbol" w:hint="default"/>
+      </w:rPr>
+    </w:lvl>
+    <w:lvl w:ilvl="4" w:tplc="08090003" w:tentative="1">
+      <w:start w:val="1"/>
+      <w:numFmt w:val="bullet"/>
+      <w:lvlText w:val="o"/>
+      <w:lvlJc w:val="left"/>
+      <w:pPr>
+        <w:ind w:left="3600" w:hanging="360"/>
+      </w:pPr>
+      <w:rPr>
+        <w:rFonts w:ascii="Courier New" w:hAnsi="Courier New" w:cs="Courier New" w:hint="default"/>
+      </w:rPr>
+    </w:lvl>
+    <w:lvl w:ilvl="5" w:tplc="08090005" w:tentative="1">
+      <w:start w:val="1"/>
+      <w:numFmt w:val="bullet"/>
+      <w:lvlText w:val=""/>
+      <w:lvlJc w:val="left"/>
+      <w:pPr>
+        <w:ind w:left="4320" w:hanging="360"/>
+      </w:pPr>
+      <w:rPr>
+        <w:rFonts w:ascii="Wingdings" w:hAnsi="Wingdings" w:hint="default"/>
+      </w:rPr>
+    </w:lvl>
+    <w:lvl w:ilvl="6" w:tplc="08090001" w:tentative="1">
+      <w:start w:val="1"/>
+      <w:numFmt w:val="bullet"/>
+      <w:lvlText w:val=""/>
+      <w:lvlJc w:val="left"/>
+      <w:pPr>
+        <w:ind w:left="5040" w:hanging="360"/>
+      </w:pPr>
+      <w:rPr>
+        <w:rFonts w:ascii="Symbol" w:hAnsi="Symbol" w:hint="default"/>
+      </w:rPr>
+    </w:lvl>
+    <w:lvl w:ilvl="7" w:tplc="08090003" w:tentative="1">
+      <w:start w:val="1"/>
+      <w:numFmt w:val="bullet"/>
+      <w:lvlText w:val="o"/>
+      <w:lvlJc w:val="left"/>
+      <w:pPr>
+        <w:ind w:left="5760" w:hanging="360"/>
+      </w:pPr>
+      <w:rPr>
+        <w:rFonts w:ascii="Courier New" w:hAnsi="Courier New" w:cs="Courier New" w:hint="default"/>
+      </w:rPr>
+    </w:lvl>
+    <w:lvl w:ilvl="8" w:tplc="08090005" w:tentative="1">
+      <w:start w:val="1"/>
+      <w:numFmt w:val="bullet"/>
+      <w:lvlText w:val=""/>
+      <w:lvlJc w:val="left"/>
+      <w:pPr>
+        <w:ind w:left="6480" w:hanging="360"/>
+      </w:pPr>
+      <w:rPr>
+        <w:rFonts w:ascii="Wingdings" w:hAnsi="Wingdings" w:hint="default"/>
+      </w:rPr>
+    </w:lvl>
+  </w:abstractNum>
+  <w:num w:numId="1" w16cid:durableId="441345725">
+    <w:abstractNumId w:val="1"/>
+  </w:num>
+  <w:num w:numId="2" w16cid:durableId="800418358">
+    <w:abstractNumId w:val="2"/>
+  </w:num>
+  <w:num w:numId="3" w16cid:durableId="1302493766">
+    <w:abstractNumId w:val="0"/>
+  </w:num>
+</w:numbering>
 </file>
 
 <file path=word/styles.xml><?xml version="1.0" encoding="utf-8"?>
@@ -1285,6 +1632,7 @@
   <w:style w:type="paragraph" w:default="1" w:styleId="Normal">
     <w:name w:val="Normal"/>
     <w:qFormat/>
+    <w:rsid w:val="007569CB"/>
   </w:style>
   <w:style w:type="paragraph" w:styleId="Heading1">
     <w:name w:val="heading 1"/>
@@ -1486,7 +1834,6 @@
   <w:style w:type="character" w:default="1" w:styleId="DefaultParagraphFont">
     <w:name w:val="Default Paragraph Font"/>
     <w:uiPriority w:val="1"/>
-    <w:semiHidden/>
     <w:unhideWhenUsed/>
   </w:style>
   <w:style w:type="table" w:default="1" w:styleId="TableNormal">

</xml_diff>

<commit_message>
feat: additional aims written
</commit_message>
<xml_diff>
--- a/Report.docx
+++ b/Report.docx
@@ -300,7 +300,7 @@
           <w:r>
             <w:fldChar w:fldCharType="separate"/>
           </w:r>
-          <w:hyperlink w:anchor="_Toc225874235" w:history="1">
+          <w:hyperlink w:anchor="_Toc225874259" w:history="1">
             <w:r>
               <w:rPr>
                 <w:rStyle w:val="Hyperlink"/>
@@ -327,7 +327,7 @@
                 <w:noProof/>
                 <w:webHidden/>
               </w:rPr>
-              <w:instrText xml:space="preserve"> PAGEREF _Toc225874235 \h </w:instrText>
+              <w:instrText xml:space="preserve"> PAGEREF _Toc225874259 \h </w:instrText>
             </w:r>
             <w:r>
               <w:rPr>
@@ -374,7 +374,7 @@
               <w14:ligatures w14:val="standardContextual"/>
             </w:rPr>
           </w:pPr>
-          <w:hyperlink w:anchor="_Toc225874236" w:history="1">
+          <w:hyperlink w:anchor="_Toc225874260" w:history="1">
             <w:r>
               <w:rPr>
                 <w:rStyle w:val="Hyperlink"/>
@@ -401,7 +401,7 @@
                 <w:noProof/>
                 <w:webHidden/>
               </w:rPr>
-              <w:instrText xml:space="preserve"> PAGEREF _Toc225874236 \h </w:instrText>
+              <w:instrText xml:space="preserve"> PAGEREF _Toc225874260 \h </w:instrText>
             </w:r>
             <w:r>
               <w:rPr>
@@ -448,7 +448,7 @@
               <w14:ligatures w14:val="standardContextual"/>
             </w:rPr>
           </w:pPr>
-          <w:hyperlink w:anchor="_Toc225874237" w:history="1">
+          <w:hyperlink w:anchor="_Toc225874261" w:history="1">
             <w:r>
               <w:rPr>
                 <w:rStyle w:val="Hyperlink"/>
@@ -475,7 +475,7 @@
                 <w:noProof/>
                 <w:webHidden/>
               </w:rPr>
-              <w:instrText xml:space="preserve"> PAGEREF _Toc225874237 \h </w:instrText>
+              <w:instrText xml:space="preserve"> PAGEREF _Toc225874261 \h </w:instrText>
             </w:r>
             <w:r>
               <w:rPr>
@@ -522,7 +522,7 @@
               <w14:ligatures w14:val="standardContextual"/>
             </w:rPr>
           </w:pPr>
-          <w:hyperlink w:anchor="_Toc225874238" w:history="1">
+          <w:hyperlink w:anchor="_Toc225874262" w:history="1">
             <w:r>
               <w:rPr>
                 <w:rStyle w:val="Hyperlink"/>
@@ -549,7 +549,7 @@
                 <w:noProof/>
                 <w:webHidden/>
               </w:rPr>
-              <w:instrText xml:space="preserve"> PAGEREF _Toc225874238 \h </w:instrText>
+              <w:instrText xml:space="preserve"> PAGEREF _Toc225874262 \h </w:instrText>
             </w:r>
             <w:r>
               <w:rPr>
@@ -570,6 +570,80 @@
                 <w:webHidden/>
               </w:rPr>
               <w:t>3</w:t>
+            </w:r>
+            <w:r>
+              <w:rPr>
+                <w:noProof/>
+                <w:webHidden/>
+              </w:rPr>
+              <w:fldChar w:fldCharType="end"/>
+            </w:r>
+          </w:hyperlink>
+        </w:p>
+        <w:p>
+          <w:pPr>
+            <w:pStyle w:val="TOC2"/>
+            <w:tabs>
+              <w:tab w:val="right" w:leader="dot" w:pos="9016"/>
+            </w:tabs>
+            <w:rPr>
+              <w:rFonts w:cstheme="minorBidi"/>
+              <w:noProof/>
+              <w:kern w:val="2"/>
+              <w:sz w:val="24"/>
+              <w:szCs w:val="24"/>
+              <w:lang w:val="en-GB" w:eastAsia="en-GB"/>
+              <w14:ligatures w14:val="standardContextual"/>
+            </w:rPr>
+          </w:pPr>
+          <w:hyperlink w:anchor="_Toc225874263" w:history="1">
+            <w:r>
+              <w:rPr>
+                <w:rStyle w:val="Hyperlink"/>
+                <w:noProof/>
+              </w:rPr>
+              <w:t>1.2.2 Additional Aims</w:t>
+            </w:r>
+            <w:r>
+              <w:rPr>
+                <w:noProof/>
+                <w:webHidden/>
+              </w:rPr>
+              <w:tab/>
+            </w:r>
+            <w:r>
+              <w:rPr>
+                <w:noProof/>
+                <w:webHidden/>
+              </w:rPr>
+              <w:fldChar w:fldCharType="begin"/>
+            </w:r>
+            <w:r>
+              <w:rPr>
+                <w:noProof/>
+                <w:webHidden/>
+              </w:rPr>
+              <w:instrText xml:space="preserve"> PAGEREF _Toc225874263 \h </w:instrText>
+            </w:r>
+            <w:r>
+              <w:rPr>
+                <w:noProof/>
+                <w:webHidden/>
+              </w:rPr>
+            </w:r>
+            <w:r>
+              <w:rPr>
+                <w:noProof/>
+                <w:webHidden/>
+              </w:rPr>
+              <w:fldChar w:fldCharType="separate"/>
+            </w:r>
+            <w:r>
+              <w:rPr>
+                <w:noProof/>
+                <w:webHidden/>
+              </w:rPr>
+              <w:t>4</w:t>
             </w:r>
             <w:r>
               <w:rPr>
@@ -749,7 +823,7 @@
         <w:pStyle w:val="Heading1"/>
         <w:jc w:val="center"/>
       </w:pPr>
-      <w:bookmarkStart w:id="0" w:name="_Toc225874235"/>
+      <w:bookmarkStart w:id="0" w:name="_Toc225874259"/>
       <w:r>
         <w:lastRenderedPageBreak/>
         <w:t>Chapter 1</w:t>
@@ -778,7 +852,7 @@
           <w:u w:val="single"/>
         </w:rPr>
       </w:pPr>
-      <w:bookmarkStart w:id="1" w:name="_Toc225874236"/>
+      <w:bookmarkStart w:id="1" w:name="_Toc225874260"/>
       <w:r>
         <w:t>1.1</w:t>
       </w:r>
@@ -823,14 +897,14 @@
       <w:pPr>
         <w:pStyle w:val="Heading1"/>
       </w:pPr>
-      <w:bookmarkStart w:id="2" w:name="_Toc225874237"/>
+      <w:bookmarkStart w:id="2" w:name="_Toc225874261"/>
       <w:r>
         <w:t>1.2 Aims</w:t>
       </w:r>
       <w:bookmarkEnd w:id="2"/>
     </w:p>
     <w:p>
-      <w:bookmarkStart w:id="3" w:name="_Toc225874238"/>
+      <w:bookmarkStart w:id="3" w:name="_Toc225874262"/>
       <w:r>
         <w:rPr>
           <w:rStyle w:val="Heading2Char"/>
@@ -867,6 +941,75 @@
       </w:r>
       <w:r>
         <w:t xml:space="preserve"> to enjoy the game and win against the AI.</w:t>
+      </w:r>
+    </w:p>
+    <w:p>
+      <w:pPr>
+        <w:pStyle w:val="Heading2"/>
+      </w:pPr>
+      <w:bookmarkStart w:id="4" w:name="_Toc225874263"/>
+      <w:r>
+        <w:lastRenderedPageBreak/>
+        <w:t>1.2.2 Additional Aims</w:t>
+      </w:r>
+      <w:bookmarkEnd w:id="4"/>
+    </w:p>
+    <w:p>
+      <w:r>
+        <w:t>The additional aims of this project are going to be smaller but necessary aims that need to be established to make the game:</w:t>
+      </w:r>
+    </w:p>
+    <w:p>
+      <w:pPr>
+        <w:pStyle w:val="ListParagraph"/>
+        <w:numPr>
+          <w:ilvl w:val="0"/>
+          <w:numId w:val="2"/>
+        </w:numPr>
+      </w:pPr>
+      <w:r>
+        <w:t>Easy to pick up.</w:t>
+      </w:r>
+    </w:p>
+    <w:p>
+      <w:pPr>
+        <w:pStyle w:val="ListParagraph"/>
+        <w:numPr>
+          <w:ilvl w:val="0"/>
+          <w:numId w:val="2"/>
+        </w:numPr>
+      </w:pPr>
+      <w:r>
+        <w:t>Easy to understand.</w:t>
+      </w:r>
+    </w:p>
+    <w:p>
+      <w:pPr>
+        <w:pStyle w:val="ListParagraph"/>
+        <w:numPr>
+          <w:ilvl w:val="0"/>
+          <w:numId w:val="2"/>
+        </w:numPr>
+      </w:pPr>
+      <w:r>
+        <w:t>Provide a clear game loop within a short period of time.</w:t>
+      </w:r>
+    </w:p>
+    <w:p>
+      <w:pPr>
+        <w:pStyle w:val="ListParagraph"/>
+        <w:numPr>
+          <w:ilvl w:val="0"/>
+          <w:numId w:val="2"/>
+        </w:numPr>
+      </w:pPr>
+      <w:r>
+        <w:t>Provide replayability.</w:t>
+      </w:r>
+    </w:p>
+    <w:p>
+      <w:r>
+        <w:t>These aims are objectives that through playtesting and surveys, will be used to draw results from. Some of these will be objective targets and will be easy to tell if they have been hit, such as providing a clear game loop and providing replayability. Other objectives will be significantly harder to measure and will likely be inferred from the playtesting and survey data.</w:t>
       </w:r>
     </w:p>
     <w:sectPr>

</xml_diff>

<commit_message>
feat: research objectives established
</commit_message>
<xml_diff>
--- a/Report.docx
+++ b/Report.docx
@@ -300,7 +300,7 @@
           <w:r>
             <w:fldChar w:fldCharType="separate"/>
           </w:r>
-          <w:hyperlink w:anchor="_Toc225874294" w:history="1">
+          <w:hyperlink w:anchor="_Toc225874326" w:history="1">
             <w:r>
               <w:rPr>
                 <w:rStyle w:val="Hyperlink"/>
@@ -327,7 +327,7 @@
                 <w:noProof/>
                 <w:webHidden/>
               </w:rPr>
-              <w:instrText xml:space="preserve"> PAGEREF _Toc225874294 \h </w:instrText>
+              <w:instrText xml:space="preserve"> PAGEREF _Toc225874326 \h </w:instrText>
             </w:r>
             <w:r>
               <w:rPr>
@@ -374,7 +374,7 @@
               <w14:ligatures w14:val="standardContextual"/>
             </w:rPr>
           </w:pPr>
-          <w:hyperlink w:anchor="_Toc225874295" w:history="1">
+          <w:hyperlink w:anchor="_Toc225874327" w:history="1">
             <w:r>
               <w:rPr>
                 <w:rStyle w:val="Hyperlink"/>
@@ -401,7 +401,7 @@
                 <w:noProof/>
                 <w:webHidden/>
               </w:rPr>
-              <w:instrText xml:space="preserve"> PAGEREF _Toc225874295 \h </w:instrText>
+              <w:instrText xml:space="preserve"> PAGEREF _Toc225874327 \h </w:instrText>
             </w:r>
             <w:r>
               <w:rPr>
@@ -448,7 +448,7 @@
               <w14:ligatures w14:val="standardContextual"/>
             </w:rPr>
           </w:pPr>
-          <w:hyperlink w:anchor="_Toc225874296" w:history="1">
+          <w:hyperlink w:anchor="_Toc225874328" w:history="1">
             <w:r>
               <w:rPr>
                 <w:rStyle w:val="Hyperlink"/>
@@ -475,7 +475,7 @@
                 <w:noProof/>
                 <w:webHidden/>
               </w:rPr>
-              <w:instrText xml:space="preserve"> PAGEREF _Toc225874296 \h </w:instrText>
+              <w:instrText xml:space="preserve"> PAGEREF _Toc225874328 \h </w:instrText>
             </w:r>
             <w:r>
               <w:rPr>
@@ -522,7 +522,7 @@
               <w14:ligatures w14:val="standardContextual"/>
             </w:rPr>
           </w:pPr>
-          <w:hyperlink w:anchor="_Toc225874297" w:history="1">
+          <w:hyperlink w:anchor="_Toc225874329" w:history="1">
             <w:r>
               <w:rPr>
                 <w:rStyle w:val="Hyperlink"/>
@@ -549,7 +549,7 @@
                 <w:noProof/>
                 <w:webHidden/>
               </w:rPr>
-              <w:instrText xml:space="preserve"> PAGEREF _Toc225874297 \h </w:instrText>
+              <w:instrText xml:space="preserve"> PAGEREF _Toc225874329 \h </w:instrText>
             </w:r>
             <w:r>
               <w:rPr>
@@ -596,7 +596,7 @@
               <w14:ligatures w14:val="standardContextual"/>
             </w:rPr>
           </w:pPr>
-          <w:hyperlink w:anchor="_Toc225874298" w:history="1">
+          <w:hyperlink w:anchor="_Toc225874330" w:history="1">
             <w:r>
               <w:rPr>
                 <w:rStyle w:val="Hyperlink"/>
@@ -623,7 +623,7 @@
                 <w:noProof/>
                 <w:webHidden/>
               </w:rPr>
-              <w:instrText xml:space="preserve"> PAGEREF _Toc225874298 \h </w:instrText>
+              <w:instrText xml:space="preserve"> PAGEREF _Toc225874330 \h </w:instrText>
             </w:r>
             <w:r>
               <w:rPr>
@@ -670,7 +670,7 @@
               <w14:ligatures w14:val="standardContextual"/>
             </w:rPr>
           </w:pPr>
-          <w:hyperlink w:anchor="_Toc225874299" w:history="1">
+          <w:hyperlink w:anchor="_Toc225874331" w:history="1">
             <w:r>
               <w:rPr>
                 <w:rStyle w:val="Hyperlink"/>
@@ -697,7 +697,7 @@
                 <w:noProof/>
                 <w:webHidden/>
               </w:rPr>
-              <w:instrText xml:space="preserve"> PAGEREF _Toc225874299 \h </w:instrText>
+              <w:instrText xml:space="preserve"> PAGEREF _Toc225874331 \h </w:instrText>
             </w:r>
             <w:r>
               <w:rPr>
@@ -744,7 +744,7 @@
               <w14:ligatures w14:val="standardContextual"/>
             </w:rPr>
           </w:pPr>
-          <w:hyperlink w:anchor="_Toc225874300" w:history="1">
+          <w:hyperlink w:anchor="_Toc225874332" w:history="1">
             <w:r>
               <w:rPr>
                 <w:rStyle w:val="Hyperlink"/>
@@ -771,7 +771,81 @@
                 <w:noProof/>
                 <w:webHidden/>
               </w:rPr>
-              <w:instrText xml:space="preserve"> PAGEREF _Toc225874300 \h </w:instrText>
+              <w:instrText xml:space="preserve"> PAGEREF _Toc225874332 \h </w:instrText>
+            </w:r>
+            <w:r>
+              <w:rPr>
+                <w:noProof/>
+                <w:webHidden/>
+              </w:rPr>
+            </w:r>
+            <w:r>
+              <w:rPr>
+                <w:noProof/>
+                <w:webHidden/>
+              </w:rPr>
+              <w:fldChar w:fldCharType="separate"/>
+            </w:r>
+            <w:r>
+              <w:rPr>
+                <w:noProof/>
+                <w:webHidden/>
+              </w:rPr>
+              <w:t>4</w:t>
+            </w:r>
+            <w:r>
+              <w:rPr>
+                <w:noProof/>
+                <w:webHidden/>
+              </w:rPr>
+              <w:fldChar w:fldCharType="end"/>
+            </w:r>
+          </w:hyperlink>
+        </w:p>
+        <w:p>
+          <w:pPr>
+            <w:pStyle w:val="TOC2"/>
+            <w:tabs>
+              <w:tab w:val="right" w:leader="dot" w:pos="9016"/>
+            </w:tabs>
+            <w:rPr>
+              <w:rFonts w:cstheme="minorBidi"/>
+              <w:noProof/>
+              <w:kern w:val="2"/>
+              <w:sz w:val="24"/>
+              <w:szCs w:val="24"/>
+              <w:lang w:val="en-GB" w:eastAsia="en-GB"/>
+              <w14:ligatures w14:val="standardContextual"/>
+            </w:rPr>
+          </w:pPr>
+          <w:hyperlink w:anchor="_Toc225874333" w:history="1">
+            <w:r>
+              <w:rPr>
+                <w:rStyle w:val="Hyperlink"/>
+                <w:noProof/>
+              </w:rPr>
+              <w:t>1.3.2 Research Objectives</w:t>
+            </w:r>
+            <w:r>
+              <w:rPr>
+                <w:noProof/>
+                <w:webHidden/>
+              </w:rPr>
+              <w:tab/>
+            </w:r>
+            <w:r>
+              <w:rPr>
+                <w:noProof/>
+                <w:webHidden/>
+              </w:rPr>
+              <w:fldChar w:fldCharType="begin"/>
+            </w:r>
+            <w:r>
+              <w:rPr>
+                <w:noProof/>
+                <w:webHidden/>
+              </w:rPr>
+              <w:instrText xml:space="preserve"> PAGEREF _Toc225874333 \h </w:instrText>
             </w:r>
             <w:r>
               <w:rPr>
@@ -971,7 +1045,7 @@
         <w:pStyle w:val="Heading1"/>
         <w:jc w:val="center"/>
       </w:pPr>
-      <w:bookmarkStart w:id="0" w:name="_Toc225874294"/>
+      <w:bookmarkStart w:id="0" w:name="_Toc225874326"/>
       <w:r>
         <w:t>Chapter 1</w:t>
       </w:r>
@@ -999,7 +1073,7 @@
           <w:u w:val="single"/>
         </w:rPr>
       </w:pPr>
-      <w:bookmarkStart w:id="1" w:name="_Toc225874295"/>
+      <w:bookmarkStart w:id="1" w:name="_Toc225874327"/>
       <w:r>
         <w:t>1.1</w:t>
       </w:r>
@@ -1044,14 +1118,14 @@
       <w:pPr>
         <w:pStyle w:val="Heading1"/>
       </w:pPr>
-      <w:bookmarkStart w:id="2" w:name="_Toc225874296"/>
+      <w:bookmarkStart w:id="2" w:name="_Toc225874328"/>
       <w:r>
         <w:t>1.2 Aims</w:t>
       </w:r>
       <w:bookmarkEnd w:id="2"/>
     </w:p>
     <w:p>
-      <w:bookmarkStart w:id="3" w:name="_Toc225874297"/>
+      <w:bookmarkStart w:id="3" w:name="_Toc225874329"/>
       <w:r>
         <w:rPr>
           <w:rStyle w:val="Heading2Char"/>
@@ -1095,7 +1169,7 @@
       <w:pPr>
         <w:pStyle w:val="Heading2"/>
       </w:pPr>
-      <w:bookmarkStart w:id="4" w:name="_Toc225874298"/>
+      <w:bookmarkStart w:id="4" w:name="_Toc225874330"/>
       <w:r>
         <w:t>1.2.2 Additional Aims</w:t>
       </w:r>
@@ -1164,7 +1238,7 @@
       <w:pPr>
         <w:pStyle w:val="Heading1"/>
       </w:pPr>
-      <w:bookmarkStart w:id="5" w:name="_Toc225874299"/>
+      <w:bookmarkStart w:id="5" w:name="_Toc225874331"/>
       <w:r>
         <w:t>1.3 Objectives</w:t>
       </w:r>
@@ -1174,7 +1248,7 @@
       <w:pPr>
         <w:pStyle w:val="Heading2"/>
       </w:pPr>
-      <w:bookmarkStart w:id="6" w:name="_Toc225874300"/>
+      <w:bookmarkStart w:id="6" w:name="_Toc225874332"/>
       <w:r>
         <w:t>1.3.1 Scope</w:t>
       </w:r>
@@ -1239,6 +1313,32 @@
       </w:pPr>
       <w:r>
         <w:t>A way to significantly amplify the weighting of the data fed into the machine learning model to ensure it learns more from the player than its original training, allowing responsive actions in subsequent games.</w:t>
+      </w:r>
+    </w:p>
+    <w:p>
+      <w:pPr>
+        <w:pStyle w:val="Heading2"/>
+      </w:pPr>
+      <w:bookmarkStart w:id="7" w:name="_Toc225874333"/>
+      <w:r>
+        <w:t>1.3.2 Research Objectives</w:t>
+      </w:r>
+      <w:bookmarkEnd w:id="7"/>
+    </w:p>
+    <w:p>
+      <w:r>
+        <w:t xml:space="preserve">For the research objectives for the game, research will be conducted into other types of media with similar features. This research will include a comparison of similar games and their features and the overall impact of those features on this project. This will be done to find a balance for the difficulty of the game and to evaluate the necessary </w:t>
+      </w:r>
+      <w:r>
+        <w:lastRenderedPageBreak/>
+        <w:t>features for the game. Some topics of features and mechanics that will be researched include: 4X &amp; Strategy Games, World Generation, Pathfinding and Event Handling. A significant amount of research will be done into various machine learning models, their strengths and weaknesses and how these can be integrated into my game.</w:t>
+      </w:r>
+      <w:r>
+        <w:br/>
+      </w:r>
+      <w:r>
+        <w:br/>
+        <w:t>Other areas of research that will be explored are core design principles for replayability and an interaction balance to not overwhelm the player with too many actions to make at any given time, as well as research into UI and UX design.</w:t>
       </w:r>
     </w:p>
     <w:sectPr>

</xml_diff>

<commit_message>
feat: Design objectives written
</commit_message>
<xml_diff>
--- a/Report.docx
+++ b/Report.docx
@@ -1331,7 +1331,19 @@
       </w:r>
       <w:r>
         <w:lastRenderedPageBreak/>
-        <w:t>features for the game. Some topics of features and mechanics that will be researched include: 4X &amp; Strategy Games, World Generation, Pathfinding and Event Handling. A significant amount of research will be done into various machine learning models, their strengths and weaknesses and how these can be integrated into my game.</w:t>
+        <w:t>features for the game. Some topics of features and mechanics that will be researched include: 4X &amp; Strategy Games, World Generation, Pathfinding</w:t>
+      </w:r>
+      <w:r>
+        <w:t>,</w:t>
+      </w:r>
+      <w:r>
+        <w:t xml:space="preserve"> Event Handling</w:t>
+      </w:r>
+      <w:r>
+        <w:t xml:space="preserve"> and AI integrations</w:t>
+      </w:r>
+      <w:r>
+        <w:t>. A significant amount of research will be done into various machine learning models, their strengths and weaknesses and how these can be integrated into my game.</w:t>
       </w:r>
       <w:r>
         <w:br/>
@@ -1339,6 +1351,115 @@
       <w:r>
         <w:br/>
         <w:t>Other areas of research that will be explored are core design principles for replayability and an interaction balance to not overwhelm the player with too many actions to make at any given time, as well as research into UI and UX design.</w:t>
+      </w:r>
+    </w:p>
+    <w:p>
+      <w:pPr>
+        <w:pStyle w:val="Heading2"/>
+      </w:pPr>
+      <w:r>
+        <w:t>1.3.3 Design Objectives</w:t>
+      </w:r>
+    </w:p>
+    <w:p>
+      <w:r>
+        <w:t xml:space="preserve">My design objectives will be focused around </w:t>
+      </w:r>
+      <w:r>
+        <w:t xml:space="preserve">creating a </w:t>
+      </w:r>
+      <w:r>
+        <w:t>4</w:t>
+      </w:r>
+      <w:r>
+        <w:t xml:space="preserve">X strategy </w:t>
+      </w:r>
+      <w:r>
+        <w:t>game that</w:t>
+      </w:r>
+      <w:r>
+        <w:t xml:space="preserve"> us</w:t>
+      </w:r>
+      <w:r>
+        <w:t>es</w:t>
+      </w:r>
+      <w:r>
+        <w:t xml:space="preserve"> a machine learning model to play against. The primary focus is to ensure that the game’s systems work together to produce balanced gameplay while also being unique each time. Given the competitive structure of the game, consisting of 7 matches played in a 1v1 style against the AI, the design will also account for short-term progression.</w:t>
+      </w:r>
+      <w:r>
+        <w:br/>
+      </w:r>
+      <w:r>
+        <w:br/>
+      </w:r>
+      <w:r>
+        <w:t>To achieve this, the following list has been created:</w:t>
+      </w:r>
+    </w:p>
+    <w:p>
+      <w:pPr>
+        <w:pStyle w:val="ListParagraph"/>
+        <w:numPr>
+          <w:ilvl w:val="0"/>
+          <w:numId w:val="5"/>
+        </w:numPr>
+      </w:pPr>
+      <w:r>
+        <w:t>Design and implement a procedural world generation system that creates strategically meaningful maps for each session, giving each player a roughly equal starting position</w:t>
+      </w:r>
+    </w:p>
+    <w:p>
+      <w:pPr>
+        <w:pStyle w:val="ListParagraph"/>
+        <w:numPr>
+          <w:ilvl w:val="0"/>
+          <w:numId w:val="5"/>
+        </w:numPr>
+      </w:pPr>
+      <w:r>
+        <w:t>Establish the gameplay loop of a typ</w:t>
+      </w:r>
+      <w:r>
+        <w:t>i</w:t>
+      </w:r>
+      <w:r>
+        <w:t>cal 4X game (explore, expand, exploit and exterminate)</w:t>
+      </w:r>
+    </w:p>
+    <w:p>
+      <w:pPr>
+        <w:pStyle w:val="ListParagraph"/>
+        <w:numPr>
+          <w:ilvl w:val="0"/>
+          <w:numId w:val="5"/>
+        </w:numPr>
+      </w:pPr>
+      <w:r>
+        <w:t>Establish a basic economy and resource system that supports each city</w:t>
+      </w:r>
+    </w:p>
+    <w:p>
+      <w:pPr>
+        <w:pStyle w:val="ListParagraph"/>
+        <w:numPr>
+          <w:ilvl w:val="0"/>
+          <w:numId w:val="5"/>
+        </w:numPr>
+      </w:pPr>
+      <w:r>
+        <w:t>Establish a consistent art style that provides clarity to the player</w:t>
+      </w:r>
+    </w:p>
+    <w:p>
+      <w:pPr>
+        <w:pStyle w:val="ListParagraph"/>
+        <w:numPr>
+          <w:ilvl w:val="0"/>
+          <w:numId w:val="5"/>
+        </w:numPr>
+      </w:pPr>
+      <w:r>
+        <w:t>Design the architecture to accommodate a machine learning opponent that can adapt over multiple sessions.</w:t>
       </w:r>
     </w:p>
     <w:sectPr>
@@ -1354,6 +1475,232 @@
 <file path=word/numbering.xml><?xml version="1.0" encoding="utf-8"?>
 <w:numbering xmlns:wpc="http://schemas.microsoft.com/office/word/2010/wordprocessingCanvas" xmlns:cx="http://schemas.microsoft.com/office/drawing/2014/chartex" xmlns:cx1="http://schemas.microsoft.com/office/drawing/2015/9/8/chartex" xmlns:cx2="http://schemas.microsoft.com/office/drawing/2015/10/21/chartex" xmlns:cx3="http://schemas.microsoft.com/office/drawing/2016/5/9/chartex" xmlns:cx4="http://schemas.microsoft.com/office/drawing/2016/5/10/chartex" xmlns:cx5="http://schemas.microsoft.com/office/drawing/2016/5/11/chartex" xmlns:cx6="http://schemas.microsoft.com/office/drawing/2016/5/12/chartex" xmlns:cx7="http://schemas.microsoft.com/office/drawing/2016/5/13/chartex" xmlns:cx8="http://schemas.microsoft.com/office/drawing/2016/5/14/chartex" xmlns:mc="http://schemas.openxmlformats.org/markup-compatibility/2006" xmlns:aink="http://schemas.microsoft.com/office/drawing/2016/ink" xmlns:am3d="http://schemas.microsoft.com/office/drawing/2017/model3d" xmlns:o="urn:schemas-microsoft-com:office:office" xmlns:oel="http://schemas.microsoft.com/office/2019/extlst" xmlns:r="http://schemas.openxmlformats.org/officeDocument/2006/relationships" xmlns:m="http://schemas.openxmlformats.org/officeDocument/2006/math" xmlns:v="urn:schemas-microsoft-com:vml" xmlns:wp14="http://schemas.microsoft.com/office/word/2010/wordprocessingDrawing" xmlns:wp="http://schemas.openxmlformats.org/drawingml/2006/wordprocessingDrawing" xmlns:w10="urn:schemas-microsoft-com:office:word" xmlns:w="http://schemas.openxmlformats.org/wordprocessingml/2006/main" xmlns:w14="http://schemas.microsoft.com/office/word/2010/wordml" xmlns:w15="http://schemas.microsoft.com/office/word/2012/wordml" xmlns:w16cex="http://schemas.microsoft.com/office/word/2018/wordml/cex" xmlns:w16cid="http://schemas.microsoft.com/office/word/2016/wordml/cid" xmlns:w16="http://schemas.microsoft.com/office/word/2018/wordml" xmlns:w16du="http://schemas.microsoft.com/office/word/2023/wordml/word16du" xmlns:w16sdtdh="http://schemas.microsoft.com/office/word/2020/wordml/sdtdatahash" xmlns:w16sdtfl="http://schemas.microsoft.com/office/word/2024/wordml/sdtformatlock" xmlns:w16se="http://schemas.microsoft.com/office/word/2015/wordml/symex" xmlns:wpg="http://schemas.microsoft.com/office/word/2010/wordprocessingGroup" xmlns:wpi="http://schemas.microsoft.com/office/word/2010/wordprocessingInk" xmlns:wne="http://schemas.microsoft.com/office/word/2006/wordml" xmlns:wps="http://schemas.microsoft.com/office/word/2010/wordprocessingShape" mc:Ignorable="w14 w15 w16se w16cid w16 w16cex w16sdtdh w16sdtfl w16du wp14">
   <w:abstractNum w:abstractNumId="0" w15:restartNumberingAfterBreak="0">
+    <w:nsid w:val="033D6E46"/>
+    <w:multiLevelType w:val="hybridMultilevel"/>
+    <w:tmpl w:val="A000AF00"/>
+    <w:lvl w:ilvl="0" w:tplc="08090001">
+      <w:start w:val="1"/>
+      <w:numFmt w:val="bullet"/>
+      <w:lvlText w:val=""/>
+      <w:lvlJc w:val="left"/>
+      <w:pPr>
+        <w:ind w:left="720" w:hanging="360"/>
+      </w:pPr>
+      <w:rPr>
+        <w:rFonts w:ascii="Symbol" w:hAnsi="Symbol" w:hint="default"/>
+      </w:rPr>
+    </w:lvl>
+    <w:lvl w:ilvl="1" w:tplc="08090003" w:tentative="1">
+      <w:start w:val="1"/>
+      <w:numFmt w:val="bullet"/>
+      <w:lvlText w:val="o"/>
+      <w:lvlJc w:val="left"/>
+      <w:pPr>
+        <w:ind w:left="1440" w:hanging="360"/>
+      </w:pPr>
+      <w:rPr>
+        <w:rFonts w:ascii="Courier New" w:hAnsi="Courier New" w:cs="Courier New" w:hint="default"/>
+      </w:rPr>
+    </w:lvl>
+    <w:lvl w:ilvl="2" w:tplc="08090005" w:tentative="1">
+      <w:start w:val="1"/>
+      <w:numFmt w:val="bullet"/>
+      <w:lvlText w:val=""/>
+      <w:lvlJc w:val="left"/>
+      <w:pPr>
+        <w:ind w:left="2160" w:hanging="360"/>
+      </w:pPr>
+      <w:rPr>
+        <w:rFonts w:ascii="Wingdings" w:hAnsi="Wingdings" w:hint="default"/>
+      </w:rPr>
+    </w:lvl>
+    <w:lvl w:ilvl="3" w:tplc="08090001" w:tentative="1">
+      <w:start w:val="1"/>
+      <w:numFmt w:val="bullet"/>
+      <w:lvlText w:val=""/>
+      <w:lvlJc w:val="left"/>
+      <w:pPr>
+        <w:ind w:left="2880" w:hanging="360"/>
+      </w:pPr>
+      <w:rPr>
+        <w:rFonts w:ascii="Symbol" w:hAnsi="Symbol" w:hint="default"/>
+      </w:rPr>
+    </w:lvl>
+    <w:lvl w:ilvl="4" w:tplc="08090003" w:tentative="1">
+      <w:start w:val="1"/>
+      <w:numFmt w:val="bullet"/>
+      <w:lvlText w:val="o"/>
+      <w:lvlJc w:val="left"/>
+      <w:pPr>
+        <w:ind w:left="3600" w:hanging="360"/>
+      </w:pPr>
+      <w:rPr>
+        <w:rFonts w:ascii="Courier New" w:hAnsi="Courier New" w:cs="Courier New" w:hint="default"/>
+      </w:rPr>
+    </w:lvl>
+    <w:lvl w:ilvl="5" w:tplc="08090005" w:tentative="1">
+      <w:start w:val="1"/>
+      <w:numFmt w:val="bullet"/>
+      <w:lvlText w:val=""/>
+      <w:lvlJc w:val="left"/>
+      <w:pPr>
+        <w:ind w:left="4320" w:hanging="360"/>
+      </w:pPr>
+      <w:rPr>
+        <w:rFonts w:ascii="Wingdings" w:hAnsi="Wingdings" w:hint="default"/>
+      </w:rPr>
+    </w:lvl>
+    <w:lvl w:ilvl="6" w:tplc="08090001" w:tentative="1">
+      <w:start w:val="1"/>
+      <w:numFmt w:val="bullet"/>
+      <w:lvlText w:val=""/>
+      <w:lvlJc w:val="left"/>
+      <w:pPr>
+        <w:ind w:left="5040" w:hanging="360"/>
+      </w:pPr>
+      <w:rPr>
+        <w:rFonts w:ascii="Symbol" w:hAnsi="Symbol" w:hint="default"/>
+      </w:rPr>
+    </w:lvl>
+    <w:lvl w:ilvl="7" w:tplc="08090003" w:tentative="1">
+      <w:start w:val="1"/>
+      <w:numFmt w:val="bullet"/>
+      <w:lvlText w:val="o"/>
+      <w:lvlJc w:val="left"/>
+      <w:pPr>
+        <w:ind w:left="5760" w:hanging="360"/>
+      </w:pPr>
+      <w:rPr>
+        <w:rFonts w:ascii="Courier New" w:hAnsi="Courier New" w:cs="Courier New" w:hint="default"/>
+      </w:rPr>
+    </w:lvl>
+    <w:lvl w:ilvl="8" w:tplc="08090005" w:tentative="1">
+      <w:start w:val="1"/>
+      <w:numFmt w:val="bullet"/>
+      <w:lvlText w:val=""/>
+      <w:lvlJc w:val="left"/>
+      <w:pPr>
+        <w:ind w:left="6480" w:hanging="360"/>
+      </w:pPr>
+      <w:rPr>
+        <w:rFonts w:ascii="Wingdings" w:hAnsi="Wingdings" w:hint="default"/>
+      </w:rPr>
+    </w:lvl>
+  </w:abstractNum>
+  <w:abstractNum w:abstractNumId="1" w15:restartNumberingAfterBreak="0">
+    <w:nsid w:val="1367016F"/>
+    <w:multiLevelType w:val="hybridMultilevel"/>
+    <w:tmpl w:val="5A12C168"/>
+    <w:lvl w:ilvl="0" w:tplc="08090001">
+      <w:start w:val="1"/>
+      <w:numFmt w:val="bullet"/>
+      <w:lvlText w:val=""/>
+      <w:lvlJc w:val="left"/>
+      <w:pPr>
+        <w:ind w:left="720" w:hanging="360"/>
+      </w:pPr>
+      <w:rPr>
+        <w:rFonts w:ascii="Symbol" w:hAnsi="Symbol" w:hint="default"/>
+      </w:rPr>
+    </w:lvl>
+    <w:lvl w:ilvl="1" w:tplc="08090003" w:tentative="1">
+      <w:start w:val="1"/>
+      <w:numFmt w:val="bullet"/>
+      <w:lvlText w:val="o"/>
+      <w:lvlJc w:val="left"/>
+      <w:pPr>
+        <w:ind w:left="1440" w:hanging="360"/>
+      </w:pPr>
+      <w:rPr>
+        <w:rFonts w:ascii="Courier New" w:hAnsi="Courier New" w:cs="Courier New" w:hint="default"/>
+      </w:rPr>
+    </w:lvl>
+    <w:lvl w:ilvl="2" w:tplc="08090005" w:tentative="1">
+      <w:start w:val="1"/>
+      <w:numFmt w:val="bullet"/>
+      <w:lvlText w:val=""/>
+      <w:lvlJc w:val="left"/>
+      <w:pPr>
+        <w:ind w:left="2160" w:hanging="360"/>
+      </w:pPr>
+      <w:rPr>
+        <w:rFonts w:ascii="Wingdings" w:hAnsi="Wingdings" w:hint="default"/>
+      </w:rPr>
+    </w:lvl>
+    <w:lvl w:ilvl="3" w:tplc="08090001" w:tentative="1">
+      <w:start w:val="1"/>
+      <w:numFmt w:val="bullet"/>
+      <w:lvlText w:val=""/>
+      <w:lvlJc w:val="left"/>
+      <w:pPr>
+        <w:ind w:left="2880" w:hanging="360"/>
+      </w:pPr>
+      <w:rPr>
+        <w:rFonts w:ascii="Symbol" w:hAnsi="Symbol" w:hint="default"/>
+      </w:rPr>
+    </w:lvl>
+    <w:lvl w:ilvl="4" w:tplc="08090003" w:tentative="1">
+      <w:start w:val="1"/>
+      <w:numFmt w:val="bullet"/>
+      <w:lvlText w:val="o"/>
+      <w:lvlJc w:val="left"/>
+      <w:pPr>
+        <w:ind w:left="3600" w:hanging="360"/>
+      </w:pPr>
+      <w:rPr>
+        <w:rFonts w:ascii="Courier New" w:hAnsi="Courier New" w:cs="Courier New" w:hint="default"/>
+      </w:rPr>
+    </w:lvl>
+    <w:lvl w:ilvl="5" w:tplc="08090005" w:tentative="1">
+      <w:start w:val="1"/>
+      <w:numFmt w:val="bullet"/>
+      <w:lvlText w:val=""/>
+      <w:lvlJc w:val="left"/>
+      <w:pPr>
+        <w:ind w:left="4320" w:hanging="360"/>
+      </w:pPr>
+      <w:rPr>
+        <w:rFonts w:ascii="Wingdings" w:hAnsi="Wingdings" w:hint="default"/>
+      </w:rPr>
+    </w:lvl>
+    <w:lvl w:ilvl="6" w:tplc="08090001" w:tentative="1">
+      <w:start w:val="1"/>
+      <w:numFmt w:val="bullet"/>
+      <w:lvlText w:val=""/>
+      <w:lvlJc w:val="left"/>
+      <w:pPr>
+        <w:ind w:left="5040" w:hanging="360"/>
+      </w:pPr>
+      <w:rPr>
+        <w:rFonts w:ascii="Symbol" w:hAnsi="Symbol" w:hint="default"/>
+      </w:rPr>
+    </w:lvl>
+    <w:lvl w:ilvl="7" w:tplc="08090003" w:tentative="1">
+      <w:start w:val="1"/>
+      <w:numFmt w:val="bullet"/>
+      <w:lvlText w:val="o"/>
+      <w:lvlJc w:val="left"/>
+      <w:pPr>
+        <w:ind w:left="5760" w:hanging="360"/>
+      </w:pPr>
+      <w:rPr>
+        <w:rFonts w:ascii="Courier New" w:hAnsi="Courier New" w:cs="Courier New" w:hint="default"/>
+      </w:rPr>
+    </w:lvl>
+    <w:lvl w:ilvl="8" w:tplc="08090005" w:tentative="1">
+      <w:start w:val="1"/>
+      <w:numFmt w:val="bullet"/>
+      <w:lvlText w:val=""/>
+      <w:lvlJc w:val="left"/>
+      <w:pPr>
+        <w:ind w:left="6480" w:hanging="360"/>
+      </w:pPr>
+      <w:rPr>
+        <w:rFonts w:ascii="Wingdings" w:hAnsi="Wingdings" w:hint="default"/>
+      </w:rPr>
+    </w:lvl>
+  </w:abstractNum>
+  <w:abstractNum w:abstractNumId="2" w15:restartNumberingAfterBreak="0">
     <w:nsid w:val="2AAA6573"/>
     <w:multiLevelType w:val="hybridMultilevel"/>
     <w:tmpl w:val="792ABFEC"/>
@@ -1466,7 +1813,7 @@
       </w:rPr>
     </w:lvl>
   </w:abstractNum>
-  <w:abstractNum w:abstractNumId="1" w15:restartNumberingAfterBreak="0">
+  <w:abstractNum w:abstractNumId="3" w15:restartNumberingAfterBreak="0">
     <w:nsid w:val="2CAE47EC"/>
     <w:multiLevelType w:val="hybridMultilevel"/>
     <w:tmpl w:val="B3C2CD1A"/>
@@ -1579,7 +1926,7 @@
       </w:rPr>
     </w:lvl>
   </w:abstractNum>
-  <w:abstractNum w:abstractNumId="2" w15:restartNumberingAfterBreak="0">
+  <w:abstractNum w:abstractNumId="4" w15:restartNumberingAfterBreak="0">
     <w:nsid w:val="6F4C07D3"/>
     <w:multiLevelType w:val="hybridMultilevel"/>
     <w:tmpl w:val="C00ADDF0"/>
@@ -1693,13 +2040,19 @@
     </w:lvl>
   </w:abstractNum>
   <w:num w:numId="1" w16cid:durableId="441345725">
-    <w:abstractNumId w:val="1"/>
+    <w:abstractNumId w:val="3"/>
   </w:num>
   <w:num w:numId="2" w16cid:durableId="800418358">
+    <w:abstractNumId w:val="4"/>
+  </w:num>
+  <w:num w:numId="3" w16cid:durableId="1302493766">
     <w:abstractNumId w:val="2"/>
   </w:num>
-  <w:num w:numId="3" w16cid:durableId="1302493766">
+  <w:num w:numId="4" w16cid:durableId="2046637229">
     <w:abstractNumId w:val="0"/>
+  </w:num>
+  <w:num w:numId="5" w16cid:durableId="384111173">
+    <w:abstractNumId w:val="1"/>
   </w:num>
 </w:numbering>
 </file>

</xml_diff>

<commit_message>
feat: Implementation Objectives written
</commit_message>
<xml_diff>
--- a/Report.docx
+++ b/Report.docx
@@ -300,7 +300,7 @@
           <w:r>
             <w:fldChar w:fldCharType="separate"/>
           </w:r>
-          <w:hyperlink w:anchor="_Toc225874326" w:history="1">
+          <w:hyperlink w:anchor="_Toc226039551" w:history="1">
             <w:r>
               <w:rPr>
                 <w:rStyle w:val="Hyperlink"/>
@@ -327,7 +327,7 @@
                 <w:noProof/>
                 <w:webHidden/>
               </w:rPr>
-              <w:instrText xml:space="preserve"> PAGEREF _Toc225874326 \h </w:instrText>
+              <w:instrText xml:space="preserve"> PAGEREF _Toc226039551 \h </w:instrText>
             </w:r>
             <w:r>
               <w:rPr>
@@ -374,7 +374,7 @@
               <w14:ligatures w14:val="standardContextual"/>
             </w:rPr>
           </w:pPr>
-          <w:hyperlink w:anchor="_Toc225874327" w:history="1">
+          <w:hyperlink w:anchor="_Toc226039552" w:history="1">
             <w:r>
               <w:rPr>
                 <w:rStyle w:val="Hyperlink"/>
@@ -401,7 +401,7 @@
                 <w:noProof/>
                 <w:webHidden/>
               </w:rPr>
-              <w:instrText xml:space="preserve"> PAGEREF _Toc225874327 \h </w:instrText>
+              <w:instrText xml:space="preserve"> PAGEREF _Toc226039552 \h </w:instrText>
             </w:r>
             <w:r>
               <w:rPr>
@@ -448,7 +448,7 @@
               <w14:ligatures w14:val="standardContextual"/>
             </w:rPr>
           </w:pPr>
-          <w:hyperlink w:anchor="_Toc225874328" w:history="1">
+          <w:hyperlink w:anchor="_Toc226039553" w:history="1">
             <w:r>
               <w:rPr>
                 <w:rStyle w:val="Hyperlink"/>
@@ -475,7 +475,7 @@
                 <w:noProof/>
                 <w:webHidden/>
               </w:rPr>
-              <w:instrText xml:space="preserve"> PAGEREF _Toc225874328 \h </w:instrText>
+              <w:instrText xml:space="preserve"> PAGEREF _Toc226039553 \h </w:instrText>
             </w:r>
             <w:r>
               <w:rPr>
@@ -522,7 +522,7 @@
               <w14:ligatures w14:val="standardContextual"/>
             </w:rPr>
           </w:pPr>
-          <w:hyperlink w:anchor="_Toc225874329" w:history="1">
+          <w:hyperlink w:anchor="_Toc226039554" w:history="1">
             <w:r>
               <w:rPr>
                 <w:rStyle w:val="Hyperlink"/>
@@ -549,7 +549,7 @@
                 <w:noProof/>
                 <w:webHidden/>
               </w:rPr>
-              <w:instrText xml:space="preserve"> PAGEREF _Toc225874329 \h </w:instrText>
+              <w:instrText xml:space="preserve"> PAGEREF _Toc226039554 \h </w:instrText>
             </w:r>
             <w:r>
               <w:rPr>
@@ -596,7 +596,7 @@
               <w14:ligatures w14:val="standardContextual"/>
             </w:rPr>
           </w:pPr>
-          <w:hyperlink w:anchor="_Toc225874330" w:history="1">
+          <w:hyperlink w:anchor="_Toc226039555" w:history="1">
             <w:r>
               <w:rPr>
                 <w:rStyle w:val="Hyperlink"/>
@@ -623,7 +623,7 @@
                 <w:noProof/>
                 <w:webHidden/>
               </w:rPr>
-              <w:instrText xml:space="preserve"> PAGEREF _Toc225874330 \h </w:instrText>
+              <w:instrText xml:space="preserve"> PAGEREF _Toc226039555 \h </w:instrText>
             </w:r>
             <w:r>
               <w:rPr>
@@ -670,7 +670,7 @@
               <w14:ligatures w14:val="standardContextual"/>
             </w:rPr>
           </w:pPr>
-          <w:hyperlink w:anchor="_Toc225874331" w:history="1">
+          <w:hyperlink w:anchor="_Toc226039556" w:history="1">
             <w:r>
               <w:rPr>
                 <w:rStyle w:val="Hyperlink"/>
@@ -697,7 +697,7 @@
                 <w:noProof/>
                 <w:webHidden/>
               </w:rPr>
-              <w:instrText xml:space="preserve"> PAGEREF _Toc225874331 \h </w:instrText>
+              <w:instrText xml:space="preserve"> PAGEREF _Toc226039556 \h </w:instrText>
             </w:r>
             <w:r>
               <w:rPr>
@@ -744,7 +744,7 @@
               <w14:ligatures w14:val="standardContextual"/>
             </w:rPr>
           </w:pPr>
-          <w:hyperlink w:anchor="_Toc225874332" w:history="1">
+          <w:hyperlink w:anchor="_Toc226039557" w:history="1">
             <w:r>
               <w:rPr>
                 <w:rStyle w:val="Hyperlink"/>
@@ -771,7 +771,7 @@
                 <w:noProof/>
                 <w:webHidden/>
               </w:rPr>
-              <w:instrText xml:space="preserve"> PAGEREF _Toc225874332 \h </w:instrText>
+              <w:instrText xml:space="preserve"> PAGEREF _Toc226039557 \h </w:instrText>
             </w:r>
             <w:r>
               <w:rPr>
@@ -818,7 +818,7 @@
               <w14:ligatures w14:val="standardContextual"/>
             </w:rPr>
           </w:pPr>
-          <w:hyperlink w:anchor="_Toc225874333" w:history="1">
+          <w:hyperlink w:anchor="_Toc226039558" w:history="1">
             <w:r>
               <w:rPr>
                 <w:rStyle w:val="Hyperlink"/>
@@ -845,7 +845,7 @@
                 <w:noProof/>
                 <w:webHidden/>
               </w:rPr>
-              <w:instrText xml:space="preserve"> PAGEREF _Toc225874333 \h </w:instrText>
+              <w:instrText xml:space="preserve"> PAGEREF _Toc226039558 \h </w:instrText>
             </w:r>
             <w:r>
               <w:rPr>
@@ -866,6 +866,154 @@
                 <w:webHidden/>
               </w:rPr>
               <w:t>4</w:t>
+            </w:r>
+            <w:r>
+              <w:rPr>
+                <w:noProof/>
+                <w:webHidden/>
+              </w:rPr>
+              <w:fldChar w:fldCharType="end"/>
+            </w:r>
+          </w:hyperlink>
+        </w:p>
+        <w:p>
+          <w:pPr>
+            <w:pStyle w:val="TOC2"/>
+            <w:tabs>
+              <w:tab w:val="right" w:leader="dot" w:pos="9016"/>
+            </w:tabs>
+            <w:rPr>
+              <w:rFonts w:cstheme="minorBidi"/>
+              <w:noProof/>
+              <w:kern w:val="2"/>
+              <w:sz w:val="24"/>
+              <w:szCs w:val="24"/>
+              <w:lang w:val="en-GB" w:eastAsia="en-GB"/>
+              <w14:ligatures w14:val="standardContextual"/>
+            </w:rPr>
+          </w:pPr>
+          <w:hyperlink w:anchor="_Toc226039559" w:history="1">
+            <w:r>
+              <w:rPr>
+                <w:rStyle w:val="Hyperlink"/>
+                <w:noProof/>
+              </w:rPr>
+              <w:t>1.3.3 Design Objectives</w:t>
+            </w:r>
+            <w:r>
+              <w:rPr>
+                <w:noProof/>
+                <w:webHidden/>
+              </w:rPr>
+              <w:tab/>
+            </w:r>
+            <w:r>
+              <w:rPr>
+                <w:noProof/>
+                <w:webHidden/>
+              </w:rPr>
+              <w:fldChar w:fldCharType="begin"/>
+            </w:r>
+            <w:r>
+              <w:rPr>
+                <w:noProof/>
+                <w:webHidden/>
+              </w:rPr>
+              <w:instrText xml:space="preserve"> PAGEREF _Toc226039559 \h </w:instrText>
+            </w:r>
+            <w:r>
+              <w:rPr>
+                <w:noProof/>
+                <w:webHidden/>
+              </w:rPr>
+            </w:r>
+            <w:r>
+              <w:rPr>
+                <w:noProof/>
+                <w:webHidden/>
+              </w:rPr>
+              <w:fldChar w:fldCharType="separate"/>
+            </w:r>
+            <w:r>
+              <w:rPr>
+                <w:noProof/>
+                <w:webHidden/>
+              </w:rPr>
+              <w:t>5</w:t>
+            </w:r>
+            <w:r>
+              <w:rPr>
+                <w:noProof/>
+                <w:webHidden/>
+              </w:rPr>
+              <w:fldChar w:fldCharType="end"/>
+            </w:r>
+          </w:hyperlink>
+        </w:p>
+        <w:p>
+          <w:pPr>
+            <w:pStyle w:val="TOC2"/>
+            <w:tabs>
+              <w:tab w:val="right" w:leader="dot" w:pos="9016"/>
+            </w:tabs>
+            <w:rPr>
+              <w:rFonts w:cstheme="minorBidi"/>
+              <w:noProof/>
+              <w:kern w:val="2"/>
+              <w:sz w:val="24"/>
+              <w:szCs w:val="24"/>
+              <w:lang w:val="en-GB" w:eastAsia="en-GB"/>
+              <w14:ligatures w14:val="standardContextual"/>
+            </w:rPr>
+          </w:pPr>
+          <w:hyperlink w:anchor="_Toc226039560" w:history="1">
+            <w:r>
+              <w:rPr>
+                <w:rStyle w:val="Hyperlink"/>
+                <w:noProof/>
+              </w:rPr>
+              <w:t>1.3.4 Implementation Objectives</w:t>
+            </w:r>
+            <w:r>
+              <w:rPr>
+                <w:noProof/>
+                <w:webHidden/>
+              </w:rPr>
+              <w:tab/>
+            </w:r>
+            <w:r>
+              <w:rPr>
+                <w:noProof/>
+                <w:webHidden/>
+              </w:rPr>
+              <w:fldChar w:fldCharType="begin"/>
+            </w:r>
+            <w:r>
+              <w:rPr>
+                <w:noProof/>
+                <w:webHidden/>
+              </w:rPr>
+              <w:instrText xml:space="preserve"> PAGEREF _Toc226039560 \h </w:instrText>
+            </w:r>
+            <w:r>
+              <w:rPr>
+                <w:noProof/>
+                <w:webHidden/>
+              </w:rPr>
+            </w:r>
+            <w:r>
+              <w:rPr>
+                <w:noProof/>
+                <w:webHidden/>
+              </w:rPr>
+              <w:fldChar w:fldCharType="separate"/>
+            </w:r>
+            <w:r>
+              <w:rPr>
+                <w:noProof/>
+                <w:webHidden/>
+              </w:rPr>
+              <w:t>5</w:t>
             </w:r>
             <w:r>
               <w:rPr>
@@ -1045,7 +1193,7 @@
         <w:pStyle w:val="Heading1"/>
         <w:jc w:val="center"/>
       </w:pPr>
-      <w:bookmarkStart w:id="0" w:name="_Toc225874326"/>
+      <w:bookmarkStart w:id="0" w:name="_Toc226039551"/>
       <w:r>
         <w:t>Chapter 1</w:t>
       </w:r>
@@ -1073,7 +1221,7 @@
           <w:u w:val="single"/>
         </w:rPr>
       </w:pPr>
-      <w:bookmarkStart w:id="1" w:name="_Toc225874327"/>
+      <w:bookmarkStart w:id="1" w:name="_Toc226039552"/>
       <w:r>
         <w:t>1.1</w:t>
       </w:r>
@@ -1118,14 +1266,14 @@
       <w:pPr>
         <w:pStyle w:val="Heading1"/>
       </w:pPr>
-      <w:bookmarkStart w:id="2" w:name="_Toc225874328"/>
+      <w:bookmarkStart w:id="2" w:name="_Toc226039553"/>
       <w:r>
         <w:t>1.2 Aims</w:t>
       </w:r>
       <w:bookmarkEnd w:id="2"/>
     </w:p>
     <w:p>
-      <w:bookmarkStart w:id="3" w:name="_Toc225874329"/>
+      <w:bookmarkStart w:id="3" w:name="_Toc226039554"/>
       <w:r>
         <w:rPr>
           <w:rStyle w:val="Heading2Char"/>
@@ -1137,7 +1285,11 @@
         <w:br/>
       </w:r>
       <w:r>
-        <w:t>The main aim for this project is to investigate and explore the usage of machine learning models for real time gaming uses</w:t>
+        <w:t xml:space="preserve">The main aim for this project is to investigate and explore the usage of machine learning </w:t>
+      </w:r>
+      <w:r>
+        <w:lastRenderedPageBreak/>
+        <w:t>models for real time gaming uses</w:t>
       </w:r>
       <w:r>
         <w:t>, primarily for opponent AI</w:t>
@@ -1152,7 +1304,6 @@
         <w:t xml:space="preserve"> play the game without the need for a significant </w:t>
       </w:r>
       <w:r>
-        <w:lastRenderedPageBreak/>
         <w:t>number</w:t>
       </w:r>
       <w:r>
@@ -1169,7 +1320,7 @@
       <w:pPr>
         <w:pStyle w:val="Heading2"/>
       </w:pPr>
-      <w:bookmarkStart w:id="4" w:name="_Toc225874330"/>
+      <w:bookmarkStart w:id="4" w:name="_Toc226039555"/>
       <w:r>
         <w:t>1.2.2 Additional Aims</w:t>
       </w:r>
@@ -1238,7 +1389,7 @@
       <w:pPr>
         <w:pStyle w:val="Heading1"/>
       </w:pPr>
-      <w:bookmarkStart w:id="5" w:name="_Toc225874331"/>
+      <w:bookmarkStart w:id="5" w:name="_Toc226039556"/>
       <w:r>
         <w:t>1.3 Objectives</w:t>
       </w:r>
@@ -1248,7 +1399,7 @@
       <w:pPr>
         <w:pStyle w:val="Heading2"/>
       </w:pPr>
-      <w:bookmarkStart w:id="6" w:name="_Toc225874332"/>
+      <w:bookmarkStart w:id="6" w:name="_Toc226039557"/>
       <w:r>
         <w:t>1.3.1 Scope</w:t>
       </w:r>
@@ -1256,15 +1407,7 @@
     </w:p>
     <w:p>
       <w:r>
-        <w:t xml:space="preserve">The objectives in terms of scope for this project are going to be generally quite broad and consist of specific milestones. The core objectives </w:t>
-      </w:r>
-      <w:proofErr w:type="gramStart"/>
-      <w:r>
-        <w:t>in regards to</w:t>
-      </w:r>
-      <w:proofErr w:type="gramEnd"/>
-      <w:r>
-        <w:t xml:space="preserve"> the scope are:</w:t>
+        <w:t>The objectives in terms of scope for this project are going to be generally quite broad and consist of specific milestones. The core objectives in regards to the scope are:</w:t>
       </w:r>
     </w:p>
     <w:p>
@@ -1319,7 +1462,7 @@
       <w:pPr>
         <w:pStyle w:val="Heading2"/>
       </w:pPr>
-      <w:bookmarkStart w:id="7" w:name="_Toc225874333"/>
+      <w:bookmarkStart w:id="7" w:name="_Toc226039558"/>
       <w:r>
         <w:t>1.3.2 Research Objectives</w:t>
       </w:r>
@@ -1327,11 +1470,11 @@
     </w:p>
     <w:p>
       <w:r>
-        <w:t xml:space="preserve">For the research objectives for the game, research will be conducted into other types of media with similar features. This research will include a comparison of similar games and their features and the overall impact of those features on this project. This will be done to find a balance for the difficulty of the game and to evaluate the necessary </w:t>
+        <w:t xml:space="preserve">For the research objectives for the game, research will be conducted into other types of media with similar features. This research will include a comparison of similar games </w:t>
       </w:r>
       <w:r>
         <w:lastRenderedPageBreak/>
-        <w:t>features for the game. Some topics of features and mechanics that will be researched include: 4X &amp; Strategy Games, World Generation, Pathfinding</w:t>
+        <w:t>and their features and the overall impact of those features on this project. This will be done to find a balance for the difficulty of the game and to evaluate the necessary features for the game. Some topics of features and mechanics that will be researched include: 4X &amp; Strategy Games, World Generation, Pathfinding</w:t>
       </w:r>
       <w:r>
         <w:t>,</w:t>
@@ -1357,9 +1500,11 @@
       <w:pPr>
         <w:pStyle w:val="Heading2"/>
       </w:pPr>
+      <w:bookmarkStart w:id="8" w:name="_Toc226039559"/>
       <w:r>
         <w:t>1.3.3 Design Objectives</w:t>
       </w:r>
+      <w:bookmarkEnd w:id="8"/>
     </w:p>
     <w:p>
       <w:r>
@@ -1460,6 +1605,126 @@
       </w:pPr>
       <w:r>
         <w:t>Design the architecture to accommodate a machine learning opponent that can adapt over multiple sessions.</w:t>
+      </w:r>
+    </w:p>
+    <w:p>
+      <w:pPr>
+        <w:pStyle w:val="ListParagraph"/>
+      </w:pPr>
+    </w:p>
+    <w:p>
+      <w:pPr>
+        <w:pStyle w:val="Heading2"/>
+      </w:pPr>
+      <w:bookmarkStart w:id="9" w:name="_Toc226039560"/>
+      <w:r>
+        <w:t>1.3.4 Implementation Objectives</w:t>
+      </w:r>
+      <w:bookmarkEnd w:id="9"/>
+    </w:p>
+    <w:p>
+      <w:r>
+        <w:t>The implementation chapter will be used to explain the development of the game, making the objectives for this project being:</w:t>
+      </w:r>
+    </w:p>
+    <w:p>
+      <w:pPr>
+        <w:pStyle w:val="ListParagraph"/>
+        <w:numPr>
+          <w:ilvl w:val="0"/>
+          <w:numId w:val="6"/>
+        </w:numPr>
+      </w:pPr>
+      <w:r>
+        <w:t>Create the world generation.</w:t>
+      </w:r>
+    </w:p>
+    <w:p>
+      <w:pPr>
+        <w:pStyle w:val="ListParagraph"/>
+        <w:numPr>
+          <w:ilvl w:val="0"/>
+          <w:numId w:val="6"/>
+        </w:numPr>
+      </w:pPr>
+      <w:r>
+        <w:t xml:space="preserve">Make the tile sprites. </w:t>
+      </w:r>
+    </w:p>
+    <w:p>
+      <w:pPr>
+        <w:pStyle w:val="ListParagraph"/>
+        <w:numPr>
+          <w:ilvl w:val="0"/>
+          <w:numId w:val="6"/>
+        </w:numPr>
+      </w:pPr>
+      <w:r>
+        <w:t>Create the pathfinding graph.</w:t>
+      </w:r>
+    </w:p>
+    <w:p>
+      <w:pPr>
+        <w:pStyle w:val="ListParagraph"/>
+        <w:numPr>
+          <w:ilvl w:val="0"/>
+          <w:numId w:val="6"/>
+        </w:numPr>
+      </w:pPr>
+      <w:r>
+        <w:t>Crea</w:t>
+      </w:r>
+      <w:r>
+        <w:t>te</w:t>
+      </w:r>
+      <w:r>
+        <w:t xml:space="preserve"> the unit types and cities.</w:t>
+      </w:r>
+    </w:p>
+    <w:p>
+      <w:pPr>
+        <w:pStyle w:val="ListParagraph"/>
+        <w:numPr>
+          <w:ilvl w:val="0"/>
+          <w:numId w:val="6"/>
+        </w:numPr>
+      </w:pPr>
+      <w:r>
+        <w:t>Mak</w:t>
+      </w:r>
+      <w:r>
+        <w:t>e</w:t>
+      </w:r>
+      <w:r>
+        <w:t xml:space="preserve"> the models for the unit types and cities</w:t>
+      </w:r>
+      <w:r>
+        <w:t>.</w:t>
+      </w:r>
+    </w:p>
+    <w:p>
+      <w:pPr>
+        <w:pStyle w:val="ListParagraph"/>
+        <w:numPr>
+          <w:ilvl w:val="0"/>
+          <w:numId w:val="6"/>
+        </w:numPr>
+      </w:pPr>
+      <w:r>
+        <w:lastRenderedPageBreak/>
+        <w:t>Create the machine learning model and integration into the game.</w:t>
+      </w:r>
+    </w:p>
+    <w:p>
+      <w:pPr>
+        <w:pStyle w:val="ListParagraph"/>
+        <w:numPr>
+          <w:ilvl w:val="0"/>
+          <w:numId w:val="6"/>
+        </w:numPr>
+      </w:pPr>
+      <w:r>
+        <w:t>Create the turn system, game evaluation system and the match-up system.</w:t>
       </w:r>
     </w:p>
     <w:sectPr>
@@ -1927,6 +2192,119 @@
     </w:lvl>
   </w:abstractNum>
   <w:abstractNum w:abstractNumId="4" w15:restartNumberingAfterBreak="0">
+    <w:nsid w:val="304C1E5E"/>
+    <w:multiLevelType w:val="hybridMultilevel"/>
+    <w:tmpl w:val="82AA2DDC"/>
+    <w:lvl w:ilvl="0" w:tplc="08090001">
+      <w:start w:val="1"/>
+      <w:numFmt w:val="bullet"/>
+      <w:lvlText w:val=""/>
+      <w:lvlJc w:val="left"/>
+      <w:pPr>
+        <w:ind w:left="720" w:hanging="360"/>
+      </w:pPr>
+      <w:rPr>
+        <w:rFonts w:ascii="Symbol" w:hAnsi="Symbol" w:hint="default"/>
+      </w:rPr>
+    </w:lvl>
+    <w:lvl w:ilvl="1" w:tplc="08090003" w:tentative="1">
+      <w:start w:val="1"/>
+      <w:numFmt w:val="bullet"/>
+      <w:lvlText w:val="o"/>
+      <w:lvlJc w:val="left"/>
+      <w:pPr>
+        <w:ind w:left="1440" w:hanging="360"/>
+      </w:pPr>
+      <w:rPr>
+        <w:rFonts w:ascii="Courier New" w:hAnsi="Courier New" w:cs="Courier New" w:hint="default"/>
+      </w:rPr>
+    </w:lvl>
+    <w:lvl w:ilvl="2" w:tplc="08090005" w:tentative="1">
+      <w:start w:val="1"/>
+      <w:numFmt w:val="bullet"/>
+      <w:lvlText w:val=""/>
+      <w:lvlJc w:val="left"/>
+      <w:pPr>
+        <w:ind w:left="2160" w:hanging="360"/>
+      </w:pPr>
+      <w:rPr>
+        <w:rFonts w:ascii="Wingdings" w:hAnsi="Wingdings" w:hint="default"/>
+      </w:rPr>
+    </w:lvl>
+    <w:lvl w:ilvl="3" w:tplc="08090001" w:tentative="1">
+      <w:start w:val="1"/>
+      <w:numFmt w:val="bullet"/>
+      <w:lvlText w:val=""/>
+      <w:lvlJc w:val="left"/>
+      <w:pPr>
+        <w:ind w:left="2880" w:hanging="360"/>
+      </w:pPr>
+      <w:rPr>
+        <w:rFonts w:ascii="Symbol" w:hAnsi="Symbol" w:hint="default"/>
+      </w:rPr>
+    </w:lvl>
+    <w:lvl w:ilvl="4" w:tplc="08090003" w:tentative="1">
+      <w:start w:val="1"/>
+      <w:numFmt w:val="bullet"/>
+      <w:lvlText w:val="o"/>
+      <w:lvlJc w:val="left"/>
+      <w:pPr>
+        <w:ind w:left="3600" w:hanging="360"/>
+      </w:pPr>
+      <w:rPr>
+        <w:rFonts w:ascii="Courier New" w:hAnsi="Courier New" w:cs="Courier New" w:hint="default"/>
+      </w:rPr>
+    </w:lvl>
+    <w:lvl w:ilvl="5" w:tplc="08090005" w:tentative="1">
+      <w:start w:val="1"/>
+      <w:numFmt w:val="bullet"/>
+      <w:lvlText w:val=""/>
+      <w:lvlJc w:val="left"/>
+      <w:pPr>
+        <w:ind w:left="4320" w:hanging="360"/>
+      </w:pPr>
+      <w:rPr>
+        <w:rFonts w:ascii="Wingdings" w:hAnsi="Wingdings" w:hint="default"/>
+      </w:rPr>
+    </w:lvl>
+    <w:lvl w:ilvl="6" w:tplc="08090001" w:tentative="1">
+      <w:start w:val="1"/>
+      <w:numFmt w:val="bullet"/>
+      <w:lvlText w:val=""/>
+      <w:lvlJc w:val="left"/>
+      <w:pPr>
+        <w:ind w:left="5040" w:hanging="360"/>
+      </w:pPr>
+      <w:rPr>
+        <w:rFonts w:ascii="Symbol" w:hAnsi="Symbol" w:hint="default"/>
+      </w:rPr>
+    </w:lvl>
+    <w:lvl w:ilvl="7" w:tplc="08090003" w:tentative="1">
+      <w:start w:val="1"/>
+      <w:numFmt w:val="bullet"/>
+      <w:lvlText w:val="o"/>
+      <w:lvlJc w:val="left"/>
+      <w:pPr>
+        <w:ind w:left="5760" w:hanging="360"/>
+      </w:pPr>
+      <w:rPr>
+        <w:rFonts w:ascii="Courier New" w:hAnsi="Courier New" w:cs="Courier New" w:hint="default"/>
+      </w:rPr>
+    </w:lvl>
+    <w:lvl w:ilvl="8" w:tplc="08090005" w:tentative="1">
+      <w:start w:val="1"/>
+      <w:numFmt w:val="bullet"/>
+      <w:lvlText w:val=""/>
+      <w:lvlJc w:val="left"/>
+      <w:pPr>
+        <w:ind w:left="6480" w:hanging="360"/>
+      </w:pPr>
+      <w:rPr>
+        <w:rFonts w:ascii="Wingdings" w:hAnsi="Wingdings" w:hint="default"/>
+      </w:rPr>
+    </w:lvl>
+  </w:abstractNum>
+  <w:abstractNum w:abstractNumId="5" w15:restartNumberingAfterBreak="0">
     <w:nsid w:val="6F4C07D3"/>
     <w:multiLevelType w:val="hybridMultilevel"/>
     <w:tmpl w:val="C00ADDF0"/>
@@ -2043,7 +2421,7 @@
     <w:abstractNumId w:val="3"/>
   </w:num>
   <w:num w:numId="2" w16cid:durableId="800418358">
-    <w:abstractNumId w:val="4"/>
+    <w:abstractNumId w:val="5"/>
   </w:num>
   <w:num w:numId="3" w16cid:durableId="1302493766">
     <w:abstractNumId w:val="2"/>
@@ -2053,6 +2431,9 @@
   </w:num>
   <w:num w:numId="5" w16cid:durableId="384111173">
     <w:abstractNumId w:val="1"/>
+  </w:num>
+  <w:num w:numId="6" w16cid:durableId="1119301822">
+    <w:abstractNumId w:val="4"/>
   </w:num>
 </w:numbering>
 </file>

</xml_diff>

<commit_message>
feat: results, evaluation and playtesting objectives written
</commit_message>
<xml_diff>
--- a/Report.docx
+++ b/Report.docx
@@ -300,7 +300,7 @@
           <w:r>
             <w:fldChar w:fldCharType="separate"/>
           </w:r>
-          <w:hyperlink w:anchor="_Toc226039551" w:history="1">
+          <w:hyperlink w:anchor="_Toc226040306" w:history="1">
             <w:r>
               <w:rPr>
                 <w:rStyle w:val="Hyperlink"/>
@@ -327,7 +327,7 @@
                 <w:noProof/>
                 <w:webHidden/>
               </w:rPr>
-              <w:instrText xml:space="preserve"> PAGEREF _Toc226039551 \h </w:instrText>
+              <w:instrText xml:space="preserve"> PAGEREF _Toc226040306 \h </w:instrText>
             </w:r>
             <w:r>
               <w:rPr>
@@ -374,7 +374,7 @@
               <w14:ligatures w14:val="standardContextual"/>
             </w:rPr>
           </w:pPr>
-          <w:hyperlink w:anchor="_Toc226039552" w:history="1">
+          <w:hyperlink w:anchor="_Toc226040307" w:history="1">
             <w:r>
               <w:rPr>
                 <w:rStyle w:val="Hyperlink"/>
@@ -401,7 +401,7 @@
                 <w:noProof/>
                 <w:webHidden/>
               </w:rPr>
-              <w:instrText xml:space="preserve"> PAGEREF _Toc226039552 \h </w:instrText>
+              <w:instrText xml:space="preserve"> PAGEREF _Toc226040307 \h </w:instrText>
             </w:r>
             <w:r>
               <w:rPr>
@@ -448,7 +448,7 @@
               <w14:ligatures w14:val="standardContextual"/>
             </w:rPr>
           </w:pPr>
-          <w:hyperlink w:anchor="_Toc226039553" w:history="1">
+          <w:hyperlink w:anchor="_Toc226040308" w:history="1">
             <w:r>
               <w:rPr>
                 <w:rStyle w:val="Hyperlink"/>
@@ -475,7 +475,7 @@
                 <w:noProof/>
                 <w:webHidden/>
               </w:rPr>
-              <w:instrText xml:space="preserve"> PAGEREF _Toc226039553 \h </w:instrText>
+              <w:instrText xml:space="preserve"> PAGEREF _Toc226040308 \h </w:instrText>
             </w:r>
             <w:r>
               <w:rPr>
@@ -495,7 +495,7 @@
                 <w:noProof/>
                 <w:webHidden/>
               </w:rPr>
-              <w:t>3</w:t>
+              <w:t>4</w:t>
             </w:r>
             <w:r>
               <w:rPr>
@@ -522,7 +522,7 @@
               <w14:ligatures w14:val="standardContextual"/>
             </w:rPr>
           </w:pPr>
-          <w:hyperlink w:anchor="_Toc226039554" w:history="1">
+          <w:hyperlink w:anchor="_Toc226040309" w:history="1">
             <w:r>
               <w:rPr>
                 <w:rStyle w:val="Hyperlink"/>
@@ -549,7 +549,7 @@
                 <w:noProof/>
                 <w:webHidden/>
               </w:rPr>
-              <w:instrText xml:space="preserve"> PAGEREF _Toc226039554 \h </w:instrText>
+              <w:instrText xml:space="preserve"> PAGEREF _Toc226040309 \h </w:instrText>
             </w:r>
             <w:r>
               <w:rPr>
@@ -569,7 +569,7 @@
                 <w:noProof/>
                 <w:webHidden/>
               </w:rPr>
-              <w:t>3</w:t>
+              <w:t>4</w:t>
             </w:r>
             <w:r>
               <w:rPr>
@@ -596,7 +596,7 @@
               <w14:ligatures w14:val="standardContextual"/>
             </w:rPr>
           </w:pPr>
-          <w:hyperlink w:anchor="_Toc226039555" w:history="1">
+          <w:hyperlink w:anchor="_Toc226040310" w:history="1">
             <w:r>
               <w:rPr>
                 <w:rStyle w:val="Hyperlink"/>
@@ -623,7 +623,7 @@
                 <w:noProof/>
                 <w:webHidden/>
               </w:rPr>
-              <w:instrText xml:space="preserve"> PAGEREF _Toc226039555 \h </w:instrText>
+              <w:instrText xml:space="preserve"> PAGEREF _Toc226040310 \h </w:instrText>
             </w:r>
             <w:r>
               <w:rPr>
@@ -670,7 +670,7 @@
               <w14:ligatures w14:val="standardContextual"/>
             </w:rPr>
           </w:pPr>
-          <w:hyperlink w:anchor="_Toc226039556" w:history="1">
+          <w:hyperlink w:anchor="_Toc226040311" w:history="1">
             <w:r>
               <w:rPr>
                 <w:rStyle w:val="Hyperlink"/>
@@ -697,7 +697,7 @@
                 <w:noProof/>
                 <w:webHidden/>
               </w:rPr>
-              <w:instrText xml:space="preserve"> PAGEREF _Toc226039556 \h </w:instrText>
+              <w:instrText xml:space="preserve"> PAGEREF _Toc226040311 \h </w:instrText>
             </w:r>
             <w:r>
               <w:rPr>
@@ -744,7 +744,7 @@
               <w14:ligatures w14:val="standardContextual"/>
             </w:rPr>
           </w:pPr>
-          <w:hyperlink w:anchor="_Toc226039557" w:history="1">
+          <w:hyperlink w:anchor="_Toc226040312" w:history="1">
             <w:r>
               <w:rPr>
                 <w:rStyle w:val="Hyperlink"/>
@@ -771,7 +771,7 @@
                 <w:noProof/>
                 <w:webHidden/>
               </w:rPr>
-              <w:instrText xml:space="preserve"> PAGEREF _Toc226039557 \h </w:instrText>
+              <w:instrText xml:space="preserve"> PAGEREF _Toc226040312 \h </w:instrText>
             </w:r>
             <w:r>
               <w:rPr>
@@ -818,7 +818,7 @@
               <w14:ligatures w14:val="standardContextual"/>
             </w:rPr>
           </w:pPr>
-          <w:hyperlink w:anchor="_Toc226039558" w:history="1">
+          <w:hyperlink w:anchor="_Toc226040313" w:history="1">
             <w:r>
               <w:rPr>
                 <w:rStyle w:val="Hyperlink"/>
@@ -845,7 +845,7 @@
                 <w:noProof/>
                 <w:webHidden/>
               </w:rPr>
-              <w:instrText xml:space="preserve"> PAGEREF _Toc226039558 \h </w:instrText>
+              <w:instrText xml:space="preserve"> PAGEREF _Toc226040313 \h </w:instrText>
             </w:r>
             <w:r>
               <w:rPr>
@@ -865,7 +865,7 @@
                 <w:noProof/>
                 <w:webHidden/>
               </w:rPr>
-              <w:t>4</w:t>
+              <w:t>5</w:t>
             </w:r>
             <w:r>
               <w:rPr>
@@ -892,7 +892,7 @@
               <w14:ligatures w14:val="standardContextual"/>
             </w:rPr>
           </w:pPr>
-          <w:hyperlink w:anchor="_Toc226039559" w:history="1">
+          <w:hyperlink w:anchor="_Toc226040314" w:history="1">
             <w:r>
               <w:rPr>
                 <w:rStyle w:val="Hyperlink"/>
@@ -919,7 +919,7 @@
                 <w:noProof/>
                 <w:webHidden/>
               </w:rPr>
-              <w:instrText xml:space="preserve"> PAGEREF _Toc226039559 \h </w:instrText>
+              <w:instrText xml:space="preserve"> PAGEREF _Toc226040314 \h </w:instrText>
             </w:r>
             <w:r>
               <w:rPr>
@@ -966,7 +966,7 @@
               <w14:ligatures w14:val="standardContextual"/>
             </w:rPr>
           </w:pPr>
-          <w:hyperlink w:anchor="_Toc226039560" w:history="1">
+          <w:hyperlink w:anchor="_Toc226040315" w:history="1">
             <w:r>
               <w:rPr>
                 <w:rStyle w:val="Hyperlink"/>
@@ -993,7 +993,7 @@
                 <w:noProof/>
                 <w:webHidden/>
               </w:rPr>
-              <w:instrText xml:space="preserve"> PAGEREF _Toc226039560 \h </w:instrText>
+              <w:instrText xml:space="preserve"> PAGEREF _Toc226040315 \h </w:instrText>
             </w:r>
             <w:r>
               <w:rPr>
@@ -1013,7 +1013,81 @@
                 <w:noProof/>
                 <w:webHidden/>
               </w:rPr>
-              <w:t>5</w:t>
+              <w:t>6</w:t>
+            </w:r>
+            <w:r>
+              <w:rPr>
+                <w:noProof/>
+                <w:webHidden/>
+              </w:rPr>
+              <w:fldChar w:fldCharType="end"/>
+            </w:r>
+          </w:hyperlink>
+        </w:p>
+        <w:p>
+          <w:pPr>
+            <w:pStyle w:val="TOC2"/>
+            <w:tabs>
+              <w:tab w:val="right" w:leader="dot" w:pos="9016"/>
+            </w:tabs>
+            <w:rPr>
+              <w:rFonts w:cstheme="minorBidi"/>
+              <w:noProof/>
+              <w:kern w:val="2"/>
+              <w:sz w:val="24"/>
+              <w:szCs w:val="24"/>
+              <w:lang w:val="en-GB" w:eastAsia="en-GB"/>
+              <w14:ligatures w14:val="standardContextual"/>
+            </w:rPr>
+          </w:pPr>
+          <w:hyperlink w:anchor="_Toc226040316" w:history="1">
+            <w:r>
+              <w:rPr>
+                <w:rStyle w:val="Hyperlink"/>
+                <w:noProof/>
+              </w:rPr>
+              <w:t>1.3.5 Results, Evaluation and Playtesting Objectives</w:t>
+            </w:r>
+            <w:r>
+              <w:rPr>
+                <w:noProof/>
+                <w:webHidden/>
+              </w:rPr>
+              <w:tab/>
+            </w:r>
+            <w:r>
+              <w:rPr>
+                <w:noProof/>
+                <w:webHidden/>
+              </w:rPr>
+              <w:fldChar w:fldCharType="begin"/>
+            </w:r>
+            <w:r>
+              <w:rPr>
+                <w:noProof/>
+                <w:webHidden/>
+              </w:rPr>
+              <w:instrText xml:space="preserve"> PAGEREF _Toc226040316 \h </w:instrText>
+            </w:r>
+            <w:r>
+              <w:rPr>
+                <w:noProof/>
+                <w:webHidden/>
+              </w:rPr>
+            </w:r>
+            <w:r>
+              <w:rPr>
+                <w:noProof/>
+                <w:webHidden/>
+              </w:rPr>
+              <w:fldChar w:fldCharType="separate"/>
+            </w:r>
+            <w:r>
+              <w:rPr>
+                <w:noProof/>
+                <w:webHidden/>
+              </w:rPr>
+              <w:t>6</w:t>
             </w:r>
             <w:r>
               <w:rPr>
@@ -1193,7 +1267,7 @@
         <w:pStyle w:val="Heading1"/>
         <w:jc w:val="center"/>
       </w:pPr>
-      <w:bookmarkStart w:id="0" w:name="_Toc226039551"/>
+      <w:bookmarkStart w:id="0" w:name="_Toc226040306"/>
       <w:r>
         <w:t>Chapter 1</w:t>
       </w:r>
@@ -1221,7 +1295,7 @@
           <w:u w:val="single"/>
         </w:rPr>
       </w:pPr>
-      <w:bookmarkStart w:id="1" w:name="_Toc226039552"/>
+      <w:bookmarkStart w:id="1" w:name="_Toc226040307"/>
       <w:r>
         <w:t>1.1</w:t>
       </w:r>
@@ -1266,14 +1340,15 @@
       <w:pPr>
         <w:pStyle w:val="Heading1"/>
       </w:pPr>
-      <w:bookmarkStart w:id="2" w:name="_Toc226039553"/>
-      <w:r>
+      <w:bookmarkStart w:id="2" w:name="_Toc226040308"/>
+      <w:r>
+        <w:lastRenderedPageBreak/>
         <w:t>1.2 Aims</w:t>
       </w:r>
       <w:bookmarkEnd w:id="2"/>
     </w:p>
     <w:p>
-      <w:bookmarkStart w:id="3" w:name="_Toc226039554"/>
+      <w:bookmarkStart w:id="3" w:name="_Toc226040309"/>
       <w:r>
         <w:rPr>
           <w:rStyle w:val="Heading2Char"/>
@@ -1285,11 +1360,7 @@
         <w:br/>
       </w:r>
       <w:r>
-        <w:t xml:space="preserve">The main aim for this project is to investigate and explore the usage of machine learning </w:t>
-      </w:r>
-      <w:r>
-        <w:lastRenderedPageBreak/>
-        <w:t>models for real time gaming uses</w:t>
+        <w:t>The main aim for this project is to investigate and explore the usage of machine learning models for real time gaming uses</w:t>
       </w:r>
       <w:r>
         <w:t>, primarily for opponent AI</w:t>
@@ -1320,7 +1391,7 @@
       <w:pPr>
         <w:pStyle w:val="Heading2"/>
       </w:pPr>
-      <w:bookmarkStart w:id="4" w:name="_Toc226039555"/>
+      <w:bookmarkStart w:id="4" w:name="_Toc226040310"/>
       <w:r>
         <w:t>1.2.2 Additional Aims</w:t>
       </w:r>
@@ -1389,7 +1460,7 @@
       <w:pPr>
         <w:pStyle w:val="Heading1"/>
       </w:pPr>
-      <w:bookmarkStart w:id="5" w:name="_Toc226039556"/>
+      <w:bookmarkStart w:id="5" w:name="_Toc226040311"/>
       <w:r>
         <w:t>1.3 Objectives</w:t>
       </w:r>
@@ -1399,7 +1470,7 @@
       <w:pPr>
         <w:pStyle w:val="Heading2"/>
       </w:pPr>
-      <w:bookmarkStart w:id="6" w:name="_Toc226039557"/>
+      <w:bookmarkStart w:id="6" w:name="_Toc226040312"/>
       <w:r>
         <w:t>1.3.1 Scope</w:t>
       </w:r>
@@ -1407,7 +1478,15 @@
     </w:p>
     <w:p>
       <w:r>
-        <w:t>The objectives in terms of scope for this project are going to be generally quite broad and consist of specific milestones. The core objectives in regards to the scope are:</w:t>
+        <w:t xml:space="preserve">The objectives in terms of scope for this project are going to be generally quite broad and consist of specific milestones. The core objectives </w:t>
+      </w:r>
+      <w:proofErr w:type="gramStart"/>
+      <w:r>
+        <w:t>in regards to</w:t>
+      </w:r>
+      <w:proofErr w:type="gramEnd"/>
+      <w:r>
+        <w:t xml:space="preserve"> the scope are:</w:t>
       </w:r>
     </w:p>
     <w:p>
@@ -1455,6 +1534,7 @@
         </w:numPr>
       </w:pPr>
       <w:r>
+        <w:lastRenderedPageBreak/>
         <w:t>A way to significantly amplify the weighting of the data fed into the machine learning model to ensure it learns more from the player than its original training, allowing responsive actions in subsequent games.</w:t>
       </w:r>
     </w:p>
@@ -1462,7 +1542,7 @@
       <w:pPr>
         <w:pStyle w:val="Heading2"/>
       </w:pPr>
-      <w:bookmarkStart w:id="7" w:name="_Toc226039558"/>
+      <w:bookmarkStart w:id="7" w:name="_Toc226040313"/>
       <w:r>
         <w:t>1.3.2 Research Objectives</w:t>
       </w:r>
@@ -1470,11 +1550,7 @@
     </w:p>
     <w:p>
       <w:r>
-        <w:t xml:space="preserve">For the research objectives for the game, research will be conducted into other types of media with similar features. This research will include a comparison of similar games </w:t>
-      </w:r>
-      <w:r>
-        <w:lastRenderedPageBreak/>
-        <w:t>and their features and the overall impact of those features on this project. This will be done to find a balance for the difficulty of the game and to evaluate the necessary features for the game. Some topics of features and mechanics that will be researched include: 4X &amp; Strategy Games, World Generation, Pathfinding</w:t>
+        <w:t>For the research objectives for the game, research will be conducted into other types of media with similar features. This research will include a comparison of similar games and their features and the overall impact of those features on this project. This will be done to find a balance for the difficulty of the game and to evaluate the necessary features for the game. Some topics of features and mechanics that will be researched include: 4X &amp; Strategy Games, World Generation, Pathfinding</w:t>
       </w:r>
       <w:r>
         <w:t>,</w:t>
@@ -1500,7 +1576,7 @@
       <w:pPr>
         <w:pStyle w:val="Heading2"/>
       </w:pPr>
-      <w:bookmarkStart w:id="8" w:name="_Toc226039559"/>
+      <w:bookmarkStart w:id="8" w:name="_Toc226040314"/>
       <w:r>
         <w:t>1.3.3 Design Objectives</w:t>
       </w:r>
@@ -1616,8 +1692,9 @@
       <w:pPr>
         <w:pStyle w:val="Heading2"/>
       </w:pPr>
-      <w:bookmarkStart w:id="9" w:name="_Toc226039560"/>
-      <w:r>
+      <w:bookmarkStart w:id="9" w:name="_Toc226040315"/>
+      <w:r>
+        <w:lastRenderedPageBreak/>
         <w:t>1.3.4 Implementation Objectives</w:t>
       </w:r>
       <w:bookmarkEnd w:id="9"/>
@@ -1711,7 +1788,6 @@
         </w:numPr>
       </w:pPr>
       <w:r>
-        <w:lastRenderedPageBreak/>
         <w:t>Create the machine learning model and integration into the game.</w:t>
       </w:r>
     </w:p>
@@ -1725,6 +1801,62 @@
       </w:pPr>
       <w:r>
         <w:t>Create the turn system, game evaluation system and the match-up system.</w:t>
+      </w:r>
+    </w:p>
+    <w:p>
+      <w:pPr>
+        <w:pStyle w:val="ListParagraph"/>
+      </w:pPr>
+    </w:p>
+    <w:p>
+      <w:pPr>
+        <w:pStyle w:val="Heading2"/>
+      </w:pPr>
+      <w:bookmarkStart w:id="10" w:name="_Toc226040316"/>
+      <w:r>
+        <w:t>1.3.5 Results, Evaluation and Playtesting Objectives</w:t>
+      </w:r>
+      <w:bookmarkEnd w:id="10"/>
+    </w:p>
+    <w:p>
+      <w:r>
+        <w:t>These objectives will be used to collect data and evaluate if the objectives mentioned above were satisfied. Therefore, the objectives are:</w:t>
+      </w:r>
+    </w:p>
+    <w:p>
+      <w:pPr>
+        <w:pStyle w:val="ListParagraph"/>
+        <w:numPr>
+          <w:ilvl w:val="0"/>
+          <w:numId w:val="7"/>
+        </w:numPr>
+      </w:pPr>
+      <w:r>
+        <w:t>Make a survey that asks questions about satisfying the above objectives.</w:t>
+      </w:r>
+    </w:p>
+    <w:p>
+      <w:pPr>
+        <w:pStyle w:val="ListParagraph"/>
+        <w:numPr>
+          <w:ilvl w:val="0"/>
+          <w:numId w:val="7"/>
+        </w:numPr>
+      </w:pPr>
+      <w:r>
+        <w:t>Evaluate the final product</w:t>
+      </w:r>
+    </w:p>
+    <w:p>
+      <w:pPr>
+        <w:pStyle w:val="ListParagraph"/>
+        <w:numPr>
+          <w:ilvl w:val="0"/>
+          <w:numId w:val="7"/>
+        </w:numPr>
+      </w:pPr>
+      <w:r>
+        <w:t>Evaluate the initial aims and if they have been hit.</w:t>
       </w:r>
     </w:p>
     <w:sectPr>
@@ -1740,6 +1872,119 @@
 <file path=word/numbering.xml><?xml version="1.0" encoding="utf-8"?>
 <w:numbering xmlns:wpc="http://schemas.microsoft.com/office/word/2010/wordprocessingCanvas" xmlns:cx="http://schemas.microsoft.com/office/drawing/2014/chartex" xmlns:cx1="http://schemas.microsoft.com/office/drawing/2015/9/8/chartex" xmlns:cx2="http://schemas.microsoft.com/office/drawing/2015/10/21/chartex" xmlns:cx3="http://schemas.microsoft.com/office/drawing/2016/5/9/chartex" xmlns:cx4="http://schemas.microsoft.com/office/drawing/2016/5/10/chartex" xmlns:cx5="http://schemas.microsoft.com/office/drawing/2016/5/11/chartex" xmlns:cx6="http://schemas.microsoft.com/office/drawing/2016/5/12/chartex" xmlns:cx7="http://schemas.microsoft.com/office/drawing/2016/5/13/chartex" xmlns:cx8="http://schemas.microsoft.com/office/drawing/2016/5/14/chartex" xmlns:mc="http://schemas.openxmlformats.org/markup-compatibility/2006" xmlns:aink="http://schemas.microsoft.com/office/drawing/2016/ink" xmlns:am3d="http://schemas.microsoft.com/office/drawing/2017/model3d" xmlns:o="urn:schemas-microsoft-com:office:office" xmlns:oel="http://schemas.microsoft.com/office/2019/extlst" xmlns:r="http://schemas.openxmlformats.org/officeDocument/2006/relationships" xmlns:m="http://schemas.openxmlformats.org/officeDocument/2006/math" xmlns:v="urn:schemas-microsoft-com:vml" xmlns:wp14="http://schemas.microsoft.com/office/word/2010/wordprocessingDrawing" xmlns:wp="http://schemas.openxmlformats.org/drawingml/2006/wordprocessingDrawing" xmlns:w10="urn:schemas-microsoft-com:office:word" xmlns:w="http://schemas.openxmlformats.org/wordprocessingml/2006/main" xmlns:w14="http://schemas.microsoft.com/office/word/2010/wordml" xmlns:w15="http://schemas.microsoft.com/office/word/2012/wordml" xmlns:w16cex="http://schemas.microsoft.com/office/word/2018/wordml/cex" xmlns:w16cid="http://schemas.microsoft.com/office/word/2016/wordml/cid" xmlns:w16="http://schemas.microsoft.com/office/word/2018/wordml" xmlns:w16du="http://schemas.microsoft.com/office/word/2023/wordml/word16du" xmlns:w16sdtdh="http://schemas.microsoft.com/office/word/2020/wordml/sdtdatahash" xmlns:w16sdtfl="http://schemas.microsoft.com/office/word/2024/wordml/sdtformatlock" xmlns:w16se="http://schemas.microsoft.com/office/word/2015/wordml/symex" xmlns:wpg="http://schemas.microsoft.com/office/word/2010/wordprocessingGroup" xmlns:wpi="http://schemas.microsoft.com/office/word/2010/wordprocessingInk" xmlns:wne="http://schemas.microsoft.com/office/word/2006/wordml" xmlns:wps="http://schemas.microsoft.com/office/word/2010/wordprocessingShape" mc:Ignorable="w14 w15 w16se w16cid w16 w16cex w16sdtdh w16sdtfl w16du wp14">
   <w:abstractNum w:abstractNumId="0" w15:restartNumberingAfterBreak="0">
+    <w:nsid w:val="01A40F09"/>
+    <w:multiLevelType w:val="hybridMultilevel"/>
+    <w:tmpl w:val="DBD076CE"/>
+    <w:lvl w:ilvl="0" w:tplc="08090001">
+      <w:start w:val="1"/>
+      <w:numFmt w:val="bullet"/>
+      <w:lvlText w:val=""/>
+      <w:lvlJc w:val="left"/>
+      <w:pPr>
+        <w:ind w:left="720" w:hanging="360"/>
+      </w:pPr>
+      <w:rPr>
+        <w:rFonts w:ascii="Symbol" w:hAnsi="Symbol" w:hint="default"/>
+      </w:rPr>
+    </w:lvl>
+    <w:lvl w:ilvl="1" w:tplc="08090003" w:tentative="1">
+      <w:start w:val="1"/>
+      <w:numFmt w:val="bullet"/>
+      <w:lvlText w:val="o"/>
+      <w:lvlJc w:val="left"/>
+      <w:pPr>
+        <w:ind w:left="1440" w:hanging="360"/>
+      </w:pPr>
+      <w:rPr>
+        <w:rFonts w:ascii="Courier New" w:hAnsi="Courier New" w:cs="Courier New" w:hint="default"/>
+      </w:rPr>
+    </w:lvl>
+    <w:lvl w:ilvl="2" w:tplc="08090005" w:tentative="1">
+      <w:start w:val="1"/>
+      <w:numFmt w:val="bullet"/>
+      <w:lvlText w:val=""/>
+      <w:lvlJc w:val="left"/>
+      <w:pPr>
+        <w:ind w:left="2160" w:hanging="360"/>
+      </w:pPr>
+      <w:rPr>
+        <w:rFonts w:ascii="Wingdings" w:hAnsi="Wingdings" w:hint="default"/>
+      </w:rPr>
+    </w:lvl>
+    <w:lvl w:ilvl="3" w:tplc="08090001" w:tentative="1">
+      <w:start w:val="1"/>
+      <w:numFmt w:val="bullet"/>
+      <w:lvlText w:val=""/>
+      <w:lvlJc w:val="left"/>
+      <w:pPr>
+        <w:ind w:left="2880" w:hanging="360"/>
+      </w:pPr>
+      <w:rPr>
+        <w:rFonts w:ascii="Symbol" w:hAnsi="Symbol" w:hint="default"/>
+      </w:rPr>
+    </w:lvl>
+    <w:lvl w:ilvl="4" w:tplc="08090003" w:tentative="1">
+      <w:start w:val="1"/>
+      <w:numFmt w:val="bullet"/>
+      <w:lvlText w:val="o"/>
+      <w:lvlJc w:val="left"/>
+      <w:pPr>
+        <w:ind w:left="3600" w:hanging="360"/>
+      </w:pPr>
+      <w:rPr>
+        <w:rFonts w:ascii="Courier New" w:hAnsi="Courier New" w:cs="Courier New" w:hint="default"/>
+      </w:rPr>
+    </w:lvl>
+    <w:lvl w:ilvl="5" w:tplc="08090005" w:tentative="1">
+      <w:start w:val="1"/>
+      <w:numFmt w:val="bullet"/>
+      <w:lvlText w:val=""/>
+      <w:lvlJc w:val="left"/>
+      <w:pPr>
+        <w:ind w:left="4320" w:hanging="360"/>
+      </w:pPr>
+      <w:rPr>
+        <w:rFonts w:ascii="Wingdings" w:hAnsi="Wingdings" w:hint="default"/>
+      </w:rPr>
+    </w:lvl>
+    <w:lvl w:ilvl="6" w:tplc="08090001" w:tentative="1">
+      <w:start w:val="1"/>
+      <w:numFmt w:val="bullet"/>
+      <w:lvlText w:val=""/>
+      <w:lvlJc w:val="left"/>
+      <w:pPr>
+        <w:ind w:left="5040" w:hanging="360"/>
+      </w:pPr>
+      <w:rPr>
+        <w:rFonts w:ascii="Symbol" w:hAnsi="Symbol" w:hint="default"/>
+      </w:rPr>
+    </w:lvl>
+    <w:lvl w:ilvl="7" w:tplc="08090003" w:tentative="1">
+      <w:start w:val="1"/>
+      <w:numFmt w:val="bullet"/>
+      <w:lvlText w:val="o"/>
+      <w:lvlJc w:val="left"/>
+      <w:pPr>
+        <w:ind w:left="5760" w:hanging="360"/>
+      </w:pPr>
+      <w:rPr>
+        <w:rFonts w:ascii="Courier New" w:hAnsi="Courier New" w:cs="Courier New" w:hint="default"/>
+      </w:rPr>
+    </w:lvl>
+    <w:lvl w:ilvl="8" w:tplc="08090005" w:tentative="1">
+      <w:start w:val="1"/>
+      <w:numFmt w:val="bullet"/>
+      <w:lvlText w:val=""/>
+      <w:lvlJc w:val="left"/>
+      <w:pPr>
+        <w:ind w:left="6480" w:hanging="360"/>
+      </w:pPr>
+      <w:rPr>
+        <w:rFonts w:ascii="Wingdings" w:hAnsi="Wingdings" w:hint="default"/>
+      </w:rPr>
+    </w:lvl>
+  </w:abstractNum>
+  <w:abstractNum w:abstractNumId="1" w15:restartNumberingAfterBreak="0">
     <w:nsid w:val="033D6E46"/>
     <w:multiLevelType w:val="hybridMultilevel"/>
     <w:tmpl w:val="A000AF00"/>
@@ -1852,7 +2097,7 @@
       </w:rPr>
     </w:lvl>
   </w:abstractNum>
-  <w:abstractNum w:abstractNumId="1" w15:restartNumberingAfterBreak="0">
+  <w:abstractNum w:abstractNumId="2" w15:restartNumberingAfterBreak="0">
     <w:nsid w:val="1367016F"/>
     <w:multiLevelType w:val="hybridMultilevel"/>
     <w:tmpl w:val="5A12C168"/>
@@ -1965,7 +2210,7 @@
       </w:rPr>
     </w:lvl>
   </w:abstractNum>
-  <w:abstractNum w:abstractNumId="2" w15:restartNumberingAfterBreak="0">
+  <w:abstractNum w:abstractNumId="3" w15:restartNumberingAfterBreak="0">
     <w:nsid w:val="2AAA6573"/>
     <w:multiLevelType w:val="hybridMultilevel"/>
     <w:tmpl w:val="792ABFEC"/>
@@ -2078,7 +2323,7 @@
       </w:rPr>
     </w:lvl>
   </w:abstractNum>
-  <w:abstractNum w:abstractNumId="3" w15:restartNumberingAfterBreak="0">
+  <w:abstractNum w:abstractNumId="4" w15:restartNumberingAfterBreak="0">
     <w:nsid w:val="2CAE47EC"/>
     <w:multiLevelType w:val="hybridMultilevel"/>
     <w:tmpl w:val="B3C2CD1A"/>
@@ -2191,7 +2436,7 @@
       </w:rPr>
     </w:lvl>
   </w:abstractNum>
-  <w:abstractNum w:abstractNumId="4" w15:restartNumberingAfterBreak="0">
+  <w:abstractNum w:abstractNumId="5" w15:restartNumberingAfterBreak="0">
     <w:nsid w:val="304C1E5E"/>
     <w:multiLevelType w:val="hybridMultilevel"/>
     <w:tmpl w:val="82AA2DDC"/>
@@ -2304,7 +2549,7 @@
       </w:rPr>
     </w:lvl>
   </w:abstractNum>
-  <w:abstractNum w:abstractNumId="5" w15:restartNumberingAfterBreak="0">
+  <w:abstractNum w:abstractNumId="6" w15:restartNumberingAfterBreak="0">
     <w:nsid w:val="6F4C07D3"/>
     <w:multiLevelType w:val="hybridMultilevel"/>
     <w:tmpl w:val="C00ADDF0"/>
@@ -2418,22 +2663,25 @@
     </w:lvl>
   </w:abstractNum>
   <w:num w:numId="1" w16cid:durableId="441345725">
+    <w:abstractNumId w:val="4"/>
+  </w:num>
+  <w:num w:numId="2" w16cid:durableId="800418358">
+    <w:abstractNumId w:val="6"/>
+  </w:num>
+  <w:num w:numId="3" w16cid:durableId="1302493766">
     <w:abstractNumId w:val="3"/>
   </w:num>
-  <w:num w:numId="2" w16cid:durableId="800418358">
+  <w:num w:numId="4" w16cid:durableId="2046637229">
+    <w:abstractNumId w:val="1"/>
+  </w:num>
+  <w:num w:numId="5" w16cid:durableId="384111173">
+    <w:abstractNumId w:val="2"/>
+  </w:num>
+  <w:num w:numId="6" w16cid:durableId="1119301822">
     <w:abstractNumId w:val="5"/>
   </w:num>
-  <w:num w:numId="3" w16cid:durableId="1302493766">
-    <w:abstractNumId w:val="2"/>
-  </w:num>
-  <w:num w:numId="4" w16cid:durableId="2046637229">
+  <w:num w:numId="7" w16cid:durableId="1732995949">
     <w:abstractNumId w:val="0"/>
-  </w:num>
-  <w:num w:numId="5" w16cid:durableId="384111173">
-    <w:abstractNumId w:val="1"/>
-  </w:num>
-  <w:num w:numId="6" w16cid:durableId="1119301822">
-    <w:abstractNumId w:val="4"/>
   </w:num>
 </w:numbering>
 </file>

</xml_diff>

<commit_message>
feat: wrote lit survey intro
</commit_message>
<xml_diff>
--- a/Report.docx
+++ b/Report.docx
@@ -300,7 +300,7 @@
           <w:r>
             <w:fldChar w:fldCharType="separate"/>
           </w:r>
-          <w:hyperlink w:anchor="_Toc226040306" w:history="1">
+          <w:hyperlink w:anchor="_Toc226286515" w:history="1">
             <w:r>
               <w:rPr>
                 <w:rStyle w:val="Hyperlink"/>
@@ -327,7 +327,7 @@
                 <w:noProof/>
                 <w:webHidden/>
               </w:rPr>
-              <w:instrText xml:space="preserve"> PAGEREF _Toc226040306 \h </w:instrText>
+              <w:instrText xml:space="preserve"> PAGEREF _Toc226286515 \h </w:instrText>
             </w:r>
             <w:r>
               <w:rPr>
@@ -374,7 +374,7 @@
               <w14:ligatures w14:val="standardContextual"/>
             </w:rPr>
           </w:pPr>
-          <w:hyperlink w:anchor="_Toc226040307" w:history="1">
+          <w:hyperlink w:anchor="_Toc226286516" w:history="1">
             <w:r>
               <w:rPr>
                 <w:rStyle w:val="Hyperlink"/>
@@ -401,7 +401,7 @@
                 <w:noProof/>
                 <w:webHidden/>
               </w:rPr>
-              <w:instrText xml:space="preserve"> PAGEREF _Toc226040307 \h </w:instrText>
+              <w:instrText xml:space="preserve"> PAGEREF _Toc226286516 \h </w:instrText>
             </w:r>
             <w:r>
               <w:rPr>
@@ -448,7 +448,7 @@
               <w14:ligatures w14:val="standardContextual"/>
             </w:rPr>
           </w:pPr>
-          <w:hyperlink w:anchor="_Toc226040308" w:history="1">
+          <w:hyperlink w:anchor="_Toc226286517" w:history="1">
             <w:r>
               <w:rPr>
                 <w:rStyle w:val="Hyperlink"/>
@@ -475,7 +475,7 @@
                 <w:noProof/>
                 <w:webHidden/>
               </w:rPr>
-              <w:instrText xml:space="preserve"> PAGEREF _Toc226040308 \h </w:instrText>
+              <w:instrText xml:space="preserve"> PAGEREF _Toc226286517 \h </w:instrText>
             </w:r>
             <w:r>
               <w:rPr>
@@ -522,7 +522,7 @@
               <w14:ligatures w14:val="standardContextual"/>
             </w:rPr>
           </w:pPr>
-          <w:hyperlink w:anchor="_Toc226040309" w:history="1">
+          <w:hyperlink w:anchor="_Toc226286518" w:history="1">
             <w:r>
               <w:rPr>
                 <w:rStyle w:val="Hyperlink"/>
@@ -549,7 +549,7 @@
                 <w:noProof/>
                 <w:webHidden/>
               </w:rPr>
-              <w:instrText xml:space="preserve"> PAGEREF _Toc226040309 \h </w:instrText>
+              <w:instrText xml:space="preserve"> PAGEREF _Toc226286518 \h </w:instrText>
             </w:r>
             <w:r>
               <w:rPr>
@@ -596,7 +596,7 @@
               <w14:ligatures w14:val="standardContextual"/>
             </w:rPr>
           </w:pPr>
-          <w:hyperlink w:anchor="_Toc226040310" w:history="1">
+          <w:hyperlink w:anchor="_Toc226286519" w:history="1">
             <w:r>
               <w:rPr>
                 <w:rStyle w:val="Hyperlink"/>
@@ -623,7 +623,7 @@
                 <w:noProof/>
                 <w:webHidden/>
               </w:rPr>
-              <w:instrText xml:space="preserve"> PAGEREF _Toc226040310 \h </w:instrText>
+              <w:instrText xml:space="preserve"> PAGEREF _Toc226286519 \h </w:instrText>
             </w:r>
             <w:r>
               <w:rPr>
@@ -670,7 +670,7 @@
               <w14:ligatures w14:val="standardContextual"/>
             </w:rPr>
           </w:pPr>
-          <w:hyperlink w:anchor="_Toc226040311" w:history="1">
+          <w:hyperlink w:anchor="_Toc226286520" w:history="1">
             <w:r>
               <w:rPr>
                 <w:rStyle w:val="Hyperlink"/>
@@ -697,7 +697,7 @@
                 <w:noProof/>
                 <w:webHidden/>
               </w:rPr>
-              <w:instrText xml:space="preserve"> PAGEREF _Toc226040311 \h </w:instrText>
+              <w:instrText xml:space="preserve"> PAGEREF _Toc226286520 \h </w:instrText>
             </w:r>
             <w:r>
               <w:rPr>
@@ -744,7 +744,7 @@
               <w14:ligatures w14:val="standardContextual"/>
             </w:rPr>
           </w:pPr>
-          <w:hyperlink w:anchor="_Toc226040312" w:history="1">
+          <w:hyperlink w:anchor="_Toc226286521" w:history="1">
             <w:r>
               <w:rPr>
                 <w:rStyle w:val="Hyperlink"/>
@@ -771,7 +771,7 @@
                 <w:noProof/>
                 <w:webHidden/>
               </w:rPr>
-              <w:instrText xml:space="preserve"> PAGEREF _Toc226040312 \h </w:instrText>
+              <w:instrText xml:space="preserve"> PAGEREF _Toc226286521 \h </w:instrText>
             </w:r>
             <w:r>
               <w:rPr>
@@ -818,7 +818,7 @@
               <w14:ligatures w14:val="standardContextual"/>
             </w:rPr>
           </w:pPr>
-          <w:hyperlink w:anchor="_Toc226040313" w:history="1">
+          <w:hyperlink w:anchor="_Toc226286522" w:history="1">
             <w:r>
               <w:rPr>
                 <w:rStyle w:val="Hyperlink"/>
@@ -845,7 +845,7 @@
                 <w:noProof/>
                 <w:webHidden/>
               </w:rPr>
-              <w:instrText xml:space="preserve"> PAGEREF _Toc226040313 \h </w:instrText>
+              <w:instrText xml:space="preserve"> PAGEREF _Toc226286522 \h </w:instrText>
             </w:r>
             <w:r>
               <w:rPr>
@@ -892,7 +892,7 @@
               <w14:ligatures w14:val="standardContextual"/>
             </w:rPr>
           </w:pPr>
-          <w:hyperlink w:anchor="_Toc226040314" w:history="1">
+          <w:hyperlink w:anchor="_Toc226286523" w:history="1">
             <w:r>
               <w:rPr>
                 <w:rStyle w:val="Hyperlink"/>
@@ -919,7 +919,7 @@
                 <w:noProof/>
                 <w:webHidden/>
               </w:rPr>
-              <w:instrText xml:space="preserve"> PAGEREF _Toc226040314 \h </w:instrText>
+              <w:instrText xml:space="preserve"> PAGEREF _Toc226286523 \h </w:instrText>
             </w:r>
             <w:r>
               <w:rPr>
@@ -966,7 +966,7 @@
               <w14:ligatures w14:val="standardContextual"/>
             </w:rPr>
           </w:pPr>
-          <w:hyperlink w:anchor="_Toc226040315" w:history="1">
+          <w:hyperlink w:anchor="_Toc226286524" w:history="1">
             <w:r>
               <w:rPr>
                 <w:rStyle w:val="Hyperlink"/>
@@ -993,7 +993,7 @@
                 <w:noProof/>
                 <w:webHidden/>
               </w:rPr>
-              <w:instrText xml:space="preserve"> PAGEREF _Toc226040315 \h </w:instrText>
+              <w:instrText xml:space="preserve"> PAGEREF _Toc226286524 \h </w:instrText>
             </w:r>
             <w:r>
               <w:rPr>
@@ -1040,7 +1040,7 @@
               <w14:ligatures w14:val="standardContextual"/>
             </w:rPr>
           </w:pPr>
-          <w:hyperlink w:anchor="_Toc226040316" w:history="1">
+          <w:hyperlink w:anchor="_Toc226286525" w:history="1">
             <w:r>
               <w:rPr>
                 <w:rStyle w:val="Hyperlink"/>
@@ -1067,7 +1067,155 @@
                 <w:noProof/>
                 <w:webHidden/>
               </w:rPr>
-              <w:instrText xml:space="preserve"> PAGEREF _Toc226040316 \h </w:instrText>
+              <w:instrText xml:space="preserve"> PAGEREF _Toc226286525 \h </w:instrText>
+            </w:r>
+            <w:r>
+              <w:rPr>
+                <w:noProof/>
+                <w:webHidden/>
+              </w:rPr>
+            </w:r>
+            <w:r>
+              <w:rPr>
+                <w:noProof/>
+                <w:webHidden/>
+              </w:rPr>
+              <w:fldChar w:fldCharType="separate"/>
+            </w:r>
+            <w:r>
+              <w:rPr>
+                <w:noProof/>
+                <w:webHidden/>
+              </w:rPr>
+              <w:t>6</w:t>
+            </w:r>
+            <w:r>
+              <w:rPr>
+                <w:noProof/>
+                <w:webHidden/>
+              </w:rPr>
+              <w:fldChar w:fldCharType="end"/>
+            </w:r>
+          </w:hyperlink>
+        </w:p>
+        <w:p>
+          <w:pPr>
+            <w:pStyle w:val="TOC1"/>
+            <w:tabs>
+              <w:tab w:val="right" w:leader="dot" w:pos="9016"/>
+            </w:tabs>
+            <w:rPr>
+              <w:rFonts w:cstheme="minorBidi"/>
+              <w:noProof/>
+              <w:kern w:val="2"/>
+              <w:sz w:val="24"/>
+              <w:szCs w:val="24"/>
+              <w:lang w:val="en-GB" w:eastAsia="en-GB"/>
+              <w14:ligatures w14:val="standardContextual"/>
+            </w:rPr>
+          </w:pPr>
+          <w:hyperlink w:anchor="_Toc226286526" w:history="1">
+            <w:r>
+              <w:rPr>
+                <w:rStyle w:val="Hyperlink"/>
+                <w:noProof/>
+              </w:rPr>
+              <w:t>Chapter 2 – Literature Survey</w:t>
+            </w:r>
+            <w:r>
+              <w:rPr>
+                <w:noProof/>
+                <w:webHidden/>
+              </w:rPr>
+              <w:tab/>
+            </w:r>
+            <w:r>
+              <w:rPr>
+                <w:noProof/>
+                <w:webHidden/>
+              </w:rPr>
+              <w:fldChar w:fldCharType="begin"/>
+            </w:r>
+            <w:r>
+              <w:rPr>
+                <w:noProof/>
+                <w:webHidden/>
+              </w:rPr>
+              <w:instrText xml:space="preserve"> PAGEREF _Toc226286526 \h </w:instrText>
+            </w:r>
+            <w:r>
+              <w:rPr>
+                <w:noProof/>
+                <w:webHidden/>
+              </w:rPr>
+            </w:r>
+            <w:r>
+              <w:rPr>
+                <w:noProof/>
+                <w:webHidden/>
+              </w:rPr>
+              <w:fldChar w:fldCharType="separate"/>
+            </w:r>
+            <w:r>
+              <w:rPr>
+                <w:noProof/>
+                <w:webHidden/>
+              </w:rPr>
+              <w:t>6</w:t>
+            </w:r>
+            <w:r>
+              <w:rPr>
+                <w:noProof/>
+                <w:webHidden/>
+              </w:rPr>
+              <w:fldChar w:fldCharType="end"/>
+            </w:r>
+          </w:hyperlink>
+        </w:p>
+        <w:p>
+          <w:pPr>
+            <w:pStyle w:val="TOC2"/>
+            <w:tabs>
+              <w:tab w:val="right" w:leader="dot" w:pos="9016"/>
+            </w:tabs>
+            <w:rPr>
+              <w:rFonts w:cstheme="minorBidi"/>
+              <w:noProof/>
+              <w:kern w:val="2"/>
+              <w:sz w:val="24"/>
+              <w:szCs w:val="24"/>
+              <w:lang w:val="en-GB" w:eastAsia="en-GB"/>
+              <w14:ligatures w14:val="standardContextual"/>
+            </w:rPr>
+          </w:pPr>
+          <w:hyperlink w:anchor="_Toc226286527" w:history="1">
+            <w:r>
+              <w:rPr>
+                <w:rStyle w:val="Hyperlink"/>
+                <w:noProof/>
+              </w:rPr>
+              <w:t>2.1 Literature Survey Introduction</w:t>
+            </w:r>
+            <w:r>
+              <w:rPr>
+                <w:noProof/>
+                <w:webHidden/>
+              </w:rPr>
+              <w:tab/>
+            </w:r>
+            <w:r>
+              <w:rPr>
+                <w:noProof/>
+                <w:webHidden/>
+              </w:rPr>
+              <w:fldChar w:fldCharType="begin"/>
+            </w:r>
+            <w:r>
+              <w:rPr>
+                <w:noProof/>
+                <w:webHidden/>
+              </w:rPr>
+              <w:instrText xml:space="preserve"> PAGEREF _Toc226286527 \h </w:instrText>
             </w:r>
             <w:r>
               <w:rPr>
@@ -1267,7 +1415,7 @@
         <w:pStyle w:val="Heading1"/>
         <w:jc w:val="center"/>
       </w:pPr>
-      <w:bookmarkStart w:id="0" w:name="_Toc226040306"/>
+      <w:bookmarkStart w:id="0" w:name="_Toc226286515"/>
       <w:r>
         <w:t>Chapter 1</w:t>
       </w:r>
@@ -1295,7 +1443,7 @@
           <w:u w:val="single"/>
         </w:rPr>
       </w:pPr>
-      <w:bookmarkStart w:id="1" w:name="_Toc226040307"/>
+      <w:bookmarkStart w:id="1" w:name="_Toc226286516"/>
       <w:r>
         <w:t>1.1</w:t>
       </w:r>
@@ -1340,7 +1488,7 @@
       <w:pPr>
         <w:pStyle w:val="Heading1"/>
       </w:pPr>
-      <w:bookmarkStart w:id="2" w:name="_Toc226040308"/>
+      <w:bookmarkStart w:id="2" w:name="_Toc226286517"/>
       <w:r>
         <w:lastRenderedPageBreak/>
         <w:t>1.2 Aims</w:t>
@@ -1348,7 +1496,7 @@
       <w:bookmarkEnd w:id="2"/>
     </w:p>
     <w:p>
-      <w:bookmarkStart w:id="3" w:name="_Toc226040309"/>
+      <w:bookmarkStart w:id="3" w:name="_Toc226286518"/>
       <w:r>
         <w:rPr>
           <w:rStyle w:val="Heading2Char"/>
@@ -1391,7 +1539,7 @@
       <w:pPr>
         <w:pStyle w:val="Heading2"/>
       </w:pPr>
-      <w:bookmarkStart w:id="4" w:name="_Toc226040310"/>
+      <w:bookmarkStart w:id="4" w:name="_Toc226286519"/>
       <w:r>
         <w:t>1.2.2 Additional Aims</w:t>
       </w:r>
@@ -1460,7 +1608,7 @@
       <w:pPr>
         <w:pStyle w:val="Heading1"/>
       </w:pPr>
-      <w:bookmarkStart w:id="5" w:name="_Toc226040311"/>
+      <w:bookmarkStart w:id="5" w:name="_Toc226286520"/>
       <w:r>
         <w:t>1.3 Objectives</w:t>
       </w:r>
@@ -1470,7 +1618,7 @@
       <w:pPr>
         <w:pStyle w:val="Heading2"/>
       </w:pPr>
-      <w:bookmarkStart w:id="6" w:name="_Toc226040312"/>
+      <w:bookmarkStart w:id="6" w:name="_Toc226286521"/>
       <w:r>
         <w:t>1.3.1 Scope</w:t>
       </w:r>
@@ -1542,7 +1690,7 @@
       <w:pPr>
         <w:pStyle w:val="Heading2"/>
       </w:pPr>
-      <w:bookmarkStart w:id="7" w:name="_Toc226040313"/>
+      <w:bookmarkStart w:id="7" w:name="_Toc226286522"/>
       <w:r>
         <w:t>1.3.2 Research Objectives</w:t>
       </w:r>
@@ -1576,7 +1724,7 @@
       <w:pPr>
         <w:pStyle w:val="Heading2"/>
       </w:pPr>
-      <w:bookmarkStart w:id="8" w:name="_Toc226040314"/>
+      <w:bookmarkStart w:id="8" w:name="_Toc226286523"/>
       <w:r>
         <w:t>1.3.3 Design Objectives</w:t>
       </w:r>
@@ -1692,7 +1840,7 @@
       <w:pPr>
         <w:pStyle w:val="Heading2"/>
       </w:pPr>
-      <w:bookmarkStart w:id="9" w:name="_Toc226040315"/>
+      <w:bookmarkStart w:id="9" w:name="_Toc226286524"/>
       <w:r>
         <w:lastRenderedPageBreak/>
         <w:t>1.3.4 Implementation Objectives</w:t>
@@ -1812,7 +1960,7 @@
       <w:pPr>
         <w:pStyle w:val="Heading2"/>
       </w:pPr>
-      <w:bookmarkStart w:id="10" w:name="_Toc226040316"/>
+      <w:bookmarkStart w:id="10" w:name="_Toc226286525"/>
       <w:r>
         <w:t>1.3.5 Results, Evaluation and Playtesting Objectives</w:t>
       </w:r>
@@ -1857,6 +2005,56 @@
       </w:pPr>
       <w:r>
         <w:t>Evaluate the initial aims and if they have been hit.</w:t>
+      </w:r>
+    </w:p>
+    <w:p/>
+    <w:p>
+      <w:pPr>
+        <w:pStyle w:val="Heading1"/>
+      </w:pPr>
+      <w:bookmarkStart w:id="11" w:name="_Toc226286526"/>
+      <w:r>
+        <w:t>Chapter 2 – Literature Survey</w:t>
+      </w:r>
+      <w:bookmarkEnd w:id="11"/>
+    </w:p>
+    <w:p>
+      <w:pPr>
+        <w:pStyle w:val="Heading2"/>
+      </w:pPr>
+      <w:bookmarkStart w:id="12" w:name="_Toc226286527"/>
+      <w:r>
+        <w:t>2.1 Literature Survey Introduction</w:t>
+      </w:r>
+      <w:bookmarkEnd w:id="12"/>
+    </w:p>
+    <w:p>
+      <w:r>
+        <w:t>In this literature survey, I will be conducting an investigation into other similar products in the industry, picking apart and evaluating the reasoning behind certain choices made during the development process of the product.</w:t>
+      </w:r>
+      <w:r>
+        <w:t xml:space="preserve"> </w:t>
+      </w:r>
+      <w:r>
+        <w:t xml:space="preserve">There will be documentation demonstrating the research and </w:t>
+      </w:r>
+      <w:r>
+        <w:t xml:space="preserve">an </w:t>
+      </w:r>
+      <w:r>
+        <w:t>assessment of</w:t>
+      </w:r>
+      <w:r>
+        <w:t xml:space="preserve"> those </w:t>
+      </w:r>
+      <w:r>
+        <w:t>findings</w:t>
+      </w:r>
+      <w:r>
+        <w:t xml:space="preserve">. Additionally, there will be </w:t>
+      </w:r>
+      <w:r>
+        <w:t>evidence indicating where this will be relevant and significant to the game's future development.</w:t>
       </w:r>
     </w:p>
     <w:sectPr>

</xml_diff>

<commit_message>
feat: wrote intro to comparative research
</commit_message>
<xml_diff>
--- a/Report.docx
+++ b/Report.docx
@@ -300,7 +300,7 @@
           <w:r>
             <w:fldChar w:fldCharType="separate"/>
           </w:r>
-          <w:hyperlink w:anchor="_Toc226286515" w:history="1">
+          <w:hyperlink w:anchor="_Toc226294800" w:history="1">
             <w:r>
               <w:rPr>
                 <w:rStyle w:val="Hyperlink"/>
@@ -327,7 +327,7 @@
                 <w:noProof/>
                 <w:webHidden/>
               </w:rPr>
-              <w:instrText xml:space="preserve"> PAGEREF _Toc226286515 \h </w:instrText>
+              <w:instrText xml:space="preserve"> PAGEREF _Toc226294800 \h </w:instrText>
             </w:r>
             <w:r>
               <w:rPr>
@@ -374,7 +374,7 @@
               <w14:ligatures w14:val="standardContextual"/>
             </w:rPr>
           </w:pPr>
-          <w:hyperlink w:anchor="_Toc226286516" w:history="1">
+          <w:hyperlink w:anchor="_Toc226294801" w:history="1">
             <w:r>
               <w:rPr>
                 <w:rStyle w:val="Hyperlink"/>
@@ -401,7 +401,7 @@
                 <w:noProof/>
                 <w:webHidden/>
               </w:rPr>
-              <w:instrText xml:space="preserve"> PAGEREF _Toc226286516 \h </w:instrText>
+              <w:instrText xml:space="preserve"> PAGEREF _Toc226294801 \h </w:instrText>
             </w:r>
             <w:r>
               <w:rPr>
@@ -448,7 +448,7 @@
               <w14:ligatures w14:val="standardContextual"/>
             </w:rPr>
           </w:pPr>
-          <w:hyperlink w:anchor="_Toc226286517" w:history="1">
+          <w:hyperlink w:anchor="_Toc226294802" w:history="1">
             <w:r>
               <w:rPr>
                 <w:rStyle w:val="Hyperlink"/>
@@ -475,7 +475,7 @@
                 <w:noProof/>
                 <w:webHidden/>
               </w:rPr>
-              <w:instrText xml:space="preserve"> PAGEREF _Toc226286517 \h </w:instrText>
+              <w:instrText xml:space="preserve"> PAGEREF _Toc226294802 \h </w:instrText>
             </w:r>
             <w:r>
               <w:rPr>
@@ -522,7 +522,7 @@
               <w14:ligatures w14:val="standardContextual"/>
             </w:rPr>
           </w:pPr>
-          <w:hyperlink w:anchor="_Toc226286518" w:history="1">
+          <w:hyperlink w:anchor="_Toc226294803" w:history="1">
             <w:r>
               <w:rPr>
                 <w:rStyle w:val="Hyperlink"/>
@@ -549,7 +549,7 @@
                 <w:noProof/>
                 <w:webHidden/>
               </w:rPr>
-              <w:instrText xml:space="preserve"> PAGEREF _Toc226286518 \h </w:instrText>
+              <w:instrText xml:space="preserve"> PAGEREF _Toc226294803 \h </w:instrText>
             </w:r>
             <w:r>
               <w:rPr>
@@ -596,7 +596,7 @@
               <w14:ligatures w14:val="standardContextual"/>
             </w:rPr>
           </w:pPr>
-          <w:hyperlink w:anchor="_Toc226286519" w:history="1">
+          <w:hyperlink w:anchor="_Toc226294804" w:history="1">
             <w:r>
               <w:rPr>
                 <w:rStyle w:val="Hyperlink"/>
@@ -623,7 +623,7 @@
                 <w:noProof/>
                 <w:webHidden/>
               </w:rPr>
-              <w:instrText xml:space="preserve"> PAGEREF _Toc226286519 \h </w:instrText>
+              <w:instrText xml:space="preserve"> PAGEREF _Toc226294804 \h </w:instrText>
             </w:r>
             <w:r>
               <w:rPr>
@@ -670,7 +670,7 @@
               <w14:ligatures w14:val="standardContextual"/>
             </w:rPr>
           </w:pPr>
-          <w:hyperlink w:anchor="_Toc226286520" w:history="1">
+          <w:hyperlink w:anchor="_Toc226294805" w:history="1">
             <w:r>
               <w:rPr>
                 <w:rStyle w:val="Hyperlink"/>
@@ -697,7 +697,7 @@
                 <w:noProof/>
                 <w:webHidden/>
               </w:rPr>
-              <w:instrText xml:space="preserve"> PAGEREF _Toc226286520 \h </w:instrText>
+              <w:instrText xml:space="preserve"> PAGEREF _Toc226294805 \h </w:instrText>
             </w:r>
             <w:r>
               <w:rPr>
@@ -744,7 +744,7 @@
               <w14:ligatures w14:val="standardContextual"/>
             </w:rPr>
           </w:pPr>
-          <w:hyperlink w:anchor="_Toc226286521" w:history="1">
+          <w:hyperlink w:anchor="_Toc226294806" w:history="1">
             <w:r>
               <w:rPr>
                 <w:rStyle w:val="Hyperlink"/>
@@ -771,7 +771,7 @@
                 <w:noProof/>
                 <w:webHidden/>
               </w:rPr>
-              <w:instrText xml:space="preserve"> PAGEREF _Toc226286521 \h </w:instrText>
+              <w:instrText xml:space="preserve"> PAGEREF _Toc226294806 \h </w:instrText>
             </w:r>
             <w:r>
               <w:rPr>
@@ -818,7 +818,7 @@
               <w14:ligatures w14:val="standardContextual"/>
             </w:rPr>
           </w:pPr>
-          <w:hyperlink w:anchor="_Toc226286522" w:history="1">
+          <w:hyperlink w:anchor="_Toc226294807" w:history="1">
             <w:r>
               <w:rPr>
                 <w:rStyle w:val="Hyperlink"/>
@@ -845,7 +845,7 @@
                 <w:noProof/>
                 <w:webHidden/>
               </w:rPr>
-              <w:instrText xml:space="preserve"> PAGEREF _Toc226286522 \h </w:instrText>
+              <w:instrText xml:space="preserve"> PAGEREF _Toc226294807 \h </w:instrText>
             </w:r>
             <w:r>
               <w:rPr>
@@ -892,7 +892,7 @@
               <w14:ligatures w14:val="standardContextual"/>
             </w:rPr>
           </w:pPr>
-          <w:hyperlink w:anchor="_Toc226286523" w:history="1">
+          <w:hyperlink w:anchor="_Toc226294808" w:history="1">
             <w:r>
               <w:rPr>
                 <w:rStyle w:val="Hyperlink"/>
@@ -919,7 +919,7 @@
                 <w:noProof/>
                 <w:webHidden/>
               </w:rPr>
-              <w:instrText xml:space="preserve"> PAGEREF _Toc226286523 \h </w:instrText>
+              <w:instrText xml:space="preserve"> PAGEREF _Toc226294808 \h </w:instrText>
             </w:r>
             <w:r>
               <w:rPr>
@@ -966,7 +966,7 @@
               <w14:ligatures w14:val="standardContextual"/>
             </w:rPr>
           </w:pPr>
-          <w:hyperlink w:anchor="_Toc226286524" w:history="1">
+          <w:hyperlink w:anchor="_Toc226294809" w:history="1">
             <w:r>
               <w:rPr>
                 <w:rStyle w:val="Hyperlink"/>
@@ -993,7 +993,7 @@
                 <w:noProof/>
                 <w:webHidden/>
               </w:rPr>
-              <w:instrText xml:space="preserve"> PAGEREF _Toc226286524 \h </w:instrText>
+              <w:instrText xml:space="preserve"> PAGEREF _Toc226294809 \h </w:instrText>
             </w:r>
             <w:r>
               <w:rPr>
@@ -1013,7 +1013,7 @@
                 <w:noProof/>
                 <w:webHidden/>
               </w:rPr>
-              <w:t>6</w:t>
+              <w:t>5</w:t>
             </w:r>
             <w:r>
               <w:rPr>
@@ -1040,7 +1040,7 @@
               <w14:ligatures w14:val="standardContextual"/>
             </w:rPr>
           </w:pPr>
-          <w:hyperlink w:anchor="_Toc226286525" w:history="1">
+          <w:hyperlink w:anchor="_Toc226294810" w:history="1">
             <w:r>
               <w:rPr>
                 <w:rStyle w:val="Hyperlink"/>
@@ -1067,7 +1067,7 @@
                 <w:noProof/>
                 <w:webHidden/>
               </w:rPr>
-              <w:instrText xml:space="preserve"> PAGEREF _Toc226286525 \h </w:instrText>
+              <w:instrText xml:space="preserve"> PAGEREF _Toc226294810 \h </w:instrText>
             </w:r>
             <w:r>
               <w:rPr>
@@ -1114,7 +1114,7 @@
               <w14:ligatures w14:val="standardContextual"/>
             </w:rPr>
           </w:pPr>
-          <w:hyperlink w:anchor="_Toc226286526" w:history="1">
+          <w:hyperlink w:anchor="_Toc226294811" w:history="1">
             <w:r>
               <w:rPr>
                 <w:rStyle w:val="Hyperlink"/>
@@ -1141,7 +1141,7 @@
                 <w:noProof/>
                 <w:webHidden/>
               </w:rPr>
-              <w:instrText xml:space="preserve"> PAGEREF _Toc226286526 \h </w:instrText>
+              <w:instrText xml:space="preserve"> PAGEREF _Toc226294811 \h </w:instrText>
             </w:r>
             <w:r>
               <w:rPr>
@@ -1188,7 +1188,7 @@
               <w14:ligatures w14:val="standardContextual"/>
             </w:rPr>
           </w:pPr>
-          <w:hyperlink w:anchor="_Toc226286527" w:history="1">
+          <w:hyperlink w:anchor="_Toc226294812" w:history="1">
             <w:r>
               <w:rPr>
                 <w:rStyle w:val="Hyperlink"/>
@@ -1215,7 +1215,155 @@
                 <w:noProof/>
                 <w:webHidden/>
               </w:rPr>
-              <w:instrText xml:space="preserve"> PAGEREF _Toc226286527 \h </w:instrText>
+              <w:instrText xml:space="preserve"> PAGEREF _Toc226294812 \h </w:instrText>
+            </w:r>
+            <w:r>
+              <w:rPr>
+                <w:noProof/>
+                <w:webHidden/>
+              </w:rPr>
+            </w:r>
+            <w:r>
+              <w:rPr>
+                <w:noProof/>
+                <w:webHidden/>
+              </w:rPr>
+              <w:fldChar w:fldCharType="separate"/>
+            </w:r>
+            <w:r>
+              <w:rPr>
+                <w:noProof/>
+                <w:webHidden/>
+              </w:rPr>
+              <w:t>6</w:t>
+            </w:r>
+            <w:r>
+              <w:rPr>
+                <w:noProof/>
+                <w:webHidden/>
+              </w:rPr>
+              <w:fldChar w:fldCharType="end"/>
+            </w:r>
+          </w:hyperlink>
+        </w:p>
+        <w:p>
+          <w:pPr>
+            <w:pStyle w:val="TOC2"/>
+            <w:tabs>
+              <w:tab w:val="right" w:leader="dot" w:pos="9016"/>
+            </w:tabs>
+            <w:rPr>
+              <w:rFonts w:cstheme="minorBidi"/>
+              <w:noProof/>
+              <w:kern w:val="2"/>
+              <w:sz w:val="24"/>
+              <w:szCs w:val="24"/>
+              <w:lang w:val="en-GB" w:eastAsia="en-GB"/>
+              <w14:ligatures w14:val="standardContextual"/>
+            </w:rPr>
+          </w:pPr>
+          <w:hyperlink w:anchor="_Toc226294813" w:history="1">
+            <w:r>
+              <w:rPr>
+                <w:rStyle w:val="Hyperlink"/>
+                <w:noProof/>
+              </w:rPr>
+              <w:t>2.2 Comparative Research</w:t>
+            </w:r>
+            <w:r>
+              <w:rPr>
+                <w:noProof/>
+                <w:webHidden/>
+              </w:rPr>
+              <w:tab/>
+            </w:r>
+            <w:r>
+              <w:rPr>
+                <w:noProof/>
+                <w:webHidden/>
+              </w:rPr>
+              <w:fldChar w:fldCharType="begin"/>
+            </w:r>
+            <w:r>
+              <w:rPr>
+                <w:noProof/>
+                <w:webHidden/>
+              </w:rPr>
+              <w:instrText xml:space="preserve"> PAGEREF _Toc226294813 \h </w:instrText>
+            </w:r>
+            <w:r>
+              <w:rPr>
+                <w:noProof/>
+                <w:webHidden/>
+              </w:rPr>
+            </w:r>
+            <w:r>
+              <w:rPr>
+                <w:noProof/>
+                <w:webHidden/>
+              </w:rPr>
+              <w:fldChar w:fldCharType="separate"/>
+            </w:r>
+            <w:r>
+              <w:rPr>
+                <w:noProof/>
+                <w:webHidden/>
+              </w:rPr>
+              <w:t>6</w:t>
+            </w:r>
+            <w:r>
+              <w:rPr>
+                <w:noProof/>
+                <w:webHidden/>
+              </w:rPr>
+              <w:fldChar w:fldCharType="end"/>
+            </w:r>
+          </w:hyperlink>
+        </w:p>
+        <w:p>
+          <w:pPr>
+            <w:pStyle w:val="TOC3"/>
+            <w:tabs>
+              <w:tab w:val="right" w:leader="dot" w:pos="9016"/>
+            </w:tabs>
+            <w:rPr>
+              <w:rFonts w:cstheme="minorBidi"/>
+              <w:noProof/>
+              <w:kern w:val="2"/>
+              <w:sz w:val="24"/>
+              <w:szCs w:val="24"/>
+              <w:lang w:val="en-GB" w:eastAsia="en-GB"/>
+              <w14:ligatures w14:val="standardContextual"/>
+            </w:rPr>
+          </w:pPr>
+          <w:hyperlink w:anchor="_Toc226294814" w:history="1">
+            <w:r>
+              <w:rPr>
+                <w:rStyle w:val="Hyperlink"/>
+                <w:noProof/>
+              </w:rPr>
+              <w:t>2.2.1 World Generation</w:t>
+            </w:r>
+            <w:r>
+              <w:rPr>
+                <w:noProof/>
+                <w:webHidden/>
+              </w:rPr>
+              <w:tab/>
+            </w:r>
+            <w:r>
+              <w:rPr>
+                <w:noProof/>
+                <w:webHidden/>
+              </w:rPr>
+              <w:fldChar w:fldCharType="begin"/>
+            </w:r>
+            <w:r>
+              <w:rPr>
+                <w:noProof/>
+                <w:webHidden/>
+              </w:rPr>
+              <w:instrText xml:space="preserve"> PAGEREF _Toc226294814 \h </w:instrText>
             </w:r>
             <w:r>
               <w:rPr>
@@ -1415,7 +1563,7 @@
         <w:pStyle w:val="Heading1"/>
         <w:jc w:val="center"/>
       </w:pPr>
-      <w:bookmarkStart w:id="0" w:name="_Toc226286515"/>
+      <w:bookmarkStart w:id="0" w:name="_Toc226294800"/>
       <w:r>
         <w:t>Chapter 1</w:t>
       </w:r>
@@ -1443,7 +1591,7 @@
           <w:u w:val="single"/>
         </w:rPr>
       </w:pPr>
-      <w:bookmarkStart w:id="1" w:name="_Toc226286516"/>
+      <w:bookmarkStart w:id="1" w:name="_Toc226294801"/>
       <w:r>
         <w:t>1.1</w:t>
       </w:r>
@@ -1488,7 +1636,7 @@
       <w:pPr>
         <w:pStyle w:val="Heading1"/>
       </w:pPr>
-      <w:bookmarkStart w:id="2" w:name="_Toc226286517"/>
+      <w:bookmarkStart w:id="2" w:name="_Toc226294802"/>
       <w:r>
         <w:lastRenderedPageBreak/>
         <w:t>1.2 Aims</w:t>
@@ -1496,7 +1644,7 @@
       <w:bookmarkEnd w:id="2"/>
     </w:p>
     <w:p>
-      <w:bookmarkStart w:id="3" w:name="_Toc226286518"/>
+      <w:bookmarkStart w:id="3" w:name="_Toc226294803"/>
       <w:r>
         <w:rPr>
           <w:rStyle w:val="Heading2Char"/>
@@ -1539,7 +1687,7 @@
       <w:pPr>
         <w:pStyle w:val="Heading2"/>
       </w:pPr>
-      <w:bookmarkStart w:id="4" w:name="_Toc226286519"/>
+      <w:bookmarkStart w:id="4" w:name="_Toc226294804"/>
       <w:r>
         <w:t>1.2.2 Additional Aims</w:t>
       </w:r>
@@ -1608,7 +1756,7 @@
       <w:pPr>
         <w:pStyle w:val="Heading1"/>
       </w:pPr>
-      <w:bookmarkStart w:id="5" w:name="_Toc226286520"/>
+      <w:bookmarkStart w:id="5" w:name="_Toc226294805"/>
       <w:r>
         <w:t>1.3 Objectives</w:t>
       </w:r>
@@ -1618,7 +1766,7 @@
       <w:pPr>
         <w:pStyle w:val="Heading2"/>
       </w:pPr>
-      <w:bookmarkStart w:id="6" w:name="_Toc226286521"/>
+      <w:bookmarkStart w:id="6" w:name="_Toc226294806"/>
       <w:r>
         <w:t>1.3.1 Scope</w:t>
       </w:r>
@@ -1690,7 +1838,7 @@
       <w:pPr>
         <w:pStyle w:val="Heading2"/>
       </w:pPr>
-      <w:bookmarkStart w:id="7" w:name="_Toc226286522"/>
+      <w:bookmarkStart w:id="7" w:name="_Toc226294807"/>
       <w:r>
         <w:t>1.3.2 Research Objectives</w:t>
       </w:r>
@@ -1698,13 +1846,27 @@
     </w:p>
     <w:p>
       <w:r>
-        <w:t>For the research objectives for the game, research will be conducted into other types of media with similar features. This research will include a comparison of similar games and their features and the overall impact of those features on this project. This will be done to find a balance for the difficulty of the game and to evaluate the necessary features for the game. Some topics of features and mechanics that will be researched include: 4X &amp; Strategy Games, World Generation, Pathfinding</w:t>
+        <w:t xml:space="preserve">For the research objectives for the game, research will be conducted into other types of media with similar features. This research will include a comparison of similar games and their features and the overall impact of those features on this project. This will be done to find a balance for the difficulty of the game and to evaluate the necessary features for the game. Some topics of features and mechanics that will be researched </w:t>
+      </w:r>
+      <w:proofErr w:type="gramStart"/>
+      <w:r>
+        <w:t>include:</w:t>
+      </w:r>
+      <w:proofErr w:type="gramEnd"/>
+      <w:r>
+        <w:t xml:space="preserve"> World Generation, Pathfinding</w:t>
       </w:r>
       <w:r>
         <w:t>,</w:t>
       </w:r>
       <w:r>
-        <w:t xml:space="preserve"> Event Handling</w:t>
+        <w:t xml:space="preserve"> </w:t>
+      </w:r>
+      <w:r>
+        <w:t xml:space="preserve">Advanced </w:t>
+      </w:r>
+      <w:r>
+        <w:t>Event Handling</w:t>
       </w:r>
       <w:r>
         <w:t xml:space="preserve"> and AI integrations</w:t>
@@ -1724,7 +1886,7 @@
       <w:pPr>
         <w:pStyle w:val="Heading2"/>
       </w:pPr>
-      <w:bookmarkStart w:id="8" w:name="_Toc226286523"/>
+      <w:bookmarkStart w:id="8" w:name="_Toc226294808"/>
       <w:r>
         <w:t>1.3.3 Design Objectives</w:t>
       </w:r>
@@ -1840,9 +2002,8 @@
       <w:pPr>
         <w:pStyle w:val="Heading2"/>
       </w:pPr>
-      <w:bookmarkStart w:id="9" w:name="_Toc226286524"/>
-      <w:r>
-        <w:lastRenderedPageBreak/>
+      <w:bookmarkStart w:id="9" w:name="_Toc226294809"/>
+      <w:r>
         <w:t>1.3.4 Implementation Objectives</w:t>
       </w:r>
       <w:bookmarkEnd w:id="9"/>
@@ -1861,6 +2022,7 @@
         </w:numPr>
       </w:pPr>
       <w:r>
+        <w:lastRenderedPageBreak/>
         <w:t>Create the world generation.</w:t>
       </w:r>
     </w:p>
@@ -1960,7 +2122,7 @@
       <w:pPr>
         <w:pStyle w:val="Heading2"/>
       </w:pPr>
-      <w:bookmarkStart w:id="10" w:name="_Toc226286525"/>
+      <w:bookmarkStart w:id="10" w:name="_Toc226294810"/>
       <w:r>
         <w:t>1.3.5 Results, Evaluation and Playtesting Objectives</w:t>
       </w:r>
@@ -2007,56 +2169,128 @@
         <w:t>Evaluate the initial aims and if they have been hit.</w:t>
       </w:r>
     </w:p>
+    <w:p>
+      <w:pPr>
+        <w:pStyle w:val="ListParagraph"/>
+      </w:pPr>
+    </w:p>
+    <w:p>
+      <w:pPr>
+        <w:pStyle w:val="Heading1"/>
+      </w:pPr>
+      <w:bookmarkStart w:id="11" w:name="_Toc226294811"/>
+      <w:r>
+        <w:t>Chapter 2 – Literature Survey</w:t>
+      </w:r>
+      <w:bookmarkEnd w:id="11"/>
+    </w:p>
+    <w:p>
+      <w:pPr>
+        <w:pStyle w:val="Heading2"/>
+      </w:pPr>
+      <w:bookmarkStart w:id="12" w:name="_Toc226294812"/>
+      <w:r>
+        <w:t>2.1 Literature Survey Introduction</w:t>
+      </w:r>
+      <w:bookmarkEnd w:id="12"/>
+    </w:p>
+    <w:p>
+      <w:r>
+        <w:t>In this literature survey, I will be conducting an investigation into other similar products in the industry, picking apart and evaluating the reasoning behind certain choices made during the development process of the product.</w:t>
+      </w:r>
+      <w:r>
+        <w:t xml:space="preserve"> </w:t>
+      </w:r>
+      <w:r>
+        <w:t xml:space="preserve">There will be documentation demonstrating the research and </w:t>
+      </w:r>
+      <w:r>
+        <w:t xml:space="preserve">an </w:t>
+      </w:r>
+      <w:r>
+        <w:t>assessment of</w:t>
+      </w:r>
+      <w:r>
+        <w:t xml:space="preserve"> those </w:t>
+      </w:r>
+      <w:r>
+        <w:t>findings</w:t>
+      </w:r>
+      <w:r>
+        <w:t xml:space="preserve">. Additionally, there will be </w:t>
+      </w:r>
+      <w:r>
+        <w:t>evidence indicating where this will be relevant and significant to the game's future development.</w:t>
+      </w:r>
+    </w:p>
+    <w:p>
+      <w:pPr>
+        <w:pStyle w:val="Heading2"/>
+      </w:pPr>
+      <w:bookmarkStart w:id="13" w:name="_Toc226294813"/>
+      <w:r>
+        <w:t>2.2 Comparative Research</w:t>
+      </w:r>
+      <w:bookmarkEnd w:id="13"/>
+    </w:p>
+    <w:p>
+      <w:r>
+        <w:t>The upcoming section will contain research which will be used to compare and discuss aspects, mechanics, design choices and other related features that will inspire and inform later decisions during the process of creating **insert name**</w:t>
+      </w:r>
+      <w:r>
+        <w:t>.</w:t>
+      </w:r>
+    </w:p>
+    <w:p>
+      <w:pPr>
+        <w:pStyle w:val="Heading3"/>
+      </w:pPr>
+      <w:bookmarkStart w:id="14" w:name="_Toc226294814"/>
+      <w:r>
+        <w:t xml:space="preserve">2.2.1 </w:t>
+      </w:r>
+      <w:r>
+        <w:t>World Generation</w:t>
+      </w:r>
+      <w:bookmarkEnd w:id="14"/>
+    </w:p>
+    <w:p>
+      <w:r>
+        <w:t>In 4X strategy games such as Civilization VI and Stellaris, world generation plays a crucial role in shaping how players explore, expand, and interact with the game environment. The structure and distribution of terrain, resources, and starting positions can dramatically influence both gameplay strategies and overall fairness.</w:t>
+      </w:r>
+      <w:r>
+        <w:br/>
+      </w:r>
+      <w:r>
+        <w:br/>
+      </w:r>
+      <w:r>
+        <w:lastRenderedPageBreak/>
+        <w:t xml:space="preserve">Games that will be researched for this section include </w:t>
+      </w:r>
+      <w:r>
+        <w:t xml:space="preserve">Minecraft (2009), Sid Meier’s </w:t>
+      </w:r>
+      <w:r>
+        <w:t>Civilization VI (2016)</w:t>
+      </w:r>
+      <w:r>
+        <w:t xml:space="preserve"> and</w:t>
+      </w:r>
+      <w:r>
+        <w:t xml:space="preserve"> Stellaris (201</w:t>
+      </w:r>
+      <w:r>
+        <w:t>6</w:t>
+      </w:r>
+      <w:r>
+        <w:t>)</w:t>
+      </w:r>
+      <w:r>
+        <w:t>.</w:t>
+      </w:r>
+    </w:p>
     <w:p/>
-    <w:p>
-      <w:pPr>
-        <w:pStyle w:val="Heading1"/>
-      </w:pPr>
-      <w:bookmarkStart w:id="11" w:name="_Toc226286526"/>
-      <w:r>
-        <w:t>Chapter 2 – Literature Survey</w:t>
-      </w:r>
-      <w:bookmarkEnd w:id="11"/>
-    </w:p>
-    <w:p>
-      <w:pPr>
-        <w:pStyle w:val="Heading2"/>
-      </w:pPr>
-      <w:bookmarkStart w:id="12" w:name="_Toc226286527"/>
-      <w:r>
-        <w:t>2.1 Literature Survey Introduction</w:t>
-      </w:r>
-      <w:bookmarkEnd w:id="12"/>
-    </w:p>
-    <w:p>
-      <w:r>
-        <w:t>In this literature survey, I will be conducting an investigation into other similar products in the industry, picking apart and evaluating the reasoning behind certain choices made during the development process of the product.</w:t>
-      </w:r>
-      <w:r>
-        <w:t xml:space="preserve"> </w:t>
-      </w:r>
-      <w:r>
-        <w:t xml:space="preserve">There will be documentation demonstrating the research and </w:t>
-      </w:r>
-      <w:r>
-        <w:t xml:space="preserve">an </w:t>
-      </w:r>
-      <w:r>
-        <w:t>assessment of</w:t>
-      </w:r>
-      <w:r>
-        <w:t xml:space="preserve"> those </w:t>
-      </w:r>
-      <w:r>
-        <w:t>findings</w:t>
-      </w:r>
-      <w:r>
-        <w:t xml:space="preserve">. Additionally, there will be </w:t>
-      </w:r>
-      <w:r>
-        <w:t>evidence indicating where this will be relevant and significant to the game's future development.</w:t>
-      </w:r>
-    </w:p>
     <w:sectPr>
       <w:pgSz w:w="11906" w:h="16838"/>
       <w:pgMar w:top="1440" w:right="1440" w:bottom="1440" w:left="1440" w:header="708" w:footer="708" w:gutter="0"/>

</xml_diff>

<commit_message>
feat: wrote BSP and Perlin Noise
</commit_message>
<xml_diff>
--- a/Report.docx
+++ b/Report.docx
@@ -223,24 +223,6 @@
           <w:u w:val="single"/>
         </w:rPr>
       </w:pPr>
-    </w:p>
-    <w:p>
-      <w:pPr>
-        <w:rPr>
-          <w:sz w:val="36"/>
-          <w:szCs w:val="36"/>
-          <w:u w:val="single"/>
-        </w:rPr>
-      </w:pPr>
-      <w:r>
-        <w:rPr>
-          <w:sz w:val="36"/>
-          <w:szCs w:val="36"/>
-          <w:u w:val="single"/>
-        </w:rPr>
-        <w:lastRenderedPageBreak/>
-        <w:t>Table of Contents</w:t>
-      </w:r>
     </w:p>
     <w:sdt>
       <w:sdtPr>
@@ -295,12 +277,12 @@
             <w:fldChar w:fldCharType="begin"/>
           </w:r>
           <w:r>
-            <w:instrText xml:space="preserve"> TOC \o "1-3" \h \z \u </w:instrText>
+            <w:instrText xml:space="preserve"> TOC \o "1-4" \h \z \u </w:instrText>
           </w:r>
           <w:r>
             <w:fldChar w:fldCharType="separate"/>
           </w:r>
-          <w:hyperlink w:anchor="_Toc226294800" w:history="1">
+          <w:hyperlink w:anchor="_Toc226298397" w:history="1">
             <w:r>
               <w:rPr>
                 <w:rStyle w:val="Hyperlink"/>
@@ -327,7 +309,7 @@
                 <w:noProof/>
                 <w:webHidden/>
               </w:rPr>
-              <w:instrText xml:space="preserve"> PAGEREF _Toc226294800 \h </w:instrText>
+              <w:instrText xml:space="preserve"> PAGEREF _Toc226298397 \h </w:instrText>
             </w:r>
             <w:r>
               <w:rPr>
@@ -374,7 +356,7 @@
               <w14:ligatures w14:val="standardContextual"/>
             </w:rPr>
           </w:pPr>
-          <w:hyperlink w:anchor="_Toc226294801" w:history="1">
+          <w:hyperlink w:anchor="_Toc226298398" w:history="1">
             <w:r>
               <w:rPr>
                 <w:rStyle w:val="Hyperlink"/>
@@ -401,7 +383,7 @@
                 <w:noProof/>
                 <w:webHidden/>
               </w:rPr>
-              <w:instrText xml:space="preserve"> PAGEREF _Toc226294801 \h </w:instrText>
+              <w:instrText xml:space="preserve"> PAGEREF _Toc226298398 \h </w:instrText>
             </w:r>
             <w:r>
               <w:rPr>
@@ -448,7 +430,7 @@
               <w14:ligatures w14:val="standardContextual"/>
             </w:rPr>
           </w:pPr>
-          <w:hyperlink w:anchor="_Toc226294802" w:history="1">
+          <w:hyperlink w:anchor="_Toc226298399" w:history="1">
             <w:r>
               <w:rPr>
                 <w:rStyle w:val="Hyperlink"/>
@@ -475,7 +457,7 @@
                 <w:noProof/>
                 <w:webHidden/>
               </w:rPr>
-              <w:instrText xml:space="preserve"> PAGEREF _Toc226294802 \h </w:instrText>
+              <w:instrText xml:space="preserve"> PAGEREF _Toc226298399 \h </w:instrText>
             </w:r>
             <w:r>
               <w:rPr>
@@ -522,7 +504,7 @@
               <w14:ligatures w14:val="standardContextual"/>
             </w:rPr>
           </w:pPr>
-          <w:hyperlink w:anchor="_Toc226294803" w:history="1">
+          <w:hyperlink w:anchor="_Toc226298400" w:history="1">
             <w:r>
               <w:rPr>
                 <w:rStyle w:val="Hyperlink"/>
@@ -549,7 +531,7 @@
                 <w:noProof/>
                 <w:webHidden/>
               </w:rPr>
-              <w:instrText xml:space="preserve"> PAGEREF _Toc226294803 \h </w:instrText>
+              <w:instrText xml:space="preserve"> PAGEREF _Toc226298400 \h </w:instrText>
             </w:r>
             <w:r>
               <w:rPr>
@@ -596,7 +578,7 @@
               <w14:ligatures w14:val="standardContextual"/>
             </w:rPr>
           </w:pPr>
-          <w:hyperlink w:anchor="_Toc226294804" w:history="1">
+          <w:hyperlink w:anchor="_Toc226298401" w:history="1">
             <w:r>
               <w:rPr>
                 <w:rStyle w:val="Hyperlink"/>
@@ -623,7 +605,7 @@
                 <w:noProof/>
                 <w:webHidden/>
               </w:rPr>
-              <w:instrText xml:space="preserve"> PAGEREF _Toc226294804 \h </w:instrText>
+              <w:instrText xml:space="preserve"> PAGEREF _Toc226298401 \h </w:instrText>
             </w:r>
             <w:r>
               <w:rPr>
@@ -670,7 +652,7 @@
               <w14:ligatures w14:val="standardContextual"/>
             </w:rPr>
           </w:pPr>
-          <w:hyperlink w:anchor="_Toc226294805" w:history="1">
+          <w:hyperlink w:anchor="_Toc226298402" w:history="1">
             <w:r>
               <w:rPr>
                 <w:rStyle w:val="Hyperlink"/>
@@ -697,7 +679,7 @@
                 <w:noProof/>
                 <w:webHidden/>
               </w:rPr>
-              <w:instrText xml:space="preserve"> PAGEREF _Toc226294805 \h </w:instrText>
+              <w:instrText xml:space="preserve"> PAGEREF _Toc226298402 \h </w:instrText>
             </w:r>
             <w:r>
               <w:rPr>
@@ -744,7 +726,7 @@
               <w14:ligatures w14:val="standardContextual"/>
             </w:rPr>
           </w:pPr>
-          <w:hyperlink w:anchor="_Toc226294806" w:history="1">
+          <w:hyperlink w:anchor="_Toc226298403" w:history="1">
             <w:r>
               <w:rPr>
                 <w:rStyle w:val="Hyperlink"/>
@@ -771,7 +753,7 @@
                 <w:noProof/>
                 <w:webHidden/>
               </w:rPr>
-              <w:instrText xml:space="preserve"> PAGEREF _Toc226294806 \h </w:instrText>
+              <w:instrText xml:space="preserve"> PAGEREF _Toc226298403 \h </w:instrText>
             </w:r>
             <w:r>
               <w:rPr>
@@ -818,7 +800,7 @@
               <w14:ligatures w14:val="standardContextual"/>
             </w:rPr>
           </w:pPr>
-          <w:hyperlink w:anchor="_Toc226294807" w:history="1">
+          <w:hyperlink w:anchor="_Toc226298404" w:history="1">
             <w:r>
               <w:rPr>
                 <w:rStyle w:val="Hyperlink"/>
@@ -845,7 +827,7 @@
                 <w:noProof/>
                 <w:webHidden/>
               </w:rPr>
-              <w:instrText xml:space="preserve"> PAGEREF _Toc226294807 \h </w:instrText>
+              <w:instrText xml:space="preserve"> PAGEREF _Toc226298404 \h </w:instrText>
             </w:r>
             <w:r>
               <w:rPr>
@@ -892,7 +874,7 @@
               <w14:ligatures w14:val="standardContextual"/>
             </w:rPr>
           </w:pPr>
-          <w:hyperlink w:anchor="_Toc226294808" w:history="1">
+          <w:hyperlink w:anchor="_Toc226298405" w:history="1">
             <w:r>
               <w:rPr>
                 <w:rStyle w:val="Hyperlink"/>
@@ -919,7 +901,7 @@
                 <w:noProof/>
                 <w:webHidden/>
               </w:rPr>
-              <w:instrText xml:space="preserve"> PAGEREF _Toc226294808 \h </w:instrText>
+              <w:instrText xml:space="preserve"> PAGEREF _Toc226298405 \h </w:instrText>
             </w:r>
             <w:r>
               <w:rPr>
@@ -966,7 +948,7 @@
               <w14:ligatures w14:val="standardContextual"/>
             </w:rPr>
           </w:pPr>
-          <w:hyperlink w:anchor="_Toc226294809" w:history="1">
+          <w:hyperlink w:anchor="_Toc226298406" w:history="1">
             <w:r>
               <w:rPr>
                 <w:rStyle w:val="Hyperlink"/>
@@ -993,7 +975,7 @@
                 <w:noProof/>
                 <w:webHidden/>
               </w:rPr>
-              <w:instrText xml:space="preserve"> PAGEREF _Toc226294809 \h </w:instrText>
+              <w:instrText xml:space="preserve"> PAGEREF _Toc226298406 \h </w:instrText>
             </w:r>
             <w:r>
               <w:rPr>
@@ -1040,7 +1022,7 @@
               <w14:ligatures w14:val="standardContextual"/>
             </w:rPr>
           </w:pPr>
-          <w:hyperlink w:anchor="_Toc226294810" w:history="1">
+          <w:hyperlink w:anchor="_Toc226298407" w:history="1">
             <w:r>
               <w:rPr>
                 <w:rStyle w:val="Hyperlink"/>
@@ -1067,7 +1049,7 @@
                 <w:noProof/>
                 <w:webHidden/>
               </w:rPr>
-              <w:instrText xml:space="preserve"> PAGEREF _Toc226294810 \h </w:instrText>
+              <w:instrText xml:space="preserve"> PAGEREF _Toc226298407 \h </w:instrText>
             </w:r>
             <w:r>
               <w:rPr>
@@ -1114,7 +1096,7 @@
               <w14:ligatures w14:val="standardContextual"/>
             </w:rPr>
           </w:pPr>
-          <w:hyperlink w:anchor="_Toc226294811" w:history="1">
+          <w:hyperlink w:anchor="_Toc226298408" w:history="1">
             <w:r>
               <w:rPr>
                 <w:rStyle w:val="Hyperlink"/>
@@ -1141,7 +1123,7 @@
                 <w:noProof/>
                 <w:webHidden/>
               </w:rPr>
-              <w:instrText xml:space="preserve"> PAGEREF _Toc226294811 \h </w:instrText>
+              <w:instrText xml:space="preserve"> PAGEREF _Toc226298408 \h </w:instrText>
             </w:r>
             <w:r>
               <w:rPr>
@@ -1188,7 +1170,7 @@
               <w14:ligatures w14:val="standardContextual"/>
             </w:rPr>
           </w:pPr>
-          <w:hyperlink w:anchor="_Toc226294812" w:history="1">
+          <w:hyperlink w:anchor="_Toc226298409" w:history="1">
             <w:r>
               <w:rPr>
                 <w:rStyle w:val="Hyperlink"/>
@@ -1215,7 +1197,7 @@
                 <w:noProof/>
                 <w:webHidden/>
               </w:rPr>
-              <w:instrText xml:space="preserve"> PAGEREF _Toc226294812 \h </w:instrText>
+              <w:instrText xml:space="preserve"> PAGEREF _Toc226298409 \h </w:instrText>
             </w:r>
             <w:r>
               <w:rPr>
@@ -1262,7 +1244,7 @@
               <w14:ligatures w14:val="standardContextual"/>
             </w:rPr>
           </w:pPr>
-          <w:hyperlink w:anchor="_Toc226294813" w:history="1">
+          <w:hyperlink w:anchor="_Toc226298410" w:history="1">
             <w:r>
               <w:rPr>
                 <w:rStyle w:val="Hyperlink"/>
@@ -1289,7 +1271,7 @@
                 <w:noProof/>
                 <w:webHidden/>
               </w:rPr>
-              <w:instrText xml:space="preserve"> PAGEREF _Toc226294813 \h </w:instrText>
+              <w:instrText xml:space="preserve"> PAGEREF _Toc226298410 \h </w:instrText>
             </w:r>
             <w:r>
               <w:rPr>
@@ -1336,7 +1318,7 @@
               <w14:ligatures w14:val="standardContextual"/>
             </w:rPr>
           </w:pPr>
-          <w:hyperlink w:anchor="_Toc226294814" w:history="1">
+          <w:hyperlink w:anchor="_Toc226298411" w:history="1">
             <w:r>
               <w:rPr>
                 <w:rStyle w:val="Hyperlink"/>
@@ -1363,7 +1345,7 @@
                 <w:noProof/>
                 <w:webHidden/>
               </w:rPr>
-              <w:instrText xml:space="preserve"> PAGEREF _Toc226294814 \h </w:instrText>
+              <w:instrText xml:space="preserve"> PAGEREF _Toc226298411 \h </w:instrText>
             </w:r>
             <w:r>
               <w:rPr>
@@ -1384,6 +1366,142 @@
                 <w:webHidden/>
               </w:rPr>
               <w:t>6</w:t>
+            </w:r>
+            <w:r>
+              <w:rPr>
+                <w:noProof/>
+                <w:webHidden/>
+              </w:rPr>
+              <w:fldChar w:fldCharType="end"/>
+            </w:r>
+          </w:hyperlink>
+        </w:p>
+        <w:p>
+          <w:pPr>
+            <w:pStyle w:val="TOC4"/>
+            <w:tabs>
+              <w:tab w:val="right" w:leader="dot" w:pos="9016"/>
+            </w:tabs>
+            <w:rPr>
+              <w:noProof/>
+            </w:rPr>
+          </w:pPr>
+          <w:hyperlink w:anchor="_Toc226298412" w:history="1">
+            <w:r>
+              <w:rPr>
+                <w:rStyle w:val="Hyperlink"/>
+                <w:noProof/>
+              </w:rPr>
+              <w:t>2.2.1.1 Perlin Noise</w:t>
+            </w:r>
+            <w:r>
+              <w:rPr>
+                <w:noProof/>
+                <w:webHidden/>
+              </w:rPr>
+              <w:tab/>
+            </w:r>
+            <w:r>
+              <w:rPr>
+                <w:noProof/>
+                <w:webHidden/>
+              </w:rPr>
+              <w:fldChar w:fldCharType="begin"/>
+            </w:r>
+            <w:r>
+              <w:rPr>
+                <w:noProof/>
+                <w:webHidden/>
+              </w:rPr>
+              <w:instrText xml:space="preserve"> PAGEREF _Toc226298412 \h </w:instrText>
+            </w:r>
+            <w:r>
+              <w:rPr>
+                <w:noProof/>
+                <w:webHidden/>
+              </w:rPr>
+            </w:r>
+            <w:r>
+              <w:rPr>
+                <w:noProof/>
+                <w:webHidden/>
+              </w:rPr>
+              <w:fldChar w:fldCharType="separate"/>
+            </w:r>
+            <w:r>
+              <w:rPr>
+                <w:noProof/>
+                <w:webHidden/>
+              </w:rPr>
+              <w:t>7</w:t>
+            </w:r>
+            <w:r>
+              <w:rPr>
+                <w:noProof/>
+                <w:webHidden/>
+              </w:rPr>
+              <w:fldChar w:fldCharType="end"/>
+            </w:r>
+          </w:hyperlink>
+        </w:p>
+        <w:p>
+          <w:pPr>
+            <w:pStyle w:val="TOC4"/>
+            <w:tabs>
+              <w:tab w:val="right" w:leader="dot" w:pos="9016"/>
+            </w:tabs>
+            <w:rPr>
+              <w:noProof/>
+            </w:rPr>
+          </w:pPr>
+          <w:hyperlink w:anchor="_Toc226298413" w:history="1">
+            <w:r>
+              <w:rPr>
+                <w:rStyle w:val="Hyperlink"/>
+                <w:noProof/>
+              </w:rPr>
+              <w:t>2.2.1.2 Binary Space Partitioning</w:t>
+            </w:r>
+            <w:r>
+              <w:rPr>
+                <w:noProof/>
+                <w:webHidden/>
+              </w:rPr>
+              <w:tab/>
+            </w:r>
+            <w:r>
+              <w:rPr>
+                <w:noProof/>
+                <w:webHidden/>
+              </w:rPr>
+              <w:fldChar w:fldCharType="begin"/>
+            </w:r>
+            <w:r>
+              <w:rPr>
+                <w:noProof/>
+                <w:webHidden/>
+              </w:rPr>
+              <w:instrText xml:space="preserve"> PAGEREF _Toc226298413 \h </w:instrText>
+            </w:r>
+            <w:r>
+              <w:rPr>
+                <w:noProof/>
+                <w:webHidden/>
+              </w:rPr>
+            </w:r>
+            <w:r>
+              <w:rPr>
+                <w:noProof/>
+                <w:webHidden/>
+              </w:rPr>
+              <w:fldChar w:fldCharType="separate"/>
+            </w:r>
+            <w:r>
+              <w:rPr>
+                <w:noProof/>
+                <w:webHidden/>
+              </w:rPr>
+              <w:t>7</w:t>
             </w:r>
             <w:r>
               <w:rPr>
@@ -1397,9 +1515,12 @@
         <w:p>
           <w:r>
             <w:rPr>
-              <w:b/>
-              <w:bCs/>
-              <w:noProof/>
+              <w:rFonts w:eastAsiaTheme="minorEastAsia" w:cs="Times New Roman"/>
+              <w:kern w:val="0"/>
+              <w:sz w:val="22"/>
+              <w:szCs w:val="22"/>
+              <w:lang w:val="en-US"/>
+              <w14:ligatures w14:val="none"/>
             </w:rPr>
             <w:fldChar w:fldCharType="end"/>
           </w:r>
@@ -1563,7 +1684,7 @@
         <w:pStyle w:val="Heading1"/>
         <w:jc w:val="center"/>
       </w:pPr>
-      <w:bookmarkStart w:id="0" w:name="_Toc226294800"/>
+      <w:bookmarkStart w:id="0" w:name="_Toc226298397"/>
       <w:r>
         <w:t>Chapter 1</w:t>
       </w:r>
@@ -1591,7 +1712,7 @@
           <w:u w:val="single"/>
         </w:rPr>
       </w:pPr>
-      <w:bookmarkStart w:id="1" w:name="_Toc226294801"/>
+      <w:bookmarkStart w:id="1" w:name="_Toc226298398"/>
       <w:r>
         <w:t>1.1</w:t>
       </w:r>
@@ -1636,7 +1757,7 @@
       <w:pPr>
         <w:pStyle w:val="Heading1"/>
       </w:pPr>
-      <w:bookmarkStart w:id="2" w:name="_Toc226294802"/>
+      <w:bookmarkStart w:id="2" w:name="_Toc226298399"/>
       <w:r>
         <w:lastRenderedPageBreak/>
         <w:t>1.2 Aims</w:t>
@@ -1644,7 +1765,7 @@
       <w:bookmarkEnd w:id="2"/>
     </w:p>
     <w:p>
-      <w:bookmarkStart w:id="3" w:name="_Toc226294803"/>
+      <w:bookmarkStart w:id="3" w:name="_Toc226298400"/>
       <w:r>
         <w:rPr>
           <w:rStyle w:val="Heading2Char"/>
@@ -1687,7 +1808,7 @@
       <w:pPr>
         <w:pStyle w:val="Heading2"/>
       </w:pPr>
-      <w:bookmarkStart w:id="4" w:name="_Toc226294804"/>
+      <w:bookmarkStart w:id="4" w:name="_Toc226298401"/>
       <w:r>
         <w:t>1.2.2 Additional Aims</w:t>
       </w:r>
@@ -1756,7 +1877,7 @@
       <w:pPr>
         <w:pStyle w:val="Heading1"/>
       </w:pPr>
-      <w:bookmarkStart w:id="5" w:name="_Toc226294805"/>
+      <w:bookmarkStart w:id="5" w:name="_Toc226298402"/>
       <w:r>
         <w:t>1.3 Objectives</w:t>
       </w:r>
@@ -1766,7 +1887,7 @@
       <w:pPr>
         <w:pStyle w:val="Heading2"/>
       </w:pPr>
-      <w:bookmarkStart w:id="6" w:name="_Toc226294806"/>
+      <w:bookmarkStart w:id="6" w:name="_Toc226298403"/>
       <w:r>
         <w:t>1.3.1 Scope</w:t>
       </w:r>
@@ -1838,7 +1959,7 @@
       <w:pPr>
         <w:pStyle w:val="Heading2"/>
       </w:pPr>
-      <w:bookmarkStart w:id="7" w:name="_Toc226294807"/>
+      <w:bookmarkStart w:id="7" w:name="_Toc226298404"/>
       <w:r>
         <w:t>1.3.2 Research Objectives</w:t>
       </w:r>
@@ -1886,7 +2007,7 @@
       <w:pPr>
         <w:pStyle w:val="Heading2"/>
       </w:pPr>
-      <w:bookmarkStart w:id="8" w:name="_Toc226294808"/>
+      <w:bookmarkStart w:id="8" w:name="_Toc226298405"/>
       <w:r>
         <w:t>1.3.3 Design Objectives</w:t>
       </w:r>
@@ -2002,7 +2123,7 @@
       <w:pPr>
         <w:pStyle w:val="Heading2"/>
       </w:pPr>
-      <w:bookmarkStart w:id="9" w:name="_Toc226294809"/>
+      <w:bookmarkStart w:id="9" w:name="_Toc226298406"/>
       <w:r>
         <w:t>1.3.4 Implementation Objectives</w:t>
       </w:r>
@@ -2122,7 +2243,7 @@
       <w:pPr>
         <w:pStyle w:val="Heading2"/>
       </w:pPr>
-      <w:bookmarkStart w:id="10" w:name="_Toc226294810"/>
+      <w:bookmarkStart w:id="10" w:name="_Toc226298407"/>
       <w:r>
         <w:t>1.3.5 Results, Evaluation and Playtesting Objectives</w:t>
       </w:r>
@@ -2178,7 +2299,7 @@
       <w:pPr>
         <w:pStyle w:val="Heading1"/>
       </w:pPr>
-      <w:bookmarkStart w:id="11" w:name="_Toc226294811"/>
+      <w:bookmarkStart w:id="11" w:name="_Toc226298408"/>
       <w:r>
         <w:t>Chapter 2 – Literature Survey</w:t>
       </w:r>
@@ -2188,7 +2309,7 @@
       <w:pPr>
         <w:pStyle w:val="Heading2"/>
       </w:pPr>
-      <w:bookmarkStart w:id="12" w:name="_Toc226294812"/>
+      <w:bookmarkStart w:id="12" w:name="_Toc226298409"/>
       <w:r>
         <w:t>2.1 Literature Survey Introduction</w:t>
       </w:r>
@@ -2227,7 +2348,7 @@
       <w:pPr>
         <w:pStyle w:val="Heading2"/>
       </w:pPr>
-      <w:bookmarkStart w:id="13" w:name="_Toc226294813"/>
+      <w:bookmarkStart w:id="13" w:name="_Toc226298410"/>
       <w:r>
         <w:t>2.2 Comparative Research</w:t>
       </w:r>
@@ -2245,7 +2366,7 @@
       <w:pPr>
         <w:pStyle w:val="Heading3"/>
       </w:pPr>
-      <w:bookmarkStart w:id="14" w:name="_Toc226294814"/>
+      <w:bookmarkStart w:id="14" w:name="_Toc226298411"/>
       <w:r>
         <w:t xml:space="preserve">2.2.1 </w:t>
       </w:r>
@@ -2256,7 +2377,25 @@
     </w:p>
     <w:p>
       <w:r>
-        <w:t>In 4X strategy games such as Civilization VI and Stellaris, world generation plays a crucial role in shaping how players explore, expand, and interact with the game environment. The structure and distribution of terrain, resources, and starting positions can dramatically influence both gameplay strategies and overall fairness.</w:t>
+        <w:t xml:space="preserve">In 4X strategy games such as </w:t>
+      </w:r>
+      <w:r>
+        <w:t xml:space="preserve">Sid Meier’s </w:t>
+      </w:r>
+      <w:r>
+        <w:t xml:space="preserve">Civilization VI </w:t>
+      </w:r>
+      <w:r>
+        <w:t xml:space="preserve">(2016) </w:t>
+      </w:r>
+      <w:r>
+        <w:t>and Stellaris</w:t>
+      </w:r>
+      <w:r>
+        <w:t xml:space="preserve"> (2016)</w:t>
+      </w:r>
+      <w:r>
+        <w:t>, world generation plays a crucial role in shaping how players explore, expand, and interact with the game environment. The structure and distribution of terrain, resources, and starting positions can dramatically influence both gameplay strategies and overall fairness.</w:t>
       </w:r>
       <w:r>
         <w:br/>
@@ -2269,7 +2408,13 @@
         <w:t xml:space="preserve">Games that will be researched for this section include </w:t>
       </w:r>
       <w:r>
-        <w:t xml:space="preserve">Minecraft (2009), Sid Meier’s </w:t>
+        <w:t>Minecraft (2009),</w:t>
+      </w:r>
+      <w:r>
+        <w:t xml:space="preserve"> Binding of Isaac (2011),</w:t>
+      </w:r>
+      <w:r>
+        <w:t xml:space="preserve"> Sid Meier’s </w:t>
       </w:r>
       <w:r>
         <w:t>Civilization VI (2016)</w:t>
@@ -2285,6 +2430,123 @@
       </w:r>
       <w:r>
         <w:t>)</w:t>
+      </w:r>
+      <w:r>
+        <w:t>.</w:t>
+      </w:r>
+    </w:p>
+    <w:p>
+      <w:pPr>
+        <w:pStyle w:val="Heading4"/>
+      </w:pPr>
+      <w:bookmarkStart w:id="15" w:name="_Toc226298412"/>
+      <w:r>
+        <w:t>2.2.1.1 Perlin Noise</w:t>
+      </w:r>
+      <w:bookmarkEnd w:id="15"/>
+    </w:p>
+    <w:p>
+      <w:r>
+        <w:t xml:space="preserve">Perlin Noise is used in </w:t>
+      </w:r>
+      <w:proofErr w:type="gramStart"/>
+      <w:r>
+        <w:t>the majority of</w:t>
+      </w:r>
+      <w:proofErr w:type="gramEnd"/>
+      <w:r>
+        <w:t xml:space="preserve"> world generations due to its versatility.</w:t>
+      </w:r>
+      <w:r>
+        <w:t xml:space="preserve"> It works through the use of layering</w:t>
+      </w:r>
+      <w:r>
+        <w:t xml:space="preserve"> </w:t>
+      </w:r>
+      <w:r>
+        <w:t>pseudo-random textures, also known as octaves, on top of each other and taking an average of each pixel’s value in the texture. The scale and lacunarity relate to how far you “view” the texture from and how much you “zoom” in on each successive octave.</w:t>
+      </w:r>
+      <w:r>
+        <w:br/>
+      </w:r>
+      <w:r>
+        <w:br/>
+      </w:r>
+      <w:r>
+        <w:t xml:space="preserve">In Minecraft (2009), </w:t>
+      </w:r>
+      <w:r>
+        <w:t xml:space="preserve">Sid Meier’s Civilization VI (2016) and Stellaris (2016), </w:t>
+      </w:r>
+      <w:r>
+        <w:t>it is used primarily to define the games biomes</w:t>
+      </w:r>
+      <w:r>
+        <w:t>, heightmaps</w:t>
+      </w:r>
+      <w:r>
+        <w:t xml:space="preserve"> and </w:t>
+      </w:r>
+      <w:r>
+        <w:t>resource distribution</w:t>
+      </w:r>
+      <w:r>
+        <w:t>. It is also used to create continents</w:t>
+      </w:r>
+      <w:r>
+        <w:t xml:space="preserve"> and other landmasses</w:t>
+      </w:r>
+      <w:r>
+        <w:t>.</w:t>
+      </w:r>
+    </w:p>
+    <w:p>
+      <w:pPr>
+        <w:pStyle w:val="Heading4"/>
+      </w:pPr>
+      <w:bookmarkStart w:id="16" w:name="_Toc226298413"/>
+      <w:r>
+        <w:t>2.2.1.2 Binary Space Partitioning</w:t>
+      </w:r>
+      <w:bookmarkEnd w:id="16"/>
+    </w:p>
+    <w:p>
+      <w:r>
+        <w:t>Binary Space Partitioning is used in many games</w:t>
+      </w:r>
+      <w:r>
+        <w:t>, often</w:t>
+      </w:r>
+      <w:r>
+        <w:t xml:space="preserve"> due to its low complexity and predictability. </w:t>
+      </w:r>
+      <w:r>
+        <w:t xml:space="preserve">It works by initially splitting a predefined area down the middle, this can be vertical or horizontal. The algorithm then picks one side and makes another division and keeps going until the desired number of divisions. Where the algorithm makes the next division can be based on </w:t>
+      </w:r>
+      <w:r>
+        <w:t>several</w:t>
+      </w:r>
+      <w:r>
+        <w:t xml:space="preserve"> </w:t>
+      </w:r>
+      <w:r>
+        <w:t>things</w:t>
+      </w:r>
+      <w:r>
+        <w:t xml:space="preserve"> such as a randomly generated number</w:t>
+      </w:r>
+      <w:r>
+        <w:t xml:space="preserve"> to define the side.</w:t>
+      </w:r>
+      <w:r>
+        <w:br/>
+      </w:r>
+      <w:r>
+        <w:br/>
+        <w:t>In The Binding of Isaac (2011), this is used to generate the floor layout</w:t>
+      </w:r>
+      <w:r>
+        <w:t xml:space="preserve"> through recursive subdivision and assigning a room to each subdivision that can be connected together to allow the player to traverse a dungeon</w:t>
       </w:r>
       <w:r>
         <w:t>.</w:t>
@@ -3591,10 +3853,9 @@
     <w:next w:val="Normal"/>
     <w:link w:val="Heading4Char"/>
     <w:uiPriority w:val="9"/>
-    <w:semiHidden/>
     <w:unhideWhenUsed/>
     <w:qFormat/>
-    <w:rsid w:val="00DC7DB9"/>
+    <w:rsid w:val="00974C7B"/>
     <w:pPr>
       <w:keepNext/>
       <w:keepLines/>
@@ -3603,7 +3864,6 @@
     </w:pPr>
     <w:rPr>
       <w:rFonts w:eastAsiaTheme="majorEastAsia" w:cstheme="majorBidi"/>
-      <w:i/>
       <w:iCs/>
       <w:color w:val="0F4761" w:themeColor="accent1" w:themeShade="BF"/>
     </w:rPr>
@@ -3614,7 +3874,6 @@
     <w:next w:val="Normal"/>
     <w:link w:val="Heading5Char"/>
     <w:uiPriority w:val="9"/>
-    <w:semiHidden/>
     <w:unhideWhenUsed/>
     <w:qFormat/>
     <w:rsid w:val="00DC7DB9"/>
@@ -3720,6 +3979,7 @@
   <w:style w:type="character" w:default="1" w:styleId="DefaultParagraphFont">
     <w:name w:val="Default Paragraph Font"/>
     <w:uiPriority w:val="1"/>
+    <w:semiHidden/>
     <w:unhideWhenUsed/>
   </w:style>
   <w:style w:type="table" w:default="1" w:styleId="TableNormal">
@@ -3787,11 +4047,9 @@
     <w:basedOn w:val="DefaultParagraphFont"/>
     <w:link w:val="Heading4"/>
     <w:uiPriority w:val="9"/>
-    <w:semiHidden/>
-    <w:rsid w:val="00DC7DB9"/>
+    <w:rsid w:val="00974C7B"/>
     <w:rPr>
       <w:rFonts w:eastAsiaTheme="majorEastAsia" w:cstheme="majorBidi"/>
-      <w:i/>
       <w:iCs/>
       <w:color w:val="0F4761" w:themeColor="accent1" w:themeShade="BF"/>
     </w:rPr>
@@ -3801,7 +4059,6 @@
     <w:basedOn w:val="DefaultParagraphFont"/>
     <w:link w:val="Heading5"/>
     <w:uiPriority w:val="9"/>
-    <w:semiHidden/>
     <w:rsid w:val="00DC7DB9"/>
     <w:rPr>
       <w:rFonts w:eastAsiaTheme="majorEastAsia" w:cstheme="majorBidi"/>
@@ -4132,6 +4389,19 @@
       <w:u w:val="single"/>
     </w:rPr>
   </w:style>
+  <w:style w:type="paragraph" w:styleId="TOC4">
+    <w:name w:val="toc 4"/>
+    <w:basedOn w:val="Normal"/>
+    <w:next w:val="Normal"/>
+    <w:autoRedefine/>
+    <w:uiPriority w:val="39"/>
+    <w:unhideWhenUsed/>
+    <w:rsid w:val="00236C8C"/>
+    <w:pPr>
+      <w:spacing w:after="100"/>
+      <w:ind w:left="720"/>
+    </w:pPr>
+  </w:style>
 </w:styles>
 </file>
 

</xml_diff>

<commit_message>
feat: cellular automata written
</commit_message>
<xml_diff>
--- a/Report.docx
+++ b/Report.docx
@@ -282,7 +282,7 @@
           <w:r>
             <w:fldChar w:fldCharType="separate"/>
           </w:r>
-          <w:hyperlink w:anchor="_Toc226298397" w:history="1">
+          <w:hyperlink w:anchor="_Toc226372212" w:history="1">
             <w:r>
               <w:rPr>
                 <w:rStyle w:val="Hyperlink"/>
@@ -309,7 +309,7 @@
                 <w:noProof/>
                 <w:webHidden/>
               </w:rPr>
-              <w:instrText xml:space="preserve"> PAGEREF _Toc226298397 \h </w:instrText>
+              <w:instrText xml:space="preserve"> PAGEREF _Toc226372212 \h </w:instrText>
             </w:r>
             <w:r>
               <w:rPr>
@@ -356,7 +356,7 @@
               <w14:ligatures w14:val="standardContextual"/>
             </w:rPr>
           </w:pPr>
-          <w:hyperlink w:anchor="_Toc226298398" w:history="1">
+          <w:hyperlink w:anchor="_Toc226372213" w:history="1">
             <w:r>
               <w:rPr>
                 <w:rStyle w:val="Hyperlink"/>
@@ -383,7 +383,7 @@
                 <w:noProof/>
                 <w:webHidden/>
               </w:rPr>
-              <w:instrText xml:space="preserve"> PAGEREF _Toc226298398 \h </w:instrText>
+              <w:instrText xml:space="preserve"> PAGEREF _Toc226372213 \h </w:instrText>
             </w:r>
             <w:r>
               <w:rPr>
@@ -430,7 +430,7 @@
               <w14:ligatures w14:val="standardContextual"/>
             </w:rPr>
           </w:pPr>
-          <w:hyperlink w:anchor="_Toc226298399" w:history="1">
+          <w:hyperlink w:anchor="_Toc226372214" w:history="1">
             <w:r>
               <w:rPr>
                 <w:rStyle w:val="Hyperlink"/>
@@ -457,7 +457,7 @@
                 <w:noProof/>
                 <w:webHidden/>
               </w:rPr>
-              <w:instrText xml:space="preserve"> PAGEREF _Toc226298399 \h </w:instrText>
+              <w:instrText xml:space="preserve"> PAGEREF _Toc226372214 \h </w:instrText>
             </w:r>
             <w:r>
               <w:rPr>
@@ -504,7 +504,7 @@
               <w14:ligatures w14:val="standardContextual"/>
             </w:rPr>
           </w:pPr>
-          <w:hyperlink w:anchor="_Toc226298400" w:history="1">
+          <w:hyperlink w:anchor="_Toc226372215" w:history="1">
             <w:r>
               <w:rPr>
                 <w:rStyle w:val="Hyperlink"/>
@@ -531,7 +531,7 @@
                 <w:noProof/>
                 <w:webHidden/>
               </w:rPr>
-              <w:instrText xml:space="preserve"> PAGEREF _Toc226298400 \h </w:instrText>
+              <w:instrText xml:space="preserve"> PAGEREF _Toc226372215 \h </w:instrText>
             </w:r>
             <w:r>
               <w:rPr>
@@ -578,7 +578,7 @@
               <w14:ligatures w14:val="standardContextual"/>
             </w:rPr>
           </w:pPr>
-          <w:hyperlink w:anchor="_Toc226298401" w:history="1">
+          <w:hyperlink w:anchor="_Toc226372216" w:history="1">
             <w:r>
               <w:rPr>
                 <w:rStyle w:val="Hyperlink"/>
@@ -605,7 +605,7 @@
                 <w:noProof/>
                 <w:webHidden/>
               </w:rPr>
-              <w:instrText xml:space="preserve"> PAGEREF _Toc226298401 \h </w:instrText>
+              <w:instrText xml:space="preserve"> PAGEREF _Toc226372216 \h </w:instrText>
             </w:r>
             <w:r>
               <w:rPr>
@@ -652,7 +652,7 @@
               <w14:ligatures w14:val="standardContextual"/>
             </w:rPr>
           </w:pPr>
-          <w:hyperlink w:anchor="_Toc226298402" w:history="1">
+          <w:hyperlink w:anchor="_Toc226372217" w:history="1">
             <w:r>
               <w:rPr>
                 <w:rStyle w:val="Hyperlink"/>
@@ -679,7 +679,7 @@
                 <w:noProof/>
                 <w:webHidden/>
               </w:rPr>
-              <w:instrText xml:space="preserve"> PAGEREF _Toc226298402 \h </w:instrText>
+              <w:instrText xml:space="preserve"> PAGEREF _Toc226372217 \h </w:instrText>
             </w:r>
             <w:r>
               <w:rPr>
@@ -726,7 +726,7 @@
               <w14:ligatures w14:val="standardContextual"/>
             </w:rPr>
           </w:pPr>
-          <w:hyperlink w:anchor="_Toc226298403" w:history="1">
+          <w:hyperlink w:anchor="_Toc226372218" w:history="1">
             <w:r>
               <w:rPr>
                 <w:rStyle w:val="Hyperlink"/>
@@ -753,7 +753,7 @@
                 <w:noProof/>
                 <w:webHidden/>
               </w:rPr>
-              <w:instrText xml:space="preserve"> PAGEREF _Toc226298403 \h </w:instrText>
+              <w:instrText xml:space="preserve"> PAGEREF _Toc226372218 \h </w:instrText>
             </w:r>
             <w:r>
               <w:rPr>
@@ -800,7 +800,7 @@
               <w14:ligatures w14:val="standardContextual"/>
             </w:rPr>
           </w:pPr>
-          <w:hyperlink w:anchor="_Toc226298404" w:history="1">
+          <w:hyperlink w:anchor="_Toc226372219" w:history="1">
             <w:r>
               <w:rPr>
                 <w:rStyle w:val="Hyperlink"/>
@@ -827,7 +827,7 @@
                 <w:noProof/>
                 <w:webHidden/>
               </w:rPr>
-              <w:instrText xml:space="preserve"> PAGEREF _Toc226298404 \h </w:instrText>
+              <w:instrText xml:space="preserve"> PAGEREF _Toc226372219 \h </w:instrText>
             </w:r>
             <w:r>
               <w:rPr>
@@ -874,7 +874,7 @@
               <w14:ligatures w14:val="standardContextual"/>
             </w:rPr>
           </w:pPr>
-          <w:hyperlink w:anchor="_Toc226298405" w:history="1">
+          <w:hyperlink w:anchor="_Toc226372220" w:history="1">
             <w:r>
               <w:rPr>
                 <w:rStyle w:val="Hyperlink"/>
@@ -901,7 +901,7 @@
                 <w:noProof/>
                 <w:webHidden/>
               </w:rPr>
-              <w:instrText xml:space="preserve"> PAGEREF _Toc226298405 \h </w:instrText>
+              <w:instrText xml:space="preserve"> PAGEREF _Toc226372220 \h </w:instrText>
             </w:r>
             <w:r>
               <w:rPr>
@@ -948,7 +948,7 @@
               <w14:ligatures w14:val="standardContextual"/>
             </w:rPr>
           </w:pPr>
-          <w:hyperlink w:anchor="_Toc226298406" w:history="1">
+          <w:hyperlink w:anchor="_Toc226372221" w:history="1">
             <w:r>
               <w:rPr>
                 <w:rStyle w:val="Hyperlink"/>
@@ -975,7 +975,7 @@
                 <w:noProof/>
                 <w:webHidden/>
               </w:rPr>
-              <w:instrText xml:space="preserve"> PAGEREF _Toc226298406 \h </w:instrText>
+              <w:instrText xml:space="preserve"> PAGEREF _Toc226372221 \h </w:instrText>
             </w:r>
             <w:r>
               <w:rPr>
@@ -995,7 +995,7 @@
                 <w:noProof/>
                 <w:webHidden/>
               </w:rPr>
-              <w:t>5</w:t>
+              <w:t>6</w:t>
             </w:r>
             <w:r>
               <w:rPr>
@@ -1022,7 +1022,7 @@
               <w14:ligatures w14:val="standardContextual"/>
             </w:rPr>
           </w:pPr>
-          <w:hyperlink w:anchor="_Toc226298407" w:history="1">
+          <w:hyperlink w:anchor="_Toc226372222" w:history="1">
             <w:r>
               <w:rPr>
                 <w:rStyle w:val="Hyperlink"/>
@@ -1049,7 +1049,7 @@
                 <w:noProof/>
                 <w:webHidden/>
               </w:rPr>
-              <w:instrText xml:space="preserve"> PAGEREF _Toc226298407 \h </w:instrText>
+              <w:instrText xml:space="preserve"> PAGEREF _Toc226372222 \h </w:instrText>
             </w:r>
             <w:r>
               <w:rPr>
@@ -1096,7 +1096,7 @@
               <w14:ligatures w14:val="standardContextual"/>
             </w:rPr>
           </w:pPr>
-          <w:hyperlink w:anchor="_Toc226298408" w:history="1">
+          <w:hyperlink w:anchor="_Toc226372223" w:history="1">
             <w:r>
               <w:rPr>
                 <w:rStyle w:val="Hyperlink"/>
@@ -1123,7 +1123,7 @@
                 <w:noProof/>
                 <w:webHidden/>
               </w:rPr>
-              <w:instrText xml:space="preserve"> PAGEREF _Toc226298408 \h </w:instrText>
+              <w:instrText xml:space="preserve"> PAGEREF _Toc226372223 \h </w:instrText>
             </w:r>
             <w:r>
               <w:rPr>
@@ -1170,7 +1170,7 @@
               <w14:ligatures w14:val="standardContextual"/>
             </w:rPr>
           </w:pPr>
-          <w:hyperlink w:anchor="_Toc226298409" w:history="1">
+          <w:hyperlink w:anchor="_Toc226372224" w:history="1">
             <w:r>
               <w:rPr>
                 <w:rStyle w:val="Hyperlink"/>
@@ -1197,7 +1197,7 @@
                 <w:noProof/>
                 <w:webHidden/>
               </w:rPr>
-              <w:instrText xml:space="preserve"> PAGEREF _Toc226298409 \h </w:instrText>
+              <w:instrText xml:space="preserve"> PAGEREF _Toc226372224 \h </w:instrText>
             </w:r>
             <w:r>
               <w:rPr>
@@ -1244,7 +1244,7 @@
               <w14:ligatures w14:val="standardContextual"/>
             </w:rPr>
           </w:pPr>
-          <w:hyperlink w:anchor="_Toc226298410" w:history="1">
+          <w:hyperlink w:anchor="_Toc226372225" w:history="1">
             <w:r>
               <w:rPr>
                 <w:rStyle w:val="Hyperlink"/>
@@ -1271,7 +1271,7 @@
                 <w:noProof/>
                 <w:webHidden/>
               </w:rPr>
-              <w:instrText xml:space="preserve"> PAGEREF _Toc226298410 \h </w:instrText>
+              <w:instrText xml:space="preserve"> PAGEREF _Toc226372225 \h </w:instrText>
             </w:r>
             <w:r>
               <w:rPr>
@@ -1318,7 +1318,7 @@
               <w14:ligatures w14:val="standardContextual"/>
             </w:rPr>
           </w:pPr>
-          <w:hyperlink w:anchor="_Toc226298411" w:history="1">
+          <w:hyperlink w:anchor="_Toc226372226" w:history="1">
             <w:r>
               <w:rPr>
                 <w:rStyle w:val="Hyperlink"/>
@@ -1345,7 +1345,7 @@
                 <w:noProof/>
                 <w:webHidden/>
               </w:rPr>
-              <w:instrText xml:space="preserve"> PAGEREF _Toc226298411 \h </w:instrText>
+              <w:instrText xml:space="preserve"> PAGEREF _Toc226372226 \h </w:instrText>
             </w:r>
             <w:r>
               <w:rPr>
@@ -1383,10 +1383,12 @@
               <w:tab w:val="right" w:leader="dot" w:pos="9016"/>
             </w:tabs>
             <w:rPr>
+              <w:rFonts w:eastAsiaTheme="minorEastAsia"/>
               <w:noProof/>
+              <w:lang w:eastAsia="en-GB"/>
             </w:rPr>
           </w:pPr>
-          <w:hyperlink w:anchor="_Toc226298412" w:history="1">
+          <w:hyperlink w:anchor="_Toc226372227" w:history="1">
             <w:r>
               <w:rPr>
                 <w:rStyle w:val="Hyperlink"/>
@@ -1413,7 +1415,7 @@
                 <w:noProof/>
                 <w:webHidden/>
               </w:rPr>
-              <w:instrText xml:space="preserve"> PAGEREF _Toc226298412 \h </w:instrText>
+              <w:instrText xml:space="preserve"> PAGEREF _Toc226372227 \h </w:instrText>
             </w:r>
             <w:r>
               <w:rPr>
@@ -1451,10 +1453,12 @@
               <w:tab w:val="right" w:leader="dot" w:pos="9016"/>
             </w:tabs>
             <w:rPr>
+              <w:rFonts w:eastAsiaTheme="minorEastAsia"/>
               <w:noProof/>
+              <w:lang w:eastAsia="en-GB"/>
             </w:rPr>
           </w:pPr>
-          <w:hyperlink w:anchor="_Toc226298413" w:history="1">
+          <w:hyperlink w:anchor="_Toc226372228" w:history="1">
             <w:r>
               <w:rPr>
                 <w:rStyle w:val="Hyperlink"/>
@@ -1481,7 +1485,7 @@
                 <w:noProof/>
                 <w:webHidden/>
               </w:rPr>
-              <w:instrText xml:space="preserve"> PAGEREF _Toc226298413 \h </w:instrText>
+              <w:instrText xml:space="preserve"> PAGEREF _Toc226372228 \h </w:instrText>
             </w:r>
             <w:r>
               <w:rPr>
@@ -1502,6 +1506,150 @@
                 <w:webHidden/>
               </w:rPr>
               <w:t>7</w:t>
+            </w:r>
+            <w:r>
+              <w:rPr>
+                <w:noProof/>
+                <w:webHidden/>
+              </w:rPr>
+              <w:fldChar w:fldCharType="end"/>
+            </w:r>
+          </w:hyperlink>
+        </w:p>
+        <w:p>
+          <w:pPr>
+            <w:pStyle w:val="TOC4"/>
+            <w:tabs>
+              <w:tab w:val="right" w:leader="dot" w:pos="9016"/>
+            </w:tabs>
+            <w:rPr>
+              <w:rFonts w:eastAsiaTheme="minorEastAsia"/>
+              <w:noProof/>
+              <w:lang w:eastAsia="en-GB"/>
+            </w:rPr>
+          </w:pPr>
+          <w:hyperlink w:anchor="_Toc226372229" w:history="1">
+            <w:r>
+              <w:rPr>
+                <w:rStyle w:val="Hyperlink"/>
+                <w:noProof/>
+              </w:rPr>
+              <w:t>2.2.1.3 Cellular Automata</w:t>
+            </w:r>
+            <w:r>
+              <w:rPr>
+                <w:noProof/>
+                <w:webHidden/>
+              </w:rPr>
+              <w:tab/>
+            </w:r>
+            <w:r>
+              <w:rPr>
+                <w:noProof/>
+                <w:webHidden/>
+              </w:rPr>
+              <w:fldChar w:fldCharType="begin"/>
+            </w:r>
+            <w:r>
+              <w:rPr>
+                <w:noProof/>
+                <w:webHidden/>
+              </w:rPr>
+              <w:instrText xml:space="preserve"> PAGEREF _Toc226372229 \h </w:instrText>
+            </w:r>
+            <w:r>
+              <w:rPr>
+                <w:noProof/>
+                <w:webHidden/>
+              </w:rPr>
+            </w:r>
+            <w:r>
+              <w:rPr>
+                <w:noProof/>
+                <w:webHidden/>
+              </w:rPr>
+              <w:fldChar w:fldCharType="separate"/>
+            </w:r>
+            <w:r>
+              <w:rPr>
+                <w:noProof/>
+                <w:webHidden/>
+              </w:rPr>
+              <w:t>7</w:t>
+            </w:r>
+            <w:r>
+              <w:rPr>
+                <w:noProof/>
+                <w:webHidden/>
+              </w:rPr>
+              <w:fldChar w:fldCharType="end"/>
+            </w:r>
+          </w:hyperlink>
+        </w:p>
+        <w:p>
+          <w:pPr>
+            <w:pStyle w:val="TOC1"/>
+            <w:tabs>
+              <w:tab w:val="right" w:leader="dot" w:pos="9016"/>
+            </w:tabs>
+            <w:rPr>
+              <w:rFonts w:cstheme="minorBidi"/>
+              <w:noProof/>
+              <w:kern w:val="2"/>
+              <w:sz w:val="24"/>
+              <w:szCs w:val="24"/>
+              <w:lang w:val="en-GB" w:eastAsia="en-GB"/>
+              <w14:ligatures w14:val="standardContextual"/>
+            </w:rPr>
+          </w:pPr>
+          <w:hyperlink w:anchor="_Toc226372230" w:history="1">
+            <w:r>
+              <w:rPr>
+                <w:rStyle w:val="Hyperlink"/>
+                <w:noProof/>
+              </w:rPr>
+              <w:t>References</w:t>
+            </w:r>
+            <w:r>
+              <w:rPr>
+                <w:noProof/>
+                <w:webHidden/>
+              </w:rPr>
+              <w:tab/>
+            </w:r>
+            <w:r>
+              <w:rPr>
+                <w:noProof/>
+                <w:webHidden/>
+              </w:rPr>
+              <w:fldChar w:fldCharType="begin"/>
+            </w:r>
+            <w:r>
+              <w:rPr>
+                <w:noProof/>
+                <w:webHidden/>
+              </w:rPr>
+              <w:instrText xml:space="preserve"> PAGEREF _Toc226372230 \h </w:instrText>
+            </w:r>
+            <w:r>
+              <w:rPr>
+                <w:noProof/>
+                <w:webHidden/>
+              </w:rPr>
+            </w:r>
+            <w:r>
+              <w:rPr>
+                <w:noProof/>
+                <w:webHidden/>
+              </w:rPr>
+              <w:fldChar w:fldCharType="separate"/>
+            </w:r>
+            <w:r>
+              <w:rPr>
+                <w:noProof/>
+                <w:webHidden/>
+              </w:rPr>
+              <w:t>8</w:t>
             </w:r>
             <w:r>
               <w:rPr>
@@ -1684,7 +1832,7 @@
         <w:pStyle w:val="Heading1"/>
         <w:jc w:val="center"/>
       </w:pPr>
-      <w:bookmarkStart w:id="0" w:name="_Toc226298397"/>
+      <w:bookmarkStart w:id="0" w:name="_Toc226372212"/>
       <w:r>
         <w:t>Chapter 1</w:t>
       </w:r>
@@ -1712,7 +1860,7 @@
           <w:u w:val="single"/>
         </w:rPr>
       </w:pPr>
-      <w:bookmarkStart w:id="1" w:name="_Toc226298398"/>
+      <w:bookmarkStart w:id="1" w:name="_Toc226372213"/>
       <w:r>
         <w:t>1.1</w:t>
       </w:r>
@@ -1749,7 +1897,11 @@
     <w:p/>
     <w:p>
       <w:r>
-        <w:t>The game will start the player off in a randomly generated world on a roughly equidistant tile from any other players, giving them the freedom to settle their first city immediately or to move them around to somewhere that may be more suited to their playstyle. The player will then be able to farm the lands resources to stimulate city growth, population growth and overall production. I have designed the game in this way to hopefully create a replay-able and fun game for players to enjoy and come back to.</w:t>
+        <w:t xml:space="preserve">The game will start the player off in a randomly generated world on a roughly equidistant tile from any other players, giving them the freedom to settle their first city immediately or to move them around to somewhere that may be more suited to their playstyle. The </w:t>
+      </w:r>
+      <w:r>
+        <w:lastRenderedPageBreak/>
+        <w:t>player will then be able to farm the lands resources to stimulate city growth, population growth and overall production. I have designed the game in this way to hopefully create a replay-able and fun game for players to enjoy and come back to.</w:t>
       </w:r>
     </w:p>
     <w:p/>
@@ -1757,15 +1909,14 @@
       <w:pPr>
         <w:pStyle w:val="Heading1"/>
       </w:pPr>
-      <w:bookmarkStart w:id="2" w:name="_Toc226298399"/>
-      <w:r>
-        <w:lastRenderedPageBreak/>
+      <w:bookmarkStart w:id="2" w:name="_Toc226372214"/>
+      <w:r>
         <w:t>1.2 Aims</w:t>
       </w:r>
       <w:bookmarkEnd w:id="2"/>
     </w:p>
     <w:p>
-      <w:bookmarkStart w:id="3" w:name="_Toc226298400"/>
+      <w:bookmarkStart w:id="3" w:name="_Toc226372215"/>
       <w:r>
         <w:rPr>
           <w:rStyle w:val="Heading2Char"/>
@@ -1808,7 +1959,7 @@
       <w:pPr>
         <w:pStyle w:val="Heading2"/>
       </w:pPr>
-      <w:bookmarkStart w:id="4" w:name="_Toc226298401"/>
+      <w:bookmarkStart w:id="4" w:name="_Toc226372216"/>
       <w:r>
         <w:t>1.2.2 Additional Aims</w:t>
       </w:r>
@@ -1877,7 +2028,7 @@
       <w:pPr>
         <w:pStyle w:val="Heading1"/>
       </w:pPr>
-      <w:bookmarkStart w:id="5" w:name="_Toc226298402"/>
+      <w:bookmarkStart w:id="5" w:name="_Toc226372217"/>
       <w:r>
         <w:t>1.3 Objectives</w:t>
       </w:r>
@@ -1887,7 +2038,7 @@
       <w:pPr>
         <w:pStyle w:val="Heading2"/>
       </w:pPr>
-      <w:bookmarkStart w:id="6" w:name="_Toc226298403"/>
+      <w:bookmarkStart w:id="6" w:name="_Toc226372218"/>
       <w:r>
         <w:t>1.3.1 Scope</w:t>
       </w:r>
@@ -1927,6 +2078,7 @@
         </w:numPr>
       </w:pPr>
       <w:r>
+        <w:lastRenderedPageBreak/>
         <w:t>A working controller for the player that not only feels dynamic but allows the player to control their units and cities in the way they want.</w:t>
       </w:r>
     </w:p>
@@ -1951,7 +2103,6 @@
         </w:numPr>
       </w:pPr>
       <w:r>
-        <w:lastRenderedPageBreak/>
         <w:t>A way to significantly amplify the weighting of the data fed into the machine learning model to ensure it learns more from the player than its original training, allowing responsive actions in subsequent games.</w:t>
       </w:r>
     </w:p>
@@ -1959,7 +2110,7 @@
       <w:pPr>
         <w:pStyle w:val="Heading2"/>
       </w:pPr>
-      <w:bookmarkStart w:id="7" w:name="_Toc226298404"/>
+      <w:bookmarkStart w:id="7" w:name="_Toc226372219"/>
       <w:r>
         <w:t>1.3.2 Research Objectives</w:t>
       </w:r>
@@ -2007,7 +2158,7 @@
       <w:pPr>
         <w:pStyle w:val="Heading2"/>
       </w:pPr>
-      <w:bookmarkStart w:id="8" w:name="_Toc226298405"/>
+      <w:bookmarkStart w:id="8" w:name="_Toc226372220"/>
       <w:r>
         <w:t>1.3.3 Design Objectives</w:t>
       </w:r>
@@ -2123,8 +2274,9 @@
       <w:pPr>
         <w:pStyle w:val="Heading2"/>
       </w:pPr>
-      <w:bookmarkStart w:id="9" w:name="_Toc226298406"/>
-      <w:r>
+      <w:bookmarkStart w:id="9" w:name="_Toc226372221"/>
+      <w:r>
+        <w:lastRenderedPageBreak/>
         <w:t>1.3.4 Implementation Objectives</w:t>
       </w:r>
       <w:bookmarkEnd w:id="9"/>
@@ -2143,7 +2295,6 @@
         </w:numPr>
       </w:pPr>
       <w:r>
-        <w:lastRenderedPageBreak/>
         <w:t>Create the world generation.</w:t>
       </w:r>
     </w:p>
@@ -2243,7 +2394,7 @@
       <w:pPr>
         <w:pStyle w:val="Heading2"/>
       </w:pPr>
-      <w:bookmarkStart w:id="10" w:name="_Toc226298407"/>
+      <w:bookmarkStart w:id="10" w:name="_Toc226372222"/>
       <w:r>
         <w:t>1.3.5 Results, Evaluation and Playtesting Objectives</w:t>
       </w:r>
@@ -2299,7 +2450,7 @@
       <w:pPr>
         <w:pStyle w:val="Heading1"/>
       </w:pPr>
-      <w:bookmarkStart w:id="11" w:name="_Toc226298408"/>
+      <w:bookmarkStart w:id="11" w:name="_Toc226372223"/>
       <w:r>
         <w:t>Chapter 2 – Literature Survey</w:t>
       </w:r>
@@ -2309,7 +2460,7 @@
       <w:pPr>
         <w:pStyle w:val="Heading2"/>
       </w:pPr>
-      <w:bookmarkStart w:id="12" w:name="_Toc226298409"/>
+      <w:bookmarkStart w:id="12" w:name="_Toc226372224"/>
       <w:r>
         <w:t>2.1 Literature Survey Introduction</w:t>
       </w:r>
@@ -2348,7 +2499,7 @@
       <w:pPr>
         <w:pStyle w:val="Heading2"/>
       </w:pPr>
-      <w:bookmarkStart w:id="13" w:name="_Toc226298410"/>
+      <w:bookmarkStart w:id="13" w:name="_Toc226372225"/>
       <w:r>
         <w:t>2.2 Comparative Research</w:t>
       </w:r>
@@ -2366,7 +2517,7 @@
       <w:pPr>
         <w:pStyle w:val="Heading3"/>
       </w:pPr>
-      <w:bookmarkStart w:id="14" w:name="_Toc226298411"/>
+      <w:bookmarkStart w:id="14" w:name="_Toc226372226"/>
       <w:r>
         <w:t xml:space="preserve">2.2.1 </w:t>
       </w:r>
@@ -2395,25 +2546,32 @@
         <w:t xml:space="preserve"> (2016)</w:t>
       </w:r>
       <w:r>
-        <w:t>, world generation plays a crucial role in shaping how players explore, expand, and interact with the game environment. The structure and distribution of terrain, resources, and starting positions can dramatically influence both gameplay strategies and overall fairness.</w:t>
+        <w:t xml:space="preserve">, world generation plays a crucial role in shaping how players explore, expand, and interact with </w:t>
+      </w:r>
+      <w:r>
+        <w:lastRenderedPageBreak/>
+        <w:t>the game environment. The structure and distribution of terrain, resources, and starting positions can dramatically influence both gameplay strategies and overall fairness.</w:t>
       </w:r>
       <w:r>
         <w:br/>
       </w:r>
       <w:r>
         <w:br/>
-      </w:r>
-      <w:r>
-        <w:lastRenderedPageBreak/>
         <w:t xml:space="preserve">Games that will be researched for this section include </w:t>
       </w:r>
       <w:r>
         <w:t>Minecraft (2009),</w:t>
       </w:r>
       <w:r>
+        <w:t xml:space="preserve"> The</w:t>
+      </w:r>
+      <w:r>
         <w:t xml:space="preserve"> Binding of Isaac (2011),</w:t>
       </w:r>
       <w:r>
+        <w:t xml:space="preserve"> Terraria (2011),</w:t>
+      </w:r>
+      <w:r>
         <w:t xml:space="preserve"> Sid Meier’s </w:t>
       </w:r>
       <w:r>
@@ -2439,7 +2597,7 @@
       <w:pPr>
         <w:pStyle w:val="Heading4"/>
       </w:pPr>
-      <w:bookmarkStart w:id="15" w:name="_Toc226298412"/>
+      <w:bookmarkStart w:id="15" w:name="_Toc226372227"/>
       <w:r>
         <w:t>2.2.1.1 Perlin Noise</w:t>
       </w:r>
@@ -2504,7 +2662,7 @@
       <w:pPr>
         <w:pStyle w:val="Heading4"/>
       </w:pPr>
-      <w:bookmarkStart w:id="16" w:name="_Toc226298413"/>
+      <w:bookmarkStart w:id="16" w:name="_Toc226372228"/>
       <w:r>
         <w:t>2.2.1.2 Binary Space Partitioning</w:t>
       </w:r>
@@ -2552,6 +2710,206 @@
         <w:t>.</w:t>
       </w:r>
     </w:p>
+    <w:p>
+      <w:pPr>
+        <w:pStyle w:val="Heading4"/>
+      </w:pPr>
+      <w:bookmarkStart w:id="17" w:name="_Toc226372229"/>
+      <w:r>
+        <w:t>2.2.1.3 Cellular Automata</w:t>
+      </w:r>
+      <w:bookmarkEnd w:id="17"/>
+    </w:p>
+    <w:p>
+      <w:r>
+        <w:t xml:space="preserve">Cellular Automata is used mostly within 2D games, often due to its customizability and simplicity in defining rules. It works by defining a </w:t>
+      </w:r>
+      <w:r>
+        <w:t>grid</w:t>
+      </w:r>
+      <w:r>
+        <w:t xml:space="preserve"> </w:t>
+      </w:r>
+      <w:r>
+        <w:t>and then randomly placing the cells inside the grid. Then a ruleset can be defined, which in more simple designs, normally only consider the neighbouring tiles in the grid, such as moving towards another neighbour.</w:t>
+      </w:r>
+      <w:r>
+        <w:br/>
+      </w:r>
+      <w:r>
+        <w:br/>
+        <w:t xml:space="preserve">The most famous use of cellular automata is likely to be Conway’s Game of Life (1970) where it </w:t>
+      </w:r>
+      <w:r>
+        <w:t>is</w:t>
+      </w:r>
+      <w:r>
+        <w:t xml:space="preserve"> used </w:t>
+      </w:r>
+      <w:r>
+        <w:t>to “</w:t>
+      </w:r>
+      <w:r>
+        <w:t>evolve in discrete timestep</w:t>
+      </w:r>
+      <w:r>
+        <w:t xml:space="preserve">s (called </w:t>
+      </w:r>
+      <w:r>
+        <w:rPr>
+          <w:b/>
+          <w:bCs/>
+        </w:rPr>
+        <w:t>generations</w:t>
+      </w:r>
+      <w:r>
+        <w:t xml:space="preserve"> or </w:t>
+      </w:r>
+      <w:r>
+        <w:rPr>
+          <w:b/>
+          <w:bCs/>
+        </w:rPr>
+        <w:t>ticks</w:t>
+      </w:r>
+      <w:r>
+        <w:t>)</w:t>
+      </w:r>
+      <w:r>
+        <w:t xml:space="preserve"> according to the following two rules: If a cell is alive, it survives to the next generation if it has 2 or 3 live neighbors; otherwise it dies. If a cell is dead, it comes to life in the next generation if it has exactly 3 live neighbors; otherwise it stays dead.” </w:t>
+      </w:r>
+      <w:sdt>
+        <w:sdtPr>
+          <w:id w:val="1979023960"/>
+          <w:citation/>
+        </w:sdtPr>
+        <w:sdtContent>
+          <w:r>
+            <w:fldChar w:fldCharType="begin"/>
+          </w:r>
+          <w:r>
+            <w:instrText xml:space="preserve">CITATION Nat21 \l 2057 </w:instrText>
+          </w:r>
+          <w:r>
+            <w:fldChar w:fldCharType="separate"/>
+          </w:r>
+          <w:r>
+            <w:rPr>
+              <w:noProof/>
+            </w:rPr>
+            <w:t>(Johnston &amp; Greene, 2021)</w:t>
+          </w:r>
+          <w:r>
+            <w:fldChar w:fldCharType="end"/>
+          </w:r>
+        </w:sdtContent>
+      </w:sdt>
+      <w:r>
+        <w:br/>
+      </w:r>
+      <w:r>
+        <w:br/>
+      </w:r>
+      <w:r>
+        <w:lastRenderedPageBreak/>
+        <w:t xml:space="preserve">In Terraria (2011), cellular automata </w:t>
+      </w:r>
+      <w:r>
+        <w:t>are</w:t>
+      </w:r>
+      <w:r>
+        <w:t xml:space="preserve"> used in this exact way, the game randomly defines a grid and randomly places alive cells and dead cells in the grid, typically weighted to the bottom of the grid. The game then simulates a given number of ticks, and the output of that is the world map. At this stage, biomes can be identified in one of two ways, randomly allocating sections of the world to each desired biome or using the final “weighting” of the alive cells to create the biomes.</w:t>
+      </w:r>
+    </w:p>
+    <w:p/>
+    <w:p/>
+    <w:p/>
+    <w:bookmarkStart w:id="18" w:name="_Toc226372230" w:displacedByCustomXml="next"/>
+    <w:sdt>
+      <w:sdtPr>
+        <w:id w:val="783850805"/>
+        <w:docPartObj>
+          <w:docPartGallery w:val="Bibliographies"/>
+          <w:docPartUnique/>
+        </w:docPartObj>
+      </w:sdtPr>
+      <w:sdtEndPr>
+        <w:rPr>
+          <w:rFonts w:asciiTheme="minorHAnsi" w:eastAsiaTheme="minorHAnsi" w:hAnsiTheme="minorHAnsi" w:cstheme="minorBidi"/>
+          <w:color w:val="auto"/>
+          <w:sz w:val="24"/>
+          <w:szCs w:val="24"/>
+        </w:rPr>
+      </w:sdtEndPr>
+      <w:sdtContent>
+        <w:p>
+          <w:pPr>
+            <w:pStyle w:val="Heading1"/>
+          </w:pPr>
+          <w:r>
+            <w:t>References</w:t>
+          </w:r>
+          <w:bookmarkEnd w:id="18"/>
+        </w:p>
+        <w:sdt>
+          <w:sdtPr>
+            <w:id w:val="-573587230"/>
+            <w:bibliography/>
+          </w:sdtPr>
+          <w:sdtContent>
+            <w:p>
+              <w:pPr>
+                <w:pStyle w:val="Bibliography"/>
+                <w:rPr>
+                  <w:noProof/>
+                  <w:kern w:val="0"/>
+                  <w14:ligatures w14:val="none"/>
+                </w:rPr>
+              </w:pPr>
+              <w:r>
+                <w:fldChar w:fldCharType="begin"/>
+              </w:r>
+              <w:r>
+                <w:instrText xml:space="preserve"> BIBLIOGRAPHY </w:instrText>
+              </w:r>
+              <w:r>
+                <w:fldChar w:fldCharType="separate"/>
+              </w:r>
+              <w:r>
+                <w:rPr>
+                  <w:noProof/>
+                </w:rPr>
+                <w:t xml:space="preserve">Johnston, N. &amp; Greene, D., 2021. </w:t>
+              </w:r>
+              <w:r>
+                <w:rPr>
+                  <w:i/>
+                  <w:iCs/>
+                  <w:noProof/>
+                </w:rPr>
+                <w:t xml:space="preserve">Conway's Game of Life: Mathematics and Construction. </w:t>
+              </w:r>
+              <w:r>
+                <w:rPr>
+                  <w:noProof/>
+                </w:rPr>
+                <w:t>s.l.:Lulu.com.</w:t>
+              </w:r>
+            </w:p>
+            <w:p>
+              <w:r>
+                <w:rPr>
+                  <w:b/>
+                  <w:bCs/>
+                  <w:noProof/>
+                </w:rPr>
+                <w:fldChar w:fldCharType="end"/>
+              </w:r>
+            </w:p>
+          </w:sdtContent>
+        </w:sdt>
+      </w:sdtContent>
+    </w:sdt>
     <w:p/>
     <w:sectPr>
       <w:pgSz w:w="11906" w:h="16838"/>
@@ -2561,6 +2919,56 @@
     </w:sectPr>
   </w:body>
 </w:document>
+</file>
+
+<file path=word/endnotes.xml><?xml version="1.0" encoding="utf-8"?>
+<w:endnotes xmlns:wpc="http://schemas.microsoft.com/office/word/2010/wordprocessingCanvas" xmlns:cx="http://schemas.microsoft.com/office/drawing/2014/chartex" xmlns:cx1="http://schemas.microsoft.com/office/drawing/2015/9/8/chartex" xmlns:cx2="http://schemas.microsoft.com/office/drawing/2015/10/21/chartex" xmlns:cx3="http://schemas.microsoft.com/office/drawing/2016/5/9/chartex" xmlns:cx4="http://schemas.microsoft.com/office/drawing/2016/5/10/chartex" xmlns:cx5="http://schemas.microsoft.com/office/drawing/2016/5/11/chartex" xmlns:cx6="http://schemas.microsoft.com/office/drawing/2016/5/12/chartex" xmlns:cx7="http://schemas.microsoft.com/office/drawing/2016/5/13/chartex" xmlns:cx8="http://schemas.microsoft.com/office/drawing/2016/5/14/chartex" xmlns:mc="http://schemas.openxmlformats.org/markup-compatibility/2006" xmlns:aink="http://schemas.microsoft.com/office/drawing/2016/ink" xmlns:am3d="http://schemas.microsoft.com/office/drawing/2017/model3d" xmlns:o="urn:schemas-microsoft-com:office:office" xmlns:oel="http://schemas.microsoft.com/office/2019/extlst" xmlns:r="http://schemas.openxmlformats.org/officeDocument/2006/relationships" xmlns:m="http://schemas.openxmlformats.org/officeDocument/2006/math" xmlns:v="urn:schemas-microsoft-com:vml" xmlns:wp14="http://schemas.microsoft.com/office/word/2010/wordprocessingDrawing" xmlns:wp="http://schemas.openxmlformats.org/drawingml/2006/wordprocessingDrawing" xmlns:w10="urn:schemas-microsoft-com:office:word" xmlns:w="http://schemas.openxmlformats.org/wordprocessingml/2006/main" xmlns:w14="http://schemas.microsoft.com/office/word/2010/wordml" xmlns:w15="http://schemas.microsoft.com/office/word/2012/wordml" xmlns:w16cex="http://schemas.microsoft.com/office/word/2018/wordml/cex" xmlns:w16cid="http://schemas.microsoft.com/office/word/2016/wordml/cid" xmlns:w16="http://schemas.microsoft.com/office/word/2018/wordml" xmlns:w16du="http://schemas.microsoft.com/office/word/2023/wordml/word16du" xmlns:w16sdtdh="http://schemas.microsoft.com/office/word/2020/wordml/sdtdatahash" xmlns:w16sdtfl="http://schemas.microsoft.com/office/word/2024/wordml/sdtformatlock" xmlns:w16se="http://schemas.microsoft.com/office/word/2015/wordml/symex" xmlns:wpg="http://schemas.microsoft.com/office/word/2010/wordprocessingGroup" xmlns:wpi="http://schemas.microsoft.com/office/word/2010/wordprocessingInk" xmlns:wne="http://schemas.microsoft.com/office/word/2006/wordml" xmlns:wps="http://schemas.microsoft.com/office/word/2010/wordprocessingShape" mc:Ignorable="w14 w15 w16se w16cid w16 w16cex w16sdtdh w16sdtfl w16du wp14">
+  <w:endnote w:type="separator" w:id="-1">
+    <w:p>
+      <w:pPr>
+        <w:spacing w:after="0" w:line="240" w:lineRule="auto"/>
+      </w:pPr>
+      <w:r>
+        <w:separator/>
+      </w:r>
+    </w:p>
+  </w:endnote>
+  <w:endnote w:type="continuationSeparator" w:id="0">
+    <w:p>
+      <w:pPr>
+        <w:spacing w:after="0" w:line="240" w:lineRule="auto"/>
+      </w:pPr>
+      <w:r>
+        <w:continuationSeparator/>
+      </w:r>
+    </w:p>
+  </w:endnote>
+</w:endnotes>
+</file>
+
+<file path=word/footnotes.xml><?xml version="1.0" encoding="utf-8"?>
+<w:footnotes xmlns:wpc="http://schemas.microsoft.com/office/word/2010/wordprocessingCanvas" xmlns:cx="http://schemas.microsoft.com/office/drawing/2014/chartex" xmlns:cx1="http://schemas.microsoft.com/office/drawing/2015/9/8/chartex" xmlns:cx2="http://schemas.microsoft.com/office/drawing/2015/10/21/chartex" xmlns:cx3="http://schemas.microsoft.com/office/drawing/2016/5/9/chartex" xmlns:cx4="http://schemas.microsoft.com/office/drawing/2016/5/10/chartex" xmlns:cx5="http://schemas.microsoft.com/office/drawing/2016/5/11/chartex" xmlns:cx6="http://schemas.microsoft.com/office/drawing/2016/5/12/chartex" xmlns:cx7="http://schemas.microsoft.com/office/drawing/2016/5/13/chartex" xmlns:cx8="http://schemas.microsoft.com/office/drawing/2016/5/14/chartex" xmlns:mc="http://schemas.openxmlformats.org/markup-compatibility/2006" xmlns:aink="http://schemas.microsoft.com/office/drawing/2016/ink" xmlns:am3d="http://schemas.microsoft.com/office/drawing/2017/model3d" xmlns:o="urn:schemas-microsoft-com:office:office" xmlns:oel="http://schemas.microsoft.com/office/2019/extlst" xmlns:r="http://schemas.openxmlformats.org/officeDocument/2006/relationships" xmlns:m="http://schemas.openxmlformats.org/officeDocument/2006/math" xmlns:v="urn:schemas-microsoft-com:vml" xmlns:wp14="http://schemas.microsoft.com/office/word/2010/wordprocessingDrawing" xmlns:wp="http://schemas.openxmlformats.org/drawingml/2006/wordprocessingDrawing" xmlns:w10="urn:schemas-microsoft-com:office:word" xmlns:w="http://schemas.openxmlformats.org/wordprocessingml/2006/main" xmlns:w14="http://schemas.microsoft.com/office/word/2010/wordml" xmlns:w15="http://schemas.microsoft.com/office/word/2012/wordml" xmlns:w16cex="http://schemas.microsoft.com/office/word/2018/wordml/cex" xmlns:w16cid="http://schemas.microsoft.com/office/word/2016/wordml/cid" xmlns:w16="http://schemas.microsoft.com/office/word/2018/wordml" xmlns:w16du="http://schemas.microsoft.com/office/word/2023/wordml/word16du" xmlns:w16sdtdh="http://schemas.microsoft.com/office/word/2020/wordml/sdtdatahash" xmlns:w16sdtfl="http://schemas.microsoft.com/office/word/2024/wordml/sdtformatlock" xmlns:w16se="http://schemas.microsoft.com/office/word/2015/wordml/symex" xmlns:wpg="http://schemas.microsoft.com/office/word/2010/wordprocessingGroup" xmlns:wpi="http://schemas.microsoft.com/office/word/2010/wordprocessingInk" xmlns:wne="http://schemas.microsoft.com/office/word/2006/wordml" xmlns:wps="http://schemas.microsoft.com/office/word/2010/wordprocessingShape" mc:Ignorable="w14 w15 w16se w16cid w16 w16cex w16sdtdh w16sdtfl w16du wp14">
+  <w:footnote w:type="separator" w:id="-1">
+    <w:p>
+      <w:pPr>
+        <w:spacing w:after="0" w:line="240" w:lineRule="auto"/>
+      </w:pPr>
+      <w:r>
+        <w:separator/>
+      </w:r>
+    </w:p>
+  </w:footnote>
+  <w:footnote w:type="continuationSeparator" w:id="0">
+    <w:p>
+      <w:pPr>
+        <w:spacing w:after="0" w:line="240" w:lineRule="auto"/>
+      </w:pPr>
+      <w:r>
+        <w:continuationSeparator/>
+      </w:r>
+    </w:p>
+  </w:footnote>
+</w:footnotes>
 </file>
 
 <file path=word/numbering.xml><?xml version="1.0" encoding="utf-8"?>
@@ -3979,7 +4387,6 @@
   <w:style w:type="character" w:default="1" w:styleId="DefaultParagraphFont">
     <w:name w:val="Default Paragraph Font"/>
     <w:uiPriority w:val="1"/>
-    <w:semiHidden/>
     <w:unhideWhenUsed/>
   </w:style>
   <w:style w:type="table" w:default="1" w:styleId="TableNormal">
@@ -4402,6 +4809,53 @@
       <w:ind w:left="720"/>
     </w:pPr>
   </w:style>
+  <w:style w:type="paragraph" w:styleId="FootnoteText">
+    <w:name w:val="footnote text"/>
+    <w:basedOn w:val="Normal"/>
+    <w:link w:val="FootnoteTextChar"/>
+    <w:uiPriority w:val="99"/>
+    <w:semiHidden/>
+    <w:unhideWhenUsed/>
+    <w:rsid w:val="00285A05"/>
+    <w:pPr>
+      <w:spacing w:after="0" w:line="240" w:lineRule="auto"/>
+    </w:pPr>
+    <w:rPr>
+      <w:sz w:val="20"/>
+      <w:szCs w:val="20"/>
+    </w:rPr>
+  </w:style>
+  <w:style w:type="character" w:customStyle="1" w:styleId="FootnoteTextChar">
+    <w:name w:val="Footnote Text Char"/>
+    <w:basedOn w:val="DefaultParagraphFont"/>
+    <w:link w:val="FootnoteText"/>
+    <w:uiPriority w:val="99"/>
+    <w:semiHidden/>
+    <w:rsid w:val="00285A05"/>
+    <w:rPr>
+      <w:sz w:val="20"/>
+      <w:szCs w:val="20"/>
+    </w:rPr>
+  </w:style>
+  <w:style w:type="character" w:styleId="FootnoteReference">
+    <w:name w:val="footnote reference"/>
+    <w:basedOn w:val="DefaultParagraphFont"/>
+    <w:uiPriority w:val="99"/>
+    <w:semiHidden/>
+    <w:unhideWhenUsed/>
+    <w:rsid w:val="00285A05"/>
+    <w:rPr>
+      <w:vertAlign w:val="superscript"/>
+    </w:rPr>
+  </w:style>
+  <w:style w:type="paragraph" w:styleId="Bibliography">
+    <w:name w:val="Bibliography"/>
+    <w:basedOn w:val="Normal"/>
+    <w:next w:val="Normal"/>
+    <w:uiPriority w:val="37"/>
+    <w:unhideWhenUsed/>
+    <w:rsid w:val="00A54C5A"/>
+  </w:style>
 </w:styles>
 </file>
 
@@ -4720,12 +5174,57 @@
 </a:theme>
 </file>
 
+<file path=word/webextensions/taskpanes.xml><?xml version="1.0" encoding="utf-8"?>
+<wetp:taskpanes xmlns:wetp="http://schemas.microsoft.com/office/webextensions/taskpanes/2010/11">
+  <wetp:taskpane dockstate="right" visibility="0" width="438" row="0">
+    <wetp:webextensionref xmlns:r="http://schemas.openxmlformats.org/officeDocument/2006/relationships" r:id="rId1"/>
+  </wetp:taskpane>
+</wetp:taskpanes>
+</file>
+
+<file path=word/webextensions/webextension1.xml><?xml version="1.0" encoding="utf-8"?>
+<we:webextension xmlns:we="http://schemas.microsoft.com/office/webextensions/webextension/2010/11" id="{5BF6ED2A-9CCE-4431-AF07-7EF35AD6CD1C}">
+  <we:reference id="wa200007520" version="3.0.0.0" store="en-US" storeType="OMEX"/>
+  <we:alternateReferences>
+    <we:reference id="WA200007520" version="3.0.0.0" store="WA200007520" storeType="OMEX"/>
+  </we:alternateReferences>
+  <we:properties/>
+  <we:bindings/>
+  <we:snapshot xmlns:r="http://schemas.openxmlformats.org/officeDocument/2006/relationships"/>
+</we:webextension>
+</file>
+
 <file path=customXml/item1.xml><?xml version="1.0" encoding="utf-8"?>
-<b:Sources xmlns:b="http://schemas.openxmlformats.org/officeDocument/2006/bibliography" xmlns="http://schemas.openxmlformats.org/officeDocument/2006/bibliography" SelectedStyle="\APASixthEditionOfficeOnline.xsl" StyleName="APA" Version="6"/>
+<b:Sources xmlns:b="http://schemas.openxmlformats.org/officeDocument/2006/bibliography" xmlns="http://schemas.openxmlformats.org/officeDocument/2006/bibliography" SelectedStyle="\HarvardAnglia2008OfficeOnline.xsl" StyleName="Harvard - Anglia" Version="2008">
+  <b:Source>
+    <b:Tag>Nat21</b:Tag>
+    <b:SourceType>Book</b:SourceType>
+    <b:Guid>{2D5724FB-AA8D-415B-A304-B5DB8CB76ADA}</b:Guid>
+    <b:Title>Conway's Game of Life: Mathematics and Construction</b:Title>
+    <b:Year>2021</b:Year>
+    <b:URL>https://books.google.co.uk/books?hl=en&amp;lr=&amp;id=xSJlEAAAQBAJ&amp;oi=fnd&amp;pg=PP11&amp;dq=conway%27s+game+of+life&amp;ots=i-oUlnzH_D&amp;sig=rJaNq1200Lch9cZPl5uefvuvgYQ&amp;redir_esc=y#v=onepage&amp;q=conway's%20game%20of%20life&amp;f=false</b:URL>
+    <b:Author>
+      <b:Author>
+        <b:NameList>
+          <b:Person>
+            <b:Last>Johnston</b:Last>
+            <b:First>Nathaniel</b:First>
+          </b:Person>
+          <b:Person>
+            <b:Last>Greene</b:Last>
+            <b:First>Dave</b:First>
+          </b:Person>
+        </b:NameList>
+      </b:Author>
+    </b:Author>
+    <b:Publisher>Lulu.com</b:Publisher>
+    <b:RefOrder>1</b:RefOrder>
+  </b:Source>
+</b:Sources>
 </file>
 
 <file path=customXml/itemProps1.xml><?xml version="1.0" encoding="utf-8"?>
-<ds:datastoreItem xmlns:ds="http://schemas.openxmlformats.org/officeDocument/2006/customXml" ds:itemID="{AE742842-5E75-4103-A8F8-1833411D09B7}">
+<ds:datastoreItem xmlns:ds="http://schemas.openxmlformats.org/officeDocument/2006/customXml" ds:itemID="{9E88FB83-5452-4B1A-9665-091CDC67F8A3}">
   <ds:schemaRefs>
     <ds:schemaRef ds:uri="http://schemas.openxmlformats.org/officeDocument/2006/bibliography"/>
   </ds:schemaRefs>

</xml_diff>

<commit_message>
feat: pathfinding section written
</commit_message>
<xml_diff>
--- a/Report.docx
+++ b/Report.docx
@@ -282,7 +282,7 @@
           <w:r>
             <w:fldChar w:fldCharType="separate"/>
           </w:r>
-          <w:hyperlink w:anchor="_Toc226372212" w:history="1">
+          <w:hyperlink w:anchor="_Toc226378545" w:history="1">
             <w:r>
               <w:rPr>
                 <w:rStyle w:val="Hyperlink"/>
@@ -309,7 +309,7 @@
                 <w:noProof/>
                 <w:webHidden/>
               </w:rPr>
-              <w:instrText xml:space="preserve"> PAGEREF _Toc226372212 \h </w:instrText>
+              <w:instrText xml:space="preserve"> PAGEREF _Toc226378545 \h </w:instrText>
             </w:r>
             <w:r>
               <w:rPr>
@@ -356,7 +356,7 @@
               <w14:ligatures w14:val="standardContextual"/>
             </w:rPr>
           </w:pPr>
-          <w:hyperlink w:anchor="_Toc226372213" w:history="1">
+          <w:hyperlink w:anchor="_Toc226378546" w:history="1">
             <w:r>
               <w:rPr>
                 <w:rStyle w:val="Hyperlink"/>
@@ -383,7 +383,7 @@
                 <w:noProof/>
                 <w:webHidden/>
               </w:rPr>
-              <w:instrText xml:space="preserve"> PAGEREF _Toc226372213 \h </w:instrText>
+              <w:instrText xml:space="preserve"> PAGEREF _Toc226378546 \h </w:instrText>
             </w:r>
             <w:r>
               <w:rPr>
@@ -430,7 +430,7 @@
               <w14:ligatures w14:val="standardContextual"/>
             </w:rPr>
           </w:pPr>
-          <w:hyperlink w:anchor="_Toc226372214" w:history="1">
+          <w:hyperlink w:anchor="_Toc226378547" w:history="1">
             <w:r>
               <w:rPr>
                 <w:rStyle w:val="Hyperlink"/>
@@ -457,7 +457,7 @@
                 <w:noProof/>
                 <w:webHidden/>
               </w:rPr>
-              <w:instrText xml:space="preserve"> PAGEREF _Toc226372214 \h </w:instrText>
+              <w:instrText xml:space="preserve"> PAGEREF _Toc226378547 \h </w:instrText>
             </w:r>
             <w:r>
               <w:rPr>
@@ -504,7 +504,7 @@
               <w14:ligatures w14:val="standardContextual"/>
             </w:rPr>
           </w:pPr>
-          <w:hyperlink w:anchor="_Toc226372215" w:history="1">
+          <w:hyperlink w:anchor="_Toc226378548" w:history="1">
             <w:r>
               <w:rPr>
                 <w:rStyle w:val="Hyperlink"/>
@@ -531,7 +531,7 @@
                 <w:noProof/>
                 <w:webHidden/>
               </w:rPr>
-              <w:instrText xml:space="preserve"> PAGEREF _Toc226372215 \h </w:instrText>
+              <w:instrText xml:space="preserve"> PAGEREF _Toc226378548 \h </w:instrText>
             </w:r>
             <w:r>
               <w:rPr>
@@ -578,7 +578,7 @@
               <w14:ligatures w14:val="standardContextual"/>
             </w:rPr>
           </w:pPr>
-          <w:hyperlink w:anchor="_Toc226372216" w:history="1">
+          <w:hyperlink w:anchor="_Toc226378549" w:history="1">
             <w:r>
               <w:rPr>
                 <w:rStyle w:val="Hyperlink"/>
@@ -605,7 +605,7 @@
                 <w:noProof/>
                 <w:webHidden/>
               </w:rPr>
-              <w:instrText xml:space="preserve"> PAGEREF _Toc226372216 \h </w:instrText>
+              <w:instrText xml:space="preserve"> PAGEREF _Toc226378549 \h </w:instrText>
             </w:r>
             <w:r>
               <w:rPr>
@@ -652,7 +652,7 @@
               <w14:ligatures w14:val="standardContextual"/>
             </w:rPr>
           </w:pPr>
-          <w:hyperlink w:anchor="_Toc226372217" w:history="1">
+          <w:hyperlink w:anchor="_Toc226378550" w:history="1">
             <w:r>
               <w:rPr>
                 <w:rStyle w:val="Hyperlink"/>
@@ -679,7 +679,7 @@
                 <w:noProof/>
                 <w:webHidden/>
               </w:rPr>
-              <w:instrText xml:space="preserve"> PAGEREF _Toc226372217 \h </w:instrText>
+              <w:instrText xml:space="preserve"> PAGEREF _Toc226378550 \h </w:instrText>
             </w:r>
             <w:r>
               <w:rPr>
@@ -726,7 +726,7 @@
               <w14:ligatures w14:val="standardContextual"/>
             </w:rPr>
           </w:pPr>
-          <w:hyperlink w:anchor="_Toc226372218" w:history="1">
+          <w:hyperlink w:anchor="_Toc226378551" w:history="1">
             <w:r>
               <w:rPr>
                 <w:rStyle w:val="Hyperlink"/>
@@ -753,7 +753,7 @@
                 <w:noProof/>
                 <w:webHidden/>
               </w:rPr>
-              <w:instrText xml:space="preserve"> PAGEREF _Toc226372218 \h </w:instrText>
+              <w:instrText xml:space="preserve"> PAGEREF _Toc226378551 \h </w:instrText>
             </w:r>
             <w:r>
               <w:rPr>
@@ -800,7 +800,7 @@
               <w14:ligatures w14:val="standardContextual"/>
             </w:rPr>
           </w:pPr>
-          <w:hyperlink w:anchor="_Toc226372219" w:history="1">
+          <w:hyperlink w:anchor="_Toc226378552" w:history="1">
             <w:r>
               <w:rPr>
                 <w:rStyle w:val="Hyperlink"/>
@@ -827,7 +827,7 @@
                 <w:noProof/>
                 <w:webHidden/>
               </w:rPr>
-              <w:instrText xml:space="preserve"> PAGEREF _Toc226372219 \h </w:instrText>
+              <w:instrText xml:space="preserve"> PAGEREF _Toc226378552 \h </w:instrText>
             </w:r>
             <w:r>
               <w:rPr>
@@ -874,7 +874,7 @@
               <w14:ligatures w14:val="standardContextual"/>
             </w:rPr>
           </w:pPr>
-          <w:hyperlink w:anchor="_Toc226372220" w:history="1">
+          <w:hyperlink w:anchor="_Toc226378553" w:history="1">
             <w:r>
               <w:rPr>
                 <w:rStyle w:val="Hyperlink"/>
@@ -901,7 +901,7 @@
                 <w:noProof/>
                 <w:webHidden/>
               </w:rPr>
-              <w:instrText xml:space="preserve"> PAGEREF _Toc226372220 \h </w:instrText>
+              <w:instrText xml:space="preserve"> PAGEREF _Toc226378553 \h </w:instrText>
             </w:r>
             <w:r>
               <w:rPr>
@@ -948,7 +948,7 @@
               <w14:ligatures w14:val="standardContextual"/>
             </w:rPr>
           </w:pPr>
-          <w:hyperlink w:anchor="_Toc226372221" w:history="1">
+          <w:hyperlink w:anchor="_Toc226378554" w:history="1">
             <w:r>
               <w:rPr>
                 <w:rStyle w:val="Hyperlink"/>
@@ -975,7 +975,7 @@
                 <w:noProof/>
                 <w:webHidden/>
               </w:rPr>
-              <w:instrText xml:space="preserve"> PAGEREF _Toc226372221 \h </w:instrText>
+              <w:instrText xml:space="preserve"> PAGEREF _Toc226378554 \h </w:instrText>
             </w:r>
             <w:r>
               <w:rPr>
@@ -1022,7 +1022,7 @@
               <w14:ligatures w14:val="standardContextual"/>
             </w:rPr>
           </w:pPr>
-          <w:hyperlink w:anchor="_Toc226372222" w:history="1">
+          <w:hyperlink w:anchor="_Toc226378555" w:history="1">
             <w:r>
               <w:rPr>
                 <w:rStyle w:val="Hyperlink"/>
@@ -1049,7 +1049,7 @@
                 <w:noProof/>
                 <w:webHidden/>
               </w:rPr>
-              <w:instrText xml:space="preserve"> PAGEREF _Toc226372222 \h </w:instrText>
+              <w:instrText xml:space="preserve"> PAGEREF _Toc226378555 \h </w:instrText>
             </w:r>
             <w:r>
               <w:rPr>
@@ -1096,7 +1096,7 @@
               <w14:ligatures w14:val="standardContextual"/>
             </w:rPr>
           </w:pPr>
-          <w:hyperlink w:anchor="_Toc226372223" w:history="1">
+          <w:hyperlink w:anchor="_Toc226378556" w:history="1">
             <w:r>
               <w:rPr>
                 <w:rStyle w:val="Hyperlink"/>
@@ -1123,7 +1123,7 @@
                 <w:noProof/>
                 <w:webHidden/>
               </w:rPr>
-              <w:instrText xml:space="preserve"> PAGEREF _Toc226372223 \h </w:instrText>
+              <w:instrText xml:space="preserve"> PAGEREF _Toc226378556 \h </w:instrText>
             </w:r>
             <w:r>
               <w:rPr>
@@ -1170,7 +1170,7 @@
               <w14:ligatures w14:val="standardContextual"/>
             </w:rPr>
           </w:pPr>
-          <w:hyperlink w:anchor="_Toc226372224" w:history="1">
+          <w:hyperlink w:anchor="_Toc226378557" w:history="1">
             <w:r>
               <w:rPr>
                 <w:rStyle w:val="Hyperlink"/>
@@ -1197,7 +1197,7 @@
                 <w:noProof/>
                 <w:webHidden/>
               </w:rPr>
-              <w:instrText xml:space="preserve"> PAGEREF _Toc226372224 \h </w:instrText>
+              <w:instrText xml:space="preserve"> PAGEREF _Toc226378557 \h </w:instrText>
             </w:r>
             <w:r>
               <w:rPr>
@@ -1244,7 +1244,7 @@
               <w14:ligatures w14:val="standardContextual"/>
             </w:rPr>
           </w:pPr>
-          <w:hyperlink w:anchor="_Toc226372225" w:history="1">
+          <w:hyperlink w:anchor="_Toc226378558" w:history="1">
             <w:r>
               <w:rPr>
                 <w:rStyle w:val="Hyperlink"/>
@@ -1271,7 +1271,7 @@
                 <w:noProof/>
                 <w:webHidden/>
               </w:rPr>
-              <w:instrText xml:space="preserve"> PAGEREF _Toc226372225 \h </w:instrText>
+              <w:instrText xml:space="preserve"> PAGEREF _Toc226378558 \h </w:instrText>
             </w:r>
             <w:r>
               <w:rPr>
@@ -1318,7 +1318,7 @@
               <w14:ligatures w14:val="standardContextual"/>
             </w:rPr>
           </w:pPr>
-          <w:hyperlink w:anchor="_Toc226372226" w:history="1">
+          <w:hyperlink w:anchor="_Toc226378559" w:history="1">
             <w:r>
               <w:rPr>
                 <w:rStyle w:val="Hyperlink"/>
@@ -1345,7 +1345,7 @@
                 <w:noProof/>
                 <w:webHidden/>
               </w:rPr>
-              <w:instrText xml:space="preserve"> PAGEREF _Toc226372226 \h </w:instrText>
+              <w:instrText xml:space="preserve"> PAGEREF _Toc226378559 \h </w:instrText>
             </w:r>
             <w:r>
               <w:rPr>
@@ -1365,7 +1365,7 @@
                 <w:noProof/>
                 <w:webHidden/>
               </w:rPr>
-              <w:t>6</w:t>
+              <w:t>7</w:t>
             </w:r>
             <w:r>
               <w:rPr>
@@ -1388,7 +1388,7 @@
               <w:lang w:eastAsia="en-GB"/>
             </w:rPr>
           </w:pPr>
-          <w:hyperlink w:anchor="_Toc226372227" w:history="1">
+          <w:hyperlink w:anchor="_Toc226378560" w:history="1">
             <w:r>
               <w:rPr>
                 <w:rStyle w:val="Hyperlink"/>
@@ -1415,7 +1415,7 @@
                 <w:noProof/>
                 <w:webHidden/>
               </w:rPr>
-              <w:instrText xml:space="preserve"> PAGEREF _Toc226372227 \h </w:instrText>
+              <w:instrText xml:space="preserve"> PAGEREF _Toc226378560 \h </w:instrText>
             </w:r>
             <w:r>
               <w:rPr>
@@ -1458,7 +1458,7 @@
               <w:lang w:eastAsia="en-GB"/>
             </w:rPr>
           </w:pPr>
-          <w:hyperlink w:anchor="_Toc226372228" w:history="1">
+          <w:hyperlink w:anchor="_Toc226378561" w:history="1">
             <w:r>
               <w:rPr>
                 <w:rStyle w:val="Hyperlink"/>
@@ -1485,7 +1485,7 @@
                 <w:noProof/>
                 <w:webHidden/>
               </w:rPr>
-              <w:instrText xml:space="preserve"> PAGEREF _Toc226372228 \h </w:instrText>
+              <w:instrText xml:space="preserve"> PAGEREF _Toc226378561 \h </w:instrText>
             </w:r>
             <w:r>
               <w:rPr>
@@ -1528,7 +1528,7 @@
               <w:lang w:eastAsia="en-GB"/>
             </w:rPr>
           </w:pPr>
-          <w:hyperlink w:anchor="_Toc226372229" w:history="1">
+          <w:hyperlink w:anchor="_Toc226378562" w:history="1">
             <w:r>
               <w:rPr>
                 <w:rStyle w:val="Hyperlink"/>
@@ -1555,7 +1555,7 @@
                 <w:noProof/>
                 <w:webHidden/>
               </w:rPr>
-              <w:instrText xml:space="preserve"> PAGEREF _Toc226372229 \h </w:instrText>
+              <w:instrText xml:space="preserve"> PAGEREF _Toc226378562 \h </w:instrText>
             </w:r>
             <w:r>
               <w:rPr>
@@ -1576,6 +1576,290 @@
                 <w:webHidden/>
               </w:rPr>
               <w:t>7</w:t>
+            </w:r>
+            <w:r>
+              <w:rPr>
+                <w:noProof/>
+                <w:webHidden/>
+              </w:rPr>
+              <w:fldChar w:fldCharType="end"/>
+            </w:r>
+          </w:hyperlink>
+        </w:p>
+        <w:p>
+          <w:pPr>
+            <w:pStyle w:val="TOC3"/>
+            <w:tabs>
+              <w:tab w:val="right" w:leader="dot" w:pos="9016"/>
+            </w:tabs>
+            <w:rPr>
+              <w:rFonts w:cstheme="minorBidi"/>
+              <w:noProof/>
+              <w:kern w:val="2"/>
+              <w:sz w:val="24"/>
+              <w:szCs w:val="24"/>
+              <w:lang w:val="en-GB" w:eastAsia="en-GB"/>
+              <w14:ligatures w14:val="standardContextual"/>
+            </w:rPr>
+          </w:pPr>
+          <w:hyperlink w:anchor="_Toc226378563" w:history="1">
+            <w:r>
+              <w:rPr>
+                <w:rStyle w:val="Hyperlink"/>
+                <w:noProof/>
+              </w:rPr>
+              <w:t>2.2.2 Pathfinding</w:t>
+            </w:r>
+            <w:r>
+              <w:rPr>
+                <w:noProof/>
+                <w:webHidden/>
+              </w:rPr>
+              <w:tab/>
+            </w:r>
+            <w:r>
+              <w:rPr>
+                <w:noProof/>
+                <w:webHidden/>
+              </w:rPr>
+              <w:fldChar w:fldCharType="begin"/>
+            </w:r>
+            <w:r>
+              <w:rPr>
+                <w:noProof/>
+                <w:webHidden/>
+              </w:rPr>
+              <w:instrText xml:space="preserve"> PAGEREF _Toc226378563 \h </w:instrText>
+            </w:r>
+            <w:r>
+              <w:rPr>
+                <w:noProof/>
+                <w:webHidden/>
+              </w:rPr>
+            </w:r>
+            <w:r>
+              <w:rPr>
+                <w:noProof/>
+                <w:webHidden/>
+              </w:rPr>
+              <w:fldChar w:fldCharType="separate"/>
+            </w:r>
+            <w:r>
+              <w:rPr>
+                <w:noProof/>
+                <w:webHidden/>
+              </w:rPr>
+              <w:t>8</w:t>
+            </w:r>
+            <w:r>
+              <w:rPr>
+                <w:noProof/>
+                <w:webHidden/>
+              </w:rPr>
+              <w:fldChar w:fldCharType="end"/>
+            </w:r>
+          </w:hyperlink>
+        </w:p>
+        <w:p>
+          <w:pPr>
+            <w:pStyle w:val="TOC4"/>
+            <w:tabs>
+              <w:tab w:val="right" w:leader="dot" w:pos="9016"/>
+            </w:tabs>
+            <w:rPr>
+              <w:rFonts w:eastAsiaTheme="minorEastAsia"/>
+              <w:noProof/>
+              <w:lang w:eastAsia="en-GB"/>
+            </w:rPr>
+          </w:pPr>
+          <w:hyperlink w:anchor="_Toc226378564" w:history="1">
+            <w:r>
+              <w:rPr>
+                <w:rStyle w:val="Hyperlink"/>
+                <w:noProof/>
+              </w:rPr>
+              <w:t>2.2.2.1 Dijkstra</w:t>
+            </w:r>
+            <w:r>
+              <w:rPr>
+                <w:noProof/>
+                <w:webHidden/>
+              </w:rPr>
+              <w:tab/>
+            </w:r>
+            <w:r>
+              <w:rPr>
+                <w:noProof/>
+                <w:webHidden/>
+              </w:rPr>
+              <w:fldChar w:fldCharType="begin"/>
+            </w:r>
+            <w:r>
+              <w:rPr>
+                <w:noProof/>
+                <w:webHidden/>
+              </w:rPr>
+              <w:instrText xml:space="preserve"> PAGEREF _Toc226378564 \h </w:instrText>
+            </w:r>
+            <w:r>
+              <w:rPr>
+                <w:noProof/>
+                <w:webHidden/>
+              </w:rPr>
+            </w:r>
+            <w:r>
+              <w:rPr>
+                <w:noProof/>
+                <w:webHidden/>
+              </w:rPr>
+              <w:fldChar w:fldCharType="separate"/>
+            </w:r>
+            <w:r>
+              <w:rPr>
+                <w:noProof/>
+                <w:webHidden/>
+              </w:rPr>
+              <w:t>8</w:t>
+            </w:r>
+            <w:r>
+              <w:rPr>
+                <w:noProof/>
+                <w:webHidden/>
+              </w:rPr>
+              <w:fldChar w:fldCharType="end"/>
+            </w:r>
+          </w:hyperlink>
+        </w:p>
+        <w:p>
+          <w:pPr>
+            <w:pStyle w:val="TOC4"/>
+            <w:tabs>
+              <w:tab w:val="right" w:leader="dot" w:pos="9016"/>
+            </w:tabs>
+            <w:rPr>
+              <w:rFonts w:eastAsiaTheme="minorEastAsia"/>
+              <w:noProof/>
+              <w:lang w:eastAsia="en-GB"/>
+            </w:rPr>
+          </w:pPr>
+          <w:hyperlink w:anchor="_Toc226378565" w:history="1">
+            <w:r>
+              <w:rPr>
+                <w:rStyle w:val="Hyperlink"/>
+                <w:noProof/>
+              </w:rPr>
+              <w:t>2.2.2.2 A*</w:t>
+            </w:r>
+            <w:r>
+              <w:rPr>
+                <w:noProof/>
+                <w:webHidden/>
+              </w:rPr>
+              <w:tab/>
+            </w:r>
+            <w:r>
+              <w:rPr>
+                <w:noProof/>
+                <w:webHidden/>
+              </w:rPr>
+              <w:fldChar w:fldCharType="begin"/>
+            </w:r>
+            <w:r>
+              <w:rPr>
+                <w:noProof/>
+                <w:webHidden/>
+              </w:rPr>
+              <w:instrText xml:space="preserve"> PAGEREF _Toc226378565 \h </w:instrText>
+            </w:r>
+            <w:r>
+              <w:rPr>
+                <w:noProof/>
+                <w:webHidden/>
+              </w:rPr>
+            </w:r>
+            <w:r>
+              <w:rPr>
+                <w:noProof/>
+                <w:webHidden/>
+              </w:rPr>
+              <w:fldChar w:fldCharType="separate"/>
+            </w:r>
+            <w:r>
+              <w:rPr>
+                <w:noProof/>
+                <w:webHidden/>
+              </w:rPr>
+              <w:t>8</w:t>
+            </w:r>
+            <w:r>
+              <w:rPr>
+                <w:noProof/>
+                <w:webHidden/>
+              </w:rPr>
+              <w:fldChar w:fldCharType="end"/>
+            </w:r>
+          </w:hyperlink>
+        </w:p>
+        <w:p>
+          <w:pPr>
+            <w:pStyle w:val="TOC4"/>
+            <w:tabs>
+              <w:tab w:val="right" w:leader="dot" w:pos="9016"/>
+            </w:tabs>
+            <w:rPr>
+              <w:rFonts w:eastAsiaTheme="minorEastAsia"/>
+              <w:noProof/>
+              <w:lang w:eastAsia="en-GB"/>
+            </w:rPr>
+          </w:pPr>
+          <w:hyperlink w:anchor="_Toc226378566" w:history="1">
+            <w:r>
+              <w:rPr>
+                <w:rStyle w:val="Hyperlink"/>
+                <w:noProof/>
+              </w:rPr>
+              <w:t>2.2.2.3 Jump Point Search</w:t>
+            </w:r>
+            <w:r>
+              <w:rPr>
+                <w:noProof/>
+                <w:webHidden/>
+              </w:rPr>
+              <w:tab/>
+            </w:r>
+            <w:r>
+              <w:rPr>
+                <w:noProof/>
+                <w:webHidden/>
+              </w:rPr>
+              <w:fldChar w:fldCharType="begin"/>
+            </w:r>
+            <w:r>
+              <w:rPr>
+                <w:noProof/>
+                <w:webHidden/>
+              </w:rPr>
+              <w:instrText xml:space="preserve"> PAGEREF _Toc226378566 \h </w:instrText>
+            </w:r>
+            <w:r>
+              <w:rPr>
+                <w:noProof/>
+                <w:webHidden/>
+              </w:rPr>
+            </w:r>
+            <w:r>
+              <w:rPr>
+                <w:noProof/>
+                <w:webHidden/>
+              </w:rPr>
+              <w:fldChar w:fldCharType="separate"/>
+            </w:r>
+            <w:r>
+              <w:rPr>
+                <w:noProof/>
+                <w:webHidden/>
+              </w:rPr>
+              <w:t>8</w:t>
             </w:r>
             <w:r>
               <w:rPr>
@@ -1602,7 +1886,7 @@
               <w14:ligatures w14:val="standardContextual"/>
             </w:rPr>
           </w:pPr>
-          <w:hyperlink w:anchor="_Toc226372230" w:history="1">
+          <w:hyperlink w:anchor="_Toc226378567" w:history="1">
             <w:r>
               <w:rPr>
                 <w:rStyle w:val="Hyperlink"/>
@@ -1629,7 +1913,7 @@
                 <w:noProof/>
                 <w:webHidden/>
               </w:rPr>
-              <w:instrText xml:space="preserve"> PAGEREF _Toc226372230 \h </w:instrText>
+              <w:instrText xml:space="preserve"> PAGEREF _Toc226378567 \h </w:instrText>
             </w:r>
             <w:r>
               <w:rPr>
@@ -1649,7 +1933,7 @@
                 <w:noProof/>
                 <w:webHidden/>
               </w:rPr>
-              <w:t>8</w:t>
+              <w:t>9</w:t>
             </w:r>
             <w:r>
               <w:rPr>
@@ -1677,23 +1961,6 @@
     </w:sdt>
     <w:p>
       <w:pPr>
-        <w:rPr>
-          <w:sz w:val="36"/>
-          <w:szCs w:val="36"/>
-          <w:u w:val="single"/>
-        </w:rPr>
-      </w:pPr>
-      <w:r>
-        <w:rPr>
-          <w:sz w:val="36"/>
-          <w:szCs w:val="36"/>
-          <w:u w:val="single"/>
-        </w:rPr>
-        <w:t>Table of Figures</w:t>
-      </w:r>
-    </w:p>
-    <w:p>
-      <w:pPr>
         <w:jc w:val="center"/>
         <w:rPr>
           <w:sz w:val="36"/>
@@ -1701,6 +1968,50 @@
           <w:u w:val="single"/>
         </w:rPr>
       </w:pPr>
+      <w:r>
+        <w:rPr>
+          <w:sz w:val="36"/>
+          <w:szCs w:val="36"/>
+          <w:u w:val="single"/>
+        </w:rPr>
+        <w:fldChar w:fldCharType="begin"/>
+      </w:r>
+      <w:r>
+        <w:rPr>
+          <w:sz w:val="36"/>
+          <w:szCs w:val="36"/>
+          <w:u w:val="single"/>
+        </w:rPr>
+        <w:instrText xml:space="preserve"> TOC \h \z \c "Figure" </w:instrText>
+      </w:r>
+      <w:r>
+        <w:rPr>
+          <w:sz w:val="36"/>
+          <w:szCs w:val="36"/>
+          <w:u w:val="single"/>
+        </w:rPr>
+        <w:fldChar w:fldCharType="separate"/>
+      </w:r>
+      <w:r>
+        <w:rPr>
+          <w:b/>
+          <w:bCs/>
+          <w:noProof/>
+          <w:sz w:val="36"/>
+          <w:szCs w:val="36"/>
+          <w:u w:val="single"/>
+          <w:lang w:val="en-US"/>
+        </w:rPr>
+        <w:t>No table of figures entries found.</w:t>
+      </w:r>
+      <w:r>
+        <w:rPr>
+          <w:sz w:val="36"/>
+          <w:szCs w:val="36"/>
+          <w:u w:val="single"/>
+        </w:rPr>
+        <w:fldChar w:fldCharType="end"/>
+      </w:r>
     </w:p>
     <w:p>
       <w:pPr>
@@ -1832,7 +2143,7 @@
         <w:pStyle w:val="Heading1"/>
         <w:jc w:val="center"/>
       </w:pPr>
-      <w:bookmarkStart w:id="0" w:name="_Toc226372212"/>
+      <w:bookmarkStart w:id="0" w:name="_Toc226378545"/>
       <w:r>
         <w:t>Chapter 1</w:t>
       </w:r>
@@ -1860,7 +2171,7 @@
           <w:u w:val="single"/>
         </w:rPr>
       </w:pPr>
-      <w:bookmarkStart w:id="1" w:name="_Toc226372213"/>
+      <w:bookmarkStart w:id="1" w:name="_Toc226378546"/>
       <w:r>
         <w:t>1.1</w:t>
       </w:r>
@@ -1897,11 +2208,8 @@
     <w:p/>
     <w:p>
       <w:r>
-        <w:t xml:space="preserve">The game will start the player off in a randomly generated world on a roughly equidistant tile from any other players, giving them the freedom to settle their first city immediately or to move them around to somewhere that may be more suited to their playstyle. The </w:t>
-      </w:r>
-      <w:r>
         <w:lastRenderedPageBreak/>
-        <w:t>player will then be able to farm the lands resources to stimulate city growth, population growth and overall production. I have designed the game in this way to hopefully create a replay-able and fun game for players to enjoy and come back to.</w:t>
+        <w:t>The game will start the player off in a randomly generated world on a roughly equidistant tile from any other players, giving them the freedom to settle their first city immediately or to move them around to somewhere that may be more suited to their playstyle. The player will then be able to farm the lands resources to stimulate city growth, population growth and overall production. I have designed the game in this way to hopefully create a replay-able and fun game for players to enjoy and come back to.</w:t>
       </w:r>
     </w:p>
     <w:p/>
@@ -1909,14 +2217,14 @@
       <w:pPr>
         <w:pStyle w:val="Heading1"/>
       </w:pPr>
-      <w:bookmarkStart w:id="2" w:name="_Toc226372214"/>
+      <w:bookmarkStart w:id="2" w:name="_Toc226378547"/>
       <w:r>
         <w:t>1.2 Aims</w:t>
       </w:r>
       <w:bookmarkEnd w:id="2"/>
     </w:p>
     <w:p>
-      <w:bookmarkStart w:id="3" w:name="_Toc226372215"/>
+      <w:bookmarkStart w:id="3" w:name="_Toc226378548"/>
       <w:r>
         <w:rPr>
           <w:rStyle w:val="Heading2Char"/>
@@ -1959,7 +2267,7 @@
       <w:pPr>
         <w:pStyle w:val="Heading2"/>
       </w:pPr>
-      <w:bookmarkStart w:id="4" w:name="_Toc226372216"/>
+      <w:bookmarkStart w:id="4" w:name="_Toc226378549"/>
       <w:r>
         <w:t>1.2.2 Additional Aims</w:t>
       </w:r>
@@ -2028,7 +2336,7 @@
       <w:pPr>
         <w:pStyle w:val="Heading1"/>
       </w:pPr>
-      <w:bookmarkStart w:id="5" w:name="_Toc226372217"/>
+      <w:bookmarkStart w:id="5" w:name="_Toc226378550"/>
       <w:r>
         <w:t>1.3 Objectives</w:t>
       </w:r>
@@ -2038,7 +2346,7 @@
       <w:pPr>
         <w:pStyle w:val="Heading2"/>
       </w:pPr>
-      <w:bookmarkStart w:id="6" w:name="_Toc226372218"/>
+      <w:bookmarkStart w:id="6" w:name="_Toc226378551"/>
       <w:r>
         <w:t>1.3.1 Scope</w:t>
       </w:r>
@@ -2046,15 +2354,7 @@
     </w:p>
     <w:p>
       <w:r>
-        <w:t xml:space="preserve">The objectives in terms of scope for this project are going to be generally quite broad and consist of specific milestones. The core objectives </w:t>
-      </w:r>
-      <w:proofErr w:type="gramStart"/>
-      <w:r>
-        <w:t>in regards to</w:t>
-      </w:r>
-      <w:proofErr w:type="gramEnd"/>
-      <w:r>
-        <w:t xml:space="preserve"> the scope are:</w:t>
+        <w:t>The objectives in terms of scope for this project are going to be generally quite broad and consist of specific milestones. The core objectives in regards to the scope are:</w:t>
       </w:r>
     </w:p>
     <w:p>
@@ -2066,6 +2366,7 @@
         </w:numPr>
       </w:pPr>
       <w:r>
+        <w:lastRenderedPageBreak/>
         <w:t>Creating a game with informed design decisions based on research and practical usages.</w:t>
       </w:r>
     </w:p>
@@ -2078,7 +2379,6 @@
         </w:numPr>
       </w:pPr>
       <w:r>
-        <w:lastRenderedPageBreak/>
         <w:t>A working controller for the player that not only feels dynamic but allows the player to control their units and cities in the way they want.</w:t>
       </w:r>
     </w:p>
@@ -2110,7 +2410,7 @@
       <w:pPr>
         <w:pStyle w:val="Heading2"/>
       </w:pPr>
-      <w:bookmarkStart w:id="7" w:name="_Toc226372219"/>
+      <w:bookmarkStart w:id="7" w:name="_Toc226378552"/>
       <w:r>
         <w:t>1.3.2 Research Objectives</w:t>
       </w:r>
@@ -2118,15 +2418,7 @@
     </w:p>
     <w:p>
       <w:r>
-        <w:t xml:space="preserve">For the research objectives for the game, research will be conducted into other types of media with similar features. This research will include a comparison of similar games and their features and the overall impact of those features on this project. This will be done to find a balance for the difficulty of the game and to evaluate the necessary features for the game. Some topics of features and mechanics that will be researched </w:t>
-      </w:r>
-      <w:proofErr w:type="gramStart"/>
-      <w:r>
-        <w:t>include:</w:t>
-      </w:r>
-      <w:proofErr w:type="gramEnd"/>
-      <w:r>
-        <w:t xml:space="preserve"> World Generation, Pathfinding</w:t>
+        <w:t>For the research objectives for the game, research will be conducted into other types of media with similar features. This research will include a comparison of similar games and their features and the overall impact of those features on this project. This will be done to find a balance for the difficulty of the game and to evaluate the necessary features for the game. Some topics of features and mechanics that will be researched include: World Generation, Pathfinding</w:t>
       </w:r>
       <w:r>
         <w:t>,</w:t>
@@ -2158,7 +2450,7 @@
       <w:pPr>
         <w:pStyle w:val="Heading2"/>
       </w:pPr>
-      <w:bookmarkStart w:id="8" w:name="_Toc226372220"/>
+      <w:bookmarkStart w:id="8" w:name="_Toc226378553"/>
       <w:r>
         <w:t>1.3.3 Design Objectives</w:t>
       </w:r>
@@ -2175,7 +2467,13 @@
         <w:t>4</w:t>
       </w:r>
       <w:r>
-        <w:t xml:space="preserve">X strategy </w:t>
+        <w:t>X</w:t>
+      </w:r>
+      <w:r>
+        <w:t xml:space="preserve"> turn-based</w:t>
+      </w:r>
+      <w:r>
+        <w:t xml:space="preserve"> strategy </w:t>
       </w:r>
       <w:r>
         <w:t>game that</w:t>
@@ -2262,6 +2560,7 @@
         </w:numPr>
       </w:pPr>
       <w:r>
+        <w:lastRenderedPageBreak/>
         <w:t>Design the architecture to accommodate a machine learning opponent that can adapt over multiple sessions.</w:t>
       </w:r>
     </w:p>
@@ -2274,9 +2573,8 @@
       <w:pPr>
         <w:pStyle w:val="Heading2"/>
       </w:pPr>
-      <w:bookmarkStart w:id="9" w:name="_Toc226372221"/>
-      <w:r>
-        <w:lastRenderedPageBreak/>
+      <w:bookmarkStart w:id="9" w:name="_Toc226378554"/>
+      <w:r>
         <w:t>1.3.4 Implementation Objectives</w:t>
       </w:r>
       <w:bookmarkEnd w:id="9"/>
@@ -2394,7 +2692,7 @@
       <w:pPr>
         <w:pStyle w:val="Heading2"/>
       </w:pPr>
-      <w:bookmarkStart w:id="10" w:name="_Toc226372222"/>
+      <w:bookmarkStart w:id="10" w:name="_Toc226378555"/>
       <w:r>
         <w:t>1.3.5 Results, Evaluation and Playtesting Objectives</w:t>
       </w:r>
@@ -2450,7 +2748,7 @@
       <w:pPr>
         <w:pStyle w:val="Heading1"/>
       </w:pPr>
-      <w:bookmarkStart w:id="11" w:name="_Toc226372223"/>
+      <w:bookmarkStart w:id="11" w:name="_Toc226378556"/>
       <w:r>
         <w:t>Chapter 2 – Literature Survey</w:t>
       </w:r>
@@ -2460,7 +2758,7 @@
       <w:pPr>
         <w:pStyle w:val="Heading2"/>
       </w:pPr>
-      <w:bookmarkStart w:id="12" w:name="_Toc226372224"/>
+      <w:bookmarkStart w:id="12" w:name="_Toc226378557"/>
       <w:r>
         <w:t>2.1 Literature Survey Introduction</w:t>
       </w:r>
@@ -2499,7 +2797,7 @@
       <w:pPr>
         <w:pStyle w:val="Heading2"/>
       </w:pPr>
-      <w:bookmarkStart w:id="13" w:name="_Toc226372225"/>
+      <w:bookmarkStart w:id="13" w:name="_Toc226378558"/>
       <w:r>
         <w:t>2.2 Comparative Research</w:t>
       </w:r>
@@ -2517,8 +2815,9 @@
       <w:pPr>
         <w:pStyle w:val="Heading3"/>
       </w:pPr>
-      <w:bookmarkStart w:id="14" w:name="_Toc226372226"/>
-      <w:r>
+      <w:bookmarkStart w:id="14" w:name="_Toc226378559"/>
+      <w:r>
+        <w:lastRenderedPageBreak/>
         <w:t xml:space="preserve">2.2.1 </w:t>
       </w:r>
       <w:r>
@@ -2546,11 +2845,7 @@
         <w:t xml:space="preserve"> (2016)</w:t>
       </w:r>
       <w:r>
-        <w:t xml:space="preserve">, world generation plays a crucial role in shaping how players explore, expand, and interact with </w:t>
-      </w:r>
-      <w:r>
-        <w:lastRenderedPageBreak/>
-        <w:t>the game environment. The structure and distribution of terrain, resources, and starting positions can dramatically influence both gameplay strategies and overall fairness.</w:t>
+        <w:t>, world generation plays a crucial role in shaping how players explore, expand, and interact with the game environment. The structure and distribution of terrain, resources, and starting positions can dramatically influence both gameplay strategies and overall fairness.</w:t>
       </w:r>
       <w:r>
         <w:br/>
@@ -2597,7 +2892,7 @@
       <w:pPr>
         <w:pStyle w:val="Heading4"/>
       </w:pPr>
-      <w:bookmarkStart w:id="15" w:name="_Toc226372227"/>
+      <w:bookmarkStart w:id="15" w:name="_Toc226378560"/>
       <w:r>
         <w:t>2.2.1.1 Perlin Noise</w:t>
       </w:r>
@@ -2605,15 +2900,7 @@
     </w:p>
     <w:p>
       <w:r>
-        <w:t xml:space="preserve">Perlin Noise is used in </w:t>
-      </w:r>
-      <w:proofErr w:type="gramStart"/>
-      <w:r>
-        <w:t>the majority of</w:t>
-      </w:r>
-      <w:proofErr w:type="gramEnd"/>
-      <w:r>
-        <w:t xml:space="preserve"> world generations due to its versatility.</w:t>
+        <w:t>Perlin Noise is used in the majority of world generations due to its versatility.</w:t>
       </w:r>
       <w:r>
         <w:t xml:space="preserve"> It works through the use of layering</w:t>
@@ -2662,7 +2949,7 @@
       <w:pPr>
         <w:pStyle w:val="Heading4"/>
       </w:pPr>
-      <w:bookmarkStart w:id="16" w:name="_Toc226372228"/>
+      <w:bookmarkStart w:id="16" w:name="_Toc226378561"/>
       <w:r>
         <w:t>2.2.1.2 Binary Space Partitioning</w:t>
       </w:r>
@@ -2714,7 +3001,7 @@
       <w:pPr>
         <w:pStyle w:val="Heading4"/>
       </w:pPr>
-      <w:bookmarkStart w:id="17" w:name="_Toc226372229"/>
+      <w:bookmarkStart w:id="17" w:name="_Toc226378562"/>
       <w:r>
         <w:t>2.2.1.3 Cellular Automata</w:t>
       </w:r>
@@ -2776,7 +3063,11 @@
         <w:t>)</w:t>
       </w:r>
       <w:r>
-        <w:t xml:space="preserve"> according to the following two rules: If a cell is alive, it survives to the next generation if it has 2 or 3 live neighbors; otherwise it dies. If a cell is dead, it comes to life in the next generation if it has exactly 3 live neighbors; otherwise it stays dead.” </w:t>
+        <w:t xml:space="preserve"> according to the following two rules: If a cell is alive, it survives to the next generation if it has 2 or 3 </w:t>
+      </w:r>
+      <w:r>
+        <w:lastRenderedPageBreak/>
+        <w:t xml:space="preserve">live neighbors; otherwise it dies. If a cell is dead, it comes to life in the next generation if it has exactly 3 live neighbors; otherwise it stays dead.” </w:t>
       </w:r>
       <w:sdt>
         <w:sdtPr>
@@ -2809,22 +3100,187 @@
       </w:r>
       <w:r>
         <w:br/>
+        <w:t xml:space="preserve">In Terraria (2011), cellular automata </w:t>
+      </w:r>
+      <w:r>
+        <w:t>are</w:t>
+      </w:r>
+      <w:r>
+        <w:t xml:space="preserve"> used in this exact way, the game randomly defines a grid and randomly places alive cells and dead cells in the grid, typically weighted to the bottom of the grid. The game then simulates a given number of ticks, and the output of that is the world map. At this stage, biomes can be identified in one of two ways, randomly allocating sections of the world to each desired biome or using the final “weighting” of the alive cells to create the biomes.</w:t>
+      </w:r>
+    </w:p>
+    <w:p>
+      <w:pPr>
+        <w:pStyle w:val="Heading3"/>
+      </w:pPr>
+      <w:bookmarkStart w:id="18" w:name="_Toc226378563"/>
+      <w:r>
+        <w:t>2.2.2 Pathfinding</w:t>
+      </w:r>
+      <w:bookmarkEnd w:id="18"/>
+    </w:p>
+    <w:p>
+      <w:r>
+        <w:t>Pathfinding is one of the most important features of any turn-based game</w:t>
+      </w:r>
+      <w:r>
+        <w:t xml:space="preserve">. </w:t>
+      </w:r>
+      <w:r>
+        <w:t>Pathfinding can completely change the approach a player must take to a strategy game as it defines how many turns a player will take to reach the destination.</w:t>
+      </w:r>
+      <w:r>
+        <w:br/>
+      </w:r>
+      <w:r>
+        <w:br/>
+        <w:t xml:space="preserve">In this section, I will be evaluating different games for their interpretation of pathfinding. </w:t>
+      </w:r>
+      <w:r>
+        <w:t xml:space="preserve">The games I will be </w:t>
+      </w:r>
+      <w:r>
+        <w:t xml:space="preserve">directly </w:t>
+      </w:r>
+      <w:r>
+        <w:t>referencing are as follows: Civilisation VI (2016), Stellaris (2016).</w:t>
+      </w:r>
+      <w:r>
+        <w:t xml:space="preserve"> </w:t>
+      </w:r>
+      <w:r>
+        <w:t>The types of pathfinding I will be evaluating are: A*, Dijkstra</w:t>
+      </w:r>
+      <w:r>
+        <w:t xml:space="preserve"> and</w:t>
+      </w:r>
+      <w:r>
+        <w:t xml:space="preserve"> Jump Point Search</w:t>
+      </w:r>
+      <w:r>
+        <w:t>.</w:t>
+      </w:r>
+    </w:p>
+    <w:p>
+      <w:pPr>
+        <w:pStyle w:val="Heading4"/>
+      </w:pPr>
+      <w:bookmarkStart w:id="19" w:name="_Toc226378564"/>
+      <w:r>
+        <w:t>2.2.2.1 Dijkstra</w:t>
+      </w:r>
+      <w:bookmarkEnd w:id="19"/>
+    </w:p>
+    <w:p>
+      <w:r>
+        <w:t xml:space="preserve">Dijkstra’s algorithm is a pathfinding algorithm that uses a breadth first search, meaning it goes wider before it goes longer, that can contain a path cost. It is always guaranteed to find the shortest path but is not very optimized. The starting point is marked, then the movement cost is calculated to each neighbour nod, this is repeated on every connected node to the new nodes until the end point is found. The algorithm then calculates the shortest path back to the starting point.   </w:t>
+      </w:r>
+    </w:p>
+    <w:p>
+      <w:pPr>
+        <w:pStyle w:val="Heading4"/>
+      </w:pPr>
+      <w:bookmarkStart w:id="20" w:name="_Toc226378565"/>
+      <w:r>
+        <w:t>2.2.2.2 A*</w:t>
+      </w:r>
+      <w:bookmarkEnd w:id="20"/>
+    </w:p>
+    <w:p>
+      <w:r>
+        <w:t>A* is an algorithm that shares the same approach as Dijkstra, although it is more efficient. In order to be more efficient, the algorithm “combines Dijkstra’s algorithm with a case-specific heuristic value”</w:t>
+      </w:r>
+      <w:r>
+        <w:t xml:space="preserve"> </w:t>
+      </w:r>
+      <w:sdt>
+        <w:sdtPr>
+          <w:id w:val="1846362225"/>
+          <w:citation/>
+        </w:sdtPr>
+        <w:sdtContent>
+          <w:r>
+            <w:fldChar w:fldCharType="begin"/>
+          </w:r>
+          <w:r>
+            <w:instrText xml:space="preserve"> CITATION Lää17 \l 2057 </w:instrText>
+          </w:r>
+          <w:r>
+            <w:fldChar w:fldCharType="separate"/>
+          </w:r>
+          <w:r>
+            <w:rPr>
+              <w:noProof/>
+            </w:rPr>
+            <w:t>(Lääveri, 2017)</w:t>
+          </w:r>
+          <w:r>
+            <w:fldChar w:fldCharType="end"/>
+          </w:r>
+        </w:sdtContent>
+      </w:sdt>
+      <w:r>
+        <w:t xml:space="preserve">. This is always guaranteed to find the shortest path and the heuristic value allows the algorithm to disregard paths that lead away from the destination, allowing for major optimizations </w:t>
+      </w:r>
+      <w:r>
+        <w:t>in regard to</w:t>
+      </w:r>
+      <w:r>
+        <w:t xml:space="preserve"> the computation speed of the algorithm. </w:t>
+      </w:r>
+    </w:p>
+    <w:p>
+      <w:pPr>
+        <w:pStyle w:val="Heading4"/>
+      </w:pPr>
+      <w:bookmarkStart w:id="21" w:name="_Toc226378566"/>
+      <w:r>
+        <w:t>2.2.2.3 Jump Point Search</w:t>
+      </w:r>
+      <w:bookmarkEnd w:id="21"/>
+    </w:p>
+    <w:p>
+      <w:r>
+        <w:t xml:space="preserve">Jump Point Search, or JPS, is a highly efficient pathfinding algorithm designed for uniform-cost grid maps. Due to A*’s “high memory overhead, low operation efficiency, and many path corners” </w:t>
+      </w:r>
+      <w:sdt>
+        <w:sdtPr>
+          <w:id w:val="-1711803641"/>
+          <w:citation/>
+        </w:sdtPr>
+        <w:sdtContent>
+          <w:r>
+            <w:fldChar w:fldCharType="begin"/>
+          </w:r>
+          <w:r>
+            <w:instrText xml:space="preserve"> CITATION Yan22 \l 2057 </w:instrText>
+          </w:r>
+          <w:r>
+            <w:fldChar w:fldCharType="separate"/>
+          </w:r>
+          <w:r>
+            <w:rPr>
+              <w:noProof/>
+            </w:rPr>
+            <w:t>(Yang, et al., 2022)</w:t>
+          </w:r>
+          <w:r>
+            <w:fldChar w:fldCharType="end"/>
+          </w:r>
+        </w:sdtContent>
+      </w:sdt>
+      <w:r>
+        <w:t xml:space="preserve">, JPS serves as a substantial optimization through the use of “pruning” unnecessary nodes and “jumping over” empty spaces. </w:t>
       </w:r>
       <w:r>
         <w:lastRenderedPageBreak/>
-        <w:t xml:space="preserve">In Terraria (2011), cellular automata </w:t>
-      </w:r>
-      <w:r>
-        <w:t>are</w:t>
-      </w:r>
-      <w:r>
-        <w:t xml:space="preserve"> used in this exact way, the game randomly defines a grid and randomly places alive cells and dead cells in the grid, typically weighted to the bottom of the grid. The game then simulates a given number of ticks, and the output of that is the world map. At this stage, biomes can be identified in one of two ways, randomly allocating sections of the world to each desired biome or using the final “weighting” of the alive cells to create the biomes.</w:t>
-      </w:r>
-    </w:p>
-    <w:p/>
-    <w:p/>
-    <w:p/>
-    <w:bookmarkStart w:id="18" w:name="_Toc226372230" w:displacedByCustomXml="next"/>
+        <w:t xml:space="preserve">Disregarding the </w:t>
+      </w:r>
+      <w:r>
+        <w:t>path cost calculations along with the aforementioned optimizations allows JPS to be significantly faster than A*, even up to an order of magnitude faster.</w:t>
+      </w:r>
+    </w:p>
+    <w:bookmarkStart w:id="22" w:name="_Toc226378567" w:displacedByCustomXml="next"/>
     <w:sdt>
       <w:sdtPr>
         <w:id w:val="783850805"/>
@@ -2849,7 +3305,7 @@
           <w:r>
             <w:t>References</w:t>
           </w:r>
-          <w:bookmarkEnd w:id="18"/>
+          <w:bookmarkEnd w:id="22"/>
         </w:p>
         <w:sdt>
           <w:sdtPr>
@@ -2894,6 +3350,62 @@
                   <w:noProof/>
                 </w:rPr>
                 <w:t>s.l.:Lulu.com.</w:t>
+              </w:r>
+            </w:p>
+            <w:p>
+              <w:pPr>
+                <w:pStyle w:val="Bibliography"/>
+                <w:rPr>
+                  <w:noProof/>
+                </w:rPr>
+              </w:pPr>
+              <w:r>
+                <w:rPr>
+                  <w:noProof/>
+                </w:rPr>
+                <w:t xml:space="preserve">Lääveri, T., 2017. </w:t>
+              </w:r>
+              <w:r>
+                <w:rPr>
+                  <w:i/>
+                  <w:iCs/>
+                  <w:noProof/>
+                </w:rPr>
+                <w:t xml:space="preserve">Integrating AI for Turn-Based 4X Strategy Game, </w:t>
+              </w:r>
+              <w:r>
+                <w:rPr>
+                  <w:noProof/>
+                </w:rPr>
+                <w:t>Helsinki: s.n.</w:t>
+              </w:r>
+            </w:p>
+            <w:p>
+              <w:pPr>
+                <w:pStyle w:val="Bibliography"/>
+                <w:rPr>
+                  <w:noProof/>
+                </w:rPr>
+              </w:pPr>
+              <w:r>
+                <w:rPr>
+                  <w:noProof/>
+                </w:rPr>
+                <w:t xml:space="preserve">Yang, Z., Li, J., Yang, L. &amp; Chen, H., 2022. </w:t>
+              </w:r>
+              <w:r>
+                <w:rPr>
+                  <w:i/>
+                  <w:iCs/>
+                  <w:noProof/>
+                </w:rPr>
+                <w:t xml:space="preserve">A Smooth Jump Point Search Algorithm for Mobile Robots Path Planning Based on a Two-Dimensional Grid Model, </w:t>
+              </w:r>
+              <w:r>
+                <w:rPr>
+                  <w:noProof/>
+                </w:rPr>
+                <w:t>Kunming: s.n.</w:t>
               </w:r>
             </w:p>
             <w:p>
@@ -5220,11 +5732,67 @@
     <b:Publisher>Lulu.com</b:Publisher>
     <b:RefOrder>1</b:RefOrder>
   </b:Source>
+  <b:Source>
+    <b:Tag>Lää17</b:Tag>
+    <b:SourceType>ElectronicSource</b:SourceType>
+    <b:Guid>{973F8A90-2E1F-4A4A-9F68-BE9F71B0790F}</b:Guid>
+    <b:Title>Integrating AI for Turn-Based 4X Strategy Game</b:Title>
+    <b:Year>2017</b:Year>
+    <b:City>Helsinki</b:City>
+    <b:YearAccessed>2026</b:YearAccessed>
+    <b:MonthAccessed>04</b:MonthAccessed>
+    <b:DayAccessed>06</b:DayAccessed>
+    <b:URL>https://www.theseus.fi/bitstream/handle/10024/134060/Toni_Laaveri.pdf?sequence=1&amp;isAllowed=y</b:URL>
+    <b:Medium>https://www.theseus.fi/bitstream/handle/10024/134060/Toni_Laaveri.pdf?sequence=1&amp;isAllowed=y</b:Medium>
+    <b:Author>
+      <b:Author>
+        <b:NameList>
+          <b:Person>
+            <b:Last>Lääveri</b:Last>
+            <b:First>Toni</b:First>
+          </b:Person>
+        </b:NameList>
+      </b:Author>
+    </b:Author>
+    <b:RefOrder>2</b:RefOrder>
+  </b:Source>
+  <b:Source>
+    <b:Tag>Yan22</b:Tag>
+    <b:SourceType>ElectronicSource</b:SourceType>
+    <b:Guid>{27127969-EB2C-4A0F-AAF1-46565C1C37D8}</b:Guid>
+    <b:Title>A Smooth Jump Point Search Algorithm for Mobile Robots Path Planning Based on a Two-Dimensional Grid Model</b:Title>
+    <b:City>Kunming</b:City>
+    <b:Year>2022</b:Year>
+    <b:URL>https://onlinelibrary.wiley.com/doi/epdf/10.1155/2022/7682201</b:URL>
+    <b:Author>
+      <b:Author>
+        <b:NameList>
+          <b:Person>
+            <b:Last>Yang</b:Last>
+            <b:First>Zhen</b:First>
+          </b:Person>
+          <b:Person>
+            <b:Last>Li</b:Last>
+            <b:First>Junli</b:First>
+          </b:Person>
+          <b:Person>
+            <b:Last>Yang</b:Last>
+            <b:First>Liwei</b:First>
+          </b:Person>
+          <b:Person>
+            <b:Last>Chen</b:Last>
+            <b:First>Hejiang</b:First>
+          </b:Person>
+        </b:NameList>
+      </b:Author>
+    </b:Author>
+    <b:RefOrder>3</b:RefOrder>
+  </b:Source>
 </b:Sources>
 </file>
 
 <file path=customXml/itemProps1.xml><?xml version="1.0" encoding="utf-8"?>
-<ds:datastoreItem xmlns:ds="http://schemas.openxmlformats.org/officeDocument/2006/customXml" ds:itemID="{9E88FB83-5452-4B1A-9665-091CDC67F8A3}">
+<ds:datastoreItem xmlns:ds="http://schemas.openxmlformats.org/officeDocument/2006/customXml" ds:itemID="{18B6477A-6460-442E-A4D7-B053D17055CA}">
   <ds:schemaRefs>
     <ds:schemaRef ds:uri="http://schemas.openxmlformats.org/officeDocument/2006/bibliography"/>
   </ds:schemaRefs>

</xml_diff>

<commit_message>
feat: Neural Networks written
</commit_message>
<xml_diff>
--- a/Report.docx
+++ b/Report.docx
@@ -282,7 +282,7 @@
           <w:r>
             <w:fldChar w:fldCharType="separate"/>
           </w:r>
-          <w:hyperlink w:anchor="_Toc226378545" w:history="1">
+          <w:hyperlink w:anchor="_Toc227233414" w:history="1">
             <w:r>
               <w:rPr>
                 <w:rStyle w:val="Hyperlink"/>
@@ -309,7 +309,7 @@
                 <w:noProof/>
                 <w:webHidden/>
               </w:rPr>
-              <w:instrText xml:space="preserve"> PAGEREF _Toc226378545 \h </w:instrText>
+              <w:instrText xml:space="preserve"> PAGEREF _Toc227233414 \h </w:instrText>
             </w:r>
             <w:r>
               <w:rPr>
@@ -356,7 +356,7 @@
               <w14:ligatures w14:val="standardContextual"/>
             </w:rPr>
           </w:pPr>
-          <w:hyperlink w:anchor="_Toc226378546" w:history="1">
+          <w:hyperlink w:anchor="_Toc227233415" w:history="1">
             <w:r>
               <w:rPr>
                 <w:rStyle w:val="Hyperlink"/>
@@ -383,7 +383,7 @@
                 <w:noProof/>
                 <w:webHidden/>
               </w:rPr>
-              <w:instrText xml:space="preserve"> PAGEREF _Toc226378546 \h </w:instrText>
+              <w:instrText xml:space="preserve"> PAGEREF _Toc227233415 \h </w:instrText>
             </w:r>
             <w:r>
               <w:rPr>
@@ -430,7 +430,7 @@
               <w14:ligatures w14:val="standardContextual"/>
             </w:rPr>
           </w:pPr>
-          <w:hyperlink w:anchor="_Toc226378547" w:history="1">
+          <w:hyperlink w:anchor="_Toc227233416" w:history="1">
             <w:r>
               <w:rPr>
                 <w:rStyle w:val="Hyperlink"/>
@@ -457,7 +457,7 @@
                 <w:noProof/>
                 <w:webHidden/>
               </w:rPr>
-              <w:instrText xml:space="preserve"> PAGEREF _Toc226378547 \h </w:instrText>
+              <w:instrText xml:space="preserve"> PAGEREF _Toc227233416 \h </w:instrText>
             </w:r>
             <w:r>
               <w:rPr>
@@ -477,7 +477,7 @@
                 <w:noProof/>
                 <w:webHidden/>
               </w:rPr>
-              <w:t>4</w:t>
+              <w:t>3</w:t>
             </w:r>
             <w:r>
               <w:rPr>
@@ -504,7 +504,7 @@
               <w14:ligatures w14:val="standardContextual"/>
             </w:rPr>
           </w:pPr>
-          <w:hyperlink w:anchor="_Toc226378548" w:history="1">
+          <w:hyperlink w:anchor="_Toc227233417" w:history="1">
             <w:r>
               <w:rPr>
                 <w:rStyle w:val="Hyperlink"/>
@@ -531,7 +531,7 @@
                 <w:noProof/>
                 <w:webHidden/>
               </w:rPr>
-              <w:instrText xml:space="preserve"> PAGEREF _Toc226378548 \h </w:instrText>
+              <w:instrText xml:space="preserve"> PAGEREF _Toc227233417 \h </w:instrText>
             </w:r>
             <w:r>
               <w:rPr>
@@ -551,7 +551,7 @@
                 <w:noProof/>
                 <w:webHidden/>
               </w:rPr>
-              <w:t>4</w:t>
+              <w:t>3</w:t>
             </w:r>
             <w:r>
               <w:rPr>
@@ -578,7 +578,7 @@
               <w14:ligatures w14:val="standardContextual"/>
             </w:rPr>
           </w:pPr>
-          <w:hyperlink w:anchor="_Toc226378549" w:history="1">
+          <w:hyperlink w:anchor="_Toc227233418" w:history="1">
             <w:r>
               <w:rPr>
                 <w:rStyle w:val="Hyperlink"/>
@@ -605,7 +605,7 @@
                 <w:noProof/>
                 <w:webHidden/>
               </w:rPr>
-              <w:instrText xml:space="preserve"> PAGEREF _Toc226378549 \h </w:instrText>
+              <w:instrText xml:space="preserve"> PAGEREF _Toc227233418 \h </w:instrText>
             </w:r>
             <w:r>
               <w:rPr>
@@ -652,7 +652,7 @@
               <w14:ligatures w14:val="standardContextual"/>
             </w:rPr>
           </w:pPr>
-          <w:hyperlink w:anchor="_Toc226378550" w:history="1">
+          <w:hyperlink w:anchor="_Toc227233419" w:history="1">
             <w:r>
               <w:rPr>
                 <w:rStyle w:val="Hyperlink"/>
@@ -679,7 +679,7 @@
                 <w:noProof/>
                 <w:webHidden/>
               </w:rPr>
-              <w:instrText xml:space="preserve"> PAGEREF _Toc226378550 \h </w:instrText>
+              <w:instrText xml:space="preserve"> PAGEREF _Toc227233419 \h </w:instrText>
             </w:r>
             <w:r>
               <w:rPr>
@@ -726,7 +726,7 @@
               <w14:ligatures w14:val="standardContextual"/>
             </w:rPr>
           </w:pPr>
-          <w:hyperlink w:anchor="_Toc226378551" w:history="1">
+          <w:hyperlink w:anchor="_Toc227233420" w:history="1">
             <w:r>
               <w:rPr>
                 <w:rStyle w:val="Hyperlink"/>
@@ -753,7 +753,7 @@
                 <w:noProof/>
                 <w:webHidden/>
               </w:rPr>
-              <w:instrText xml:space="preserve"> PAGEREF _Toc226378551 \h </w:instrText>
+              <w:instrText xml:space="preserve"> PAGEREF _Toc227233420 \h </w:instrText>
             </w:r>
             <w:r>
               <w:rPr>
@@ -800,7 +800,7 @@
               <w14:ligatures w14:val="standardContextual"/>
             </w:rPr>
           </w:pPr>
-          <w:hyperlink w:anchor="_Toc226378552" w:history="1">
+          <w:hyperlink w:anchor="_Toc227233421" w:history="1">
             <w:r>
               <w:rPr>
                 <w:rStyle w:val="Hyperlink"/>
@@ -827,7 +827,7 @@
                 <w:noProof/>
                 <w:webHidden/>
               </w:rPr>
-              <w:instrText xml:space="preserve"> PAGEREF _Toc226378552 \h </w:instrText>
+              <w:instrText xml:space="preserve"> PAGEREF _Toc227233421 \h </w:instrText>
             </w:r>
             <w:r>
               <w:rPr>
@@ -847,7 +847,7 @@
                 <w:noProof/>
                 <w:webHidden/>
               </w:rPr>
-              <w:t>5</w:t>
+              <w:t>4</w:t>
             </w:r>
             <w:r>
               <w:rPr>
@@ -874,7 +874,7 @@
               <w14:ligatures w14:val="standardContextual"/>
             </w:rPr>
           </w:pPr>
-          <w:hyperlink w:anchor="_Toc226378553" w:history="1">
+          <w:hyperlink w:anchor="_Toc227233422" w:history="1">
             <w:r>
               <w:rPr>
                 <w:rStyle w:val="Hyperlink"/>
@@ -901,7 +901,7 @@
                 <w:noProof/>
                 <w:webHidden/>
               </w:rPr>
-              <w:instrText xml:space="preserve"> PAGEREF _Toc226378553 \h </w:instrText>
+              <w:instrText xml:space="preserve"> PAGEREF _Toc227233422 \h </w:instrText>
             </w:r>
             <w:r>
               <w:rPr>
@@ -948,7 +948,7 @@
               <w14:ligatures w14:val="standardContextual"/>
             </w:rPr>
           </w:pPr>
-          <w:hyperlink w:anchor="_Toc226378554" w:history="1">
+          <w:hyperlink w:anchor="_Toc227233423" w:history="1">
             <w:r>
               <w:rPr>
                 <w:rStyle w:val="Hyperlink"/>
@@ -975,7 +975,7 @@
                 <w:noProof/>
                 <w:webHidden/>
               </w:rPr>
-              <w:instrText xml:space="preserve"> PAGEREF _Toc226378554 \h </w:instrText>
+              <w:instrText xml:space="preserve"> PAGEREF _Toc227233423 \h </w:instrText>
             </w:r>
             <w:r>
               <w:rPr>
@@ -995,7 +995,7 @@
                 <w:noProof/>
                 <w:webHidden/>
               </w:rPr>
-              <w:t>6</w:t>
+              <w:t>5</w:t>
             </w:r>
             <w:r>
               <w:rPr>
@@ -1022,7 +1022,7 @@
               <w14:ligatures w14:val="standardContextual"/>
             </w:rPr>
           </w:pPr>
-          <w:hyperlink w:anchor="_Toc226378555" w:history="1">
+          <w:hyperlink w:anchor="_Toc227233424" w:history="1">
             <w:r>
               <w:rPr>
                 <w:rStyle w:val="Hyperlink"/>
@@ -1049,7 +1049,7 @@
                 <w:noProof/>
                 <w:webHidden/>
               </w:rPr>
-              <w:instrText xml:space="preserve"> PAGEREF _Toc226378555 \h </w:instrText>
+              <w:instrText xml:space="preserve"> PAGEREF _Toc227233424 \h </w:instrText>
             </w:r>
             <w:r>
               <w:rPr>
@@ -1096,7 +1096,7 @@
               <w14:ligatures w14:val="standardContextual"/>
             </w:rPr>
           </w:pPr>
-          <w:hyperlink w:anchor="_Toc226378556" w:history="1">
+          <w:hyperlink w:anchor="_Toc227233425" w:history="1">
             <w:r>
               <w:rPr>
                 <w:rStyle w:val="Hyperlink"/>
@@ -1123,7 +1123,7 @@
                 <w:noProof/>
                 <w:webHidden/>
               </w:rPr>
-              <w:instrText xml:space="preserve"> PAGEREF _Toc226378556 \h </w:instrText>
+              <w:instrText xml:space="preserve"> PAGEREF _Toc227233425 \h </w:instrText>
             </w:r>
             <w:r>
               <w:rPr>
@@ -1170,7 +1170,7 @@
               <w14:ligatures w14:val="standardContextual"/>
             </w:rPr>
           </w:pPr>
-          <w:hyperlink w:anchor="_Toc226378557" w:history="1">
+          <w:hyperlink w:anchor="_Toc227233426" w:history="1">
             <w:r>
               <w:rPr>
                 <w:rStyle w:val="Hyperlink"/>
@@ -1197,7 +1197,7 @@
                 <w:noProof/>
                 <w:webHidden/>
               </w:rPr>
-              <w:instrText xml:space="preserve"> PAGEREF _Toc226378557 \h </w:instrText>
+              <w:instrText xml:space="preserve"> PAGEREF _Toc227233426 \h </w:instrText>
             </w:r>
             <w:r>
               <w:rPr>
@@ -1244,7 +1244,7 @@
               <w14:ligatures w14:val="standardContextual"/>
             </w:rPr>
           </w:pPr>
-          <w:hyperlink w:anchor="_Toc226378558" w:history="1">
+          <w:hyperlink w:anchor="_Toc227233427" w:history="1">
             <w:r>
               <w:rPr>
                 <w:rStyle w:val="Hyperlink"/>
@@ -1271,7 +1271,7 @@
                 <w:noProof/>
                 <w:webHidden/>
               </w:rPr>
-              <w:instrText xml:space="preserve"> PAGEREF _Toc226378558 \h </w:instrText>
+              <w:instrText xml:space="preserve"> PAGEREF _Toc227233427 \h </w:instrText>
             </w:r>
             <w:r>
               <w:rPr>
@@ -1318,7 +1318,7 @@
               <w14:ligatures w14:val="standardContextual"/>
             </w:rPr>
           </w:pPr>
-          <w:hyperlink w:anchor="_Toc226378559" w:history="1">
+          <w:hyperlink w:anchor="_Toc227233428" w:history="1">
             <w:r>
               <w:rPr>
                 <w:rStyle w:val="Hyperlink"/>
@@ -1345,7 +1345,7 @@
                 <w:noProof/>
                 <w:webHidden/>
               </w:rPr>
-              <w:instrText xml:space="preserve"> PAGEREF _Toc226378559 \h </w:instrText>
+              <w:instrText xml:space="preserve"> PAGEREF _Toc227233428 \h </w:instrText>
             </w:r>
             <w:r>
               <w:rPr>
@@ -1365,7 +1365,7 @@
                 <w:noProof/>
                 <w:webHidden/>
               </w:rPr>
-              <w:t>7</w:t>
+              <w:t>6</w:t>
             </w:r>
             <w:r>
               <w:rPr>
@@ -1388,7 +1388,7 @@
               <w:lang w:eastAsia="en-GB"/>
             </w:rPr>
           </w:pPr>
-          <w:hyperlink w:anchor="_Toc226378560" w:history="1">
+          <w:hyperlink w:anchor="_Toc227233429" w:history="1">
             <w:r>
               <w:rPr>
                 <w:rStyle w:val="Hyperlink"/>
@@ -1415,7 +1415,7 @@
                 <w:noProof/>
                 <w:webHidden/>
               </w:rPr>
-              <w:instrText xml:space="preserve"> PAGEREF _Toc226378560 \h </w:instrText>
+              <w:instrText xml:space="preserve"> PAGEREF _Toc227233429 \h </w:instrText>
             </w:r>
             <w:r>
               <w:rPr>
@@ -1435,7 +1435,7 @@
                 <w:noProof/>
                 <w:webHidden/>
               </w:rPr>
-              <w:t>7</w:t>
+              <w:t>6</w:t>
             </w:r>
             <w:r>
               <w:rPr>
@@ -1458,7 +1458,7 @@
               <w:lang w:eastAsia="en-GB"/>
             </w:rPr>
           </w:pPr>
-          <w:hyperlink w:anchor="_Toc226378561" w:history="1">
+          <w:hyperlink w:anchor="_Toc227233430" w:history="1">
             <w:r>
               <w:rPr>
                 <w:rStyle w:val="Hyperlink"/>
@@ -1485,7 +1485,7 @@
                 <w:noProof/>
                 <w:webHidden/>
               </w:rPr>
-              <w:instrText xml:space="preserve"> PAGEREF _Toc226378561 \h </w:instrText>
+              <w:instrText xml:space="preserve"> PAGEREF _Toc227233430 \h </w:instrText>
             </w:r>
             <w:r>
               <w:rPr>
@@ -1528,7 +1528,7 @@
               <w:lang w:eastAsia="en-GB"/>
             </w:rPr>
           </w:pPr>
-          <w:hyperlink w:anchor="_Toc226378562" w:history="1">
+          <w:hyperlink w:anchor="_Toc227233431" w:history="1">
             <w:r>
               <w:rPr>
                 <w:rStyle w:val="Hyperlink"/>
@@ -1555,7 +1555,7 @@
                 <w:noProof/>
                 <w:webHidden/>
               </w:rPr>
-              <w:instrText xml:space="preserve"> PAGEREF _Toc226378562 \h </w:instrText>
+              <w:instrText xml:space="preserve"> PAGEREF _Toc227233431 \h </w:instrText>
             </w:r>
             <w:r>
               <w:rPr>
@@ -1602,7 +1602,7 @@
               <w14:ligatures w14:val="standardContextual"/>
             </w:rPr>
           </w:pPr>
-          <w:hyperlink w:anchor="_Toc226378563" w:history="1">
+          <w:hyperlink w:anchor="_Toc227233432" w:history="1">
             <w:r>
               <w:rPr>
                 <w:rStyle w:val="Hyperlink"/>
@@ -1629,7 +1629,7 @@
                 <w:noProof/>
                 <w:webHidden/>
               </w:rPr>
-              <w:instrText xml:space="preserve"> PAGEREF _Toc226378563 \h </w:instrText>
+              <w:instrText xml:space="preserve"> PAGEREF _Toc227233432 \h </w:instrText>
             </w:r>
             <w:r>
               <w:rPr>
@@ -1649,7 +1649,7 @@
                 <w:noProof/>
                 <w:webHidden/>
               </w:rPr>
-              <w:t>8</w:t>
+              <w:t>7</w:t>
             </w:r>
             <w:r>
               <w:rPr>
@@ -1672,7 +1672,7 @@
               <w:lang w:eastAsia="en-GB"/>
             </w:rPr>
           </w:pPr>
-          <w:hyperlink w:anchor="_Toc226378564" w:history="1">
+          <w:hyperlink w:anchor="_Toc227233433" w:history="1">
             <w:r>
               <w:rPr>
                 <w:rStyle w:val="Hyperlink"/>
@@ -1699,7 +1699,7 @@
                 <w:noProof/>
                 <w:webHidden/>
               </w:rPr>
-              <w:instrText xml:space="preserve"> PAGEREF _Toc226378564 \h </w:instrText>
+              <w:instrText xml:space="preserve"> PAGEREF _Toc227233433 \h </w:instrText>
             </w:r>
             <w:r>
               <w:rPr>
@@ -1742,7 +1742,7 @@
               <w:lang w:eastAsia="en-GB"/>
             </w:rPr>
           </w:pPr>
-          <w:hyperlink w:anchor="_Toc226378565" w:history="1">
+          <w:hyperlink w:anchor="_Toc227233434" w:history="1">
             <w:r>
               <w:rPr>
                 <w:rStyle w:val="Hyperlink"/>
@@ -1769,7 +1769,7 @@
                 <w:noProof/>
                 <w:webHidden/>
               </w:rPr>
-              <w:instrText xml:space="preserve"> PAGEREF _Toc226378565 \h </w:instrText>
+              <w:instrText xml:space="preserve"> PAGEREF _Toc227233434 \h </w:instrText>
             </w:r>
             <w:r>
               <w:rPr>
@@ -1812,7 +1812,7 @@
               <w:lang w:eastAsia="en-GB"/>
             </w:rPr>
           </w:pPr>
-          <w:hyperlink w:anchor="_Toc226378566" w:history="1">
+          <w:hyperlink w:anchor="_Toc227233435" w:history="1">
             <w:r>
               <w:rPr>
                 <w:rStyle w:val="Hyperlink"/>
@@ -1839,7 +1839,291 @@
                 <w:noProof/>
                 <w:webHidden/>
               </w:rPr>
-              <w:instrText xml:space="preserve"> PAGEREF _Toc226378566 \h </w:instrText>
+              <w:instrText xml:space="preserve"> PAGEREF _Toc227233435 \h </w:instrText>
+            </w:r>
+            <w:r>
+              <w:rPr>
+                <w:noProof/>
+                <w:webHidden/>
+              </w:rPr>
+            </w:r>
+            <w:r>
+              <w:rPr>
+                <w:noProof/>
+                <w:webHidden/>
+              </w:rPr>
+              <w:fldChar w:fldCharType="separate"/>
+            </w:r>
+            <w:r>
+              <w:rPr>
+                <w:noProof/>
+                <w:webHidden/>
+              </w:rPr>
+              <w:t>8</w:t>
+            </w:r>
+            <w:r>
+              <w:rPr>
+                <w:noProof/>
+                <w:webHidden/>
+              </w:rPr>
+              <w:fldChar w:fldCharType="end"/>
+            </w:r>
+          </w:hyperlink>
+        </w:p>
+        <w:p>
+          <w:pPr>
+            <w:pStyle w:val="TOC3"/>
+            <w:tabs>
+              <w:tab w:val="right" w:leader="dot" w:pos="9016"/>
+            </w:tabs>
+            <w:rPr>
+              <w:rFonts w:cstheme="minorBidi"/>
+              <w:noProof/>
+              <w:kern w:val="2"/>
+              <w:sz w:val="24"/>
+              <w:szCs w:val="24"/>
+              <w:lang w:val="en-GB" w:eastAsia="en-GB"/>
+              <w14:ligatures w14:val="standardContextual"/>
+            </w:rPr>
+          </w:pPr>
+          <w:hyperlink w:anchor="_Toc227233436" w:history="1">
+            <w:r>
+              <w:rPr>
+                <w:rStyle w:val="Hyperlink"/>
+                <w:noProof/>
+              </w:rPr>
+              <w:t>2.2.3 AI Integrations</w:t>
+            </w:r>
+            <w:r>
+              <w:rPr>
+                <w:noProof/>
+                <w:webHidden/>
+              </w:rPr>
+              <w:tab/>
+            </w:r>
+            <w:r>
+              <w:rPr>
+                <w:noProof/>
+                <w:webHidden/>
+              </w:rPr>
+              <w:fldChar w:fldCharType="begin"/>
+            </w:r>
+            <w:r>
+              <w:rPr>
+                <w:noProof/>
+                <w:webHidden/>
+              </w:rPr>
+              <w:instrText xml:space="preserve"> PAGEREF _Toc227233436 \h </w:instrText>
+            </w:r>
+            <w:r>
+              <w:rPr>
+                <w:noProof/>
+                <w:webHidden/>
+              </w:rPr>
+            </w:r>
+            <w:r>
+              <w:rPr>
+                <w:noProof/>
+                <w:webHidden/>
+              </w:rPr>
+              <w:fldChar w:fldCharType="separate"/>
+            </w:r>
+            <w:r>
+              <w:rPr>
+                <w:noProof/>
+                <w:webHidden/>
+              </w:rPr>
+              <w:t>8</w:t>
+            </w:r>
+            <w:r>
+              <w:rPr>
+                <w:noProof/>
+                <w:webHidden/>
+              </w:rPr>
+              <w:fldChar w:fldCharType="end"/>
+            </w:r>
+          </w:hyperlink>
+        </w:p>
+        <w:p>
+          <w:pPr>
+            <w:pStyle w:val="TOC4"/>
+            <w:tabs>
+              <w:tab w:val="right" w:leader="dot" w:pos="9016"/>
+            </w:tabs>
+            <w:rPr>
+              <w:rFonts w:eastAsiaTheme="minorEastAsia"/>
+              <w:noProof/>
+              <w:lang w:eastAsia="en-GB"/>
+            </w:rPr>
+          </w:pPr>
+          <w:hyperlink w:anchor="_Toc227233437" w:history="1">
+            <w:r>
+              <w:rPr>
+                <w:rStyle w:val="Hyperlink"/>
+                <w:noProof/>
+              </w:rPr>
+              <w:t>2.2.3.1 Neural Network</w:t>
+            </w:r>
+            <w:r>
+              <w:rPr>
+                <w:noProof/>
+                <w:webHidden/>
+              </w:rPr>
+              <w:tab/>
+            </w:r>
+            <w:r>
+              <w:rPr>
+                <w:noProof/>
+                <w:webHidden/>
+              </w:rPr>
+              <w:fldChar w:fldCharType="begin"/>
+            </w:r>
+            <w:r>
+              <w:rPr>
+                <w:noProof/>
+                <w:webHidden/>
+              </w:rPr>
+              <w:instrText xml:space="preserve"> PAGEREF _Toc227233437 \h </w:instrText>
+            </w:r>
+            <w:r>
+              <w:rPr>
+                <w:noProof/>
+                <w:webHidden/>
+              </w:rPr>
+            </w:r>
+            <w:r>
+              <w:rPr>
+                <w:noProof/>
+                <w:webHidden/>
+              </w:rPr>
+              <w:fldChar w:fldCharType="separate"/>
+            </w:r>
+            <w:r>
+              <w:rPr>
+                <w:noProof/>
+                <w:webHidden/>
+              </w:rPr>
+              <w:t>8</w:t>
+            </w:r>
+            <w:r>
+              <w:rPr>
+                <w:noProof/>
+                <w:webHidden/>
+              </w:rPr>
+              <w:fldChar w:fldCharType="end"/>
+            </w:r>
+          </w:hyperlink>
+        </w:p>
+        <w:p>
+          <w:pPr>
+            <w:pStyle w:val="TOC4"/>
+            <w:tabs>
+              <w:tab w:val="right" w:leader="dot" w:pos="9016"/>
+            </w:tabs>
+            <w:rPr>
+              <w:rFonts w:eastAsiaTheme="minorEastAsia"/>
+              <w:noProof/>
+              <w:lang w:eastAsia="en-GB"/>
+            </w:rPr>
+          </w:pPr>
+          <w:hyperlink w:anchor="_Toc227233438" w:history="1">
+            <w:r>
+              <w:rPr>
+                <w:rStyle w:val="Hyperlink"/>
+                <w:noProof/>
+              </w:rPr>
+              <w:t>2.2.3.2 Reinforcement Learning</w:t>
+            </w:r>
+            <w:r>
+              <w:rPr>
+                <w:noProof/>
+                <w:webHidden/>
+              </w:rPr>
+              <w:tab/>
+            </w:r>
+            <w:r>
+              <w:rPr>
+                <w:noProof/>
+                <w:webHidden/>
+              </w:rPr>
+              <w:fldChar w:fldCharType="begin"/>
+            </w:r>
+            <w:r>
+              <w:rPr>
+                <w:noProof/>
+                <w:webHidden/>
+              </w:rPr>
+              <w:instrText xml:space="preserve"> PAGEREF _Toc227233438 \h </w:instrText>
+            </w:r>
+            <w:r>
+              <w:rPr>
+                <w:noProof/>
+                <w:webHidden/>
+              </w:rPr>
+            </w:r>
+            <w:r>
+              <w:rPr>
+                <w:noProof/>
+                <w:webHidden/>
+              </w:rPr>
+              <w:fldChar w:fldCharType="separate"/>
+            </w:r>
+            <w:r>
+              <w:rPr>
+                <w:noProof/>
+                <w:webHidden/>
+              </w:rPr>
+              <w:t>8</w:t>
+            </w:r>
+            <w:r>
+              <w:rPr>
+                <w:noProof/>
+                <w:webHidden/>
+              </w:rPr>
+              <w:fldChar w:fldCharType="end"/>
+            </w:r>
+          </w:hyperlink>
+        </w:p>
+        <w:p>
+          <w:pPr>
+            <w:pStyle w:val="TOC4"/>
+            <w:tabs>
+              <w:tab w:val="right" w:leader="dot" w:pos="9016"/>
+            </w:tabs>
+            <w:rPr>
+              <w:rFonts w:eastAsiaTheme="minorEastAsia"/>
+              <w:noProof/>
+              <w:lang w:eastAsia="en-GB"/>
+            </w:rPr>
+          </w:pPr>
+          <w:hyperlink w:anchor="_Toc227233439" w:history="1">
+            <w:r>
+              <w:rPr>
+                <w:rStyle w:val="Hyperlink"/>
+                <w:noProof/>
+              </w:rPr>
+              <w:t>2.2.3.3 Imitation Learning</w:t>
+            </w:r>
+            <w:r>
+              <w:rPr>
+                <w:noProof/>
+                <w:webHidden/>
+              </w:rPr>
+              <w:tab/>
+            </w:r>
+            <w:r>
+              <w:rPr>
+                <w:noProof/>
+                <w:webHidden/>
+              </w:rPr>
+              <w:fldChar w:fldCharType="begin"/>
+            </w:r>
+            <w:r>
+              <w:rPr>
+                <w:noProof/>
+                <w:webHidden/>
+              </w:rPr>
+              <w:instrText xml:space="preserve"> PAGEREF _Toc227233439 \h </w:instrText>
             </w:r>
             <w:r>
               <w:rPr>
@@ -1886,7 +2170,7 @@
               <w14:ligatures w14:val="standardContextual"/>
             </w:rPr>
           </w:pPr>
-          <w:hyperlink w:anchor="_Toc226378567" w:history="1">
+          <w:hyperlink w:anchor="_Toc227233440" w:history="1">
             <w:r>
               <w:rPr>
                 <w:rStyle w:val="Hyperlink"/>
@@ -1913,7 +2197,7 @@
                 <w:noProof/>
                 <w:webHidden/>
               </w:rPr>
-              <w:instrText xml:space="preserve"> PAGEREF _Toc226378567 \h </w:instrText>
+              <w:instrText xml:space="preserve"> PAGEREF _Toc227233440 \h </w:instrText>
             </w:r>
             <w:r>
               <w:rPr>
@@ -1933,7 +2217,7 @@
                 <w:noProof/>
                 <w:webHidden/>
               </w:rPr>
-              <w:t>9</w:t>
+              <w:t>8</w:t>
             </w:r>
             <w:r>
               <w:rPr>
@@ -2050,100 +2334,10 @@
     </w:p>
     <w:p>
       <w:pPr>
-        <w:rPr>
-          <w:sz w:val="36"/>
-          <w:szCs w:val="36"/>
-          <w:u w:val="single"/>
-        </w:rPr>
-      </w:pPr>
-    </w:p>
-    <w:p>
-      <w:pPr>
-        <w:rPr>
-          <w:sz w:val="36"/>
-          <w:szCs w:val="36"/>
-          <w:u w:val="single"/>
-        </w:rPr>
-      </w:pPr>
-    </w:p>
-    <w:p>
-      <w:pPr>
-        <w:rPr>
-          <w:sz w:val="36"/>
-          <w:szCs w:val="36"/>
-          <w:u w:val="single"/>
-        </w:rPr>
-      </w:pPr>
-    </w:p>
-    <w:p>
-      <w:pPr>
-        <w:rPr>
-          <w:sz w:val="36"/>
-          <w:szCs w:val="36"/>
-          <w:u w:val="single"/>
-        </w:rPr>
-      </w:pPr>
-    </w:p>
-    <w:p>
-      <w:pPr>
-        <w:rPr>
-          <w:sz w:val="36"/>
-          <w:szCs w:val="36"/>
-          <w:u w:val="single"/>
-        </w:rPr>
-      </w:pPr>
-    </w:p>
-    <w:p>
-      <w:pPr>
-        <w:rPr>
-          <w:sz w:val="36"/>
-          <w:szCs w:val="36"/>
-          <w:u w:val="single"/>
-        </w:rPr>
-      </w:pPr>
-    </w:p>
-    <w:p>
-      <w:pPr>
-        <w:rPr>
-          <w:sz w:val="36"/>
-          <w:szCs w:val="36"/>
-          <w:u w:val="single"/>
-        </w:rPr>
-      </w:pPr>
-    </w:p>
-    <w:p>
-      <w:pPr>
-        <w:rPr>
-          <w:sz w:val="36"/>
-          <w:szCs w:val="36"/>
-          <w:u w:val="single"/>
-        </w:rPr>
-      </w:pPr>
-    </w:p>
-    <w:p>
-      <w:pPr>
-        <w:rPr>
-          <w:sz w:val="36"/>
-          <w:szCs w:val="36"/>
-          <w:u w:val="single"/>
-        </w:rPr>
-      </w:pPr>
-    </w:p>
-    <w:p>
-      <w:pPr>
-        <w:rPr>
-          <w:sz w:val="36"/>
-          <w:szCs w:val="36"/>
-          <w:u w:val="single"/>
-        </w:rPr>
-      </w:pPr>
-    </w:p>
-    <w:p>
-      <w:pPr>
         <w:pStyle w:val="Heading1"/>
         <w:jc w:val="center"/>
       </w:pPr>
-      <w:bookmarkStart w:id="0" w:name="_Toc226378545"/>
+      <w:bookmarkStart w:id="0" w:name="_Toc227233414"/>
       <w:r>
         <w:t>Chapter 1</w:t>
       </w:r>
@@ -2171,7 +2365,7 @@
           <w:u w:val="single"/>
         </w:rPr>
       </w:pPr>
-      <w:bookmarkStart w:id="1" w:name="_Toc226378546"/>
+      <w:bookmarkStart w:id="1" w:name="_Toc227233415"/>
       <w:r>
         <w:t>1.1</w:t>
       </w:r>
@@ -2208,7 +2402,6 @@
     <w:p/>
     <w:p>
       <w:r>
-        <w:lastRenderedPageBreak/>
         <w:t>The game will start the player off in a randomly generated world on a roughly equidistant tile from any other players, giving them the freedom to settle their first city immediately or to move them around to somewhere that may be more suited to their playstyle. The player will then be able to farm the lands resources to stimulate city growth, population growth and overall production. I have designed the game in this way to hopefully create a replay-able and fun game for players to enjoy and come back to.</w:t>
       </w:r>
     </w:p>
@@ -2217,14 +2410,14 @@
       <w:pPr>
         <w:pStyle w:val="Heading1"/>
       </w:pPr>
-      <w:bookmarkStart w:id="2" w:name="_Toc226378547"/>
+      <w:bookmarkStart w:id="2" w:name="_Toc227233416"/>
       <w:r>
         <w:t>1.2 Aims</w:t>
       </w:r>
       <w:bookmarkEnd w:id="2"/>
     </w:p>
     <w:p>
-      <w:bookmarkStart w:id="3" w:name="_Toc226378548"/>
+      <w:bookmarkStart w:id="3" w:name="_Toc227233417"/>
       <w:r>
         <w:rPr>
           <w:rStyle w:val="Heading2Char"/>
@@ -2251,6 +2444,7 @@
         <w:t xml:space="preserve"> play the game without the need for a significant </w:t>
       </w:r>
       <w:r>
+        <w:lastRenderedPageBreak/>
         <w:t>number</w:t>
       </w:r>
       <w:r>
@@ -2267,7 +2461,7 @@
       <w:pPr>
         <w:pStyle w:val="Heading2"/>
       </w:pPr>
-      <w:bookmarkStart w:id="4" w:name="_Toc226378549"/>
+      <w:bookmarkStart w:id="4" w:name="_Toc227233418"/>
       <w:r>
         <w:t>1.2.2 Additional Aims</w:t>
       </w:r>
@@ -2336,7 +2530,7 @@
       <w:pPr>
         <w:pStyle w:val="Heading1"/>
       </w:pPr>
-      <w:bookmarkStart w:id="5" w:name="_Toc226378550"/>
+      <w:bookmarkStart w:id="5" w:name="_Toc227233419"/>
       <w:r>
         <w:t>1.3 Objectives</w:t>
       </w:r>
@@ -2346,7 +2540,7 @@
       <w:pPr>
         <w:pStyle w:val="Heading2"/>
       </w:pPr>
-      <w:bookmarkStart w:id="6" w:name="_Toc226378551"/>
+      <w:bookmarkStart w:id="6" w:name="_Toc227233420"/>
       <w:r>
         <w:t>1.3.1 Scope</w:t>
       </w:r>
@@ -2366,7 +2560,6 @@
         </w:numPr>
       </w:pPr>
       <w:r>
-        <w:lastRenderedPageBreak/>
         <w:t>Creating a game with informed design decisions based on research and practical usages.</w:t>
       </w:r>
     </w:p>
@@ -2410,7 +2603,7 @@
       <w:pPr>
         <w:pStyle w:val="Heading2"/>
       </w:pPr>
-      <w:bookmarkStart w:id="7" w:name="_Toc226378552"/>
+      <w:bookmarkStart w:id="7" w:name="_Toc227233421"/>
       <w:r>
         <w:t>1.3.2 Research Objectives</w:t>
       </w:r>
@@ -2418,22 +2611,20 @@
     </w:p>
     <w:p>
       <w:r>
-        <w:t>For the research objectives for the game, research will be conducted into other types of media with similar features. This research will include a comparison of similar games and their features and the overall impact of those features on this project. This will be done to find a balance for the difficulty of the game and to evaluate the necessary features for the game. Some topics of features and mechanics that will be researched include: World Generation, Pathfinding</w:t>
-      </w:r>
-      <w:r>
-        <w:t>,</w:t>
-      </w:r>
-      <w:r>
-        <w:t xml:space="preserve"> </w:t>
-      </w:r>
-      <w:r>
-        <w:t xml:space="preserve">Advanced </w:t>
-      </w:r>
-      <w:r>
-        <w:t>Event Handling</w:t>
-      </w:r>
-      <w:r>
-        <w:t xml:space="preserve"> and AI integrations</w:t>
+        <w:t xml:space="preserve">For the research objectives for the game, research will be conducted into other types of media with similar features. This research will include a comparison of similar games and their features and the overall impact of those features on this project. This will be done to find a balance for the difficulty of the game and to evaluate the necessary </w:t>
+      </w:r>
+      <w:r>
+        <w:lastRenderedPageBreak/>
+        <w:t>features for the game. Some topics of features and mechanics that will be researched include: World Generation, Pathfinding</w:t>
+      </w:r>
+      <w:r>
+        <w:t xml:space="preserve"> and </w:t>
+      </w:r>
+      <w:r>
+        <w:t>AI integrations</w:t>
+      </w:r>
+      <w:r>
+        <w:t xml:space="preserve"> for games</w:t>
       </w:r>
       <w:r>
         <w:t>. A significant amount of research will be done into various machine learning models, their strengths and weaknesses and how these can be integrated into my game.</w:t>
@@ -2450,7 +2641,7 @@
       <w:pPr>
         <w:pStyle w:val="Heading2"/>
       </w:pPr>
-      <w:bookmarkStart w:id="8" w:name="_Toc226378553"/>
+      <w:bookmarkStart w:id="8" w:name="_Toc227233422"/>
       <w:r>
         <w:t>1.3.3 Design Objectives</w:t>
       </w:r>
@@ -2560,7 +2751,6 @@
         </w:numPr>
       </w:pPr>
       <w:r>
-        <w:lastRenderedPageBreak/>
         <w:t>Design the architecture to accommodate a machine learning opponent that can adapt over multiple sessions.</w:t>
       </w:r>
     </w:p>
@@ -2573,7 +2763,7 @@
       <w:pPr>
         <w:pStyle w:val="Heading2"/>
       </w:pPr>
-      <w:bookmarkStart w:id="9" w:name="_Toc226378554"/>
+      <w:bookmarkStart w:id="9" w:name="_Toc227233423"/>
       <w:r>
         <w:t>1.3.4 Implementation Objectives</w:t>
       </w:r>
@@ -2692,7 +2882,7 @@
       <w:pPr>
         <w:pStyle w:val="Heading2"/>
       </w:pPr>
-      <w:bookmarkStart w:id="10" w:name="_Toc226378555"/>
+      <w:bookmarkStart w:id="10" w:name="_Toc227233424"/>
       <w:r>
         <w:t>1.3.5 Results, Evaluation and Playtesting Objectives</w:t>
       </w:r>
@@ -2748,7 +2938,7 @@
       <w:pPr>
         <w:pStyle w:val="Heading1"/>
       </w:pPr>
-      <w:bookmarkStart w:id="11" w:name="_Toc226378556"/>
+      <w:bookmarkStart w:id="11" w:name="_Toc227233425"/>
       <w:r>
         <w:t>Chapter 2 – Literature Survey</w:t>
       </w:r>
@@ -2758,7 +2948,7 @@
       <w:pPr>
         <w:pStyle w:val="Heading2"/>
       </w:pPr>
-      <w:bookmarkStart w:id="12" w:name="_Toc226378557"/>
+      <w:bookmarkStart w:id="12" w:name="_Toc227233426"/>
       <w:r>
         <w:t>2.1 Literature Survey Introduction</w:t>
       </w:r>
@@ -2797,7 +2987,7 @@
       <w:pPr>
         <w:pStyle w:val="Heading2"/>
       </w:pPr>
-      <w:bookmarkStart w:id="13" w:name="_Toc226378558"/>
+      <w:bookmarkStart w:id="13" w:name="_Toc227233427"/>
       <w:r>
         <w:t>2.2 Comparative Research</w:t>
       </w:r>
@@ -2815,9 +3005,8 @@
       <w:pPr>
         <w:pStyle w:val="Heading3"/>
       </w:pPr>
-      <w:bookmarkStart w:id="14" w:name="_Toc226378559"/>
-      <w:r>
-        <w:lastRenderedPageBreak/>
+      <w:bookmarkStart w:id="14" w:name="_Toc227233428"/>
+      <w:r>
         <w:t xml:space="preserve">2.2.1 </w:t>
       </w:r>
       <w:r>
@@ -2892,7 +3081,7 @@
       <w:pPr>
         <w:pStyle w:val="Heading4"/>
       </w:pPr>
-      <w:bookmarkStart w:id="15" w:name="_Toc226378560"/>
+      <w:bookmarkStart w:id="15" w:name="_Toc227233429"/>
       <w:r>
         <w:t>2.2.1.1 Perlin Noise</w:t>
       </w:r>
@@ -2915,6 +3104,7 @@
         <w:br/>
       </w:r>
       <w:r>
+        <w:lastRenderedPageBreak/>
         <w:br/>
       </w:r>
       <w:r>
@@ -2949,7 +3139,7 @@
       <w:pPr>
         <w:pStyle w:val="Heading4"/>
       </w:pPr>
-      <w:bookmarkStart w:id="16" w:name="_Toc226378561"/>
+      <w:bookmarkStart w:id="16" w:name="_Toc227233430"/>
       <w:r>
         <w:t>2.2.1.2 Binary Space Partitioning</w:t>
       </w:r>
@@ -3001,7 +3191,7 @@
       <w:pPr>
         <w:pStyle w:val="Heading4"/>
       </w:pPr>
-      <w:bookmarkStart w:id="17" w:name="_Toc226378562"/>
+      <w:bookmarkStart w:id="17" w:name="_Toc227233431"/>
       <w:r>
         <w:t>2.2.1.3 Cellular Automata</w:t>
       </w:r>
@@ -3063,11 +3253,7 @@
         <w:t>)</w:t>
       </w:r>
       <w:r>
-        <w:t xml:space="preserve"> according to the following two rules: If a cell is alive, it survives to the next generation if it has 2 or 3 </w:t>
-      </w:r>
-      <w:r>
-        <w:lastRenderedPageBreak/>
-        <w:t xml:space="preserve">live neighbors; otherwise it dies. If a cell is dead, it comes to life in the next generation if it has exactly 3 live neighbors; otherwise it stays dead.” </w:t>
+        <w:t xml:space="preserve"> according to the following two rules: If a cell is alive, it survives to the next generation if it has 2 or 3 live neighbors; otherwise it dies. If a cell is dead, it comes to life in the next generation if it has exactly 3 live neighbors; otherwise it stays dead.” </w:t>
       </w:r>
       <w:sdt>
         <w:sdtPr>
@@ -3113,7 +3299,7 @@
       <w:pPr>
         <w:pStyle w:val="Heading3"/>
       </w:pPr>
-      <w:bookmarkStart w:id="18" w:name="_Toc226378563"/>
+      <w:bookmarkStart w:id="18" w:name="_Toc227233432"/>
       <w:r>
         <w:t>2.2.2 Pathfinding</w:t>
       </w:r>
@@ -3134,6 +3320,9 @@
       </w:r>
       <w:r>
         <w:br/>
+      </w:r>
+      <w:r>
+        <w:lastRenderedPageBreak/>
         <w:t xml:space="preserve">In this section, I will be evaluating different games for their interpretation of pathfinding. </w:t>
       </w:r>
       <w:r>
@@ -3152,6 +3341,9 @@
         <w:t>The types of pathfinding I will be evaluating are: A*, Dijkstra</w:t>
       </w:r>
       <w:r>
+        <w:t>,</w:t>
+      </w:r>
+      <w:r>
         <w:t xml:space="preserve"> and</w:t>
       </w:r>
       <w:r>
@@ -3165,7 +3357,7 @@
       <w:pPr>
         <w:pStyle w:val="Heading4"/>
       </w:pPr>
-      <w:bookmarkStart w:id="19" w:name="_Toc226378564"/>
+      <w:bookmarkStart w:id="19" w:name="_Toc227233433"/>
       <w:r>
         <w:t>2.2.2.1 Dijkstra</w:t>
       </w:r>
@@ -3180,7 +3372,7 @@
       <w:pPr>
         <w:pStyle w:val="Heading4"/>
       </w:pPr>
-      <w:bookmarkStart w:id="20" w:name="_Toc226378565"/>
+      <w:bookmarkStart w:id="20" w:name="_Toc227233434"/>
       <w:r>
         <w:t>2.2.2.2 A*</w:t>
       </w:r>
@@ -3233,7 +3425,7 @@
       <w:pPr>
         <w:pStyle w:val="Heading4"/>
       </w:pPr>
-      <w:bookmarkStart w:id="21" w:name="_Toc226378566"/>
+      <w:bookmarkStart w:id="21" w:name="_Toc227233435"/>
       <w:r>
         <w:t>2.2.2.3 Jump Point Search</w:t>
       </w:r>
@@ -3270,33 +3462,129 @@
         </w:sdtContent>
       </w:sdt>
       <w:r>
-        <w:t xml:space="preserve">, JPS serves as a substantial optimization through the use of “pruning” unnecessary nodes and “jumping over” empty spaces. </w:t>
-      </w:r>
+        <w:t xml:space="preserve">, JPS serves as a substantial optimization through the use of “pruning” unnecessary nodes and “jumping over” empty spaces. Disregarding the </w:t>
+      </w:r>
+      <w:r>
+        <w:t>path cost calculations along with the aforementioned optimizations allows JPS to be significantly faster than A*, even up to an order of magnitude faster.</w:t>
+      </w:r>
+    </w:p>
+    <w:p>
+      <w:pPr>
+        <w:pStyle w:val="Heading3"/>
+      </w:pPr>
+      <w:bookmarkStart w:id="22" w:name="_Toc227233436"/>
+      <w:r>
+        <w:t>2.2.3 AI Integrations</w:t>
+      </w:r>
+      <w:bookmarkEnd w:id="22"/>
+    </w:p>
+    <w:p>
+      <w:r>
+        <w:t>AI is one of the core components of this game and as such needs to be meticulously researched before implementing to ensure I get it right. AI will be used within this game to primarily drive the player’s opponent.</w:t>
+      </w:r>
+      <w:r>
+        <w:br/>
+      </w:r>
+      <w:r>
+        <w:br/>
+        <w:t>In this section of research, I will be researching 3 different types of AI for their strengths and weaknesses and their application within my game. The types of AI I will be researching are: Neural Networks, Reinforcement Learning, and Imitation Learning</w:t>
+      </w:r>
+      <w:r>
+        <w:t>.</w:t>
+      </w:r>
+    </w:p>
+    <w:p>
+      <w:pPr>
+        <w:pStyle w:val="Heading4"/>
+      </w:pPr>
+      <w:bookmarkStart w:id="23" w:name="_Toc227233437"/>
+      <w:r>
+        <w:t>2.2.3.1 Neural Network</w:t>
+      </w:r>
+      <w:bookmarkEnd w:id="23"/>
+    </w:p>
+    <w:p>
+      <w:r>
+        <w:t>Neural Networks are AI models that are inspired by the human brain</w:t>
+      </w:r>
+      <w:r>
+        <w:t>, utilizing artificial neurons and weights to identify patterns and make predictions.</w:t>
+      </w:r>
+      <w:r>
+        <w:t xml:space="preserve"> Neural networks need training data to be able to recognize patterns and alter behaviours. This training data allows the network to “know” things about its input, for example, positions of objects.</w:t>
+      </w:r>
+    </w:p>
+    <w:p>
       <w:r>
         <w:lastRenderedPageBreak/>
-        <w:t xml:space="preserve">Disregarding the </w:t>
-      </w:r>
-      <w:r>
-        <w:t>path cost calculations along with the aforementioned optimizations allows JPS to be significantly faster than A*, even up to an order of magnitude faster.</w:t>
-      </w:r>
-    </w:p>
-    <w:bookmarkStart w:id="22" w:name="_Toc226378567" w:displacedByCustomXml="next"/>
+        <w:t xml:space="preserve">After the initial training phase, if we present the network with a pattern it hasn’t seen before in its training data, it should classify the unseen pattern correctly, only if it has learnt the underlying structure of the problem </w:t>
+      </w:r>
+      <w:sdt>
+        <w:sdtPr>
+          <w:id w:val="-88461243"/>
+          <w:citation/>
+        </w:sdtPr>
+        <w:sdtContent>
+          <w:r>
+            <w:fldChar w:fldCharType="begin"/>
+          </w:r>
+          <w:r>
+            <w:instrText xml:space="preserve"> CITATION Kev18 \l 2057 </w:instrText>
+          </w:r>
+          <w:r>
+            <w:fldChar w:fldCharType="separate"/>
+          </w:r>
+          <w:r>
+            <w:rPr>
+              <w:noProof/>
+            </w:rPr>
+            <w:t>(Gurney, 2018)</w:t>
+          </w:r>
+          <w:r>
+            <w:fldChar w:fldCharType="end"/>
+          </w:r>
+        </w:sdtContent>
+      </w:sdt>
+      <w:r>
+        <w:t>.</w:t>
+      </w:r>
+    </w:p>
+    <w:p>
+      <w:pPr>
+        <w:pStyle w:val="Heading4"/>
+      </w:pPr>
+      <w:bookmarkStart w:id="24" w:name="_Toc227233438"/>
+      <w:r>
+        <w:t>2.2.3.2 Reinforcement Learning</w:t>
+      </w:r>
+      <w:bookmarkEnd w:id="24"/>
+    </w:p>
+    <w:p>
+      <w:pPr>
+        <w:pStyle w:val="Heading4"/>
+      </w:pPr>
+      <w:bookmarkStart w:id="25" w:name="_Toc227233439"/>
+      <w:r>
+        <w:t>2.2.3.3 Imitation Learning</w:t>
+      </w:r>
+      <w:bookmarkEnd w:id="25"/>
+    </w:p>
+    <w:p/>
+    <w:bookmarkStart w:id="26" w:name="_Toc227233440" w:displacedByCustomXml="next"/>
     <w:sdt>
       <w:sdtPr>
+        <w:rPr>
+          <w:rFonts w:asciiTheme="minorHAnsi" w:eastAsiaTheme="minorHAnsi" w:hAnsiTheme="minorHAnsi" w:cstheme="minorBidi"/>
+          <w:color w:val="auto"/>
+          <w:sz w:val="24"/>
+          <w:szCs w:val="24"/>
+        </w:rPr>
         <w:id w:val="783850805"/>
         <w:docPartObj>
           <w:docPartGallery w:val="Bibliographies"/>
           <w:docPartUnique/>
         </w:docPartObj>
       </w:sdtPr>
-      <w:sdtEndPr>
-        <w:rPr>
-          <w:rFonts w:asciiTheme="minorHAnsi" w:eastAsiaTheme="minorHAnsi" w:hAnsiTheme="minorHAnsi" w:cstheme="minorBidi"/>
-          <w:color w:val="auto"/>
-          <w:sz w:val="24"/>
-          <w:szCs w:val="24"/>
-        </w:rPr>
-      </w:sdtEndPr>
       <w:sdtContent>
         <w:p>
           <w:pPr>
@@ -3305,7 +3593,7 @@
           <w:r>
             <w:t>References</w:t>
           </w:r>
-          <w:bookmarkEnd w:id="22"/>
+          <w:bookmarkEnd w:id="26"/>
         </w:p>
         <w:sdt>
           <w:sdtPr>
@@ -3331,6 +3619,34 @@
               <w:r>
                 <w:fldChar w:fldCharType="separate"/>
               </w:r>
+              <w:r>
+                <w:rPr>
+                  <w:noProof/>
+                </w:rPr>
+                <w:t xml:space="preserve">Gurney, K., 2018. </w:t>
+              </w:r>
+              <w:r>
+                <w:rPr>
+                  <w:i/>
+                  <w:iCs/>
+                  <w:noProof/>
+                </w:rPr>
+                <w:t xml:space="preserve">An introduction to neural networks. </w:t>
+              </w:r>
+              <w:r>
+                <w:rPr>
+                  <w:noProof/>
+                </w:rPr>
+                <w:t>s.l.:CRC press.</w:t>
+              </w:r>
+            </w:p>
+            <w:p>
+              <w:pPr>
+                <w:pStyle w:val="Bibliography"/>
+                <w:rPr>
+                  <w:noProof/>
+                </w:rPr>
+              </w:pPr>
               <w:r>
                 <w:rPr>
                   <w:noProof/>
@@ -4899,6 +5215,7 @@
   <w:style w:type="character" w:default="1" w:styleId="DefaultParagraphFont">
     <w:name w:val="Default Paragraph Font"/>
     <w:uiPriority w:val="1"/>
+    <w:semiHidden/>
     <w:unhideWhenUsed/>
   </w:style>
   <w:style w:type="table" w:default="1" w:styleId="TableNormal">
@@ -5788,11 +6105,30 @@
     </b:Author>
     <b:RefOrder>3</b:RefOrder>
   </b:Source>
+  <b:Source>
+    <b:Tag>Kev18</b:Tag>
+    <b:SourceType>Book</b:SourceType>
+    <b:Guid>{881FF616-329F-44F6-9749-A2E012B92917}</b:Guid>
+    <b:Title>An introduction to neural networks</b:Title>
+    <b:Publisher>CRC press</b:Publisher>
+    <b:Year>2018</b:Year>
+    <b:Author>
+      <b:Author>
+        <b:NameList>
+          <b:Person>
+            <b:Last>Gurney</b:Last>
+            <b:First>Kevin</b:First>
+          </b:Person>
+        </b:NameList>
+      </b:Author>
+    </b:Author>
+    <b:RefOrder>4</b:RefOrder>
+  </b:Source>
 </b:Sources>
 </file>
 
 <file path=customXml/itemProps1.xml><?xml version="1.0" encoding="utf-8"?>
-<ds:datastoreItem xmlns:ds="http://schemas.openxmlformats.org/officeDocument/2006/customXml" ds:itemID="{18B6477A-6460-442E-A4D7-B053D17055CA}">
+<ds:datastoreItem xmlns:ds="http://schemas.openxmlformats.org/officeDocument/2006/customXml" ds:itemID="{157FEB5F-6CA6-4B0B-A294-D9EAC91C473F}">
   <ds:schemaRefs>
     <ds:schemaRef ds:uri="http://schemas.openxmlformats.org/officeDocument/2006/bibliography"/>
   </ds:schemaRefs>

</xml_diff>

<commit_message>
feat: Reinforcement Learning written
</commit_message>
<xml_diff>
--- a/Report.docx
+++ b/Report.docx
@@ -282,7 +282,7 @@
           <w:r>
             <w:fldChar w:fldCharType="separate"/>
           </w:r>
-          <w:hyperlink w:anchor="_Toc227233414" w:history="1">
+          <w:hyperlink w:anchor="_Toc227236449" w:history="1">
             <w:r>
               <w:rPr>
                 <w:rStyle w:val="Hyperlink"/>
@@ -309,7 +309,7 @@
                 <w:noProof/>
                 <w:webHidden/>
               </w:rPr>
-              <w:instrText xml:space="preserve"> PAGEREF _Toc227233414 \h </w:instrText>
+              <w:instrText xml:space="preserve"> PAGEREF _Toc227236449 \h </w:instrText>
             </w:r>
             <w:r>
               <w:rPr>
@@ -356,7 +356,7 @@
               <w14:ligatures w14:val="standardContextual"/>
             </w:rPr>
           </w:pPr>
-          <w:hyperlink w:anchor="_Toc227233415" w:history="1">
+          <w:hyperlink w:anchor="_Toc227236450" w:history="1">
             <w:r>
               <w:rPr>
                 <w:rStyle w:val="Hyperlink"/>
@@ -383,7 +383,7 @@
                 <w:noProof/>
                 <w:webHidden/>
               </w:rPr>
-              <w:instrText xml:space="preserve"> PAGEREF _Toc227233415 \h </w:instrText>
+              <w:instrText xml:space="preserve"> PAGEREF _Toc227236450 \h </w:instrText>
             </w:r>
             <w:r>
               <w:rPr>
@@ -404,6 +404,672 @@
                 <w:webHidden/>
               </w:rPr>
               <w:t>3</w:t>
+            </w:r>
+            <w:r>
+              <w:rPr>
+                <w:noProof/>
+                <w:webHidden/>
+              </w:rPr>
+              <w:fldChar w:fldCharType="end"/>
+            </w:r>
+          </w:hyperlink>
+        </w:p>
+        <w:p>
+          <w:pPr>
+            <w:pStyle w:val="TOC2"/>
+            <w:tabs>
+              <w:tab w:val="right" w:leader="dot" w:pos="9016"/>
+            </w:tabs>
+            <w:rPr>
+              <w:rFonts w:cstheme="minorBidi"/>
+              <w:noProof/>
+              <w:kern w:val="2"/>
+              <w:sz w:val="24"/>
+              <w:szCs w:val="24"/>
+              <w:lang w:val="en-GB" w:eastAsia="en-GB"/>
+              <w14:ligatures w14:val="standardContextual"/>
+            </w:rPr>
+          </w:pPr>
+          <w:hyperlink w:anchor="_Toc227236451" w:history="1">
+            <w:r>
+              <w:rPr>
+                <w:rStyle w:val="Hyperlink"/>
+                <w:noProof/>
+              </w:rPr>
+              <w:t>1.2 Aims</w:t>
+            </w:r>
+            <w:r>
+              <w:rPr>
+                <w:noProof/>
+                <w:webHidden/>
+              </w:rPr>
+              <w:tab/>
+            </w:r>
+            <w:r>
+              <w:rPr>
+                <w:noProof/>
+                <w:webHidden/>
+              </w:rPr>
+              <w:fldChar w:fldCharType="begin"/>
+            </w:r>
+            <w:r>
+              <w:rPr>
+                <w:noProof/>
+                <w:webHidden/>
+              </w:rPr>
+              <w:instrText xml:space="preserve"> PAGEREF _Toc227236451 \h </w:instrText>
+            </w:r>
+            <w:r>
+              <w:rPr>
+                <w:noProof/>
+                <w:webHidden/>
+              </w:rPr>
+            </w:r>
+            <w:r>
+              <w:rPr>
+                <w:noProof/>
+                <w:webHidden/>
+              </w:rPr>
+              <w:fldChar w:fldCharType="separate"/>
+            </w:r>
+            <w:r>
+              <w:rPr>
+                <w:noProof/>
+                <w:webHidden/>
+              </w:rPr>
+              <w:t>3</w:t>
+            </w:r>
+            <w:r>
+              <w:rPr>
+                <w:noProof/>
+                <w:webHidden/>
+              </w:rPr>
+              <w:fldChar w:fldCharType="end"/>
+            </w:r>
+          </w:hyperlink>
+        </w:p>
+        <w:p>
+          <w:pPr>
+            <w:pStyle w:val="TOC3"/>
+            <w:tabs>
+              <w:tab w:val="right" w:leader="dot" w:pos="9016"/>
+            </w:tabs>
+            <w:rPr>
+              <w:rFonts w:cstheme="minorBidi"/>
+              <w:noProof/>
+              <w:kern w:val="2"/>
+              <w:sz w:val="24"/>
+              <w:szCs w:val="24"/>
+              <w:lang w:val="en-GB" w:eastAsia="en-GB"/>
+              <w14:ligatures w14:val="standardContextual"/>
+            </w:rPr>
+          </w:pPr>
+          <w:hyperlink w:anchor="_Toc227236452" w:history="1">
+            <w:r>
+              <w:rPr>
+                <w:rStyle w:val="Hyperlink"/>
+                <w:noProof/>
+              </w:rPr>
+              <w:t>1.2.1 Main Aim</w:t>
+            </w:r>
+            <w:r>
+              <w:rPr>
+                <w:noProof/>
+                <w:webHidden/>
+              </w:rPr>
+              <w:tab/>
+            </w:r>
+            <w:r>
+              <w:rPr>
+                <w:noProof/>
+                <w:webHidden/>
+              </w:rPr>
+              <w:fldChar w:fldCharType="begin"/>
+            </w:r>
+            <w:r>
+              <w:rPr>
+                <w:noProof/>
+                <w:webHidden/>
+              </w:rPr>
+              <w:instrText xml:space="preserve"> PAGEREF _Toc227236452 \h </w:instrText>
+            </w:r>
+            <w:r>
+              <w:rPr>
+                <w:noProof/>
+                <w:webHidden/>
+              </w:rPr>
+            </w:r>
+            <w:r>
+              <w:rPr>
+                <w:noProof/>
+                <w:webHidden/>
+              </w:rPr>
+              <w:fldChar w:fldCharType="separate"/>
+            </w:r>
+            <w:r>
+              <w:rPr>
+                <w:noProof/>
+                <w:webHidden/>
+              </w:rPr>
+              <w:t>3</w:t>
+            </w:r>
+            <w:r>
+              <w:rPr>
+                <w:noProof/>
+                <w:webHidden/>
+              </w:rPr>
+              <w:fldChar w:fldCharType="end"/>
+            </w:r>
+          </w:hyperlink>
+        </w:p>
+        <w:p>
+          <w:pPr>
+            <w:pStyle w:val="TOC3"/>
+            <w:tabs>
+              <w:tab w:val="right" w:leader="dot" w:pos="9016"/>
+            </w:tabs>
+            <w:rPr>
+              <w:rFonts w:cstheme="minorBidi"/>
+              <w:noProof/>
+              <w:kern w:val="2"/>
+              <w:sz w:val="24"/>
+              <w:szCs w:val="24"/>
+              <w:lang w:val="en-GB" w:eastAsia="en-GB"/>
+              <w14:ligatures w14:val="standardContextual"/>
+            </w:rPr>
+          </w:pPr>
+          <w:hyperlink w:anchor="_Toc227236453" w:history="1">
+            <w:r>
+              <w:rPr>
+                <w:rStyle w:val="Hyperlink"/>
+                <w:noProof/>
+              </w:rPr>
+              <w:t>1.2.2 Additional Aims</w:t>
+            </w:r>
+            <w:r>
+              <w:rPr>
+                <w:noProof/>
+                <w:webHidden/>
+              </w:rPr>
+              <w:tab/>
+            </w:r>
+            <w:r>
+              <w:rPr>
+                <w:noProof/>
+                <w:webHidden/>
+              </w:rPr>
+              <w:fldChar w:fldCharType="begin"/>
+            </w:r>
+            <w:r>
+              <w:rPr>
+                <w:noProof/>
+                <w:webHidden/>
+              </w:rPr>
+              <w:instrText xml:space="preserve"> PAGEREF _Toc227236453 \h </w:instrText>
+            </w:r>
+            <w:r>
+              <w:rPr>
+                <w:noProof/>
+                <w:webHidden/>
+              </w:rPr>
+            </w:r>
+            <w:r>
+              <w:rPr>
+                <w:noProof/>
+                <w:webHidden/>
+              </w:rPr>
+              <w:fldChar w:fldCharType="separate"/>
+            </w:r>
+            <w:r>
+              <w:rPr>
+                <w:noProof/>
+                <w:webHidden/>
+              </w:rPr>
+              <w:t>4</w:t>
+            </w:r>
+            <w:r>
+              <w:rPr>
+                <w:noProof/>
+                <w:webHidden/>
+              </w:rPr>
+              <w:fldChar w:fldCharType="end"/>
+            </w:r>
+          </w:hyperlink>
+        </w:p>
+        <w:p>
+          <w:pPr>
+            <w:pStyle w:val="TOC2"/>
+            <w:tabs>
+              <w:tab w:val="right" w:leader="dot" w:pos="9016"/>
+            </w:tabs>
+            <w:rPr>
+              <w:rFonts w:cstheme="minorBidi"/>
+              <w:noProof/>
+              <w:kern w:val="2"/>
+              <w:sz w:val="24"/>
+              <w:szCs w:val="24"/>
+              <w:lang w:val="en-GB" w:eastAsia="en-GB"/>
+              <w14:ligatures w14:val="standardContextual"/>
+            </w:rPr>
+          </w:pPr>
+          <w:hyperlink w:anchor="_Toc227236454" w:history="1">
+            <w:r>
+              <w:rPr>
+                <w:rStyle w:val="Hyperlink"/>
+                <w:noProof/>
+              </w:rPr>
+              <w:t>1.3 Objectives</w:t>
+            </w:r>
+            <w:r>
+              <w:rPr>
+                <w:noProof/>
+                <w:webHidden/>
+              </w:rPr>
+              <w:tab/>
+            </w:r>
+            <w:r>
+              <w:rPr>
+                <w:noProof/>
+                <w:webHidden/>
+              </w:rPr>
+              <w:fldChar w:fldCharType="begin"/>
+            </w:r>
+            <w:r>
+              <w:rPr>
+                <w:noProof/>
+                <w:webHidden/>
+              </w:rPr>
+              <w:instrText xml:space="preserve"> PAGEREF _Toc227236454 \h </w:instrText>
+            </w:r>
+            <w:r>
+              <w:rPr>
+                <w:noProof/>
+                <w:webHidden/>
+              </w:rPr>
+            </w:r>
+            <w:r>
+              <w:rPr>
+                <w:noProof/>
+                <w:webHidden/>
+              </w:rPr>
+              <w:fldChar w:fldCharType="separate"/>
+            </w:r>
+            <w:r>
+              <w:rPr>
+                <w:noProof/>
+                <w:webHidden/>
+              </w:rPr>
+              <w:t>4</w:t>
+            </w:r>
+            <w:r>
+              <w:rPr>
+                <w:noProof/>
+                <w:webHidden/>
+              </w:rPr>
+              <w:fldChar w:fldCharType="end"/>
+            </w:r>
+          </w:hyperlink>
+        </w:p>
+        <w:p>
+          <w:pPr>
+            <w:pStyle w:val="TOC3"/>
+            <w:tabs>
+              <w:tab w:val="right" w:leader="dot" w:pos="9016"/>
+            </w:tabs>
+            <w:rPr>
+              <w:rFonts w:cstheme="minorBidi"/>
+              <w:noProof/>
+              <w:kern w:val="2"/>
+              <w:sz w:val="24"/>
+              <w:szCs w:val="24"/>
+              <w:lang w:val="en-GB" w:eastAsia="en-GB"/>
+              <w14:ligatures w14:val="standardContextual"/>
+            </w:rPr>
+          </w:pPr>
+          <w:hyperlink w:anchor="_Toc227236455" w:history="1">
+            <w:r>
+              <w:rPr>
+                <w:rStyle w:val="Hyperlink"/>
+                <w:noProof/>
+              </w:rPr>
+              <w:t>1.3.1 Scope</w:t>
+            </w:r>
+            <w:r>
+              <w:rPr>
+                <w:noProof/>
+                <w:webHidden/>
+              </w:rPr>
+              <w:tab/>
+            </w:r>
+            <w:r>
+              <w:rPr>
+                <w:noProof/>
+                <w:webHidden/>
+              </w:rPr>
+              <w:fldChar w:fldCharType="begin"/>
+            </w:r>
+            <w:r>
+              <w:rPr>
+                <w:noProof/>
+                <w:webHidden/>
+              </w:rPr>
+              <w:instrText xml:space="preserve"> PAGEREF _Toc227236455 \h </w:instrText>
+            </w:r>
+            <w:r>
+              <w:rPr>
+                <w:noProof/>
+                <w:webHidden/>
+              </w:rPr>
+            </w:r>
+            <w:r>
+              <w:rPr>
+                <w:noProof/>
+                <w:webHidden/>
+              </w:rPr>
+              <w:fldChar w:fldCharType="separate"/>
+            </w:r>
+            <w:r>
+              <w:rPr>
+                <w:noProof/>
+                <w:webHidden/>
+              </w:rPr>
+              <w:t>4</w:t>
+            </w:r>
+            <w:r>
+              <w:rPr>
+                <w:noProof/>
+                <w:webHidden/>
+              </w:rPr>
+              <w:fldChar w:fldCharType="end"/>
+            </w:r>
+          </w:hyperlink>
+        </w:p>
+        <w:p>
+          <w:pPr>
+            <w:pStyle w:val="TOC3"/>
+            <w:tabs>
+              <w:tab w:val="right" w:leader="dot" w:pos="9016"/>
+            </w:tabs>
+            <w:rPr>
+              <w:rFonts w:cstheme="minorBidi"/>
+              <w:noProof/>
+              <w:kern w:val="2"/>
+              <w:sz w:val="24"/>
+              <w:szCs w:val="24"/>
+              <w:lang w:val="en-GB" w:eastAsia="en-GB"/>
+              <w14:ligatures w14:val="standardContextual"/>
+            </w:rPr>
+          </w:pPr>
+          <w:hyperlink w:anchor="_Toc227236456" w:history="1">
+            <w:r>
+              <w:rPr>
+                <w:rStyle w:val="Hyperlink"/>
+                <w:noProof/>
+              </w:rPr>
+              <w:t>1.3.2 Research Objectives</w:t>
+            </w:r>
+            <w:r>
+              <w:rPr>
+                <w:noProof/>
+                <w:webHidden/>
+              </w:rPr>
+              <w:tab/>
+            </w:r>
+            <w:r>
+              <w:rPr>
+                <w:noProof/>
+                <w:webHidden/>
+              </w:rPr>
+              <w:fldChar w:fldCharType="begin"/>
+            </w:r>
+            <w:r>
+              <w:rPr>
+                <w:noProof/>
+                <w:webHidden/>
+              </w:rPr>
+              <w:instrText xml:space="preserve"> PAGEREF _Toc227236456 \h </w:instrText>
+            </w:r>
+            <w:r>
+              <w:rPr>
+                <w:noProof/>
+                <w:webHidden/>
+              </w:rPr>
+            </w:r>
+            <w:r>
+              <w:rPr>
+                <w:noProof/>
+                <w:webHidden/>
+              </w:rPr>
+              <w:fldChar w:fldCharType="separate"/>
+            </w:r>
+            <w:r>
+              <w:rPr>
+                <w:noProof/>
+                <w:webHidden/>
+              </w:rPr>
+              <w:t>4</w:t>
+            </w:r>
+            <w:r>
+              <w:rPr>
+                <w:noProof/>
+                <w:webHidden/>
+              </w:rPr>
+              <w:fldChar w:fldCharType="end"/>
+            </w:r>
+          </w:hyperlink>
+        </w:p>
+        <w:p>
+          <w:pPr>
+            <w:pStyle w:val="TOC3"/>
+            <w:tabs>
+              <w:tab w:val="right" w:leader="dot" w:pos="9016"/>
+            </w:tabs>
+            <w:rPr>
+              <w:rFonts w:cstheme="minorBidi"/>
+              <w:noProof/>
+              <w:kern w:val="2"/>
+              <w:sz w:val="24"/>
+              <w:szCs w:val="24"/>
+              <w:lang w:val="en-GB" w:eastAsia="en-GB"/>
+              <w14:ligatures w14:val="standardContextual"/>
+            </w:rPr>
+          </w:pPr>
+          <w:hyperlink w:anchor="_Toc227236457" w:history="1">
+            <w:r>
+              <w:rPr>
+                <w:rStyle w:val="Hyperlink"/>
+                <w:noProof/>
+              </w:rPr>
+              <w:t>1.3.3 Design Objectives</w:t>
+            </w:r>
+            <w:r>
+              <w:rPr>
+                <w:noProof/>
+                <w:webHidden/>
+              </w:rPr>
+              <w:tab/>
+            </w:r>
+            <w:r>
+              <w:rPr>
+                <w:noProof/>
+                <w:webHidden/>
+              </w:rPr>
+              <w:fldChar w:fldCharType="begin"/>
+            </w:r>
+            <w:r>
+              <w:rPr>
+                <w:noProof/>
+                <w:webHidden/>
+              </w:rPr>
+              <w:instrText xml:space="preserve"> PAGEREF _Toc227236457 \h </w:instrText>
+            </w:r>
+            <w:r>
+              <w:rPr>
+                <w:noProof/>
+                <w:webHidden/>
+              </w:rPr>
+            </w:r>
+            <w:r>
+              <w:rPr>
+                <w:noProof/>
+                <w:webHidden/>
+              </w:rPr>
+              <w:fldChar w:fldCharType="separate"/>
+            </w:r>
+            <w:r>
+              <w:rPr>
+                <w:noProof/>
+                <w:webHidden/>
+              </w:rPr>
+              <w:t>5</w:t>
+            </w:r>
+            <w:r>
+              <w:rPr>
+                <w:noProof/>
+                <w:webHidden/>
+              </w:rPr>
+              <w:fldChar w:fldCharType="end"/>
+            </w:r>
+          </w:hyperlink>
+        </w:p>
+        <w:p>
+          <w:pPr>
+            <w:pStyle w:val="TOC3"/>
+            <w:tabs>
+              <w:tab w:val="right" w:leader="dot" w:pos="9016"/>
+            </w:tabs>
+            <w:rPr>
+              <w:rFonts w:cstheme="minorBidi"/>
+              <w:noProof/>
+              <w:kern w:val="2"/>
+              <w:sz w:val="24"/>
+              <w:szCs w:val="24"/>
+              <w:lang w:val="en-GB" w:eastAsia="en-GB"/>
+              <w14:ligatures w14:val="standardContextual"/>
+            </w:rPr>
+          </w:pPr>
+          <w:hyperlink w:anchor="_Toc227236458" w:history="1">
+            <w:r>
+              <w:rPr>
+                <w:rStyle w:val="Hyperlink"/>
+                <w:noProof/>
+              </w:rPr>
+              <w:t>1.3.4 Implementation Objectives</w:t>
+            </w:r>
+            <w:r>
+              <w:rPr>
+                <w:noProof/>
+                <w:webHidden/>
+              </w:rPr>
+              <w:tab/>
+            </w:r>
+            <w:r>
+              <w:rPr>
+                <w:noProof/>
+                <w:webHidden/>
+              </w:rPr>
+              <w:fldChar w:fldCharType="begin"/>
+            </w:r>
+            <w:r>
+              <w:rPr>
+                <w:noProof/>
+                <w:webHidden/>
+              </w:rPr>
+              <w:instrText xml:space="preserve"> PAGEREF _Toc227236458 \h </w:instrText>
+            </w:r>
+            <w:r>
+              <w:rPr>
+                <w:noProof/>
+                <w:webHidden/>
+              </w:rPr>
+            </w:r>
+            <w:r>
+              <w:rPr>
+                <w:noProof/>
+                <w:webHidden/>
+              </w:rPr>
+              <w:fldChar w:fldCharType="separate"/>
+            </w:r>
+            <w:r>
+              <w:rPr>
+                <w:noProof/>
+                <w:webHidden/>
+              </w:rPr>
+              <w:t>5</w:t>
+            </w:r>
+            <w:r>
+              <w:rPr>
+                <w:noProof/>
+                <w:webHidden/>
+              </w:rPr>
+              <w:fldChar w:fldCharType="end"/>
+            </w:r>
+          </w:hyperlink>
+        </w:p>
+        <w:p>
+          <w:pPr>
+            <w:pStyle w:val="TOC3"/>
+            <w:tabs>
+              <w:tab w:val="right" w:leader="dot" w:pos="9016"/>
+            </w:tabs>
+            <w:rPr>
+              <w:rFonts w:cstheme="minorBidi"/>
+              <w:noProof/>
+              <w:kern w:val="2"/>
+              <w:sz w:val="24"/>
+              <w:szCs w:val="24"/>
+              <w:lang w:val="en-GB" w:eastAsia="en-GB"/>
+              <w14:ligatures w14:val="standardContextual"/>
+            </w:rPr>
+          </w:pPr>
+          <w:hyperlink w:anchor="_Toc227236459" w:history="1">
+            <w:r>
+              <w:rPr>
+                <w:rStyle w:val="Hyperlink"/>
+                <w:noProof/>
+              </w:rPr>
+              <w:t>1.3.5 Results, Evaluation and Playtesting Objectives</w:t>
+            </w:r>
+            <w:r>
+              <w:rPr>
+                <w:noProof/>
+                <w:webHidden/>
+              </w:rPr>
+              <w:tab/>
+            </w:r>
+            <w:r>
+              <w:rPr>
+                <w:noProof/>
+                <w:webHidden/>
+              </w:rPr>
+              <w:fldChar w:fldCharType="begin"/>
+            </w:r>
+            <w:r>
+              <w:rPr>
+                <w:noProof/>
+                <w:webHidden/>
+              </w:rPr>
+              <w:instrText xml:space="preserve"> PAGEREF _Toc227236459 \h </w:instrText>
+            </w:r>
+            <w:r>
+              <w:rPr>
+                <w:noProof/>
+                <w:webHidden/>
+              </w:rPr>
+            </w:r>
+            <w:r>
+              <w:rPr>
+                <w:noProof/>
+                <w:webHidden/>
+              </w:rPr>
+              <w:fldChar w:fldCharType="separate"/>
+            </w:r>
+            <w:r>
+              <w:rPr>
+                <w:noProof/>
+                <w:webHidden/>
+              </w:rPr>
+              <w:t>5</w:t>
             </w:r>
             <w:r>
               <w:rPr>
@@ -430,13 +1096,13 @@
               <w14:ligatures w14:val="standardContextual"/>
             </w:rPr>
           </w:pPr>
-          <w:hyperlink w:anchor="_Toc227233416" w:history="1">
+          <w:hyperlink w:anchor="_Toc227236460" w:history="1">
             <w:r>
               <w:rPr>
                 <w:rStyle w:val="Hyperlink"/>
                 <w:noProof/>
               </w:rPr>
-              <w:t>1.2 Aims</w:t>
+              <w:t>Chapter 2 – Literature Survey</w:t>
             </w:r>
             <w:r>
               <w:rPr>
@@ -457,7 +1123,7 @@
                 <w:noProof/>
                 <w:webHidden/>
               </w:rPr>
-              <w:instrText xml:space="preserve"> PAGEREF _Toc227233416 \h </w:instrText>
+              <w:instrText xml:space="preserve"> PAGEREF _Toc227236460 \h </w:instrText>
             </w:r>
             <w:r>
               <w:rPr>
@@ -477,7 +1143,7 @@
                 <w:noProof/>
                 <w:webHidden/>
               </w:rPr>
-              <w:t>3</w:t>
+              <w:t>6</w:t>
             </w:r>
             <w:r>
               <w:rPr>
@@ -504,13 +1170,13 @@
               <w14:ligatures w14:val="standardContextual"/>
             </w:rPr>
           </w:pPr>
-          <w:hyperlink w:anchor="_Toc227233417" w:history="1">
+          <w:hyperlink w:anchor="_Toc227236461" w:history="1">
             <w:r>
               <w:rPr>
                 <w:rStyle w:val="Hyperlink"/>
                 <w:noProof/>
               </w:rPr>
-              <w:t>1.2.1 Main Aim</w:t>
+              <w:t>2.1 Literature Survey Introduction</w:t>
             </w:r>
             <w:r>
               <w:rPr>
@@ -531,7 +1197,7 @@
                 <w:noProof/>
                 <w:webHidden/>
               </w:rPr>
-              <w:instrText xml:space="preserve"> PAGEREF _Toc227233417 \h </w:instrText>
+              <w:instrText xml:space="preserve"> PAGEREF _Toc227236461 \h </w:instrText>
             </w:r>
             <w:r>
               <w:rPr>
@@ -551,7 +1217,7 @@
                 <w:noProof/>
                 <w:webHidden/>
               </w:rPr>
-              <w:t>3</w:t>
+              <w:t>6</w:t>
             </w:r>
             <w:r>
               <w:rPr>
@@ -578,13 +1244,13 @@
               <w14:ligatures w14:val="standardContextual"/>
             </w:rPr>
           </w:pPr>
-          <w:hyperlink w:anchor="_Toc227233418" w:history="1">
+          <w:hyperlink w:anchor="_Toc227236462" w:history="1">
             <w:r>
               <w:rPr>
                 <w:rStyle w:val="Hyperlink"/>
                 <w:noProof/>
               </w:rPr>
-              <w:t>1.2.2 Additional Aims</w:t>
+              <w:t>2.2 Comparative Research</w:t>
             </w:r>
             <w:r>
               <w:rPr>
@@ -605,7 +1271,7 @@
                 <w:noProof/>
                 <w:webHidden/>
               </w:rPr>
-              <w:instrText xml:space="preserve"> PAGEREF _Toc227233418 \h </w:instrText>
+              <w:instrText xml:space="preserve"> PAGEREF _Toc227236462 \h </w:instrText>
             </w:r>
             <w:r>
               <w:rPr>
@@ -625,7 +1291,859 @@
                 <w:noProof/>
                 <w:webHidden/>
               </w:rPr>
-              <w:t>4</w:t>
+              <w:t>6</w:t>
+            </w:r>
+            <w:r>
+              <w:rPr>
+                <w:noProof/>
+                <w:webHidden/>
+              </w:rPr>
+              <w:fldChar w:fldCharType="end"/>
+            </w:r>
+          </w:hyperlink>
+        </w:p>
+        <w:p>
+          <w:pPr>
+            <w:pStyle w:val="TOC3"/>
+            <w:tabs>
+              <w:tab w:val="right" w:leader="dot" w:pos="9016"/>
+            </w:tabs>
+            <w:rPr>
+              <w:rFonts w:cstheme="minorBidi"/>
+              <w:noProof/>
+              <w:kern w:val="2"/>
+              <w:sz w:val="24"/>
+              <w:szCs w:val="24"/>
+              <w:lang w:val="en-GB" w:eastAsia="en-GB"/>
+              <w14:ligatures w14:val="standardContextual"/>
+            </w:rPr>
+          </w:pPr>
+          <w:hyperlink w:anchor="_Toc227236463" w:history="1">
+            <w:r>
+              <w:rPr>
+                <w:rStyle w:val="Hyperlink"/>
+                <w:noProof/>
+              </w:rPr>
+              <w:t>2.2.1 World Generation</w:t>
+            </w:r>
+            <w:r>
+              <w:rPr>
+                <w:noProof/>
+                <w:webHidden/>
+              </w:rPr>
+              <w:tab/>
+            </w:r>
+            <w:r>
+              <w:rPr>
+                <w:noProof/>
+                <w:webHidden/>
+              </w:rPr>
+              <w:fldChar w:fldCharType="begin"/>
+            </w:r>
+            <w:r>
+              <w:rPr>
+                <w:noProof/>
+                <w:webHidden/>
+              </w:rPr>
+              <w:instrText xml:space="preserve"> PAGEREF _Toc227236463 \h </w:instrText>
+            </w:r>
+            <w:r>
+              <w:rPr>
+                <w:noProof/>
+                <w:webHidden/>
+              </w:rPr>
+            </w:r>
+            <w:r>
+              <w:rPr>
+                <w:noProof/>
+                <w:webHidden/>
+              </w:rPr>
+              <w:fldChar w:fldCharType="separate"/>
+            </w:r>
+            <w:r>
+              <w:rPr>
+                <w:noProof/>
+                <w:webHidden/>
+              </w:rPr>
+              <w:t>6</w:t>
+            </w:r>
+            <w:r>
+              <w:rPr>
+                <w:noProof/>
+                <w:webHidden/>
+              </w:rPr>
+              <w:fldChar w:fldCharType="end"/>
+            </w:r>
+          </w:hyperlink>
+        </w:p>
+        <w:p>
+          <w:pPr>
+            <w:pStyle w:val="TOC4"/>
+            <w:tabs>
+              <w:tab w:val="right" w:leader="dot" w:pos="9016"/>
+            </w:tabs>
+            <w:rPr>
+              <w:rFonts w:eastAsiaTheme="minorEastAsia"/>
+              <w:noProof/>
+              <w:lang w:eastAsia="en-GB"/>
+            </w:rPr>
+          </w:pPr>
+          <w:hyperlink w:anchor="_Toc227236464" w:history="1">
+            <w:r>
+              <w:rPr>
+                <w:rStyle w:val="Hyperlink"/>
+                <w:noProof/>
+              </w:rPr>
+              <w:t>2.2.1.1 Perlin Noise</w:t>
+            </w:r>
+            <w:r>
+              <w:rPr>
+                <w:noProof/>
+                <w:webHidden/>
+              </w:rPr>
+              <w:tab/>
+            </w:r>
+            <w:r>
+              <w:rPr>
+                <w:noProof/>
+                <w:webHidden/>
+              </w:rPr>
+              <w:fldChar w:fldCharType="begin"/>
+            </w:r>
+            <w:r>
+              <w:rPr>
+                <w:noProof/>
+                <w:webHidden/>
+              </w:rPr>
+              <w:instrText xml:space="preserve"> PAGEREF _Toc227236464 \h </w:instrText>
+            </w:r>
+            <w:r>
+              <w:rPr>
+                <w:noProof/>
+                <w:webHidden/>
+              </w:rPr>
+            </w:r>
+            <w:r>
+              <w:rPr>
+                <w:noProof/>
+                <w:webHidden/>
+              </w:rPr>
+              <w:fldChar w:fldCharType="separate"/>
+            </w:r>
+            <w:r>
+              <w:rPr>
+                <w:noProof/>
+                <w:webHidden/>
+              </w:rPr>
+              <w:t>6</w:t>
+            </w:r>
+            <w:r>
+              <w:rPr>
+                <w:noProof/>
+                <w:webHidden/>
+              </w:rPr>
+              <w:fldChar w:fldCharType="end"/>
+            </w:r>
+          </w:hyperlink>
+        </w:p>
+        <w:p>
+          <w:pPr>
+            <w:pStyle w:val="TOC4"/>
+            <w:tabs>
+              <w:tab w:val="right" w:leader="dot" w:pos="9016"/>
+            </w:tabs>
+            <w:rPr>
+              <w:rFonts w:eastAsiaTheme="minorEastAsia"/>
+              <w:noProof/>
+              <w:lang w:eastAsia="en-GB"/>
+            </w:rPr>
+          </w:pPr>
+          <w:hyperlink w:anchor="_Toc227236465" w:history="1">
+            <w:r>
+              <w:rPr>
+                <w:rStyle w:val="Hyperlink"/>
+                <w:noProof/>
+              </w:rPr>
+              <w:t>2.2.1.2 Binary Space Partitioning</w:t>
+            </w:r>
+            <w:r>
+              <w:rPr>
+                <w:noProof/>
+                <w:webHidden/>
+              </w:rPr>
+              <w:tab/>
+            </w:r>
+            <w:r>
+              <w:rPr>
+                <w:noProof/>
+                <w:webHidden/>
+              </w:rPr>
+              <w:fldChar w:fldCharType="begin"/>
+            </w:r>
+            <w:r>
+              <w:rPr>
+                <w:noProof/>
+                <w:webHidden/>
+              </w:rPr>
+              <w:instrText xml:space="preserve"> PAGEREF _Toc227236465 \h </w:instrText>
+            </w:r>
+            <w:r>
+              <w:rPr>
+                <w:noProof/>
+                <w:webHidden/>
+              </w:rPr>
+            </w:r>
+            <w:r>
+              <w:rPr>
+                <w:noProof/>
+                <w:webHidden/>
+              </w:rPr>
+              <w:fldChar w:fldCharType="separate"/>
+            </w:r>
+            <w:r>
+              <w:rPr>
+                <w:noProof/>
+                <w:webHidden/>
+              </w:rPr>
+              <w:t>7</w:t>
+            </w:r>
+            <w:r>
+              <w:rPr>
+                <w:noProof/>
+                <w:webHidden/>
+              </w:rPr>
+              <w:fldChar w:fldCharType="end"/>
+            </w:r>
+          </w:hyperlink>
+        </w:p>
+        <w:p>
+          <w:pPr>
+            <w:pStyle w:val="TOC4"/>
+            <w:tabs>
+              <w:tab w:val="right" w:leader="dot" w:pos="9016"/>
+            </w:tabs>
+            <w:rPr>
+              <w:rFonts w:eastAsiaTheme="minorEastAsia"/>
+              <w:noProof/>
+              <w:lang w:eastAsia="en-GB"/>
+            </w:rPr>
+          </w:pPr>
+          <w:hyperlink w:anchor="_Toc227236466" w:history="1">
+            <w:r>
+              <w:rPr>
+                <w:rStyle w:val="Hyperlink"/>
+                <w:noProof/>
+              </w:rPr>
+              <w:t>2.2.1.3 Cellular Automata</w:t>
+            </w:r>
+            <w:r>
+              <w:rPr>
+                <w:noProof/>
+                <w:webHidden/>
+              </w:rPr>
+              <w:tab/>
+            </w:r>
+            <w:r>
+              <w:rPr>
+                <w:noProof/>
+                <w:webHidden/>
+              </w:rPr>
+              <w:fldChar w:fldCharType="begin"/>
+            </w:r>
+            <w:r>
+              <w:rPr>
+                <w:noProof/>
+                <w:webHidden/>
+              </w:rPr>
+              <w:instrText xml:space="preserve"> PAGEREF _Toc227236466 \h </w:instrText>
+            </w:r>
+            <w:r>
+              <w:rPr>
+                <w:noProof/>
+                <w:webHidden/>
+              </w:rPr>
+            </w:r>
+            <w:r>
+              <w:rPr>
+                <w:noProof/>
+                <w:webHidden/>
+              </w:rPr>
+              <w:fldChar w:fldCharType="separate"/>
+            </w:r>
+            <w:r>
+              <w:rPr>
+                <w:noProof/>
+                <w:webHidden/>
+              </w:rPr>
+              <w:t>7</w:t>
+            </w:r>
+            <w:r>
+              <w:rPr>
+                <w:noProof/>
+                <w:webHidden/>
+              </w:rPr>
+              <w:fldChar w:fldCharType="end"/>
+            </w:r>
+          </w:hyperlink>
+        </w:p>
+        <w:p>
+          <w:pPr>
+            <w:pStyle w:val="TOC3"/>
+            <w:tabs>
+              <w:tab w:val="right" w:leader="dot" w:pos="9016"/>
+            </w:tabs>
+            <w:rPr>
+              <w:rFonts w:cstheme="minorBidi"/>
+              <w:noProof/>
+              <w:kern w:val="2"/>
+              <w:sz w:val="24"/>
+              <w:szCs w:val="24"/>
+              <w:lang w:val="en-GB" w:eastAsia="en-GB"/>
+              <w14:ligatures w14:val="standardContextual"/>
+            </w:rPr>
+          </w:pPr>
+          <w:hyperlink w:anchor="_Toc227236467" w:history="1">
+            <w:r>
+              <w:rPr>
+                <w:rStyle w:val="Hyperlink"/>
+                <w:noProof/>
+              </w:rPr>
+              <w:t>2.2.2 Pathfinding</w:t>
+            </w:r>
+            <w:r>
+              <w:rPr>
+                <w:noProof/>
+                <w:webHidden/>
+              </w:rPr>
+              <w:tab/>
+            </w:r>
+            <w:r>
+              <w:rPr>
+                <w:noProof/>
+                <w:webHidden/>
+              </w:rPr>
+              <w:fldChar w:fldCharType="begin"/>
+            </w:r>
+            <w:r>
+              <w:rPr>
+                <w:noProof/>
+                <w:webHidden/>
+              </w:rPr>
+              <w:instrText xml:space="preserve"> PAGEREF _Toc227236467 \h </w:instrText>
+            </w:r>
+            <w:r>
+              <w:rPr>
+                <w:noProof/>
+                <w:webHidden/>
+              </w:rPr>
+            </w:r>
+            <w:r>
+              <w:rPr>
+                <w:noProof/>
+                <w:webHidden/>
+              </w:rPr>
+              <w:fldChar w:fldCharType="separate"/>
+            </w:r>
+            <w:r>
+              <w:rPr>
+                <w:noProof/>
+                <w:webHidden/>
+              </w:rPr>
+              <w:t>7</w:t>
+            </w:r>
+            <w:r>
+              <w:rPr>
+                <w:noProof/>
+                <w:webHidden/>
+              </w:rPr>
+              <w:fldChar w:fldCharType="end"/>
+            </w:r>
+          </w:hyperlink>
+        </w:p>
+        <w:p>
+          <w:pPr>
+            <w:pStyle w:val="TOC4"/>
+            <w:tabs>
+              <w:tab w:val="right" w:leader="dot" w:pos="9016"/>
+            </w:tabs>
+            <w:rPr>
+              <w:rFonts w:eastAsiaTheme="minorEastAsia"/>
+              <w:noProof/>
+              <w:lang w:eastAsia="en-GB"/>
+            </w:rPr>
+          </w:pPr>
+          <w:hyperlink w:anchor="_Toc227236468" w:history="1">
+            <w:r>
+              <w:rPr>
+                <w:rStyle w:val="Hyperlink"/>
+                <w:noProof/>
+              </w:rPr>
+              <w:t>2.2.2.1 Dijkstra</w:t>
+            </w:r>
+            <w:r>
+              <w:rPr>
+                <w:noProof/>
+                <w:webHidden/>
+              </w:rPr>
+              <w:tab/>
+            </w:r>
+            <w:r>
+              <w:rPr>
+                <w:noProof/>
+                <w:webHidden/>
+              </w:rPr>
+              <w:fldChar w:fldCharType="begin"/>
+            </w:r>
+            <w:r>
+              <w:rPr>
+                <w:noProof/>
+                <w:webHidden/>
+              </w:rPr>
+              <w:instrText xml:space="preserve"> PAGEREF _Toc227236468 \h </w:instrText>
+            </w:r>
+            <w:r>
+              <w:rPr>
+                <w:noProof/>
+                <w:webHidden/>
+              </w:rPr>
+            </w:r>
+            <w:r>
+              <w:rPr>
+                <w:noProof/>
+                <w:webHidden/>
+              </w:rPr>
+              <w:fldChar w:fldCharType="separate"/>
+            </w:r>
+            <w:r>
+              <w:rPr>
+                <w:noProof/>
+                <w:webHidden/>
+              </w:rPr>
+              <w:t>8</w:t>
+            </w:r>
+            <w:r>
+              <w:rPr>
+                <w:noProof/>
+                <w:webHidden/>
+              </w:rPr>
+              <w:fldChar w:fldCharType="end"/>
+            </w:r>
+          </w:hyperlink>
+        </w:p>
+        <w:p>
+          <w:pPr>
+            <w:pStyle w:val="TOC4"/>
+            <w:tabs>
+              <w:tab w:val="right" w:leader="dot" w:pos="9016"/>
+            </w:tabs>
+            <w:rPr>
+              <w:rFonts w:eastAsiaTheme="minorEastAsia"/>
+              <w:noProof/>
+              <w:lang w:eastAsia="en-GB"/>
+            </w:rPr>
+          </w:pPr>
+          <w:hyperlink w:anchor="_Toc227236469" w:history="1">
+            <w:r>
+              <w:rPr>
+                <w:rStyle w:val="Hyperlink"/>
+                <w:noProof/>
+              </w:rPr>
+              <w:t>2.2.2.2 A*</w:t>
+            </w:r>
+            <w:r>
+              <w:rPr>
+                <w:noProof/>
+                <w:webHidden/>
+              </w:rPr>
+              <w:tab/>
+            </w:r>
+            <w:r>
+              <w:rPr>
+                <w:noProof/>
+                <w:webHidden/>
+              </w:rPr>
+              <w:fldChar w:fldCharType="begin"/>
+            </w:r>
+            <w:r>
+              <w:rPr>
+                <w:noProof/>
+                <w:webHidden/>
+              </w:rPr>
+              <w:instrText xml:space="preserve"> PAGEREF _Toc227236469 \h </w:instrText>
+            </w:r>
+            <w:r>
+              <w:rPr>
+                <w:noProof/>
+                <w:webHidden/>
+              </w:rPr>
+            </w:r>
+            <w:r>
+              <w:rPr>
+                <w:noProof/>
+                <w:webHidden/>
+              </w:rPr>
+              <w:fldChar w:fldCharType="separate"/>
+            </w:r>
+            <w:r>
+              <w:rPr>
+                <w:noProof/>
+                <w:webHidden/>
+              </w:rPr>
+              <w:t>8</w:t>
+            </w:r>
+            <w:r>
+              <w:rPr>
+                <w:noProof/>
+                <w:webHidden/>
+              </w:rPr>
+              <w:fldChar w:fldCharType="end"/>
+            </w:r>
+          </w:hyperlink>
+        </w:p>
+        <w:p>
+          <w:pPr>
+            <w:pStyle w:val="TOC4"/>
+            <w:tabs>
+              <w:tab w:val="right" w:leader="dot" w:pos="9016"/>
+            </w:tabs>
+            <w:rPr>
+              <w:rFonts w:eastAsiaTheme="minorEastAsia"/>
+              <w:noProof/>
+              <w:lang w:eastAsia="en-GB"/>
+            </w:rPr>
+          </w:pPr>
+          <w:hyperlink w:anchor="_Toc227236470" w:history="1">
+            <w:r>
+              <w:rPr>
+                <w:rStyle w:val="Hyperlink"/>
+                <w:noProof/>
+              </w:rPr>
+              <w:t>2.2.2.3 Jump Point Search</w:t>
+            </w:r>
+            <w:r>
+              <w:rPr>
+                <w:noProof/>
+                <w:webHidden/>
+              </w:rPr>
+              <w:tab/>
+            </w:r>
+            <w:r>
+              <w:rPr>
+                <w:noProof/>
+                <w:webHidden/>
+              </w:rPr>
+              <w:fldChar w:fldCharType="begin"/>
+            </w:r>
+            <w:r>
+              <w:rPr>
+                <w:noProof/>
+                <w:webHidden/>
+              </w:rPr>
+              <w:instrText xml:space="preserve"> PAGEREF _Toc227236470 \h </w:instrText>
+            </w:r>
+            <w:r>
+              <w:rPr>
+                <w:noProof/>
+                <w:webHidden/>
+              </w:rPr>
+            </w:r>
+            <w:r>
+              <w:rPr>
+                <w:noProof/>
+                <w:webHidden/>
+              </w:rPr>
+              <w:fldChar w:fldCharType="separate"/>
+            </w:r>
+            <w:r>
+              <w:rPr>
+                <w:noProof/>
+                <w:webHidden/>
+              </w:rPr>
+              <w:t>8</w:t>
+            </w:r>
+            <w:r>
+              <w:rPr>
+                <w:noProof/>
+                <w:webHidden/>
+              </w:rPr>
+              <w:fldChar w:fldCharType="end"/>
+            </w:r>
+          </w:hyperlink>
+        </w:p>
+        <w:p>
+          <w:pPr>
+            <w:pStyle w:val="TOC3"/>
+            <w:tabs>
+              <w:tab w:val="right" w:leader="dot" w:pos="9016"/>
+            </w:tabs>
+            <w:rPr>
+              <w:rFonts w:cstheme="minorBidi"/>
+              <w:noProof/>
+              <w:kern w:val="2"/>
+              <w:sz w:val="24"/>
+              <w:szCs w:val="24"/>
+              <w:lang w:val="en-GB" w:eastAsia="en-GB"/>
+              <w14:ligatures w14:val="standardContextual"/>
+            </w:rPr>
+          </w:pPr>
+          <w:hyperlink w:anchor="_Toc227236471" w:history="1">
+            <w:r>
+              <w:rPr>
+                <w:rStyle w:val="Hyperlink"/>
+                <w:noProof/>
+              </w:rPr>
+              <w:t>2.2.3 AI Integrations</w:t>
+            </w:r>
+            <w:r>
+              <w:rPr>
+                <w:noProof/>
+                <w:webHidden/>
+              </w:rPr>
+              <w:tab/>
+            </w:r>
+            <w:r>
+              <w:rPr>
+                <w:noProof/>
+                <w:webHidden/>
+              </w:rPr>
+              <w:fldChar w:fldCharType="begin"/>
+            </w:r>
+            <w:r>
+              <w:rPr>
+                <w:noProof/>
+                <w:webHidden/>
+              </w:rPr>
+              <w:instrText xml:space="preserve"> PAGEREF _Toc227236471 \h </w:instrText>
+            </w:r>
+            <w:r>
+              <w:rPr>
+                <w:noProof/>
+                <w:webHidden/>
+              </w:rPr>
+            </w:r>
+            <w:r>
+              <w:rPr>
+                <w:noProof/>
+                <w:webHidden/>
+              </w:rPr>
+              <w:fldChar w:fldCharType="separate"/>
+            </w:r>
+            <w:r>
+              <w:rPr>
+                <w:noProof/>
+                <w:webHidden/>
+              </w:rPr>
+              <w:t>8</w:t>
+            </w:r>
+            <w:r>
+              <w:rPr>
+                <w:noProof/>
+                <w:webHidden/>
+              </w:rPr>
+              <w:fldChar w:fldCharType="end"/>
+            </w:r>
+          </w:hyperlink>
+        </w:p>
+        <w:p>
+          <w:pPr>
+            <w:pStyle w:val="TOC4"/>
+            <w:tabs>
+              <w:tab w:val="right" w:leader="dot" w:pos="9016"/>
+            </w:tabs>
+            <w:rPr>
+              <w:rFonts w:eastAsiaTheme="minorEastAsia"/>
+              <w:noProof/>
+              <w:lang w:eastAsia="en-GB"/>
+            </w:rPr>
+          </w:pPr>
+          <w:hyperlink w:anchor="_Toc227236472" w:history="1">
+            <w:r>
+              <w:rPr>
+                <w:rStyle w:val="Hyperlink"/>
+                <w:noProof/>
+              </w:rPr>
+              <w:t>2.2.3.1 Neural Network</w:t>
+            </w:r>
+            <w:r>
+              <w:rPr>
+                <w:noProof/>
+                <w:webHidden/>
+              </w:rPr>
+              <w:tab/>
+            </w:r>
+            <w:r>
+              <w:rPr>
+                <w:noProof/>
+                <w:webHidden/>
+              </w:rPr>
+              <w:fldChar w:fldCharType="begin"/>
+            </w:r>
+            <w:r>
+              <w:rPr>
+                <w:noProof/>
+                <w:webHidden/>
+              </w:rPr>
+              <w:instrText xml:space="preserve"> PAGEREF _Toc227236472 \h </w:instrText>
+            </w:r>
+            <w:r>
+              <w:rPr>
+                <w:noProof/>
+                <w:webHidden/>
+              </w:rPr>
+            </w:r>
+            <w:r>
+              <w:rPr>
+                <w:noProof/>
+                <w:webHidden/>
+              </w:rPr>
+              <w:fldChar w:fldCharType="separate"/>
+            </w:r>
+            <w:r>
+              <w:rPr>
+                <w:noProof/>
+                <w:webHidden/>
+              </w:rPr>
+              <w:t>8</w:t>
+            </w:r>
+            <w:r>
+              <w:rPr>
+                <w:noProof/>
+                <w:webHidden/>
+              </w:rPr>
+              <w:fldChar w:fldCharType="end"/>
+            </w:r>
+          </w:hyperlink>
+        </w:p>
+        <w:p>
+          <w:pPr>
+            <w:pStyle w:val="TOC4"/>
+            <w:tabs>
+              <w:tab w:val="right" w:leader="dot" w:pos="9016"/>
+            </w:tabs>
+            <w:rPr>
+              <w:rFonts w:eastAsiaTheme="minorEastAsia"/>
+              <w:noProof/>
+              <w:lang w:eastAsia="en-GB"/>
+            </w:rPr>
+          </w:pPr>
+          <w:hyperlink w:anchor="_Toc227236473" w:history="1">
+            <w:r>
+              <w:rPr>
+                <w:rStyle w:val="Hyperlink"/>
+                <w:noProof/>
+              </w:rPr>
+              <w:t>2.2.3.2 Reinforcement Learning</w:t>
+            </w:r>
+            <w:r>
+              <w:rPr>
+                <w:noProof/>
+                <w:webHidden/>
+              </w:rPr>
+              <w:tab/>
+            </w:r>
+            <w:r>
+              <w:rPr>
+                <w:noProof/>
+                <w:webHidden/>
+              </w:rPr>
+              <w:fldChar w:fldCharType="begin"/>
+            </w:r>
+            <w:r>
+              <w:rPr>
+                <w:noProof/>
+                <w:webHidden/>
+              </w:rPr>
+              <w:instrText xml:space="preserve"> PAGEREF _Toc227236473 \h </w:instrText>
+            </w:r>
+            <w:r>
+              <w:rPr>
+                <w:noProof/>
+                <w:webHidden/>
+              </w:rPr>
+            </w:r>
+            <w:r>
+              <w:rPr>
+                <w:noProof/>
+                <w:webHidden/>
+              </w:rPr>
+              <w:fldChar w:fldCharType="separate"/>
+            </w:r>
+            <w:r>
+              <w:rPr>
+                <w:noProof/>
+                <w:webHidden/>
+              </w:rPr>
+              <w:t>9</w:t>
+            </w:r>
+            <w:r>
+              <w:rPr>
+                <w:noProof/>
+                <w:webHidden/>
+              </w:rPr>
+              <w:fldChar w:fldCharType="end"/>
+            </w:r>
+          </w:hyperlink>
+        </w:p>
+        <w:p>
+          <w:pPr>
+            <w:pStyle w:val="TOC4"/>
+            <w:tabs>
+              <w:tab w:val="right" w:leader="dot" w:pos="9016"/>
+            </w:tabs>
+            <w:rPr>
+              <w:rFonts w:eastAsiaTheme="minorEastAsia"/>
+              <w:noProof/>
+              <w:lang w:eastAsia="en-GB"/>
+            </w:rPr>
+          </w:pPr>
+          <w:hyperlink w:anchor="_Toc227236474" w:history="1">
+            <w:r>
+              <w:rPr>
+                <w:rStyle w:val="Hyperlink"/>
+                <w:noProof/>
+              </w:rPr>
+              <w:t>2.2.3.3 Imitation Learning</w:t>
+            </w:r>
+            <w:r>
+              <w:rPr>
+                <w:noProof/>
+                <w:webHidden/>
+              </w:rPr>
+              <w:tab/>
+            </w:r>
+            <w:r>
+              <w:rPr>
+                <w:noProof/>
+                <w:webHidden/>
+              </w:rPr>
+              <w:fldChar w:fldCharType="begin"/>
+            </w:r>
+            <w:r>
+              <w:rPr>
+                <w:noProof/>
+                <w:webHidden/>
+              </w:rPr>
+              <w:instrText xml:space="preserve"> PAGEREF _Toc227236474 \h </w:instrText>
+            </w:r>
+            <w:r>
+              <w:rPr>
+                <w:noProof/>
+                <w:webHidden/>
+              </w:rPr>
+            </w:r>
+            <w:r>
+              <w:rPr>
+                <w:noProof/>
+                <w:webHidden/>
+              </w:rPr>
+              <w:fldChar w:fldCharType="separate"/>
+            </w:r>
+            <w:r>
+              <w:rPr>
+                <w:noProof/>
+                <w:webHidden/>
+              </w:rPr>
+              <w:t>9</w:t>
             </w:r>
             <w:r>
               <w:rPr>
@@ -652,13 +2170,13 @@
               <w14:ligatures w14:val="standardContextual"/>
             </w:rPr>
           </w:pPr>
-          <w:hyperlink w:anchor="_Toc227233419" w:history="1">
+          <w:hyperlink w:anchor="_Toc227236475" w:history="1">
             <w:r>
               <w:rPr>
                 <w:rStyle w:val="Hyperlink"/>
                 <w:noProof/>
               </w:rPr>
-              <w:t>1.3 Objectives</w:t>
+              <w:t>References</w:t>
             </w:r>
             <w:r>
               <w:rPr>
@@ -679,7 +2197,7 @@
                 <w:noProof/>
                 <w:webHidden/>
               </w:rPr>
-              <w:instrText xml:space="preserve"> PAGEREF _Toc227233419 \h </w:instrText>
+              <w:instrText xml:space="preserve"> PAGEREF _Toc227236475 \h </w:instrText>
             </w:r>
             <w:r>
               <w:rPr>
@@ -699,7 +2217,7 @@
                 <w:noProof/>
                 <w:webHidden/>
               </w:rPr>
-              <w:t>4</w:t>
+              <w:t>9</w:t>
             </w:r>
             <w:r>
               <w:rPr>
@@ -712,1523 +2230,12 @@
         </w:p>
         <w:p>
           <w:pPr>
-            <w:pStyle w:val="TOC2"/>
-            <w:tabs>
-              <w:tab w:val="right" w:leader="dot" w:pos="9016"/>
-            </w:tabs>
             <w:rPr>
-              <w:rFonts w:cstheme="minorBidi"/>
+              <w:b/>
+              <w:bCs/>
               <w:noProof/>
-              <w:kern w:val="2"/>
-              <w:sz w:val="24"/>
-              <w:szCs w:val="24"/>
-              <w:lang w:val="en-GB" w:eastAsia="en-GB"/>
-              <w14:ligatures w14:val="standardContextual"/>
             </w:rPr>
           </w:pPr>
-          <w:hyperlink w:anchor="_Toc227233420" w:history="1">
-            <w:r>
-              <w:rPr>
-                <w:rStyle w:val="Hyperlink"/>
-                <w:noProof/>
-              </w:rPr>
-              <w:t>1.3.1 Scope</w:t>
-            </w:r>
-            <w:r>
-              <w:rPr>
-                <w:noProof/>
-                <w:webHidden/>
-              </w:rPr>
-              <w:tab/>
-            </w:r>
-            <w:r>
-              <w:rPr>
-                <w:noProof/>
-                <w:webHidden/>
-              </w:rPr>
-              <w:fldChar w:fldCharType="begin"/>
-            </w:r>
-            <w:r>
-              <w:rPr>
-                <w:noProof/>
-                <w:webHidden/>
-              </w:rPr>
-              <w:instrText xml:space="preserve"> PAGEREF _Toc227233420 \h </w:instrText>
-            </w:r>
-            <w:r>
-              <w:rPr>
-                <w:noProof/>
-                <w:webHidden/>
-              </w:rPr>
-            </w:r>
-            <w:r>
-              <w:rPr>
-                <w:noProof/>
-                <w:webHidden/>
-              </w:rPr>
-              <w:fldChar w:fldCharType="separate"/>
-            </w:r>
-            <w:r>
-              <w:rPr>
-                <w:noProof/>
-                <w:webHidden/>
-              </w:rPr>
-              <w:t>4</w:t>
-            </w:r>
-            <w:r>
-              <w:rPr>
-                <w:noProof/>
-                <w:webHidden/>
-              </w:rPr>
-              <w:fldChar w:fldCharType="end"/>
-            </w:r>
-          </w:hyperlink>
-        </w:p>
-        <w:p>
-          <w:pPr>
-            <w:pStyle w:val="TOC2"/>
-            <w:tabs>
-              <w:tab w:val="right" w:leader="dot" w:pos="9016"/>
-            </w:tabs>
-            <w:rPr>
-              <w:rFonts w:cstheme="minorBidi"/>
-              <w:noProof/>
-              <w:kern w:val="2"/>
-              <w:sz w:val="24"/>
-              <w:szCs w:val="24"/>
-              <w:lang w:val="en-GB" w:eastAsia="en-GB"/>
-              <w14:ligatures w14:val="standardContextual"/>
-            </w:rPr>
-          </w:pPr>
-          <w:hyperlink w:anchor="_Toc227233421" w:history="1">
-            <w:r>
-              <w:rPr>
-                <w:rStyle w:val="Hyperlink"/>
-                <w:noProof/>
-              </w:rPr>
-              <w:t>1.3.2 Research Objectives</w:t>
-            </w:r>
-            <w:r>
-              <w:rPr>
-                <w:noProof/>
-                <w:webHidden/>
-              </w:rPr>
-              <w:tab/>
-            </w:r>
-            <w:r>
-              <w:rPr>
-                <w:noProof/>
-                <w:webHidden/>
-              </w:rPr>
-              <w:fldChar w:fldCharType="begin"/>
-            </w:r>
-            <w:r>
-              <w:rPr>
-                <w:noProof/>
-                <w:webHidden/>
-              </w:rPr>
-              <w:instrText xml:space="preserve"> PAGEREF _Toc227233421 \h </w:instrText>
-            </w:r>
-            <w:r>
-              <w:rPr>
-                <w:noProof/>
-                <w:webHidden/>
-              </w:rPr>
-            </w:r>
-            <w:r>
-              <w:rPr>
-                <w:noProof/>
-                <w:webHidden/>
-              </w:rPr>
-              <w:fldChar w:fldCharType="separate"/>
-            </w:r>
-            <w:r>
-              <w:rPr>
-                <w:noProof/>
-                <w:webHidden/>
-              </w:rPr>
-              <w:t>4</w:t>
-            </w:r>
-            <w:r>
-              <w:rPr>
-                <w:noProof/>
-                <w:webHidden/>
-              </w:rPr>
-              <w:fldChar w:fldCharType="end"/>
-            </w:r>
-          </w:hyperlink>
-        </w:p>
-        <w:p>
-          <w:pPr>
-            <w:pStyle w:val="TOC2"/>
-            <w:tabs>
-              <w:tab w:val="right" w:leader="dot" w:pos="9016"/>
-            </w:tabs>
-            <w:rPr>
-              <w:rFonts w:cstheme="minorBidi"/>
-              <w:noProof/>
-              <w:kern w:val="2"/>
-              <w:sz w:val="24"/>
-              <w:szCs w:val="24"/>
-              <w:lang w:val="en-GB" w:eastAsia="en-GB"/>
-              <w14:ligatures w14:val="standardContextual"/>
-            </w:rPr>
-          </w:pPr>
-          <w:hyperlink w:anchor="_Toc227233422" w:history="1">
-            <w:r>
-              <w:rPr>
-                <w:rStyle w:val="Hyperlink"/>
-                <w:noProof/>
-              </w:rPr>
-              <w:t>1.3.3 Design Objectives</w:t>
-            </w:r>
-            <w:r>
-              <w:rPr>
-                <w:noProof/>
-                <w:webHidden/>
-              </w:rPr>
-              <w:tab/>
-            </w:r>
-            <w:r>
-              <w:rPr>
-                <w:noProof/>
-                <w:webHidden/>
-              </w:rPr>
-              <w:fldChar w:fldCharType="begin"/>
-            </w:r>
-            <w:r>
-              <w:rPr>
-                <w:noProof/>
-                <w:webHidden/>
-              </w:rPr>
-              <w:instrText xml:space="preserve"> PAGEREF _Toc227233422 \h </w:instrText>
-            </w:r>
-            <w:r>
-              <w:rPr>
-                <w:noProof/>
-                <w:webHidden/>
-              </w:rPr>
-            </w:r>
-            <w:r>
-              <w:rPr>
-                <w:noProof/>
-                <w:webHidden/>
-              </w:rPr>
-              <w:fldChar w:fldCharType="separate"/>
-            </w:r>
-            <w:r>
-              <w:rPr>
-                <w:noProof/>
-                <w:webHidden/>
-              </w:rPr>
-              <w:t>5</w:t>
-            </w:r>
-            <w:r>
-              <w:rPr>
-                <w:noProof/>
-                <w:webHidden/>
-              </w:rPr>
-              <w:fldChar w:fldCharType="end"/>
-            </w:r>
-          </w:hyperlink>
-        </w:p>
-        <w:p>
-          <w:pPr>
-            <w:pStyle w:val="TOC2"/>
-            <w:tabs>
-              <w:tab w:val="right" w:leader="dot" w:pos="9016"/>
-            </w:tabs>
-            <w:rPr>
-              <w:rFonts w:cstheme="minorBidi"/>
-              <w:noProof/>
-              <w:kern w:val="2"/>
-              <w:sz w:val="24"/>
-              <w:szCs w:val="24"/>
-              <w:lang w:val="en-GB" w:eastAsia="en-GB"/>
-              <w14:ligatures w14:val="standardContextual"/>
-            </w:rPr>
-          </w:pPr>
-          <w:hyperlink w:anchor="_Toc227233423" w:history="1">
-            <w:r>
-              <w:rPr>
-                <w:rStyle w:val="Hyperlink"/>
-                <w:noProof/>
-              </w:rPr>
-              <w:t>1.3.4 Implementation Objectives</w:t>
-            </w:r>
-            <w:r>
-              <w:rPr>
-                <w:noProof/>
-                <w:webHidden/>
-              </w:rPr>
-              <w:tab/>
-            </w:r>
-            <w:r>
-              <w:rPr>
-                <w:noProof/>
-                <w:webHidden/>
-              </w:rPr>
-              <w:fldChar w:fldCharType="begin"/>
-            </w:r>
-            <w:r>
-              <w:rPr>
-                <w:noProof/>
-                <w:webHidden/>
-              </w:rPr>
-              <w:instrText xml:space="preserve"> PAGEREF _Toc227233423 \h </w:instrText>
-            </w:r>
-            <w:r>
-              <w:rPr>
-                <w:noProof/>
-                <w:webHidden/>
-              </w:rPr>
-            </w:r>
-            <w:r>
-              <w:rPr>
-                <w:noProof/>
-                <w:webHidden/>
-              </w:rPr>
-              <w:fldChar w:fldCharType="separate"/>
-            </w:r>
-            <w:r>
-              <w:rPr>
-                <w:noProof/>
-                <w:webHidden/>
-              </w:rPr>
-              <w:t>5</w:t>
-            </w:r>
-            <w:r>
-              <w:rPr>
-                <w:noProof/>
-                <w:webHidden/>
-              </w:rPr>
-              <w:fldChar w:fldCharType="end"/>
-            </w:r>
-          </w:hyperlink>
-        </w:p>
-        <w:p>
-          <w:pPr>
-            <w:pStyle w:val="TOC2"/>
-            <w:tabs>
-              <w:tab w:val="right" w:leader="dot" w:pos="9016"/>
-            </w:tabs>
-            <w:rPr>
-              <w:rFonts w:cstheme="minorBidi"/>
-              <w:noProof/>
-              <w:kern w:val="2"/>
-              <w:sz w:val="24"/>
-              <w:szCs w:val="24"/>
-              <w:lang w:val="en-GB" w:eastAsia="en-GB"/>
-              <w14:ligatures w14:val="standardContextual"/>
-            </w:rPr>
-          </w:pPr>
-          <w:hyperlink w:anchor="_Toc227233424" w:history="1">
-            <w:r>
-              <w:rPr>
-                <w:rStyle w:val="Hyperlink"/>
-                <w:noProof/>
-              </w:rPr>
-              <w:t>1.3.5 Results, Evaluation and Playtesting Objectives</w:t>
-            </w:r>
-            <w:r>
-              <w:rPr>
-                <w:noProof/>
-                <w:webHidden/>
-              </w:rPr>
-              <w:tab/>
-            </w:r>
-            <w:r>
-              <w:rPr>
-                <w:noProof/>
-                <w:webHidden/>
-              </w:rPr>
-              <w:fldChar w:fldCharType="begin"/>
-            </w:r>
-            <w:r>
-              <w:rPr>
-                <w:noProof/>
-                <w:webHidden/>
-              </w:rPr>
-              <w:instrText xml:space="preserve"> PAGEREF _Toc227233424 \h </w:instrText>
-            </w:r>
-            <w:r>
-              <w:rPr>
-                <w:noProof/>
-                <w:webHidden/>
-              </w:rPr>
-            </w:r>
-            <w:r>
-              <w:rPr>
-                <w:noProof/>
-                <w:webHidden/>
-              </w:rPr>
-              <w:fldChar w:fldCharType="separate"/>
-            </w:r>
-            <w:r>
-              <w:rPr>
-                <w:noProof/>
-                <w:webHidden/>
-              </w:rPr>
-              <w:t>6</w:t>
-            </w:r>
-            <w:r>
-              <w:rPr>
-                <w:noProof/>
-                <w:webHidden/>
-              </w:rPr>
-              <w:fldChar w:fldCharType="end"/>
-            </w:r>
-          </w:hyperlink>
-        </w:p>
-        <w:p>
-          <w:pPr>
-            <w:pStyle w:val="TOC1"/>
-            <w:tabs>
-              <w:tab w:val="right" w:leader="dot" w:pos="9016"/>
-            </w:tabs>
-            <w:rPr>
-              <w:rFonts w:cstheme="minorBidi"/>
-              <w:noProof/>
-              <w:kern w:val="2"/>
-              <w:sz w:val="24"/>
-              <w:szCs w:val="24"/>
-              <w:lang w:val="en-GB" w:eastAsia="en-GB"/>
-              <w14:ligatures w14:val="standardContextual"/>
-            </w:rPr>
-          </w:pPr>
-          <w:hyperlink w:anchor="_Toc227233425" w:history="1">
-            <w:r>
-              <w:rPr>
-                <w:rStyle w:val="Hyperlink"/>
-                <w:noProof/>
-              </w:rPr>
-              <w:t>Chapter 2 – Literature Survey</w:t>
-            </w:r>
-            <w:r>
-              <w:rPr>
-                <w:noProof/>
-                <w:webHidden/>
-              </w:rPr>
-              <w:tab/>
-            </w:r>
-            <w:r>
-              <w:rPr>
-                <w:noProof/>
-                <w:webHidden/>
-              </w:rPr>
-              <w:fldChar w:fldCharType="begin"/>
-            </w:r>
-            <w:r>
-              <w:rPr>
-                <w:noProof/>
-                <w:webHidden/>
-              </w:rPr>
-              <w:instrText xml:space="preserve"> PAGEREF _Toc227233425 \h </w:instrText>
-            </w:r>
-            <w:r>
-              <w:rPr>
-                <w:noProof/>
-                <w:webHidden/>
-              </w:rPr>
-            </w:r>
-            <w:r>
-              <w:rPr>
-                <w:noProof/>
-                <w:webHidden/>
-              </w:rPr>
-              <w:fldChar w:fldCharType="separate"/>
-            </w:r>
-            <w:r>
-              <w:rPr>
-                <w:noProof/>
-                <w:webHidden/>
-              </w:rPr>
-              <w:t>6</w:t>
-            </w:r>
-            <w:r>
-              <w:rPr>
-                <w:noProof/>
-                <w:webHidden/>
-              </w:rPr>
-              <w:fldChar w:fldCharType="end"/>
-            </w:r>
-          </w:hyperlink>
-        </w:p>
-        <w:p>
-          <w:pPr>
-            <w:pStyle w:val="TOC2"/>
-            <w:tabs>
-              <w:tab w:val="right" w:leader="dot" w:pos="9016"/>
-            </w:tabs>
-            <w:rPr>
-              <w:rFonts w:cstheme="minorBidi"/>
-              <w:noProof/>
-              <w:kern w:val="2"/>
-              <w:sz w:val="24"/>
-              <w:szCs w:val="24"/>
-              <w:lang w:val="en-GB" w:eastAsia="en-GB"/>
-              <w14:ligatures w14:val="standardContextual"/>
-            </w:rPr>
-          </w:pPr>
-          <w:hyperlink w:anchor="_Toc227233426" w:history="1">
-            <w:r>
-              <w:rPr>
-                <w:rStyle w:val="Hyperlink"/>
-                <w:noProof/>
-              </w:rPr>
-              <w:t>2.1 Literature Survey Introduction</w:t>
-            </w:r>
-            <w:r>
-              <w:rPr>
-                <w:noProof/>
-                <w:webHidden/>
-              </w:rPr>
-              <w:tab/>
-            </w:r>
-            <w:r>
-              <w:rPr>
-                <w:noProof/>
-                <w:webHidden/>
-              </w:rPr>
-              <w:fldChar w:fldCharType="begin"/>
-            </w:r>
-            <w:r>
-              <w:rPr>
-                <w:noProof/>
-                <w:webHidden/>
-              </w:rPr>
-              <w:instrText xml:space="preserve"> PAGEREF _Toc227233426 \h </w:instrText>
-            </w:r>
-            <w:r>
-              <w:rPr>
-                <w:noProof/>
-                <w:webHidden/>
-              </w:rPr>
-            </w:r>
-            <w:r>
-              <w:rPr>
-                <w:noProof/>
-                <w:webHidden/>
-              </w:rPr>
-              <w:fldChar w:fldCharType="separate"/>
-            </w:r>
-            <w:r>
-              <w:rPr>
-                <w:noProof/>
-                <w:webHidden/>
-              </w:rPr>
-              <w:t>6</w:t>
-            </w:r>
-            <w:r>
-              <w:rPr>
-                <w:noProof/>
-                <w:webHidden/>
-              </w:rPr>
-              <w:fldChar w:fldCharType="end"/>
-            </w:r>
-          </w:hyperlink>
-        </w:p>
-        <w:p>
-          <w:pPr>
-            <w:pStyle w:val="TOC2"/>
-            <w:tabs>
-              <w:tab w:val="right" w:leader="dot" w:pos="9016"/>
-            </w:tabs>
-            <w:rPr>
-              <w:rFonts w:cstheme="minorBidi"/>
-              <w:noProof/>
-              <w:kern w:val="2"/>
-              <w:sz w:val="24"/>
-              <w:szCs w:val="24"/>
-              <w:lang w:val="en-GB" w:eastAsia="en-GB"/>
-              <w14:ligatures w14:val="standardContextual"/>
-            </w:rPr>
-          </w:pPr>
-          <w:hyperlink w:anchor="_Toc227233427" w:history="1">
-            <w:r>
-              <w:rPr>
-                <w:rStyle w:val="Hyperlink"/>
-                <w:noProof/>
-              </w:rPr>
-              <w:t>2.2 Comparative Research</w:t>
-            </w:r>
-            <w:r>
-              <w:rPr>
-                <w:noProof/>
-                <w:webHidden/>
-              </w:rPr>
-              <w:tab/>
-            </w:r>
-            <w:r>
-              <w:rPr>
-                <w:noProof/>
-                <w:webHidden/>
-              </w:rPr>
-              <w:fldChar w:fldCharType="begin"/>
-            </w:r>
-            <w:r>
-              <w:rPr>
-                <w:noProof/>
-                <w:webHidden/>
-              </w:rPr>
-              <w:instrText xml:space="preserve"> PAGEREF _Toc227233427 \h </w:instrText>
-            </w:r>
-            <w:r>
-              <w:rPr>
-                <w:noProof/>
-                <w:webHidden/>
-              </w:rPr>
-            </w:r>
-            <w:r>
-              <w:rPr>
-                <w:noProof/>
-                <w:webHidden/>
-              </w:rPr>
-              <w:fldChar w:fldCharType="separate"/>
-            </w:r>
-            <w:r>
-              <w:rPr>
-                <w:noProof/>
-                <w:webHidden/>
-              </w:rPr>
-              <w:t>6</w:t>
-            </w:r>
-            <w:r>
-              <w:rPr>
-                <w:noProof/>
-                <w:webHidden/>
-              </w:rPr>
-              <w:fldChar w:fldCharType="end"/>
-            </w:r>
-          </w:hyperlink>
-        </w:p>
-        <w:p>
-          <w:pPr>
-            <w:pStyle w:val="TOC3"/>
-            <w:tabs>
-              <w:tab w:val="right" w:leader="dot" w:pos="9016"/>
-            </w:tabs>
-            <w:rPr>
-              <w:rFonts w:cstheme="minorBidi"/>
-              <w:noProof/>
-              <w:kern w:val="2"/>
-              <w:sz w:val="24"/>
-              <w:szCs w:val="24"/>
-              <w:lang w:val="en-GB" w:eastAsia="en-GB"/>
-              <w14:ligatures w14:val="standardContextual"/>
-            </w:rPr>
-          </w:pPr>
-          <w:hyperlink w:anchor="_Toc227233428" w:history="1">
-            <w:r>
-              <w:rPr>
-                <w:rStyle w:val="Hyperlink"/>
-                <w:noProof/>
-              </w:rPr>
-              <w:t>2.2.1 World Generation</w:t>
-            </w:r>
-            <w:r>
-              <w:rPr>
-                <w:noProof/>
-                <w:webHidden/>
-              </w:rPr>
-              <w:tab/>
-            </w:r>
-            <w:r>
-              <w:rPr>
-                <w:noProof/>
-                <w:webHidden/>
-              </w:rPr>
-              <w:fldChar w:fldCharType="begin"/>
-            </w:r>
-            <w:r>
-              <w:rPr>
-                <w:noProof/>
-                <w:webHidden/>
-              </w:rPr>
-              <w:instrText xml:space="preserve"> PAGEREF _Toc227233428 \h </w:instrText>
-            </w:r>
-            <w:r>
-              <w:rPr>
-                <w:noProof/>
-                <w:webHidden/>
-              </w:rPr>
-            </w:r>
-            <w:r>
-              <w:rPr>
-                <w:noProof/>
-                <w:webHidden/>
-              </w:rPr>
-              <w:fldChar w:fldCharType="separate"/>
-            </w:r>
-            <w:r>
-              <w:rPr>
-                <w:noProof/>
-                <w:webHidden/>
-              </w:rPr>
-              <w:t>6</w:t>
-            </w:r>
-            <w:r>
-              <w:rPr>
-                <w:noProof/>
-                <w:webHidden/>
-              </w:rPr>
-              <w:fldChar w:fldCharType="end"/>
-            </w:r>
-          </w:hyperlink>
-        </w:p>
-        <w:p>
-          <w:pPr>
-            <w:pStyle w:val="TOC4"/>
-            <w:tabs>
-              <w:tab w:val="right" w:leader="dot" w:pos="9016"/>
-            </w:tabs>
-            <w:rPr>
-              <w:rFonts w:eastAsiaTheme="minorEastAsia"/>
-              <w:noProof/>
-              <w:lang w:eastAsia="en-GB"/>
-            </w:rPr>
-          </w:pPr>
-          <w:hyperlink w:anchor="_Toc227233429" w:history="1">
-            <w:r>
-              <w:rPr>
-                <w:rStyle w:val="Hyperlink"/>
-                <w:noProof/>
-              </w:rPr>
-              <w:t>2.2.1.1 Perlin Noise</w:t>
-            </w:r>
-            <w:r>
-              <w:rPr>
-                <w:noProof/>
-                <w:webHidden/>
-              </w:rPr>
-              <w:tab/>
-            </w:r>
-            <w:r>
-              <w:rPr>
-                <w:noProof/>
-                <w:webHidden/>
-              </w:rPr>
-              <w:fldChar w:fldCharType="begin"/>
-            </w:r>
-            <w:r>
-              <w:rPr>
-                <w:noProof/>
-                <w:webHidden/>
-              </w:rPr>
-              <w:instrText xml:space="preserve"> PAGEREF _Toc227233429 \h </w:instrText>
-            </w:r>
-            <w:r>
-              <w:rPr>
-                <w:noProof/>
-                <w:webHidden/>
-              </w:rPr>
-            </w:r>
-            <w:r>
-              <w:rPr>
-                <w:noProof/>
-                <w:webHidden/>
-              </w:rPr>
-              <w:fldChar w:fldCharType="separate"/>
-            </w:r>
-            <w:r>
-              <w:rPr>
-                <w:noProof/>
-                <w:webHidden/>
-              </w:rPr>
-              <w:t>6</w:t>
-            </w:r>
-            <w:r>
-              <w:rPr>
-                <w:noProof/>
-                <w:webHidden/>
-              </w:rPr>
-              <w:fldChar w:fldCharType="end"/>
-            </w:r>
-          </w:hyperlink>
-        </w:p>
-        <w:p>
-          <w:pPr>
-            <w:pStyle w:val="TOC4"/>
-            <w:tabs>
-              <w:tab w:val="right" w:leader="dot" w:pos="9016"/>
-            </w:tabs>
-            <w:rPr>
-              <w:rFonts w:eastAsiaTheme="minorEastAsia"/>
-              <w:noProof/>
-              <w:lang w:eastAsia="en-GB"/>
-            </w:rPr>
-          </w:pPr>
-          <w:hyperlink w:anchor="_Toc227233430" w:history="1">
-            <w:r>
-              <w:rPr>
-                <w:rStyle w:val="Hyperlink"/>
-                <w:noProof/>
-              </w:rPr>
-              <w:t>2.2.1.2 Binary Space Partitioning</w:t>
-            </w:r>
-            <w:r>
-              <w:rPr>
-                <w:noProof/>
-                <w:webHidden/>
-              </w:rPr>
-              <w:tab/>
-            </w:r>
-            <w:r>
-              <w:rPr>
-                <w:noProof/>
-                <w:webHidden/>
-              </w:rPr>
-              <w:fldChar w:fldCharType="begin"/>
-            </w:r>
-            <w:r>
-              <w:rPr>
-                <w:noProof/>
-                <w:webHidden/>
-              </w:rPr>
-              <w:instrText xml:space="preserve"> PAGEREF _Toc227233430 \h </w:instrText>
-            </w:r>
-            <w:r>
-              <w:rPr>
-                <w:noProof/>
-                <w:webHidden/>
-              </w:rPr>
-            </w:r>
-            <w:r>
-              <w:rPr>
-                <w:noProof/>
-                <w:webHidden/>
-              </w:rPr>
-              <w:fldChar w:fldCharType="separate"/>
-            </w:r>
-            <w:r>
-              <w:rPr>
-                <w:noProof/>
-                <w:webHidden/>
-              </w:rPr>
-              <w:t>7</w:t>
-            </w:r>
-            <w:r>
-              <w:rPr>
-                <w:noProof/>
-                <w:webHidden/>
-              </w:rPr>
-              <w:fldChar w:fldCharType="end"/>
-            </w:r>
-          </w:hyperlink>
-        </w:p>
-        <w:p>
-          <w:pPr>
-            <w:pStyle w:val="TOC4"/>
-            <w:tabs>
-              <w:tab w:val="right" w:leader="dot" w:pos="9016"/>
-            </w:tabs>
-            <w:rPr>
-              <w:rFonts w:eastAsiaTheme="minorEastAsia"/>
-              <w:noProof/>
-              <w:lang w:eastAsia="en-GB"/>
-            </w:rPr>
-          </w:pPr>
-          <w:hyperlink w:anchor="_Toc227233431" w:history="1">
-            <w:r>
-              <w:rPr>
-                <w:rStyle w:val="Hyperlink"/>
-                <w:noProof/>
-              </w:rPr>
-              <w:t>2.2.1.3 Cellular Automata</w:t>
-            </w:r>
-            <w:r>
-              <w:rPr>
-                <w:noProof/>
-                <w:webHidden/>
-              </w:rPr>
-              <w:tab/>
-            </w:r>
-            <w:r>
-              <w:rPr>
-                <w:noProof/>
-                <w:webHidden/>
-              </w:rPr>
-              <w:fldChar w:fldCharType="begin"/>
-            </w:r>
-            <w:r>
-              <w:rPr>
-                <w:noProof/>
-                <w:webHidden/>
-              </w:rPr>
-              <w:instrText xml:space="preserve"> PAGEREF _Toc227233431 \h </w:instrText>
-            </w:r>
-            <w:r>
-              <w:rPr>
-                <w:noProof/>
-                <w:webHidden/>
-              </w:rPr>
-            </w:r>
-            <w:r>
-              <w:rPr>
-                <w:noProof/>
-                <w:webHidden/>
-              </w:rPr>
-              <w:fldChar w:fldCharType="separate"/>
-            </w:r>
-            <w:r>
-              <w:rPr>
-                <w:noProof/>
-                <w:webHidden/>
-              </w:rPr>
-              <w:t>7</w:t>
-            </w:r>
-            <w:r>
-              <w:rPr>
-                <w:noProof/>
-                <w:webHidden/>
-              </w:rPr>
-              <w:fldChar w:fldCharType="end"/>
-            </w:r>
-          </w:hyperlink>
-        </w:p>
-        <w:p>
-          <w:pPr>
-            <w:pStyle w:val="TOC3"/>
-            <w:tabs>
-              <w:tab w:val="right" w:leader="dot" w:pos="9016"/>
-            </w:tabs>
-            <w:rPr>
-              <w:rFonts w:cstheme="minorBidi"/>
-              <w:noProof/>
-              <w:kern w:val="2"/>
-              <w:sz w:val="24"/>
-              <w:szCs w:val="24"/>
-              <w:lang w:val="en-GB" w:eastAsia="en-GB"/>
-              <w14:ligatures w14:val="standardContextual"/>
-            </w:rPr>
-          </w:pPr>
-          <w:hyperlink w:anchor="_Toc227233432" w:history="1">
-            <w:r>
-              <w:rPr>
-                <w:rStyle w:val="Hyperlink"/>
-                <w:noProof/>
-              </w:rPr>
-              <w:t>2.2.2 Pathfinding</w:t>
-            </w:r>
-            <w:r>
-              <w:rPr>
-                <w:noProof/>
-                <w:webHidden/>
-              </w:rPr>
-              <w:tab/>
-            </w:r>
-            <w:r>
-              <w:rPr>
-                <w:noProof/>
-                <w:webHidden/>
-              </w:rPr>
-              <w:fldChar w:fldCharType="begin"/>
-            </w:r>
-            <w:r>
-              <w:rPr>
-                <w:noProof/>
-                <w:webHidden/>
-              </w:rPr>
-              <w:instrText xml:space="preserve"> PAGEREF _Toc227233432 \h </w:instrText>
-            </w:r>
-            <w:r>
-              <w:rPr>
-                <w:noProof/>
-                <w:webHidden/>
-              </w:rPr>
-            </w:r>
-            <w:r>
-              <w:rPr>
-                <w:noProof/>
-                <w:webHidden/>
-              </w:rPr>
-              <w:fldChar w:fldCharType="separate"/>
-            </w:r>
-            <w:r>
-              <w:rPr>
-                <w:noProof/>
-                <w:webHidden/>
-              </w:rPr>
-              <w:t>7</w:t>
-            </w:r>
-            <w:r>
-              <w:rPr>
-                <w:noProof/>
-                <w:webHidden/>
-              </w:rPr>
-              <w:fldChar w:fldCharType="end"/>
-            </w:r>
-          </w:hyperlink>
-        </w:p>
-        <w:p>
-          <w:pPr>
-            <w:pStyle w:val="TOC4"/>
-            <w:tabs>
-              <w:tab w:val="right" w:leader="dot" w:pos="9016"/>
-            </w:tabs>
-            <w:rPr>
-              <w:rFonts w:eastAsiaTheme="minorEastAsia"/>
-              <w:noProof/>
-              <w:lang w:eastAsia="en-GB"/>
-            </w:rPr>
-          </w:pPr>
-          <w:hyperlink w:anchor="_Toc227233433" w:history="1">
-            <w:r>
-              <w:rPr>
-                <w:rStyle w:val="Hyperlink"/>
-                <w:noProof/>
-              </w:rPr>
-              <w:t>2.2.2.1 Dijkstra</w:t>
-            </w:r>
-            <w:r>
-              <w:rPr>
-                <w:noProof/>
-                <w:webHidden/>
-              </w:rPr>
-              <w:tab/>
-            </w:r>
-            <w:r>
-              <w:rPr>
-                <w:noProof/>
-                <w:webHidden/>
-              </w:rPr>
-              <w:fldChar w:fldCharType="begin"/>
-            </w:r>
-            <w:r>
-              <w:rPr>
-                <w:noProof/>
-                <w:webHidden/>
-              </w:rPr>
-              <w:instrText xml:space="preserve"> PAGEREF _Toc227233433 \h </w:instrText>
-            </w:r>
-            <w:r>
-              <w:rPr>
-                <w:noProof/>
-                <w:webHidden/>
-              </w:rPr>
-            </w:r>
-            <w:r>
-              <w:rPr>
-                <w:noProof/>
-                <w:webHidden/>
-              </w:rPr>
-              <w:fldChar w:fldCharType="separate"/>
-            </w:r>
-            <w:r>
-              <w:rPr>
-                <w:noProof/>
-                <w:webHidden/>
-              </w:rPr>
-              <w:t>8</w:t>
-            </w:r>
-            <w:r>
-              <w:rPr>
-                <w:noProof/>
-                <w:webHidden/>
-              </w:rPr>
-              <w:fldChar w:fldCharType="end"/>
-            </w:r>
-          </w:hyperlink>
-        </w:p>
-        <w:p>
-          <w:pPr>
-            <w:pStyle w:val="TOC4"/>
-            <w:tabs>
-              <w:tab w:val="right" w:leader="dot" w:pos="9016"/>
-            </w:tabs>
-            <w:rPr>
-              <w:rFonts w:eastAsiaTheme="minorEastAsia"/>
-              <w:noProof/>
-              <w:lang w:eastAsia="en-GB"/>
-            </w:rPr>
-          </w:pPr>
-          <w:hyperlink w:anchor="_Toc227233434" w:history="1">
-            <w:r>
-              <w:rPr>
-                <w:rStyle w:val="Hyperlink"/>
-                <w:noProof/>
-              </w:rPr>
-              <w:t>2.2.2.2 A*</w:t>
-            </w:r>
-            <w:r>
-              <w:rPr>
-                <w:noProof/>
-                <w:webHidden/>
-              </w:rPr>
-              <w:tab/>
-            </w:r>
-            <w:r>
-              <w:rPr>
-                <w:noProof/>
-                <w:webHidden/>
-              </w:rPr>
-              <w:fldChar w:fldCharType="begin"/>
-            </w:r>
-            <w:r>
-              <w:rPr>
-                <w:noProof/>
-                <w:webHidden/>
-              </w:rPr>
-              <w:instrText xml:space="preserve"> PAGEREF _Toc227233434 \h </w:instrText>
-            </w:r>
-            <w:r>
-              <w:rPr>
-                <w:noProof/>
-                <w:webHidden/>
-              </w:rPr>
-            </w:r>
-            <w:r>
-              <w:rPr>
-                <w:noProof/>
-                <w:webHidden/>
-              </w:rPr>
-              <w:fldChar w:fldCharType="separate"/>
-            </w:r>
-            <w:r>
-              <w:rPr>
-                <w:noProof/>
-                <w:webHidden/>
-              </w:rPr>
-              <w:t>8</w:t>
-            </w:r>
-            <w:r>
-              <w:rPr>
-                <w:noProof/>
-                <w:webHidden/>
-              </w:rPr>
-              <w:fldChar w:fldCharType="end"/>
-            </w:r>
-          </w:hyperlink>
-        </w:p>
-        <w:p>
-          <w:pPr>
-            <w:pStyle w:val="TOC4"/>
-            <w:tabs>
-              <w:tab w:val="right" w:leader="dot" w:pos="9016"/>
-            </w:tabs>
-            <w:rPr>
-              <w:rFonts w:eastAsiaTheme="minorEastAsia"/>
-              <w:noProof/>
-              <w:lang w:eastAsia="en-GB"/>
-            </w:rPr>
-          </w:pPr>
-          <w:hyperlink w:anchor="_Toc227233435" w:history="1">
-            <w:r>
-              <w:rPr>
-                <w:rStyle w:val="Hyperlink"/>
-                <w:noProof/>
-              </w:rPr>
-              <w:t>2.2.2.3 Jump Point Search</w:t>
-            </w:r>
-            <w:r>
-              <w:rPr>
-                <w:noProof/>
-                <w:webHidden/>
-              </w:rPr>
-              <w:tab/>
-            </w:r>
-            <w:r>
-              <w:rPr>
-                <w:noProof/>
-                <w:webHidden/>
-              </w:rPr>
-              <w:fldChar w:fldCharType="begin"/>
-            </w:r>
-            <w:r>
-              <w:rPr>
-                <w:noProof/>
-                <w:webHidden/>
-              </w:rPr>
-              <w:instrText xml:space="preserve"> PAGEREF _Toc227233435 \h </w:instrText>
-            </w:r>
-            <w:r>
-              <w:rPr>
-                <w:noProof/>
-                <w:webHidden/>
-              </w:rPr>
-            </w:r>
-            <w:r>
-              <w:rPr>
-                <w:noProof/>
-                <w:webHidden/>
-              </w:rPr>
-              <w:fldChar w:fldCharType="separate"/>
-            </w:r>
-            <w:r>
-              <w:rPr>
-                <w:noProof/>
-                <w:webHidden/>
-              </w:rPr>
-              <w:t>8</w:t>
-            </w:r>
-            <w:r>
-              <w:rPr>
-                <w:noProof/>
-                <w:webHidden/>
-              </w:rPr>
-              <w:fldChar w:fldCharType="end"/>
-            </w:r>
-          </w:hyperlink>
-        </w:p>
-        <w:p>
-          <w:pPr>
-            <w:pStyle w:val="TOC3"/>
-            <w:tabs>
-              <w:tab w:val="right" w:leader="dot" w:pos="9016"/>
-            </w:tabs>
-            <w:rPr>
-              <w:rFonts w:cstheme="minorBidi"/>
-              <w:noProof/>
-              <w:kern w:val="2"/>
-              <w:sz w:val="24"/>
-              <w:szCs w:val="24"/>
-              <w:lang w:val="en-GB" w:eastAsia="en-GB"/>
-              <w14:ligatures w14:val="standardContextual"/>
-            </w:rPr>
-          </w:pPr>
-          <w:hyperlink w:anchor="_Toc227233436" w:history="1">
-            <w:r>
-              <w:rPr>
-                <w:rStyle w:val="Hyperlink"/>
-                <w:noProof/>
-              </w:rPr>
-              <w:t>2.2.3 AI Integrations</w:t>
-            </w:r>
-            <w:r>
-              <w:rPr>
-                <w:noProof/>
-                <w:webHidden/>
-              </w:rPr>
-              <w:tab/>
-            </w:r>
-            <w:r>
-              <w:rPr>
-                <w:noProof/>
-                <w:webHidden/>
-              </w:rPr>
-              <w:fldChar w:fldCharType="begin"/>
-            </w:r>
-            <w:r>
-              <w:rPr>
-                <w:noProof/>
-                <w:webHidden/>
-              </w:rPr>
-              <w:instrText xml:space="preserve"> PAGEREF _Toc227233436 \h </w:instrText>
-            </w:r>
-            <w:r>
-              <w:rPr>
-                <w:noProof/>
-                <w:webHidden/>
-              </w:rPr>
-            </w:r>
-            <w:r>
-              <w:rPr>
-                <w:noProof/>
-                <w:webHidden/>
-              </w:rPr>
-              <w:fldChar w:fldCharType="separate"/>
-            </w:r>
-            <w:r>
-              <w:rPr>
-                <w:noProof/>
-                <w:webHidden/>
-              </w:rPr>
-              <w:t>8</w:t>
-            </w:r>
-            <w:r>
-              <w:rPr>
-                <w:noProof/>
-                <w:webHidden/>
-              </w:rPr>
-              <w:fldChar w:fldCharType="end"/>
-            </w:r>
-          </w:hyperlink>
-        </w:p>
-        <w:p>
-          <w:pPr>
-            <w:pStyle w:val="TOC4"/>
-            <w:tabs>
-              <w:tab w:val="right" w:leader="dot" w:pos="9016"/>
-            </w:tabs>
-            <w:rPr>
-              <w:rFonts w:eastAsiaTheme="minorEastAsia"/>
-              <w:noProof/>
-              <w:lang w:eastAsia="en-GB"/>
-            </w:rPr>
-          </w:pPr>
-          <w:hyperlink w:anchor="_Toc227233437" w:history="1">
-            <w:r>
-              <w:rPr>
-                <w:rStyle w:val="Hyperlink"/>
-                <w:noProof/>
-              </w:rPr>
-              <w:t>2.2.3.1 Neural Network</w:t>
-            </w:r>
-            <w:r>
-              <w:rPr>
-                <w:noProof/>
-                <w:webHidden/>
-              </w:rPr>
-              <w:tab/>
-            </w:r>
-            <w:r>
-              <w:rPr>
-                <w:noProof/>
-                <w:webHidden/>
-              </w:rPr>
-              <w:fldChar w:fldCharType="begin"/>
-            </w:r>
-            <w:r>
-              <w:rPr>
-                <w:noProof/>
-                <w:webHidden/>
-              </w:rPr>
-              <w:instrText xml:space="preserve"> PAGEREF _Toc227233437 \h </w:instrText>
-            </w:r>
-            <w:r>
-              <w:rPr>
-                <w:noProof/>
-                <w:webHidden/>
-              </w:rPr>
-            </w:r>
-            <w:r>
-              <w:rPr>
-                <w:noProof/>
-                <w:webHidden/>
-              </w:rPr>
-              <w:fldChar w:fldCharType="separate"/>
-            </w:r>
-            <w:r>
-              <w:rPr>
-                <w:noProof/>
-                <w:webHidden/>
-              </w:rPr>
-              <w:t>8</w:t>
-            </w:r>
-            <w:r>
-              <w:rPr>
-                <w:noProof/>
-                <w:webHidden/>
-              </w:rPr>
-              <w:fldChar w:fldCharType="end"/>
-            </w:r>
-          </w:hyperlink>
-        </w:p>
-        <w:p>
-          <w:pPr>
-            <w:pStyle w:val="TOC4"/>
-            <w:tabs>
-              <w:tab w:val="right" w:leader="dot" w:pos="9016"/>
-            </w:tabs>
-            <w:rPr>
-              <w:rFonts w:eastAsiaTheme="minorEastAsia"/>
-              <w:noProof/>
-              <w:lang w:eastAsia="en-GB"/>
-            </w:rPr>
-          </w:pPr>
-          <w:hyperlink w:anchor="_Toc227233438" w:history="1">
-            <w:r>
-              <w:rPr>
-                <w:rStyle w:val="Hyperlink"/>
-                <w:noProof/>
-              </w:rPr>
-              <w:t>2.2.3.2 Reinforcement Learning</w:t>
-            </w:r>
-            <w:r>
-              <w:rPr>
-                <w:noProof/>
-                <w:webHidden/>
-              </w:rPr>
-              <w:tab/>
-            </w:r>
-            <w:r>
-              <w:rPr>
-                <w:noProof/>
-                <w:webHidden/>
-              </w:rPr>
-              <w:fldChar w:fldCharType="begin"/>
-            </w:r>
-            <w:r>
-              <w:rPr>
-                <w:noProof/>
-                <w:webHidden/>
-              </w:rPr>
-              <w:instrText xml:space="preserve"> PAGEREF _Toc227233438 \h </w:instrText>
-            </w:r>
-            <w:r>
-              <w:rPr>
-                <w:noProof/>
-                <w:webHidden/>
-              </w:rPr>
-            </w:r>
-            <w:r>
-              <w:rPr>
-                <w:noProof/>
-                <w:webHidden/>
-              </w:rPr>
-              <w:fldChar w:fldCharType="separate"/>
-            </w:r>
-            <w:r>
-              <w:rPr>
-                <w:noProof/>
-                <w:webHidden/>
-              </w:rPr>
-              <w:t>8</w:t>
-            </w:r>
-            <w:r>
-              <w:rPr>
-                <w:noProof/>
-                <w:webHidden/>
-              </w:rPr>
-              <w:fldChar w:fldCharType="end"/>
-            </w:r>
-          </w:hyperlink>
-        </w:p>
-        <w:p>
-          <w:pPr>
-            <w:pStyle w:val="TOC4"/>
-            <w:tabs>
-              <w:tab w:val="right" w:leader="dot" w:pos="9016"/>
-            </w:tabs>
-            <w:rPr>
-              <w:rFonts w:eastAsiaTheme="minorEastAsia"/>
-              <w:noProof/>
-              <w:lang w:eastAsia="en-GB"/>
-            </w:rPr>
-          </w:pPr>
-          <w:hyperlink w:anchor="_Toc227233439" w:history="1">
-            <w:r>
-              <w:rPr>
-                <w:rStyle w:val="Hyperlink"/>
-                <w:noProof/>
-              </w:rPr>
-              <w:t>2.2.3.3 Imitation Learning</w:t>
-            </w:r>
-            <w:r>
-              <w:rPr>
-                <w:noProof/>
-                <w:webHidden/>
-              </w:rPr>
-              <w:tab/>
-            </w:r>
-            <w:r>
-              <w:rPr>
-                <w:noProof/>
-                <w:webHidden/>
-              </w:rPr>
-              <w:fldChar w:fldCharType="begin"/>
-            </w:r>
-            <w:r>
-              <w:rPr>
-                <w:noProof/>
-                <w:webHidden/>
-              </w:rPr>
-              <w:instrText xml:space="preserve"> PAGEREF _Toc227233439 \h </w:instrText>
-            </w:r>
-            <w:r>
-              <w:rPr>
-                <w:noProof/>
-                <w:webHidden/>
-              </w:rPr>
-            </w:r>
-            <w:r>
-              <w:rPr>
-                <w:noProof/>
-                <w:webHidden/>
-              </w:rPr>
-              <w:fldChar w:fldCharType="separate"/>
-            </w:r>
-            <w:r>
-              <w:rPr>
-                <w:noProof/>
-                <w:webHidden/>
-              </w:rPr>
-              <w:t>8</w:t>
-            </w:r>
-            <w:r>
-              <w:rPr>
-                <w:noProof/>
-                <w:webHidden/>
-              </w:rPr>
-              <w:fldChar w:fldCharType="end"/>
-            </w:r>
-          </w:hyperlink>
-        </w:p>
-        <w:p>
-          <w:pPr>
-            <w:pStyle w:val="TOC1"/>
-            <w:tabs>
-              <w:tab w:val="right" w:leader="dot" w:pos="9016"/>
-            </w:tabs>
-            <w:rPr>
-              <w:rFonts w:cstheme="minorBidi"/>
-              <w:noProof/>
-              <w:kern w:val="2"/>
-              <w:sz w:val="24"/>
-              <w:szCs w:val="24"/>
-              <w:lang w:val="en-GB" w:eastAsia="en-GB"/>
-              <w14:ligatures w14:val="standardContextual"/>
-            </w:rPr>
-          </w:pPr>
-          <w:hyperlink w:anchor="_Toc227233440" w:history="1">
-            <w:r>
-              <w:rPr>
-                <w:rStyle w:val="Hyperlink"/>
-                <w:noProof/>
-              </w:rPr>
-              <w:t>References</w:t>
-            </w:r>
-            <w:r>
-              <w:rPr>
-                <w:noProof/>
-                <w:webHidden/>
-              </w:rPr>
-              <w:tab/>
-            </w:r>
-            <w:r>
-              <w:rPr>
-                <w:noProof/>
-                <w:webHidden/>
-              </w:rPr>
-              <w:fldChar w:fldCharType="begin"/>
-            </w:r>
-            <w:r>
-              <w:rPr>
-                <w:noProof/>
-                <w:webHidden/>
-              </w:rPr>
-              <w:instrText xml:space="preserve"> PAGEREF _Toc227233440 \h </w:instrText>
-            </w:r>
-            <w:r>
-              <w:rPr>
-                <w:noProof/>
-                <w:webHidden/>
-              </w:rPr>
-            </w:r>
-            <w:r>
-              <w:rPr>
-                <w:noProof/>
-                <w:webHidden/>
-              </w:rPr>
-              <w:fldChar w:fldCharType="separate"/>
-            </w:r>
-            <w:r>
-              <w:rPr>
-                <w:noProof/>
-                <w:webHidden/>
-              </w:rPr>
-              <w:t>8</w:t>
-            </w:r>
-            <w:r>
-              <w:rPr>
-                <w:noProof/>
-                <w:webHidden/>
-              </w:rPr>
-              <w:fldChar w:fldCharType="end"/>
-            </w:r>
-          </w:hyperlink>
-        </w:p>
-        <w:p>
           <w:r>
             <w:rPr>
               <w:rFonts w:eastAsiaTheme="minorEastAsia" w:cs="Times New Roman"/>
@@ -2245,6 +2252,108 @@
     </w:sdt>
     <w:p>
       <w:pPr>
+        <w:pStyle w:val="Heading2"/>
+      </w:pPr>
+      <w:r>
+        <w:t>Table of Figures</w:t>
+      </w:r>
+    </w:p>
+    <w:p>
+      <w:pPr>
+        <w:pStyle w:val="TableofFigures"/>
+        <w:tabs>
+          <w:tab w:val="right" w:leader="dot" w:pos="9016"/>
+        </w:tabs>
+        <w:rPr>
+          <w:rFonts w:eastAsiaTheme="minorEastAsia"/>
+          <w:noProof/>
+          <w:lang w:eastAsia="en-GB"/>
+        </w:rPr>
+      </w:pPr>
+      <w:r>
+        <w:rPr>
+          <w:sz w:val="36"/>
+          <w:szCs w:val="36"/>
+          <w:u w:val="single"/>
+        </w:rPr>
+        <w:fldChar w:fldCharType="begin"/>
+      </w:r>
+      <w:r>
+        <w:rPr>
+          <w:sz w:val="36"/>
+          <w:szCs w:val="36"/>
+          <w:u w:val="single"/>
+        </w:rPr>
+        <w:instrText xml:space="preserve"> TOC \h \z \c "Figure" </w:instrText>
+      </w:r>
+      <w:r>
+        <w:rPr>
+          <w:sz w:val="36"/>
+          <w:szCs w:val="36"/>
+          <w:u w:val="single"/>
+        </w:rPr>
+        <w:fldChar w:fldCharType="separate"/>
+      </w:r>
+      <w:hyperlink w:anchor="_Toc227236723" w:history="1">
+        <w:r>
+          <w:rPr>
+            <w:rStyle w:val="Hyperlink"/>
+            <w:noProof/>
+          </w:rPr>
+          <w:t>Figure 1 (Murel &amp; Kavlakoglu, n.d.)</w:t>
+        </w:r>
+        <w:r>
+          <w:rPr>
+            <w:noProof/>
+            <w:webHidden/>
+          </w:rPr>
+          <w:tab/>
+        </w:r>
+        <w:r>
+          <w:rPr>
+            <w:noProof/>
+            <w:webHidden/>
+          </w:rPr>
+          <w:fldChar w:fldCharType="begin"/>
+        </w:r>
+        <w:r>
+          <w:rPr>
+            <w:noProof/>
+            <w:webHidden/>
+          </w:rPr>
+          <w:instrText xml:space="preserve"> PAGEREF _Toc227236723 \h </w:instrText>
+        </w:r>
+        <w:r>
+          <w:rPr>
+            <w:noProof/>
+            <w:webHidden/>
+          </w:rPr>
+        </w:r>
+        <w:r>
+          <w:rPr>
+            <w:noProof/>
+            <w:webHidden/>
+          </w:rPr>
+          <w:fldChar w:fldCharType="separate"/>
+        </w:r>
+        <w:r>
+          <w:rPr>
+            <w:noProof/>
+            <w:webHidden/>
+          </w:rPr>
+          <w:t>9</w:t>
+        </w:r>
+        <w:r>
+          <w:rPr>
+            <w:noProof/>
+            <w:webHidden/>
+          </w:rPr>
+          <w:fldChar w:fldCharType="end"/>
+        </w:r>
+      </w:hyperlink>
+    </w:p>
+    <w:p>
+      <w:pPr>
         <w:jc w:val="center"/>
         <w:rPr>
           <w:sz w:val="36"/>
@@ -2258,78 +2367,16 @@
           <w:szCs w:val="36"/>
           <w:u w:val="single"/>
         </w:rPr>
-        <w:fldChar w:fldCharType="begin"/>
-      </w:r>
-      <w:r>
+        <w:fldChar w:fldCharType="end"/>
+      </w:r>
+    </w:p>
+    <w:p>
+      <w:pPr>
         <w:rPr>
           <w:sz w:val="36"/>
           <w:szCs w:val="36"/>
           <w:u w:val="single"/>
         </w:rPr>
-        <w:instrText xml:space="preserve"> TOC \h \z \c "Figure" </w:instrText>
-      </w:r>
-      <w:r>
-        <w:rPr>
-          <w:sz w:val="36"/>
-          <w:szCs w:val="36"/>
-          <w:u w:val="single"/>
-        </w:rPr>
-        <w:fldChar w:fldCharType="separate"/>
-      </w:r>
-      <w:r>
-        <w:rPr>
-          <w:b/>
-          <w:bCs/>
-          <w:noProof/>
-          <w:sz w:val="36"/>
-          <w:szCs w:val="36"/>
-          <w:u w:val="single"/>
-          <w:lang w:val="en-US"/>
-        </w:rPr>
-        <w:t>No table of figures entries found.</w:t>
-      </w:r>
-      <w:r>
-        <w:rPr>
-          <w:sz w:val="36"/>
-          <w:szCs w:val="36"/>
-          <w:u w:val="single"/>
-        </w:rPr>
-        <w:fldChar w:fldCharType="end"/>
-      </w:r>
-    </w:p>
-    <w:p>
-      <w:pPr>
-        <w:rPr>
-          <w:sz w:val="36"/>
-          <w:szCs w:val="36"/>
-          <w:u w:val="single"/>
-        </w:rPr>
-      </w:pPr>
-      <w:r>
-        <w:rPr>
-          <w:sz w:val="36"/>
-          <w:szCs w:val="36"/>
-          <w:u w:val="single"/>
-        </w:rPr>
-        <w:br/>
-      </w:r>
-    </w:p>
-    <w:p>
-      <w:pPr>
-        <w:rPr>
-          <w:sz w:val="36"/>
-          <w:szCs w:val="36"/>
-          <w:u w:val="single"/>
-        </w:rPr>
-      </w:pPr>
-    </w:p>
-    <w:p>
-      <w:pPr>
-        <w:rPr>
-          <w:sz w:val="36"/>
-          <w:szCs w:val="36"/>
-          <w:u w:val="single"/>
-        </w:rPr>
       </w:pPr>
     </w:p>
     <w:p>
@@ -2337,8 +2384,9 @@
         <w:pStyle w:val="Heading1"/>
         <w:jc w:val="center"/>
       </w:pPr>
-      <w:bookmarkStart w:id="0" w:name="_Toc227233414"/>
-      <w:r>
+      <w:bookmarkStart w:id="0" w:name="_Toc227236449"/>
+      <w:r>
+        <w:lastRenderedPageBreak/>
         <w:t>Chapter 1</w:t>
       </w:r>
       <w:r>
@@ -2365,7 +2413,7 @@
           <w:u w:val="single"/>
         </w:rPr>
       </w:pPr>
-      <w:bookmarkStart w:id="1" w:name="_Toc227233415"/>
+      <w:bookmarkStart w:id="1" w:name="_Toc227236450"/>
       <w:r>
         <w:t>1.1</w:t>
       </w:r>
@@ -2408,26 +2456,37 @@
     <w:p/>
     <w:p>
       <w:pPr>
-        <w:pStyle w:val="Heading1"/>
-      </w:pPr>
-      <w:bookmarkStart w:id="2" w:name="_Toc227233416"/>
+        <w:pStyle w:val="Heading2"/>
+      </w:pPr>
+      <w:bookmarkStart w:id="2" w:name="_Toc227236451"/>
       <w:r>
         <w:t>1.2 Aims</w:t>
       </w:r>
       <w:bookmarkEnd w:id="2"/>
     </w:p>
     <w:p>
-      <w:bookmarkStart w:id="3" w:name="_Toc227233417"/>
-      <w:r>
+      <w:pPr>
+        <w:pStyle w:val="Heading3"/>
         <w:rPr>
           <w:rStyle w:val="Heading2Char"/>
+          <w:rFonts w:asciiTheme="minorHAnsi" w:hAnsiTheme="minorHAnsi"/>
+          <w:sz w:val="28"/>
+          <w:szCs w:val="28"/>
+        </w:rPr>
+      </w:pPr>
+      <w:bookmarkStart w:id="3" w:name="_Toc227236452"/>
+      <w:r>
+        <w:rPr>
+          <w:rStyle w:val="Heading2Char"/>
+          <w:rFonts w:asciiTheme="minorHAnsi" w:hAnsiTheme="minorHAnsi"/>
+          <w:sz w:val="28"/>
+          <w:szCs w:val="28"/>
         </w:rPr>
         <w:t>1.2.1 Main Aim</w:t>
       </w:r>
       <w:bookmarkEnd w:id="3"/>
-      <w:r>
-        <w:br/>
-      </w:r>
+    </w:p>
+    <w:p>
       <w:r>
         <w:t>The main aim for this project is to investigate and explore the usage of machine learning models for real time gaming uses</w:t>
       </w:r>
@@ -2444,25 +2503,25 @@
         <w:t xml:space="preserve"> play the game without the need for a significant </w:t>
       </w:r>
       <w:r>
+        <w:t>number</w:t>
+      </w:r>
+      <w:r>
+        <w:t xml:space="preserve"> of diverging paths. This will be implemented in a way that doesn’t overwhelm the player through difficulty and create a situation where the player </w:t>
+      </w:r>
+      <w:r>
+        <w:t>manages</w:t>
+      </w:r>
+      <w:r>
+        <w:t xml:space="preserve"> to enjoy the game and win against the AI.</w:t>
+      </w:r>
+    </w:p>
+    <w:p>
+      <w:pPr>
+        <w:pStyle w:val="Heading3"/>
+      </w:pPr>
+      <w:bookmarkStart w:id="4" w:name="_Toc227236453"/>
+      <w:r>
         <w:lastRenderedPageBreak/>
-        <w:t>number</w:t>
-      </w:r>
-      <w:r>
-        <w:t xml:space="preserve"> of diverging paths. This will be implemented in a way that doesn’t overwhelm the player through difficulty and create a situation where the player </w:t>
-      </w:r>
-      <w:r>
-        <w:t>manages</w:t>
-      </w:r>
-      <w:r>
-        <w:t xml:space="preserve"> to enjoy the game and win against the AI.</w:t>
-      </w:r>
-    </w:p>
-    <w:p>
-      <w:pPr>
-        <w:pStyle w:val="Heading2"/>
-      </w:pPr>
-      <w:bookmarkStart w:id="4" w:name="_Toc227233418"/>
-      <w:r>
         <w:t>1.2.2 Additional Aims</w:t>
       </w:r>
       <w:bookmarkEnd w:id="4"/>
@@ -2528,9 +2587,9 @@
     <w:p/>
     <w:p>
       <w:pPr>
-        <w:pStyle w:val="Heading1"/>
-      </w:pPr>
-      <w:bookmarkStart w:id="5" w:name="_Toc227233419"/>
+        <w:pStyle w:val="Heading2"/>
+      </w:pPr>
+      <w:bookmarkStart w:id="5" w:name="_Toc227236454"/>
       <w:r>
         <w:t>1.3 Objectives</w:t>
       </w:r>
@@ -2538,9 +2597,9 @@
     </w:p>
     <w:p>
       <w:pPr>
-        <w:pStyle w:val="Heading2"/>
-      </w:pPr>
-      <w:bookmarkStart w:id="6" w:name="_Toc227233420"/>
+        <w:pStyle w:val="Heading3"/>
+      </w:pPr>
+      <w:bookmarkStart w:id="6" w:name="_Toc227236455"/>
       <w:r>
         <w:t>1.3.1 Scope</w:t>
       </w:r>
@@ -2601,9 +2660,9 @@
     </w:p>
     <w:p>
       <w:pPr>
-        <w:pStyle w:val="Heading2"/>
-      </w:pPr>
-      <w:bookmarkStart w:id="7" w:name="_Toc227233421"/>
+        <w:pStyle w:val="Heading3"/>
+      </w:pPr>
+      <w:bookmarkStart w:id="7" w:name="_Toc227236456"/>
       <w:r>
         <w:t>1.3.2 Research Objectives</w:t>
       </w:r>
@@ -2611,37 +2670,36 @@
     </w:p>
     <w:p>
       <w:r>
-        <w:t xml:space="preserve">For the research objectives for the game, research will be conducted into other types of media with similar features. This research will include a comparison of similar games and their features and the overall impact of those features on this project. This will be done to find a balance for the difficulty of the game and to evaluate the necessary </w:t>
+        <w:t>For the research objectives for the game, research will be conducted into other types of media with similar features. This research will include a comparison of similar games and their features and the overall impact of those features on this project. This will be done to find a balance for the difficulty of the game and to evaluate the necessary features for the game. Some topics of features and mechanics that will be researched include: World Generation, Pathfinding</w:t>
+      </w:r>
+      <w:r>
+        <w:t xml:space="preserve"> and </w:t>
+      </w:r>
+      <w:r>
+        <w:t>AI integrations</w:t>
+      </w:r>
+      <w:r>
+        <w:t xml:space="preserve"> for games</w:t>
+      </w:r>
+      <w:r>
+        <w:t>. A significant amount of research will be done into various machine learning models, their strengths and weaknesses and how these can be integrated into my game.</w:t>
+      </w:r>
+      <w:r>
+        <w:br/>
+      </w:r>
+      <w:r>
+        <w:br/>
       </w:r>
       <w:r>
         <w:lastRenderedPageBreak/>
-        <w:t>features for the game. Some topics of features and mechanics that will be researched include: World Generation, Pathfinding</w:t>
-      </w:r>
-      <w:r>
-        <w:t xml:space="preserve"> and </w:t>
-      </w:r>
-      <w:r>
-        <w:t>AI integrations</w:t>
-      </w:r>
-      <w:r>
-        <w:t xml:space="preserve"> for games</w:t>
-      </w:r>
-      <w:r>
-        <w:t>. A significant amount of research will be done into various machine learning models, their strengths and weaknesses and how these can be integrated into my game.</w:t>
-      </w:r>
-      <w:r>
-        <w:br/>
-      </w:r>
-      <w:r>
-        <w:br/>
         <w:t>Other areas of research that will be explored are core design principles for replayability and an interaction balance to not overwhelm the player with too many actions to make at any given time, as well as research into UI and UX design.</w:t>
       </w:r>
     </w:p>
     <w:p>
       <w:pPr>
-        <w:pStyle w:val="Heading2"/>
-      </w:pPr>
-      <w:bookmarkStart w:id="8" w:name="_Toc227233422"/>
+        <w:pStyle w:val="Heading3"/>
+      </w:pPr>
+      <w:bookmarkStart w:id="8" w:name="_Toc227236457"/>
       <w:r>
         <w:t>1.3.3 Design Objectives</w:t>
       </w:r>
@@ -2761,9 +2819,9 @@
     </w:p>
     <w:p>
       <w:pPr>
-        <w:pStyle w:val="Heading2"/>
-      </w:pPr>
-      <w:bookmarkStart w:id="9" w:name="_Toc227233423"/>
+        <w:pStyle w:val="Heading3"/>
+      </w:pPr>
+      <w:bookmarkStart w:id="9" w:name="_Toc227236458"/>
       <w:r>
         <w:t>1.3.4 Implementation Objectives</w:t>
       </w:r>
@@ -2880,9 +2938,9 @@
     </w:p>
     <w:p>
       <w:pPr>
-        <w:pStyle w:val="Heading2"/>
-      </w:pPr>
-      <w:bookmarkStart w:id="10" w:name="_Toc227233424"/>
+        <w:pStyle w:val="Heading3"/>
+      </w:pPr>
+      <w:bookmarkStart w:id="10" w:name="_Toc227236459"/>
       <w:r>
         <w:t>1.3.5 Results, Evaluation and Playtesting Objectives</w:t>
       </w:r>
@@ -2902,6 +2960,7 @@
         </w:numPr>
       </w:pPr>
       <w:r>
+        <w:lastRenderedPageBreak/>
         <w:t>Make a survey that asks questions about satisfying the above objectives.</w:t>
       </w:r>
     </w:p>
@@ -2938,7 +2997,7 @@
       <w:pPr>
         <w:pStyle w:val="Heading1"/>
       </w:pPr>
-      <w:bookmarkStart w:id="11" w:name="_Toc227233425"/>
+      <w:bookmarkStart w:id="11" w:name="_Toc227236460"/>
       <w:r>
         <w:t>Chapter 2 – Literature Survey</w:t>
       </w:r>
@@ -2948,7 +3007,7 @@
       <w:pPr>
         <w:pStyle w:val="Heading2"/>
       </w:pPr>
-      <w:bookmarkStart w:id="12" w:name="_Toc227233426"/>
+      <w:bookmarkStart w:id="12" w:name="_Toc227236461"/>
       <w:r>
         <w:t>2.1 Literature Survey Introduction</w:t>
       </w:r>
@@ -2987,7 +3046,7 @@
       <w:pPr>
         <w:pStyle w:val="Heading2"/>
       </w:pPr>
-      <w:bookmarkStart w:id="13" w:name="_Toc227233427"/>
+      <w:bookmarkStart w:id="13" w:name="_Toc227236462"/>
       <w:r>
         <w:t>2.2 Comparative Research</w:t>
       </w:r>
@@ -3005,7 +3064,7 @@
       <w:pPr>
         <w:pStyle w:val="Heading3"/>
       </w:pPr>
-      <w:bookmarkStart w:id="14" w:name="_Toc227233428"/>
+      <w:bookmarkStart w:id="14" w:name="_Toc227236463"/>
       <w:r>
         <w:t xml:space="preserve">2.2.1 </w:t>
       </w:r>
@@ -3081,7 +3140,7 @@
       <w:pPr>
         <w:pStyle w:val="Heading4"/>
       </w:pPr>
-      <w:bookmarkStart w:id="15" w:name="_Toc227233429"/>
+      <w:bookmarkStart w:id="15" w:name="_Toc227236464"/>
       <w:r>
         <w:t>2.2.1.1 Perlin Noise</w:t>
       </w:r>
@@ -3104,43 +3163,43 @@
         <w:br/>
       </w:r>
       <w:r>
+        <w:br/>
+      </w:r>
+      <w:r>
+        <w:t xml:space="preserve">In Minecraft (2009), </w:t>
+      </w:r>
+      <w:r>
+        <w:t xml:space="preserve">Sid Meier’s Civilization VI (2016) and Stellaris (2016), </w:t>
+      </w:r>
+      <w:r>
+        <w:t>it is used primarily to define the games biomes</w:t>
+      </w:r>
+      <w:r>
+        <w:t>, heightmaps</w:t>
+      </w:r>
+      <w:r>
+        <w:t xml:space="preserve"> and </w:t>
+      </w:r>
+      <w:r>
+        <w:t>resource distribution</w:t>
+      </w:r>
+      <w:r>
+        <w:t>. It is also used to create continents</w:t>
+      </w:r>
+      <w:r>
+        <w:t xml:space="preserve"> and other landmasses</w:t>
+      </w:r>
+      <w:r>
+        <w:t>.</w:t>
+      </w:r>
+    </w:p>
+    <w:p>
+      <w:pPr>
+        <w:pStyle w:val="Heading4"/>
+      </w:pPr>
+      <w:bookmarkStart w:id="16" w:name="_Toc227236465"/>
+      <w:r>
         <w:lastRenderedPageBreak/>
-        <w:br/>
-      </w:r>
-      <w:r>
-        <w:t xml:space="preserve">In Minecraft (2009), </w:t>
-      </w:r>
-      <w:r>
-        <w:t xml:space="preserve">Sid Meier’s Civilization VI (2016) and Stellaris (2016), </w:t>
-      </w:r>
-      <w:r>
-        <w:t>it is used primarily to define the games biomes</w:t>
-      </w:r>
-      <w:r>
-        <w:t>, heightmaps</w:t>
-      </w:r>
-      <w:r>
-        <w:t xml:space="preserve"> and </w:t>
-      </w:r>
-      <w:r>
-        <w:t>resource distribution</w:t>
-      </w:r>
-      <w:r>
-        <w:t>. It is also used to create continents</w:t>
-      </w:r>
-      <w:r>
-        <w:t xml:space="preserve"> and other landmasses</w:t>
-      </w:r>
-      <w:r>
-        <w:t>.</w:t>
-      </w:r>
-    </w:p>
-    <w:p>
-      <w:pPr>
-        <w:pStyle w:val="Heading4"/>
-      </w:pPr>
-      <w:bookmarkStart w:id="16" w:name="_Toc227233430"/>
-      <w:r>
         <w:t>2.2.1.2 Binary Space Partitioning</w:t>
       </w:r>
       <w:bookmarkEnd w:id="16"/>
@@ -3191,7 +3250,7 @@
       <w:pPr>
         <w:pStyle w:val="Heading4"/>
       </w:pPr>
-      <w:bookmarkStart w:id="17" w:name="_Toc227233431"/>
+      <w:bookmarkStart w:id="17" w:name="_Toc227236466"/>
       <w:r>
         <w:t>2.2.1.3 Cellular Automata</w:t>
       </w:r>
@@ -3299,7 +3358,7 @@
       <w:pPr>
         <w:pStyle w:val="Heading3"/>
       </w:pPr>
-      <w:bookmarkStart w:id="18" w:name="_Toc227233432"/>
+      <w:bookmarkStart w:id="18" w:name="_Toc227236467"/>
       <w:r>
         <w:t>2.2.2 Pathfinding</w:t>
       </w:r>
@@ -3320,59 +3379,57 @@
       </w:r>
       <w:r>
         <w:br/>
-      </w:r>
+        <w:t xml:space="preserve">In this section, I will be evaluating different games for their interpretation of pathfinding. </w:t>
+      </w:r>
+      <w:r>
+        <w:t xml:space="preserve">The games I will be </w:t>
+      </w:r>
+      <w:r>
+        <w:t xml:space="preserve">directly </w:t>
+      </w:r>
+      <w:r>
+        <w:t>referencing are as follows: Civilisation VI (2016), Stellaris (2016).</w:t>
+      </w:r>
+      <w:r>
+        <w:t xml:space="preserve"> </w:t>
+      </w:r>
+      <w:r>
+        <w:t>The types of pathfinding I will be evaluating are: A*, Dijkstra</w:t>
+      </w:r>
+      <w:r>
+        <w:t>,</w:t>
+      </w:r>
+      <w:r>
+        <w:t xml:space="preserve"> and</w:t>
+      </w:r>
+      <w:r>
+        <w:t xml:space="preserve"> Jump Point Search</w:t>
+      </w:r>
+      <w:r>
+        <w:t>.</w:t>
+      </w:r>
+    </w:p>
+    <w:p>
+      <w:pPr>
+        <w:pStyle w:val="Heading4"/>
+      </w:pPr>
+      <w:bookmarkStart w:id="19" w:name="_Toc227236468"/>
       <w:r>
         <w:lastRenderedPageBreak/>
-        <w:t xml:space="preserve">In this section, I will be evaluating different games for their interpretation of pathfinding. </w:t>
-      </w:r>
-      <w:r>
-        <w:t xml:space="preserve">The games I will be </w:t>
-      </w:r>
-      <w:r>
-        <w:t xml:space="preserve">directly </w:t>
-      </w:r>
-      <w:r>
-        <w:t>referencing are as follows: Civilisation VI (2016), Stellaris (2016).</w:t>
-      </w:r>
-      <w:r>
-        <w:t xml:space="preserve"> </w:t>
-      </w:r>
-      <w:r>
-        <w:t>The types of pathfinding I will be evaluating are: A*, Dijkstra</w:t>
-      </w:r>
-      <w:r>
-        <w:t>,</w:t>
-      </w:r>
-      <w:r>
-        <w:t xml:space="preserve"> and</w:t>
-      </w:r>
-      <w:r>
-        <w:t xml:space="preserve"> Jump Point Search</w:t>
-      </w:r>
-      <w:r>
-        <w:t>.</w:t>
+        <w:t>2.2.2.1 Dijkstra</w:t>
+      </w:r>
+      <w:bookmarkEnd w:id="19"/>
+    </w:p>
+    <w:p>
+      <w:r>
+        <w:t xml:space="preserve">Dijkstra’s algorithm is a pathfinding algorithm that uses a breadth first search, meaning it goes wider before it goes longer, that can contain a path cost. It is always guaranteed to find the shortest path but is not very optimized. The starting point is marked, then the movement cost is calculated to each neighbour nod, this is repeated on every connected node to the new nodes until the end point is found. The algorithm then calculates the shortest path back to the starting point.   </w:t>
       </w:r>
     </w:p>
     <w:p>
       <w:pPr>
         <w:pStyle w:val="Heading4"/>
       </w:pPr>
-      <w:bookmarkStart w:id="19" w:name="_Toc227233433"/>
-      <w:r>
-        <w:t>2.2.2.1 Dijkstra</w:t>
-      </w:r>
-      <w:bookmarkEnd w:id="19"/>
-    </w:p>
-    <w:p>
-      <w:r>
-        <w:t xml:space="preserve">Dijkstra’s algorithm is a pathfinding algorithm that uses a breadth first search, meaning it goes wider before it goes longer, that can contain a path cost. It is always guaranteed to find the shortest path but is not very optimized. The starting point is marked, then the movement cost is calculated to each neighbour nod, this is repeated on every connected node to the new nodes until the end point is found. The algorithm then calculates the shortest path back to the starting point.   </w:t>
-      </w:r>
-    </w:p>
-    <w:p>
-      <w:pPr>
-        <w:pStyle w:val="Heading4"/>
-      </w:pPr>
-      <w:bookmarkStart w:id="20" w:name="_Toc227233434"/>
+      <w:bookmarkStart w:id="20" w:name="_Toc227236469"/>
       <w:r>
         <w:t>2.2.2.2 A*</w:t>
       </w:r>
@@ -3425,7 +3482,7 @@
       <w:pPr>
         <w:pStyle w:val="Heading4"/>
       </w:pPr>
-      <w:bookmarkStart w:id="21" w:name="_Toc227233435"/>
+      <w:bookmarkStart w:id="21" w:name="_Toc227236470"/>
       <w:r>
         <w:t>2.2.2.3 Jump Point Search</w:t>
       </w:r>
@@ -3472,7 +3529,7 @@
       <w:pPr>
         <w:pStyle w:val="Heading3"/>
       </w:pPr>
-      <w:bookmarkStart w:id="22" w:name="_Toc227233436"/>
+      <w:bookmarkStart w:id="22" w:name="_Toc227236471"/>
       <w:r>
         <w:t>2.2.3 AI Integrations</w:t>
       </w:r>
@@ -3497,7 +3554,7 @@
       <w:pPr>
         <w:pStyle w:val="Heading4"/>
       </w:pPr>
-      <w:bookmarkStart w:id="23" w:name="_Toc227233437"/>
+      <w:bookmarkStart w:id="23" w:name="_Toc227236472"/>
       <w:r>
         <w:t>2.2.3.1 Neural Network</w:t>
       </w:r>
@@ -3516,7 +3573,6 @@
     </w:p>
     <w:p>
       <w:r>
-        <w:lastRenderedPageBreak/>
         <w:t xml:space="preserve">After the initial training phase, if we present the network with a pattern it hasn’t seen before in its training data, it should classify the unseen pattern correctly, only if it has learnt the underlying structure of the problem </w:t>
       </w:r>
       <w:sdt>
@@ -3553,24 +3609,208 @@
       <w:pPr>
         <w:pStyle w:val="Heading4"/>
       </w:pPr>
-      <w:bookmarkStart w:id="24" w:name="_Toc227233438"/>
-      <w:r>
+      <w:bookmarkStart w:id="24" w:name="_Toc227236473"/>
+      <w:r>
+        <w:lastRenderedPageBreak/>
         <w:t>2.2.3.2 Reinforcement Learning</w:t>
       </w:r>
       <w:bookmarkEnd w:id="24"/>
     </w:p>
     <w:p>
       <w:pPr>
+        <w:keepNext/>
+      </w:pPr>
+      <w:r>
+        <w:t>Reinforcement Learning, or RL, works by training an “agent” to make decisions through trial-and-error, interacting with an environment to maximize rewards. A reward can be as simple as giving a higher number for the “correct” result or more complex such as rewarding the AI for every possible action taken.</w:t>
+      </w:r>
+      <w:r>
+        <w:br/>
+      </w:r>
+      <w:r>
+        <w:br/>
+      </w:r>
+      <w:r>
+        <w:rPr>
+          <w:noProof/>
+        </w:rPr>
+        <w:drawing>
+          <wp:inline distT="0" distB="0" distL="0" distR="0" wp14:anchorId="01651E2C" wp14:editId="0DE3BA34">
+            <wp:extent cx="5705475" cy="3211877"/>
+            <wp:effectExtent l="0" t="0" r="0" b="7620"/>
+            <wp:docPr id="783752246" name="Picture 5"/>
+            <wp:cNvGraphicFramePr>
+              <a:graphicFrameLocks xmlns:a="http://schemas.openxmlformats.org/drawingml/2006/main" noChangeAspect="1"/>
+            </wp:cNvGraphicFramePr>
+            <a:graphic xmlns:a="http://schemas.openxmlformats.org/drawingml/2006/main">
+              <a:graphicData uri="http://schemas.openxmlformats.org/drawingml/2006/picture">
+                <pic:pic xmlns:pic="http://schemas.openxmlformats.org/drawingml/2006/picture">
+                  <pic:nvPicPr>
+                    <pic:cNvPr id="0" name="Picture 3"/>
+                    <pic:cNvPicPr>
+                      <a:picLocks noChangeAspect="1" noChangeArrowheads="1"/>
+                    </pic:cNvPicPr>
+                  </pic:nvPicPr>
+                  <pic:blipFill>
+                    <a:blip r:embed="rId8" cstate="print">
+                      <a:extLst>
+                        <a:ext uri="{28A0092B-C50C-407E-A947-70E740481C1C}">
+                          <a14:useLocalDpi xmlns:a14="http://schemas.microsoft.com/office/drawing/2010/main" val="0"/>
+                        </a:ext>
+                      </a:extLst>
+                    </a:blip>
+                    <a:srcRect/>
+                    <a:stretch>
+                      <a:fillRect/>
+                    </a:stretch>
+                  </pic:blipFill>
+                  <pic:spPr bwMode="auto">
+                    <a:xfrm>
+                      <a:off x="0" y="0"/>
+                      <a:ext cx="5733748" cy="3227793"/>
+                    </a:xfrm>
+                    <a:prstGeom prst="rect">
+                      <a:avLst/>
+                    </a:prstGeom>
+                    <a:noFill/>
+                  </pic:spPr>
+                </pic:pic>
+              </a:graphicData>
+            </a:graphic>
+          </wp:inline>
+        </w:drawing>
+      </w:r>
+    </w:p>
+    <w:p>
+      <w:pPr>
+        <w:pStyle w:val="Caption"/>
+      </w:pPr>
+      <w:bookmarkStart w:id="25" w:name="_Toc227236723"/>
+      <w:r>
+        <w:t xml:space="preserve">Figure </w:t>
+      </w:r>
+      <w:fldSimple w:instr=" SEQ Figure \* ARABIC ">
+        <w:r>
+          <w:rPr>
+            <w:noProof/>
+          </w:rPr>
+          <w:t>1</w:t>
+        </w:r>
+      </w:fldSimple>
+      <w:r>
+        <w:t xml:space="preserve"> </w:t>
+      </w:r>
+      <w:sdt>
+        <w:sdtPr>
+          <w:id w:val="2015028107"/>
+          <w:citation/>
+        </w:sdtPr>
+        <w:sdtContent>
+          <w:r>
+            <w:fldChar w:fldCharType="begin"/>
+          </w:r>
+          <w:r>
+            <w:instrText xml:space="preserve"> CITATION Mur26 \l 2057 </w:instrText>
+          </w:r>
+          <w:r>
+            <w:fldChar w:fldCharType="separate"/>
+          </w:r>
+          <w:r>
+            <w:rPr>
+              <w:noProof/>
+            </w:rPr>
+            <w:t>(Murel &amp; Kavlakoglu, n.d.)</w:t>
+          </w:r>
+          <w:r>
+            <w:fldChar w:fldCharType="end"/>
+          </w:r>
+        </w:sdtContent>
+      </w:sdt>
+      <w:bookmarkEnd w:id="25"/>
+    </w:p>
+    <w:p>
+      <w:r>
+        <w:t>Figure 1 shows a very simple reinforcement learning model in which the agent reads the state of the environment and performs an action, the environment then rewards the agent. The agent’s purpose is to maximize the reward.</w:t>
+      </w:r>
+      <w:r>
+        <w:t xml:space="preserve"> There are 2 types of learning for reinforcement models: “Supervised” and “Unsupervised”. Supervised </w:t>
+      </w:r>
+      <w:r>
+        <w:t>l</w:t>
+      </w:r>
+      <w:r>
+        <w:t xml:space="preserve">earning uses “manually labelled data to produce predictions” </w:t>
+      </w:r>
+      <w:sdt>
+        <w:sdtPr>
+          <w:id w:val="979655841"/>
+          <w:citation/>
+        </w:sdtPr>
+        <w:sdtContent>
+          <w:r>
+            <w:fldChar w:fldCharType="begin"/>
+          </w:r>
+          <w:r>
+            <w:instrText xml:space="preserve"> CITATION Mur26 \l 2057 </w:instrText>
+          </w:r>
+          <w:r>
+            <w:fldChar w:fldCharType="separate"/>
+          </w:r>
+          <w:r>
+            <w:rPr>
+              <w:noProof/>
+            </w:rPr>
+            <w:t>(Murel &amp; Kavlakoglu, n.d.)</w:t>
+          </w:r>
+          <w:r>
+            <w:fldChar w:fldCharType="end"/>
+          </w:r>
+        </w:sdtContent>
+      </w:sdt>
+      <w:r>
+        <w:t xml:space="preserve"> while unsupervised learning “aims to uncover and learn hidden patters from unlabelled data” </w:t>
+      </w:r>
+      <w:sdt>
+        <w:sdtPr>
+          <w:id w:val="-190002740"/>
+          <w:citation/>
+        </w:sdtPr>
+        <w:sdtContent>
+          <w:r>
+            <w:fldChar w:fldCharType="begin"/>
+          </w:r>
+          <w:r>
+            <w:instrText xml:space="preserve"> CITATION Mur26 \l 2057 </w:instrText>
+          </w:r>
+          <w:r>
+            <w:fldChar w:fldCharType="separate"/>
+          </w:r>
+          <w:r>
+            <w:rPr>
+              <w:noProof/>
+            </w:rPr>
+            <w:t>(Murel &amp; Kavlakoglu, n.d.)</w:t>
+          </w:r>
+          <w:r>
+            <w:fldChar w:fldCharType="end"/>
+          </w:r>
+        </w:sdtContent>
+      </w:sdt>
+      <w:r>
+        <w:t>.</w:t>
+      </w:r>
+    </w:p>
+    <w:p>
+      <w:pPr>
         <w:pStyle w:val="Heading4"/>
       </w:pPr>
-      <w:bookmarkStart w:id="25" w:name="_Toc227233439"/>
+      <w:bookmarkStart w:id="26" w:name="_Toc227236474"/>
       <w:r>
         <w:t>2.2.3.3 Imitation Learning</w:t>
       </w:r>
-      <w:bookmarkEnd w:id="25"/>
+      <w:bookmarkEnd w:id="26"/>
     </w:p>
     <w:p/>
-    <w:bookmarkStart w:id="26" w:name="_Toc227233440" w:displacedByCustomXml="next"/>
+    <w:bookmarkStart w:id="27" w:name="_Toc227236475" w:displacedByCustomXml="next"/>
     <w:sdt>
       <w:sdtPr>
         <w:rPr>
@@ -3593,7 +3833,7 @@
           <w:r>
             <w:t>References</w:t>
           </w:r>
-          <w:bookmarkEnd w:id="26"/>
+          <w:bookmarkEnd w:id="27"/>
         </w:p>
         <w:sdt>
           <w:sdtPr>
@@ -3694,6 +3934,56 @@
                   <w:noProof/>
                 </w:rPr>
                 <w:t>Helsinki: s.n.</w:t>
+              </w:r>
+            </w:p>
+            <w:p>
+              <w:pPr>
+                <w:pStyle w:val="Bibliography"/>
+                <w:rPr>
+                  <w:noProof/>
+                </w:rPr>
+              </w:pPr>
+              <w:r>
+                <w:rPr>
+                  <w:noProof/>
+                </w:rPr>
+                <w:lastRenderedPageBreak/>
+                <w:t xml:space="preserve">Murel, J. &amp; Kavlakoglu, E., n.d. </w:t>
+              </w:r>
+              <w:r>
+                <w:rPr>
+                  <w:i/>
+                  <w:iCs/>
+                  <w:noProof/>
+                </w:rPr>
+                <w:t xml:space="preserve">What is reinforcement learning?. </w:t>
+              </w:r>
+              <w:r>
+                <w:rPr>
+                  <w:noProof/>
+                </w:rPr>
+                <w:t xml:space="preserve">[Online] </w:t>
+              </w:r>
+              <w:r>
+                <w:rPr>
+                  <w:noProof/>
+                </w:rPr>
+                <w:br/>
+                <w:t xml:space="preserve">Available at: </w:t>
+              </w:r>
+              <w:r>
+                <w:rPr>
+                  <w:noProof/>
+                  <w:u w:val="single"/>
+                </w:rPr>
+                <w:t>https://www.ibm.com/think/topics/reinforcement-learning</w:t>
+              </w:r>
+              <w:r>
+                <w:rPr>
+                  <w:noProof/>
+                </w:rPr>
+                <w:br/>
+                <w:t>[Accessed 16 April 2026].</w:t>
               </w:r>
             </w:p>
             <w:p>
@@ -5215,7 +5505,6 @@
   <w:style w:type="character" w:default="1" w:styleId="DefaultParagraphFont">
     <w:name w:val="Default Paragraph Font"/>
     <w:uiPriority w:val="1"/>
-    <w:semiHidden/>
     <w:unhideWhenUsed/>
   </w:style>
   <w:style w:type="table" w:default="1" w:styleId="TableNormal">
@@ -5685,6 +5974,75 @@
     <w:unhideWhenUsed/>
     <w:rsid w:val="00A54C5A"/>
   </w:style>
+  <w:style w:type="paragraph" w:styleId="EndnoteText">
+    <w:name w:val="endnote text"/>
+    <w:basedOn w:val="Normal"/>
+    <w:link w:val="EndnoteTextChar"/>
+    <w:uiPriority w:val="99"/>
+    <w:semiHidden/>
+    <w:unhideWhenUsed/>
+    <w:rsid w:val="00192528"/>
+    <w:pPr>
+      <w:spacing w:after="0" w:line="240" w:lineRule="auto"/>
+    </w:pPr>
+    <w:rPr>
+      <w:sz w:val="20"/>
+      <w:szCs w:val="20"/>
+    </w:rPr>
+  </w:style>
+  <w:style w:type="character" w:customStyle="1" w:styleId="EndnoteTextChar">
+    <w:name w:val="Endnote Text Char"/>
+    <w:basedOn w:val="DefaultParagraphFont"/>
+    <w:link w:val="EndnoteText"/>
+    <w:uiPriority w:val="99"/>
+    <w:semiHidden/>
+    <w:rsid w:val="00192528"/>
+    <w:rPr>
+      <w:sz w:val="20"/>
+      <w:szCs w:val="20"/>
+    </w:rPr>
+  </w:style>
+  <w:style w:type="character" w:styleId="EndnoteReference">
+    <w:name w:val="endnote reference"/>
+    <w:basedOn w:val="DefaultParagraphFont"/>
+    <w:uiPriority w:val="99"/>
+    <w:semiHidden/>
+    <w:unhideWhenUsed/>
+    <w:rsid w:val="00192528"/>
+    <w:rPr>
+      <w:vertAlign w:val="superscript"/>
+    </w:rPr>
+  </w:style>
+  <w:style w:type="paragraph" w:styleId="Caption">
+    <w:name w:val="caption"/>
+    <w:basedOn w:val="Normal"/>
+    <w:next w:val="Normal"/>
+    <w:uiPriority w:val="35"/>
+    <w:unhideWhenUsed/>
+    <w:qFormat/>
+    <w:rsid w:val="00DF3DA0"/>
+    <w:pPr>
+      <w:spacing w:after="200" w:line="240" w:lineRule="auto"/>
+    </w:pPr>
+    <w:rPr>
+      <w:i/>
+      <w:iCs/>
+      <w:color w:val="0E2841" w:themeColor="text2"/>
+      <w:sz w:val="18"/>
+      <w:szCs w:val="18"/>
+    </w:rPr>
+  </w:style>
+  <w:style w:type="paragraph" w:styleId="TableofFigures">
+    <w:name w:val="table of figures"/>
+    <w:basedOn w:val="Normal"/>
+    <w:next w:val="Normal"/>
+    <w:uiPriority w:val="99"/>
+    <w:unhideWhenUsed/>
+    <w:rsid w:val="00DF3DA0"/>
+    <w:pPr>
+      <w:spacing w:after="0"/>
+    </w:pPr>
+  </w:style>
 </w:styles>
 </file>
 
@@ -6124,11 +6482,36 @@
     </b:Author>
     <b:RefOrder>4</b:RefOrder>
   </b:Source>
+  <b:Source>
+    <b:Tag>Mur26</b:Tag>
+    <b:SourceType>InternetSite</b:SourceType>
+    <b:Guid>{E7168ECF-A370-4FE2-991A-A9ED88D18A2B}</b:Guid>
+    <b:Title>What is reinforcement learning?</b:Title>
+    <b:YearAccessed>2026</b:YearAccessed>
+    <b:MonthAccessed>April</b:MonthAccessed>
+    <b:DayAccessed>16</b:DayAccessed>
+    <b:URL>https://www.ibm.com/think/topics/reinforcement-learning</b:URL>
+    <b:Author>
+      <b:Author>
+        <b:NameList>
+          <b:Person>
+            <b:Last>Murel</b:Last>
+            <b:First>Jacob</b:First>
+          </b:Person>
+          <b:Person>
+            <b:Last>Kavlakoglu</b:Last>
+            <b:First>Eda</b:First>
+          </b:Person>
+        </b:NameList>
+      </b:Author>
+    </b:Author>
+    <b:RefOrder>5</b:RefOrder>
+  </b:Source>
 </b:Sources>
 </file>
 
 <file path=customXml/itemProps1.xml><?xml version="1.0" encoding="utf-8"?>
-<ds:datastoreItem xmlns:ds="http://schemas.openxmlformats.org/officeDocument/2006/customXml" ds:itemID="{157FEB5F-6CA6-4B0B-A294-D9EAC91C473F}">
+<ds:datastoreItem xmlns:ds="http://schemas.openxmlformats.org/officeDocument/2006/customXml" ds:itemID="{1ACD143F-47F9-4E2D-BCF2-42AD54F59C26}">
   <ds:schemaRefs>
     <ds:schemaRef ds:uri="http://schemas.openxmlformats.org/officeDocument/2006/bibliography"/>
   </ds:schemaRefs>

</xml_diff>

<commit_message>
feat: Comparative Research written
</commit_message>
<xml_diff>
--- a/Report.docx
+++ b/Report.docx
@@ -2607,7 +2607,15 @@
     </w:p>
     <w:p>
       <w:r>
-        <w:t>The objectives in terms of scope for this project are going to be generally quite broad and consist of specific milestones. The core objectives in regards to the scope are:</w:t>
+        <w:t xml:space="preserve">The objectives in terms of scope for this project are going to be generally quite broad and consist of specific milestones. The core objectives </w:t>
+      </w:r>
+      <w:proofErr w:type="gramStart"/>
+      <w:r>
+        <w:t>in regards to</w:t>
+      </w:r>
+      <w:proofErr w:type="gramEnd"/>
+      <w:r>
+        <w:t xml:space="preserve"> the scope are:</w:t>
       </w:r>
     </w:p>
     <w:p>
@@ -2670,7 +2678,15 @@
     </w:p>
     <w:p>
       <w:r>
-        <w:t>For the research objectives for the game, research will be conducted into other types of media with similar features. This research will include a comparison of similar games and their features and the overall impact of those features on this project. This will be done to find a balance for the difficulty of the game and to evaluate the necessary features for the game. Some topics of features and mechanics that will be researched include: World Generation, Pathfinding</w:t>
+        <w:t xml:space="preserve">For the research objectives for the game, research will be conducted into other types of media with similar features. This research will include a comparison of similar games and their features and the overall impact of those features on this project. This will be done to find a balance for the difficulty of the game and to evaluate the necessary features for the game. Some topics of features and mechanics that will be researched </w:t>
+      </w:r>
+      <w:proofErr w:type="gramStart"/>
+      <w:r>
+        <w:t>include:</w:t>
+      </w:r>
+      <w:proofErr w:type="gramEnd"/>
+      <w:r>
+        <w:t xml:space="preserve"> World Generation, Pathfinding</w:t>
       </w:r>
       <w:r>
         <w:t xml:space="preserve"> and </w:t>
@@ -3148,10 +3164,26 @@
     </w:p>
     <w:p>
       <w:r>
-        <w:t>Perlin Noise is used in the majority of world generations due to its versatility.</w:t>
-      </w:r>
-      <w:r>
-        <w:t xml:space="preserve"> It works through the use of layering</w:t>
+        <w:t xml:space="preserve">Perlin Noise is used in </w:t>
+      </w:r>
+      <w:proofErr w:type="gramStart"/>
+      <w:r>
+        <w:t>the majority of</w:t>
+      </w:r>
+      <w:proofErr w:type="gramEnd"/>
+      <w:r>
+        <w:t xml:space="preserve"> world generations due to its versatility.</w:t>
+      </w:r>
+      <w:r>
+        <w:t xml:space="preserve"> It works </w:t>
+      </w:r>
+      <w:proofErr w:type="gramStart"/>
+      <w:r>
+        <w:t>through the use of</w:t>
+      </w:r>
+      <w:proofErr w:type="gramEnd"/>
+      <w:r>
+        <w:t xml:space="preserve"> layering</w:t>
       </w:r>
       <w:r>
         <w:t xml:space="preserve"> </w:t>
@@ -3312,7 +3344,15 @@
         <w:t>)</w:t>
       </w:r>
       <w:r>
-        <w:t xml:space="preserve"> according to the following two rules: If a cell is alive, it survives to the next generation if it has 2 or 3 live neighbors; otherwise it dies. If a cell is dead, it comes to life in the next generation if it has exactly 3 live neighbors; otherwise it stays dead.” </w:t>
+        <w:t xml:space="preserve"> according to the following two rules: If a cell is alive, it survives to the next generation if it has 2 or 3 live neighbors; otherwise it dies. If a cell is dead, it comes to life in the next generation if it has exactly 3 live neighbors; </w:t>
+      </w:r>
+      <w:proofErr w:type="gramStart"/>
+      <w:r>
+        <w:t>otherwise</w:t>
+      </w:r>
+      <w:proofErr w:type="gramEnd"/>
+      <w:r>
+        <w:t xml:space="preserve"> it stays dead.” </w:t>
       </w:r>
       <w:sdt>
         <w:sdtPr>
@@ -3394,7 +3434,15 @@
         <w:t xml:space="preserve"> </w:t>
       </w:r>
       <w:r>
-        <w:t>The types of pathfinding I will be evaluating are: A*, Dijkstra</w:t>
+        <w:t xml:space="preserve">The types of pathfinding I will be evaluating </w:t>
+      </w:r>
+      <w:proofErr w:type="gramStart"/>
+      <w:r>
+        <w:t>are:</w:t>
+      </w:r>
+      <w:proofErr w:type="gramEnd"/>
+      <w:r>
+        <w:t xml:space="preserve"> A*, Dijkstra</w:t>
       </w:r>
       <w:r>
         <w:t>,</w:t>
@@ -3437,7 +3485,15 @@
     </w:p>
     <w:p>
       <w:r>
-        <w:t>A* is an algorithm that shares the same approach as Dijkstra, although it is more efficient. In order to be more efficient, the algorithm “combines Dijkstra’s algorithm with a case-specific heuristic value”</w:t>
+        <w:t xml:space="preserve">A* is an algorithm that shares the same approach as Dijkstra, although it is more efficient. </w:t>
+      </w:r>
+      <w:proofErr w:type="gramStart"/>
+      <w:r>
+        <w:t>In order to</w:t>
+      </w:r>
+      <w:proofErr w:type="gramEnd"/>
+      <w:r>
+        <w:t xml:space="preserve"> be more efficient, the algorithm “combines Dijkstra’s algorithm with a case-specific heuristic value”</w:t>
       </w:r>
       <w:r>
         <w:t xml:space="preserve"> </w:t>
@@ -3471,9 +3527,11 @@
       <w:r>
         <w:t xml:space="preserve">. This is always guaranteed to find the shortest path and the heuristic value allows the algorithm to disregard paths that lead away from the destination, allowing for major optimizations </w:t>
       </w:r>
+      <w:proofErr w:type="gramStart"/>
       <w:r>
         <w:t>in regard to</w:t>
       </w:r>
+      <w:proofErr w:type="gramEnd"/>
       <w:r>
         <w:t xml:space="preserve"> the computation speed of the algorithm. </w:t>
       </w:r>
@@ -3522,7 +3580,15 @@
         <w:t xml:space="preserve">, JPS serves as a substantial optimization through the use of “pruning” unnecessary nodes and “jumping over” empty spaces. Disregarding the </w:t>
       </w:r>
       <w:r>
-        <w:t>path cost calculations along with the aforementioned optimizations allows JPS to be significantly faster than A*, even up to an order of magnitude faster.</w:t>
+        <w:t xml:space="preserve">path cost calculations along with the </w:t>
+      </w:r>
+      <w:proofErr w:type="gramStart"/>
+      <w:r>
+        <w:t>aforementioned optimizations</w:t>
+      </w:r>
+      <w:proofErr w:type="gramEnd"/>
+      <w:r>
+        <w:t xml:space="preserve"> allows JPS to be significantly faster than A*, even up to an order of magnitude faster.</w:t>
       </w:r>
     </w:p>
     <w:p>
@@ -3709,7 +3775,7 @@
             <w:fldChar w:fldCharType="begin"/>
           </w:r>
           <w:r>
-            <w:instrText xml:space="preserve"> CITATION Mur26 \l 2057 </w:instrText>
+            <w:instrText xml:space="preserve">CITATION Mur26 \l 2057 </w:instrText>
           </w:r>
           <w:r>
             <w:fldChar w:fldCharType="separate"/>
@@ -3718,7 +3784,7 @@
             <w:rPr>
               <w:noProof/>
             </w:rPr>
-            <w:t>(Murel &amp; Kavlakoglu, n.d.)</w:t>
+            <w:t>(Murel &amp; Kavlakoglu, 2024)</w:t>
           </w:r>
           <w:r>
             <w:fldChar w:fldCharType="end"/>
@@ -3750,7 +3816,7 @@
             <w:fldChar w:fldCharType="begin"/>
           </w:r>
           <w:r>
-            <w:instrText xml:space="preserve"> CITATION Mur26 \l 2057 </w:instrText>
+            <w:instrText xml:space="preserve">CITATION Mur26 \l 2057 </w:instrText>
           </w:r>
           <w:r>
             <w:fldChar w:fldCharType="separate"/>
@@ -3759,7 +3825,7 @@
             <w:rPr>
               <w:noProof/>
             </w:rPr>
-            <w:t>(Murel &amp; Kavlakoglu, n.d.)</w:t>
+            <w:t>(Murel &amp; Kavlakoglu, 2024)</w:t>
           </w:r>
           <w:r>
             <w:fldChar w:fldCharType="end"/>
@@ -3779,7 +3845,7 @@
             <w:fldChar w:fldCharType="begin"/>
           </w:r>
           <w:r>
-            <w:instrText xml:space="preserve"> CITATION Mur26 \l 2057 </w:instrText>
+            <w:instrText xml:space="preserve">CITATION Mur26 \l 2057 </w:instrText>
           </w:r>
           <w:r>
             <w:fldChar w:fldCharType="separate"/>
@@ -3788,7 +3854,7 @@
             <w:rPr>
               <w:noProof/>
             </w:rPr>
-            <w:t>(Murel &amp; Kavlakoglu, n.d.)</w:t>
+            <w:t>(Murel &amp; Kavlakoglu, 2024)</w:t>
           </w:r>
           <w:r>
             <w:fldChar w:fldCharType="end"/>
@@ -3809,7 +3875,129 @@
       </w:r>
       <w:bookmarkEnd w:id="26"/>
     </w:p>
-    <w:p/>
+    <w:p>
+      <w:r>
+        <w:t xml:space="preserve">Imitation learning, or IL, is a technique where an agent learns to perform tasks by mimicking expert demonstrations, which are often human, rather than relying on rewards. The simplest approach to IL is Behavioural Cloning, this uses </w:t>
+      </w:r>
+      <w:r>
+        <w:t>“</w:t>
+      </w:r>
+      <w:r>
+        <w:t>supervised learning to predict the expert’s action for any given state</w:t>
+      </w:r>
+      <w:r>
+        <w:t>”</w:t>
+      </w:r>
+      <w:r>
+        <w:t xml:space="preserve">  </w:t>
+      </w:r>
+      <w:sdt>
+        <w:sdtPr>
+          <w:id w:val="624661446"/>
+          <w:citation/>
+        </w:sdtPr>
+        <w:sdtContent>
+          <w:r>
+            <w:fldChar w:fldCharType="begin"/>
+          </w:r>
+          <w:r>
+            <w:instrText xml:space="preserve">CITATION Ors21 \l 2057 </w:instrText>
+          </w:r>
+          <w:r>
+            <w:fldChar w:fldCharType="separate"/>
+          </w:r>
+          <w:r>
+            <w:rPr>
+              <w:noProof/>
+            </w:rPr>
+            <w:t>(Orsini, et al., 2021)</w:t>
+          </w:r>
+          <w:r>
+            <w:fldChar w:fldCharType="end"/>
+          </w:r>
+        </w:sdtContent>
+      </w:sdt>
+      <w:r>
+        <w:t xml:space="preserve">. Behavioural Cloning is often unreliable as prediction errors compound extremely quickly. </w:t>
+      </w:r>
+      <w:r>
+        <w:br/>
+      </w:r>
+      <w:r>
+        <w:br/>
+      </w:r>
+      <w:r>
+        <w:t xml:space="preserve">Adversarial Imitation Learning aims to “remedy this using inspiration from Generative Adversarial Networks and Inverse RL” </w:t>
+      </w:r>
+      <w:sdt>
+        <w:sdtPr>
+          <w:id w:val="-1454938235"/>
+          <w:citation/>
+        </w:sdtPr>
+        <w:sdtContent>
+          <w:r>
+            <w:fldChar w:fldCharType="begin"/>
+          </w:r>
+          <w:r>
+            <w:instrText xml:space="preserve"> CITATION Ors21 \l 2057 </w:instrText>
+          </w:r>
+          <w:r>
+            <w:fldChar w:fldCharType="separate"/>
+          </w:r>
+          <w:r>
+            <w:rPr>
+              <w:noProof/>
+            </w:rPr>
+            <w:t>(Orsini, et al., 2021)</w:t>
+          </w:r>
+          <w:r>
+            <w:fldChar w:fldCharType="end"/>
+          </w:r>
+        </w:sdtContent>
+      </w:sdt>
+      <w:r>
+        <w:t xml:space="preserve">. Generative Adversarial </w:t>
+      </w:r>
+      <w:r>
+        <w:lastRenderedPageBreak/>
+        <w:t xml:space="preserve">Networks are a machine learning framework where two neural networks, a generator and a discriminator, compete against each other in a zero-sum game to create realistic albeit synthetic data. </w:t>
+      </w:r>
+      <w:r>
+        <w:t xml:space="preserve">Inverse RL is a technique that gives a reward based on behaviour rather than having a condition be met. </w:t>
+      </w:r>
+      <w:r>
+        <w:t xml:space="preserve">“The policy is trained to generate trajectories that are indistinguishable from the expert’s ones” </w:t>
+      </w:r>
+      <w:sdt>
+        <w:sdtPr>
+          <w:id w:val="-1955019050"/>
+          <w:citation/>
+        </w:sdtPr>
+        <w:sdtContent>
+          <w:r>
+            <w:fldChar w:fldCharType="begin"/>
+          </w:r>
+          <w:r>
+            <w:instrText xml:space="preserve"> CITATION Ors21 \l 2057 </w:instrText>
+          </w:r>
+          <w:r>
+            <w:fldChar w:fldCharType="separate"/>
+          </w:r>
+          <w:r>
+            <w:rPr>
+              <w:noProof/>
+            </w:rPr>
+            <w:t>(Orsini, et al., 2021)</w:t>
+          </w:r>
+          <w:r>
+            <w:fldChar w:fldCharType="end"/>
+          </w:r>
+        </w:sdtContent>
+      </w:sdt>
+      <w:r>
+        <w:t>.</w:t>
+      </w:r>
+    </w:p>
     <w:bookmarkStart w:id="27" w:name="_Toc227236475" w:displacedByCustomXml="next"/>
     <w:sdt>
       <w:sdtPr>
@@ -3947,8 +4135,7 @@
                 <w:rPr>
                   <w:noProof/>
                 </w:rPr>
-                <w:lastRenderedPageBreak/>
-                <w:t xml:space="preserve">Murel, J. &amp; Kavlakoglu, E., n.d. </w:t>
+                <w:t xml:space="preserve">Murel, J. &amp; Kavlakoglu, E., 2024. </w:t>
               </w:r>
               <w:r>
                 <w:rPr>
@@ -3984,6 +4171,34 @@
                 </w:rPr>
                 <w:br/>
                 <w:t>[Accessed 16 April 2026].</w:t>
+              </w:r>
+            </w:p>
+            <w:p>
+              <w:pPr>
+                <w:pStyle w:val="Bibliography"/>
+                <w:rPr>
+                  <w:noProof/>
+                </w:rPr>
+              </w:pPr>
+              <w:r>
+                <w:rPr>
+                  <w:noProof/>
+                </w:rPr>
+                <w:t xml:space="preserve">Orsini, M. et al., 2021. </w:t>
+              </w:r>
+              <w:r>
+                <w:rPr>
+                  <w:i/>
+                  <w:iCs/>
+                  <w:noProof/>
+                </w:rPr>
+                <w:t xml:space="preserve">What Matters for Adversarial Imitation Learning?, </w:t>
+              </w:r>
+              <w:r>
+                <w:rPr>
+                  <w:noProof/>
+                </w:rPr>
+                <w:t>s.l.: Google Research, Brain Team.</w:t>
               </w:r>
             </w:p>
             <w:p>
@@ -6485,7 +6700,7 @@
   <b:Source>
     <b:Tag>Mur26</b:Tag>
     <b:SourceType>InternetSite</b:SourceType>
-    <b:Guid>{E7168ECF-A370-4FE2-991A-A9ED88D18A2B}</b:Guid>
+    <b:Guid>{FD14B1B6-B236-433E-9B48-9D0B3671F067}</b:Guid>
     <b:Title>What is reinforcement learning?</b:Title>
     <b:YearAccessed>2026</b:YearAccessed>
     <b:MonthAccessed>April</b:MonthAccessed>
@@ -6505,13 +6720,65 @@
         </b:NameList>
       </b:Author>
     </b:Author>
+    <b:Year>2024</b:Year>
     <b:RefOrder>5</b:RefOrder>
+  </b:Source>
+  <b:Source>
+    <b:Tag>Ors21</b:Tag>
+    <b:SourceType>Report</b:SourceType>
+    <b:Guid>{7C8D9BA9-FD60-4B9D-8CAB-9DCF99FF6EF6}</b:Guid>
+    <b:Title>What Matters for Adversarial Imitation Learning?</b:Title>
+    <b:Year>2021</b:Year>
+    <b:Publisher>Google Research, Brain Team</b:Publisher>
+    <b:Author>
+      <b:Author>
+        <b:NameList>
+          <b:Person>
+            <b:Last>Orsini</b:Last>
+            <b:First>Manu</b:First>
+          </b:Person>
+          <b:Person>
+            <b:Last>Raichuk</b:Last>
+            <b:First>Anton</b:First>
+          </b:Person>
+          <b:Person>
+            <b:Last>Hussenot</b:Last>
+            <b:First>Léonard</b:First>
+          </b:Person>
+          <b:Person>
+            <b:Last>Vincent</b:Last>
+            <b:First>Damien</b:First>
+          </b:Person>
+          <b:Person>
+            <b:Last>Dadashi</b:Last>
+            <b:First>Robert</b:First>
+          </b:Person>
+          <b:Person>
+            <b:Last>Girgin</b:Last>
+            <b:First>Sertan</b:First>
+          </b:Person>
+          <b:Person>
+            <b:Last>Geist</b:Last>
+            <b:First>Matthieu</b:First>
+          </b:Person>
+          <b:Person>
+            <b:Last>Bachem</b:Last>
+            <b:First>Olivier</b:First>
+          </b:Person>
+          <b:Person>
+            <b:Last>Andrychowicz</b:Last>
+            <b:First>Marcin</b:First>
+          </b:Person>
+        </b:NameList>
+      </b:Author>
+    </b:Author>
+    <b:RefOrder>6</b:RefOrder>
   </b:Source>
 </b:Sources>
 </file>
 
 <file path=customXml/itemProps1.xml><?xml version="1.0" encoding="utf-8"?>
-<ds:datastoreItem xmlns:ds="http://schemas.openxmlformats.org/officeDocument/2006/customXml" ds:itemID="{1ACD143F-47F9-4E2D-BCF2-42AD54F59C26}">
+<ds:datastoreItem xmlns:ds="http://schemas.openxmlformats.org/officeDocument/2006/customXml" ds:itemID="{2309FDCD-826E-4F39-A8C4-4415CA334F2C}">
   <ds:schemaRefs>
     <ds:schemaRef ds:uri="http://schemas.openxmlformats.org/officeDocument/2006/bibliography"/>
   </ds:schemaRefs>

</xml_diff>

<commit_message>
feat: added figures to Perlin Noise and Dijkstra research and wrote a little bit about them. Formatted the report to reflect the template from moodle.
</commit_message>
<xml_diff>
--- a/Report.docx
+++ b/Report.docx
@@ -4,20 +4,21 @@
   <w:body>
     <w:p>
       <w:pPr>
-        <w:ind w:left="3600"/>
+        <w:spacing w:after="89" w:line="259" w:lineRule="auto"/>
+        <w:ind w:left="174"/>
+        <w:jc w:val="center"/>
         <w:rPr>
-          <w:sz w:val="36"/>
-          <w:szCs w:val="36"/>
+          <w:rFonts w:cs="Calibri"/>
+        </w:rPr>
+      </w:pPr>
+      <w:r>
+        <w:rPr>
+          <w:rFonts w:cs="Calibri"/>
+          <w:sz w:val="50"/>
+          <w:szCs w:val="50"/>
           <w:u w:val="single"/>
         </w:rPr>
-      </w:pPr>
-      <w:r>
-        <w:rPr>
-          <w:sz w:val="36"/>
-          <w:szCs w:val="36"/>
-          <w:u w:val="single"/>
-        </w:rPr>
-        <w:t>Intro Page</w:t>
+        <w:t>INSERT TITLE HERE</w:t>
       </w:r>
       <w:r>
         <w:rPr>
@@ -53,11 +54,208 @@
       </w:r>
       <w:r>
         <w:rPr>
+          <w:rFonts w:cs="Calibri"/>
+        </w:rPr>
+        <w:t xml:space="preserve">A </w:t>
+      </w:r>
+      <w:r>
+        <w:rPr>
+          <w:rFonts w:cs="Calibri"/>
+          <w:sz w:val="19"/>
+        </w:rPr>
+        <w:t xml:space="preserve">DISSERTATION SUBMITTED TO </w:t>
+      </w:r>
+      <w:r>
+        <w:rPr>
+          <w:rFonts w:cs="Calibri"/>
+        </w:rPr>
+        <w:t>M</w:t>
+      </w:r>
+      <w:r>
+        <w:rPr>
+          <w:rFonts w:cs="Calibri"/>
+          <w:sz w:val="19"/>
+        </w:rPr>
+        <w:t xml:space="preserve">ANCHESTER </w:t>
+      </w:r>
+      <w:r>
+        <w:rPr>
+          <w:rFonts w:cs="Calibri"/>
+        </w:rPr>
+        <w:t>M</w:t>
+      </w:r>
+      <w:r>
+        <w:rPr>
+          <w:rFonts w:cs="Calibri"/>
+          <w:sz w:val="19"/>
+        </w:rPr>
+        <w:t xml:space="preserve">ETROPOLITAN </w:t>
+      </w:r>
+      <w:r>
+        <w:rPr>
+          <w:rFonts w:cs="Calibri"/>
+        </w:rPr>
+        <w:t>U</w:t>
+      </w:r>
+      <w:r>
+        <w:rPr>
+          <w:rFonts w:cs="Calibri"/>
+          <w:sz w:val="19"/>
+        </w:rPr>
+        <w:t>NIVERSITY</w:t>
+      </w:r>
+    </w:p>
+    <w:p>
+      <w:pPr>
+        <w:spacing w:after="78" w:line="265" w:lineRule="auto"/>
+        <w:jc w:val="center"/>
+        <w:rPr>
+          <w:rFonts w:cs="Calibri"/>
+        </w:rPr>
+      </w:pPr>
+      <w:r>
+        <w:rPr>
+          <w:rFonts w:cs="Calibri"/>
+          <w:sz w:val="19"/>
+        </w:rPr>
+        <w:t xml:space="preserve">FOR THE DEGREE OF </w:t>
+      </w:r>
+      <w:r>
+        <w:rPr>
+          <w:rFonts w:cs="Calibri"/>
+        </w:rPr>
+        <w:t>M</w:t>
+      </w:r>
+      <w:r>
+        <w:rPr>
+          <w:rFonts w:cs="Calibri"/>
+          <w:sz w:val="19"/>
+        </w:rPr>
+        <w:t xml:space="preserve">ASTER OF </w:t>
+      </w:r>
+      <w:r>
+        <w:rPr>
+          <w:rFonts w:cs="Calibri"/>
+        </w:rPr>
+        <w:t>S</w:t>
+      </w:r>
+      <w:r>
+        <w:rPr>
+          <w:rFonts w:cs="Calibri"/>
+          <w:sz w:val="19"/>
+        </w:rPr>
+        <w:t>CIENCE</w:t>
+      </w:r>
+    </w:p>
+    <w:p>
+      <w:pPr>
+        <w:spacing w:after="739" w:line="265" w:lineRule="auto"/>
+        <w:jc w:val="center"/>
+        <w:rPr>
+          <w:rFonts w:cs="Calibri"/>
+          <w:sz w:val="19"/>
+        </w:rPr>
+      </w:pPr>
+      <w:r>
+        <w:rPr>
+          <w:rFonts w:cs="Calibri"/>
+          <w:sz w:val="19"/>
+        </w:rPr>
+        <w:t xml:space="preserve">IN THE </w:t>
+      </w:r>
+      <w:r>
+        <w:rPr>
+          <w:rFonts w:cs="Calibri"/>
+        </w:rPr>
+        <w:t>F</w:t>
+      </w:r>
+      <w:r>
+        <w:rPr>
+          <w:rFonts w:cs="Calibri"/>
+          <w:sz w:val="19"/>
+        </w:rPr>
+        <w:t xml:space="preserve">ACULTY OF </w:t>
+      </w:r>
+      <w:r>
+        <w:rPr>
+          <w:rFonts w:cs="Calibri"/>
+        </w:rPr>
+        <w:t>S</w:t>
+      </w:r>
+      <w:r>
+        <w:rPr>
+          <w:rFonts w:cs="Calibri"/>
+          <w:sz w:val="19"/>
+        </w:rPr>
+        <w:t xml:space="preserve">CIENCE AND </w:t>
+      </w:r>
+      <w:r>
+        <w:rPr>
+          <w:rFonts w:cs="Calibri"/>
+        </w:rPr>
+        <w:t>E</w:t>
+      </w:r>
+      <w:r>
+        <w:rPr>
+          <w:rFonts w:cs="Calibri"/>
+          <w:sz w:val="19"/>
+        </w:rPr>
+        <w:t>NGINEERING</w:t>
+      </w:r>
+    </w:p>
+    <w:p>
+      <w:pPr>
+        <w:spacing w:after="739" w:line="265" w:lineRule="auto"/>
+        <w:jc w:val="center"/>
+        <w:rPr>
           <w:sz w:val="36"/>
           <w:szCs w:val="36"/>
           <w:u w:val="single"/>
         </w:rPr>
-        <w:br/>
+      </w:pPr>
+      <w:r>
+        <w:rPr>
+          <w:noProof/>
+        </w:rPr>
+        <w:drawing>
+          <wp:inline distT="0" distB="0" distL="0" distR="0" wp14:anchorId="5A9D299F" wp14:editId="5526855E">
+            <wp:extent cx="2087880" cy="2077720"/>
+            <wp:effectExtent l="0" t="0" r="7620" b="0"/>
+            <wp:docPr id="28" name="Picture 28"/>
+            <wp:cNvGraphicFramePr/>
+            <a:graphic xmlns:a="http://schemas.openxmlformats.org/drawingml/2006/main">
+              <a:graphicData uri="http://schemas.openxmlformats.org/drawingml/2006/picture">
+                <pic:pic xmlns:pic="http://schemas.openxmlformats.org/drawingml/2006/picture">
+                  <pic:nvPicPr>
+                    <pic:cNvPr id="28" name="Picture 28"/>
+                    <pic:cNvPicPr/>
+                  </pic:nvPicPr>
+                  <pic:blipFill>
+                    <a:blip r:embed="rId8" cstate="print">
+                      <a:extLst>
+                        <a:ext uri="{28A0092B-C50C-407E-A947-70E740481C1C}">
+                          <a14:useLocalDpi xmlns:a14="http://schemas.microsoft.com/office/drawing/2010/main" val="0"/>
+                        </a:ext>
+                      </a:extLst>
+                    </a:blip>
+                    <a:stretch>
+                      <a:fillRect/>
+                    </a:stretch>
+                  </pic:blipFill>
+                  <pic:spPr>
+                    <a:xfrm>
+                      <a:off x="0" y="0"/>
+                      <a:ext cx="2087880" cy="2077720"/>
+                    </a:xfrm>
+                    <a:prstGeom prst="rect">
+                      <a:avLst/>
+                    </a:prstGeom>
+                  </pic:spPr>
+                </pic:pic>
+              </a:graphicData>
+            </a:graphic>
+          </wp:inline>
+        </w:drawing>
       </w:r>
       <w:r>
         <w:rPr>
@@ -71,9 +269,14 @@
         <w:rPr>
           <w:sz w:val="36"/>
           <w:szCs w:val="36"/>
-          <w:u w:val="single"/>
         </w:rPr>
         <w:br/>
+      </w:r>
+      <w:r>
+        <w:rPr>
+          <w:rFonts w:cs="Calibri"/>
+        </w:rPr>
+        <w:t>2026</w:t>
       </w:r>
       <w:r>
         <w:rPr>
@@ -83,157 +286,353 @@
         </w:rPr>
         <w:br/>
       </w:r>
-      <w:r>
-        <w:rPr>
-          <w:sz w:val="36"/>
-          <w:szCs w:val="36"/>
-          <w:u w:val="single"/>
-        </w:rPr>
+    </w:p>
+    <w:p>
+      <w:pPr>
+        <w:jc w:val="center"/>
+      </w:pPr>
+      <w:r>
+        <w:t>By</w:t>
+      </w:r>
+      <w:r>
         <w:br/>
-      </w:r>
-      <w:r>
-        <w:rPr>
-          <w:sz w:val="36"/>
-          <w:szCs w:val="36"/>
-          <w:u w:val="single"/>
-        </w:rPr>
+        <w:t>Daniel Cleaver</w:t>
+      </w:r>
+      <w:r>
         <w:br/>
-      </w:r>
-      <w:r>
-        <w:rPr>
-          <w:sz w:val="36"/>
-          <w:szCs w:val="36"/>
-          <w:u w:val="single"/>
-        </w:rPr>
+        <w:t>Department of Computing and Mathematics</w:t>
+      </w:r>
+    </w:p>
+    <w:p>
+      <w:r>
         <w:br/>
       </w:r>
       <w:r>
-        <w:rPr>
-          <w:sz w:val="36"/>
-          <w:szCs w:val="36"/>
-          <w:u w:val="single"/>
-        </w:rPr>
         <w:br/>
       </w:r>
-      <w:r>
-        <w:rPr>
-          <w:sz w:val="36"/>
-          <w:szCs w:val="36"/>
-          <w:u w:val="single"/>
-        </w:rPr>
-        <w:br/>
-      </w:r>
-      <w:r>
-        <w:rPr>
-          <w:sz w:val="36"/>
-          <w:szCs w:val="36"/>
-          <w:u w:val="single"/>
-        </w:rPr>
-        <w:br/>
-      </w:r>
-      <w:r>
-        <w:rPr>
-          <w:sz w:val="36"/>
-          <w:szCs w:val="36"/>
-          <w:u w:val="single"/>
-        </w:rPr>
-        <w:br/>
-      </w:r>
-      <w:r>
-        <w:rPr>
-          <w:sz w:val="36"/>
-          <w:szCs w:val="36"/>
-          <w:u w:val="single"/>
-        </w:rPr>
-        <w:br/>
-      </w:r>
-      <w:r>
-        <w:rPr>
-          <w:sz w:val="36"/>
-          <w:szCs w:val="36"/>
-          <w:u w:val="single"/>
-        </w:rPr>
-        <w:br/>
-      </w:r>
-      <w:r>
-        <w:rPr>
-          <w:sz w:val="36"/>
-          <w:szCs w:val="36"/>
-          <w:u w:val="single"/>
-        </w:rPr>
-        <w:br/>
-      </w:r>
-      <w:r>
-        <w:rPr>
-          <w:sz w:val="36"/>
-          <w:szCs w:val="36"/>
-          <w:u w:val="single"/>
-        </w:rPr>
-        <w:br/>
-      </w:r>
-      <w:r>
-        <w:rPr>
-          <w:sz w:val="36"/>
-          <w:szCs w:val="36"/>
-          <w:u w:val="single"/>
-        </w:rPr>
-        <w:br/>
-      </w:r>
-      <w:r>
-        <w:rPr>
-          <w:sz w:val="36"/>
-          <w:szCs w:val="36"/>
-          <w:u w:val="single"/>
-        </w:rPr>
-        <w:br/>
-      </w:r>
-    </w:p>
-    <w:p>
-      <w:pPr>
-        <w:rPr>
-          <w:sz w:val="36"/>
-          <w:szCs w:val="36"/>
-          <w:u w:val="single"/>
-        </w:rPr>
-      </w:pPr>
-    </w:p>
-    <w:p>
-      <w:pPr>
-        <w:rPr>
-          <w:sz w:val="36"/>
-          <w:szCs w:val="36"/>
-          <w:u w:val="single"/>
-        </w:rPr>
-      </w:pPr>
-    </w:p>
-    <w:p>
-      <w:pPr>
-        <w:rPr>
-          <w:sz w:val="36"/>
-          <w:szCs w:val="36"/>
-          <w:u w:val="single"/>
-        </w:rPr>
-      </w:pPr>
-    </w:p>
-    <w:p>
-      <w:pPr>
-        <w:rPr>
-          <w:sz w:val="36"/>
-          <w:szCs w:val="36"/>
-          <w:u w:val="single"/>
-        </w:rPr>
-      </w:pPr>
-    </w:p>
+      <w:bookmarkStart w:id="0" w:name="_Toc40899000"/>
+    </w:p>
+    <w:p/>
+    <w:p/>
+    <w:p/>
+    <w:p/>
+    <w:p>
+      <w:pPr>
+        <w:pStyle w:val="Heading1"/>
+      </w:pPr>
+      <w:bookmarkStart w:id="1" w:name="_Toc40898999"/>
+      <w:bookmarkStart w:id="2" w:name="_Toc227404760"/>
+      <w:r>
+        <w:lastRenderedPageBreak/>
+        <w:t>Abstract</w:t>
+      </w:r>
+      <w:bookmarkEnd w:id="1"/>
+      <w:bookmarkEnd w:id="2"/>
+    </w:p>
+    <w:p>
+      <w:r>
+        <w:t xml:space="preserve">AI is a still growing industry and while the current trend of AI is heading towards the usage of Large Language Models, I believe there is a genuine use case for machine learning models within video games. The focus of this project is to uncover the current reasons behind why the industry doesn’t use machine learning AI for uses such as </w:t>
+      </w:r>
+      <w:proofErr w:type="gramStart"/>
+      <w:r>
+        <w:t>Non-Player Characters</w:t>
+      </w:r>
+      <w:proofErr w:type="gramEnd"/>
+      <w:r>
+        <w:t xml:space="preserve"> or local multiplayer games. This is appro</w:t>
+      </w:r>
+      <w:r>
+        <w:t>ached by covering the design choices and code architecture of implementing a machine learning model into the Unity game engine. To evaluate whether the AI is functional, data has been gathered using a mix of qualitative and quantitative research. This research was collected through a short survey given to participants.</w:t>
+      </w:r>
+    </w:p>
+    <w:p/>
+    <w:p/>
+    <w:p/>
+    <w:p/>
+    <w:p/>
+    <w:p/>
+    <w:p/>
+    <w:p/>
+    <w:p/>
+    <w:p/>
+    <w:p/>
+    <w:p/>
+    <w:p/>
+    <w:p/>
+    <w:p/>
+    <w:p/>
+    <w:p/>
+    <w:p/>
+    <w:p>
+      <w:pPr>
+        <w:pStyle w:val="Heading1"/>
+        <w:spacing w:after="321"/>
+        <w:ind w:left="-5"/>
+      </w:pPr>
+      <w:bookmarkStart w:id="3" w:name="_Toc227404761"/>
+      <w:r>
+        <w:lastRenderedPageBreak/>
+        <w:t>Declaration</w:t>
+      </w:r>
+      <w:bookmarkEnd w:id="0"/>
+      <w:bookmarkEnd w:id="3"/>
+    </w:p>
+    <w:p>
+      <w:pPr>
+        <w:spacing w:after="1695"/>
+        <w:ind w:left="1240" w:right="1230"/>
+      </w:pPr>
+      <w:r>
+        <w:t xml:space="preserve">No part of this project has been submitted in support of an application for any other degree or qualification at this or any other institute of learning. Apart from those parts of the project containing citations to the work of others, this project is my own unaided work. This work has been carried out in accordance with the Manchester Metropolitan University research ethics procedures, and has received ethical approval number </w:t>
+      </w:r>
+      <w:r>
+        <w:t>88111</w:t>
+      </w:r>
+      <w:r>
+        <w:t>.</w:t>
+      </w:r>
+    </w:p>
+    <w:p>
+      <w:pPr>
+        <w:spacing w:after="1136"/>
+        <w:ind w:left="1240" w:right="14"/>
+      </w:pPr>
+      <w:r>
+        <w:t>Signed:</w:t>
+      </w:r>
+      <w:r>
+        <w:t xml:space="preserve"> Daniel Cleaver</w:t>
+      </w:r>
+    </w:p>
+    <w:p>
+      <w:pPr>
+        <w:ind w:left="1240" w:right="14"/>
+      </w:pPr>
+      <w:r>
+        <w:t>Date:</w:t>
+      </w:r>
+      <w:r>
+        <w:t xml:space="preserve"> 08/05/2026</w:t>
+      </w:r>
+    </w:p>
+    <w:p>
+      <w:pPr>
+        <w:ind w:left="1240" w:right="14"/>
+      </w:pPr>
+    </w:p>
+    <w:p>
+      <w:pPr>
+        <w:ind w:left="1240" w:right="14"/>
+      </w:pPr>
+    </w:p>
+    <w:p>
+      <w:pPr>
+        <w:ind w:left="1240" w:right="14"/>
+      </w:pPr>
+    </w:p>
+    <w:p>
+      <w:pPr>
+        <w:ind w:left="1240" w:right="14"/>
+      </w:pPr>
+    </w:p>
+    <w:p>
+      <w:pPr>
+        <w:ind w:left="1240" w:right="14"/>
+      </w:pPr>
+    </w:p>
+    <w:p>
+      <w:pPr>
+        <w:ind w:left="1240" w:right="14"/>
+      </w:pPr>
+    </w:p>
+    <w:p>
+      <w:pPr>
+        <w:ind w:left="1240" w:right="14"/>
+      </w:pPr>
+    </w:p>
+    <w:p>
+      <w:pPr>
+        <w:ind w:left="1240" w:right="14"/>
+      </w:pPr>
+    </w:p>
+    <w:p>
+      <w:pPr>
+        <w:ind w:left="1240" w:right="14"/>
+      </w:pPr>
+    </w:p>
+    <w:p>
+      <w:pPr>
+        <w:ind w:left="1240" w:right="14"/>
+      </w:pPr>
+    </w:p>
+    <w:p>
+      <w:pPr>
+        <w:ind w:left="1240" w:right="14"/>
+      </w:pPr>
+    </w:p>
+    <w:p>
+      <w:pPr>
+        <w:ind w:left="1240" w:right="14"/>
+      </w:pPr>
+    </w:p>
+    <w:p>
+      <w:pPr>
+        <w:ind w:left="1240" w:right="14"/>
+      </w:pPr>
+    </w:p>
+    <w:p>
+      <w:pPr>
+        <w:ind w:left="1240" w:right="14"/>
+      </w:pPr>
+    </w:p>
+    <w:p>
+      <w:pPr>
+        <w:pStyle w:val="Heading1"/>
+        <w:ind w:left="-5"/>
+      </w:pPr>
+      <w:bookmarkStart w:id="4" w:name="_Toc40899001"/>
+      <w:bookmarkStart w:id="5" w:name="_Toc227404762"/>
+      <w:r>
+        <w:lastRenderedPageBreak/>
+        <w:t>Acknowledgements</w:t>
+      </w:r>
+      <w:bookmarkEnd w:id="4"/>
+      <w:bookmarkEnd w:id="5"/>
+    </w:p>
+    <w:p>
+      <w:pPr>
+        <w:ind w:left="1240" w:right="14"/>
+      </w:pPr>
+      <w:r>
+        <w:t>I would like to thank my supervisor Matthew Crossley, and tutor Jimmy Mullin for their advice, support and guidance towards the development of **insert name here**.</w:t>
+      </w:r>
+      <w:r>
+        <w:t xml:space="preserve"> I would also like to thank my family and friends for their support and encouragement throughout the development of this game and the write up of this dissertation.</w:t>
+      </w:r>
+    </w:p>
+    <w:p>
+      <w:pPr>
+        <w:spacing w:line="259" w:lineRule="auto"/>
+      </w:pPr>
+    </w:p>
+    <w:p>
+      <w:pPr>
+        <w:spacing w:line="259" w:lineRule="auto"/>
+      </w:pPr>
+    </w:p>
+    <w:p>
+      <w:pPr>
+        <w:spacing w:line="259" w:lineRule="auto"/>
+      </w:pPr>
+    </w:p>
+    <w:p>
+      <w:pPr>
+        <w:spacing w:line="259" w:lineRule="auto"/>
+      </w:pPr>
+    </w:p>
+    <w:p>
+      <w:pPr>
+        <w:spacing w:line="259" w:lineRule="auto"/>
+      </w:pPr>
+    </w:p>
+    <w:p>
+      <w:pPr>
+        <w:spacing w:line="259" w:lineRule="auto"/>
+      </w:pPr>
+    </w:p>
+    <w:p>
+      <w:pPr>
+        <w:spacing w:line="259" w:lineRule="auto"/>
+      </w:pPr>
+    </w:p>
+    <w:p>
+      <w:pPr>
+        <w:spacing w:line="259" w:lineRule="auto"/>
+      </w:pPr>
+    </w:p>
+    <w:p>
+      <w:pPr>
+        <w:spacing w:line="259" w:lineRule="auto"/>
+      </w:pPr>
+    </w:p>
+    <w:p>
+      <w:pPr>
+        <w:spacing w:line="259" w:lineRule="auto"/>
+      </w:pPr>
+    </w:p>
+    <w:p>
+      <w:pPr>
+        <w:spacing w:line="259" w:lineRule="auto"/>
+      </w:pPr>
+    </w:p>
+    <w:p>
+      <w:pPr>
+        <w:spacing w:line="259" w:lineRule="auto"/>
+      </w:pPr>
+    </w:p>
+    <w:p>
+      <w:pPr>
+        <w:spacing w:line="259" w:lineRule="auto"/>
+      </w:pPr>
+    </w:p>
+    <w:p>
+      <w:pPr>
+        <w:spacing w:line="259" w:lineRule="auto"/>
+      </w:pPr>
+    </w:p>
+    <w:p>
+      <w:pPr>
+        <w:spacing w:line="259" w:lineRule="auto"/>
+      </w:pPr>
+    </w:p>
+    <w:p>
+      <w:pPr>
+        <w:spacing w:line="259" w:lineRule="auto"/>
+      </w:pPr>
+    </w:p>
+    <w:p>
+      <w:pPr>
+        <w:spacing w:line="259" w:lineRule="auto"/>
+      </w:pPr>
+    </w:p>
+    <w:p>
+      <w:pPr>
+        <w:spacing w:line="259" w:lineRule="auto"/>
+      </w:pPr>
+    </w:p>
+    <w:p>
+      <w:pPr>
+        <w:spacing w:line="259" w:lineRule="auto"/>
+      </w:pPr>
+    </w:p>
+    <w:p>
+      <w:pPr>
+        <w:spacing w:line="259" w:lineRule="auto"/>
+      </w:pPr>
+    </w:p>
+    <w:p>
+      <w:pPr>
+        <w:spacing w:line="259" w:lineRule="auto"/>
+      </w:pPr>
+    </w:p>
+    <w:p>
+      <w:pPr>
+        <w:spacing w:line="259" w:lineRule="auto"/>
+      </w:pPr>
+    </w:p>
+    <w:p>
+      <w:pPr>
+        <w:spacing w:line="259" w:lineRule="auto"/>
+      </w:pPr>
+    </w:p>
+    <w:bookmarkStart w:id="6" w:name="_Toc227404763" w:displacedByCustomXml="next"/>
     <w:sdt>
       <w:sdtPr>
         <w:rPr>
           <w:rFonts w:asciiTheme="minorHAnsi" w:eastAsiaTheme="minorHAnsi" w:hAnsiTheme="minorHAnsi" w:cstheme="minorBidi"/>
           <w:color w:val="auto"/>
-          <w:kern w:val="2"/>
           <w:sz w:val="24"/>
           <w:szCs w:val="24"/>
-          <w:lang w:val="en-GB"/>
-          <w14:ligatures w14:val="standardContextual"/>
         </w:rPr>
         <w:id w:val="1909112241"/>
         <w:docPartObj>
@@ -243,6 +642,7 @@
       </w:sdtPr>
       <w:sdtEndPr>
         <w:rPr>
+          <w:rFonts w:ascii="Calibri" w:hAnsi="Calibri"/>
           <w:b/>
           <w:bCs/>
           <w:noProof/>
@@ -251,11 +651,12 @@
       <w:sdtContent>
         <w:p>
           <w:pPr>
-            <w:pStyle w:val="TOCHeading"/>
+            <w:pStyle w:val="Heading1"/>
           </w:pPr>
           <w:r>
             <w:t>Table of Contents</w:t>
           </w:r>
+          <w:bookmarkEnd w:id="6"/>
         </w:p>
         <w:p>
           <w:pPr>
@@ -264,7 +665,7 @@
               <w:tab w:val="right" w:leader="dot" w:pos="9016"/>
             </w:tabs>
             <w:rPr>
-              <w:rFonts w:cstheme="minorBidi"/>
+              <w:rFonts w:asciiTheme="minorHAnsi" w:hAnsiTheme="minorHAnsi" w:cstheme="minorBidi"/>
               <w:noProof/>
               <w:kern w:val="2"/>
               <w:sz w:val="24"/>
@@ -282,12 +683,382 @@
           <w:r>
             <w:fldChar w:fldCharType="separate"/>
           </w:r>
-          <w:hyperlink w:anchor="_Toc227236449" w:history="1">
+          <w:hyperlink w:anchor="_Toc227404760" w:history="1">
             <w:r>
               <w:rPr>
                 <w:rStyle w:val="Hyperlink"/>
                 <w:noProof/>
               </w:rPr>
+              <w:t>Abstract</w:t>
+            </w:r>
+            <w:r>
+              <w:rPr>
+                <w:noProof/>
+                <w:webHidden/>
+              </w:rPr>
+              <w:tab/>
+            </w:r>
+            <w:r>
+              <w:rPr>
+                <w:noProof/>
+                <w:webHidden/>
+              </w:rPr>
+              <w:fldChar w:fldCharType="begin"/>
+            </w:r>
+            <w:r>
+              <w:rPr>
+                <w:noProof/>
+                <w:webHidden/>
+              </w:rPr>
+              <w:instrText xml:space="preserve"> PAGEREF _Toc227404760 \h </w:instrText>
+            </w:r>
+            <w:r>
+              <w:rPr>
+                <w:noProof/>
+                <w:webHidden/>
+              </w:rPr>
+            </w:r>
+            <w:r>
+              <w:rPr>
+                <w:noProof/>
+                <w:webHidden/>
+              </w:rPr>
+              <w:fldChar w:fldCharType="separate"/>
+            </w:r>
+            <w:r>
+              <w:rPr>
+                <w:noProof/>
+                <w:webHidden/>
+              </w:rPr>
+              <w:t>ii</w:t>
+            </w:r>
+            <w:r>
+              <w:rPr>
+                <w:noProof/>
+                <w:webHidden/>
+              </w:rPr>
+              <w:fldChar w:fldCharType="end"/>
+            </w:r>
+          </w:hyperlink>
+        </w:p>
+        <w:p>
+          <w:pPr>
+            <w:pStyle w:val="TOC1"/>
+            <w:tabs>
+              <w:tab w:val="right" w:leader="dot" w:pos="9016"/>
+            </w:tabs>
+            <w:rPr>
+              <w:rFonts w:asciiTheme="minorHAnsi" w:hAnsiTheme="minorHAnsi" w:cstheme="minorBidi"/>
+              <w:noProof/>
+              <w:kern w:val="2"/>
+              <w:sz w:val="24"/>
+              <w:szCs w:val="24"/>
+              <w:lang w:val="en-GB" w:eastAsia="en-GB"/>
+              <w14:ligatures w14:val="standardContextual"/>
+            </w:rPr>
+          </w:pPr>
+          <w:hyperlink w:anchor="_Toc227404761" w:history="1">
+            <w:r>
+              <w:rPr>
+                <w:rStyle w:val="Hyperlink"/>
+                <w:noProof/>
+              </w:rPr>
+              <w:t>Declaration</w:t>
+            </w:r>
+            <w:r>
+              <w:rPr>
+                <w:noProof/>
+                <w:webHidden/>
+              </w:rPr>
+              <w:tab/>
+            </w:r>
+            <w:r>
+              <w:rPr>
+                <w:noProof/>
+                <w:webHidden/>
+              </w:rPr>
+              <w:fldChar w:fldCharType="begin"/>
+            </w:r>
+            <w:r>
+              <w:rPr>
+                <w:noProof/>
+                <w:webHidden/>
+              </w:rPr>
+              <w:instrText xml:space="preserve"> PAGEREF _Toc227404761 \h </w:instrText>
+            </w:r>
+            <w:r>
+              <w:rPr>
+                <w:noProof/>
+                <w:webHidden/>
+              </w:rPr>
+            </w:r>
+            <w:r>
+              <w:rPr>
+                <w:noProof/>
+                <w:webHidden/>
+              </w:rPr>
+              <w:fldChar w:fldCharType="separate"/>
+            </w:r>
+            <w:r>
+              <w:rPr>
+                <w:noProof/>
+                <w:webHidden/>
+              </w:rPr>
+              <w:t>iii</w:t>
+            </w:r>
+            <w:r>
+              <w:rPr>
+                <w:noProof/>
+                <w:webHidden/>
+              </w:rPr>
+              <w:fldChar w:fldCharType="end"/>
+            </w:r>
+          </w:hyperlink>
+        </w:p>
+        <w:p>
+          <w:pPr>
+            <w:pStyle w:val="TOC1"/>
+            <w:tabs>
+              <w:tab w:val="right" w:leader="dot" w:pos="9016"/>
+            </w:tabs>
+            <w:rPr>
+              <w:rFonts w:asciiTheme="minorHAnsi" w:hAnsiTheme="minorHAnsi" w:cstheme="minorBidi"/>
+              <w:noProof/>
+              <w:kern w:val="2"/>
+              <w:sz w:val="24"/>
+              <w:szCs w:val="24"/>
+              <w:lang w:val="en-GB" w:eastAsia="en-GB"/>
+              <w14:ligatures w14:val="standardContextual"/>
+            </w:rPr>
+          </w:pPr>
+          <w:hyperlink w:anchor="_Toc227404762" w:history="1">
+            <w:r>
+              <w:rPr>
+                <w:rStyle w:val="Hyperlink"/>
+                <w:noProof/>
+              </w:rPr>
+              <w:t>Acknowledgements</w:t>
+            </w:r>
+            <w:r>
+              <w:rPr>
+                <w:noProof/>
+                <w:webHidden/>
+              </w:rPr>
+              <w:tab/>
+            </w:r>
+            <w:r>
+              <w:rPr>
+                <w:noProof/>
+                <w:webHidden/>
+              </w:rPr>
+              <w:fldChar w:fldCharType="begin"/>
+            </w:r>
+            <w:r>
+              <w:rPr>
+                <w:noProof/>
+                <w:webHidden/>
+              </w:rPr>
+              <w:instrText xml:space="preserve"> PAGEREF _Toc227404762 \h </w:instrText>
+            </w:r>
+            <w:r>
+              <w:rPr>
+                <w:noProof/>
+                <w:webHidden/>
+              </w:rPr>
+            </w:r>
+            <w:r>
+              <w:rPr>
+                <w:noProof/>
+                <w:webHidden/>
+              </w:rPr>
+              <w:fldChar w:fldCharType="separate"/>
+            </w:r>
+            <w:r>
+              <w:rPr>
+                <w:noProof/>
+                <w:webHidden/>
+              </w:rPr>
+              <w:t>iv</w:t>
+            </w:r>
+            <w:r>
+              <w:rPr>
+                <w:noProof/>
+                <w:webHidden/>
+              </w:rPr>
+              <w:fldChar w:fldCharType="end"/>
+            </w:r>
+          </w:hyperlink>
+        </w:p>
+        <w:p>
+          <w:pPr>
+            <w:pStyle w:val="TOC1"/>
+            <w:tabs>
+              <w:tab w:val="right" w:leader="dot" w:pos="9016"/>
+            </w:tabs>
+            <w:rPr>
+              <w:rFonts w:asciiTheme="minorHAnsi" w:hAnsiTheme="minorHAnsi" w:cstheme="minorBidi"/>
+              <w:noProof/>
+              <w:kern w:val="2"/>
+              <w:sz w:val="24"/>
+              <w:szCs w:val="24"/>
+              <w:lang w:val="en-GB" w:eastAsia="en-GB"/>
+              <w14:ligatures w14:val="standardContextual"/>
+            </w:rPr>
+          </w:pPr>
+          <w:hyperlink w:anchor="_Toc227404763" w:history="1">
+            <w:r>
+              <w:rPr>
+                <w:rStyle w:val="Hyperlink"/>
+                <w:noProof/>
+              </w:rPr>
+              <w:t>Table of Contents</w:t>
+            </w:r>
+            <w:r>
+              <w:rPr>
+                <w:noProof/>
+                <w:webHidden/>
+              </w:rPr>
+              <w:tab/>
+            </w:r>
+            <w:r>
+              <w:rPr>
+                <w:noProof/>
+                <w:webHidden/>
+              </w:rPr>
+              <w:fldChar w:fldCharType="begin"/>
+            </w:r>
+            <w:r>
+              <w:rPr>
+                <w:noProof/>
+                <w:webHidden/>
+              </w:rPr>
+              <w:instrText xml:space="preserve"> PAGEREF _Toc227404763 \h </w:instrText>
+            </w:r>
+            <w:r>
+              <w:rPr>
+                <w:noProof/>
+                <w:webHidden/>
+              </w:rPr>
+            </w:r>
+            <w:r>
+              <w:rPr>
+                <w:noProof/>
+                <w:webHidden/>
+              </w:rPr>
+              <w:fldChar w:fldCharType="separate"/>
+            </w:r>
+            <w:r>
+              <w:rPr>
+                <w:noProof/>
+                <w:webHidden/>
+              </w:rPr>
+              <w:t>v</w:t>
+            </w:r>
+            <w:r>
+              <w:rPr>
+                <w:noProof/>
+                <w:webHidden/>
+              </w:rPr>
+              <w:fldChar w:fldCharType="end"/>
+            </w:r>
+          </w:hyperlink>
+        </w:p>
+        <w:p>
+          <w:pPr>
+            <w:pStyle w:val="TOC1"/>
+            <w:tabs>
+              <w:tab w:val="right" w:leader="dot" w:pos="9016"/>
+            </w:tabs>
+            <w:rPr>
+              <w:rFonts w:asciiTheme="minorHAnsi" w:hAnsiTheme="minorHAnsi" w:cstheme="minorBidi"/>
+              <w:noProof/>
+              <w:kern w:val="2"/>
+              <w:sz w:val="24"/>
+              <w:szCs w:val="24"/>
+              <w:lang w:val="en-GB" w:eastAsia="en-GB"/>
+              <w14:ligatures w14:val="standardContextual"/>
+            </w:rPr>
+          </w:pPr>
+          <w:hyperlink w:anchor="_Toc227404764" w:history="1">
+            <w:r>
+              <w:rPr>
+                <w:rStyle w:val="Hyperlink"/>
+                <w:noProof/>
+              </w:rPr>
+              <w:t>Table of Figures</w:t>
+            </w:r>
+            <w:r>
+              <w:rPr>
+                <w:noProof/>
+                <w:webHidden/>
+              </w:rPr>
+              <w:tab/>
+            </w:r>
+            <w:r>
+              <w:rPr>
+                <w:noProof/>
+                <w:webHidden/>
+              </w:rPr>
+              <w:fldChar w:fldCharType="begin"/>
+            </w:r>
+            <w:r>
+              <w:rPr>
+                <w:noProof/>
+                <w:webHidden/>
+              </w:rPr>
+              <w:instrText xml:space="preserve"> PAGEREF _Toc227404764 \h </w:instrText>
+            </w:r>
+            <w:r>
+              <w:rPr>
+                <w:noProof/>
+                <w:webHidden/>
+              </w:rPr>
+            </w:r>
+            <w:r>
+              <w:rPr>
+                <w:noProof/>
+                <w:webHidden/>
+              </w:rPr>
+              <w:fldChar w:fldCharType="separate"/>
+            </w:r>
+            <w:r>
+              <w:rPr>
+                <w:noProof/>
+                <w:webHidden/>
+              </w:rPr>
+              <w:t>vi</w:t>
+            </w:r>
+            <w:r>
+              <w:rPr>
+                <w:noProof/>
+                <w:webHidden/>
+              </w:rPr>
+              <w:fldChar w:fldCharType="end"/>
+            </w:r>
+          </w:hyperlink>
+        </w:p>
+        <w:p>
+          <w:pPr>
+            <w:pStyle w:val="TOC1"/>
+            <w:tabs>
+              <w:tab w:val="right" w:leader="dot" w:pos="9016"/>
+            </w:tabs>
+            <w:rPr>
+              <w:rFonts w:asciiTheme="minorHAnsi" w:hAnsiTheme="minorHAnsi" w:cstheme="minorBidi"/>
+              <w:noProof/>
+              <w:kern w:val="2"/>
+              <w:sz w:val="24"/>
+              <w:szCs w:val="24"/>
+              <w:lang w:val="en-GB" w:eastAsia="en-GB"/>
+              <w14:ligatures w14:val="standardContextual"/>
+            </w:rPr>
+          </w:pPr>
+          <w:hyperlink w:anchor="_Toc227404765" w:history="1">
+            <w:r>
+              <w:rPr>
+                <w:rStyle w:val="Hyperlink"/>
+                <w:noProof/>
+              </w:rPr>
               <w:t>Chapter 1 – Introduction</w:t>
             </w:r>
             <w:r>
@@ -309,7 +1080,7 @@
                 <w:noProof/>
                 <w:webHidden/>
               </w:rPr>
-              <w:instrText xml:space="preserve"> PAGEREF _Toc227236449 \h </w:instrText>
+              <w:instrText xml:space="preserve"> PAGEREF _Toc227404765 \h </w:instrText>
             </w:r>
             <w:r>
               <w:rPr>
@@ -329,7 +1100,7 @@
                 <w:noProof/>
                 <w:webHidden/>
               </w:rPr>
-              <w:t>3</w:t>
+              <w:t>1</w:t>
             </w:r>
             <w:r>
               <w:rPr>
@@ -347,7 +1118,7 @@
               <w:tab w:val="right" w:leader="dot" w:pos="9016"/>
             </w:tabs>
             <w:rPr>
-              <w:rFonts w:cstheme="minorBidi"/>
+              <w:rFonts w:asciiTheme="minorHAnsi" w:hAnsiTheme="minorHAnsi" w:cstheme="minorBidi"/>
               <w:noProof/>
               <w:kern w:val="2"/>
               <w:sz w:val="24"/>
@@ -356,7 +1127,7 @@
               <w14:ligatures w14:val="standardContextual"/>
             </w:rPr>
           </w:pPr>
-          <w:hyperlink w:anchor="_Toc227236450" w:history="1">
+          <w:hyperlink w:anchor="_Toc227404766" w:history="1">
             <w:r>
               <w:rPr>
                 <w:rStyle w:val="Hyperlink"/>
@@ -383,7 +1154,7 @@
                 <w:noProof/>
                 <w:webHidden/>
               </w:rPr>
-              <w:instrText xml:space="preserve"> PAGEREF _Toc227236450 \h </w:instrText>
+              <w:instrText xml:space="preserve"> PAGEREF _Toc227404766 \h </w:instrText>
             </w:r>
             <w:r>
               <w:rPr>
@@ -403,7 +1174,7 @@
                 <w:noProof/>
                 <w:webHidden/>
               </w:rPr>
-              <w:t>3</w:t>
+              <w:t>1</w:t>
             </w:r>
             <w:r>
               <w:rPr>
@@ -421,7 +1192,7 @@
               <w:tab w:val="right" w:leader="dot" w:pos="9016"/>
             </w:tabs>
             <w:rPr>
-              <w:rFonts w:cstheme="minorBidi"/>
+              <w:rFonts w:asciiTheme="minorHAnsi" w:hAnsiTheme="minorHAnsi" w:cstheme="minorBidi"/>
               <w:noProof/>
               <w:kern w:val="2"/>
               <w:sz w:val="24"/>
@@ -430,7 +1201,7 @@
               <w14:ligatures w14:val="standardContextual"/>
             </w:rPr>
           </w:pPr>
-          <w:hyperlink w:anchor="_Toc227236451" w:history="1">
+          <w:hyperlink w:anchor="_Toc227404767" w:history="1">
             <w:r>
               <w:rPr>
                 <w:rStyle w:val="Hyperlink"/>
@@ -457,7 +1228,7 @@
                 <w:noProof/>
                 <w:webHidden/>
               </w:rPr>
-              <w:instrText xml:space="preserve"> PAGEREF _Toc227236451 \h </w:instrText>
+              <w:instrText xml:space="preserve"> PAGEREF _Toc227404767 \h </w:instrText>
             </w:r>
             <w:r>
               <w:rPr>
@@ -477,7 +1248,7 @@
                 <w:noProof/>
                 <w:webHidden/>
               </w:rPr>
-              <w:t>3</w:t>
+              <w:t>1</w:t>
             </w:r>
             <w:r>
               <w:rPr>
@@ -495,7 +1266,7 @@
               <w:tab w:val="right" w:leader="dot" w:pos="9016"/>
             </w:tabs>
             <w:rPr>
-              <w:rFonts w:cstheme="minorBidi"/>
+              <w:rFonts w:asciiTheme="minorHAnsi" w:hAnsiTheme="minorHAnsi" w:cstheme="minorBidi"/>
               <w:noProof/>
               <w:kern w:val="2"/>
               <w:sz w:val="24"/>
@@ -504,7 +1275,7 @@
               <w14:ligatures w14:val="standardContextual"/>
             </w:rPr>
           </w:pPr>
-          <w:hyperlink w:anchor="_Toc227236452" w:history="1">
+          <w:hyperlink w:anchor="_Toc227404768" w:history="1">
             <w:r>
               <w:rPr>
                 <w:rStyle w:val="Hyperlink"/>
@@ -531,7 +1302,7 @@
                 <w:noProof/>
                 <w:webHidden/>
               </w:rPr>
-              <w:instrText xml:space="preserve"> PAGEREF _Toc227236452 \h </w:instrText>
+              <w:instrText xml:space="preserve"> PAGEREF _Toc227404768 \h </w:instrText>
             </w:r>
             <w:r>
               <w:rPr>
@@ -551,7 +1322,7 @@
                 <w:noProof/>
                 <w:webHidden/>
               </w:rPr>
-              <w:t>3</w:t>
+              <w:t>1</w:t>
             </w:r>
             <w:r>
               <w:rPr>
@@ -569,7 +1340,7 @@
               <w:tab w:val="right" w:leader="dot" w:pos="9016"/>
             </w:tabs>
             <w:rPr>
-              <w:rFonts w:cstheme="minorBidi"/>
+              <w:rFonts w:asciiTheme="minorHAnsi" w:hAnsiTheme="minorHAnsi" w:cstheme="minorBidi"/>
               <w:noProof/>
               <w:kern w:val="2"/>
               <w:sz w:val="24"/>
@@ -578,7 +1349,7 @@
               <w14:ligatures w14:val="standardContextual"/>
             </w:rPr>
           </w:pPr>
-          <w:hyperlink w:anchor="_Toc227236453" w:history="1">
+          <w:hyperlink w:anchor="_Toc227404769" w:history="1">
             <w:r>
               <w:rPr>
                 <w:rStyle w:val="Hyperlink"/>
@@ -605,7 +1376,7 @@
                 <w:noProof/>
                 <w:webHidden/>
               </w:rPr>
-              <w:instrText xml:space="preserve"> PAGEREF _Toc227236453 \h </w:instrText>
+              <w:instrText xml:space="preserve"> PAGEREF _Toc227404769 \h </w:instrText>
             </w:r>
             <w:r>
               <w:rPr>
@@ -625,7 +1396,7 @@
                 <w:noProof/>
                 <w:webHidden/>
               </w:rPr>
-              <w:t>4</w:t>
+              <w:t>2</w:t>
             </w:r>
             <w:r>
               <w:rPr>
@@ -643,7 +1414,7 @@
               <w:tab w:val="right" w:leader="dot" w:pos="9016"/>
             </w:tabs>
             <w:rPr>
-              <w:rFonts w:cstheme="minorBidi"/>
+              <w:rFonts w:asciiTheme="minorHAnsi" w:hAnsiTheme="minorHAnsi" w:cstheme="minorBidi"/>
               <w:noProof/>
               <w:kern w:val="2"/>
               <w:sz w:val="24"/>
@@ -652,7 +1423,7 @@
               <w14:ligatures w14:val="standardContextual"/>
             </w:rPr>
           </w:pPr>
-          <w:hyperlink w:anchor="_Toc227236454" w:history="1">
+          <w:hyperlink w:anchor="_Toc227404770" w:history="1">
             <w:r>
               <w:rPr>
                 <w:rStyle w:val="Hyperlink"/>
@@ -679,7 +1450,7 @@
                 <w:noProof/>
                 <w:webHidden/>
               </w:rPr>
-              <w:instrText xml:space="preserve"> PAGEREF _Toc227236454 \h </w:instrText>
+              <w:instrText xml:space="preserve"> PAGEREF _Toc227404770 \h </w:instrText>
             </w:r>
             <w:r>
               <w:rPr>
@@ -699,7 +1470,7 @@
                 <w:noProof/>
                 <w:webHidden/>
               </w:rPr>
-              <w:t>4</w:t>
+              <w:t>2</w:t>
             </w:r>
             <w:r>
               <w:rPr>
@@ -717,7 +1488,7 @@
               <w:tab w:val="right" w:leader="dot" w:pos="9016"/>
             </w:tabs>
             <w:rPr>
-              <w:rFonts w:cstheme="minorBidi"/>
+              <w:rFonts w:asciiTheme="minorHAnsi" w:hAnsiTheme="minorHAnsi" w:cstheme="minorBidi"/>
               <w:noProof/>
               <w:kern w:val="2"/>
               <w:sz w:val="24"/>
@@ -726,7 +1497,7 @@
               <w14:ligatures w14:val="standardContextual"/>
             </w:rPr>
           </w:pPr>
-          <w:hyperlink w:anchor="_Toc227236455" w:history="1">
+          <w:hyperlink w:anchor="_Toc227404771" w:history="1">
             <w:r>
               <w:rPr>
                 <w:rStyle w:val="Hyperlink"/>
@@ -753,7 +1524,7 @@
                 <w:noProof/>
                 <w:webHidden/>
               </w:rPr>
-              <w:instrText xml:space="preserve"> PAGEREF _Toc227236455 \h </w:instrText>
+              <w:instrText xml:space="preserve"> PAGEREF _Toc227404771 \h </w:instrText>
             </w:r>
             <w:r>
               <w:rPr>
@@ -773,7 +1544,7 @@
                 <w:noProof/>
                 <w:webHidden/>
               </w:rPr>
-              <w:t>4</w:t>
+              <w:t>2</w:t>
             </w:r>
             <w:r>
               <w:rPr>
@@ -791,7 +1562,7 @@
               <w:tab w:val="right" w:leader="dot" w:pos="9016"/>
             </w:tabs>
             <w:rPr>
-              <w:rFonts w:cstheme="minorBidi"/>
+              <w:rFonts w:asciiTheme="minorHAnsi" w:hAnsiTheme="minorHAnsi" w:cstheme="minorBidi"/>
               <w:noProof/>
               <w:kern w:val="2"/>
               <w:sz w:val="24"/>
@@ -800,7 +1571,7 @@
               <w14:ligatures w14:val="standardContextual"/>
             </w:rPr>
           </w:pPr>
-          <w:hyperlink w:anchor="_Toc227236456" w:history="1">
+          <w:hyperlink w:anchor="_Toc227404772" w:history="1">
             <w:r>
               <w:rPr>
                 <w:rStyle w:val="Hyperlink"/>
@@ -827,7 +1598,7 @@
                 <w:noProof/>
                 <w:webHidden/>
               </w:rPr>
-              <w:instrText xml:space="preserve"> PAGEREF _Toc227236456 \h </w:instrText>
+              <w:instrText xml:space="preserve"> PAGEREF _Toc227404772 \h </w:instrText>
             </w:r>
             <w:r>
               <w:rPr>
@@ -847,7 +1618,7 @@
                 <w:noProof/>
                 <w:webHidden/>
               </w:rPr>
-              <w:t>4</w:t>
+              <w:t>2</w:t>
             </w:r>
             <w:r>
               <w:rPr>
@@ -865,7 +1636,7 @@
               <w:tab w:val="right" w:leader="dot" w:pos="9016"/>
             </w:tabs>
             <w:rPr>
-              <w:rFonts w:cstheme="minorBidi"/>
+              <w:rFonts w:asciiTheme="minorHAnsi" w:hAnsiTheme="minorHAnsi" w:cstheme="minorBidi"/>
               <w:noProof/>
               <w:kern w:val="2"/>
               <w:sz w:val="24"/>
@@ -874,7 +1645,7 @@
               <w14:ligatures w14:val="standardContextual"/>
             </w:rPr>
           </w:pPr>
-          <w:hyperlink w:anchor="_Toc227236457" w:history="1">
+          <w:hyperlink w:anchor="_Toc227404773" w:history="1">
             <w:r>
               <w:rPr>
                 <w:rStyle w:val="Hyperlink"/>
@@ -901,7 +1672,7 @@
                 <w:noProof/>
                 <w:webHidden/>
               </w:rPr>
-              <w:instrText xml:space="preserve"> PAGEREF _Toc227236457 \h </w:instrText>
+              <w:instrText xml:space="preserve"> PAGEREF _Toc227404773 \h </w:instrText>
             </w:r>
             <w:r>
               <w:rPr>
@@ -921,7 +1692,7 @@
                 <w:noProof/>
                 <w:webHidden/>
               </w:rPr>
-              <w:t>5</w:t>
+              <w:t>3</w:t>
             </w:r>
             <w:r>
               <w:rPr>
@@ -939,7 +1710,7 @@
               <w:tab w:val="right" w:leader="dot" w:pos="9016"/>
             </w:tabs>
             <w:rPr>
-              <w:rFonts w:cstheme="minorBidi"/>
+              <w:rFonts w:asciiTheme="minorHAnsi" w:hAnsiTheme="minorHAnsi" w:cstheme="minorBidi"/>
               <w:noProof/>
               <w:kern w:val="2"/>
               <w:sz w:val="24"/>
@@ -948,7 +1719,7 @@
               <w14:ligatures w14:val="standardContextual"/>
             </w:rPr>
           </w:pPr>
-          <w:hyperlink w:anchor="_Toc227236458" w:history="1">
+          <w:hyperlink w:anchor="_Toc227404774" w:history="1">
             <w:r>
               <w:rPr>
                 <w:rStyle w:val="Hyperlink"/>
@@ -975,7 +1746,7 @@
                 <w:noProof/>
                 <w:webHidden/>
               </w:rPr>
-              <w:instrText xml:space="preserve"> PAGEREF _Toc227236458 \h </w:instrText>
+              <w:instrText xml:space="preserve"> PAGEREF _Toc227404774 \h </w:instrText>
             </w:r>
             <w:r>
               <w:rPr>
@@ -995,7 +1766,7 @@
                 <w:noProof/>
                 <w:webHidden/>
               </w:rPr>
-              <w:t>5</w:t>
+              <w:t>3</w:t>
             </w:r>
             <w:r>
               <w:rPr>
@@ -1013,7 +1784,7 @@
               <w:tab w:val="right" w:leader="dot" w:pos="9016"/>
             </w:tabs>
             <w:rPr>
-              <w:rFonts w:cstheme="minorBidi"/>
+              <w:rFonts w:asciiTheme="minorHAnsi" w:hAnsiTheme="minorHAnsi" w:cstheme="minorBidi"/>
               <w:noProof/>
               <w:kern w:val="2"/>
               <w:sz w:val="24"/>
@@ -1022,7 +1793,7 @@
               <w14:ligatures w14:val="standardContextual"/>
             </w:rPr>
           </w:pPr>
-          <w:hyperlink w:anchor="_Toc227236459" w:history="1">
+          <w:hyperlink w:anchor="_Toc227404775" w:history="1">
             <w:r>
               <w:rPr>
                 <w:rStyle w:val="Hyperlink"/>
@@ -1049,7 +1820,7 @@
                 <w:noProof/>
                 <w:webHidden/>
               </w:rPr>
-              <w:instrText xml:space="preserve"> PAGEREF _Toc227236459 \h </w:instrText>
+              <w:instrText xml:space="preserve"> PAGEREF _Toc227404775 \h </w:instrText>
             </w:r>
             <w:r>
               <w:rPr>
@@ -1069,7 +1840,7 @@
                 <w:noProof/>
                 <w:webHidden/>
               </w:rPr>
-              <w:t>5</w:t>
+              <w:t>3</w:t>
             </w:r>
             <w:r>
               <w:rPr>
@@ -1087,7 +1858,7 @@
               <w:tab w:val="right" w:leader="dot" w:pos="9016"/>
             </w:tabs>
             <w:rPr>
-              <w:rFonts w:cstheme="minorBidi"/>
+              <w:rFonts w:asciiTheme="minorHAnsi" w:hAnsiTheme="minorHAnsi" w:cstheme="minorBidi"/>
               <w:noProof/>
               <w:kern w:val="2"/>
               <w:sz w:val="24"/>
@@ -1096,7 +1867,7 @@
               <w14:ligatures w14:val="standardContextual"/>
             </w:rPr>
           </w:pPr>
-          <w:hyperlink w:anchor="_Toc227236460" w:history="1">
+          <w:hyperlink w:anchor="_Toc227404776" w:history="1">
             <w:r>
               <w:rPr>
                 <w:rStyle w:val="Hyperlink"/>
@@ -1123,7 +1894,7 @@
                 <w:noProof/>
                 <w:webHidden/>
               </w:rPr>
-              <w:instrText xml:space="preserve"> PAGEREF _Toc227236460 \h </w:instrText>
+              <w:instrText xml:space="preserve"> PAGEREF _Toc227404776 \h </w:instrText>
             </w:r>
             <w:r>
               <w:rPr>
@@ -1143,7 +1914,7 @@
                 <w:noProof/>
                 <w:webHidden/>
               </w:rPr>
-              <w:t>6</w:t>
+              <w:t>4</w:t>
             </w:r>
             <w:r>
               <w:rPr>
@@ -1161,7 +1932,7 @@
               <w:tab w:val="right" w:leader="dot" w:pos="9016"/>
             </w:tabs>
             <w:rPr>
-              <w:rFonts w:cstheme="minorBidi"/>
+              <w:rFonts w:asciiTheme="minorHAnsi" w:hAnsiTheme="minorHAnsi" w:cstheme="minorBidi"/>
               <w:noProof/>
               <w:kern w:val="2"/>
               <w:sz w:val="24"/>
@@ -1170,7 +1941,7 @@
               <w14:ligatures w14:val="standardContextual"/>
             </w:rPr>
           </w:pPr>
-          <w:hyperlink w:anchor="_Toc227236461" w:history="1">
+          <w:hyperlink w:anchor="_Toc227404777" w:history="1">
             <w:r>
               <w:rPr>
                 <w:rStyle w:val="Hyperlink"/>
@@ -1197,7 +1968,7 @@
                 <w:noProof/>
                 <w:webHidden/>
               </w:rPr>
-              <w:instrText xml:space="preserve"> PAGEREF _Toc227236461 \h </w:instrText>
+              <w:instrText xml:space="preserve"> PAGEREF _Toc227404777 \h </w:instrText>
             </w:r>
             <w:r>
               <w:rPr>
@@ -1217,7 +1988,7 @@
                 <w:noProof/>
                 <w:webHidden/>
               </w:rPr>
-              <w:t>6</w:t>
+              <w:t>4</w:t>
             </w:r>
             <w:r>
               <w:rPr>
@@ -1235,7 +2006,7 @@
               <w:tab w:val="right" w:leader="dot" w:pos="9016"/>
             </w:tabs>
             <w:rPr>
-              <w:rFonts w:cstheme="minorBidi"/>
+              <w:rFonts w:asciiTheme="minorHAnsi" w:hAnsiTheme="minorHAnsi" w:cstheme="minorBidi"/>
               <w:noProof/>
               <w:kern w:val="2"/>
               <w:sz w:val="24"/>
@@ -1244,7 +2015,7 @@
               <w14:ligatures w14:val="standardContextual"/>
             </w:rPr>
           </w:pPr>
-          <w:hyperlink w:anchor="_Toc227236462" w:history="1">
+          <w:hyperlink w:anchor="_Toc227404778" w:history="1">
             <w:r>
               <w:rPr>
                 <w:rStyle w:val="Hyperlink"/>
@@ -1271,7 +2042,7 @@
                 <w:noProof/>
                 <w:webHidden/>
               </w:rPr>
-              <w:instrText xml:space="preserve"> PAGEREF _Toc227236462 \h </w:instrText>
+              <w:instrText xml:space="preserve"> PAGEREF _Toc227404778 \h </w:instrText>
             </w:r>
             <w:r>
               <w:rPr>
@@ -1291,7 +2062,7 @@
                 <w:noProof/>
                 <w:webHidden/>
               </w:rPr>
-              <w:t>6</w:t>
+              <w:t>4</w:t>
             </w:r>
             <w:r>
               <w:rPr>
@@ -1309,7 +2080,7 @@
               <w:tab w:val="right" w:leader="dot" w:pos="9016"/>
             </w:tabs>
             <w:rPr>
-              <w:rFonts w:cstheme="minorBidi"/>
+              <w:rFonts w:asciiTheme="minorHAnsi" w:hAnsiTheme="minorHAnsi" w:cstheme="minorBidi"/>
               <w:noProof/>
               <w:kern w:val="2"/>
               <w:sz w:val="24"/>
@@ -1318,7 +2089,7 @@
               <w14:ligatures w14:val="standardContextual"/>
             </w:rPr>
           </w:pPr>
-          <w:hyperlink w:anchor="_Toc227236463" w:history="1">
+          <w:hyperlink w:anchor="_Toc227404779" w:history="1">
             <w:r>
               <w:rPr>
                 <w:rStyle w:val="Hyperlink"/>
@@ -1345,7 +2116,7 @@
                 <w:noProof/>
                 <w:webHidden/>
               </w:rPr>
-              <w:instrText xml:space="preserve"> PAGEREF _Toc227236463 \h </w:instrText>
+              <w:instrText xml:space="preserve"> PAGEREF _Toc227404779 \h </w:instrText>
             </w:r>
             <w:r>
               <w:rPr>
@@ -1365,7 +2136,7 @@
                 <w:noProof/>
                 <w:webHidden/>
               </w:rPr>
-              <w:t>6</w:t>
+              <w:t>4</w:t>
             </w:r>
             <w:r>
               <w:rPr>
@@ -1383,12 +2154,12 @@
               <w:tab w:val="right" w:leader="dot" w:pos="9016"/>
             </w:tabs>
             <w:rPr>
-              <w:rFonts w:eastAsiaTheme="minorEastAsia"/>
+              <w:rFonts w:asciiTheme="minorHAnsi" w:eastAsiaTheme="minorEastAsia" w:hAnsiTheme="minorHAnsi"/>
               <w:noProof/>
               <w:lang w:eastAsia="en-GB"/>
             </w:rPr>
           </w:pPr>
-          <w:hyperlink w:anchor="_Toc227236464" w:history="1">
+          <w:hyperlink w:anchor="_Toc227404780" w:history="1">
             <w:r>
               <w:rPr>
                 <w:rStyle w:val="Hyperlink"/>
@@ -1415,7 +2186,7 @@
                 <w:noProof/>
                 <w:webHidden/>
               </w:rPr>
-              <w:instrText xml:space="preserve"> PAGEREF _Toc227236464 \h </w:instrText>
+              <w:instrText xml:space="preserve"> PAGEREF _Toc227404780 \h </w:instrText>
             </w:r>
             <w:r>
               <w:rPr>
@@ -1435,7 +2206,7 @@
                 <w:noProof/>
                 <w:webHidden/>
               </w:rPr>
-              <w:t>6</w:t>
+              <w:t>4</w:t>
             </w:r>
             <w:r>
               <w:rPr>
@@ -1453,12 +2224,12 @@
               <w:tab w:val="right" w:leader="dot" w:pos="9016"/>
             </w:tabs>
             <w:rPr>
-              <w:rFonts w:eastAsiaTheme="minorEastAsia"/>
+              <w:rFonts w:asciiTheme="minorHAnsi" w:eastAsiaTheme="minorEastAsia" w:hAnsiTheme="minorHAnsi"/>
               <w:noProof/>
               <w:lang w:eastAsia="en-GB"/>
             </w:rPr>
           </w:pPr>
-          <w:hyperlink w:anchor="_Toc227236465" w:history="1">
+          <w:hyperlink w:anchor="_Toc227404781" w:history="1">
             <w:r>
               <w:rPr>
                 <w:rStyle w:val="Hyperlink"/>
@@ -1485,7 +2256,7 @@
                 <w:noProof/>
                 <w:webHidden/>
               </w:rPr>
-              <w:instrText xml:space="preserve"> PAGEREF _Toc227236465 \h </w:instrText>
+              <w:instrText xml:space="preserve"> PAGEREF _Toc227404781 \h </w:instrText>
             </w:r>
             <w:r>
               <w:rPr>
@@ -1505,7 +2276,7 @@
                 <w:noProof/>
                 <w:webHidden/>
               </w:rPr>
-              <w:t>7</w:t>
+              <w:t>5</w:t>
             </w:r>
             <w:r>
               <w:rPr>
@@ -1523,12 +2294,12 @@
               <w:tab w:val="right" w:leader="dot" w:pos="9016"/>
             </w:tabs>
             <w:rPr>
-              <w:rFonts w:eastAsiaTheme="minorEastAsia"/>
+              <w:rFonts w:asciiTheme="minorHAnsi" w:eastAsiaTheme="minorEastAsia" w:hAnsiTheme="minorHAnsi"/>
               <w:noProof/>
               <w:lang w:eastAsia="en-GB"/>
             </w:rPr>
           </w:pPr>
-          <w:hyperlink w:anchor="_Toc227236466" w:history="1">
+          <w:hyperlink w:anchor="_Toc227404782" w:history="1">
             <w:r>
               <w:rPr>
                 <w:rStyle w:val="Hyperlink"/>
@@ -1555,7 +2326,7 @@
                 <w:noProof/>
                 <w:webHidden/>
               </w:rPr>
-              <w:instrText xml:space="preserve"> PAGEREF _Toc227236466 \h </w:instrText>
+              <w:instrText xml:space="preserve"> PAGEREF _Toc227404782 \h </w:instrText>
             </w:r>
             <w:r>
               <w:rPr>
@@ -1575,7 +2346,7 @@
                 <w:noProof/>
                 <w:webHidden/>
               </w:rPr>
-              <w:t>7</w:t>
+              <w:t>5</w:t>
             </w:r>
             <w:r>
               <w:rPr>
@@ -1593,7 +2364,7 @@
               <w:tab w:val="right" w:leader="dot" w:pos="9016"/>
             </w:tabs>
             <w:rPr>
-              <w:rFonts w:cstheme="minorBidi"/>
+              <w:rFonts w:asciiTheme="minorHAnsi" w:hAnsiTheme="minorHAnsi" w:cstheme="minorBidi"/>
               <w:noProof/>
               <w:kern w:val="2"/>
               <w:sz w:val="24"/>
@@ -1602,7 +2373,7 @@
               <w14:ligatures w14:val="standardContextual"/>
             </w:rPr>
           </w:pPr>
-          <w:hyperlink w:anchor="_Toc227236467" w:history="1">
+          <w:hyperlink w:anchor="_Toc227404783" w:history="1">
             <w:r>
               <w:rPr>
                 <w:rStyle w:val="Hyperlink"/>
@@ -1629,7 +2400,7 @@
                 <w:noProof/>
                 <w:webHidden/>
               </w:rPr>
-              <w:instrText xml:space="preserve"> PAGEREF _Toc227236467 \h </w:instrText>
+              <w:instrText xml:space="preserve"> PAGEREF _Toc227404783 \h </w:instrText>
             </w:r>
             <w:r>
               <w:rPr>
@@ -1649,7 +2420,7 @@
                 <w:noProof/>
                 <w:webHidden/>
               </w:rPr>
-              <w:t>7</w:t>
+              <w:t>6</w:t>
             </w:r>
             <w:r>
               <w:rPr>
@@ -1667,12 +2438,12 @@
               <w:tab w:val="right" w:leader="dot" w:pos="9016"/>
             </w:tabs>
             <w:rPr>
-              <w:rFonts w:eastAsiaTheme="minorEastAsia"/>
+              <w:rFonts w:asciiTheme="minorHAnsi" w:eastAsiaTheme="minorEastAsia" w:hAnsiTheme="minorHAnsi"/>
               <w:noProof/>
               <w:lang w:eastAsia="en-GB"/>
             </w:rPr>
           </w:pPr>
-          <w:hyperlink w:anchor="_Toc227236468" w:history="1">
+          <w:hyperlink w:anchor="_Toc227404784" w:history="1">
             <w:r>
               <w:rPr>
                 <w:rStyle w:val="Hyperlink"/>
@@ -1699,7 +2470,7 @@
                 <w:noProof/>
                 <w:webHidden/>
               </w:rPr>
-              <w:instrText xml:space="preserve"> PAGEREF _Toc227236468 \h </w:instrText>
+              <w:instrText xml:space="preserve"> PAGEREF _Toc227404784 \h </w:instrText>
             </w:r>
             <w:r>
               <w:rPr>
@@ -1719,7 +2490,7 @@
                 <w:noProof/>
                 <w:webHidden/>
               </w:rPr>
-              <w:t>8</w:t>
+              <w:t>6</w:t>
             </w:r>
             <w:r>
               <w:rPr>
@@ -1737,12 +2508,12 @@
               <w:tab w:val="right" w:leader="dot" w:pos="9016"/>
             </w:tabs>
             <w:rPr>
-              <w:rFonts w:eastAsiaTheme="minorEastAsia"/>
+              <w:rFonts w:asciiTheme="minorHAnsi" w:eastAsiaTheme="minorEastAsia" w:hAnsiTheme="minorHAnsi"/>
               <w:noProof/>
               <w:lang w:eastAsia="en-GB"/>
             </w:rPr>
           </w:pPr>
-          <w:hyperlink w:anchor="_Toc227236469" w:history="1">
+          <w:hyperlink w:anchor="_Toc227404785" w:history="1">
             <w:r>
               <w:rPr>
                 <w:rStyle w:val="Hyperlink"/>
@@ -1769,7 +2540,7 @@
                 <w:noProof/>
                 <w:webHidden/>
               </w:rPr>
-              <w:instrText xml:space="preserve"> PAGEREF _Toc227236469 \h </w:instrText>
+              <w:instrText xml:space="preserve"> PAGEREF _Toc227404785 \h </w:instrText>
             </w:r>
             <w:r>
               <w:rPr>
@@ -1789,7 +2560,7 @@
                 <w:noProof/>
                 <w:webHidden/>
               </w:rPr>
-              <w:t>8</w:t>
+              <w:t>7</w:t>
             </w:r>
             <w:r>
               <w:rPr>
@@ -1807,12 +2578,12 @@
               <w:tab w:val="right" w:leader="dot" w:pos="9016"/>
             </w:tabs>
             <w:rPr>
-              <w:rFonts w:eastAsiaTheme="minorEastAsia"/>
+              <w:rFonts w:asciiTheme="minorHAnsi" w:eastAsiaTheme="minorEastAsia" w:hAnsiTheme="minorHAnsi"/>
               <w:noProof/>
               <w:lang w:eastAsia="en-GB"/>
             </w:rPr>
           </w:pPr>
-          <w:hyperlink w:anchor="_Toc227236470" w:history="1">
+          <w:hyperlink w:anchor="_Toc227404786" w:history="1">
             <w:r>
               <w:rPr>
                 <w:rStyle w:val="Hyperlink"/>
@@ -1839,7 +2610,7 @@
                 <w:noProof/>
                 <w:webHidden/>
               </w:rPr>
-              <w:instrText xml:space="preserve"> PAGEREF _Toc227236470 \h </w:instrText>
+              <w:instrText xml:space="preserve"> PAGEREF _Toc227404786 \h </w:instrText>
             </w:r>
             <w:r>
               <w:rPr>
@@ -1859,7 +2630,7 @@
                 <w:noProof/>
                 <w:webHidden/>
               </w:rPr>
-              <w:t>8</w:t>
+              <w:t>7</w:t>
             </w:r>
             <w:r>
               <w:rPr>
@@ -1877,7 +2648,7 @@
               <w:tab w:val="right" w:leader="dot" w:pos="9016"/>
             </w:tabs>
             <w:rPr>
-              <w:rFonts w:cstheme="minorBidi"/>
+              <w:rFonts w:asciiTheme="minorHAnsi" w:hAnsiTheme="minorHAnsi" w:cstheme="minorBidi"/>
               <w:noProof/>
               <w:kern w:val="2"/>
               <w:sz w:val="24"/>
@@ -1886,7 +2657,7 @@
               <w14:ligatures w14:val="standardContextual"/>
             </w:rPr>
           </w:pPr>
-          <w:hyperlink w:anchor="_Toc227236471" w:history="1">
+          <w:hyperlink w:anchor="_Toc227404787" w:history="1">
             <w:r>
               <w:rPr>
                 <w:rStyle w:val="Hyperlink"/>
@@ -1913,7 +2684,7 @@
                 <w:noProof/>
                 <w:webHidden/>
               </w:rPr>
-              <w:instrText xml:space="preserve"> PAGEREF _Toc227236471 \h </w:instrText>
+              <w:instrText xml:space="preserve"> PAGEREF _Toc227404787 \h </w:instrText>
             </w:r>
             <w:r>
               <w:rPr>
@@ -1933,7 +2704,7 @@
                 <w:noProof/>
                 <w:webHidden/>
               </w:rPr>
-              <w:t>8</w:t>
+              <w:t>7</w:t>
             </w:r>
             <w:r>
               <w:rPr>
@@ -1951,12 +2722,12 @@
               <w:tab w:val="right" w:leader="dot" w:pos="9016"/>
             </w:tabs>
             <w:rPr>
-              <w:rFonts w:eastAsiaTheme="minorEastAsia"/>
+              <w:rFonts w:asciiTheme="minorHAnsi" w:eastAsiaTheme="minorEastAsia" w:hAnsiTheme="minorHAnsi"/>
               <w:noProof/>
               <w:lang w:eastAsia="en-GB"/>
             </w:rPr>
           </w:pPr>
-          <w:hyperlink w:anchor="_Toc227236472" w:history="1">
+          <w:hyperlink w:anchor="_Toc227404788" w:history="1">
             <w:r>
               <w:rPr>
                 <w:rStyle w:val="Hyperlink"/>
@@ -1983,7 +2754,7 @@
                 <w:noProof/>
                 <w:webHidden/>
               </w:rPr>
-              <w:instrText xml:space="preserve"> PAGEREF _Toc227236472 \h </w:instrText>
+              <w:instrText xml:space="preserve"> PAGEREF _Toc227404788 \h </w:instrText>
             </w:r>
             <w:r>
               <w:rPr>
@@ -2003,7 +2774,7 @@
                 <w:noProof/>
                 <w:webHidden/>
               </w:rPr>
-              <w:t>8</w:t>
+              <w:t>7</w:t>
             </w:r>
             <w:r>
               <w:rPr>
@@ -2021,12 +2792,12 @@
               <w:tab w:val="right" w:leader="dot" w:pos="9016"/>
             </w:tabs>
             <w:rPr>
-              <w:rFonts w:eastAsiaTheme="minorEastAsia"/>
+              <w:rFonts w:asciiTheme="minorHAnsi" w:eastAsiaTheme="minorEastAsia" w:hAnsiTheme="minorHAnsi"/>
               <w:noProof/>
               <w:lang w:eastAsia="en-GB"/>
             </w:rPr>
           </w:pPr>
-          <w:hyperlink w:anchor="_Toc227236473" w:history="1">
+          <w:hyperlink w:anchor="_Toc227404789" w:history="1">
             <w:r>
               <w:rPr>
                 <w:rStyle w:val="Hyperlink"/>
@@ -2053,7 +2824,7 @@
                 <w:noProof/>
                 <w:webHidden/>
               </w:rPr>
-              <w:instrText xml:space="preserve"> PAGEREF _Toc227236473 \h </w:instrText>
+              <w:instrText xml:space="preserve"> PAGEREF _Toc227404789 \h </w:instrText>
             </w:r>
             <w:r>
               <w:rPr>
@@ -2073,7 +2844,7 @@
                 <w:noProof/>
                 <w:webHidden/>
               </w:rPr>
-              <w:t>9</w:t>
+              <w:t>7</w:t>
             </w:r>
             <w:r>
               <w:rPr>
@@ -2091,12 +2862,12 @@
               <w:tab w:val="right" w:leader="dot" w:pos="9016"/>
             </w:tabs>
             <w:rPr>
-              <w:rFonts w:eastAsiaTheme="minorEastAsia"/>
+              <w:rFonts w:asciiTheme="minorHAnsi" w:eastAsiaTheme="minorEastAsia" w:hAnsiTheme="minorHAnsi"/>
               <w:noProof/>
               <w:lang w:eastAsia="en-GB"/>
             </w:rPr>
           </w:pPr>
-          <w:hyperlink w:anchor="_Toc227236474" w:history="1">
+          <w:hyperlink w:anchor="_Toc227404790" w:history="1">
             <w:r>
               <w:rPr>
                 <w:rStyle w:val="Hyperlink"/>
@@ -2123,7 +2894,7 @@
                 <w:noProof/>
                 <w:webHidden/>
               </w:rPr>
-              <w:instrText xml:space="preserve"> PAGEREF _Toc227236474 \h </w:instrText>
+              <w:instrText xml:space="preserve"> PAGEREF _Toc227404790 \h </w:instrText>
             </w:r>
             <w:r>
               <w:rPr>
@@ -2143,7 +2914,7 @@
                 <w:noProof/>
                 <w:webHidden/>
               </w:rPr>
-              <w:t>9</w:t>
+              <w:t>8</w:t>
             </w:r>
             <w:r>
               <w:rPr>
@@ -2161,7 +2932,7 @@
               <w:tab w:val="right" w:leader="dot" w:pos="9016"/>
             </w:tabs>
             <w:rPr>
-              <w:rFonts w:cstheme="minorBidi"/>
+              <w:rFonts w:asciiTheme="minorHAnsi" w:hAnsiTheme="minorHAnsi" w:cstheme="minorBidi"/>
               <w:noProof/>
               <w:kern w:val="2"/>
               <w:sz w:val="24"/>
@@ -2170,7 +2941,7 @@
               <w14:ligatures w14:val="standardContextual"/>
             </w:rPr>
           </w:pPr>
-          <w:hyperlink w:anchor="_Toc227236475" w:history="1">
+          <w:hyperlink w:anchor="_Toc227404791" w:history="1">
             <w:r>
               <w:rPr>
                 <w:rStyle w:val="Hyperlink"/>
@@ -2197,7 +2968,7 @@
                 <w:noProof/>
                 <w:webHidden/>
               </w:rPr>
-              <w:instrText xml:space="preserve"> PAGEREF _Toc227236475 \h </w:instrText>
+              <w:instrText xml:space="preserve"> PAGEREF _Toc227404791 \h </w:instrText>
             </w:r>
             <w:r>
               <w:rPr>
@@ -2252,11 +3023,14 @@
     </w:sdt>
     <w:p>
       <w:pPr>
-        <w:pStyle w:val="Heading2"/>
-      </w:pPr>
-      <w:r>
+        <w:pStyle w:val="Heading1"/>
+      </w:pPr>
+      <w:bookmarkStart w:id="7" w:name="_Toc227404764"/>
+      <w:r>
+        <w:lastRenderedPageBreak/>
         <w:t>Table of Figures</w:t>
       </w:r>
+      <w:bookmarkEnd w:id="7"/>
     </w:p>
     <w:p>
       <w:pPr>
@@ -2265,7 +3039,7 @@
           <w:tab w:val="right" w:leader="dot" w:pos="9016"/>
         </w:tabs>
         <w:rPr>
-          <w:rFonts w:eastAsiaTheme="minorEastAsia"/>
+          <w:rFonts w:asciiTheme="minorHAnsi" w:eastAsiaTheme="minorEastAsia" w:hAnsiTheme="minorHAnsi"/>
           <w:noProof/>
           <w:lang w:eastAsia="en-GB"/>
         </w:rPr>
@@ -2294,13 +3068,13 @@
         </w:rPr>
         <w:fldChar w:fldCharType="separate"/>
       </w:r>
-      <w:hyperlink w:anchor="_Toc227236723" w:history="1">
+      <w:hyperlink w:anchor="_Toc227404719" w:history="1">
         <w:r>
           <w:rPr>
             <w:rStyle w:val="Hyperlink"/>
             <w:noProof/>
           </w:rPr>
-          <w:t>Figure 1 (Murel &amp; Kavlakoglu, n.d.)</w:t>
+          <w:t>Figure 1 (Wikipedia, n.d.), (Scher, 2017)</w:t>
         </w:r>
         <w:r>
           <w:rPr>
@@ -2321,7 +3095,7 @@
             <w:noProof/>
             <w:webHidden/>
           </w:rPr>
-          <w:instrText xml:space="preserve"> PAGEREF _Toc227236723 \h </w:instrText>
+          <w:instrText xml:space="preserve"> PAGEREF _Toc227404719 \h </w:instrText>
         </w:r>
         <w:r>
           <w:rPr>
@@ -2341,7 +3115,7 @@
             <w:noProof/>
             <w:webHidden/>
           </w:rPr>
-          <w:t>9</w:t>
+          <w:t>5</w:t>
         </w:r>
         <w:r>
           <w:rPr>
@@ -2354,12 +3128,160 @@
     </w:p>
     <w:p>
       <w:pPr>
-        <w:jc w:val="center"/>
+        <w:pStyle w:val="TableofFigures"/>
+        <w:tabs>
+          <w:tab w:val="right" w:leader="dot" w:pos="9016"/>
+        </w:tabs>
+        <w:rPr>
+          <w:rFonts w:asciiTheme="minorHAnsi" w:eastAsiaTheme="minorEastAsia" w:hAnsiTheme="minorHAnsi"/>
+          <w:noProof/>
+          <w:lang w:eastAsia="en-GB"/>
+        </w:rPr>
+      </w:pPr>
+      <w:hyperlink w:anchor="_Toc227404720" w:history="1">
+        <w:r>
+          <w:rPr>
+            <w:rStyle w:val="Hyperlink"/>
+            <w:noProof/>
+          </w:rPr>
+          <w:t>Figure 2 (Kartik, 2026)</w:t>
+        </w:r>
+        <w:r>
+          <w:rPr>
+            <w:noProof/>
+            <w:webHidden/>
+          </w:rPr>
+          <w:tab/>
+        </w:r>
+        <w:r>
+          <w:rPr>
+            <w:noProof/>
+            <w:webHidden/>
+          </w:rPr>
+          <w:fldChar w:fldCharType="begin"/>
+        </w:r>
+        <w:r>
+          <w:rPr>
+            <w:noProof/>
+            <w:webHidden/>
+          </w:rPr>
+          <w:instrText xml:space="preserve"> PAGEREF _Toc227404720 \h </w:instrText>
+        </w:r>
+        <w:r>
+          <w:rPr>
+            <w:noProof/>
+            <w:webHidden/>
+          </w:rPr>
+        </w:r>
+        <w:r>
+          <w:rPr>
+            <w:noProof/>
+            <w:webHidden/>
+          </w:rPr>
+          <w:fldChar w:fldCharType="separate"/>
+        </w:r>
+        <w:r>
+          <w:rPr>
+            <w:noProof/>
+            <w:webHidden/>
+          </w:rPr>
+          <w:t>6</w:t>
+        </w:r>
+        <w:r>
+          <w:rPr>
+            <w:noProof/>
+            <w:webHidden/>
+          </w:rPr>
+          <w:fldChar w:fldCharType="end"/>
+        </w:r>
+      </w:hyperlink>
+    </w:p>
+    <w:p>
+      <w:pPr>
+        <w:pStyle w:val="TableofFigures"/>
+        <w:tabs>
+          <w:tab w:val="right" w:leader="dot" w:pos="9016"/>
+        </w:tabs>
+        <w:rPr>
+          <w:rFonts w:asciiTheme="minorHAnsi" w:eastAsiaTheme="minorEastAsia" w:hAnsiTheme="minorHAnsi"/>
+          <w:noProof/>
+          <w:lang w:eastAsia="en-GB"/>
+        </w:rPr>
+      </w:pPr>
+      <w:hyperlink w:anchor="_Toc227404721" w:history="1">
+        <w:r>
+          <w:rPr>
+            <w:rStyle w:val="Hyperlink"/>
+            <w:noProof/>
+          </w:rPr>
+          <w:t>Figure 3 (Murel &amp; Kavlakoglu, 2024)</w:t>
+        </w:r>
+        <w:r>
+          <w:rPr>
+            <w:noProof/>
+            <w:webHidden/>
+          </w:rPr>
+          <w:tab/>
+        </w:r>
+        <w:r>
+          <w:rPr>
+            <w:noProof/>
+            <w:webHidden/>
+          </w:rPr>
+          <w:fldChar w:fldCharType="begin"/>
+        </w:r>
+        <w:r>
+          <w:rPr>
+            <w:noProof/>
+            <w:webHidden/>
+          </w:rPr>
+          <w:instrText xml:space="preserve"> PAGEREF _Toc227404721 \h </w:instrText>
+        </w:r>
+        <w:r>
+          <w:rPr>
+            <w:noProof/>
+            <w:webHidden/>
+          </w:rPr>
+        </w:r>
+        <w:r>
+          <w:rPr>
+            <w:noProof/>
+            <w:webHidden/>
+          </w:rPr>
+          <w:fldChar w:fldCharType="separate"/>
+        </w:r>
+        <w:r>
+          <w:rPr>
+            <w:noProof/>
+            <w:webHidden/>
+          </w:rPr>
+          <w:t>8</w:t>
+        </w:r>
+        <w:r>
+          <w:rPr>
+            <w:noProof/>
+            <w:webHidden/>
+          </w:rPr>
+          <w:fldChar w:fldCharType="end"/>
+        </w:r>
+      </w:hyperlink>
+    </w:p>
+    <w:p>
+      <w:pPr>
+        <w:spacing w:line="259" w:lineRule="auto"/>
         <w:rPr>
           <w:sz w:val="36"/>
           <w:szCs w:val="36"/>
           <w:u w:val="single"/>
         </w:rPr>
+        <w:sectPr>
+          <w:footerReference w:type="default" r:id="rId9"/>
+          <w:pgSz w:w="11906" w:h="16838"/>
+          <w:pgMar w:top="1440" w:right="1440" w:bottom="1440" w:left="1440" w:header="708" w:footer="708" w:gutter="0"/>
+          <w:pgNumType w:fmt="lowerRoman" w:start="1"/>
+          <w:cols w:space="708"/>
+          <w:docGrid w:linePitch="360"/>
+        </w:sectPr>
       </w:pPr>
       <w:r>
         <w:rPr>
@@ -2372,10 +3294,9 @@
     </w:p>
     <w:p>
       <w:pPr>
+        <w:spacing w:line="259" w:lineRule="auto"/>
         <w:rPr>
-          <w:sz w:val="36"/>
-          <w:szCs w:val="36"/>
-          <w:u w:val="single"/>
+          <w:sz w:val="50"/>
         </w:rPr>
       </w:pPr>
     </w:p>
@@ -2384,9 +3305,8 @@
         <w:pStyle w:val="Heading1"/>
         <w:jc w:val="center"/>
       </w:pPr>
-      <w:bookmarkStart w:id="0" w:name="_Toc227236449"/>
-      <w:r>
-        <w:lastRenderedPageBreak/>
+      <w:bookmarkStart w:id="8" w:name="_Toc227404765"/>
+      <w:r>
         <w:t>Chapter 1</w:t>
       </w:r>
       <w:r>
@@ -2401,7 +3321,7 @@
       <w:r>
         <w:t>Introduction</w:t>
       </w:r>
-      <w:bookmarkEnd w:id="0"/>
+      <w:bookmarkEnd w:id="8"/>
     </w:p>
     <w:p>
       <w:pPr>
@@ -2413,14 +3333,14 @@
           <w:u w:val="single"/>
         </w:rPr>
       </w:pPr>
-      <w:bookmarkStart w:id="1" w:name="_Toc227236450"/>
+      <w:bookmarkStart w:id="9" w:name="_Toc227404766"/>
       <w:r>
         <w:t>1.1</w:t>
       </w:r>
       <w:r>
         <w:t xml:space="preserve"> Background</w:t>
       </w:r>
-      <w:bookmarkEnd w:id="1"/>
+      <w:bookmarkEnd w:id="9"/>
     </w:p>
     <w:p>
       <w:r>
@@ -2458,11 +3378,11 @@
       <w:pPr>
         <w:pStyle w:val="Heading2"/>
       </w:pPr>
-      <w:bookmarkStart w:id="2" w:name="_Toc227236451"/>
+      <w:bookmarkStart w:id="10" w:name="_Toc227404767"/>
       <w:r>
         <w:t>1.2 Aims</w:t>
       </w:r>
-      <w:bookmarkEnd w:id="2"/>
+      <w:bookmarkEnd w:id="10"/>
     </w:p>
     <w:p>
       <w:pPr>
@@ -2474,7 +3394,7 @@
           <w:szCs w:val="28"/>
         </w:rPr>
       </w:pPr>
-      <w:bookmarkStart w:id="3" w:name="_Toc227236452"/>
+      <w:bookmarkStart w:id="11" w:name="_Toc227404768"/>
       <w:r>
         <w:rPr>
           <w:rStyle w:val="Heading2Char"/>
@@ -2484,7 +3404,7 @@
         </w:rPr>
         <w:t>1.2.1 Main Aim</w:t>
       </w:r>
-      <w:bookmarkEnd w:id="3"/>
+      <w:bookmarkEnd w:id="11"/>
     </w:p>
     <w:p>
       <w:r>
@@ -2519,12 +3439,12 @@
       <w:pPr>
         <w:pStyle w:val="Heading3"/>
       </w:pPr>
-      <w:bookmarkStart w:id="4" w:name="_Toc227236453"/>
+      <w:bookmarkStart w:id="12" w:name="_Toc227404769"/>
       <w:r>
         <w:lastRenderedPageBreak/>
         <w:t>1.2.2 Additional Aims</w:t>
       </w:r>
-      <w:bookmarkEnd w:id="4"/>
+      <w:bookmarkEnd w:id="12"/>
     </w:p>
     <w:p>
       <w:r>
@@ -2589,21 +3509,21 @@
       <w:pPr>
         <w:pStyle w:val="Heading2"/>
       </w:pPr>
-      <w:bookmarkStart w:id="5" w:name="_Toc227236454"/>
+      <w:bookmarkStart w:id="13" w:name="_Toc227404770"/>
       <w:r>
         <w:t>1.3 Objectives</w:t>
       </w:r>
-      <w:bookmarkEnd w:id="5"/>
+      <w:bookmarkEnd w:id="13"/>
     </w:p>
     <w:p>
       <w:pPr>
         <w:pStyle w:val="Heading3"/>
       </w:pPr>
-      <w:bookmarkStart w:id="6" w:name="_Toc227236455"/>
+      <w:bookmarkStart w:id="14" w:name="_Toc227404771"/>
       <w:r>
         <w:t>1.3.1 Scope</w:t>
       </w:r>
-      <w:bookmarkEnd w:id="6"/>
+      <w:bookmarkEnd w:id="14"/>
     </w:p>
     <w:p>
       <w:r>
@@ -2670,11 +3590,11 @@
       <w:pPr>
         <w:pStyle w:val="Heading3"/>
       </w:pPr>
-      <w:bookmarkStart w:id="7" w:name="_Toc227236456"/>
+      <w:bookmarkStart w:id="15" w:name="_Toc227404772"/>
       <w:r>
         <w:t>1.3.2 Research Objectives</w:t>
       </w:r>
-      <w:bookmarkEnd w:id="7"/>
+      <w:bookmarkEnd w:id="15"/>
     </w:p>
     <w:p>
       <w:r>
@@ -2715,11 +3635,11 @@
       <w:pPr>
         <w:pStyle w:val="Heading3"/>
       </w:pPr>
-      <w:bookmarkStart w:id="8" w:name="_Toc227236457"/>
+      <w:bookmarkStart w:id="16" w:name="_Toc227404773"/>
       <w:r>
         <w:t>1.3.3 Design Objectives</w:t>
       </w:r>
-      <w:bookmarkEnd w:id="8"/>
+      <w:bookmarkEnd w:id="16"/>
     </w:p>
     <w:p>
       <w:r>
@@ -2837,11 +3757,11 @@
       <w:pPr>
         <w:pStyle w:val="Heading3"/>
       </w:pPr>
-      <w:bookmarkStart w:id="9" w:name="_Toc227236458"/>
+      <w:bookmarkStart w:id="17" w:name="_Toc227404774"/>
       <w:r>
         <w:t>1.3.4 Implementation Objectives</w:t>
       </w:r>
-      <w:bookmarkEnd w:id="9"/>
+      <w:bookmarkEnd w:id="17"/>
     </w:p>
     <w:p>
       <w:r>
@@ -2956,11 +3876,11 @@
       <w:pPr>
         <w:pStyle w:val="Heading3"/>
       </w:pPr>
-      <w:bookmarkStart w:id="10" w:name="_Toc227236459"/>
+      <w:bookmarkStart w:id="18" w:name="_Toc227404775"/>
       <w:r>
         <w:t>1.3.5 Results, Evaluation and Playtesting Objectives</w:t>
       </w:r>
-      <w:bookmarkEnd w:id="10"/>
+      <w:bookmarkEnd w:id="18"/>
     </w:p>
     <w:p>
       <w:r>
@@ -2976,7 +3896,6 @@
         </w:numPr>
       </w:pPr>
       <w:r>
-        <w:lastRenderedPageBreak/>
         <w:t>Make a survey that asks questions about satisfying the above objectives.</w:t>
       </w:r>
     </w:p>
@@ -2989,6 +3908,7 @@
         </w:numPr>
       </w:pPr>
       <w:r>
+        <w:lastRenderedPageBreak/>
         <w:t>Evaluate the final product</w:t>
       </w:r>
     </w:p>
@@ -3013,21 +3933,21 @@
       <w:pPr>
         <w:pStyle w:val="Heading1"/>
       </w:pPr>
-      <w:bookmarkStart w:id="11" w:name="_Toc227236460"/>
+      <w:bookmarkStart w:id="19" w:name="_Toc227404776"/>
       <w:r>
         <w:t>Chapter 2 – Literature Survey</w:t>
       </w:r>
-      <w:bookmarkEnd w:id="11"/>
+      <w:bookmarkEnd w:id="19"/>
     </w:p>
     <w:p>
       <w:pPr>
         <w:pStyle w:val="Heading2"/>
       </w:pPr>
-      <w:bookmarkStart w:id="12" w:name="_Toc227236461"/>
+      <w:bookmarkStart w:id="20" w:name="_Toc227404777"/>
       <w:r>
         <w:t>2.1 Literature Survey Introduction</w:t>
       </w:r>
-      <w:bookmarkEnd w:id="12"/>
+      <w:bookmarkEnd w:id="20"/>
     </w:p>
     <w:p>
       <w:r>
@@ -3062,11 +3982,11 @@
       <w:pPr>
         <w:pStyle w:val="Heading2"/>
       </w:pPr>
-      <w:bookmarkStart w:id="13" w:name="_Toc227236462"/>
+      <w:bookmarkStart w:id="21" w:name="_Toc227404778"/>
       <w:r>
         <w:t>2.2 Comparative Research</w:t>
       </w:r>
-      <w:bookmarkEnd w:id="13"/>
+      <w:bookmarkEnd w:id="21"/>
     </w:p>
     <w:p>
       <w:r>
@@ -3080,14 +4000,14 @@
       <w:pPr>
         <w:pStyle w:val="Heading3"/>
       </w:pPr>
-      <w:bookmarkStart w:id="14" w:name="_Toc227236463"/>
+      <w:bookmarkStart w:id="22" w:name="_Toc227404779"/>
       <w:r>
         <w:t xml:space="preserve">2.2.1 </w:t>
       </w:r>
       <w:r>
         <w:t>World Generation</w:t>
       </w:r>
-      <w:bookmarkEnd w:id="14"/>
+      <w:bookmarkEnd w:id="22"/>
     </w:p>
     <w:p>
       <w:r>
@@ -3156,13 +4076,16 @@
       <w:pPr>
         <w:pStyle w:val="Heading4"/>
       </w:pPr>
-      <w:bookmarkStart w:id="15" w:name="_Toc227236464"/>
+      <w:bookmarkStart w:id="23" w:name="_Toc227404780"/>
       <w:r>
         <w:t>2.2.1.1 Perlin Noise</w:t>
       </w:r>
-      <w:bookmarkEnd w:id="15"/>
-    </w:p>
-    <w:p>
+      <w:bookmarkEnd w:id="23"/>
+    </w:p>
+    <w:p>
+      <w:pPr>
+        <w:keepNext/>
+      </w:pPr>
       <w:r>
         <w:t xml:space="preserve">Perlin Noise is used in </w:t>
       </w:r>
@@ -3224,17 +4147,339 @@
       <w:r>
         <w:t>.</w:t>
       </w:r>
+      <w:r>
+        <w:br/>
+      </w:r>
+      <w:r>
+        <w:lastRenderedPageBreak/>
+        <w:br/>
+      </w:r>
+    </w:p>
+    <w:tbl>
+      <w:tblPr>
+        <w:tblStyle w:val="TableGrid"/>
+        <w:tblW w:w="0" w:type="auto"/>
+        <w:tblBorders>
+          <w:top w:val="none" w:sz="0" w:space="0" w:color="auto"/>
+          <w:left w:val="none" w:sz="0" w:space="0" w:color="auto"/>
+          <w:bottom w:val="none" w:sz="0" w:space="0" w:color="auto"/>
+          <w:right w:val="none" w:sz="0" w:space="0" w:color="auto"/>
+          <w:insideH w:val="none" w:sz="0" w:space="0" w:color="auto"/>
+          <w:insideV w:val="none" w:sz="0" w:space="0" w:color="auto"/>
+        </w:tblBorders>
+        <w:tblLook w:val="04A0" w:firstRow="1" w:lastRow="0" w:firstColumn="1" w:lastColumn="0" w:noHBand="0" w:noVBand="1"/>
+      </w:tblPr>
+      <w:tblGrid>
+        <w:gridCol w:w="2934"/>
+        <w:gridCol w:w="2935"/>
+        <w:gridCol w:w="2935"/>
+        <w:gridCol w:w="222"/>
+      </w:tblGrid>
+      <w:tr>
+        <w:tc>
+          <w:tcPr>
+            <w:tcW w:w="3410" w:type="dxa"/>
+          </w:tcPr>
+          <w:p>
+            <w:pPr>
+              <w:keepNext/>
+            </w:pPr>
+            <w:r>
+              <w:rPr>
+                <w:noProof/>
+              </w:rPr>
+              <w:drawing>
+                <wp:inline distT="0" distB="0" distL="0" distR="0" wp14:anchorId="35326277" wp14:editId="5CA434D3">
+                  <wp:extent cx="1847850" cy="1847850"/>
+                  <wp:effectExtent l="0" t="0" r="0" b="0"/>
+                  <wp:docPr id="1288909920" name="Picture 1"/>
+                  <wp:cNvGraphicFramePr>
+                    <a:graphicFrameLocks xmlns:a="http://schemas.openxmlformats.org/drawingml/2006/main" noChangeAspect="1"/>
+                  </wp:cNvGraphicFramePr>
+                  <a:graphic xmlns:a="http://schemas.openxmlformats.org/drawingml/2006/main">
+                    <a:graphicData uri="http://schemas.openxmlformats.org/drawingml/2006/picture">
+                      <pic:pic xmlns:pic="http://schemas.openxmlformats.org/drawingml/2006/picture">
+                        <pic:nvPicPr>
+                          <pic:cNvPr id="1288909920" name="Picture 1"/>
+                          <pic:cNvPicPr>
+                            <a:picLocks noChangeAspect="1" noChangeArrowheads="1"/>
+                          </pic:cNvPicPr>
+                        </pic:nvPicPr>
+                        <pic:blipFill>
+                          <a:blip r:embed="rId10" cstate="print">
+                            <a:extLst>
+                              <a:ext uri="{28A0092B-C50C-407E-A947-70E740481C1C}">
+                                <a14:useLocalDpi xmlns:a14="http://schemas.microsoft.com/office/drawing/2010/main" val="0"/>
+                              </a:ext>
+                            </a:extLst>
+                          </a:blip>
+                          <a:srcRect/>
+                          <a:stretch>
+                            <a:fillRect/>
+                          </a:stretch>
+                        </pic:blipFill>
+                        <pic:spPr bwMode="auto">
+                          <a:xfrm>
+                            <a:off x="0" y="0"/>
+                            <a:ext cx="1847850" cy="1847850"/>
+                          </a:xfrm>
+                          <a:prstGeom prst="rect">
+                            <a:avLst/>
+                          </a:prstGeom>
+                          <a:noFill/>
+                          <a:ln>
+                            <a:noFill/>
+                          </a:ln>
+                        </pic:spPr>
+                      </pic:pic>
+                    </a:graphicData>
+                  </a:graphic>
+                </wp:inline>
+              </w:drawing>
+            </w:r>
+          </w:p>
+        </w:tc>
+        <w:tc>
+          <w:tcPr>
+            <w:tcW w:w="3410" w:type="dxa"/>
+          </w:tcPr>
+          <w:p>
+            <w:pPr>
+              <w:keepNext/>
+              <w:jc w:val="right"/>
+            </w:pPr>
+            <w:r>
+              <w:rPr>
+                <w:noProof/>
+              </w:rPr>
+              <w:drawing>
+                <wp:inline distT="0" distB="0" distL="0" distR="0" wp14:anchorId="237B97D9" wp14:editId="2F6C73AB">
+                  <wp:extent cx="1847850" cy="1847850"/>
+                  <wp:effectExtent l="0" t="0" r="0" b="0"/>
+                  <wp:docPr id="1710555399" name="Picture 3"/>
+                  <wp:cNvGraphicFramePr>
+                    <a:graphicFrameLocks xmlns:a="http://schemas.openxmlformats.org/drawingml/2006/main" noChangeAspect="1"/>
+                  </wp:cNvGraphicFramePr>
+                  <a:graphic xmlns:a="http://schemas.openxmlformats.org/drawingml/2006/main">
+                    <a:graphicData uri="http://schemas.openxmlformats.org/drawingml/2006/picture">
+                      <pic:pic xmlns:pic="http://schemas.openxmlformats.org/drawingml/2006/picture">
+                        <pic:nvPicPr>
+                          <pic:cNvPr id="1710555399" name="Picture 3"/>
+                          <pic:cNvPicPr>
+                            <a:picLocks noChangeAspect="1" noChangeArrowheads="1"/>
+                          </pic:cNvPicPr>
+                        </pic:nvPicPr>
+                        <pic:blipFill>
+                          <a:blip r:embed="rId11" cstate="print">
+                            <a:extLst>
+                              <a:ext uri="{28A0092B-C50C-407E-A947-70E740481C1C}">
+                                <a14:useLocalDpi xmlns:a14="http://schemas.microsoft.com/office/drawing/2010/main" val="0"/>
+                              </a:ext>
+                            </a:extLst>
+                          </a:blip>
+                          <a:srcRect/>
+                          <a:stretch>
+                            <a:fillRect/>
+                          </a:stretch>
+                        </pic:blipFill>
+                        <pic:spPr bwMode="auto">
+                          <a:xfrm>
+                            <a:off x="0" y="0"/>
+                            <a:ext cx="1847850" cy="1847850"/>
+                          </a:xfrm>
+                          <a:prstGeom prst="rect">
+                            <a:avLst/>
+                          </a:prstGeom>
+                          <a:noFill/>
+                          <a:ln>
+                            <a:noFill/>
+                          </a:ln>
+                        </pic:spPr>
+                      </pic:pic>
+                    </a:graphicData>
+                  </a:graphic>
+                </wp:inline>
+              </w:drawing>
+            </w:r>
+          </w:p>
+        </w:tc>
+        <w:tc>
+          <w:tcPr>
+            <w:tcW w:w="1103" w:type="dxa"/>
+          </w:tcPr>
+          <w:p>
+            <w:pPr>
+              <w:keepNext/>
+              <w:jc w:val="right"/>
+              <w:rPr>
+                <w:noProof/>
+              </w:rPr>
+            </w:pPr>
+            <w:r>
+              <w:rPr>
+                <w:noProof/>
+              </w:rPr>
+              <w:drawing>
+                <wp:inline distT="0" distB="0" distL="0" distR="0" wp14:anchorId="15D2DAB3" wp14:editId="720B74F3">
+                  <wp:extent cx="1846021" cy="1848884"/>
+                  <wp:effectExtent l="0" t="0" r="1905" b="0"/>
+                  <wp:docPr id="154416457" name="Picture 5"/>
+                  <wp:cNvGraphicFramePr>
+                    <a:graphicFrameLocks xmlns:a="http://schemas.openxmlformats.org/drawingml/2006/main" noChangeAspect="1"/>
+                  </wp:cNvGraphicFramePr>
+                  <a:graphic xmlns:a="http://schemas.openxmlformats.org/drawingml/2006/main">
+                    <a:graphicData uri="http://schemas.openxmlformats.org/drawingml/2006/picture">
+                      <pic:pic xmlns:pic="http://schemas.openxmlformats.org/drawingml/2006/picture">
+                        <pic:nvPicPr>
+                          <pic:cNvPr id="0" name="Picture 7"/>
+                          <pic:cNvPicPr>
+                            <a:picLocks noChangeAspect="1" noChangeArrowheads="1"/>
+                          </pic:cNvPicPr>
+                        </pic:nvPicPr>
+                        <pic:blipFill>
+                          <a:blip r:embed="rId12" cstate="print">
+                            <a:extLst>
+                              <a:ext uri="{28A0092B-C50C-407E-A947-70E740481C1C}">
+                                <a14:useLocalDpi xmlns:a14="http://schemas.microsoft.com/office/drawing/2010/main" val="0"/>
+                              </a:ext>
+                            </a:extLst>
+                          </a:blip>
+                          <a:srcRect/>
+                          <a:stretch>
+                            <a:fillRect/>
+                          </a:stretch>
+                        </pic:blipFill>
+                        <pic:spPr bwMode="auto">
+                          <a:xfrm flipH="1">
+                            <a:off x="0" y="0"/>
+                            <a:ext cx="1860008" cy="1862893"/>
+                          </a:xfrm>
+                          <a:prstGeom prst="rect">
+                            <a:avLst/>
+                          </a:prstGeom>
+                          <a:noFill/>
+                          <a:ln>
+                            <a:noFill/>
+                          </a:ln>
+                        </pic:spPr>
+                      </pic:pic>
+                    </a:graphicData>
+                  </a:graphic>
+                </wp:inline>
+              </w:drawing>
+            </w:r>
+          </w:p>
+        </w:tc>
+        <w:tc>
+          <w:tcPr>
+            <w:tcW w:w="1103" w:type="dxa"/>
+          </w:tcPr>
+          <w:p>
+            <w:pPr>
+              <w:keepNext/>
+              <w:jc w:val="right"/>
+              <w:rPr>
+                <w:noProof/>
+              </w:rPr>
+            </w:pPr>
+          </w:p>
+        </w:tc>
+      </w:tr>
+    </w:tbl>
+    <w:p>
+      <w:pPr>
+        <w:pStyle w:val="Caption"/>
+        <w:jc w:val="center"/>
+      </w:pPr>
+      <w:bookmarkStart w:id="24" w:name="_Toc227404719"/>
+      <w:r>
+        <w:t xml:space="preserve">Figure </w:t>
+      </w:r>
+      <w:fldSimple w:instr=" SEQ Figure \* ARABIC ">
+        <w:r>
+          <w:rPr>
+            <w:noProof/>
+          </w:rPr>
+          <w:t>1</w:t>
+        </w:r>
+      </w:fldSimple>
+      <w:r>
+        <w:t xml:space="preserve"> </w:t>
+      </w:r>
+      <w:sdt>
+        <w:sdtPr>
+          <w:id w:val="-998036595"/>
+          <w:citation/>
+        </w:sdtPr>
+        <w:sdtContent>
+          <w:r>
+            <w:fldChar w:fldCharType="begin"/>
+          </w:r>
+          <w:r>
+            <w:instrText xml:space="preserve"> CITATION Wik26 \l 2057 </w:instrText>
+          </w:r>
+          <w:r>
+            <w:fldChar w:fldCharType="separate"/>
+          </w:r>
+          <w:r>
+            <w:rPr>
+              <w:noProof/>
+            </w:rPr>
+            <w:t>(Wikipedia, n.d.)</w:t>
+          </w:r>
+          <w:r>
+            <w:fldChar w:fldCharType="end"/>
+          </w:r>
+        </w:sdtContent>
+      </w:sdt>
+      <w:r>
+        <w:t xml:space="preserve">, </w:t>
+      </w:r>
+      <w:sdt>
+        <w:sdtPr>
+          <w:id w:val="-638264324"/>
+          <w:citation/>
+        </w:sdtPr>
+        <w:sdtContent>
+          <w:r>
+            <w:fldChar w:fldCharType="begin"/>
+          </w:r>
+          <w:r>
+            <w:instrText xml:space="preserve"> CITATION Sch17 \l 2057 </w:instrText>
+          </w:r>
+          <w:r>
+            <w:fldChar w:fldCharType="separate"/>
+          </w:r>
+          <w:r>
+            <w:rPr>
+              <w:noProof/>
+            </w:rPr>
+            <w:t>(Scher, 2017)</w:t>
+          </w:r>
+          <w:r>
+            <w:fldChar w:fldCharType="end"/>
+          </w:r>
+        </w:sdtContent>
+      </w:sdt>
+      <w:bookmarkEnd w:id="24"/>
+    </w:p>
+    <w:p>
+      <w:r>
+        <w:t xml:space="preserve">Figure 1 shows how </w:t>
+      </w:r>
+      <w:r>
+        <w:t>Perlin Noise can be transformed from random noise into a complex and diverse word generation tool, utilizing randomness and height variables to define continents and landmasses.</w:t>
+      </w:r>
     </w:p>
     <w:p>
       <w:pPr>
         <w:pStyle w:val="Heading4"/>
       </w:pPr>
-      <w:bookmarkStart w:id="16" w:name="_Toc227236465"/>
-      <w:r>
-        <w:lastRenderedPageBreak/>
+      <w:bookmarkStart w:id="25" w:name="_Toc227404781"/>
+      <w:r>
         <w:t>2.2.1.2 Binary Space Partitioning</w:t>
       </w:r>
-      <w:bookmarkEnd w:id="16"/>
+      <w:bookmarkEnd w:id="25"/>
     </w:p>
     <w:p>
       <w:r>
@@ -3282,11 +4527,11 @@
       <w:pPr>
         <w:pStyle w:val="Heading4"/>
       </w:pPr>
-      <w:bookmarkStart w:id="17" w:name="_Toc227236466"/>
+      <w:bookmarkStart w:id="26" w:name="_Toc227404782"/>
       <w:r>
         <w:t>2.2.1.3 Cellular Automata</w:t>
       </w:r>
-      <w:bookmarkEnd w:id="17"/>
+      <w:bookmarkEnd w:id="26"/>
     </w:p>
     <w:p>
       <w:r>
@@ -3391,18 +4636,22 @@
         <w:t>are</w:t>
       </w:r>
       <w:r>
-        <w:t xml:space="preserve"> used in this exact way, the game randomly defines a grid and randomly places alive cells and dead cells in the grid, typically weighted to the bottom of the grid. The game then simulates a given number of ticks, and the output of that is the world map. At this stage, biomes can be identified in one of two ways, randomly allocating sections of the world to each desired biome or using the final “weighting” of the alive cells to create the biomes.</w:t>
+        <w:t xml:space="preserve"> used in this exact way, the game randomly defines a </w:t>
+      </w:r>
+      <w:r>
+        <w:lastRenderedPageBreak/>
+        <w:t>grid and randomly places alive cells and dead cells in the grid, typically weighted to the bottom of the grid. The game then simulates a given number of ticks, and the output of that is the world map. At this stage, biomes can be identified in one of two ways, randomly allocating sections of the world to each desired biome or using the final “weighting” of the alive cells to create the biomes.</w:t>
       </w:r>
     </w:p>
     <w:p>
       <w:pPr>
         <w:pStyle w:val="Heading3"/>
       </w:pPr>
-      <w:bookmarkStart w:id="18" w:name="_Toc227236467"/>
+      <w:bookmarkStart w:id="27" w:name="_Toc227404783"/>
       <w:r>
         <w:t>2.2.2 Pathfinding</w:t>
       </w:r>
-      <w:bookmarkEnd w:id="18"/>
+      <w:bookmarkEnd w:id="27"/>
     </w:p>
     <w:p>
       <w:r>
@@ -3461,27 +4710,146 @@
       <w:pPr>
         <w:pStyle w:val="Heading4"/>
       </w:pPr>
-      <w:bookmarkStart w:id="19" w:name="_Toc227236468"/>
+      <w:bookmarkStart w:id="28" w:name="_Toc227404784"/>
+      <w:r>
+        <w:t>2.2.2.1 Dijkstra</w:t>
+      </w:r>
+      <w:bookmarkEnd w:id="28"/>
+    </w:p>
+    <w:p>
+      <w:r>
+        <w:t>Dijkstra’s algorithm is a pathfinding algorithm that uses a breadth first search, meaning it goes wider before it goes longer, that can contain a path cost. It is always guaranteed to find the shortest path but is not very optimized. The starting point is marked, then the movement cost is calculated to each neighbour nod</w:t>
+      </w:r>
+      <w:r>
+        <w:t>e</w:t>
+      </w:r>
+      <w:r>
+        <w:t xml:space="preserve">, this is repeated on every connected node to the new nodes until the end point is found. The algorithm then calculates the shortest path back to the starting point.  </w:t>
+      </w:r>
+    </w:p>
+    <w:p>
+      <w:pPr>
+        <w:keepNext/>
+        <w:jc w:val="center"/>
+      </w:pPr>
+      <w:r>
+        <w:br/>
+      </w:r>
+      <w:r>
+        <w:rPr>
+          <w:noProof/>
+        </w:rPr>
+        <w:drawing>
+          <wp:inline distT="0" distB="0" distL="0" distR="0" wp14:anchorId="2201D1D7" wp14:editId="3ADBFC53">
+            <wp:extent cx="2434442" cy="1971898"/>
+            <wp:effectExtent l="0" t="0" r="4445" b="0"/>
+            <wp:docPr id="547412665" name="Picture 7"/>
+            <wp:cNvGraphicFramePr>
+              <a:graphicFrameLocks xmlns:a="http://schemas.openxmlformats.org/drawingml/2006/main" noChangeAspect="1"/>
+            </wp:cNvGraphicFramePr>
+            <a:graphic xmlns:a="http://schemas.openxmlformats.org/drawingml/2006/main">
+              <a:graphicData uri="http://schemas.openxmlformats.org/drawingml/2006/picture">
+                <pic:pic xmlns:pic="http://schemas.openxmlformats.org/drawingml/2006/picture">
+                  <pic:nvPicPr>
+                    <pic:cNvPr id="0" name="Picture 2"/>
+                    <pic:cNvPicPr>
+                      <a:picLocks noChangeAspect="1" noChangeArrowheads="1"/>
+                    </pic:cNvPicPr>
+                  </pic:nvPicPr>
+                  <pic:blipFill>
+                    <a:blip r:embed="rId13">
+                      <a:extLst>
+                        <a:ext uri="{28A0092B-C50C-407E-A947-70E740481C1C}">
+                          <a14:useLocalDpi xmlns:a14="http://schemas.microsoft.com/office/drawing/2010/main" val="0"/>
+                        </a:ext>
+                      </a:extLst>
+                    </a:blip>
+                    <a:srcRect/>
+                    <a:stretch>
+                      <a:fillRect/>
+                    </a:stretch>
+                  </pic:blipFill>
+                  <pic:spPr bwMode="auto">
+                    <a:xfrm>
+                      <a:off x="0" y="0"/>
+                      <a:ext cx="2471854" cy="2002202"/>
+                    </a:xfrm>
+                    <a:prstGeom prst="rect">
+                      <a:avLst/>
+                    </a:prstGeom>
+                    <a:noFill/>
+                  </pic:spPr>
+                </pic:pic>
+              </a:graphicData>
+            </a:graphic>
+          </wp:inline>
+        </w:drawing>
+      </w:r>
+    </w:p>
+    <w:p>
+      <w:pPr>
+        <w:pStyle w:val="Caption"/>
+        <w:jc w:val="center"/>
+      </w:pPr>
+      <w:bookmarkStart w:id="29" w:name="_Toc227404720"/>
+      <w:r>
+        <w:t xml:space="preserve">Figure </w:t>
+      </w:r>
+      <w:fldSimple w:instr=" SEQ Figure \* ARABIC ">
+        <w:r>
+          <w:rPr>
+            <w:noProof/>
+          </w:rPr>
+          <w:t>2</w:t>
+        </w:r>
+      </w:fldSimple>
+      <w:r>
+        <w:t xml:space="preserve"> </w:t>
+      </w:r>
+      <w:sdt>
+        <w:sdtPr>
+          <w:id w:val="-61326311"/>
+          <w:citation/>
+        </w:sdtPr>
+        <w:sdtContent>
+          <w:r>
+            <w:fldChar w:fldCharType="begin"/>
+          </w:r>
+          <w:r>
+            <w:instrText xml:space="preserve"> CITATION Kar26 \l 2057 </w:instrText>
+          </w:r>
+          <w:r>
+            <w:fldChar w:fldCharType="separate"/>
+          </w:r>
+          <w:r>
+            <w:rPr>
+              <w:noProof/>
+            </w:rPr>
+            <w:t>(Kartik, 2026)</w:t>
+          </w:r>
+          <w:r>
+            <w:fldChar w:fldCharType="end"/>
+          </w:r>
+        </w:sdtContent>
+      </w:sdt>
+      <w:bookmarkEnd w:id="29"/>
+    </w:p>
+    <w:p>
+      <w:r>
+        <w:t>Figure 2 shows how a graph is constructed and shows the movement cost of each path. For example, to get from node 0 to node 4, the algorithm will firstly calculate the cost of 0 -&gt; 1 -&gt; 4 (4 + 6) then it will do   0 -&gt; 1 -&gt; 2 -&gt; 3 -&gt; 4 (4 + 3 + 2 + 10) then it will do 0 -&gt; 2 -&gt; 3 -&gt; 4 (8 + 2 + 10) then finally 0 -&gt; 2 -&gt; 1 -&gt; 4 (8 + 3 + 6). This makes the most direct path from the source node to node 4, 0 -&gt; 1 -&gt; 4. This path has a movement cost of 10.</w:t>
+      </w:r>
+    </w:p>
+    <w:p/>
+    <w:p>
+      <w:pPr>
+        <w:pStyle w:val="Heading4"/>
+      </w:pPr>
+      <w:bookmarkStart w:id="30" w:name="_Toc227404785"/>
       <w:r>
         <w:lastRenderedPageBreak/>
-        <w:t>2.2.2.1 Dijkstra</w:t>
-      </w:r>
-      <w:bookmarkEnd w:id="19"/>
-    </w:p>
-    <w:p>
-      <w:r>
-        <w:t xml:space="preserve">Dijkstra’s algorithm is a pathfinding algorithm that uses a breadth first search, meaning it goes wider before it goes longer, that can contain a path cost. It is always guaranteed to find the shortest path but is not very optimized. The starting point is marked, then the movement cost is calculated to each neighbour nod, this is repeated on every connected node to the new nodes until the end point is found. The algorithm then calculates the shortest path back to the starting point.   </w:t>
-      </w:r>
-    </w:p>
-    <w:p>
-      <w:pPr>
-        <w:pStyle w:val="Heading4"/>
-      </w:pPr>
-      <w:bookmarkStart w:id="20" w:name="_Toc227236469"/>
-      <w:r>
         <w:t>2.2.2.2 A*</w:t>
       </w:r>
-      <w:bookmarkEnd w:id="20"/>
+      <w:bookmarkEnd w:id="30"/>
     </w:p>
     <w:p>
       <w:r>
@@ -3540,11 +4908,11 @@
       <w:pPr>
         <w:pStyle w:val="Heading4"/>
       </w:pPr>
-      <w:bookmarkStart w:id="21" w:name="_Toc227236470"/>
+      <w:bookmarkStart w:id="31" w:name="_Toc227404786"/>
       <w:r>
         <w:t>2.2.2.3 Jump Point Search</w:t>
       </w:r>
-      <w:bookmarkEnd w:id="21"/>
+      <w:bookmarkEnd w:id="31"/>
     </w:p>
     <w:p>
       <w:r>
@@ -3595,11 +4963,11 @@
       <w:pPr>
         <w:pStyle w:val="Heading3"/>
       </w:pPr>
-      <w:bookmarkStart w:id="22" w:name="_Toc227236471"/>
+      <w:bookmarkStart w:id="32" w:name="_Toc227404787"/>
       <w:r>
         <w:t>2.2.3 AI Integrations</w:t>
       </w:r>
-      <w:bookmarkEnd w:id="22"/>
+      <w:bookmarkEnd w:id="32"/>
     </w:p>
     <w:p>
       <w:r>
@@ -3620,11 +4988,11 @@
       <w:pPr>
         <w:pStyle w:val="Heading4"/>
       </w:pPr>
-      <w:bookmarkStart w:id="23" w:name="_Toc227236472"/>
+      <w:bookmarkStart w:id="33" w:name="_Toc227404788"/>
       <w:r>
         <w:t>2.2.3.1 Neural Network</w:t>
       </w:r>
-      <w:bookmarkEnd w:id="23"/>
+      <w:bookmarkEnd w:id="33"/>
     </w:p>
     <w:p>
       <w:r>
@@ -3675,24 +5043,24 @@
       <w:pPr>
         <w:pStyle w:val="Heading4"/>
       </w:pPr>
-      <w:bookmarkStart w:id="24" w:name="_Toc227236473"/>
+      <w:bookmarkStart w:id="34" w:name="_Toc227404789"/>
+      <w:r>
+        <w:t>2.2.3.2 Reinforcement Learning</w:t>
+      </w:r>
+      <w:bookmarkEnd w:id="34"/>
+    </w:p>
+    <w:p>
+      <w:pPr>
+        <w:keepNext/>
+      </w:pPr>
+      <w:r>
+        <w:t>Reinforcement Learning, or RL, works by training an “agent” to make decisions through trial-and-error, interacting with an environment to maximize rewards. A reward can be as simple as giving a higher number for the “correct” result or more complex such as rewarding the AI for every possible action taken.</w:t>
+      </w:r>
+      <w:r>
+        <w:br/>
+      </w:r>
       <w:r>
         <w:lastRenderedPageBreak/>
-        <w:t>2.2.3.2 Reinforcement Learning</w:t>
-      </w:r>
-      <w:bookmarkEnd w:id="24"/>
-    </w:p>
-    <w:p>
-      <w:pPr>
-        <w:keepNext/>
-      </w:pPr>
-      <w:r>
-        <w:t>Reinforcement Learning, or RL, works by training an “agent” to make decisions through trial-and-error, interacting with an environment to maximize rewards. A reward can be as simple as giving a higher number for the “correct” result or more complex such as rewarding the AI for every possible action taken.</w:t>
-      </w:r>
-      <w:r>
-        <w:br/>
-      </w:r>
-      <w:r>
         <w:br/>
       </w:r>
       <w:r>
@@ -3717,7 +5085,7 @@
                     </pic:cNvPicPr>
                   </pic:nvPicPr>
                   <pic:blipFill>
-                    <a:blip r:embed="rId8" cstate="print">
+                    <a:blip r:embed="rId14" cstate="print">
                       <a:extLst>
                         <a:ext uri="{28A0092B-C50C-407E-A947-70E740481C1C}">
                           <a14:useLocalDpi xmlns:a14="http://schemas.microsoft.com/office/drawing/2010/main" val="0"/>
@@ -3750,7 +5118,7 @@
       <w:pPr>
         <w:pStyle w:val="Caption"/>
       </w:pPr>
-      <w:bookmarkStart w:id="25" w:name="_Toc227236723"/>
+      <w:bookmarkStart w:id="35" w:name="_Toc227404721"/>
       <w:r>
         <w:t xml:space="preserve">Figure </w:t>
       </w:r>
@@ -3759,7 +5127,7 @@
           <w:rPr>
             <w:noProof/>
           </w:rPr>
-          <w:t>1</w:t>
+          <w:t>3</w:t>
         </w:r>
       </w:fldSimple>
       <w:r>
@@ -3791,11 +5159,17 @@
           </w:r>
         </w:sdtContent>
       </w:sdt>
-      <w:bookmarkEnd w:id="25"/>
-    </w:p>
-    <w:p>
-      <w:r>
-        <w:t>Figure 1 shows a very simple reinforcement learning model in which the agent reads the state of the environment and performs an action, the environment then rewards the agent. The agent’s purpose is to maximize the reward.</w:t>
+      <w:bookmarkEnd w:id="35"/>
+    </w:p>
+    <w:p>
+      <w:r>
+        <w:t xml:space="preserve">Figure </w:t>
+      </w:r>
+      <w:r>
+        <w:t>3</w:t>
+      </w:r>
+      <w:r>
+        <w:t xml:space="preserve"> shows a very simple reinforcement learning model in which the agent reads the state of the environment and performs an action, the environment then rewards the agent. The agent’s purpose is to maximize the reward.</w:t>
       </w:r>
       <w:r>
         <w:t xml:space="preserve"> There are 2 types of learning for reinforcement models: “Supervised” and “Unsupervised”. Supervised </w:t>
@@ -3869,11 +5243,11 @@
       <w:pPr>
         <w:pStyle w:val="Heading4"/>
       </w:pPr>
-      <w:bookmarkStart w:id="26" w:name="_Toc227236474"/>
+      <w:bookmarkStart w:id="36" w:name="_Toc227404790"/>
       <w:r>
         <w:t>2.2.3.3 Imitation Learning</w:t>
       </w:r>
-      <w:bookmarkEnd w:id="26"/>
+      <w:bookmarkEnd w:id="36"/>
     </w:p>
     <w:p>
       <w:r>
@@ -3956,11 +5330,7 @@
         </w:sdtContent>
       </w:sdt>
       <w:r>
-        <w:t xml:space="preserve">. Generative Adversarial </w:t>
-      </w:r>
-      <w:r>
-        <w:lastRenderedPageBreak/>
-        <w:t xml:space="preserve">Networks are a machine learning framework where two neural networks, a generator and a discriminator, compete against each other in a zero-sum game to create realistic albeit synthetic data. </w:t>
+        <w:t xml:space="preserve">. Generative Adversarial Networks are a machine learning framework where two neural networks, a generator and a discriminator, compete against each other in a zero-sum game to create realistic albeit synthetic data. </w:t>
       </w:r>
       <w:r>
         <w:t xml:space="preserve">Inverse RL is a technique that gives a reward based on behaviour rather than having a condition be met. </w:t>
@@ -3998,7 +5368,8 @@
         <w:t>.</w:t>
       </w:r>
     </w:p>
-    <w:bookmarkStart w:id="27" w:name="_Toc227236475" w:displacedByCustomXml="next"/>
+    <w:p/>
+    <w:bookmarkStart w:id="37" w:name="_Toc227404791" w:displacedByCustomXml="next"/>
     <w:sdt>
       <w:sdtPr>
         <w:rPr>
@@ -4013,6 +5384,11 @@
           <w:docPartUnique/>
         </w:docPartObj>
       </w:sdtPr>
+      <w:sdtEndPr>
+        <w:rPr>
+          <w:rFonts w:ascii="Calibri" w:hAnsi="Calibri"/>
+        </w:rPr>
+      </w:sdtEndPr>
       <w:sdtContent>
         <w:p>
           <w:pPr>
@@ -4021,7 +5397,7 @@
           <w:r>
             <w:t>References</w:t>
           </w:r>
-          <w:bookmarkEnd w:id="27"/>
+          <w:bookmarkEnd w:id="37"/>
         </w:p>
         <w:sdt>
           <w:sdtPr>
@@ -4094,6 +5470,55 @@
                   <w:noProof/>
                 </w:rPr>
                 <w:t>s.l.:Lulu.com.</w:t>
+              </w:r>
+            </w:p>
+            <w:p>
+              <w:pPr>
+                <w:pStyle w:val="Bibliography"/>
+                <w:rPr>
+                  <w:noProof/>
+                </w:rPr>
+              </w:pPr>
+              <w:r>
+                <w:rPr>
+                  <w:noProof/>
+                </w:rPr>
+                <w:t xml:space="preserve">Kartik, 2026. </w:t>
+              </w:r>
+              <w:r>
+                <w:rPr>
+                  <w:i/>
+                  <w:iCs/>
+                  <w:noProof/>
+                </w:rPr>
+                <w:t xml:space="preserve">Dijksta's Algorithm. </w:t>
+              </w:r>
+              <w:r>
+                <w:rPr>
+                  <w:noProof/>
+                </w:rPr>
+                <w:t xml:space="preserve">[Online] </w:t>
+              </w:r>
+              <w:r>
+                <w:rPr>
+                  <w:noProof/>
+                </w:rPr>
+                <w:br/>
+                <w:t xml:space="preserve">Available at: </w:t>
+              </w:r>
+              <w:r>
+                <w:rPr>
+                  <w:noProof/>
+                  <w:u w:val="single"/>
+                </w:rPr>
+                <w:t>https://www.geeksforgeeks.org/dsa/dijkstras-shortest-path-algorithm-greedy-algo-7/</w:t>
+              </w:r>
+              <w:r>
+                <w:rPr>
+                  <w:noProof/>
+                </w:rPr>
+                <w:br/>
+                <w:t>[Accessed 04 18 2026].</w:t>
               </w:r>
             </w:p>
             <w:p>
@@ -4212,6 +5637,104 @@
                 <w:rPr>
                   <w:noProof/>
                 </w:rPr>
+                <w:t xml:space="preserve">Scher, Y., 2017. </w:t>
+              </w:r>
+              <w:r>
+                <w:rPr>
+                  <w:i/>
+                  <w:iCs/>
+                  <w:noProof/>
+                </w:rPr>
+                <w:t xml:space="preserve">Playing with Perlin Nosie: Generating Realistic Archipelagos. </w:t>
+              </w:r>
+              <w:r>
+                <w:rPr>
+                  <w:noProof/>
+                </w:rPr>
+                <w:t xml:space="preserve">[Online] </w:t>
+              </w:r>
+              <w:r>
+                <w:rPr>
+                  <w:noProof/>
+                </w:rPr>
+                <w:br/>
+                <w:t xml:space="preserve">Available at: </w:t>
+              </w:r>
+              <w:r>
+                <w:rPr>
+                  <w:noProof/>
+                  <w:u w:val="single"/>
+                </w:rPr>
+                <w:t>https://medium.com/@yvanscher/playing-with-perlin-noise-generating-realistic-archipelagos-b59f004d8401</w:t>
+              </w:r>
+              <w:r>
+                <w:rPr>
+                  <w:noProof/>
+                </w:rPr>
+                <w:br/>
+                <w:t>[Accessed 18 04 2026].</w:t>
+              </w:r>
+            </w:p>
+            <w:p>
+              <w:pPr>
+                <w:pStyle w:val="Bibliography"/>
+                <w:rPr>
+                  <w:noProof/>
+                </w:rPr>
+              </w:pPr>
+              <w:r>
+                <w:rPr>
+                  <w:noProof/>
+                </w:rPr>
+                <w:t xml:space="preserve">Wikipedia, n.d. </w:t>
+              </w:r>
+              <w:r>
+                <w:rPr>
+                  <w:i/>
+                  <w:iCs/>
+                  <w:noProof/>
+                </w:rPr>
+                <w:t xml:space="preserve">Perlin noise. </w:t>
+              </w:r>
+              <w:r>
+                <w:rPr>
+                  <w:noProof/>
+                </w:rPr>
+                <w:t xml:space="preserve">[Online] </w:t>
+              </w:r>
+              <w:r>
+                <w:rPr>
+                  <w:noProof/>
+                </w:rPr>
+                <w:br/>
+                <w:t xml:space="preserve">Available at: </w:t>
+              </w:r>
+              <w:r>
+                <w:rPr>
+                  <w:noProof/>
+                  <w:u w:val="single"/>
+                </w:rPr>
+                <w:t>https://en.wikipedia.org/wiki/Perlin_noise</w:t>
+              </w:r>
+              <w:r>
+                <w:rPr>
+                  <w:noProof/>
+                </w:rPr>
+                <w:br/>
+                <w:t>[Accessed 18 04 2026].</w:t>
+              </w:r>
+            </w:p>
+            <w:p>
+              <w:pPr>
+                <w:pStyle w:val="Bibliography"/>
+                <w:rPr>
+                  <w:noProof/>
+                </w:rPr>
+              </w:pPr>
+              <w:r>
+                <w:rPr>
+                  <w:noProof/>
+                </w:rPr>
                 <w:t xml:space="preserve">Yang, Z., Li, J., Yang, L. &amp; Chen, H., 2022. </w:t>
               </w:r>
               <w:r>
@@ -4247,6 +5770,7 @@
     <w:sectPr>
       <w:pgSz w:w="11906" w:h="16838"/>
       <w:pgMar w:top="1440" w:right="1440" w:bottom="1440" w:left="1440" w:header="708" w:footer="708" w:gutter="0"/>
+      <w:pgNumType w:start="1"/>
       <w:cols w:space="708"/>
       <w:docGrid w:linePitch="360"/>
     </w:sectPr>
@@ -4277,6 +5801,59 @@
     </w:p>
   </w:endnote>
 </w:endnotes>
+</file>
+
+<file path=word/footer1.xml><?xml version="1.0" encoding="utf-8"?>
+<w:ftr xmlns:wpc="http://schemas.microsoft.com/office/word/2010/wordprocessingCanvas" xmlns:cx="http://schemas.microsoft.com/office/drawing/2014/chartex" xmlns:cx1="http://schemas.microsoft.com/office/drawing/2015/9/8/chartex" xmlns:cx2="http://schemas.microsoft.com/office/drawing/2015/10/21/chartex" xmlns:cx3="http://schemas.microsoft.com/office/drawing/2016/5/9/chartex" xmlns:cx4="http://schemas.microsoft.com/office/drawing/2016/5/10/chartex" xmlns:cx5="http://schemas.microsoft.com/office/drawing/2016/5/11/chartex" xmlns:cx6="http://schemas.microsoft.com/office/drawing/2016/5/12/chartex" xmlns:cx7="http://schemas.microsoft.com/office/drawing/2016/5/13/chartex" xmlns:cx8="http://schemas.microsoft.com/office/drawing/2016/5/14/chartex" xmlns:mc="http://schemas.openxmlformats.org/markup-compatibility/2006" xmlns:aink="http://schemas.microsoft.com/office/drawing/2016/ink" xmlns:am3d="http://schemas.microsoft.com/office/drawing/2017/model3d" xmlns:o="urn:schemas-microsoft-com:office:office" xmlns:oel="http://schemas.microsoft.com/office/2019/extlst" xmlns:r="http://schemas.openxmlformats.org/officeDocument/2006/relationships" xmlns:m="http://schemas.openxmlformats.org/officeDocument/2006/math" xmlns:v="urn:schemas-microsoft-com:vml" xmlns:wp14="http://schemas.microsoft.com/office/word/2010/wordprocessingDrawing" xmlns:wp="http://schemas.openxmlformats.org/drawingml/2006/wordprocessingDrawing" xmlns:w10="urn:schemas-microsoft-com:office:word" xmlns:w="http://schemas.openxmlformats.org/wordprocessingml/2006/main" xmlns:w14="http://schemas.microsoft.com/office/word/2010/wordml" xmlns:w15="http://schemas.microsoft.com/office/word/2012/wordml" xmlns:w16cex="http://schemas.microsoft.com/office/word/2018/wordml/cex" xmlns:w16cid="http://schemas.microsoft.com/office/word/2016/wordml/cid" xmlns:w16="http://schemas.microsoft.com/office/word/2018/wordml" xmlns:w16du="http://schemas.microsoft.com/office/word/2023/wordml/word16du" xmlns:w16sdtdh="http://schemas.microsoft.com/office/word/2020/wordml/sdtdatahash" xmlns:w16sdtfl="http://schemas.microsoft.com/office/word/2024/wordml/sdtformatlock" xmlns:w16se="http://schemas.microsoft.com/office/word/2015/wordml/symex" xmlns:wpg="http://schemas.microsoft.com/office/word/2010/wordprocessingGroup" xmlns:wpi="http://schemas.microsoft.com/office/word/2010/wordprocessingInk" xmlns:wne="http://schemas.microsoft.com/office/word/2006/wordml" xmlns:wps="http://schemas.microsoft.com/office/word/2010/wordprocessingShape" mc:Ignorable="w14 w15 w16se w16cid w16 w16cex w16sdtdh w16sdtfl w16du wp14">
+  <w:sdt>
+    <w:sdtPr>
+      <w:id w:val="-2091762713"/>
+      <w:docPartObj>
+        <w:docPartGallery w:val="Page Numbers (Bottom of Page)"/>
+        <w:docPartUnique/>
+      </w:docPartObj>
+    </w:sdtPr>
+    <w:sdtEndPr>
+      <w:rPr>
+        <w:noProof/>
+      </w:rPr>
+    </w:sdtEndPr>
+    <w:sdtContent>
+      <w:p>
+        <w:pPr>
+          <w:pStyle w:val="Footer"/>
+          <w:jc w:val="center"/>
+        </w:pPr>
+        <w:r>
+          <w:fldChar w:fldCharType="begin"/>
+        </w:r>
+        <w:r>
+          <w:instrText xml:space="preserve"> PAGE   \* MERGEFORMAT </w:instrText>
+        </w:r>
+        <w:r>
+          <w:fldChar w:fldCharType="separate"/>
+        </w:r>
+        <w:r>
+          <w:rPr>
+            <w:noProof/>
+          </w:rPr>
+          <w:t>2</w:t>
+        </w:r>
+        <w:r>
+          <w:rPr>
+            <w:noProof/>
+          </w:rPr>
+          <w:fldChar w:fldCharType="end"/>
+        </w:r>
+      </w:p>
+    </w:sdtContent>
+  </w:sdt>
+  <w:p>
+    <w:pPr>
+      <w:pStyle w:val="Footer"/>
+    </w:pPr>
+  </w:p>
+</w:ftr>
 </file>
 
 <file path=word/footnotes.xml><?xml version="1.0" encoding="utf-8"?>
@@ -5521,7 +7098,10 @@
   <w:style w:type="paragraph" w:default="1" w:styleId="Normal">
     <w:name w:val="Normal"/>
     <w:qFormat/>
-    <w:rsid w:val="007569CB"/>
+    <w:rsid w:val="00936759"/>
+    <w:rPr>
+      <w:rFonts w:ascii="Calibri" w:hAnsi="Calibri"/>
+    </w:rPr>
   </w:style>
   <w:style w:type="paragraph" w:styleId="Heading1">
     <w:name w:val="heading 1"/>
@@ -5530,7 +7110,7 @@
     <w:link w:val="Heading1Char"/>
     <w:uiPriority w:val="9"/>
     <w:qFormat/>
-    <w:rsid w:val="00DC7DB9"/>
+    <w:rsid w:val="00936759"/>
     <w:pPr>
       <w:keepNext/>
       <w:keepLines/>
@@ -5538,7 +7118,7 @@
       <w:outlineLvl w:val="0"/>
     </w:pPr>
     <w:rPr>
-      <w:rFonts w:asciiTheme="majorHAnsi" w:eastAsiaTheme="majorEastAsia" w:hAnsiTheme="majorHAnsi" w:cstheme="majorBidi"/>
+      <w:rFonts w:eastAsiaTheme="majorEastAsia" w:cstheme="majorBidi"/>
       <w:color w:val="0F4761" w:themeColor="accent1" w:themeShade="BF"/>
       <w:sz w:val="40"/>
       <w:szCs w:val="40"/>
@@ -5552,7 +7132,7 @@
     <w:uiPriority w:val="9"/>
     <w:unhideWhenUsed/>
     <w:qFormat/>
-    <w:rsid w:val="00DC7DB9"/>
+    <w:rsid w:val="00936759"/>
     <w:pPr>
       <w:keepNext/>
       <w:keepLines/>
@@ -5560,7 +7140,7 @@
       <w:outlineLvl w:val="1"/>
     </w:pPr>
     <w:rPr>
-      <w:rFonts w:asciiTheme="majorHAnsi" w:eastAsiaTheme="majorEastAsia" w:hAnsiTheme="majorHAnsi" w:cstheme="majorBidi"/>
+      <w:rFonts w:eastAsiaTheme="majorEastAsia" w:cstheme="majorBidi"/>
       <w:color w:val="0F4761" w:themeColor="accent1" w:themeShade="BF"/>
       <w:sz w:val="32"/>
       <w:szCs w:val="32"/>
@@ -5574,7 +7154,7 @@
     <w:uiPriority w:val="9"/>
     <w:unhideWhenUsed/>
     <w:qFormat/>
-    <w:rsid w:val="00DC7DB9"/>
+    <w:rsid w:val="00936759"/>
     <w:pPr>
       <w:keepNext/>
       <w:keepLines/>
@@ -5748,9 +7328,9 @@
     <w:basedOn w:val="DefaultParagraphFont"/>
     <w:link w:val="Heading1"/>
     <w:uiPriority w:val="9"/>
-    <w:rsid w:val="00DC7DB9"/>
+    <w:rsid w:val="00936759"/>
     <w:rPr>
-      <w:rFonts w:asciiTheme="majorHAnsi" w:eastAsiaTheme="majorEastAsia" w:hAnsiTheme="majorHAnsi" w:cstheme="majorBidi"/>
+      <w:rFonts w:ascii="Calibri" w:eastAsiaTheme="majorEastAsia" w:hAnsi="Calibri" w:cstheme="majorBidi"/>
       <w:color w:val="0F4761" w:themeColor="accent1" w:themeShade="BF"/>
       <w:sz w:val="40"/>
       <w:szCs w:val="40"/>
@@ -5761,9 +7341,9 @@
     <w:basedOn w:val="DefaultParagraphFont"/>
     <w:link w:val="Heading2"/>
     <w:uiPriority w:val="9"/>
-    <w:rsid w:val="00DC7DB9"/>
+    <w:rsid w:val="00936759"/>
     <w:rPr>
-      <w:rFonts w:asciiTheme="majorHAnsi" w:eastAsiaTheme="majorEastAsia" w:hAnsiTheme="majorHAnsi" w:cstheme="majorBidi"/>
+      <w:rFonts w:ascii="Calibri" w:eastAsiaTheme="majorEastAsia" w:hAnsi="Calibri" w:cstheme="majorBidi"/>
       <w:color w:val="0F4761" w:themeColor="accent1" w:themeShade="BF"/>
       <w:sz w:val="32"/>
       <w:szCs w:val="32"/>
@@ -5774,9 +7354,9 @@
     <w:basedOn w:val="DefaultParagraphFont"/>
     <w:link w:val="Heading3"/>
     <w:uiPriority w:val="9"/>
-    <w:rsid w:val="00DC7DB9"/>
+    <w:rsid w:val="00936759"/>
     <w:rPr>
-      <w:rFonts w:eastAsiaTheme="majorEastAsia" w:cstheme="majorBidi"/>
+      <w:rFonts w:ascii="Calibri" w:eastAsiaTheme="majorEastAsia" w:hAnsi="Calibri" w:cstheme="majorBidi"/>
       <w:color w:val="0F4761" w:themeColor="accent1" w:themeShade="BF"/>
       <w:sz w:val="28"/>
       <w:szCs w:val="28"/>
@@ -6258,6 +7838,69 @@
       <w:spacing w:after="0"/>
     </w:pPr>
   </w:style>
+  <w:style w:type="paragraph" w:styleId="Header">
+    <w:name w:val="header"/>
+    <w:basedOn w:val="Normal"/>
+    <w:link w:val="HeaderChar"/>
+    <w:uiPriority w:val="99"/>
+    <w:unhideWhenUsed/>
+    <w:rsid w:val="00804CA0"/>
+    <w:pPr>
+      <w:tabs>
+        <w:tab w:val="center" w:pos="4513"/>
+        <w:tab w:val="right" w:pos="9026"/>
+      </w:tabs>
+      <w:spacing w:after="0" w:line="240" w:lineRule="auto"/>
+    </w:pPr>
+  </w:style>
+  <w:style w:type="character" w:customStyle="1" w:styleId="HeaderChar">
+    <w:name w:val="Header Char"/>
+    <w:basedOn w:val="DefaultParagraphFont"/>
+    <w:link w:val="Header"/>
+    <w:uiPriority w:val="99"/>
+    <w:rsid w:val="00804CA0"/>
+  </w:style>
+  <w:style w:type="paragraph" w:styleId="Footer">
+    <w:name w:val="footer"/>
+    <w:basedOn w:val="Normal"/>
+    <w:link w:val="FooterChar"/>
+    <w:uiPriority w:val="99"/>
+    <w:unhideWhenUsed/>
+    <w:rsid w:val="00804CA0"/>
+    <w:pPr>
+      <w:tabs>
+        <w:tab w:val="center" w:pos="4513"/>
+        <w:tab w:val="right" w:pos="9026"/>
+      </w:tabs>
+      <w:spacing w:after="0" w:line="240" w:lineRule="auto"/>
+    </w:pPr>
+  </w:style>
+  <w:style w:type="character" w:customStyle="1" w:styleId="FooterChar">
+    <w:name w:val="Footer Char"/>
+    <w:basedOn w:val="DefaultParagraphFont"/>
+    <w:link w:val="Footer"/>
+    <w:uiPriority w:val="99"/>
+    <w:rsid w:val="00804CA0"/>
+  </w:style>
+  <w:style w:type="table" w:styleId="TableGrid">
+    <w:name w:val="Table Grid"/>
+    <w:basedOn w:val="TableNormal"/>
+    <w:uiPriority w:val="39"/>
+    <w:rsid w:val="00C221A6"/>
+    <w:pPr>
+      <w:spacing w:after="0" w:line="240" w:lineRule="auto"/>
+    </w:pPr>
+    <w:tblPr>
+      <w:tblBorders>
+        <w:top w:val="single" w:sz="4" w:space="0" w:color="auto"/>
+        <w:left w:val="single" w:sz="4" w:space="0" w:color="auto"/>
+        <w:bottom w:val="single" w:sz="4" w:space="0" w:color="auto"/>
+        <w:right w:val="single" w:sz="4" w:space="0" w:color="auto"/>
+        <w:insideH w:val="single" w:sz="4" w:space="0" w:color="auto"/>
+        <w:insideV w:val="single" w:sz="4" w:space="0" w:color="auto"/>
+      </w:tblBorders>
+    </w:tblPr>
+  </w:style>
 </w:styles>
 </file>
 
@@ -6620,7 +8263,7 @@
       </b:Author>
     </b:Author>
     <b:Publisher>Lulu.com</b:Publisher>
-    <b:RefOrder>1</b:RefOrder>
+    <b:RefOrder>3</b:RefOrder>
   </b:Source>
   <b:Source>
     <b:Tag>Lää17</b:Tag>
@@ -6644,7 +8287,7 @@
         </b:NameList>
       </b:Author>
     </b:Author>
-    <b:RefOrder>2</b:RefOrder>
+    <b:RefOrder>5</b:RefOrder>
   </b:Source>
   <b:Source>
     <b:Tag>Yan22</b:Tag>
@@ -6676,7 +8319,7 @@
         </b:NameList>
       </b:Author>
     </b:Author>
-    <b:RefOrder>3</b:RefOrder>
+    <b:RefOrder>6</b:RefOrder>
   </b:Source>
   <b:Source>
     <b:Tag>Kev18</b:Tag>
@@ -6695,7 +8338,7 @@
         </b:NameList>
       </b:Author>
     </b:Author>
-    <b:RefOrder>4</b:RefOrder>
+    <b:RefOrder>7</b:RefOrder>
   </b:Source>
   <b:Source>
     <b:Tag>Mur26</b:Tag>
@@ -6721,7 +8364,7 @@
       </b:Author>
     </b:Author>
     <b:Year>2024</b:Year>
-    <b:RefOrder>5</b:RefOrder>
+    <b:RefOrder>8</b:RefOrder>
   </b:Source>
   <b:Source>
     <b:Tag>Ors21</b:Tag>
@@ -6772,13 +8415,76 @@
         </b:NameList>
       </b:Author>
     </b:Author>
-    <b:RefOrder>6</b:RefOrder>
+    <b:RefOrder>9</b:RefOrder>
+  </b:Source>
+  <b:Source>
+    <b:Tag>Wik26</b:Tag>
+    <b:SourceType>InternetSite</b:SourceType>
+    <b:Guid>{797B5469-61E6-4B70-B096-D48E61408097}</b:Guid>
+    <b:Title>Perlin noise</b:Title>
+    <b:Author>
+      <b:Author>
+        <b:NameList>
+          <b:Person>
+            <b:Last>Wikipedia</b:Last>
+          </b:Person>
+        </b:NameList>
+      </b:Author>
+    </b:Author>
+    <b:YearAccessed>2026</b:YearAccessed>
+    <b:MonthAccessed>04</b:MonthAccessed>
+    <b:DayAccessed>18</b:DayAccessed>
+    <b:URL>https://en.wikipedia.org/wiki/Perlin_noise</b:URL>
+    <b:RefOrder>1</b:RefOrder>
+  </b:Source>
+  <b:Source>
+    <b:Tag>Sch17</b:Tag>
+    <b:SourceType>InternetSite</b:SourceType>
+    <b:Guid>{4E9548B2-D8FE-404B-82DC-2F1742F288D7}</b:Guid>
+    <b:Author>
+      <b:Author>
+        <b:NameList>
+          <b:Person>
+            <b:Last>Scher</b:Last>
+            <b:First>Yvan</b:First>
+          </b:Person>
+        </b:NameList>
+      </b:Author>
+    </b:Author>
+    <b:Title>Playing with Perlin Nosie: Generating Realistic Archipelagos</b:Title>
+    <b:Year>2017</b:Year>
+    <b:YearAccessed>2026</b:YearAccessed>
+    <b:MonthAccessed>04</b:MonthAccessed>
+    <b:DayAccessed>18</b:DayAccessed>
+    <b:URL>https://medium.com/@yvanscher/playing-with-perlin-noise-generating-realistic-archipelagos-b59f004d8401</b:URL>
+    <b:RefOrder>2</b:RefOrder>
+  </b:Source>
+  <b:Source>
+    <b:Tag>Kar26</b:Tag>
+    <b:SourceType>InternetSite</b:SourceType>
+    <b:Guid>{AEF4D7A5-38D8-45CC-8E22-CCDB8F66AE59}</b:Guid>
+    <b:Author>
+      <b:Author>
+        <b:NameList>
+          <b:Person>
+            <b:Last>Kartik</b:Last>
+          </b:Person>
+        </b:NameList>
+      </b:Author>
+    </b:Author>
+    <b:Title>Dijksta's Algorithm</b:Title>
+    <b:Year>2026</b:Year>
+    <b:YearAccessed>2026</b:YearAccessed>
+    <b:MonthAccessed>18</b:MonthAccessed>
+    <b:DayAccessed>04</b:DayAccessed>
+    <b:URL>https://www.geeksforgeeks.org/dsa/dijkstras-shortest-path-algorithm-greedy-algo-7/</b:URL>
+    <b:RefOrder>4</b:RefOrder>
   </b:Source>
 </b:Sources>
 </file>
 
 <file path=customXml/itemProps1.xml><?xml version="1.0" encoding="utf-8"?>
-<ds:datastoreItem xmlns:ds="http://schemas.openxmlformats.org/officeDocument/2006/customXml" ds:itemID="{2309FDCD-826E-4F39-A8C4-4415CA334F2C}">
+<ds:datastoreItem xmlns:ds="http://schemas.openxmlformats.org/officeDocument/2006/customXml" ds:itemID="{12860CD0-749E-412E-8FF1-BA086C6F884E}">
   <ds:schemaRefs>
     <ds:schemaRef ds:uri="http://schemas.openxmlformats.org/officeDocument/2006/bibliography"/>
   </ds:schemaRefs>

</xml_diff>

<commit_message>
feat: design chapter intro written
</commit_message>
<xml_diff>
--- a/Report.docx
+++ b/Report.docx
@@ -331,15 +331,7 @@
     </w:p>
     <w:p>
       <w:r>
-        <w:t xml:space="preserve">AI is a still growing industry and while the current trend of AI is heading towards the usage of Large Language Models, I believe there is a genuine use case for machine learning models within video games. The focus of this project is to uncover the current reasons behind why the industry doesn’t use machine learning AI for uses such as </w:t>
-      </w:r>
-      <w:proofErr w:type="gramStart"/>
-      <w:r>
-        <w:t>Non-Player Characters</w:t>
-      </w:r>
-      <w:proofErr w:type="gramEnd"/>
-      <w:r>
-        <w:t xml:space="preserve"> or local multiplayer games. This is appro</w:t>
+        <w:t>AI is a still growing industry and while the current trend of AI is heading towards the usage of Large Language Models, I believe there is a genuine use case for machine learning models within video games. The focus of this project is to uncover the current reasons behind why the industry doesn’t use machine learning AI for uses such as Non-Player Characters or local multiplayer games. This is appro</w:t>
       </w:r>
       <w:r>
         <w:t>ached by covering the design choices and code architecture of implementing a machine learning model into the Unity game engine. To evaluate whether the AI is functional, data has been gathered using a mix of qualitative and quantitative research. This research was collected through a short survey given to participants.</w:t>
@@ -3303,7 +3295,6 @@
     <w:p>
       <w:pPr>
         <w:pStyle w:val="Heading1"/>
-        <w:jc w:val="center"/>
       </w:pPr>
       <w:bookmarkStart w:id="8" w:name="_Toc227404765"/>
       <w:r>
@@ -3527,15 +3518,7 @@
     </w:p>
     <w:p>
       <w:r>
-        <w:t xml:space="preserve">The objectives in terms of scope for this project are going to be generally quite broad and consist of specific milestones. The core objectives </w:t>
-      </w:r>
-      <w:proofErr w:type="gramStart"/>
-      <w:r>
-        <w:t>in regards to</w:t>
-      </w:r>
-      <w:proofErr w:type="gramEnd"/>
-      <w:r>
-        <w:t xml:space="preserve"> the scope are:</w:t>
+        <w:t>The objectives in terms of scope for this project are going to be generally quite broad and consist of specific milestones. The core objectives in regards to the scope are:</w:t>
       </w:r>
     </w:p>
     <w:p>
@@ -3598,15 +3581,7 @@
     </w:p>
     <w:p>
       <w:r>
-        <w:t xml:space="preserve">For the research objectives for the game, research will be conducted into other types of media with similar features. This research will include a comparison of similar games and their features and the overall impact of those features on this project. This will be done to find a balance for the difficulty of the game and to evaluate the necessary features for the game. Some topics of features and mechanics that will be researched </w:t>
-      </w:r>
-      <w:proofErr w:type="gramStart"/>
-      <w:r>
-        <w:t>include:</w:t>
-      </w:r>
-      <w:proofErr w:type="gramEnd"/>
-      <w:r>
-        <w:t xml:space="preserve"> World Generation, Pathfinding</w:t>
+        <w:t>For the research objectives for the game, research will be conducted into other types of media with similar features. This research will include a comparison of similar games and their features and the overall impact of those features on this project. This will be done to find a balance for the difficulty of the game and to evaluate the necessary features for the game. Some topics of features and mechanics that will be researched include: World Generation, Pathfinding</w:t>
       </w:r>
       <w:r>
         <w:t xml:space="preserve"> and </w:t>
@@ -4087,26 +4062,10 @@
         <w:keepNext/>
       </w:pPr>
       <w:r>
-        <w:t xml:space="preserve">Perlin Noise is used in </w:t>
-      </w:r>
-      <w:proofErr w:type="gramStart"/>
-      <w:r>
-        <w:t>the majority of</w:t>
-      </w:r>
-      <w:proofErr w:type="gramEnd"/>
-      <w:r>
-        <w:t xml:space="preserve"> world generations due to its versatility.</w:t>
-      </w:r>
-      <w:r>
-        <w:t xml:space="preserve"> It works </w:t>
-      </w:r>
-      <w:proofErr w:type="gramStart"/>
-      <w:r>
-        <w:t>through the use of</w:t>
-      </w:r>
-      <w:proofErr w:type="gramEnd"/>
-      <w:r>
-        <w:t xml:space="preserve"> layering</w:t>
+        <w:t>Perlin Noise is used in the majority of world generations due to its versatility.</w:t>
+      </w:r>
+      <w:r>
+        <w:t xml:space="preserve"> It works through the use of layering</w:t>
       </w:r>
       <w:r>
         <w:t xml:space="preserve"> </w:t>
@@ -4589,15 +4548,7 @@
         <w:t>)</w:t>
       </w:r>
       <w:r>
-        <w:t xml:space="preserve"> according to the following two rules: If a cell is alive, it survives to the next generation if it has 2 or 3 live neighbors; otherwise it dies. If a cell is dead, it comes to life in the next generation if it has exactly 3 live neighbors; </w:t>
-      </w:r>
-      <w:proofErr w:type="gramStart"/>
-      <w:r>
-        <w:t>otherwise</w:t>
-      </w:r>
-      <w:proofErr w:type="gramEnd"/>
-      <w:r>
-        <w:t xml:space="preserve"> it stays dead.” </w:t>
+        <w:t xml:space="preserve"> according to the following two rules: If a cell is alive, it survives to the next generation if it has 2 or 3 live neighbors; otherwise it dies. If a cell is dead, it comes to life in the next generation if it has exactly 3 live neighbors; otherwise it stays dead.” </w:t>
       </w:r>
       <w:sdt>
         <w:sdtPr>
@@ -4683,15 +4634,7 @@
         <w:t xml:space="preserve"> </w:t>
       </w:r>
       <w:r>
-        <w:t xml:space="preserve">The types of pathfinding I will be evaluating </w:t>
-      </w:r>
-      <w:proofErr w:type="gramStart"/>
-      <w:r>
-        <w:t>are:</w:t>
-      </w:r>
-      <w:proofErr w:type="gramEnd"/>
-      <w:r>
-        <w:t xml:space="preserve"> A*, Dijkstra</w:t>
+        <w:t>The types of pathfinding I will be evaluating are: A*, Dijkstra</w:t>
       </w:r>
       <w:r>
         <w:t>,</w:t>
@@ -4853,15 +4796,7 @@
     </w:p>
     <w:p>
       <w:r>
-        <w:t xml:space="preserve">A* is an algorithm that shares the same approach as Dijkstra, although it is more efficient. </w:t>
-      </w:r>
-      <w:proofErr w:type="gramStart"/>
-      <w:r>
-        <w:t>In order to</w:t>
-      </w:r>
-      <w:proofErr w:type="gramEnd"/>
-      <w:r>
-        <w:t xml:space="preserve"> be more efficient, the algorithm “combines Dijkstra’s algorithm with a case-specific heuristic value”</w:t>
+        <w:t>A* is an algorithm that shares the same approach as Dijkstra, although it is more efficient. In order to be more efficient, the algorithm “combines Dijkstra’s algorithm with a case-specific heuristic value”</w:t>
       </w:r>
       <w:r>
         <w:t xml:space="preserve"> </w:t>
@@ -4895,11 +4830,9 @@
       <w:r>
         <w:t xml:space="preserve">. This is always guaranteed to find the shortest path and the heuristic value allows the algorithm to disregard paths that lead away from the destination, allowing for major optimizations </w:t>
       </w:r>
-      <w:proofErr w:type="gramStart"/>
       <w:r>
         <w:t>in regard to</w:t>
       </w:r>
-      <w:proofErr w:type="gramEnd"/>
       <w:r>
         <w:t xml:space="preserve"> the computation speed of the algorithm. </w:t>
       </w:r>
@@ -4948,15 +4881,7 @@
         <w:t xml:space="preserve">, JPS serves as a substantial optimization through the use of “pruning” unnecessary nodes and “jumping over” empty spaces. Disregarding the </w:t>
       </w:r>
       <w:r>
-        <w:t xml:space="preserve">path cost calculations along with the </w:t>
-      </w:r>
-      <w:proofErr w:type="gramStart"/>
-      <w:r>
-        <w:t>aforementioned optimizations</w:t>
-      </w:r>
-      <w:proofErr w:type="gramEnd"/>
-      <w:r>
-        <w:t xml:space="preserve"> allows JPS to be significantly faster than A*, even up to an order of magnitude faster.</w:t>
+        <w:t>path cost calculations along with the aforementioned optimizations allows JPS to be significantly faster than A*, even up to an order of magnitude faster.</w:t>
       </w:r>
     </w:p>
     <w:p>
@@ -5366,6 +5291,34 @@
       </w:sdt>
       <w:r>
         <w:t>.</w:t>
+      </w:r>
+    </w:p>
+    <w:p>
+      <w:pPr>
+        <w:pStyle w:val="Heading1"/>
+      </w:pPr>
+      <w:r>
+        <w:lastRenderedPageBreak/>
+        <w:t>Chapter 3 – Design</w:t>
+      </w:r>
+    </w:p>
+    <w:p>
+      <w:r>
+        <w:t>The design chapter will outline the main features of **insert game name** and the reasoning behind choosing these techniques.</w:t>
+      </w:r>
+      <w:r>
+        <w:t xml:space="preserve"> This chapter will be dedicated to the overall technical decisions made before implementing these ideas.</w:t>
+      </w:r>
+      <w:r>
+        <w:t xml:space="preserve"> The subchapters in this section are labelled after each of the research subchapters from the literature survey.</w:t>
+      </w:r>
+    </w:p>
+    <w:p>
+      <w:pPr>
+        <w:pStyle w:val="Heading2"/>
+      </w:pPr>
+      <w:r>
+        <w:t xml:space="preserve">3.1 </w:t>
       </w:r>
     </w:p>
     <w:p/>
@@ -7300,6 +7253,7 @@
   <w:style w:type="character" w:default="1" w:styleId="DefaultParagraphFont">
     <w:name w:val="Default Paragraph Font"/>
     <w:uiPriority w:val="1"/>
+    <w:semiHidden/>
     <w:unhideWhenUsed/>
   </w:style>
   <w:style w:type="table" w:default="1" w:styleId="TableNormal">

</xml_diff>

<commit_message>
fix: more accurately explained dijkstra's algorithm
</commit_message>
<xml_diff>
--- a/Report.docx
+++ b/Report.docx
@@ -331,7 +331,15 @@
     </w:p>
     <w:p>
       <w:r>
-        <w:t>AI is a still growing industry and while the current trend of AI is heading towards the usage of Large Language Models, I believe there is a genuine use case for machine learning models within video games. The focus of this project is to uncover the current reasons behind why the industry doesn’t use machine learning AI for uses such as Non-Player Characters or local multiplayer games. This is appro</w:t>
+        <w:t xml:space="preserve">AI is a still growing industry and while the current trend of AI is heading towards the usage of Large Language Models, I believe there is a genuine use case for machine learning models within video games. The focus of this project is to uncover the current reasons behind why the industry doesn’t use machine learning AI for uses such as </w:t>
+      </w:r>
+      <w:proofErr w:type="gramStart"/>
+      <w:r>
+        <w:t>Non-Player Characters</w:t>
+      </w:r>
+      <w:proofErr w:type="gramEnd"/>
+      <w:r>
+        <w:t xml:space="preserve"> or local multiplayer games. This is appro</w:t>
       </w:r>
       <w:r>
         <w:t>ached by covering the design choices and code architecture of implementing a machine learning model into the Unity game engine. To evaluate whether the AI is functional, data has been gathered using a mix of qualitative and quantitative research. This research was collected through a short survey given to participants.</w:t>
@@ -3518,7 +3526,15 @@
     </w:p>
     <w:p>
       <w:r>
-        <w:t>The objectives in terms of scope for this project are going to be generally quite broad and consist of specific milestones. The core objectives in regards to the scope are:</w:t>
+        <w:t xml:space="preserve">The objectives in terms of scope for this project are going to be generally quite broad and consist of specific milestones. The core objectives </w:t>
+      </w:r>
+      <w:proofErr w:type="gramStart"/>
+      <w:r>
+        <w:t>in regards to</w:t>
+      </w:r>
+      <w:proofErr w:type="gramEnd"/>
+      <w:r>
+        <w:t xml:space="preserve"> the scope are:</w:t>
       </w:r>
     </w:p>
     <w:p>
@@ -3581,7 +3597,15 @@
     </w:p>
     <w:p>
       <w:r>
-        <w:t>For the research objectives for the game, research will be conducted into other types of media with similar features. This research will include a comparison of similar games and their features and the overall impact of those features on this project. This will be done to find a balance for the difficulty of the game and to evaluate the necessary features for the game. Some topics of features and mechanics that will be researched include: World Generation, Pathfinding</w:t>
+        <w:t xml:space="preserve">For the research objectives for the game, research will be conducted into other types of media with similar features. This research will include a comparison of similar games and their features and the overall impact of those features on this project. This will be done to find a balance for the difficulty of the game and to evaluate the necessary features for the game. Some topics of features and mechanics that will be researched </w:t>
+      </w:r>
+      <w:proofErr w:type="gramStart"/>
+      <w:r>
+        <w:t>include:</w:t>
+      </w:r>
+      <w:proofErr w:type="gramEnd"/>
+      <w:r>
+        <w:t xml:space="preserve"> World Generation, Pathfinding</w:t>
       </w:r>
       <w:r>
         <w:t xml:space="preserve"> and </w:t>
@@ -4062,10 +4086,26 @@
         <w:keepNext/>
       </w:pPr>
       <w:r>
-        <w:t>Perlin Noise is used in the majority of world generations due to its versatility.</w:t>
-      </w:r>
-      <w:r>
-        <w:t xml:space="preserve"> It works through the use of layering</w:t>
+        <w:t xml:space="preserve">Perlin Noise is used in </w:t>
+      </w:r>
+      <w:proofErr w:type="gramStart"/>
+      <w:r>
+        <w:t>the majority of</w:t>
+      </w:r>
+      <w:proofErr w:type="gramEnd"/>
+      <w:r>
+        <w:t xml:space="preserve"> world generations due to its versatility.</w:t>
+      </w:r>
+      <w:r>
+        <w:t xml:space="preserve"> It works </w:t>
+      </w:r>
+      <w:proofErr w:type="gramStart"/>
+      <w:r>
+        <w:t>through the use of</w:t>
+      </w:r>
+      <w:proofErr w:type="gramEnd"/>
+      <w:r>
+        <w:t xml:space="preserve"> layering</w:t>
       </w:r>
       <w:r>
         <w:t xml:space="preserve"> </w:t>
@@ -4354,14 +4394,27 @@
       <w:r>
         <w:t xml:space="preserve">Figure </w:t>
       </w:r>
-      <w:fldSimple w:instr=" SEQ Figure \* ARABIC ">
-        <w:r>
-          <w:rPr>
-            <w:noProof/>
-          </w:rPr>
-          <w:t>1</w:t>
-        </w:r>
-      </w:fldSimple>
+      <w:r>
+        <w:fldChar w:fldCharType="begin"/>
+      </w:r>
+      <w:r>
+        <w:instrText xml:space="preserve"> SEQ Figure \* ARABIC </w:instrText>
+      </w:r>
+      <w:r>
+        <w:fldChar w:fldCharType="separate"/>
+      </w:r>
+      <w:r>
+        <w:rPr>
+          <w:noProof/>
+        </w:rPr>
+        <w:t>1</w:t>
+      </w:r>
+      <w:r>
+        <w:rPr>
+          <w:noProof/>
+        </w:rPr>
+        <w:fldChar w:fldCharType="end"/>
+      </w:r>
       <w:r>
         <w:t xml:space="preserve"> </w:t>
       </w:r>
@@ -4548,7 +4601,15 @@
         <w:t>)</w:t>
       </w:r>
       <w:r>
-        <w:t xml:space="preserve"> according to the following two rules: If a cell is alive, it survives to the next generation if it has 2 or 3 live neighbors; otherwise it dies. If a cell is dead, it comes to life in the next generation if it has exactly 3 live neighbors; otherwise it stays dead.” </w:t>
+        <w:t xml:space="preserve"> according to the following two rules: If a cell is alive, it survives to the next generation if it has 2 or 3 live neighbors; otherwise it dies. If a cell is dead, it comes to life in the next generation if it has exactly 3 live neighbors; </w:t>
+      </w:r>
+      <w:proofErr w:type="gramStart"/>
+      <w:r>
+        <w:t>otherwise</w:t>
+      </w:r>
+      <w:proofErr w:type="gramEnd"/>
+      <w:r>
+        <w:t xml:space="preserve"> it stays dead.” </w:t>
       </w:r>
       <w:sdt>
         <w:sdtPr>
@@ -4634,7 +4695,15 @@
         <w:t xml:space="preserve"> </w:t>
       </w:r>
       <w:r>
-        <w:t>The types of pathfinding I will be evaluating are: A*, Dijkstra</w:t>
+        <w:t xml:space="preserve">The types of pathfinding I will be evaluating </w:t>
+      </w:r>
+      <w:proofErr w:type="gramStart"/>
+      <w:r>
+        <w:t>are:</w:t>
+      </w:r>
+      <w:proofErr w:type="gramEnd"/>
+      <w:r>
+        <w:t xml:space="preserve"> A*, Dijkstra</w:t>
       </w:r>
       <w:r>
         <w:t>,</w:t>
@@ -4738,14 +4807,27 @@
       <w:r>
         <w:t xml:space="preserve">Figure </w:t>
       </w:r>
-      <w:fldSimple w:instr=" SEQ Figure \* ARABIC ">
-        <w:r>
-          <w:rPr>
-            <w:noProof/>
-          </w:rPr>
-          <w:t>2</w:t>
-        </w:r>
-      </w:fldSimple>
+      <w:r>
+        <w:fldChar w:fldCharType="begin"/>
+      </w:r>
+      <w:r>
+        <w:instrText xml:space="preserve"> SEQ Figure \* ARABIC </w:instrText>
+      </w:r>
+      <w:r>
+        <w:fldChar w:fldCharType="separate"/>
+      </w:r>
+      <w:r>
+        <w:rPr>
+          <w:noProof/>
+        </w:rPr>
+        <w:t>2</w:t>
+      </w:r>
+      <w:r>
+        <w:rPr>
+          <w:noProof/>
+        </w:rPr>
+        <w:fldChar w:fldCharType="end"/>
+      </w:r>
       <w:r>
         <w:t xml:space="preserve"> </w:t>
       </w:r>
@@ -4779,24 +4861,72 @@
     </w:p>
     <w:p>
       <w:r>
-        <w:t>Figure 2 shows how a graph is constructed and shows the movement cost of each path. For example, to get from node 0 to node 4, the algorithm will firstly calculate the cost of 0 -&gt; 1 -&gt; 4 (4 + 6) then it will do   0 -&gt; 1 -&gt; 2 -&gt; 3 -&gt; 4 (4 + 3 + 2 + 10) then it will do 0 -&gt; 2 -&gt; 3 -&gt; 4 (8 + 2 + 10) then finally 0 -&gt; 2 -&gt; 1 -&gt; 4 (8 + 3 + 6). This makes the most direct path from the source node to node 4, 0 -&gt; 1 -&gt; 4. This path has a movement cost of 10.</w:t>
-      </w:r>
-    </w:p>
-    <w:p/>
+        <w:t xml:space="preserve">Figure 2 shows how a graph is constructed and shows the movement cost of each path. </w:t>
+      </w:r>
+      <w:r>
+        <w:t xml:space="preserve">For example, from our source node, node 0, we calculate the distance to </w:t>
+      </w:r>
+      <w:proofErr w:type="gramStart"/>
+      <w:r>
+        <w:t>all of</w:t>
+      </w:r>
+      <w:proofErr w:type="gramEnd"/>
+      <w:r>
+        <w:t xml:space="preserve"> its neighbour nodes, in this case being nodes 1 and 2 and take a </w:t>
+      </w:r>
+      <w:r>
+        <w:t>“</w:t>
+      </w:r>
+      <w:r>
+        <w:t>step towards</w:t>
+      </w:r>
+      <w:r>
+        <w:t>”</w:t>
+      </w:r>
+      <w:r>
+        <w:t xml:space="preserve"> the smallest node. From node 1, the algorithm </w:t>
+      </w:r>
+      <w:r>
+        <w:t xml:space="preserve">then updates the total distance travelled so the distance to node 2 is now 7, the distance to node 4 becomes 10. The algorithm then makes a </w:t>
+      </w:r>
+      <w:r>
+        <w:t>“</w:t>
+      </w:r>
+      <w:r>
+        <w:t>step towards</w:t>
+      </w:r>
+      <w:r>
+        <w:t>”</w:t>
+      </w:r>
+      <w:r>
+        <w:t xml:space="preserve"> node 2 as it is closer than node 4, and repeats the same process. The distance to node 3 becomes 9 and after node 3 is processed, it makes a step towards node 4, noticing that the cost is </w:t>
+      </w:r>
+      <w:r>
+        <w:lastRenderedPageBreak/>
+        <w:t>greater than the path it reached earlier and doesn’t update the distance as a shorter one already exists.</w:t>
+      </w:r>
+    </w:p>
     <w:p>
       <w:pPr>
         <w:pStyle w:val="Heading4"/>
       </w:pPr>
       <w:bookmarkStart w:id="30" w:name="_Toc227404785"/>
       <w:r>
-        <w:lastRenderedPageBreak/>
         <w:t>2.2.2.2 A*</w:t>
       </w:r>
       <w:bookmarkEnd w:id="30"/>
     </w:p>
     <w:p>
       <w:r>
-        <w:t>A* is an algorithm that shares the same approach as Dijkstra, although it is more efficient. In order to be more efficient, the algorithm “combines Dijkstra’s algorithm with a case-specific heuristic value”</w:t>
+        <w:t xml:space="preserve">A* is an algorithm that shares the same approach as Dijkstra, although it is more efficient. </w:t>
+      </w:r>
+      <w:proofErr w:type="gramStart"/>
+      <w:r>
+        <w:t>In order to</w:t>
+      </w:r>
+      <w:proofErr w:type="gramEnd"/>
+      <w:r>
+        <w:t xml:space="preserve"> be more efficient, the algorithm “combines Dijkstra’s algorithm with a case-specific heuristic value”</w:t>
       </w:r>
       <w:r>
         <w:t xml:space="preserve"> </w:t>
@@ -4830,9 +4960,11 @@
       <w:r>
         <w:t xml:space="preserve">. This is always guaranteed to find the shortest path and the heuristic value allows the algorithm to disregard paths that lead away from the destination, allowing for major optimizations </w:t>
       </w:r>
+      <w:proofErr w:type="gramStart"/>
       <w:r>
         <w:t>in regard to</w:t>
       </w:r>
+      <w:proofErr w:type="gramEnd"/>
       <w:r>
         <w:t xml:space="preserve"> the computation speed of the algorithm. </w:t>
       </w:r>
@@ -4881,7 +5013,15 @@
         <w:t xml:space="preserve">, JPS serves as a substantial optimization through the use of “pruning” unnecessary nodes and “jumping over” empty spaces. Disregarding the </w:t>
       </w:r>
       <w:r>
-        <w:t>path cost calculations along with the aforementioned optimizations allows JPS to be significantly faster than A*, even up to an order of magnitude faster.</w:t>
+        <w:t xml:space="preserve">path cost calculations along with the </w:t>
+      </w:r>
+      <w:proofErr w:type="gramStart"/>
+      <w:r>
+        <w:t>aforementioned optimizations</w:t>
+      </w:r>
+      <w:proofErr w:type="gramEnd"/>
+      <w:r>
+        <w:t xml:space="preserve"> allows JPS to be significantly faster than A*, even up to an order of magnitude faster.</w:t>
       </w:r>
     </w:p>
     <w:p>
@@ -5047,14 +5187,27 @@
       <w:r>
         <w:t xml:space="preserve">Figure </w:t>
       </w:r>
-      <w:fldSimple w:instr=" SEQ Figure \* ARABIC ">
-        <w:r>
-          <w:rPr>
-            <w:noProof/>
-          </w:rPr>
-          <w:t>3</w:t>
-        </w:r>
-      </w:fldSimple>
+      <w:r>
+        <w:fldChar w:fldCharType="begin"/>
+      </w:r>
+      <w:r>
+        <w:instrText xml:space="preserve"> SEQ Figure \* ARABIC </w:instrText>
+      </w:r>
+      <w:r>
+        <w:fldChar w:fldCharType="separate"/>
+      </w:r>
+      <w:r>
+        <w:rPr>
+          <w:noProof/>
+        </w:rPr>
+        <w:t>3</w:t>
+      </w:r>
+      <w:r>
+        <w:rPr>
+          <w:noProof/>
+        </w:rPr>
+        <w:fldChar w:fldCharType="end"/>
+      </w:r>
       <w:r>
         <w:t xml:space="preserve"> </w:t>
       </w:r>
@@ -7253,7 +7406,6 @@
   <w:style w:type="character" w:default="1" w:styleId="DefaultParagraphFont">
     <w:name w:val="Default Paragraph Font"/>
     <w:uiPriority w:val="1"/>
-    <w:semiHidden/>
     <w:unhideWhenUsed/>
   </w:style>
   <w:style w:type="table" w:default="1" w:styleId="TableNormal">
@@ -7855,6 +8007,17 @@
       </w:tblBorders>
     </w:tblPr>
   </w:style>
+  <w:style w:type="paragraph" w:styleId="NormalWeb">
+    <w:name w:val="Normal (Web)"/>
+    <w:basedOn w:val="Normal"/>
+    <w:uiPriority w:val="99"/>
+    <w:semiHidden/>
+    <w:unhideWhenUsed/>
+    <w:rsid w:val="0090506A"/>
+    <w:rPr>
+      <w:rFonts w:ascii="Times New Roman" w:hAnsi="Times New Roman" w:cs="Times New Roman"/>
+    </w:rPr>
+  </w:style>
 </w:styles>
 </file>
 

</xml_diff>

<commit_message>
feat: part 1 of tile design
talk about things like coordinate system
</commit_message>
<xml_diff>
--- a/Report.docx
+++ b/Report.docx
@@ -321,7 +321,7 @@
         <w:pStyle w:val="Heading1"/>
       </w:pPr>
       <w:bookmarkStart w:id="1" w:name="_Toc40898999"/>
-      <w:bookmarkStart w:id="2" w:name="_Toc227404760"/>
+      <w:bookmarkStart w:id="2" w:name="_Toc227684366"/>
       <w:r>
         <w:lastRenderedPageBreak/>
         <w:t>Abstract</w:t>
@@ -369,7 +369,7 @@
         <w:spacing w:after="321"/>
         <w:ind w:left="-5"/>
       </w:pPr>
-      <w:bookmarkStart w:id="3" w:name="_Toc227404761"/>
+      <w:bookmarkStart w:id="3" w:name="_Toc227684367"/>
       <w:r>
         <w:lastRenderedPageBreak/>
         <w:t>Declaration</w:t>
@@ -491,7 +491,7 @@
         <w:ind w:left="-5"/>
       </w:pPr>
       <w:bookmarkStart w:id="4" w:name="_Toc40899001"/>
-      <w:bookmarkStart w:id="5" w:name="_Toc227404762"/>
+      <w:bookmarkStart w:id="5" w:name="_Toc227684368"/>
       <w:r>
         <w:lastRenderedPageBreak/>
         <w:t>Acknowledgements</w:t>
@@ -625,7 +625,7 @@
         <w:spacing w:line="259" w:lineRule="auto"/>
       </w:pPr>
     </w:p>
-    <w:bookmarkStart w:id="6" w:name="_Toc227404763" w:displacedByCustomXml="next"/>
+    <w:bookmarkStart w:id="6" w:name="_Toc227684369" w:displacedByCustomXml="next"/>
     <w:sdt>
       <w:sdtPr>
         <w:rPr>
@@ -683,7 +683,7 @@
           <w:r>
             <w:fldChar w:fldCharType="separate"/>
           </w:r>
-          <w:hyperlink w:anchor="_Toc227404760" w:history="1">
+          <w:hyperlink w:anchor="_Toc227684366" w:history="1">
             <w:r>
               <w:rPr>
                 <w:rStyle w:val="Hyperlink"/>
@@ -710,7 +710,7 @@
                 <w:noProof/>
                 <w:webHidden/>
               </w:rPr>
-              <w:instrText xml:space="preserve"> PAGEREF _Toc227404760 \h </w:instrText>
+              <w:instrText xml:space="preserve"> PAGEREF _Toc227684366 \h </w:instrText>
             </w:r>
             <w:r>
               <w:rPr>
@@ -757,7 +757,7 @@
               <w14:ligatures w14:val="standardContextual"/>
             </w:rPr>
           </w:pPr>
-          <w:hyperlink w:anchor="_Toc227404761" w:history="1">
+          <w:hyperlink w:anchor="_Toc227684367" w:history="1">
             <w:r>
               <w:rPr>
                 <w:rStyle w:val="Hyperlink"/>
@@ -784,7 +784,7 @@
                 <w:noProof/>
                 <w:webHidden/>
               </w:rPr>
-              <w:instrText xml:space="preserve"> PAGEREF _Toc227404761 \h </w:instrText>
+              <w:instrText xml:space="preserve"> PAGEREF _Toc227684367 \h </w:instrText>
             </w:r>
             <w:r>
               <w:rPr>
@@ -831,7 +831,7 @@
               <w14:ligatures w14:val="standardContextual"/>
             </w:rPr>
           </w:pPr>
-          <w:hyperlink w:anchor="_Toc227404762" w:history="1">
+          <w:hyperlink w:anchor="_Toc227684368" w:history="1">
             <w:r>
               <w:rPr>
                 <w:rStyle w:val="Hyperlink"/>
@@ -858,7 +858,7 @@
                 <w:noProof/>
                 <w:webHidden/>
               </w:rPr>
-              <w:instrText xml:space="preserve"> PAGEREF _Toc227404762 \h </w:instrText>
+              <w:instrText xml:space="preserve"> PAGEREF _Toc227684368 \h </w:instrText>
             </w:r>
             <w:r>
               <w:rPr>
@@ -905,7 +905,7 @@
               <w14:ligatures w14:val="standardContextual"/>
             </w:rPr>
           </w:pPr>
-          <w:hyperlink w:anchor="_Toc227404763" w:history="1">
+          <w:hyperlink w:anchor="_Toc227684369" w:history="1">
             <w:r>
               <w:rPr>
                 <w:rStyle w:val="Hyperlink"/>
@@ -932,7 +932,7 @@
                 <w:noProof/>
                 <w:webHidden/>
               </w:rPr>
-              <w:instrText xml:space="preserve"> PAGEREF _Toc227404763 \h </w:instrText>
+              <w:instrText xml:space="preserve"> PAGEREF _Toc227684369 \h </w:instrText>
             </w:r>
             <w:r>
               <w:rPr>
@@ -979,7 +979,7 @@
               <w14:ligatures w14:val="standardContextual"/>
             </w:rPr>
           </w:pPr>
-          <w:hyperlink w:anchor="_Toc227404764" w:history="1">
+          <w:hyperlink w:anchor="_Toc227684370" w:history="1">
             <w:r>
               <w:rPr>
                 <w:rStyle w:val="Hyperlink"/>
@@ -1006,7 +1006,7 @@
                 <w:noProof/>
                 <w:webHidden/>
               </w:rPr>
-              <w:instrText xml:space="preserve"> PAGEREF _Toc227404764 \h </w:instrText>
+              <w:instrText xml:space="preserve"> PAGEREF _Toc227684370 \h </w:instrText>
             </w:r>
             <w:r>
               <w:rPr>
@@ -1053,7 +1053,7 @@
               <w14:ligatures w14:val="standardContextual"/>
             </w:rPr>
           </w:pPr>
-          <w:hyperlink w:anchor="_Toc227404765" w:history="1">
+          <w:hyperlink w:anchor="_Toc227684371" w:history="1">
             <w:r>
               <w:rPr>
                 <w:rStyle w:val="Hyperlink"/>
@@ -1080,7 +1080,7 @@
                 <w:noProof/>
                 <w:webHidden/>
               </w:rPr>
-              <w:instrText xml:space="preserve"> PAGEREF _Toc227404765 \h </w:instrText>
+              <w:instrText xml:space="preserve"> PAGEREF _Toc227684371 \h </w:instrText>
             </w:r>
             <w:r>
               <w:rPr>
@@ -1127,7 +1127,7 @@
               <w14:ligatures w14:val="standardContextual"/>
             </w:rPr>
           </w:pPr>
-          <w:hyperlink w:anchor="_Toc227404766" w:history="1">
+          <w:hyperlink w:anchor="_Toc227684372" w:history="1">
             <w:r>
               <w:rPr>
                 <w:rStyle w:val="Hyperlink"/>
@@ -1154,7 +1154,7 @@
                 <w:noProof/>
                 <w:webHidden/>
               </w:rPr>
-              <w:instrText xml:space="preserve"> PAGEREF _Toc227404766 \h </w:instrText>
+              <w:instrText xml:space="preserve"> PAGEREF _Toc227684372 \h </w:instrText>
             </w:r>
             <w:r>
               <w:rPr>
@@ -1201,7 +1201,7 @@
               <w14:ligatures w14:val="standardContextual"/>
             </w:rPr>
           </w:pPr>
-          <w:hyperlink w:anchor="_Toc227404767" w:history="1">
+          <w:hyperlink w:anchor="_Toc227684373" w:history="1">
             <w:r>
               <w:rPr>
                 <w:rStyle w:val="Hyperlink"/>
@@ -1228,7 +1228,7 @@
                 <w:noProof/>
                 <w:webHidden/>
               </w:rPr>
-              <w:instrText xml:space="preserve"> PAGEREF _Toc227404767 \h </w:instrText>
+              <w:instrText xml:space="preserve"> PAGEREF _Toc227684373 \h </w:instrText>
             </w:r>
             <w:r>
               <w:rPr>
@@ -1275,7 +1275,7 @@
               <w14:ligatures w14:val="standardContextual"/>
             </w:rPr>
           </w:pPr>
-          <w:hyperlink w:anchor="_Toc227404768" w:history="1">
+          <w:hyperlink w:anchor="_Toc227684374" w:history="1">
             <w:r>
               <w:rPr>
                 <w:rStyle w:val="Hyperlink"/>
@@ -1302,7 +1302,7 @@
                 <w:noProof/>
                 <w:webHidden/>
               </w:rPr>
-              <w:instrText xml:space="preserve"> PAGEREF _Toc227404768 \h </w:instrText>
+              <w:instrText xml:space="preserve"> PAGEREF _Toc227684374 \h </w:instrText>
             </w:r>
             <w:r>
               <w:rPr>
@@ -1349,7 +1349,7 @@
               <w14:ligatures w14:val="standardContextual"/>
             </w:rPr>
           </w:pPr>
-          <w:hyperlink w:anchor="_Toc227404769" w:history="1">
+          <w:hyperlink w:anchor="_Toc227684375" w:history="1">
             <w:r>
               <w:rPr>
                 <w:rStyle w:val="Hyperlink"/>
@@ -1376,7 +1376,7 @@
                 <w:noProof/>
                 <w:webHidden/>
               </w:rPr>
-              <w:instrText xml:space="preserve"> PAGEREF _Toc227404769 \h </w:instrText>
+              <w:instrText xml:space="preserve"> PAGEREF _Toc227684375 \h </w:instrText>
             </w:r>
             <w:r>
               <w:rPr>
@@ -1423,7 +1423,7 @@
               <w14:ligatures w14:val="standardContextual"/>
             </w:rPr>
           </w:pPr>
-          <w:hyperlink w:anchor="_Toc227404770" w:history="1">
+          <w:hyperlink w:anchor="_Toc227684376" w:history="1">
             <w:r>
               <w:rPr>
                 <w:rStyle w:val="Hyperlink"/>
@@ -1450,7 +1450,7 @@
                 <w:noProof/>
                 <w:webHidden/>
               </w:rPr>
-              <w:instrText xml:space="preserve"> PAGEREF _Toc227404770 \h </w:instrText>
+              <w:instrText xml:space="preserve"> PAGEREF _Toc227684376 \h </w:instrText>
             </w:r>
             <w:r>
               <w:rPr>
@@ -1497,7 +1497,7 @@
               <w14:ligatures w14:val="standardContextual"/>
             </w:rPr>
           </w:pPr>
-          <w:hyperlink w:anchor="_Toc227404771" w:history="1">
+          <w:hyperlink w:anchor="_Toc227684377" w:history="1">
             <w:r>
               <w:rPr>
                 <w:rStyle w:val="Hyperlink"/>
@@ -1524,7 +1524,7 @@
                 <w:noProof/>
                 <w:webHidden/>
               </w:rPr>
-              <w:instrText xml:space="preserve"> PAGEREF _Toc227404771 \h </w:instrText>
+              <w:instrText xml:space="preserve"> PAGEREF _Toc227684377 \h </w:instrText>
             </w:r>
             <w:r>
               <w:rPr>
@@ -1571,7 +1571,7 @@
               <w14:ligatures w14:val="standardContextual"/>
             </w:rPr>
           </w:pPr>
-          <w:hyperlink w:anchor="_Toc227404772" w:history="1">
+          <w:hyperlink w:anchor="_Toc227684378" w:history="1">
             <w:r>
               <w:rPr>
                 <w:rStyle w:val="Hyperlink"/>
@@ -1598,7 +1598,7 @@
                 <w:noProof/>
                 <w:webHidden/>
               </w:rPr>
-              <w:instrText xml:space="preserve"> PAGEREF _Toc227404772 \h </w:instrText>
+              <w:instrText xml:space="preserve"> PAGEREF _Toc227684378 \h </w:instrText>
             </w:r>
             <w:r>
               <w:rPr>
@@ -1645,7 +1645,7 @@
               <w14:ligatures w14:val="standardContextual"/>
             </w:rPr>
           </w:pPr>
-          <w:hyperlink w:anchor="_Toc227404773" w:history="1">
+          <w:hyperlink w:anchor="_Toc227684379" w:history="1">
             <w:r>
               <w:rPr>
                 <w:rStyle w:val="Hyperlink"/>
@@ -1672,7 +1672,7 @@
                 <w:noProof/>
                 <w:webHidden/>
               </w:rPr>
-              <w:instrText xml:space="preserve"> PAGEREF _Toc227404773 \h </w:instrText>
+              <w:instrText xml:space="preserve"> PAGEREF _Toc227684379 \h </w:instrText>
             </w:r>
             <w:r>
               <w:rPr>
@@ -1719,7 +1719,7 @@
               <w14:ligatures w14:val="standardContextual"/>
             </w:rPr>
           </w:pPr>
-          <w:hyperlink w:anchor="_Toc227404774" w:history="1">
+          <w:hyperlink w:anchor="_Toc227684380" w:history="1">
             <w:r>
               <w:rPr>
                 <w:rStyle w:val="Hyperlink"/>
@@ -1746,7 +1746,7 @@
                 <w:noProof/>
                 <w:webHidden/>
               </w:rPr>
-              <w:instrText xml:space="preserve"> PAGEREF _Toc227404774 \h </w:instrText>
+              <w:instrText xml:space="preserve"> PAGEREF _Toc227684380 \h </w:instrText>
             </w:r>
             <w:r>
               <w:rPr>
@@ -1793,7 +1793,7 @@
               <w14:ligatures w14:val="standardContextual"/>
             </w:rPr>
           </w:pPr>
-          <w:hyperlink w:anchor="_Toc227404775" w:history="1">
+          <w:hyperlink w:anchor="_Toc227684381" w:history="1">
             <w:r>
               <w:rPr>
                 <w:rStyle w:val="Hyperlink"/>
@@ -1820,7 +1820,7 @@
                 <w:noProof/>
                 <w:webHidden/>
               </w:rPr>
-              <w:instrText xml:space="preserve"> PAGEREF _Toc227404775 \h </w:instrText>
+              <w:instrText xml:space="preserve"> PAGEREF _Toc227684381 \h </w:instrText>
             </w:r>
             <w:r>
               <w:rPr>
@@ -1867,7 +1867,7 @@
               <w14:ligatures w14:val="standardContextual"/>
             </w:rPr>
           </w:pPr>
-          <w:hyperlink w:anchor="_Toc227404776" w:history="1">
+          <w:hyperlink w:anchor="_Toc227684382" w:history="1">
             <w:r>
               <w:rPr>
                 <w:rStyle w:val="Hyperlink"/>
@@ -1894,7 +1894,7 @@
                 <w:noProof/>
                 <w:webHidden/>
               </w:rPr>
-              <w:instrText xml:space="preserve"> PAGEREF _Toc227404776 \h </w:instrText>
+              <w:instrText xml:space="preserve"> PAGEREF _Toc227684382 \h </w:instrText>
             </w:r>
             <w:r>
               <w:rPr>
@@ -1941,7 +1941,7 @@
               <w14:ligatures w14:val="standardContextual"/>
             </w:rPr>
           </w:pPr>
-          <w:hyperlink w:anchor="_Toc227404777" w:history="1">
+          <w:hyperlink w:anchor="_Toc227684383" w:history="1">
             <w:r>
               <w:rPr>
                 <w:rStyle w:val="Hyperlink"/>
@@ -1968,7 +1968,7 @@
                 <w:noProof/>
                 <w:webHidden/>
               </w:rPr>
-              <w:instrText xml:space="preserve"> PAGEREF _Toc227404777 \h </w:instrText>
+              <w:instrText xml:space="preserve"> PAGEREF _Toc227684383 \h </w:instrText>
             </w:r>
             <w:r>
               <w:rPr>
@@ -2015,7 +2015,7 @@
               <w14:ligatures w14:val="standardContextual"/>
             </w:rPr>
           </w:pPr>
-          <w:hyperlink w:anchor="_Toc227404778" w:history="1">
+          <w:hyperlink w:anchor="_Toc227684384" w:history="1">
             <w:r>
               <w:rPr>
                 <w:rStyle w:val="Hyperlink"/>
@@ -2042,7 +2042,7 @@
                 <w:noProof/>
                 <w:webHidden/>
               </w:rPr>
-              <w:instrText xml:space="preserve"> PAGEREF _Toc227404778 \h </w:instrText>
+              <w:instrText xml:space="preserve"> PAGEREF _Toc227684384 \h </w:instrText>
             </w:r>
             <w:r>
               <w:rPr>
@@ -2089,7 +2089,7 @@
               <w14:ligatures w14:val="standardContextual"/>
             </w:rPr>
           </w:pPr>
-          <w:hyperlink w:anchor="_Toc227404779" w:history="1">
+          <w:hyperlink w:anchor="_Toc227684385" w:history="1">
             <w:r>
               <w:rPr>
                 <w:rStyle w:val="Hyperlink"/>
@@ -2116,7 +2116,7 @@
                 <w:noProof/>
                 <w:webHidden/>
               </w:rPr>
-              <w:instrText xml:space="preserve"> PAGEREF _Toc227404779 \h </w:instrText>
+              <w:instrText xml:space="preserve"> PAGEREF _Toc227684385 \h </w:instrText>
             </w:r>
             <w:r>
               <w:rPr>
@@ -2159,7 +2159,7 @@
               <w:lang w:eastAsia="en-GB"/>
             </w:rPr>
           </w:pPr>
-          <w:hyperlink w:anchor="_Toc227404780" w:history="1">
+          <w:hyperlink w:anchor="_Toc227684386" w:history="1">
             <w:r>
               <w:rPr>
                 <w:rStyle w:val="Hyperlink"/>
@@ -2186,7 +2186,7 @@
                 <w:noProof/>
                 <w:webHidden/>
               </w:rPr>
-              <w:instrText xml:space="preserve"> PAGEREF _Toc227404780 \h </w:instrText>
+              <w:instrText xml:space="preserve"> PAGEREF _Toc227684386 \h </w:instrText>
             </w:r>
             <w:r>
               <w:rPr>
@@ -2229,7 +2229,7 @@
               <w:lang w:eastAsia="en-GB"/>
             </w:rPr>
           </w:pPr>
-          <w:hyperlink w:anchor="_Toc227404781" w:history="1">
+          <w:hyperlink w:anchor="_Toc227684387" w:history="1">
             <w:r>
               <w:rPr>
                 <w:rStyle w:val="Hyperlink"/>
@@ -2256,7 +2256,7 @@
                 <w:noProof/>
                 <w:webHidden/>
               </w:rPr>
-              <w:instrText xml:space="preserve"> PAGEREF _Toc227404781 \h </w:instrText>
+              <w:instrText xml:space="preserve"> PAGEREF _Toc227684387 \h </w:instrText>
             </w:r>
             <w:r>
               <w:rPr>
@@ -2299,7 +2299,7 @@
               <w:lang w:eastAsia="en-GB"/>
             </w:rPr>
           </w:pPr>
-          <w:hyperlink w:anchor="_Toc227404782" w:history="1">
+          <w:hyperlink w:anchor="_Toc227684388" w:history="1">
             <w:r>
               <w:rPr>
                 <w:rStyle w:val="Hyperlink"/>
@@ -2326,7 +2326,7 @@
                 <w:noProof/>
                 <w:webHidden/>
               </w:rPr>
-              <w:instrText xml:space="preserve"> PAGEREF _Toc227404782 \h </w:instrText>
+              <w:instrText xml:space="preserve"> PAGEREF _Toc227684388 \h </w:instrText>
             </w:r>
             <w:r>
               <w:rPr>
@@ -2373,7 +2373,7 @@
               <w14:ligatures w14:val="standardContextual"/>
             </w:rPr>
           </w:pPr>
-          <w:hyperlink w:anchor="_Toc227404783" w:history="1">
+          <w:hyperlink w:anchor="_Toc227684389" w:history="1">
             <w:r>
               <w:rPr>
                 <w:rStyle w:val="Hyperlink"/>
@@ -2400,7 +2400,7 @@
                 <w:noProof/>
                 <w:webHidden/>
               </w:rPr>
-              <w:instrText xml:space="preserve"> PAGEREF _Toc227404783 \h </w:instrText>
+              <w:instrText xml:space="preserve"> PAGEREF _Toc227684389 \h </w:instrText>
             </w:r>
             <w:r>
               <w:rPr>
@@ -2443,7 +2443,7 @@
               <w:lang w:eastAsia="en-GB"/>
             </w:rPr>
           </w:pPr>
-          <w:hyperlink w:anchor="_Toc227404784" w:history="1">
+          <w:hyperlink w:anchor="_Toc227684390" w:history="1">
             <w:r>
               <w:rPr>
                 <w:rStyle w:val="Hyperlink"/>
@@ -2470,7 +2470,7 @@
                 <w:noProof/>
                 <w:webHidden/>
               </w:rPr>
-              <w:instrText xml:space="preserve"> PAGEREF _Toc227404784 \h </w:instrText>
+              <w:instrText xml:space="preserve"> PAGEREF _Toc227684390 \h </w:instrText>
             </w:r>
             <w:r>
               <w:rPr>
@@ -2513,7 +2513,7 @@
               <w:lang w:eastAsia="en-GB"/>
             </w:rPr>
           </w:pPr>
-          <w:hyperlink w:anchor="_Toc227404785" w:history="1">
+          <w:hyperlink w:anchor="_Toc227684391" w:history="1">
             <w:r>
               <w:rPr>
                 <w:rStyle w:val="Hyperlink"/>
@@ -2540,7 +2540,7 @@
                 <w:noProof/>
                 <w:webHidden/>
               </w:rPr>
-              <w:instrText xml:space="preserve"> PAGEREF _Toc227404785 \h </w:instrText>
+              <w:instrText xml:space="preserve"> PAGEREF _Toc227684391 \h </w:instrText>
             </w:r>
             <w:r>
               <w:rPr>
@@ -2583,7 +2583,7 @@
               <w:lang w:eastAsia="en-GB"/>
             </w:rPr>
           </w:pPr>
-          <w:hyperlink w:anchor="_Toc227404786" w:history="1">
+          <w:hyperlink w:anchor="_Toc227684392" w:history="1">
             <w:r>
               <w:rPr>
                 <w:rStyle w:val="Hyperlink"/>
@@ -2610,7 +2610,7 @@
                 <w:noProof/>
                 <w:webHidden/>
               </w:rPr>
-              <w:instrText xml:space="preserve"> PAGEREF _Toc227404786 \h </w:instrText>
+              <w:instrText xml:space="preserve"> PAGEREF _Toc227684392 \h </w:instrText>
             </w:r>
             <w:r>
               <w:rPr>
@@ -2657,7 +2657,7 @@
               <w14:ligatures w14:val="standardContextual"/>
             </w:rPr>
           </w:pPr>
-          <w:hyperlink w:anchor="_Toc227404787" w:history="1">
+          <w:hyperlink w:anchor="_Toc227684393" w:history="1">
             <w:r>
               <w:rPr>
                 <w:rStyle w:val="Hyperlink"/>
@@ -2684,7 +2684,7 @@
                 <w:noProof/>
                 <w:webHidden/>
               </w:rPr>
-              <w:instrText xml:space="preserve"> PAGEREF _Toc227404787 \h </w:instrText>
+              <w:instrText xml:space="preserve"> PAGEREF _Toc227684393 \h </w:instrText>
             </w:r>
             <w:r>
               <w:rPr>
@@ -2727,7 +2727,7 @@
               <w:lang w:eastAsia="en-GB"/>
             </w:rPr>
           </w:pPr>
-          <w:hyperlink w:anchor="_Toc227404788" w:history="1">
+          <w:hyperlink w:anchor="_Toc227684394" w:history="1">
             <w:r>
               <w:rPr>
                 <w:rStyle w:val="Hyperlink"/>
@@ -2754,7 +2754,7 @@
                 <w:noProof/>
                 <w:webHidden/>
               </w:rPr>
-              <w:instrText xml:space="preserve"> PAGEREF _Toc227404788 \h </w:instrText>
+              <w:instrText xml:space="preserve"> PAGEREF _Toc227684394 \h </w:instrText>
             </w:r>
             <w:r>
               <w:rPr>
@@ -2797,7 +2797,7 @@
               <w:lang w:eastAsia="en-GB"/>
             </w:rPr>
           </w:pPr>
-          <w:hyperlink w:anchor="_Toc227404789" w:history="1">
+          <w:hyperlink w:anchor="_Toc227684395" w:history="1">
             <w:r>
               <w:rPr>
                 <w:rStyle w:val="Hyperlink"/>
@@ -2824,7 +2824,7 @@
                 <w:noProof/>
                 <w:webHidden/>
               </w:rPr>
-              <w:instrText xml:space="preserve"> PAGEREF _Toc227404789 \h </w:instrText>
+              <w:instrText xml:space="preserve"> PAGEREF _Toc227684395 \h </w:instrText>
             </w:r>
             <w:r>
               <w:rPr>
@@ -2867,7 +2867,7 @@
               <w:lang w:eastAsia="en-GB"/>
             </w:rPr>
           </w:pPr>
-          <w:hyperlink w:anchor="_Toc227404790" w:history="1">
+          <w:hyperlink w:anchor="_Toc227684396" w:history="1">
             <w:r>
               <w:rPr>
                 <w:rStyle w:val="Hyperlink"/>
@@ -2894,7 +2894,7 @@
                 <w:noProof/>
                 <w:webHidden/>
               </w:rPr>
-              <w:instrText xml:space="preserve"> PAGEREF _Toc227404790 \h </w:instrText>
+              <w:instrText xml:space="preserve"> PAGEREF _Toc227684396 \h </w:instrText>
             </w:r>
             <w:r>
               <w:rPr>
@@ -2941,12 +2941,234 @@
               <w14:ligatures w14:val="standardContextual"/>
             </w:rPr>
           </w:pPr>
-          <w:hyperlink w:anchor="_Toc227404791" w:history="1">
+          <w:hyperlink w:anchor="_Toc227684397" w:history="1">
             <w:r>
               <w:rPr>
                 <w:rStyle w:val="Hyperlink"/>
                 <w:noProof/>
               </w:rPr>
+              <w:t>Chapter 3 – Design</w:t>
+            </w:r>
+            <w:r>
+              <w:rPr>
+                <w:noProof/>
+                <w:webHidden/>
+              </w:rPr>
+              <w:tab/>
+            </w:r>
+            <w:r>
+              <w:rPr>
+                <w:noProof/>
+                <w:webHidden/>
+              </w:rPr>
+              <w:fldChar w:fldCharType="begin"/>
+            </w:r>
+            <w:r>
+              <w:rPr>
+                <w:noProof/>
+                <w:webHidden/>
+              </w:rPr>
+              <w:instrText xml:space="preserve"> PAGEREF _Toc227684397 \h </w:instrText>
+            </w:r>
+            <w:r>
+              <w:rPr>
+                <w:noProof/>
+                <w:webHidden/>
+              </w:rPr>
+            </w:r>
+            <w:r>
+              <w:rPr>
+                <w:noProof/>
+                <w:webHidden/>
+              </w:rPr>
+              <w:fldChar w:fldCharType="separate"/>
+            </w:r>
+            <w:r>
+              <w:rPr>
+                <w:noProof/>
+                <w:webHidden/>
+              </w:rPr>
+              <w:t>9</w:t>
+            </w:r>
+            <w:r>
+              <w:rPr>
+                <w:noProof/>
+                <w:webHidden/>
+              </w:rPr>
+              <w:fldChar w:fldCharType="end"/>
+            </w:r>
+          </w:hyperlink>
+        </w:p>
+        <w:p>
+          <w:pPr>
+            <w:pStyle w:val="TOC2"/>
+            <w:tabs>
+              <w:tab w:val="right" w:leader="dot" w:pos="9016"/>
+            </w:tabs>
+            <w:rPr>
+              <w:rFonts w:asciiTheme="minorHAnsi" w:hAnsiTheme="minorHAnsi" w:cstheme="minorBidi"/>
+              <w:noProof/>
+              <w:kern w:val="2"/>
+              <w:sz w:val="24"/>
+              <w:szCs w:val="24"/>
+              <w:lang w:val="en-GB" w:eastAsia="en-GB"/>
+              <w14:ligatures w14:val="standardContextual"/>
+            </w:rPr>
+          </w:pPr>
+          <w:hyperlink w:anchor="_Toc227684398" w:history="1">
+            <w:r>
+              <w:rPr>
+                <w:rStyle w:val="Hyperlink"/>
+                <w:noProof/>
+              </w:rPr>
+              <w:t>3.1 World Generation</w:t>
+            </w:r>
+            <w:r>
+              <w:rPr>
+                <w:noProof/>
+                <w:webHidden/>
+              </w:rPr>
+              <w:tab/>
+            </w:r>
+            <w:r>
+              <w:rPr>
+                <w:noProof/>
+                <w:webHidden/>
+              </w:rPr>
+              <w:fldChar w:fldCharType="begin"/>
+            </w:r>
+            <w:r>
+              <w:rPr>
+                <w:noProof/>
+                <w:webHidden/>
+              </w:rPr>
+              <w:instrText xml:space="preserve"> PAGEREF _Toc227684398 \h </w:instrText>
+            </w:r>
+            <w:r>
+              <w:rPr>
+                <w:noProof/>
+                <w:webHidden/>
+              </w:rPr>
+            </w:r>
+            <w:r>
+              <w:rPr>
+                <w:noProof/>
+                <w:webHidden/>
+              </w:rPr>
+              <w:fldChar w:fldCharType="separate"/>
+            </w:r>
+            <w:r>
+              <w:rPr>
+                <w:noProof/>
+                <w:webHidden/>
+              </w:rPr>
+              <w:t>9</w:t>
+            </w:r>
+            <w:r>
+              <w:rPr>
+                <w:noProof/>
+                <w:webHidden/>
+              </w:rPr>
+              <w:fldChar w:fldCharType="end"/>
+            </w:r>
+          </w:hyperlink>
+        </w:p>
+        <w:p>
+          <w:pPr>
+            <w:pStyle w:val="TOC3"/>
+            <w:tabs>
+              <w:tab w:val="right" w:leader="dot" w:pos="9016"/>
+            </w:tabs>
+            <w:rPr>
+              <w:rFonts w:asciiTheme="minorHAnsi" w:hAnsiTheme="minorHAnsi" w:cstheme="minorBidi"/>
+              <w:noProof/>
+              <w:kern w:val="2"/>
+              <w:sz w:val="24"/>
+              <w:szCs w:val="24"/>
+              <w:lang w:val="en-GB" w:eastAsia="en-GB"/>
+              <w14:ligatures w14:val="standardContextual"/>
+            </w:rPr>
+          </w:pPr>
+          <w:hyperlink w:anchor="_Toc227684399" w:history="1">
+            <w:r>
+              <w:rPr>
+                <w:rStyle w:val="Hyperlink"/>
+                <w:noProof/>
+              </w:rPr>
+              <w:t>3.1.1 The tile and its storage</w:t>
+            </w:r>
+            <w:r>
+              <w:rPr>
+                <w:noProof/>
+                <w:webHidden/>
+              </w:rPr>
+              <w:tab/>
+            </w:r>
+            <w:r>
+              <w:rPr>
+                <w:noProof/>
+                <w:webHidden/>
+              </w:rPr>
+              <w:fldChar w:fldCharType="begin"/>
+            </w:r>
+            <w:r>
+              <w:rPr>
+                <w:noProof/>
+                <w:webHidden/>
+              </w:rPr>
+              <w:instrText xml:space="preserve"> PAGEREF _Toc227684399 \h </w:instrText>
+            </w:r>
+            <w:r>
+              <w:rPr>
+                <w:noProof/>
+                <w:webHidden/>
+              </w:rPr>
+            </w:r>
+            <w:r>
+              <w:rPr>
+                <w:noProof/>
+                <w:webHidden/>
+              </w:rPr>
+              <w:fldChar w:fldCharType="separate"/>
+            </w:r>
+            <w:r>
+              <w:rPr>
+                <w:noProof/>
+                <w:webHidden/>
+              </w:rPr>
+              <w:t>9</w:t>
+            </w:r>
+            <w:r>
+              <w:rPr>
+                <w:noProof/>
+                <w:webHidden/>
+              </w:rPr>
+              <w:fldChar w:fldCharType="end"/>
+            </w:r>
+          </w:hyperlink>
+        </w:p>
+        <w:p>
+          <w:pPr>
+            <w:pStyle w:val="TOC1"/>
+            <w:tabs>
+              <w:tab w:val="right" w:leader="dot" w:pos="9016"/>
+            </w:tabs>
+            <w:rPr>
+              <w:rFonts w:asciiTheme="minorHAnsi" w:hAnsiTheme="minorHAnsi" w:cstheme="minorBidi"/>
+              <w:noProof/>
+              <w:kern w:val="2"/>
+              <w:sz w:val="24"/>
+              <w:szCs w:val="24"/>
+              <w:lang w:val="en-GB" w:eastAsia="en-GB"/>
+              <w14:ligatures w14:val="standardContextual"/>
+            </w:rPr>
+          </w:pPr>
+          <w:hyperlink w:anchor="_Toc227684400" w:history="1">
+            <w:r>
+              <w:rPr>
+                <w:rStyle w:val="Hyperlink"/>
+                <w:noProof/>
+              </w:rPr>
               <w:t>References</w:t>
             </w:r>
             <w:r>
@@ -2968,7 +3190,7 @@
                 <w:noProof/>
                 <w:webHidden/>
               </w:rPr>
-              <w:instrText xml:space="preserve"> PAGEREF _Toc227404791 \h </w:instrText>
+              <w:instrText xml:space="preserve"> PAGEREF _Toc227684400 \h </w:instrText>
             </w:r>
             <w:r>
               <w:rPr>
@@ -3025,9 +3247,8 @@
       <w:pPr>
         <w:pStyle w:val="Heading1"/>
       </w:pPr>
-      <w:bookmarkStart w:id="7" w:name="_Toc227404764"/>
-      <w:r>
-        <w:lastRenderedPageBreak/>
+      <w:bookmarkStart w:id="7" w:name="_Toc227684370"/>
+      <w:r>
         <w:t>Table of Figures</w:t>
       </w:r>
       <w:bookmarkEnd w:id="7"/>
@@ -3068,7 +3289,7 @@
         </w:rPr>
         <w:fldChar w:fldCharType="separate"/>
       </w:r>
-      <w:hyperlink w:anchor="_Toc227404719" w:history="1">
+      <w:hyperlink w:anchor="_Toc227684401" w:history="1">
         <w:r>
           <w:rPr>
             <w:rStyle w:val="Hyperlink"/>
@@ -3095,7 +3316,7 @@
             <w:noProof/>
             <w:webHidden/>
           </w:rPr>
-          <w:instrText xml:space="preserve"> PAGEREF _Toc227404719 \h </w:instrText>
+          <w:instrText xml:space="preserve"> PAGEREF _Toc227684401 \h </w:instrText>
         </w:r>
         <w:r>
           <w:rPr>
@@ -3138,7 +3359,7 @@
           <w:lang w:eastAsia="en-GB"/>
         </w:rPr>
       </w:pPr>
-      <w:hyperlink w:anchor="_Toc227404720" w:history="1">
+      <w:hyperlink w:anchor="_Toc227684402" w:history="1">
         <w:r>
           <w:rPr>
             <w:rStyle w:val="Hyperlink"/>
@@ -3165,7 +3386,7 @@
             <w:noProof/>
             <w:webHidden/>
           </w:rPr>
-          <w:instrText xml:space="preserve"> PAGEREF _Toc227404720 \h </w:instrText>
+          <w:instrText xml:space="preserve"> PAGEREF _Toc227684402 \h </w:instrText>
         </w:r>
         <w:r>
           <w:rPr>
@@ -3208,7 +3429,7 @@
           <w:lang w:eastAsia="en-GB"/>
         </w:rPr>
       </w:pPr>
-      <w:hyperlink w:anchor="_Toc227404721" w:history="1">
+      <w:hyperlink w:anchor="_Toc227684403" w:history="1">
         <w:r>
           <w:rPr>
             <w:rStyle w:val="Hyperlink"/>
@@ -3235,7 +3456,7 @@
             <w:noProof/>
             <w:webHidden/>
           </w:rPr>
-          <w:instrText xml:space="preserve"> PAGEREF _Toc227404721 \h </w:instrText>
+          <w:instrText xml:space="preserve"> PAGEREF _Toc227684403 \h </w:instrText>
         </w:r>
         <w:r>
           <w:rPr>
@@ -3268,6 +3489,76 @@
     </w:p>
     <w:p>
       <w:pPr>
+        <w:pStyle w:val="TableofFigures"/>
+        <w:tabs>
+          <w:tab w:val="right" w:leader="dot" w:pos="9016"/>
+        </w:tabs>
+        <w:rPr>
+          <w:rFonts w:asciiTheme="minorHAnsi" w:eastAsiaTheme="minorEastAsia" w:hAnsiTheme="minorHAnsi"/>
+          <w:noProof/>
+          <w:lang w:eastAsia="en-GB"/>
+        </w:rPr>
+      </w:pPr>
+      <w:hyperlink w:anchor="_Toc227684404" w:history="1">
+        <w:r>
+          <w:rPr>
+            <w:rStyle w:val="Hyperlink"/>
+            <w:noProof/>
+          </w:rPr>
+          <w:t>Figure 4</w:t>
+        </w:r>
+        <w:r>
+          <w:rPr>
+            <w:noProof/>
+            <w:webHidden/>
+          </w:rPr>
+          <w:tab/>
+        </w:r>
+        <w:r>
+          <w:rPr>
+            <w:noProof/>
+            <w:webHidden/>
+          </w:rPr>
+          <w:fldChar w:fldCharType="begin"/>
+        </w:r>
+        <w:r>
+          <w:rPr>
+            <w:noProof/>
+            <w:webHidden/>
+          </w:rPr>
+          <w:instrText xml:space="preserve"> PAGEREF _Toc227684404 \h </w:instrText>
+        </w:r>
+        <w:r>
+          <w:rPr>
+            <w:noProof/>
+            <w:webHidden/>
+          </w:rPr>
+        </w:r>
+        <w:r>
+          <w:rPr>
+            <w:noProof/>
+            <w:webHidden/>
+          </w:rPr>
+          <w:fldChar w:fldCharType="separate"/>
+        </w:r>
+        <w:r>
+          <w:rPr>
+            <w:noProof/>
+            <w:webHidden/>
+          </w:rPr>
+          <w:t>9</w:t>
+        </w:r>
+        <w:r>
+          <w:rPr>
+            <w:noProof/>
+            <w:webHidden/>
+          </w:rPr>
+          <w:fldChar w:fldCharType="end"/>
+        </w:r>
+      </w:hyperlink>
+    </w:p>
+    <w:p>
+      <w:pPr>
         <w:spacing w:line="259" w:lineRule="auto"/>
         <w:rPr>
           <w:sz w:val="36"/>
@@ -3304,7 +3595,7 @@
       <w:pPr>
         <w:pStyle w:val="Heading1"/>
       </w:pPr>
-      <w:bookmarkStart w:id="8" w:name="_Toc227404765"/>
+      <w:bookmarkStart w:id="8" w:name="_Toc227684371"/>
       <w:r>
         <w:t>Chapter 1</w:t>
       </w:r>
@@ -3332,7 +3623,7 @@
           <w:u w:val="single"/>
         </w:rPr>
       </w:pPr>
-      <w:bookmarkStart w:id="9" w:name="_Toc227404766"/>
+      <w:bookmarkStart w:id="9" w:name="_Toc227684372"/>
       <w:r>
         <w:t>1.1</w:t>
       </w:r>
@@ -3377,7 +3668,7 @@
       <w:pPr>
         <w:pStyle w:val="Heading2"/>
       </w:pPr>
-      <w:bookmarkStart w:id="10" w:name="_Toc227404767"/>
+      <w:bookmarkStart w:id="10" w:name="_Toc227684373"/>
       <w:r>
         <w:t>1.2 Aims</w:t>
       </w:r>
@@ -3393,7 +3684,7 @@
           <w:szCs w:val="28"/>
         </w:rPr>
       </w:pPr>
-      <w:bookmarkStart w:id="11" w:name="_Toc227404768"/>
+      <w:bookmarkStart w:id="11" w:name="_Toc227684374"/>
       <w:r>
         <w:rPr>
           <w:rStyle w:val="Heading2Char"/>
@@ -3438,7 +3729,7 @@
       <w:pPr>
         <w:pStyle w:val="Heading3"/>
       </w:pPr>
-      <w:bookmarkStart w:id="12" w:name="_Toc227404769"/>
+      <w:bookmarkStart w:id="12" w:name="_Toc227684375"/>
       <w:r>
         <w:lastRenderedPageBreak/>
         <w:t>1.2.2 Additional Aims</w:t>
@@ -3508,7 +3799,7 @@
       <w:pPr>
         <w:pStyle w:val="Heading2"/>
       </w:pPr>
-      <w:bookmarkStart w:id="13" w:name="_Toc227404770"/>
+      <w:bookmarkStart w:id="13" w:name="_Toc227684376"/>
       <w:r>
         <w:t>1.3 Objectives</w:t>
       </w:r>
@@ -3518,7 +3809,7 @@
       <w:pPr>
         <w:pStyle w:val="Heading3"/>
       </w:pPr>
-      <w:bookmarkStart w:id="14" w:name="_Toc227404771"/>
+      <w:bookmarkStart w:id="14" w:name="_Toc227684377"/>
       <w:r>
         <w:t>1.3.1 Scope</w:t>
       </w:r>
@@ -3589,7 +3880,7 @@
       <w:pPr>
         <w:pStyle w:val="Heading3"/>
       </w:pPr>
-      <w:bookmarkStart w:id="15" w:name="_Toc227404772"/>
+      <w:bookmarkStart w:id="15" w:name="_Toc227684378"/>
       <w:r>
         <w:t>1.3.2 Research Objectives</w:t>
       </w:r>
@@ -3634,7 +3925,7 @@
       <w:pPr>
         <w:pStyle w:val="Heading3"/>
       </w:pPr>
-      <w:bookmarkStart w:id="16" w:name="_Toc227404773"/>
+      <w:bookmarkStart w:id="16" w:name="_Toc227684379"/>
       <w:r>
         <w:t>1.3.3 Design Objectives</w:t>
       </w:r>
@@ -3756,7 +4047,7 @@
       <w:pPr>
         <w:pStyle w:val="Heading3"/>
       </w:pPr>
-      <w:bookmarkStart w:id="17" w:name="_Toc227404774"/>
+      <w:bookmarkStart w:id="17" w:name="_Toc227684380"/>
       <w:r>
         <w:t>1.3.4 Implementation Objectives</w:t>
       </w:r>
@@ -3875,7 +4166,7 @@
       <w:pPr>
         <w:pStyle w:val="Heading3"/>
       </w:pPr>
-      <w:bookmarkStart w:id="18" w:name="_Toc227404775"/>
+      <w:bookmarkStart w:id="18" w:name="_Toc227684381"/>
       <w:r>
         <w:t>1.3.5 Results, Evaluation and Playtesting Objectives</w:t>
       </w:r>
@@ -3932,7 +4223,7 @@
       <w:pPr>
         <w:pStyle w:val="Heading1"/>
       </w:pPr>
-      <w:bookmarkStart w:id="19" w:name="_Toc227404776"/>
+      <w:bookmarkStart w:id="19" w:name="_Toc227684382"/>
       <w:r>
         <w:t>Chapter 2 – Literature Survey</w:t>
       </w:r>
@@ -3942,7 +4233,7 @@
       <w:pPr>
         <w:pStyle w:val="Heading2"/>
       </w:pPr>
-      <w:bookmarkStart w:id="20" w:name="_Toc227404777"/>
+      <w:bookmarkStart w:id="20" w:name="_Toc227684383"/>
       <w:r>
         <w:t>2.1 Literature Survey Introduction</w:t>
       </w:r>
@@ -3981,7 +4272,7 @@
       <w:pPr>
         <w:pStyle w:val="Heading2"/>
       </w:pPr>
-      <w:bookmarkStart w:id="21" w:name="_Toc227404778"/>
+      <w:bookmarkStart w:id="21" w:name="_Toc227684384"/>
       <w:r>
         <w:t>2.2 Comparative Research</w:t>
       </w:r>
@@ -3999,7 +4290,7 @@
       <w:pPr>
         <w:pStyle w:val="Heading3"/>
       </w:pPr>
-      <w:bookmarkStart w:id="22" w:name="_Toc227404779"/>
+      <w:bookmarkStart w:id="22" w:name="_Toc227684385"/>
       <w:r>
         <w:t xml:space="preserve">2.2.1 </w:t>
       </w:r>
@@ -4075,7 +4366,7 @@
       <w:pPr>
         <w:pStyle w:val="Heading4"/>
       </w:pPr>
-      <w:bookmarkStart w:id="23" w:name="_Toc227404780"/>
+      <w:bookmarkStart w:id="23" w:name="_Toc227684386"/>
       <w:r>
         <w:t>2.2.1.1 Perlin Noise</w:t>
       </w:r>
@@ -4390,7 +4681,7 @@
         <w:pStyle w:val="Caption"/>
         <w:jc w:val="center"/>
       </w:pPr>
-      <w:bookmarkStart w:id="24" w:name="_Toc227404719"/>
+      <w:bookmarkStart w:id="24" w:name="_Toc227684401"/>
       <w:r>
         <w:t xml:space="preserve">Figure </w:t>
       </w:r>
@@ -4487,7 +4778,7 @@
       <w:pPr>
         <w:pStyle w:val="Heading4"/>
       </w:pPr>
-      <w:bookmarkStart w:id="25" w:name="_Toc227404781"/>
+      <w:bookmarkStart w:id="25" w:name="_Toc227684387"/>
       <w:r>
         <w:t>2.2.1.2 Binary Space Partitioning</w:t>
       </w:r>
@@ -4539,7 +4830,7 @@
       <w:pPr>
         <w:pStyle w:val="Heading4"/>
       </w:pPr>
-      <w:bookmarkStart w:id="26" w:name="_Toc227404782"/>
+      <w:bookmarkStart w:id="26" w:name="_Toc227684388"/>
       <w:r>
         <w:t>2.2.1.3 Cellular Automata</w:t>
       </w:r>
@@ -4659,7 +4950,7 @@
       <w:pPr>
         <w:pStyle w:val="Heading3"/>
       </w:pPr>
-      <w:bookmarkStart w:id="27" w:name="_Toc227404783"/>
+      <w:bookmarkStart w:id="27" w:name="_Toc227684389"/>
       <w:r>
         <w:t>2.2.2 Pathfinding</w:t>
       </w:r>
@@ -4722,7 +5013,7 @@
       <w:pPr>
         <w:pStyle w:val="Heading4"/>
       </w:pPr>
-      <w:bookmarkStart w:id="28" w:name="_Toc227404784"/>
+      <w:bookmarkStart w:id="28" w:name="_Toc227684390"/>
       <w:r>
         <w:t>2.2.2.1 Dijkstra</w:t>
       </w:r>
@@ -4803,7 +5094,7 @@
         <w:pStyle w:val="Caption"/>
         <w:jc w:val="center"/>
       </w:pPr>
-      <w:bookmarkStart w:id="29" w:name="_Toc227404720"/>
+      <w:bookmarkStart w:id="29" w:name="_Toc227684402"/>
       <w:r>
         <w:t xml:space="preserve">Figure </w:t>
       </w:r>
@@ -4910,7 +5201,7 @@
       <w:pPr>
         <w:pStyle w:val="Heading4"/>
       </w:pPr>
-      <w:bookmarkStart w:id="30" w:name="_Toc227404785"/>
+      <w:bookmarkStart w:id="30" w:name="_Toc227684391"/>
       <w:r>
         <w:t>2.2.2.2 A*</w:t>
       </w:r>
@@ -4973,7 +5264,7 @@
       <w:pPr>
         <w:pStyle w:val="Heading4"/>
       </w:pPr>
-      <w:bookmarkStart w:id="31" w:name="_Toc227404786"/>
+      <w:bookmarkStart w:id="31" w:name="_Toc227684392"/>
       <w:r>
         <w:t>2.2.2.3 Jump Point Search</w:t>
       </w:r>
@@ -5028,7 +5319,7 @@
       <w:pPr>
         <w:pStyle w:val="Heading3"/>
       </w:pPr>
-      <w:bookmarkStart w:id="32" w:name="_Toc227404787"/>
+      <w:bookmarkStart w:id="32" w:name="_Toc227684393"/>
       <w:r>
         <w:t>2.2.3 AI Integrations</w:t>
       </w:r>
@@ -5053,7 +5344,7 @@
       <w:pPr>
         <w:pStyle w:val="Heading4"/>
       </w:pPr>
-      <w:bookmarkStart w:id="33" w:name="_Toc227404788"/>
+      <w:bookmarkStart w:id="33" w:name="_Toc227684394"/>
       <w:r>
         <w:t>2.2.3.1 Neural Network</w:t>
       </w:r>
@@ -5108,7 +5399,7 @@
       <w:pPr>
         <w:pStyle w:val="Heading4"/>
       </w:pPr>
-      <w:bookmarkStart w:id="34" w:name="_Toc227404789"/>
+      <w:bookmarkStart w:id="34" w:name="_Toc227684395"/>
       <w:r>
         <w:t>2.2.3.2 Reinforcement Learning</w:t>
       </w:r>
@@ -5182,8 +5473,9 @@
     <w:p>
       <w:pPr>
         <w:pStyle w:val="Caption"/>
-      </w:pPr>
-      <w:bookmarkStart w:id="35" w:name="_Toc227404721"/>
+        <w:jc w:val="center"/>
+      </w:pPr>
+      <w:bookmarkStart w:id="35" w:name="_Toc227684403"/>
       <w:r>
         <w:t xml:space="preserve">Figure </w:t>
       </w:r>
@@ -5321,7 +5613,7 @@
       <w:pPr>
         <w:pStyle w:val="Heading4"/>
       </w:pPr>
-      <w:bookmarkStart w:id="36" w:name="_Toc227404790"/>
+      <w:bookmarkStart w:id="36" w:name="_Toc227684396"/>
       <w:r>
         <w:t>2.2.3.3 Imitation Learning</w:t>
       </w:r>
@@ -5450,10 +5742,12 @@
       <w:pPr>
         <w:pStyle w:val="Heading1"/>
       </w:pPr>
+      <w:bookmarkStart w:id="37" w:name="_Toc227684397"/>
       <w:r>
         <w:lastRenderedPageBreak/>
         <w:t>Chapter 3 – Design</w:t>
       </w:r>
+      <w:bookmarkEnd w:id="37"/>
     </w:p>
     <w:p>
       <w:r>
@@ -5470,12 +5764,168 @@
       <w:pPr>
         <w:pStyle w:val="Heading2"/>
       </w:pPr>
+      <w:bookmarkStart w:id="38" w:name="_Toc227684398"/>
       <w:r>
         <w:t xml:space="preserve">3.1 </w:t>
       </w:r>
+      <w:r>
+        <w:t>World Generation</w:t>
+      </w:r>
+      <w:bookmarkEnd w:id="38"/>
+    </w:p>
+    <w:p>
+      <w:r>
+        <w:t xml:space="preserve">After the research of world generation types, I conclude that the most effective method for this game would be to make the game use Perlin noise to generate its world and landmasses. I came to this conclusion </w:t>
+      </w:r>
+      <w:r>
+        <w:t xml:space="preserve">as Binary Space Partitioning requires many iterations to make convincing </w:t>
+      </w:r>
+      <w:r>
+        <w:t>landmasses,</w:t>
+      </w:r>
+      <w:r>
+        <w:t xml:space="preserve"> and Cellular Automata would require simulation of the Cellular Automata which is relatively computationally heavy.  </w:t>
+      </w:r>
+    </w:p>
+    <w:p>
+      <w:pPr>
+        <w:pStyle w:val="Heading3"/>
+      </w:pPr>
+      <w:bookmarkStart w:id="39" w:name="_Toc227684399"/>
+      <w:r>
+        <w:t xml:space="preserve">3.1.1 </w:t>
+      </w:r>
+      <w:r>
+        <w:t>The tile and its storage</w:t>
+      </w:r>
+      <w:bookmarkEnd w:id="39"/>
+    </w:p>
+    <w:p>
+      <w:pPr>
+        <w:keepNext/>
+      </w:pPr>
+      <w:r>
+        <w:t>I have decided to store each interactable space as a tile. I will create a custom class for the tile that contains references to its neighbouring tiles, the tiles biome (likely stored as an enum), the resources on that tile and its overall gold and production values.</w:t>
+      </w:r>
+    </w:p>
+    <w:p>
+      <w:pPr>
+        <w:keepNext/>
+        <w:jc w:val="center"/>
+      </w:pPr>
+      <w:r>
+        <w:br/>
+      </w:r>
+      <w:r>
+        <w:rPr>
+          <w:noProof/>
+        </w:rPr>
+        <w:drawing>
+          <wp:inline distT="0" distB="0" distL="0" distR="0" wp14:anchorId="7D5A5376" wp14:editId="44C02C36">
+            <wp:extent cx="2479538" cy="2261556"/>
+            <wp:effectExtent l="0" t="0" r="0" b="5715"/>
+            <wp:docPr id="455141339" name="Picture 4"/>
+            <wp:cNvGraphicFramePr>
+              <a:graphicFrameLocks xmlns:a="http://schemas.openxmlformats.org/drawingml/2006/main" noChangeAspect="1"/>
+            </wp:cNvGraphicFramePr>
+            <a:graphic xmlns:a="http://schemas.openxmlformats.org/drawingml/2006/main">
+              <a:graphicData uri="http://schemas.openxmlformats.org/drawingml/2006/picture">
+                <pic:pic xmlns:pic="http://schemas.openxmlformats.org/drawingml/2006/picture">
+                  <pic:nvPicPr>
+                    <pic:cNvPr id="0" name="Picture 5"/>
+                    <pic:cNvPicPr>
+                      <a:picLocks noChangeAspect="1" noChangeArrowheads="1"/>
+                    </pic:cNvPicPr>
+                  </pic:nvPicPr>
+                  <pic:blipFill rotWithShape="1">
+                    <a:blip r:embed="rId15" cstate="print">
+                      <a:extLst>
+                        <a:ext uri="{28A0092B-C50C-407E-A947-70E740481C1C}">
+                          <a14:useLocalDpi xmlns:a14="http://schemas.microsoft.com/office/drawing/2010/main" val="0"/>
+                        </a:ext>
+                      </a:extLst>
+                    </a:blip>
+                    <a:srcRect r="16205" b="23572"/>
+                    <a:stretch>
+                      <a:fillRect/>
+                    </a:stretch>
+                  </pic:blipFill>
+                  <pic:spPr bwMode="auto">
+                    <a:xfrm>
+                      <a:off x="0" y="0"/>
+                      <a:ext cx="2487401" cy="2268727"/>
+                    </a:xfrm>
+                    <a:prstGeom prst="rect">
+                      <a:avLst/>
+                    </a:prstGeom>
+                    <a:noFill/>
+                    <a:ln>
+                      <a:noFill/>
+                    </a:ln>
+                    <a:extLst>
+                      <a:ext uri="{53640926-AAD7-44D8-BBD7-CCE9431645EC}">
+                        <a14:shadowObscured xmlns:a14="http://schemas.microsoft.com/office/drawing/2010/main"/>
+                      </a:ext>
+                    </a:extLst>
+                  </pic:spPr>
+                </pic:pic>
+              </a:graphicData>
+            </a:graphic>
+          </wp:inline>
+        </w:drawing>
+      </w:r>
+    </w:p>
+    <w:p>
+      <w:pPr>
+        <w:pStyle w:val="Caption"/>
+        <w:jc w:val="center"/>
+      </w:pPr>
+      <w:bookmarkStart w:id="40" w:name="_Toc227684404"/>
+      <w:r>
+        <w:t xml:space="preserve">Figure </w:t>
+      </w:r>
+      <w:r>
+        <w:fldChar w:fldCharType="begin"/>
+      </w:r>
+      <w:r>
+        <w:instrText xml:space="preserve"> SEQ Figure \* ARABIC </w:instrText>
+      </w:r>
+      <w:r>
+        <w:fldChar w:fldCharType="separate"/>
+      </w:r>
+      <w:r>
+        <w:rPr>
+          <w:noProof/>
+        </w:rPr>
+        <w:t>4</w:t>
+      </w:r>
+      <w:bookmarkEnd w:id="40"/>
+      <w:r>
+        <w:fldChar w:fldCharType="end"/>
+      </w:r>
+    </w:p>
+    <w:p>
+      <w:r>
+        <w:t xml:space="preserve">Figure 4 shows how on a square grid, although the vertical and horizontal axis are identical, the diagonal creates an unfair advantage on movement, being a cost of </w:t>
+      </w:r>
+      <w:r>
+        <w:t>√</w:t>
+      </w:r>
+      <w:r>
+        <w:t xml:space="preserve">2 while getting the movement of 2 tiles. </w:t>
+      </w:r>
+      <w:proofErr w:type="gramStart"/>
+      <w:r>
+        <w:t>In order to</w:t>
+      </w:r>
+      <w:proofErr w:type="gramEnd"/>
+      <w:r>
+        <w:t xml:space="preserve"> combat this, I have decided to use a hexagonal grid which has uniform lengths to all neighbouring tiles.</w:t>
+      </w:r>
     </w:p>
     <w:p/>
-    <w:bookmarkStart w:id="37" w:name="_Toc227404791" w:displacedByCustomXml="next"/>
+    <w:p/>
+    <w:bookmarkStart w:id="41" w:name="_Toc227684400" w:displacedByCustomXml="next"/>
     <w:sdt>
       <w:sdtPr>
         <w:rPr>
@@ -5503,7 +5953,7 @@
           <w:r>
             <w:t>References</w:t>
           </w:r>
-          <w:bookmarkEnd w:id="37"/>
+          <w:bookmarkEnd w:id="41"/>
         </w:p>
         <w:sdt>
           <w:sdtPr>
@@ -8597,11 +9047,33 @@
     <b:URL>https://www.geeksforgeeks.org/dsa/dijkstras-shortest-path-algorithm-greedy-algo-7/</b:URL>
     <b:RefOrder>4</b:RefOrder>
   </b:Source>
+  <b:Source>
+    <b:Tag>Glo22</b:Tag>
+    <b:SourceType>DocumentFromInternetSite</b:SourceType>
+    <b:Guid>{A5023F31-3D16-4913-AEB8-412248EB9918}</b:Guid>
+    <b:Title>Hexagon grid coordinate system</b:Title>
+    <b:Year>2022</b:Year>
+    <b:YearAccessed>2026</b:YearAccessed>
+    <b:MonthAccessed>04</b:MonthAccessed>
+    <b:DayAccessed>21</b:DayAccessed>
+    <b:URL>https://math.stackexchange.com/questions/2254655/hexagon-grid-coordinate-system</b:URL>
+    <b:Author>
+      <b:Author>
+        <b:NameList>
+          <b:Person>
+            <b:Last>Glorfindel</b:Last>
+          </b:Person>
+        </b:NameList>
+      </b:Author>
+    </b:Author>
+    <b:Month>05</b:Month>
+    <b:RefOrder>10</b:RefOrder>
+  </b:Source>
 </b:Sources>
 </file>
 
 <file path=customXml/itemProps1.xml><?xml version="1.0" encoding="utf-8"?>
-<ds:datastoreItem xmlns:ds="http://schemas.openxmlformats.org/officeDocument/2006/customXml" ds:itemID="{12860CD0-749E-412E-8FF1-BA086C6F884E}">
+<ds:datastoreItem xmlns:ds="http://schemas.openxmlformats.org/officeDocument/2006/customXml" ds:itemID="{60D2967D-6E22-4ECF-BB7C-EBA865E1AE13}">
   <ds:schemaRefs>
     <ds:schemaRef ds:uri="http://schemas.openxmlformats.org/officeDocument/2006/bibliography"/>
   </ds:schemaRefs>

</xml_diff>

<commit_message>
feat: finished 3.1.1 Tile and storage
</commit_message>
<xml_diff>
--- a/Report.docx
+++ b/Report.docx
@@ -331,15 +331,7 @@
     </w:p>
     <w:p>
       <w:r>
-        <w:t xml:space="preserve">AI is a still growing industry and while the current trend of AI is heading towards the usage of Large Language Models, I believe there is a genuine use case for machine learning models within video games. The focus of this project is to uncover the current reasons behind why the industry doesn’t use machine learning AI for uses such as </w:t>
-      </w:r>
-      <w:proofErr w:type="gramStart"/>
-      <w:r>
-        <w:t>Non-Player Characters</w:t>
-      </w:r>
-      <w:proofErr w:type="gramEnd"/>
-      <w:r>
-        <w:t xml:space="preserve"> or local multiplayer games. This is appro</w:t>
+        <w:t>AI is a still growing industry and while the current trend of AI is heading towards the usage of Large Language Models, I believe there is a genuine use case for machine learning models within video games. The focus of this project is to uncover the current reasons behind why the industry doesn’t use machine learning AI for uses such as Non-Player Characters or local multiplayer games. This is appro</w:t>
       </w:r>
       <w:r>
         <w:t>ached by covering the design choices and code architecture of implementing a machine learning model into the Unity game engine. To evaluate whether the AI is functional, data has been gathered using a mix of qualitative and quantitative research. This research was collected through a short survey given to participants.</w:t>
@@ -3817,15 +3809,7 @@
     </w:p>
     <w:p>
       <w:r>
-        <w:t xml:space="preserve">The objectives in terms of scope for this project are going to be generally quite broad and consist of specific milestones. The core objectives </w:t>
-      </w:r>
-      <w:proofErr w:type="gramStart"/>
-      <w:r>
-        <w:t>in regards to</w:t>
-      </w:r>
-      <w:proofErr w:type="gramEnd"/>
-      <w:r>
-        <w:t xml:space="preserve"> the scope are:</w:t>
+        <w:t>The objectives in terms of scope for this project are going to be generally quite broad and consist of specific milestones. The core objectives in regards to the scope are:</w:t>
       </w:r>
     </w:p>
     <w:p>
@@ -3888,15 +3872,7 @@
     </w:p>
     <w:p>
       <w:r>
-        <w:t xml:space="preserve">For the research objectives for the game, research will be conducted into other types of media with similar features. This research will include a comparison of similar games and their features and the overall impact of those features on this project. This will be done to find a balance for the difficulty of the game and to evaluate the necessary features for the game. Some topics of features and mechanics that will be researched </w:t>
-      </w:r>
-      <w:proofErr w:type="gramStart"/>
-      <w:r>
-        <w:t>include:</w:t>
-      </w:r>
-      <w:proofErr w:type="gramEnd"/>
-      <w:r>
-        <w:t xml:space="preserve"> World Generation, Pathfinding</w:t>
+        <w:t>For the research objectives for the game, research will be conducted into other types of media with similar features. This research will include a comparison of similar games and their features and the overall impact of those features on this project. This will be done to find a balance for the difficulty of the game and to evaluate the necessary features for the game. Some topics of features and mechanics that will be researched include: World Generation, Pathfinding</w:t>
       </w:r>
       <w:r>
         <w:t xml:space="preserve"> and </w:t>
@@ -4377,26 +4353,10 @@
         <w:keepNext/>
       </w:pPr>
       <w:r>
-        <w:t xml:space="preserve">Perlin Noise is used in </w:t>
-      </w:r>
-      <w:proofErr w:type="gramStart"/>
-      <w:r>
-        <w:t>the majority of</w:t>
-      </w:r>
-      <w:proofErr w:type="gramEnd"/>
-      <w:r>
-        <w:t xml:space="preserve"> world generations due to its versatility.</w:t>
-      </w:r>
-      <w:r>
-        <w:t xml:space="preserve"> It works </w:t>
-      </w:r>
-      <w:proofErr w:type="gramStart"/>
-      <w:r>
-        <w:t>through the use of</w:t>
-      </w:r>
-      <w:proofErr w:type="gramEnd"/>
-      <w:r>
-        <w:t xml:space="preserve"> layering</w:t>
+        <w:t>Perlin Noise is used in the majority of world generations due to its versatility.</w:t>
+      </w:r>
+      <w:r>
+        <w:t xml:space="preserve"> It works through the use of layering</w:t>
       </w:r>
       <w:r>
         <w:t xml:space="preserve"> </w:t>
@@ -4892,15 +4852,7 @@
         <w:t>)</w:t>
       </w:r>
       <w:r>
-        <w:t xml:space="preserve"> according to the following two rules: If a cell is alive, it survives to the next generation if it has 2 or 3 live neighbors; otherwise it dies. If a cell is dead, it comes to life in the next generation if it has exactly 3 live neighbors; </w:t>
-      </w:r>
-      <w:proofErr w:type="gramStart"/>
-      <w:r>
-        <w:t>otherwise</w:t>
-      </w:r>
-      <w:proofErr w:type="gramEnd"/>
-      <w:r>
-        <w:t xml:space="preserve"> it stays dead.” </w:t>
+        <w:t xml:space="preserve"> according to the following two rules: If a cell is alive, it survives to the next generation if it has 2 or 3 live neighbors; otherwise it dies. If a cell is dead, it comes to life in the next generation if it has exactly 3 live neighbors; otherwise it stays dead.” </w:t>
       </w:r>
       <w:sdt>
         <w:sdtPr>
@@ -4986,15 +4938,7 @@
         <w:t xml:space="preserve"> </w:t>
       </w:r>
       <w:r>
-        <w:t xml:space="preserve">The types of pathfinding I will be evaluating </w:t>
-      </w:r>
-      <w:proofErr w:type="gramStart"/>
-      <w:r>
-        <w:t>are:</w:t>
-      </w:r>
-      <w:proofErr w:type="gramEnd"/>
-      <w:r>
-        <w:t xml:space="preserve"> A*, Dijkstra</w:t>
+        <w:t>The types of pathfinding I will be evaluating are: A*, Dijkstra</w:t>
       </w:r>
       <w:r>
         <w:t>,</w:t>
@@ -5155,15 +5099,7 @@
         <w:t xml:space="preserve">Figure 2 shows how a graph is constructed and shows the movement cost of each path. </w:t>
       </w:r>
       <w:r>
-        <w:t xml:space="preserve">For example, from our source node, node 0, we calculate the distance to </w:t>
-      </w:r>
-      <w:proofErr w:type="gramStart"/>
-      <w:r>
-        <w:t>all of</w:t>
-      </w:r>
-      <w:proofErr w:type="gramEnd"/>
-      <w:r>
-        <w:t xml:space="preserve"> its neighbour nodes, in this case being nodes 1 and 2 and take a </w:t>
+        <w:t xml:space="preserve">For example, from our source node, node 0, we calculate the distance to all of its neighbour nodes, in this case being nodes 1 and 2 and take a </w:t>
       </w:r>
       <w:r>
         <w:t>“</w:t>
@@ -5209,15 +5145,7 @@
     </w:p>
     <w:p>
       <w:r>
-        <w:t xml:space="preserve">A* is an algorithm that shares the same approach as Dijkstra, although it is more efficient. </w:t>
-      </w:r>
-      <w:proofErr w:type="gramStart"/>
-      <w:r>
-        <w:t>In order to</w:t>
-      </w:r>
-      <w:proofErr w:type="gramEnd"/>
-      <w:r>
-        <w:t xml:space="preserve"> be more efficient, the algorithm “combines Dijkstra’s algorithm with a case-specific heuristic value”</w:t>
+        <w:t>A* is an algorithm that shares the same approach as Dijkstra, although it is more efficient. In order to be more efficient, the algorithm “combines Dijkstra’s algorithm with a case-specific heuristic value”</w:t>
       </w:r>
       <w:r>
         <w:t xml:space="preserve"> </w:t>
@@ -5251,11 +5179,9 @@
       <w:r>
         <w:t xml:space="preserve">. This is always guaranteed to find the shortest path and the heuristic value allows the algorithm to disregard paths that lead away from the destination, allowing for major optimizations </w:t>
       </w:r>
-      <w:proofErr w:type="gramStart"/>
       <w:r>
         <w:t>in regard to</w:t>
       </w:r>
-      <w:proofErr w:type="gramEnd"/>
       <w:r>
         <w:t xml:space="preserve"> the computation speed of the algorithm. </w:t>
       </w:r>
@@ -5304,15 +5230,7 @@
         <w:t xml:space="preserve">, JPS serves as a substantial optimization through the use of “pruning” unnecessary nodes and “jumping over” empty spaces. Disregarding the </w:t>
       </w:r>
       <w:r>
-        <w:t xml:space="preserve">path cost calculations along with the </w:t>
-      </w:r>
-      <w:proofErr w:type="gramStart"/>
-      <w:r>
-        <w:t>aforementioned optimizations</w:t>
-      </w:r>
-      <w:proofErr w:type="gramEnd"/>
-      <w:r>
-        <w:t xml:space="preserve"> allows JPS to be significantly faster than A*, even up to an order of magnitude faster.</w:t>
+        <w:t>path cost calculations along with the aforementioned optimizations allows JPS to be significantly faster than A*, even up to an order of magnitude faster.</w:t>
       </w:r>
     </w:p>
     <w:p>
@@ -5912,18 +5830,240 @@
         <w:t>√</w:t>
       </w:r>
       <w:r>
-        <w:t xml:space="preserve">2 while getting the movement of 2 tiles. </w:t>
-      </w:r>
-      <w:proofErr w:type="gramStart"/>
-      <w:r>
-        <w:t>In order to</w:t>
-      </w:r>
-      <w:proofErr w:type="gramEnd"/>
-      <w:r>
-        <w:t xml:space="preserve"> combat this, I have decided to use a hexagonal grid which has uniform lengths to all neighbouring tiles.</w:t>
-      </w:r>
-    </w:p>
-    <w:p/>
+        <w:t>2 while getting the movement of 2 tiles. In order to combat this, I have decided to use a hexagonal grid which has uniform lengths to all neighbouring tiles.</w:t>
+      </w:r>
+    </w:p>
+    <w:tbl>
+      <w:tblPr>
+        <w:tblStyle w:val="TableGrid"/>
+        <w:tblW w:w="0" w:type="auto"/>
+        <w:tblBorders>
+          <w:top w:val="none" w:sz="0" w:space="0" w:color="auto"/>
+          <w:left w:val="none" w:sz="0" w:space="0" w:color="auto"/>
+          <w:bottom w:val="none" w:sz="0" w:space="0" w:color="auto"/>
+          <w:right w:val="none" w:sz="0" w:space="0" w:color="auto"/>
+          <w:insideH w:val="none" w:sz="0" w:space="0" w:color="auto"/>
+          <w:insideV w:val="none" w:sz="0" w:space="0" w:color="auto"/>
+        </w:tblBorders>
+        <w:tblLook w:val="04A0" w:firstRow="1" w:lastRow="0" w:firstColumn="1" w:lastColumn="0" w:noHBand="0" w:noVBand="1"/>
+      </w:tblPr>
+      <w:tblGrid>
+        <w:gridCol w:w="4508"/>
+        <w:gridCol w:w="4508"/>
+      </w:tblGrid>
+      <w:tr>
+        <w:tc>
+          <w:tcPr>
+            <w:tcW w:w="4508" w:type="dxa"/>
+          </w:tcPr>
+          <w:p>
+            <w:pPr>
+              <w:keepNext/>
+              <w:jc w:val="center"/>
+            </w:pPr>
+            <w:r>
+              <w:rPr>
+                <w:noProof/>
+              </w:rPr>
+              <w:lastRenderedPageBreak/>
+              <w:drawing>
+                <wp:inline distT="0" distB="0" distL="0" distR="0" wp14:anchorId="2A67817B" wp14:editId="5FDF18C8">
+                  <wp:extent cx="2295525" cy="2105025"/>
+                  <wp:effectExtent l="0" t="0" r="0" b="0"/>
+                  <wp:docPr id="1070291612" name="Picture 5"/>
+                  <wp:cNvGraphicFramePr>
+                    <a:graphicFrameLocks xmlns:a="http://schemas.openxmlformats.org/drawingml/2006/main" noChangeAspect="1"/>
+                  </wp:cNvGraphicFramePr>
+                  <a:graphic xmlns:a="http://schemas.openxmlformats.org/drawingml/2006/main">
+                    <a:graphicData uri="http://schemas.openxmlformats.org/drawingml/2006/picture">
+                      <pic:pic xmlns:pic="http://schemas.openxmlformats.org/drawingml/2006/picture">
+                        <pic:nvPicPr>
+                          <pic:cNvPr id="1070291612" name="Picture 1070291612"/>
+                          <pic:cNvPicPr/>
+                        </pic:nvPicPr>
+                        <pic:blipFill rotWithShape="1">
+                          <a:blip r:embed="rId16" cstate="print">
+                            <a:extLst>
+                              <a:ext uri="{28A0092B-C50C-407E-A947-70E740481C1C}">
+                                <a14:useLocalDpi xmlns:a14="http://schemas.microsoft.com/office/drawing/2010/main" val="0"/>
+                              </a:ext>
+                            </a:extLst>
+                          </a:blip>
+                          <a:srcRect l="10937" t="10312" r="13750" b="20625"/>
+                          <a:stretch>
+                            <a:fillRect/>
+                          </a:stretch>
+                        </pic:blipFill>
+                        <pic:spPr bwMode="auto">
+                          <a:xfrm>
+                            <a:off x="0" y="0"/>
+                            <a:ext cx="2295529" cy="2105029"/>
+                          </a:xfrm>
+                          <a:prstGeom prst="rect">
+                            <a:avLst/>
+                          </a:prstGeom>
+                          <a:ln>
+                            <a:noFill/>
+                          </a:ln>
+                          <a:extLst>
+                            <a:ext uri="{53640926-AAD7-44D8-BBD7-CCE9431645EC}">
+                              <a14:shadowObscured xmlns:a14="http://schemas.microsoft.com/office/drawing/2010/main"/>
+                            </a:ext>
+                          </a:extLst>
+                        </pic:spPr>
+                      </pic:pic>
+                    </a:graphicData>
+                  </a:graphic>
+                </wp:inline>
+              </w:drawing>
+            </w:r>
+          </w:p>
+          <w:p>
+            <w:pPr>
+              <w:pStyle w:val="Caption"/>
+              <w:jc w:val="center"/>
+            </w:pPr>
+            <w:r>
+              <w:t xml:space="preserve">Figure </w:t>
+            </w:r>
+            <w:r>
+              <w:fldChar w:fldCharType="begin"/>
+            </w:r>
+            <w:r>
+              <w:instrText xml:space="preserve"> SEQ Figure \* ARABIC </w:instrText>
+            </w:r>
+            <w:r>
+              <w:fldChar w:fldCharType="separate"/>
+            </w:r>
+            <w:r>
+              <w:rPr>
+                <w:noProof/>
+              </w:rPr>
+              <w:t>5</w:t>
+            </w:r>
+            <w:r>
+              <w:fldChar w:fldCharType="end"/>
+            </w:r>
+          </w:p>
+        </w:tc>
+        <w:tc>
+          <w:tcPr>
+            <w:tcW w:w="4508" w:type="dxa"/>
+          </w:tcPr>
+          <w:p>
+            <w:pPr>
+              <w:keepNext/>
+              <w:jc w:val="center"/>
+            </w:pPr>
+            <w:r>
+              <w:rPr>
+                <w:noProof/>
+              </w:rPr>
+              <w:drawing>
+                <wp:inline distT="0" distB="0" distL="0" distR="0" wp14:anchorId="127E4030" wp14:editId="6A2EEE7B">
+                  <wp:extent cx="2724150" cy="1781175"/>
+                  <wp:effectExtent l="0" t="0" r="0" b="0"/>
+                  <wp:docPr id="1348578601" name="Picture 6"/>
+                  <wp:cNvGraphicFramePr>
+                    <a:graphicFrameLocks xmlns:a="http://schemas.openxmlformats.org/drawingml/2006/main" noChangeAspect="1"/>
+                  </wp:cNvGraphicFramePr>
+                  <a:graphic xmlns:a="http://schemas.openxmlformats.org/drawingml/2006/main">
+                    <a:graphicData uri="http://schemas.openxmlformats.org/drawingml/2006/picture">
+                      <pic:pic xmlns:pic="http://schemas.openxmlformats.org/drawingml/2006/picture">
+                        <pic:nvPicPr>
+                          <pic:cNvPr id="0" name="Picture 6"/>
+                          <pic:cNvPicPr>
+                            <a:picLocks noChangeAspect="1" noChangeArrowheads="1"/>
+                          </pic:cNvPicPr>
+                        </pic:nvPicPr>
+                        <pic:blipFill rotWithShape="1">
+                          <a:blip r:embed="rId17" cstate="print">
+                            <a:extLst>
+                              <a:ext uri="{28A0092B-C50C-407E-A947-70E740481C1C}">
+                                <a14:useLocalDpi xmlns:a14="http://schemas.microsoft.com/office/drawing/2010/main" val="0"/>
+                              </a:ext>
+                            </a:extLst>
+                          </a:blip>
+                          <a:srcRect l="4687" t="21875" r="5937" b="19687"/>
+                          <a:stretch>
+                            <a:fillRect/>
+                          </a:stretch>
+                        </pic:blipFill>
+                        <pic:spPr bwMode="auto">
+                          <a:xfrm>
+                            <a:off x="0" y="0"/>
+                            <a:ext cx="2724150" cy="1781175"/>
+                          </a:xfrm>
+                          <a:prstGeom prst="rect">
+                            <a:avLst/>
+                          </a:prstGeom>
+                          <a:noFill/>
+                          <a:ln>
+                            <a:noFill/>
+                          </a:ln>
+                          <a:extLst>
+                            <a:ext uri="{53640926-AAD7-44D8-BBD7-CCE9431645EC}">
+                              <a14:shadowObscured xmlns:a14="http://schemas.microsoft.com/office/drawing/2010/main"/>
+                            </a:ext>
+                          </a:extLst>
+                        </pic:spPr>
+                      </pic:pic>
+                    </a:graphicData>
+                  </a:graphic>
+                </wp:inline>
+              </w:drawing>
+            </w:r>
+          </w:p>
+          <w:p>
+            <w:pPr>
+              <w:pStyle w:val="Caption"/>
+              <w:jc w:val="center"/>
+            </w:pPr>
+            <w:r>
+              <w:t xml:space="preserve">Figure </w:t>
+            </w:r>
+            <w:r>
+              <w:fldChar w:fldCharType="begin"/>
+            </w:r>
+            <w:r>
+              <w:instrText xml:space="preserve"> SEQ Figure \* ARABIC </w:instrText>
+            </w:r>
+            <w:r>
+              <w:fldChar w:fldCharType="separate"/>
+            </w:r>
+            <w:r>
+              <w:rPr>
+                <w:noProof/>
+              </w:rPr>
+              <w:t>6</w:t>
+            </w:r>
+            <w:r>
+              <w:fldChar w:fldCharType="end"/>
+            </w:r>
+          </w:p>
+        </w:tc>
+      </w:tr>
+    </w:tbl>
+    <w:p>
+      <w:pPr>
+        <w:keepNext/>
+        <w:jc w:val="center"/>
+      </w:pPr>
+    </w:p>
+    <w:p>
+      <w:r>
+        <w:t xml:space="preserve">Figure 5 is a visualisation of a 3x3 hexagonal grid. There is one glaring issue, there is lots of </w:t>
+      </w:r>
+      <w:r>
+        <w:t xml:space="preserve">dead </w:t>
+      </w:r>
+      <w:r>
+        <w:t xml:space="preserve">space in between </w:t>
+      </w:r>
+      <w:r>
+        <w:t xml:space="preserve">the tiles. Figure 6 shows how I will be rearranging the tiles so that they tesselate. The coordinates for these tiles are going to be bottom left based meaning that the tiles will be created from the bottom left towards the top right. </w:t>
+      </w:r>
+    </w:p>
     <w:p/>
     <w:bookmarkStart w:id="41" w:name="_Toc227684400" w:displacedByCustomXml="next"/>
     <w:sdt>
@@ -5979,6 +6119,55 @@
               <w:r>
                 <w:fldChar w:fldCharType="separate"/>
               </w:r>
+              <w:r>
+                <w:rPr>
+                  <w:noProof/>
+                </w:rPr>
+                <w:t xml:space="preserve">Glorfindel, 2022. </w:t>
+              </w:r>
+              <w:r>
+                <w:rPr>
+                  <w:i/>
+                  <w:iCs/>
+                  <w:noProof/>
+                </w:rPr>
+                <w:t xml:space="preserve">Hexagon grid coordinate system. </w:t>
+              </w:r>
+              <w:r>
+                <w:rPr>
+                  <w:noProof/>
+                </w:rPr>
+                <w:t xml:space="preserve">[Online] </w:t>
+              </w:r>
+              <w:r>
+                <w:rPr>
+                  <w:noProof/>
+                </w:rPr>
+                <w:br/>
+                <w:t xml:space="preserve">Available at: </w:t>
+              </w:r>
+              <w:r>
+                <w:rPr>
+                  <w:noProof/>
+                  <w:u w:val="single"/>
+                </w:rPr>
+                <w:t>https://math.stackexchange.com/questions/2254655/hexagon-grid-coordinate-system</w:t>
+              </w:r>
+              <w:r>
+                <w:rPr>
+                  <w:noProof/>
+                </w:rPr>
+                <w:br/>
+                <w:t>[Accessed 21 04 2026].</w:t>
+              </w:r>
+            </w:p>
+            <w:p>
+              <w:pPr>
+                <w:pStyle w:val="Bibliography"/>
+                <w:rPr>
+                  <w:noProof/>
+                </w:rPr>
+              </w:pPr>
               <w:r>
                 <w:rPr>
                   <w:noProof/>
@@ -6193,6 +6382,7 @@
                 <w:rPr>
                   <w:noProof/>
                 </w:rPr>
+                <w:lastRenderedPageBreak/>
                 <w:t xml:space="preserve">Scher, Y., 2017. </w:t>
               </w:r>
               <w:r>
@@ -7654,7 +7844,7 @@
   <w:style w:type="paragraph" w:default="1" w:styleId="Normal">
     <w:name w:val="Normal"/>
     <w:qFormat/>
-    <w:rsid w:val="00936759"/>
+    <w:rsid w:val="00F15A1A"/>
     <w:rPr>
       <w:rFonts w:ascii="Calibri" w:hAnsi="Calibri"/>
     </w:rPr>

</xml_diff>

<commit_message>
feat: biomes design written
</commit_message>
<xml_diff>
--- a/Report.docx
+++ b/Report.docx
@@ -321,7 +321,7 @@
         <w:pStyle w:val="Heading1"/>
       </w:pPr>
       <w:bookmarkStart w:id="1" w:name="_Toc40898999"/>
-      <w:bookmarkStart w:id="2" w:name="_Toc227684366"/>
+      <w:bookmarkStart w:id="2" w:name="_Toc227695939"/>
       <w:r>
         <w:lastRenderedPageBreak/>
         <w:t>Abstract</w:t>
@@ -331,7 +331,15 @@
     </w:p>
     <w:p>
       <w:r>
-        <w:t>AI is a still growing industry and while the current trend of AI is heading towards the usage of Large Language Models, I believe there is a genuine use case for machine learning models within video games. The focus of this project is to uncover the current reasons behind why the industry doesn’t use machine learning AI for uses such as Non-Player Characters or local multiplayer games. This is appro</w:t>
+        <w:t xml:space="preserve">AI is a still growing industry and while the current trend of AI is heading towards the usage of Large Language Models, I believe there is a genuine use case for machine learning models within video games. The focus of this project is to uncover the current reasons behind why the industry doesn’t use machine learning AI for uses such as </w:t>
+      </w:r>
+      <w:proofErr w:type="gramStart"/>
+      <w:r>
+        <w:t>Non-Player Characters</w:t>
+      </w:r>
+      <w:proofErr w:type="gramEnd"/>
+      <w:r>
+        <w:t xml:space="preserve"> or local multiplayer games. This is appro</w:t>
       </w:r>
       <w:r>
         <w:t>ached by covering the design choices and code architecture of implementing a machine learning model into the Unity game engine. To evaluate whether the AI is functional, data has been gathered using a mix of qualitative and quantitative research. This research was collected through a short survey given to participants.</w:t>
@@ -361,7 +369,7 @@
         <w:spacing w:after="321"/>
         <w:ind w:left="-5"/>
       </w:pPr>
-      <w:bookmarkStart w:id="3" w:name="_Toc227684367"/>
+      <w:bookmarkStart w:id="3" w:name="_Toc227695940"/>
       <w:r>
         <w:lastRenderedPageBreak/>
         <w:t>Declaration</w:t>
@@ -483,7 +491,7 @@
         <w:ind w:left="-5"/>
       </w:pPr>
       <w:bookmarkStart w:id="4" w:name="_Toc40899001"/>
-      <w:bookmarkStart w:id="5" w:name="_Toc227684368"/>
+      <w:bookmarkStart w:id="5" w:name="_Toc227695941"/>
       <w:r>
         <w:lastRenderedPageBreak/>
         <w:t>Acknowledgements</w:t>
@@ -617,7 +625,7 @@
         <w:spacing w:line="259" w:lineRule="auto"/>
       </w:pPr>
     </w:p>
-    <w:bookmarkStart w:id="6" w:name="_Toc227684369" w:displacedByCustomXml="next"/>
+    <w:bookmarkStart w:id="6" w:name="_Toc227695942" w:displacedByCustomXml="next"/>
     <w:sdt>
       <w:sdtPr>
         <w:rPr>
@@ -675,7 +683,7 @@
           <w:r>
             <w:fldChar w:fldCharType="separate"/>
           </w:r>
-          <w:hyperlink w:anchor="_Toc227684366" w:history="1">
+          <w:hyperlink w:anchor="_Toc227695939" w:history="1">
             <w:r>
               <w:rPr>
                 <w:rStyle w:val="Hyperlink"/>
@@ -702,7 +710,7 @@
                 <w:noProof/>
                 <w:webHidden/>
               </w:rPr>
-              <w:instrText xml:space="preserve"> PAGEREF _Toc227684366 \h </w:instrText>
+              <w:instrText xml:space="preserve"> PAGEREF _Toc227695939 \h </w:instrText>
             </w:r>
             <w:r>
               <w:rPr>
@@ -749,7 +757,7 @@
               <w14:ligatures w14:val="standardContextual"/>
             </w:rPr>
           </w:pPr>
-          <w:hyperlink w:anchor="_Toc227684367" w:history="1">
+          <w:hyperlink w:anchor="_Toc227695940" w:history="1">
             <w:r>
               <w:rPr>
                 <w:rStyle w:val="Hyperlink"/>
@@ -776,7 +784,7 @@
                 <w:noProof/>
                 <w:webHidden/>
               </w:rPr>
-              <w:instrText xml:space="preserve"> PAGEREF _Toc227684367 \h </w:instrText>
+              <w:instrText xml:space="preserve"> PAGEREF _Toc227695940 \h </w:instrText>
             </w:r>
             <w:r>
               <w:rPr>
@@ -823,7 +831,7 @@
               <w14:ligatures w14:val="standardContextual"/>
             </w:rPr>
           </w:pPr>
-          <w:hyperlink w:anchor="_Toc227684368" w:history="1">
+          <w:hyperlink w:anchor="_Toc227695941" w:history="1">
             <w:r>
               <w:rPr>
                 <w:rStyle w:val="Hyperlink"/>
@@ -850,7 +858,7 @@
                 <w:noProof/>
                 <w:webHidden/>
               </w:rPr>
-              <w:instrText xml:space="preserve"> PAGEREF _Toc227684368 \h </w:instrText>
+              <w:instrText xml:space="preserve"> PAGEREF _Toc227695941 \h </w:instrText>
             </w:r>
             <w:r>
               <w:rPr>
@@ -897,7 +905,7 @@
               <w14:ligatures w14:val="standardContextual"/>
             </w:rPr>
           </w:pPr>
-          <w:hyperlink w:anchor="_Toc227684369" w:history="1">
+          <w:hyperlink w:anchor="_Toc227695942" w:history="1">
             <w:r>
               <w:rPr>
                 <w:rStyle w:val="Hyperlink"/>
@@ -924,7 +932,7 @@
                 <w:noProof/>
                 <w:webHidden/>
               </w:rPr>
-              <w:instrText xml:space="preserve"> PAGEREF _Toc227684369 \h </w:instrText>
+              <w:instrText xml:space="preserve"> PAGEREF _Toc227695942 \h </w:instrText>
             </w:r>
             <w:r>
               <w:rPr>
@@ -971,7 +979,7 @@
               <w14:ligatures w14:val="standardContextual"/>
             </w:rPr>
           </w:pPr>
-          <w:hyperlink w:anchor="_Toc227684370" w:history="1">
+          <w:hyperlink w:anchor="_Toc227695943" w:history="1">
             <w:r>
               <w:rPr>
                 <w:rStyle w:val="Hyperlink"/>
@@ -998,7 +1006,7 @@
                 <w:noProof/>
                 <w:webHidden/>
               </w:rPr>
-              <w:instrText xml:space="preserve"> PAGEREF _Toc227684370 \h </w:instrText>
+              <w:instrText xml:space="preserve"> PAGEREF _Toc227695943 \h </w:instrText>
             </w:r>
             <w:r>
               <w:rPr>
@@ -1045,7 +1053,7 @@
               <w14:ligatures w14:val="standardContextual"/>
             </w:rPr>
           </w:pPr>
-          <w:hyperlink w:anchor="_Toc227684371" w:history="1">
+          <w:hyperlink w:anchor="_Toc227695944" w:history="1">
             <w:r>
               <w:rPr>
                 <w:rStyle w:val="Hyperlink"/>
@@ -1072,7 +1080,7 @@
                 <w:noProof/>
                 <w:webHidden/>
               </w:rPr>
-              <w:instrText xml:space="preserve"> PAGEREF _Toc227684371 \h </w:instrText>
+              <w:instrText xml:space="preserve"> PAGEREF _Toc227695944 \h </w:instrText>
             </w:r>
             <w:r>
               <w:rPr>
@@ -1119,7 +1127,7 @@
               <w14:ligatures w14:val="standardContextual"/>
             </w:rPr>
           </w:pPr>
-          <w:hyperlink w:anchor="_Toc227684372" w:history="1">
+          <w:hyperlink w:anchor="_Toc227695945" w:history="1">
             <w:r>
               <w:rPr>
                 <w:rStyle w:val="Hyperlink"/>
@@ -1146,7 +1154,7 @@
                 <w:noProof/>
                 <w:webHidden/>
               </w:rPr>
-              <w:instrText xml:space="preserve"> PAGEREF _Toc227684372 \h </w:instrText>
+              <w:instrText xml:space="preserve"> PAGEREF _Toc227695945 \h </w:instrText>
             </w:r>
             <w:r>
               <w:rPr>
@@ -1193,7 +1201,7 @@
               <w14:ligatures w14:val="standardContextual"/>
             </w:rPr>
           </w:pPr>
-          <w:hyperlink w:anchor="_Toc227684373" w:history="1">
+          <w:hyperlink w:anchor="_Toc227695946" w:history="1">
             <w:r>
               <w:rPr>
                 <w:rStyle w:val="Hyperlink"/>
@@ -1220,7 +1228,7 @@
                 <w:noProof/>
                 <w:webHidden/>
               </w:rPr>
-              <w:instrText xml:space="preserve"> PAGEREF _Toc227684373 \h </w:instrText>
+              <w:instrText xml:space="preserve"> PAGEREF _Toc227695946 \h </w:instrText>
             </w:r>
             <w:r>
               <w:rPr>
@@ -1267,7 +1275,7 @@
               <w14:ligatures w14:val="standardContextual"/>
             </w:rPr>
           </w:pPr>
-          <w:hyperlink w:anchor="_Toc227684374" w:history="1">
+          <w:hyperlink w:anchor="_Toc227695947" w:history="1">
             <w:r>
               <w:rPr>
                 <w:rStyle w:val="Hyperlink"/>
@@ -1294,7 +1302,7 @@
                 <w:noProof/>
                 <w:webHidden/>
               </w:rPr>
-              <w:instrText xml:space="preserve"> PAGEREF _Toc227684374 \h </w:instrText>
+              <w:instrText xml:space="preserve"> PAGEREF _Toc227695947 \h </w:instrText>
             </w:r>
             <w:r>
               <w:rPr>
@@ -1341,7 +1349,7 @@
               <w14:ligatures w14:val="standardContextual"/>
             </w:rPr>
           </w:pPr>
-          <w:hyperlink w:anchor="_Toc227684375" w:history="1">
+          <w:hyperlink w:anchor="_Toc227695948" w:history="1">
             <w:r>
               <w:rPr>
                 <w:rStyle w:val="Hyperlink"/>
@@ -1368,7 +1376,7 @@
                 <w:noProof/>
                 <w:webHidden/>
               </w:rPr>
-              <w:instrText xml:space="preserve"> PAGEREF _Toc227684375 \h </w:instrText>
+              <w:instrText xml:space="preserve"> PAGEREF _Toc227695948 \h </w:instrText>
             </w:r>
             <w:r>
               <w:rPr>
@@ -1415,7 +1423,7 @@
               <w14:ligatures w14:val="standardContextual"/>
             </w:rPr>
           </w:pPr>
-          <w:hyperlink w:anchor="_Toc227684376" w:history="1">
+          <w:hyperlink w:anchor="_Toc227695949" w:history="1">
             <w:r>
               <w:rPr>
                 <w:rStyle w:val="Hyperlink"/>
@@ -1442,7 +1450,7 @@
                 <w:noProof/>
                 <w:webHidden/>
               </w:rPr>
-              <w:instrText xml:space="preserve"> PAGEREF _Toc227684376 \h </w:instrText>
+              <w:instrText xml:space="preserve"> PAGEREF _Toc227695949 \h </w:instrText>
             </w:r>
             <w:r>
               <w:rPr>
@@ -1489,7 +1497,7 @@
               <w14:ligatures w14:val="standardContextual"/>
             </w:rPr>
           </w:pPr>
-          <w:hyperlink w:anchor="_Toc227684377" w:history="1">
+          <w:hyperlink w:anchor="_Toc227695950" w:history="1">
             <w:r>
               <w:rPr>
                 <w:rStyle w:val="Hyperlink"/>
@@ -1516,7 +1524,7 @@
                 <w:noProof/>
                 <w:webHidden/>
               </w:rPr>
-              <w:instrText xml:space="preserve"> PAGEREF _Toc227684377 \h </w:instrText>
+              <w:instrText xml:space="preserve"> PAGEREF _Toc227695950 \h </w:instrText>
             </w:r>
             <w:r>
               <w:rPr>
@@ -1563,7 +1571,7 @@
               <w14:ligatures w14:val="standardContextual"/>
             </w:rPr>
           </w:pPr>
-          <w:hyperlink w:anchor="_Toc227684378" w:history="1">
+          <w:hyperlink w:anchor="_Toc227695951" w:history="1">
             <w:r>
               <w:rPr>
                 <w:rStyle w:val="Hyperlink"/>
@@ -1590,7 +1598,7 @@
                 <w:noProof/>
                 <w:webHidden/>
               </w:rPr>
-              <w:instrText xml:space="preserve"> PAGEREF _Toc227684378 \h </w:instrText>
+              <w:instrText xml:space="preserve"> PAGEREF _Toc227695951 \h </w:instrText>
             </w:r>
             <w:r>
               <w:rPr>
@@ -1637,7 +1645,7 @@
               <w14:ligatures w14:val="standardContextual"/>
             </w:rPr>
           </w:pPr>
-          <w:hyperlink w:anchor="_Toc227684379" w:history="1">
+          <w:hyperlink w:anchor="_Toc227695952" w:history="1">
             <w:r>
               <w:rPr>
                 <w:rStyle w:val="Hyperlink"/>
@@ -1664,7 +1672,7 @@
                 <w:noProof/>
                 <w:webHidden/>
               </w:rPr>
-              <w:instrText xml:space="preserve"> PAGEREF _Toc227684379 \h </w:instrText>
+              <w:instrText xml:space="preserve"> PAGEREF _Toc227695952 \h </w:instrText>
             </w:r>
             <w:r>
               <w:rPr>
@@ -1711,7 +1719,7 @@
               <w14:ligatures w14:val="standardContextual"/>
             </w:rPr>
           </w:pPr>
-          <w:hyperlink w:anchor="_Toc227684380" w:history="1">
+          <w:hyperlink w:anchor="_Toc227695953" w:history="1">
             <w:r>
               <w:rPr>
                 <w:rStyle w:val="Hyperlink"/>
@@ -1738,7 +1746,7 @@
                 <w:noProof/>
                 <w:webHidden/>
               </w:rPr>
-              <w:instrText xml:space="preserve"> PAGEREF _Toc227684380 \h </w:instrText>
+              <w:instrText xml:space="preserve"> PAGEREF _Toc227695953 \h </w:instrText>
             </w:r>
             <w:r>
               <w:rPr>
@@ -1785,7 +1793,7 @@
               <w14:ligatures w14:val="standardContextual"/>
             </w:rPr>
           </w:pPr>
-          <w:hyperlink w:anchor="_Toc227684381" w:history="1">
+          <w:hyperlink w:anchor="_Toc227695954" w:history="1">
             <w:r>
               <w:rPr>
                 <w:rStyle w:val="Hyperlink"/>
@@ -1812,7 +1820,7 @@
                 <w:noProof/>
                 <w:webHidden/>
               </w:rPr>
-              <w:instrText xml:space="preserve"> PAGEREF _Toc227684381 \h </w:instrText>
+              <w:instrText xml:space="preserve"> PAGEREF _Toc227695954 \h </w:instrText>
             </w:r>
             <w:r>
               <w:rPr>
@@ -1859,7 +1867,7 @@
               <w14:ligatures w14:val="standardContextual"/>
             </w:rPr>
           </w:pPr>
-          <w:hyperlink w:anchor="_Toc227684382" w:history="1">
+          <w:hyperlink w:anchor="_Toc227695955" w:history="1">
             <w:r>
               <w:rPr>
                 <w:rStyle w:val="Hyperlink"/>
@@ -1886,7 +1894,7 @@
                 <w:noProof/>
                 <w:webHidden/>
               </w:rPr>
-              <w:instrText xml:space="preserve"> PAGEREF _Toc227684382 \h </w:instrText>
+              <w:instrText xml:space="preserve"> PAGEREF _Toc227695955 \h </w:instrText>
             </w:r>
             <w:r>
               <w:rPr>
@@ -1933,7 +1941,7 @@
               <w14:ligatures w14:val="standardContextual"/>
             </w:rPr>
           </w:pPr>
-          <w:hyperlink w:anchor="_Toc227684383" w:history="1">
+          <w:hyperlink w:anchor="_Toc227695956" w:history="1">
             <w:r>
               <w:rPr>
                 <w:rStyle w:val="Hyperlink"/>
@@ -1960,7 +1968,7 @@
                 <w:noProof/>
                 <w:webHidden/>
               </w:rPr>
-              <w:instrText xml:space="preserve"> PAGEREF _Toc227684383 \h </w:instrText>
+              <w:instrText xml:space="preserve"> PAGEREF _Toc227695956 \h </w:instrText>
             </w:r>
             <w:r>
               <w:rPr>
@@ -2007,7 +2015,7 @@
               <w14:ligatures w14:val="standardContextual"/>
             </w:rPr>
           </w:pPr>
-          <w:hyperlink w:anchor="_Toc227684384" w:history="1">
+          <w:hyperlink w:anchor="_Toc227695957" w:history="1">
             <w:r>
               <w:rPr>
                 <w:rStyle w:val="Hyperlink"/>
@@ -2034,7 +2042,7 @@
                 <w:noProof/>
                 <w:webHidden/>
               </w:rPr>
-              <w:instrText xml:space="preserve"> PAGEREF _Toc227684384 \h </w:instrText>
+              <w:instrText xml:space="preserve"> PAGEREF _Toc227695957 \h </w:instrText>
             </w:r>
             <w:r>
               <w:rPr>
@@ -2081,7 +2089,7 @@
               <w14:ligatures w14:val="standardContextual"/>
             </w:rPr>
           </w:pPr>
-          <w:hyperlink w:anchor="_Toc227684385" w:history="1">
+          <w:hyperlink w:anchor="_Toc227695958" w:history="1">
             <w:r>
               <w:rPr>
                 <w:rStyle w:val="Hyperlink"/>
@@ -2108,7 +2116,7 @@
                 <w:noProof/>
                 <w:webHidden/>
               </w:rPr>
-              <w:instrText xml:space="preserve"> PAGEREF _Toc227684385 \h </w:instrText>
+              <w:instrText xml:space="preserve"> PAGEREF _Toc227695958 \h </w:instrText>
             </w:r>
             <w:r>
               <w:rPr>
@@ -2151,7 +2159,7 @@
               <w:lang w:eastAsia="en-GB"/>
             </w:rPr>
           </w:pPr>
-          <w:hyperlink w:anchor="_Toc227684386" w:history="1">
+          <w:hyperlink w:anchor="_Toc227695959" w:history="1">
             <w:r>
               <w:rPr>
                 <w:rStyle w:val="Hyperlink"/>
@@ -2178,7 +2186,7 @@
                 <w:noProof/>
                 <w:webHidden/>
               </w:rPr>
-              <w:instrText xml:space="preserve"> PAGEREF _Toc227684386 \h </w:instrText>
+              <w:instrText xml:space="preserve"> PAGEREF _Toc227695959 \h </w:instrText>
             </w:r>
             <w:r>
               <w:rPr>
@@ -2221,7 +2229,7 @@
               <w:lang w:eastAsia="en-GB"/>
             </w:rPr>
           </w:pPr>
-          <w:hyperlink w:anchor="_Toc227684387" w:history="1">
+          <w:hyperlink w:anchor="_Toc227695960" w:history="1">
             <w:r>
               <w:rPr>
                 <w:rStyle w:val="Hyperlink"/>
@@ -2248,7 +2256,7 @@
                 <w:noProof/>
                 <w:webHidden/>
               </w:rPr>
-              <w:instrText xml:space="preserve"> PAGEREF _Toc227684387 \h </w:instrText>
+              <w:instrText xml:space="preserve"> PAGEREF _Toc227695960 \h </w:instrText>
             </w:r>
             <w:r>
               <w:rPr>
@@ -2291,7 +2299,7 @@
               <w:lang w:eastAsia="en-GB"/>
             </w:rPr>
           </w:pPr>
-          <w:hyperlink w:anchor="_Toc227684388" w:history="1">
+          <w:hyperlink w:anchor="_Toc227695961" w:history="1">
             <w:r>
               <w:rPr>
                 <w:rStyle w:val="Hyperlink"/>
@@ -2318,7 +2326,7 @@
                 <w:noProof/>
                 <w:webHidden/>
               </w:rPr>
-              <w:instrText xml:space="preserve"> PAGEREF _Toc227684388 \h </w:instrText>
+              <w:instrText xml:space="preserve"> PAGEREF _Toc227695961 \h </w:instrText>
             </w:r>
             <w:r>
               <w:rPr>
@@ -2365,7 +2373,7 @@
               <w14:ligatures w14:val="standardContextual"/>
             </w:rPr>
           </w:pPr>
-          <w:hyperlink w:anchor="_Toc227684389" w:history="1">
+          <w:hyperlink w:anchor="_Toc227695962" w:history="1">
             <w:r>
               <w:rPr>
                 <w:rStyle w:val="Hyperlink"/>
@@ -2392,7 +2400,7 @@
                 <w:noProof/>
                 <w:webHidden/>
               </w:rPr>
-              <w:instrText xml:space="preserve"> PAGEREF _Toc227684389 \h </w:instrText>
+              <w:instrText xml:space="preserve"> PAGEREF _Toc227695962 \h </w:instrText>
             </w:r>
             <w:r>
               <w:rPr>
@@ -2435,7 +2443,7 @@
               <w:lang w:eastAsia="en-GB"/>
             </w:rPr>
           </w:pPr>
-          <w:hyperlink w:anchor="_Toc227684390" w:history="1">
+          <w:hyperlink w:anchor="_Toc227695963" w:history="1">
             <w:r>
               <w:rPr>
                 <w:rStyle w:val="Hyperlink"/>
@@ -2462,7 +2470,7 @@
                 <w:noProof/>
                 <w:webHidden/>
               </w:rPr>
-              <w:instrText xml:space="preserve"> PAGEREF _Toc227684390 \h </w:instrText>
+              <w:instrText xml:space="preserve"> PAGEREF _Toc227695963 \h </w:instrText>
             </w:r>
             <w:r>
               <w:rPr>
@@ -2505,7 +2513,7 @@
               <w:lang w:eastAsia="en-GB"/>
             </w:rPr>
           </w:pPr>
-          <w:hyperlink w:anchor="_Toc227684391" w:history="1">
+          <w:hyperlink w:anchor="_Toc227695964" w:history="1">
             <w:r>
               <w:rPr>
                 <w:rStyle w:val="Hyperlink"/>
@@ -2532,7 +2540,7 @@
                 <w:noProof/>
                 <w:webHidden/>
               </w:rPr>
-              <w:instrText xml:space="preserve"> PAGEREF _Toc227684391 \h </w:instrText>
+              <w:instrText xml:space="preserve"> PAGEREF _Toc227695964 \h </w:instrText>
             </w:r>
             <w:r>
               <w:rPr>
@@ -2575,7 +2583,7 @@
               <w:lang w:eastAsia="en-GB"/>
             </w:rPr>
           </w:pPr>
-          <w:hyperlink w:anchor="_Toc227684392" w:history="1">
+          <w:hyperlink w:anchor="_Toc227695965" w:history="1">
             <w:r>
               <w:rPr>
                 <w:rStyle w:val="Hyperlink"/>
@@ -2602,7 +2610,7 @@
                 <w:noProof/>
                 <w:webHidden/>
               </w:rPr>
-              <w:instrText xml:space="preserve"> PAGEREF _Toc227684392 \h </w:instrText>
+              <w:instrText xml:space="preserve"> PAGEREF _Toc227695965 \h </w:instrText>
             </w:r>
             <w:r>
               <w:rPr>
@@ -2649,7 +2657,7 @@
               <w14:ligatures w14:val="standardContextual"/>
             </w:rPr>
           </w:pPr>
-          <w:hyperlink w:anchor="_Toc227684393" w:history="1">
+          <w:hyperlink w:anchor="_Toc227695966" w:history="1">
             <w:r>
               <w:rPr>
                 <w:rStyle w:val="Hyperlink"/>
@@ -2676,7 +2684,7 @@
                 <w:noProof/>
                 <w:webHidden/>
               </w:rPr>
-              <w:instrText xml:space="preserve"> PAGEREF _Toc227684393 \h </w:instrText>
+              <w:instrText xml:space="preserve"> PAGEREF _Toc227695966 \h </w:instrText>
             </w:r>
             <w:r>
               <w:rPr>
@@ -2719,7 +2727,7 @@
               <w:lang w:eastAsia="en-GB"/>
             </w:rPr>
           </w:pPr>
-          <w:hyperlink w:anchor="_Toc227684394" w:history="1">
+          <w:hyperlink w:anchor="_Toc227695967" w:history="1">
             <w:r>
               <w:rPr>
                 <w:rStyle w:val="Hyperlink"/>
@@ -2746,7 +2754,7 @@
                 <w:noProof/>
                 <w:webHidden/>
               </w:rPr>
-              <w:instrText xml:space="preserve"> PAGEREF _Toc227684394 \h </w:instrText>
+              <w:instrText xml:space="preserve"> PAGEREF _Toc227695967 \h </w:instrText>
             </w:r>
             <w:r>
               <w:rPr>
@@ -2789,7 +2797,7 @@
               <w:lang w:eastAsia="en-GB"/>
             </w:rPr>
           </w:pPr>
-          <w:hyperlink w:anchor="_Toc227684395" w:history="1">
+          <w:hyperlink w:anchor="_Toc227695968" w:history="1">
             <w:r>
               <w:rPr>
                 <w:rStyle w:val="Hyperlink"/>
@@ -2816,7 +2824,7 @@
                 <w:noProof/>
                 <w:webHidden/>
               </w:rPr>
-              <w:instrText xml:space="preserve"> PAGEREF _Toc227684395 \h </w:instrText>
+              <w:instrText xml:space="preserve"> PAGEREF _Toc227695968 \h </w:instrText>
             </w:r>
             <w:r>
               <w:rPr>
@@ -2859,7 +2867,7 @@
               <w:lang w:eastAsia="en-GB"/>
             </w:rPr>
           </w:pPr>
-          <w:hyperlink w:anchor="_Toc227684396" w:history="1">
+          <w:hyperlink w:anchor="_Toc227695969" w:history="1">
             <w:r>
               <w:rPr>
                 <w:rStyle w:val="Hyperlink"/>
@@ -2886,7 +2894,7 @@
                 <w:noProof/>
                 <w:webHidden/>
               </w:rPr>
-              <w:instrText xml:space="preserve"> PAGEREF _Toc227684396 \h </w:instrText>
+              <w:instrText xml:space="preserve"> PAGEREF _Toc227695969 \h </w:instrText>
             </w:r>
             <w:r>
               <w:rPr>
@@ -2933,7 +2941,7 @@
               <w14:ligatures w14:val="standardContextual"/>
             </w:rPr>
           </w:pPr>
-          <w:hyperlink w:anchor="_Toc227684397" w:history="1">
+          <w:hyperlink w:anchor="_Toc227695970" w:history="1">
             <w:r>
               <w:rPr>
                 <w:rStyle w:val="Hyperlink"/>
@@ -2960,7 +2968,7 @@
                 <w:noProof/>
                 <w:webHidden/>
               </w:rPr>
-              <w:instrText xml:space="preserve"> PAGEREF _Toc227684397 \h </w:instrText>
+              <w:instrText xml:space="preserve"> PAGEREF _Toc227695970 \h </w:instrText>
             </w:r>
             <w:r>
               <w:rPr>
@@ -3007,7 +3015,7 @@
               <w14:ligatures w14:val="standardContextual"/>
             </w:rPr>
           </w:pPr>
-          <w:hyperlink w:anchor="_Toc227684398" w:history="1">
+          <w:hyperlink w:anchor="_Toc227695971" w:history="1">
             <w:r>
               <w:rPr>
                 <w:rStyle w:val="Hyperlink"/>
@@ -3034,7 +3042,7 @@
                 <w:noProof/>
                 <w:webHidden/>
               </w:rPr>
-              <w:instrText xml:space="preserve"> PAGEREF _Toc227684398 \h </w:instrText>
+              <w:instrText xml:space="preserve"> PAGEREF _Toc227695971 \h </w:instrText>
             </w:r>
             <w:r>
               <w:rPr>
@@ -3081,7 +3089,7 @@
               <w14:ligatures w14:val="standardContextual"/>
             </w:rPr>
           </w:pPr>
-          <w:hyperlink w:anchor="_Toc227684399" w:history="1">
+          <w:hyperlink w:anchor="_Toc227695972" w:history="1">
             <w:r>
               <w:rPr>
                 <w:rStyle w:val="Hyperlink"/>
@@ -3108,7 +3116,7 @@
                 <w:noProof/>
                 <w:webHidden/>
               </w:rPr>
-              <w:instrText xml:space="preserve"> PAGEREF _Toc227684399 \h </w:instrText>
+              <w:instrText xml:space="preserve"> PAGEREF _Toc227695972 \h </w:instrText>
             </w:r>
             <w:r>
               <w:rPr>
@@ -3129,6 +3137,80 @@
                 <w:webHidden/>
               </w:rPr>
               <w:t>9</w:t>
+            </w:r>
+            <w:r>
+              <w:rPr>
+                <w:noProof/>
+                <w:webHidden/>
+              </w:rPr>
+              <w:fldChar w:fldCharType="end"/>
+            </w:r>
+          </w:hyperlink>
+        </w:p>
+        <w:p>
+          <w:pPr>
+            <w:pStyle w:val="TOC3"/>
+            <w:tabs>
+              <w:tab w:val="right" w:leader="dot" w:pos="9016"/>
+            </w:tabs>
+            <w:rPr>
+              <w:rFonts w:asciiTheme="minorHAnsi" w:hAnsiTheme="minorHAnsi" w:cstheme="minorBidi"/>
+              <w:noProof/>
+              <w:kern w:val="2"/>
+              <w:sz w:val="24"/>
+              <w:szCs w:val="24"/>
+              <w:lang w:val="en-GB" w:eastAsia="en-GB"/>
+              <w14:ligatures w14:val="standardContextual"/>
+            </w:rPr>
+          </w:pPr>
+          <w:hyperlink w:anchor="_Toc227695973" w:history="1">
+            <w:r>
+              <w:rPr>
+                <w:rStyle w:val="Hyperlink"/>
+                <w:noProof/>
+              </w:rPr>
+              <w:t>3.1.2 Biomes</w:t>
+            </w:r>
+            <w:r>
+              <w:rPr>
+                <w:noProof/>
+                <w:webHidden/>
+              </w:rPr>
+              <w:tab/>
+            </w:r>
+            <w:r>
+              <w:rPr>
+                <w:noProof/>
+                <w:webHidden/>
+              </w:rPr>
+              <w:fldChar w:fldCharType="begin"/>
+            </w:r>
+            <w:r>
+              <w:rPr>
+                <w:noProof/>
+                <w:webHidden/>
+              </w:rPr>
+              <w:instrText xml:space="preserve"> PAGEREF _Toc227695973 \h </w:instrText>
+            </w:r>
+            <w:r>
+              <w:rPr>
+                <w:noProof/>
+                <w:webHidden/>
+              </w:rPr>
+            </w:r>
+            <w:r>
+              <w:rPr>
+                <w:noProof/>
+                <w:webHidden/>
+              </w:rPr>
+              <w:fldChar w:fldCharType="separate"/>
+            </w:r>
+            <w:r>
+              <w:rPr>
+                <w:noProof/>
+                <w:webHidden/>
+              </w:rPr>
+              <w:t>10</w:t>
             </w:r>
             <w:r>
               <w:rPr>
@@ -3155,7 +3237,7 @@
               <w14:ligatures w14:val="standardContextual"/>
             </w:rPr>
           </w:pPr>
-          <w:hyperlink w:anchor="_Toc227684400" w:history="1">
+          <w:hyperlink w:anchor="_Toc227695974" w:history="1">
             <w:r>
               <w:rPr>
                 <w:rStyle w:val="Hyperlink"/>
@@ -3182,7 +3264,7 @@
                 <w:noProof/>
                 <w:webHidden/>
               </w:rPr>
-              <w:instrText xml:space="preserve"> PAGEREF _Toc227684400 \h </w:instrText>
+              <w:instrText xml:space="preserve"> PAGEREF _Toc227695974 \h </w:instrText>
             </w:r>
             <w:r>
               <w:rPr>
@@ -3202,7 +3284,7 @@
                 <w:noProof/>
                 <w:webHidden/>
               </w:rPr>
-              <w:t>9</w:t>
+              <w:t>11</w:t>
             </w:r>
             <w:r>
               <w:rPr>
@@ -3239,7 +3321,7 @@
       <w:pPr>
         <w:pStyle w:val="Heading1"/>
       </w:pPr>
-      <w:bookmarkStart w:id="7" w:name="_Toc227684370"/>
+      <w:bookmarkStart w:id="7" w:name="_Toc227695943"/>
       <w:r>
         <w:t>Table of Figures</w:t>
       </w:r>
@@ -3281,7 +3363,7 @@
         </w:rPr>
         <w:fldChar w:fldCharType="separate"/>
       </w:r>
-      <w:hyperlink w:anchor="_Toc227684401" w:history="1">
+      <w:hyperlink w:anchor="_Toc227695975" w:history="1">
         <w:r>
           <w:rPr>
             <w:rStyle w:val="Hyperlink"/>
@@ -3308,7 +3390,7 @@
             <w:noProof/>
             <w:webHidden/>
           </w:rPr>
-          <w:instrText xml:space="preserve"> PAGEREF _Toc227684401 \h </w:instrText>
+          <w:instrText xml:space="preserve"> PAGEREF _Toc227695975 \h </w:instrText>
         </w:r>
         <w:r>
           <w:rPr>
@@ -3351,7 +3433,7 @@
           <w:lang w:eastAsia="en-GB"/>
         </w:rPr>
       </w:pPr>
-      <w:hyperlink w:anchor="_Toc227684402" w:history="1">
+      <w:hyperlink w:anchor="_Toc227695976" w:history="1">
         <w:r>
           <w:rPr>
             <w:rStyle w:val="Hyperlink"/>
@@ -3378,7 +3460,7 @@
             <w:noProof/>
             <w:webHidden/>
           </w:rPr>
-          <w:instrText xml:space="preserve"> PAGEREF _Toc227684402 \h </w:instrText>
+          <w:instrText xml:space="preserve"> PAGEREF _Toc227695976 \h </w:instrText>
         </w:r>
         <w:r>
           <w:rPr>
@@ -3421,7 +3503,7 @@
           <w:lang w:eastAsia="en-GB"/>
         </w:rPr>
       </w:pPr>
-      <w:hyperlink w:anchor="_Toc227684403" w:history="1">
+      <w:hyperlink w:anchor="_Toc227695977" w:history="1">
         <w:r>
           <w:rPr>
             <w:rStyle w:val="Hyperlink"/>
@@ -3448,7 +3530,7 @@
             <w:noProof/>
             <w:webHidden/>
           </w:rPr>
-          <w:instrText xml:space="preserve"> PAGEREF _Toc227684403 \h </w:instrText>
+          <w:instrText xml:space="preserve"> PAGEREF _Toc227695977 \h </w:instrText>
         </w:r>
         <w:r>
           <w:rPr>
@@ -3491,7 +3573,7 @@
           <w:lang w:eastAsia="en-GB"/>
         </w:rPr>
       </w:pPr>
-      <w:hyperlink w:anchor="_Toc227684404" w:history="1">
+      <w:hyperlink w:anchor="_Toc227695978" w:history="1">
         <w:r>
           <w:rPr>
             <w:rStyle w:val="Hyperlink"/>
@@ -3518,7 +3600,7 @@
             <w:noProof/>
             <w:webHidden/>
           </w:rPr>
-          <w:instrText xml:space="preserve"> PAGEREF _Toc227684404 \h </w:instrText>
+          <w:instrText xml:space="preserve"> PAGEREF _Toc227695978 \h </w:instrText>
         </w:r>
         <w:r>
           <w:rPr>
@@ -3551,6 +3633,216 @@
     </w:p>
     <w:p>
       <w:pPr>
+        <w:pStyle w:val="TableofFigures"/>
+        <w:tabs>
+          <w:tab w:val="right" w:leader="dot" w:pos="9016"/>
+        </w:tabs>
+        <w:rPr>
+          <w:rFonts w:asciiTheme="minorHAnsi" w:eastAsiaTheme="minorEastAsia" w:hAnsiTheme="minorHAnsi"/>
+          <w:noProof/>
+          <w:lang w:eastAsia="en-GB"/>
+        </w:rPr>
+      </w:pPr>
+      <w:hyperlink w:anchor="_Toc227695979" w:history="1">
+        <w:r>
+          <w:rPr>
+            <w:rStyle w:val="Hyperlink"/>
+            <w:noProof/>
+          </w:rPr>
+          <w:t>Figure 5</w:t>
+        </w:r>
+        <w:r>
+          <w:rPr>
+            <w:noProof/>
+            <w:webHidden/>
+          </w:rPr>
+          <w:tab/>
+        </w:r>
+        <w:r>
+          <w:rPr>
+            <w:noProof/>
+            <w:webHidden/>
+          </w:rPr>
+          <w:fldChar w:fldCharType="begin"/>
+        </w:r>
+        <w:r>
+          <w:rPr>
+            <w:noProof/>
+            <w:webHidden/>
+          </w:rPr>
+          <w:instrText xml:space="preserve"> PAGEREF _Toc227695979 \h </w:instrText>
+        </w:r>
+        <w:r>
+          <w:rPr>
+            <w:noProof/>
+            <w:webHidden/>
+          </w:rPr>
+        </w:r>
+        <w:r>
+          <w:rPr>
+            <w:noProof/>
+            <w:webHidden/>
+          </w:rPr>
+          <w:fldChar w:fldCharType="separate"/>
+        </w:r>
+        <w:r>
+          <w:rPr>
+            <w:noProof/>
+            <w:webHidden/>
+          </w:rPr>
+          <w:t>10</w:t>
+        </w:r>
+        <w:r>
+          <w:rPr>
+            <w:noProof/>
+            <w:webHidden/>
+          </w:rPr>
+          <w:fldChar w:fldCharType="end"/>
+        </w:r>
+      </w:hyperlink>
+    </w:p>
+    <w:p>
+      <w:pPr>
+        <w:pStyle w:val="TableofFigures"/>
+        <w:tabs>
+          <w:tab w:val="right" w:leader="dot" w:pos="9016"/>
+        </w:tabs>
+        <w:rPr>
+          <w:rFonts w:asciiTheme="minorHAnsi" w:eastAsiaTheme="minorEastAsia" w:hAnsiTheme="minorHAnsi"/>
+          <w:noProof/>
+          <w:lang w:eastAsia="en-GB"/>
+        </w:rPr>
+      </w:pPr>
+      <w:hyperlink w:anchor="_Toc227695980" w:history="1">
+        <w:r>
+          <w:rPr>
+            <w:rStyle w:val="Hyperlink"/>
+            <w:noProof/>
+          </w:rPr>
+          <w:t>Figure 6</w:t>
+        </w:r>
+        <w:r>
+          <w:rPr>
+            <w:noProof/>
+            <w:webHidden/>
+          </w:rPr>
+          <w:tab/>
+        </w:r>
+        <w:r>
+          <w:rPr>
+            <w:noProof/>
+            <w:webHidden/>
+          </w:rPr>
+          <w:fldChar w:fldCharType="begin"/>
+        </w:r>
+        <w:r>
+          <w:rPr>
+            <w:noProof/>
+            <w:webHidden/>
+          </w:rPr>
+          <w:instrText xml:space="preserve"> PAGEREF _Toc227695980 \h </w:instrText>
+        </w:r>
+        <w:r>
+          <w:rPr>
+            <w:noProof/>
+            <w:webHidden/>
+          </w:rPr>
+        </w:r>
+        <w:r>
+          <w:rPr>
+            <w:noProof/>
+            <w:webHidden/>
+          </w:rPr>
+          <w:fldChar w:fldCharType="separate"/>
+        </w:r>
+        <w:r>
+          <w:rPr>
+            <w:noProof/>
+            <w:webHidden/>
+          </w:rPr>
+          <w:t>10</w:t>
+        </w:r>
+        <w:r>
+          <w:rPr>
+            <w:noProof/>
+            <w:webHidden/>
+          </w:rPr>
+          <w:fldChar w:fldCharType="end"/>
+        </w:r>
+      </w:hyperlink>
+    </w:p>
+    <w:p>
+      <w:pPr>
+        <w:pStyle w:val="TableofFigures"/>
+        <w:tabs>
+          <w:tab w:val="right" w:leader="dot" w:pos="9016"/>
+        </w:tabs>
+        <w:rPr>
+          <w:rFonts w:asciiTheme="minorHAnsi" w:eastAsiaTheme="minorEastAsia" w:hAnsiTheme="minorHAnsi"/>
+          <w:noProof/>
+          <w:lang w:eastAsia="en-GB"/>
+        </w:rPr>
+      </w:pPr>
+      <w:hyperlink w:anchor="_Toc227695981" w:history="1">
+        <w:r>
+          <w:rPr>
+            <w:rStyle w:val="Hyperlink"/>
+            <w:noProof/>
+          </w:rPr>
+          <w:t>Figure 7 (Scher, 2017)</w:t>
+        </w:r>
+        <w:r>
+          <w:rPr>
+            <w:noProof/>
+            <w:webHidden/>
+          </w:rPr>
+          <w:tab/>
+        </w:r>
+        <w:r>
+          <w:rPr>
+            <w:noProof/>
+            <w:webHidden/>
+          </w:rPr>
+          <w:fldChar w:fldCharType="begin"/>
+        </w:r>
+        <w:r>
+          <w:rPr>
+            <w:noProof/>
+            <w:webHidden/>
+          </w:rPr>
+          <w:instrText xml:space="preserve"> PAGEREF _Toc227695981 \h </w:instrText>
+        </w:r>
+        <w:r>
+          <w:rPr>
+            <w:noProof/>
+            <w:webHidden/>
+          </w:rPr>
+        </w:r>
+        <w:r>
+          <w:rPr>
+            <w:noProof/>
+            <w:webHidden/>
+          </w:rPr>
+          <w:fldChar w:fldCharType="separate"/>
+        </w:r>
+        <w:r>
+          <w:rPr>
+            <w:noProof/>
+            <w:webHidden/>
+          </w:rPr>
+          <w:t>10</w:t>
+        </w:r>
+        <w:r>
+          <w:rPr>
+            <w:noProof/>
+            <w:webHidden/>
+          </w:rPr>
+          <w:fldChar w:fldCharType="end"/>
+        </w:r>
+      </w:hyperlink>
+    </w:p>
+    <w:p>
+      <w:pPr>
         <w:spacing w:line="259" w:lineRule="auto"/>
         <w:rPr>
           <w:sz w:val="36"/>
@@ -3587,7 +3879,7 @@
       <w:pPr>
         <w:pStyle w:val="Heading1"/>
       </w:pPr>
-      <w:bookmarkStart w:id="8" w:name="_Toc227684371"/>
+      <w:bookmarkStart w:id="8" w:name="_Toc227695944"/>
       <w:r>
         <w:t>Chapter 1</w:t>
       </w:r>
@@ -3615,7 +3907,7 @@
           <w:u w:val="single"/>
         </w:rPr>
       </w:pPr>
-      <w:bookmarkStart w:id="9" w:name="_Toc227684372"/>
+      <w:bookmarkStart w:id="9" w:name="_Toc227695945"/>
       <w:r>
         <w:t>1.1</w:t>
       </w:r>
@@ -3660,7 +3952,7 @@
       <w:pPr>
         <w:pStyle w:val="Heading2"/>
       </w:pPr>
-      <w:bookmarkStart w:id="10" w:name="_Toc227684373"/>
+      <w:bookmarkStart w:id="10" w:name="_Toc227695946"/>
       <w:r>
         <w:t>1.2 Aims</w:t>
       </w:r>
@@ -3676,7 +3968,7 @@
           <w:szCs w:val="28"/>
         </w:rPr>
       </w:pPr>
-      <w:bookmarkStart w:id="11" w:name="_Toc227684374"/>
+      <w:bookmarkStart w:id="11" w:name="_Toc227695947"/>
       <w:r>
         <w:rPr>
           <w:rStyle w:val="Heading2Char"/>
@@ -3721,7 +4013,7 @@
       <w:pPr>
         <w:pStyle w:val="Heading3"/>
       </w:pPr>
-      <w:bookmarkStart w:id="12" w:name="_Toc227684375"/>
+      <w:bookmarkStart w:id="12" w:name="_Toc227695948"/>
       <w:r>
         <w:lastRenderedPageBreak/>
         <w:t>1.2.2 Additional Aims</w:t>
@@ -3791,7 +4083,7 @@
       <w:pPr>
         <w:pStyle w:val="Heading2"/>
       </w:pPr>
-      <w:bookmarkStart w:id="13" w:name="_Toc227684376"/>
+      <w:bookmarkStart w:id="13" w:name="_Toc227695949"/>
       <w:r>
         <w:t>1.3 Objectives</w:t>
       </w:r>
@@ -3801,7 +4093,7 @@
       <w:pPr>
         <w:pStyle w:val="Heading3"/>
       </w:pPr>
-      <w:bookmarkStart w:id="14" w:name="_Toc227684377"/>
+      <w:bookmarkStart w:id="14" w:name="_Toc227695950"/>
       <w:r>
         <w:t>1.3.1 Scope</w:t>
       </w:r>
@@ -3809,7 +4101,15 @@
     </w:p>
     <w:p>
       <w:r>
-        <w:t>The objectives in terms of scope for this project are going to be generally quite broad and consist of specific milestones. The core objectives in regards to the scope are:</w:t>
+        <w:t xml:space="preserve">The objectives in terms of scope for this project are going to be generally quite broad and consist of specific milestones. The core objectives </w:t>
+      </w:r>
+      <w:proofErr w:type="gramStart"/>
+      <w:r>
+        <w:t>in regards to</w:t>
+      </w:r>
+      <w:proofErr w:type="gramEnd"/>
+      <w:r>
+        <w:t xml:space="preserve"> the scope are:</w:t>
       </w:r>
     </w:p>
     <w:p>
@@ -3864,7 +4164,7 @@
       <w:pPr>
         <w:pStyle w:val="Heading3"/>
       </w:pPr>
-      <w:bookmarkStart w:id="15" w:name="_Toc227684378"/>
+      <w:bookmarkStart w:id="15" w:name="_Toc227695951"/>
       <w:r>
         <w:t>1.3.2 Research Objectives</w:t>
       </w:r>
@@ -3872,7 +4172,15 @@
     </w:p>
     <w:p>
       <w:r>
-        <w:t>For the research objectives for the game, research will be conducted into other types of media with similar features. This research will include a comparison of similar games and their features and the overall impact of those features on this project. This will be done to find a balance for the difficulty of the game and to evaluate the necessary features for the game. Some topics of features and mechanics that will be researched include: World Generation, Pathfinding</w:t>
+        <w:t xml:space="preserve">For the research objectives for the game, research will be conducted into other types of media with similar features. This research will include a comparison of similar games and their features and the overall impact of those features on this project. This will be done to find a balance for the difficulty of the game and to evaluate the necessary features for the game. Some topics of features and mechanics that will be researched </w:t>
+      </w:r>
+      <w:proofErr w:type="gramStart"/>
+      <w:r>
+        <w:t>include:</w:t>
+      </w:r>
+      <w:proofErr w:type="gramEnd"/>
+      <w:r>
+        <w:t xml:space="preserve"> World Generation, Pathfinding</w:t>
       </w:r>
       <w:r>
         <w:t xml:space="preserve"> and </w:t>
@@ -3901,7 +4209,7 @@
       <w:pPr>
         <w:pStyle w:val="Heading3"/>
       </w:pPr>
-      <w:bookmarkStart w:id="16" w:name="_Toc227684379"/>
+      <w:bookmarkStart w:id="16" w:name="_Toc227695952"/>
       <w:r>
         <w:t>1.3.3 Design Objectives</w:t>
       </w:r>
@@ -4023,7 +4331,7 @@
       <w:pPr>
         <w:pStyle w:val="Heading3"/>
       </w:pPr>
-      <w:bookmarkStart w:id="17" w:name="_Toc227684380"/>
+      <w:bookmarkStart w:id="17" w:name="_Toc227695953"/>
       <w:r>
         <w:t>1.3.4 Implementation Objectives</w:t>
       </w:r>
@@ -4142,7 +4450,7 @@
       <w:pPr>
         <w:pStyle w:val="Heading3"/>
       </w:pPr>
-      <w:bookmarkStart w:id="18" w:name="_Toc227684381"/>
+      <w:bookmarkStart w:id="18" w:name="_Toc227695954"/>
       <w:r>
         <w:t>1.3.5 Results, Evaluation and Playtesting Objectives</w:t>
       </w:r>
@@ -4199,7 +4507,7 @@
       <w:pPr>
         <w:pStyle w:val="Heading1"/>
       </w:pPr>
-      <w:bookmarkStart w:id="19" w:name="_Toc227684382"/>
+      <w:bookmarkStart w:id="19" w:name="_Toc227695955"/>
       <w:r>
         <w:t>Chapter 2 – Literature Survey</w:t>
       </w:r>
@@ -4209,7 +4517,7 @@
       <w:pPr>
         <w:pStyle w:val="Heading2"/>
       </w:pPr>
-      <w:bookmarkStart w:id="20" w:name="_Toc227684383"/>
+      <w:bookmarkStart w:id="20" w:name="_Toc227695956"/>
       <w:r>
         <w:t>2.1 Literature Survey Introduction</w:t>
       </w:r>
@@ -4248,7 +4556,7 @@
       <w:pPr>
         <w:pStyle w:val="Heading2"/>
       </w:pPr>
-      <w:bookmarkStart w:id="21" w:name="_Toc227684384"/>
+      <w:bookmarkStart w:id="21" w:name="_Toc227695957"/>
       <w:r>
         <w:t>2.2 Comparative Research</w:t>
       </w:r>
@@ -4266,7 +4574,7 @@
       <w:pPr>
         <w:pStyle w:val="Heading3"/>
       </w:pPr>
-      <w:bookmarkStart w:id="22" w:name="_Toc227684385"/>
+      <w:bookmarkStart w:id="22" w:name="_Toc227695958"/>
       <w:r>
         <w:t xml:space="preserve">2.2.1 </w:t>
       </w:r>
@@ -4342,7 +4650,7 @@
       <w:pPr>
         <w:pStyle w:val="Heading4"/>
       </w:pPr>
-      <w:bookmarkStart w:id="23" w:name="_Toc227684386"/>
+      <w:bookmarkStart w:id="23" w:name="_Toc227695959"/>
       <w:r>
         <w:t>2.2.1.1 Perlin Noise</w:t>
       </w:r>
@@ -4353,10 +4661,26 @@
         <w:keepNext/>
       </w:pPr>
       <w:r>
-        <w:t>Perlin Noise is used in the majority of world generations due to its versatility.</w:t>
-      </w:r>
-      <w:r>
-        <w:t xml:space="preserve"> It works through the use of layering</w:t>
+        <w:t xml:space="preserve">Perlin Noise is used in </w:t>
+      </w:r>
+      <w:proofErr w:type="gramStart"/>
+      <w:r>
+        <w:t>the majority of</w:t>
+      </w:r>
+      <w:proofErr w:type="gramEnd"/>
+      <w:r>
+        <w:t xml:space="preserve"> world generations due to its versatility.</w:t>
+      </w:r>
+      <w:r>
+        <w:t xml:space="preserve"> It works </w:t>
+      </w:r>
+      <w:proofErr w:type="gramStart"/>
+      <w:r>
+        <w:t>through the use of</w:t>
+      </w:r>
+      <w:proofErr w:type="gramEnd"/>
+      <w:r>
+        <w:t xml:space="preserve"> layering</w:t>
       </w:r>
       <w:r>
         <w:t xml:space="preserve"> </w:t>
@@ -4641,7 +4965,7 @@
         <w:pStyle w:val="Caption"/>
         <w:jc w:val="center"/>
       </w:pPr>
-      <w:bookmarkStart w:id="24" w:name="_Toc227684401"/>
+      <w:bookmarkStart w:id="24" w:name="_Toc227695975"/>
       <w:r>
         <w:t xml:space="preserve">Figure </w:t>
       </w:r>
@@ -4738,7 +5062,7 @@
       <w:pPr>
         <w:pStyle w:val="Heading4"/>
       </w:pPr>
-      <w:bookmarkStart w:id="25" w:name="_Toc227684387"/>
+      <w:bookmarkStart w:id="25" w:name="_Toc227695960"/>
       <w:r>
         <w:t>2.2.1.2 Binary Space Partitioning</w:t>
       </w:r>
@@ -4790,7 +5114,7 @@
       <w:pPr>
         <w:pStyle w:val="Heading4"/>
       </w:pPr>
-      <w:bookmarkStart w:id="26" w:name="_Toc227684388"/>
+      <w:bookmarkStart w:id="26" w:name="_Toc227695961"/>
       <w:r>
         <w:t>2.2.1.3 Cellular Automata</w:t>
       </w:r>
@@ -4852,7 +5176,15 @@
         <w:t>)</w:t>
       </w:r>
       <w:r>
-        <w:t xml:space="preserve"> according to the following two rules: If a cell is alive, it survives to the next generation if it has 2 or 3 live neighbors; otherwise it dies. If a cell is dead, it comes to life in the next generation if it has exactly 3 live neighbors; otherwise it stays dead.” </w:t>
+        <w:t xml:space="preserve"> according to the following two rules: If a cell is alive, it survives to the next generation if it has 2 or 3 live neighbors; otherwise it dies. If a cell is dead, it comes to life in the next generation if it has exactly 3 live neighbors; </w:t>
+      </w:r>
+      <w:proofErr w:type="gramStart"/>
+      <w:r>
+        <w:t>otherwise</w:t>
+      </w:r>
+      <w:proofErr w:type="gramEnd"/>
+      <w:r>
+        <w:t xml:space="preserve"> it stays dead.” </w:t>
       </w:r>
       <w:sdt>
         <w:sdtPr>
@@ -4902,7 +5234,7 @@
       <w:pPr>
         <w:pStyle w:val="Heading3"/>
       </w:pPr>
-      <w:bookmarkStart w:id="27" w:name="_Toc227684389"/>
+      <w:bookmarkStart w:id="27" w:name="_Toc227695962"/>
       <w:r>
         <w:t>2.2.2 Pathfinding</w:t>
       </w:r>
@@ -4938,7 +5270,15 @@
         <w:t xml:space="preserve"> </w:t>
       </w:r>
       <w:r>
-        <w:t>The types of pathfinding I will be evaluating are: A*, Dijkstra</w:t>
+        <w:t xml:space="preserve">The types of pathfinding I will be evaluating </w:t>
+      </w:r>
+      <w:proofErr w:type="gramStart"/>
+      <w:r>
+        <w:t>are:</w:t>
+      </w:r>
+      <w:proofErr w:type="gramEnd"/>
+      <w:r>
+        <w:t xml:space="preserve"> A*, Dijkstra</w:t>
       </w:r>
       <w:r>
         <w:t>,</w:t>
@@ -4957,7 +5297,7 @@
       <w:pPr>
         <w:pStyle w:val="Heading4"/>
       </w:pPr>
-      <w:bookmarkStart w:id="28" w:name="_Toc227684390"/>
+      <w:bookmarkStart w:id="28" w:name="_Toc227695963"/>
       <w:r>
         <w:t>2.2.2.1 Dijkstra</w:t>
       </w:r>
@@ -5038,7 +5378,7 @@
         <w:pStyle w:val="Caption"/>
         <w:jc w:val="center"/>
       </w:pPr>
-      <w:bookmarkStart w:id="29" w:name="_Toc227684402"/>
+      <w:bookmarkStart w:id="29" w:name="_Toc227695976"/>
       <w:r>
         <w:t xml:space="preserve">Figure </w:t>
       </w:r>
@@ -5099,7 +5439,15 @@
         <w:t xml:space="preserve">Figure 2 shows how a graph is constructed and shows the movement cost of each path. </w:t>
       </w:r>
       <w:r>
-        <w:t xml:space="preserve">For example, from our source node, node 0, we calculate the distance to all of its neighbour nodes, in this case being nodes 1 and 2 and take a </w:t>
+        <w:t xml:space="preserve">For example, from our source node, node 0, we calculate the distance to </w:t>
+      </w:r>
+      <w:proofErr w:type="gramStart"/>
+      <w:r>
+        <w:t>all of</w:t>
+      </w:r>
+      <w:proofErr w:type="gramEnd"/>
+      <w:r>
+        <w:t xml:space="preserve"> its neighbour nodes, in this case being nodes 1 and 2 and take a </w:t>
       </w:r>
       <w:r>
         <w:t>“</w:t>
@@ -5137,7 +5485,7 @@
       <w:pPr>
         <w:pStyle w:val="Heading4"/>
       </w:pPr>
-      <w:bookmarkStart w:id="30" w:name="_Toc227684391"/>
+      <w:bookmarkStart w:id="30" w:name="_Toc227695964"/>
       <w:r>
         <w:t>2.2.2.2 A*</w:t>
       </w:r>
@@ -5145,7 +5493,15 @@
     </w:p>
     <w:p>
       <w:r>
-        <w:t>A* is an algorithm that shares the same approach as Dijkstra, although it is more efficient. In order to be more efficient, the algorithm “combines Dijkstra’s algorithm with a case-specific heuristic value”</w:t>
+        <w:t xml:space="preserve">A* is an algorithm that shares the same approach as Dijkstra, although it is more efficient. </w:t>
+      </w:r>
+      <w:proofErr w:type="gramStart"/>
+      <w:r>
+        <w:t>In order to</w:t>
+      </w:r>
+      <w:proofErr w:type="gramEnd"/>
+      <w:r>
+        <w:t xml:space="preserve"> be more efficient, the algorithm “combines Dijkstra’s algorithm with a case-specific heuristic value”</w:t>
       </w:r>
       <w:r>
         <w:t xml:space="preserve"> </w:t>
@@ -5179,9 +5535,11 @@
       <w:r>
         <w:t xml:space="preserve">. This is always guaranteed to find the shortest path and the heuristic value allows the algorithm to disregard paths that lead away from the destination, allowing for major optimizations </w:t>
       </w:r>
+      <w:proofErr w:type="gramStart"/>
       <w:r>
         <w:t>in regard to</w:t>
       </w:r>
+      <w:proofErr w:type="gramEnd"/>
       <w:r>
         <w:t xml:space="preserve"> the computation speed of the algorithm. </w:t>
       </w:r>
@@ -5190,7 +5548,7 @@
       <w:pPr>
         <w:pStyle w:val="Heading4"/>
       </w:pPr>
-      <w:bookmarkStart w:id="31" w:name="_Toc227684392"/>
+      <w:bookmarkStart w:id="31" w:name="_Toc227695965"/>
       <w:r>
         <w:t>2.2.2.3 Jump Point Search</w:t>
       </w:r>
@@ -5230,14 +5588,22 @@
         <w:t xml:space="preserve">, JPS serves as a substantial optimization through the use of “pruning” unnecessary nodes and “jumping over” empty spaces. Disregarding the </w:t>
       </w:r>
       <w:r>
-        <w:t>path cost calculations along with the aforementioned optimizations allows JPS to be significantly faster than A*, even up to an order of magnitude faster.</w:t>
+        <w:t xml:space="preserve">path cost calculations along with the </w:t>
+      </w:r>
+      <w:proofErr w:type="gramStart"/>
+      <w:r>
+        <w:t>aforementioned optimizations</w:t>
+      </w:r>
+      <w:proofErr w:type="gramEnd"/>
+      <w:r>
+        <w:t xml:space="preserve"> allows JPS to be significantly faster than A*, even up to an order of magnitude faster.</w:t>
       </w:r>
     </w:p>
     <w:p>
       <w:pPr>
         <w:pStyle w:val="Heading3"/>
       </w:pPr>
-      <w:bookmarkStart w:id="32" w:name="_Toc227684393"/>
+      <w:bookmarkStart w:id="32" w:name="_Toc227695966"/>
       <w:r>
         <w:t>2.2.3 AI Integrations</w:t>
       </w:r>
@@ -5262,7 +5628,7 @@
       <w:pPr>
         <w:pStyle w:val="Heading4"/>
       </w:pPr>
-      <w:bookmarkStart w:id="33" w:name="_Toc227684394"/>
+      <w:bookmarkStart w:id="33" w:name="_Toc227695967"/>
       <w:r>
         <w:t>2.2.3.1 Neural Network</w:t>
       </w:r>
@@ -5317,7 +5683,7 @@
       <w:pPr>
         <w:pStyle w:val="Heading4"/>
       </w:pPr>
-      <w:bookmarkStart w:id="34" w:name="_Toc227684395"/>
+      <w:bookmarkStart w:id="34" w:name="_Toc227695968"/>
       <w:r>
         <w:t>2.2.3.2 Reinforcement Learning</w:t>
       </w:r>
@@ -5393,7 +5759,7 @@
         <w:pStyle w:val="Caption"/>
         <w:jc w:val="center"/>
       </w:pPr>
-      <w:bookmarkStart w:id="35" w:name="_Toc227684403"/>
+      <w:bookmarkStart w:id="35" w:name="_Toc227695977"/>
       <w:r>
         <w:t xml:space="preserve">Figure </w:t>
       </w:r>
@@ -5531,7 +5897,7 @@
       <w:pPr>
         <w:pStyle w:val="Heading4"/>
       </w:pPr>
-      <w:bookmarkStart w:id="36" w:name="_Toc227684396"/>
+      <w:bookmarkStart w:id="36" w:name="_Toc227695969"/>
       <w:r>
         <w:t>2.2.3.3 Imitation Learning</w:t>
       </w:r>
@@ -5660,7 +6026,7 @@
       <w:pPr>
         <w:pStyle w:val="Heading1"/>
       </w:pPr>
-      <w:bookmarkStart w:id="37" w:name="_Toc227684397"/>
+      <w:bookmarkStart w:id="37" w:name="_Toc227695970"/>
       <w:r>
         <w:lastRenderedPageBreak/>
         <w:t>Chapter 3 – Design</w:t>
@@ -5682,7 +6048,7 @@
       <w:pPr>
         <w:pStyle w:val="Heading2"/>
       </w:pPr>
-      <w:bookmarkStart w:id="38" w:name="_Toc227684398"/>
+      <w:bookmarkStart w:id="38" w:name="_Toc227695971"/>
       <w:r>
         <w:t xml:space="preserve">3.1 </w:t>
       </w:r>
@@ -5709,7 +6075,7 @@
       <w:pPr>
         <w:pStyle w:val="Heading3"/>
       </w:pPr>
-      <w:bookmarkStart w:id="39" w:name="_Toc227684399"/>
+      <w:bookmarkStart w:id="39" w:name="_Toc227695972"/>
       <w:r>
         <w:t xml:space="preserve">3.1.1 </w:t>
       </w:r>
@@ -5798,7 +6164,7 @@
         <w:pStyle w:val="Caption"/>
         <w:jc w:val="center"/>
       </w:pPr>
-      <w:bookmarkStart w:id="40" w:name="_Toc227684404"/>
+      <w:bookmarkStart w:id="40" w:name="_Toc227695978"/>
       <w:r>
         <w:t xml:space="preserve">Figure </w:t>
       </w:r>
@@ -5830,7 +6196,15 @@
         <w:t>√</w:t>
       </w:r>
       <w:r>
-        <w:t>2 while getting the movement of 2 tiles. In order to combat this, I have decided to use a hexagonal grid which has uniform lengths to all neighbouring tiles.</w:t>
+        <w:t xml:space="preserve">2 while getting the movement of 2 tiles. </w:t>
+      </w:r>
+      <w:proofErr w:type="gramStart"/>
+      <w:r>
+        <w:t>In order to</w:t>
+      </w:r>
+      <w:proofErr w:type="gramEnd"/>
+      <w:r>
+        <w:t xml:space="preserve"> combat this, I have decided to use a hexagonal grid which has uniform lengths to all neighbouring tiles.</w:t>
       </w:r>
     </w:p>
     <w:tbl>
@@ -5923,6 +6297,7 @@
               <w:pStyle w:val="Caption"/>
               <w:jc w:val="center"/>
             </w:pPr>
+            <w:bookmarkStart w:id="41" w:name="_Toc227695979"/>
             <w:r>
               <w:t xml:space="preserve">Figure </w:t>
             </w:r>
@@ -5941,6 +6316,7 @@
               </w:rPr>
               <w:t>5</w:t>
             </w:r>
+            <w:bookmarkEnd w:id="41"/>
             <w:r>
               <w:fldChar w:fldCharType="end"/>
             </w:r>
@@ -6019,6 +6395,7 @@
               <w:pStyle w:val="Caption"/>
               <w:jc w:val="center"/>
             </w:pPr>
+            <w:bookmarkStart w:id="42" w:name="_Toc227695980"/>
             <w:r>
               <w:t xml:space="preserve">Figure </w:t>
             </w:r>
@@ -6037,6 +6414,7 @@
               </w:rPr>
               <w:t>6</w:t>
             </w:r>
+            <w:bookmarkEnd w:id="42"/>
             <w:r>
               <w:fldChar w:fldCharType="end"/>
             </w:r>
@@ -6064,8 +6442,282 @@
         <w:t xml:space="preserve">the tiles. Figure 6 shows how I will be rearranging the tiles so that they tesselate. The coordinates for these tiles are going to be bottom left based meaning that the tiles will be created from the bottom left towards the top right. </w:t>
       </w:r>
     </w:p>
+    <w:p>
+      <w:pPr>
+        <w:pStyle w:val="Heading3"/>
+      </w:pPr>
+      <w:bookmarkStart w:id="43" w:name="_Toc227695973"/>
+      <w:r>
+        <w:t>3.1.2 Biomes</w:t>
+      </w:r>
+      <w:bookmarkEnd w:id="43"/>
+    </w:p>
+    <w:p>
+      <w:r>
+        <w:t>Each tile within the game has a biome, the biome will be derived from the noise map generated by the Perlin noise world generation algorithm. The algorithm then uses the “height” of the pixel on the noise map to determine its biome.</w:t>
+      </w:r>
+    </w:p>
+    <w:p>
+      <w:pPr>
+        <w:keepNext/>
+        <w:jc w:val="center"/>
+      </w:pPr>
+    </w:p>
+    <w:tbl>
+      <w:tblPr>
+        <w:tblStyle w:val="TableGrid"/>
+        <w:tblW w:w="0" w:type="auto"/>
+        <w:tblBorders>
+          <w:top w:val="none" w:sz="0" w:space="0" w:color="auto"/>
+          <w:left w:val="none" w:sz="0" w:space="0" w:color="auto"/>
+          <w:bottom w:val="none" w:sz="0" w:space="0" w:color="auto"/>
+          <w:right w:val="none" w:sz="0" w:space="0" w:color="auto"/>
+          <w:insideH w:val="none" w:sz="0" w:space="0" w:color="auto"/>
+          <w:insideV w:val="none" w:sz="0" w:space="0" w:color="auto"/>
+        </w:tblBorders>
+        <w:tblLook w:val="04A0" w:firstRow="1" w:lastRow="0" w:firstColumn="1" w:lastColumn="0" w:noHBand="0" w:noVBand="1"/>
+      </w:tblPr>
+      <w:tblGrid>
+        <w:gridCol w:w="4508"/>
+        <w:gridCol w:w="4508"/>
+      </w:tblGrid>
+      <w:tr>
+        <w:tc>
+          <w:tcPr>
+            <w:tcW w:w="4508" w:type="dxa"/>
+          </w:tcPr>
+          <w:p>
+            <w:pPr>
+              <w:keepNext/>
+              <w:jc w:val="center"/>
+            </w:pPr>
+            <w:r>
+              <w:rPr>
+                <w:noProof/>
+              </w:rPr>
+              <w:drawing>
+                <wp:inline distT="0" distB="0" distL="0" distR="0" wp14:anchorId="30B513F4" wp14:editId="2DCB3B4D">
+                  <wp:extent cx="1847850" cy="1847850"/>
+                  <wp:effectExtent l="0" t="0" r="0" b="0"/>
+                  <wp:docPr id="373520761" name="Picture 3"/>
+                  <wp:cNvGraphicFramePr>
+                    <a:graphicFrameLocks xmlns:a="http://schemas.openxmlformats.org/drawingml/2006/main" noChangeAspect="1"/>
+                  </wp:cNvGraphicFramePr>
+                  <a:graphic xmlns:a="http://schemas.openxmlformats.org/drawingml/2006/main">
+                    <a:graphicData uri="http://schemas.openxmlformats.org/drawingml/2006/picture">
+                      <pic:pic xmlns:pic="http://schemas.openxmlformats.org/drawingml/2006/picture">
+                        <pic:nvPicPr>
+                          <pic:cNvPr id="1710555399" name="Picture 3"/>
+                          <pic:cNvPicPr>
+                            <a:picLocks noChangeAspect="1" noChangeArrowheads="1"/>
+                          </pic:cNvPicPr>
+                        </pic:nvPicPr>
+                        <pic:blipFill>
+                          <a:blip r:embed="rId11" cstate="print">
+                            <a:extLst>
+                              <a:ext uri="{28A0092B-C50C-407E-A947-70E740481C1C}">
+                                <a14:useLocalDpi xmlns:a14="http://schemas.microsoft.com/office/drawing/2010/main" val="0"/>
+                              </a:ext>
+                            </a:extLst>
+                          </a:blip>
+                          <a:srcRect/>
+                          <a:stretch>
+                            <a:fillRect/>
+                          </a:stretch>
+                        </pic:blipFill>
+                        <pic:spPr bwMode="auto">
+                          <a:xfrm>
+                            <a:off x="0" y="0"/>
+                            <a:ext cx="1847850" cy="1847850"/>
+                          </a:xfrm>
+                          <a:prstGeom prst="rect">
+                            <a:avLst/>
+                          </a:prstGeom>
+                          <a:noFill/>
+                          <a:ln>
+                            <a:noFill/>
+                          </a:ln>
+                        </pic:spPr>
+                      </pic:pic>
+                    </a:graphicData>
+                  </a:graphic>
+                </wp:inline>
+              </w:drawing>
+            </w:r>
+          </w:p>
+        </w:tc>
+        <w:tc>
+          <w:tcPr>
+            <w:tcW w:w="4508" w:type="dxa"/>
+          </w:tcPr>
+          <w:p>
+            <w:pPr>
+              <w:keepNext/>
+              <w:jc w:val="center"/>
+            </w:pPr>
+            <w:r>
+              <w:rPr>
+                <w:noProof/>
+              </w:rPr>
+              <w:drawing>
+                <wp:inline distT="0" distB="0" distL="0" distR="0" wp14:anchorId="41E46335" wp14:editId="45D95E54">
+                  <wp:extent cx="1846021" cy="1848884"/>
+                  <wp:effectExtent l="0" t="0" r="1905" b="0"/>
+                  <wp:docPr id="905791460" name="Picture 5"/>
+                  <wp:cNvGraphicFramePr>
+                    <a:graphicFrameLocks xmlns:a="http://schemas.openxmlformats.org/drawingml/2006/main" noChangeAspect="1"/>
+                  </wp:cNvGraphicFramePr>
+                  <a:graphic xmlns:a="http://schemas.openxmlformats.org/drawingml/2006/main">
+                    <a:graphicData uri="http://schemas.openxmlformats.org/drawingml/2006/picture">
+                      <pic:pic xmlns:pic="http://schemas.openxmlformats.org/drawingml/2006/picture">
+                        <pic:nvPicPr>
+                          <pic:cNvPr id="0" name="Picture 7"/>
+                          <pic:cNvPicPr>
+                            <a:picLocks noChangeAspect="1" noChangeArrowheads="1"/>
+                          </pic:cNvPicPr>
+                        </pic:nvPicPr>
+                        <pic:blipFill>
+                          <a:blip r:embed="rId12" cstate="print">
+                            <a:extLst>
+                              <a:ext uri="{28A0092B-C50C-407E-A947-70E740481C1C}">
+                                <a14:useLocalDpi xmlns:a14="http://schemas.microsoft.com/office/drawing/2010/main" val="0"/>
+                              </a:ext>
+                            </a:extLst>
+                          </a:blip>
+                          <a:srcRect/>
+                          <a:stretch>
+                            <a:fillRect/>
+                          </a:stretch>
+                        </pic:blipFill>
+                        <pic:spPr bwMode="auto">
+                          <a:xfrm flipH="1">
+                            <a:off x="0" y="0"/>
+                            <a:ext cx="1860008" cy="1862893"/>
+                          </a:xfrm>
+                          <a:prstGeom prst="rect">
+                            <a:avLst/>
+                          </a:prstGeom>
+                          <a:noFill/>
+                          <a:ln>
+                            <a:noFill/>
+                          </a:ln>
+                        </pic:spPr>
+                      </pic:pic>
+                    </a:graphicData>
+                  </a:graphic>
+                </wp:inline>
+              </w:drawing>
+            </w:r>
+          </w:p>
+        </w:tc>
+      </w:tr>
+    </w:tbl>
+    <w:p>
+      <w:pPr>
+        <w:pStyle w:val="Caption"/>
+        <w:jc w:val="center"/>
+      </w:pPr>
+      <w:bookmarkStart w:id="44" w:name="_Toc227695981"/>
+      <w:r>
+        <w:t xml:space="preserve">Figure </w:t>
+      </w:r>
+      <w:r>
+        <w:fldChar w:fldCharType="begin"/>
+      </w:r>
+      <w:r>
+        <w:instrText xml:space="preserve"> SEQ Figure \* ARABIC </w:instrText>
+      </w:r>
+      <w:r>
+        <w:fldChar w:fldCharType="separate"/>
+      </w:r>
+      <w:r>
+        <w:rPr>
+          <w:noProof/>
+        </w:rPr>
+        <w:t>7</w:t>
+      </w:r>
+      <w:r>
+        <w:fldChar w:fldCharType="end"/>
+      </w:r>
+      <w:r>
+        <w:t xml:space="preserve"> </w:t>
+      </w:r>
+      <w:sdt>
+        <w:sdtPr>
+          <w:id w:val="-1760210495"/>
+          <w:citation/>
+        </w:sdtPr>
+        <w:sdtContent>
+          <w:r>
+            <w:fldChar w:fldCharType="begin"/>
+          </w:r>
+          <w:r>
+            <w:instrText xml:space="preserve"> CITATION Sch17 \l 2057 </w:instrText>
+          </w:r>
+          <w:r>
+            <w:fldChar w:fldCharType="separate"/>
+          </w:r>
+          <w:r>
+            <w:rPr>
+              <w:noProof/>
+            </w:rPr>
+            <w:t>(Scher, 2017)</w:t>
+          </w:r>
+          <w:r>
+            <w:fldChar w:fldCharType="end"/>
+          </w:r>
+        </w:sdtContent>
+      </w:sdt>
+      <w:bookmarkEnd w:id="44"/>
+    </w:p>
+    <w:p>
+      <w:r>
+        <w:t>Figure 7 shows how the height, how dark or light</w:t>
+      </w:r>
+      <w:r>
+        <w:t xml:space="preserve"> a pixel is, can become the boundaries for biomes. In this example, there are only 3 biomes: ocean, beach, and grass</w:t>
+      </w:r>
+      <w:r>
+        <w:t xml:space="preserve">. The </w:t>
+      </w:r>
+      <w:proofErr w:type="gramStart"/>
+      <w:r>
+        <w:t>amount</w:t>
+      </w:r>
+      <w:proofErr w:type="gramEnd"/>
+      <w:r>
+        <w:t xml:space="preserve"> of biomes possible are technically infinite. Although biome separation will be very prevalent as you go past roughly 10 biomes. </w:t>
+      </w:r>
+    </w:p>
     <w:p/>
-    <w:bookmarkStart w:id="41" w:name="_Toc227684400" w:displacedByCustomXml="next"/>
+    <w:p>
+      <w:r>
+        <w:t xml:space="preserve">For my game, I am choosing to have 5 true biomes: Deep water, shallow water, sand, grass and snow. Each of these biomes are going to be abundant in different resources and </w:t>
+      </w:r>
+      <w:r>
+        <w:t xml:space="preserve">have </w:t>
+      </w:r>
+      <w:r>
+        <w:lastRenderedPageBreak/>
+        <w:t xml:space="preserve">very different base tile variables. For example, grassland tiles will contain more production than a sand </w:t>
+      </w:r>
+      <w:proofErr w:type="gramStart"/>
+      <w:r>
+        <w:t>tile</w:t>
+      </w:r>
+      <w:proofErr w:type="gramEnd"/>
+      <w:r>
+        <w:t xml:space="preserve"> but a sand tile will have more gold than a grassland tile</w:t>
+      </w:r>
+      <w:r>
+        <w:t>.</w:t>
+      </w:r>
+      <w:r>
+        <w:t xml:space="preserve"> This should balance out the resource distribution enough that players seek grassland at the beginning of the game.</w:t>
+      </w:r>
+    </w:p>
+    <w:p/>
+    <w:bookmarkStart w:id="45" w:name="_Toc227695974" w:displacedByCustomXml="next"/>
     <w:sdt>
       <w:sdtPr>
         <w:rPr>
@@ -6093,7 +6745,7 @@
           <w:r>
             <w:t>References</w:t>
           </w:r>
-          <w:bookmarkEnd w:id="41"/>
+          <w:bookmarkEnd w:id="45"/>
         </w:p>
         <w:sdt>
           <w:sdtPr>
@@ -6382,7 +7034,6 @@
                 <w:rPr>
                   <w:noProof/>
                 </w:rPr>
-                <w:lastRenderedPageBreak/>
                 <w:t xml:space="preserve">Scher, Y., 2017. </w:t>
               </w:r>
               <w:r>

</xml_diff>

<commit_message>
feat: resource distribution design written
</commit_message>
<xml_diff>
--- a/Report.docx
+++ b/Report.docx
@@ -321,7 +321,7 @@
         <w:pStyle w:val="Heading1"/>
       </w:pPr>
       <w:bookmarkStart w:id="1" w:name="_Toc40898999"/>
-      <w:bookmarkStart w:id="2" w:name="_Toc227695939"/>
+      <w:bookmarkStart w:id="2" w:name="_Toc227696376"/>
       <w:r>
         <w:lastRenderedPageBreak/>
         <w:t>Abstract</w:t>
@@ -369,7 +369,7 @@
         <w:spacing w:after="321"/>
         <w:ind w:left="-5"/>
       </w:pPr>
-      <w:bookmarkStart w:id="3" w:name="_Toc227695940"/>
+      <w:bookmarkStart w:id="3" w:name="_Toc227696377"/>
       <w:r>
         <w:lastRenderedPageBreak/>
         <w:t>Declaration</w:t>
@@ -491,7 +491,7 @@
         <w:ind w:left="-5"/>
       </w:pPr>
       <w:bookmarkStart w:id="4" w:name="_Toc40899001"/>
-      <w:bookmarkStart w:id="5" w:name="_Toc227695941"/>
+      <w:bookmarkStart w:id="5" w:name="_Toc227696378"/>
       <w:r>
         <w:lastRenderedPageBreak/>
         <w:t>Acknowledgements</w:t>
@@ -625,7 +625,7 @@
         <w:spacing w:line="259" w:lineRule="auto"/>
       </w:pPr>
     </w:p>
-    <w:bookmarkStart w:id="6" w:name="_Toc227695942" w:displacedByCustomXml="next"/>
+    <w:bookmarkStart w:id="6" w:name="_Toc227696379" w:displacedByCustomXml="next"/>
     <w:sdt>
       <w:sdtPr>
         <w:rPr>
@@ -683,7 +683,7 @@
           <w:r>
             <w:fldChar w:fldCharType="separate"/>
           </w:r>
-          <w:hyperlink w:anchor="_Toc227695939" w:history="1">
+          <w:hyperlink w:anchor="_Toc227696376" w:history="1">
             <w:r>
               <w:rPr>
                 <w:rStyle w:val="Hyperlink"/>
@@ -710,7 +710,7 @@
                 <w:noProof/>
                 <w:webHidden/>
               </w:rPr>
-              <w:instrText xml:space="preserve"> PAGEREF _Toc227695939 \h </w:instrText>
+              <w:instrText xml:space="preserve"> PAGEREF _Toc227696376 \h </w:instrText>
             </w:r>
             <w:r>
               <w:rPr>
@@ -757,7 +757,7 @@
               <w14:ligatures w14:val="standardContextual"/>
             </w:rPr>
           </w:pPr>
-          <w:hyperlink w:anchor="_Toc227695940" w:history="1">
+          <w:hyperlink w:anchor="_Toc227696377" w:history="1">
             <w:r>
               <w:rPr>
                 <w:rStyle w:val="Hyperlink"/>
@@ -784,7 +784,7 @@
                 <w:noProof/>
                 <w:webHidden/>
               </w:rPr>
-              <w:instrText xml:space="preserve"> PAGEREF _Toc227695940 \h </w:instrText>
+              <w:instrText xml:space="preserve"> PAGEREF _Toc227696377 \h </w:instrText>
             </w:r>
             <w:r>
               <w:rPr>
@@ -831,7 +831,7 @@
               <w14:ligatures w14:val="standardContextual"/>
             </w:rPr>
           </w:pPr>
-          <w:hyperlink w:anchor="_Toc227695941" w:history="1">
+          <w:hyperlink w:anchor="_Toc227696378" w:history="1">
             <w:r>
               <w:rPr>
                 <w:rStyle w:val="Hyperlink"/>
@@ -858,7 +858,7 @@
                 <w:noProof/>
                 <w:webHidden/>
               </w:rPr>
-              <w:instrText xml:space="preserve"> PAGEREF _Toc227695941 \h </w:instrText>
+              <w:instrText xml:space="preserve"> PAGEREF _Toc227696378 \h </w:instrText>
             </w:r>
             <w:r>
               <w:rPr>
@@ -905,7 +905,7 @@
               <w14:ligatures w14:val="standardContextual"/>
             </w:rPr>
           </w:pPr>
-          <w:hyperlink w:anchor="_Toc227695942" w:history="1">
+          <w:hyperlink w:anchor="_Toc227696379" w:history="1">
             <w:r>
               <w:rPr>
                 <w:rStyle w:val="Hyperlink"/>
@@ -932,7 +932,7 @@
                 <w:noProof/>
                 <w:webHidden/>
               </w:rPr>
-              <w:instrText xml:space="preserve"> PAGEREF _Toc227695942 \h </w:instrText>
+              <w:instrText xml:space="preserve"> PAGEREF _Toc227696379 \h </w:instrText>
             </w:r>
             <w:r>
               <w:rPr>
@@ -979,7 +979,7 @@
               <w14:ligatures w14:val="standardContextual"/>
             </w:rPr>
           </w:pPr>
-          <w:hyperlink w:anchor="_Toc227695943" w:history="1">
+          <w:hyperlink w:anchor="_Toc227696380" w:history="1">
             <w:r>
               <w:rPr>
                 <w:rStyle w:val="Hyperlink"/>
@@ -1006,7 +1006,7 @@
                 <w:noProof/>
                 <w:webHidden/>
               </w:rPr>
-              <w:instrText xml:space="preserve"> PAGEREF _Toc227695943 \h </w:instrText>
+              <w:instrText xml:space="preserve"> PAGEREF _Toc227696380 \h </w:instrText>
             </w:r>
             <w:r>
               <w:rPr>
@@ -1053,7 +1053,7 @@
               <w14:ligatures w14:val="standardContextual"/>
             </w:rPr>
           </w:pPr>
-          <w:hyperlink w:anchor="_Toc227695944" w:history="1">
+          <w:hyperlink w:anchor="_Toc227696381" w:history="1">
             <w:r>
               <w:rPr>
                 <w:rStyle w:val="Hyperlink"/>
@@ -1080,7 +1080,7 @@
                 <w:noProof/>
                 <w:webHidden/>
               </w:rPr>
-              <w:instrText xml:space="preserve"> PAGEREF _Toc227695944 \h </w:instrText>
+              <w:instrText xml:space="preserve"> PAGEREF _Toc227696381 \h </w:instrText>
             </w:r>
             <w:r>
               <w:rPr>
@@ -1127,7 +1127,7 @@
               <w14:ligatures w14:val="standardContextual"/>
             </w:rPr>
           </w:pPr>
-          <w:hyperlink w:anchor="_Toc227695945" w:history="1">
+          <w:hyperlink w:anchor="_Toc227696382" w:history="1">
             <w:r>
               <w:rPr>
                 <w:rStyle w:val="Hyperlink"/>
@@ -1154,7 +1154,7 @@
                 <w:noProof/>
                 <w:webHidden/>
               </w:rPr>
-              <w:instrText xml:space="preserve"> PAGEREF _Toc227695945 \h </w:instrText>
+              <w:instrText xml:space="preserve"> PAGEREF _Toc227696382 \h </w:instrText>
             </w:r>
             <w:r>
               <w:rPr>
@@ -1201,7 +1201,7 @@
               <w14:ligatures w14:val="standardContextual"/>
             </w:rPr>
           </w:pPr>
-          <w:hyperlink w:anchor="_Toc227695946" w:history="1">
+          <w:hyperlink w:anchor="_Toc227696383" w:history="1">
             <w:r>
               <w:rPr>
                 <w:rStyle w:val="Hyperlink"/>
@@ -1228,7 +1228,7 @@
                 <w:noProof/>
                 <w:webHidden/>
               </w:rPr>
-              <w:instrText xml:space="preserve"> PAGEREF _Toc227695946 \h </w:instrText>
+              <w:instrText xml:space="preserve"> PAGEREF _Toc227696383 \h </w:instrText>
             </w:r>
             <w:r>
               <w:rPr>
@@ -1275,7 +1275,7 @@
               <w14:ligatures w14:val="standardContextual"/>
             </w:rPr>
           </w:pPr>
-          <w:hyperlink w:anchor="_Toc227695947" w:history="1">
+          <w:hyperlink w:anchor="_Toc227696384" w:history="1">
             <w:r>
               <w:rPr>
                 <w:rStyle w:val="Hyperlink"/>
@@ -1302,7 +1302,7 @@
                 <w:noProof/>
                 <w:webHidden/>
               </w:rPr>
-              <w:instrText xml:space="preserve"> PAGEREF _Toc227695947 \h </w:instrText>
+              <w:instrText xml:space="preserve"> PAGEREF _Toc227696384 \h </w:instrText>
             </w:r>
             <w:r>
               <w:rPr>
@@ -1349,7 +1349,7 @@
               <w14:ligatures w14:val="standardContextual"/>
             </w:rPr>
           </w:pPr>
-          <w:hyperlink w:anchor="_Toc227695948" w:history="1">
+          <w:hyperlink w:anchor="_Toc227696385" w:history="1">
             <w:r>
               <w:rPr>
                 <w:rStyle w:val="Hyperlink"/>
@@ -1376,7 +1376,7 @@
                 <w:noProof/>
                 <w:webHidden/>
               </w:rPr>
-              <w:instrText xml:space="preserve"> PAGEREF _Toc227695948 \h </w:instrText>
+              <w:instrText xml:space="preserve"> PAGEREF _Toc227696385 \h </w:instrText>
             </w:r>
             <w:r>
               <w:rPr>
@@ -1423,7 +1423,7 @@
               <w14:ligatures w14:val="standardContextual"/>
             </w:rPr>
           </w:pPr>
-          <w:hyperlink w:anchor="_Toc227695949" w:history="1">
+          <w:hyperlink w:anchor="_Toc227696386" w:history="1">
             <w:r>
               <w:rPr>
                 <w:rStyle w:val="Hyperlink"/>
@@ -1450,7 +1450,7 @@
                 <w:noProof/>
                 <w:webHidden/>
               </w:rPr>
-              <w:instrText xml:space="preserve"> PAGEREF _Toc227695949 \h </w:instrText>
+              <w:instrText xml:space="preserve"> PAGEREF _Toc227696386 \h </w:instrText>
             </w:r>
             <w:r>
               <w:rPr>
@@ -1497,7 +1497,7 @@
               <w14:ligatures w14:val="standardContextual"/>
             </w:rPr>
           </w:pPr>
-          <w:hyperlink w:anchor="_Toc227695950" w:history="1">
+          <w:hyperlink w:anchor="_Toc227696387" w:history="1">
             <w:r>
               <w:rPr>
                 <w:rStyle w:val="Hyperlink"/>
@@ -1524,7 +1524,7 @@
                 <w:noProof/>
                 <w:webHidden/>
               </w:rPr>
-              <w:instrText xml:space="preserve"> PAGEREF _Toc227695950 \h </w:instrText>
+              <w:instrText xml:space="preserve"> PAGEREF _Toc227696387 \h </w:instrText>
             </w:r>
             <w:r>
               <w:rPr>
@@ -1571,7 +1571,7 @@
               <w14:ligatures w14:val="standardContextual"/>
             </w:rPr>
           </w:pPr>
-          <w:hyperlink w:anchor="_Toc227695951" w:history="1">
+          <w:hyperlink w:anchor="_Toc227696388" w:history="1">
             <w:r>
               <w:rPr>
                 <w:rStyle w:val="Hyperlink"/>
@@ -1598,7 +1598,7 @@
                 <w:noProof/>
                 <w:webHidden/>
               </w:rPr>
-              <w:instrText xml:space="preserve"> PAGEREF _Toc227695951 \h </w:instrText>
+              <w:instrText xml:space="preserve"> PAGEREF _Toc227696388 \h </w:instrText>
             </w:r>
             <w:r>
               <w:rPr>
@@ -1645,7 +1645,7 @@
               <w14:ligatures w14:val="standardContextual"/>
             </w:rPr>
           </w:pPr>
-          <w:hyperlink w:anchor="_Toc227695952" w:history="1">
+          <w:hyperlink w:anchor="_Toc227696389" w:history="1">
             <w:r>
               <w:rPr>
                 <w:rStyle w:val="Hyperlink"/>
@@ -1672,7 +1672,7 @@
                 <w:noProof/>
                 <w:webHidden/>
               </w:rPr>
-              <w:instrText xml:space="preserve"> PAGEREF _Toc227695952 \h </w:instrText>
+              <w:instrText xml:space="preserve"> PAGEREF _Toc227696389 \h </w:instrText>
             </w:r>
             <w:r>
               <w:rPr>
@@ -1719,7 +1719,7 @@
               <w14:ligatures w14:val="standardContextual"/>
             </w:rPr>
           </w:pPr>
-          <w:hyperlink w:anchor="_Toc227695953" w:history="1">
+          <w:hyperlink w:anchor="_Toc227696390" w:history="1">
             <w:r>
               <w:rPr>
                 <w:rStyle w:val="Hyperlink"/>
@@ -1746,7 +1746,7 @@
                 <w:noProof/>
                 <w:webHidden/>
               </w:rPr>
-              <w:instrText xml:space="preserve"> PAGEREF _Toc227695953 \h </w:instrText>
+              <w:instrText xml:space="preserve"> PAGEREF _Toc227696390 \h </w:instrText>
             </w:r>
             <w:r>
               <w:rPr>
@@ -1793,7 +1793,7 @@
               <w14:ligatures w14:val="standardContextual"/>
             </w:rPr>
           </w:pPr>
-          <w:hyperlink w:anchor="_Toc227695954" w:history="1">
+          <w:hyperlink w:anchor="_Toc227696391" w:history="1">
             <w:r>
               <w:rPr>
                 <w:rStyle w:val="Hyperlink"/>
@@ -1820,7 +1820,7 @@
                 <w:noProof/>
                 <w:webHidden/>
               </w:rPr>
-              <w:instrText xml:space="preserve"> PAGEREF _Toc227695954 \h </w:instrText>
+              <w:instrText xml:space="preserve"> PAGEREF _Toc227696391 \h </w:instrText>
             </w:r>
             <w:r>
               <w:rPr>
@@ -1867,7 +1867,7 @@
               <w14:ligatures w14:val="standardContextual"/>
             </w:rPr>
           </w:pPr>
-          <w:hyperlink w:anchor="_Toc227695955" w:history="1">
+          <w:hyperlink w:anchor="_Toc227696392" w:history="1">
             <w:r>
               <w:rPr>
                 <w:rStyle w:val="Hyperlink"/>
@@ -1894,7 +1894,7 @@
                 <w:noProof/>
                 <w:webHidden/>
               </w:rPr>
-              <w:instrText xml:space="preserve"> PAGEREF _Toc227695955 \h </w:instrText>
+              <w:instrText xml:space="preserve"> PAGEREF _Toc227696392 \h </w:instrText>
             </w:r>
             <w:r>
               <w:rPr>
@@ -1941,7 +1941,7 @@
               <w14:ligatures w14:val="standardContextual"/>
             </w:rPr>
           </w:pPr>
-          <w:hyperlink w:anchor="_Toc227695956" w:history="1">
+          <w:hyperlink w:anchor="_Toc227696393" w:history="1">
             <w:r>
               <w:rPr>
                 <w:rStyle w:val="Hyperlink"/>
@@ -1968,7 +1968,7 @@
                 <w:noProof/>
                 <w:webHidden/>
               </w:rPr>
-              <w:instrText xml:space="preserve"> PAGEREF _Toc227695956 \h </w:instrText>
+              <w:instrText xml:space="preserve"> PAGEREF _Toc227696393 \h </w:instrText>
             </w:r>
             <w:r>
               <w:rPr>
@@ -2015,7 +2015,7 @@
               <w14:ligatures w14:val="standardContextual"/>
             </w:rPr>
           </w:pPr>
-          <w:hyperlink w:anchor="_Toc227695957" w:history="1">
+          <w:hyperlink w:anchor="_Toc227696394" w:history="1">
             <w:r>
               <w:rPr>
                 <w:rStyle w:val="Hyperlink"/>
@@ -2042,7 +2042,7 @@
                 <w:noProof/>
                 <w:webHidden/>
               </w:rPr>
-              <w:instrText xml:space="preserve"> PAGEREF _Toc227695957 \h </w:instrText>
+              <w:instrText xml:space="preserve"> PAGEREF _Toc227696394 \h </w:instrText>
             </w:r>
             <w:r>
               <w:rPr>
@@ -2089,7 +2089,7 @@
               <w14:ligatures w14:val="standardContextual"/>
             </w:rPr>
           </w:pPr>
-          <w:hyperlink w:anchor="_Toc227695958" w:history="1">
+          <w:hyperlink w:anchor="_Toc227696395" w:history="1">
             <w:r>
               <w:rPr>
                 <w:rStyle w:val="Hyperlink"/>
@@ -2116,7 +2116,7 @@
                 <w:noProof/>
                 <w:webHidden/>
               </w:rPr>
-              <w:instrText xml:space="preserve"> PAGEREF _Toc227695958 \h </w:instrText>
+              <w:instrText xml:space="preserve"> PAGEREF _Toc227696395 \h </w:instrText>
             </w:r>
             <w:r>
               <w:rPr>
@@ -2159,7 +2159,7 @@
               <w:lang w:eastAsia="en-GB"/>
             </w:rPr>
           </w:pPr>
-          <w:hyperlink w:anchor="_Toc227695959" w:history="1">
+          <w:hyperlink w:anchor="_Toc227696396" w:history="1">
             <w:r>
               <w:rPr>
                 <w:rStyle w:val="Hyperlink"/>
@@ -2186,7 +2186,7 @@
                 <w:noProof/>
                 <w:webHidden/>
               </w:rPr>
-              <w:instrText xml:space="preserve"> PAGEREF _Toc227695959 \h </w:instrText>
+              <w:instrText xml:space="preserve"> PAGEREF _Toc227696396 \h </w:instrText>
             </w:r>
             <w:r>
               <w:rPr>
@@ -2229,7 +2229,7 @@
               <w:lang w:eastAsia="en-GB"/>
             </w:rPr>
           </w:pPr>
-          <w:hyperlink w:anchor="_Toc227695960" w:history="1">
+          <w:hyperlink w:anchor="_Toc227696397" w:history="1">
             <w:r>
               <w:rPr>
                 <w:rStyle w:val="Hyperlink"/>
@@ -2256,7 +2256,7 @@
                 <w:noProof/>
                 <w:webHidden/>
               </w:rPr>
-              <w:instrText xml:space="preserve"> PAGEREF _Toc227695960 \h </w:instrText>
+              <w:instrText xml:space="preserve"> PAGEREF _Toc227696397 \h </w:instrText>
             </w:r>
             <w:r>
               <w:rPr>
@@ -2299,7 +2299,7 @@
               <w:lang w:eastAsia="en-GB"/>
             </w:rPr>
           </w:pPr>
-          <w:hyperlink w:anchor="_Toc227695961" w:history="1">
+          <w:hyperlink w:anchor="_Toc227696398" w:history="1">
             <w:r>
               <w:rPr>
                 <w:rStyle w:val="Hyperlink"/>
@@ -2326,7 +2326,7 @@
                 <w:noProof/>
                 <w:webHidden/>
               </w:rPr>
-              <w:instrText xml:space="preserve"> PAGEREF _Toc227695961 \h </w:instrText>
+              <w:instrText xml:space="preserve"> PAGEREF _Toc227696398 \h </w:instrText>
             </w:r>
             <w:r>
               <w:rPr>
@@ -2373,7 +2373,7 @@
               <w14:ligatures w14:val="standardContextual"/>
             </w:rPr>
           </w:pPr>
-          <w:hyperlink w:anchor="_Toc227695962" w:history="1">
+          <w:hyperlink w:anchor="_Toc227696399" w:history="1">
             <w:r>
               <w:rPr>
                 <w:rStyle w:val="Hyperlink"/>
@@ -2400,7 +2400,7 @@
                 <w:noProof/>
                 <w:webHidden/>
               </w:rPr>
-              <w:instrText xml:space="preserve"> PAGEREF _Toc227695962 \h </w:instrText>
+              <w:instrText xml:space="preserve"> PAGEREF _Toc227696399 \h </w:instrText>
             </w:r>
             <w:r>
               <w:rPr>
@@ -2443,7 +2443,7 @@
               <w:lang w:eastAsia="en-GB"/>
             </w:rPr>
           </w:pPr>
-          <w:hyperlink w:anchor="_Toc227695963" w:history="1">
+          <w:hyperlink w:anchor="_Toc227696400" w:history="1">
             <w:r>
               <w:rPr>
                 <w:rStyle w:val="Hyperlink"/>
@@ -2470,7 +2470,7 @@
                 <w:noProof/>
                 <w:webHidden/>
               </w:rPr>
-              <w:instrText xml:space="preserve"> PAGEREF _Toc227695963 \h </w:instrText>
+              <w:instrText xml:space="preserve"> PAGEREF _Toc227696400 \h </w:instrText>
             </w:r>
             <w:r>
               <w:rPr>
@@ -2513,7 +2513,7 @@
               <w:lang w:eastAsia="en-GB"/>
             </w:rPr>
           </w:pPr>
-          <w:hyperlink w:anchor="_Toc227695964" w:history="1">
+          <w:hyperlink w:anchor="_Toc227696401" w:history="1">
             <w:r>
               <w:rPr>
                 <w:rStyle w:val="Hyperlink"/>
@@ -2540,7 +2540,7 @@
                 <w:noProof/>
                 <w:webHidden/>
               </w:rPr>
-              <w:instrText xml:space="preserve"> PAGEREF _Toc227695964 \h </w:instrText>
+              <w:instrText xml:space="preserve"> PAGEREF _Toc227696401 \h </w:instrText>
             </w:r>
             <w:r>
               <w:rPr>
@@ -2583,7 +2583,7 @@
               <w:lang w:eastAsia="en-GB"/>
             </w:rPr>
           </w:pPr>
-          <w:hyperlink w:anchor="_Toc227695965" w:history="1">
+          <w:hyperlink w:anchor="_Toc227696402" w:history="1">
             <w:r>
               <w:rPr>
                 <w:rStyle w:val="Hyperlink"/>
@@ -2610,7 +2610,7 @@
                 <w:noProof/>
                 <w:webHidden/>
               </w:rPr>
-              <w:instrText xml:space="preserve"> PAGEREF _Toc227695965 \h </w:instrText>
+              <w:instrText xml:space="preserve"> PAGEREF _Toc227696402 \h </w:instrText>
             </w:r>
             <w:r>
               <w:rPr>
@@ -2657,7 +2657,7 @@
               <w14:ligatures w14:val="standardContextual"/>
             </w:rPr>
           </w:pPr>
-          <w:hyperlink w:anchor="_Toc227695966" w:history="1">
+          <w:hyperlink w:anchor="_Toc227696403" w:history="1">
             <w:r>
               <w:rPr>
                 <w:rStyle w:val="Hyperlink"/>
@@ -2684,7 +2684,7 @@
                 <w:noProof/>
                 <w:webHidden/>
               </w:rPr>
-              <w:instrText xml:space="preserve"> PAGEREF _Toc227695966 \h </w:instrText>
+              <w:instrText xml:space="preserve"> PAGEREF _Toc227696403 \h </w:instrText>
             </w:r>
             <w:r>
               <w:rPr>
@@ -2727,7 +2727,7 @@
               <w:lang w:eastAsia="en-GB"/>
             </w:rPr>
           </w:pPr>
-          <w:hyperlink w:anchor="_Toc227695967" w:history="1">
+          <w:hyperlink w:anchor="_Toc227696404" w:history="1">
             <w:r>
               <w:rPr>
                 <w:rStyle w:val="Hyperlink"/>
@@ -2754,7 +2754,7 @@
                 <w:noProof/>
                 <w:webHidden/>
               </w:rPr>
-              <w:instrText xml:space="preserve"> PAGEREF _Toc227695967 \h </w:instrText>
+              <w:instrText xml:space="preserve"> PAGEREF _Toc227696404 \h </w:instrText>
             </w:r>
             <w:r>
               <w:rPr>
@@ -2797,7 +2797,7 @@
               <w:lang w:eastAsia="en-GB"/>
             </w:rPr>
           </w:pPr>
-          <w:hyperlink w:anchor="_Toc227695968" w:history="1">
+          <w:hyperlink w:anchor="_Toc227696405" w:history="1">
             <w:r>
               <w:rPr>
                 <w:rStyle w:val="Hyperlink"/>
@@ -2824,7 +2824,7 @@
                 <w:noProof/>
                 <w:webHidden/>
               </w:rPr>
-              <w:instrText xml:space="preserve"> PAGEREF _Toc227695968 \h </w:instrText>
+              <w:instrText xml:space="preserve"> PAGEREF _Toc227696405 \h </w:instrText>
             </w:r>
             <w:r>
               <w:rPr>
@@ -2867,7 +2867,7 @@
               <w:lang w:eastAsia="en-GB"/>
             </w:rPr>
           </w:pPr>
-          <w:hyperlink w:anchor="_Toc227695969" w:history="1">
+          <w:hyperlink w:anchor="_Toc227696406" w:history="1">
             <w:r>
               <w:rPr>
                 <w:rStyle w:val="Hyperlink"/>
@@ -2894,7 +2894,7 @@
                 <w:noProof/>
                 <w:webHidden/>
               </w:rPr>
-              <w:instrText xml:space="preserve"> PAGEREF _Toc227695969 \h </w:instrText>
+              <w:instrText xml:space="preserve"> PAGEREF _Toc227696406 \h </w:instrText>
             </w:r>
             <w:r>
               <w:rPr>
@@ -2941,7 +2941,7 @@
               <w14:ligatures w14:val="standardContextual"/>
             </w:rPr>
           </w:pPr>
-          <w:hyperlink w:anchor="_Toc227695970" w:history="1">
+          <w:hyperlink w:anchor="_Toc227696407" w:history="1">
             <w:r>
               <w:rPr>
                 <w:rStyle w:val="Hyperlink"/>
@@ -2968,7 +2968,7 @@
                 <w:noProof/>
                 <w:webHidden/>
               </w:rPr>
-              <w:instrText xml:space="preserve"> PAGEREF _Toc227695970 \h </w:instrText>
+              <w:instrText xml:space="preserve"> PAGEREF _Toc227696407 \h </w:instrText>
             </w:r>
             <w:r>
               <w:rPr>
@@ -3015,7 +3015,7 @@
               <w14:ligatures w14:val="standardContextual"/>
             </w:rPr>
           </w:pPr>
-          <w:hyperlink w:anchor="_Toc227695971" w:history="1">
+          <w:hyperlink w:anchor="_Toc227696408" w:history="1">
             <w:r>
               <w:rPr>
                 <w:rStyle w:val="Hyperlink"/>
@@ -3042,7 +3042,7 @@
                 <w:noProof/>
                 <w:webHidden/>
               </w:rPr>
-              <w:instrText xml:space="preserve"> PAGEREF _Toc227695971 \h </w:instrText>
+              <w:instrText xml:space="preserve"> PAGEREF _Toc227696408 \h </w:instrText>
             </w:r>
             <w:r>
               <w:rPr>
@@ -3089,7 +3089,7 @@
               <w14:ligatures w14:val="standardContextual"/>
             </w:rPr>
           </w:pPr>
-          <w:hyperlink w:anchor="_Toc227695972" w:history="1">
+          <w:hyperlink w:anchor="_Toc227696409" w:history="1">
             <w:r>
               <w:rPr>
                 <w:rStyle w:val="Hyperlink"/>
@@ -3116,7 +3116,7 @@
                 <w:noProof/>
                 <w:webHidden/>
               </w:rPr>
-              <w:instrText xml:space="preserve"> PAGEREF _Toc227695972 \h </w:instrText>
+              <w:instrText xml:space="preserve"> PAGEREF _Toc227696409 \h </w:instrText>
             </w:r>
             <w:r>
               <w:rPr>
@@ -3163,7 +3163,7 @@
               <w14:ligatures w14:val="standardContextual"/>
             </w:rPr>
           </w:pPr>
-          <w:hyperlink w:anchor="_Toc227695973" w:history="1">
+          <w:hyperlink w:anchor="_Toc227696410" w:history="1">
             <w:r>
               <w:rPr>
                 <w:rStyle w:val="Hyperlink"/>
@@ -3190,7 +3190,7 @@
                 <w:noProof/>
                 <w:webHidden/>
               </w:rPr>
-              <w:instrText xml:space="preserve"> PAGEREF _Toc227695973 \h </w:instrText>
+              <w:instrText xml:space="preserve"> PAGEREF _Toc227696410 \h </w:instrText>
             </w:r>
             <w:r>
               <w:rPr>
@@ -3211,6 +3211,80 @@
                 <w:webHidden/>
               </w:rPr>
               <w:t>10</w:t>
+            </w:r>
+            <w:r>
+              <w:rPr>
+                <w:noProof/>
+                <w:webHidden/>
+              </w:rPr>
+              <w:fldChar w:fldCharType="end"/>
+            </w:r>
+          </w:hyperlink>
+        </w:p>
+        <w:p>
+          <w:pPr>
+            <w:pStyle w:val="TOC3"/>
+            <w:tabs>
+              <w:tab w:val="right" w:leader="dot" w:pos="9016"/>
+            </w:tabs>
+            <w:rPr>
+              <w:rFonts w:asciiTheme="minorHAnsi" w:hAnsiTheme="minorHAnsi" w:cstheme="minorBidi"/>
+              <w:noProof/>
+              <w:kern w:val="2"/>
+              <w:sz w:val="24"/>
+              <w:szCs w:val="24"/>
+              <w:lang w:val="en-GB" w:eastAsia="en-GB"/>
+              <w14:ligatures w14:val="standardContextual"/>
+            </w:rPr>
+          </w:pPr>
+          <w:hyperlink w:anchor="_Toc227696411" w:history="1">
+            <w:r>
+              <w:rPr>
+                <w:rStyle w:val="Hyperlink"/>
+                <w:noProof/>
+              </w:rPr>
+              <w:t>3.1.3 Resource Distribution</w:t>
+            </w:r>
+            <w:r>
+              <w:rPr>
+                <w:noProof/>
+                <w:webHidden/>
+              </w:rPr>
+              <w:tab/>
+            </w:r>
+            <w:r>
+              <w:rPr>
+                <w:noProof/>
+                <w:webHidden/>
+              </w:rPr>
+              <w:fldChar w:fldCharType="begin"/>
+            </w:r>
+            <w:r>
+              <w:rPr>
+                <w:noProof/>
+                <w:webHidden/>
+              </w:rPr>
+              <w:instrText xml:space="preserve"> PAGEREF _Toc227696411 \h </w:instrText>
+            </w:r>
+            <w:r>
+              <w:rPr>
+                <w:noProof/>
+                <w:webHidden/>
+              </w:rPr>
+            </w:r>
+            <w:r>
+              <w:rPr>
+                <w:noProof/>
+                <w:webHidden/>
+              </w:rPr>
+              <w:fldChar w:fldCharType="separate"/>
+            </w:r>
+            <w:r>
+              <w:rPr>
+                <w:noProof/>
+                <w:webHidden/>
+              </w:rPr>
+              <w:t>11</w:t>
             </w:r>
             <w:r>
               <w:rPr>
@@ -3237,7 +3311,7 @@
               <w14:ligatures w14:val="standardContextual"/>
             </w:rPr>
           </w:pPr>
-          <w:hyperlink w:anchor="_Toc227695974" w:history="1">
+          <w:hyperlink w:anchor="_Toc227696412" w:history="1">
             <w:r>
               <w:rPr>
                 <w:rStyle w:val="Hyperlink"/>
@@ -3264,7 +3338,7 @@
                 <w:noProof/>
                 <w:webHidden/>
               </w:rPr>
-              <w:instrText xml:space="preserve"> PAGEREF _Toc227695974 \h </w:instrText>
+              <w:instrText xml:space="preserve"> PAGEREF _Toc227696412 \h </w:instrText>
             </w:r>
             <w:r>
               <w:rPr>
@@ -3321,7 +3395,7 @@
       <w:pPr>
         <w:pStyle w:val="Heading1"/>
       </w:pPr>
-      <w:bookmarkStart w:id="7" w:name="_Toc227695943"/>
+      <w:bookmarkStart w:id="7" w:name="_Toc227696380"/>
       <w:r>
         <w:t>Table of Figures</w:t>
       </w:r>
@@ -3879,7 +3953,7 @@
       <w:pPr>
         <w:pStyle w:val="Heading1"/>
       </w:pPr>
-      <w:bookmarkStart w:id="8" w:name="_Toc227695944"/>
+      <w:bookmarkStart w:id="8" w:name="_Toc227696381"/>
       <w:r>
         <w:t>Chapter 1</w:t>
       </w:r>
@@ -3907,7 +3981,7 @@
           <w:u w:val="single"/>
         </w:rPr>
       </w:pPr>
-      <w:bookmarkStart w:id="9" w:name="_Toc227695945"/>
+      <w:bookmarkStart w:id="9" w:name="_Toc227696382"/>
       <w:r>
         <w:t>1.1</w:t>
       </w:r>
@@ -3952,7 +4026,7 @@
       <w:pPr>
         <w:pStyle w:val="Heading2"/>
       </w:pPr>
-      <w:bookmarkStart w:id="10" w:name="_Toc227695946"/>
+      <w:bookmarkStart w:id="10" w:name="_Toc227696383"/>
       <w:r>
         <w:t>1.2 Aims</w:t>
       </w:r>
@@ -3968,7 +4042,7 @@
           <w:szCs w:val="28"/>
         </w:rPr>
       </w:pPr>
-      <w:bookmarkStart w:id="11" w:name="_Toc227695947"/>
+      <w:bookmarkStart w:id="11" w:name="_Toc227696384"/>
       <w:r>
         <w:rPr>
           <w:rStyle w:val="Heading2Char"/>
@@ -4013,7 +4087,7 @@
       <w:pPr>
         <w:pStyle w:val="Heading3"/>
       </w:pPr>
-      <w:bookmarkStart w:id="12" w:name="_Toc227695948"/>
+      <w:bookmarkStart w:id="12" w:name="_Toc227696385"/>
       <w:r>
         <w:lastRenderedPageBreak/>
         <w:t>1.2.2 Additional Aims</w:t>
@@ -4083,7 +4157,7 @@
       <w:pPr>
         <w:pStyle w:val="Heading2"/>
       </w:pPr>
-      <w:bookmarkStart w:id="13" w:name="_Toc227695949"/>
+      <w:bookmarkStart w:id="13" w:name="_Toc227696386"/>
       <w:r>
         <w:t>1.3 Objectives</w:t>
       </w:r>
@@ -4093,7 +4167,7 @@
       <w:pPr>
         <w:pStyle w:val="Heading3"/>
       </w:pPr>
-      <w:bookmarkStart w:id="14" w:name="_Toc227695950"/>
+      <w:bookmarkStart w:id="14" w:name="_Toc227696387"/>
       <w:r>
         <w:t>1.3.1 Scope</w:t>
       </w:r>
@@ -4164,7 +4238,7 @@
       <w:pPr>
         <w:pStyle w:val="Heading3"/>
       </w:pPr>
-      <w:bookmarkStart w:id="15" w:name="_Toc227695951"/>
+      <w:bookmarkStart w:id="15" w:name="_Toc227696388"/>
       <w:r>
         <w:t>1.3.2 Research Objectives</w:t>
       </w:r>
@@ -4209,7 +4283,7 @@
       <w:pPr>
         <w:pStyle w:val="Heading3"/>
       </w:pPr>
-      <w:bookmarkStart w:id="16" w:name="_Toc227695952"/>
+      <w:bookmarkStart w:id="16" w:name="_Toc227696389"/>
       <w:r>
         <w:t>1.3.3 Design Objectives</w:t>
       </w:r>
@@ -4331,7 +4405,7 @@
       <w:pPr>
         <w:pStyle w:val="Heading3"/>
       </w:pPr>
-      <w:bookmarkStart w:id="17" w:name="_Toc227695953"/>
+      <w:bookmarkStart w:id="17" w:name="_Toc227696390"/>
       <w:r>
         <w:t>1.3.4 Implementation Objectives</w:t>
       </w:r>
@@ -4450,7 +4524,7 @@
       <w:pPr>
         <w:pStyle w:val="Heading3"/>
       </w:pPr>
-      <w:bookmarkStart w:id="18" w:name="_Toc227695954"/>
+      <w:bookmarkStart w:id="18" w:name="_Toc227696391"/>
       <w:r>
         <w:t>1.3.5 Results, Evaluation and Playtesting Objectives</w:t>
       </w:r>
@@ -4507,7 +4581,7 @@
       <w:pPr>
         <w:pStyle w:val="Heading1"/>
       </w:pPr>
-      <w:bookmarkStart w:id="19" w:name="_Toc227695955"/>
+      <w:bookmarkStart w:id="19" w:name="_Toc227696392"/>
       <w:r>
         <w:t>Chapter 2 – Literature Survey</w:t>
       </w:r>
@@ -4517,7 +4591,7 @@
       <w:pPr>
         <w:pStyle w:val="Heading2"/>
       </w:pPr>
-      <w:bookmarkStart w:id="20" w:name="_Toc227695956"/>
+      <w:bookmarkStart w:id="20" w:name="_Toc227696393"/>
       <w:r>
         <w:t>2.1 Literature Survey Introduction</w:t>
       </w:r>
@@ -4556,7 +4630,7 @@
       <w:pPr>
         <w:pStyle w:val="Heading2"/>
       </w:pPr>
-      <w:bookmarkStart w:id="21" w:name="_Toc227695957"/>
+      <w:bookmarkStart w:id="21" w:name="_Toc227696394"/>
       <w:r>
         <w:t>2.2 Comparative Research</w:t>
       </w:r>
@@ -4574,7 +4648,7 @@
       <w:pPr>
         <w:pStyle w:val="Heading3"/>
       </w:pPr>
-      <w:bookmarkStart w:id="22" w:name="_Toc227695958"/>
+      <w:bookmarkStart w:id="22" w:name="_Toc227696395"/>
       <w:r>
         <w:t xml:space="preserve">2.2.1 </w:t>
       </w:r>
@@ -4650,7 +4724,7 @@
       <w:pPr>
         <w:pStyle w:val="Heading4"/>
       </w:pPr>
-      <w:bookmarkStart w:id="23" w:name="_Toc227695959"/>
+      <w:bookmarkStart w:id="23" w:name="_Toc227696396"/>
       <w:r>
         <w:t>2.2.1.1 Perlin Noise</w:t>
       </w:r>
@@ -5062,7 +5136,7 @@
       <w:pPr>
         <w:pStyle w:val="Heading4"/>
       </w:pPr>
-      <w:bookmarkStart w:id="25" w:name="_Toc227695960"/>
+      <w:bookmarkStart w:id="25" w:name="_Toc227696397"/>
       <w:r>
         <w:t>2.2.1.2 Binary Space Partitioning</w:t>
       </w:r>
@@ -5114,7 +5188,7 @@
       <w:pPr>
         <w:pStyle w:val="Heading4"/>
       </w:pPr>
-      <w:bookmarkStart w:id="26" w:name="_Toc227695961"/>
+      <w:bookmarkStart w:id="26" w:name="_Toc227696398"/>
       <w:r>
         <w:t>2.2.1.3 Cellular Automata</w:t>
       </w:r>
@@ -5234,7 +5308,7 @@
       <w:pPr>
         <w:pStyle w:val="Heading3"/>
       </w:pPr>
-      <w:bookmarkStart w:id="27" w:name="_Toc227695962"/>
+      <w:bookmarkStart w:id="27" w:name="_Toc227696399"/>
       <w:r>
         <w:t>2.2.2 Pathfinding</w:t>
       </w:r>
@@ -5297,7 +5371,7 @@
       <w:pPr>
         <w:pStyle w:val="Heading4"/>
       </w:pPr>
-      <w:bookmarkStart w:id="28" w:name="_Toc227695963"/>
+      <w:bookmarkStart w:id="28" w:name="_Toc227696400"/>
       <w:r>
         <w:t>2.2.2.1 Dijkstra</w:t>
       </w:r>
@@ -5485,7 +5559,7 @@
       <w:pPr>
         <w:pStyle w:val="Heading4"/>
       </w:pPr>
-      <w:bookmarkStart w:id="30" w:name="_Toc227695964"/>
+      <w:bookmarkStart w:id="30" w:name="_Toc227696401"/>
       <w:r>
         <w:t>2.2.2.2 A*</w:t>
       </w:r>
@@ -5548,7 +5622,7 @@
       <w:pPr>
         <w:pStyle w:val="Heading4"/>
       </w:pPr>
-      <w:bookmarkStart w:id="31" w:name="_Toc227695965"/>
+      <w:bookmarkStart w:id="31" w:name="_Toc227696402"/>
       <w:r>
         <w:t>2.2.2.3 Jump Point Search</w:t>
       </w:r>
@@ -5603,7 +5677,7 @@
       <w:pPr>
         <w:pStyle w:val="Heading3"/>
       </w:pPr>
-      <w:bookmarkStart w:id="32" w:name="_Toc227695966"/>
+      <w:bookmarkStart w:id="32" w:name="_Toc227696403"/>
       <w:r>
         <w:t>2.2.3 AI Integrations</w:t>
       </w:r>
@@ -5628,7 +5702,7 @@
       <w:pPr>
         <w:pStyle w:val="Heading4"/>
       </w:pPr>
-      <w:bookmarkStart w:id="33" w:name="_Toc227695967"/>
+      <w:bookmarkStart w:id="33" w:name="_Toc227696404"/>
       <w:r>
         <w:t>2.2.3.1 Neural Network</w:t>
       </w:r>
@@ -5683,7 +5757,7 @@
       <w:pPr>
         <w:pStyle w:val="Heading4"/>
       </w:pPr>
-      <w:bookmarkStart w:id="34" w:name="_Toc227695968"/>
+      <w:bookmarkStart w:id="34" w:name="_Toc227696405"/>
       <w:r>
         <w:t>2.2.3.2 Reinforcement Learning</w:t>
       </w:r>
@@ -5897,7 +5971,7 @@
       <w:pPr>
         <w:pStyle w:val="Heading4"/>
       </w:pPr>
-      <w:bookmarkStart w:id="36" w:name="_Toc227695969"/>
+      <w:bookmarkStart w:id="36" w:name="_Toc227696406"/>
       <w:r>
         <w:t>2.2.3.3 Imitation Learning</w:t>
       </w:r>
@@ -6026,7 +6100,7 @@
       <w:pPr>
         <w:pStyle w:val="Heading1"/>
       </w:pPr>
-      <w:bookmarkStart w:id="37" w:name="_Toc227695970"/>
+      <w:bookmarkStart w:id="37" w:name="_Toc227696407"/>
       <w:r>
         <w:lastRenderedPageBreak/>
         <w:t>Chapter 3 – Design</w:t>
@@ -6048,7 +6122,7 @@
       <w:pPr>
         <w:pStyle w:val="Heading2"/>
       </w:pPr>
-      <w:bookmarkStart w:id="38" w:name="_Toc227695971"/>
+      <w:bookmarkStart w:id="38" w:name="_Toc227696408"/>
       <w:r>
         <w:t xml:space="preserve">3.1 </w:t>
       </w:r>
@@ -6075,7 +6149,7 @@
       <w:pPr>
         <w:pStyle w:val="Heading3"/>
       </w:pPr>
-      <w:bookmarkStart w:id="39" w:name="_Toc227695972"/>
+      <w:bookmarkStart w:id="39" w:name="_Toc227696409"/>
       <w:r>
         <w:t xml:space="preserve">3.1.1 </w:t>
       </w:r>
@@ -6446,7 +6520,7 @@
       <w:pPr>
         <w:pStyle w:val="Heading3"/>
       </w:pPr>
-      <w:bookmarkStart w:id="43" w:name="_Toc227695973"/>
+      <w:bookmarkStart w:id="43" w:name="_Toc227696410"/>
       <w:r>
         <w:t>3.1.2 Biomes</w:t>
       </w:r>
@@ -6716,8 +6790,38 @@
         <w:t xml:space="preserve"> This should balance out the resource distribution enough that players seek grassland at the beginning of the game.</w:t>
       </w:r>
     </w:p>
+    <w:p>
+      <w:pPr>
+        <w:pStyle w:val="Heading3"/>
+      </w:pPr>
+      <w:bookmarkStart w:id="45" w:name="_Toc227696411"/>
+      <w:r>
+        <w:t>3.1.3 Resource Distribution</w:t>
+      </w:r>
+      <w:bookmarkEnd w:id="45"/>
+    </w:p>
+    <w:p>
+      <w:r>
+        <w:t xml:space="preserve">Every tile in the game has a Resource variable inside its class. This is so that resources can add and remove resources from tiles when needed. This will include the ability for the player to consume the entire tiles resources on 1 turn, destroying the resource on the tile. The list of </w:t>
+      </w:r>
+      <w:r>
+        <w:t>resources available</w:t>
+      </w:r>
+      <w:r>
+        <w:t xml:space="preserve"> is as follows: Wheat, Fish, Cows, Horses, Stone, and Iron.</w:t>
+      </w:r>
+    </w:p>
     <w:p/>
-    <w:bookmarkStart w:id="45" w:name="_Toc227695974" w:displacedByCustomXml="next"/>
+    <w:p>
+      <w:r>
+        <w:t xml:space="preserve">Initially resources will be placed at random with some rules, such as fish only appearing on water tiles and wheat and cows only appearing in grassland. Other resources such as stone and iron will be available on any land tiles. </w:t>
+      </w:r>
+      <w:r>
+        <w:t>This random resource approach is purely for the development speed of the project and will hopefully be succeeded by a more sophisticated distribution algorithm to ensure both the player and the AI have relatively equal access to resources.</w:t>
+      </w:r>
+    </w:p>
+    <w:p/>
+    <w:bookmarkStart w:id="46" w:name="_Toc227696412" w:displacedByCustomXml="next"/>
     <w:sdt>
       <w:sdtPr>
         <w:rPr>
@@ -6745,7 +6849,7 @@
           <w:r>
             <w:t>References</w:t>
           </w:r>
-          <w:bookmarkEnd w:id="45"/>
+          <w:bookmarkEnd w:id="46"/>
         </w:p>
         <w:sdt>
           <w:sdtPr>
@@ -7006,6 +7110,7 @@
                 <w:rPr>
                   <w:noProof/>
                 </w:rPr>
+                <w:lastRenderedPageBreak/>
                 <w:t xml:space="preserve">Orsini, M. et al., 2021. </w:t>
               </w:r>
               <w:r>

</xml_diff>

<commit_message>
feat: written river generation design
</commit_message>
<xml_diff>
--- a/Report.docx
+++ b/Report.docx
@@ -321,7 +321,7 @@
         <w:pStyle w:val="Heading1"/>
       </w:pPr>
       <w:bookmarkStart w:id="1" w:name="_Toc40898999"/>
-      <w:bookmarkStart w:id="2" w:name="_Toc227696376"/>
+      <w:bookmarkStart w:id="2" w:name="_Toc227741913"/>
       <w:r>
         <w:lastRenderedPageBreak/>
         <w:t>Abstract</w:t>
@@ -369,7 +369,7 @@
         <w:spacing w:after="321"/>
         <w:ind w:left="-5"/>
       </w:pPr>
-      <w:bookmarkStart w:id="3" w:name="_Toc227696377"/>
+      <w:bookmarkStart w:id="3" w:name="_Toc227741914"/>
       <w:r>
         <w:lastRenderedPageBreak/>
         <w:t>Declaration</w:t>
@@ -491,7 +491,7 @@
         <w:ind w:left="-5"/>
       </w:pPr>
       <w:bookmarkStart w:id="4" w:name="_Toc40899001"/>
-      <w:bookmarkStart w:id="5" w:name="_Toc227696378"/>
+      <w:bookmarkStart w:id="5" w:name="_Toc227741915"/>
       <w:r>
         <w:lastRenderedPageBreak/>
         <w:t>Acknowledgements</w:t>
@@ -625,7 +625,7 @@
         <w:spacing w:line="259" w:lineRule="auto"/>
       </w:pPr>
     </w:p>
-    <w:bookmarkStart w:id="6" w:name="_Toc227696379" w:displacedByCustomXml="next"/>
+    <w:bookmarkStart w:id="6" w:name="_Toc227741916" w:displacedByCustomXml="next"/>
     <w:sdt>
       <w:sdtPr>
         <w:rPr>
@@ -683,7 +683,7 @@
           <w:r>
             <w:fldChar w:fldCharType="separate"/>
           </w:r>
-          <w:hyperlink w:anchor="_Toc227696376" w:history="1">
+          <w:hyperlink w:anchor="_Toc227741913" w:history="1">
             <w:r>
               <w:rPr>
                 <w:rStyle w:val="Hyperlink"/>
@@ -710,7 +710,7 @@
                 <w:noProof/>
                 <w:webHidden/>
               </w:rPr>
-              <w:instrText xml:space="preserve"> PAGEREF _Toc227696376 \h </w:instrText>
+              <w:instrText xml:space="preserve"> PAGEREF _Toc227741913 \h </w:instrText>
             </w:r>
             <w:r>
               <w:rPr>
@@ -757,7 +757,7 @@
               <w14:ligatures w14:val="standardContextual"/>
             </w:rPr>
           </w:pPr>
-          <w:hyperlink w:anchor="_Toc227696377" w:history="1">
+          <w:hyperlink w:anchor="_Toc227741914" w:history="1">
             <w:r>
               <w:rPr>
                 <w:rStyle w:val="Hyperlink"/>
@@ -784,7 +784,7 @@
                 <w:noProof/>
                 <w:webHidden/>
               </w:rPr>
-              <w:instrText xml:space="preserve"> PAGEREF _Toc227696377 \h </w:instrText>
+              <w:instrText xml:space="preserve"> PAGEREF _Toc227741914 \h </w:instrText>
             </w:r>
             <w:r>
               <w:rPr>
@@ -831,7 +831,7 @@
               <w14:ligatures w14:val="standardContextual"/>
             </w:rPr>
           </w:pPr>
-          <w:hyperlink w:anchor="_Toc227696378" w:history="1">
+          <w:hyperlink w:anchor="_Toc227741915" w:history="1">
             <w:r>
               <w:rPr>
                 <w:rStyle w:val="Hyperlink"/>
@@ -858,7 +858,7 @@
                 <w:noProof/>
                 <w:webHidden/>
               </w:rPr>
-              <w:instrText xml:space="preserve"> PAGEREF _Toc227696378 \h </w:instrText>
+              <w:instrText xml:space="preserve"> PAGEREF _Toc227741915 \h </w:instrText>
             </w:r>
             <w:r>
               <w:rPr>
@@ -905,7 +905,7 @@
               <w14:ligatures w14:val="standardContextual"/>
             </w:rPr>
           </w:pPr>
-          <w:hyperlink w:anchor="_Toc227696379" w:history="1">
+          <w:hyperlink w:anchor="_Toc227741916" w:history="1">
             <w:r>
               <w:rPr>
                 <w:rStyle w:val="Hyperlink"/>
@@ -932,7 +932,7 @@
                 <w:noProof/>
                 <w:webHidden/>
               </w:rPr>
-              <w:instrText xml:space="preserve"> PAGEREF _Toc227696379 \h </w:instrText>
+              <w:instrText xml:space="preserve"> PAGEREF _Toc227741916 \h </w:instrText>
             </w:r>
             <w:r>
               <w:rPr>
@@ -979,7 +979,7 @@
               <w14:ligatures w14:val="standardContextual"/>
             </w:rPr>
           </w:pPr>
-          <w:hyperlink w:anchor="_Toc227696380" w:history="1">
+          <w:hyperlink w:anchor="_Toc227741917" w:history="1">
             <w:r>
               <w:rPr>
                 <w:rStyle w:val="Hyperlink"/>
@@ -1006,7 +1006,7 @@
                 <w:noProof/>
                 <w:webHidden/>
               </w:rPr>
-              <w:instrText xml:space="preserve"> PAGEREF _Toc227696380 \h </w:instrText>
+              <w:instrText xml:space="preserve"> PAGEREF _Toc227741917 \h </w:instrText>
             </w:r>
             <w:r>
               <w:rPr>
@@ -1053,7 +1053,7 @@
               <w14:ligatures w14:val="standardContextual"/>
             </w:rPr>
           </w:pPr>
-          <w:hyperlink w:anchor="_Toc227696381" w:history="1">
+          <w:hyperlink w:anchor="_Toc227741918" w:history="1">
             <w:r>
               <w:rPr>
                 <w:rStyle w:val="Hyperlink"/>
@@ -1080,7 +1080,7 @@
                 <w:noProof/>
                 <w:webHidden/>
               </w:rPr>
-              <w:instrText xml:space="preserve"> PAGEREF _Toc227696381 \h </w:instrText>
+              <w:instrText xml:space="preserve"> PAGEREF _Toc227741918 \h </w:instrText>
             </w:r>
             <w:r>
               <w:rPr>
@@ -1127,7 +1127,7 @@
               <w14:ligatures w14:val="standardContextual"/>
             </w:rPr>
           </w:pPr>
-          <w:hyperlink w:anchor="_Toc227696382" w:history="1">
+          <w:hyperlink w:anchor="_Toc227741919" w:history="1">
             <w:r>
               <w:rPr>
                 <w:rStyle w:val="Hyperlink"/>
@@ -1154,7 +1154,7 @@
                 <w:noProof/>
                 <w:webHidden/>
               </w:rPr>
-              <w:instrText xml:space="preserve"> PAGEREF _Toc227696382 \h </w:instrText>
+              <w:instrText xml:space="preserve"> PAGEREF _Toc227741919 \h </w:instrText>
             </w:r>
             <w:r>
               <w:rPr>
@@ -1201,7 +1201,7 @@
               <w14:ligatures w14:val="standardContextual"/>
             </w:rPr>
           </w:pPr>
-          <w:hyperlink w:anchor="_Toc227696383" w:history="1">
+          <w:hyperlink w:anchor="_Toc227741920" w:history="1">
             <w:r>
               <w:rPr>
                 <w:rStyle w:val="Hyperlink"/>
@@ -1228,7 +1228,7 @@
                 <w:noProof/>
                 <w:webHidden/>
               </w:rPr>
-              <w:instrText xml:space="preserve"> PAGEREF _Toc227696383 \h </w:instrText>
+              <w:instrText xml:space="preserve"> PAGEREF _Toc227741920 \h </w:instrText>
             </w:r>
             <w:r>
               <w:rPr>
@@ -1275,7 +1275,7 @@
               <w14:ligatures w14:val="standardContextual"/>
             </w:rPr>
           </w:pPr>
-          <w:hyperlink w:anchor="_Toc227696384" w:history="1">
+          <w:hyperlink w:anchor="_Toc227741921" w:history="1">
             <w:r>
               <w:rPr>
                 <w:rStyle w:val="Hyperlink"/>
@@ -1302,7 +1302,7 @@
                 <w:noProof/>
                 <w:webHidden/>
               </w:rPr>
-              <w:instrText xml:space="preserve"> PAGEREF _Toc227696384 \h </w:instrText>
+              <w:instrText xml:space="preserve"> PAGEREF _Toc227741921 \h </w:instrText>
             </w:r>
             <w:r>
               <w:rPr>
@@ -1349,7 +1349,7 @@
               <w14:ligatures w14:val="standardContextual"/>
             </w:rPr>
           </w:pPr>
-          <w:hyperlink w:anchor="_Toc227696385" w:history="1">
+          <w:hyperlink w:anchor="_Toc227741922" w:history="1">
             <w:r>
               <w:rPr>
                 <w:rStyle w:val="Hyperlink"/>
@@ -1376,7 +1376,7 @@
                 <w:noProof/>
                 <w:webHidden/>
               </w:rPr>
-              <w:instrText xml:space="preserve"> PAGEREF _Toc227696385 \h </w:instrText>
+              <w:instrText xml:space="preserve"> PAGEREF _Toc227741922 \h </w:instrText>
             </w:r>
             <w:r>
               <w:rPr>
@@ -1423,7 +1423,7 @@
               <w14:ligatures w14:val="standardContextual"/>
             </w:rPr>
           </w:pPr>
-          <w:hyperlink w:anchor="_Toc227696386" w:history="1">
+          <w:hyperlink w:anchor="_Toc227741923" w:history="1">
             <w:r>
               <w:rPr>
                 <w:rStyle w:val="Hyperlink"/>
@@ -1450,7 +1450,7 @@
                 <w:noProof/>
                 <w:webHidden/>
               </w:rPr>
-              <w:instrText xml:space="preserve"> PAGEREF _Toc227696386 \h </w:instrText>
+              <w:instrText xml:space="preserve"> PAGEREF _Toc227741923 \h </w:instrText>
             </w:r>
             <w:r>
               <w:rPr>
@@ -1497,7 +1497,7 @@
               <w14:ligatures w14:val="standardContextual"/>
             </w:rPr>
           </w:pPr>
-          <w:hyperlink w:anchor="_Toc227696387" w:history="1">
+          <w:hyperlink w:anchor="_Toc227741924" w:history="1">
             <w:r>
               <w:rPr>
                 <w:rStyle w:val="Hyperlink"/>
@@ -1524,7 +1524,7 @@
                 <w:noProof/>
                 <w:webHidden/>
               </w:rPr>
-              <w:instrText xml:space="preserve"> PAGEREF _Toc227696387 \h </w:instrText>
+              <w:instrText xml:space="preserve"> PAGEREF _Toc227741924 \h </w:instrText>
             </w:r>
             <w:r>
               <w:rPr>
@@ -1571,7 +1571,7 @@
               <w14:ligatures w14:val="standardContextual"/>
             </w:rPr>
           </w:pPr>
-          <w:hyperlink w:anchor="_Toc227696388" w:history="1">
+          <w:hyperlink w:anchor="_Toc227741925" w:history="1">
             <w:r>
               <w:rPr>
                 <w:rStyle w:val="Hyperlink"/>
@@ -1598,7 +1598,7 @@
                 <w:noProof/>
                 <w:webHidden/>
               </w:rPr>
-              <w:instrText xml:space="preserve"> PAGEREF _Toc227696388 \h </w:instrText>
+              <w:instrText xml:space="preserve"> PAGEREF _Toc227741925 \h </w:instrText>
             </w:r>
             <w:r>
               <w:rPr>
@@ -1645,7 +1645,7 @@
               <w14:ligatures w14:val="standardContextual"/>
             </w:rPr>
           </w:pPr>
-          <w:hyperlink w:anchor="_Toc227696389" w:history="1">
+          <w:hyperlink w:anchor="_Toc227741926" w:history="1">
             <w:r>
               <w:rPr>
                 <w:rStyle w:val="Hyperlink"/>
@@ -1672,7 +1672,7 @@
                 <w:noProof/>
                 <w:webHidden/>
               </w:rPr>
-              <w:instrText xml:space="preserve"> PAGEREF _Toc227696389 \h </w:instrText>
+              <w:instrText xml:space="preserve"> PAGEREF _Toc227741926 \h </w:instrText>
             </w:r>
             <w:r>
               <w:rPr>
@@ -1719,7 +1719,7 @@
               <w14:ligatures w14:val="standardContextual"/>
             </w:rPr>
           </w:pPr>
-          <w:hyperlink w:anchor="_Toc227696390" w:history="1">
+          <w:hyperlink w:anchor="_Toc227741927" w:history="1">
             <w:r>
               <w:rPr>
                 <w:rStyle w:val="Hyperlink"/>
@@ -1746,7 +1746,7 @@
                 <w:noProof/>
                 <w:webHidden/>
               </w:rPr>
-              <w:instrText xml:space="preserve"> PAGEREF _Toc227696390 \h </w:instrText>
+              <w:instrText xml:space="preserve"> PAGEREF _Toc227741927 \h </w:instrText>
             </w:r>
             <w:r>
               <w:rPr>
@@ -1793,7 +1793,7 @@
               <w14:ligatures w14:val="standardContextual"/>
             </w:rPr>
           </w:pPr>
-          <w:hyperlink w:anchor="_Toc227696391" w:history="1">
+          <w:hyperlink w:anchor="_Toc227741928" w:history="1">
             <w:r>
               <w:rPr>
                 <w:rStyle w:val="Hyperlink"/>
@@ -1820,7 +1820,7 @@
                 <w:noProof/>
                 <w:webHidden/>
               </w:rPr>
-              <w:instrText xml:space="preserve"> PAGEREF _Toc227696391 \h </w:instrText>
+              <w:instrText xml:space="preserve"> PAGEREF _Toc227741928 \h </w:instrText>
             </w:r>
             <w:r>
               <w:rPr>
@@ -1867,7 +1867,7 @@
               <w14:ligatures w14:val="standardContextual"/>
             </w:rPr>
           </w:pPr>
-          <w:hyperlink w:anchor="_Toc227696392" w:history="1">
+          <w:hyperlink w:anchor="_Toc227741929" w:history="1">
             <w:r>
               <w:rPr>
                 <w:rStyle w:val="Hyperlink"/>
@@ -1894,7 +1894,7 @@
                 <w:noProof/>
                 <w:webHidden/>
               </w:rPr>
-              <w:instrText xml:space="preserve"> PAGEREF _Toc227696392 \h </w:instrText>
+              <w:instrText xml:space="preserve"> PAGEREF _Toc227741929 \h </w:instrText>
             </w:r>
             <w:r>
               <w:rPr>
@@ -1941,7 +1941,7 @@
               <w14:ligatures w14:val="standardContextual"/>
             </w:rPr>
           </w:pPr>
-          <w:hyperlink w:anchor="_Toc227696393" w:history="1">
+          <w:hyperlink w:anchor="_Toc227741930" w:history="1">
             <w:r>
               <w:rPr>
                 <w:rStyle w:val="Hyperlink"/>
@@ -1968,7 +1968,7 @@
                 <w:noProof/>
                 <w:webHidden/>
               </w:rPr>
-              <w:instrText xml:space="preserve"> PAGEREF _Toc227696393 \h </w:instrText>
+              <w:instrText xml:space="preserve"> PAGEREF _Toc227741930 \h </w:instrText>
             </w:r>
             <w:r>
               <w:rPr>
@@ -2015,7 +2015,7 @@
               <w14:ligatures w14:val="standardContextual"/>
             </w:rPr>
           </w:pPr>
-          <w:hyperlink w:anchor="_Toc227696394" w:history="1">
+          <w:hyperlink w:anchor="_Toc227741931" w:history="1">
             <w:r>
               <w:rPr>
                 <w:rStyle w:val="Hyperlink"/>
@@ -2042,7 +2042,7 @@
                 <w:noProof/>
                 <w:webHidden/>
               </w:rPr>
-              <w:instrText xml:space="preserve"> PAGEREF _Toc227696394 \h </w:instrText>
+              <w:instrText xml:space="preserve"> PAGEREF _Toc227741931 \h </w:instrText>
             </w:r>
             <w:r>
               <w:rPr>
@@ -2089,7 +2089,7 @@
               <w14:ligatures w14:val="standardContextual"/>
             </w:rPr>
           </w:pPr>
-          <w:hyperlink w:anchor="_Toc227696395" w:history="1">
+          <w:hyperlink w:anchor="_Toc227741932" w:history="1">
             <w:r>
               <w:rPr>
                 <w:rStyle w:val="Hyperlink"/>
@@ -2116,7 +2116,7 @@
                 <w:noProof/>
                 <w:webHidden/>
               </w:rPr>
-              <w:instrText xml:space="preserve"> PAGEREF _Toc227696395 \h </w:instrText>
+              <w:instrText xml:space="preserve"> PAGEREF _Toc227741932 \h </w:instrText>
             </w:r>
             <w:r>
               <w:rPr>
@@ -2159,7 +2159,7 @@
               <w:lang w:eastAsia="en-GB"/>
             </w:rPr>
           </w:pPr>
-          <w:hyperlink w:anchor="_Toc227696396" w:history="1">
+          <w:hyperlink w:anchor="_Toc227741933" w:history="1">
             <w:r>
               <w:rPr>
                 <w:rStyle w:val="Hyperlink"/>
@@ -2186,7 +2186,7 @@
                 <w:noProof/>
                 <w:webHidden/>
               </w:rPr>
-              <w:instrText xml:space="preserve"> PAGEREF _Toc227696396 \h </w:instrText>
+              <w:instrText xml:space="preserve"> PAGEREF _Toc227741933 \h </w:instrText>
             </w:r>
             <w:r>
               <w:rPr>
@@ -2229,7 +2229,7 @@
               <w:lang w:eastAsia="en-GB"/>
             </w:rPr>
           </w:pPr>
-          <w:hyperlink w:anchor="_Toc227696397" w:history="1">
+          <w:hyperlink w:anchor="_Toc227741934" w:history="1">
             <w:r>
               <w:rPr>
                 <w:rStyle w:val="Hyperlink"/>
@@ -2256,7 +2256,7 @@
                 <w:noProof/>
                 <w:webHidden/>
               </w:rPr>
-              <w:instrText xml:space="preserve"> PAGEREF _Toc227696397 \h </w:instrText>
+              <w:instrText xml:space="preserve"> PAGEREF _Toc227741934 \h </w:instrText>
             </w:r>
             <w:r>
               <w:rPr>
@@ -2299,7 +2299,7 @@
               <w:lang w:eastAsia="en-GB"/>
             </w:rPr>
           </w:pPr>
-          <w:hyperlink w:anchor="_Toc227696398" w:history="1">
+          <w:hyperlink w:anchor="_Toc227741935" w:history="1">
             <w:r>
               <w:rPr>
                 <w:rStyle w:val="Hyperlink"/>
@@ -2326,7 +2326,7 @@
                 <w:noProof/>
                 <w:webHidden/>
               </w:rPr>
-              <w:instrText xml:space="preserve"> PAGEREF _Toc227696398 \h </w:instrText>
+              <w:instrText xml:space="preserve"> PAGEREF _Toc227741935 \h </w:instrText>
             </w:r>
             <w:r>
               <w:rPr>
@@ -2373,7 +2373,7 @@
               <w14:ligatures w14:val="standardContextual"/>
             </w:rPr>
           </w:pPr>
-          <w:hyperlink w:anchor="_Toc227696399" w:history="1">
+          <w:hyperlink w:anchor="_Toc227741936" w:history="1">
             <w:r>
               <w:rPr>
                 <w:rStyle w:val="Hyperlink"/>
@@ -2400,7 +2400,7 @@
                 <w:noProof/>
                 <w:webHidden/>
               </w:rPr>
-              <w:instrText xml:space="preserve"> PAGEREF _Toc227696399 \h </w:instrText>
+              <w:instrText xml:space="preserve"> PAGEREF _Toc227741936 \h </w:instrText>
             </w:r>
             <w:r>
               <w:rPr>
@@ -2443,7 +2443,7 @@
               <w:lang w:eastAsia="en-GB"/>
             </w:rPr>
           </w:pPr>
-          <w:hyperlink w:anchor="_Toc227696400" w:history="1">
+          <w:hyperlink w:anchor="_Toc227741937" w:history="1">
             <w:r>
               <w:rPr>
                 <w:rStyle w:val="Hyperlink"/>
@@ -2470,7 +2470,7 @@
                 <w:noProof/>
                 <w:webHidden/>
               </w:rPr>
-              <w:instrText xml:space="preserve"> PAGEREF _Toc227696400 \h </w:instrText>
+              <w:instrText xml:space="preserve"> PAGEREF _Toc227741937 \h </w:instrText>
             </w:r>
             <w:r>
               <w:rPr>
@@ -2513,7 +2513,7 @@
               <w:lang w:eastAsia="en-GB"/>
             </w:rPr>
           </w:pPr>
-          <w:hyperlink w:anchor="_Toc227696401" w:history="1">
+          <w:hyperlink w:anchor="_Toc227741938" w:history="1">
             <w:r>
               <w:rPr>
                 <w:rStyle w:val="Hyperlink"/>
@@ -2540,7 +2540,7 @@
                 <w:noProof/>
                 <w:webHidden/>
               </w:rPr>
-              <w:instrText xml:space="preserve"> PAGEREF _Toc227696401 \h </w:instrText>
+              <w:instrText xml:space="preserve"> PAGEREF _Toc227741938 \h </w:instrText>
             </w:r>
             <w:r>
               <w:rPr>
@@ -2583,7 +2583,7 @@
               <w:lang w:eastAsia="en-GB"/>
             </w:rPr>
           </w:pPr>
-          <w:hyperlink w:anchor="_Toc227696402" w:history="1">
+          <w:hyperlink w:anchor="_Toc227741939" w:history="1">
             <w:r>
               <w:rPr>
                 <w:rStyle w:val="Hyperlink"/>
@@ -2610,7 +2610,7 @@
                 <w:noProof/>
                 <w:webHidden/>
               </w:rPr>
-              <w:instrText xml:space="preserve"> PAGEREF _Toc227696402 \h </w:instrText>
+              <w:instrText xml:space="preserve"> PAGEREF _Toc227741939 \h </w:instrText>
             </w:r>
             <w:r>
               <w:rPr>
@@ -2657,7 +2657,7 @@
               <w14:ligatures w14:val="standardContextual"/>
             </w:rPr>
           </w:pPr>
-          <w:hyperlink w:anchor="_Toc227696403" w:history="1">
+          <w:hyperlink w:anchor="_Toc227741940" w:history="1">
             <w:r>
               <w:rPr>
                 <w:rStyle w:val="Hyperlink"/>
@@ -2684,7 +2684,7 @@
                 <w:noProof/>
                 <w:webHidden/>
               </w:rPr>
-              <w:instrText xml:space="preserve"> PAGEREF _Toc227696403 \h </w:instrText>
+              <w:instrText xml:space="preserve"> PAGEREF _Toc227741940 \h </w:instrText>
             </w:r>
             <w:r>
               <w:rPr>
@@ -2727,7 +2727,7 @@
               <w:lang w:eastAsia="en-GB"/>
             </w:rPr>
           </w:pPr>
-          <w:hyperlink w:anchor="_Toc227696404" w:history="1">
+          <w:hyperlink w:anchor="_Toc227741941" w:history="1">
             <w:r>
               <w:rPr>
                 <w:rStyle w:val="Hyperlink"/>
@@ -2754,7 +2754,7 @@
                 <w:noProof/>
                 <w:webHidden/>
               </w:rPr>
-              <w:instrText xml:space="preserve"> PAGEREF _Toc227696404 \h </w:instrText>
+              <w:instrText xml:space="preserve"> PAGEREF _Toc227741941 \h </w:instrText>
             </w:r>
             <w:r>
               <w:rPr>
@@ -2797,7 +2797,7 @@
               <w:lang w:eastAsia="en-GB"/>
             </w:rPr>
           </w:pPr>
-          <w:hyperlink w:anchor="_Toc227696405" w:history="1">
+          <w:hyperlink w:anchor="_Toc227741942" w:history="1">
             <w:r>
               <w:rPr>
                 <w:rStyle w:val="Hyperlink"/>
@@ -2824,7 +2824,7 @@
                 <w:noProof/>
                 <w:webHidden/>
               </w:rPr>
-              <w:instrText xml:space="preserve"> PAGEREF _Toc227696405 \h </w:instrText>
+              <w:instrText xml:space="preserve"> PAGEREF _Toc227741942 \h </w:instrText>
             </w:r>
             <w:r>
               <w:rPr>
@@ -2867,7 +2867,7 @@
               <w:lang w:eastAsia="en-GB"/>
             </w:rPr>
           </w:pPr>
-          <w:hyperlink w:anchor="_Toc227696406" w:history="1">
+          <w:hyperlink w:anchor="_Toc227741943" w:history="1">
             <w:r>
               <w:rPr>
                 <w:rStyle w:val="Hyperlink"/>
@@ -2894,7 +2894,7 @@
                 <w:noProof/>
                 <w:webHidden/>
               </w:rPr>
-              <w:instrText xml:space="preserve"> PAGEREF _Toc227696406 \h </w:instrText>
+              <w:instrText xml:space="preserve"> PAGEREF _Toc227741943 \h </w:instrText>
             </w:r>
             <w:r>
               <w:rPr>
@@ -2941,7 +2941,7 @@
               <w14:ligatures w14:val="standardContextual"/>
             </w:rPr>
           </w:pPr>
-          <w:hyperlink w:anchor="_Toc227696407" w:history="1">
+          <w:hyperlink w:anchor="_Toc227741944" w:history="1">
             <w:r>
               <w:rPr>
                 <w:rStyle w:val="Hyperlink"/>
@@ -2968,7 +2968,7 @@
                 <w:noProof/>
                 <w:webHidden/>
               </w:rPr>
-              <w:instrText xml:space="preserve"> PAGEREF _Toc227696407 \h </w:instrText>
+              <w:instrText xml:space="preserve"> PAGEREF _Toc227741944 \h </w:instrText>
             </w:r>
             <w:r>
               <w:rPr>
@@ -3015,7 +3015,7 @@
               <w14:ligatures w14:val="standardContextual"/>
             </w:rPr>
           </w:pPr>
-          <w:hyperlink w:anchor="_Toc227696408" w:history="1">
+          <w:hyperlink w:anchor="_Toc227741945" w:history="1">
             <w:r>
               <w:rPr>
                 <w:rStyle w:val="Hyperlink"/>
@@ -3042,7 +3042,7 @@
                 <w:noProof/>
                 <w:webHidden/>
               </w:rPr>
-              <w:instrText xml:space="preserve"> PAGEREF _Toc227696408 \h </w:instrText>
+              <w:instrText xml:space="preserve"> PAGEREF _Toc227741945 \h </w:instrText>
             </w:r>
             <w:r>
               <w:rPr>
@@ -3089,7 +3089,7 @@
               <w14:ligatures w14:val="standardContextual"/>
             </w:rPr>
           </w:pPr>
-          <w:hyperlink w:anchor="_Toc227696409" w:history="1">
+          <w:hyperlink w:anchor="_Toc227741946" w:history="1">
             <w:r>
               <w:rPr>
                 <w:rStyle w:val="Hyperlink"/>
@@ -3116,7 +3116,7 @@
                 <w:noProof/>
                 <w:webHidden/>
               </w:rPr>
-              <w:instrText xml:space="preserve"> PAGEREF _Toc227696409 \h </w:instrText>
+              <w:instrText xml:space="preserve"> PAGEREF _Toc227741946 \h </w:instrText>
             </w:r>
             <w:r>
               <w:rPr>
@@ -3163,7 +3163,7 @@
               <w14:ligatures w14:val="standardContextual"/>
             </w:rPr>
           </w:pPr>
-          <w:hyperlink w:anchor="_Toc227696410" w:history="1">
+          <w:hyperlink w:anchor="_Toc227741947" w:history="1">
             <w:r>
               <w:rPr>
                 <w:rStyle w:val="Hyperlink"/>
@@ -3190,7 +3190,7 @@
                 <w:noProof/>
                 <w:webHidden/>
               </w:rPr>
-              <w:instrText xml:space="preserve"> PAGEREF _Toc227696410 \h </w:instrText>
+              <w:instrText xml:space="preserve"> PAGEREF _Toc227741947 \h </w:instrText>
             </w:r>
             <w:r>
               <w:rPr>
@@ -3237,7 +3237,7 @@
               <w14:ligatures w14:val="standardContextual"/>
             </w:rPr>
           </w:pPr>
-          <w:hyperlink w:anchor="_Toc227696411" w:history="1">
+          <w:hyperlink w:anchor="_Toc227741948" w:history="1">
             <w:r>
               <w:rPr>
                 <w:rStyle w:val="Hyperlink"/>
@@ -3264,7 +3264,81 @@
                 <w:noProof/>
                 <w:webHidden/>
               </w:rPr>
-              <w:instrText xml:space="preserve"> PAGEREF _Toc227696411 \h </w:instrText>
+              <w:instrText xml:space="preserve"> PAGEREF _Toc227741948 \h </w:instrText>
+            </w:r>
+            <w:r>
+              <w:rPr>
+                <w:noProof/>
+                <w:webHidden/>
+              </w:rPr>
+            </w:r>
+            <w:r>
+              <w:rPr>
+                <w:noProof/>
+                <w:webHidden/>
+              </w:rPr>
+              <w:fldChar w:fldCharType="separate"/>
+            </w:r>
+            <w:r>
+              <w:rPr>
+                <w:noProof/>
+                <w:webHidden/>
+              </w:rPr>
+              <w:t>11</w:t>
+            </w:r>
+            <w:r>
+              <w:rPr>
+                <w:noProof/>
+                <w:webHidden/>
+              </w:rPr>
+              <w:fldChar w:fldCharType="end"/>
+            </w:r>
+          </w:hyperlink>
+        </w:p>
+        <w:p>
+          <w:pPr>
+            <w:pStyle w:val="TOC3"/>
+            <w:tabs>
+              <w:tab w:val="right" w:leader="dot" w:pos="9016"/>
+            </w:tabs>
+            <w:rPr>
+              <w:rFonts w:asciiTheme="minorHAnsi" w:hAnsiTheme="minorHAnsi" w:cstheme="minorBidi"/>
+              <w:noProof/>
+              <w:kern w:val="2"/>
+              <w:sz w:val="24"/>
+              <w:szCs w:val="24"/>
+              <w:lang w:val="en-GB" w:eastAsia="en-GB"/>
+              <w14:ligatures w14:val="standardContextual"/>
+            </w:rPr>
+          </w:pPr>
+          <w:hyperlink w:anchor="_Toc227741949" w:history="1">
+            <w:r>
+              <w:rPr>
+                <w:rStyle w:val="Hyperlink"/>
+                <w:noProof/>
+              </w:rPr>
+              <w:t>3.1.4 River generation</w:t>
+            </w:r>
+            <w:r>
+              <w:rPr>
+                <w:noProof/>
+                <w:webHidden/>
+              </w:rPr>
+              <w:tab/>
+            </w:r>
+            <w:r>
+              <w:rPr>
+                <w:noProof/>
+                <w:webHidden/>
+              </w:rPr>
+              <w:fldChar w:fldCharType="begin"/>
+            </w:r>
+            <w:r>
+              <w:rPr>
+                <w:noProof/>
+                <w:webHidden/>
+              </w:rPr>
+              <w:instrText xml:space="preserve"> PAGEREF _Toc227741949 \h </w:instrText>
             </w:r>
             <w:r>
               <w:rPr>
@@ -3311,7 +3385,7 @@
               <w14:ligatures w14:val="standardContextual"/>
             </w:rPr>
           </w:pPr>
-          <w:hyperlink w:anchor="_Toc227696412" w:history="1">
+          <w:hyperlink w:anchor="_Toc227741950" w:history="1">
             <w:r>
               <w:rPr>
                 <w:rStyle w:val="Hyperlink"/>
@@ -3338,7 +3412,7 @@
                 <w:noProof/>
                 <w:webHidden/>
               </w:rPr>
-              <w:instrText xml:space="preserve"> PAGEREF _Toc227696412 \h </w:instrText>
+              <w:instrText xml:space="preserve"> PAGEREF _Toc227741950 \h </w:instrText>
             </w:r>
             <w:r>
               <w:rPr>
@@ -3395,7 +3469,7 @@
       <w:pPr>
         <w:pStyle w:val="Heading1"/>
       </w:pPr>
-      <w:bookmarkStart w:id="7" w:name="_Toc227696380"/>
+      <w:bookmarkStart w:id="7" w:name="_Toc227741917"/>
       <w:r>
         <w:t>Table of Figures</w:t>
       </w:r>
@@ -3953,7 +4027,7 @@
       <w:pPr>
         <w:pStyle w:val="Heading1"/>
       </w:pPr>
-      <w:bookmarkStart w:id="8" w:name="_Toc227696381"/>
+      <w:bookmarkStart w:id="8" w:name="_Toc227741918"/>
       <w:r>
         <w:t>Chapter 1</w:t>
       </w:r>
@@ -3981,7 +4055,7 @@
           <w:u w:val="single"/>
         </w:rPr>
       </w:pPr>
-      <w:bookmarkStart w:id="9" w:name="_Toc227696382"/>
+      <w:bookmarkStart w:id="9" w:name="_Toc227741919"/>
       <w:r>
         <w:t>1.1</w:t>
       </w:r>
@@ -4026,7 +4100,7 @@
       <w:pPr>
         <w:pStyle w:val="Heading2"/>
       </w:pPr>
-      <w:bookmarkStart w:id="10" w:name="_Toc227696383"/>
+      <w:bookmarkStart w:id="10" w:name="_Toc227741920"/>
       <w:r>
         <w:t>1.2 Aims</w:t>
       </w:r>
@@ -4042,7 +4116,7 @@
           <w:szCs w:val="28"/>
         </w:rPr>
       </w:pPr>
-      <w:bookmarkStart w:id="11" w:name="_Toc227696384"/>
+      <w:bookmarkStart w:id="11" w:name="_Toc227741921"/>
       <w:r>
         <w:rPr>
           <w:rStyle w:val="Heading2Char"/>
@@ -4087,7 +4161,7 @@
       <w:pPr>
         <w:pStyle w:val="Heading3"/>
       </w:pPr>
-      <w:bookmarkStart w:id="12" w:name="_Toc227696385"/>
+      <w:bookmarkStart w:id="12" w:name="_Toc227741922"/>
       <w:r>
         <w:lastRenderedPageBreak/>
         <w:t>1.2.2 Additional Aims</w:t>
@@ -4157,7 +4231,7 @@
       <w:pPr>
         <w:pStyle w:val="Heading2"/>
       </w:pPr>
-      <w:bookmarkStart w:id="13" w:name="_Toc227696386"/>
+      <w:bookmarkStart w:id="13" w:name="_Toc227741923"/>
       <w:r>
         <w:t>1.3 Objectives</w:t>
       </w:r>
@@ -4167,7 +4241,7 @@
       <w:pPr>
         <w:pStyle w:val="Heading3"/>
       </w:pPr>
-      <w:bookmarkStart w:id="14" w:name="_Toc227696387"/>
+      <w:bookmarkStart w:id="14" w:name="_Toc227741924"/>
       <w:r>
         <w:t>1.3.1 Scope</w:t>
       </w:r>
@@ -4238,7 +4312,7 @@
       <w:pPr>
         <w:pStyle w:val="Heading3"/>
       </w:pPr>
-      <w:bookmarkStart w:id="15" w:name="_Toc227696388"/>
+      <w:bookmarkStart w:id="15" w:name="_Toc227741925"/>
       <w:r>
         <w:t>1.3.2 Research Objectives</w:t>
       </w:r>
@@ -4283,7 +4357,7 @@
       <w:pPr>
         <w:pStyle w:val="Heading3"/>
       </w:pPr>
-      <w:bookmarkStart w:id="16" w:name="_Toc227696389"/>
+      <w:bookmarkStart w:id="16" w:name="_Toc227741926"/>
       <w:r>
         <w:t>1.3.3 Design Objectives</w:t>
       </w:r>
@@ -4405,7 +4479,7 @@
       <w:pPr>
         <w:pStyle w:val="Heading3"/>
       </w:pPr>
-      <w:bookmarkStart w:id="17" w:name="_Toc227696390"/>
+      <w:bookmarkStart w:id="17" w:name="_Toc227741927"/>
       <w:r>
         <w:t>1.3.4 Implementation Objectives</w:t>
       </w:r>
@@ -4524,7 +4598,7 @@
       <w:pPr>
         <w:pStyle w:val="Heading3"/>
       </w:pPr>
-      <w:bookmarkStart w:id="18" w:name="_Toc227696391"/>
+      <w:bookmarkStart w:id="18" w:name="_Toc227741928"/>
       <w:r>
         <w:t>1.3.5 Results, Evaluation and Playtesting Objectives</w:t>
       </w:r>
@@ -4581,7 +4655,7 @@
       <w:pPr>
         <w:pStyle w:val="Heading1"/>
       </w:pPr>
-      <w:bookmarkStart w:id="19" w:name="_Toc227696392"/>
+      <w:bookmarkStart w:id="19" w:name="_Toc227741929"/>
       <w:r>
         <w:t>Chapter 2 – Literature Survey</w:t>
       </w:r>
@@ -4591,7 +4665,7 @@
       <w:pPr>
         <w:pStyle w:val="Heading2"/>
       </w:pPr>
-      <w:bookmarkStart w:id="20" w:name="_Toc227696393"/>
+      <w:bookmarkStart w:id="20" w:name="_Toc227741930"/>
       <w:r>
         <w:t>2.1 Literature Survey Introduction</w:t>
       </w:r>
@@ -4630,7 +4704,7 @@
       <w:pPr>
         <w:pStyle w:val="Heading2"/>
       </w:pPr>
-      <w:bookmarkStart w:id="21" w:name="_Toc227696394"/>
+      <w:bookmarkStart w:id="21" w:name="_Toc227741931"/>
       <w:r>
         <w:t>2.2 Comparative Research</w:t>
       </w:r>
@@ -4648,7 +4722,7 @@
       <w:pPr>
         <w:pStyle w:val="Heading3"/>
       </w:pPr>
-      <w:bookmarkStart w:id="22" w:name="_Toc227696395"/>
+      <w:bookmarkStart w:id="22" w:name="_Toc227741932"/>
       <w:r>
         <w:t xml:space="preserve">2.2.1 </w:t>
       </w:r>
@@ -4724,7 +4798,7 @@
       <w:pPr>
         <w:pStyle w:val="Heading4"/>
       </w:pPr>
-      <w:bookmarkStart w:id="23" w:name="_Toc227696396"/>
+      <w:bookmarkStart w:id="23" w:name="_Toc227741933"/>
       <w:r>
         <w:t>2.2.1.1 Perlin Noise</w:t>
       </w:r>
@@ -5043,27 +5117,14 @@
       <w:r>
         <w:t xml:space="preserve">Figure </w:t>
       </w:r>
-      <w:r>
-        <w:fldChar w:fldCharType="begin"/>
-      </w:r>
-      <w:r>
-        <w:instrText xml:space="preserve"> SEQ Figure \* ARABIC </w:instrText>
-      </w:r>
-      <w:r>
-        <w:fldChar w:fldCharType="separate"/>
-      </w:r>
-      <w:r>
-        <w:rPr>
-          <w:noProof/>
-        </w:rPr>
-        <w:t>1</w:t>
-      </w:r>
-      <w:r>
-        <w:rPr>
-          <w:noProof/>
-        </w:rPr>
-        <w:fldChar w:fldCharType="end"/>
-      </w:r>
+      <w:fldSimple w:instr=" SEQ Figure \* ARABIC ">
+        <w:r>
+          <w:rPr>
+            <w:noProof/>
+          </w:rPr>
+          <w:t>1</w:t>
+        </w:r>
+      </w:fldSimple>
       <w:r>
         <w:t xml:space="preserve"> </w:t>
       </w:r>
@@ -5136,7 +5197,7 @@
       <w:pPr>
         <w:pStyle w:val="Heading4"/>
       </w:pPr>
-      <w:bookmarkStart w:id="25" w:name="_Toc227696397"/>
+      <w:bookmarkStart w:id="25" w:name="_Toc227741934"/>
       <w:r>
         <w:t>2.2.1.2 Binary Space Partitioning</w:t>
       </w:r>
@@ -5188,7 +5249,7 @@
       <w:pPr>
         <w:pStyle w:val="Heading4"/>
       </w:pPr>
-      <w:bookmarkStart w:id="26" w:name="_Toc227696398"/>
+      <w:bookmarkStart w:id="26" w:name="_Toc227741935"/>
       <w:r>
         <w:t>2.2.1.3 Cellular Automata</w:t>
       </w:r>
@@ -5308,7 +5369,7 @@
       <w:pPr>
         <w:pStyle w:val="Heading3"/>
       </w:pPr>
-      <w:bookmarkStart w:id="27" w:name="_Toc227696399"/>
+      <w:bookmarkStart w:id="27" w:name="_Toc227741936"/>
       <w:r>
         <w:t>2.2.2 Pathfinding</w:t>
       </w:r>
@@ -5371,7 +5432,7 @@
       <w:pPr>
         <w:pStyle w:val="Heading4"/>
       </w:pPr>
-      <w:bookmarkStart w:id="28" w:name="_Toc227696400"/>
+      <w:bookmarkStart w:id="28" w:name="_Toc227741937"/>
       <w:r>
         <w:t>2.2.2.1 Dijkstra</w:t>
       </w:r>
@@ -5456,27 +5517,14 @@
       <w:r>
         <w:t xml:space="preserve">Figure </w:t>
       </w:r>
-      <w:r>
-        <w:fldChar w:fldCharType="begin"/>
-      </w:r>
-      <w:r>
-        <w:instrText xml:space="preserve"> SEQ Figure \* ARABIC </w:instrText>
-      </w:r>
-      <w:r>
-        <w:fldChar w:fldCharType="separate"/>
-      </w:r>
-      <w:r>
-        <w:rPr>
-          <w:noProof/>
-        </w:rPr>
-        <w:t>2</w:t>
-      </w:r>
-      <w:r>
-        <w:rPr>
-          <w:noProof/>
-        </w:rPr>
-        <w:fldChar w:fldCharType="end"/>
-      </w:r>
+      <w:fldSimple w:instr=" SEQ Figure \* ARABIC ">
+        <w:r>
+          <w:rPr>
+            <w:noProof/>
+          </w:rPr>
+          <w:t>2</w:t>
+        </w:r>
+      </w:fldSimple>
       <w:r>
         <w:t xml:space="preserve"> </w:t>
       </w:r>
@@ -5559,7 +5607,7 @@
       <w:pPr>
         <w:pStyle w:val="Heading4"/>
       </w:pPr>
-      <w:bookmarkStart w:id="30" w:name="_Toc227696401"/>
+      <w:bookmarkStart w:id="30" w:name="_Toc227741938"/>
       <w:r>
         <w:t>2.2.2.2 A*</w:t>
       </w:r>
@@ -5622,7 +5670,7 @@
       <w:pPr>
         <w:pStyle w:val="Heading4"/>
       </w:pPr>
-      <w:bookmarkStart w:id="31" w:name="_Toc227696402"/>
+      <w:bookmarkStart w:id="31" w:name="_Toc227741939"/>
       <w:r>
         <w:t>2.2.2.3 Jump Point Search</w:t>
       </w:r>
@@ -5677,7 +5725,7 @@
       <w:pPr>
         <w:pStyle w:val="Heading3"/>
       </w:pPr>
-      <w:bookmarkStart w:id="32" w:name="_Toc227696403"/>
+      <w:bookmarkStart w:id="32" w:name="_Toc227741940"/>
       <w:r>
         <w:t>2.2.3 AI Integrations</w:t>
       </w:r>
@@ -5702,7 +5750,7 @@
       <w:pPr>
         <w:pStyle w:val="Heading4"/>
       </w:pPr>
-      <w:bookmarkStart w:id="33" w:name="_Toc227696404"/>
+      <w:bookmarkStart w:id="33" w:name="_Toc227741941"/>
       <w:r>
         <w:t>2.2.3.1 Neural Network</w:t>
       </w:r>
@@ -5757,7 +5805,7 @@
       <w:pPr>
         <w:pStyle w:val="Heading4"/>
       </w:pPr>
-      <w:bookmarkStart w:id="34" w:name="_Toc227696405"/>
+      <w:bookmarkStart w:id="34" w:name="_Toc227741942"/>
       <w:r>
         <w:t>2.2.3.2 Reinforcement Learning</w:t>
       </w:r>
@@ -5837,27 +5885,14 @@
       <w:r>
         <w:t xml:space="preserve">Figure </w:t>
       </w:r>
-      <w:r>
-        <w:fldChar w:fldCharType="begin"/>
-      </w:r>
-      <w:r>
-        <w:instrText xml:space="preserve"> SEQ Figure \* ARABIC </w:instrText>
-      </w:r>
-      <w:r>
-        <w:fldChar w:fldCharType="separate"/>
-      </w:r>
-      <w:r>
-        <w:rPr>
-          <w:noProof/>
-        </w:rPr>
-        <w:t>3</w:t>
-      </w:r>
-      <w:r>
-        <w:rPr>
-          <w:noProof/>
-        </w:rPr>
-        <w:fldChar w:fldCharType="end"/>
-      </w:r>
+      <w:fldSimple w:instr=" SEQ Figure \* ARABIC ">
+        <w:r>
+          <w:rPr>
+            <w:noProof/>
+          </w:rPr>
+          <w:t>3</w:t>
+        </w:r>
+      </w:fldSimple>
       <w:r>
         <w:t xml:space="preserve"> </w:t>
       </w:r>
@@ -5971,7 +6006,7 @@
       <w:pPr>
         <w:pStyle w:val="Heading4"/>
       </w:pPr>
-      <w:bookmarkStart w:id="36" w:name="_Toc227696406"/>
+      <w:bookmarkStart w:id="36" w:name="_Toc227741943"/>
       <w:r>
         <w:t>2.2.3.3 Imitation Learning</w:t>
       </w:r>
@@ -6100,7 +6135,7 @@
       <w:pPr>
         <w:pStyle w:val="Heading1"/>
       </w:pPr>
-      <w:bookmarkStart w:id="37" w:name="_Toc227696407"/>
+      <w:bookmarkStart w:id="37" w:name="_Toc227741944"/>
       <w:r>
         <w:lastRenderedPageBreak/>
         <w:t>Chapter 3 – Design</w:t>
@@ -6122,7 +6157,7 @@
       <w:pPr>
         <w:pStyle w:val="Heading2"/>
       </w:pPr>
-      <w:bookmarkStart w:id="38" w:name="_Toc227696408"/>
+      <w:bookmarkStart w:id="38" w:name="_Toc227741945"/>
       <w:r>
         <w:t xml:space="preserve">3.1 </w:t>
       </w:r>
@@ -6149,12 +6184,18 @@
       <w:pPr>
         <w:pStyle w:val="Heading3"/>
       </w:pPr>
-      <w:bookmarkStart w:id="39" w:name="_Toc227696409"/>
+      <w:bookmarkStart w:id="39" w:name="_Toc227741946"/>
       <w:r>
         <w:t xml:space="preserve">3.1.1 </w:t>
       </w:r>
       <w:r>
-        <w:t>The tile and its storage</w:t>
+        <w:t>The tile</w:t>
+      </w:r>
+      <w:r>
+        <w:t xml:space="preserve"> and</w:t>
+      </w:r>
+      <w:r>
+        <w:t xml:space="preserve"> its storage</w:t>
       </w:r>
       <w:bookmarkEnd w:id="39"/>
     </w:p>
@@ -6179,7 +6220,7 @@
           <w:noProof/>
         </w:rPr>
         <w:drawing>
-          <wp:inline distT="0" distB="0" distL="0" distR="0" wp14:anchorId="7D5A5376" wp14:editId="44C02C36">
+          <wp:inline distT="0" distB="0" distL="0" distR="0" wp14:anchorId="7D5A5376" wp14:editId="31D4EDFB">
             <wp:extent cx="2479538" cy="2261556"/>
             <wp:effectExtent l="0" t="0" r="0" b="5715"/>
             <wp:docPr id="455141339" name="Picture 4"/>
@@ -6242,25 +6283,15 @@
       <w:r>
         <w:t xml:space="preserve">Figure </w:t>
       </w:r>
-      <w:r>
-        <w:fldChar w:fldCharType="begin"/>
-      </w:r>
-      <w:r>
-        <w:instrText xml:space="preserve"> SEQ Figure \* ARABIC </w:instrText>
-      </w:r>
-      <w:r>
-        <w:fldChar w:fldCharType="separate"/>
-      </w:r>
-      <w:r>
-        <w:rPr>
-          <w:noProof/>
-        </w:rPr>
-        <w:t>4</w:t>
-      </w:r>
-      <w:bookmarkEnd w:id="40"/>
-      <w:r>
-        <w:fldChar w:fldCharType="end"/>
-      </w:r>
+      <w:fldSimple w:instr=" SEQ Figure \* ARABIC ">
+        <w:r>
+          <w:rPr>
+            <w:noProof/>
+          </w:rPr>
+          <w:t>4</w:t>
+        </w:r>
+        <w:bookmarkEnd w:id="40"/>
+      </w:fldSimple>
     </w:p>
     <w:p>
       <w:r>
@@ -6315,7 +6346,7 @@
               </w:rPr>
               <w:lastRenderedPageBreak/>
               <w:drawing>
-                <wp:inline distT="0" distB="0" distL="0" distR="0" wp14:anchorId="2A67817B" wp14:editId="5FDF18C8">
+                <wp:inline distT="0" distB="0" distL="0" distR="0" wp14:anchorId="2A67817B" wp14:editId="44F97A48">
                   <wp:extent cx="2295525" cy="2105025"/>
                   <wp:effectExtent l="0" t="0" r="0" b="0"/>
                   <wp:docPr id="1070291612" name="Picture 5"/>
@@ -6375,25 +6406,15 @@
             <w:r>
               <w:t xml:space="preserve">Figure </w:t>
             </w:r>
-            <w:r>
-              <w:fldChar w:fldCharType="begin"/>
-            </w:r>
-            <w:r>
-              <w:instrText xml:space="preserve"> SEQ Figure \* ARABIC </w:instrText>
-            </w:r>
-            <w:r>
-              <w:fldChar w:fldCharType="separate"/>
-            </w:r>
-            <w:r>
-              <w:rPr>
-                <w:noProof/>
-              </w:rPr>
-              <w:t>5</w:t>
-            </w:r>
-            <w:bookmarkEnd w:id="41"/>
-            <w:r>
-              <w:fldChar w:fldCharType="end"/>
-            </w:r>
+            <w:fldSimple w:instr=" SEQ Figure \* ARABIC ">
+              <w:r>
+                <w:rPr>
+                  <w:noProof/>
+                </w:rPr>
+                <w:t>5</w:t>
+              </w:r>
+              <w:bookmarkEnd w:id="41"/>
+            </w:fldSimple>
           </w:p>
         </w:tc>
         <w:tc>
@@ -6473,25 +6494,15 @@
             <w:r>
               <w:t xml:space="preserve">Figure </w:t>
             </w:r>
-            <w:r>
-              <w:fldChar w:fldCharType="begin"/>
-            </w:r>
-            <w:r>
-              <w:instrText xml:space="preserve"> SEQ Figure \* ARABIC </w:instrText>
-            </w:r>
-            <w:r>
-              <w:fldChar w:fldCharType="separate"/>
-            </w:r>
-            <w:r>
-              <w:rPr>
-                <w:noProof/>
-              </w:rPr>
-              <w:t>6</w:t>
-            </w:r>
-            <w:bookmarkEnd w:id="42"/>
-            <w:r>
-              <w:fldChar w:fldCharType="end"/>
-            </w:r>
+            <w:fldSimple w:instr=" SEQ Figure \* ARABIC ">
+              <w:r>
+                <w:rPr>
+                  <w:noProof/>
+                </w:rPr>
+                <w:t>6</w:t>
+              </w:r>
+              <w:bookmarkEnd w:id="42"/>
+            </w:fldSimple>
           </w:p>
         </w:tc>
       </w:tr>
@@ -6520,7 +6531,7 @@
       <w:pPr>
         <w:pStyle w:val="Heading3"/>
       </w:pPr>
-      <w:bookmarkStart w:id="43" w:name="_Toc227696410"/>
+      <w:bookmarkStart w:id="43" w:name="_Toc227741947"/>
       <w:r>
         <w:t>3.1.2 Biomes</w:t>
       </w:r>
@@ -6695,24 +6706,14 @@
       <w:r>
         <w:t xml:space="preserve">Figure </w:t>
       </w:r>
-      <w:r>
-        <w:fldChar w:fldCharType="begin"/>
-      </w:r>
-      <w:r>
-        <w:instrText xml:space="preserve"> SEQ Figure \* ARABIC </w:instrText>
-      </w:r>
-      <w:r>
-        <w:fldChar w:fldCharType="separate"/>
-      </w:r>
-      <w:r>
-        <w:rPr>
-          <w:noProof/>
-        </w:rPr>
-        <w:t>7</w:t>
-      </w:r>
-      <w:r>
-        <w:fldChar w:fldCharType="end"/>
-      </w:r>
+      <w:fldSimple w:instr=" SEQ Figure \* ARABIC ">
+        <w:r>
+          <w:rPr>
+            <w:noProof/>
+          </w:rPr>
+          <w:t>7</w:t>
+        </w:r>
+      </w:fldSimple>
       <w:r>
         <w:t xml:space="preserve"> </w:t>
       </w:r>
@@ -6794,7 +6795,7 @@
       <w:pPr>
         <w:pStyle w:val="Heading3"/>
       </w:pPr>
-      <w:bookmarkStart w:id="45" w:name="_Toc227696411"/>
+      <w:bookmarkStart w:id="45" w:name="_Toc227741948"/>
       <w:r>
         <w:t>3.1.3 Resource Distribution</w:t>
       </w:r>
@@ -6820,8 +6821,49 @@
         <w:t>This random resource approach is purely for the development speed of the project and will hopefully be succeeded by a more sophisticated distribution algorithm to ensure both the player and the AI have relatively equal access to resources.</w:t>
       </w:r>
     </w:p>
+    <w:p>
+      <w:pPr>
+        <w:pStyle w:val="Heading3"/>
+      </w:pPr>
+      <w:bookmarkStart w:id="46" w:name="_Toc227741949"/>
+      <w:r>
+        <w:t>3.1.4 River generation</w:t>
+      </w:r>
+      <w:bookmarkEnd w:id="46"/>
+    </w:p>
+    <w:p>
+      <w:r>
+        <w:t>In this game, I want to incorporate river systems to boost food growth, production, gold, and general city prosperity. There are 2 methods for this that I want to explore, edge traversal and biome switching. For edge traversal, I will be selecting a random edge on a random tile and building a river from that, labelling each edge on a hexagon from 0 to 6 and making sure they link up correctly.</w:t>
+      </w:r>
+      <w:r>
+        <w:t xml:space="preserve"> This has the hindrance of having to draw new game objects for each river.</w:t>
+      </w:r>
+    </w:p>
     <w:p/>
-    <w:bookmarkStart w:id="46" w:name="_Toc227696412" w:displacedByCustomXml="next"/>
+    <w:p>
+      <w:r>
+        <w:t xml:space="preserve">The other possible method is biome switching, this will use 3 biomes: “River Head”, “River”, and “River End”. This method requires that I select a tile, and change its biome to “River Head”, then generate the river path, making it go towards either ocean or an arbitrary length, then switch the body of the river to </w:t>
+      </w:r>
+      <w:r>
+        <w:t xml:space="preserve">the </w:t>
+      </w:r>
+      <w:r>
+        <w:t>“River”</w:t>
+      </w:r>
+      <w:r>
+        <w:t xml:space="preserve"> biome</w:t>
+      </w:r>
+      <w:r>
+        <w:t xml:space="preserve"> and then</w:t>
+      </w:r>
+      <w:r>
+        <w:t xml:space="preserve"> switching the end of the river to the “River End” biome. This has the added benefit of easily switching the tile sprite.</w:t>
+      </w:r>
+      <w:r>
+        <w:t xml:space="preserve"> </w:t>
+      </w:r>
+    </w:p>
+    <w:bookmarkStart w:id="47" w:name="_Toc227741950" w:displacedByCustomXml="next"/>
     <w:sdt>
       <w:sdtPr>
         <w:rPr>
@@ -6849,7 +6891,7 @@
           <w:r>
             <w:t>References</w:t>
           </w:r>
-          <w:bookmarkEnd w:id="46"/>
+          <w:bookmarkEnd w:id="47"/>
         </w:p>
         <w:sdt>
           <w:sdtPr>
@@ -6928,6 +6970,7 @@
                 <w:rPr>
                   <w:noProof/>
                 </w:rPr>
+                <w:lastRenderedPageBreak/>
                 <w:t xml:space="preserve">Gurney, K., 2018. </w:t>
               </w:r>
               <w:r>
@@ -7110,7 +7153,6 @@
                 <w:rPr>
                   <w:noProof/>
                 </w:rPr>
-                <w:lastRenderedPageBreak/>
                 <w:t xml:space="preserve">Orsini, M. et al., 2021. </w:t>
               </w:r>
               <w:r>
@@ -8802,6 +8844,7 @@
   <w:style w:type="character" w:default="1" w:styleId="DefaultParagraphFont">
     <w:name w:val="Default Paragraph Font"/>
     <w:uiPriority w:val="1"/>
+    <w:semiHidden/>
     <w:unhideWhenUsed/>
   </w:style>
   <w:style w:type="table" w:default="1" w:styleId="TableNormal">

</xml_diff>

<commit_message>
feat: added some more to the tile design
</commit_message>
<xml_diff>
--- a/Report.docx
+++ b/Report.docx
@@ -321,7 +321,7 @@
         <w:pStyle w:val="Heading1"/>
       </w:pPr>
       <w:bookmarkStart w:id="1" w:name="_Toc40898999"/>
-      <w:bookmarkStart w:id="2" w:name="_Toc227741913"/>
+      <w:bookmarkStart w:id="2" w:name="_Toc227742923"/>
       <w:r>
         <w:lastRenderedPageBreak/>
         <w:t>Abstract</w:t>
@@ -369,7 +369,7 @@
         <w:spacing w:after="321"/>
         <w:ind w:left="-5"/>
       </w:pPr>
-      <w:bookmarkStart w:id="3" w:name="_Toc227741914"/>
+      <w:bookmarkStart w:id="3" w:name="_Toc227742924"/>
       <w:r>
         <w:lastRenderedPageBreak/>
         <w:t>Declaration</w:t>
@@ -491,7 +491,7 @@
         <w:ind w:left="-5"/>
       </w:pPr>
       <w:bookmarkStart w:id="4" w:name="_Toc40899001"/>
-      <w:bookmarkStart w:id="5" w:name="_Toc227741915"/>
+      <w:bookmarkStart w:id="5" w:name="_Toc227742925"/>
       <w:r>
         <w:lastRenderedPageBreak/>
         <w:t>Acknowledgements</w:t>
@@ -625,7 +625,7 @@
         <w:spacing w:line="259" w:lineRule="auto"/>
       </w:pPr>
     </w:p>
-    <w:bookmarkStart w:id="6" w:name="_Toc227741916" w:displacedByCustomXml="next"/>
+    <w:bookmarkStart w:id="6" w:name="_Toc227742926" w:displacedByCustomXml="next"/>
     <w:sdt>
       <w:sdtPr>
         <w:rPr>
@@ -683,7 +683,7 @@
           <w:r>
             <w:fldChar w:fldCharType="separate"/>
           </w:r>
-          <w:hyperlink w:anchor="_Toc227741913" w:history="1">
+          <w:hyperlink w:anchor="_Toc227742923" w:history="1">
             <w:r>
               <w:rPr>
                 <w:rStyle w:val="Hyperlink"/>
@@ -710,7 +710,7 @@
                 <w:noProof/>
                 <w:webHidden/>
               </w:rPr>
-              <w:instrText xml:space="preserve"> PAGEREF _Toc227741913 \h </w:instrText>
+              <w:instrText xml:space="preserve"> PAGEREF _Toc227742923 \h </w:instrText>
             </w:r>
             <w:r>
               <w:rPr>
@@ -757,7 +757,7 @@
               <w14:ligatures w14:val="standardContextual"/>
             </w:rPr>
           </w:pPr>
-          <w:hyperlink w:anchor="_Toc227741914" w:history="1">
+          <w:hyperlink w:anchor="_Toc227742924" w:history="1">
             <w:r>
               <w:rPr>
                 <w:rStyle w:val="Hyperlink"/>
@@ -784,7 +784,7 @@
                 <w:noProof/>
                 <w:webHidden/>
               </w:rPr>
-              <w:instrText xml:space="preserve"> PAGEREF _Toc227741914 \h </w:instrText>
+              <w:instrText xml:space="preserve"> PAGEREF _Toc227742924 \h </w:instrText>
             </w:r>
             <w:r>
               <w:rPr>
@@ -831,7 +831,7 @@
               <w14:ligatures w14:val="standardContextual"/>
             </w:rPr>
           </w:pPr>
-          <w:hyperlink w:anchor="_Toc227741915" w:history="1">
+          <w:hyperlink w:anchor="_Toc227742925" w:history="1">
             <w:r>
               <w:rPr>
                 <w:rStyle w:val="Hyperlink"/>
@@ -858,7 +858,7 @@
                 <w:noProof/>
                 <w:webHidden/>
               </w:rPr>
-              <w:instrText xml:space="preserve"> PAGEREF _Toc227741915 \h </w:instrText>
+              <w:instrText xml:space="preserve"> PAGEREF _Toc227742925 \h </w:instrText>
             </w:r>
             <w:r>
               <w:rPr>
@@ -905,7 +905,7 @@
               <w14:ligatures w14:val="standardContextual"/>
             </w:rPr>
           </w:pPr>
-          <w:hyperlink w:anchor="_Toc227741916" w:history="1">
+          <w:hyperlink w:anchor="_Toc227742926" w:history="1">
             <w:r>
               <w:rPr>
                 <w:rStyle w:val="Hyperlink"/>
@@ -932,7 +932,7 @@
                 <w:noProof/>
                 <w:webHidden/>
               </w:rPr>
-              <w:instrText xml:space="preserve"> PAGEREF _Toc227741916 \h </w:instrText>
+              <w:instrText xml:space="preserve"> PAGEREF _Toc227742926 \h </w:instrText>
             </w:r>
             <w:r>
               <w:rPr>
@@ -979,7 +979,7 @@
               <w14:ligatures w14:val="standardContextual"/>
             </w:rPr>
           </w:pPr>
-          <w:hyperlink w:anchor="_Toc227741917" w:history="1">
+          <w:hyperlink w:anchor="_Toc227742927" w:history="1">
             <w:r>
               <w:rPr>
                 <w:rStyle w:val="Hyperlink"/>
@@ -1006,7 +1006,7 @@
                 <w:noProof/>
                 <w:webHidden/>
               </w:rPr>
-              <w:instrText xml:space="preserve"> PAGEREF _Toc227741917 \h </w:instrText>
+              <w:instrText xml:space="preserve"> PAGEREF _Toc227742927 \h </w:instrText>
             </w:r>
             <w:r>
               <w:rPr>
@@ -1053,7 +1053,7 @@
               <w14:ligatures w14:val="standardContextual"/>
             </w:rPr>
           </w:pPr>
-          <w:hyperlink w:anchor="_Toc227741918" w:history="1">
+          <w:hyperlink w:anchor="_Toc227742928" w:history="1">
             <w:r>
               <w:rPr>
                 <w:rStyle w:val="Hyperlink"/>
@@ -1080,7 +1080,7 @@
                 <w:noProof/>
                 <w:webHidden/>
               </w:rPr>
-              <w:instrText xml:space="preserve"> PAGEREF _Toc227741918 \h </w:instrText>
+              <w:instrText xml:space="preserve"> PAGEREF _Toc227742928 \h </w:instrText>
             </w:r>
             <w:r>
               <w:rPr>
@@ -1127,7 +1127,7 @@
               <w14:ligatures w14:val="standardContextual"/>
             </w:rPr>
           </w:pPr>
-          <w:hyperlink w:anchor="_Toc227741919" w:history="1">
+          <w:hyperlink w:anchor="_Toc227742929" w:history="1">
             <w:r>
               <w:rPr>
                 <w:rStyle w:val="Hyperlink"/>
@@ -1154,7 +1154,7 @@
                 <w:noProof/>
                 <w:webHidden/>
               </w:rPr>
-              <w:instrText xml:space="preserve"> PAGEREF _Toc227741919 \h </w:instrText>
+              <w:instrText xml:space="preserve"> PAGEREF _Toc227742929 \h </w:instrText>
             </w:r>
             <w:r>
               <w:rPr>
@@ -1201,7 +1201,7 @@
               <w14:ligatures w14:val="standardContextual"/>
             </w:rPr>
           </w:pPr>
-          <w:hyperlink w:anchor="_Toc227741920" w:history="1">
+          <w:hyperlink w:anchor="_Toc227742930" w:history="1">
             <w:r>
               <w:rPr>
                 <w:rStyle w:val="Hyperlink"/>
@@ -1228,7 +1228,7 @@
                 <w:noProof/>
                 <w:webHidden/>
               </w:rPr>
-              <w:instrText xml:space="preserve"> PAGEREF _Toc227741920 \h </w:instrText>
+              <w:instrText xml:space="preserve"> PAGEREF _Toc227742930 \h </w:instrText>
             </w:r>
             <w:r>
               <w:rPr>
@@ -1275,7 +1275,7 @@
               <w14:ligatures w14:val="standardContextual"/>
             </w:rPr>
           </w:pPr>
-          <w:hyperlink w:anchor="_Toc227741921" w:history="1">
+          <w:hyperlink w:anchor="_Toc227742931" w:history="1">
             <w:r>
               <w:rPr>
                 <w:rStyle w:val="Hyperlink"/>
@@ -1302,7 +1302,7 @@
                 <w:noProof/>
                 <w:webHidden/>
               </w:rPr>
-              <w:instrText xml:space="preserve"> PAGEREF _Toc227741921 \h </w:instrText>
+              <w:instrText xml:space="preserve"> PAGEREF _Toc227742931 \h </w:instrText>
             </w:r>
             <w:r>
               <w:rPr>
@@ -1349,7 +1349,7 @@
               <w14:ligatures w14:val="standardContextual"/>
             </w:rPr>
           </w:pPr>
-          <w:hyperlink w:anchor="_Toc227741922" w:history="1">
+          <w:hyperlink w:anchor="_Toc227742932" w:history="1">
             <w:r>
               <w:rPr>
                 <w:rStyle w:val="Hyperlink"/>
@@ -1376,7 +1376,7 @@
                 <w:noProof/>
                 <w:webHidden/>
               </w:rPr>
-              <w:instrText xml:space="preserve"> PAGEREF _Toc227741922 \h </w:instrText>
+              <w:instrText xml:space="preserve"> PAGEREF _Toc227742932 \h </w:instrText>
             </w:r>
             <w:r>
               <w:rPr>
@@ -1423,7 +1423,7 @@
               <w14:ligatures w14:val="standardContextual"/>
             </w:rPr>
           </w:pPr>
-          <w:hyperlink w:anchor="_Toc227741923" w:history="1">
+          <w:hyperlink w:anchor="_Toc227742933" w:history="1">
             <w:r>
               <w:rPr>
                 <w:rStyle w:val="Hyperlink"/>
@@ -1450,7 +1450,7 @@
                 <w:noProof/>
                 <w:webHidden/>
               </w:rPr>
-              <w:instrText xml:space="preserve"> PAGEREF _Toc227741923 \h </w:instrText>
+              <w:instrText xml:space="preserve"> PAGEREF _Toc227742933 \h </w:instrText>
             </w:r>
             <w:r>
               <w:rPr>
@@ -1497,7 +1497,7 @@
               <w14:ligatures w14:val="standardContextual"/>
             </w:rPr>
           </w:pPr>
-          <w:hyperlink w:anchor="_Toc227741924" w:history="1">
+          <w:hyperlink w:anchor="_Toc227742934" w:history="1">
             <w:r>
               <w:rPr>
                 <w:rStyle w:val="Hyperlink"/>
@@ -1524,7 +1524,7 @@
                 <w:noProof/>
                 <w:webHidden/>
               </w:rPr>
-              <w:instrText xml:space="preserve"> PAGEREF _Toc227741924 \h </w:instrText>
+              <w:instrText xml:space="preserve"> PAGEREF _Toc227742934 \h </w:instrText>
             </w:r>
             <w:r>
               <w:rPr>
@@ -1571,7 +1571,7 @@
               <w14:ligatures w14:val="standardContextual"/>
             </w:rPr>
           </w:pPr>
-          <w:hyperlink w:anchor="_Toc227741925" w:history="1">
+          <w:hyperlink w:anchor="_Toc227742935" w:history="1">
             <w:r>
               <w:rPr>
                 <w:rStyle w:val="Hyperlink"/>
@@ -1598,7 +1598,7 @@
                 <w:noProof/>
                 <w:webHidden/>
               </w:rPr>
-              <w:instrText xml:space="preserve"> PAGEREF _Toc227741925 \h </w:instrText>
+              <w:instrText xml:space="preserve"> PAGEREF _Toc227742935 \h </w:instrText>
             </w:r>
             <w:r>
               <w:rPr>
@@ -1645,7 +1645,7 @@
               <w14:ligatures w14:val="standardContextual"/>
             </w:rPr>
           </w:pPr>
-          <w:hyperlink w:anchor="_Toc227741926" w:history="1">
+          <w:hyperlink w:anchor="_Toc227742936" w:history="1">
             <w:r>
               <w:rPr>
                 <w:rStyle w:val="Hyperlink"/>
@@ -1672,7 +1672,7 @@
                 <w:noProof/>
                 <w:webHidden/>
               </w:rPr>
-              <w:instrText xml:space="preserve"> PAGEREF _Toc227741926 \h </w:instrText>
+              <w:instrText xml:space="preserve"> PAGEREF _Toc227742936 \h </w:instrText>
             </w:r>
             <w:r>
               <w:rPr>
@@ -1719,7 +1719,7 @@
               <w14:ligatures w14:val="standardContextual"/>
             </w:rPr>
           </w:pPr>
-          <w:hyperlink w:anchor="_Toc227741927" w:history="1">
+          <w:hyperlink w:anchor="_Toc227742937" w:history="1">
             <w:r>
               <w:rPr>
                 <w:rStyle w:val="Hyperlink"/>
@@ -1746,7 +1746,7 @@
                 <w:noProof/>
                 <w:webHidden/>
               </w:rPr>
-              <w:instrText xml:space="preserve"> PAGEREF _Toc227741927 \h </w:instrText>
+              <w:instrText xml:space="preserve"> PAGEREF _Toc227742937 \h </w:instrText>
             </w:r>
             <w:r>
               <w:rPr>
@@ -1793,7 +1793,7 @@
               <w14:ligatures w14:val="standardContextual"/>
             </w:rPr>
           </w:pPr>
-          <w:hyperlink w:anchor="_Toc227741928" w:history="1">
+          <w:hyperlink w:anchor="_Toc227742938" w:history="1">
             <w:r>
               <w:rPr>
                 <w:rStyle w:val="Hyperlink"/>
@@ -1820,7 +1820,7 @@
                 <w:noProof/>
                 <w:webHidden/>
               </w:rPr>
-              <w:instrText xml:space="preserve"> PAGEREF _Toc227741928 \h </w:instrText>
+              <w:instrText xml:space="preserve"> PAGEREF _Toc227742938 \h </w:instrText>
             </w:r>
             <w:r>
               <w:rPr>
@@ -1867,7 +1867,7 @@
               <w14:ligatures w14:val="standardContextual"/>
             </w:rPr>
           </w:pPr>
-          <w:hyperlink w:anchor="_Toc227741929" w:history="1">
+          <w:hyperlink w:anchor="_Toc227742939" w:history="1">
             <w:r>
               <w:rPr>
                 <w:rStyle w:val="Hyperlink"/>
@@ -1894,7 +1894,7 @@
                 <w:noProof/>
                 <w:webHidden/>
               </w:rPr>
-              <w:instrText xml:space="preserve"> PAGEREF _Toc227741929 \h </w:instrText>
+              <w:instrText xml:space="preserve"> PAGEREF _Toc227742939 \h </w:instrText>
             </w:r>
             <w:r>
               <w:rPr>
@@ -1941,7 +1941,7 @@
               <w14:ligatures w14:val="standardContextual"/>
             </w:rPr>
           </w:pPr>
-          <w:hyperlink w:anchor="_Toc227741930" w:history="1">
+          <w:hyperlink w:anchor="_Toc227742940" w:history="1">
             <w:r>
               <w:rPr>
                 <w:rStyle w:val="Hyperlink"/>
@@ -1968,7 +1968,7 @@
                 <w:noProof/>
                 <w:webHidden/>
               </w:rPr>
-              <w:instrText xml:space="preserve"> PAGEREF _Toc227741930 \h </w:instrText>
+              <w:instrText xml:space="preserve"> PAGEREF _Toc227742940 \h </w:instrText>
             </w:r>
             <w:r>
               <w:rPr>
@@ -2015,7 +2015,7 @@
               <w14:ligatures w14:val="standardContextual"/>
             </w:rPr>
           </w:pPr>
-          <w:hyperlink w:anchor="_Toc227741931" w:history="1">
+          <w:hyperlink w:anchor="_Toc227742941" w:history="1">
             <w:r>
               <w:rPr>
                 <w:rStyle w:val="Hyperlink"/>
@@ -2042,7 +2042,7 @@
                 <w:noProof/>
                 <w:webHidden/>
               </w:rPr>
-              <w:instrText xml:space="preserve"> PAGEREF _Toc227741931 \h </w:instrText>
+              <w:instrText xml:space="preserve"> PAGEREF _Toc227742941 \h </w:instrText>
             </w:r>
             <w:r>
               <w:rPr>
@@ -2089,7 +2089,7 @@
               <w14:ligatures w14:val="standardContextual"/>
             </w:rPr>
           </w:pPr>
-          <w:hyperlink w:anchor="_Toc227741932" w:history="1">
+          <w:hyperlink w:anchor="_Toc227742942" w:history="1">
             <w:r>
               <w:rPr>
                 <w:rStyle w:val="Hyperlink"/>
@@ -2116,7 +2116,7 @@
                 <w:noProof/>
                 <w:webHidden/>
               </w:rPr>
-              <w:instrText xml:space="preserve"> PAGEREF _Toc227741932 \h </w:instrText>
+              <w:instrText xml:space="preserve"> PAGEREF _Toc227742942 \h </w:instrText>
             </w:r>
             <w:r>
               <w:rPr>
@@ -2159,7 +2159,7 @@
               <w:lang w:eastAsia="en-GB"/>
             </w:rPr>
           </w:pPr>
-          <w:hyperlink w:anchor="_Toc227741933" w:history="1">
+          <w:hyperlink w:anchor="_Toc227742943" w:history="1">
             <w:r>
               <w:rPr>
                 <w:rStyle w:val="Hyperlink"/>
@@ -2186,7 +2186,7 @@
                 <w:noProof/>
                 <w:webHidden/>
               </w:rPr>
-              <w:instrText xml:space="preserve"> PAGEREF _Toc227741933 \h </w:instrText>
+              <w:instrText xml:space="preserve"> PAGEREF _Toc227742943 \h </w:instrText>
             </w:r>
             <w:r>
               <w:rPr>
@@ -2229,7 +2229,7 @@
               <w:lang w:eastAsia="en-GB"/>
             </w:rPr>
           </w:pPr>
-          <w:hyperlink w:anchor="_Toc227741934" w:history="1">
+          <w:hyperlink w:anchor="_Toc227742944" w:history="1">
             <w:r>
               <w:rPr>
                 <w:rStyle w:val="Hyperlink"/>
@@ -2256,7 +2256,7 @@
                 <w:noProof/>
                 <w:webHidden/>
               </w:rPr>
-              <w:instrText xml:space="preserve"> PAGEREF _Toc227741934 \h </w:instrText>
+              <w:instrText xml:space="preserve"> PAGEREF _Toc227742944 \h </w:instrText>
             </w:r>
             <w:r>
               <w:rPr>
@@ -2299,7 +2299,7 @@
               <w:lang w:eastAsia="en-GB"/>
             </w:rPr>
           </w:pPr>
-          <w:hyperlink w:anchor="_Toc227741935" w:history="1">
+          <w:hyperlink w:anchor="_Toc227742945" w:history="1">
             <w:r>
               <w:rPr>
                 <w:rStyle w:val="Hyperlink"/>
@@ -2326,7 +2326,7 @@
                 <w:noProof/>
                 <w:webHidden/>
               </w:rPr>
-              <w:instrText xml:space="preserve"> PAGEREF _Toc227741935 \h </w:instrText>
+              <w:instrText xml:space="preserve"> PAGEREF _Toc227742945 \h </w:instrText>
             </w:r>
             <w:r>
               <w:rPr>
@@ -2373,7 +2373,7 @@
               <w14:ligatures w14:val="standardContextual"/>
             </w:rPr>
           </w:pPr>
-          <w:hyperlink w:anchor="_Toc227741936" w:history="1">
+          <w:hyperlink w:anchor="_Toc227742946" w:history="1">
             <w:r>
               <w:rPr>
                 <w:rStyle w:val="Hyperlink"/>
@@ -2400,7 +2400,7 @@
                 <w:noProof/>
                 <w:webHidden/>
               </w:rPr>
-              <w:instrText xml:space="preserve"> PAGEREF _Toc227741936 \h </w:instrText>
+              <w:instrText xml:space="preserve"> PAGEREF _Toc227742946 \h </w:instrText>
             </w:r>
             <w:r>
               <w:rPr>
@@ -2443,7 +2443,7 @@
               <w:lang w:eastAsia="en-GB"/>
             </w:rPr>
           </w:pPr>
-          <w:hyperlink w:anchor="_Toc227741937" w:history="1">
+          <w:hyperlink w:anchor="_Toc227742947" w:history="1">
             <w:r>
               <w:rPr>
                 <w:rStyle w:val="Hyperlink"/>
@@ -2470,7 +2470,7 @@
                 <w:noProof/>
                 <w:webHidden/>
               </w:rPr>
-              <w:instrText xml:space="preserve"> PAGEREF _Toc227741937 \h </w:instrText>
+              <w:instrText xml:space="preserve"> PAGEREF _Toc227742947 \h </w:instrText>
             </w:r>
             <w:r>
               <w:rPr>
@@ -2513,7 +2513,7 @@
               <w:lang w:eastAsia="en-GB"/>
             </w:rPr>
           </w:pPr>
-          <w:hyperlink w:anchor="_Toc227741938" w:history="1">
+          <w:hyperlink w:anchor="_Toc227742948" w:history="1">
             <w:r>
               <w:rPr>
                 <w:rStyle w:val="Hyperlink"/>
@@ -2540,7 +2540,7 @@
                 <w:noProof/>
                 <w:webHidden/>
               </w:rPr>
-              <w:instrText xml:space="preserve"> PAGEREF _Toc227741938 \h </w:instrText>
+              <w:instrText xml:space="preserve"> PAGEREF _Toc227742948 \h </w:instrText>
             </w:r>
             <w:r>
               <w:rPr>
@@ -2583,7 +2583,7 @@
               <w:lang w:eastAsia="en-GB"/>
             </w:rPr>
           </w:pPr>
-          <w:hyperlink w:anchor="_Toc227741939" w:history="1">
+          <w:hyperlink w:anchor="_Toc227742949" w:history="1">
             <w:r>
               <w:rPr>
                 <w:rStyle w:val="Hyperlink"/>
@@ -2610,7 +2610,7 @@
                 <w:noProof/>
                 <w:webHidden/>
               </w:rPr>
-              <w:instrText xml:space="preserve"> PAGEREF _Toc227741939 \h </w:instrText>
+              <w:instrText xml:space="preserve"> PAGEREF _Toc227742949 \h </w:instrText>
             </w:r>
             <w:r>
               <w:rPr>
@@ -2657,7 +2657,7 @@
               <w14:ligatures w14:val="standardContextual"/>
             </w:rPr>
           </w:pPr>
-          <w:hyperlink w:anchor="_Toc227741940" w:history="1">
+          <w:hyperlink w:anchor="_Toc227742950" w:history="1">
             <w:r>
               <w:rPr>
                 <w:rStyle w:val="Hyperlink"/>
@@ -2684,7 +2684,7 @@
                 <w:noProof/>
                 <w:webHidden/>
               </w:rPr>
-              <w:instrText xml:space="preserve"> PAGEREF _Toc227741940 \h </w:instrText>
+              <w:instrText xml:space="preserve"> PAGEREF _Toc227742950 \h </w:instrText>
             </w:r>
             <w:r>
               <w:rPr>
@@ -2727,7 +2727,7 @@
               <w:lang w:eastAsia="en-GB"/>
             </w:rPr>
           </w:pPr>
-          <w:hyperlink w:anchor="_Toc227741941" w:history="1">
+          <w:hyperlink w:anchor="_Toc227742951" w:history="1">
             <w:r>
               <w:rPr>
                 <w:rStyle w:val="Hyperlink"/>
@@ -2754,7 +2754,7 @@
                 <w:noProof/>
                 <w:webHidden/>
               </w:rPr>
-              <w:instrText xml:space="preserve"> PAGEREF _Toc227741941 \h </w:instrText>
+              <w:instrText xml:space="preserve"> PAGEREF _Toc227742951 \h </w:instrText>
             </w:r>
             <w:r>
               <w:rPr>
@@ -2797,7 +2797,7 @@
               <w:lang w:eastAsia="en-GB"/>
             </w:rPr>
           </w:pPr>
-          <w:hyperlink w:anchor="_Toc227741942" w:history="1">
+          <w:hyperlink w:anchor="_Toc227742952" w:history="1">
             <w:r>
               <w:rPr>
                 <w:rStyle w:val="Hyperlink"/>
@@ -2824,7 +2824,7 @@
                 <w:noProof/>
                 <w:webHidden/>
               </w:rPr>
-              <w:instrText xml:space="preserve"> PAGEREF _Toc227741942 \h </w:instrText>
+              <w:instrText xml:space="preserve"> PAGEREF _Toc227742952 \h </w:instrText>
             </w:r>
             <w:r>
               <w:rPr>
@@ -2867,7 +2867,7 @@
               <w:lang w:eastAsia="en-GB"/>
             </w:rPr>
           </w:pPr>
-          <w:hyperlink w:anchor="_Toc227741943" w:history="1">
+          <w:hyperlink w:anchor="_Toc227742953" w:history="1">
             <w:r>
               <w:rPr>
                 <w:rStyle w:val="Hyperlink"/>
@@ -2894,7 +2894,7 @@
                 <w:noProof/>
                 <w:webHidden/>
               </w:rPr>
-              <w:instrText xml:space="preserve"> PAGEREF _Toc227741943 \h </w:instrText>
+              <w:instrText xml:space="preserve"> PAGEREF _Toc227742953 \h </w:instrText>
             </w:r>
             <w:r>
               <w:rPr>
@@ -2941,7 +2941,7 @@
               <w14:ligatures w14:val="standardContextual"/>
             </w:rPr>
           </w:pPr>
-          <w:hyperlink w:anchor="_Toc227741944" w:history="1">
+          <w:hyperlink w:anchor="_Toc227742954" w:history="1">
             <w:r>
               <w:rPr>
                 <w:rStyle w:val="Hyperlink"/>
@@ -2968,7 +2968,7 @@
                 <w:noProof/>
                 <w:webHidden/>
               </w:rPr>
-              <w:instrText xml:space="preserve"> PAGEREF _Toc227741944 \h </w:instrText>
+              <w:instrText xml:space="preserve"> PAGEREF _Toc227742954 \h </w:instrText>
             </w:r>
             <w:r>
               <w:rPr>
@@ -3015,7 +3015,7 @@
               <w14:ligatures w14:val="standardContextual"/>
             </w:rPr>
           </w:pPr>
-          <w:hyperlink w:anchor="_Toc227741945" w:history="1">
+          <w:hyperlink w:anchor="_Toc227742955" w:history="1">
             <w:r>
               <w:rPr>
                 <w:rStyle w:val="Hyperlink"/>
@@ -3042,7 +3042,7 @@
                 <w:noProof/>
                 <w:webHidden/>
               </w:rPr>
-              <w:instrText xml:space="preserve"> PAGEREF _Toc227741945 \h </w:instrText>
+              <w:instrText xml:space="preserve"> PAGEREF _Toc227742955 \h </w:instrText>
             </w:r>
             <w:r>
               <w:rPr>
@@ -3089,13 +3089,13 @@
               <w14:ligatures w14:val="standardContextual"/>
             </w:rPr>
           </w:pPr>
-          <w:hyperlink w:anchor="_Toc227741946" w:history="1">
+          <w:hyperlink w:anchor="_Toc227742956" w:history="1">
             <w:r>
               <w:rPr>
                 <w:rStyle w:val="Hyperlink"/>
                 <w:noProof/>
               </w:rPr>
-              <w:t>3.1.1 The tile and its storage</w:t>
+              <w:t>3.1.1 The tile, its storage and how it’s displayed</w:t>
             </w:r>
             <w:r>
               <w:rPr>
@@ -3116,7 +3116,7 @@
                 <w:noProof/>
                 <w:webHidden/>
               </w:rPr>
-              <w:instrText xml:space="preserve"> PAGEREF _Toc227741946 \h </w:instrText>
+              <w:instrText xml:space="preserve"> PAGEREF _Toc227742956 \h </w:instrText>
             </w:r>
             <w:r>
               <w:rPr>
@@ -3163,7 +3163,7 @@
               <w14:ligatures w14:val="standardContextual"/>
             </w:rPr>
           </w:pPr>
-          <w:hyperlink w:anchor="_Toc227741947" w:history="1">
+          <w:hyperlink w:anchor="_Toc227742957" w:history="1">
             <w:r>
               <w:rPr>
                 <w:rStyle w:val="Hyperlink"/>
@@ -3190,7 +3190,7 @@
                 <w:noProof/>
                 <w:webHidden/>
               </w:rPr>
-              <w:instrText xml:space="preserve"> PAGEREF _Toc227741947 \h </w:instrText>
+              <w:instrText xml:space="preserve"> PAGEREF _Toc227742957 \h </w:instrText>
             </w:r>
             <w:r>
               <w:rPr>
@@ -3237,7 +3237,7 @@
               <w14:ligatures w14:val="standardContextual"/>
             </w:rPr>
           </w:pPr>
-          <w:hyperlink w:anchor="_Toc227741948" w:history="1">
+          <w:hyperlink w:anchor="_Toc227742958" w:history="1">
             <w:r>
               <w:rPr>
                 <w:rStyle w:val="Hyperlink"/>
@@ -3264,7 +3264,7 @@
                 <w:noProof/>
                 <w:webHidden/>
               </w:rPr>
-              <w:instrText xml:space="preserve"> PAGEREF _Toc227741948 \h </w:instrText>
+              <w:instrText xml:space="preserve"> PAGEREF _Toc227742958 \h </w:instrText>
             </w:r>
             <w:r>
               <w:rPr>
@@ -3311,7 +3311,7 @@
               <w14:ligatures w14:val="standardContextual"/>
             </w:rPr>
           </w:pPr>
-          <w:hyperlink w:anchor="_Toc227741949" w:history="1">
+          <w:hyperlink w:anchor="_Toc227742959" w:history="1">
             <w:r>
               <w:rPr>
                 <w:rStyle w:val="Hyperlink"/>
@@ -3338,7 +3338,7 @@
                 <w:noProof/>
                 <w:webHidden/>
               </w:rPr>
-              <w:instrText xml:space="preserve"> PAGEREF _Toc227741949 \h </w:instrText>
+              <w:instrText xml:space="preserve"> PAGEREF _Toc227742959 \h </w:instrText>
             </w:r>
             <w:r>
               <w:rPr>
@@ -3385,7 +3385,7 @@
               <w14:ligatures w14:val="standardContextual"/>
             </w:rPr>
           </w:pPr>
-          <w:hyperlink w:anchor="_Toc227741950" w:history="1">
+          <w:hyperlink w:anchor="_Toc227742960" w:history="1">
             <w:r>
               <w:rPr>
                 <w:rStyle w:val="Hyperlink"/>
@@ -3412,7 +3412,7 @@
                 <w:noProof/>
                 <w:webHidden/>
               </w:rPr>
-              <w:instrText xml:space="preserve"> PAGEREF _Toc227741950 \h </w:instrText>
+              <w:instrText xml:space="preserve"> PAGEREF _Toc227742960 \h </w:instrText>
             </w:r>
             <w:r>
               <w:rPr>
@@ -3432,7 +3432,7 @@
                 <w:noProof/>
                 <w:webHidden/>
               </w:rPr>
-              <w:t>11</w:t>
+              <w:t>12</w:t>
             </w:r>
             <w:r>
               <w:rPr>
@@ -3469,7 +3469,7 @@
       <w:pPr>
         <w:pStyle w:val="Heading1"/>
       </w:pPr>
-      <w:bookmarkStart w:id="7" w:name="_Toc227741917"/>
+      <w:bookmarkStart w:id="7" w:name="_Toc227742927"/>
       <w:r>
         <w:t>Table of Figures</w:t>
       </w:r>
@@ -3511,7 +3511,7 @@
         </w:rPr>
         <w:fldChar w:fldCharType="separate"/>
       </w:r>
-      <w:hyperlink w:anchor="_Toc227695975" w:history="1">
+      <w:hyperlink w:anchor="_Toc227742916" w:history="1">
         <w:r>
           <w:rPr>
             <w:rStyle w:val="Hyperlink"/>
@@ -3538,7 +3538,7 @@
             <w:noProof/>
             <w:webHidden/>
           </w:rPr>
-          <w:instrText xml:space="preserve"> PAGEREF _Toc227695975 \h </w:instrText>
+          <w:instrText xml:space="preserve"> PAGEREF _Toc227742916 \h </w:instrText>
         </w:r>
         <w:r>
           <w:rPr>
@@ -3581,7 +3581,7 @@
           <w:lang w:eastAsia="en-GB"/>
         </w:rPr>
       </w:pPr>
-      <w:hyperlink w:anchor="_Toc227695976" w:history="1">
+      <w:hyperlink w:anchor="_Toc227742917" w:history="1">
         <w:r>
           <w:rPr>
             <w:rStyle w:val="Hyperlink"/>
@@ -3608,7 +3608,7 @@
             <w:noProof/>
             <w:webHidden/>
           </w:rPr>
-          <w:instrText xml:space="preserve"> PAGEREF _Toc227695976 \h </w:instrText>
+          <w:instrText xml:space="preserve"> PAGEREF _Toc227742917 \h </w:instrText>
         </w:r>
         <w:r>
           <w:rPr>
@@ -3651,7 +3651,7 @@
           <w:lang w:eastAsia="en-GB"/>
         </w:rPr>
       </w:pPr>
-      <w:hyperlink w:anchor="_Toc227695977" w:history="1">
+      <w:hyperlink w:anchor="_Toc227742918" w:history="1">
         <w:r>
           <w:rPr>
             <w:rStyle w:val="Hyperlink"/>
@@ -3678,7 +3678,7 @@
             <w:noProof/>
             <w:webHidden/>
           </w:rPr>
-          <w:instrText xml:space="preserve"> PAGEREF _Toc227695977 \h </w:instrText>
+          <w:instrText xml:space="preserve"> PAGEREF _Toc227742918 \h </w:instrText>
         </w:r>
         <w:r>
           <w:rPr>
@@ -3721,7 +3721,7 @@
           <w:lang w:eastAsia="en-GB"/>
         </w:rPr>
       </w:pPr>
-      <w:hyperlink w:anchor="_Toc227695978" w:history="1">
+      <w:hyperlink w:anchor="_Toc227742919" w:history="1">
         <w:r>
           <w:rPr>
             <w:rStyle w:val="Hyperlink"/>
@@ -3748,7 +3748,7 @@
             <w:noProof/>
             <w:webHidden/>
           </w:rPr>
-          <w:instrText xml:space="preserve"> PAGEREF _Toc227695978 \h </w:instrText>
+          <w:instrText xml:space="preserve"> PAGEREF _Toc227742919 \h </w:instrText>
         </w:r>
         <w:r>
           <w:rPr>
@@ -3791,7 +3791,7 @@
           <w:lang w:eastAsia="en-GB"/>
         </w:rPr>
       </w:pPr>
-      <w:hyperlink w:anchor="_Toc227695979" w:history="1">
+      <w:hyperlink w:anchor="_Toc227742920" w:history="1">
         <w:r>
           <w:rPr>
             <w:rStyle w:val="Hyperlink"/>
@@ -3818,7 +3818,7 @@
             <w:noProof/>
             <w:webHidden/>
           </w:rPr>
-          <w:instrText xml:space="preserve"> PAGEREF _Toc227695979 \h </w:instrText>
+          <w:instrText xml:space="preserve"> PAGEREF _Toc227742920 \h </w:instrText>
         </w:r>
         <w:r>
           <w:rPr>
@@ -3861,7 +3861,7 @@
           <w:lang w:eastAsia="en-GB"/>
         </w:rPr>
       </w:pPr>
-      <w:hyperlink w:anchor="_Toc227695980" w:history="1">
+      <w:hyperlink w:anchor="_Toc227742921" w:history="1">
         <w:r>
           <w:rPr>
             <w:rStyle w:val="Hyperlink"/>
@@ -3888,7 +3888,7 @@
             <w:noProof/>
             <w:webHidden/>
           </w:rPr>
-          <w:instrText xml:space="preserve"> PAGEREF _Toc227695980 \h </w:instrText>
+          <w:instrText xml:space="preserve"> PAGEREF _Toc227742921 \h </w:instrText>
         </w:r>
         <w:r>
           <w:rPr>
@@ -3931,7 +3931,7 @@
           <w:lang w:eastAsia="en-GB"/>
         </w:rPr>
       </w:pPr>
-      <w:hyperlink w:anchor="_Toc227695981" w:history="1">
+      <w:hyperlink w:anchor="_Toc227742922" w:history="1">
         <w:r>
           <w:rPr>
             <w:rStyle w:val="Hyperlink"/>
@@ -3958,7 +3958,7 @@
             <w:noProof/>
             <w:webHidden/>
           </w:rPr>
-          <w:instrText xml:space="preserve"> PAGEREF _Toc227695981 \h </w:instrText>
+          <w:instrText xml:space="preserve"> PAGEREF _Toc227742922 \h </w:instrText>
         </w:r>
         <w:r>
           <w:rPr>
@@ -3978,7 +3978,7 @@
             <w:noProof/>
             <w:webHidden/>
           </w:rPr>
-          <w:t>10</w:t>
+          <w:t>11</w:t>
         </w:r>
         <w:r>
           <w:rPr>
@@ -4027,7 +4027,7 @@
       <w:pPr>
         <w:pStyle w:val="Heading1"/>
       </w:pPr>
-      <w:bookmarkStart w:id="8" w:name="_Toc227741918"/>
+      <w:bookmarkStart w:id="8" w:name="_Toc227742928"/>
       <w:r>
         <w:t>Chapter 1</w:t>
       </w:r>
@@ -4055,7 +4055,7 @@
           <w:u w:val="single"/>
         </w:rPr>
       </w:pPr>
-      <w:bookmarkStart w:id="9" w:name="_Toc227741919"/>
+      <w:bookmarkStart w:id="9" w:name="_Toc227742929"/>
       <w:r>
         <w:t>1.1</w:t>
       </w:r>
@@ -4100,7 +4100,7 @@
       <w:pPr>
         <w:pStyle w:val="Heading2"/>
       </w:pPr>
-      <w:bookmarkStart w:id="10" w:name="_Toc227741920"/>
+      <w:bookmarkStart w:id="10" w:name="_Toc227742930"/>
       <w:r>
         <w:t>1.2 Aims</w:t>
       </w:r>
@@ -4116,7 +4116,7 @@
           <w:szCs w:val="28"/>
         </w:rPr>
       </w:pPr>
-      <w:bookmarkStart w:id="11" w:name="_Toc227741921"/>
+      <w:bookmarkStart w:id="11" w:name="_Toc227742931"/>
       <w:r>
         <w:rPr>
           <w:rStyle w:val="Heading2Char"/>
@@ -4161,7 +4161,7 @@
       <w:pPr>
         <w:pStyle w:val="Heading3"/>
       </w:pPr>
-      <w:bookmarkStart w:id="12" w:name="_Toc227741922"/>
+      <w:bookmarkStart w:id="12" w:name="_Toc227742932"/>
       <w:r>
         <w:lastRenderedPageBreak/>
         <w:t>1.2.2 Additional Aims</w:t>
@@ -4231,7 +4231,7 @@
       <w:pPr>
         <w:pStyle w:val="Heading2"/>
       </w:pPr>
-      <w:bookmarkStart w:id="13" w:name="_Toc227741923"/>
+      <w:bookmarkStart w:id="13" w:name="_Toc227742933"/>
       <w:r>
         <w:t>1.3 Objectives</w:t>
       </w:r>
@@ -4241,7 +4241,7 @@
       <w:pPr>
         <w:pStyle w:val="Heading3"/>
       </w:pPr>
-      <w:bookmarkStart w:id="14" w:name="_Toc227741924"/>
+      <w:bookmarkStart w:id="14" w:name="_Toc227742934"/>
       <w:r>
         <w:t>1.3.1 Scope</w:t>
       </w:r>
@@ -4312,7 +4312,7 @@
       <w:pPr>
         <w:pStyle w:val="Heading3"/>
       </w:pPr>
-      <w:bookmarkStart w:id="15" w:name="_Toc227741925"/>
+      <w:bookmarkStart w:id="15" w:name="_Toc227742935"/>
       <w:r>
         <w:t>1.3.2 Research Objectives</w:t>
       </w:r>
@@ -4357,7 +4357,7 @@
       <w:pPr>
         <w:pStyle w:val="Heading3"/>
       </w:pPr>
-      <w:bookmarkStart w:id="16" w:name="_Toc227741926"/>
+      <w:bookmarkStart w:id="16" w:name="_Toc227742936"/>
       <w:r>
         <w:t>1.3.3 Design Objectives</w:t>
       </w:r>
@@ -4479,7 +4479,7 @@
       <w:pPr>
         <w:pStyle w:val="Heading3"/>
       </w:pPr>
-      <w:bookmarkStart w:id="17" w:name="_Toc227741927"/>
+      <w:bookmarkStart w:id="17" w:name="_Toc227742937"/>
       <w:r>
         <w:t>1.3.4 Implementation Objectives</w:t>
       </w:r>
@@ -4598,7 +4598,7 @@
       <w:pPr>
         <w:pStyle w:val="Heading3"/>
       </w:pPr>
-      <w:bookmarkStart w:id="18" w:name="_Toc227741928"/>
+      <w:bookmarkStart w:id="18" w:name="_Toc227742938"/>
       <w:r>
         <w:t>1.3.5 Results, Evaluation and Playtesting Objectives</w:t>
       </w:r>
@@ -4655,7 +4655,7 @@
       <w:pPr>
         <w:pStyle w:val="Heading1"/>
       </w:pPr>
-      <w:bookmarkStart w:id="19" w:name="_Toc227741929"/>
+      <w:bookmarkStart w:id="19" w:name="_Toc227742939"/>
       <w:r>
         <w:t>Chapter 2 – Literature Survey</w:t>
       </w:r>
@@ -4665,7 +4665,7 @@
       <w:pPr>
         <w:pStyle w:val="Heading2"/>
       </w:pPr>
-      <w:bookmarkStart w:id="20" w:name="_Toc227741930"/>
+      <w:bookmarkStart w:id="20" w:name="_Toc227742940"/>
       <w:r>
         <w:t>2.1 Literature Survey Introduction</w:t>
       </w:r>
@@ -4704,7 +4704,7 @@
       <w:pPr>
         <w:pStyle w:val="Heading2"/>
       </w:pPr>
-      <w:bookmarkStart w:id="21" w:name="_Toc227741931"/>
+      <w:bookmarkStart w:id="21" w:name="_Toc227742941"/>
       <w:r>
         <w:t>2.2 Comparative Research</w:t>
       </w:r>
@@ -4722,7 +4722,7 @@
       <w:pPr>
         <w:pStyle w:val="Heading3"/>
       </w:pPr>
-      <w:bookmarkStart w:id="22" w:name="_Toc227741932"/>
+      <w:bookmarkStart w:id="22" w:name="_Toc227742942"/>
       <w:r>
         <w:t xml:space="preserve">2.2.1 </w:t>
       </w:r>
@@ -4798,7 +4798,7 @@
       <w:pPr>
         <w:pStyle w:val="Heading4"/>
       </w:pPr>
-      <w:bookmarkStart w:id="23" w:name="_Toc227741933"/>
+      <w:bookmarkStart w:id="23" w:name="_Toc227742943"/>
       <w:r>
         <w:t>2.2.1.1 Perlin Noise</w:t>
       </w:r>
@@ -5113,7 +5113,7 @@
         <w:pStyle w:val="Caption"/>
         <w:jc w:val="center"/>
       </w:pPr>
-      <w:bookmarkStart w:id="24" w:name="_Toc227695975"/>
+      <w:bookmarkStart w:id="24" w:name="_Toc227742916"/>
       <w:r>
         <w:t xml:space="preserve">Figure </w:t>
       </w:r>
@@ -5197,7 +5197,7 @@
       <w:pPr>
         <w:pStyle w:val="Heading4"/>
       </w:pPr>
-      <w:bookmarkStart w:id="25" w:name="_Toc227741934"/>
+      <w:bookmarkStart w:id="25" w:name="_Toc227742944"/>
       <w:r>
         <w:t>2.2.1.2 Binary Space Partitioning</w:t>
       </w:r>
@@ -5249,7 +5249,7 @@
       <w:pPr>
         <w:pStyle w:val="Heading4"/>
       </w:pPr>
-      <w:bookmarkStart w:id="26" w:name="_Toc227741935"/>
+      <w:bookmarkStart w:id="26" w:name="_Toc227742945"/>
       <w:r>
         <w:t>2.2.1.3 Cellular Automata</w:t>
       </w:r>
@@ -5369,7 +5369,7 @@
       <w:pPr>
         <w:pStyle w:val="Heading3"/>
       </w:pPr>
-      <w:bookmarkStart w:id="27" w:name="_Toc227741936"/>
+      <w:bookmarkStart w:id="27" w:name="_Toc227742946"/>
       <w:r>
         <w:t>2.2.2 Pathfinding</w:t>
       </w:r>
@@ -5432,7 +5432,7 @@
       <w:pPr>
         <w:pStyle w:val="Heading4"/>
       </w:pPr>
-      <w:bookmarkStart w:id="28" w:name="_Toc227741937"/>
+      <w:bookmarkStart w:id="28" w:name="_Toc227742947"/>
       <w:r>
         <w:t>2.2.2.1 Dijkstra</w:t>
       </w:r>
@@ -5513,7 +5513,7 @@
         <w:pStyle w:val="Caption"/>
         <w:jc w:val="center"/>
       </w:pPr>
-      <w:bookmarkStart w:id="29" w:name="_Toc227695976"/>
+      <w:bookmarkStart w:id="29" w:name="_Toc227742917"/>
       <w:r>
         <w:t xml:space="preserve">Figure </w:t>
       </w:r>
@@ -5607,7 +5607,7 @@
       <w:pPr>
         <w:pStyle w:val="Heading4"/>
       </w:pPr>
-      <w:bookmarkStart w:id="30" w:name="_Toc227741938"/>
+      <w:bookmarkStart w:id="30" w:name="_Toc227742948"/>
       <w:r>
         <w:t>2.2.2.2 A*</w:t>
       </w:r>
@@ -5670,7 +5670,7 @@
       <w:pPr>
         <w:pStyle w:val="Heading4"/>
       </w:pPr>
-      <w:bookmarkStart w:id="31" w:name="_Toc227741939"/>
+      <w:bookmarkStart w:id="31" w:name="_Toc227742949"/>
       <w:r>
         <w:t>2.2.2.3 Jump Point Search</w:t>
       </w:r>
@@ -5725,7 +5725,7 @@
       <w:pPr>
         <w:pStyle w:val="Heading3"/>
       </w:pPr>
-      <w:bookmarkStart w:id="32" w:name="_Toc227741940"/>
+      <w:bookmarkStart w:id="32" w:name="_Toc227742950"/>
       <w:r>
         <w:t>2.2.3 AI Integrations</w:t>
       </w:r>
@@ -5750,7 +5750,7 @@
       <w:pPr>
         <w:pStyle w:val="Heading4"/>
       </w:pPr>
-      <w:bookmarkStart w:id="33" w:name="_Toc227741941"/>
+      <w:bookmarkStart w:id="33" w:name="_Toc227742951"/>
       <w:r>
         <w:t>2.2.3.1 Neural Network</w:t>
       </w:r>
@@ -5805,7 +5805,7 @@
       <w:pPr>
         <w:pStyle w:val="Heading4"/>
       </w:pPr>
-      <w:bookmarkStart w:id="34" w:name="_Toc227741942"/>
+      <w:bookmarkStart w:id="34" w:name="_Toc227742952"/>
       <w:r>
         <w:t>2.2.3.2 Reinforcement Learning</w:t>
       </w:r>
@@ -5881,7 +5881,7 @@
         <w:pStyle w:val="Caption"/>
         <w:jc w:val="center"/>
       </w:pPr>
-      <w:bookmarkStart w:id="35" w:name="_Toc227695977"/>
+      <w:bookmarkStart w:id="35" w:name="_Toc227742918"/>
       <w:r>
         <w:t xml:space="preserve">Figure </w:t>
       </w:r>
@@ -6006,7 +6006,7 @@
       <w:pPr>
         <w:pStyle w:val="Heading4"/>
       </w:pPr>
-      <w:bookmarkStart w:id="36" w:name="_Toc227741943"/>
+      <w:bookmarkStart w:id="36" w:name="_Toc227742953"/>
       <w:r>
         <w:t>2.2.3.3 Imitation Learning</w:t>
       </w:r>
@@ -6135,7 +6135,7 @@
       <w:pPr>
         <w:pStyle w:val="Heading1"/>
       </w:pPr>
-      <w:bookmarkStart w:id="37" w:name="_Toc227741944"/>
+      <w:bookmarkStart w:id="37" w:name="_Toc227742954"/>
       <w:r>
         <w:lastRenderedPageBreak/>
         <w:t>Chapter 3 – Design</w:t>
@@ -6157,7 +6157,7 @@
       <w:pPr>
         <w:pStyle w:val="Heading2"/>
       </w:pPr>
-      <w:bookmarkStart w:id="38" w:name="_Toc227741945"/>
+      <w:bookmarkStart w:id="38" w:name="_Toc227742955"/>
       <w:r>
         <w:t xml:space="preserve">3.1 </w:t>
       </w:r>
@@ -6184,7 +6184,7 @@
       <w:pPr>
         <w:pStyle w:val="Heading3"/>
       </w:pPr>
-      <w:bookmarkStart w:id="39" w:name="_Toc227741946"/>
+      <w:bookmarkStart w:id="39" w:name="_Toc227742956"/>
       <w:r>
         <w:t xml:space="preserve">3.1.1 </w:t>
       </w:r>
@@ -6192,10 +6192,13 @@
         <w:t>The tile</w:t>
       </w:r>
       <w:r>
-        <w:t xml:space="preserve"> and</w:t>
+        <w:t>,</w:t>
       </w:r>
       <w:r>
         <w:t xml:space="preserve"> its storage</w:t>
+      </w:r>
+      <w:r>
+        <w:t xml:space="preserve"> and how it’s displayed</w:t>
       </w:r>
       <w:bookmarkEnd w:id="39"/>
     </w:p>
@@ -6279,7 +6282,7 @@
         <w:pStyle w:val="Caption"/>
         <w:jc w:val="center"/>
       </w:pPr>
-      <w:bookmarkStart w:id="40" w:name="_Toc227695978"/>
+      <w:bookmarkStart w:id="40" w:name="_Toc227742919"/>
       <w:r>
         <w:t xml:space="preserve">Figure </w:t>
       </w:r>
@@ -6402,7 +6405,7 @@
               <w:pStyle w:val="Caption"/>
               <w:jc w:val="center"/>
             </w:pPr>
-            <w:bookmarkStart w:id="41" w:name="_Toc227695979"/>
+            <w:bookmarkStart w:id="41" w:name="_Toc227742920"/>
             <w:r>
               <w:t xml:space="preserve">Figure </w:t>
             </w:r>
@@ -6490,7 +6493,7 @@
               <w:pStyle w:val="Caption"/>
               <w:jc w:val="center"/>
             </w:pPr>
-            <w:bookmarkStart w:id="42" w:name="_Toc227695980"/>
+            <w:bookmarkStart w:id="42" w:name="_Toc227742921"/>
             <w:r>
               <w:t xml:space="preserve">Figure </w:t>
             </w:r>
@@ -6527,11 +6530,32 @@
         <w:t xml:space="preserve">the tiles. Figure 6 shows how I will be rearranging the tiles so that they tesselate. The coordinates for these tiles are going to be bottom left based meaning that the tiles will be created from the bottom left towards the top right. </w:t>
       </w:r>
     </w:p>
+    <w:p/>
+    <w:p>
+      <w:r>
+        <w:t>There are 2 ways that I can easily display the tiles to the user: Prefabs, and Mesh Generation. Prefabs would be significantly easier to incorporate, allowing me to create a prefab for each biome and instantiating each prefab where needed. This has many benefits such as making development of this feature very quick, simplicity, code readability and making pathfinding easier through direct ray-casting. This could have potential drawbacks such as performance losses from having thousands to tens of thousands of GameObjects in a scene.</w:t>
+      </w:r>
+    </w:p>
+    <w:p/>
+    <w:p>
+      <w:r>
+        <w:t xml:space="preserve">The other method is mesh generation, this method requires having the world split into chunks and creating a mesh for each chunk, with </w:t>
+      </w:r>
+      <w:r>
+        <w:t>all</w:t>
+      </w:r>
+      <w:r>
+        <w:t xml:space="preserve"> the hex’s in. This has the benefit of having significantly increased performance but has many drawbacks,</w:t>
+      </w:r>
+      <w:r>
+        <w:t xml:space="preserve"> such as being more complex for development, it’s more complex, less readable, and makes ray-casting positions harder as I will need to develop converter functions to convert my click position to the appropriate world position instead of using the tile world position. </w:t>
+      </w:r>
+    </w:p>
     <w:p>
       <w:pPr>
         <w:pStyle w:val="Heading3"/>
       </w:pPr>
-      <w:bookmarkStart w:id="43" w:name="_Toc227741947"/>
+      <w:bookmarkStart w:id="43" w:name="_Toc227742957"/>
       <w:r>
         <w:t>3.1.2 Biomes</w:t>
       </w:r>
@@ -6702,7 +6726,7 @@
         <w:pStyle w:val="Caption"/>
         <w:jc w:val="center"/>
       </w:pPr>
-      <w:bookmarkStart w:id="44" w:name="_Toc227695981"/>
+      <w:bookmarkStart w:id="44" w:name="_Toc227742922"/>
       <w:r>
         <w:t xml:space="preserve">Figure </w:t>
       </w:r>
@@ -6770,78 +6794,78 @@
         <w:t xml:space="preserve">For my game, I am choosing to have 5 true biomes: Deep water, shallow water, sand, grass and snow. Each of these biomes are going to be abundant in different resources and </w:t>
       </w:r>
       <w:r>
-        <w:t xml:space="preserve">have </w:t>
+        <w:t xml:space="preserve">have very different base tile variables. For example, grassland tiles will contain more production than a sand </w:t>
+      </w:r>
+      <w:proofErr w:type="gramStart"/>
+      <w:r>
+        <w:t>tile</w:t>
+      </w:r>
+      <w:proofErr w:type="gramEnd"/>
+      <w:r>
+        <w:t xml:space="preserve"> but a sand tile will have more gold than a grassland tile</w:t>
+      </w:r>
+      <w:r>
+        <w:t>.</w:t>
+      </w:r>
+      <w:r>
+        <w:t xml:space="preserve"> This should balance out the resource distribution enough that players seek grassland at the beginning of the game.</w:t>
+      </w:r>
+    </w:p>
+    <w:p>
+      <w:pPr>
+        <w:pStyle w:val="Heading3"/>
+      </w:pPr>
+      <w:bookmarkStart w:id="45" w:name="_Toc227742958"/>
+      <w:r>
+        <w:t>3.1.3 Resource Distribution</w:t>
+      </w:r>
+      <w:bookmarkEnd w:id="45"/>
+    </w:p>
+    <w:p>
+      <w:r>
+        <w:t xml:space="preserve">Every tile in the game has a Resource variable inside its class. This is so that resources can add and remove resources from tiles when needed. This will include the ability for the player to consume the entire tiles resources on 1 turn, destroying the resource on the tile. The list of </w:t>
+      </w:r>
+      <w:r>
+        <w:t>resources available</w:t>
+      </w:r>
+      <w:r>
+        <w:t xml:space="preserve"> is as follows: Wheat, Fish, Cows, Horses, Stone, and Iron.</w:t>
+      </w:r>
+    </w:p>
+    <w:p/>
+    <w:p>
+      <w:r>
+        <w:t xml:space="preserve">Initially resources will be placed at random with some rules, such as fish only appearing on water tiles and wheat and cows only appearing in grassland. Other resources such as stone and iron will be available on any land tiles. </w:t>
+      </w:r>
+      <w:r>
+        <w:t>This random resource approach is purely for the development speed of the project and will hopefully be succeeded by a more sophisticated distribution algorithm to ensure both the player and the AI have relatively equal access to resources.</w:t>
+      </w:r>
+    </w:p>
+    <w:p>
+      <w:pPr>
+        <w:pStyle w:val="Heading3"/>
+      </w:pPr>
+      <w:bookmarkStart w:id="46" w:name="_Toc227742959"/>
+      <w:r>
+        <w:t>3.1.4 River generation</w:t>
+      </w:r>
+      <w:bookmarkEnd w:id="46"/>
+    </w:p>
+    <w:p>
+      <w:r>
+        <w:t xml:space="preserve">In this game, I want to incorporate river systems to boost food growth, production, gold, and general city prosperity. There are 2 methods for this that I want to explore, edge traversal </w:t>
       </w:r>
       <w:r>
         <w:lastRenderedPageBreak/>
-        <w:t xml:space="preserve">very different base tile variables. For example, grassland tiles will contain more production than a sand </w:t>
-      </w:r>
-      <w:proofErr w:type="gramStart"/>
-      <w:r>
-        <w:t>tile</w:t>
-      </w:r>
-      <w:proofErr w:type="gramEnd"/>
-      <w:r>
-        <w:t xml:space="preserve"> but a sand tile will have more gold than a grassland tile</w:t>
-      </w:r>
-      <w:r>
-        <w:t>.</w:t>
-      </w:r>
-      <w:r>
-        <w:t xml:space="preserve"> This should balance out the resource distribution enough that players seek grassland at the beginning of the game.</w:t>
-      </w:r>
-    </w:p>
-    <w:p>
-      <w:pPr>
-        <w:pStyle w:val="Heading3"/>
-      </w:pPr>
-      <w:bookmarkStart w:id="45" w:name="_Toc227741948"/>
-      <w:r>
-        <w:t>3.1.3 Resource Distribution</w:t>
-      </w:r>
-      <w:bookmarkEnd w:id="45"/>
-    </w:p>
-    <w:p>
-      <w:r>
-        <w:t xml:space="preserve">Every tile in the game has a Resource variable inside its class. This is so that resources can add and remove resources from tiles when needed. This will include the ability for the player to consume the entire tiles resources on 1 turn, destroying the resource on the tile. The list of </w:t>
-      </w:r>
-      <w:r>
-        <w:t>resources available</w:t>
-      </w:r>
-      <w:r>
-        <w:t xml:space="preserve"> is as follows: Wheat, Fish, Cows, Horses, Stone, and Iron.</w:t>
+        <w:t>and biome switching. For edge traversal, I will be selecting a random edge on a random tile and building a river from that, labelling each edge on a hexagon from 0 to 6 and making sure they link up correctly.</w:t>
+      </w:r>
+      <w:r>
+        <w:t xml:space="preserve"> This has the hindrance of having to draw new game objects for each river.</w:t>
       </w:r>
     </w:p>
     <w:p/>
     <w:p>
       <w:r>
-        <w:t xml:space="preserve">Initially resources will be placed at random with some rules, such as fish only appearing on water tiles and wheat and cows only appearing in grassland. Other resources such as stone and iron will be available on any land tiles. </w:t>
-      </w:r>
-      <w:r>
-        <w:t>This random resource approach is purely for the development speed of the project and will hopefully be succeeded by a more sophisticated distribution algorithm to ensure both the player and the AI have relatively equal access to resources.</w:t>
-      </w:r>
-    </w:p>
-    <w:p>
-      <w:pPr>
-        <w:pStyle w:val="Heading3"/>
-      </w:pPr>
-      <w:bookmarkStart w:id="46" w:name="_Toc227741949"/>
-      <w:r>
-        <w:t>3.1.4 River generation</w:t>
-      </w:r>
-      <w:bookmarkEnd w:id="46"/>
-    </w:p>
-    <w:p>
-      <w:r>
-        <w:t>In this game, I want to incorporate river systems to boost food growth, production, gold, and general city prosperity. There are 2 methods for this that I want to explore, edge traversal and biome switching. For edge traversal, I will be selecting a random edge on a random tile and building a river from that, labelling each edge on a hexagon from 0 to 6 and making sure they link up correctly.</w:t>
-      </w:r>
-      <w:r>
-        <w:t xml:space="preserve"> This has the hindrance of having to draw new game objects for each river.</w:t>
-      </w:r>
-    </w:p>
-    <w:p/>
-    <w:p>
-      <w:r>
         <w:t xml:space="preserve">The other possible method is biome switching, this will use 3 biomes: “River Head”, “River”, and “River End”. This method requires that I select a tile, and change its biome to “River Head”, then generate the river path, making it go towards either ocean or an arbitrary length, then switch the body of the river to </w:t>
       </w:r>
       <w:r>
@@ -6863,7 +6887,7 @@
         <w:t xml:space="preserve"> </w:t>
       </w:r>
     </w:p>
-    <w:bookmarkStart w:id="47" w:name="_Toc227741950" w:displacedByCustomXml="next"/>
+    <w:bookmarkStart w:id="47" w:name="_Toc227742960" w:displacedByCustomXml="next"/>
     <w:sdt>
       <w:sdtPr>
         <w:rPr>
@@ -6970,7 +6994,6 @@
                 <w:rPr>
                   <w:noProof/>
                 </w:rPr>
-                <w:lastRenderedPageBreak/>
                 <w:t xml:space="preserve">Gurney, K., 2018. </w:t>
               </w:r>
               <w:r>
@@ -7230,6 +7253,7 @@
                 <w:rPr>
                   <w:noProof/>
                 </w:rPr>
+                <w:lastRenderedPageBreak/>
                 <w:t xml:space="preserve">Wikipedia, n.d. </w:t>
               </w:r>
               <w:r>

</xml_diff>

<commit_message>
feat: Pathfinding design intro written
</commit_message>
<xml_diff>
--- a/Report.docx
+++ b/Report.docx
@@ -321,7 +321,7 @@
         <w:pStyle w:val="Heading1"/>
       </w:pPr>
       <w:bookmarkStart w:id="1" w:name="_Toc40898999"/>
-      <w:bookmarkStart w:id="2" w:name="_Toc227742923"/>
+      <w:bookmarkStart w:id="2" w:name="_Toc227743241"/>
       <w:r>
         <w:lastRenderedPageBreak/>
         <w:t>Abstract</w:t>
@@ -369,7 +369,7 @@
         <w:spacing w:after="321"/>
         <w:ind w:left="-5"/>
       </w:pPr>
-      <w:bookmarkStart w:id="3" w:name="_Toc227742924"/>
+      <w:bookmarkStart w:id="3" w:name="_Toc227743242"/>
       <w:r>
         <w:lastRenderedPageBreak/>
         <w:t>Declaration</w:t>
@@ -491,7 +491,7 @@
         <w:ind w:left="-5"/>
       </w:pPr>
       <w:bookmarkStart w:id="4" w:name="_Toc40899001"/>
-      <w:bookmarkStart w:id="5" w:name="_Toc227742925"/>
+      <w:bookmarkStart w:id="5" w:name="_Toc227743243"/>
       <w:r>
         <w:lastRenderedPageBreak/>
         <w:t>Acknowledgements</w:t>
@@ -625,7 +625,7 @@
         <w:spacing w:line="259" w:lineRule="auto"/>
       </w:pPr>
     </w:p>
-    <w:bookmarkStart w:id="6" w:name="_Toc227742926" w:displacedByCustomXml="next"/>
+    <w:bookmarkStart w:id="6" w:name="_Toc227743244" w:displacedByCustomXml="next"/>
     <w:sdt>
       <w:sdtPr>
         <w:rPr>
@@ -683,7 +683,7 @@
           <w:r>
             <w:fldChar w:fldCharType="separate"/>
           </w:r>
-          <w:hyperlink w:anchor="_Toc227742923" w:history="1">
+          <w:hyperlink w:anchor="_Toc227743241" w:history="1">
             <w:r>
               <w:rPr>
                 <w:rStyle w:val="Hyperlink"/>
@@ -710,7 +710,7 @@
                 <w:noProof/>
                 <w:webHidden/>
               </w:rPr>
-              <w:instrText xml:space="preserve"> PAGEREF _Toc227742923 \h </w:instrText>
+              <w:instrText xml:space="preserve"> PAGEREF _Toc227743241 \h </w:instrText>
             </w:r>
             <w:r>
               <w:rPr>
@@ -757,7 +757,7 @@
               <w14:ligatures w14:val="standardContextual"/>
             </w:rPr>
           </w:pPr>
-          <w:hyperlink w:anchor="_Toc227742924" w:history="1">
+          <w:hyperlink w:anchor="_Toc227743242" w:history="1">
             <w:r>
               <w:rPr>
                 <w:rStyle w:val="Hyperlink"/>
@@ -784,7 +784,7 @@
                 <w:noProof/>
                 <w:webHidden/>
               </w:rPr>
-              <w:instrText xml:space="preserve"> PAGEREF _Toc227742924 \h </w:instrText>
+              <w:instrText xml:space="preserve"> PAGEREF _Toc227743242 \h </w:instrText>
             </w:r>
             <w:r>
               <w:rPr>
@@ -831,7 +831,7 @@
               <w14:ligatures w14:val="standardContextual"/>
             </w:rPr>
           </w:pPr>
-          <w:hyperlink w:anchor="_Toc227742925" w:history="1">
+          <w:hyperlink w:anchor="_Toc227743243" w:history="1">
             <w:r>
               <w:rPr>
                 <w:rStyle w:val="Hyperlink"/>
@@ -858,7 +858,7 @@
                 <w:noProof/>
                 <w:webHidden/>
               </w:rPr>
-              <w:instrText xml:space="preserve"> PAGEREF _Toc227742925 \h </w:instrText>
+              <w:instrText xml:space="preserve"> PAGEREF _Toc227743243 \h </w:instrText>
             </w:r>
             <w:r>
               <w:rPr>
@@ -905,7 +905,7 @@
               <w14:ligatures w14:val="standardContextual"/>
             </w:rPr>
           </w:pPr>
-          <w:hyperlink w:anchor="_Toc227742926" w:history="1">
+          <w:hyperlink w:anchor="_Toc227743244" w:history="1">
             <w:r>
               <w:rPr>
                 <w:rStyle w:val="Hyperlink"/>
@@ -932,7 +932,7 @@
                 <w:noProof/>
                 <w:webHidden/>
               </w:rPr>
-              <w:instrText xml:space="preserve"> PAGEREF _Toc227742926 \h </w:instrText>
+              <w:instrText xml:space="preserve"> PAGEREF _Toc227743244 \h </w:instrText>
             </w:r>
             <w:r>
               <w:rPr>
@@ -979,7 +979,7 @@
               <w14:ligatures w14:val="standardContextual"/>
             </w:rPr>
           </w:pPr>
-          <w:hyperlink w:anchor="_Toc227742927" w:history="1">
+          <w:hyperlink w:anchor="_Toc227743245" w:history="1">
             <w:r>
               <w:rPr>
                 <w:rStyle w:val="Hyperlink"/>
@@ -1006,7 +1006,7 @@
                 <w:noProof/>
                 <w:webHidden/>
               </w:rPr>
-              <w:instrText xml:space="preserve"> PAGEREF _Toc227742927 \h </w:instrText>
+              <w:instrText xml:space="preserve"> PAGEREF _Toc227743245 \h </w:instrText>
             </w:r>
             <w:r>
               <w:rPr>
@@ -1053,7 +1053,7 @@
               <w14:ligatures w14:val="standardContextual"/>
             </w:rPr>
           </w:pPr>
-          <w:hyperlink w:anchor="_Toc227742928" w:history="1">
+          <w:hyperlink w:anchor="_Toc227743246" w:history="1">
             <w:r>
               <w:rPr>
                 <w:rStyle w:val="Hyperlink"/>
@@ -1080,7 +1080,7 @@
                 <w:noProof/>
                 <w:webHidden/>
               </w:rPr>
-              <w:instrText xml:space="preserve"> PAGEREF _Toc227742928 \h </w:instrText>
+              <w:instrText xml:space="preserve"> PAGEREF _Toc227743246 \h </w:instrText>
             </w:r>
             <w:r>
               <w:rPr>
@@ -1127,7 +1127,7 @@
               <w14:ligatures w14:val="standardContextual"/>
             </w:rPr>
           </w:pPr>
-          <w:hyperlink w:anchor="_Toc227742929" w:history="1">
+          <w:hyperlink w:anchor="_Toc227743247" w:history="1">
             <w:r>
               <w:rPr>
                 <w:rStyle w:val="Hyperlink"/>
@@ -1154,7 +1154,7 @@
                 <w:noProof/>
                 <w:webHidden/>
               </w:rPr>
-              <w:instrText xml:space="preserve"> PAGEREF _Toc227742929 \h </w:instrText>
+              <w:instrText xml:space="preserve"> PAGEREF _Toc227743247 \h </w:instrText>
             </w:r>
             <w:r>
               <w:rPr>
@@ -1201,7 +1201,7 @@
               <w14:ligatures w14:val="standardContextual"/>
             </w:rPr>
           </w:pPr>
-          <w:hyperlink w:anchor="_Toc227742930" w:history="1">
+          <w:hyperlink w:anchor="_Toc227743248" w:history="1">
             <w:r>
               <w:rPr>
                 <w:rStyle w:val="Hyperlink"/>
@@ -1228,7 +1228,7 @@
                 <w:noProof/>
                 <w:webHidden/>
               </w:rPr>
-              <w:instrText xml:space="preserve"> PAGEREF _Toc227742930 \h </w:instrText>
+              <w:instrText xml:space="preserve"> PAGEREF _Toc227743248 \h </w:instrText>
             </w:r>
             <w:r>
               <w:rPr>
@@ -1275,7 +1275,7 @@
               <w14:ligatures w14:val="standardContextual"/>
             </w:rPr>
           </w:pPr>
-          <w:hyperlink w:anchor="_Toc227742931" w:history="1">
+          <w:hyperlink w:anchor="_Toc227743249" w:history="1">
             <w:r>
               <w:rPr>
                 <w:rStyle w:val="Hyperlink"/>
@@ -1302,7 +1302,7 @@
                 <w:noProof/>
                 <w:webHidden/>
               </w:rPr>
-              <w:instrText xml:space="preserve"> PAGEREF _Toc227742931 \h </w:instrText>
+              <w:instrText xml:space="preserve"> PAGEREF _Toc227743249 \h </w:instrText>
             </w:r>
             <w:r>
               <w:rPr>
@@ -1349,7 +1349,7 @@
               <w14:ligatures w14:val="standardContextual"/>
             </w:rPr>
           </w:pPr>
-          <w:hyperlink w:anchor="_Toc227742932" w:history="1">
+          <w:hyperlink w:anchor="_Toc227743250" w:history="1">
             <w:r>
               <w:rPr>
                 <w:rStyle w:val="Hyperlink"/>
@@ -1376,7 +1376,7 @@
                 <w:noProof/>
                 <w:webHidden/>
               </w:rPr>
-              <w:instrText xml:space="preserve"> PAGEREF _Toc227742932 \h </w:instrText>
+              <w:instrText xml:space="preserve"> PAGEREF _Toc227743250 \h </w:instrText>
             </w:r>
             <w:r>
               <w:rPr>
@@ -1423,7 +1423,7 @@
               <w14:ligatures w14:val="standardContextual"/>
             </w:rPr>
           </w:pPr>
-          <w:hyperlink w:anchor="_Toc227742933" w:history="1">
+          <w:hyperlink w:anchor="_Toc227743251" w:history="1">
             <w:r>
               <w:rPr>
                 <w:rStyle w:val="Hyperlink"/>
@@ -1450,7 +1450,7 @@
                 <w:noProof/>
                 <w:webHidden/>
               </w:rPr>
-              <w:instrText xml:space="preserve"> PAGEREF _Toc227742933 \h </w:instrText>
+              <w:instrText xml:space="preserve"> PAGEREF _Toc227743251 \h </w:instrText>
             </w:r>
             <w:r>
               <w:rPr>
@@ -1497,7 +1497,7 @@
               <w14:ligatures w14:val="standardContextual"/>
             </w:rPr>
           </w:pPr>
-          <w:hyperlink w:anchor="_Toc227742934" w:history="1">
+          <w:hyperlink w:anchor="_Toc227743252" w:history="1">
             <w:r>
               <w:rPr>
                 <w:rStyle w:val="Hyperlink"/>
@@ -1524,7 +1524,7 @@
                 <w:noProof/>
                 <w:webHidden/>
               </w:rPr>
-              <w:instrText xml:space="preserve"> PAGEREF _Toc227742934 \h </w:instrText>
+              <w:instrText xml:space="preserve"> PAGEREF _Toc227743252 \h </w:instrText>
             </w:r>
             <w:r>
               <w:rPr>
@@ -1571,7 +1571,7 @@
               <w14:ligatures w14:val="standardContextual"/>
             </w:rPr>
           </w:pPr>
-          <w:hyperlink w:anchor="_Toc227742935" w:history="1">
+          <w:hyperlink w:anchor="_Toc227743253" w:history="1">
             <w:r>
               <w:rPr>
                 <w:rStyle w:val="Hyperlink"/>
@@ -1598,7 +1598,7 @@
                 <w:noProof/>
                 <w:webHidden/>
               </w:rPr>
-              <w:instrText xml:space="preserve"> PAGEREF _Toc227742935 \h </w:instrText>
+              <w:instrText xml:space="preserve"> PAGEREF _Toc227743253 \h </w:instrText>
             </w:r>
             <w:r>
               <w:rPr>
@@ -1645,7 +1645,7 @@
               <w14:ligatures w14:val="standardContextual"/>
             </w:rPr>
           </w:pPr>
-          <w:hyperlink w:anchor="_Toc227742936" w:history="1">
+          <w:hyperlink w:anchor="_Toc227743254" w:history="1">
             <w:r>
               <w:rPr>
                 <w:rStyle w:val="Hyperlink"/>
@@ -1672,7 +1672,7 @@
                 <w:noProof/>
                 <w:webHidden/>
               </w:rPr>
-              <w:instrText xml:space="preserve"> PAGEREF _Toc227742936 \h </w:instrText>
+              <w:instrText xml:space="preserve"> PAGEREF _Toc227743254 \h </w:instrText>
             </w:r>
             <w:r>
               <w:rPr>
@@ -1719,7 +1719,7 @@
               <w14:ligatures w14:val="standardContextual"/>
             </w:rPr>
           </w:pPr>
-          <w:hyperlink w:anchor="_Toc227742937" w:history="1">
+          <w:hyperlink w:anchor="_Toc227743255" w:history="1">
             <w:r>
               <w:rPr>
                 <w:rStyle w:val="Hyperlink"/>
@@ -1746,7 +1746,7 @@
                 <w:noProof/>
                 <w:webHidden/>
               </w:rPr>
-              <w:instrText xml:space="preserve"> PAGEREF _Toc227742937 \h </w:instrText>
+              <w:instrText xml:space="preserve"> PAGEREF _Toc227743255 \h </w:instrText>
             </w:r>
             <w:r>
               <w:rPr>
@@ -1793,7 +1793,7 @@
               <w14:ligatures w14:val="standardContextual"/>
             </w:rPr>
           </w:pPr>
-          <w:hyperlink w:anchor="_Toc227742938" w:history="1">
+          <w:hyperlink w:anchor="_Toc227743256" w:history="1">
             <w:r>
               <w:rPr>
                 <w:rStyle w:val="Hyperlink"/>
@@ -1820,7 +1820,7 @@
                 <w:noProof/>
                 <w:webHidden/>
               </w:rPr>
-              <w:instrText xml:space="preserve"> PAGEREF _Toc227742938 \h </w:instrText>
+              <w:instrText xml:space="preserve"> PAGEREF _Toc227743256 \h </w:instrText>
             </w:r>
             <w:r>
               <w:rPr>
@@ -1867,7 +1867,7 @@
               <w14:ligatures w14:val="standardContextual"/>
             </w:rPr>
           </w:pPr>
-          <w:hyperlink w:anchor="_Toc227742939" w:history="1">
+          <w:hyperlink w:anchor="_Toc227743257" w:history="1">
             <w:r>
               <w:rPr>
                 <w:rStyle w:val="Hyperlink"/>
@@ -1894,7 +1894,7 @@
                 <w:noProof/>
                 <w:webHidden/>
               </w:rPr>
-              <w:instrText xml:space="preserve"> PAGEREF _Toc227742939 \h </w:instrText>
+              <w:instrText xml:space="preserve"> PAGEREF _Toc227743257 \h </w:instrText>
             </w:r>
             <w:r>
               <w:rPr>
@@ -1941,7 +1941,7 @@
               <w14:ligatures w14:val="standardContextual"/>
             </w:rPr>
           </w:pPr>
-          <w:hyperlink w:anchor="_Toc227742940" w:history="1">
+          <w:hyperlink w:anchor="_Toc227743258" w:history="1">
             <w:r>
               <w:rPr>
                 <w:rStyle w:val="Hyperlink"/>
@@ -1968,7 +1968,7 @@
                 <w:noProof/>
                 <w:webHidden/>
               </w:rPr>
-              <w:instrText xml:space="preserve"> PAGEREF _Toc227742940 \h </w:instrText>
+              <w:instrText xml:space="preserve"> PAGEREF _Toc227743258 \h </w:instrText>
             </w:r>
             <w:r>
               <w:rPr>
@@ -2015,7 +2015,7 @@
               <w14:ligatures w14:val="standardContextual"/>
             </w:rPr>
           </w:pPr>
-          <w:hyperlink w:anchor="_Toc227742941" w:history="1">
+          <w:hyperlink w:anchor="_Toc227743259" w:history="1">
             <w:r>
               <w:rPr>
                 <w:rStyle w:val="Hyperlink"/>
@@ -2042,7 +2042,7 @@
                 <w:noProof/>
                 <w:webHidden/>
               </w:rPr>
-              <w:instrText xml:space="preserve"> PAGEREF _Toc227742941 \h </w:instrText>
+              <w:instrText xml:space="preserve"> PAGEREF _Toc227743259 \h </w:instrText>
             </w:r>
             <w:r>
               <w:rPr>
@@ -2089,7 +2089,7 @@
               <w14:ligatures w14:val="standardContextual"/>
             </w:rPr>
           </w:pPr>
-          <w:hyperlink w:anchor="_Toc227742942" w:history="1">
+          <w:hyperlink w:anchor="_Toc227743260" w:history="1">
             <w:r>
               <w:rPr>
                 <w:rStyle w:val="Hyperlink"/>
@@ -2116,7 +2116,7 @@
                 <w:noProof/>
                 <w:webHidden/>
               </w:rPr>
-              <w:instrText xml:space="preserve"> PAGEREF _Toc227742942 \h </w:instrText>
+              <w:instrText xml:space="preserve"> PAGEREF _Toc227743260 \h </w:instrText>
             </w:r>
             <w:r>
               <w:rPr>
@@ -2159,7 +2159,7 @@
               <w:lang w:eastAsia="en-GB"/>
             </w:rPr>
           </w:pPr>
-          <w:hyperlink w:anchor="_Toc227742943" w:history="1">
+          <w:hyperlink w:anchor="_Toc227743261" w:history="1">
             <w:r>
               <w:rPr>
                 <w:rStyle w:val="Hyperlink"/>
@@ -2186,7 +2186,7 @@
                 <w:noProof/>
                 <w:webHidden/>
               </w:rPr>
-              <w:instrText xml:space="preserve"> PAGEREF _Toc227742943 \h </w:instrText>
+              <w:instrText xml:space="preserve"> PAGEREF _Toc227743261 \h </w:instrText>
             </w:r>
             <w:r>
               <w:rPr>
@@ -2229,7 +2229,7 @@
               <w:lang w:eastAsia="en-GB"/>
             </w:rPr>
           </w:pPr>
-          <w:hyperlink w:anchor="_Toc227742944" w:history="1">
+          <w:hyperlink w:anchor="_Toc227743262" w:history="1">
             <w:r>
               <w:rPr>
                 <w:rStyle w:val="Hyperlink"/>
@@ -2256,7 +2256,7 @@
                 <w:noProof/>
                 <w:webHidden/>
               </w:rPr>
-              <w:instrText xml:space="preserve"> PAGEREF _Toc227742944 \h </w:instrText>
+              <w:instrText xml:space="preserve"> PAGEREF _Toc227743262 \h </w:instrText>
             </w:r>
             <w:r>
               <w:rPr>
@@ -2299,7 +2299,7 @@
               <w:lang w:eastAsia="en-GB"/>
             </w:rPr>
           </w:pPr>
-          <w:hyperlink w:anchor="_Toc227742945" w:history="1">
+          <w:hyperlink w:anchor="_Toc227743263" w:history="1">
             <w:r>
               <w:rPr>
                 <w:rStyle w:val="Hyperlink"/>
@@ -2326,7 +2326,7 @@
                 <w:noProof/>
                 <w:webHidden/>
               </w:rPr>
-              <w:instrText xml:space="preserve"> PAGEREF _Toc227742945 \h </w:instrText>
+              <w:instrText xml:space="preserve"> PAGEREF _Toc227743263 \h </w:instrText>
             </w:r>
             <w:r>
               <w:rPr>
@@ -2373,7 +2373,7 @@
               <w14:ligatures w14:val="standardContextual"/>
             </w:rPr>
           </w:pPr>
-          <w:hyperlink w:anchor="_Toc227742946" w:history="1">
+          <w:hyperlink w:anchor="_Toc227743264" w:history="1">
             <w:r>
               <w:rPr>
                 <w:rStyle w:val="Hyperlink"/>
@@ -2400,7 +2400,7 @@
                 <w:noProof/>
                 <w:webHidden/>
               </w:rPr>
-              <w:instrText xml:space="preserve"> PAGEREF _Toc227742946 \h </w:instrText>
+              <w:instrText xml:space="preserve"> PAGEREF _Toc227743264 \h </w:instrText>
             </w:r>
             <w:r>
               <w:rPr>
@@ -2443,7 +2443,7 @@
               <w:lang w:eastAsia="en-GB"/>
             </w:rPr>
           </w:pPr>
-          <w:hyperlink w:anchor="_Toc227742947" w:history="1">
+          <w:hyperlink w:anchor="_Toc227743265" w:history="1">
             <w:r>
               <w:rPr>
                 <w:rStyle w:val="Hyperlink"/>
@@ -2470,7 +2470,7 @@
                 <w:noProof/>
                 <w:webHidden/>
               </w:rPr>
-              <w:instrText xml:space="preserve"> PAGEREF _Toc227742947 \h </w:instrText>
+              <w:instrText xml:space="preserve"> PAGEREF _Toc227743265 \h </w:instrText>
             </w:r>
             <w:r>
               <w:rPr>
@@ -2513,7 +2513,7 @@
               <w:lang w:eastAsia="en-GB"/>
             </w:rPr>
           </w:pPr>
-          <w:hyperlink w:anchor="_Toc227742948" w:history="1">
+          <w:hyperlink w:anchor="_Toc227743266" w:history="1">
             <w:r>
               <w:rPr>
                 <w:rStyle w:val="Hyperlink"/>
@@ -2540,7 +2540,7 @@
                 <w:noProof/>
                 <w:webHidden/>
               </w:rPr>
-              <w:instrText xml:space="preserve"> PAGEREF _Toc227742948 \h </w:instrText>
+              <w:instrText xml:space="preserve"> PAGEREF _Toc227743266 \h </w:instrText>
             </w:r>
             <w:r>
               <w:rPr>
@@ -2583,7 +2583,7 @@
               <w:lang w:eastAsia="en-GB"/>
             </w:rPr>
           </w:pPr>
-          <w:hyperlink w:anchor="_Toc227742949" w:history="1">
+          <w:hyperlink w:anchor="_Toc227743267" w:history="1">
             <w:r>
               <w:rPr>
                 <w:rStyle w:val="Hyperlink"/>
@@ -2610,7 +2610,7 @@
                 <w:noProof/>
                 <w:webHidden/>
               </w:rPr>
-              <w:instrText xml:space="preserve"> PAGEREF _Toc227742949 \h </w:instrText>
+              <w:instrText xml:space="preserve"> PAGEREF _Toc227743267 \h </w:instrText>
             </w:r>
             <w:r>
               <w:rPr>
@@ -2657,7 +2657,7 @@
               <w14:ligatures w14:val="standardContextual"/>
             </w:rPr>
           </w:pPr>
-          <w:hyperlink w:anchor="_Toc227742950" w:history="1">
+          <w:hyperlink w:anchor="_Toc227743268" w:history="1">
             <w:r>
               <w:rPr>
                 <w:rStyle w:val="Hyperlink"/>
@@ -2684,7 +2684,7 @@
                 <w:noProof/>
                 <w:webHidden/>
               </w:rPr>
-              <w:instrText xml:space="preserve"> PAGEREF _Toc227742950 \h </w:instrText>
+              <w:instrText xml:space="preserve"> PAGEREF _Toc227743268 \h </w:instrText>
             </w:r>
             <w:r>
               <w:rPr>
@@ -2727,7 +2727,7 @@
               <w:lang w:eastAsia="en-GB"/>
             </w:rPr>
           </w:pPr>
-          <w:hyperlink w:anchor="_Toc227742951" w:history="1">
+          <w:hyperlink w:anchor="_Toc227743269" w:history="1">
             <w:r>
               <w:rPr>
                 <w:rStyle w:val="Hyperlink"/>
@@ -2754,7 +2754,7 @@
                 <w:noProof/>
                 <w:webHidden/>
               </w:rPr>
-              <w:instrText xml:space="preserve"> PAGEREF _Toc227742951 \h </w:instrText>
+              <w:instrText xml:space="preserve"> PAGEREF _Toc227743269 \h </w:instrText>
             </w:r>
             <w:r>
               <w:rPr>
@@ -2797,7 +2797,7 @@
               <w:lang w:eastAsia="en-GB"/>
             </w:rPr>
           </w:pPr>
-          <w:hyperlink w:anchor="_Toc227742952" w:history="1">
+          <w:hyperlink w:anchor="_Toc227743270" w:history="1">
             <w:r>
               <w:rPr>
                 <w:rStyle w:val="Hyperlink"/>
@@ -2824,7 +2824,7 @@
                 <w:noProof/>
                 <w:webHidden/>
               </w:rPr>
-              <w:instrText xml:space="preserve"> PAGEREF _Toc227742952 \h </w:instrText>
+              <w:instrText xml:space="preserve"> PAGEREF _Toc227743270 \h </w:instrText>
             </w:r>
             <w:r>
               <w:rPr>
@@ -2867,7 +2867,7 @@
               <w:lang w:eastAsia="en-GB"/>
             </w:rPr>
           </w:pPr>
-          <w:hyperlink w:anchor="_Toc227742953" w:history="1">
+          <w:hyperlink w:anchor="_Toc227743271" w:history="1">
             <w:r>
               <w:rPr>
                 <w:rStyle w:val="Hyperlink"/>
@@ -2894,7 +2894,7 @@
                 <w:noProof/>
                 <w:webHidden/>
               </w:rPr>
-              <w:instrText xml:space="preserve"> PAGEREF _Toc227742953 \h </w:instrText>
+              <w:instrText xml:space="preserve"> PAGEREF _Toc227743271 \h </w:instrText>
             </w:r>
             <w:r>
               <w:rPr>
@@ -2941,7 +2941,7 @@
               <w14:ligatures w14:val="standardContextual"/>
             </w:rPr>
           </w:pPr>
-          <w:hyperlink w:anchor="_Toc227742954" w:history="1">
+          <w:hyperlink w:anchor="_Toc227743272" w:history="1">
             <w:r>
               <w:rPr>
                 <w:rStyle w:val="Hyperlink"/>
@@ -2968,7 +2968,7 @@
                 <w:noProof/>
                 <w:webHidden/>
               </w:rPr>
-              <w:instrText xml:space="preserve"> PAGEREF _Toc227742954 \h </w:instrText>
+              <w:instrText xml:space="preserve"> PAGEREF _Toc227743272 \h </w:instrText>
             </w:r>
             <w:r>
               <w:rPr>
@@ -3015,7 +3015,7 @@
               <w14:ligatures w14:val="standardContextual"/>
             </w:rPr>
           </w:pPr>
-          <w:hyperlink w:anchor="_Toc227742955" w:history="1">
+          <w:hyperlink w:anchor="_Toc227743273" w:history="1">
             <w:r>
               <w:rPr>
                 <w:rStyle w:val="Hyperlink"/>
@@ -3042,7 +3042,7 @@
                 <w:noProof/>
                 <w:webHidden/>
               </w:rPr>
-              <w:instrText xml:space="preserve"> PAGEREF _Toc227742955 \h </w:instrText>
+              <w:instrText xml:space="preserve"> PAGEREF _Toc227743273 \h </w:instrText>
             </w:r>
             <w:r>
               <w:rPr>
@@ -3089,7 +3089,7 @@
               <w14:ligatures w14:val="standardContextual"/>
             </w:rPr>
           </w:pPr>
-          <w:hyperlink w:anchor="_Toc227742956" w:history="1">
+          <w:hyperlink w:anchor="_Toc227743274" w:history="1">
             <w:r>
               <w:rPr>
                 <w:rStyle w:val="Hyperlink"/>
@@ -3116,7 +3116,7 @@
                 <w:noProof/>
                 <w:webHidden/>
               </w:rPr>
-              <w:instrText xml:space="preserve"> PAGEREF _Toc227742956 \h </w:instrText>
+              <w:instrText xml:space="preserve"> PAGEREF _Toc227743274 \h </w:instrText>
             </w:r>
             <w:r>
               <w:rPr>
@@ -3163,7 +3163,7 @@
               <w14:ligatures w14:val="standardContextual"/>
             </w:rPr>
           </w:pPr>
-          <w:hyperlink w:anchor="_Toc227742957" w:history="1">
+          <w:hyperlink w:anchor="_Toc227743275" w:history="1">
             <w:r>
               <w:rPr>
                 <w:rStyle w:val="Hyperlink"/>
@@ -3190,7 +3190,7 @@
                 <w:noProof/>
                 <w:webHidden/>
               </w:rPr>
-              <w:instrText xml:space="preserve"> PAGEREF _Toc227742957 \h </w:instrText>
+              <w:instrText xml:space="preserve"> PAGEREF _Toc227743275 \h </w:instrText>
             </w:r>
             <w:r>
               <w:rPr>
@@ -3237,7 +3237,7 @@
               <w14:ligatures w14:val="standardContextual"/>
             </w:rPr>
           </w:pPr>
-          <w:hyperlink w:anchor="_Toc227742958" w:history="1">
+          <w:hyperlink w:anchor="_Toc227743276" w:history="1">
             <w:r>
               <w:rPr>
                 <w:rStyle w:val="Hyperlink"/>
@@ -3264,7 +3264,7 @@
                 <w:noProof/>
                 <w:webHidden/>
               </w:rPr>
-              <w:instrText xml:space="preserve"> PAGEREF _Toc227742958 \h </w:instrText>
+              <w:instrText xml:space="preserve"> PAGEREF _Toc227743276 \h </w:instrText>
             </w:r>
             <w:r>
               <w:rPr>
@@ -3311,7 +3311,7 @@
               <w14:ligatures w14:val="standardContextual"/>
             </w:rPr>
           </w:pPr>
-          <w:hyperlink w:anchor="_Toc227742959" w:history="1">
+          <w:hyperlink w:anchor="_Toc227743277" w:history="1">
             <w:r>
               <w:rPr>
                 <w:rStyle w:val="Hyperlink"/>
@@ -3338,7 +3338,7 @@
                 <w:noProof/>
                 <w:webHidden/>
               </w:rPr>
-              <w:instrText xml:space="preserve"> PAGEREF _Toc227742959 \h </w:instrText>
+              <w:instrText xml:space="preserve"> PAGEREF _Toc227743277 \h </w:instrText>
             </w:r>
             <w:r>
               <w:rPr>
@@ -3359,6 +3359,80 @@
                 <w:webHidden/>
               </w:rPr>
               <w:t>11</w:t>
+            </w:r>
+            <w:r>
+              <w:rPr>
+                <w:noProof/>
+                <w:webHidden/>
+              </w:rPr>
+              <w:fldChar w:fldCharType="end"/>
+            </w:r>
+          </w:hyperlink>
+        </w:p>
+        <w:p>
+          <w:pPr>
+            <w:pStyle w:val="TOC2"/>
+            <w:tabs>
+              <w:tab w:val="right" w:leader="dot" w:pos="9016"/>
+            </w:tabs>
+            <w:rPr>
+              <w:rFonts w:asciiTheme="minorHAnsi" w:hAnsiTheme="minorHAnsi" w:cstheme="minorBidi"/>
+              <w:noProof/>
+              <w:kern w:val="2"/>
+              <w:sz w:val="24"/>
+              <w:szCs w:val="24"/>
+              <w:lang w:val="en-GB" w:eastAsia="en-GB"/>
+              <w14:ligatures w14:val="standardContextual"/>
+            </w:rPr>
+          </w:pPr>
+          <w:hyperlink w:anchor="_Toc227743278" w:history="1">
+            <w:r>
+              <w:rPr>
+                <w:rStyle w:val="Hyperlink"/>
+                <w:noProof/>
+              </w:rPr>
+              <w:t>3.2 Pathfinding</w:t>
+            </w:r>
+            <w:r>
+              <w:rPr>
+                <w:noProof/>
+                <w:webHidden/>
+              </w:rPr>
+              <w:tab/>
+            </w:r>
+            <w:r>
+              <w:rPr>
+                <w:noProof/>
+                <w:webHidden/>
+              </w:rPr>
+              <w:fldChar w:fldCharType="begin"/>
+            </w:r>
+            <w:r>
+              <w:rPr>
+                <w:noProof/>
+                <w:webHidden/>
+              </w:rPr>
+              <w:instrText xml:space="preserve"> PAGEREF _Toc227743278 \h </w:instrText>
+            </w:r>
+            <w:r>
+              <w:rPr>
+                <w:noProof/>
+                <w:webHidden/>
+              </w:rPr>
+            </w:r>
+            <w:r>
+              <w:rPr>
+                <w:noProof/>
+                <w:webHidden/>
+              </w:rPr>
+              <w:fldChar w:fldCharType="separate"/>
+            </w:r>
+            <w:r>
+              <w:rPr>
+                <w:noProof/>
+                <w:webHidden/>
+              </w:rPr>
+              <w:t>12</w:t>
             </w:r>
             <w:r>
               <w:rPr>
@@ -3385,7 +3459,7 @@
               <w14:ligatures w14:val="standardContextual"/>
             </w:rPr>
           </w:pPr>
-          <w:hyperlink w:anchor="_Toc227742960" w:history="1">
+          <w:hyperlink w:anchor="_Toc227743279" w:history="1">
             <w:r>
               <w:rPr>
                 <w:rStyle w:val="Hyperlink"/>
@@ -3412,7 +3486,7 @@
                 <w:noProof/>
                 <w:webHidden/>
               </w:rPr>
-              <w:instrText xml:space="preserve"> PAGEREF _Toc227742960 \h </w:instrText>
+              <w:instrText xml:space="preserve"> PAGEREF _Toc227743279 \h </w:instrText>
             </w:r>
             <w:r>
               <w:rPr>
@@ -3469,7 +3543,7 @@
       <w:pPr>
         <w:pStyle w:val="Heading1"/>
       </w:pPr>
-      <w:bookmarkStart w:id="7" w:name="_Toc227742927"/>
+      <w:bookmarkStart w:id="7" w:name="_Toc227743245"/>
       <w:r>
         <w:t>Table of Figures</w:t>
       </w:r>
@@ -3511,7 +3585,7 @@
         </w:rPr>
         <w:fldChar w:fldCharType="separate"/>
       </w:r>
-      <w:hyperlink w:anchor="_Toc227742916" w:history="1">
+      <w:hyperlink w:anchor="_Toc227743280" w:history="1">
         <w:r>
           <w:rPr>
             <w:rStyle w:val="Hyperlink"/>
@@ -3538,7 +3612,7 @@
             <w:noProof/>
             <w:webHidden/>
           </w:rPr>
-          <w:instrText xml:space="preserve"> PAGEREF _Toc227742916 \h </w:instrText>
+          <w:instrText xml:space="preserve"> PAGEREF _Toc227743280 \h </w:instrText>
         </w:r>
         <w:r>
           <w:rPr>
@@ -3581,7 +3655,7 @@
           <w:lang w:eastAsia="en-GB"/>
         </w:rPr>
       </w:pPr>
-      <w:hyperlink w:anchor="_Toc227742917" w:history="1">
+      <w:hyperlink w:anchor="_Toc227743281" w:history="1">
         <w:r>
           <w:rPr>
             <w:rStyle w:val="Hyperlink"/>
@@ -3608,7 +3682,7 @@
             <w:noProof/>
             <w:webHidden/>
           </w:rPr>
-          <w:instrText xml:space="preserve"> PAGEREF _Toc227742917 \h </w:instrText>
+          <w:instrText xml:space="preserve"> PAGEREF _Toc227743281 \h </w:instrText>
         </w:r>
         <w:r>
           <w:rPr>
@@ -3651,7 +3725,7 @@
           <w:lang w:eastAsia="en-GB"/>
         </w:rPr>
       </w:pPr>
-      <w:hyperlink w:anchor="_Toc227742918" w:history="1">
+      <w:hyperlink w:anchor="_Toc227743282" w:history="1">
         <w:r>
           <w:rPr>
             <w:rStyle w:val="Hyperlink"/>
@@ -3678,7 +3752,7 @@
             <w:noProof/>
             <w:webHidden/>
           </w:rPr>
-          <w:instrText xml:space="preserve"> PAGEREF _Toc227742918 \h </w:instrText>
+          <w:instrText xml:space="preserve"> PAGEREF _Toc227743282 \h </w:instrText>
         </w:r>
         <w:r>
           <w:rPr>
@@ -3721,7 +3795,7 @@
           <w:lang w:eastAsia="en-GB"/>
         </w:rPr>
       </w:pPr>
-      <w:hyperlink w:anchor="_Toc227742919" w:history="1">
+      <w:hyperlink w:anchor="_Toc227743283" w:history="1">
         <w:r>
           <w:rPr>
             <w:rStyle w:val="Hyperlink"/>
@@ -3748,7 +3822,7 @@
             <w:noProof/>
             <w:webHidden/>
           </w:rPr>
-          <w:instrText xml:space="preserve"> PAGEREF _Toc227742919 \h </w:instrText>
+          <w:instrText xml:space="preserve"> PAGEREF _Toc227743283 \h </w:instrText>
         </w:r>
         <w:r>
           <w:rPr>
@@ -3791,7 +3865,7 @@
           <w:lang w:eastAsia="en-GB"/>
         </w:rPr>
       </w:pPr>
-      <w:hyperlink w:anchor="_Toc227742920" w:history="1">
+      <w:hyperlink w:anchor="_Toc227743284" w:history="1">
         <w:r>
           <w:rPr>
             <w:rStyle w:val="Hyperlink"/>
@@ -3818,7 +3892,7 @@
             <w:noProof/>
             <w:webHidden/>
           </w:rPr>
-          <w:instrText xml:space="preserve"> PAGEREF _Toc227742920 \h </w:instrText>
+          <w:instrText xml:space="preserve"> PAGEREF _Toc227743284 \h </w:instrText>
         </w:r>
         <w:r>
           <w:rPr>
@@ -3861,7 +3935,7 @@
           <w:lang w:eastAsia="en-GB"/>
         </w:rPr>
       </w:pPr>
-      <w:hyperlink w:anchor="_Toc227742921" w:history="1">
+      <w:hyperlink w:anchor="_Toc227743285" w:history="1">
         <w:r>
           <w:rPr>
             <w:rStyle w:val="Hyperlink"/>
@@ -3888,7 +3962,7 @@
             <w:noProof/>
             <w:webHidden/>
           </w:rPr>
-          <w:instrText xml:space="preserve"> PAGEREF _Toc227742921 \h </w:instrText>
+          <w:instrText xml:space="preserve"> PAGEREF _Toc227743285 \h </w:instrText>
         </w:r>
         <w:r>
           <w:rPr>
@@ -3931,7 +4005,7 @@
           <w:lang w:eastAsia="en-GB"/>
         </w:rPr>
       </w:pPr>
-      <w:hyperlink w:anchor="_Toc227742922" w:history="1">
+      <w:hyperlink w:anchor="_Toc227743286" w:history="1">
         <w:r>
           <w:rPr>
             <w:rStyle w:val="Hyperlink"/>
@@ -3958,7 +4032,7 @@
             <w:noProof/>
             <w:webHidden/>
           </w:rPr>
-          <w:instrText xml:space="preserve"> PAGEREF _Toc227742922 \h </w:instrText>
+          <w:instrText xml:space="preserve"> PAGEREF _Toc227743286 \h </w:instrText>
         </w:r>
         <w:r>
           <w:rPr>
@@ -4027,7 +4101,7 @@
       <w:pPr>
         <w:pStyle w:val="Heading1"/>
       </w:pPr>
-      <w:bookmarkStart w:id="8" w:name="_Toc227742928"/>
+      <w:bookmarkStart w:id="8" w:name="_Toc227743246"/>
       <w:r>
         <w:t>Chapter 1</w:t>
       </w:r>
@@ -4055,7 +4129,7 @@
           <w:u w:val="single"/>
         </w:rPr>
       </w:pPr>
-      <w:bookmarkStart w:id="9" w:name="_Toc227742929"/>
+      <w:bookmarkStart w:id="9" w:name="_Toc227743247"/>
       <w:r>
         <w:t>1.1</w:t>
       </w:r>
@@ -4100,7 +4174,7 @@
       <w:pPr>
         <w:pStyle w:val="Heading2"/>
       </w:pPr>
-      <w:bookmarkStart w:id="10" w:name="_Toc227742930"/>
+      <w:bookmarkStart w:id="10" w:name="_Toc227743248"/>
       <w:r>
         <w:t>1.2 Aims</w:t>
       </w:r>
@@ -4116,7 +4190,7 @@
           <w:szCs w:val="28"/>
         </w:rPr>
       </w:pPr>
-      <w:bookmarkStart w:id="11" w:name="_Toc227742931"/>
+      <w:bookmarkStart w:id="11" w:name="_Toc227743249"/>
       <w:r>
         <w:rPr>
           <w:rStyle w:val="Heading2Char"/>
@@ -4161,7 +4235,7 @@
       <w:pPr>
         <w:pStyle w:val="Heading3"/>
       </w:pPr>
-      <w:bookmarkStart w:id="12" w:name="_Toc227742932"/>
+      <w:bookmarkStart w:id="12" w:name="_Toc227743250"/>
       <w:r>
         <w:lastRenderedPageBreak/>
         <w:t>1.2.2 Additional Aims</w:t>
@@ -4231,7 +4305,7 @@
       <w:pPr>
         <w:pStyle w:val="Heading2"/>
       </w:pPr>
-      <w:bookmarkStart w:id="13" w:name="_Toc227742933"/>
+      <w:bookmarkStart w:id="13" w:name="_Toc227743251"/>
       <w:r>
         <w:t>1.3 Objectives</w:t>
       </w:r>
@@ -4241,7 +4315,7 @@
       <w:pPr>
         <w:pStyle w:val="Heading3"/>
       </w:pPr>
-      <w:bookmarkStart w:id="14" w:name="_Toc227742934"/>
+      <w:bookmarkStart w:id="14" w:name="_Toc227743252"/>
       <w:r>
         <w:t>1.3.1 Scope</w:t>
       </w:r>
@@ -4312,7 +4386,7 @@
       <w:pPr>
         <w:pStyle w:val="Heading3"/>
       </w:pPr>
-      <w:bookmarkStart w:id="15" w:name="_Toc227742935"/>
+      <w:bookmarkStart w:id="15" w:name="_Toc227743253"/>
       <w:r>
         <w:t>1.3.2 Research Objectives</w:t>
       </w:r>
@@ -4357,7 +4431,7 @@
       <w:pPr>
         <w:pStyle w:val="Heading3"/>
       </w:pPr>
-      <w:bookmarkStart w:id="16" w:name="_Toc227742936"/>
+      <w:bookmarkStart w:id="16" w:name="_Toc227743254"/>
       <w:r>
         <w:t>1.3.3 Design Objectives</w:t>
       </w:r>
@@ -4479,7 +4553,7 @@
       <w:pPr>
         <w:pStyle w:val="Heading3"/>
       </w:pPr>
-      <w:bookmarkStart w:id="17" w:name="_Toc227742937"/>
+      <w:bookmarkStart w:id="17" w:name="_Toc227743255"/>
       <w:r>
         <w:t>1.3.4 Implementation Objectives</w:t>
       </w:r>
@@ -4598,7 +4672,7 @@
       <w:pPr>
         <w:pStyle w:val="Heading3"/>
       </w:pPr>
-      <w:bookmarkStart w:id="18" w:name="_Toc227742938"/>
+      <w:bookmarkStart w:id="18" w:name="_Toc227743256"/>
       <w:r>
         <w:t>1.3.5 Results, Evaluation and Playtesting Objectives</w:t>
       </w:r>
@@ -4655,7 +4729,7 @@
       <w:pPr>
         <w:pStyle w:val="Heading1"/>
       </w:pPr>
-      <w:bookmarkStart w:id="19" w:name="_Toc227742939"/>
+      <w:bookmarkStart w:id="19" w:name="_Toc227743257"/>
       <w:r>
         <w:t>Chapter 2 – Literature Survey</w:t>
       </w:r>
@@ -4665,7 +4739,7 @@
       <w:pPr>
         <w:pStyle w:val="Heading2"/>
       </w:pPr>
-      <w:bookmarkStart w:id="20" w:name="_Toc227742940"/>
+      <w:bookmarkStart w:id="20" w:name="_Toc227743258"/>
       <w:r>
         <w:t>2.1 Literature Survey Introduction</w:t>
       </w:r>
@@ -4704,7 +4778,7 @@
       <w:pPr>
         <w:pStyle w:val="Heading2"/>
       </w:pPr>
-      <w:bookmarkStart w:id="21" w:name="_Toc227742941"/>
+      <w:bookmarkStart w:id="21" w:name="_Toc227743259"/>
       <w:r>
         <w:t>2.2 Comparative Research</w:t>
       </w:r>
@@ -4722,7 +4796,7 @@
       <w:pPr>
         <w:pStyle w:val="Heading3"/>
       </w:pPr>
-      <w:bookmarkStart w:id="22" w:name="_Toc227742942"/>
+      <w:bookmarkStart w:id="22" w:name="_Toc227743260"/>
       <w:r>
         <w:t xml:space="preserve">2.2.1 </w:t>
       </w:r>
@@ -4798,7 +4872,7 @@
       <w:pPr>
         <w:pStyle w:val="Heading4"/>
       </w:pPr>
-      <w:bookmarkStart w:id="23" w:name="_Toc227742943"/>
+      <w:bookmarkStart w:id="23" w:name="_Toc227743261"/>
       <w:r>
         <w:t>2.2.1.1 Perlin Noise</w:t>
       </w:r>
@@ -5113,7 +5187,7 @@
         <w:pStyle w:val="Caption"/>
         <w:jc w:val="center"/>
       </w:pPr>
-      <w:bookmarkStart w:id="24" w:name="_Toc227742916"/>
+      <w:bookmarkStart w:id="24" w:name="_Toc227743280"/>
       <w:r>
         <w:t xml:space="preserve">Figure </w:t>
       </w:r>
@@ -5197,7 +5271,7 @@
       <w:pPr>
         <w:pStyle w:val="Heading4"/>
       </w:pPr>
-      <w:bookmarkStart w:id="25" w:name="_Toc227742944"/>
+      <w:bookmarkStart w:id="25" w:name="_Toc227743262"/>
       <w:r>
         <w:t>2.2.1.2 Binary Space Partitioning</w:t>
       </w:r>
@@ -5249,7 +5323,7 @@
       <w:pPr>
         <w:pStyle w:val="Heading4"/>
       </w:pPr>
-      <w:bookmarkStart w:id="26" w:name="_Toc227742945"/>
+      <w:bookmarkStart w:id="26" w:name="_Toc227743263"/>
       <w:r>
         <w:t>2.2.1.3 Cellular Automata</w:t>
       </w:r>
@@ -5369,7 +5443,7 @@
       <w:pPr>
         <w:pStyle w:val="Heading3"/>
       </w:pPr>
-      <w:bookmarkStart w:id="27" w:name="_Toc227742946"/>
+      <w:bookmarkStart w:id="27" w:name="_Toc227743264"/>
       <w:r>
         <w:t>2.2.2 Pathfinding</w:t>
       </w:r>
@@ -5432,7 +5506,7 @@
       <w:pPr>
         <w:pStyle w:val="Heading4"/>
       </w:pPr>
-      <w:bookmarkStart w:id="28" w:name="_Toc227742947"/>
+      <w:bookmarkStart w:id="28" w:name="_Toc227743265"/>
       <w:r>
         <w:t>2.2.2.1 Dijkstra</w:t>
       </w:r>
@@ -5513,7 +5587,7 @@
         <w:pStyle w:val="Caption"/>
         <w:jc w:val="center"/>
       </w:pPr>
-      <w:bookmarkStart w:id="29" w:name="_Toc227742917"/>
+      <w:bookmarkStart w:id="29" w:name="_Toc227743281"/>
       <w:r>
         <w:t xml:space="preserve">Figure </w:t>
       </w:r>
@@ -5607,7 +5681,7 @@
       <w:pPr>
         <w:pStyle w:val="Heading4"/>
       </w:pPr>
-      <w:bookmarkStart w:id="30" w:name="_Toc227742948"/>
+      <w:bookmarkStart w:id="30" w:name="_Toc227743266"/>
       <w:r>
         <w:t>2.2.2.2 A*</w:t>
       </w:r>
@@ -5670,7 +5744,7 @@
       <w:pPr>
         <w:pStyle w:val="Heading4"/>
       </w:pPr>
-      <w:bookmarkStart w:id="31" w:name="_Toc227742949"/>
+      <w:bookmarkStart w:id="31" w:name="_Toc227743267"/>
       <w:r>
         <w:t>2.2.2.3 Jump Point Search</w:t>
       </w:r>
@@ -5725,7 +5799,7 @@
       <w:pPr>
         <w:pStyle w:val="Heading3"/>
       </w:pPr>
-      <w:bookmarkStart w:id="32" w:name="_Toc227742950"/>
+      <w:bookmarkStart w:id="32" w:name="_Toc227743268"/>
       <w:r>
         <w:t>2.2.3 AI Integrations</w:t>
       </w:r>
@@ -5750,7 +5824,7 @@
       <w:pPr>
         <w:pStyle w:val="Heading4"/>
       </w:pPr>
-      <w:bookmarkStart w:id="33" w:name="_Toc227742951"/>
+      <w:bookmarkStart w:id="33" w:name="_Toc227743269"/>
       <w:r>
         <w:t>2.2.3.1 Neural Network</w:t>
       </w:r>
@@ -5805,7 +5879,7 @@
       <w:pPr>
         <w:pStyle w:val="Heading4"/>
       </w:pPr>
-      <w:bookmarkStart w:id="34" w:name="_Toc227742952"/>
+      <w:bookmarkStart w:id="34" w:name="_Toc227743270"/>
       <w:r>
         <w:t>2.2.3.2 Reinforcement Learning</w:t>
       </w:r>
@@ -5881,7 +5955,7 @@
         <w:pStyle w:val="Caption"/>
         <w:jc w:val="center"/>
       </w:pPr>
-      <w:bookmarkStart w:id="35" w:name="_Toc227742918"/>
+      <w:bookmarkStart w:id="35" w:name="_Toc227743282"/>
       <w:r>
         <w:t xml:space="preserve">Figure </w:t>
       </w:r>
@@ -6006,7 +6080,7 @@
       <w:pPr>
         <w:pStyle w:val="Heading4"/>
       </w:pPr>
-      <w:bookmarkStart w:id="36" w:name="_Toc227742953"/>
+      <w:bookmarkStart w:id="36" w:name="_Toc227743271"/>
       <w:r>
         <w:t>2.2.3.3 Imitation Learning</w:t>
       </w:r>
@@ -6135,7 +6209,7 @@
       <w:pPr>
         <w:pStyle w:val="Heading1"/>
       </w:pPr>
-      <w:bookmarkStart w:id="37" w:name="_Toc227742954"/>
+      <w:bookmarkStart w:id="37" w:name="_Toc227743272"/>
       <w:r>
         <w:lastRenderedPageBreak/>
         <w:t>Chapter 3 – Design</w:t>
@@ -6157,7 +6231,7 @@
       <w:pPr>
         <w:pStyle w:val="Heading2"/>
       </w:pPr>
-      <w:bookmarkStart w:id="38" w:name="_Toc227742955"/>
+      <w:bookmarkStart w:id="38" w:name="_Toc227743273"/>
       <w:r>
         <w:t xml:space="preserve">3.1 </w:t>
       </w:r>
@@ -6184,7 +6258,7 @@
       <w:pPr>
         <w:pStyle w:val="Heading3"/>
       </w:pPr>
-      <w:bookmarkStart w:id="39" w:name="_Toc227742956"/>
+      <w:bookmarkStart w:id="39" w:name="_Toc227743274"/>
       <w:r>
         <w:t xml:space="preserve">3.1.1 </w:t>
       </w:r>
@@ -6282,7 +6356,7 @@
         <w:pStyle w:val="Caption"/>
         <w:jc w:val="center"/>
       </w:pPr>
-      <w:bookmarkStart w:id="40" w:name="_Toc227742919"/>
+      <w:bookmarkStart w:id="40" w:name="_Toc227743283"/>
       <w:r>
         <w:t xml:space="preserve">Figure </w:t>
       </w:r>
@@ -6405,7 +6479,7 @@
               <w:pStyle w:val="Caption"/>
               <w:jc w:val="center"/>
             </w:pPr>
-            <w:bookmarkStart w:id="41" w:name="_Toc227742920"/>
+            <w:bookmarkStart w:id="41" w:name="_Toc227743284"/>
             <w:r>
               <w:t xml:space="preserve">Figure </w:t>
             </w:r>
@@ -6493,7 +6567,7 @@
               <w:pStyle w:val="Caption"/>
               <w:jc w:val="center"/>
             </w:pPr>
-            <w:bookmarkStart w:id="42" w:name="_Toc227742921"/>
+            <w:bookmarkStart w:id="42" w:name="_Toc227743285"/>
             <w:r>
               <w:t xml:space="preserve">Figure </w:t>
             </w:r>
@@ -6555,7 +6629,7 @@
       <w:pPr>
         <w:pStyle w:val="Heading3"/>
       </w:pPr>
-      <w:bookmarkStart w:id="43" w:name="_Toc227742957"/>
+      <w:bookmarkStart w:id="43" w:name="_Toc227743275"/>
       <w:r>
         <w:t>3.1.2 Biomes</w:t>
       </w:r>
@@ -6726,7 +6800,7 @@
         <w:pStyle w:val="Caption"/>
         <w:jc w:val="center"/>
       </w:pPr>
-      <w:bookmarkStart w:id="44" w:name="_Toc227742922"/>
+      <w:bookmarkStart w:id="44" w:name="_Toc227743286"/>
       <w:r>
         <w:t xml:space="preserve">Figure </w:t>
       </w:r>
@@ -6815,7 +6889,7 @@
       <w:pPr>
         <w:pStyle w:val="Heading3"/>
       </w:pPr>
-      <w:bookmarkStart w:id="45" w:name="_Toc227742958"/>
+      <w:bookmarkStart w:id="45" w:name="_Toc227743276"/>
       <w:r>
         <w:t>3.1.3 Resource Distribution</w:t>
       </w:r>
@@ -6845,7 +6919,7 @@
       <w:pPr>
         <w:pStyle w:val="Heading3"/>
       </w:pPr>
-      <w:bookmarkStart w:id="46" w:name="_Toc227742959"/>
+      <w:bookmarkStart w:id="46" w:name="_Toc227743277"/>
       <w:r>
         <w:t>3.1.4 River generation</w:t>
       </w:r>
@@ -6887,7 +6961,25 @@
         <w:t xml:space="preserve"> </w:t>
       </w:r>
     </w:p>
-    <w:bookmarkStart w:id="47" w:name="_Toc227742960" w:displacedByCustomXml="next"/>
+    <w:p>
+      <w:pPr>
+        <w:pStyle w:val="Heading2"/>
+      </w:pPr>
+      <w:bookmarkStart w:id="47" w:name="_Toc227743278"/>
+      <w:r>
+        <w:t>3.2 Pathfinding</w:t>
+      </w:r>
+      <w:bookmarkEnd w:id="47"/>
+    </w:p>
+    <w:p>
+      <w:r>
+        <w:t xml:space="preserve">After the research into different pathfinding types, I conclude that the best method for this project is to use the A* algorithm to create my pathfinding system with. I came to this conclusion through the evaluation of Dijkstra, A*, and JPS. While Dijkstra may be better for a single agent and JPS may be better for uniform cost graphs, A* has the best balance between performance across multiple agents whilst still allowing </w:t>
+      </w:r>
+      <w:r>
+        <w:t>different cost pathing.</w:t>
+      </w:r>
+    </w:p>
+    <w:bookmarkStart w:id="48" w:name="_Toc227743279" w:displacedByCustomXml="next"/>
     <w:sdt>
       <w:sdtPr>
         <w:rPr>
@@ -6915,7 +7007,7 @@
           <w:r>
             <w:t>References</w:t>
           </w:r>
-          <w:bookmarkEnd w:id="47"/>
+          <w:bookmarkEnd w:id="48"/>
         </w:p>
         <w:sdt>
           <w:sdtPr>
@@ -7176,6 +7268,7 @@
                 <w:rPr>
                   <w:noProof/>
                 </w:rPr>
+                <w:lastRenderedPageBreak/>
                 <w:t xml:space="preserve">Orsini, M. et al., 2021. </w:t>
               </w:r>
               <w:r>
@@ -7253,7 +7346,6 @@
                 <w:rPr>
                   <w:noProof/>
                 </w:rPr>
-                <w:lastRenderedPageBreak/>
                 <w:t xml:space="preserve">Wikipedia, n.d. </w:t>
               </w:r>
               <w:r>

</xml_diff>

<commit_message>
fix: formatted chapters properly
</commit_message>
<xml_diff>
--- a/Report.docx
+++ b/Report.docx
@@ -331,15 +331,7 @@
     </w:p>
     <w:p>
       <w:r>
-        <w:t xml:space="preserve">AI is a still growing industry and while the current trend of AI is heading towards the usage of Large Language Models, I believe there is a genuine use case for machine learning models within video games. The focus of this project is to uncover the current reasons behind why the industry doesn’t use machine learning AI for uses such as </w:t>
-      </w:r>
-      <w:proofErr w:type="gramStart"/>
-      <w:r>
-        <w:t>Non-Player Characters</w:t>
-      </w:r>
-      <w:proofErr w:type="gramEnd"/>
-      <w:r>
-        <w:t xml:space="preserve"> or local multiplayer games. This is appro</w:t>
+        <w:t>AI is a still growing industry and while the current trend of AI is heading towards the usage of Large Language Models, I believe there is a genuine use case for machine learning models within video games. The focus of this project is to uncover the current reasons behind why the industry doesn’t use machine learning AI for uses such as Non-Player Characters or local multiplayer games. This is appro</w:t>
       </w:r>
       <w:r>
         <w:t>ached by covering the design choices and code architecture of implementing a machine learning model into the Unity game engine. To evaluate whether the AI is functional, data has been gathered using a mix of qualitative and quantitative research. This research was collected through a short survey given to participants.</w:t>
@@ -4323,15 +4315,7 @@
     </w:p>
     <w:p>
       <w:r>
-        <w:t xml:space="preserve">The objectives in terms of scope for this project are going to be generally quite broad and consist of specific milestones. The core objectives </w:t>
-      </w:r>
-      <w:proofErr w:type="gramStart"/>
-      <w:r>
-        <w:t>in regards to</w:t>
-      </w:r>
-      <w:proofErr w:type="gramEnd"/>
-      <w:r>
-        <w:t xml:space="preserve"> the scope are:</w:t>
+        <w:t>The objectives in terms of scope for this project are going to be generally quite broad and consist of specific milestones. The core objectives in regards to the scope are:</w:t>
       </w:r>
     </w:p>
     <w:p>
@@ -4394,15 +4378,7 @@
     </w:p>
     <w:p>
       <w:r>
-        <w:t xml:space="preserve">For the research objectives for the game, research will be conducted into other types of media with similar features. This research will include a comparison of similar games and their features and the overall impact of those features on this project. This will be done to find a balance for the difficulty of the game and to evaluate the necessary features for the game. Some topics of features and mechanics that will be researched </w:t>
-      </w:r>
-      <w:proofErr w:type="gramStart"/>
-      <w:r>
-        <w:t>include:</w:t>
-      </w:r>
-      <w:proofErr w:type="gramEnd"/>
-      <w:r>
-        <w:t xml:space="preserve"> World Generation, Pathfinding</w:t>
+        <w:t>For the research objectives for the game, research will be conducted into other types of media with similar features. This research will include a comparison of similar games and their features and the overall impact of those features on this project. This will be done to find a balance for the difficulty of the game and to evaluate the necessary features for the game. Some topics of features and mechanics that will be researched include: World Generation, Pathfinding</w:t>
       </w:r>
       <w:r>
         <w:t xml:space="preserve"> and </w:t>
@@ -4724,6 +4700,102 @@
       <w:pPr>
         <w:pStyle w:val="ListParagraph"/>
       </w:pPr>
+      <w:r>
+        <w:br/>
+      </w:r>
+      <w:r>
+        <w:br/>
+      </w:r>
+      <w:r>
+        <w:br/>
+      </w:r>
+      <w:r>
+        <w:br/>
+      </w:r>
+      <w:r>
+        <w:br/>
+      </w:r>
+      <w:r>
+        <w:br/>
+      </w:r>
+      <w:r>
+        <w:br/>
+      </w:r>
+      <w:r>
+        <w:br/>
+      </w:r>
+      <w:r>
+        <w:br/>
+      </w:r>
+      <w:r>
+        <w:br/>
+      </w:r>
+      <w:r>
+        <w:br/>
+      </w:r>
+      <w:r>
+        <w:br/>
+      </w:r>
+      <w:r>
+        <w:br/>
+      </w:r>
+      <w:r>
+        <w:br/>
+      </w:r>
+      <w:r>
+        <w:br/>
+      </w:r>
+      <w:r>
+        <w:br/>
+      </w:r>
+      <w:r>
+        <w:br/>
+      </w:r>
+      <w:r>
+        <w:br/>
+      </w:r>
+      <w:r>
+        <w:br/>
+      </w:r>
+      <w:r>
+        <w:br/>
+      </w:r>
+      <w:r>
+        <w:br/>
+      </w:r>
+      <w:r>
+        <w:br/>
+      </w:r>
+      <w:r>
+        <w:br/>
+      </w:r>
+      <w:r>
+        <w:br/>
+      </w:r>
+      <w:r>
+        <w:br/>
+      </w:r>
+      <w:r>
+        <w:br/>
+      </w:r>
+      <w:r>
+        <w:br/>
+      </w:r>
+      <w:r>
+        <w:br/>
+      </w:r>
+      <w:r>
+        <w:br/>
+      </w:r>
+      <w:r>
+        <w:br/>
+      </w:r>
+      <w:r>
+        <w:br/>
+      </w:r>
+      <w:r>
+        <w:br/>
+      </w:r>
     </w:p>
     <w:p>
       <w:pPr>
@@ -4731,6 +4803,7 @@
       </w:pPr>
       <w:bookmarkStart w:id="19" w:name="_Toc227743257"/>
       <w:r>
+        <w:lastRenderedPageBreak/>
         <w:t>Chapter 2 – Literature Survey</w:t>
       </w:r>
       <w:bookmarkEnd w:id="19"/>
@@ -4883,26 +4956,10 @@
         <w:keepNext/>
       </w:pPr>
       <w:r>
-        <w:t xml:space="preserve">Perlin Noise is used in </w:t>
-      </w:r>
-      <w:proofErr w:type="gramStart"/>
-      <w:r>
-        <w:t>the majority of</w:t>
-      </w:r>
-      <w:proofErr w:type="gramEnd"/>
-      <w:r>
-        <w:t xml:space="preserve"> world generations due to its versatility.</w:t>
-      </w:r>
-      <w:r>
-        <w:t xml:space="preserve"> It works </w:t>
-      </w:r>
-      <w:proofErr w:type="gramStart"/>
-      <w:r>
-        <w:t>through the use of</w:t>
-      </w:r>
-      <w:proofErr w:type="gramEnd"/>
-      <w:r>
-        <w:t xml:space="preserve"> layering</w:t>
+        <w:t>Perlin Noise is used in the majority of world generations due to its versatility.</w:t>
+      </w:r>
+      <w:r>
+        <w:t xml:space="preserve"> It works through the use of layering</w:t>
       </w:r>
       <w:r>
         <w:t xml:space="preserve"> </w:t>
@@ -5385,15 +5442,7 @@
         <w:t>)</w:t>
       </w:r>
       <w:r>
-        <w:t xml:space="preserve"> according to the following two rules: If a cell is alive, it survives to the next generation if it has 2 or 3 live neighbors; otherwise it dies. If a cell is dead, it comes to life in the next generation if it has exactly 3 live neighbors; </w:t>
-      </w:r>
-      <w:proofErr w:type="gramStart"/>
-      <w:r>
-        <w:t>otherwise</w:t>
-      </w:r>
-      <w:proofErr w:type="gramEnd"/>
-      <w:r>
-        <w:t xml:space="preserve"> it stays dead.” </w:t>
+        <w:t xml:space="preserve"> according to the following two rules: If a cell is alive, it survives to the next generation if it has 2 or 3 live neighbors; otherwise it dies. If a cell is dead, it comes to life in the next generation if it has exactly 3 live neighbors; otherwise it stays dead.” </w:t>
       </w:r>
       <w:sdt>
         <w:sdtPr>
@@ -5479,15 +5528,7 @@
         <w:t xml:space="preserve"> </w:t>
       </w:r>
       <w:r>
-        <w:t xml:space="preserve">The types of pathfinding I will be evaluating </w:t>
-      </w:r>
-      <w:proofErr w:type="gramStart"/>
-      <w:r>
-        <w:t>are:</w:t>
-      </w:r>
-      <w:proofErr w:type="gramEnd"/>
-      <w:r>
-        <w:t xml:space="preserve"> A*, Dijkstra</w:t>
+        <w:t>The types of pathfinding I will be evaluating are: A*, Dijkstra</w:t>
       </w:r>
       <w:r>
         <w:t>,</w:t>
@@ -5635,15 +5676,7 @@
         <w:t xml:space="preserve">Figure 2 shows how a graph is constructed and shows the movement cost of each path. </w:t>
       </w:r>
       <w:r>
-        <w:t xml:space="preserve">For example, from our source node, node 0, we calculate the distance to </w:t>
-      </w:r>
-      <w:proofErr w:type="gramStart"/>
-      <w:r>
-        <w:t>all of</w:t>
-      </w:r>
-      <w:proofErr w:type="gramEnd"/>
-      <w:r>
-        <w:t xml:space="preserve"> its neighbour nodes, in this case being nodes 1 and 2 and take a </w:t>
+        <w:t xml:space="preserve">For example, from our source node, node 0, we calculate the distance to all of its neighbour nodes, in this case being nodes 1 and 2 and take a </w:t>
       </w:r>
       <w:r>
         <w:t>“</w:t>
@@ -5689,15 +5722,7 @@
     </w:p>
     <w:p>
       <w:r>
-        <w:t xml:space="preserve">A* is an algorithm that shares the same approach as Dijkstra, although it is more efficient. </w:t>
-      </w:r>
-      <w:proofErr w:type="gramStart"/>
-      <w:r>
-        <w:t>In order to</w:t>
-      </w:r>
-      <w:proofErr w:type="gramEnd"/>
-      <w:r>
-        <w:t xml:space="preserve"> be more efficient, the algorithm “combines Dijkstra’s algorithm with a case-specific heuristic value”</w:t>
+        <w:t>A* is an algorithm that shares the same approach as Dijkstra, although it is more efficient. In order to be more efficient, the algorithm “combines Dijkstra’s algorithm with a case-specific heuristic value”</w:t>
       </w:r>
       <w:r>
         <w:t xml:space="preserve"> </w:t>
@@ -5731,11 +5756,9 @@
       <w:r>
         <w:t xml:space="preserve">. This is always guaranteed to find the shortest path and the heuristic value allows the algorithm to disregard paths that lead away from the destination, allowing for major optimizations </w:t>
       </w:r>
-      <w:proofErr w:type="gramStart"/>
       <w:r>
         <w:t>in regard to</w:t>
       </w:r>
-      <w:proofErr w:type="gramEnd"/>
       <w:r>
         <w:t xml:space="preserve"> the computation speed of the algorithm. </w:t>
       </w:r>
@@ -5784,15 +5807,7 @@
         <w:t xml:space="preserve">, JPS serves as a substantial optimization through the use of “pruning” unnecessary nodes and “jumping over” empty spaces. Disregarding the </w:t>
       </w:r>
       <w:r>
-        <w:t xml:space="preserve">path cost calculations along with the </w:t>
-      </w:r>
-      <w:proofErr w:type="gramStart"/>
-      <w:r>
-        <w:t>aforementioned optimizations</w:t>
-      </w:r>
-      <w:proofErr w:type="gramEnd"/>
-      <w:r>
-        <w:t xml:space="preserve"> allows JPS to be significantly faster than A*, even up to an order of magnitude faster.</w:t>
+        <w:t>path cost calculations along with the aforementioned optimizations allows JPS to be significantly faster than A*, even up to an order of magnitude faster.</w:t>
       </w:r>
     </w:p>
     <w:p>
@@ -6297,7 +6312,7 @@
           <w:noProof/>
         </w:rPr>
         <w:drawing>
-          <wp:inline distT="0" distB="0" distL="0" distR="0" wp14:anchorId="7D5A5376" wp14:editId="31D4EDFB">
+          <wp:inline distT="0" distB="0" distL="0" distR="0" wp14:anchorId="7D5A5376" wp14:editId="3EF17D2F">
             <wp:extent cx="2479538" cy="2261556"/>
             <wp:effectExtent l="0" t="0" r="0" b="5715"/>
             <wp:docPr id="455141339" name="Picture 4"/>
@@ -6378,15 +6393,7 @@
         <w:t>√</w:t>
       </w:r>
       <w:r>
-        <w:t xml:space="preserve">2 while getting the movement of 2 tiles. </w:t>
-      </w:r>
-      <w:proofErr w:type="gramStart"/>
-      <w:r>
-        <w:t>In order to</w:t>
-      </w:r>
-      <w:proofErr w:type="gramEnd"/>
-      <w:r>
-        <w:t xml:space="preserve"> combat this, I have decided to use a hexagonal grid which has uniform lengths to all neighbouring tiles.</w:t>
+        <w:t>2 while getting the movement of 2 tiles. In order to combat this, I have decided to use a hexagonal grid which has uniform lengths to all neighbouring tiles.</w:t>
       </w:r>
     </w:p>
     <w:tbl>
@@ -6423,7 +6430,7 @@
               </w:rPr>
               <w:lastRenderedPageBreak/>
               <w:drawing>
-                <wp:inline distT="0" distB="0" distL="0" distR="0" wp14:anchorId="2A67817B" wp14:editId="44F97A48">
+                <wp:inline distT="0" distB="0" distL="0" distR="0" wp14:anchorId="2A67817B" wp14:editId="708BD183">
                   <wp:extent cx="2295525" cy="2105025"/>
                   <wp:effectExtent l="0" t="0" r="0" b="0"/>
                   <wp:docPr id="1070291612" name="Picture 5"/>
@@ -6851,15 +6858,7 @@
         <w:t xml:space="preserve"> a pixel is, can become the boundaries for biomes. In this example, there are only 3 biomes: ocean, beach, and grass</w:t>
       </w:r>
       <w:r>
-        <w:t xml:space="preserve">. The </w:t>
-      </w:r>
-      <w:proofErr w:type="gramStart"/>
-      <w:r>
-        <w:t>amount</w:t>
-      </w:r>
-      <w:proofErr w:type="gramEnd"/>
-      <w:r>
-        <w:t xml:space="preserve"> of biomes possible are technically infinite. Although biome separation will be very prevalent as you go past roughly 10 biomes. </w:t>
+        <w:t xml:space="preserve">. The amount of biomes possible are technically infinite. Although biome separation will be very prevalent as you go past roughly 10 biomes. </w:t>
       </w:r>
     </w:p>
     <w:p/>
@@ -6868,15 +6867,7 @@
         <w:t xml:space="preserve">For my game, I am choosing to have 5 true biomes: Deep water, shallow water, sand, grass and snow. Each of these biomes are going to be abundant in different resources and </w:t>
       </w:r>
       <w:r>
-        <w:t xml:space="preserve">have very different base tile variables. For example, grassland tiles will contain more production than a sand </w:t>
-      </w:r>
-      <w:proofErr w:type="gramStart"/>
-      <w:r>
-        <w:t>tile</w:t>
-      </w:r>
-      <w:proofErr w:type="gramEnd"/>
-      <w:r>
-        <w:t xml:space="preserve"> but a sand tile will have more gold than a grassland tile</w:t>
+        <w:t>have very different base tile variables. For example, grassland tiles will contain more production than a sand tile but a sand tile will have more gold than a grassland tile</w:t>
       </w:r>
       <w:r>
         <w:t>.</w:t>

</xml_diff>

<commit_message>
feat: added extra explanation of JPS A* and Dijkstra and Wrote Limitations of World Gen
</commit_message>
<xml_diff>
--- a/Report.docx
+++ b/Report.docx
@@ -18,7 +18,7 @@
           <w:szCs w:val="50"/>
           <w:u w:val="single"/>
         </w:rPr>
-        <w:t>INSERT TITLE HERE</w:t>
+        <w:t>Neural Conquest</w:t>
       </w:r>
       <w:r>
         <w:rPr>
@@ -321,7 +321,7 @@
         <w:pStyle w:val="Heading1"/>
       </w:pPr>
       <w:bookmarkStart w:id="1" w:name="_Toc40898999"/>
-      <w:bookmarkStart w:id="2" w:name="_Toc227743241"/>
+      <w:bookmarkStart w:id="2" w:name="_Toc228963411"/>
       <w:r>
         <w:lastRenderedPageBreak/>
         <w:t>Abstract</w:t>
@@ -331,7 +331,15 @@
     </w:p>
     <w:p>
       <w:r>
-        <w:t>AI is a still growing industry and while the current trend of AI is heading towards the usage of Large Language Models, I believe there is a genuine use case for machine learning models within video games. The focus of this project is to uncover the current reasons behind why the industry doesn’t use machine learning AI for uses such as Non-Player Characters or local multiplayer games. This is appro</w:t>
+        <w:t xml:space="preserve">AI is a still growing industry and while the current trend of AI is heading towards the usage of Large Language Models, I believe there is a genuine use case for machine learning models within video games. The focus of this project is to uncover the current reasons behind why the industry doesn’t use machine learning AI for uses such as </w:t>
+      </w:r>
+      <w:proofErr w:type="gramStart"/>
+      <w:r>
+        <w:t>Non-Player Characters</w:t>
+      </w:r>
+      <w:proofErr w:type="gramEnd"/>
+      <w:r>
+        <w:t xml:space="preserve"> or local multiplayer games. This is appro</w:t>
       </w:r>
       <w:r>
         <w:t>ached by covering the design choices and code architecture of implementing a machine learning model into the Unity game engine. To evaluate whether the AI is functional, data has been gathered using a mix of qualitative and quantitative research. This research was collected through a short survey given to participants.</w:t>
@@ -361,7 +369,7 @@
         <w:spacing w:after="321"/>
         <w:ind w:left="-5"/>
       </w:pPr>
-      <w:bookmarkStart w:id="3" w:name="_Toc227743242"/>
+      <w:bookmarkStart w:id="3" w:name="_Toc228963412"/>
       <w:r>
         <w:lastRenderedPageBreak/>
         <w:t>Declaration</w:t>
@@ -483,7 +491,7 @@
         <w:ind w:left="-5"/>
       </w:pPr>
       <w:bookmarkStart w:id="4" w:name="_Toc40899001"/>
-      <w:bookmarkStart w:id="5" w:name="_Toc227743243"/>
+      <w:bookmarkStart w:id="5" w:name="_Toc228963413"/>
       <w:r>
         <w:lastRenderedPageBreak/>
         <w:t>Acknowledgements</w:t>
@@ -496,10 +504,13 @@
         <w:ind w:left="1240" w:right="14"/>
       </w:pPr>
       <w:r>
-        <w:t>I would like to thank my supervisor Matthew Crossley, and tutor Jimmy Mullin for their advice, support and guidance towards the development of **insert name here**.</w:t>
-      </w:r>
-      <w:r>
-        <w:t xml:space="preserve"> I would also like to thank my family and friends for their support and encouragement throughout the development of this game and the write up of this dissertation.</w:t>
+        <w:t xml:space="preserve">I would like to thank my supervisor Matthew Crossley, and tutor Jimmy Mullin for their advice, support and guidance towards the development of </w:t>
+      </w:r>
+      <w:r>
+        <w:t xml:space="preserve">Neural Conquest. </w:t>
+      </w:r>
+      <w:r>
+        <w:t>I would also like to thank my family and friends for their support and encouragement throughout the development of this game and the write up of this dissertation.</w:t>
       </w:r>
     </w:p>
     <w:p>
@@ -617,7 +628,7 @@
         <w:spacing w:line="259" w:lineRule="auto"/>
       </w:pPr>
     </w:p>
-    <w:bookmarkStart w:id="6" w:name="_Toc227743244" w:displacedByCustomXml="next"/>
+    <w:bookmarkStart w:id="6" w:name="_Toc228963414" w:displacedByCustomXml="next"/>
     <w:sdt>
       <w:sdtPr>
         <w:rPr>
@@ -675,7 +686,7 @@
           <w:r>
             <w:fldChar w:fldCharType="separate"/>
           </w:r>
-          <w:hyperlink w:anchor="_Toc227743241" w:history="1">
+          <w:hyperlink w:anchor="_Toc228963411" w:history="1">
             <w:r>
               <w:rPr>
                 <w:rStyle w:val="Hyperlink"/>
@@ -702,7 +713,7 @@
                 <w:noProof/>
                 <w:webHidden/>
               </w:rPr>
-              <w:instrText xml:space="preserve"> PAGEREF _Toc227743241 \h </w:instrText>
+              <w:instrText xml:space="preserve"> PAGEREF _Toc228963411 \h </w:instrText>
             </w:r>
             <w:r>
               <w:rPr>
@@ -749,7 +760,7 @@
               <w14:ligatures w14:val="standardContextual"/>
             </w:rPr>
           </w:pPr>
-          <w:hyperlink w:anchor="_Toc227743242" w:history="1">
+          <w:hyperlink w:anchor="_Toc228963412" w:history="1">
             <w:r>
               <w:rPr>
                 <w:rStyle w:val="Hyperlink"/>
@@ -776,7 +787,7 @@
                 <w:noProof/>
                 <w:webHidden/>
               </w:rPr>
-              <w:instrText xml:space="preserve"> PAGEREF _Toc227743242 \h </w:instrText>
+              <w:instrText xml:space="preserve"> PAGEREF _Toc228963412 \h </w:instrText>
             </w:r>
             <w:r>
               <w:rPr>
@@ -823,7 +834,7 @@
               <w14:ligatures w14:val="standardContextual"/>
             </w:rPr>
           </w:pPr>
-          <w:hyperlink w:anchor="_Toc227743243" w:history="1">
+          <w:hyperlink w:anchor="_Toc228963413" w:history="1">
             <w:r>
               <w:rPr>
                 <w:rStyle w:val="Hyperlink"/>
@@ -850,7 +861,7 @@
                 <w:noProof/>
                 <w:webHidden/>
               </w:rPr>
-              <w:instrText xml:space="preserve"> PAGEREF _Toc227743243 \h </w:instrText>
+              <w:instrText xml:space="preserve"> PAGEREF _Toc228963413 \h </w:instrText>
             </w:r>
             <w:r>
               <w:rPr>
@@ -897,7 +908,7 @@
               <w14:ligatures w14:val="standardContextual"/>
             </w:rPr>
           </w:pPr>
-          <w:hyperlink w:anchor="_Toc227743244" w:history="1">
+          <w:hyperlink w:anchor="_Toc228963414" w:history="1">
             <w:r>
               <w:rPr>
                 <w:rStyle w:val="Hyperlink"/>
@@ -924,7 +935,7 @@
                 <w:noProof/>
                 <w:webHidden/>
               </w:rPr>
-              <w:instrText xml:space="preserve"> PAGEREF _Toc227743244 \h </w:instrText>
+              <w:instrText xml:space="preserve"> PAGEREF _Toc228963414 \h </w:instrText>
             </w:r>
             <w:r>
               <w:rPr>
@@ -971,7 +982,7 @@
               <w14:ligatures w14:val="standardContextual"/>
             </w:rPr>
           </w:pPr>
-          <w:hyperlink w:anchor="_Toc227743245" w:history="1">
+          <w:hyperlink w:anchor="_Toc228963415" w:history="1">
             <w:r>
               <w:rPr>
                 <w:rStyle w:val="Hyperlink"/>
@@ -998,7 +1009,7 @@
                 <w:noProof/>
                 <w:webHidden/>
               </w:rPr>
-              <w:instrText xml:space="preserve"> PAGEREF _Toc227743245 \h </w:instrText>
+              <w:instrText xml:space="preserve"> PAGEREF _Toc228963415 \h </w:instrText>
             </w:r>
             <w:r>
               <w:rPr>
@@ -1045,7 +1056,7 @@
               <w14:ligatures w14:val="standardContextual"/>
             </w:rPr>
           </w:pPr>
-          <w:hyperlink w:anchor="_Toc227743246" w:history="1">
+          <w:hyperlink w:anchor="_Toc228963416" w:history="1">
             <w:r>
               <w:rPr>
                 <w:rStyle w:val="Hyperlink"/>
@@ -1072,7 +1083,7 @@
                 <w:noProof/>
                 <w:webHidden/>
               </w:rPr>
-              <w:instrText xml:space="preserve"> PAGEREF _Toc227743246 \h </w:instrText>
+              <w:instrText xml:space="preserve"> PAGEREF _Toc228963416 \h </w:instrText>
             </w:r>
             <w:r>
               <w:rPr>
@@ -1119,7 +1130,7 @@
               <w14:ligatures w14:val="standardContextual"/>
             </w:rPr>
           </w:pPr>
-          <w:hyperlink w:anchor="_Toc227743247" w:history="1">
+          <w:hyperlink w:anchor="_Toc228963417" w:history="1">
             <w:r>
               <w:rPr>
                 <w:rStyle w:val="Hyperlink"/>
@@ -1146,7 +1157,7 @@
                 <w:noProof/>
                 <w:webHidden/>
               </w:rPr>
-              <w:instrText xml:space="preserve"> PAGEREF _Toc227743247 \h </w:instrText>
+              <w:instrText xml:space="preserve"> PAGEREF _Toc228963417 \h </w:instrText>
             </w:r>
             <w:r>
               <w:rPr>
@@ -1193,7 +1204,7 @@
               <w14:ligatures w14:val="standardContextual"/>
             </w:rPr>
           </w:pPr>
-          <w:hyperlink w:anchor="_Toc227743248" w:history="1">
+          <w:hyperlink w:anchor="_Toc228963418" w:history="1">
             <w:r>
               <w:rPr>
                 <w:rStyle w:val="Hyperlink"/>
@@ -1220,7 +1231,7 @@
                 <w:noProof/>
                 <w:webHidden/>
               </w:rPr>
-              <w:instrText xml:space="preserve"> PAGEREF _Toc227743248 \h </w:instrText>
+              <w:instrText xml:space="preserve"> PAGEREF _Toc228963418 \h </w:instrText>
             </w:r>
             <w:r>
               <w:rPr>
@@ -1267,7 +1278,7 @@
               <w14:ligatures w14:val="standardContextual"/>
             </w:rPr>
           </w:pPr>
-          <w:hyperlink w:anchor="_Toc227743249" w:history="1">
+          <w:hyperlink w:anchor="_Toc228963419" w:history="1">
             <w:r>
               <w:rPr>
                 <w:rStyle w:val="Hyperlink"/>
@@ -1294,7 +1305,7 @@
                 <w:noProof/>
                 <w:webHidden/>
               </w:rPr>
-              <w:instrText xml:space="preserve"> PAGEREF _Toc227743249 \h </w:instrText>
+              <w:instrText xml:space="preserve"> PAGEREF _Toc228963419 \h </w:instrText>
             </w:r>
             <w:r>
               <w:rPr>
@@ -1341,7 +1352,7 @@
               <w14:ligatures w14:val="standardContextual"/>
             </w:rPr>
           </w:pPr>
-          <w:hyperlink w:anchor="_Toc227743250" w:history="1">
+          <w:hyperlink w:anchor="_Toc228963420" w:history="1">
             <w:r>
               <w:rPr>
                 <w:rStyle w:val="Hyperlink"/>
@@ -1368,7 +1379,7 @@
                 <w:noProof/>
                 <w:webHidden/>
               </w:rPr>
-              <w:instrText xml:space="preserve"> PAGEREF _Toc227743250 \h </w:instrText>
+              <w:instrText xml:space="preserve"> PAGEREF _Toc228963420 \h </w:instrText>
             </w:r>
             <w:r>
               <w:rPr>
@@ -1415,7 +1426,7 @@
               <w14:ligatures w14:val="standardContextual"/>
             </w:rPr>
           </w:pPr>
-          <w:hyperlink w:anchor="_Toc227743251" w:history="1">
+          <w:hyperlink w:anchor="_Toc228963421" w:history="1">
             <w:r>
               <w:rPr>
                 <w:rStyle w:val="Hyperlink"/>
@@ -1442,7 +1453,7 @@
                 <w:noProof/>
                 <w:webHidden/>
               </w:rPr>
-              <w:instrText xml:space="preserve"> PAGEREF _Toc227743251 \h </w:instrText>
+              <w:instrText xml:space="preserve"> PAGEREF _Toc228963421 \h </w:instrText>
             </w:r>
             <w:r>
               <w:rPr>
@@ -1489,7 +1500,7 @@
               <w14:ligatures w14:val="standardContextual"/>
             </w:rPr>
           </w:pPr>
-          <w:hyperlink w:anchor="_Toc227743252" w:history="1">
+          <w:hyperlink w:anchor="_Toc228963422" w:history="1">
             <w:r>
               <w:rPr>
                 <w:rStyle w:val="Hyperlink"/>
@@ -1516,7 +1527,7 @@
                 <w:noProof/>
                 <w:webHidden/>
               </w:rPr>
-              <w:instrText xml:space="preserve"> PAGEREF _Toc227743252 \h </w:instrText>
+              <w:instrText xml:space="preserve"> PAGEREF _Toc228963422 \h </w:instrText>
             </w:r>
             <w:r>
               <w:rPr>
@@ -1563,7 +1574,7 @@
               <w14:ligatures w14:val="standardContextual"/>
             </w:rPr>
           </w:pPr>
-          <w:hyperlink w:anchor="_Toc227743253" w:history="1">
+          <w:hyperlink w:anchor="_Toc228963423" w:history="1">
             <w:r>
               <w:rPr>
                 <w:rStyle w:val="Hyperlink"/>
@@ -1590,7 +1601,7 @@
                 <w:noProof/>
                 <w:webHidden/>
               </w:rPr>
-              <w:instrText xml:space="preserve"> PAGEREF _Toc227743253 \h </w:instrText>
+              <w:instrText xml:space="preserve"> PAGEREF _Toc228963423 \h </w:instrText>
             </w:r>
             <w:r>
               <w:rPr>
@@ -1637,7 +1648,7 @@
               <w14:ligatures w14:val="standardContextual"/>
             </w:rPr>
           </w:pPr>
-          <w:hyperlink w:anchor="_Toc227743254" w:history="1">
+          <w:hyperlink w:anchor="_Toc228963424" w:history="1">
             <w:r>
               <w:rPr>
                 <w:rStyle w:val="Hyperlink"/>
@@ -1664,7 +1675,7 @@
                 <w:noProof/>
                 <w:webHidden/>
               </w:rPr>
-              <w:instrText xml:space="preserve"> PAGEREF _Toc227743254 \h </w:instrText>
+              <w:instrText xml:space="preserve"> PAGEREF _Toc228963424 \h </w:instrText>
             </w:r>
             <w:r>
               <w:rPr>
@@ -1711,7 +1722,7 @@
               <w14:ligatures w14:val="standardContextual"/>
             </w:rPr>
           </w:pPr>
-          <w:hyperlink w:anchor="_Toc227743255" w:history="1">
+          <w:hyperlink w:anchor="_Toc228963425" w:history="1">
             <w:r>
               <w:rPr>
                 <w:rStyle w:val="Hyperlink"/>
@@ -1738,7 +1749,7 @@
                 <w:noProof/>
                 <w:webHidden/>
               </w:rPr>
-              <w:instrText xml:space="preserve"> PAGEREF _Toc227743255 \h </w:instrText>
+              <w:instrText xml:space="preserve"> PAGEREF _Toc228963425 \h </w:instrText>
             </w:r>
             <w:r>
               <w:rPr>
@@ -1785,7 +1796,7 @@
               <w14:ligatures w14:val="standardContextual"/>
             </w:rPr>
           </w:pPr>
-          <w:hyperlink w:anchor="_Toc227743256" w:history="1">
+          <w:hyperlink w:anchor="_Toc228963426" w:history="1">
             <w:r>
               <w:rPr>
                 <w:rStyle w:val="Hyperlink"/>
@@ -1812,7 +1823,7 @@
                 <w:noProof/>
                 <w:webHidden/>
               </w:rPr>
-              <w:instrText xml:space="preserve"> PAGEREF _Toc227743256 \h </w:instrText>
+              <w:instrText xml:space="preserve"> PAGEREF _Toc228963426 \h </w:instrText>
             </w:r>
             <w:r>
               <w:rPr>
@@ -1859,7 +1870,7 @@
               <w14:ligatures w14:val="standardContextual"/>
             </w:rPr>
           </w:pPr>
-          <w:hyperlink w:anchor="_Toc227743257" w:history="1">
+          <w:hyperlink w:anchor="_Toc228963427" w:history="1">
             <w:r>
               <w:rPr>
                 <w:rStyle w:val="Hyperlink"/>
@@ -1886,7 +1897,7 @@
                 <w:noProof/>
                 <w:webHidden/>
               </w:rPr>
-              <w:instrText xml:space="preserve"> PAGEREF _Toc227743257 \h </w:instrText>
+              <w:instrText xml:space="preserve"> PAGEREF _Toc228963427 \h </w:instrText>
             </w:r>
             <w:r>
               <w:rPr>
@@ -1906,7 +1917,7 @@
                 <w:noProof/>
                 <w:webHidden/>
               </w:rPr>
-              <w:t>4</w:t>
+              <w:t>5</w:t>
             </w:r>
             <w:r>
               <w:rPr>
@@ -1933,7 +1944,7 @@
               <w14:ligatures w14:val="standardContextual"/>
             </w:rPr>
           </w:pPr>
-          <w:hyperlink w:anchor="_Toc227743258" w:history="1">
+          <w:hyperlink w:anchor="_Toc228963428" w:history="1">
             <w:r>
               <w:rPr>
                 <w:rStyle w:val="Hyperlink"/>
@@ -1960,7 +1971,7 @@
                 <w:noProof/>
                 <w:webHidden/>
               </w:rPr>
-              <w:instrText xml:space="preserve"> PAGEREF _Toc227743258 \h </w:instrText>
+              <w:instrText xml:space="preserve"> PAGEREF _Toc228963428 \h </w:instrText>
             </w:r>
             <w:r>
               <w:rPr>
@@ -1980,7 +1991,7 @@
                 <w:noProof/>
                 <w:webHidden/>
               </w:rPr>
-              <w:t>4</w:t>
+              <w:t>5</w:t>
             </w:r>
             <w:r>
               <w:rPr>
@@ -2007,7 +2018,7 @@
               <w14:ligatures w14:val="standardContextual"/>
             </w:rPr>
           </w:pPr>
-          <w:hyperlink w:anchor="_Toc227743259" w:history="1">
+          <w:hyperlink w:anchor="_Toc228963429" w:history="1">
             <w:r>
               <w:rPr>
                 <w:rStyle w:val="Hyperlink"/>
@@ -2034,7 +2045,7 @@
                 <w:noProof/>
                 <w:webHidden/>
               </w:rPr>
-              <w:instrText xml:space="preserve"> PAGEREF _Toc227743259 \h </w:instrText>
+              <w:instrText xml:space="preserve"> PAGEREF _Toc228963429 \h </w:instrText>
             </w:r>
             <w:r>
               <w:rPr>
@@ -2054,7 +2065,7 @@
                 <w:noProof/>
                 <w:webHidden/>
               </w:rPr>
-              <w:t>4</w:t>
+              <w:t>5</w:t>
             </w:r>
             <w:r>
               <w:rPr>
@@ -2081,7 +2092,7 @@
               <w14:ligatures w14:val="standardContextual"/>
             </w:rPr>
           </w:pPr>
-          <w:hyperlink w:anchor="_Toc227743260" w:history="1">
+          <w:hyperlink w:anchor="_Toc228963430" w:history="1">
             <w:r>
               <w:rPr>
                 <w:rStyle w:val="Hyperlink"/>
@@ -2108,7 +2119,7 @@
                 <w:noProof/>
                 <w:webHidden/>
               </w:rPr>
-              <w:instrText xml:space="preserve"> PAGEREF _Toc227743260 \h </w:instrText>
+              <w:instrText xml:space="preserve"> PAGEREF _Toc228963430 \h </w:instrText>
             </w:r>
             <w:r>
               <w:rPr>
@@ -2128,7 +2139,7 @@
                 <w:noProof/>
                 <w:webHidden/>
               </w:rPr>
-              <w:t>4</w:t>
+              <w:t>5</w:t>
             </w:r>
             <w:r>
               <w:rPr>
@@ -2151,7 +2162,7 @@
               <w:lang w:eastAsia="en-GB"/>
             </w:rPr>
           </w:pPr>
-          <w:hyperlink w:anchor="_Toc227743261" w:history="1">
+          <w:hyperlink w:anchor="_Toc228963431" w:history="1">
             <w:r>
               <w:rPr>
                 <w:rStyle w:val="Hyperlink"/>
@@ -2178,7 +2189,7 @@
                 <w:noProof/>
                 <w:webHidden/>
               </w:rPr>
-              <w:instrText xml:space="preserve"> PAGEREF _Toc227743261 \h </w:instrText>
+              <w:instrText xml:space="preserve"> PAGEREF _Toc228963431 \h </w:instrText>
             </w:r>
             <w:r>
               <w:rPr>
@@ -2198,7 +2209,7 @@
                 <w:noProof/>
                 <w:webHidden/>
               </w:rPr>
-              <w:t>4</w:t>
+              <w:t>5</w:t>
             </w:r>
             <w:r>
               <w:rPr>
@@ -2221,7 +2232,7 @@
               <w:lang w:eastAsia="en-GB"/>
             </w:rPr>
           </w:pPr>
-          <w:hyperlink w:anchor="_Toc227743262" w:history="1">
+          <w:hyperlink w:anchor="_Toc228963432" w:history="1">
             <w:r>
               <w:rPr>
                 <w:rStyle w:val="Hyperlink"/>
@@ -2248,7 +2259,7 @@
                 <w:noProof/>
                 <w:webHidden/>
               </w:rPr>
-              <w:instrText xml:space="preserve"> PAGEREF _Toc227743262 \h </w:instrText>
+              <w:instrText xml:space="preserve"> PAGEREF _Toc228963432 \h </w:instrText>
             </w:r>
             <w:r>
               <w:rPr>
@@ -2268,7 +2279,7 @@
                 <w:noProof/>
                 <w:webHidden/>
               </w:rPr>
-              <w:t>5</w:t>
+              <w:t>6</w:t>
             </w:r>
             <w:r>
               <w:rPr>
@@ -2291,7 +2302,7 @@
               <w:lang w:eastAsia="en-GB"/>
             </w:rPr>
           </w:pPr>
-          <w:hyperlink w:anchor="_Toc227743263" w:history="1">
+          <w:hyperlink w:anchor="_Toc228963433" w:history="1">
             <w:r>
               <w:rPr>
                 <w:rStyle w:val="Hyperlink"/>
@@ -2318,7 +2329,7 @@
                 <w:noProof/>
                 <w:webHidden/>
               </w:rPr>
-              <w:instrText xml:space="preserve"> PAGEREF _Toc227743263 \h </w:instrText>
+              <w:instrText xml:space="preserve"> PAGEREF _Toc228963433 \h </w:instrText>
             </w:r>
             <w:r>
               <w:rPr>
@@ -2338,7 +2349,7 @@
                 <w:noProof/>
                 <w:webHidden/>
               </w:rPr>
-              <w:t>5</w:t>
+              <w:t>6</w:t>
             </w:r>
             <w:r>
               <w:rPr>
@@ -2365,7 +2376,7 @@
               <w14:ligatures w14:val="standardContextual"/>
             </w:rPr>
           </w:pPr>
-          <w:hyperlink w:anchor="_Toc227743264" w:history="1">
+          <w:hyperlink w:anchor="_Toc228963434" w:history="1">
             <w:r>
               <w:rPr>
                 <w:rStyle w:val="Hyperlink"/>
@@ -2392,7 +2403,7 @@
                 <w:noProof/>
                 <w:webHidden/>
               </w:rPr>
-              <w:instrText xml:space="preserve"> PAGEREF _Toc227743264 \h </w:instrText>
+              <w:instrText xml:space="preserve"> PAGEREF _Toc228963434 \h </w:instrText>
             </w:r>
             <w:r>
               <w:rPr>
@@ -2412,7 +2423,7 @@
                 <w:noProof/>
                 <w:webHidden/>
               </w:rPr>
-              <w:t>6</w:t>
+              <w:t>7</w:t>
             </w:r>
             <w:r>
               <w:rPr>
@@ -2435,7 +2446,7 @@
               <w:lang w:eastAsia="en-GB"/>
             </w:rPr>
           </w:pPr>
-          <w:hyperlink w:anchor="_Toc227743265" w:history="1">
+          <w:hyperlink w:anchor="_Toc228963435" w:history="1">
             <w:r>
               <w:rPr>
                 <w:rStyle w:val="Hyperlink"/>
@@ -2462,7 +2473,7 @@
                 <w:noProof/>
                 <w:webHidden/>
               </w:rPr>
-              <w:instrText xml:space="preserve"> PAGEREF _Toc227743265 \h </w:instrText>
+              <w:instrText xml:space="preserve"> PAGEREF _Toc228963435 \h </w:instrText>
             </w:r>
             <w:r>
               <w:rPr>
@@ -2482,7 +2493,7 @@
                 <w:noProof/>
                 <w:webHidden/>
               </w:rPr>
-              <w:t>6</w:t>
+              <w:t>7</w:t>
             </w:r>
             <w:r>
               <w:rPr>
@@ -2505,7 +2516,7 @@
               <w:lang w:eastAsia="en-GB"/>
             </w:rPr>
           </w:pPr>
-          <w:hyperlink w:anchor="_Toc227743266" w:history="1">
+          <w:hyperlink w:anchor="_Toc228963436" w:history="1">
             <w:r>
               <w:rPr>
                 <w:rStyle w:val="Hyperlink"/>
@@ -2532,7 +2543,7 @@
                 <w:noProof/>
                 <w:webHidden/>
               </w:rPr>
-              <w:instrText xml:space="preserve"> PAGEREF _Toc227743266 \h </w:instrText>
+              <w:instrText xml:space="preserve"> PAGEREF _Toc228963436 \h </w:instrText>
             </w:r>
             <w:r>
               <w:rPr>
@@ -2552,7 +2563,7 @@
                 <w:noProof/>
                 <w:webHidden/>
               </w:rPr>
-              <w:t>7</w:t>
+              <w:t>8</w:t>
             </w:r>
             <w:r>
               <w:rPr>
@@ -2575,7 +2586,7 @@
               <w:lang w:eastAsia="en-GB"/>
             </w:rPr>
           </w:pPr>
-          <w:hyperlink w:anchor="_Toc227743267" w:history="1">
+          <w:hyperlink w:anchor="_Toc228963437" w:history="1">
             <w:r>
               <w:rPr>
                 <w:rStyle w:val="Hyperlink"/>
@@ -2602,7 +2613,7 @@
                 <w:noProof/>
                 <w:webHidden/>
               </w:rPr>
-              <w:instrText xml:space="preserve"> PAGEREF _Toc227743267 \h </w:instrText>
+              <w:instrText xml:space="preserve"> PAGEREF _Toc228963437 \h </w:instrText>
             </w:r>
             <w:r>
               <w:rPr>
@@ -2622,7 +2633,7 @@
                 <w:noProof/>
                 <w:webHidden/>
               </w:rPr>
-              <w:t>7</w:t>
+              <w:t>8</w:t>
             </w:r>
             <w:r>
               <w:rPr>
@@ -2649,7 +2660,7 @@
               <w14:ligatures w14:val="standardContextual"/>
             </w:rPr>
           </w:pPr>
-          <w:hyperlink w:anchor="_Toc227743268" w:history="1">
+          <w:hyperlink w:anchor="_Toc228963438" w:history="1">
             <w:r>
               <w:rPr>
                 <w:rStyle w:val="Hyperlink"/>
@@ -2676,7 +2687,7 @@
                 <w:noProof/>
                 <w:webHidden/>
               </w:rPr>
-              <w:instrText xml:space="preserve"> PAGEREF _Toc227743268 \h </w:instrText>
+              <w:instrText xml:space="preserve"> PAGEREF _Toc228963438 \h </w:instrText>
             </w:r>
             <w:r>
               <w:rPr>
@@ -2696,7 +2707,7 @@
                 <w:noProof/>
                 <w:webHidden/>
               </w:rPr>
-              <w:t>7</w:t>
+              <w:t>8</w:t>
             </w:r>
             <w:r>
               <w:rPr>
@@ -2719,7 +2730,7 @@
               <w:lang w:eastAsia="en-GB"/>
             </w:rPr>
           </w:pPr>
-          <w:hyperlink w:anchor="_Toc227743269" w:history="1">
+          <w:hyperlink w:anchor="_Toc228963439" w:history="1">
             <w:r>
               <w:rPr>
                 <w:rStyle w:val="Hyperlink"/>
@@ -2746,7 +2757,7 @@
                 <w:noProof/>
                 <w:webHidden/>
               </w:rPr>
-              <w:instrText xml:space="preserve"> PAGEREF _Toc227743269 \h </w:instrText>
+              <w:instrText xml:space="preserve"> PAGEREF _Toc228963439 \h </w:instrText>
             </w:r>
             <w:r>
               <w:rPr>
@@ -2766,7 +2777,7 @@
                 <w:noProof/>
                 <w:webHidden/>
               </w:rPr>
-              <w:t>7</w:t>
+              <w:t>8</w:t>
             </w:r>
             <w:r>
               <w:rPr>
@@ -2789,7 +2800,7 @@
               <w:lang w:eastAsia="en-GB"/>
             </w:rPr>
           </w:pPr>
-          <w:hyperlink w:anchor="_Toc227743270" w:history="1">
+          <w:hyperlink w:anchor="_Toc228963440" w:history="1">
             <w:r>
               <w:rPr>
                 <w:rStyle w:val="Hyperlink"/>
@@ -2816,7 +2827,7 @@
                 <w:noProof/>
                 <w:webHidden/>
               </w:rPr>
-              <w:instrText xml:space="preserve"> PAGEREF _Toc227743270 \h </w:instrText>
+              <w:instrText xml:space="preserve"> PAGEREF _Toc228963440 \h </w:instrText>
             </w:r>
             <w:r>
               <w:rPr>
@@ -2836,7 +2847,7 @@
                 <w:noProof/>
                 <w:webHidden/>
               </w:rPr>
-              <w:t>7</w:t>
+              <w:t>9</w:t>
             </w:r>
             <w:r>
               <w:rPr>
@@ -2859,7 +2870,7 @@
               <w:lang w:eastAsia="en-GB"/>
             </w:rPr>
           </w:pPr>
-          <w:hyperlink w:anchor="_Toc227743271" w:history="1">
+          <w:hyperlink w:anchor="_Toc228963441" w:history="1">
             <w:r>
               <w:rPr>
                 <w:rStyle w:val="Hyperlink"/>
@@ -2886,7 +2897,7 @@
                 <w:noProof/>
                 <w:webHidden/>
               </w:rPr>
-              <w:instrText xml:space="preserve"> PAGEREF _Toc227743271 \h </w:instrText>
+              <w:instrText xml:space="preserve"> PAGEREF _Toc228963441 \h </w:instrText>
             </w:r>
             <w:r>
               <w:rPr>
@@ -2906,7 +2917,7 @@
                 <w:noProof/>
                 <w:webHidden/>
               </w:rPr>
-              <w:t>8</w:t>
+              <w:t>9</w:t>
             </w:r>
             <w:r>
               <w:rPr>
@@ -2933,7 +2944,7 @@
               <w14:ligatures w14:val="standardContextual"/>
             </w:rPr>
           </w:pPr>
-          <w:hyperlink w:anchor="_Toc227743272" w:history="1">
+          <w:hyperlink w:anchor="_Toc228963442" w:history="1">
             <w:r>
               <w:rPr>
                 <w:rStyle w:val="Hyperlink"/>
@@ -2960,7 +2971,7 @@
                 <w:noProof/>
                 <w:webHidden/>
               </w:rPr>
-              <w:instrText xml:space="preserve"> PAGEREF _Toc227743272 \h </w:instrText>
+              <w:instrText xml:space="preserve"> PAGEREF _Toc228963442 \h </w:instrText>
             </w:r>
             <w:r>
               <w:rPr>
@@ -2980,7 +2991,7 @@
                 <w:noProof/>
                 <w:webHidden/>
               </w:rPr>
-              <w:t>9</w:t>
+              <w:t>10</w:t>
             </w:r>
             <w:r>
               <w:rPr>
@@ -3007,7 +3018,7 @@
               <w14:ligatures w14:val="standardContextual"/>
             </w:rPr>
           </w:pPr>
-          <w:hyperlink w:anchor="_Toc227743273" w:history="1">
+          <w:hyperlink w:anchor="_Toc228963443" w:history="1">
             <w:r>
               <w:rPr>
                 <w:rStyle w:val="Hyperlink"/>
@@ -3034,7 +3045,7 @@
                 <w:noProof/>
                 <w:webHidden/>
               </w:rPr>
-              <w:instrText xml:space="preserve"> PAGEREF _Toc227743273 \h </w:instrText>
+              <w:instrText xml:space="preserve"> PAGEREF _Toc228963443 \h </w:instrText>
             </w:r>
             <w:r>
               <w:rPr>
@@ -3054,7 +3065,7 @@
                 <w:noProof/>
                 <w:webHidden/>
               </w:rPr>
-              <w:t>9</w:t>
+              <w:t>10</w:t>
             </w:r>
             <w:r>
               <w:rPr>
@@ -3081,7 +3092,7 @@
               <w14:ligatures w14:val="standardContextual"/>
             </w:rPr>
           </w:pPr>
-          <w:hyperlink w:anchor="_Toc227743274" w:history="1">
+          <w:hyperlink w:anchor="_Toc228963444" w:history="1">
             <w:r>
               <w:rPr>
                 <w:rStyle w:val="Hyperlink"/>
@@ -3108,7 +3119,7 @@
                 <w:noProof/>
                 <w:webHidden/>
               </w:rPr>
-              <w:instrText xml:space="preserve"> PAGEREF _Toc227743274 \h </w:instrText>
+              <w:instrText xml:space="preserve"> PAGEREF _Toc228963444 \h </w:instrText>
             </w:r>
             <w:r>
               <w:rPr>
@@ -3128,7 +3139,7 @@
                 <w:noProof/>
                 <w:webHidden/>
               </w:rPr>
-              <w:t>9</w:t>
+              <w:t>11</w:t>
             </w:r>
             <w:r>
               <w:rPr>
@@ -3155,7 +3166,7 @@
               <w14:ligatures w14:val="standardContextual"/>
             </w:rPr>
           </w:pPr>
-          <w:hyperlink w:anchor="_Toc227743275" w:history="1">
+          <w:hyperlink w:anchor="_Toc228963445" w:history="1">
             <w:r>
               <w:rPr>
                 <w:rStyle w:val="Hyperlink"/>
@@ -3182,7 +3193,7 @@
                 <w:noProof/>
                 <w:webHidden/>
               </w:rPr>
-              <w:instrText xml:space="preserve"> PAGEREF _Toc227743275 \h </w:instrText>
+              <w:instrText xml:space="preserve"> PAGEREF _Toc228963445 \h </w:instrText>
             </w:r>
             <w:r>
               <w:rPr>
@@ -3202,7 +3213,7 @@
                 <w:noProof/>
                 <w:webHidden/>
               </w:rPr>
-              <w:t>10</w:t>
+              <w:t>12</w:t>
             </w:r>
             <w:r>
               <w:rPr>
@@ -3229,7 +3240,7 @@
               <w14:ligatures w14:val="standardContextual"/>
             </w:rPr>
           </w:pPr>
-          <w:hyperlink w:anchor="_Toc227743276" w:history="1">
+          <w:hyperlink w:anchor="_Toc228963446" w:history="1">
             <w:r>
               <w:rPr>
                 <w:rStyle w:val="Hyperlink"/>
@@ -3256,7 +3267,7 @@
                 <w:noProof/>
                 <w:webHidden/>
               </w:rPr>
-              <w:instrText xml:space="preserve"> PAGEREF _Toc227743276 \h </w:instrText>
+              <w:instrText xml:space="preserve"> PAGEREF _Toc228963446 \h </w:instrText>
             </w:r>
             <w:r>
               <w:rPr>
@@ -3276,7 +3287,7 @@
                 <w:noProof/>
                 <w:webHidden/>
               </w:rPr>
-              <w:t>11</w:t>
+              <w:t>13</w:t>
             </w:r>
             <w:r>
               <w:rPr>
@@ -3303,7 +3314,7 @@
               <w14:ligatures w14:val="standardContextual"/>
             </w:rPr>
           </w:pPr>
-          <w:hyperlink w:anchor="_Toc227743277" w:history="1">
+          <w:hyperlink w:anchor="_Toc228963447" w:history="1">
             <w:r>
               <w:rPr>
                 <w:rStyle w:val="Hyperlink"/>
@@ -3330,7 +3341,7 @@
                 <w:noProof/>
                 <w:webHidden/>
               </w:rPr>
-              <w:instrText xml:space="preserve"> PAGEREF _Toc227743277 \h </w:instrText>
+              <w:instrText xml:space="preserve"> PAGEREF _Toc228963447 \h </w:instrText>
             </w:r>
             <w:r>
               <w:rPr>
@@ -3350,7 +3361,81 @@
                 <w:noProof/>
                 <w:webHidden/>
               </w:rPr>
-              <w:t>11</w:t>
+              <w:t>13</w:t>
+            </w:r>
+            <w:r>
+              <w:rPr>
+                <w:noProof/>
+                <w:webHidden/>
+              </w:rPr>
+              <w:fldChar w:fldCharType="end"/>
+            </w:r>
+          </w:hyperlink>
+        </w:p>
+        <w:p>
+          <w:pPr>
+            <w:pStyle w:val="TOC3"/>
+            <w:tabs>
+              <w:tab w:val="right" w:leader="dot" w:pos="9016"/>
+            </w:tabs>
+            <w:rPr>
+              <w:rFonts w:asciiTheme="minorHAnsi" w:hAnsiTheme="minorHAnsi" w:cstheme="minorBidi"/>
+              <w:noProof/>
+              <w:kern w:val="2"/>
+              <w:sz w:val="24"/>
+              <w:szCs w:val="24"/>
+              <w:lang w:val="en-GB" w:eastAsia="en-GB"/>
+              <w14:ligatures w14:val="standardContextual"/>
+            </w:rPr>
+          </w:pPr>
+          <w:hyperlink w:anchor="_Toc228963448" w:history="1">
+            <w:r>
+              <w:rPr>
+                <w:rStyle w:val="Hyperlink"/>
+                <w:noProof/>
+              </w:rPr>
+              <w:t>3.1.5 Limitations</w:t>
+            </w:r>
+            <w:r>
+              <w:rPr>
+                <w:noProof/>
+                <w:webHidden/>
+              </w:rPr>
+              <w:tab/>
+            </w:r>
+            <w:r>
+              <w:rPr>
+                <w:noProof/>
+                <w:webHidden/>
+              </w:rPr>
+              <w:fldChar w:fldCharType="begin"/>
+            </w:r>
+            <w:r>
+              <w:rPr>
+                <w:noProof/>
+                <w:webHidden/>
+              </w:rPr>
+              <w:instrText xml:space="preserve"> PAGEREF _Toc228963448 \h </w:instrText>
+            </w:r>
+            <w:r>
+              <w:rPr>
+                <w:noProof/>
+                <w:webHidden/>
+              </w:rPr>
+            </w:r>
+            <w:r>
+              <w:rPr>
+                <w:noProof/>
+                <w:webHidden/>
+              </w:rPr>
+              <w:fldChar w:fldCharType="separate"/>
+            </w:r>
+            <w:r>
+              <w:rPr>
+                <w:noProof/>
+                <w:webHidden/>
+              </w:rPr>
+              <w:t>13</w:t>
             </w:r>
             <w:r>
               <w:rPr>
@@ -3377,7 +3462,7 @@
               <w14:ligatures w14:val="standardContextual"/>
             </w:rPr>
           </w:pPr>
-          <w:hyperlink w:anchor="_Toc227743278" w:history="1">
+          <w:hyperlink w:anchor="_Toc228963449" w:history="1">
             <w:r>
               <w:rPr>
                 <w:rStyle w:val="Hyperlink"/>
@@ -3404,7 +3489,7 @@
                 <w:noProof/>
                 <w:webHidden/>
               </w:rPr>
-              <w:instrText xml:space="preserve"> PAGEREF _Toc227743278 \h </w:instrText>
+              <w:instrText xml:space="preserve"> PAGEREF _Toc228963449 \h </w:instrText>
             </w:r>
             <w:r>
               <w:rPr>
@@ -3424,7 +3509,7 @@
                 <w:noProof/>
                 <w:webHidden/>
               </w:rPr>
-              <w:t>12</w:t>
+              <w:t>14</w:t>
             </w:r>
             <w:r>
               <w:rPr>
@@ -3451,7 +3536,7 @@
               <w14:ligatures w14:val="standardContextual"/>
             </w:rPr>
           </w:pPr>
-          <w:hyperlink w:anchor="_Toc227743279" w:history="1">
+          <w:hyperlink w:anchor="_Toc228963450" w:history="1">
             <w:r>
               <w:rPr>
                 <w:rStyle w:val="Hyperlink"/>
@@ -3478,7 +3563,7 @@
                 <w:noProof/>
                 <w:webHidden/>
               </w:rPr>
-              <w:instrText xml:space="preserve"> PAGEREF _Toc227743279 \h </w:instrText>
+              <w:instrText xml:space="preserve"> PAGEREF _Toc228963450 \h </w:instrText>
             </w:r>
             <w:r>
               <w:rPr>
@@ -3498,7 +3583,7 @@
                 <w:noProof/>
                 <w:webHidden/>
               </w:rPr>
-              <w:t>12</w:t>
+              <w:t>14</w:t>
             </w:r>
             <w:r>
               <w:rPr>
@@ -3535,7 +3620,7 @@
       <w:pPr>
         <w:pStyle w:val="Heading1"/>
       </w:pPr>
-      <w:bookmarkStart w:id="7" w:name="_Toc227743245"/>
+      <w:bookmarkStart w:id="7" w:name="_Toc228963415"/>
       <w:r>
         <w:t>Table of Figures</w:t>
       </w:r>
@@ -4093,7 +4178,7 @@
       <w:pPr>
         <w:pStyle w:val="Heading1"/>
       </w:pPr>
-      <w:bookmarkStart w:id="8" w:name="_Toc227743246"/>
+      <w:bookmarkStart w:id="8" w:name="_Toc228963416"/>
       <w:r>
         <w:t>Chapter 1</w:t>
       </w:r>
@@ -4121,7 +4206,7 @@
           <w:u w:val="single"/>
         </w:rPr>
       </w:pPr>
-      <w:bookmarkStart w:id="9" w:name="_Toc227743247"/>
+      <w:bookmarkStart w:id="9" w:name="_Toc228963417"/>
       <w:r>
         <w:t>1.1</w:t>
       </w:r>
@@ -4132,7 +4217,13 @@
     </w:p>
     <w:p>
       <w:r>
-        <w:t>In this report, I will follow the design, creation, implementation and thought process behind **insert title here**. The game will be designed so the player will be gradually pushed into playing better moves to stay ahead of the AI enemy</w:t>
+        <w:t xml:space="preserve">In this report, I will follow the design, creation, implementation and thought process behind </w:t>
+      </w:r>
+      <w:r>
+        <w:t>Neural Conquest.</w:t>
+      </w:r>
+      <w:r>
+        <w:t xml:space="preserve"> The game will be designed so the player will be gradually pushed into playing better moves to stay ahead of the AI enemy</w:t>
       </w:r>
       <w:r>
         <w:t xml:space="preserve"> </w:t>
@@ -4166,7 +4257,7 @@
       <w:pPr>
         <w:pStyle w:val="Heading2"/>
       </w:pPr>
-      <w:bookmarkStart w:id="10" w:name="_Toc227743248"/>
+      <w:bookmarkStart w:id="10" w:name="_Toc228963418"/>
       <w:r>
         <w:t>1.2 Aims</w:t>
       </w:r>
@@ -4182,7 +4273,7 @@
           <w:szCs w:val="28"/>
         </w:rPr>
       </w:pPr>
-      <w:bookmarkStart w:id="11" w:name="_Toc227743249"/>
+      <w:bookmarkStart w:id="11" w:name="_Toc228963419"/>
       <w:r>
         <w:rPr>
           <w:rStyle w:val="Heading2Char"/>
@@ -4227,7 +4318,7 @@
       <w:pPr>
         <w:pStyle w:val="Heading3"/>
       </w:pPr>
-      <w:bookmarkStart w:id="12" w:name="_Toc227743250"/>
+      <w:bookmarkStart w:id="12" w:name="_Toc228963420"/>
       <w:r>
         <w:lastRenderedPageBreak/>
         <w:t>1.2.2 Additional Aims</w:t>
@@ -4297,7 +4388,7 @@
       <w:pPr>
         <w:pStyle w:val="Heading2"/>
       </w:pPr>
-      <w:bookmarkStart w:id="13" w:name="_Toc227743251"/>
+      <w:bookmarkStart w:id="13" w:name="_Toc228963421"/>
       <w:r>
         <w:t>1.3 Objectives</w:t>
       </w:r>
@@ -4307,7 +4398,7 @@
       <w:pPr>
         <w:pStyle w:val="Heading3"/>
       </w:pPr>
-      <w:bookmarkStart w:id="14" w:name="_Toc227743252"/>
+      <w:bookmarkStart w:id="14" w:name="_Toc228963422"/>
       <w:r>
         <w:t>1.3.1 Scope</w:t>
       </w:r>
@@ -4315,7 +4406,15 @@
     </w:p>
     <w:p>
       <w:r>
-        <w:t>The objectives in terms of scope for this project are going to be generally quite broad and consist of specific milestones. The core objectives in regards to the scope are:</w:t>
+        <w:t xml:space="preserve">The objectives in terms of scope for this project are going to be generally quite broad and consist of specific milestones. The core objectives </w:t>
+      </w:r>
+      <w:proofErr w:type="gramStart"/>
+      <w:r>
+        <w:t>in regards to</w:t>
+      </w:r>
+      <w:proofErr w:type="gramEnd"/>
+      <w:r>
+        <w:t xml:space="preserve"> the scope are:</w:t>
       </w:r>
     </w:p>
     <w:p>
@@ -4370,7 +4469,7 @@
       <w:pPr>
         <w:pStyle w:val="Heading3"/>
       </w:pPr>
-      <w:bookmarkStart w:id="15" w:name="_Toc227743253"/>
+      <w:bookmarkStart w:id="15" w:name="_Toc228963423"/>
       <w:r>
         <w:t>1.3.2 Research Objectives</w:t>
       </w:r>
@@ -4378,7 +4477,15 @@
     </w:p>
     <w:p>
       <w:r>
-        <w:t>For the research objectives for the game, research will be conducted into other types of media with similar features. This research will include a comparison of similar games and their features and the overall impact of those features on this project. This will be done to find a balance for the difficulty of the game and to evaluate the necessary features for the game. Some topics of features and mechanics that will be researched include: World Generation, Pathfinding</w:t>
+        <w:t xml:space="preserve">For the research objectives for the game, research will be conducted into other types of media with similar features. This research will include a comparison of similar games and their features and the overall impact of those features on this project. This will be done to find a balance for the difficulty of the game and to evaluate the necessary features for the game. Some topics of features and mechanics that will be researched </w:t>
+      </w:r>
+      <w:proofErr w:type="gramStart"/>
+      <w:r>
+        <w:t>include:</w:t>
+      </w:r>
+      <w:proofErr w:type="gramEnd"/>
+      <w:r>
+        <w:t xml:space="preserve"> World Generation, Pathfinding</w:t>
       </w:r>
       <w:r>
         <w:t xml:space="preserve"> and </w:t>
@@ -4407,7 +4514,7 @@
       <w:pPr>
         <w:pStyle w:val="Heading3"/>
       </w:pPr>
-      <w:bookmarkStart w:id="16" w:name="_Toc227743254"/>
+      <w:bookmarkStart w:id="16" w:name="_Toc228963424"/>
       <w:r>
         <w:t>1.3.3 Design Objectives</w:t>
       </w:r>
@@ -4529,7 +4636,7 @@
       <w:pPr>
         <w:pStyle w:val="Heading3"/>
       </w:pPr>
-      <w:bookmarkStart w:id="17" w:name="_Toc227743255"/>
+      <w:bookmarkStart w:id="17" w:name="_Toc228963425"/>
       <w:r>
         <w:t>1.3.4 Implementation Objectives</w:t>
       </w:r>
@@ -4648,7 +4755,7 @@
       <w:pPr>
         <w:pStyle w:val="Heading3"/>
       </w:pPr>
-      <w:bookmarkStart w:id="18" w:name="_Toc227743256"/>
+      <w:bookmarkStart w:id="18" w:name="_Toc228963426"/>
       <w:r>
         <w:t>1.3.5 Results, Evaluation and Playtesting Objectives</w:t>
       </w:r>
@@ -4801,7 +4908,7 @@
       <w:pPr>
         <w:pStyle w:val="Heading1"/>
       </w:pPr>
-      <w:bookmarkStart w:id="19" w:name="_Toc227743257"/>
+      <w:bookmarkStart w:id="19" w:name="_Toc228963427"/>
       <w:r>
         <w:lastRenderedPageBreak/>
         <w:t>Chapter 2 – Literature Survey</w:t>
@@ -4812,7 +4919,7 @@
       <w:pPr>
         <w:pStyle w:val="Heading2"/>
       </w:pPr>
-      <w:bookmarkStart w:id="20" w:name="_Toc227743258"/>
+      <w:bookmarkStart w:id="20" w:name="_Toc228963428"/>
       <w:r>
         <w:t>2.1 Literature Survey Introduction</w:t>
       </w:r>
@@ -4851,7 +4958,7 @@
       <w:pPr>
         <w:pStyle w:val="Heading2"/>
       </w:pPr>
-      <w:bookmarkStart w:id="21" w:name="_Toc227743259"/>
+      <w:bookmarkStart w:id="21" w:name="_Toc228963429"/>
       <w:r>
         <w:t>2.2 Comparative Research</w:t>
       </w:r>
@@ -4859,17 +4966,17 @@
     </w:p>
     <w:p>
       <w:r>
-        <w:t>The upcoming section will contain research which will be used to compare and discuss aspects, mechanics, design choices and other related features that will inspire and inform later decisions during the process of creating **insert name**</w:t>
-      </w:r>
-      <w:r>
-        <w:t>.</w:t>
+        <w:t xml:space="preserve">The upcoming section will contain research which will be used to compare and discuss aspects, mechanics, design choices and other related features that will inspire and inform later decisions during the process of creating </w:t>
+      </w:r>
+      <w:r>
+        <w:t>Neural Conquest.</w:t>
       </w:r>
     </w:p>
     <w:p>
       <w:pPr>
         <w:pStyle w:val="Heading3"/>
       </w:pPr>
-      <w:bookmarkStart w:id="22" w:name="_Toc227743260"/>
+      <w:bookmarkStart w:id="22" w:name="_Toc228963430"/>
       <w:r>
         <w:t xml:space="preserve">2.2.1 </w:t>
       </w:r>
@@ -4945,7 +5052,7 @@
       <w:pPr>
         <w:pStyle w:val="Heading4"/>
       </w:pPr>
-      <w:bookmarkStart w:id="23" w:name="_Toc227743261"/>
+      <w:bookmarkStart w:id="23" w:name="_Toc228963431"/>
       <w:r>
         <w:t>2.2.1.1 Perlin Noise</w:t>
       </w:r>
@@ -5328,7 +5435,7 @@
       <w:pPr>
         <w:pStyle w:val="Heading4"/>
       </w:pPr>
-      <w:bookmarkStart w:id="25" w:name="_Toc227743262"/>
+      <w:bookmarkStart w:id="25" w:name="_Toc228963432"/>
       <w:r>
         <w:t>2.2.1.2 Binary Space Partitioning</w:t>
       </w:r>
@@ -5380,7 +5487,7 @@
       <w:pPr>
         <w:pStyle w:val="Heading4"/>
       </w:pPr>
-      <w:bookmarkStart w:id="26" w:name="_Toc227743263"/>
+      <w:bookmarkStart w:id="26" w:name="_Toc228963433"/>
       <w:r>
         <w:t>2.2.1.3 Cellular Automata</w:t>
       </w:r>
@@ -5442,7 +5549,15 @@
         <w:t>)</w:t>
       </w:r>
       <w:r>
-        <w:t xml:space="preserve"> according to the following two rules: If a cell is alive, it survives to the next generation if it has 2 or 3 live neighbors; otherwise it dies. If a cell is dead, it comes to life in the next generation if it has exactly 3 live neighbors; otherwise it stays dead.” </w:t>
+        <w:t xml:space="preserve"> according to the following two rules: If a cell is alive, it survives to the next generation if it has 2 or 3 live neighbors; otherwise it dies. If a cell is dead, it comes to life in the next generation if it has exactly 3 live neighbors; </w:t>
+      </w:r>
+      <w:proofErr w:type="gramStart"/>
+      <w:r>
+        <w:t>otherwise</w:t>
+      </w:r>
+      <w:proofErr w:type="gramEnd"/>
+      <w:r>
+        <w:t xml:space="preserve"> it stays dead.” </w:t>
       </w:r>
       <w:sdt>
         <w:sdtPr>
@@ -5492,7 +5607,7 @@
       <w:pPr>
         <w:pStyle w:val="Heading3"/>
       </w:pPr>
-      <w:bookmarkStart w:id="27" w:name="_Toc227743264"/>
+      <w:bookmarkStart w:id="27" w:name="_Toc228963434"/>
       <w:r>
         <w:t>2.2.2 Pathfinding</w:t>
       </w:r>
@@ -5528,7 +5643,15 @@
         <w:t xml:space="preserve"> </w:t>
       </w:r>
       <w:r>
-        <w:t>The types of pathfinding I will be evaluating are: A*, Dijkstra</w:t>
+        <w:t xml:space="preserve">The types of pathfinding I will be evaluating </w:t>
+      </w:r>
+      <w:proofErr w:type="gramStart"/>
+      <w:r>
+        <w:t>are:</w:t>
+      </w:r>
+      <w:proofErr w:type="gramEnd"/>
+      <w:r>
+        <w:t xml:space="preserve"> A*, Dijkstra</w:t>
       </w:r>
       <w:r>
         <w:t>,</w:t>
@@ -5547,7 +5670,7 @@
       <w:pPr>
         <w:pStyle w:val="Heading4"/>
       </w:pPr>
-      <w:bookmarkStart w:id="28" w:name="_Toc227743265"/>
+      <w:bookmarkStart w:id="28" w:name="_Toc228963435"/>
       <w:r>
         <w:t>2.2.2.1 Dijkstra</w:t>
       </w:r>
@@ -5555,7 +5678,13 @@
     </w:p>
     <w:p>
       <w:r>
-        <w:t>Dijkstra’s algorithm is a pathfinding algorithm that uses a breadth first search, meaning it goes wider before it goes longer, that can contain a path cost. It is always guaranteed to find the shortest path but is not very optimized. The starting point is marked, then the movement cost is calculated to each neighbour nod</w:t>
+        <w:t xml:space="preserve">Dijkstra’s algorithm is a pathfinding algorithm that uses a breadth first search, </w:t>
+      </w:r>
+      <w:r>
+        <w:t>meaning it uses an uninformed search that explores all unexplored nodes</w:t>
+      </w:r>
+      <w:r>
+        <w:t>, that can contain a path cost. It is always guaranteed to find the shortest path but is not very optimized. The starting point is marked, then the movement cost is calculated to each neighbour nod</w:t>
       </w:r>
       <w:r>
         <w:t>e</w:t>
@@ -5714,7 +5843,7 @@
       <w:pPr>
         <w:pStyle w:val="Heading4"/>
       </w:pPr>
-      <w:bookmarkStart w:id="30" w:name="_Toc227743266"/>
+      <w:bookmarkStart w:id="30" w:name="_Toc228963436"/>
       <w:r>
         <w:t>2.2.2.2 A*</w:t>
       </w:r>
@@ -5722,14 +5851,14 @@
     </w:p>
     <w:p>
       <w:r>
-        <w:t>A* is an algorithm that shares the same approach as Dijkstra, although it is more efficient. In order to be more efficient, the algorithm “combines Dijkstra’s algorithm with a case-specific heuristic value”</w:t>
-      </w:r>
-      <w:r>
-        <w:t xml:space="preserve"> </w:t>
+        <w:t xml:space="preserve">A* is an algorithm that shares the same approach as Dijkstra, although it is more efficient. </w:t>
+      </w:r>
+      <w:r>
+        <w:t xml:space="preserve">As described by </w:t>
       </w:r>
       <w:sdt>
         <w:sdtPr>
-          <w:id w:val="1846362225"/>
+          <w:id w:val="1226099472"/>
           <w:citation/>
         </w:sdtPr>
         <w:sdtContent>
@@ -5754,6 +5883,9 @@
         </w:sdtContent>
       </w:sdt>
       <w:r>
+        <w:t>, it effectively “combines Dijkstra’s algorithm with a case-specific heuristic value,” allowing the algorithm to prioritise more promising paths and reduce unnecessary exploration</w:t>
+      </w:r>
+      <w:r>
         <w:t xml:space="preserve">. This is always guaranteed to find the shortest path and the heuristic value allows the algorithm to disregard paths that lead away from the destination, allowing for major optimizations </w:t>
       </w:r>
       <w:r>
@@ -5762,12 +5894,21 @@
       <w:r>
         <w:t xml:space="preserve"> the computation speed of the algorithm. </w:t>
       </w:r>
+      <w:r>
+        <w:t>A* offers a balance between the most optimal computation and computational efficiency, making it more suitable than Dijkstra for multi-agent systems where real-time performance is required.</w:t>
+      </w:r>
+    </w:p>
+    <w:p/>
+    <w:p>
+      <w:r>
+        <w:t>The performance of A* is highly dependant on the quality of the heuristic data. If the heuristic is poorly chosen, the algorithm may degrade towards the performance of Dijkstra’s algorithm. Additionally, A* can incur higher memory usage due to the need to maintain open and closed node lists, which may become significant in large-scale environments.</w:t>
+      </w:r>
     </w:p>
     <w:p>
       <w:pPr>
         <w:pStyle w:val="Heading4"/>
       </w:pPr>
-      <w:bookmarkStart w:id="31" w:name="_Toc227743267"/>
+      <w:bookmarkStart w:id="31" w:name="_Toc228963437"/>
       <w:r>
         <w:t>2.2.2.3 Jump Point Search</w:t>
       </w:r>
@@ -5809,12 +5950,15 @@
       <w:r>
         <w:t>path cost calculations along with the aforementioned optimizations allows JPS to be significantly faster than A*, even up to an order of magnitude faster.</w:t>
       </w:r>
+      <w:r>
+        <w:t xml:space="preserve"> JPS is not suitable for non-uniform cost grids and is significantly less flexible than A*.</w:t>
+      </w:r>
     </w:p>
     <w:p>
       <w:pPr>
         <w:pStyle w:val="Heading3"/>
       </w:pPr>
-      <w:bookmarkStart w:id="32" w:name="_Toc227743268"/>
+      <w:bookmarkStart w:id="32" w:name="_Toc228963438"/>
       <w:r>
         <w:t>2.2.3 AI Integrations</w:t>
       </w:r>
@@ -5839,7 +5983,7 @@
       <w:pPr>
         <w:pStyle w:val="Heading4"/>
       </w:pPr>
-      <w:bookmarkStart w:id="33" w:name="_Toc227743269"/>
+      <w:bookmarkStart w:id="33" w:name="_Toc228963439"/>
       <w:r>
         <w:t>2.2.3.1 Neural Network</w:t>
       </w:r>
@@ -5853,12 +5997,24 @@
         <w:t>, utilizing artificial neurons and weights to identify patterns and make predictions.</w:t>
       </w:r>
       <w:r>
-        <w:t xml:space="preserve"> Neural networks need training data to be able to recognize patterns and alter behaviours. This training data allows the network to “know” things about its input, for example, positions of objects.</w:t>
-      </w:r>
-    </w:p>
-    <w:p>
-      <w:r>
-        <w:t xml:space="preserve">After the initial training phase, if we present the network with a pattern it hasn’t seen before in its training data, it should classify the unseen pattern correctly, only if it has learnt the underlying structure of the problem </w:t>
+        <w:t xml:space="preserve"> Neural networks need </w:t>
+      </w:r>
+      <w:r>
+        <w:lastRenderedPageBreak/>
+        <w:t>training data to be able to recognize patterns and alter behaviours. This training data allows the network to “know” things about its input, for example, positions of objects.</w:t>
+      </w:r>
+    </w:p>
+    <w:p>
+      <w:r>
+        <w:t xml:space="preserve">After the initial training phase, if we present the network with a </w:t>
+      </w:r>
+      <w:proofErr w:type="gramStart"/>
+      <w:r>
+        <w:t>pattern</w:t>
+      </w:r>
+      <w:proofErr w:type="gramEnd"/>
+      <w:r>
+        <w:t xml:space="preserve"> it hasn’t seen before in its training data, it should classify the unseen pattern correctly, only if it has learnt the underlying structure of the problem </w:t>
       </w:r>
       <w:sdt>
         <w:sdtPr>
@@ -5894,7 +6050,7 @@
       <w:pPr>
         <w:pStyle w:val="Heading4"/>
       </w:pPr>
-      <w:bookmarkStart w:id="34" w:name="_Toc227743270"/>
+      <w:bookmarkStart w:id="34" w:name="_Toc228963440"/>
       <w:r>
         <w:t>2.2.3.2 Reinforcement Learning</w:t>
       </w:r>
@@ -5911,7 +6067,6 @@
         <w:br/>
       </w:r>
       <w:r>
-        <w:lastRenderedPageBreak/>
         <w:br/>
       </w:r>
       <w:r>
@@ -6095,7 +6250,7 @@
       <w:pPr>
         <w:pStyle w:val="Heading4"/>
       </w:pPr>
-      <w:bookmarkStart w:id="36" w:name="_Toc227743271"/>
+      <w:bookmarkStart w:id="36" w:name="_Toc228963441"/>
       <w:r>
         <w:t>2.2.3.3 Imitation Learning</w:t>
       </w:r>
@@ -6109,7 +6264,11 @@
         <w:t>“</w:t>
       </w:r>
       <w:r>
-        <w:t>supervised learning to predict the expert’s action for any given state</w:t>
+        <w:t xml:space="preserve">supervised learning to predict the expert’s </w:t>
+      </w:r>
+      <w:r>
+        <w:lastRenderedPageBreak/>
+        <w:t>action for any given state</w:t>
       </w:r>
       <w:r>
         <w:t>”</w:t>
@@ -6224,57 +6383,87 @@
       <w:pPr>
         <w:pStyle w:val="Heading1"/>
       </w:pPr>
-      <w:bookmarkStart w:id="37" w:name="_Toc227743272"/>
+      <w:bookmarkStart w:id="37" w:name="_Toc228963442"/>
+      <w:r>
+        <w:t>Chapter 3 – Design</w:t>
+      </w:r>
+      <w:bookmarkEnd w:id="37"/>
+    </w:p>
+    <w:p>
+      <w:r>
+        <w:t xml:space="preserve">The design chapter will outline the main features of </w:t>
+      </w:r>
+      <w:r>
+        <w:t>Neural Conquest</w:t>
+      </w:r>
+      <w:r>
+        <w:t xml:space="preserve"> and the reasoning behind choosing these techniques.</w:t>
+      </w:r>
+      <w:r>
+        <w:t xml:space="preserve"> This chapter will be dedicated to the overall technical decisions made before implementing these ideas.</w:t>
+      </w:r>
+      <w:r>
+        <w:t xml:space="preserve"> The subchapters in this section are labelled after each of the research subchapters from the literature survey.</w:t>
+      </w:r>
+    </w:p>
+    <w:p>
+      <w:pPr>
+        <w:pStyle w:val="Heading2"/>
+      </w:pPr>
+      <w:bookmarkStart w:id="38" w:name="_Toc228963443"/>
+      <w:r>
+        <w:t xml:space="preserve">3.1 </w:t>
+      </w:r>
+      <w:r>
+        <w:t>World Generation</w:t>
+      </w:r>
+      <w:bookmarkEnd w:id="38"/>
+    </w:p>
+    <w:p>
+      <w:r>
+        <w:t xml:space="preserve">After the research of world generation types, I conclude that the most effective method for this game would be to make the game use Perlin noise to generate its world and landmasses. I came to this conclusion </w:t>
+      </w:r>
+      <w:r>
+        <w:t xml:space="preserve">as Binary Space Partitioning requires many iterations to make convincing </w:t>
+      </w:r>
+      <w:r>
+        <w:t>landmasses</w:t>
+      </w:r>
+      <w:r>
+        <w:t>, iterations are a problem for this project as I would like to reduce the time complexity of the World Generation so the player doesn’t waste their time waiting for a world to generate</w:t>
+      </w:r>
+      <w:r>
+        <w:t>,</w:t>
+      </w:r>
+      <w:r>
+        <w:t xml:space="preserve"> and </w:t>
+      </w:r>
+      <w:r>
+        <w:t xml:space="preserve">a </w:t>
+      </w:r>
+      <w:r>
+        <w:t xml:space="preserve">Cellular Automata </w:t>
+      </w:r>
+      <w:r>
+        <w:t xml:space="preserve">approach </w:t>
+      </w:r>
+      <w:r>
+        <w:t>would require simulation of the Cellular Automata which is relatively</w:t>
+      </w:r>
+      <w:r>
+        <w:t xml:space="preserve"> complex as many rules are needed to define the simulation space</w:t>
+      </w:r>
+      <w:r>
+        <w:t xml:space="preserve">.  </w:t>
+      </w:r>
+    </w:p>
+    <w:p>
+      <w:pPr>
+        <w:pStyle w:val="Heading3"/>
+      </w:pPr>
+      <w:bookmarkStart w:id="39" w:name="_Toc228963444"/>
       <w:r>
         <w:lastRenderedPageBreak/>
-        <w:t>Chapter 3 – Design</w:t>
-      </w:r>
-      <w:bookmarkEnd w:id="37"/>
-    </w:p>
-    <w:p>
-      <w:r>
-        <w:t>The design chapter will outline the main features of **insert game name** and the reasoning behind choosing these techniques.</w:t>
-      </w:r>
-      <w:r>
-        <w:t xml:space="preserve"> This chapter will be dedicated to the overall technical decisions made before implementing these ideas.</w:t>
-      </w:r>
-      <w:r>
-        <w:t xml:space="preserve"> The subchapters in this section are labelled after each of the research subchapters from the literature survey.</w:t>
-      </w:r>
-    </w:p>
-    <w:p>
-      <w:pPr>
-        <w:pStyle w:val="Heading2"/>
-      </w:pPr>
-      <w:bookmarkStart w:id="38" w:name="_Toc227743273"/>
-      <w:r>
-        <w:t xml:space="preserve">3.1 </w:t>
-      </w:r>
-      <w:r>
-        <w:t>World Generation</w:t>
-      </w:r>
-      <w:bookmarkEnd w:id="38"/>
-    </w:p>
-    <w:p>
-      <w:r>
-        <w:t xml:space="preserve">After the research of world generation types, I conclude that the most effective method for this game would be to make the game use Perlin noise to generate its world and landmasses. I came to this conclusion </w:t>
-      </w:r>
-      <w:r>
-        <w:t xml:space="preserve">as Binary Space Partitioning requires many iterations to make convincing </w:t>
-      </w:r>
-      <w:r>
-        <w:t>landmasses,</w:t>
-      </w:r>
-      <w:r>
-        <w:t xml:space="preserve"> and Cellular Automata would require simulation of the Cellular Automata which is relatively computationally heavy.  </w:t>
-      </w:r>
-    </w:p>
-    <w:p>
-      <w:pPr>
-        <w:pStyle w:val="Heading3"/>
-      </w:pPr>
-      <w:bookmarkStart w:id="39" w:name="_Toc227743274"/>
-      <w:r>
         <w:t xml:space="preserve">3.1.1 </w:t>
       </w:r>
       <w:r>
@@ -6312,7 +6501,7 @@
           <w:noProof/>
         </w:rPr>
         <w:drawing>
-          <wp:inline distT="0" distB="0" distL="0" distR="0" wp14:anchorId="7D5A5376" wp14:editId="3EF17D2F">
+          <wp:inline distT="0" distB="0" distL="0" distR="0" wp14:anchorId="7D5A5376" wp14:editId="22A2AC5E">
             <wp:extent cx="2479538" cy="2261556"/>
             <wp:effectExtent l="0" t="0" r="0" b="5715"/>
             <wp:docPr id="455141339" name="Picture 4"/>
@@ -6428,9 +6617,8 @@
               <w:rPr>
                 <w:noProof/>
               </w:rPr>
-              <w:lastRenderedPageBreak/>
               <w:drawing>
-                <wp:inline distT="0" distB="0" distL="0" distR="0" wp14:anchorId="2A67817B" wp14:editId="708BD183">
+                <wp:inline distT="0" distB="0" distL="0" distR="0" wp14:anchorId="2A67817B" wp14:editId="7A94342D">
                   <wp:extent cx="2295525" cy="2105025"/>
                   <wp:effectExtent l="0" t="0" r="0" b="0"/>
                   <wp:docPr id="1070291612" name="Picture 5"/>
@@ -6614,6 +6802,7 @@
     <w:p/>
     <w:p>
       <w:r>
+        <w:lastRenderedPageBreak/>
         <w:t>There are 2 ways that I can easily display the tiles to the user: Prefabs, and Mesh Generation. Prefabs would be significantly easier to incorporate, allowing me to create a prefab for each biome and instantiating each prefab where needed. This has many benefits such as making development of this feature very quick, simplicity, code readability and making pathfinding easier through direct ray-casting. This could have potential drawbacks such as performance losses from having thousands to tens of thousands of GameObjects in a scene.</w:t>
       </w:r>
     </w:p>
@@ -6636,7 +6825,7 @@
       <w:pPr>
         <w:pStyle w:val="Heading3"/>
       </w:pPr>
-      <w:bookmarkStart w:id="43" w:name="_Toc227743275"/>
+      <w:bookmarkStart w:id="43" w:name="_Toc228963445"/>
       <w:r>
         <w:t>3.1.2 Biomes</w:t>
       </w:r>
@@ -6858,7 +7047,15 @@
         <w:t xml:space="preserve"> a pixel is, can become the boundaries for biomes. In this example, there are only 3 biomes: ocean, beach, and grass</w:t>
       </w:r>
       <w:r>
-        <w:t xml:space="preserve">. The amount of biomes possible are technically infinite. Although biome separation will be very prevalent as you go past roughly 10 biomes. </w:t>
+        <w:t xml:space="preserve">. The </w:t>
+      </w:r>
+      <w:proofErr w:type="gramStart"/>
+      <w:r>
+        <w:t>amount</w:t>
+      </w:r>
+      <w:proofErr w:type="gramEnd"/>
+      <w:r>
+        <w:t xml:space="preserve"> of biomes possible are technically infinite. Although biome separation will be very prevalent as you go past roughly 10 biomes. </w:t>
       </w:r>
     </w:p>
     <w:p/>
@@ -6867,20 +7064,32 @@
         <w:t xml:space="preserve">For my game, I am choosing to have 5 true biomes: Deep water, shallow water, sand, grass and snow. Each of these biomes are going to be abundant in different resources and </w:t>
       </w:r>
       <w:r>
-        <w:t>have very different base tile variables. For example, grassland tiles will contain more production than a sand tile but a sand tile will have more gold than a grassland tile</w:t>
+        <w:t xml:space="preserve">have very different base tile variables. For example, grassland tiles will contain more production than a sand </w:t>
+      </w:r>
+      <w:proofErr w:type="gramStart"/>
+      <w:r>
+        <w:t>tile</w:t>
+      </w:r>
+      <w:proofErr w:type="gramEnd"/>
+      <w:r>
+        <w:t xml:space="preserve"> but a sand tile will have more gold than a grassland tile</w:t>
       </w:r>
       <w:r>
         <w:t>.</w:t>
       </w:r>
       <w:r>
-        <w:t xml:space="preserve"> This should balance out the resource distribution enough that players seek grassland at the beginning of the game.</w:t>
+        <w:t xml:space="preserve"> This should balance </w:t>
+      </w:r>
+      <w:r>
+        <w:lastRenderedPageBreak/>
+        <w:t>out the resource distribution enough that players seek grassland at the beginning of the game.</w:t>
       </w:r>
     </w:p>
     <w:p>
       <w:pPr>
         <w:pStyle w:val="Heading3"/>
       </w:pPr>
-      <w:bookmarkStart w:id="45" w:name="_Toc227743276"/>
+      <w:bookmarkStart w:id="45" w:name="_Toc228963446"/>
       <w:r>
         <w:t>3.1.3 Resource Distribution</w:t>
       </w:r>
@@ -6910,7 +7119,7 @@
       <w:pPr>
         <w:pStyle w:val="Heading3"/>
       </w:pPr>
-      <w:bookmarkStart w:id="46" w:name="_Toc227743277"/>
+      <w:bookmarkStart w:id="46" w:name="_Toc228963447"/>
       <w:r>
         <w:t>3.1.4 River generation</w:t>
       </w:r>
@@ -6918,49 +7127,154 @@
     </w:p>
     <w:p>
       <w:r>
-        <w:t xml:space="preserve">In this game, I want to incorporate river systems to boost food growth, production, gold, and general city prosperity. There are 2 methods for this that I want to explore, edge traversal </w:t>
-      </w:r>
+        <w:t>In this game, I want to incorporate river systems to boost food growth, production, gold, and general city prosperity. There are 2 methods for this that I want to explore, edge traversal and biome switching. For edge traversal, I will be selecting a random edge on a random tile and building a river from that, labelling each edge on a hexagon from 0 to 6 and making sure they link up correctly.</w:t>
+      </w:r>
+      <w:r>
+        <w:t xml:space="preserve"> This has the hindrance of having to draw new game objects for each river.</w:t>
+      </w:r>
+    </w:p>
+    <w:p/>
+    <w:p>
+      <w:r>
+        <w:t xml:space="preserve">The other possible method is biome switching, this will use 3 biomes: “River Head”, “River”, and “River End”. This method requires that I select a tile, and change its biome to “River Head”, then generate the river path, making it go towards either ocean or an arbitrary length, then switch the body of the river to </w:t>
+      </w:r>
+      <w:r>
+        <w:t xml:space="preserve">the </w:t>
+      </w:r>
+      <w:r>
+        <w:t>“River”</w:t>
+      </w:r>
+      <w:r>
+        <w:t xml:space="preserve"> biome</w:t>
+      </w:r>
+      <w:r>
+        <w:t xml:space="preserve"> and then</w:t>
+      </w:r>
+      <w:r>
+        <w:t xml:space="preserve"> switching the end of the river to the “River End” biome. This has the added benefit of easily switching the tile sprite.</w:t>
+      </w:r>
+      <w:r>
+        <w:t xml:space="preserve"> </w:t>
+      </w:r>
+    </w:p>
+    <w:p>
+      <w:pPr>
+        <w:pStyle w:val="Heading3"/>
+      </w:pPr>
+      <w:bookmarkStart w:id="47" w:name="_Toc228963448"/>
+      <w:r>
+        <w:t>3.1.</w:t>
+      </w:r>
+      <w:r>
+        <w:t>5</w:t>
+      </w:r>
+      <w:r>
+        <w:t xml:space="preserve"> Limitations</w:t>
+      </w:r>
+      <w:bookmarkEnd w:id="47"/>
+    </w:p>
+    <w:p>
+      <w:r>
+        <w:t>The limitations of this system are that Perlin Noise</w:t>
+      </w:r>
+      <w:r>
+        <w:t>,</w:t>
+      </w:r>
+      <w:r>
+        <w:t xml:space="preserve"> while being “fast and infinite” </w:t>
+      </w:r>
+      <w:sdt>
+        <w:sdtPr>
+          <w:id w:val="-223136267"/>
+          <w:citation/>
+        </w:sdtPr>
+        <w:sdtContent>
+          <w:r>
+            <w:fldChar w:fldCharType="begin"/>
+          </w:r>
+          <w:r>
+            <w:instrText xml:space="preserve"> CITATION Gos25 \l 2057 </w:instrText>
+          </w:r>
+          <w:r>
+            <w:fldChar w:fldCharType="separate"/>
+          </w:r>
+          <w:r>
+            <w:rPr>
+              <w:noProof/>
+            </w:rPr>
+            <w:t>(Goslin, 2025)</w:t>
+          </w:r>
+          <w:r>
+            <w:fldChar w:fldCharType="end"/>
+          </w:r>
+        </w:sdtContent>
+      </w:sdt>
+      <w:r>
+        <w:t>,</w:t>
+      </w:r>
+      <w:r>
+        <w:t xml:space="preserve"> are also “fundamentally limited in realism and large-scale coherence”</w:t>
+      </w:r>
+      <w:r>
+        <w:t xml:space="preserve"> </w:t>
+      </w:r>
+      <w:sdt>
+        <w:sdtPr>
+          <w:id w:val="-543524229"/>
+          <w:citation/>
+        </w:sdtPr>
+        <w:sdtContent>
+          <w:r>
+            <w:fldChar w:fldCharType="begin"/>
+          </w:r>
+          <w:r>
+            <w:instrText xml:space="preserve"> CITATION Gos25 \l 2057 </w:instrText>
+          </w:r>
+          <w:r>
+            <w:fldChar w:fldCharType="separate"/>
+          </w:r>
+          <w:r>
+            <w:rPr>
+              <w:noProof/>
+            </w:rPr>
+            <w:t>(Goslin, 2025)</w:t>
+          </w:r>
+          <w:r>
+            <w:fldChar w:fldCharType="end"/>
+          </w:r>
+        </w:sdtContent>
+      </w:sdt>
+      <w:r>
+        <w:t xml:space="preserve">. </w:t>
+      </w:r>
+      <w:r>
+        <w:t>The algorithm operating on locally smooth gradients means that there is often a lack of meaningful global structure, leading to “non-dominant” regions often being small</w:t>
+      </w:r>
+      <w:r>
+        <w:t>.</w:t>
+      </w:r>
+      <w:r>
+        <w:t xml:space="preserve"> This can negatively impact both realism and gameplay, particularly in a strategy game where large-scale environmental features have a real impact on the player’s decision making and long-term strategy.</w:t>
+      </w:r>
+    </w:p>
+    <w:p>
       <w:r>
         <w:lastRenderedPageBreak/>
-        <w:t>and biome switching. For edge traversal, I will be selecting a random edge on a random tile and building a river from that, labelling each edge on a hexagon from 0 to 6 and making sure they link up correctly.</w:t>
-      </w:r>
-      <w:r>
-        <w:t xml:space="preserve"> This has the hindrance of having to draw new game objects for each river.</w:t>
-      </w:r>
-    </w:p>
-    <w:p/>
-    <w:p>
-      <w:r>
-        <w:t xml:space="preserve">The other possible method is biome switching, this will use 3 biomes: “River Head”, “River”, and “River End”. This method requires that I select a tile, and change its biome to “River Head”, then generate the river path, making it go towards either ocean or an arbitrary length, then switch the body of the river to </w:t>
-      </w:r>
-      <w:r>
-        <w:t xml:space="preserve">the </w:t>
-      </w:r>
-      <w:r>
-        <w:t>“River”</w:t>
-      </w:r>
-      <w:r>
-        <w:t xml:space="preserve"> biome</w:t>
-      </w:r>
-      <w:r>
-        <w:t xml:space="preserve"> and then</w:t>
-      </w:r>
-      <w:r>
-        <w:t xml:space="preserve"> switching the end of the river to the “River End” biome. This has the added benefit of easily switching the tile sprite.</w:t>
-      </w:r>
-      <w:r>
-        <w:t xml:space="preserve"> </w:t>
+        <w:t>As a result, using additional techniques, such as layering noise maps, applying rule-based biome adjustments and using noise warping for more organic shapes</w:t>
+      </w:r>
+      <w:r>
+        <w:t>, may be required to produce more coherent and strategically meaningful environments.</w:t>
       </w:r>
     </w:p>
     <w:p>
       <w:pPr>
         <w:pStyle w:val="Heading2"/>
       </w:pPr>
-      <w:bookmarkStart w:id="47" w:name="_Toc227743278"/>
+      <w:bookmarkStart w:id="48" w:name="_Toc228963449"/>
       <w:r>
         <w:t>3.2 Pathfinding</w:t>
       </w:r>
-      <w:bookmarkEnd w:id="47"/>
+      <w:bookmarkEnd w:id="48"/>
     </w:p>
     <w:p>
       <w:r>
@@ -6970,7 +7284,7 @@
         <w:t>different cost pathing.</w:t>
       </w:r>
     </w:p>
-    <w:bookmarkStart w:id="48" w:name="_Toc227743279" w:displacedByCustomXml="next"/>
+    <w:bookmarkStart w:id="49" w:name="_Toc228963450" w:displacedByCustomXml="next"/>
     <w:sdt>
       <w:sdtPr>
         <w:rPr>
@@ -6998,7 +7312,7 @@
           <w:r>
             <w:t>References</w:t>
           </w:r>
-          <w:bookmarkEnd w:id="48"/>
+          <w:bookmarkEnd w:id="49"/>
         </w:p>
         <w:sdt>
           <w:sdtPr>
@@ -7064,6 +7378,34 @@
                 </w:rPr>
                 <w:br/>
                 <w:t>[Accessed 21 04 2026].</w:t>
+              </w:r>
+            </w:p>
+            <w:p>
+              <w:pPr>
+                <w:pStyle w:val="Bibliography"/>
+                <w:rPr>
+                  <w:noProof/>
+                </w:rPr>
+              </w:pPr>
+              <w:r>
+                <w:rPr>
+                  <w:noProof/>
+                </w:rPr>
+                <w:t xml:space="preserve">Goslin, A., 2025. </w:t>
+              </w:r>
+              <w:r>
+                <w:rPr>
+                  <w:i/>
+                  <w:iCs/>
+                  <w:noProof/>
+                </w:rPr>
+                <w:t xml:space="preserve">Terrain Diffusion: A Diffusion-Based Successor to Perlin Noise in Infinite, Real-Time Terrain Generation, </w:t>
+              </w:r>
+              <w:r>
+                <w:rPr>
+                  <w:noProof/>
+                </w:rPr>
+                <w:t>s.l.: arXiv.</w:t>
               </w:r>
             </w:p>
             <w:p>
@@ -7259,7 +7601,6 @@
                 <w:rPr>
                   <w:noProof/>
                 </w:rPr>
-                <w:lastRenderedPageBreak/>
                 <w:t xml:space="preserve">Orsini, M. et al., 2021. </w:t>
               </w:r>
               <w:r>
@@ -7337,6 +7678,7 @@
                 <w:rPr>
                   <w:noProof/>
                 </w:rPr>
+                <w:lastRenderedPageBreak/>
                 <w:t xml:space="preserve">Wikipedia, n.d. </w:t>
               </w:r>
               <w:r>
@@ -8951,7 +9293,6 @@
   <w:style w:type="character" w:default="1" w:styleId="DefaultParagraphFont">
     <w:name w:val="Default Paragraph Font"/>
     <w:uiPriority w:val="1"/>
-    <w:semiHidden/>
     <w:unhideWhenUsed/>
   </w:style>
   <w:style w:type="table" w:default="1" w:styleId="TableNormal">
@@ -10163,13 +10504,32 @@
       </b:Author>
     </b:Author>
     <b:Month>05</b:Month>
+    <b:RefOrder>11</b:RefOrder>
+  </b:Source>
+  <b:Source>
+    <b:Tag>Gos25</b:Tag>
+    <b:SourceType>Report</b:SourceType>
+    <b:Guid>{76EEA2F5-E6C1-4D0B-A427-60538DD4CF1F}</b:Guid>
+    <b:Author>
+      <b:Author>
+        <b:NameList>
+          <b:Person>
+            <b:Last>Goslin</b:Last>
+            <b:First>Alexander</b:First>
+          </b:Person>
+        </b:NameList>
+      </b:Author>
+    </b:Author>
+    <b:Title>Terrain Diffusion: A Diffusion-Based Successor to Perlin Noise in Infinite, Real-Time Terrain Generation</b:Title>
+    <b:Year>2025</b:Year>
+    <b:Publisher>arXiv</b:Publisher>
     <b:RefOrder>10</b:RefOrder>
   </b:Source>
 </b:Sources>
 </file>
 
 <file path=customXml/itemProps1.xml><?xml version="1.0" encoding="utf-8"?>
-<ds:datastoreItem xmlns:ds="http://schemas.openxmlformats.org/officeDocument/2006/customXml" ds:itemID="{60D2967D-6E22-4ECF-BB7C-EBA865E1AE13}">
+<ds:datastoreItem xmlns:ds="http://schemas.openxmlformats.org/officeDocument/2006/customXml" ds:itemID="{24993291-BF94-4ACC-BC4F-77885C623932}">
   <ds:schemaRefs>
     <ds:schemaRef ds:uri="http://schemas.openxmlformats.org/officeDocument/2006/bibliography"/>
   </ds:schemaRefs>

</xml_diff>

<commit_message>
feat: opening of Pathfinding design and architecture design written
</commit_message>
<xml_diff>
--- a/Report.docx
+++ b/Report.docx
@@ -321,7 +321,7 @@
         <w:pStyle w:val="Heading1"/>
       </w:pPr>
       <w:bookmarkStart w:id="1" w:name="_Toc40898999"/>
-      <w:bookmarkStart w:id="2" w:name="_Toc228963411"/>
+      <w:bookmarkStart w:id="2" w:name="_Toc228976073"/>
       <w:r>
         <w:lastRenderedPageBreak/>
         <w:t>Abstract</w:t>
@@ -369,7 +369,7 @@
         <w:spacing w:after="321"/>
         <w:ind w:left="-5"/>
       </w:pPr>
-      <w:bookmarkStart w:id="3" w:name="_Toc228963412"/>
+      <w:bookmarkStart w:id="3" w:name="_Toc228976074"/>
       <w:r>
         <w:lastRenderedPageBreak/>
         <w:t>Declaration</w:t>
@@ -491,7 +491,7 @@
         <w:ind w:left="-5"/>
       </w:pPr>
       <w:bookmarkStart w:id="4" w:name="_Toc40899001"/>
-      <w:bookmarkStart w:id="5" w:name="_Toc228963413"/>
+      <w:bookmarkStart w:id="5" w:name="_Toc228976075"/>
       <w:r>
         <w:lastRenderedPageBreak/>
         <w:t>Acknowledgements</w:t>
@@ -628,7 +628,7 @@
         <w:spacing w:line="259" w:lineRule="auto"/>
       </w:pPr>
     </w:p>
-    <w:bookmarkStart w:id="6" w:name="_Toc228963414" w:displacedByCustomXml="next"/>
+    <w:bookmarkStart w:id="6" w:name="_Toc228976076" w:displacedByCustomXml="next"/>
     <w:sdt>
       <w:sdtPr>
         <w:rPr>
@@ -686,7 +686,7 @@
           <w:r>
             <w:fldChar w:fldCharType="separate"/>
           </w:r>
-          <w:hyperlink w:anchor="_Toc228963411" w:history="1">
+          <w:hyperlink w:anchor="_Toc228976073" w:history="1">
             <w:r>
               <w:rPr>
                 <w:rStyle w:val="Hyperlink"/>
@@ -713,7 +713,7 @@
                 <w:noProof/>
                 <w:webHidden/>
               </w:rPr>
-              <w:instrText xml:space="preserve"> PAGEREF _Toc228963411 \h </w:instrText>
+              <w:instrText xml:space="preserve"> PAGEREF _Toc228976073 \h </w:instrText>
             </w:r>
             <w:r>
               <w:rPr>
@@ -760,7 +760,7 @@
               <w14:ligatures w14:val="standardContextual"/>
             </w:rPr>
           </w:pPr>
-          <w:hyperlink w:anchor="_Toc228963412" w:history="1">
+          <w:hyperlink w:anchor="_Toc228976074" w:history="1">
             <w:r>
               <w:rPr>
                 <w:rStyle w:val="Hyperlink"/>
@@ -787,7 +787,7 @@
                 <w:noProof/>
                 <w:webHidden/>
               </w:rPr>
-              <w:instrText xml:space="preserve"> PAGEREF _Toc228963412 \h </w:instrText>
+              <w:instrText xml:space="preserve"> PAGEREF _Toc228976074 \h </w:instrText>
             </w:r>
             <w:r>
               <w:rPr>
@@ -834,7 +834,7 @@
               <w14:ligatures w14:val="standardContextual"/>
             </w:rPr>
           </w:pPr>
-          <w:hyperlink w:anchor="_Toc228963413" w:history="1">
+          <w:hyperlink w:anchor="_Toc228976075" w:history="1">
             <w:r>
               <w:rPr>
                 <w:rStyle w:val="Hyperlink"/>
@@ -861,7 +861,7 @@
                 <w:noProof/>
                 <w:webHidden/>
               </w:rPr>
-              <w:instrText xml:space="preserve"> PAGEREF _Toc228963413 \h </w:instrText>
+              <w:instrText xml:space="preserve"> PAGEREF _Toc228976075 \h </w:instrText>
             </w:r>
             <w:r>
               <w:rPr>
@@ -908,7 +908,7 @@
               <w14:ligatures w14:val="standardContextual"/>
             </w:rPr>
           </w:pPr>
-          <w:hyperlink w:anchor="_Toc228963414" w:history="1">
+          <w:hyperlink w:anchor="_Toc228976076" w:history="1">
             <w:r>
               <w:rPr>
                 <w:rStyle w:val="Hyperlink"/>
@@ -935,7 +935,7 @@
                 <w:noProof/>
                 <w:webHidden/>
               </w:rPr>
-              <w:instrText xml:space="preserve"> PAGEREF _Toc228963414 \h </w:instrText>
+              <w:instrText xml:space="preserve"> PAGEREF _Toc228976076 \h </w:instrText>
             </w:r>
             <w:r>
               <w:rPr>
@@ -982,7 +982,7 @@
               <w14:ligatures w14:val="standardContextual"/>
             </w:rPr>
           </w:pPr>
-          <w:hyperlink w:anchor="_Toc228963415" w:history="1">
+          <w:hyperlink w:anchor="_Toc228976077" w:history="1">
             <w:r>
               <w:rPr>
                 <w:rStyle w:val="Hyperlink"/>
@@ -1009,7 +1009,7 @@
                 <w:noProof/>
                 <w:webHidden/>
               </w:rPr>
-              <w:instrText xml:space="preserve"> PAGEREF _Toc228963415 \h </w:instrText>
+              <w:instrText xml:space="preserve"> PAGEREF _Toc228976077 \h </w:instrText>
             </w:r>
             <w:r>
               <w:rPr>
@@ -1056,7 +1056,7 @@
               <w14:ligatures w14:val="standardContextual"/>
             </w:rPr>
           </w:pPr>
-          <w:hyperlink w:anchor="_Toc228963416" w:history="1">
+          <w:hyperlink w:anchor="_Toc228976078" w:history="1">
             <w:r>
               <w:rPr>
                 <w:rStyle w:val="Hyperlink"/>
@@ -1083,7 +1083,7 @@
                 <w:noProof/>
                 <w:webHidden/>
               </w:rPr>
-              <w:instrText xml:space="preserve"> PAGEREF _Toc228963416 \h </w:instrText>
+              <w:instrText xml:space="preserve"> PAGEREF _Toc228976078 \h </w:instrText>
             </w:r>
             <w:r>
               <w:rPr>
@@ -1130,7 +1130,7 @@
               <w14:ligatures w14:val="standardContextual"/>
             </w:rPr>
           </w:pPr>
-          <w:hyperlink w:anchor="_Toc228963417" w:history="1">
+          <w:hyperlink w:anchor="_Toc228976079" w:history="1">
             <w:r>
               <w:rPr>
                 <w:rStyle w:val="Hyperlink"/>
@@ -1157,7 +1157,7 @@
                 <w:noProof/>
                 <w:webHidden/>
               </w:rPr>
-              <w:instrText xml:space="preserve"> PAGEREF _Toc228963417 \h </w:instrText>
+              <w:instrText xml:space="preserve"> PAGEREF _Toc228976079 \h </w:instrText>
             </w:r>
             <w:r>
               <w:rPr>
@@ -1204,7 +1204,7 @@
               <w14:ligatures w14:val="standardContextual"/>
             </w:rPr>
           </w:pPr>
-          <w:hyperlink w:anchor="_Toc228963418" w:history="1">
+          <w:hyperlink w:anchor="_Toc228976080" w:history="1">
             <w:r>
               <w:rPr>
                 <w:rStyle w:val="Hyperlink"/>
@@ -1231,7 +1231,7 @@
                 <w:noProof/>
                 <w:webHidden/>
               </w:rPr>
-              <w:instrText xml:space="preserve"> PAGEREF _Toc228963418 \h </w:instrText>
+              <w:instrText xml:space="preserve"> PAGEREF _Toc228976080 \h </w:instrText>
             </w:r>
             <w:r>
               <w:rPr>
@@ -1278,7 +1278,7 @@
               <w14:ligatures w14:val="standardContextual"/>
             </w:rPr>
           </w:pPr>
-          <w:hyperlink w:anchor="_Toc228963419" w:history="1">
+          <w:hyperlink w:anchor="_Toc228976081" w:history="1">
             <w:r>
               <w:rPr>
                 <w:rStyle w:val="Hyperlink"/>
@@ -1305,7 +1305,7 @@
                 <w:noProof/>
                 <w:webHidden/>
               </w:rPr>
-              <w:instrText xml:space="preserve"> PAGEREF _Toc228963419 \h </w:instrText>
+              <w:instrText xml:space="preserve"> PAGEREF _Toc228976081 \h </w:instrText>
             </w:r>
             <w:r>
               <w:rPr>
@@ -1352,7 +1352,7 @@
               <w14:ligatures w14:val="standardContextual"/>
             </w:rPr>
           </w:pPr>
-          <w:hyperlink w:anchor="_Toc228963420" w:history="1">
+          <w:hyperlink w:anchor="_Toc228976082" w:history="1">
             <w:r>
               <w:rPr>
                 <w:rStyle w:val="Hyperlink"/>
@@ -1379,7 +1379,7 @@
                 <w:noProof/>
                 <w:webHidden/>
               </w:rPr>
-              <w:instrText xml:space="preserve"> PAGEREF _Toc228963420 \h </w:instrText>
+              <w:instrText xml:space="preserve"> PAGEREF _Toc228976082 \h </w:instrText>
             </w:r>
             <w:r>
               <w:rPr>
@@ -1426,7 +1426,7 @@
               <w14:ligatures w14:val="standardContextual"/>
             </w:rPr>
           </w:pPr>
-          <w:hyperlink w:anchor="_Toc228963421" w:history="1">
+          <w:hyperlink w:anchor="_Toc228976083" w:history="1">
             <w:r>
               <w:rPr>
                 <w:rStyle w:val="Hyperlink"/>
@@ -1453,7 +1453,7 @@
                 <w:noProof/>
                 <w:webHidden/>
               </w:rPr>
-              <w:instrText xml:space="preserve"> PAGEREF _Toc228963421 \h </w:instrText>
+              <w:instrText xml:space="preserve"> PAGEREF _Toc228976083 \h </w:instrText>
             </w:r>
             <w:r>
               <w:rPr>
@@ -1500,7 +1500,7 @@
               <w14:ligatures w14:val="standardContextual"/>
             </w:rPr>
           </w:pPr>
-          <w:hyperlink w:anchor="_Toc228963422" w:history="1">
+          <w:hyperlink w:anchor="_Toc228976084" w:history="1">
             <w:r>
               <w:rPr>
                 <w:rStyle w:val="Hyperlink"/>
@@ -1527,7 +1527,7 @@
                 <w:noProof/>
                 <w:webHidden/>
               </w:rPr>
-              <w:instrText xml:space="preserve"> PAGEREF _Toc228963422 \h </w:instrText>
+              <w:instrText xml:space="preserve"> PAGEREF _Toc228976084 \h </w:instrText>
             </w:r>
             <w:r>
               <w:rPr>
@@ -1574,7 +1574,7 @@
               <w14:ligatures w14:val="standardContextual"/>
             </w:rPr>
           </w:pPr>
-          <w:hyperlink w:anchor="_Toc228963423" w:history="1">
+          <w:hyperlink w:anchor="_Toc228976085" w:history="1">
             <w:r>
               <w:rPr>
                 <w:rStyle w:val="Hyperlink"/>
@@ -1601,7 +1601,7 @@
                 <w:noProof/>
                 <w:webHidden/>
               </w:rPr>
-              <w:instrText xml:space="preserve"> PAGEREF _Toc228963423 \h </w:instrText>
+              <w:instrText xml:space="preserve"> PAGEREF _Toc228976085 \h </w:instrText>
             </w:r>
             <w:r>
               <w:rPr>
@@ -1648,7 +1648,7 @@
               <w14:ligatures w14:val="standardContextual"/>
             </w:rPr>
           </w:pPr>
-          <w:hyperlink w:anchor="_Toc228963424" w:history="1">
+          <w:hyperlink w:anchor="_Toc228976086" w:history="1">
             <w:r>
               <w:rPr>
                 <w:rStyle w:val="Hyperlink"/>
@@ -1675,7 +1675,7 @@
                 <w:noProof/>
                 <w:webHidden/>
               </w:rPr>
-              <w:instrText xml:space="preserve"> PAGEREF _Toc228963424 \h </w:instrText>
+              <w:instrText xml:space="preserve"> PAGEREF _Toc228976086 \h </w:instrText>
             </w:r>
             <w:r>
               <w:rPr>
@@ -1722,7 +1722,7 @@
               <w14:ligatures w14:val="standardContextual"/>
             </w:rPr>
           </w:pPr>
-          <w:hyperlink w:anchor="_Toc228963425" w:history="1">
+          <w:hyperlink w:anchor="_Toc228976087" w:history="1">
             <w:r>
               <w:rPr>
                 <w:rStyle w:val="Hyperlink"/>
@@ -1749,7 +1749,7 @@
                 <w:noProof/>
                 <w:webHidden/>
               </w:rPr>
-              <w:instrText xml:space="preserve"> PAGEREF _Toc228963425 \h </w:instrText>
+              <w:instrText xml:space="preserve"> PAGEREF _Toc228976087 \h </w:instrText>
             </w:r>
             <w:r>
               <w:rPr>
@@ -1796,7 +1796,7 @@
               <w14:ligatures w14:val="standardContextual"/>
             </w:rPr>
           </w:pPr>
-          <w:hyperlink w:anchor="_Toc228963426" w:history="1">
+          <w:hyperlink w:anchor="_Toc228976088" w:history="1">
             <w:r>
               <w:rPr>
                 <w:rStyle w:val="Hyperlink"/>
@@ -1823,7 +1823,7 @@
                 <w:noProof/>
                 <w:webHidden/>
               </w:rPr>
-              <w:instrText xml:space="preserve"> PAGEREF _Toc228963426 \h </w:instrText>
+              <w:instrText xml:space="preserve"> PAGEREF _Toc228976088 \h </w:instrText>
             </w:r>
             <w:r>
               <w:rPr>
@@ -1870,7 +1870,7 @@
               <w14:ligatures w14:val="standardContextual"/>
             </w:rPr>
           </w:pPr>
-          <w:hyperlink w:anchor="_Toc228963427" w:history="1">
+          <w:hyperlink w:anchor="_Toc228976089" w:history="1">
             <w:r>
               <w:rPr>
                 <w:rStyle w:val="Hyperlink"/>
@@ -1897,7 +1897,7 @@
                 <w:noProof/>
                 <w:webHidden/>
               </w:rPr>
-              <w:instrText xml:space="preserve"> PAGEREF _Toc228963427 \h </w:instrText>
+              <w:instrText xml:space="preserve"> PAGEREF _Toc228976089 \h </w:instrText>
             </w:r>
             <w:r>
               <w:rPr>
@@ -1944,7 +1944,7 @@
               <w14:ligatures w14:val="standardContextual"/>
             </w:rPr>
           </w:pPr>
-          <w:hyperlink w:anchor="_Toc228963428" w:history="1">
+          <w:hyperlink w:anchor="_Toc228976090" w:history="1">
             <w:r>
               <w:rPr>
                 <w:rStyle w:val="Hyperlink"/>
@@ -1971,7 +1971,7 @@
                 <w:noProof/>
                 <w:webHidden/>
               </w:rPr>
-              <w:instrText xml:space="preserve"> PAGEREF _Toc228963428 \h </w:instrText>
+              <w:instrText xml:space="preserve"> PAGEREF _Toc228976090 \h </w:instrText>
             </w:r>
             <w:r>
               <w:rPr>
@@ -2018,7 +2018,7 @@
               <w14:ligatures w14:val="standardContextual"/>
             </w:rPr>
           </w:pPr>
-          <w:hyperlink w:anchor="_Toc228963429" w:history="1">
+          <w:hyperlink w:anchor="_Toc228976091" w:history="1">
             <w:r>
               <w:rPr>
                 <w:rStyle w:val="Hyperlink"/>
@@ -2045,7 +2045,7 @@
                 <w:noProof/>
                 <w:webHidden/>
               </w:rPr>
-              <w:instrText xml:space="preserve"> PAGEREF _Toc228963429 \h </w:instrText>
+              <w:instrText xml:space="preserve"> PAGEREF _Toc228976091 \h </w:instrText>
             </w:r>
             <w:r>
               <w:rPr>
@@ -2092,7 +2092,7 @@
               <w14:ligatures w14:val="standardContextual"/>
             </w:rPr>
           </w:pPr>
-          <w:hyperlink w:anchor="_Toc228963430" w:history="1">
+          <w:hyperlink w:anchor="_Toc228976092" w:history="1">
             <w:r>
               <w:rPr>
                 <w:rStyle w:val="Hyperlink"/>
@@ -2119,7 +2119,7 @@
                 <w:noProof/>
                 <w:webHidden/>
               </w:rPr>
-              <w:instrText xml:space="preserve"> PAGEREF _Toc228963430 \h </w:instrText>
+              <w:instrText xml:space="preserve"> PAGEREF _Toc228976092 \h </w:instrText>
             </w:r>
             <w:r>
               <w:rPr>
@@ -2162,7 +2162,7 @@
               <w:lang w:eastAsia="en-GB"/>
             </w:rPr>
           </w:pPr>
-          <w:hyperlink w:anchor="_Toc228963431" w:history="1">
+          <w:hyperlink w:anchor="_Toc228976093" w:history="1">
             <w:r>
               <w:rPr>
                 <w:rStyle w:val="Hyperlink"/>
@@ -2189,7 +2189,7 @@
                 <w:noProof/>
                 <w:webHidden/>
               </w:rPr>
-              <w:instrText xml:space="preserve"> PAGEREF _Toc228963431 \h </w:instrText>
+              <w:instrText xml:space="preserve"> PAGEREF _Toc228976093 \h </w:instrText>
             </w:r>
             <w:r>
               <w:rPr>
@@ -2232,7 +2232,7 @@
               <w:lang w:eastAsia="en-GB"/>
             </w:rPr>
           </w:pPr>
-          <w:hyperlink w:anchor="_Toc228963432" w:history="1">
+          <w:hyperlink w:anchor="_Toc228976094" w:history="1">
             <w:r>
               <w:rPr>
                 <w:rStyle w:val="Hyperlink"/>
@@ -2259,7 +2259,7 @@
                 <w:noProof/>
                 <w:webHidden/>
               </w:rPr>
-              <w:instrText xml:space="preserve"> PAGEREF _Toc228963432 \h </w:instrText>
+              <w:instrText xml:space="preserve"> PAGEREF _Toc228976094 \h </w:instrText>
             </w:r>
             <w:r>
               <w:rPr>
@@ -2302,7 +2302,7 @@
               <w:lang w:eastAsia="en-GB"/>
             </w:rPr>
           </w:pPr>
-          <w:hyperlink w:anchor="_Toc228963433" w:history="1">
+          <w:hyperlink w:anchor="_Toc228976095" w:history="1">
             <w:r>
               <w:rPr>
                 <w:rStyle w:val="Hyperlink"/>
@@ -2329,7 +2329,7 @@
                 <w:noProof/>
                 <w:webHidden/>
               </w:rPr>
-              <w:instrText xml:space="preserve"> PAGEREF _Toc228963433 \h </w:instrText>
+              <w:instrText xml:space="preserve"> PAGEREF _Toc228976095 \h </w:instrText>
             </w:r>
             <w:r>
               <w:rPr>
@@ -2376,7 +2376,7 @@
               <w14:ligatures w14:val="standardContextual"/>
             </w:rPr>
           </w:pPr>
-          <w:hyperlink w:anchor="_Toc228963434" w:history="1">
+          <w:hyperlink w:anchor="_Toc228976096" w:history="1">
             <w:r>
               <w:rPr>
                 <w:rStyle w:val="Hyperlink"/>
@@ -2403,7 +2403,7 @@
                 <w:noProof/>
                 <w:webHidden/>
               </w:rPr>
-              <w:instrText xml:space="preserve"> PAGEREF _Toc228963434 \h </w:instrText>
+              <w:instrText xml:space="preserve"> PAGEREF _Toc228976096 \h </w:instrText>
             </w:r>
             <w:r>
               <w:rPr>
@@ -2446,7 +2446,7 @@
               <w:lang w:eastAsia="en-GB"/>
             </w:rPr>
           </w:pPr>
-          <w:hyperlink w:anchor="_Toc228963435" w:history="1">
+          <w:hyperlink w:anchor="_Toc228976097" w:history="1">
             <w:r>
               <w:rPr>
                 <w:rStyle w:val="Hyperlink"/>
@@ -2473,7 +2473,7 @@
                 <w:noProof/>
                 <w:webHidden/>
               </w:rPr>
-              <w:instrText xml:space="preserve"> PAGEREF _Toc228963435 \h </w:instrText>
+              <w:instrText xml:space="preserve"> PAGEREF _Toc228976097 \h </w:instrText>
             </w:r>
             <w:r>
               <w:rPr>
@@ -2516,7 +2516,7 @@
               <w:lang w:eastAsia="en-GB"/>
             </w:rPr>
           </w:pPr>
-          <w:hyperlink w:anchor="_Toc228963436" w:history="1">
+          <w:hyperlink w:anchor="_Toc228976098" w:history="1">
             <w:r>
               <w:rPr>
                 <w:rStyle w:val="Hyperlink"/>
@@ -2543,7 +2543,7 @@
                 <w:noProof/>
                 <w:webHidden/>
               </w:rPr>
-              <w:instrText xml:space="preserve"> PAGEREF _Toc228963436 \h </w:instrText>
+              <w:instrText xml:space="preserve"> PAGEREF _Toc228976098 \h </w:instrText>
             </w:r>
             <w:r>
               <w:rPr>
@@ -2586,7 +2586,7 @@
               <w:lang w:eastAsia="en-GB"/>
             </w:rPr>
           </w:pPr>
-          <w:hyperlink w:anchor="_Toc228963437" w:history="1">
+          <w:hyperlink w:anchor="_Toc228976099" w:history="1">
             <w:r>
               <w:rPr>
                 <w:rStyle w:val="Hyperlink"/>
@@ -2613,7 +2613,7 @@
                 <w:noProof/>
                 <w:webHidden/>
               </w:rPr>
-              <w:instrText xml:space="preserve"> PAGEREF _Toc228963437 \h </w:instrText>
+              <w:instrText xml:space="preserve"> PAGEREF _Toc228976099 \h </w:instrText>
             </w:r>
             <w:r>
               <w:rPr>
@@ -2660,7 +2660,7 @@
               <w14:ligatures w14:val="standardContextual"/>
             </w:rPr>
           </w:pPr>
-          <w:hyperlink w:anchor="_Toc228963438" w:history="1">
+          <w:hyperlink w:anchor="_Toc228976100" w:history="1">
             <w:r>
               <w:rPr>
                 <w:rStyle w:val="Hyperlink"/>
@@ -2687,7 +2687,7 @@
                 <w:noProof/>
                 <w:webHidden/>
               </w:rPr>
-              <w:instrText xml:space="preserve"> PAGEREF _Toc228963438 \h </w:instrText>
+              <w:instrText xml:space="preserve"> PAGEREF _Toc228976100 \h </w:instrText>
             </w:r>
             <w:r>
               <w:rPr>
@@ -2730,7 +2730,7 @@
               <w:lang w:eastAsia="en-GB"/>
             </w:rPr>
           </w:pPr>
-          <w:hyperlink w:anchor="_Toc228963439" w:history="1">
+          <w:hyperlink w:anchor="_Toc228976101" w:history="1">
             <w:r>
               <w:rPr>
                 <w:rStyle w:val="Hyperlink"/>
@@ -2757,7 +2757,7 @@
                 <w:noProof/>
                 <w:webHidden/>
               </w:rPr>
-              <w:instrText xml:space="preserve"> PAGEREF _Toc228963439 \h </w:instrText>
+              <w:instrText xml:space="preserve"> PAGEREF _Toc228976101 \h </w:instrText>
             </w:r>
             <w:r>
               <w:rPr>
@@ -2800,7 +2800,7 @@
               <w:lang w:eastAsia="en-GB"/>
             </w:rPr>
           </w:pPr>
-          <w:hyperlink w:anchor="_Toc228963440" w:history="1">
+          <w:hyperlink w:anchor="_Toc228976102" w:history="1">
             <w:r>
               <w:rPr>
                 <w:rStyle w:val="Hyperlink"/>
@@ -2827,7 +2827,7 @@
                 <w:noProof/>
                 <w:webHidden/>
               </w:rPr>
-              <w:instrText xml:space="preserve"> PAGEREF _Toc228963440 \h </w:instrText>
+              <w:instrText xml:space="preserve"> PAGEREF _Toc228976102 \h </w:instrText>
             </w:r>
             <w:r>
               <w:rPr>
@@ -2870,7 +2870,7 @@
               <w:lang w:eastAsia="en-GB"/>
             </w:rPr>
           </w:pPr>
-          <w:hyperlink w:anchor="_Toc228963441" w:history="1">
+          <w:hyperlink w:anchor="_Toc228976103" w:history="1">
             <w:r>
               <w:rPr>
                 <w:rStyle w:val="Hyperlink"/>
@@ -2897,7 +2897,7 @@
                 <w:noProof/>
                 <w:webHidden/>
               </w:rPr>
-              <w:instrText xml:space="preserve"> PAGEREF _Toc228963441 \h </w:instrText>
+              <w:instrText xml:space="preserve"> PAGEREF _Toc228976103 \h </w:instrText>
             </w:r>
             <w:r>
               <w:rPr>
@@ -2944,7 +2944,7 @@
               <w14:ligatures w14:val="standardContextual"/>
             </w:rPr>
           </w:pPr>
-          <w:hyperlink w:anchor="_Toc228963442" w:history="1">
+          <w:hyperlink w:anchor="_Toc228976104" w:history="1">
             <w:r>
               <w:rPr>
                 <w:rStyle w:val="Hyperlink"/>
@@ -2971,7 +2971,7 @@
                 <w:noProof/>
                 <w:webHidden/>
               </w:rPr>
-              <w:instrText xml:space="preserve"> PAGEREF _Toc228963442 \h </w:instrText>
+              <w:instrText xml:space="preserve"> PAGEREF _Toc228976104 \h </w:instrText>
             </w:r>
             <w:r>
               <w:rPr>
@@ -3018,7 +3018,7 @@
               <w14:ligatures w14:val="standardContextual"/>
             </w:rPr>
           </w:pPr>
-          <w:hyperlink w:anchor="_Toc228963443" w:history="1">
+          <w:hyperlink w:anchor="_Toc228976105" w:history="1">
             <w:r>
               <w:rPr>
                 <w:rStyle w:val="Hyperlink"/>
@@ -3045,7 +3045,7 @@
                 <w:noProof/>
                 <w:webHidden/>
               </w:rPr>
-              <w:instrText xml:space="preserve"> PAGEREF _Toc228963443 \h </w:instrText>
+              <w:instrText xml:space="preserve"> PAGEREF _Toc228976105 \h </w:instrText>
             </w:r>
             <w:r>
               <w:rPr>
@@ -3092,7 +3092,7 @@
               <w14:ligatures w14:val="standardContextual"/>
             </w:rPr>
           </w:pPr>
-          <w:hyperlink w:anchor="_Toc228963444" w:history="1">
+          <w:hyperlink w:anchor="_Toc228976106" w:history="1">
             <w:r>
               <w:rPr>
                 <w:rStyle w:val="Hyperlink"/>
@@ -3119,7 +3119,7 @@
                 <w:noProof/>
                 <w:webHidden/>
               </w:rPr>
-              <w:instrText xml:space="preserve"> PAGEREF _Toc228963444 \h </w:instrText>
+              <w:instrText xml:space="preserve"> PAGEREF _Toc228976106 \h </w:instrText>
             </w:r>
             <w:r>
               <w:rPr>
@@ -3166,7 +3166,7 @@
               <w14:ligatures w14:val="standardContextual"/>
             </w:rPr>
           </w:pPr>
-          <w:hyperlink w:anchor="_Toc228963445" w:history="1">
+          <w:hyperlink w:anchor="_Toc228976107" w:history="1">
             <w:r>
               <w:rPr>
                 <w:rStyle w:val="Hyperlink"/>
@@ -3193,7 +3193,7 @@
                 <w:noProof/>
                 <w:webHidden/>
               </w:rPr>
-              <w:instrText xml:space="preserve"> PAGEREF _Toc228963445 \h </w:instrText>
+              <w:instrText xml:space="preserve"> PAGEREF _Toc228976107 \h </w:instrText>
             </w:r>
             <w:r>
               <w:rPr>
@@ -3240,7 +3240,7 @@
               <w14:ligatures w14:val="standardContextual"/>
             </w:rPr>
           </w:pPr>
-          <w:hyperlink w:anchor="_Toc228963446" w:history="1">
+          <w:hyperlink w:anchor="_Toc228976108" w:history="1">
             <w:r>
               <w:rPr>
                 <w:rStyle w:val="Hyperlink"/>
@@ -3267,7 +3267,7 @@
                 <w:noProof/>
                 <w:webHidden/>
               </w:rPr>
-              <w:instrText xml:space="preserve"> PAGEREF _Toc228963446 \h </w:instrText>
+              <w:instrText xml:space="preserve"> PAGEREF _Toc228976108 \h </w:instrText>
             </w:r>
             <w:r>
               <w:rPr>
@@ -3314,7 +3314,7 @@
               <w14:ligatures w14:val="standardContextual"/>
             </w:rPr>
           </w:pPr>
-          <w:hyperlink w:anchor="_Toc228963447" w:history="1">
+          <w:hyperlink w:anchor="_Toc228976109" w:history="1">
             <w:r>
               <w:rPr>
                 <w:rStyle w:val="Hyperlink"/>
@@ -3341,7 +3341,7 @@
                 <w:noProof/>
                 <w:webHidden/>
               </w:rPr>
-              <w:instrText xml:space="preserve"> PAGEREF _Toc228963447 \h </w:instrText>
+              <w:instrText xml:space="preserve"> PAGEREF _Toc228976109 \h </w:instrText>
             </w:r>
             <w:r>
               <w:rPr>
@@ -3388,7 +3388,7 @@
               <w14:ligatures w14:val="standardContextual"/>
             </w:rPr>
           </w:pPr>
-          <w:hyperlink w:anchor="_Toc228963448" w:history="1">
+          <w:hyperlink w:anchor="_Toc228976110" w:history="1">
             <w:r>
               <w:rPr>
                 <w:rStyle w:val="Hyperlink"/>
@@ -3415,7 +3415,7 @@
                 <w:noProof/>
                 <w:webHidden/>
               </w:rPr>
-              <w:instrText xml:space="preserve"> PAGEREF _Toc228963448 \h </w:instrText>
+              <w:instrText xml:space="preserve"> PAGEREF _Toc228976110 \h </w:instrText>
             </w:r>
             <w:r>
               <w:rPr>
@@ -3462,7 +3462,7 @@
               <w14:ligatures w14:val="standardContextual"/>
             </w:rPr>
           </w:pPr>
-          <w:hyperlink w:anchor="_Toc228963449" w:history="1">
+          <w:hyperlink w:anchor="_Toc228976111" w:history="1">
             <w:r>
               <w:rPr>
                 <w:rStyle w:val="Hyperlink"/>
@@ -3489,7 +3489,81 @@
                 <w:noProof/>
                 <w:webHidden/>
               </w:rPr>
-              <w:instrText xml:space="preserve"> PAGEREF _Toc228963449 \h </w:instrText>
+              <w:instrText xml:space="preserve"> PAGEREF _Toc228976111 \h </w:instrText>
+            </w:r>
+            <w:r>
+              <w:rPr>
+                <w:noProof/>
+                <w:webHidden/>
+              </w:rPr>
+            </w:r>
+            <w:r>
+              <w:rPr>
+                <w:noProof/>
+                <w:webHidden/>
+              </w:rPr>
+              <w:fldChar w:fldCharType="separate"/>
+            </w:r>
+            <w:r>
+              <w:rPr>
+                <w:noProof/>
+                <w:webHidden/>
+              </w:rPr>
+              <w:t>14</w:t>
+            </w:r>
+            <w:r>
+              <w:rPr>
+                <w:noProof/>
+                <w:webHidden/>
+              </w:rPr>
+              <w:fldChar w:fldCharType="end"/>
+            </w:r>
+          </w:hyperlink>
+        </w:p>
+        <w:p>
+          <w:pPr>
+            <w:pStyle w:val="TOC3"/>
+            <w:tabs>
+              <w:tab w:val="right" w:leader="dot" w:pos="9016"/>
+            </w:tabs>
+            <w:rPr>
+              <w:rFonts w:asciiTheme="minorHAnsi" w:hAnsiTheme="minorHAnsi" w:cstheme="minorBidi"/>
+              <w:noProof/>
+              <w:kern w:val="2"/>
+              <w:sz w:val="24"/>
+              <w:szCs w:val="24"/>
+              <w:lang w:val="en-GB" w:eastAsia="en-GB"/>
+              <w14:ligatures w14:val="standardContextual"/>
+            </w:rPr>
+          </w:pPr>
+          <w:hyperlink w:anchor="_Toc228976112" w:history="1">
+            <w:r>
+              <w:rPr>
+                <w:rStyle w:val="Hyperlink"/>
+                <w:noProof/>
+              </w:rPr>
+              <w:t>3.2.1 Architecture</w:t>
+            </w:r>
+            <w:r>
+              <w:rPr>
+                <w:noProof/>
+                <w:webHidden/>
+              </w:rPr>
+              <w:tab/>
+            </w:r>
+            <w:r>
+              <w:rPr>
+                <w:noProof/>
+                <w:webHidden/>
+              </w:rPr>
+              <w:fldChar w:fldCharType="begin"/>
+            </w:r>
+            <w:r>
+              <w:rPr>
+                <w:noProof/>
+                <w:webHidden/>
+              </w:rPr>
+              <w:instrText xml:space="preserve"> PAGEREF _Toc228976112 \h </w:instrText>
             </w:r>
             <w:r>
               <w:rPr>
@@ -3536,7 +3610,7 @@
               <w14:ligatures w14:val="standardContextual"/>
             </w:rPr>
           </w:pPr>
-          <w:hyperlink w:anchor="_Toc228963450" w:history="1">
+          <w:hyperlink w:anchor="_Toc228976113" w:history="1">
             <w:r>
               <w:rPr>
                 <w:rStyle w:val="Hyperlink"/>
@@ -3563,7 +3637,7 @@
                 <w:noProof/>
                 <w:webHidden/>
               </w:rPr>
-              <w:instrText xml:space="preserve"> PAGEREF _Toc228963450 \h </w:instrText>
+              <w:instrText xml:space="preserve"> PAGEREF _Toc228976113 \h </w:instrText>
             </w:r>
             <w:r>
               <w:rPr>
@@ -3620,7 +3694,7 @@
       <w:pPr>
         <w:pStyle w:val="Heading1"/>
       </w:pPr>
-      <w:bookmarkStart w:id="7" w:name="_Toc228963415"/>
+      <w:bookmarkStart w:id="7" w:name="_Toc228976077"/>
       <w:r>
         <w:t>Table of Figures</w:t>
       </w:r>
@@ -4178,7 +4252,7 @@
       <w:pPr>
         <w:pStyle w:val="Heading1"/>
       </w:pPr>
-      <w:bookmarkStart w:id="8" w:name="_Toc228963416"/>
+      <w:bookmarkStart w:id="8" w:name="_Toc228976078"/>
       <w:r>
         <w:t>Chapter 1</w:t>
       </w:r>
@@ -4206,7 +4280,7 @@
           <w:u w:val="single"/>
         </w:rPr>
       </w:pPr>
-      <w:bookmarkStart w:id="9" w:name="_Toc228963417"/>
+      <w:bookmarkStart w:id="9" w:name="_Toc228976079"/>
       <w:r>
         <w:t>1.1</w:t>
       </w:r>
@@ -4257,7 +4331,7 @@
       <w:pPr>
         <w:pStyle w:val="Heading2"/>
       </w:pPr>
-      <w:bookmarkStart w:id="10" w:name="_Toc228963418"/>
+      <w:bookmarkStart w:id="10" w:name="_Toc228976080"/>
       <w:r>
         <w:t>1.2 Aims</w:t>
       </w:r>
@@ -4273,7 +4347,7 @@
           <w:szCs w:val="28"/>
         </w:rPr>
       </w:pPr>
-      <w:bookmarkStart w:id="11" w:name="_Toc228963419"/>
+      <w:bookmarkStart w:id="11" w:name="_Toc228976081"/>
       <w:r>
         <w:rPr>
           <w:rStyle w:val="Heading2Char"/>
@@ -4318,7 +4392,7 @@
       <w:pPr>
         <w:pStyle w:val="Heading3"/>
       </w:pPr>
-      <w:bookmarkStart w:id="12" w:name="_Toc228963420"/>
+      <w:bookmarkStart w:id="12" w:name="_Toc228976082"/>
       <w:r>
         <w:lastRenderedPageBreak/>
         <w:t>1.2.2 Additional Aims</w:t>
@@ -4388,7 +4462,7 @@
       <w:pPr>
         <w:pStyle w:val="Heading2"/>
       </w:pPr>
-      <w:bookmarkStart w:id="13" w:name="_Toc228963421"/>
+      <w:bookmarkStart w:id="13" w:name="_Toc228976083"/>
       <w:r>
         <w:t>1.3 Objectives</w:t>
       </w:r>
@@ -4398,7 +4472,7 @@
       <w:pPr>
         <w:pStyle w:val="Heading3"/>
       </w:pPr>
-      <w:bookmarkStart w:id="14" w:name="_Toc228963422"/>
+      <w:bookmarkStart w:id="14" w:name="_Toc228976084"/>
       <w:r>
         <w:t>1.3.1 Scope</w:t>
       </w:r>
@@ -4469,7 +4543,7 @@
       <w:pPr>
         <w:pStyle w:val="Heading3"/>
       </w:pPr>
-      <w:bookmarkStart w:id="15" w:name="_Toc228963423"/>
+      <w:bookmarkStart w:id="15" w:name="_Toc228976085"/>
       <w:r>
         <w:t>1.3.2 Research Objectives</w:t>
       </w:r>
@@ -4514,7 +4588,7 @@
       <w:pPr>
         <w:pStyle w:val="Heading3"/>
       </w:pPr>
-      <w:bookmarkStart w:id="16" w:name="_Toc228963424"/>
+      <w:bookmarkStart w:id="16" w:name="_Toc228976086"/>
       <w:r>
         <w:t>1.3.3 Design Objectives</w:t>
       </w:r>
@@ -4636,7 +4710,7 @@
       <w:pPr>
         <w:pStyle w:val="Heading3"/>
       </w:pPr>
-      <w:bookmarkStart w:id="17" w:name="_Toc228963425"/>
+      <w:bookmarkStart w:id="17" w:name="_Toc228976087"/>
       <w:r>
         <w:t>1.3.4 Implementation Objectives</w:t>
       </w:r>
@@ -4755,7 +4829,7 @@
       <w:pPr>
         <w:pStyle w:val="Heading3"/>
       </w:pPr>
-      <w:bookmarkStart w:id="18" w:name="_Toc228963426"/>
+      <w:bookmarkStart w:id="18" w:name="_Toc228976088"/>
       <w:r>
         <w:t>1.3.5 Results, Evaluation and Playtesting Objectives</w:t>
       </w:r>
@@ -4908,7 +4982,7 @@
       <w:pPr>
         <w:pStyle w:val="Heading1"/>
       </w:pPr>
-      <w:bookmarkStart w:id="19" w:name="_Toc228963427"/>
+      <w:bookmarkStart w:id="19" w:name="_Toc228976089"/>
       <w:r>
         <w:lastRenderedPageBreak/>
         <w:t>Chapter 2 – Literature Survey</w:t>
@@ -4919,7 +4993,7 @@
       <w:pPr>
         <w:pStyle w:val="Heading2"/>
       </w:pPr>
-      <w:bookmarkStart w:id="20" w:name="_Toc228963428"/>
+      <w:bookmarkStart w:id="20" w:name="_Toc228976090"/>
       <w:r>
         <w:t>2.1 Literature Survey Introduction</w:t>
       </w:r>
@@ -4958,7 +5032,7 @@
       <w:pPr>
         <w:pStyle w:val="Heading2"/>
       </w:pPr>
-      <w:bookmarkStart w:id="21" w:name="_Toc228963429"/>
+      <w:bookmarkStart w:id="21" w:name="_Toc228976091"/>
       <w:r>
         <w:t>2.2 Comparative Research</w:t>
       </w:r>
@@ -4976,7 +5050,7 @@
       <w:pPr>
         <w:pStyle w:val="Heading3"/>
       </w:pPr>
-      <w:bookmarkStart w:id="22" w:name="_Toc228963430"/>
+      <w:bookmarkStart w:id="22" w:name="_Toc228976092"/>
       <w:r>
         <w:t xml:space="preserve">2.2.1 </w:t>
       </w:r>
@@ -5052,7 +5126,7 @@
       <w:pPr>
         <w:pStyle w:val="Heading4"/>
       </w:pPr>
-      <w:bookmarkStart w:id="23" w:name="_Toc228963431"/>
+      <w:bookmarkStart w:id="23" w:name="_Toc228976093"/>
       <w:r>
         <w:t>2.2.1.1 Perlin Noise</w:t>
       </w:r>
@@ -5435,7 +5509,7 @@
       <w:pPr>
         <w:pStyle w:val="Heading4"/>
       </w:pPr>
-      <w:bookmarkStart w:id="25" w:name="_Toc228963432"/>
+      <w:bookmarkStart w:id="25" w:name="_Toc228976094"/>
       <w:r>
         <w:t>2.2.1.2 Binary Space Partitioning</w:t>
       </w:r>
@@ -5487,7 +5561,7 @@
       <w:pPr>
         <w:pStyle w:val="Heading4"/>
       </w:pPr>
-      <w:bookmarkStart w:id="26" w:name="_Toc228963433"/>
+      <w:bookmarkStart w:id="26" w:name="_Toc228976095"/>
       <w:r>
         <w:t>2.2.1.3 Cellular Automata</w:t>
       </w:r>
@@ -5607,7 +5681,7 @@
       <w:pPr>
         <w:pStyle w:val="Heading3"/>
       </w:pPr>
-      <w:bookmarkStart w:id="27" w:name="_Toc228963434"/>
+      <w:bookmarkStart w:id="27" w:name="_Toc228976096"/>
       <w:r>
         <w:t>2.2.2 Pathfinding</w:t>
       </w:r>
@@ -5670,7 +5744,7 @@
       <w:pPr>
         <w:pStyle w:val="Heading4"/>
       </w:pPr>
-      <w:bookmarkStart w:id="28" w:name="_Toc228963435"/>
+      <w:bookmarkStart w:id="28" w:name="_Toc228976097"/>
       <w:r>
         <w:t>2.2.2.1 Dijkstra</w:t>
       </w:r>
@@ -5843,7 +5917,7 @@
       <w:pPr>
         <w:pStyle w:val="Heading4"/>
       </w:pPr>
-      <w:bookmarkStart w:id="30" w:name="_Toc228963436"/>
+      <w:bookmarkStart w:id="30" w:name="_Toc228976098"/>
       <w:r>
         <w:t>2.2.2.2 A*</w:t>
       </w:r>
@@ -5908,7 +5982,7 @@
       <w:pPr>
         <w:pStyle w:val="Heading4"/>
       </w:pPr>
-      <w:bookmarkStart w:id="31" w:name="_Toc228963437"/>
+      <w:bookmarkStart w:id="31" w:name="_Toc228976099"/>
       <w:r>
         <w:t>2.2.2.3 Jump Point Search</w:t>
       </w:r>
@@ -5958,7 +6032,7 @@
       <w:pPr>
         <w:pStyle w:val="Heading3"/>
       </w:pPr>
-      <w:bookmarkStart w:id="32" w:name="_Toc228963438"/>
+      <w:bookmarkStart w:id="32" w:name="_Toc228976100"/>
       <w:r>
         <w:t>2.2.3 AI Integrations</w:t>
       </w:r>
@@ -5983,7 +6057,7 @@
       <w:pPr>
         <w:pStyle w:val="Heading4"/>
       </w:pPr>
-      <w:bookmarkStart w:id="33" w:name="_Toc228963439"/>
+      <w:bookmarkStart w:id="33" w:name="_Toc228976101"/>
       <w:r>
         <w:t>2.2.3.1 Neural Network</w:t>
       </w:r>
@@ -6050,7 +6124,7 @@
       <w:pPr>
         <w:pStyle w:val="Heading4"/>
       </w:pPr>
-      <w:bookmarkStart w:id="34" w:name="_Toc228963440"/>
+      <w:bookmarkStart w:id="34" w:name="_Toc228976102"/>
       <w:r>
         <w:t>2.2.3.2 Reinforcement Learning</w:t>
       </w:r>
@@ -6250,7 +6324,7 @@
       <w:pPr>
         <w:pStyle w:val="Heading4"/>
       </w:pPr>
-      <w:bookmarkStart w:id="36" w:name="_Toc228963441"/>
+      <w:bookmarkStart w:id="36" w:name="_Toc228976103"/>
       <w:r>
         <w:t>2.2.3.3 Imitation Learning</w:t>
       </w:r>
@@ -6383,7 +6457,7 @@
       <w:pPr>
         <w:pStyle w:val="Heading1"/>
       </w:pPr>
-      <w:bookmarkStart w:id="37" w:name="_Toc228963442"/>
+      <w:bookmarkStart w:id="37" w:name="_Toc228976104"/>
       <w:r>
         <w:t>Chapter 3 – Design</w:t>
       </w:r>
@@ -6410,7 +6484,7 @@
       <w:pPr>
         <w:pStyle w:val="Heading2"/>
       </w:pPr>
-      <w:bookmarkStart w:id="38" w:name="_Toc228963443"/>
+      <w:bookmarkStart w:id="38" w:name="_Toc228976105"/>
       <w:r>
         <w:t xml:space="preserve">3.1 </w:t>
       </w:r>
@@ -6461,7 +6535,7 @@
       <w:pPr>
         <w:pStyle w:val="Heading3"/>
       </w:pPr>
-      <w:bookmarkStart w:id="39" w:name="_Toc228963444"/>
+      <w:bookmarkStart w:id="39" w:name="_Toc228976106"/>
       <w:r>
         <w:lastRenderedPageBreak/>
         <w:t xml:space="preserve">3.1.1 </w:t>
@@ -6825,7 +6899,7 @@
       <w:pPr>
         <w:pStyle w:val="Heading3"/>
       </w:pPr>
-      <w:bookmarkStart w:id="43" w:name="_Toc228963445"/>
+      <w:bookmarkStart w:id="43" w:name="_Toc228976107"/>
       <w:r>
         <w:t>3.1.2 Biomes</w:t>
       </w:r>
@@ -7089,7 +7163,7 @@
       <w:pPr>
         <w:pStyle w:val="Heading3"/>
       </w:pPr>
-      <w:bookmarkStart w:id="45" w:name="_Toc228963446"/>
+      <w:bookmarkStart w:id="45" w:name="_Toc228976108"/>
       <w:r>
         <w:t>3.1.3 Resource Distribution</w:t>
       </w:r>
@@ -7119,7 +7193,7 @@
       <w:pPr>
         <w:pStyle w:val="Heading3"/>
       </w:pPr>
-      <w:bookmarkStart w:id="46" w:name="_Toc228963447"/>
+      <w:bookmarkStart w:id="46" w:name="_Toc228976109"/>
       <w:r>
         <w:t>3.1.4 River generation</w:t>
       </w:r>
@@ -7161,7 +7235,7 @@
       <w:pPr>
         <w:pStyle w:val="Heading3"/>
       </w:pPr>
-      <w:bookmarkStart w:id="47" w:name="_Toc228963448"/>
+      <w:bookmarkStart w:id="47" w:name="_Toc228976110"/>
       <w:r>
         <w:t>3.1.</w:t>
       </w:r>
@@ -7270,7 +7344,7 @@
       <w:pPr>
         <w:pStyle w:val="Heading2"/>
       </w:pPr>
-      <w:bookmarkStart w:id="48" w:name="_Toc228963449"/>
+      <w:bookmarkStart w:id="48" w:name="_Toc228976111"/>
       <w:r>
         <w:t>3.2 Pathfinding</w:t>
       </w:r>
@@ -7284,7 +7358,68 @@
         <w:t>different cost pathing.</w:t>
       </w:r>
     </w:p>
-    <w:bookmarkStart w:id="49" w:name="_Toc228963450" w:displacedByCustomXml="next"/>
+    <w:p>
+      <w:pPr>
+        <w:pStyle w:val="Heading3"/>
+      </w:pPr>
+      <w:bookmarkStart w:id="49" w:name="_Toc228976112"/>
+      <w:r>
+        <w:t xml:space="preserve">3.2.1 </w:t>
+      </w:r>
+      <w:r>
+        <w:t>Architecture</w:t>
+      </w:r>
+      <w:bookmarkEnd w:id="49"/>
+    </w:p>
+    <w:p>
+      <w:r>
+        <w:t xml:space="preserve">The preferred method to access the pathfinding functions is through a singleton. This ensures that only one instance of this class can exist at any given time and allows the functions of the class to easily be used by calling the class instance rather than using references on every unit to access the class’s functions. </w:t>
+      </w:r>
+      <w:r>
+        <w:t xml:space="preserve">The cons of using a singleton implementation are that it can be difficult to </w:t>
+      </w:r>
+      <w:r>
+        <w:t>test code due to the instance being globally accessible, meaning that isolating code for testing can be challenging.</w:t>
+      </w:r>
+    </w:p>
+    <w:p/>
+    <w:p>
+      <w:r>
+        <w:t xml:space="preserve">The alternative method is to use references on all </w:t>
+      </w:r>
+      <w:proofErr w:type="gramStart"/>
+      <w:r>
+        <w:t>units,</w:t>
+      </w:r>
+      <w:proofErr w:type="gramEnd"/>
+      <w:r>
+        <w:t xml:space="preserve"> this is better for testing and easier to manage multiple instances of. The cons to this method are that, in Unity, getting references is quite expensive and the pathfinding will be a MonoBehaviour class meaning that the use of Unity’s GetComponent will be mandatory.</w:t>
+      </w:r>
+    </w:p>
+    <w:p>
+      <w:r>
+        <w:br/>
+        <w:t xml:space="preserve">The singleton design pattern seems to be perfect for this use case, allowing all units to access the class without having a reference to it. This eliminates the need to use GetComponent which has its own </w:t>
+      </w:r>
+      <w:proofErr w:type="gramStart"/>
+      <w:r>
+        <w:t>myriad</w:t>
+      </w:r>
+      <w:proofErr w:type="gramEnd"/>
+      <w:r>
+        <w:t xml:space="preserve"> of drawbacks such as the degradation of performance when units try to access it, </w:t>
+      </w:r>
+      <w:proofErr w:type="spellStart"/>
+      <w:r>
+        <w:t>NullReference</w:t>
+      </w:r>
+      <w:proofErr w:type="spellEnd"/>
+      <w:r>
+        <w:t xml:space="preserve"> exceptions crashing the pathfinding functions, and making redundant calls.</w:t>
+      </w:r>
+    </w:p>
+    <w:p/>
+    <w:bookmarkStart w:id="50" w:name="_Toc228976113" w:displacedByCustomXml="next"/>
     <w:sdt>
       <w:sdtPr>
         <w:rPr>
@@ -7312,7 +7447,7 @@
           <w:r>
             <w:t>References</w:t>
           </w:r>
-          <w:bookmarkEnd w:id="49"/>
+          <w:bookmarkEnd w:id="50"/>
         </w:p>
         <w:sdt>
           <w:sdtPr>
@@ -7419,6 +7554,7 @@
                 <w:rPr>
                   <w:noProof/>
                 </w:rPr>
+                <w:lastRenderedPageBreak/>
                 <w:t xml:space="preserve">Gurney, K., 2018. </w:t>
               </w:r>
               <w:r>
@@ -7678,7 +7814,6 @@
                 <w:rPr>
                   <w:noProof/>
                 </w:rPr>
-                <w:lastRenderedPageBreak/>
                 <w:t xml:space="preserve">Wikipedia, n.d. </w:t>
               </w:r>
               <w:r>

</xml_diff>

<commit_message>
feat: Heuristic design written
</commit_message>
<xml_diff>
--- a/Report.docx
+++ b/Report.docx
@@ -321,7 +321,7 @@
         <w:pStyle w:val="Heading1"/>
       </w:pPr>
       <w:bookmarkStart w:id="1" w:name="_Toc40898999"/>
-      <w:bookmarkStart w:id="2" w:name="_Toc228976073"/>
+      <w:bookmarkStart w:id="2" w:name="_Toc228977514"/>
       <w:r>
         <w:lastRenderedPageBreak/>
         <w:t>Abstract</w:t>
@@ -369,7 +369,7 @@
         <w:spacing w:after="321"/>
         <w:ind w:left="-5"/>
       </w:pPr>
-      <w:bookmarkStart w:id="3" w:name="_Toc228976074"/>
+      <w:bookmarkStart w:id="3" w:name="_Toc228977515"/>
       <w:r>
         <w:lastRenderedPageBreak/>
         <w:t>Declaration</w:t>
@@ -491,7 +491,7 @@
         <w:ind w:left="-5"/>
       </w:pPr>
       <w:bookmarkStart w:id="4" w:name="_Toc40899001"/>
-      <w:bookmarkStart w:id="5" w:name="_Toc228976075"/>
+      <w:bookmarkStart w:id="5" w:name="_Toc228977516"/>
       <w:r>
         <w:lastRenderedPageBreak/>
         <w:t>Acknowledgements</w:t>
@@ -628,7 +628,7 @@
         <w:spacing w:line="259" w:lineRule="auto"/>
       </w:pPr>
     </w:p>
-    <w:bookmarkStart w:id="6" w:name="_Toc228976076" w:displacedByCustomXml="next"/>
+    <w:bookmarkStart w:id="6" w:name="_Toc228977517" w:displacedByCustomXml="next"/>
     <w:sdt>
       <w:sdtPr>
         <w:rPr>
@@ -686,7 +686,7 @@
           <w:r>
             <w:fldChar w:fldCharType="separate"/>
           </w:r>
-          <w:hyperlink w:anchor="_Toc228976073" w:history="1">
+          <w:hyperlink w:anchor="_Toc228977514" w:history="1">
             <w:r>
               <w:rPr>
                 <w:rStyle w:val="Hyperlink"/>
@@ -713,7 +713,7 @@
                 <w:noProof/>
                 <w:webHidden/>
               </w:rPr>
-              <w:instrText xml:space="preserve"> PAGEREF _Toc228976073 \h </w:instrText>
+              <w:instrText xml:space="preserve"> PAGEREF _Toc228977514 \h </w:instrText>
             </w:r>
             <w:r>
               <w:rPr>
@@ -760,7 +760,7 @@
               <w14:ligatures w14:val="standardContextual"/>
             </w:rPr>
           </w:pPr>
-          <w:hyperlink w:anchor="_Toc228976074" w:history="1">
+          <w:hyperlink w:anchor="_Toc228977515" w:history="1">
             <w:r>
               <w:rPr>
                 <w:rStyle w:val="Hyperlink"/>
@@ -787,7 +787,7 @@
                 <w:noProof/>
                 <w:webHidden/>
               </w:rPr>
-              <w:instrText xml:space="preserve"> PAGEREF _Toc228976074 \h </w:instrText>
+              <w:instrText xml:space="preserve"> PAGEREF _Toc228977515 \h </w:instrText>
             </w:r>
             <w:r>
               <w:rPr>
@@ -834,7 +834,7 @@
               <w14:ligatures w14:val="standardContextual"/>
             </w:rPr>
           </w:pPr>
-          <w:hyperlink w:anchor="_Toc228976075" w:history="1">
+          <w:hyperlink w:anchor="_Toc228977516" w:history="1">
             <w:r>
               <w:rPr>
                 <w:rStyle w:val="Hyperlink"/>
@@ -861,7 +861,7 @@
                 <w:noProof/>
                 <w:webHidden/>
               </w:rPr>
-              <w:instrText xml:space="preserve"> PAGEREF _Toc228976075 \h </w:instrText>
+              <w:instrText xml:space="preserve"> PAGEREF _Toc228977516 \h </w:instrText>
             </w:r>
             <w:r>
               <w:rPr>
@@ -908,7 +908,7 @@
               <w14:ligatures w14:val="standardContextual"/>
             </w:rPr>
           </w:pPr>
-          <w:hyperlink w:anchor="_Toc228976076" w:history="1">
+          <w:hyperlink w:anchor="_Toc228977517" w:history="1">
             <w:r>
               <w:rPr>
                 <w:rStyle w:val="Hyperlink"/>
@@ -935,7 +935,7 @@
                 <w:noProof/>
                 <w:webHidden/>
               </w:rPr>
-              <w:instrText xml:space="preserve"> PAGEREF _Toc228976076 \h </w:instrText>
+              <w:instrText xml:space="preserve"> PAGEREF _Toc228977517 \h </w:instrText>
             </w:r>
             <w:r>
               <w:rPr>
@@ -982,7 +982,7 @@
               <w14:ligatures w14:val="standardContextual"/>
             </w:rPr>
           </w:pPr>
-          <w:hyperlink w:anchor="_Toc228976077" w:history="1">
+          <w:hyperlink w:anchor="_Toc228977518" w:history="1">
             <w:r>
               <w:rPr>
                 <w:rStyle w:val="Hyperlink"/>
@@ -1009,7 +1009,7 @@
                 <w:noProof/>
                 <w:webHidden/>
               </w:rPr>
-              <w:instrText xml:space="preserve"> PAGEREF _Toc228976077 \h </w:instrText>
+              <w:instrText xml:space="preserve"> PAGEREF _Toc228977518 \h </w:instrText>
             </w:r>
             <w:r>
               <w:rPr>
@@ -1056,7 +1056,7 @@
               <w14:ligatures w14:val="standardContextual"/>
             </w:rPr>
           </w:pPr>
-          <w:hyperlink w:anchor="_Toc228976078" w:history="1">
+          <w:hyperlink w:anchor="_Toc228977519" w:history="1">
             <w:r>
               <w:rPr>
                 <w:rStyle w:val="Hyperlink"/>
@@ -1083,7 +1083,7 @@
                 <w:noProof/>
                 <w:webHidden/>
               </w:rPr>
-              <w:instrText xml:space="preserve"> PAGEREF _Toc228976078 \h </w:instrText>
+              <w:instrText xml:space="preserve"> PAGEREF _Toc228977519 \h </w:instrText>
             </w:r>
             <w:r>
               <w:rPr>
@@ -1130,7 +1130,7 @@
               <w14:ligatures w14:val="standardContextual"/>
             </w:rPr>
           </w:pPr>
-          <w:hyperlink w:anchor="_Toc228976079" w:history="1">
+          <w:hyperlink w:anchor="_Toc228977520" w:history="1">
             <w:r>
               <w:rPr>
                 <w:rStyle w:val="Hyperlink"/>
@@ -1157,7 +1157,7 @@
                 <w:noProof/>
                 <w:webHidden/>
               </w:rPr>
-              <w:instrText xml:space="preserve"> PAGEREF _Toc228976079 \h </w:instrText>
+              <w:instrText xml:space="preserve"> PAGEREF _Toc228977520 \h </w:instrText>
             </w:r>
             <w:r>
               <w:rPr>
@@ -1204,7 +1204,7 @@
               <w14:ligatures w14:val="standardContextual"/>
             </w:rPr>
           </w:pPr>
-          <w:hyperlink w:anchor="_Toc228976080" w:history="1">
+          <w:hyperlink w:anchor="_Toc228977521" w:history="1">
             <w:r>
               <w:rPr>
                 <w:rStyle w:val="Hyperlink"/>
@@ -1231,7 +1231,7 @@
                 <w:noProof/>
                 <w:webHidden/>
               </w:rPr>
-              <w:instrText xml:space="preserve"> PAGEREF _Toc228976080 \h </w:instrText>
+              <w:instrText xml:space="preserve"> PAGEREF _Toc228977521 \h </w:instrText>
             </w:r>
             <w:r>
               <w:rPr>
@@ -1278,7 +1278,7 @@
               <w14:ligatures w14:val="standardContextual"/>
             </w:rPr>
           </w:pPr>
-          <w:hyperlink w:anchor="_Toc228976081" w:history="1">
+          <w:hyperlink w:anchor="_Toc228977522" w:history="1">
             <w:r>
               <w:rPr>
                 <w:rStyle w:val="Hyperlink"/>
@@ -1305,7 +1305,7 @@
                 <w:noProof/>
                 <w:webHidden/>
               </w:rPr>
-              <w:instrText xml:space="preserve"> PAGEREF _Toc228976081 \h </w:instrText>
+              <w:instrText xml:space="preserve"> PAGEREF _Toc228977522 \h </w:instrText>
             </w:r>
             <w:r>
               <w:rPr>
@@ -1352,7 +1352,7 @@
               <w14:ligatures w14:val="standardContextual"/>
             </w:rPr>
           </w:pPr>
-          <w:hyperlink w:anchor="_Toc228976082" w:history="1">
+          <w:hyperlink w:anchor="_Toc228977523" w:history="1">
             <w:r>
               <w:rPr>
                 <w:rStyle w:val="Hyperlink"/>
@@ -1379,7 +1379,7 @@
                 <w:noProof/>
                 <w:webHidden/>
               </w:rPr>
-              <w:instrText xml:space="preserve"> PAGEREF _Toc228976082 \h </w:instrText>
+              <w:instrText xml:space="preserve"> PAGEREF _Toc228977523 \h </w:instrText>
             </w:r>
             <w:r>
               <w:rPr>
@@ -1426,7 +1426,7 @@
               <w14:ligatures w14:val="standardContextual"/>
             </w:rPr>
           </w:pPr>
-          <w:hyperlink w:anchor="_Toc228976083" w:history="1">
+          <w:hyperlink w:anchor="_Toc228977524" w:history="1">
             <w:r>
               <w:rPr>
                 <w:rStyle w:val="Hyperlink"/>
@@ -1453,7 +1453,7 @@
                 <w:noProof/>
                 <w:webHidden/>
               </w:rPr>
-              <w:instrText xml:space="preserve"> PAGEREF _Toc228976083 \h </w:instrText>
+              <w:instrText xml:space="preserve"> PAGEREF _Toc228977524 \h </w:instrText>
             </w:r>
             <w:r>
               <w:rPr>
@@ -1500,7 +1500,7 @@
               <w14:ligatures w14:val="standardContextual"/>
             </w:rPr>
           </w:pPr>
-          <w:hyperlink w:anchor="_Toc228976084" w:history="1">
+          <w:hyperlink w:anchor="_Toc228977525" w:history="1">
             <w:r>
               <w:rPr>
                 <w:rStyle w:val="Hyperlink"/>
@@ -1527,7 +1527,7 @@
                 <w:noProof/>
                 <w:webHidden/>
               </w:rPr>
-              <w:instrText xml:space="preserve"> PAGEREF _Toc228976084 \h </w:instrText>
+              <w:instrText xml:space="preserve"> PAGEREF _Toc228977525 \h </w:instrText>
             </w:r>
             <w:r>
               <w:rPr>
@@ -1574,7 +1574,7 @@
               <w14:ligatures w14:val="standardContextual"/>
             </w:rPr>
           </w:pPr>
-          <w:hyperlink w:anchor="_Toc228976085" w:history="1">
+          <w:hyperlink w:anchor="_Toc228977526" w:history="1">
             <w:r>
               <w:rPr>
                 <w:rStyle w:val="Hyperlink"/>
@@ -1601,7 +1601,7 @@
                 <w:noProof/>
                 <w:webHidden/>
               </w:rPr>
-              <w:instrText xml:space="preserve"> PAGEREF _Toc228976085 \h </w:instrText>
+              <w:instrText xml:space="preserve"> PAGEREF _Toc228977526 \h </w:instrText>
             </w:r>
             <w:r>
               <w:rPr>
@@ -1648,7 +1648,7 @@
               <w14:ligatures w14:val="standardContextual"/>
             </w:rPr>
           </w:pPr>
-          <w:hyperlink w:anchor="_Toc228976086" w:history="1">
+          <w:hyperlink w:anchor="_Toc228977527" w:history="1">
             <w:r>
               <w:rPr>
                 <w:rStyle w:val="Hyperlink"/>
@@ -1675,7 +1675,7 @@
                 <w:noProof/>
                 <w:webHidden/>
               </w:rPr>
-              <w:instrText xml:space="preserve"> PAGEREF _Toc228976086 \h </w:instrText>
+              <w:instrText xml:space="preserve"> PAGEREF _Toc228977527 \h </w:instrText>
             </w:r>
             <w:r>
               <w:rPr>
@@ -1722,7 +1722,7 @@
               <w14:ligatures w14:val="standardContextual"/>
             </w:rPr>
           </w:pPr>
-          <w:hyperlink w:anchor="_Toc228976087" w:history="1">
+          <w:hyperlink w:anchor="_Toc228977528" w:history="1">
             <w:r>
               <w:rPr>
                 <w:rStyle w:val="Hyperlink"/>
@@ -1749,7 +1749,7 @@
                 <w:noProof/>
                 <w:webHidden/>
               </w:rPr>
-              <w:instrText xml:space="preserve"> PAGEREF _Toc228976087 \h </w:instrText>
+              <w:instrText xml:space="preserve"> PAGEREF _Toc228977528 \h </w:instrText>
             </w:r>
             <w:r>
               <w:rPr>
@@ -1796,7 +1796,7 @@
               <w14:ligatures w14:val="standardContextual"/>
             </w:rPr>
           </w:pPr>
-          <w:hyperlink w:anchor="_Toc228976088" w:history="1">
+          <w:hyperlink w:anchor="_Toc228977529" w:history="1">
             <w:r>
               <w:rPr>
                 <w:rStyle w:val="Hyperlink"/>
@@ -1823,7 +1823,7 @@
                 <w:noProof/>
                 <w:webHidden/>
               </w:rPr>
-              <w:instrText xml:space="preserve"> PAGEREF _Toc228976088 \h </w:instrText>
+              <w:instrText xml:space="preserve"> PAGEREF _Toc228977529 \h </w:instrText>
             </w:r>
             <w:r>
               <w:rPr>
@@ -1870,7 +1870,7 @@
               <w14:ligatures w14:val="standardContextual"/>
             </w:rPr>
           </w:pPr>
-          <w:hyperlink w:anchor="_Toc228976089" w:history="1">
+          <w:hyperlink w:anchor="_Toc228977530" w:history="1">
             <w:r>
               <w:rPr>
                 <w:rStyle w:val="Hyperlink"/>
@@ -1897,7 +1897,7 @@
                 <w:noProof/>
                 <w:webHidden/>
               </w:rPr>
-              <w:instrText xml:space="preserve"> PAGEREF _Toc228976089 \h </w:instrText>
+              <w:instrText xml:space="preserve"> PAGEREF _Toc228977530 \h </w:instrText>
             </w:r>
             <w:r>
               <w:rPr>
@@ -1944,7 +1944,7 @@
               <w14:ligatures w14:val="standardContextual"/>
             </w:rPr>
           </w:pPr>
-          <w:hyperlink w:anchor="_Toc228976090" w:history="1">
+          <w:hyperlink w:anchor="_Toc228977531" w:history="1">
             <w:r>
               <w:rPr>
                 <w:rStyle w:val="Hyperlink"/>
@@ -1971,7 +1971,7 @@
                 <w:noProof/>
                 <w:webHidden/>
               </w:rPr>
-              <w:instrText xml:space="preserve"> PAGEREF _Toc228976090 \h </w:instrText>
+              <w:instrText xml:space="preserve"> PAGEREF _Toc228977531 \h </w:instrText>
             </w:r>
             <w:r>
               <w:rPr>
@@ -2018,7 +2018,7 @@
               <w14:ligatures w14:val="standardContextual"/>
             </w:rPr>
           </w:pPr>
-          <w:hyperlink w:anchor="_Toc228976091" w:history="1">
+          <w:hyperlink w:anchor="_Toc228977532" w:history="1">
             <w:r>
               <w:rPr>
                 <w:rStyle w:val="Hyperlink"/>
@@ -2045,7 +2045,7 @@
                 <w:noProof/>
                 <w:webHidden/>
               </w:rPr>
-              <w:instrText xml:space="preserve"> PAGEREF _Toc228976091 \h </w:instrText>
+              <w:instrText xml:space="preserve"> PAGEREF _Toc228977532 \h </w:instrText>
             </w:r>
             <w:r>
               <w:rPr>
@@ -2092,7 +2092,7 @@
               <w14:ligatures w14:val="standardContextual"/>
             </w:rPr>
           </w:pPr>
-          <w:hyperlink w:anchor="_Toc228976092" w:history="1">
+          <w:hyperlink w:anchor="_Toc228977533" w:history="1">
             <w:r>
               <w:rPr>
                 <w:rStyle w:val="Hyperlink"/>
@@ -2119,7 +2119,7 @@
                 <w:noProof/>
                 <w:webHidden/>
               </w:rPr>
-              <w:instrText xml:space="preserve"> PAGEREF _Toc228976092 \h </w:instrText>
+              <w:instrText xml:space="preserve"> PAGEREF _Toc228977533 \h </w:instrText>
             </w:r>
             <w:r>
               <w:rPr>
@@ -2162,7 +2162,7 @@
               <w:lang w:eastAsia="en-GB"/>
             </w:rPr>
           </w:pPr>
-          <w:hyperlink w:anchor="_Toc228976093" w:history="1">
+          <w:hyperlink w:anchor="_Toc228977534" w:history="1">
             <w:r>
               <w:rPr>
                 <w:rStyle w:val="Hyperlink"/>
@@ -2189,7 +2189,7 @@
                 <w:noProof/>
                 <w:webHidden/>
               </w:rPr>
-              <w:instrText xml:space="preserve"> PAGEREF _Toc228976093 \h </w:instrText>
+              <w:instrText xml:space="preserve"> PAGEREF _Toc228977534 \h </w:instrText>
             </w:r>
             <w:r>
               <w:rPr>
@@ -2232,7 +2232,7 @@
               <w:lang w:eastAsia="en-GB"/>
             </w:rPr>
           </w:pPr>
-          <w:hyperlink w:anchor="_Toc228976094" w:history="1">
+          <w:hyperlink w:anchor="_Toc228977535" w:history="1">
             <w:r>
               <w:rPr>
                 <w:rStyle w:val="Hyperlink"/>
@@ -2259,7 +2259,7 @@
                 <w:noProof/>
                 <w:webHidden/>
               </w:rPr>
-              <w:instrText xml:space="preserve"> PAGEREF _Toc228976094 \h </w:instrText>
+              <w:instrText xml:space="preserve"> PAGEREF _Toc228977535 \h </w:instrText>
             </w:r>
             <w:r>
               <w:rPr>
@@ -2302,7 +2302,7 @@
               <w:lang w:eastAsia="en-GB"/>
             </w:rPr>
           </w:pPr>
-          <w:hyperlink w:anchor="_Toc228976095" w:history="1">
+          <w:hyperlink w:anchor="_Toc228977536" w:history="1">
             <w:r>
               <w:rPr>
                 <w:rStyle w:val="Hyperlink"/>
@@ -2329,7 +2329,7 @@
                 <w:noProof/>
                 <w:webHidden/>
               </w:rPr>
-              <w:instrText xml:space="preserve"> PAGEREF _Toc228976095 \h </w:instrText>
+              <w:instrText xml:space="preserve"> PAGEREF _Toc228977536 \h </w:instrText>
             </w:r>
             <w:r>
               <w:rPr>
@@ -2376,7 +2376,7 @@
               <w14:ligatures w14:val="standardContextual"/>
             </w:rPr>
           </w:pPr>
-          <w:hyperlink w:anchor="_Toc228976096" w:history="1">
+          <w:hyperlink w:anchor="_Toc228977537" w:history="1">
             <w:r>
               <w:rPr>
                 <w:rStyle w:val="Hyperlink"/>
@@ -2403,7 +2403,7 @@
                 <w:noProof/>
                 <w:webHidden/>
               </w:rPr>
-              <w:instrText xml:space="preserve"> PAGEREF _Toc228976096 \h </w:instrText>
+              <w:instrText xml:space="preserve"> PAGEREF _Toc228977537 \h </w:instrText>
             </w:r>
             <w:r>
               <w:rPr>
@@ -2446,7 +2446,7 @@
               <w:lang w:eastAsia="en-GB"/>
             </w:rPr>
           </w:pPr>
-          <w:hyperlink w:anchor="_Toc228976097" w:history="1">
+          <w:hyperlink w:anchor="_Toc228977538" w:history="1">
             <w:r>
               <w:rPr>
                 <w:rStyle w:val="Hyperlink"/>
@@ -2473,7 +2473,7 @@
                 <w:noProof/>
                 <w:webHidden/>
               </w:rPr>
-              <w:instrText xml:space="preserve"> PAGEREF _Toc228976097 \h </w:instrText>
+              <w:instrText xml:space="preserve"> PAGEREF _Toc228977538 \h </w:instrText>
             </w:r>
             <w:r>
               <w:rPr>
@@ -2516,7 +2516,7 @@
               <w:lang w:eastAsia="en-GB"/>
             </w:rPr>
           </w:pPr>
-          <w:hyperlink w:anchor="_Toc228976098" w:history="1">
+          <w:hyperlink w:anchor="_Toc228977539" w:history="1">
             <w:r>
               <w:rPr>
                 <w:rStyle w:val="Hyperlink"/>
@@ -2543,7 +2543,7 @@
                 <w:noProof/>
                 <w:webHidden/>
               </w:rPr>
-              <w:instrText xml:space="preserve"> PAGEREF _Toc228976098 \h </w:instrText>
+              <w:instrText xml:space="preserve"> PAGEREF _Toc228977539 \h </w:instrText>
             </w:r>
             <w:r>
               <w:rPr>
@@ -2586,7 +2586,7 @@
               <w:lang w:eastAsia="en-GB"/>
             </w:rPr>
           </w:pPr>
-          <w:hyperlink w:anchor="_Toc228976099" w:history="1">
+          <w:hyperlink w:anchor="_Toc228977540" w:history="1">
             <w:r>
               <w:rPr>
                 <w:rStyle w:val="Hyperlink"/>
@@ -2613,7 +2613,7 @@
                 <w:noProof/>
                 <w:webHidden/>
               </w:rPr>
-              <w:instrText xml:space="preserve"> PAGEREF _Toc228976099 \h </w:instrText>
+              <w:instrText xml:space="preserve"> PAGEREF _Toc228977540 \h </w:instrText>
             </w:r>
             <w:r>
               <w:rPr>
@@ -2660,7 +2660,7 @@
               <w14:ligatures w14:val="standardContextual"/>
             </w:rPr>
           </w:pPr>
-          <w:hyperlink w:anchor="_Toc228976100" w:history="1">
+          <w:hyperlink w:anchor="_Toc228977541" w:history="1">
             <w:r>
               <w:rPr>
                 <w:rStyle w:val="Hyperlink"/>
@@ -2687,7 +2687,7 @@
                 <w:noProof/>
                 <w:webHidden/>
               </w:rPr>
-              <w:instrText xml:space="preserve"> PAGEREF _Toc228976100 \h </w:instrText>
+              <w:instrText xml:space="preserve"> PAGEREF _Toc228977541 \h </w:instrText>
             </w:r>
             <w:r>
               <w:rPr>
@@ -2730,7 +2730,7 @@
               <w:lang w:eastAsia="en-GB"/>
             </w:rPr>
           </w:pPr>
-          <w:hyperlink w:anchor="_Toc228976101" w:history="1">
+          <w:hyperlink w:anchor="_Toc228977542" w:history="1">
             <w:r>
               <w:rPr>
                 <w:rStyle w:val="Hyperlink"/>
@@ -2757,7 +2757,7 @@
                 <w:noProof/>
                 <w:webHidden/>
               </w:rPr>
-              <w:instrText xml:space="preserve"> PAGEREF _Toc228976101 \h </w:instrText>
+              <w:instrText xml:space="preserve"> PAGEREF _Toc228977542 \h </w:instrText>
             </w:r>
             <w:r>
               <w:rPr>
@@ -2800,7 +2800,7 @@
               <w:lang w:eastAsia="en-GB"/>
             </w:rPr>
           </w:pPr>
-          <w:hyperlink w:anchor="_Toc228976102" w:history="1">
+          <w:hyperlink w:anchor="_Toc228977543" w:history="1">
             <w:r>
               <w:rPr>
                 <w:rStyle w:val="Hyperlink"/>
@@ -2827,7 +2827,7 @@
                 <w:noProof/>
                 <w:webHidden/>
               </w:rPr>
-              <w:instrText xml:space="preserve"> PAGEREF _Toc228976102 \h </w:instrText>
+              <w:instrText xml:space="preserve"> PAGEREF _Toc228977543 \h </w:instrText>
             </w:r>
             <w:r>
               <w:rPr>
@@ -2870,7 +2870,7 @@
               <w:lang w:eastAsia="en-GB"/>
             </w:rPr>
           </w:pPr>
-          <w:hyperlink w:anchor="_Toc228976103" w:history="1">
+          <w:hyperlink w:anchor="_Toc228977544" w:history="1">
             <w:r>
               <w:rPr>
                 <w:rStyle w:val="Hyperlink"/>
@@ -2897,7 +2897,7 @@
                 <w:noProof/>
                 <w:webHidden/>
               </w:rPr>
-              <w:instrText xml:space="preserve"> PAGEREF _Toc228976103 \h </w:instrText>
+              <w:instrText xml:space="preserve"> PAGEREF _Toc228977544 \h </w:instrText>
             </w:r>
             <w:r>
               <w:rPr>
@@ -2944,7 +2944,7 @@
               <w14:ligatures w14:val="standardContextual"/>
             </w:rPr>
           </w:pPr>
-          <w:hyperlink w:anchor="_Toc228976104" w:history="1">
+          <w:hyperlink w:anchor="_Toc228977545" w:history="1">
             <w:r>
               <w:rPr>
                 <w:rStyle w:val="Hyperlink"/>
@@ -2971,7 +2971,7 @@
                 <w:noProof/>
                 <w:webHidden/>
               </w:rPr>
-              <w:instrText xml:space="preserve"> PAGEREF _Toc228976104 \h </w:instrText>
+              <w:instrText xml:space="preserve"> PAGEREF _Toc228977545 \h </w:instrText>
             </w:r>
             <w:r>
               <w:rPr>
@@ -3018,7 +3018,7 @@
               <w14:ligatures w14:val="standardContextual"/>
             </w:rPr>
           </w:pPr>
-          <w:hyperlink w:anchor="_Toc228976105" w:history="1">
+          <w:hyperlink w:anchor="_Toc228977546" w:history="1">
             <w:r>
               <w:rPr>
                 <w:rStyle w:val="Hyperlink"/>
@@ -3045,7 +3045,7 @@
                 <w:noProof/>
                 <w:webHidden/>
               </w:rPr>
-              <w:instrText xml:space="preserve"> PAGEREF _Toc228976105 \h </w:instrText>
+              <w:instrText xml:space="preserve"> PAGEREF _Toc228977546 \h </w:instrText>
             </w:r>
             <w:r>
               <w:rPr>
@@ -3092,7 +3092,7 @@
               <w14:ligatures w14:val="standardContextual"/>
             </w:rPr>
           </w:pPr>
-          <w:hyperlink w:anchor="_Toc228976106" w:history="1">
+          <w:hyperlink w:anchor="_Toc228977547" w:history="1">
             <w:r>
               <w:rPr>
                 <w:rStyle w:val="Hyperlink"/>
@@ -3119,7 +3119,7 @@
                 <w:noProof/>
                 <w:webHidden/>
               </w:rPr>
-              <w:instrText xml:space="preserve"> PAGEREF _Toc228976106 \h </w:instrText>
+              <w:instrText xml:space="preserve"> PAGEREF _Toc228977547 \h </w:instrText>
             </w:r>
             <w:r>
               <w:rPr>
@@ -3166,7 +3166,7 @@
               <w14:ligatures w14:val="standardContextual"/>
             </w:rPr>
           </w:pPr>
-          <w:hyperlink w:anchor="_Toc228976107" w:history="1">
+          <w:hyperlink w:anchor="_Toc228977548" w:history="1">
             <w:r>
               <w:rPr>
                 <w:rStyle w:val="Hyperlink"/>
@@ -3193,7 +3193,7 @@
                 <w:noProof/>
                 <w:webHidden/>
               </w:rPr>
-              <w:instrText xml:space="preserve"> PAGEREF _Toc228976107 \h </w:instrText>
+              <w:instrText xml:space="preserve"> PAGEREF _Toc228977548 \h </w:instrText>
             </w:r>
             <w:r>
               <w:rPr>
@@ -3240,7 +3240,7 @@
               <w14:ligatures w14:val="standardContextual"/>
             </w:rPr>
           </w:pPr>
-          <w:hyperlink w:anchor="_Toc228976108" w:history="1">
+          <w:hyperlink w:anchor="_Toc228977549" w:history="1">
             <w:r>
               <w:rPr>
                 <w:rStyle w:val="Hyperlink"/>
@@ -3267,7 +3267,7 @@
                 <w:noProof/>
                 <w:webHidden/>
               </w:rPr>
-              <w:instrText xml:space="preserve"> PAGEREF _Toc228976108 \h </w:instrText>
+              <w:instrText xml:space="preserve"> PAGEREF _Toc228977549 \h </w:instrText>
             </w:r>
             <w:r>
               <w:rPr>
@@ -3314,7 +3314,7 @@
               <w14:ligatures w14:val="standardContextual"/>
             </w:rPr>
           </w:pPr>
-          <w:hyperlink w:anchor="_Toc228976109" w:history="1">
+          <w:hyperlink w:anchor="_Toc228977550" w:history="1">
             <w:r>
               <w:rPr>
                 <w:rStyle w:val="Hyperlink"/>
@@ -3341,7 +3341,7 @@
                 <w:noProof/>
                 <w:webHidden/>
               </w:rPr>
-              <w:instrText xml:space="preserve"> PAGEREF _Toc228976109 \h </w:instrText>
+              <w:instrText xml:space="preserve"> PAGEREF _Toc228977550 \h </w:instrText>
             </w:r>
             <w:r>
               <w:rPr>
@@ -3388,7 +3388,7 @@
               <w14:ligatures w14:val="standardContextual"/>
             </w:rPr>
           </w:pPr>
-          <w:hyperlink w:anchor="_Toc228976110" w:history="1">
+          <w:hyperlink w:anchor="_Toc228977551" w:history="1">
             <w:r>
               <w:rPr>
                 <w:rStyle w:val="Hyperlink"/>
@@ -3415,7 +3415,7 @@
                 <w:noProof/>
                 <w:webHidden/>
               </w:rPr>
-              <w:instrText xml:space="preserve"> PAGEREF _Toc228976110 \h </w:instrText>
+              <w:instrText xml:space="preserve"> PAGEREF _Toc228977551 \h </w:instrText>
             </w:r>
             <w:r>
               <w:rPr>
@@ -3462,7 +3462,7 @@
               <w14:ligatures w14:val="standardContextual"/>
             </w:rPr>
           </w:pPr>
-          <w:hyperlink w:anchor="_Toc228976111" w:history="1">
+          <w:hyperlink w:anchor="_Toc228977552" w:history="1">
             <w:r>
               <w:rPr>
                 <w:rStyle w:val="Hyperlink"/>
@@ -3489,7 +3489,7 @@
                 <w:noProof/>
                 <w:webHidden/>
               </w:rPr>
-              <w:instrText xml:space="preserve"> PAGEREF _Toc228976111 \h </w:instrText>
+              <w:instrText xml:space="preserve"> PAGEREF _Toc228977552 \h </w:instrText>
             </w:r>
             <w:r>
               <w:rPr>
@@ -3536,7 +3536,7 @@
               <w14:ligatures w14:val="standardContextual"/>
             </w:rPr>
           </w:pPr>
-          <w:hyperlink w:anchor="_Toc228976112" w:history="1">
+          <w:hyperlink w:anchor="_Toc228977553" w:history="1">
             <w:r>
               <w:rPr>
                 <w:rStyle w:val="Hyperlink"/>
@@ -3563,7 +3563,81 @@
                 <w:noProof/>
                 <w:webHidden/>
               </w:rPr>
-              <w:instrText xml:space="preserve"> PAGEREF _Toc228976112 \h </w:instrText>
+              <w:instrText xml:space="preserve"> PAGEREF _Toc228977553 \h </w:instrText>
+            </w:r>
+            <w:r>
+              <w:rPr>
+                <w:noProof/>
+                <w:webHidden/>
+              </w:rPr>
+            </w:r>
+            <w:r>
+              <w:rPr>
+                <w:noProof/>
+                <w:webHidden/>
+              </w:rPr>
+              <w:fldChar w:fldCharType="separate"/>
+            </w:r>
+            <w:r>
+              <w:rPr>
+                <w:noProof/>
+                <w:webHidden/>
+              </w:rPr>
+              <w:t>14</w:t>
+            </w:r>
+            <w:r>
+              <w:rPr>
+                <w:noProof/>
+                <w:webHidden/>
+              </w:rPr>
+              <w:fldChar w:fldCharType="end"/>
+            </w:r>
+          </w:hyperlink>
+        </w:p>
+        <w:p>
+          <w:pPr>
+            <w:pStyle w:val="TOC3"/>
+            <w:tabs>
+              <w:tab w:val="right" w:leader="dot" w:pos="9016"/>
+            </w:tabs>
+            <w:rPr>
+              <w:rFonts w:asciiTheme="minorHAnsi" w:hAnsiTheme="minorHAnsi" w:cstheme="minorBidi"/>
+              <w:noProof/>
+              <w:kern w:val="2"/>
+              <w:sz w:val="24"/>
+              <w:szCs w:val="24"/>
+              <w:lang w:val="en-GB" w:eastAsia="en-GB"/>
+              <w14:ligatures w14:val="standardContextual"/>
+            </w:rPr>
+          </w:pPr>
+          <w:hyperlink w:anchor="_Toc228977554" w:history="1">
+            <w:r>
+              <w:rPr>
+                <w:rStyle w:val="Hyperlink"/>
+                <w:noProof/>
+              </w:rPr>
+              <w:t>3.2.2 Heuristics</w:t>
+            </w:r>
+            <w:r>
+              <w:rPr>
+                <w:noProof/>
+                <w:webHidden/>
+              </w:rPr>
+              <w:tab/>
+            </w:r>
+            <w:r>
+              <w:rPr>
+                <w:noProof/>
+                <w:webHidden/>
+              </w:rPr>
+              <w:fldChar w:fldCharType="begin"/>
+            </w:r>
+            <w:r>
+              <w:rPr>
+                <w:noProof/>
+                <w:webHidden/>
+              </w:rPr>
+              <w:instrText xml:space="preserve"> PAGEREF _Toc228977554 \h </w:instrText>
             </w:r>
             <w:r>
               <w:rPr>
@@ -3610,7 +3684,7 @@
               <w14:ligatures w14:val="standardContextual"/>
             </w:rPr>
           </w:pPr>
-          <w:hyperlink w:anchor="_Toc228976113" w:history="1">
+          <w:hyperlink w:anchor="_Toc228977555" w:history="1">
             <w:r>
               <w:rPr>
                 <w:rStyle w:val="Hyperlink"/>
@@ -3637,7 +3711,7 @@
                 <w:noProof/>
                 <w:webHidden/>
               </w:rPr>
-              <w:instrText xml:space="preserve"> PAGEREF _Toc228976113 \h </w:instrText>
+              <w:instrText xml:space="preserve"> PAGEREF _Toc228977555 \h </w:instrText>
             </w:r>
             <w:r>
               <w:rPr>
@@ -3657,7 +3731,7 @@
                 <w:noProof/>
                 <w:webHidden/>
               </w:rPr>
-              <w:t>14</w:t>
+              <w:t>15</w:t>
             </w:r>
             <w:r>
               <w:rPr>
@@ -3694,7 +3768,7 @@
       <w:pPr>
         <w:pStyle w:val="Heading1"/>
       </w:pPr>
-      <w:bookmarkStart w:id="7" w:name="_Toc228976077"/>
+      <w:bookmarkStart w:id="7" w:name="_Toc228977518"/>
       <w:r>
         <w:t>Table of Figures</w:t>
       </w:r>
@@ -3736,7 +3810,7 @@
         </w:rPr>
         <w:fldChar w:fldCharType="separate"/>
       </w:r>
-      <w:hyperlink w:anchor="_Toc227743280" w:history="1">
+      <w:hyperlink w:anchor="_Toc228977556" w:history="1">
         <w:r>
           <w:rPr>
             <w:rStyle w:val="Hyperlink"/>
@@ -3763,77 +3837,7 @@
             <w:noProof/>
             <w:webHidden/>
           </w:rPr>
-          <w:instrText xml:space="preserve"> PAGEREF _Toc227743280 \h </w:instrText>
-        </w:r>
-        <w:r>
-          <w:rPr>
-            <w:noProof/>
-            <w:webHidden/>
-          </w:rPr>
-        </w:r>
-        <w:r>
-          <w:rPr>
-            <w:noProof/>
-            <w:webHidden/>
-          </w:rPr>
-          <w:fldChar w:fldCharType="separate"/>
-        </w:r>
-        <w:r>
-          <w:rPr>
-            <w:noProof/>
-            <w:webHidden/>
-          </w:rPr>
-          <w:t>5</w:t>
-        </w:r>
-        <w:r>
-          <w:rPr>
-            <w:noProof/>
-            <w:webHidden/>
-          </w:rPr>
-          <w:fldChar w:fldCharType="end"/>
-        </w:r>
-      </w:hyperlink>
-    </w:p>
-    <w:p>
-      <w:pPr>
-        <w:pStyle w:val="TableofFigures"/>
-        <w:tabs>
-          <w:tab w:val="right" w:leader="dot" w:pos="9016"/>
-        </w:tabs>
-        <w:rPr>
-          <w:rFonts w:asciiTheme="minorHAnsi" w:eastAsiaTheme="minorEastAsia" w:hAnsiTheme="minorHAnsi"/>
-          <w:noProof/>
-          <w:lang w:eastAsia="en-GB"/>
-        </w:rPr>
-      </w:pPr>
-      <w:hyperlink w:anchor="_Toc227743281" w:history="1">
-        <w:r>
-          <w:rPr>
-            <w:rStyle w:val="Hyperlink"/>
-            <w:noProof/>
-          </w:rPr>
-          <w:t>Figure 2 (Kartik, 2026)</w:t>
-        </w:r>
-        <w:r>
-          <w:rPr>
-            <w:noProof/>
-            <w:webHidden/>
-          </w:rPr>
-          <w:tab/>
-        </w:r>
-        <w:r>
-          <w:rPr>
-            <w:noProof/>
-            <w:webHidden/>
-          </w:rPr>
-          <w:fldChar w:fldCharType="begin"/>
-        </w:r>
-        <w:r>
-          <w:rPr>
-            <w:noProof/>
-            <w:webHidden/>
-          </w:rPr>
-          <w:instrText xml:space="preserve"> PAGEREF _Toc227743281 \h </w:instrText>
+          <w:instrText xml:space="preserve"> PAGEREF _Toc228977556 \h </w:instrText>
         </w:r>
         <w:r>
           <w:rPr>
@@ -3876,7 +3880,77 @@
           <w:lang w:eastAsia="en-GB"/>
         </w:rPr>
       </w:pPr>
-      <w:hyperlink w:anchor="_Toc227743282" w:history="1">
+      <w:hyperlink w:anchor="_Toc228977557" w:history="1">
+        <w:r>
+          <w:rPr>
+            <w:rStyle w:val="Hyperlink"/>
+            <w:noProof/>
+          </w:rPr>
+          <w:t>Figure 2 (Kartik, 2026)</w:t>
+        </w:r>
+        <w:r>
+          <w:rPr>
+            <w:noProof/>
+            <w:webHidden/>
+          </w:rPr>
+          <w:tab/>
+        </w:r>
+        <w:r>
+          <w:rPr>
+            <w:noProof/>
+            <w:webHidden/>
+          </w:rPr>
+          <w:fldChar w:fldCharType="begin"/>
+        </w:r>
+        <w:r>
+          <w:rPr>
+            <w:noProof/>
+            <w:webHidden/>
+          </w:rPr>
+          <w:instrText xml:space="preserve"> PAGEREF _Toc228977557 \h </w:instrText>
+        </w:r>
+        <w:r>
+          <w:rPr>
+            <w:noProof/>
+            <w:webHidden/>
+          </w:rPr>
+        </w:r>
+        <w:r>
+          <w:rPr>
+            <w:noProof/>
+            <w:webHidden/>
+          </w:rPr>
+          <w:fldChar w:fldCharType="separate"/>
+        </w:r>
+        <w:r>
+          <w:rPr>
+            <w:noProof/>
+            <w:webHidden/>
+          </w:rPr>
+          <w:t>7</w:t>
+        </w:r>
+        <w:r>
+          <w:rPr>
+            <w:noProof/>
+            <w:webHidden/>
+          </w:rPr>
+          <w:fldChar w:fldCharType="end"/>
+        </w:r>
+      </w:hyperlink>
+    </w:p>
+    <w:p>
+      <w:pPr>
+        <w:pStyle w:val="TableofFigures"/>
+        <w:tabs>
+          <w:tab w:val="right" w:leader="dot" w:pos="9016"/>
+        </w:tabs>
+        <w:rPr>
+          <w:rFonts w:asciiTheme="minorHAnsi" w:eastAsiaTheme="minorEastAsia" w:hAnsiTheme="minorHAnsi"/>
+          <w:noProof/>
+          <w:lang w:eastAsia="en-GB"/>
+        </w:rPr>
+      </w:pPr>
+      <w:hyperlink w:anchor="_Toc228977558" w:history="1">
         <w:r>
           <w:rPr>
             <w:rStyle w:val="Hyperlink"/>
@@ -3903,77 +3977,7 @@
             <w:noProof/>
             <w:webHidden/>
           </w:rPr>
-          <w:instrText xml:space="preserve"> PAGEREF _Toc227743282 \h </w:instrText>
-        </w:r>
-        <w:r>
-          <w:rPr>
-            <w:noProof/>
-            <w:webHidden/>
-          </w:rPr>
-        </w:r>
-        <w:r>
-          <w:rPr>
-            <w:noProof/>
-            <w:webHidden/>
-          </w:rPr>
-          <w:fldChar w:fldCharType="separate"/>
-        </w:r>
-        <w:r>
-          <w:rPr>
-            <w:noProof/>
-            <w:webHidden/>
-          </w:rPr>
-          <w:t>8</w:t>
-        </w:r>
-        <w:r>
-          <w:rPr>
-            <w:noProof/>
-            <w:webHidden/>
-          </w:rPr>
-          <w:fldChar w:fldCharType="end"/>
-        </w:r>
-      </w:hyperlink>
-    </w:p>
-    <w:p>
-      <w:pPr>
-        <w:pStyle w:val="TableofFigures"/>
-        <w:tabs>
-          <w:tab w:val="right" w:leader="dot" w:pos="9016"/>
-        </w:tabs>
-        <w:rPr>
-          <w:rFonts w:asciiTheme="minorHAnsi" w:eastAsiaTheme="minorEastAsia" w:hAnsiTheme="minorHAnsi"/>
-          <w:noProof/>
-          <w:lang w:eastAsia="en-GB"/>
-        </w:rPr>
-      </w:pPr>
-      <w:hyperlink w:anchor="_Toc227743283" w:history="1">
-        <w:r>
-          <w:rPr>
-            <w:rStyle w:val="Hyperlink"/>
-            <w:noProof/>
-          </w:rPr>
-          <w:t>Figure 4</w:t>
-        </w:r>
-        <w:r>
-          <w:rPr>
-            <w:noProof/>
-            <w:webHidden/>
-          </w:rPr>
-          <w:tab/>
-        </w:r>
-        <w:r>
-          <w:rPr>
-            <w:noProof/>
-            <w:webHidden/>
-          </w:rPr>
-          <w:fldChar w:fldCharType="begin"/>
-        </w:r>
-        <w:r>
-          <w:rPr>
-            <w:noProof/>
-            <w:webHidden/>
-          </w:rPr>
-          <w:instrText xml:space="preserve"> PAGEREF _Toc227743283 \h </w:instrText>
+          <w:instrText xml:space="preserve"> PAGEREF _Toc228977558 \h </w:instrText>
         </w:r>
         <w:r>
           <w:rPr>
@@ -4016,13 +4020,13 @@
           <w:lang w:eastAsia="en-GB"/>
         </w:rPr>
       </w:pPr>
-      <w:hyperlink w:anchor="_Toc227743284" w:history="1">
+      <w:hyperlink w:anchor="_Toc228977559" w:history="1">
         <w:r>
           <w:rPr>
             <w:rStyle w:val="Hyperlink"/>
             <w:noProof/>
           </w:rPr>
-          <w:t>Figure 5</w:t>
+          <w:t>Figure 4</w:t>
         </w:r>
         <w:r>
           <w:rPr>
@@ -4043,147 +4047,7 @@
             <w:noProof/>
             <w:webHidden/>
           </w:rPr>
-          <w:instrText xml:space="preserve"> PAGEREF _Toc227743284 \h </w:instrText>
-        </w:r>
-        <w:r>
-          <w:rPr>
-            <w:noProof/>
-            <w:webHidden/>
-          </w:rPr>
-        </w:r>
-        <w:r>
-          <w:rPr>
-            <w:noProof/>
-            <w:webHidden/>
-          </w:rPr>
-          <w:fldChar w:fldCharType="separate"/>
-        </w:r>
-        <w:r>
-          <w:rPr>
-            <w:noProof/>
-            <w:webHidden/>
-          </w:rPr>
-          <w:t>10</w:t>
-        </w:r>
-        <w:r>
-          <w:rPr>
-            <w:noProof/>
-            <w:webHidden/>
-          </w:rPr>
-          <w:fldChar w:fldCharType="end"/>
-        </w:r>
-      </w:hyperlink>
-    </w:p>
-    <w:p>
-      <w:pPr>
-        <w:pStyle w:val="TableofFigures"/>
-        <w:tabs>
-          <w:tab w:val="right" w:leader="dot" w:pos="9016"/>
-        </w:tabs>
-        <w:rPr>
-          <w:rFonts w:asciiTheme="minorHAnsi" w:eastAsiaTheme="minorEastAsia" w:hAnsiTheme="minorHAnsi"/>
-          <w:noProof/>
-          <w:lang w:eastAsia="en-GB"/>
-        </w:rPr>
-      </w:pPr>
-      <w:hyperlink w:anchor="_Toc227743285" w:history="1">
-        <w:r>
-          <w:rPr>
-            <w:rStyle w:val="Hyperlink"/>
-            <w:noProof/>
-          </w:rPr>
-          <w:t>Figure 6</w:t>
-        </w:r>
-        <w:r>
-          <w:rPr>
-            <w:noProof/>
-            <w:webHidden/>
-          </w:rPr>
-          <w:tab/>
-        </w:r>
-        <w:r>
-          <w:rPr>
-            <w:noProof/>
-            <w:webHidden/>
-          </w:rPr>
-          <w:fldChar w:fldCharType="begin"/>
-        </w:r>
-        <w:r>
-          <w:rPr>
-            <w:noProof/>
-            <w:webHidden/>
-          </w:rPr>
-          <w:instrText xml:space="preserve"> PAGEREF _Toc227743285 \h </w:instrText>
-        </w:r>
-        <w:r>
-          <w:rPr>
-            <w:noProof/>
-            <w:webHidden/>
-          </w:rPr>
-        </w:r>
-        <w:r>
-          <w:rPr>
-            <w:noProof/>
-            <w:webHidden/>
-          </w:rPr>
-          <w:fldChar w:fldCharType="separate"/>
-        </w:r>
-        <w:r>
-          <w:rPr>
-            <w:noProof/>
-            <w:webHidden/>
-          </w:rPr>
-          <w:t>10</w:t>
-        </w:r>
-        <w:r>
-          <w:rPr>
-            <w:noProof/>
-            <w:webHidden/>
-          </w:rPr>
-          <w:fldChar w:fldCharType="end"/>
-        </w:r>
-      </w:hyperlink>
-    </w:p>
-    <w:p>
-      <w:pPr>
-        <w:pStyle w:val="TableofFigures"/>
-        <w:tabs>
-          <w:tab w:val="right" w:leader="dot" w:pos="9016"/>
-        </w:tabs>
-        <w:rPr>
-          <w:rFonts w:asciiTheme="minorHAnsi" w:eastAsiaTheme="minorEastAsia" w:hAnsiTheme="minorHAnsi"/>
-          <w:noProof/>
-          <w:lang w:eastAsia="en-GB"/>
-        </w:rPr>
-      </w:pPr>
-      <w:hyperlink w:anchor="_Toc227743286" w:history="1">
-        <w:r>
-          <w:rPr>
-            <w:rStyle w:val="Hyperlink"/>
-            <w:noProof/>
-          </w:rPr>
-          <w:t>Figure 7 (Scher, 2017)</w:t>
-        </w:r>
-        <w:r>
-          <w:rPr>
-            <w:noProof/>
-            <w:webHidden/>
-          </w:rPr>
-          <w:tab/>
-        </w:r>
-        <w:r>
-          <w:rPr>
-            <w:noProof/>
-            <w:webHidden/>
-          </w:rPr>
-          <w:fldChar w:fldCharType="begin"/>
-        </w:r>
-        <w:r>
-          <w:rPr>
-            <w:noProof/>
-            <w:webHidden/>
-          </w:rPr>
-          <w:instrText xml:space="preserve"> PAGEREF _Toc227743286 \h </w:instrText>
+          <w:instrText xml:space="preserve"> PAGEREF _Toc228977559 \h </w:instrText>
         </w:r>
         <w:r>
           <w:rPr>
@@ -4216,6 +4080,286 @@
     </w:p>
     <w:p>
       <w:pPr>
+        <w:pStyle w:val="TableofFigures"/>
+        <w:tabs>
+          <w:tab w:val="right" w:leader="dot" w:pos="9016"/>
+        </w:tabs>
+        <w:rPr>
+          <w:rFonts w:asciiTheme="minorHAnsi" w:eastAsiaTheme="minorEastAsia" w:hAnsiTheme="minorHAnsi"/>
+          <w:noProof/>
+          <w:lang w:eastAsia="en-GB"/>
+        </w:rPr>
+      </w:pPr>
+      <w:hyperlink w:anchor="_Toc228977560" w:history="1">
+        <w:r>
+          <w:rPr>
+            <w:rStyle w:val="Hyperlink"/>
+            <w:noProof/>
+          </w:rPr>
+          <w:t>Figure 5</w:t>
+        </w:r>
+        <w:r>
+          <w:rPr>
+            <w:noProof/>
+            <w:webHidden/>
+          </w:rPr>
+          <w:tab/>
+        </w:r>
+        <w:r>
+          <w:rPr>
+            <w:noProof/>
+            <w:webHidden/>
+          </w:rPr>
+          <w:fldChar w:fldCharType="begin"/>
+        </w:r>
+        <w:r>
+          <w:rPr>
+            <w:noProof/>
+            <w:webHidden/>
+          </w:rPr>
+          <w:instrText xml:space="preserve"> PAGEREF _Toc228977560 \h </w:instrText>
+        </w:r>
+        <w:r>
+          <w:rPr>
+            <w:noProof/>
+            <w:webHidden/>
+          </w:rPr>
+        </w:r>
+        <w:r>
+          <w:rPr>
+            <w:noProof/>
+            <w:webHidden/>
+          </w:rPr>
+          <w:fldChar w:fldCharType="separate"/>
+        </w:r>
+        <w:r>
+          <w:rPr>
+            <w:noProof/>
+            <w:webHidden/>
+          </w:rPr>
+          <w:t>11</w:t>
+        </w:r>
+        <w:r>
+          <w:rPr>
+            <w:noProof/>
+            <w:webHidden/>
+          </w:rPr>
+          <w:fldChar w:fldCharType="end"/>
+        </w:r>
+      </w:hyperlink>
+    </w:p>
+    <w:p>
+      <w:pPr>
+        <w:pStyle w:val="TableofFigures"/>
+        <w:tabs>
+          <w:tab w:val="right" w:leader="dot" w:pos="9016"/>
+        </w:tabs>
+        <w:rPr>
+          <w:rFonts w:asciiTheme="minorHAnsi" w:eastAsiaTheme="minorEastAsia" w:hAnsiTheme="minorHAnsi"/>
+          <w:noProof/>
+          <w:lang w:eastAsia="en-GB"/>
+        </w:rPr>
+      </w:pPr>
+      <w:hyperlink w:anchor="_Toc228977561" w:history="1">
+        <w:r>
+          <w:rPr>
+            <w:rStyle w:val="Hyperlink"/>
+            <w:noProof/>
+          </w:rPr>
+          <w:t>Figure 6</w:t>
+        </w:r>
+        <w:r>
+          <w:rPr>
+            <w:noProof/>
+            <w:webHidden/>
+          </w:rPr>
+          <w:tab/>
+        </w:r>
+        <w:r>
+          <w:rPr>
+            <w:noProof/>
+            <w:webHidden/>
+          </w:rPr>
+          <w:fldChar w:fldCharType="begin"/>
+        </w:r>
+        <w:r>
+          <w:rPr>
+            <w:noProof/>
+            <w:webHidden/>
+          </w:rPr>
+          <w:instrText xml:space="preserve"> PAGEREF _Toc228977561 \h </w:instrText>
+        </w:r>
+        <w:r>
+          <w:rPr>
+            <w:noProof/>
+            <w:webHidden/>
+          </w:rPr>
+        </w:r>
+        <w:r>
+          <w:rPr>
+            <w:noProof/>
+            <w:webHidden/>
+          </w:rPr>
+          <w:fldChar w:fldCharType="separate"/>
+        </w:r>
+        <w:r>
+          <w:rPr>
+            <w:noProof/>
+            <w:webHidden/>
+          </w:rPr>
+          <w:t>11</w:t>
+        </w:r>
+        <w:r>
+          <w:rPr>
+            <w:noProof/>
+            <w:webHidden/>
+          </w:rPr>
+          <w:fldChar w:fldCharType="end"/>
+        </w:r>
+      </w:hyperlink>
+    </w:p>
+    <w:p>
+      <w:pPr>
+        <w:pStyle w:val="TableofFigures"/>
+        <w:tabs>
+          <w:tab w:val="right" w:leader="dot" w:pos="9016"/>
+        </w:tabs>
+        <w:rPr>
+          <w:rFonts w:asciiTheme="minorHAnsi" w:eastAsiaTheme="minorEastAsia" w:hAnsiTheme="minorHAnsi"/>
+          <w:noProof/>
+          <w:lang w:eastAsia="en-GB"/>
+        </w:rPr>
+      </w:pPr>
+      <w:hyperlink w:anchor="_Toc228977562" w:history="1">
+        <w:r>
+          <w:rPr>
+            <w:rStyle w:val="Hyperlink"/>
+            <w:noProof/>
+          </w:rPr>
+          <w:t>Figure 7 (Scher, 2017)</w:t>
+        </w:r>
+        <w:r>
+          <w:rPr>
+            <w:noProof/>
+            <w:webHidden/>
+          </w:rPr>
+          <w:tab/>
+        </w:r>
+        <w:r>
+          <w:rPr>
+            <w:noProof/>
+            <w:webHidden/>
+          </w:rPr>
+          <w:fldChar w:fldCharType="begin"/>
+        </w:r>
+        <w:r>
+          <w:rPr>
+            <w:noProof/>
+            <w:webHidden/>
+          </w:rPr>
+          <w:instrText xml:space="preserve"> PAGEREF _Toc228977562 \h </w:instrText>
+        </w:r>
+        <w:r>
+          <w:rPr>
+            <w:noProof/>
+            <w:webHidden/>
+          </w:rPr>
+        </w:r>
+        <w:r>
+          <w:rPr>
+            <w:noProof/>
+            <w:webHidden/>
+          </w:rPr>
+          <w:fldChar w:fldCharType="separate"/>
+        </w:r>
+        <w:r>
+          <w:rPr>
+            <w:noProof/>
+            <w:webHidden/>
+          </w:rPr>
+          <w:t>12</w:t>
+        </w:r>
+        <w:r>
+          <w:rPr>
+            <w:noProof/>
+            <w:webHidden/>
+          </w:rPr>
+          <w:fldChar w:fldCharType="end"/>
+        </w:r>
+      </w:hyperlink>
+    </w:p>
+    <w:p>
+      <w:pPr>
+        <w:pStyle w:val="TableofFigures"/>
+        <w:tabs>
+          <w:tab w:val="right" w:leader="dot" w:pos="9016"/>
+        </w:tabs>
+        <w:rPr>
+          <w:rFonts w:asciiTheme="minorHAnsi" w:eastAsiaTheme="minorEastAsia" w:hAnsiTheme="minorHAnsi"/>
+          <w:noProof/>
+          <w:lang w:eastAsia="en-GB"/>
+        </w:rPr>
+      </w:pPr>
+      <w:hyperlink w:anchor="_Toc228977563" w:history="1">
+        <w:r>
+          <w:rPr>
+            <w:rStyle w:val="Hyperlink"/>
+            <w:noProof/>
+          </w:rPr>
+          <w:t>Figure 8 (IQ, 2018)</w:t>
+        </w:r>
+        <w:r>
+          <w:rPr>
+            <w:noProof/>
+            <w:webHidden/>
+          </w:rPr>
+          <w:tab/>
+        </w:r>
+        <w:r>
+          <w:rPr>
+            <w:noProof/>
+            <w:webHidden/>
+          </w:rPr>
+          <w:fldChar w:fldCharType="begin"/>
+        </w:r>
+        <w:r>
+          <w:rPr>
+            <w:noProof/>
+            <w:webHidden/>
+          </w:rPr>
+          <w:instrText xml:space="preserve"> PAGEREF _Toc228977563 \h </w:instrText>
+        </w:r>
+        <w:r>
+          <w:rPr>
+            <w:noProof/>
+            <w:webHidden/>
+          </w:rPr>
+        </w:r>
+        <w:r>
+          <w:rPr>
+            <w:noProof/>
+            <w:webHidden/>
+          </w:rPr>
+          <w:fldChar w:fldCharType="separate"/>
+        </w:r>
+        <w:r>
+          <w:rPr>
+            <w:noProof/>
+            <w:webHidden/>
+          </w:rPr>
+          <w:t>15</w:t>
+        </w:r>
+        <w:r>
+          <w:rPr>
+            <w:noProof/>
+            <w:webHidden/>
+          </w:rPr>
+          <w:fldChar w:fldCharType="end"/>
+        </w:r>
+      </w:hyperlink>
+    </w:p>
+    <w:p>
+      <w:pPr>
         <w:spacing w:line="259" w:lineRule="auto"/>
         <w:rPr>
           <w:sz w:val="36"/>
@@ -4252,7 +4396,7 @@
       <w:pPr>
         <w:pStyle w:val="Heading1"/>
       </w:pPr>
-      <w:bookmarkStart w:id="8" w:name="_Toc228976078"/>
+      <w:bookmarkStart w:id="8" w:name="_Toc228977519"/>
       <w:r>
         <w:t>Chapter 1</w:t>
       </w:r>
@@ -4280,7 +4424,7 @@
           <w:u w:val="single"/>
         </w:rPr>
       </w:pPr>
-      <w:bookmarkStart w:id="9" w:name="_Toc228976079"/>
+      <w:bookmarkStart w:id="9" w:name="_Toc228977520"/>
       <w:r>
         <w:t>1.1</w:t>
       </w:r>
@@ -4331,7 +4475,7 @@
       <w:pPr>
         <w:pStyle w:val="Heading2"/>
       </w:pPr>
-      <w:bookmarkStart w:id="10" w:name="_Toc228976080"/>
+      <w:bookmarkStart w:id="10" w:name="_Toc228977521"/>
       <w:r>
         <w:t>1.2 Aims</w:t>
       </w:r>
@@ -4347,7 +4491,7 @@
           <w:szCs w:val="28"/>
         </w:rPr>
       </w:pPr>
-      <w:bookmarkStart w:id="11" w:name="_Toc228976081"/>
+      <w:bookmarkStart w:id="11" w:name="_Toc228977522"/>
       <w:r>
         <w:rPr>
           <w:rStyle w:val="Heading2Char"/>
@@ -4392,7 +4536,7 @@
       <w:pPr>
         <w:pStyle w:val="Heading3"/>
       </w:pPr>
-      <w:bookmarkStart w:id="12" w:name="_Toc228976082"/>
+      <w:bookmarkStart w:id="12" w:name="_Toc228977523"/>
       <w:r>
         <w:lastRenderedPageBreak/>
         <w:t>1.2.2 Additional Aims</w:t>
@@ -4462,7 +4606,7 @@
       <w:pPr>
         <w:pStyle w:val="Heading2"/>
       </w:pPr>
-      <w:bookmarkStart w:id="13" w:name="_Toc228976083"/>
+      <w:bookmarkStart w:id="13" w:name="_Toc228977524"/>
       <w:r>
         <w:t>1.3 Objectives</w:t>
       </w:r>
@@ -4472,7 +4616,7 @@
       <w:pPr>
         <w:pStyle w:val="Heading3"/>
       </w:pPr>
-      <w:bookmarkStart w:id="14" w:name="_Toc228976084"/>
+      <w:bookmarkStart w:id="14" w:name="_Toc228977525"/>
       <w:r>
         <w:t>1.3.1 Scope</w:t>
       </w:r>
@@ -4543,7 +4687,7 @@
       <w:pPr>
         <w:pStyle w:val="Heading3"/>
       </w:pPr>
-      <w:bookmarkStart w:id="15" w:name="_Toc228976085"/>
+      <w:bookmarkStart w:id="15" w:name="_Toc228977526"/>
       <w:r>
         <w:t>1.3.2 Research Objectives</w:t>
       </w:r>
@@ -4588,7 +4732,7 @@
       <w:pPr>
         <w:pStyle w:val="Heading3"/>
       </w:pPr>
-      <w:bookmarkStart w:id="16" w:name="_Toc228976086"/>
+      <w:bookmarkStart w:id="16" w:name="_Toc228977527"/>
       <w:r>
         <w:t>1.3.3 Design Objectives</w:t>
       </w:r>
@@ -4710,7 +4854,7 @@
       <w:pPr>
         <w:pStyle w:val="Heading3"/>
       </w:pPr>
-      <w:bookmarkStart w:id="17" w:name="_Toc228976087"/>
+      <w:bookmarkStart w:id="17" w:name="_Toc228977528"/>
       <w:r>
         <w:t>1.3.4 Implementation Objectives</w:t>
       </w:r>
@@ -4829,7 +4973,7 @@
       <w:pPr>
         <w:pStyle w:val="Heading3"/>
       </w:pPr>
-      <w:bookmarkStart w:id="18" w:name="_Toc228976088"/>
+      <w:bookmarkStart w:id="18" w:name="_Toc228977529"/>
       <w:r>
         <w:t>1.3.5 Results, Evaluation and Playtesting Objectives</w:t>
       </w:r>
@@ -4982,7 +5126,7 @@
       <w:pPr>
         <w:pStyle w:val="Heading1"/>
       </w:pPr>
-      <w:bookmarkStart w:id="19" w:name="_Toc228976089"/>
+      <w:bookmarkStart w:id="19" w:name="_Toc228977530"/>
       <w:r>
         <w:lastRenderedPageBreak/>
         <w:t>Chapter 2 – Literature Survey</w:t>
@@ -4993,7 +5137,7 @@
       <w:pPr>
         <w:pStyle w:val="Heading2"/>
       </w:pPr>
-      <w:bookmarkStart w:id="20" w:name="_Toc228976090"/>
+      <w:bookmarkStart w:id="20" w:name="_Toc228977531"/>
       <w:r>
         <w:t>2.1 Literature Survey Introduction</w:t>
       </w:r>
@@ -5032,7 +5176,7 @@
       <w:pPr>
         <w:pStyle w:val="Heading2"/>
       </w:pPr>
-      <w:bookmarkStart w:id="21" w:name="_Toc228976091"/>
+      <w:bookmarkStart w:id="21" w:name="_Toc228977532"/>
       <w:r>
         <w:t>2.2 Comparative Research</w:t>
       </w:r>
@@ -5050,7 +5194,7 @@
       <w:pPr>
         <w:pStyle w:val="Heading3"/>
       </w:pPr>
-      <w:bookmarkStart w:id="22" w:name="_Toc228976092"/>
+      <w:bookmarkStart w:id="22" w:name="_Toc228977533"/>
       <w:r>
         <w:t xml:space="preserve">2.2.1 </w:t>
       </w:r>
@@ -5126,7 +5270,7 @@
       <w:pPr>
         <w:pStyle w:val="Heading4"/>
       </w:pPr>
-      <w:bookmarkStart w:id="23" w:name="_Toc228976093"/>
+      <w:bookmarkStart w:id="23" w:name="_Toc228977534"/>
       <w:r>
         <w:t>2.2.1.1 Perlin Noise</w:t>
       </w:r>
@@ -5425,7 +5569,7 @@
         <w:pStyle w:val="Caption"/>
         <w:jc w:val="center"/>
       </w:pPr>
-      <w:bookmarkStart w:id="24" w:name="_Toc227743280"/>
+      <w:bookmarkStart w:id="24" w:name="_Toc228977556"/>
       <w:r>
         <w:t xml:space="preserve">Figure </w:t>
       </w:r>
@@ -5509,7 +5653,7 @@
       <w:pPr>
         <w:pStyle w:val="Heading4"/>
       </w:pPr>
-      <w:bookmarkStart w:id="25" w:name="_Toc228976094"/>
+      <w:bookmarkStart w:id="25" w:name="_Toc228977535"/>
       <w:r>
         <w:t>2.2.1.2 Binary Space Partitioning</w:t>
       </w:r>
@@ -5561,7 +5705,7 @@
       <w:pPr>
         <w:pStyle w:val="Heading4"/>
       </w:pPr>
-      <w:bookmarkStart w:id="26" w:name="_Toc228976095"/>
+      <w:bookmarkStart w:id="26" w:name="_Toc228977536"/>
       <w:r>
         <w:t>2.2.1.3 Cellular Automata</w:t>
       </w:r>
@@ -5681,7 +5825,7 @@
       <w:pPr>
         <w:pStyle w:val="Heading3"/>
       </w:pPr>
-      <w:bookmarkStart w:id="27" w:name="_Toc228976096"/>
+      <w:bookmarkStart w:id="27" w:name="_Toc228977537"/>
       <w:r>
         <w:t>2.2.2 Pathfinding</w:t>
       </w:r>
@@ -5744,7 +5888,7 @@
       <w:pPr>
         <w:pStyle w:val="Heading4"/>
       </w:pPr>
-      <w:bookmarkStart w:id="28" w:name="_Toc228976097"/>
+      <w:bookmarkStart w:id="28" w:name="_Toc228977538"/>
       <w:r>
         <w:t>2.2.2.1 Dijkstra</w:t>
       </w:r>
@@ -5831,7 +5975,7 @@
         <w:pStyle w:val="Caption"/>
         <w:jc w:val="center"/>
       </w:pPr>
-      <w:bookmarkStart w:id="29" w:name="_Toc227743281"/>
+      <w:bookmarkStart w:id="29" w:name="_Toc228977557"/>
       <w:r>
         <w:t xml:space="preserve">Figure </w:t>
       </w:r>
@@ -5917,7 +6061,7 @@
       <w:pPr>
         <w:pStyle w:val="Heading4"/>
       </w:pPr>
-      <w:bookmarkStart w:id="30" w:name="_Toc228976098"/>
+      <w:bookmarkStart w:id="30" w:name="_Toc228977539"/>
       <w:r>
         <w:t>2.2.2.2 A*</w:t>
       </w:r>
@@ -5982,7 +6126,7 @@
       <w:pPr>
         <w:pStyle w:val="Heading4"/>
       </w:pPr>
-      <w:bookmarkStart w:id="31" w:name="_Toc228976099"/>
+      <w:bookmarkStart w:id="31" w:name="_Toc228977540"/>
       <w:r>
         <w:t>2.2.2.3 Jump Point Search</w:t>
       </w:r>
@@ -6032,7 +6176,7 @@
       <w:pPr>
         <w:pStyle w:val="Heading3"/>
       </w:pPr>
-      <w:bookmarkStart w:id="32" w:name="_Toc228976100"/>
+      <w:bookmarkStart w:id="32" w:name="_Toc228977541"/>
       <w:r>
         <w:t>2.2.3 AI Integrations</w:t>
       </w:r>
@@ -6057,7 +6201,7 @@
       <w:pPr>
         <w:pStyle w:val="Heading4"/>
       </w:pPr>
-      <w:bookmarkStart w:id="33" w:name="_Toc228976101"/>
+      <w:bookmarkStart w:id="33" w:name="_Toc228977542"/>
       <w:r>
         <w:t>2.2.3.1 Neural Network</w:t>
       </w:r>
@@ -6124,7 +6268,7 @@
       <w:pPr>
         <w:pStyle w:val="Heading4"/>
       </w:pPr>
-      <w:bookmarkStart w:id="34" w:name="_Toc228976102"/>
+      <w:bookmarkStart w:id="34" w:name="_Toc228977543"/>
       <w:r>
         <w:t>2.2.3.2 Reinforcement Learning</w:t>
       </w:r>
@@ -6199,7 +6343,7 @@
         <w:pStyle w:val="Caption"/>
         <w:jc w:val="center"/>
       </w:pPr>
-      <w:bookmarkStart w:id="35" w:name="_Toc227743282"/>
+      <w:bookmarkStart w:id="35" w:name="_Toc228977558"/>
       <w:r>
         <w:t xml:space="preserve">Figure </w:t>
       </w:r>
@@ -6324,7 +6468,7 @@
       <w:pPr>
         <w:pStyle w:val="Heading4"/>
       </w:pPr>
-      <w:bookmarkStart w:id="36" w:name="_Toc228976103"/>
+      <w:bookmarkStart w:id="36" w:name="_Toc228977544"/>
       <w:r>
         <w:t>2.2.3.3 Imitation Learning</w:t>
       </w:r>
@@ -6457,7 +6601,7 @@
       <w:pPr>
         <w:pStyle w:val="Heading1"/>
       </w:pPr>
-      <w:bookmarkStart w:id="37" w:name="_Toc228976104"/>
+      <w:bookmarkStart w:id="37" w:name="_Toc228977545"/>
       <w:r>
         <w:t>Chapter 3 – Design</w:t>
       </w:r>
@@ -6484,7 +6628,7 @@
       <w:pPr>
         <w:pStyle w:val="Heading2"/>
       </w:pPr>
-      <w:bookmarkStart w:id="38" w:name="_Toc228976105"/>
+      <w:bookmarkStart w:id="38" w:name="_Toc228977546"/>
       <w:r>
         <w:t xml:space="preserve">3.1 </w:t>
       </w:r>
@@ -6535,7 +6679,7 @@
       <w:pPr>
         <w:pStyle w:val="Heading3"/>
       </w:pPr>
-      <w:bookmarkStart w:id="39" w:name="_Toc228976106"/>
+      <w:bookmarkStart w:id="39" w:name="_Toc228977547"/>
       <w:r>
         <w:lastRenderedPageBreak/>
         <w:t xml:space="preserve">3.1.1 </w:t>
@@ -6634,7 +6778,7 @@
         <w:pStyle w:val="Caption"/>
         <w:jc w:val="center"/>
       </w:pPr>
-      <w:bookmarkStart w:id="40" w:name="_Toc227743283"/>
+      <w:bookmarkStart w:id="40" w:name="_Toc228977559"/>
       <w:r>
         <w:t xml:space="preserve">Figure </w:t>
       </w:r>
@@ -6748,7 +6892,7 @@
               <w:pStyle w:val="Caption"/>
               <w:jc w:val="center"/>
             </w:pPr>
-            <w:bookmarkStart w:id="41" w:name="_Toc227743284"/>
+            <w:bookmarkStart w:id="41" w:name="_Toc228977560"/>
             <w:r>
               <w:t xml:space="preserve">Figure </w:t>
             </w:r>
@@ -6836,7 +6980,7 @@
               <w:pStyle w:val="Caption"/>
               <w:jc w:val="center"/>
             </w:pPr>
-            <w:bookmarkStart w:id="42" w:name="_Toc227743285"/>
+            <w:bookmarkStart w:id="42" w:name="_Toc228977561"/>
             <w:r>
               <w:t xml:space="preserve">Figure </w:t>
             </w:r>
@@ -6899,7 +7043,7 @@
       <w:pPr>
         <w:pStyle w:val="Heading3"/>
       </w:pPr>
-      <w:bookmarkStart w:id="43" w:name="_Toc228976107"/>
+      <w:bookmarkStart w:id="43" w:name="_Toc228977548"/>
       <w:r>
         <w:t>3.1.2 Biomes</w:t>
       </w:r>
@@ -7070,7 +7214,7 @@
         <w:pStyle w:val="Caption"/>
         <w:jc w:val="center"/>
       </w:pPr>
-      <w:bookmarkStart w:id="44" w:name="_Toc227743286"/>
+      <w:bookmarkStart w:id="44" w:name="_Toc228977562"/>
       <w:r>
         <w:t xml:space="preserve">Figure </w:t>
       </w:r>
@@ -7163,7 +7307,7 @@
       <w:pPr>
         <w:pStyle w:val="Heading3"/>
       </w:pPr>
-      <w:bookmarkStart w:id="45" w:name="_Toc228976108"/>
+      <w:bookmarkStart w:id="45" w:name="_Toc228977549"/>
       <w:r>
         <w:t>3.1.3 Resource Distribution</w:t>
       </w:r>
@@ -7193,7 +7337,7 @@
       <w:pPr>
         <w:pStyle w:val="Heading3"/>
       </w:pPr>
-      <w:bookmarkStart w:id="46" w:name="_Toc228976109"/>
+      <w:bookmarkStart w:id="46" w:name="_Toc228977550"/>
       <w:r>
         <w:t>3.1.4 River generation</w:t>
       </w:r>
@@ -7235,7 +7379,7 @@
       <w:pPr>
         <w:pStyle w:val="Heading3"/>
       </w:pPr>
-      <w:bookmarkStart w:id="47" w:name="_Toc228976110"/>
+      <w:bookmarkStart w:id="47" w:name="_Toc228977551"/>
       <w:r>
         <w:t>3.1.</w:t>
       </w:r>
@@ -7344,7 +7488,7 @@
       <w:pPr>
         <w:pStyle w:val="Heading2"/>
       </w:pPr>
-      <w:bookmarkStart w:id="48" w:name="_Toc228976111"/>
+      <w:bookmarkStart w:id="48" w:name="_Toc228977552"/>
       <w:r>
         <w:t>3.2 Pathfinding</w:t>
       </w:r>
@@ -7362,7 +7506,7 @@
       <w:pPr>
         <w:pStyle w:val="Heading3"/>
       </w:pPr>
-      <w:bookmarkStart w:id="49" w:name="_Toc228976112"/>
+      <w:bookmarkStart w:id="49" w:name="_Toc228977553"/>
       <w:r>
         <w:t xml:space="preserve">3.2.1 </w:t>
       </w:r>
@@ -7418,8 +7562,213 @@
         <w:t xml:space="preserve"> exceptions crashing the pathfinding functions, and making redundant calls.</w:t>
       </w:r>
     </w:p>
+    <w:p>
+      <w:pPr>
+        <w:pStyle w:val="Heading3"/>
+      </w:pPr>
+      <w:bookmarkStart w:id="50" w:name="_Toc228977554"/>
+      <w:r>
+        <w:t>3.2.2 Heuristics</w:t>
+      </w:r>
+      <w:bookmarkEnd w:id="50"/>
+    </w:p>
+    <w:p>
+      <w:r>
+        <w:t xml:space="preserve">There are 3 methods to calculate a heuristic value for A*: Manhattan, Euclidean and </w:t>
+      </w:r>
+      <w:r>
+        <w:t>Chebyshev</w:t>
+      </w:r>
+      <w:r>
+        <w:t xml:space="preserve">. The Manhattan method is often the fastest method but is </w:t>
+      </w:r>
+      <w:r>
+        <w:t>“</w:t>
+      </w:r>
+      <w:r>
+        <w:t>often less accurate in open or cost-sensitive maps</w:t>
+      </w:r>
+      <w:r>
+        <w:t xml:space="preserve">” </w:t>
+      </w:r>
+      <w:sdt>
+        <w:sdtPr>
+          <w:id w:val="-1079905806"/>
+          <w:citation/>
+        </w:sdtPr>
+        <w:sdtContent>
+          <w:r>
+            <w:fldChar w:fldCharType="begin"/>
+          </w:r>
+          <w:r>
+            <w:instrText xml:space="preserve"> CITATION Yad25 \l 2057 </w:instrText>
+          </w:r>
+          <w:r>
+            <w:fldChar w:fldCharType="separate"/>
+          </w:r>
+          <w:r>
+            <w:rPr>
+              <w:noProof/>
+            </w:rPr>
+            <w:t>(Yadav, 2025)</w:t>
+          </w:r>
+          <w:r>
+            <w:fldChar w:fldCharType="end"/>
+          </w:r>
+        </w:sdtContent>
+      </w:sdt>
+      <w:r>
+        <w:t>. This means that on a completely open world that has a different cost per tile</w:t>
+      </w:r>
+      <w:r>
+        <w:t>.</w:t>
+      </w:r>
+      <w:r>
+        <w:t xml:space="preserve"> </w:t>
+      </w:r>
+      <w:r>
+        <w:t>T</w:t>
+      </w:r>
+      <w:r>
+        <w:t>he Manhattan method is likely not going to be good for this project’s requirements</w:t>
+      </w:r>
+      <w:r>
+        <w:t xml:space="preserve"> due to the accessibility to every tile and open nature of the game.</w:t>
+      </w:r>
+    </w:p>
+    <w:p>
+      <w:pPr>
+        <w:keepNext/>
+      </w:pPr>
+      <w:r>
+        <w:rPr>
+          <w:noProof/>
+        </w:rPr>
+        <w:lastRenderedPageBreak/>
+        <w:drawing>
+          <wp:inline distT="0" distB="0" distL="0" distR="0" wp14:anchorId="37293E47" wp14:editId="59A72955">
+            <wp:extent cx="5731510" cy="1860550"/>
+            <wp:effectExtent l="0" t="0" r="2540" b="6350"/>
+            <wp:docPr id="691597124" name="Picture 1" descr="Euclidean vs Manhattan vs Chebyshev Distance"/>
+            <wp:cNvGraphicFramePr>
+              <a:graphicFrameLocks xmlns:a="http://schemas.openxmlformats.org/drawingml/2006/main" noChangeAspect="1"/>
+            </wp:cNvGraphicFramePr>
+            <a:graphic xmlns:a="http://schemas.openxmlformats.org/drawingml/2006/main">
+              <a:graphicData uri="http://schemas.openxmlformats.org/drawingml/2006/picture">
+                <pic:pic xmlns:pic="http://schemas.openxmlformats.org/drawingml/2006/picture">
+                  <pic:nvPicPr>
+                    <pic:cNvPr id="0" name="Picture 1" descr="Euclidean vs Manhattan vs Chebyshev Distance"/>
+                    <pic:cNvPicPr>
+                      <a:picLocks noChangeAspect="1" noChangeArrowheads="1"/>
+                    </pic:cNvPicPr>
+                  </pic:nvPicPr>
+                  <pic:blipFill>
+                    <a:blip r:embed="rId18">
+                      <a:extLst>
+                        <a:ext uri="{28A0092B-C50C-407E-A947-70E740481C1C}">
+                          <a14:useLocalDpi xmlns:a14="http://schemas.microsoft.com/office/drawing/2010/main" val="0"/>
+                        </a:ext>
+                      </a:extLst>
+                    </a:blip>
+                    <a:srcRect/>
+                    <a:stretch>
+                      <a:fillRect/>
+                    </a:stretch>
+                  </pic:blipFill>
+                  <pic:spPr bwMode="auto">
+                    <a:xfrm>
+                      <a:off x="0" y="0"/>
+                      <a:ext cx="5731510" cy="1860550"/>
+                    </a:xfrm>
+                    <a:prstGeom prst="rect">
+                      <a:avLst/>
+                    </a:prstGeom>
+                    <a:noFill/>
+                    <a:ln>
+                      <a:noFill/>
+                    </a:ln>
+                  </pic:spPr>
+                </pic:pic>
+              </a:graphicData>
+            </a:graphic>
+          </wp:inline>
+        </w:drawing>
+      </w:r>
+    </w:p>
+    <w:p>
+      <w:pPr>
+        <w:pStyle w:val="Caption"/>
+        <w:jc w:val="center"/>
+      </w:pPr>
+      <w:bookmarkStart w:id="51" w:name="_Toc228977563"/>
+      <w:r>
+        <w:t xml:space="preserve">Figure </w:t>
+      </w:r>
+      <w:fldSimple w:instr=" SEQ Figure \* ARABIC ">
+        <w:r>
+          <w:rPr>
+            <w:noProof/>
+          </w:rPr>
+          <w:t>8</w:t>
+        </w:r>
+      </w:fldSimple>
+      <w:r>
+        <w:t xml:space="preserve"> </w:t>
+      </w:r>
+      <w:sdt>
+        <w:sdtPr>
+          <w:id w:val="-1201001291"/>
+          <w:citation/>
+        </w:sdtPr>
+        <w:sdtContent>
+          <w:r>
+            <w:fldChar w:fldCharType="begin"/>
+          </w:r>
+          <w:r>
+            <w:instrText xml:space="preserve"> CITATION Ope18 \l 2057 </w:instrText>
+          </w:r>
+          <w:r>
+            <w:fldChar w:fldCharType="separate"/>
+          </w:r>
+          <w:r>
+            <w:rPr>
+              <w:noProof/>
+            </w:rPr>
+            <w:t>(IQ, 2018)</w:t>
+          </w:r>
+          <w:r>
+            <w:fldChar w:fldCharType="end"/>
+          </w:r>
+        </w:sdtContent>
+      </w:sdt>
+      <w:bookmarkEnd w:id="51"/>
+    </w:p>
+    <w:p>
+      <w:r>
+        <w:t>Figure 8 shows the difference between the 3 methods I am evaluating. As shown above, the Manhattan method does not properly handle corners in a way that would be applicable to this game. The Chebyshev method fixes this problem defining the distance as the maximum coordinate difference. It is often used when movement is possible in all directions, namely for pieces like a king or queen on a chess board, with an equal cost.</w:t>
+      </w:r>
+      <w:r>
+        <w:t xml:space="preserve"> The Chebyshev method has drawbacks, namely the uniform cost of each path, which makes it unviable for this project.</w:t>
+      </w:r>
+    </w:p>
     <w:p/>
-    <w:bookmarkStart w:id="50" w:name="_Toc228976113" w:displacedByCustomXml="next"/>
+    <w:p>
+      <w:r>
+        <w:t xml:space="preserve">Euclidean Distance </w:t>
+      </w:r>
+      <w:r>
+        <w:t xml:space="preserve">is a direct measurement from point A to point B. As shown in figure 8, from the origin, the provided line can be traced to its destination. Inserting all grid tiles that are highlighted into a list, a path can be formed from the origin to the destination. This is almost a perfect solution to this project’s requirements due to the ease of implementation and it </w:t>
+      </w:r>
+      <w:proofErr w:type="gramStart"/>
+      <w:r>
+        <w:t>taking</w:t>
+      </w:r>
+      <w:proofErr w:type="gramEnd"/>
+      <w:r>
+        <w:t xml:space="preserve"> pathing cost into account. The drawbacks of Euclidean distance are that its relatively computationally expensive due to its handling of square roots.</w:t>
+      </w:r>
+    </w:p>
+    <w:bookmarkStart w:id="52" w:name="_Toc228977555" w:displacedByCustomXml="next"/>
     <w:sdt>
       <w:sdtPr>
         <w:rPr>
@@ -7447,7 +7796,7 @@
           <w:r>
             <w:t>References</w:t>
           </w:r>
-          <w:bookmarkEnd w:id="50"/>
+          <w:bookmarkEnd w:id="52"/>
         </w:p>
         <w:sdt>
           <w:sdtPr>
@@ -7554,7 +7903,6 @@
                 <w:rPr>
                   <w:noProof/>
                 </w:rPr>
-                <w:lastRenderedPageBreak/>
                 <w:t xml:space="preserve">Gurney, K., 2018. </w:t>
               </w:r>
               <w:r>
@@ -7583,6 +7931,56 @@
                 <w:rPr>
                   <w:noProof/>
                 </w:rPr>
+                <w:t xml:space="preserve">IQ, O., 2018. </w:t>
+              </w:r>
+              <w:r>
+                <w:rPr>
+                  <w:i/>
+                  <w:iCs/>
+                  <w:noProof/>
+                </w:rPr>
+                <w:t xml:space="preserve">Euclidean vs Manhattan vs Chebyshev Distance. </w:t>
+              </w:r>
+              <w:r>
+                <w:rPr>
+                  <w:noProof/>
+                </w:rPr>
+                <w:t xml:space="preserve">[Online] </w:t>
+              </w:r>
+              <w:r>
+                <w:rPr>
+                  <w:noProof/>
+                </w:rPr>
+                <w:br/>
+                <w:t xml:space="preserve">Available at: </w:t>
+              </w:r>
+              <w:r>
+                <w:rPr>
+                  <w:noProof/>
+                  <w:u w:val="single"/>
+                </w:rPr>
+                <w:t>https://iq.opengenus.org/euclidean-vs-manhattan-vs-chebyshev-distance/</w:t>
+              </w:r>
+              <w:r>
+                <w:rPr>
+                  <w:noProof/>
+                </w:rPr>
+                <w:br/>
+                <w:t>[Accessed 06 05 2025].</w:t>
+              </w:r>
+            </w:p>
+            <w:p>
+              <w:pPr>
+                <w:pStyle w:val="Bibliography"/>
+                <w:rPr>
+                  <w:noProof/>
+                </w:rPr>
+              </w:pPr>
+              <w:r>
+                <w:rPr>
+                  <w:noProof/>
+                </w:rPr>
+                <w:lastRenderedPageBreak/>
                 <w:t xml:space="preserve">Johnston, N. &amp; Greene, D., 2021. </w:t>
               </w:r>
               <w:r>
@@ -7850,6 +8248,34 @@
                 </w:rPr>
                 <w:br/>
                 <w:t>[Accessed 18 04 2026].</w:t>
+              </w:r>
+            </w:p>
+            <w:p>
+              <w:pPr>
+                <w:pStyle w:val="Bibliography"/>
+                <w:rPr>
+                  <w:noProof/>
+                </w:rPr>
+              </w:pPr>
+              <w:r>
+                <w:rPr>
+                  <w:noProof/>
+                </w:rPr>
+                <w:t xml:space="preserve">Yadav, H., 2025. </w:t>
+              </w:r>
+              <w:r>
+                <w:rPr>
+                  <w:i/>
+                  <w:iCs/>
+                  <w:noProof/>
+                </w:rPr>
+                <w:t xml:space="preserve">Evaluating A* Heuristics Across Diverse Map, </w:t>
+              </w:r>
+              <w:r>
+                <w:rPr>
+                  <w:noProof/>
+                </w:rPr>
+                <w:t>s.l.: Authorea Preprints.</w:t>
               </w:r>
             </w:p>
             <w:p>
@@ -10639,7 +11065,7 @@
       </b:Author>
     </b:Author>
     <b:Month>05</b:Month>
-    <b:RefOrder>11</b:RefOrder>
+    <b:RefOrder>13</b:RefOrder>
   </b:Source>
   <b:Source>
     <b:Tag>Gos25</b:Tag>
@@ -10660,11 +11086,52 @@
     <b:Publisher>arXiv</b:Publisher>
     <b:RefOrder>10</b:RefOrder>
   </b:Source>
+  <b:Source>
+    <b:Tag>Yad25</b:Tag>
+    <b:SourceType>Report</b:SourceType>
+    <b:Guid>{CDC86850-1920-4021-AFDC-6CB358117C5D}</b:Guid>
+    <b:Author>
+      <b:Author>
+        <b:NameList>
+          <b:Person>
+            <b:Last>Yadav</b:Last>
+            <b:First>Harsh</b:First>
+          </b:Person>
+        </b:NameList>
+      </b:Author>
+    </b:Author>
+    <b:Title>Evaluating A* Heuristics Across Diverse Map</b:Title>
+    <b:Year>2025</b:Year>
+    <b:Publisher>Authorea Preprints</b:Publisher>
+    <b:RefOrder>11</b:RefOrder>
+  </b:Source>
+  <b:Source>
+    <b:Tag>Ope18</b:Tag>
+    <b:SourceType>InternetSite</b:SourceType>
+    <b:Guid>{B2432E8B-6466-4650-BC1A-E44EEEE83B86}</b:Guid>
+    <b:Title>Euclidean vs Manhattan vs Chebyshev Distance</b:Title>
+    <b:Year>2018</b:Year>
+    <b:Author>
+      <b:Author>
+        <b:NameList>
+          <b:Person>
+            <b:Last>IQ</b:Last>
+            <b:First>OpenGenus</b:First>
+          </b:Person>
+        </b:NameList>
+      </b:Author>
+    </b:Author>
+    <b:YearAccessed>2025</b:YearAccessed>
+    <b:MonthAccessed>05</b:MonthAccessed>
+    <b:DayAccessed>06</b:DayAccessed>
+    <b:URL>https://iq.opengenus.org/euclidean-vs-manhattan-vs-chebyshev-distance/</b:URL>
+    <b:RefOrder>12</b:RefOrder>
+  </b:Source>
 </b:Sources>
 </file>
 
 <file path=customXml/itemProps1.xml><?xml version="1.0" encoding="utf-8"?>
-<ds:datastoreItem xmlns:ds="http://schemas.openxmlformats.org/officeDocument/2006/customXml" ds:itemID="{24993291-BF94-4ACC-BC4F-77885C623932}">
+<ds:datastoreItem xmlns:ds="http://schemas.openxmlformats.org/officeDocument/2006/customXml" ds:itemID="{6522D53D-76AF-4A24-850F-A29FEEBD0DAD}">
   <ds:schemaRefs>
     <ds:schemaRef ds:uri="http://schemas.openxmlformats.org/officeDocument/2006/bibliography"/>
   </ds:schemaRefs>

</xml_diff>

<commit_message>
feat: pathfinding limitations written
</commit_message>
<xml_diff>
--- a/Report.docx
+++ b/Report.docx
@@ -321,7 +321,7 @@
         <w:pStyle w:val="Heading1"/>
       </w:pPr>
       <w:bookmarkStart w:id="1" w:name="_Toc40898999"/>
-      <w:bookmarkStart w:id="2" w:name="_Toc228977514"/>
+      <w:bookmarkStart w:id="2" w:name="_Toc228978185"/>
       <w:r>
         <w:lastRenderedPageBreak/>
         <w:t>Abstract</w:t>
@@ -369,7 +369,7 @@
         <w:spacing w:after="321"/>
         <w:ind w:left="-5"/>
       </w:pPr>
-      <w:bookmarkStart w:id="3" w:name="_Toc228977515"/>
+      <w:bookmarkStart w:id="3" w:name="_Toc228978186"/>
       <w:r>
         <w:lastRenderedPageBreak/>
         <w:t>Declaration</w:t>
@@ -491,7 +491,7 @@
         <w:ind w:left="-5"/>
       </w:pPr>
       <w:bookmarkStart w:id="4" w:name="_Toc40899001"/>
-      <w:bookmarkStart w:id="5" w:name="_Toc228977516"/>
+      <w:bookmarkStart w:id="5" w:name="_Toc228978187"/>
       <w:r>
         <w:lastRenderedPageBreak/>
         <w:t>Acknowledgements</w:t>
@@ -628,7 +628,7 @@
         <w:spacing w:line="259" w:lineRule="auto"/>
       </w:pPr>
     </w:p>
-    <w:bookmarkStart w:id="6" w:name="_Toc228977517" w:displacedByCustomXml="next"/>
+    <w:bookmarkStart w:id="6" w:name="_Toc228978188" w:displacedByCustomXml="next"/>
     <w:sdt>
       <w:sdtPr>
         <w:rPr>
@@ -686,7 +686,7 @@
           <w:r>
             <w:fldChar w:fldCharType="separate"/>
           </w:r>
-          <w:hyperlink w:anchor="_Toc228977514" w:history="1">
+          <w:hyperlink w:anchor="_Toc228978185" w:history="1">
             <w:r>
               <w:rPr>
                 <w:rStyle w:val="Hyperlink"/>
@@ -713,7 +713,7 @@
                 <w:noProof/>
                 <w:webHidden/>
               </w:rPr>
-              <w:instrText xml:space="preserve"> PAGEREF _Toc228977514 \h </w:instrText>
+              <w:instrText xml:space="preserve"> PAGEREF _Toc228978185 \h </w:instrText>
             </w:r>
             <w:r>
               <w:rPr>
@@ -760,7 +760,7 @@
               <w14:ligatures w14:val="standardContextual"/>
             </w:rPr>
           </w:pPr>
-          <w:hyperlink w:anchor="_Toc228977515" w:history="1">
+          <w:hyperlink w:anchor="_Toc228978186" w:history="1">
             <w:r>
               <w:rPr>
                 <w:rStyle w:val="Hyperlink"/>
@@ -787,7 +787,7 @@
                 <w:noProof/>
                 <w:webHidden/>
               </w:rPr>
-              <w:instrText xml:space="preserve"> PAGEREF _Toc228977515 \h </w:instrText>
+              <w:instrText xml:space="preserve"> PAGEREF _Toc228978186 \h </w:instrText>
             </w:r>
             <w:r>
               <w:rPr>
@@ -834,7 +834,7 @@
               <w14:ligatures w14:val="standardContextual"/>
             </w:rPr>
           </w:pPr>
-          <w:hyperlink w:anchor="_Toc228977516" w:history="1">
+          <w:hyperlink w:anchor="_Toc228978187" w:history="1">
             <w:r>
               <w:rPr>
                 <w:rStyle w:val="Hyperlink"/>
@@ -861,7 +861,7 @@
                 <w:noProof/>
                 <w:webHidden/>
               </w:rPr>
-              <w:instrText xml:space="preserve"> PAGEREF _Toc228977516 \h </w:instrText>
+              <w:instrText xml:space="preserve"> PAGEREF _Toc228978187 \h </w:instrText>
             </w:r>
             <w:r>
               <w:rPr>
@@ -908,7 +908,7 @@
               <w14:ligatures w14:val="standardContextual"/>
             </w:rPr>
           </w:pPr>
-          <w:hyperlink w:anchor="_Toc228977517" w:history="1">
+          <w:hyperlink w:anchor="_Toc228978188" w:history="1">
             <w:r>
               <w:rPr>
                 <w:rStyle w:val="Hyperlink"/>
@@ -935,7 +935,7 @@
                 <w:noProof/>
                 <w:webHidden/>
               </w:rPr>
-              <w:instrText xml:space="preserve"> PAGEREF _Toc228977517 \h </w:instrText>
+              <w:instrText xml:space="preserve"> PAGEREF _Toc228978188 \h </w:instrText>
             </w:r>
             <w:r>
               <w:rPr>
@@ -982,7 +982,7 @@
               <w14:ligatures w14:val="standardContextual"/>
             </w:rPr>
           </w:pPr>
-          <w:hyperlink w:anchor="_Toc228977518" w:history="1">
+          <w:hyperlink w:anchor="_Toc228978189" w:history="1">
             <w:r>
               <w:rPr>
                 <w:rStyle w:val="Hyperlink"/>
@@ -1009,7 +1009,7 @@
                 <w:noProof/>
                 <w:webHidden/>
               </w:rPr>
-              <w:instrText xml:space="preserve"> PAGEREF _Toc228977518 \h </w:instrText>
+              <w:instrText xml:space="preserve"> PAGEREF _Toc228978189 \h </w:instrText>
             </w:r>
             <w:r>
               <w:rPr>
@@ -1056,7 +1056,7 @@
               <w14:ligatures w14:val="standardContextual"/>
             </w:rPr>
           </w:pPr>
-          <w:hyperlink w:anchor="_Toc228977519" w:history="1">
+          <w:hyperlink w:anchor="_Toc228978190" w:history="1">
             <w:r>
               <w:rPr>
                 <w:rStyle w:val="Hyperlink"/>
@@ -1083,7 +1083,7 @@
                 <w:noProof/>
                 <w:webHidden/>
               </w:rPr>
-              <w:instrText xml:space="preserve"> PAGEREF _Toc228977519 \h </w:instrText>
+              <w:instrText xml:space="preserve"> PAGEREF _Toc228978190 \h </w:instrText>
             </w:r>
             <w:r>
               <w:rPr>
@@ -1130,7 +1130,7 @@
               <w14:ligatures w14:val="standardContextual"/>
             </w:rPr>
           </w:pPr>
-          <w:hyperlink w:anchor="_Toc228977520" w:history="1">
+          <w:hyperlink w:anchor="_Toc228978191" w:history="1">
             <w:r>
               <w:rPr>
                 <w:rStyle w:val="Hyperlink"/>
@@ -1157,7 +1157,7 @@
                 <w:noProof/>
                 <w:webHidden/>
               </w:rPr>
-              <w:instrText xml:space="preserve"> PAGEREF _Toc228977520 \h </w:instrText>
+              <w:instrText xml:space="preserve"> PAGEREF _Toc228978191 \h </w:instrText>
             </w:r>
             <w:r>
               <w:rPr>
@@ -1204,7 +1204,7 @@
               <w14:ligatures w14:val="standardContextual"/>
             </w:rPr>
           </w:pPr>
-          <w:hyperlink w:anchor="_Toc228977521" w:history="1">
+          <w:hyperlink w:anchor="_Toc228978192" w:history="1">
             <w:r>
               <w:rPr>
                 <w:rStyle w:val="Hyperlink"/>
@@ -1231,7 +1231,7 @@
                 <w:noProof/>
                 <w:webHidden/>
               </w:rPr>
-              <w:instrText xml:space="preserve"> PAGEREF _Toc228977521 \h </w:instrText>
+              <w:instrText xml:space="preserve"> PAGEREF _Toc228978192 \h </w:instrText>
             </w:r>
             <w:r>
               <w:rPr>
@@ -1278,7 +1278,7 @@
               <w14:ligatures w14:val="standardContextual"/>
             </w:rPr>
           </w:pPr>
-          <w:hyperlink w:anchor="_Toc228977522" w:history="1">
+          <w:hyperlink w:anchor="_Toc228978193" w:history="1">
             <w:r>
               <w:rPr>
                 <w:rStyle w:val="Hyperlink"/>
@@ -1305,7 +1305,7 @@
                 <w:noProof/>
                 <w:webHidden/>
               </w:rPr>
-              <w:instrText xml:space="preserve"> PAGEREF _Toc228977522 \h </w:instrText>
+              <w:instrText xml:space="preserve"> PAGEREF _Toc228978193 \h </w:instrText>
             </w:r>
             <w:r>
               <w:rPr>
@@ -1352,7 +1352,7 @@
               <w14:ligatures w14:val="standardContextual"/>
             </w:rPr>
           </w:pPr>
-          <w:hyperlink w:anchor="_Toc228977523" w:history="1">
+          <w:hyperlink w:anchor="_Toc228978194" w:history="1">
             <w:r>
               <w:rPr>
                 <w:rStyle w:val="Hyperlink"/>
@@ -1379,7 +1379,7 @@
                 <w:noProof/>
                 <w:webHidden/>
               </w:rPr>
-              <w:instrText xml:space="preserve"> PAGEREF _Toc228977523 \h </w:instrText>
+              <w:instrText xml:space="preserve"> PAGEREF _Toc228978194 \h </w:instrText>
             </w:r>
             <w:r>
               <w:rPr>
@@ -1426,7 +1426,7 @@
               <w14:ligatures w14:val="standardContextual"/>
             </w:rPr>
           </w:pPr>
-          <w:hyperlink w:anchor="_Toc228977524" w:history="1">
+          <w:hyperlink w:anchor="_Toc228978195" w:history="1">
             <w:r>
               <w:rPr>
                 <w:rStyle w:val="Hyperlink"/>
@@ -1453,7 +1453,7 @@
                 <w:noProof/>
                 <w:webHidden/>
               </w:rPr>
-              <w:instrText xml:space="preserve"> PAGEREF _Toc228977524 \h </w:instrText>
+              <w:instrText xml:space="preserve"> PAGEREF _Toc228978195 \h </w:instrText>
             </w:r>
             <w:r>
               <w:rPr>
@@ -1500,7 +1500,7 @@
               <w14:ligatures w14:val="standardContextual"/>
             </w:rPr>
           </w:pPr>
-          <w:hyperlink w:anchor="_Toc228977525" w:history="1">
+          <w:hyperlink w:anchor="_Toc228978196" w:history="1">
             <w:r>
               <w:rPr>
                 <w:rStyle w:val="Hyperlink"/>
@@ -1527,7 +1527,7 @@
                 <w:noProof/>
                 <w:webHidden/>
               </w:rPr>
-              <w:instrText xml:space="preserve"> PAGEREF _Toc228977525 \h </w:instrText>
+              <w:instrText xml:space="preserve"> PAGEREF _Toc228978196 \h </w:instrText>
             </w:r>
             <w:r>
               <w:rPr>
@@ -1574,7 +1574,7 @@
               <w14:ligatures w14:val="standardContextual"/>
             </w:rPr>
           </w:pPr>
-          <w:hyperlink w:anchor="_Toc228977526" w:history="1">
+          <w:hyperlink w:anchor="_Toc228978197" w:history="1">
             <w:r>
               <w:rPr>
                 <w:rStyle w:val="Hyperlink"/>
@@ -1601,7 +1601,7 @@
                 <w:noProof/>
                 <w:webHidden/>
               </w:rPr>
-              <w:instrText xml:space="preserve"> PAGEREF _Toc228977526 \h </w:instrText>
+              <w:instrText xml:space="preserve"> PAGEREF _Toc228978197 \h </w:instrText>
             </w:r>
             <w:r>
               <w:rPr>
@@ -1648,7 +1648,7 @@
               <w14:ligatures w14:val="standardContextual"/>
             </w:rPr>
           </w:pPr>
-          <w:hyperlink w:anchor="_Toc228977527" w:history="1">
+          <w:hyperlink w:anchor="_Toc228978198" w:history="1">
             <w:r>
               <w:rPr>
                 <w:rStyle w:val="Hyperlink"/>
@@ -1675,7 +1675,7 @@
                 <w:noProof/>
                 <w:webHidden/>
               </w:rPr>
-              <w:instrText xml:space="preserve"> PAGEREF _Toc228977527 \h </w:instrText>
+              <w:instrText xml:space="preserve"> PAGEREF _Toc228978198 \h </w:instrText>
             </w:r>
             <w:r>
               <w:rPr>
@@ -1722,7 +1722,7 @@
               <w14:ligatures w14:val="standardContextual"/>
             </w:rPr>
           </w:pPr>
-          <w:hyperlink w:anchor="_Toc228977528" w:history="1">
+          <w:hyperlink w:anchor="_Toc228978199" w:history="1">
             <w:r>
               <w:rPr>
                 <w:rStyle w:val="Hyperlink"/>
@@ -1749,7 +1749,7 @@
                 <w:noProof/>
                 <w:webHidden/>
               </w:rPr>
-              <w:instrText xml:space="preserve"> PAGEREF _Toc228977528 \h </w:instrText>
+              <w:instrText xml:space="preserve"> PAGEREF _Toc228978199 \h </w:instrText>
             </w:r>
             <w:r>
               <w:rPr>
@@ -1796,7 +1796,7 @@
               <w14:ligatures w14:val="standardContextual"/>
             </w:rPr>
           </w:pPr>
-          <w:hyperlink w:anchor="_Toc228977529" w:history="1">
+          <w:hyperlink w:anchor="_Toc228978200" w:history="1">
             <w:r>
               <w:rPr>
                 <w:rStyle w:val="Hyperlink"/>
@@ -1823,7 +1823,7 @@
                 <w:noProof/>
                 <w:webHidden/>
               </w:rPr>
-              <w:instrText xml:space="preserve"> PAGEREF _Toc228977529 \h </w:instrText>
+              <w:instrText xml:space="preserve"> PAGEREF _Toc228978200 \h </w:instrText>
             </w:r>
             <w:r>
               <w:rPr>
@@ -1870,7 +1870,7 @@
               <w14:ligatures w14:val="standardContextual"/>
             </w:rPr>
           </w:pPr>
-          <w:hyperlink w:anchor="_Toc228977530" w:history="1">
+          <w:hyperlink w:anchor="_Toc228978201" w:history="1">
             <w:r>
               <w:rPr>
                 <w:rStyle w:val="Hyperlink"/>
@@ -1897,7 +1897,7 @@
                 <w:noProof/>
                 <w:webHidden/>
               </w:rPr>
-              <w:instrText xml:space="preserve"> PAGEREF _Toc228977530 \h </w:instrText>
+              <w:instrText xml:space="preserve"> PAGEREF _Toc228978201 \h </w:instrText>
             </w:r>
             <w:r>
               <w:rPr>
@@ -1944,7 +1944,7 @@
               <w14:ligatures w14:val="standardContextual"/>
             </w:rPr>
           </w:pPr>
-          <w:hyperlink w:anchor="_Toc228977531" w:history="1">
+          <w:hyperlink w:anchor="_Toc228978202" w:history="1">
             <w:r>
               <w:rPr>
                 <w:rStyle w:val="Hyperlink"/>
@@ -1971,7 +1971,7 @@
                 <w:noProof/>
                 <w:webHidden/>
               </w:rPr>
-              <w:instrText xml:space="preserve"> PAGEREF _Toc228977531 \h </w:instrText>
+              <w:instrText xml:space="preserve"> PAGEREF _Toc228978202 \h </w:instrText>
             </w:r>
             <w:r>
               <w:rPr>
@@ -2018,7 +2018,7 @@
               <w14:ligatures w14:val="standardContextual"/>
             </w:rPr>
           </w:pPr>
-          <w:hyperlink w:anchor="_Toc228977532" w:history="1">
+          <w:hyperlink w:anchor="_Toc228978203" w:history="1">
             <w:r>
               <w:rPr>
                 <w:rStyle w:val="Hyperlink"/>
@@ -2045,7 +2045,7 @@
                 <w:noProof/>
                 <w:webHidden/>
               </w:rPr>
-              <w:instrText xml:space="preserve"> PAGEREF _Toc228977532 \h </w:instrText>
+              <w:instrText xml:space="preserve"> PAGEREF _Toc228978203 \h </w:instrText>
             </w:r>
             <w:r>
               <w:rPr>
@@ -2092,7 +2092,7 @@
               <w14:ligatures w14:val="standardContextual"/>
             </w:rPr>
           </w:pPr>
-          <w:hyperlink w:anchor="_Toc228977533" w:history="1">
+          <w:hyperlink w:anchor="_Toc228978204" w:history="1">
             <w:r>
               <w:rPr>
                 <w:rStyle w:val="Hyperlink"/>
@@ -2119,7 +2119,7 @@
                 <w:noProof/>
                 <w:webHidden/>
               </w:rPr>
-              <w:instrText xml:space="preserve"> PAGEREF _Toc228977533 \h </w:instrText>
+              <w:instrText xml:space="preserve"> PAGEREF _Toc228978204 \h </w:instrText>
             </w:r>
             <w:r>
               <w:rPr>
@@ -2162,7 +2162,7 @@
               <w:lang w:eastAsia="en-GB"/>
             </w:rPr>
           </w:pPr>
-          <w:hyperlink w:anchor="_Toc228977534" w:history="1">
+          <w:hyperlink w:anchor="_Toc228978205" w:history="1">
             <w:r>
               <w:rPr>
                 <w:rStyle w:val="Hyperlink"/>
@@ -2189,7 +2189,7 @@
                 <w:noProof/>
                 <w:webHidden/>
               </w:rPr>
-              <w:instrText xml:space="preserve"> PAGEREF _Toc228977534 \h </w:instrText>
+              <w:instrText xml:space="preserve"> PAGEREF _Toc228978205 \h </w:instrText>
             </w:r>
             <w:r>
               <w:rPr>
@@ -2232,7 +2232,7 @@
               <w:lang w:eastAsia="en-GB"/>
             </w:rPr>
           </w:pPr>
-          <w:hyperlink w:anchor="_Toc228977535" w:history="1">
+          <w:hyperlink w:anchor="_Toc228978206" w:history="1">
             <w:r>
               <w:rPr>
                 <w:rStyle w:val="Hyperlink"/>
@@ -2259,7 +2259,7 @@
                 <w:noProof/>
                 <w:webHidden/>
               </w:rPr>
-              <w:instrText xml:space="preserve"> PAGEREF _Toc228977535 \h </w:instrText>
+              <w:instrText xml:space="preserve"> PAGEREF _Toc228978206 \h </w:instrText>
             </w:r>
             <w:r>
               <w:rPr>
@@ -2302,7 +2302,7 @@
               <w:lang w:eastAsia="en-GB"/>
             </w:rPr>
           </w:pPr>
-          <w:hyperlink w:anchor="_Toc228977536" w:history="1">
+          <w:hyperlink w:anchor="_Toc228978207" w:history="1">
             <w:r>
               <w:rPr>
                 <w:rStyle w:val="Hyperlink"/>
@@ -2329,7 +2329,7 @@
                 <w:noProof/>
                 <w:webHidden/>
               </w:rPr>
-              <w:instrText xml:space="preserve"> PAGEREF _Toc228977536 \h </w:instrText>
+              <w:instrText xml:space="preserve"> PAGEREF _Toc228978207 \h </w:instrText>
             </w:r>
             <w:r>
               <w:rPr>
@@ -2376,7 +2376,7 @@
               <w14:ligatures w14:val="standardContextual"/>
             </w:rPr>
           </w:pPr>
-          <w:hyperlink w:anchor="_Toc228977537" w:history="1">
+          <w:hyperlink w:anchor="_Toc228978208" w:history="1">
             <w:r>
               <w:rPr>
                 <w:rStyle w:val="Hyperlink"/>
@@ -2403,7 +2403,7 @@
                 <w:noProof/>
                 <w:webHidden/>
               </w:rPr>
-              <w:instrText xml:space="preserve"> PAGEREF _Toc228977537 \h </w:instrText>
+              <w:instrText xml:space="preserve"> PAGEREF _Toc228978208 \h </w:instrText>
             </w:r>
             <w:r>
               <w:rPr>
@@ -2446,7 +2446,7 @@
               <w:lang w:eastAsia="en-GB"/>
             </w:rPr>
           </w:pPr>
-          <w:hyperlink w:anchor="_Toc228977538" w:history="1">
+          <w:hyperlink w:anchor="_Toc228978209" w:history="1">
             <w:r>
               <w:rPr>
                 <w:rStyle w:val="Hyperlink"/>
@@ -2473,7 +2473,7 @@
                 <w:noProof/>
                 <w:webHidden/>
               </w:rPr>
-              <w:instrText xml:space="preserve"> PAGEREF _Toc228977538 \h </w:instrText>
+              <w:instrText xml:space="preserve"> PAGEREF _Toc228978209 \h </w:instrText>
             </w:r>
             <w:r>
               <w:rPr>
@@ -2516,7 +2516,7 @@
               <w:lang w:eastAsia="en-GB"/>
             </w:rPr>
           </w:pPr>
-          <w:hyperlink w:anchor="_Toc228977539" w:history="1">
+          <w:hyperlink w:anchor="_Toc228978210" w:history="1">
             <w:r>
               <w:rPr>
                 <w:rStyle w:val="Hyperlink"/>
@@ -2543,7 +2543,7 @@
                 <w:noProof/>
                 <w:webHidden/>
               </w:rPr>
-              <w:instrText xml:space="preserve"> PAGEREF _Toc228977539 \h </w:instrText>
+              <w:instrText xml:space="preserve"> PAGEREF _Toc228978210 \h </w:instrText>
             </w:r>
             <w:r>
               <w:rPr>
@@ -2586,7 +2586,7 @@
               <w:lang w:eastAsia="en-GB"/>
             </w:rPr>
           </w:pPr>
-          <w:hyperlink w:anchor="_Toc228977540" w:history="1">
+          <w:hyperlink w:anchor="_Toc228978211" w:history="1">
             <w:r>
               <w:rPr>
                 <w:rStyle w:val="Hyperlink"/>
@@ -2613,7 +2613,7 @@
                 <w:noProof/>
                 <w:webHidden/>
               </w:rPr>
-              <w:instrText xml:space="preserve"> PAGEREF _Toc228977540 \h </w:instrText>
+              <w:instrText xml:space="preserve"> PAGEREF _Toc228978211 \h </w:instrText>
             </w:r>
             <w:r>
               <w:rPr>
@@ -2660,7 +2660,7 @@
               <w14:ligatures w14:val="standardContextual"/>
             </w:rPr>
           </w:pPr>
-          <w:hyperlink w:anchor="_Toc228977541" w:history="1">
+          <w:hyperlink w:anchor="_Toc228978212" w:history="1">
             <w:r>
               <w:rPr>
                 <w:rStyle w:val="Hyperlink"/>
@@ -2687,7 +2687,7 @@
                 <w:noProof/>
                 <w:webHidden/>
               </w:rPr>
-              <w:instrText xml:space="preserve"> PAGEREF _Toc228977541 \h </w:instrText>
+              <w:instrText xml:space="preserve"> PAGEREF _Toc228978212 \h </w:instrText>
             </w:r>
             <w:r>
               <w:rPr>
@@ -2730,7 +2730,7 @@
               <w:lang w:eastAsia="en-GB"/>
             </w:rPr>
           </w:pPr>
-          <w:hyperlink w:anchor="_Toc228977542" w:history="1">
+          <w:hyperlink w:anchor="_Toc228978213" w:history="1">
             <w:r>
               <w:rPr>
                 <w:rStyle w:val="Hyperlink"/>
@@ -2757,7 +2757,7 @@
                 <w:noProof/>
                 <w:webHidden/>
               </w:rPr>
-              <w:instrText xml:space="preserve"> PAGEREF _Toc228977542 \h </w:instrText>
+              <w:instrText xml:space="preserve"> PAGEREF _Toc228978213 \h </w:instrText>
             </w:r>
             <w:r>
               <w:rPr>
@@ -2800,7 +2800,7 @@
               <w:lang w:eastAsia="en-GB"/>
             </w:rPr>
           </w:pPr>
-          <w:hyperlink w:anchor="_Toc228977543" w:history="1">
+          <w:hyperlink w:anchor="_Toc228978214" w:history="1">
             <w:r>
               <w:rPr>
                 <w:rStyle w:val="Hyperlink"/>
@@ -2827,7 +2827,7 @@
                 <w:noProof/>
                 <w:webHidden/>
               </w:rPr>
-              <w:instrText xml:space="preserve"> PAGEREF _Toc228977543 \h </w:instrText>
+              <w:instrText xml:space="preserve"> PAGEREF _Toc228978214 \h </w:instrText>
             </w:r>
             <w:r>
               <w:rPr>
@@ -2870,7 +2870,7 @@
               <w:lang w:eastAsia="en-GB"/>
             </w:rPr>
           </w:pPr>
-          <w:hyperlink w:anchor="_Toc228977544" w:history="1">
+          <w:hyperlink w:anchor="_Toc228978215" w:history="1">
             <w:r>
               <w:rPr>
                 <w:rStyle w:val="Hyperlink"/>
@@ -2897,7 +2897,7 @@
                 <w:noProof/>
                 <w:webHidden/>
               </w:rPr>
-              <w:instrText xml:space="preserve"> PAGEREF _Toc228977544 \h </w:instrText>
+              <w:instrText xml:space="preserve"> PAGEREF _Toc228978215 \h </w:instrText>
             </w:r>
             <w:r>
               <w:rPr>
@@ -2944,7 +2944,7 @@
               <w14:ligatures w14:val="standardContextual"/>
             </w:rPr>
           </w:pPr>
-          <w:hyperlink w:anchor="_Toc228977545" w:history="1">
+          <w:hyperlink w:anchor="_Toc228978216" w:history="1">
             <w:r>
               <w:rPr>
                 <w:rStyle w:val="Hyperlink"/>
@@ -2971,7 +2971,7 @@
                 <w:noProof/>
                 <w:webHidden/>
               </w:rPr>
-              <w:instrText xml:space="preserve"> PAGEREF _Toc228977545 \h </w:instrText>
+              <w:instrText xml:space="preserve"> PAGEREF _Toc228978216 \h </w:instrText>
             </w:r>
             <w:r>
               <w:rPr>
@@ -3018,7 +3018,7 @@
               <w14:ligatures w14:val="standardContextual"/>
             </w:rPr>
           </w:pPr>
-          <w:hyperlink w:anchor="_Toc228977546" w:history="1">
+          <w:hyperlink w:anchor="_Toc228978217" w:history="1">
             <w:r>
               <w:rPr>
                 <w:rStyle w:val="Hyperlink"/>
@@ -3045,7 +3045,7 @@
                 <w:noProof/>
                 <w:webHidden/>
               </w:rPr>
-              <w:instrText xml:space="preserve"> PAGEREF _Toc228977546 \h </w:instrText>
+              <w:instrText xml:space="preserve"> PAGEREF _Toc228978217 \h </w:instrText>
             </w:r>
             <w:r>
               <w:rPr>
@@ -3092,7 +3092,7 @@
               <w14:ligatures w14:val="standardContextual"/>
             </w:rPr>
           </w:pPr>
-          <w:hyperlink w:anchor="_Toc228977547" w:history="1">
+          <w:hyperlink w:anchor="_Toc228978218" w:history="1">
             <w:r>
               <w:rPr>
                 <w:rStyle w:val="Hyperlink"/>
@@ -3119,7 +3119,7 @@
                 <w:noProof/>
                 <w:webHidden/>
               </w:rPr>
-              <w:instrText xml:space="preserve"> PAGEREF _Toc228977547 \h </w:instrText>
+              <w:instrText xml:space="preserve"> PAGEREF _Toc228978218 \h </w:instrText>
             </w:r>
             <w:r>
               <w:rPr>
@@ -3166,7 +3166,7 @@
               <w14:ligatures w14:val="standardContextual"/>
             </w:rPr>
           </w:pPr>
-          <w:hyperlink w:anchor="_Toc228977548" w:history="1">
+          <w:hyperlink w:anchor="_Toc228978219" w:history="1">
             <w:r>
               <w:rPr>
                 <w:rStyle w:val="Hyperlink"/>
@@ -3193,7 +3193,7 @@
                 <w:noProof/>
                 <w:webHidden/>
               </w:rPr>
-              <w:instrText xml:space="preserve"> PAGEREF _Toc228977548 \h </w:instrText>
+              <w:instrText xml:space="preserve"> PAGEREF _Toc228978219 \h </w:instrText>
             </w:r>
             <w:r>
               <w:rPr>
@@ -3240,7 +3240,7 @@
               <w14:ligatures w14:val="standardContextual"/>
             </w:rPr>
           </w:pPr>
-          <w:hyperlink w:anchor="_Toc228977549" w:history="1">
+          <w:hyperlink w:anchor="_Toc228978220" w:history="1">
             <w:r>
               <w:rPr>
                 <w:rStyle w:val="Hyperlink"/>
@@ -3267,7 +3267,7 @@
                 <w:noProof/>
                 <w:webHidden/>
               </w:rPr>
-              <w:instrText xml:space="preserve"> PAGEREF _Toc228977549 \h </w:instrText>
+              <w:instrText xml:space="preserve"> PAGEREF _Toc228978220 \h </w:instrText>
             </w:r>
             <w:r>
               <w:rPr>
@@ -3314,7 +3314,7 @@
               <w14:ligatures w14:val="standardContextual"/>
             </w:rPr>
           </w:pPr>
-          <w:hyperlink w:anchor="_Toc228977550" w:history="1">
+          <w:hyperlink w:anchor="_Toc228978221" w:history="1">
             <w:r>
               <w:rPr>
                 <w:rStyle w:val="Hyperlink"/>
@@ -3341,7 +3341,7 @@
                 <w:noProof/>
                 <w:webHidden/>
               </w:rPr>
-              <w:instrText xml:space="preserve"> PAGEREF _Toc228977550 \h </w:instrText>
+              <w:instrText xml:space="preserve"> PAGEREF _Toc228978221 \h </w:instrText>
             </w:r>
             <w:r>
               <w:rPr>
@@ -3388,7 +3388,7 @@
               <w14:ligatures w14:val="standardContextual"/>
             </w:rPr>
           </w:pPr>
-          <w:hyperlink w:anchor="_Toc228977551" w:history="1">
+          <w:hyperlink w:anchor="_Toc228978222" w:history="1">
             <w:r>
               <w:rPr>
                 <w:rStyle w:val="Hyperlink"/>
@@ -3415,7 +3415,7 @@
                 <w:noProof/>
                 <w:webHidden/>
               </w:rPr>
-              <w:instrText xml:space="preserve"> PAGEREF _Toc228977551 \h </w:instrText>
+              <w:instrText xml:space="preserve"> PAGEREF _Toc228978222 \h </w:instrText>
             </w:r>
             <w:r>
               <w:rPr>
@@ -3462,7 +3462,7 @@
               <w14:ligatures w14:val="standardContextual"/>
             </w:rPr>
           </w:pPr>
-          <w:hyperlink w:anchor="_Toc228977552" w:history="1">
+          <w:hyperlink w:anchor="_Toc228978223" w:history="1">
             <w:r>
               <w:rPr>
                 <w:rStyle w:val="Hyperlink"/>
@@ -3489,7 +3489,7 @@
                 <w:noProof/>
                 <w:webHidden/>
               </w:rPr>
-              <w:instrText xml:space="preserve"> PAGEREF _Toc228977552 \h </w:instrText>
+              <w:instrText xml:space="preserve"> PAGEREF _Toc228978223 \h </w:instrText>
             </w:r>
             <w:r>
               <w:rPr>
@@ -3536,7 +3536,7 @@
               <w14:ligatures w14:val="standardContextual"/>
             </w:rPr>
           </w:pPr>
-          <w:hyperlink w:anchor="_Toc228977553" w:history="1">
+          <w:hyperlink w:anchor="_Toc228978224" w:history="1">
             <w:r>
               <w:rPr>
                 <w:rStyle w:val="Hyperlink"/>
@@ -3563,7 +3563,7 @@
                 <w:noProof/>
                 <w:webHidden/>
               </w:rPr>
-              <w:instrText xml:space="preserve"> PAGEREF _Toc228977553 \h </w:instrText>
+              <w:instrText xml:space="preserve"> PAGEREF _Toc228978224 \h </w:instrText>
             </w:r>
             <w:r>
               <w:rPr>
@@ -3610,7 +3610,7 @@
               <w14:ligatures w14:val="standardContextual"/>
             </w:rPr>
           </w:pPr>
-          <w:hyperlink w:anchor="_Toc228977554" w:history="1">
+          <w:hyperlink w:anchor="_Toc228978225" w:history="1">
             <w:r>
               <w:rPr>
                 <w:rStyle w:val="Hyperlink"/>
@@ -3637,7 +3637,7 @@
                 <w:noProof/>
                 <w:webHidden/>
               </w:rPr>
-              <w:instrText xml:space="preserve"> PAGEREF _Toc228977554 \h </w:instrText>
+              <w:instrText xml:space="preserve"> PAGEREF _Toc228978225 \h </w:instrText>
             </w:r>
             <w:r>
               <w:rPr>
@@ -3658,6 +3658,80 @@
                 <w:webHidden/>
               </w:rPr>
               <w:t>14</w:t>
+            </w:r>
+            <w:r>
+              <w:rPr>
+                <w:noProof/>
+                <w:webHidden/>
+              </w:rPr>
+              <w:fldChar w:fldCharType="end"/>
+            </w:r>
+          </w:hyperlink>
+        </w:p>
+        <w:p>
+          <w:pPr>
+            <w:pStyle w:val="TOC3"/>
+            <w:tabs>
+              <w:tab w:val="right" w:leader="dot" w:pos="9016"/>
+            </w:tabs>
+            <w:rPr>
+              <w:rFonts w:asciiTheme="minorHAnsi" w:hAnsiTheme="minorHAnsi" w:cstheme="minorBidi"/>
+              <w:noProof/>
+              <w:kern w:val="2"/>
+              <w:sz w:val="24"/>
+              <w:szCs w:val="24"/>
+              <w:lang w:val="en-GB" w:eastAsia="en-GB"/>
+              <w14:ligatures w14:val="standardContextual"/>
+            </w:rPr>
+          </w:pPr>
+          <w:hyperlink w:anchor="_Toc228978226" w:history="1">
+            <w:r>
+              <w:rPr>
+                <w:rStyle w:val="Hyperlink"/>
+                <w:noProof/>
+              </w:rPr>
+              <w:t>3.2.3 Limitations</w:t>
+            </w:r>
+            <w:r>
+              <w:rPr>
+                <w:noProof/>
+                <w:webHidden/>
+              </w:rPr>
+              <w:tab/>
+            </w:r>
+            <w:r>
+              <w:rPr>
+                <w:noProof/>
+                <w:webHidden/>
+              </w:rPr>
+              <w:fldChar w:fldCharType="begin"/>
+            </w:r>
+            <w:r>
+              <w:rPr>
+                <w:noProof/>
+                <w:webHidden/>
+              </w:rPr>
+              <w:instrText xml:space="preserve"> PAGEREF _Toc228978226 \h </w:instrText>
+            </w:r>
+            <w:r>
+              <w:rPr>
+                <w:noProof/>
+                <w:webHidden/>
+              </w:rPr>
+            </w:r>
+            <w:r>
+              <w:rPr>
+                <w:noProof/>
+                <w:webHidden/>
+              </w:rPr>
+              <w:fldChar w:fldCharType="separate"/>
+            </w:r>
+            <w:r>
+              <w:rPr>
+                <w:noProof/>
+                <w:webHidden/>
+              </w:rPr>
+              <w:t>15</w:t>
             </w:r>
             <w:r>
               <w:rPr>
@@ -3684,7 +3758,7 @@
               <w14:ligatures w14:val="standardContextual"/>
             </w:rPr>
           </w:pPr>
-          <w:hyperlink w:anchor="_Toc228977555" w:history="1">
+          <w:hyperlink w:anchor="_Toc228978227" w:history="1">
             <w:r>
               <w:rPr>
                 <w:rStyle w:val="Hyperlink"/>
@@ -3711,7 +3785,7 @@
                 <w:noProof/>
                 <w:webHidden/>
               </w:rPr>
-              <w:instrText xml:space="preserve"> PAGEREF _Toc228977555 \h </w:instrText>
+              <w:instrText xml:space="preserve"> PAGEREF _Toc228978227 \h </w:instrText>
             </w:r>
             <w:r>
               <w:rPr>
@@ -3731,7 +3805,7 @@
                 <w:noProof/>
                 <w:webHidden/>
               </w:rPr>
-              <w:t>15</w:t>
+              <w:t>16</w:t>
             </w:r>
             <w:r>
               <w:rPr>
@@ -3768,7 +3842,7 @@
       <w:pPr>
         <w:pStyle w:val="Heading1"/>
       </w:pPr>
-      <w:bookmarkStart w:id="7" w:name="_Toc228977518"/>
+      <w:bookmarkStart w:id="7" w:name="_Toc228978189"/>
       <w:r>
         <w:t>Table of Figures</w:t>
       </w:r>
@@ -4396,7 +4470,7 @@
       <w:pPr>
         <w:pStyle w:val="Heading1"/>
       </w:pPr>
-      <w:bookmarkStart w:id="8" w:name="_Toc228977519"/>
+      <w:bookmarkStart w:id="8" w:name="_Toc228978190"/>
       <w:r>
         <w:t>Chapter 1</w:t>
       </w:r>
@@ -4424,7 +4498,7 @@
           <w:u w:val="single"/>
         </w:rPr>
       </w:pPr>
-      <w:bookmarkStart w:id="9" w:name="_Toc228977520"/>
+      <w:bookmarkStart w:id="9" w:name="_Toc228978191"/>
       <w:r>
         <w:t>1.1</w:t>
       </w:r>
@@ -4475,7 +4549,7 @@
       <w:pPr>
         <w:pStyle w:val="Heading2"/>
       </w:pPr>
-      <w:bookmarkStart w:id="10" w:name="_Toc228977521"/>
+      <w:bookmarkStart w:id="10" w:name="_Toc228978192"/>
       <w:r>
         <w:t>1.2 Aims</w:t>
       </w:r>
@@ -4491,7 +4565,7 @@
           <w:szCs w:val="28"/>
         </w:rPr>
       </w:pPr>
-      <w:bookmarkStart w:id="11" w:name="_Toc228977522"/>
+      <w:bookmarkStart w:id="11" w:name="_Toc228978193"/>
       <w:r>
         <w:rPr>
           <w:rStyle w:val="Heading2Char"/>
@@ -4536,7 +4610,7 @@
       <w:pPr>
         <w:pStyle w:val="Heading3"/>
       </w:pPr>
-      <w:bookmarkStart w:id="12" w:name="_Toc228977523"/>
+      <w:bookmarkStart w:id="12" w:name="_Toc228978194"/>
       <w:r>
         <w:lastRenderedPageBreak/>
         <w:t>1.2.2 Additional Aims</w:t>
@@ -4606,7 +4680,7 @@
       <w:pPr>
         <w:pStyle w:val="Heading2"/>
       </w:pPr>
-      <w:bookmarkStart w:id="13" w:name="_Toc228977524"/>
+      <w:bookmarkStart w:id="13" w:name="_Toc228978195"/>
       <w:r>
         <w:t>1.3 Objectives</w:t>
       </w:r>
@@ -4616,7 +4690,7 @@
       <w:pPr>
         <w:pStyle w:val="Heading3"/>
       </w:pPr>
-      <w:bookmarkStart w:id="14" w:name="_Toc228977525"/>
+      <w:bookmarkStart w:id="14" w:name="_Toc228978196"/>
       <w:r>
         <w:t>1.3.1 Scope</w:t>
       </w:r>
@@ -4687,7 +4761,7 @@
       <w:pPr>
         <w:pStyle w:val="Heading3"/>
       </w:pPr>
-      <w:bookmarkStart w:id="15" w:name="_Toc228977526"/>
+      <w:bookmarkStart w:id="15" w:name="_Toc228978197"/>
       <w:r>
         <w:t>1.3.2 Research Objectives</w:t>
       </w:r>
@@ -4732,7 +4806,7 @@
       <w:pPr>
         <w:pStyle w:val="Heading3"/>
       </w:pPr>
-      <w:bookmarkStart w:id="16" w:name="_Toc228977527"/>
+      <w:bookmarkStart w:id="16" w:name="_Toc228978198"/>
       <w:r>
         <w:t>1.3.3 Design Objectives</w:t>
       </w:r>
@@ -4854,7 +4928,7 @@
       <w:pPr>
         <w:pStyle w:val="Heading3"/>
       </w:pPr>
-      <w:bookmarkStart w:id="17" w:name="_Toc228977528"/>
+      <w:bookmarkStart w:id="17" w:name="_Toc228978199"/>
       <w:r>
         <w:t>1.3.4 Implementation Objectives</w:t>
       </w:r>
@@ -4973,7 +5047,7 @@
       <w:pPr>
         <w:pStyle w:val="Heading3"/>
       </w:pPr>
-      <w:bookmarkStart w:id="18" w:name="_Toc228977529"/>
+      <w:bookmarkStart w:id="18" w:name="_Toc228978200"/>
       <w:r>
         <w:t>1.3.5 Results, Evaluation and Playtesting Objectives</w:t>
       </w:r>
@@ -5126,7 +5200,7 @@
       <w:pPr>
         <w:pStyle w:val="Heading1"/>
       </w:pPr>
-      <w:bookmarkStart w:id="19" w:name="_Toc228977530"/>
+      <w:bookmarkStart w:id="19" w:name="_Toc228978201"/>
       <w:r>
         <w:lastRenderedPageBreak/>
         <w:t>Chapter 2 – Literature Survey</w:t>
@@ -5137,7 +5211,7 @@
       <w:pPr>
         <w:pStyle w:val="Heading2"/>
       </w:pPr>
-      <w:bookmarkStart w:id="20" w:name="_Toc228977531"/>
+      <w:bookmarkStart w:id="20" w:name="_Toc228978202"/>
       <w:r>
         <w:t>2.1 Literature Survey Introduction</w:t>
       </w:r>
@@ -5176,7 +5250,7 @@
       <w:pPr>
         <w:pStyle w:val="Heading2"/>
       </w:pPr>
-      <w:bookmarkStart w:id="21" w:name="_Toc228977532"/>
+      <w:bookmarkStart w:id="21" w:name="_Toc228978203"/>
       <w:r>
         <w:t>2.2 Comparative Research</w:t>
       </w:r>
@@ -5194,7 +5268,7 @@
       <w:pPr>
         <w:pStyle w:val="Heading3"/>
       </w:pPr>
-      <w:bookmarkStart w:id="22" w:name="_Toc228977533"/>
+      <w:bookmarkStart w:id="22" w:name="_Toc228978204"/>
       <w:r>
         <w:t xml:space="preserve">2.2.1 </w:t>
       </w:r>
@@ -5270,7 +5344,7 @@
       <w:pPr>
         <w:pStyle w:val="Heading4"/>
       </w:pPr>
-      <w:bookmarkStart w:id="23" w:name="_Toc228977534"/>
+      <w:bookmarkStart w:id="23" w:name="_Toc228978205"/>
       <w:r>
         <w:t>2.2.1.1 Perlin Noise</w:t>
       </w:r>
@@ -5653,7 +5727,7 @@
       <w:pPr>
         <w:pStyle w:val="Heading4"/>
       </w:pPr>
-      <w:bookmarkStart w:id="25" w:name="_Toc228977535"/>
+      <w:bookmarkStart w:id="25" w:name="_Toc228978206"/>
       <w:r>
         <w:t>2.2.1.2 Binary Space Partitioning</w:t>
       </w:r>
@@ -5705,7 +5779,7 @@
       <w:pPr>
         <w:pStyle w:val="Heading4"/>
       </w:pPr>
-      <w:bookmarkStart w:id="26" w:name="_Toc228977536"/>
+      <w:bookmarkStart w:id="26" w:name="_Toc228978207"/>
       <w:r>
         <w:t>2.2.1.3 Cellular Automata</w:t>
       </w:r>
@@ -5825,7 +5899,7 @@
       <w:pPr>
         <w:pStyle w:val="Heading3"/>
       </w:pPr>
-      <w:bookmarkStart w:id="27" w:name="_Toc228977537"/>
+      <w:bookmarkStart w:id="27" w:name="_Toc228978208"/>
       <w:r>
         <w:t>2.2.2 Pathfinding</w:t>
       </w:r>
@@ -5888,7 +5962,7 @@
       <w:pPr>
         <w:pStyle w:val="Heading4"/>
       </w:pPr>
-      <w:bookmarkStart w:id="28" w:name="_Toc228977538"/>
+      <w:bookmarkStart w:id="28" w:name="_Toc228978209"/>
       <w:r>
         <w:t>2.2.2.1 Dijkstra</w:t>
       </w:r>
@@ -6061,7 +6135,7 @@
       <w:pPr>
         <w:pStyle w:val="Heading4"/>
       </w:pPr>
-      <w:bookmarkStart w:id="30" w:name="_Toc228977539"/>
+      <w:bookmarkStart w:id="30" w:name="_Toc228978210"/>
       <w:r>
         <w:t>2.2.2.2 A*</w:t>
       </w:r>
@@ -6126,7 +6200,7 @@
       <w:pPr>
         <w:pStyle w:val="Heading4"/>
       </w:pPr>
-      <w:bookmarkStart w:id="31" w:name="_Toc228977540"/>
+      <w:bookmarkStart w:id="31" w:name="_Toc228978211"/>
       <w:r>
         <w:t>2.2.2.3 Jump Point Search</w:t>
       </w:r>
@@ -6176,7 +6250,7 @@
       <w:pPr>
         <w:pStyle w:val="Heading3"/>
       </w:pPr>
-      <w:bookmarkStart w:id="32" w:name="_Toc228977541"/>
+      <w:bookmarkStart w:id="32" w:name="_Toc228978212"/>
       <w:r>
         <w:t>2.2.3 AI Integrations</w:t>
       </w:r>
@@ -6201,7 +6275,7 @@
       <w:pPr>
         <w:pStyle w:val="Heading4"/>
       </w:pPr>
-      <w:bookmarkStart w:id="33" w:name="_Toc228977542"/>
+      <w:bookmarkStart w:id="33" w:name="_Toc228978213"/>
       <w:r>
         <w:t>2.2.3.1 Neural Network</w:t>
       </w:r>
@@ -6268,7 +6342,7 @@
       <w:pPr>
         <w:pStyle w:val="Heading4"/>
       </w:pPr>
-      <w:bookmarkStart w:id="34" w:name="_Toc228977543"/>
+      <w:bookmarkStart w:id="34" w:name="_Toc228978214"/>
       <w:r>
         <w:t>2.2.3.2 Reinforcement Learning</w:t>
       </w:r>
@@ -6468,7 +6542,7 @@
       <w:pPr>
         <w:pStyle w:val="Heading4"/>
       </w:pPr>
-      <w:bookmarkStart w:id="36" w:name="_Toc228977544"/>
+      <w:bookmarkStart w:id="36" w:name="_Toc228978215"/>
       <w:r>
         <w:t>2.2.3.3 Imitation Learning</w:t>
       </w:r>
@@ -6601,7 +6675,7 @@
       <w:pPr>
         <w:pStyle w:val="Heading1"/>
       </w:pPr>
-      <w:bookmarkStart w:id="37" w:name="_Toc228977545"/>
+      <w:bookmarkStart w:id="37" w:name="_Toc228978216"/>
       <w:r>
         <w:t>Chapter 3 – Design</w:t>
       </w:r>
@@ -6628,7 +6702,7 @@
       <w:pPr>
         <w:pStyle w:val="Heading2"/>
       </w:pPr>
-      <w:bookmarkStart w:id="38" w:name="_Toc228977546"/>
+      <w:bookmarkStart w:id="38" w:name="_Toc228978217"/>
       <w:r>
         <w:t xml:space="preserve">3.1 </w:t>
       </w:r>
@@ -6679,7 +6753,7 @@
       <w:pPr>
         <w:pStyle w:val="Heading3"/>
       </w:pPr>
-      <w:bookmarkStart w:id="39" w:name="_Toc228977547"/>
+      <w:bookmarkStart w:id="39" w:name="_Toc228978218"/>
       <w:r>
         <w:lastRenderedPageBreak/>
         <w:t xml:space="preserve">3.1.1 </w:t>
@@ -7043,7 +7117,7 @@
       <w:pPr>
         <w:pStyle w:val="Heading3"/>
       </w:pPr>
-      <w:bookmarkStart w:id="43" w:name="_Toc228977548"/>
+      <w:bookmarkStart w:id="43" w:name="_Toc228978219"/>
       <w:r>
         <w:t>3.1.2 Biomes</w:t>
       </w:r>
@@ -7307,7 +7381,7 @@
       <w:pPr>
         <w:pStyle w:val="Heading3"/>
       </w:pPr>
-      <w:bookmarkStart w:id="45" w:name="_Toc228977549"/>
+      <w:bookmarkStart w:id="45" w:name="_Toc228978220"/>
       <w:r>
         <w:t>3.1.3 Resource Distribution</w:t>
       </w:r>
@@ -7337,7 +7411,7 @@
       <w:pPr>
         <w:pStyle w:val="Heading3"/>
       </w:pPr>
-      <w:bookmarkStart w:id="46" w:name="_Toc228977550"/>
+      <w:bookmarkStart w:id="46" w:name="_Toc228978221"/>
       <w:r>
         <w:t>3.1.4 River generation</w:t>
       </w:r>
@@ -7379,7 +7453,7 @@
       <w:pPr>
         <w:pStyle w:val="Heading3"/>
       </w:pPr>
-      <w:bookmarkStart w:id="47" w:name="_Toc228977551"/>
+      <w:bookmarkStart w:id="47" w:name="_Toc228978222"/>
       <w:r>
         <w:t>3.1.</w:t>
       </w:r>
@@ -7488,7 +7562,7 @@
       <w:pPr>
         <w:pStyle w:val="Heading2"/>
       </w:pPr>
-      <w:bookmarkStart w:id="48" w:name="_Toc228977552"/>
+      <w:bookmarkStart w:id="48" w:name="_Toc228978223"/>
       <w:r>
         <w:t>3.2 Pathfinding</w:t>
       </w:r>
@@ -7506,7 +7580,7 @@
       <w:pPr>
         <w:pStyle w:val="Heading3"/>
       </w:pPr>
-      <w:bookmarkStart w:id="49" w:name="_Toc228977553"/>
+      <w:bookmarkStart w:id="49" w:name="_Toc228978224"/>
       <w:r>
         <w:t xml:space="preserve">3.2.1 </w:t>
       </w:r>
@@ -7543,30 +7617,14 @@
     <w:p>
       <w:r>
         <w:br/>
-        <w:t xml:space="preserve">The singleton design pattern seems to be perfect for this use case, allowing all units to access the class without having a reference to it. This eliminates the need to use GetComponent which has its own </w:t>
-      </w:r>
-      <w:proofErr w:type="gramStart"/>
-      <w:r>
-        <w:t>myriad</w:t>
-      </w:r>
-      <w:proofErr w:type="gramEnd"/>
-      <w:r>
-        <w:t xml:space="preserve"> of drawbacks such as the degradation of performance when units try to access it, </w:t>
-      </w:r>
-      <w:proofErr w:type="spellStart"/>
-      <w:r>
-        <w:t>NullReference</w:t>
-      </w:r>
-      <w:proofErr w:type="spellEnd"/>
-      <w:r>
-        <w:t xml:space="preserve"> exceptions crashing the pathfinding functions, and making redundant calls.</w:t>
+        <w:t>The singleton design pattern seems to be perfect for this use case, allowing all units to access the class without having a reference to it. This eliminates the need to use GetComponent which has its own myriad of drawbacks such as the degradation of performance when units try to access it, NullReference exceptions crashing the pathfinding functions, and making redundant calls.</w:t>
       </w:r>
     </w:p>
     <w:p>
       <w:pPr>
         <w:pStyle w:val="Heading3"/>
       </w:pPr>
-      <w:bookmarkStart w:id="50" w:name="_Toc228977554"/>
+      <w:bookmarkStart w:id="50" w:name="_Toc228978225"/>
       <w:r>
         <w:t>3.2.2 Heuristics</w:t>
       </w:r>
@@ -7757,18 +7815,72 @@
         <w:t xml:space="preserve">Euclidean Distance </w:t>
       </w:r>
       <w:r>
-        <w:t xml:space="preserve">is a direct measurement from point A to point B. As shown in figure 8, from the origin, the provided line can be traced to its destination. Inserting all grid tiles that are highlighted into a list, a path can be formed from the origin to the destination. This is almost a perfect solution to this project’s requirements due to the ease of implementation and it </w:t>
+        <w:t xml:space="preserve">is a direct measurement from point A to point B. As shown in figure 8, from the origin, the provided line can be traced to its destination. Inserting all grid tiles that are highlighted into a list, a path can be formed from the origin to the destination. This is almost a perfect solution to this project’s requirements due to the ease of </w:t>
       </w:r>
       <w:proofErr w:type="gramStart"/>
       <w:r>
-        <w:t>taking</w:t>
+        <w:t>implementation</w:t>
       </w:r>
       <w:proofErr w:type="gramEnd"/>
       <w:r>
+        <w:t xml:space="preserve"> and it </w:t>
+      </w:r>
+      <w:r>
+        <w:t>takes</w:t>
+      </w:r>
+      <w:r>
         <w:t xml:space="preserve"> pathing cost into account. The drawbacks of Euclidean distance are that its relatively computationally expensive due to its handling of square roots.</w:t>
       </w:r>
     </w:p>
-    <w:bookmarkStart w:id="52" w:name="_Toc228977555" w:displacedByCustomXml="next"/>
+    <w:p>
+      <w:pPr>
+        <w:pStyle w:val="Heading3"/>
+      </w:pPr>
+      <w:bookmarkStart w:id="52" w:name="_Toc228978226"/>
+      <w:r>
+        <w:t>3.2.3 Limitations</w:t>
+      </w:r>
+      <w:bookmarkEnd w:id="52"/>
+    </w:p>
+    <w:p>
+      <w:r>
+        <w:t>The limitations of this system are that Singletons, while being extremely easy to create and access, are also harder to support for multiple independent systems. If the project requirements shift to having multiple layers or regions later in development, having a singleton-based architecture is likely not going to be ideal due to the need to have multiple pathfinding systems.</w:t>
+      </w:r>
+    </w:p>
+    <w:p/>
+    <w:p>
+      <w:r>
+        <w:t xml:space="preserve">Another limitation of </w:t>
+      </w:r>
+      <w:r>
+        <w:t xml:space="preserve">pathfinding is that Euclidean heuristics are quite expensive to compute. This is due to a large </w:t>
+      </w:r>
+      <w:proofErr w:type="gramStart"/>
+      <w:r>
+        <w:t>amount</w:t>
+      </w:r>
+      <w:proofErr w:type="gramEnd"/>
+      <w:r>
+        <w:t xml:space="preserve"> of </w:t>
+      </w:r>
+      <w:r>
+        <w:t>floating-point</w:t>
+      </w:r>
+      <w:r>
+        <w:t xml:space="preserve"> operations and square root calculations being a per node evaluation. In a large-scale grid or multi-agent system, the performance deficit to Manhattan and Chebyshev methods becomes noticeable and can begin to cause slowdowns of systems and hitches in gameplay.</w:t>
+      </w:r>
+    </w:p>
+    <w:p/>
+    <w:p>
+      <w:r>
+        <w:lastRenderedPageBreak/>
+        <w:t>Despite these limitations, this project will still be using a singleton architecture and Euclidean heuristics due to the</w:t>
+      </w:r>
+      <w:r>
+        <w:t xml:space="preserve"> benefits outlined above.</w:t>
+      </w:r>
+    </w:p>
+    <w:bookmarkStart w:id="53" w:name="_Toc228978227" w:displacedByCustomXml="next"/>
     <w:sdt>
       <w:sdtPr>
         <w:rPr>
@@ -7796,7 +7908,7 @@
           <w:r>
             <w:t>References</w:t>
           </w:r>
-          <w:bookmarkEnd w:id="52"/>
+          <w:bookmarkEnd w:id="53"/>
         </w:p>
         <w:sdt>
           <w:sdtPr>
@@ -7980,7 +8092,6 @@
                 <w:rPr>
                   <w:noProof/>
                 </w:rPr>
-                <w:lastRenderedPageBreak/>
                 <w:t xml:space="preserve">Johnston, N. &amp; Greene, D., 2021. </w:t>
               </w:r>
               <w:r>
@@ -8289,6 +8400,7 @@
                 <w:rPr>
                   <w:noProof/>
                 </w:rPr>
+                <w:lastRenderedPageBreak/>
                 <w:t xml:space="preserve">Yang, Z., Li, J., Yang, L. &amp; Chen, H., 2022. </w:t>
               </w:r>
               <w:r>

</xml_diff>

<commit_message>
feat: AI design intro written
</commit_message>
<xml_diff>
--- a/Report.docx
+++ b/Report.docx
@@ -321,7 +321,7 @@
         <w:pStyle w:val="Heading1"/>
       </w:pPr>
       <w:bookmarkStart w:id="1" w:name="_Toc40898999"/>
-      <w:bookmarkStart w:id="2" w:name="_Toc228978185"/>
+      <w:bookmarkStart w:id="2" w:name="_Toc228979432"/>
       <w:r>
         <w:lastRenderedPageBreak/>
         <w:t>Abstract</w:t>
@@ -369,7 +369,7 @@
         <w:spacing w:after="321"/>
         <w:ind w:left="-5"/>
       </w:pPr>
-      <w:bookmarkStart w:id="3" w:name="_Toc228978186"/>
+      <w:bookmarkStart w:id="3" w:name="_Toc228979433"/>
       <w:r>
         <w:lastRenderedPageBreak/>
         <w:t>Declaration</w:t>
@@ -491,7 +491,7 @@
         <w:ind w:left="-5"/>
       </w:pPr>
       <w:bookmarkStart w:id="4" w:name="_Toc40899001"/>
-      <w:bookmarkStart w:id="5" w:name="_Toc228978187"/>
+      <w:bookmarkStart w:id="5" w:name="_Toc228979434"/>
       <w:r>
         <w:lastRenderedPageBreak/>
         <w:t>Acknowledgements</w:t>
@@ -628,7 +628,7 @@
         <w:spacing w:line="259" w:lineRule="auto"/>
       </w:pPr>
     </w:p>
-    <w:bookmarkStart w:id="6" w:name="_Toc228978188" w:displacedByCustomXml="next"/>
+    <w:bookmarkStart w:id="6" w:name="_Toc228979435" w:displacedByCustomXml="next"/>
     <w:sdt>
       <w:sdtPr>
         <w:rPr>
@@ -686,7 +686,7 @@
           <w:r>
             <w:fldChar w:fldCharType="separate"/>
           </w:r>
-          <w:hyperlink w:anchor="_Toc228978185" w:history="1">
+          <w:hyperlink w:anchor="_Toc228979432" w:history="1">
             <w:r>
               <w:rPr>
                 <w:rStyle w:val="Hyperlink"/>
@@ -713,7 +713,7 @@
                 <w:noProof/>
                 <w:webHidden/>
               </w:rPr>
-              <w:instrText xml:space="preserve"> PAGEREF _Toc228978185 \h </w:instrText>
+              <w:instrText xml:space="preserve"> PAGEREF _Toc228979432 \h </w:instrText>
             </w:r>
             <w:r>
               <w:rPr>
@@ -760,7 +760,7 @@
               <w14:ligatures w14:val="standardContextual"/>
             </w:rPr>
           </w:pPr>
-          <w:hyperlink w:anchor="_Toc228978186" w:history="1">
+          <w:hyperlink w:anchor="_Toc228979433" w:history="1">
             <w:r>
               <w:rPr>
                 <w:rStyle w:val="Hyperlink"/>
@@ -787,7 +787,7 @@
                 <w:noProof/>
                 <w:webHidden/>
               </w:rPr>
-              <w:instrText xml:space="preserve"> PAGEREF _Toc228978186 \h </w:instrText>
+              <w:instrText xml:space="preserve"> PAGEREF _Toc228979433 \h </w:instrText>
             </w:r>
             <w:r>
               <w:rPr>
@@ -834,7 +834,7 @@
               <w14:ligatures w14:val="standardContextual"/>
             </w:rPr>
           </w:pPr>
-          <w:hyperlink w:anchor="_Toc228978187" w:history="1">
+          <w:hyperlink w:anchor="_Toc228979434" w:history="1">
             <w:r>
               <w:rPr>
                 <w:rStyle w:val="Hyperlink"/>
@@ -861,7 +861,7 @@
                 <w:noProof/>
                 <w:webHidden/>
               </w:rPr>
-              <w:instrText xml:space="preserve"> PAGEREF _Toc228978187 \h </w:instrText>
+              <w:instrText xml:space="preserve"> PAGEREF _Toc228979434 \h </w:instrText>
             </w:r>
             <w:r>
               <w:rPr>
@@ -908,7 +908,7 @@
               <w14:ligatures w14:val="standardContextual"/>
             </w:rPr>
           </w:pPr>
-          <w:hyperlink w:anchor="_Toc228978188" w:history="1">
+          <w:hyperlink w:anchor="_Toc228979435" w:history="1">
             <w:r>
               <w:rPr>
                 <w:rStyle w:val="Hyperlink"/>
@@ -935,7 +935,7 @@
                 <w:noProof/>
                 <w:webHidden/>
               </w:rPr>
-              <w:instrText xml:space="preserve"> PAGEREF _Toc228978188 \h </w:instrText>
+              <w:instrText xml:space="preserve"> PAGEREF _Toc228979435 \h </w:instrText>
             </w:r>
             <w:r>
               <w:rPr>
@@ -982,7 +982,7 @@
               <w14:ligatures w14:val="standardContextual"/>
             </w:rPr>
           </w:pPr>
-          <w:hyperlink w:anchor="_Toc228978189" w:history="1">
+          <w:hyperlink w:anchor="_Toc228979436" w:history="1">
             <w:r>
               <w:rPr>
                 <w:rStyle w:val="Hyperlink"/>
@@ -1009,7 +1009,7 @@
                 <w:noProof/>
                 <w:webHidden/>
               </w:rPr>
-              <w:instrText xml:space="preserve"> PAGEREF _Toc228978189 \h </w:instrText>
+              <w:instrText xml:space="preserve"> PAGEREF _Toc228979436 \h </w:instrText>
             </w:r>
             <w:r>
               <w:rPr>
@@ -1056,7 +1056,7 @@
               <w14:ligatures w14:val="standardContextual"/>
             </w:rPr>
           </w:pPr>
-          <w:hyperlink w:anchor="_Toc228978190" w:history="1">
+          <w:hyperlink w:anchor="_Toc228979437" w:history="1">
             <w:r>
               <w:rPr>
                 <w:rStyle w:val="Hyperlink"/>
@@ -1083,7 +1083,7 @@
                 <w:noProof/>
                 <w:webHidden/>
               </w:rPr>
-              <w:instrText xml:space="preserve"> PAGEREF _Toc228978190 \h </w:instrText>
+              <w:instrText xml:space="preserve"> PAGEREF _Toc228979437 \h </w:instrText>
             </w:r>
             <w:r>
               <w:rPr>
@@ -1130,7 +1130,7 @@
               <w14:ligatures w14:val="standardContextual"/>
             </w:rPr>
           </w:pPr>
-          <w:hyperlink w:anchor="_Toc228978191" w:history="1">
+          <w:hyperlink w:anchor="_Toc228979438" w:history="1">
             <w:r>
               <w:rPr>
                 <w:rStyle w:val="Hyperlink"/>
@@ -1157,7 +1157,7 @@
                 <w:noProof/>
                 <w:webHidden/>
               </w:rPr>
-              <w:instrText xml:space="preserve"> PAGEREF _Toc228978191 \h </w:instrText>
+              <w:instrText xml:space="preserve"> PAGEREF _Toc228979438 \h </w:instrText>
             </w:r>
             <w:r>
               <w:rPr>
@@ -1204,7 +1204,7 @@
               <w14:ligatures w14:val="standardContextual"/>
             </w:rPr>
           </w:pPr>
-          <w:hyperlink w:anchor="_Toc228978192" w:history="1">
+          <w:hyperlink w:anchor="_Toc228979439" w:history="1">
             <w:r>
               <w:rPr>
                 <w:rStyle w:val="Hyperlink"/>
@@ -1231,7 +1231,7 @@
                 <w:noProof/>
                 <w:webHidden/>
               </w:rPr>
-              <w:instrText xml:space="preserve"> PAGEREF _Toc228978192 \h </w:instrText>
+              <w:instrText xml:space="preserve"> PAGEREF _Toc228979439 \h </w:instrText>
             </w:r>
             <w:r>
               <w:rPr>
@@ -1278,7 +1278,7 @@
               <w14:ligatures w14:val="standardContextual"/>
             </w:rPr>
           </w:pPr>
-          <w:hyperlink w:anchor="_Toc228978193" w:history="1">
+          <w:hyperlink w:anchor="_Toc228979440" w:history="1">
             <w:r>
               <w:rPr>
                 <w:rStyle w:val="Hyperlink"/>
@@ -1305,7 +1305,7 @@
                 <w:noProof/>
                 <w:webHidden/>
               </w:rPr>
-              <w:instrText xml:space="preserve"> PAGEREF _Toc228978193 \h </w:instrText>
+              <w:instrText xml:space="preserve"> PAGEREF _Toc228979440 \h </w:instrText>
             </w:r>
             <w:r>
               <w:rPr>
@@ -1352,7 +1352,7 @@
               <w14:ligatures w14:val="standardContextual"/>
             </w:rPr>
           </w:pPr>
-          <w:hyperlink w:anchor="_Toc228978194" w:history="1">
+          <w:hyperlink w:anchor="_Toc228979441" w:history="1">
             <w:r>
               <w:rPr>
                 <w:rStyle w:val="Hyperlink"/>
@@ -1379,7 +1379,7 @@
                 <w:noProof/>
                 <w:webHidden/>
               </w:rPr>
-              <w:instrText xml:space="preserve"> PAGEREF _Toc228978194 \h </w:instrText>
+              <w:instrText xml:space="preserve"> PAGEREF _Toc228979441 \h </w:instrText>
             </w:r>
             <w:r>
               <w:rPr>
@@ -1426,7 +1426,7 @@
               <w14:ligatures w14:val="standardContextual"/>
             </w:rPr>
           </w:pPr>
-          <w:hyperlink w:anchor="_Toc228978195" w:history="1">
+          <w:hyperlink w:anchor="_Toc228979442" w:history="1">
             <w:r>
               <w:rPr>
                 <w:rStyle w:val="Hyperlink"/>
@@ -1453,7 +1453,7 @@
                 <w:noProof/>
                 <w:webHidden/>
               </w:rPr>
-              <w:instrText xml:space="preserve"> PAGEREF _Toc228978195 \h </w:instrText>
+              <w:instrText xml:space="preserve"> PAGEREF _Toc228979442 \h </w:instrText>
             </w:r>
             <w:r>
               <w:rPr>
@@ -1500,7 +1500,7 @@
               <w14:ligatures w14:val="standardContextual"/>
             </w:rPr>
           </w:pPr>
-          <w:hyperlink w:anchor="_Toc228978196" w:history="1">
+          <w:hyperlink w:anchor="_Toc228979443" w:history="1">
             <w:r>
               <w:rPr>
                 <w:rStyle w:val="Hyperlink"/>
@@ -1527,7 +1527,7 @@
                 <w:noProof/>
                 <w:webHidden/>
               </w:rPr>
-              <w:instrText xml:space="preserve"> PAGEREF _Toc228978196 \h </w:instrText>
+              <w:instrText xml:space="preserve"> PAGEREF _Toc228979443 \h </w:instrText>
             </w:r>
             <w:r>
               <w:rPr>
@@ -1574,7 +1574,7 @@
               <w14:ligatures w14:val="standardContextual"/>
             </w:rPr>
           </w:pPr>
-          <w:hyperlink w:anchor="_Toc228978197" w:history="1">
+          <w:hyperlink w:anchor="_Toc228979444" w:history="1">
             <w:r>
               <w:rPr>
                 <w:rStyle w:val="Hyperlink"/>
@@ -1601,7 +1601,7 @@
                 <w:noProof/>
                 <w:webHidden/>
               </w:rPr>
-              <w:instrText xml:space="preserve"> PAGEREF _Toc228978197 \h </w:instrText>
+              <w:instrText xml:space="preserve"> PAGEREF _Toc228979444 \h </w:instrText>
             </w:r>
             <w:r>
               <w:rPr>
@@ -1648,7 +1648,7 @@
               <w14:ligatures w14:val="standardContextual"/>
             </w:rPr>
           </w:pPr>
-          <w:hyperlink w:anchor="_Toc228978198" w:history="1">
+          <w:hyperlink w:anchor="_Toc228979445" w:history="1">
             <w:r>
               <w:rPr>
                 <w:rStyle w:val="Hyperlink"/>
@@ -1675,7 +1675,7 @@
                 <w:noProof/>
                 <w:webHidden/>
               </w:rPr>
-              <w:instrText xml:space="preserve"> PAGEREF _Toc228978198 \h </w:instrText>
+              <w:instrText xml:space="preserve"> PAGEREF _Toc228979445 \h </w:instrText>
             </w:r>
             <w:r>
               <w:rPr>
@@ -1722,7 +1722,7 @@
               <w14:ligatures w14:val="standardContextual"/>
             </w:rPr>
           </w:pPr>
-          <w:hyperlink w:anchor="_Toc228978199" w:history="1">
+          <w:hyperlink w:anchor="_Toc228979446" w:history="1">
             <w:r>
               <w:rPr>
                 <w:rStyle w:val="Hyperlink"/>
@@ -1749,7 +1749,7 @@
                 <w:noProof/>
                 <w:webHidden/>
               </w:rPr>
-              <w:instrText xml:space="preserve"> PAGEREF _Toc228978199 \h </w:instrText>
+              <w:instrText xml:space="preserve"> PAGEREF _Toc228979446 \h </w:instrText>
             </w:r>
             <w:r>
               <w:rPr>
@@ -1796,7 +1796,7 @@
               <w14:ligatures w14:val="standardContextual"/>
             </w:rPr>
           </w:pPr>
-          <w:hyperlink w:anchor="_Toc228978200" w:history="1">
+          <w:hyperlink w:anchor="_Toc228979447" w:history="1">
             <w:r>
               <w:rPr>
                 <w:rStyle w:val="Hyperlink"/>
@@ -1823,7 +1823,7 @@
                 <w:noProof/>
                 <w:webHidden/>
               </w:rPr>
-              <w:instrText xml:space="preserve"> PAGEREF _Toc228978200 \h </w:instrText>
+              <w:instrText xml:space="preserve"> PAGEREF _Toc228979447 \h </w:instrText>
             </w:r>
             <w:r>
               <w:rPr>
@@ -1870,7 +1870,7 @@
               <w14:ligatures w14:val="standardContextual"/>
             </w:rPr>
           </w:pPr>
-          <w:hyperlink w:anchor="_Toc228978201" w:history="1">
+          <w:hyperlink w:anchor="_Toc228979448" w:history="1">
             <w:r>
               <w:rPr>
                 <w:rStyle w:val="Hyperlink"/>
@@ -1897,7 +1897,7 @@
                 <w:noProof/>
                 <w:webHidden/>
               </w:rPr>
-              <w:instrText xml:space="preserve"> PAGEREF _Toc228978201 \h </w:instrText>
+              <w:instrText xml:space="preserve"> PAGEREF _Toc228979448 \h </w:instrText>
             </w:r>
             <w:r>
               <w:rPr>
@@ -1917,7 +1917,7 @@
                 <w:noProof/>
                 <w:webHidden/>
               </w:rPr>
-              <w:t>5</w:t>
+              <w:t>4</w:t>
             </w:r>
             <w:r>
               <w:rPr>
@@ -1944,7 +1944,7 @@
               <w14:ligatures w14:val="standardContextual"/>
             </w:rPr>
           </w:pPr>
-          <w:hyperlink w:anchor="_Toc228978202" w:history="1">
+          <w:hyperlink w:anchor="_Toc228979449" w:history="1">
             <w:r>
               <w:rPr>
                 <w:rStyle w:val="Hyperlink"/>
@@ -1971,7 +1971,7 @@
                 <w:noProof/>
                 <w:webHidden/>
               </w:rPr>
-              <w:instrText xml:space="preserve"> PAGEREF _Toc228978202 \h </w:instrText>
+              <w:instrText xml:space="preserve"> PAGEREF _Toc228979449 \h </w:instrText>
             </w:r>
             <w:r>
               <w:rPr>
@@ -1991,7 +1991,7 @@
                 <w:noProof/>
                 <w:webHidden/>
               </w:rPr>
-              <w:t>5</w:t>
+              <w:t>4</w:t>
             </w:r>
             <w:r>
               <w:rPr>
@@ -2018,7 +2018,7 @@
               <w14:ligatures w14:val="standardContextual"/>
             </w:rPr>
           </w:pPr>
-          <w:hyperlink w:anchor="_Toc228978203" w:history="1">
+          <w:hyperlink w:anchor="_Toc228979450" w:history="1">
             <w:r>
               <w:rPr>
                 <w:rStyle w:val="Hyperlink"/>
@@ -2045,7 +2045,7 @@
                 <w:noProof/>
                 <w:webHidden/>
               </w:rPr>
-              <w:instrText xml:space="preserve"> PAGEREF _Toc228978203 \h </w:instrText>
+              <w:instrText xml:space="preserve"> PAGEREF _Toc228979450 \h </w:instrText>
             </w:r>
             <w:r>
               <w:rPr>
@@ -2065,7 +2065,7 @@
                 <w:noProof/>
                 <w:webHidden/>
               </w:rPr>
-              <w:t>5</w:t>
+              <w:t>4</w:t>
             </w:r>
             <w:r>
               <w:rPr>
@@ -2092,7 +2092,7 @@
               <w14:ligatures w14:val="standardContextual"/>
             </w:rPr>
           </w:pPr>
-          <w:hyperlink w:anchor="_Toc228978204" w:history="1">
+          <w:hyperlink w:anchor="_Toc228979451" w:history="1">
             <w:r>
               <w:rPr>
                 <w:rStyle w:val="Hyperlink"/>
@@ -2119,7 +2119,7 @@
                 <w:noProof/>
                 <w:webHidden/>
               </w:rPr>
-              <w:instrText xml:space="preserve"> PAGEREF _Toc228978204 \h </w:instrText>
+              <w:instrText xml:space="preserve"> PAGEREF _Toc228979451 \h </w:instrText>
             </w:r>
             <w:r>
               <w:rPr>
@@ -2139,7 +2139,7 @@
                 <w:noProof/>
                 <w:webHidden/>
               </w:rPr>
-              <w:t>5</w:t>
+              <w:t>4</w:t>
             </w:r>
             <w:r>
               <w:rPr>
@@ -2162,7 +2162,7 @@
               <w:lang w:eastAsia="en-GB"/>
             </w:rPr>
           </w:pPr>
-          <w:hyperlink w:anchor="_Toc228978205" w:history="1">
+          <w:hyperlink w:anchor="_Toc228979452" w:history="1">
             <w:r>
               <w:rPr>
                 <w:rStyle w:val="Hyperlink"/>
@@ -2189,7 +2189,7 @@
                 <w:noProof/>
                 <w:webHidden/>
               </w:rPr>
-              <w:instrText xml:space="preserve"> PAGEREF _Toc228978205 \h </w:instrText>
+              <w:instrText xml:space="preserve"> PAGEREF _Toc228979452 \h </w:instrText>
             </w:r>
             <w:r>
               <w:rPr>
@@ -2209,7 +2209,7 @@
                 <w:noProof/>
                 <w:webHidden/>
               </w:rPr>
-              <w:t>5</w:t>
+              <w:t>4</w:t>
             </w:r>
             <w:r>
               <w:rPr>
@@ -2232,7 +2232,7 @@
               <w:lang w:eastAsia="en-GB"/>
             </w:rPr>
           </w:pPr>
-          <w:hyperlink w:anchor="_Toc228978206" w:history="1">
+          <w:hyperlink w:anchor="_Toc228979453" w:history="1">
             <w:r>
               <w:rPr>
                 <w:rStyle w:val="Hyperlink"/>
@@ -2259,7 +2259,7 @@
                 <w:noProof/>
                 <w:webHidden/>
               </w:rPr>
-              <w:instrText xml:space="preserve"> PAGEREF _Toc228978206 \h </w:instrText>
+              <w:instrText xml:space="preserve"> PAGEREF _Toc228979453 \h </w:instrText>
             </w:r>
             <w:r>
               <w:rPr>
@@ -2279,7 +2279,7 @@
                 <w:noProof/>
                 <w:webHidden/>
               </w:rPr>
-              <w:t>6</w:t>
+              <w:t>5</w:t>
             </w:r>
             <w:r>
               <w:rPr>
@@ -2302,7 +2302,7 @@
               <w:lang w:eastAsia="en-GB"/>
             </w:rPr>
           </w:pPr>
-          <w:hyperlink w:anchor="_Toc228978207" w:history="1">
+          <w:hyperlink w:anchor="_Toc228979454" w:history="1">
             <w:r>
               <w:rPr>
                 <w:rStyle w:val="Hyperlink"/>
@@ -2329,7 +2329,7 @@
                 <w:noProof/>
                 <w:webHidden/>
               </w:rPr>
-              <w:instrText xml:space="preserve"> PAGEREF _Toc228978207 \h </w:instrText>
+              <w:instrText xml:space="preserve"> PAGEREF _Toc228979454 \h </w:instrText>
             </w:r>
             <w:r>
               <w:rPr>
@@ -2349,7 +2349,7 @@
                 <w:noProof/>
                 <w:webHidden/>
               </w:rPr>
-              <w:t>6</w:t>
+              <w:t>5</w:t>
             </w:r>
             <w:r>
               <w:rPr>
@@ -2376,7 +2376,7 @@
               <w14:ligatures w14:val="standardContextual"/>
             </w:rPr>
           </w:pPr>
-          <w:hyperlink w:anchor="_Toc228978208" w:history="1">
+          <w:hyperlink w:anchor="_Toc228979455" w:history="1">
             <w:r>
               <w:rPr>
                 <w:rStyle w:val="Hyperlink"/>
@@ -2403,7 +2403,7 @@
                 <w:noProof/>
                 <w:webHidden/>
               </w:rPr>
-              <w:instrText xml:space="preserve"> PAGEREF _Toc228978208 \h </w:instrText>
+              <w:instrText xml:space="preserve"> PAGEREF _Toc228979455 \h </w:instrText>
             </w:r>
             <w:r>
               <w:rPr>
@@ -2423,7 +2423,7 @@
                 <w:noProof/>
                 <w:webHidden/>
               </w:rPr>
-              <w:t>7</w:t>
+              <w:t>6</w:t>
             </w:r>
             <w:r>
               <w:rPr>
@@ -2446,7 +2446,7 @@
               <w:lang w:eastAsia="en-GB"/>
             </w:rPr>
           </w:pPr>
-          <w:hyperlink w:anchor="_Toc228978209" w:history="1">
+          <w:hyperlink w:anchor="_Toc228979456" w:history="1">
             <w:r>
               <w:rPr>
                 <w:rStyle w:val="Hyperlink"/>
@@ -2473,7 +2473,7 @@
                 <w:noProof/>
                 <w:webHidden/>
               </w:rPr>
-              <w:instrText xml:space="preserve"> PAGEREF _Toc228978209 \h </w:instrText>
+              <w:instrText xml:space="preserve"> PAGEREF _Toc228979456 \h </w:instrText>
             </w:r>
             <w:r>
               <w:rPr>
@@ -2493,7 +2493,7 @@
                 <w:noProof/>
                 <w:webHidden/>
               </w:rPr>
-              <w:t>7</w:t>
+              <w:t>6</w:t>
             </w:r>
             <w:r>
               <w:rPr>
@@ -2516,7 +2516,7 @@
               <w:lang w:eastAsia="en-GB"/>
             </w:rPr>
           </w:pPr>
-          <w:hyperlink w:anchor="_Toc228978210" w:history="1">
+          <w:hyperlink w:anchor="_Toc228979457" w:history="1">
             <w:r>
               <w:rPr>
                 <w:rStyle w:val="Hyperlink"/>
@@ -2543,7 +2543,7 @@
                 <w:noProof/>
                 <w:webHidden/>
               </w:rPr>
-              <w:instrText xml:space="preserve"> PAGEREF _Toc228978210 \h </w:instrText>
+              <w:instrText xml:space="preserve"> PAGEREF _Toc228979457 \h </w:instrText>
             </w:r>
             <w:r>
               <w:rPr>
@@ -2563,7 +2563,7 @@
                 <w:noProof/>
                 <w:webHidden/>
               </w:rPr>
-              <w:t>8</w:t>
+              <w:t>7</w:t>
             </w:r>
             <w:r>
               <w:rPr>
@@ -2586,7 +2586,7 @@
               <w:lang w:eastAsia="en-GB"/>
             </w:rPr>
           </w:pPr>
-          <w:hyperlink w:anchor="_Toc228978211" w:history="1">
+          <w:hyperlink w:anchor="_Toc228979458" w:history="1">
             <w:r>
               <w:rPr>
                 <w:rStyle w:val="Hyperlink"/>
@@ -2613,7 +2613,7 @@
                 <w:noProof/>
                 <w:webHidden/>
               </w:rPr>
-              <w:instrText xml:space="preserve"> PAGEREF _Toc228978211 \h </w:instrText>
+              <w:instrText xml:space="preserve"> PAGEREF _Toc228979458 \h </w:instrText>
             </w:r>
             <w:r>
               <w:rPr>
@@ -2633,7 +2633,7 @@
                 <w:noProof/>
                 <w:webHidden/>
               </w:rPr>
-              <w:t>8</w:t>
+              <w:t>7</w:t>
             </w:r>
             <w:r>
               <w:rPr>
@@ -2660,7 +2660,7 @@
               <w14:ligatures w14:val="standardContextual"/>
             </w:rPr>
           </w:pPr>
-          <w:hyperlink w:anchor="_Toc228978212" w:history="1">
+          <w:hyperlink w:anchor="_Toc228979459" w:history="1">
             <w:r>
               <w:rPr>
                 <w:rStyle w:val="Hyperlink"/>
@@ -2687,7 +2687,7 @@
                 <w:noProof/>
                 <w:webHidden/>
               </w:rPr>
-              <w:instrText xml:space="preserve"> PAGEREF _Toc228978212 \h </w:instrText>
+              <w:instrText xml:space="preserve"> PAGEREF _Toc228979459 \h </w:instrText>
             </w:r>
             <w:r>
               <w:rPr>
@@ -2707,7 +2707,7 @@
                 <w:noProof/>
                 <w:webHidden/>
               </w:rPr>
-              <w:t>8</w:t>
+              <w:t>7</w:t>
             </w:r>
             <w:r>
               <w:rPr>
@@ -2730,7 +2730,7 @@
               <w:lang w:eastAsia="en-GB"/>
             </w:rPr>
           </w:pPr>
-          <w:hyperlink w:anchor="_Toc228978213" w:history="1">
+          <w:hyperlink w:anchor="_Toc228979460" w:history="1">
             <w:r>
               <w:rPr>
                 <w:rStyle w:val="Hyperlink"/>
@@ -2757,7 +2757,7 @@
                 <w:noProof/>
                 <w:webHidden/>
               </w:rPr>
-              <w:instrText xml:space="preserve"> PAGEREF _Toc228978213 \h </w:instrText>
+              <w:instrText xml:space="preserve"> PAGEREF _Toc228979460 \h </w:instrText>
             </w:r>
             <w:r>
               <w:rPr>
@@ -2777,7 +2777,7 @@
                 <w:noProof/>
                 <w:webHidden/>
               </w:rPr>
-              <w:t>8</w:t>
+              <w:t>7</w:t>
             </w:r>
             <w:r>
               <w:rPr>
@@ -2800,7 +2800,7 @@
               <w:lang w:eastAsia="en-GB"/>
             </w:rPr>
           </w:pPr>
-          <w:hyperlink w:anchor="_Toc228978214" w:history="1">
+          <w:hyperlink w:anchor="_Toc228979461" w:history="1">
             <w:r>
               <w:rPr>
                 <w:rStyle w:val="Hyperlink"/>
@@ -2827,7 +2827,7 @@
                 <w:noProof/>
                 <w:webHidden/>
               </w:rPr>
-              <w:instrText xml:space="preserve"> PAGEREF _Toc228978214 \h </w:instrText>
+              <w:instrText xml:space="preserve"> PAGEREF _Toc228979461 \h </w:instrText>
             </w:r>
             <w:r>
               <w:rPr>
@@ -2847,7 +2847,7 @@
                 <w:noProof/>
                 <w:webHidden/>
               </w:rPr>
-              <w:t>9</w:t>
+              <w:t>8</w:t>
             </w:r>
             <w:r>
               <w:rPr>
@@ -2870,7 +2870,7 @@
               <w:lang w:eastAsia="en-GB"/>
             </w:rPr>
           </w:pPr>
-          <w:hyperlink w:anchor="_Toc228978215" w:history="1">
+          <w:hyperlink w:anchor="_Toc228979462" w:history="1">
             <w:r>
               <w:rPr>
                 <w:rStyle w:val="Hyperlink"/>
@@ -2897,7 +2897,7 @@
                 <w:noProof/>
                 <w:webHidden/>
               </w:rPr>
-              <w:instrText xml:space="preserve"> PAGEREF _Toc228978215 \h </w:instrText>
+              <w:instrText xml:space="preserve"> PAGEREF _Toc228979462 \h </w:instrText>
             </w:r>
             <w:r>
               <w:rPr>
@@ -2917,7 +2917,7 @@
                 <w:noProof/>
                 <w:webHidden/>
               </w:rPr>
-              <w:t>9</w:t>
+              <w:t>8</w:t>
             </w:r>
             <w:r>
               <w:rPr>
@@ -2944,7 +2944,7 @@
               <w14:ligatures w14:val="standardContextual"/>
             </w:rPr>
           </w:pPr>
-          <w:hyperlink w:anchor="_Toc228978216" w:history="1">
+          <w:hyperlink w:anchor="_Toc228979463" w:history="1">
             <w:r>
               <w:rPr>
                 <w:rStyle w:val="Hyperlink"/>
@@ -2971,7 +2971,7 @@
                 <w:noProof/>
                 <w:webHidden/>
               </w:rPr>
-              <w:instrText xml:space="preserve"> PAGEREF _Toc228978216 \h </w:instrText>
+              <w:instrText xml:space="preserve"> PAGEREF _Toc228979463 \h </w:instrText>
             </w:r>
             <w:r>
               <w:rPr>
@@ -2991,7 +2991,7 @@
                 <w:noProof/>
                 <w:webHidden/>
               </w:rPr>
-              <w:t>10</w:t>
+              <w:t>9</w:t>
             </w:r>
             <w:r>
               <w:rPr>
@@ -3018,7 +3018,7 @@
               <w14:ligatures w14:val="standardContextual"/>
             </w:rPr>
           </w:pPr>
-          <w:hyperlink w:anchor="_Toc228978217" w:history="1">
+          <w:hyperlink w:anchor="_Toc228979464" w:history="1">
             <w:r>
               <w:rPr>
                 <w:rStyle w:val="Hyperlink"/>
@@ -3045,7 +3045,7 @@
                 <w:noProof/>
                 <w:webHidden/>
               </w:rPr>
-              <w:instrText xml:space="preserve"> PAGEREF _Toc228978217 \h </w:instrText>
+              <w:instrText xml:space="preserve"> PAGEREF _Toc228979464 \h </w:instrText>
             </w:r>
             <w:r>
               <w:rPr>
@@ -3065,7 +3065,7 @@
                 <w:noProof/>
                 <w:webHidden/>
               </w:rPr>
-              <w:t>10</w:t>
+              <w:t>9</w:t>
             </w:r>
             <w:r>
               <w:rPr>
@@ -3092,7 +3092,7 @@
               <w14:ligatures w14:val="standardContextual"/>
             </w:rPr>
           </w:pPr>
-          <w:hyperlink w:anchor="_Toc228978218" w:history="1">
+          <w:hyperlink w:anchor="_Toc228979465" w:history="1">
             <w:r>
               <w:rPr>
                 <w:rStyle w:val="Hyperlink"/>
@@ -3119,7 +3119,7 @@
                 <w:noProof/>
                 <w:webHidden/>
               </w:rPr>
-              <w:instrText xml:space="preserve"> PAGEREF _Toc228978218 \h </w:instrText>
+              <w:instrText xml:space="preserve"> PAGEREF _Toc228979465 \h </w:instrText>
             </w:r>
             <w:r>
               <w:rPr>
@@ -3139,7 +3139,7 @@
                 <w:noProof/>
                 <w:webHidden/>
               </w:rPr>
-              <w:t>11</w:t>
+              <w:t>10</w:t>
             </w:r>
             <w:r>
               <w:rPr>
@@ -3166,7 +3166,7 @@
               <w14:ligatures w14:val="standardContextual"/>
             </w:rPr>
           </w:pPr>
-          <w:hyperlink w:anchor="_Toc228978219" w:history="1">
+          <w:hyperlink w:anchor="_Toc228979466" w:history="1">
             <w:r>
               <w:rPr>
                 <w:rStyle w:val="Hyperlink"/>
@@ -3193,7 +3193,7 @@
                 <w:noProof/>
                 <w:webHidden/>
               </w:rPr>
-              <w:instrText xml:space="preserve"> PAGEREF _Toc228978219 \h </w:instrText>
+              <w:instrText xml:space="preserve"> PAGEREF _Toc228979466 \h </w:instrText>
             </w:r>
             <w:r>
               <w:rPr>
@@ -3213,7 +3213,7 @@
                 <w:noProof/>
                 <w:webHidden/>
               </w:rPr>
-              <w:t>12</w:t>
+              <w:t>11</w:t>
             </w:r>
             <w:r>
               <w:rPr>
@@ -3240,7 +3240,7 @@
               <w14:ligatures w14:val="standardContextual"/>
             </w:rPr>
           </w:pPr>
-          <w:hyperlink w:anchor="_Toc228978220" w:history="1">
+          <w:hyperlink w:anchor="_Toc228979467" w:history="1">
             <w:r>
               <w:rPr>
                 <w:rStyle w:val="Hyperlink"/>
@@ -3267,7 +3267,7 @@
                 <w:noProof/>
                 <w:webHidden/>
               </w:rPr>
-              <w:instrText xml:space="preserve"> PAGEREF _Toc228978220 \h </w:instrText>
+              <w:instrText xml:space="preserve"> PAGEREF _Toc228979467 \h </w:instrText>
             </w:r>
             <w:r>
               <w:rPr>
@@ -3287,7 +3287,7 @@
                 <w:noProof/>
                 <w:webHidden/>
               </w:rPr>
-              <w:t>13</w:t>
+              <w:t>12</w:t>
             </w:r>
             <w:r>
               <w:rPr>
@@ -3314,7 +3314,7 @@
               <w14:ligatures w14:val="standardContextual"/>
             </w:rPr>
           </w:pPr>
-          <w:hyperlink w:anchor="_Toc228978221" w:history="1">
+          <w:hyperlink w:anchor="_Toc228979468" w:history="1">
             <w:r>
               <w:rPr>
                 <w:rStyle w:val="Hyperlink"/>
@@ -3341,7 +3341,7 @@
                 <w:noProof/>
                 <w:webHidden/>
               </w:rPr>
-              <w:instrText xml:space="preserve"> PAGEREF _Toc228978221 \h </w:instrText>
+              <w:instrText xml:space="preserve"> PAGEREF _Toc228979468 \h </w:instrText>
             </w:r>
             <w:r>
               <w:rPr>
@@ -3361,7 +3361,7 @@
                 <w:noProof/>
                 <w:webHidden/>
               </w:rPr>
-              <w:t>13</w:t>
+              <w:t>12</w:t>
             </w:r>
             <w:r>
               <w:rPr>
@@ -3388,7 +3388,7 @@
               <w14:ligatures w14:val="standardContextual"/>
             </w:rPr>
           </w:pPr>
-          <w:hyperlink w:anchor="_Toc228978222" w:history="1">
+          <w:hyperlink w:anchor="_Toc228979469" w:history="1">
             <w:r>
               <w:rPr>
                 <w:rStyle w:val="Hyperlink"/>
@@ -3415,7 +3415,7 @@
                 <w:noProof/>
                 <w:webHidden/>
               </w:rPr>
-              <w:instrText xml:space="preserve"> PAGEREF _Toc228978222 \h </w:instrText>
+              <w:instrText xml:space="preserve"> PAGEREF _Toc228979469 \h </w:instrText>
             </w:r>
             <w:r>
               <w:rPr>
@@ -3435,7 +3435,7 @@
                 <w:noProof/>
                 <w:webHidden/>
               </w:rPr>
-              <w:t>13</w:t>
+              <w:t>12</w:t>
             </w:r>
             <w:r>
               <w:rPr>
@@ -3462,7 +3462,7 @@
               <w14:ligatures w14:val="standardContextual"/>
             </w:rPr>
           </w:pPr>
-          <w:hyperlink w:anchor="_Toc228978223" w:history="1">
+          <w:hyperlink w:anchor="_Toc228979470" w:history="1">
             <w:r>
               <w:rPr>
                 <w:rStyle w:val="Hyperlink"/>
@@ -3489,7 +3489,7 @@
                 <w:noProof/>
                 <w:webHidden/>
               </w:rPr>
-              <w:instrText xml:space="preserve"> PAGEREF _Toc228978223 \h </w:instrText>
+              <w:instrText xml:space="preserve"> PAGEREF _Toc228979470 \h </w:instrText>
             </w:r>
             <w:r>
               <w:rPr>
@@ -3509,7 +3509,7 @@
                 <w:noProof/>
                 <w:webHidden/>
               </w:rPr>
-              <w:t>14</w:t>
+              <w:t>13</w:t>
             </w:r>
             <w:r>
               <w:rPr>
@@ -3536,7 +3536,7 @@
               <w14:ligatures w14:val="standardContextual"/>
             </w:rPr>
           </w:pPr>
-          <w:hyperlink w:anchor="_Toc228978224" w:history="1">
+          <w:hyperlink w:anchor="_Toc228979471" w:history="1">
             <w:r>
               <w:rPr>
                 <w:rStyle w:val="Hyperlink"/>
@@ -3563,7 +3563,7 @@
                 <w:noProof/>
                 <w:webHidden/>
               </w:rPr>
-              <w:instrText xml:space="preserve"> PAGEREF _Toc228978224 \h </w:instrText>
+              <w:instrText xml:space="preserve"> PAGEREF _Toc228979471 \h </w:instrText>
             </w:r>
             <w:r>
               <w:rPr>
@@ -3583,7 +3583,7 @@
                 <w:noProof/>
                 <w:webHidden/>
               </w:rPr>
-              <w:t>14</w:t>
+              <w:t>13</w:t>
             </w:r>
             <w:r>
               <w:rPr>
@@ -3610,7 +3610,7 @@
               <w14:ligatures w14:val="standardContextual"/>
             </w:rPr>
           </w:pPr>
-          <w:hyperlink w:anchor="_Toc228978225" w:history="1">
+          <w:hyperlink w:anchor="_Toc228979472" w:history="1">
             <w:r>
               <w:rPr>
                 <w:rStyle w:val="Hyperlink"/>
@@ -3637,7 +3637,7 @@
                 <w:noProof/>
                 <w:webHidden/>
               </w:rPr>
-              <w:instrText xml:space="preserve"> PAGEREF _Toc228978225 \h </w:instrText>
+              <w:instrText xml:space="preserve"> PAGEREF _Toc228979472 \h </w:instrText>
             </w:r>
             <w:r>
               <w:rPr>
@@ -3657,7 +3657,7 @@
                 <w:noProof/>
                 <w:webHidden/>
               </w:rPr>
-              <w:t>14</w:t>
+              <w:t>13</w:t>
             </w:r>
             <w:r>
               <w:rPr>
@@ -3684,7 +3684,7 @@
               <w14:ligatures w14:val="standardContextual"/>
             </w:rPr>
           </w:pPr>
-          <w:hyperlink w:anchor="_Toc228978226" w:history="1">
+          <w:hyperlink w:anchor="_Toc228979473" w:history="1">
             <w:r>
               <w:rPr>
                 <w:rStyle w:val="Hyperlink"/>
@@ -3711,7 +3711,81 @@
                 <w:noProof/>
                 <w:webHidden/>
               </w:rPr>
-              <w:instrText xml:space="preserve"> PAGEREF _Toc228978226 \h </w:instrText>
+              <w:instrText xml:space="preserve"> PAGEREF _Toc228979473 \h </w:instrText>
+            </w:r>
+            <w:r>
+              <w:rPr>
+                <w:noProof/>
+                <w:webHidden/>
+              </w:rPr>
+            </w:r>
+            <w:r>
+              <w:rPr>
+                <w:noProof/>
+                <w:webHidden/>
+              </w:rPr>
+              <w:fldChar w:fldCharType="separate"/>
+            </w:r>
+            <w:r>
+              <w:rPr>
+                <w:noProof/>
+                <w:webHidden/>
+              </w:rPr>
+              <w:t>14</w:t>
+            </w:r>
+            <w:r>
+              <w:rPr>
+                <w:noProof/>
+                <w:webHidden/>
+              </w:rPr>
+              <w:fldChar w:fldCharType="end"/>
+            </w:r>
+          </w:hyperlink>
+        </w:p>
+        <w:p>
+          <w:pPr>
+            <w:pStyle w:val="TOC2"/>
+            <w:tabs>
+              <w:tab w:val="right" w:leader="dot" w:pos="9016"/>
+            </w:tabs>
+            <w:rPr>
+              <w:rFonts w:asciiTheme="minorHAnsi" w:hAnsiTheme="minorHAnsi" w:cstheme="minorBidi"/>
+              <w:noProof/>
+              <w:kern w:val="2"/>
+              <w:sz w:val="24"/>
+              <w:szCs w:val="24"/>
+              <w:lang w:val="en-GB" w:eastAsia="en-GB"/>
+              <w14:ligatures w14:val="standardContextual"/>
+            </w:rPr>
+          </w:pPr>
+          <w:hyperlink w:anchor="_Toc228979474" w:history="1">
+            <w:r>
+              <w:rPr>
+                <w:rStyle w:val="Hyperlink"/>
+                <w:noProof/>
+              </w:rPr>
+              <w:t>3.3 AI Integrations</w:t>
+            </w:r>
+            <w:r>
+              <w:rPr>
+                <w:noProof/>
+                <w:webHidden/>
+              </w:rPr>
+              <w:tab/>
+            </w:r>
+            <w:r>
+              <w:rPr>
+                <w:noProof/>
+                <w:webHidden/>
+              </w:rPr>
+              <w:fldChar w:fldCharType="begin"/>
+            </w:r>
+            <w:r>
+              <w:rPr>
+                <w:noProof/>
+                <w:webHidden/>
+              </w:rPr>
+              <w:instrText xml:space="preserve"> PAGEREF _Toc228979474 \h </w:instrText>
             </w:r>
             <w:r>
               <w:rPr>
@@ -3758,7 +3832,7 @@
               <w14:ligatures w14:val="standardContextual"/>
             </w:rPr>
           </w:pPr>
-          <w:hyperlink w:anchor="_Toc228978227" w:history="1">
+          <w:hyperlink w:anchor="_Toc228979475" w:history="1">
             <w:r>
               <w:rPr>
                 <w:rStyle w:val="Hyperlink"/>
@@ -3785,7 +3859,7 @@
                 <w:noProof/>
                 <w:webHidden/>
               </w:rPr>
-              <w:instrText xml:space="preserve"> PAGEREF _Toc228978227 \h </w:instrText>
+              <w:instrText xml:space="preserve"> PAGEREF _Toc228979475 \h </w:instrText>
             </w:r>
             <w:r>
               <w:rPr>
@@ -3805,7 +3879,7 @@
                 <w:noProof/>
                 <w:webHidden/>
               </w:rPr>
-              <w:t>16</w:t>
+              <w:t>15</w:t>
             </w:r>
             <w:r>
               <w:rPr>
@@ -3842,7 +3916,7 @@
       <w:pPr>
         <w:pStyle w:val="Heading1"/>
       </w:pPr>
-      <w:bookmarkStart w:id="7" w:name="_Toc228978189"/>
+      <w:bookmarkStart w:id="7" w:name="_Toc228979436"/>
       <w:r>
         <w:t>Table of Figures</w:t>
       </w:r>
@@ -3931,7 +4005,7 @@
             <w:noProof/>
             <w:webHidden/>
           </w:rPr>
-          <w:t>6</w:t>
+          <w:t>5</w:t>
         </w:r>
         <w:r>
           <w:rPr>
@@ -4001,7 +4075,7 @@
             <w:noProof/>
             <w:webHidden/>
           </w:rPr>
-          <w:t>7</w:t>
+          <w:t>6</w:t>
         </w:r>
         <w:r>
           <w:rPr>
@@ -4071,7 +4145,7 @@
             <w:noProof/>
             <w:webHidden/>
           </w:rPr>
-          <w:t>9</w:t>
+          <w:t>8</w:t>
         </w:r>
         <w:r>
           <w:rPr>
@@ -4141,7 +4215,7 @@
             <w:noProof/>
             <w:webHidden/>
           </w:rPr>
-          <w:t>11</w:t>
+          <w:t>10</w:t>
         </w:r>
         <w:r>
           <w:rPr>
@@ -4211,7 +4285,7 @@
             <w:noProof/>
             <w:webHidden/>
           </w:rPr>
-          <w:t>11</w:t>
+          <w:t>10</w:t>
         </w:r>
         <w:r>
           <w:rPr>
@@ -4281,7 +4355,7 @@
             <w:noProof/>
             <w:webHidden/>
           </w:rPr>
-          <w:t>11</w:t>
+          <w:t>10</w:t>
         </w:r>
         <w:r>
           <w:rPr>
@@ -4351,7 +4425,7 @@
             <w:noProof/>
             <w:webHidden/>
           </w:rPr>
-          <w:t>12</w:t>
+          <w:t>11</w:t>
         </w:r>
         <w:r>
           <w:rPr>
@@ -4421,7 +4495,7 @@
             <w:noProof/>
             <w:webHidden/>
           </w:rPr>
-          <w:t>15</w:t>
+          <w:t>14</w:t>
         </w:r>
         <w:r>
           <w:rPr>
@@ -4470,7 +4544,7 @@
       <w:pPr>
         <w:pStyle w:val="Heading1"/>
       </w:pPr>
-      <w:bookmarkStart w:id="8" w:name="_Toc228978190"/>
+      <w:bookmarkStart w:id="8" w:name="_Toc228979437"/>
       <w:r>
         <w:t>Chapter 1</w:t>
       </w:r>
@@ -4498,7 +4572,7 @@
           <w:u w:val="single"/>
         </w:rPr>
       </w:pPr>
-      <w:bookmarkStart w:id="9" w:name="_Toc228978191"/>
+      <w:bookmarkStart w:id="9" w:name="_Toc228979438"/>
       <w:r>
         <w:t>1.1</w:t>
       </w:r>
@@ -4549,7 +4623,7 @@
       <w:pPr>
         <w:pStyle w:val="Heading2"/>
       </w:pPr>
-      <w:bookmarkStart w:id="10" w:name="_Toc228978192"/>
+      <w:bookmarkStart w:id="10" w:name="_Toc228979439"/>
       <w:r>
         <w:t>1.2 Aims</w:t>
       </w:r>
@@ -4565,7 +4639,7 @@
           <w:szCs w:val="28"/>
         </w:rPr>
       </w:pPr>
-      <w:bookmarkStart w:id="11" w:name="_Toc228978193"/>
+      <w:bookmarkStart w:id="11" w:name="_Toc228979440"/>
       <w:r>
         <w:rPr>
           <w:rStyle w:val="Heading2Char"/>
@@ -4610,7 +4684,7 @@
       <w:pPr>
         <w:pStyle w:val="Heading3"/>
       </w:pPr>
-      <w:bookmarkStart w:id="12" w:name="_Toc228978194"/>
+      <w:bookmarkStart w:id="12" w:name="_Toc228979441"/>
       <w:r>
         <w:lastRenderedPageBreak/>
         <w:t>1.2.2 Additional Aims</w:t>
@@ -4680,7 +4754,7 @@
       <w:pPr>
         <w:pStyle w:val="Heading2"/>
       </w:pPr>
-      <w:bookmarkStart w:id="13" w:name="_Toc228978195"/>
+      <w:bookmarkStart w:id="13" w:name="_Toc228979442"/>
       <w:r>
         <w:t>1.3 Objectives</w:t>
       </w:r>
@@ -4690,7 +4764,7 @@
       <w:pPr>
         <w:pStyle w:val="Heading3"/>
       </w:pPr>
-      <w:bookmarkStart w:id="14" w:name="_Toc228978196"/>
+      <w:bookmarkStart w:id="14" w:name="_Toc228979443"/>
       <w:r>
         <w:t>1.3.1 Scope</w:t>
       </w:r>
@@ -4761,7 +4835,7 @@
       <w:pPr>
         <w:pStyle w:val="Heading3"/>
       </w:pPr>
-      <w:bookmarkStart w:id="15" w:name="_Toc228978197"/>
+      <w:bookmarkStart w:id="15" w:name="_Toc228979444"/>
       <w:r>
         <w:t>1.3.2 Research Objectives</w:t>
       </w:r>
@@ -4794,20 +4868,14 @@
       <w:r>
         <w:br/>
       </w:r>
-      <w:r>
-        <w:br/>
-      </w:r>
+    </w:p>
+    <w:p>
+      <w:pPr>
+        <w:pStyle w:val="Heading3"/>
+      </w:pPr>
+      <w:bookmarkStart w:id="16" w:name="_Toc228979445"/>
       <w:r>
         <w:lastRenderedPageBreak/>
-        <w:t>Other areas of research that will be explored are core design principles for replayability and an interaction balance to not overwhelm the player with too many actions to make at any given time, as well as research into UI and UX design.</w:t>
-      </w:r>
-    </w:p>
-    <w:p>
-      <w:pPr>
-        <w:pStyle w:val="Heading3"/>
-      </w:pPr>
-      <w:bookmarkStart w:id="16" w:name="_Toc228978198"/>
-      <w:r>
         <w:t>1.3.3 Design Objectives</w:t>
       </w:r>
       <w:bookmarkEnd w:id="16"/>
@@ -4928,7 +4996,7 @@
       <w:pPr>
         <w:pStyle w:val="Heading3"/>
       </w:pPr>
-      <w:bookmarkStart w:id="17" w:name="_Toc228978199"/>
+      <w:bookmarkStart w:id="17" w:name="_Toc228979446"/>
       <w:r>
         <w:t>1.3.4 Implementation Objectives</w:t>
       </w:r>
@@ -5047,7 +5115,7 @@
       <w:pPr>
         <w:pStyle w:val="Heading3"/>
       </w:pPr>
-      <w:bookmarkStart w:id="18" w:name="_Toc228978200"/>
+      <w:bookmarkStart w:id="18" w:name="_Toc228979447"/>
       <w:r>
         <w:t>1.3.5 Results, Evaluation and Playtesting Objectives</w:t>
       </w:r>
@@ -5079,7 +5147,6 @@
         </w:numPr>
       </w:pPr>
       <w:r>
-        <w:lastRenderedPageBreak/>
         <w:t>Evaluate the final product</w:t>
       </w:r>
     </w:p>
@@ -5092,115 +5159,20 @@
         </w:numPr>
       </w:pPr>
       <w:r>
-        <w:t>Evaluate the initial aims and if they have been hit.</w:t>
-      </w:r>
-    </w:p>
-    <w:p>
-      <w:pPr>
-        <w:pStyle w:val="ListParagraph"/>
-      </w:pPr>
+        <w:t>Evaluate the initial aims and if they have been hit</w:t>
+      </w:r>
       <w:r>
         <w:br/>
       </w:r>
       <w:r>
         <w:br/>
       </w:r>
-      <w:r>
-        <w:br/>
-      </w:r>
-      <w:r>
-        <w:br/>
-      </w:r>
-      <w:r>
-        <w:br/>
-      </w:r>
-      <w:r>
-        <w:br/>
-      </w:r>
-      <w:r>
-        <w:br/>
-      </w:r>
-      <w:r>
-        <w:br/>
-      </w:r>
-      <w:r>
-        <w:br/>
-      </w:r>
-      <w:r>
-        <w:br/>
-      </w:r>
-      <w:r>
-        <w:br/>
-      </w:r>
-      <w:r>
-        <w:br/>
-      </w:r>
-      <w:r>
-        <w:br/>
-      </w:r>
-      <w:r>
-        <w:br/>
-      </w:r>
-      <w:r>
-        <w:br/>
-      </w:r>
-      <w:r>
-        <w:br/>
-      </w:r>
-      <w:r>
-        <w:br/>
-      </w:r>
-      <w:r>
-        <w:br/>
-      </w:r>
-      <w:r>
-        <w:br/>
-      </w:r>
-      <w:r>
-        <w:br/>
-      </w:r>
-      <w:r>
-        <w:br/>
-      </w:r>
-      <w:r>
-        <w:br/>
-      </w:r>
-      <w:r>
-        <w:br/>
-      </w:r>
-      <w:r>
-        <w:br/>
-      </w:r>
-      <w:r>
-        <w:br/>
-      </w:r>
-      <w:r>
-        <w:br/>
-      </w:r>
-      <w:r>
-        <w:br/>
-      </w:r>
-      <w:r>
-        <w:br/>
-      </w:r>
-      <w:r>
-        <w:br/>
-      </w:r>
-      <w:r>
-        <w:br/>
-      </w:r>
-      <w:r>
-        <w:br/>
-      </w:r>
-      <w:r>
-        <w:br/>
-      </w:r>
     </w:p>
     <w:p>
       <w:pPr>
         <w:pStyle w:val="Heading1"/>
       </w:pPr>
-      <w:bookmarkStart w:id="19" w:name="_Toc228978201"/>
+      <w:bookmarkStart w:id="19" w:name="_Toc228979448"/>
       <w:r>
         <w:lastRenderedPageBreak/>
         <w:t>Chapter 2 – Literature Survey</w:t>
@@ -5211,7 +5183,7 @@
       <w:pPr>
         <w:pStyle w:val="Heading2"/>
       </w:pPr>
-      <w:bookmarkStart w:id="20" w:name="_Toc228978202"/>
+      <w:bookmarkStart w:id="20" w:name="_Toc228979449"/>
       <w:r>
         <w:t>2.1 Literature Survey Introduction</w:t>
       </w:r>
@@ -5250,7 +5222,7 @@
       <w:pPr>
         <w:pStyle w:val="Heading2"/>
       </w:pPr>
-      <w:bookmarkStart w:id="21" w:name="_Toc228978203"/>
+      <w:bookmarkStart w:id="21" w:name="_Toc228979450"/>
       <w:r>
         <w:t>2.2 Comparative Research</w:t>
       </w:r>
@@ -5268,7 +5240,7 @@
       <w:pPr>
         <w:pStyle w:val="Heading3"/>
       </w:pPr>
-      <w:bookmarkStart w:id="22" w:name="_Toc228978204"/>
+      <w:bookmarkStart w:id="22" w:name="_Toc228979451"/>
       <w:r>
         <w:t xml:space="preserve">2.2.1 </w:t>
       </w:r>
@@ -5344,7 +5316,7 @@
       <w:pPr>
         <w:pStyle w:val="Heading4"/>
       </w:pPr>
-      <w:bookmarkStart w:id="23" w:name="_Toc228978205"/>
+      <w:bookmarkStart w:id="23" w:name="_Toc228979452"/>
       <w:r>
         <w:t>2.2.1.1 Perlin Noise</w:t>
       </w:r>
@@ -5727,7 +5699,7 @@
       <w:pPr>
         <w:pStyle w:val="Heading4"/>
       </w:pPr>
-      <w:bookmarkStart w:id="25" w:name="_Toc228978206"/>
+      <w:bookmarkStart w:id="25" w:name="_Toc228979453"/>
       <w:r>
         <w:t>2.2.1.2 Binary Space Partitioning</w:t>
       </w:r>
@@ -5779,7 +5751,7 @@
       <w:pPr>
         <w:pStyle w:val="Heading4"/>
       </w:pPr>
-      <w:bookmarkStart w:id="26" w:name="_Toc228978207"/>
+      <w:bookmarkStart w:id="26" w:name="_Toc228979454"/>
       <w:r>
         <w:t>2.2.1.3 Cellular Automata</w:t>
       </w:r>
@@ -5899,7 +5871,7 @@
       <w:pPr>
         <w:pStyle w:val="Heading3"/>
       </w:pPr>
-      <w:bookmarkStart w:id="27" w:name="_Toc228978208"/>
+      <w:bookmarkStart w:id="27" w:name="_Toc228979455"/>
       <w:r>
         <w:t>2.2.2 Pathfinding</w:t>
       </w:r>
@@ -5962,7 +5934,7 @@
       <w:pPr>
         <w:pStyle w:val="Heading4"/>
       </w:pPr>
-      <w:bookmarkStart w:id="28" w:name="_Toc228978209"/>
+      <w:bookmarkStart w:id="28" w:name="_Toc228979456"/>
       <w:r>
         <w:t>2.2.2.1 Dijkstra</w:t>
       </w:r>
@@ -6135,7 +6107,7 @@
       <w:pPr>
         <w:pStyle w:val="Heading4"/>
       </w:pPr>
-      <w:bookmarkStart w:id="30" w:name="_Toc228978210"/>
+      <w:bookmarkStart w:id="30" w:name="_Toc228979457"/>
       <w:r>
         <w:t>2.2.2.2 A*</w:t>
       </w:r>
@@ -6200,7 +6172,7 @@
       <w:pPr>
         <w:pStyle w:val="Heading4"/>
       </w:pPr>
-      <w:bookmarkStart w:id="31" w:name="_Toc228978211"/>
+      <w:bookmarkStart w:id="31" w:name="_Toc228979458"/>
       <w:r>
         <w:t>2.2.2.3 Jump Point Search</w:t>
       </w:r>
@@ -6250,7 +6222,7 @@
       <w:pPr>
         <w:pStyle w:val="Heading3"/>
       </w:pPr>
-      <w:bookmarkStart w:id="32" w:name="_Toc228978212"/>
+      <w:bookmarkStart w:id="32" w:name="_Toc228979459"/>
       <w:r>
         <w:t>2.2.3 AI Integrations</w:t>
       </w:r>
@@ -6275,7 +6247,7 @@
       <w:pPr>
         <w:pStyle w:val="Heading4"/>
       </w:pPr>
-      <w:bookmarkStart w:id="33" w:name="_Toc228978213"/>
+      <w:bookmarkStart w:id="33" w:name="_Toc228979460"/>
       <w:r>
         <w:t>2.2.3.1 Neural Network</w:t>
       </w:r>
@@ -6342,7 +6314,7 @@
       <w:pPr>
         <w:pStyle w:val="Heading4"/>
       </w:pPr>
-      <w:bookmarkStart w:id="34" w:name="_Toc228978214"/>
+      <w:bookmarkStart w:id="34" w:name="_Toc228979461"/>
       <w:r>
         <w:t>2.2.3.2 Reinforcement Learning</w:t>
       </w:r>
@@ -6542,7 +6514,7 @@
       <w:pPr>
         <w:pStyle w:val="Heading4"/>
       </w:pPr>
-      <w:bookmarkStart w:id="36" w:name="_Toc228978215"/>
+      <w:bookmarkStart w:id="36" w:name="_Toc228979462"/>
       <w:r>
         <w:t>2.2.3.3 Imitation Learning</w:t>
       </w:r>
@@ -6675,7 +6647,7 @@
       <w:pPr>
         <w:pStyle w:val="Heading1"/>
       </w:pPr>
-      <w:bookmarkStart w:id="37" w:name="_Toc228978216"/>
+      <w:bookmarkStart w:id="37" w:name="_Toc228979463"/>
       <w:r>
         <w:t>Chapter 3 – Design</w:t>
       </w:r>
@@ -6702,7 +6674,7 @@
       <w:pPr>
         <w:pStyle w:val="Heading2"/>
       </w:pPr>
-      <w:bookmarkStart w:id="38" w:name="_Toc228978217"/>
+      <w:bookmarkStart w:id="38" w:name="_Toc228979464"/>
       <w:r>
         <w:t xml:space="preserve">3.1 </w:t>
       </w:r>
@@ -6753,7 +6725,7 @@
       <w:pPr>
         <w:pStyle w:val="Heading3"/>
       </w:pPr>
-      <w:bookmarkStart w:id="39" w:name="_Toc228978218"/>
+      <w:bookmarkStart w:id="39" w:name="_Toc228979465"/>
       <w:r>
         <w:lastRenderedPageBreak/>
         <w:t xml:space="preserve">3.1.1 </w:t>
@@ -7117,7 +7089,7 @@
       <w:pPr>
         <w:pStyle w:val="Heading3"/>
       </w:pPr>
-      <w:bookmarkStart w:id="43" w:name="_Toc228978219"/>
+      <w:bookmarkStart w:id="43" w:name="_Toc228979466"/>
       <w:r>
         <w:t>3.1.2 Biomes</w:t>
       </w:r>
@@ -7381,7 +7353,7 @@
       <w:pPr>
         <w:pStyle w:val="Heading3"/>
       </w:pPr>
-      <w:bookmarkStart w:id="45" w:name="_Toc228978220"/>
+      <w:bookmarkStart w:id="45" w:name="_Toc228979467"/>
       <w:r>
         <w:t>3.1.3 Resource Distribution</w:t>
       </w:r>
@@ -7411,7 +7383,7 @@
       <w:pPr>
         <w:pStyle w:val="Heading3"/>
       </w:pPr>
-      <w:bookmarkStart w:id="46" w:name="_Toc228978221"/>
+      <w:bookmarkStart w:id="46" w:name="_Toc228979468"/>
       <w:r>
         <w:t>3.1.4 River generation</w:t>
       </w:r>
@@ -7453,7 +7425,7 @@
       <w:pPr>
         <w:pStyle w:val="Heading3"/>
       </w:pPr>
-      <w:bookmarkStart w:id="47" w:name="_Toc228978222"/>
+      <w:bookmarkStart w:id="47" w:name="_Toc228979469"/>
       <w:r>
         <w:t>3.1.</w:t>
       </w:r>
@@ -7562,7 +7534,7 @@
       <w:pPr>
         <w:pStyle w:val="Heading2"/>
       </w:pPr>
-      <w:bookmarkStart w:id="48" w:name="_Toc228978223"/>
+      <w:bookmarkStart w:id="48" w:name="_Toc228979470"/>
       <w:r>
         <w:t>3.2 Pathfinding</w:t>
       </w:r>
@@ -7580,7 +7552,7 @@
       <w:pPr>
         <w:pStyle w:val="Heading3"/>
       </w:pPr>
-      <w:bookmarkStart w:id="49" w:name="_Toc228978224"/>
+      <w:bookmarkStart w:id="49" w:name="_Toc228979471"/>
       <w:r>
         <w:t xml:space="preserve">3.2.1 </w:t>
       </w:r>
@@ -7624,7 +7596,7 @@
       <w:pPr>
         <w:pStyle w:val="Heading3"/>
       </w:pPr>
-      <w:bookmarkStart w:id="50" w:name="_Toc228978225"/>
+      <w:bookmarkStart w:id="50" w:name="_Toc228979472"/>
       <w:r>
         <w:t>3.2.2 Heuristics</w:t>
       </w:r>
@@ -7836,7 +7808,7 @@
       <w:pPr>
         <w:pStyle w:val="Heading3"/>
       </w:pPr>
-      <w:bookmarkStart w:id="52" w:name="_Toc228978226"/>
+      <w:bookmarkStart w:id="52" w:name="_Toc228979473"/>
       <w:r>
         <w:t>3.2.3 Limitations</w:t>
       </w:r>
@@ -7880,7 +7852,34 @@
         <w:t xml:space="preserve"> benefits outlined above.</w:t>
       </w:r>
     </w:p>
-    <w:bookmarkStart w:id="53" w:name="_Toc228978227" w:displacedByCustomXml="next"/>
+    <w:p>
+      <w:pPr>
+        <w:pStyle w:val="Heading2"/>
+      </w:pPr>
+      <w:bookmarkStart w:id="53" w:name="_Toc228979474"/>
+      <w:r>
+        <w:t>3.3 AI Integrations</w:t>
+      </w:r>
+      <w:bookmarkEnd w:id="53"/>
+    </w:p>
+    <w:p>
+      <w:r>
+        <w:t xml:space="preserve">After the research into different AI integrations, I conclude that the best method for this project is to use Reinforcement Learning for AI. </w:t>
+      </w:r>
+      <w:r>
+        <w:t xml:space="preserve">I came to this conclusion through the evaluation of Neural Networks, Reinforcement Learning and Imitation Learning. While Neural Networks </w:t>
+      </w:r>
+      <w:r>
+        <w:t xml:space="preserve">and Imitation Learning </w:t>
+      </w:r>
+      <w:r>
+        <w:t xml:space="preserve">may be a better overall </w:t>
+      </w:r>
+      <w:r>
+        <w:t>for an AI opponent, I have chosen Reinforcement Learning as a middle ground between training time, training input data and ease of implementation.</w:t>
+      </w:r>
+    </w:p>
+    <w:bookmarkStart w:id="54" w:name="_Toc228979475" w:displacedByCustomXml="next"/>
     <w:sdt>
       <w:sdtPr>
         <w:rPr>
@@ -7908,7 +7907,7 @@
           <w:r>
             <w:t>References</w:t>
           </w:r>
-          <w:bookmarkEnd w:id="53"/>
+          <w:bookmarkEnd w:id="54"/>
         </w:p>
         <w:sdt>
           <w:sdtPr>
@@ -8302,7 +8301,15 @@
                   <w:noProof/>
                   <w:u w:val="single"/>
                 </w:rPr>
-                <w:t>https://medium.com/@yvanscher/playing-with-perlin-noise-generating-realistic-archipelagos-b59f004d8401</w:t>
+                <w:t>https://medium.com/@yvanscher/playing-with-perlin-noise-generating-</w:t>
+              </w:r>
+              <w:r>
+                <w:rPr>
+                  <w:noProof/>
+                  <w:u w:val="single"/>
+                </w:rPr>
+                <w:lastRenderedPageBreak/>
+                <w:t>realistic-archipelagos-b59f004d8401</w:t>
               </w:r>
               <w:r>
                 <w:rPr>
@@ -8400,7 +8407,6 @@
                 <w:rPr>
                   <w:noProof/>
                 </w:rPr>
-                <w:lastRenderedPageBreak/>
                 <w:t xml:space="preserve">Yang, Z., Li, J., Yang, L. &amp; Chen, H., 2022. </w:t>
               </w:r>
               <w:r>

</xml_diff>

<commit_message>
feat: ML-Agents design written
</commit_message>
<xml_diff>
--- a/Report.docx
+++ b/Report.docx
@@ -331,15 +331,7 @@
     </w:p>
     <w:p>
       <w:r>
-        <w:t xml:space="preserve">AI is a still growing industry and while the current trend of AI is heading towards the usage of Large Language Models, I believe there is a genuine use case for machine learning models within video games. The focus of this project is to uncover the current reasons behind why the industry doesn’t use machine learning AI for uses such as </w:t>
-      </w:r>
-      <w:proofErr w:type="gramStart"/>
-      <w:r>
-        <w:t>Non-Player Characters</w:t>
-      </w:r>
-      <w:proofErr w:type="gramEnd"/>
-      <w:r>
-        <w:t xml:space="preserve"> or local multiplayer games. This is appro</w:t>
+        <w:t>AI is a still growing industry and while the current trend of AI is heading towards the usage of Large Language Models, I believe there is a genuine use case for machine learning models within video games. The focus of this project is to uncover the current reasons behind why the industry doesn’t use machine learning AI for uses such as Non-Player Characters or local multiplayer games. This is appro</w:t>
       </w:r>
       <w:r>
         <w:t>ached by covering the design choices and code architecture of implementing a machine learning model into the Unity game engine. To evaluate whether the AI is functional, data has been gathered using a mix of qualitative and quantitative research. This research was collected through a short survey given to participants.</w:t>
@@ -4772,15 +4764,7 @@
     </w:p>
     <w:p>
       <w:r>
-        <w:t xml:space="preserve">The objectives in terms of scope for this project are going to be generally quite broad and consist of specific milestones. The core objectives </w:t>
-      </w:r>
-      <w:proofErr w:type="gramStart"/>
-      <w:r>
-        <w:t>in regards to</w:t>
-      </w:r>
-      <w:proofErr w:type="gramEnd"/>
-      <w:r>
-        <w:t xml:space="preserve"> the scope are:</w:t>
+        <w:t>The objectives in terms of scope for this project are going to be generally quite broad and consist of specific milestones. The core objectives in regards to the scope are:</w:t>
       </w:r>
     </w:p>
     <w:p>
@@ -4843,15 +4827,7 @@
     </w:p>
     <w:p>
       <w:r>
-        <w:t xml:space="preserve">For the research objectives for the game, research will be conducted into other types of media with similar features. This research will include a comparison of similar games and their features and the overall impact of those features on this project. This will be done to find a balance for the difficulty of the game and to evaluate the necessary features for the game. Some topics of features and mechanics that will be researched </w:t>
-      </w:r>
-      <w:proofErr w:type="gramStart"/>
-      <w:r>
-        <w:t>include:</w:t>
-      </w:r>
-      <w:proofErr w:type="gramEnd"/>
-      <w:r>
-        <w:t xml:space="preserve"> World Generation, Pathfinding</w:t>
+        <w:t>For the research objectives for the game, research will be conducted into other types of media with similar features. This research will include a comparison of similar games and their features and the overall impact of those features on this project. This will be done to find a balance for the difficulty of the game and to evaluate the necessary features for the game. Some topics of features and mechanics that will be researched include: World Generation, Pathfinding</w:t>
       </w:r>
       <w:r>
         <w:t xml:space="preserve"> and </w:t>
@@ -5813,15 +5789,7 @@
         <w:t>)</w:t>
       </w:r>
       <w:r>
-        <w:t xml:space="preserve"> according to the following two rules: If a cell is alive, it survives to the next generation if it has 2 or 3 live neighbors; otherwise it dies. If a cell is dead, it comes to life in the next generation if it has exactly 3 live neighbors; </w:t>
-      </w:r>
-      <w:proofErr w:type="gramStart"/>
-      <w:r>
-        <w:t>otherwise</w:t>
-      </w:r>
-      <w:proofErr w:type="gramEnd"/>
-      <w:r>
-        <w:t xml:space="preserve"> it stays dead.” </w:t>
+        <w:t xml:space="preserve"> according to the following two rules: If a cell is alive, it survives to the next generation if it has 2 or 3 live neighbors; otherwise it dies. If a cell is dead, it comes to life in the next generation if it has exactly 3 live neighbors; otherwise it stays dead.” </w:t>
       </w:r>
       <w:sdt>
         <w:sdtPr>
@@ -5907,15 +5875,7 @@
         <w:t xml:space="preserve"> </w:t>
       </w:r>
       <w:r>
-        <w:t xml:space="preserve">The types of pathfinding I will be evaluating </w:t>
-      </w:r>
-      <w:proofErr w:type="gramStart"/>
-      <w:r>
-        <w:t>are:</w:t>
-      </w:r>
-      <w:proofErr w:type="gramEnd"/>
-      <w:r>
-        <w:t xml:space="preserve"> A*, Dijkstra</w:t>
+        <w:t>The types of pathfinding I will be evaluating are: A*, Dijkstra</w:t>
       </w:r>
       <w:r>
         <w:t>,</w:t>
@@ -6270,15 +6230,7 @@
     </w:p>
     <w:p>
       <w:r>
-        <w:t xml:space="preserve">After the initial training phase, if we present the network with a </w:t>
-      </w:r>
-      <w:proofErr w:type="gramStart"/>
-      <w:r>
-        <w:t>pattern</w:t>
-      </w:r>
-      <w:proofErr w:type="gramEnd"/>
-      <w:r>
-        <w:t xml:space="preserve"> it hasn’t seen before in its training data, it should classify the unseen pattern correctly, only if it has learnt the underlying structure of the problem </w:t>
+        <w:t xml:space="preserve">After the initial training phase, if we present the network with a pattern it hasn’t seen before in its training data, it should classify the unseen pattern correctly, only if it has learnt the underlying structure of the problem </w:t>
       </w:r>
       <w:sdt>
         <w:sdtPr>
@@ -7311,15 +7263,7 @@
         <w:t xml:space="preserve"> a pixel is, can become the boundaries for biomes. In this example, there are only 3 biomes: ocean, beach, and grass</w:t>
       </w:r>
       <w:r>
-        <w:t xml:space="preserve">. The </w:t>
-      </w:r>
-      <w:proofErr w:type="gramStart"/>
-      <w:r>
-        <w:t>amount</w:t>
-      </w:r>
-      <w:proofErr w:type="gramEnd"/>
-      <w:r>
-        <w:t xml:space="preserve"> of biomes possible are technically infinite. Although biome separation will be very prevalent as you go past roughly 10 biomes. </w:t>
+        <w:t xml:space="preserve">. The amount of biomes possible are technically infinite. Although biome separation will be very prevalent as you go past roughly 10 biomes. </w:t>
       </w:r>
     </w:p>
     <w:p/>
@@ -7328,15 +7272,7 @@
         <w:t xml:space="preserve">For my game, I am choosing to have 5 true biomes: Deep water, shallow water, sand, grass and snow. Each of these biomes are going to be abundant in different resources and </w:t>
       </w:r>
       <w:r>
-        <w:t xml:space="preserve">have very different base tile variables. For example, grassland tiles will contain more production than a sand </w:t>
-      </w:r>
-      <w:proofErr w:type="gramStart"/>
-      <w:r>
-        <w:t>tile</w:t>
-      </w:r>
-      <w:proofErr w:type="gramEnd"/>
-      <w:r>
-        <w:t xml:space="preserve"> but a sand tile will have more gold than a grassland tile</w:t>
+        <w:t>have very different base tile variables. For example, grassland tiles will contain more production than a sand tile but a sand tile will have more gold than a grassland tile</w:t>
       </w:r>
       <w:r>
         <w:t>.</w:t>
@@ -7575,15 +7511,7 @@
     <w:p/>
     <w:p>
       <w:r>
-        <w:t xml:space="preserve">The alternative method is to use references on all </w:t>
-      </w:r>
-      <w:proofErr w:type="gramStart"/>
-      <w:r>
-        <w:t>units,</w:t>
-      </w:r>
-      <w:proofErr w:type="gramEnd"/>
-      <w:r>
-        <w:t xml:space="preserve"> this is better for testing and easier to manage multiple instances of. The cons to this method are that, in Unity, getting references is quite expensive and the pathfinding will be a MonoBehaviour class meaning that the use of Unity’s GetComponent will be mandatory.</w:t>
+        <w:t>The alternative method is to use references on all units, this is better for testing and easier to manage multiple instances of. The cons to this method are that, in Unity, getting references is quite expensive and the pathfinding will be a MonoBehaviour class meaning that the use of Unity’s GetComponent will be mandatory.</w:t>
       </w:r>
     </w:p>
     <w:p>
@@ -7787,15 +7715,7 @@
         <w:t xml:space="preserve">Euclidean Distance </w:t>
       </w:r>
       <w:r>
-        <w:t xml:space="preserve">is a direct measurement from point A to point B. As shown in figure 8, from the origin, the provided line can be traced to its destination. Inserting all grid tiles that are highlighted into a list, a path can be formed from the origin to the destination. This is almost a perfect solution to this project’s requirements due to the ease of </w:t>
-      </w:r>
-      <w:proofErr w:type="gramStart"/>
-      <w:r>
-        <w:t>implementation</w:t>
-      </w:r>
-      <w:proofErr w:type="gramEnd"/>
-      <w:r>
-        <w:t xml:space="preserve"> and it </w:t>
+        <w:t xml:space="preserve">is a direct measurement from point A to point B. As shown in figure 8, from the origin, the provided line can be traced to its destination. Inserting all grid tiles that are highlighted into a list, a path can be formed from the origin to the destination. This is almost a perfect solution to this project’s requirements due to the ease of implementation and it </w:t>
       </w:r>
       <w:r>
         <w:t>takes</w:t>
@@ -7825,15 +7745,7 @@
         <w:t xml:space="preserve">Another limitation of </w:t>
       </w:r>
       <w:r>
-        <w:t xml:space="preserve">pathfinding is that Euclidean heuristics are quite expensive to compute. This is due to a large </w:t>
-      </w:r>
-      <w:proofErr w:type="gramStart"/>
-      <w:r>
-        <w:t>amount</w:t>
-      </w:r>
-      <w:proofErr w:type="gramEnd"/>
-      <w:r>
-        <w:t xml:space="preserve"> of </w:t>
+        <w:t xml:space="preserve">pathfinding is that Euclidean heuristics are quite expensive to compute. This is due to a large amount of </w:t>
       </w:r>
       <w:r>
         <w:t>floating-point</w:t>
@@ -7877,6 +7789,75 @@
       </w:r>
       <w:r>
         <w:t>for an AI opponent, I have chosen Reinforcement Learning as a middle ground between training time, training input data and ease of implementation.</w:t>
+      </w:r>
+    </w:p>
+    <w:p>
+      <w:pPr>
+        <w:pStyle w:val="Heading3"/>
+      </w:pPr>
+      <w:r>
+        <w:t>3.3.1 Unity ML-Agents</w:t>
+      </w:r>
+    </w:p>
+    <w:p>
+      <w:r>
+        <w:t xml:space="preserve">The ML-Agents package from Unity is an “open-source toolkit that enables develops to create environments where AI agents can learn complex behaviours through reinforcement learning techniques” </w:t>
+      </w:r>
+      <w:sdt>
+        <w:sdtPr>
+          <w:id w:val="1755713099"/>
+          <w:citation/>
+        </w:sdtPr>
+        <w:sdtContent>
+          <w:r>
+            <w:fldChar w:fldCharType="begin"/>
+          </w:r>
+          <w:r>
+            <w:instrText xml:space="preserve"> CITATION Uni20 \l 2057 </w:instrText>
+          </w:r>
+          <w:r>
+            <w:fldChar w:fldCharType="separate"/>
+          </w:r>
+          <w:r>
+            <w:rPr>
+              <w:noProof/>
+            </w:rPr>
+            <w:t>(Unity, 2020)</w:t>
+          </w:r>
+          <w:r>
+            <w:fldChar w:fldCharType="end"/>
+          </w:r>
+        </w:sdtContent>
+      </w:sdt>
+      <w:r>
+        <w:t xml:space="preserve">. ML-Agents is a framework that allows a Python API to communicate with the Unity game engine, allowing developers to train agents using reinforcement learning algorithms. </w:t>
+      </w:r>
+    </w:p>
+    <w:p/>
+    <w:p>
+      <w:r>
+        <w:t>The training works through adding sensor observations to actions and providing a reward to each action taken. This reward is not necessarily normalized but for the sake of this project should be treated as such. A series win will be treated as a +1</w:t>
+      </w:r>
+      <w:r>
+        <w:t>0 and a series loss will be treated as a -10</w:t>
+      </w:r>
+      <w:r>
+        <w:t xml:space="preserve"> to the sensor observation with actions such as </w:t>
+      </w:r>
+      <w:r>
+        <w:t>destroying units</w:t>
+      </w:r>
+      <w:r>
+        <w:t xml:space="preserve"> be worth +</w:t>
+      </w:r>
+      <w:r>
+        <w:t>1 and losing its own unit will be -0.5</w:t>
+      </w:r>
+      <w:r>
+        <w:t>.</w:t>
+      </w:r>
+      <w:r>
+        <w:t xml:space="preserve"> Rewards will also be distributed to the AI for taking actions like movement or even choosing to do an action. These rewards will be miniscule and exist solely to dissuade the AI from doing nothing later in the game. Other rewards such as a reward of -0.15 for not having any cities will be used to deter the AI from stalling at the beginning of the game.</w:t>
       </w:r>
     </w:p>
     <w:bookmarkStart w:id="54" w:name="_Toc228979475" w:displacedByCustomXml="next"/>
@@ -8042,6 +8023,7 @@
                 <w:rPr>
                   <w:noProof/>
                 </w:rPr>
+                <w:lastRenderedPageBreak/>
                 <w:t xml:space="preserve">IQ, O., 2018. </w:t>
               </w:r>
               <w:r>
@@ -8301,15 +8283,7 @@
                   <w:noProof/>
                   <w:u w:val="single"/>
                 </w:rPr>
-                <w:t>https://medium.com/@yvanscher/playing-with-perlin-noise-generating-</w:t>
-              </w:r>
-              <w:r>
-                <w:rPr>
-                  <w:noProof/>
-                  <w:u w:val="single"/>
-                </w:rPr>
-                <w:lastRenderedPageBreak/>
-                <w:t>realistic-archipelagos-b59f004d8401</w:t>
+                <w:t>https://medium.com/@yvanscher/playing-with-perlin-noise-generating-realistic-archipelagos-b59f004d8401</w:t>
               </w:r>
               <w:r>
                 <w:rPr>
@@ -8317,6 +8291,55 @@
                 </w:rPr>
                 <w:br/>
                 <w:t>[Accessed 18 04 2026].</w:t>
+              </w:r>
+            </w:p>
+            <w:p>
+              <w:pPr>
+                <w:pStyle w:val="Bibliography"/>
+                <w:rPr>
+                  <w:noProof/>
+                </w:rPr>
+              </w:pPr>
+              <w:r>
+                <w:rPr>
+                  <w:noProof/>
+                </w:rPr>
+                <w:t xml:space="preserve">Unity, 2020. </w:t>
+              </w:r>
+              <w:r>
+                <w:rPr>
+                  <w:i/>
+                  <w:iCs/>
+                  <w:noProof/>
+                </w:rPr>
+                <w:t xml:space="preserve">What are ML-Agents. </w:t>
+              </w:r>
+              <w:r>
+                <w:rPr>
+                  <w:noProof/>
+                </w:rPr>
+                <w:t xml:space="preserve">[Online] </w:t>
+              </w:r>
+              <w:r>
+                <w:rPr>
+                  <w:noProof/>
+                </w:rPr>
+                <w:br/>
+                <w:t xml:space="preserve">Available at: </w:t>
+              </w:r>
+              <w:r>
+                <w:rPr>
+                  <w:noProof/>
+                  <w:u w:val="single"/>
+                </w:rPr>
+                <w:t>https://unity.com/glossary/ml-agents</w:t>
+              </w:r>
+              <w:r>
+                <w:rPr>
+                  <w:noProof/>
+                </w:rPr>
+                <w:br/>
+                <w:t>[Accessed 06 05 2025].</w:t>
               </w:r>
             </w:p>
             <w:p>
@@ -11183,7 +11206,7 @@
       </b:Author>
     </b:Author>
     <b:Month>05</b:Month>
-    <b:RefOrder>13</b:RefOrder>
+    <b:RefOrder>14</b:RefOrder>
   </b:Source>
   <b:Source>
     <b:Tag>Gos25</b:Tag>
@@ -11245,11 +11268,32 @@
     <b:URL>https://iq.opengenus.org/euclidean-vs-manhattan-vs-chebyshev-distance/</b:URL>
     <b:RefOrder>12</b:RefOrder>
   </b:Source>
+  <b:Source>
+    <b:Tag>Uni20</b:Tag>
+    <b:SourceType>InternetSite</b:SourceType>
+    <b:Guid>{9C77ADB2-BF14-4021-8486-19591B0211B7}</b:Guid>
+    <b:Author>
+      <b:Author>
+        <b:NameList>
+          <b:Person>
+            <b:Last>Unity</b:Last>
+          </b:Person>
+        </b:NameList>
+      </b:Author>
+    </b:Author>
+    <b:Title>What are ML-Agents</b:Title>
+    <b:Year>2020</b:Year>
+    <b:YearAccessed>2025</b:YearAccessed>
+    <b:MonthAccessed>05</b:MonthAccessed>
+    <b:DayAccessed>06</b:DayAccessed>
+    <b:URL>https://unity.com/glossary/ml-agents</b:URL>
+    <b:RefOrder>13</b:RefOrder>
+  </b:Source>
 </b:Sources>
 </file>
 
 <file path=customXml/itemProps1.xml><?xml version="1.0" encoding="utf-8"?>
-<ds:datastoreItem xmlns:ds="http://schemas.openxmlformats.org/officeDocument/2006/customXml" ds:itemID="{6522D53D-76AF-4A24-850F-A29FEEBD0DAD}">
+<ds:datastoreItem xmlns:ds="http://schemas.openxmlformats.org/officeDocument/2006/customXml" ds:itemID="{A4BF1837-2BF9-438F-8A12-DD0A3BA7FF8D}">
   <ds:schemaRefs>
     <ds:schemaRef ds:uri="http://schemas.openxmlformats.org/officeDocument/2006/bibliography"/>
   </ds:schemaRefs>

</xml_diff>

<commit_message>
feat: Design chapter finished
</commit_message>
<xml_diff>
--- a/Report.docx
+++ b/Report.docx
@@ -321,7 +321,7 @@
         <w:pStyle w:val="Heading1"/>
       </w:pPr>
       <w:bookmarkStart w:id="1" w:name="_Toc40898999"/>
-      <w:bookmarkStart w:id="2" w:name="_Toc228979432"/>
+      <w:bookmarkStart w:id="2" w:name="_Toc228981212"/>
       <w:r>
         <w:lastRenderedPageBreak/>
         <w:t>Abstract</w:t>
@@ -331,7 +331,15 @@
     </w:p>
     <w:p>
       <w:r>
-        <w:t>AI is a still growing industry and while the current trend of AI is heading towards the usage of Large Language Models, I believe there is a genuine use case for machine learning models within video games. The focus of this project is to uncover the current reasons behind why the industry doesn’t use machine learning AI for uses such as Non-Player Characters or local multiplayer games. This is appro</w:t>
+        <w:t xml:space="preserve">AI is a still growing industry and while the current trend of AI is heading towards the usage of Large Language Models, I believe there is a genuine use case for machine learning models within video games. The focus of this project is to uncover the current reasons behind why the industry doesn’t use machine learning AI for uses such as </w:t>
+      </w:r>
+      <w:proofErr w:type="gramStart"/>
+      <w:r>
+        <w:t>Non-Player Characters</w:t>
+      </w:r>
+      <w:proofErr w:type="gramEnd"/>
+      <w:r>
+        <w:t xml:space="preserve"> or local multiplayer games. This is appro</w:t>
       </w:r>
       <w:r>
         <w:t>ached by covering the design choices and code architecture of implementing a machine learning model into the Unity game engine. To evaluate whether the AI is functional, data has been gathered using a mix of qualitative and quantitative research. This research was collected through a short survey given to participants.</w:t>
@@ -361,7 +369,7 @@
         <w:spacing w:after="321"/>
         <w:ind w:left="-5"/>
       </w:pPr>
-      <w:bookmarkStart w:id="3" w:name="_Toc228979433"/>
+      <w:bookmarkStart w:id="3" w:name="_Toc228981213"/>
       <w:r>
         <w:lastRenderedPageBreak/>
         <w:t>Declaration</w:t>
@@ -483,7 +491,7 @@
         <w:ind w:left="-5"/>
       </w:pPr>
       <w:bookmarkStart w:id="4" w:name="_Toc40899001"/>
-      <w:bookmarkStart w:id="5" w:name="_Toc228979434"/>
+      <w:bookmarkStart w:id="5" w:name="_Toc228981214"/>
       <w:r>
         <w:lastRenderedPageBreak/>
         <w:t>Acknowledgements</w:t>
@@ -620,7 +628,7 @@
         <w:spacing w:line="259" w:lineRule="auto"/>
       </w:pPr>
     </w:p>
-    <w:bookmarkStart w:id="6" w:name="_Toc228979435" w:displacedByCustomXml="next"/>
+    <w:bookmarkStart w:id="6" w:name="_Toc228981215" w:displacedByCustomXml="next"/>
     <w:sdt>
       <w:sdtPr>
         <w:rPr>
@@ -678,7 +686,7 @@
           <w:r>
             <w:fldChar w:fldCharType="separate"/>
           </w:r>
-          <w:hyperlink w:anchor="_Toc228979432" w:history="1">
+          <w:hyperlink w:anchor="_Toc228981212" w:history="1">
             <w:r>
               <w:rPr>
                 <w:rStyle w:val="Hyperlink"/>
@@ -705,7 +713,7 @@
                 <w:noProof/>
                 <w:webHidden/>
               </w:rPr>
-              <w:instrText xml:space="preserve"> PAGEREF _Toc228979432 \h </w:instrText>
+              <w:instrText xml:space="preserve"> PAGEREF _Toc228981212 \h </w:instrText>
             </w:r>
             <w:r>
               <w:rPr>
@@ -752,7 +760,7 @@
               <w14:ligatures w14:val="standardContextual"/>
             </w:rPr>
           </w:pPr>
-          <w:hyperlink w:anchor="_Toc228979433" w:history="1">
+          <w:hyperlink w:anchor="_Toc228981213" w:history="1">
             <w:r>
               <w:rPr>
                 <w:rStyle w:val="Hyperlink"/>
@@ -779,7 +787,7 @@
                 <w:noProof/>
                 <w:webHidden/>
               </w:rPr>
-              <w:instrText xml:space="preserve"> PAGEREF _Toc228979433 \h </w:instrText>
+              <w:instrText xml:space="preserve"> PAGEREF _Toc228981213 \h </w:instrText>
             </w:r>
             <w:r>
               <w:rPr>
@@ -826,7 +834,7 @@
               <w14:ligatures w14:val="standardContextual"/>
             </w:rPr>
           </w:pPr>
-          <w:hyperlink w:anchor="_Toc228979434" w:history="1">
+          <w:hyperlink w:anchor="_Toc228981214" w:history="1">
             <w:r>
               <w:rPr>
                 <w:rStyle w:val="Hyperlink"/>
@@ -853,7 +861,7 @@
                 <w:noProof/>
                 <w:webHidden/>
               </w:rPr>
-              <w:instrText xml:space="preserve"> PAGEREF _Toc228979434 \h </w:instrText>
+              <w:instrText xml:space="preserve"> PAGEREF _Toc228981214 \h </w:instrText>
             </w:r>
             <w:r>
               <w:rPr>
@@ -900,7 +908,7 @@
               <w14:ligatures w14:val="standardContextual"/>
             </w:rPr>
           </w:pPr>
-          <w:hyperlink w:anchor="_Toc228979435" w:history="1">
+          <w:hyperlink w:anchor="_Toc228981215" w:history="1">
             <w:r>
               <w:rPr>
                 <w:rStyle w:val="Hyperlink"/>
@@ -927,7 +935,7 @@
                 <w:noProof/>
                 <w:webHidden/>
               </w:rPr>
-              <w:instrText xml:space="preserve"> PAGEREF _Toc228979435 \h </w:instrText>
+              <w:instrText xml:space="preserve"> PAGEREF _Toc228981215 \h </w:instrText>
             </w:r>
             <w:r>
               <w:rPr>
@@ -974,7 +982,7 @@
               <w14:ligatures w14:val="standardContextual"/>
             </w:rPr>
           </w:pPr>
-          <w:hyperlink w:anchor="_Toc228979436" w:history="1">
+          <w:hyperlink w:anchor="_Toc228981216" w:history="1">
             <w:r>
               <w:rPr>
                 <w:rStyle w:val="Hyperlink"/>
@@ -1001,7 +1009,7 @@
                 <w:noProof/>
                 <w:webHidden/>
               </w:rPr>
-              <w:instrText xml:space="preserve"> PAGEREF _Toc228979436 \h </w:instrText>
+              <w:instrText xml:space="preserve"> PAGEREF _Toc228981216 \h </w:instrText>
             </w:r>
             <w:r>
               <w:rPr>
@@ -1048,7 +1056,7 @@
               <w14:ligatures w14:val="standardContextual"/>
             </w:rPr>
           </w:pPr>
-          <w:hyperlink w:anchor="_Toc228979437" w:history="1">
+          <w:hyperlink w:anchor="_Toc228981217" w:history="1">
             <w:r>
               <w:rPr>
                 <w:rStyle w:val="Hyperlink"/>
@@ -1075,7 +1083,7 @@
                 <w:noProof/>
                 <w:webHidden/>
               </w:rPr>
-              <w:instrText xml:space="preserve"> PAGEREF _Toc228979437 \h </w:instrText>
+              <w:instrText xml:space="preserve"> PAGEREF _Toc228981217 \h </w:instrText>
             </w:r>
             <w:r>
               <w:rPr>
@@ -1122,7 +1130,7 @@
               <w14:ligatures w14:val="standardContextual"/>
             </w:rPr>
           </w:pPr>
-          <w:hyperlink w:anchor="_Toc228979438" w:history="1">
+          <w:hyperlink w:anchor="_Toc228981218" w:history="1">
             <w:r>
               <w:rPr>
                 <w:rStyle w:val="Hyperlink"/>
@@ -1149,7 +1157,7 @@
                 <w:noProof/>
                 <w:webHidden/>
               </w:rPr>
-              <w:instrText xml:space="preserve"> PAGEREF _Toc228979438 \h </w:instrText>
+              <w:instrText xml:space="preserve"> PAGEREF _Toc228981218 \h </w:instrText>
             </w:r>
             <w:r>
               <w:rPr>
@@ -1196,7 +1204,7 @@
               <w14:ligatures w14:val="standardContextual"/>
             </w:rPr>
           </w:pPr>
-          <w:hyperlink w:anchor="_Toc228979439" w:history="1">
+          <w:hyperlink w:anchor="_Toc228981219" w:history="1">
             <w:r>
               <w:rPr>
                 <w:rStyle w:val="Hyperlink"/>
@@ -1223,7 +1231,7 @@
                 <w:noProof/>
                 <w:webHidden/>
               </w:rPr>
-              <w:instrText xml:space="preserve"> PAGEREF _Toc228979439 \h </w:instrText>
+              <w:instrText xml:space="preserve"> PAGEREF _Toc228981219 \h </w:instrText>
             </w:r>
             <w:r>
               <w:rPr>
@@ -1270,7 +1278,7 @@
               <w14:ligatures w14:val="standardContextual"/>
             </w:rPr>
           </w:pPr>
-          <w:hyperlink w:anchor="_Toc228979440" w:history="1">
+          <w:hyperlink w:anchor="_Toc228981220" w:history="1">
             <w:r>
               <w:rPr>
                 <w:rStyle w:val="Hyperlink"/>
@@ -1297,7 +1305,7 @@
                 <w:noProof/>
                 <w:webHidden/>
               </w:rPr>
-              <w:instrText xml:space="preserve"> PAGEREF _Toc228979440 \h </w:instrText>
+              <w:instrText xml:space="preserve"> PAGEREF _Toc228981220 \h </w:instrText>
             </w:r>
             <w:r>
               <w:rPr>
@@ -1344,7 +1352,7 @@
               <w14:ligatures w14:val="standardContextual"/>
             </w:rPr>
           </w:pPr>
-          <w:hyperlink w:anchor="_Toc228979441" w:history="1">
+          <w:hyperlink w:anchor="_Toc228981221" w:history="1">
             <w:r>
               <w:rPr>
                 <w:rStyle w:val="Hyperlink"/>
@@ -1371,7 +1379,7 @@
                 <w:noProof/>
                 <w:webHidden/>
               </w:rPr>
-              <w:instrText xml:space="preserve"> PAGEREF _Toc228979441 \h </w:instrText>
+              <w:instrText xml:space="preserve"> PAGEREF _Toc228981221 \h </w:instrText>
             </w:r>
             <w:r>
               <w:rPr>
@@ -1418,7 +1426,7 @@
               <w14:ligatures w14:val="standardContextual"/>
             </w:rPr>
           </w:pPr>
-          <w:hyperlink w:anchor="_Toc228979442" w:history="1">
+          <w:hyperlink w:anchor="_Toc228981222" w:history="1">
             <w:r>
               <w:rPr>
                 <w:rStyle w:val="Hyperlink"/>
@@ -1445,7 +1453,7 @@
                 <w:noProof/>
                 <w:webHidden/>
               </w:rPr>
-              <w:instrText xml:space="preserve"> PAGEREF _Toc228979442 \h </w:instrText>
+              <w:instrText xml:space="preserve"> PAGEREF _Toc228981222 \h </w:instrText>
             </w:r>
             <w:r>
               <w:rPr>
@@ -1492,7 +1500,7 @@
               <w14:ligatures w14:val="standardContextual"/>
             </w:rPr>
           </w:pPr>
-          <w:hyperlink w:anchor="_Toc228979443" w:history="1">
+          <w:hyperlink w:anchor="_Toc228981223" w:history="1">
             <w:r>
               <w:rPr>
                 <w:rStyle w:val="Hyperlink"/>
@@ -1519,7 +1527,7 @@
                 <w:noProof/>
                 <w:webHidden/>
               </w:rPr>
-              <w:instrText xml:space="preserve"> PAGEREF _Toc228979443 \h </w:instrText>
+              <w:instrText xml:space="preserve"> PAGEREF _Toc228981223 \h </w:instrText>
             </w:r>
             <w:r>
               <w:rPr>
@@ -1566,7 +1574,7 @@
               <w14:ligatures w14:val="standardContextual"/>
             </w:rPr>
           </w:pPr>
-          <w:hyperlink w:anchor="_Toc228979444" w:history="1">
+          <w:hyperlink w:anchor="_Toc228981224" w:history="1">
             <w:r>
               <w:rPr>
                 <w:rStyle w:val="Hyperlink"/>
@@ -1593,7 +1601,7 @@
                 <w:noProof/>
                 <w:webHidden/>
               </w:rPr>
-              <w:instrText xml:space="preserve"> PAGEREF _Toc228979444 \h </w:instrText>
+              <w:instrText xml:space="preserve"> PAGEREF _Toc228981224 \h </w:instrText>
             </w:r>
             <w:r>
               <w:rPr>
@@ -1640,7 +1648,7 @@
               <w14:ligatures w14:val="standardContextual"/>
             </w:rPr>
           </w:pPr>
-          <w:hyperlink w:anchor="_Toc228979445" w:history="1">
+          <w:hyperlink w:anchor="_Toc228981225" w:history="1">
             <w:r>
               <w:rPr>
                 <w:rStyle w:val="Hyperlink"/>
@@ -1667,7 +1675,7 @@
                 <w:noProof/>
                 <w:webHidden/>
               </w:rPr>
-              <w:instrText xml:space="preserve"> PAGEREF _Toc228979445 \h </w:instrText>
+              <w:instrText xml:space="preserve"> PAGEREF _Toc228981225 \h </w:instrText>
             </w:r>
             <w:r>
               <w:rPr>
@@ -1714,7 +1722,7 @@
               <w14:ligatures w14:val="standardContextual"/>
             </w:rPr>
           </w:pPr>
-          <w:hyperlink w:anchor="_Toc228979446" w:history="1">
+          <w:hyperlink w:anchor="_Toc228981226" w:history="1">
             <w:r>
               <w:rPr>
                 <w:rStyle w:val="Hyperlink"/>
@@ -1741,7 +1749,7 @@
                 <w:noProof/>
                 <w:webHidden/>
               </w:rPr>
-              <w:instrText xml:space="preserve"> PAGEREF _Toc228979446 \h </w:instrText>
+              <w:instrText xml:space="preserve"> PAGEREF _Toc228981226 \h </w:instrText>
             </w:r>
             <w:r>
               <w:rPr>
@@ -1788,7 +1796,7 @@
               <w14:ligatures w14:val="standardContextual"/>
             </w:rPr>
           </w:pPr>
-          <w:hyperlink w:anchor="_Toc228979447" w:history="1">
+          <w:hyperlink w:anchor="_Toc228981227" w:history="1">
             <w:r>
               <w:rPr>
                 <w:rStyle w:val="Hyperlink"/>
@@ -1815,7 +1823,7 @@
                 <w:noProof/>
                 <w:webHidden/>
               </w:rPr>
-              <w:instrText xml:space="preserve"> PAGEREF _Toc228979447 \h </w:instrText>
+              <w:instrText xml:space="preserve"> PAGEREF _Toc228981227 \h </w:instrText>
             </w:r>
             <w:r>
               <w:rPr>
@@ -1862,7 +1870,7 @@
               <w14:ligatures w14:val="standardContextual"/>
             </w:rPr>
           </w:pPr>
-          <w:hyperlink w:anchor="_Toc228979448" w:history="1">
+          <w:hyperlink w:anchor="_Toc228981228" w:history="1">
             <w:r>
               <w:rPr>
                 <w:rStyle w:val="Hyperlink"/>
@@ -1889,7 +1897,7 @@
                 <w:noProof/>
                 <w:webHidden/>
               </w:rPr>
-              <w:instrText xml:space="preserve"> PAGEREF _Toc228979448 \h </w:instrText>
+              <w:instrText xml:space="preserve"> PAGEREF _Toc228981228 \h </w:instrText>
             </w:r>
             <w:r>
               <w:rPr>
@@ -1936,7 +1944,7 @@
               <w14:ligatures w14:val="standardContextual"/>
             </w:rPr>
           </w:pPr>
-          <w:hyperlink w:anchor="_Toc228979449" w:history="1">
+          <w:hyperlink w:anchor="_Toc228981229" w:history="1">
             <w:r>
               <w:rPr>
                 <w:rStyle w:val="Hyperlink"/>
@@ -1963,7 +1971,7 @@
                 <w:noProof/>
                 <w:webHidden/>
               </w:rPr>
-              <w:instrText xml:space="preserve"> PAGEREF _Toc228979449 \h </w:instrText>
+              <w:instrText xml:space="preserve"> PAGEREF _Toc228981229 \h </w:instrText>
             </w:r>
             <w:r>
               <w:rPr>
@@ -2010,7 +2018,7 @@
               <w14:ligatures w14:val="standardContextual"/>
             </w:rPr>
           </w:pPr>
-          <w:hyperlink w:anchor="_Toc228979450" w:history="1">
+          <w:hyperlink w:anchor="_Toc228981230" w:history="1">
             <w:r>
               <w:rPr>
                 <w:rStyle w:val="Hyperlink"/>
@@ -2037,7 +2045,7 @@
                 <w:noProof/>
                 <w:webHidden/>
               </w:rPr>
-              <w:instrText xml:space="preserve"> PAGEREF _Toc228979450 \h </w:instrText>
+              <w:instrText xml:space="preserve"> PAGEREF _Toc228981230 \h </w:instrText>
             </w:r>
             <w:r>
               <w:rPr>
@@ -2084,7 +2092,7 @@
               <w14:ligatures w14:val="standardContextual"/>
             </w:rPr>
           </w:pPr>
-          <w:hyperlink w:anchor="_Toc228979451" w:history="1">
+          <w:hyperlink w:anchor="_Toc228981231" w:history="1">
             <w:r>
               <w:rPr>
                 <w:rStyle w:val="Hyperlink"/>
@@ -2111,7 +2119,7 @@
                 <w:noProof/>
                 <w:webHidden/>
               </w:rPr>
-              <w:instrText xml:space="preserve"> PAGEREF _Toc228979451 \h </w:instrText>
+              <w:instrText xml:space="preserve"> PAGEREF _Toc228981231 \h </w:instrText>
             </w:r>
             <w:r>
               <w:rPr>
@@ -2154,7 +2162,7 @@
               <w:lang w:eastAsia="en-GB"/>
             </w:rPr>
           </w:pPr>
-          <w:hyperlink w:anchor="_Toc228979452" w:history="1">
+          <w:hyperlink w:anchor="_Toc228981232" w:history="1">
             <w:r>
               <w:rPr>
                 <w:rStyle w:val="Hyperlink"/>
@@ -2181,7 +2189,7 @@
                 <w:noProof/>
                 <w:webHidden/>
               </w:rPr>
-              <w:instrText xml:space="preserve"> PAGEREF _Toc228979452 \h </w:instrText>
+              <w:instrText xml:space="preserve"> PAGEREF _Toc228981232 \h </w:instrText>
             </w:r>
             <w:r>
               <w:rPr>
@@ -2224,7 +2232,7 @@
               <w:lang w:eastAsia="en-GB"/>
             </w:rPr>
           </w:pPr>
-          <w:hyperlink w:anchor="_Toc228979453" w:history="1">
+          <w:hyperlink w:anchor="_Toc228981233" w:history="1">
             <w:r>
               <w:rPr>
                 <w:rStyle w:val="Hyperlink"/>
@@ -2251,7 +2259,7 @@
                 <w:noProof/>
                 <w:webHidden/>
               </w:rPr>
-              <w:instrText xml:space="preserve"> PAGEREF _Toc228979453 \h </w:instrText>
+              <w:instrText xml:space="preserve"> PAGEREF _Toc228981233 \h </w:instrText>
             </w:r>
             <w:r>
               <w:rPr>
@@ -2294,7 +2302,7 @@
               <w:lang w:eastAsia="en-GB"/>
             </w:rPr>
           </w:pPr>
-          <w:hyperlink w:anchor="_Toc228979454" w:history="1">
+          <w:hyperlink w:anchor="_Toc228981234" w:history="1">
             <w:r>
               <w:rPr>
                 <w:rStyle w:val="Hyperlink"/>
@@ -2321,7 +2329,7 @@
                 <w:noProof/>
                 <w:webHidden/>
               </w:rPr>
-              <w:instrText xml:space="preserve"> PAGEREF _Toc228979454 \h </w:instrText>
+              <w:instrText xml:space="preserve"> PAGEREF _Toc228981234 \h </w:instrText>
             </w:r>
             <w:r>
               <w:rPr>
@@ -2368,7 +2376,7 @@
               <w14:ligatures w14:val="standardContextual"/>
             </w:rPr>
           </w:pPr>
-          <w:hyperlink w:anchor="_Toc228979455" w:history="1">
+          <w:hyperlink w:anchor="_Toc228981235" w:history="1">
             <w:r>
               <w:rPr>
                 <w:rStyle w:val="Hyperlink"/>
@@ -2395,7 +2403,7 @@
                 <w:noProof/>
                 <w:webHidden/>
               </w:rPr>
-              <w:instrText xml:space="preserve"> PAGEREF _Toc228979455 \h </w:instrText>
+              <w:instrText xml:space="preserve"> PAGEREF _Toc228981235 \h </w:instrText>
             </w:r>
             <w:r>
               <w:rPr>
@@ -2438,7 +2446,7 @@
               <w:lang w:eastAsia="en-GB"/>
             </w:rPr>
           </w:pPr>
-          <w:hyperlink w:anchor="_Toc228979456" w:history="1">
+          <w:hyperlink w:anchor="_Toc228981236" w:history="1">
             <w:r>
               <w:rPr>
                 <w:rStyle w:val="Hyperlink"/>
@@ -2465,7 +2473,7 @@
                 <w:noProof/>
                 <w:webHidden/>
               </w:rPr>
-              <w:instrText xml:space="preserve"> PAGEREF _Toc228979456 \h </w:instrText>
+              <w:instrText xml:space="preserve"> PAGEREF _Toc228981236 \h </w:instrText>
             </w:r>
             <w:r>
               <w:rPr>
@@ -2508,7 +2516,7 @@
               <w:lang w:eastAsia="en-GB"/>
             </w:rPr>
           </w:pPr>
-          <w:hyperlink w:anchor="_Toc228979457" w:history="1">
+          <w:hyperlink w:anchor="_Toc228981237" w:history="1">
             <w:r>
               <w:rPr>
                 <w:rStyle w:val="Hyperlink"/>
@@ -2535,7 +2543,7 @@
                 <w:noProof/>
                 <w:webHidden/>
               </w:rPr>
-              <w:instrText xml:space="preserve"> PAGEREF _Toc228979457 \h </w:instrText>
+              <w:instrText xml:space="preserve"> PAGEREF _Toc228981237 \h </w:instrText>
             </w:r>
             <w:r>
               <w:rPr>
@@ -2578,7 +2586,7 @@
               <w:lang w:eastAsia="en-GB"/>
             </w:rPr>
           </w:pPr>
-          <w:hyperlink w:anchor="_Toc228979458" w:history="1">
+          <w:hyperlink w:anchor="_Toc228981238" w:history="1">
             <w:r>
               <w:rPr>
                 <w:rStyle w:val="Hyperlink"/>
@@ -2605,7 +2613,7 @@
                 <w:noProof/>
                 <w:webHidden/>
               </w:rPr>
-              <w:instrText xml:space="preserve"> PAGEREF _Toc228979458 \h </w:instrText>
+              <w:instrText xml:space="preserve"> PAGEREF _Toc228981238 \h </w:instrText>
             </w:r>
             <w:r>
               <w:rPr>
@@ -2652,7 +2660,7 @@
               <w14:ligatures w14:val="standardContextual"/>
             </w:rPr>
           </w:pPr>
-          <w:hyperlink w:anchor="_Toc228979459" w:history="1">
+          <w:hyperlink w:anchor="_Toc228981239" w:history="1">
             <w:r>
               <w:rPr>
                 <w:rStyle w:val="Hyperlink"/>
@@ -2679,7 +2687,7 @@
                 <w:noProof/>
                 <w:webHidden/>
               </w:rPr>
-              <w:instrText xml:space="preserve"> PAGEREF _Toc228979459 \h </w:instrText>
+              <w:instrText xml:space="preserve"> PAGEREF _Toc228981239 \h </w:instrText>
             </w:r>
             <w:r>
               <w:rPr>
@@ -2722,7 +2730,7 @@
               <w:lang w:eastAsia="en-GB"/>
             </w:rPr>
           </w:pPr>
-          <w:hyperlink w:anchor="_Toc228979460" w:history="1">
+          <w:hyperlink w:anchor="_Toc228981240" w:history="1">
             <w:r>
               <w:rPr>
                 <w:rStyle w:val="Hyperlink"/>
@@ -2749,7 +2757,7 @@
                 <w:noProof/>
                 <w:webHidden/>
               </w:rPr>
-              <w:instrText xml:space="preserve"> PAGEREF _Toc228979460 \h </w:instrText>
+              <w:instrText xml:space="preserve"> PAGEREF _Toc228981240 \h </w:instrText>
             </w:r>
             <w:r>
               <w:rPr>
@@ -2792,7 +2800,7 @@
               <w:lang w:eastAsia="en-GB"/>
             </w:rPr>
           </w:pPr>
-          <w:hyperlink w:anchor="_Toc228979461" w:history="1">
+          <w:hyperlink w:anchor="_Toc228981241" w:history="1">
             <w:r>
               <w:rPr>
                 <w:rStyle w:val="Hyperlink"/>
@@ -2819,7 +2827,7 @@
                 <w:noProof/>
                 <w:webHidden/>
               </w:rPr>
-              <w:instrText xml:space="preserve"> PAGEREF _Toc228979461 \h </w:instrText>
+              <w:instrText xml:space="preserve"> PAGEREF _Toc228981241 \h </w:instrText>
             </w:r>
             <w:r>
               <w:rPr>
@@ -2862,7 +2870,7 @@
               <w:lang w:eastAsia="en-GB"/>
             </w:rPr>
           </w:pPr>
-          <w:hyperlink w:anchor="_Toc228979462" w:history="1">
+          <w:hyperlink w:anchor="_Toc228981242" w:history="1">
             <w:r>
               <w:rPr>
                 <w:rStyle w:val="Hyperlink"/>
@@ -2889,7 +2897,7 @@
                 <w:noProof/>
                 <w:webHidden/>
               </w:rPr>
-              <w:instrText xml:space="preserve"> PAGEREF _Toc228979462 \h </w:instrText>
+              <w:instrText xml:space="preserve"> PAGEREF _Toc228981242 \h </w:instrText>
             </w:r>
             <w:r>
               <w:rPr>
@@ -2936,7 +2944,7 @@
               <w14:ligatures w14:val="standardContextual"/>
             </w:rPr>
           </w:pPr>
-          <w:hyperlink w:anchor="_Toc228979463" w:history="1">
+          <w:hyperlink w:anchor="_Toc228981243" w:history="1">
             <w:r>
               <w:rPr>
                 <w:rStyle w:val="Hyperlink"/>
@@ -2963,7 +2971,7 @@
                 <w:noProof/>
                 <w:webHidden/>
               </w:rPr>
-              <w:instrText xml:space="preserve"> PAGEREF _Toc228979463 \h </w:instrText>
+              <w:instrText xml:space="preserve"> PAGEREF _Toc228981243 \h </w:instrText>
             </w:r>
             <w:r>
               <w:rPr>
@@ -3010,7 +3018,7 @@
               <w14:ligatures w14:val="standardContextual"/>
             </w:rPr>
           </w:pPr>
-          <w:hyperlink w:anchor="_Toc228979464" w:history="1">
+          <w:hyperlink w:anchor="_Toc228981244" w:history="1">
             <w:r>
               <w:rPr>
                 <w:rStyle w:val="Hyperlink"/>
@@ -3037,7 +3045,7 @@
                 <w:noProof/>
                 <w:webHidden/>
               </w:rPr>
-              <w:instrText xml:space="preserve"> PAGEREF _Toc228979464 \h </w:instrText>
+              <w:instrText xml:space="preserve"> PAGEREF _Toc228981244 \h </w:instrText>
             </w:r>
             <w:r>
               <w:rPr>
@@ -3084,7 +3092,7 @@
               <w14:ligatures w14:val="standardContextual"/>
             </w:rPr>
           </w:pPr>
-          <w:hyperlink w:anchor="_Toc228979465" w:history="1">
+          <w:hyperlink w:anchor="_Toc228981245" w:history="1">
             <w:r>
               <w:rPr>
                 <w:rStyle w:val="Hyperlink"/>
@@ -3111,7 +3119,7 @@
                 <w:noProof/>
                 <w:webHidden/>
               </w:rPr>
-              <w:instrText xml:space="preserve"> PAGEREF _Toc228979465 \h </w:instrText>
+              <w:instrText xml:space="preserve"> PAGEREF _Toc228981245 \h </w:instrText>
             </w:r>
             <w:r>
               <w:rPr>
@@ -3158,7 +3166,7 @@
               <w14:ligatures w14:val="standardContextual"/>
             </w:rPr>
           </w:pPr>
-          <w:hyperlink w:anchor="_Toc228979466" w:history="1">
+          <w:hyperlink w:anchor="_Toc228981246" w:history="1">
             <w:r>
               <w:rPr>
                 <w:rStyle w:val="Hyperlink"/>
@@ -3185,7 +3193,7 @@
                 <w:noProof/>
                 <w:webHidden/>
               </w:rPr>
-              <w:instrText xml:space="preserve"> PAGEREF _Toc228979466 \h </w:instrText>
+              <w:instrText xml:space="preserve"> PAGEREF _Toc228981246 \h </w:instrText>
             </w:r>
             <w:r>
               <w:rPr>
@@ -3232,7 +3240,7 @@
               <w14:ligatures w14:val="standardContextual"/>
             </w:rPr>
           </w:pPr>
-          <w:hyperlink w:anchor="_Toc228979467" w:history="1">
+          <w:hyperlink w:anchor="_Toc228981247" w:history="1">
             <w:r>
               <w:rPr>
                 <w:rStyle w:val="Hyperlink"/>
@@ -3259,7 +3267,7 @@
                 <w:noProof/>
                 <w:webHidden/>
               </w:rPr>
-              <w:instrText xml:space="preserve"> PAGEREF _Toc228979467 \h </w:instrText>
+              <w:instrText xml:space="preserve"> PAGEREF _Toc228981247 \h </w:instrText>
             </w:r>
             <w:r>
               <w:rPr>
@@ -3306,7 +3314,7 @@
               <w14:ligatures w14:val="standardContextual"/>
             </w:rPr>
           </w:pPr>
-          <w:hyperlink w:anchor="_Toc228979468" w:history="1">
+          <w:hyperlink w:anchor="_Toc228981248" w:history="1">
             <w:r>
               <w:rPr>
                 <w:rStyle w:val="Hyperlink"/>
@@ -3333,7 +3341,7 @@
                 <w:noProof/>
                 <w:webHidden/>
               </w:rPr>
-              <w:instrText xml:space="preserve"> PAGEREF _Toc228979468 \h </w:instrText>
+              <w:instrText xml:space="preserve"> PAGEREF _Toc228981248 \h </w:instrText>
             </w:r>
             <w:r>
               <w:rPr>
@@ -3380,7 +3388,7 @@
               <w14:ligatures w14:val="standardContextual"/>
             </w:rPr>
           </w:pPr>
-          <w:hyperlink w:anchor="_Toc228979469" w:history="1">
+          <w:hyperlink w:anchor="_Toc228981249" w:history="1">
             <w:r>
               <w:rPr>
                 <w:rStyle w:val="Hyperlink"/>
@@ -3407,7 +3415,7 @@
                 <w:noProof/>
                 <w:webHidden/>
               </w:rPr>
-              <w:instrText xml:space="preserve"> PAGEREF _Toc228979469 \h </w:instrText>
+              <w:instrText xml:space="preserve"> PAGEREF _Toc228981249 \h </w:instrText>
             </w:r>
             <w:r>
               <w:rPr>
@@ -3454,7 +3462,7 @@
               <w14:ligatures w14:val="standardContextual"/>
             </w:rPr>
           </w:pPr>
-          <w:hyperlink w:anchor="_Toc228979470" w:history="1">
+          <w:hyperlink w:anchor="_Toc228981250" w:history="1">
             <w:r>
               <w:rPr>
                 <w:rStyle w:val="Hyperlink"/>
@@ -3481,7 +3489,7 @@
                 <w:noProof/>
                 <w:webHidden/>
               </w:rPr>
-              <w:instrText xml:space="preserve"> PAGEREF _Toc228979470 \h </w:instrText>
+              <w:instrText xml:space="preserve"> PAGEREF _Toc228981250 \h </w:instrText>
             </w:r>
             <w:r>
               <w:rPr>
@@ -3528,7 +3536,7 @@
               <w14:ligatures w14:val="standardContextual"/>
             </w:rPr>
           </w:pPr>
-          <w:hyperlink w:anchor="_Toc228979471" w:history="1">
+          <w:hyperlink w:anchor="_Toc228981251" w:history="1">
             <w:r>
               <w:rPr>
                 <w:rStyle w:val="Hyperlink"/>
@@ -3555,7 +3563,7 @@
                 <w:noProof/>
                 <w:webHidden/>
               </w:rPr>
-              <w:instrText xml:space="preserve"> PAGEREF _Toc228979471 \h </w:instrText>
+              <w:instrText xml:space="preserve"> PAGEREF _Toc228981251 \h </w:instrText>
             </w:r>
             <w:r>
               <w:rPr>
@@ -3602,7 +3610,7 @@
               <w14:ligatures w14:val="standardContextual"/>
             </w:rPr>
           </w:pPr>
-          <w:hyperlink w:anchor="_Toc228979472" w:history="1">
+          <w:hyperlink w:anchor="_Toc228981252" w:history="1">
             <w:r>
               <w:rPr>
                 <w:rStyle w:val="Hyperlink"/>
@@ -3629,7 +3637,7 @@
                 <w:noProof/>
                 <w:webHidden/>
               </w:rPr>
-              <w:instrText xml:space="preserve"> PAGEREF _Toc228979472 \h </w:instrText>
+              <w:instrText xml:space="preserve"> PAGEREF _Toc228981252 \h </w:instrText>
             </w:r>
             <w:r>
               <w:rPr>
@@ -3676,7 +3684,7 @@
               <w14:ligatures w14:val="standardContextual"/>
             </w:rPr>
           </w:pPr>
-          <w:hyperlink w:anchor="_Toc228979473" w:history="1">
+          <w:hyperlink w:anchor="_Toc228981253" w:history="1">
             <w:r>
               <w:rPr>
                 <w:rStyle w:val="Hyperlink"/>
@@ -3703,7 +3711,7 @@
                 <w:noProof/>
                 <w:webHidden/>
               </w:rPr>
-              <w:instrText xml:space="preserve"> PAGEREF _Toc228979473 \h </w:instrText>
+              <w:instrText xml:space="preserve"> PAGEREF _Toc228981253 \h </w:instrText>
             </w:r>
             <w:r>
               <w:rPr>
@@ -3750,7 +3758,7 @@
               <w14:ligatures w14:val="standardContextual"/>
             </w:rPr>
           </w:pPr>
-          <w:hyperlink w:anchor="_Toc228979474" w:history="1">
+          <w:hyperlink w:anchor="_Toc228981254" w:history="1">
             <w:r>
               <w:rPr>
                 <w:rStyle w:val="Hyperlink"/>
@@ -3777,7 +3785,155 @@
                 <w:noProof/>
                 <w:webHidden/>
               </w:rPr>
-              <w:instrText xml:space="preserve"> PAGEREF _Toc228979474 \h </w:instrText>
+              <w:instrText xml:space="preserve"> PAGEREF _Toc228981254 \h </w:instrText>
+            </w:r>
+            <w:r>
+              <w:rPr>
+                <w:noProof/>
+                <w:webHidden/>
+              </w:rPr>
+            </w:r>
+            <w:r>
+              <w:rPr>
+                <w:noProof/>
+                <w:webHidden/>
+              </w:rPr>
+              <w:fldChar w:fldCharType="separate"/>
+            </w:r>
+            <w:r>
+              <w:rPr>
+                <w:noProof/>
+                <w:webHidden/>
+              </w:rPr>
+              <w:t>15</w:t>
+            </w:r>
+            <w:r>
+              <w:rPr>
+                <w:noProof/>
+                <w:webHidden/>
+              </w:rPr>
+              <w:fldChar w:fldCharType="end"/>
+            </w:r>
+          </w:hyperlink>
+        </w:p>
+        <w:p>
+          <w:pPr>
+            <w:pStyle w:val="TOC3"/>
+            <w:tabs>
+              <w:tab w:val="right" w:leader="dot" w:pos="9016"/>
+            </w:tabs>
+            <w:rPr>
+              <w:rFonts w:asciiTheme="minorHAnsi" w:hAnsiTheme="minorHAnsi" w:cstheme="minorBidi"/>
+              <w:noProof/>
+              <w:kern w:val="2"/>
+              <w:sz w:val="24"/>
+              <w:szCs w:val="24"/>
+              <w:lang w:val="en-GB" w:eastAsia="en-GB"/>
+              <w14:ligatures w14:val="standardContextual"/>
+            </w:rPr>
+          </w:pPr>
+          <w:hyperlink w:anchor="_Toc228981255" w:history="1">
+            <w:r>
+              <w:rPr>
+                <w:rStyle w:val="Hyperlink"/>
+                <w:noProof/>
+              </w:rPr>
+              <w:t>3.3.1 Unity ML-Agents</w:t>
+            </w:r>
+            <w:r>
+              <w:rPr>
+                <w:noProof/>
+                <w:webHidden/>
+              </w:rPr>
+              <w:tab/>
+            </w:r>
+            <w:r>
+              <w:rPr>
+                <w:noProof/>
+                <w:webHidden/>
+              </w:rPr>
+              <w:fldChar w:fldCharType="begin"/>
+            </w:r>
+            <w:r>
+              <w:rPr>
+                <w:noProof/>
+                <w:webHidden/>
+              </w:rPr>
+              <w:instrText xml:space="preserve"> PAGEREF _Toc228981255 \h </w:instrText>
+            </w:r>
+            <w:r>
+              <w:rPr>
+                <w:noProof/>
+                <w:webHidden/>
+              </w:rPr>
+            </w:r>
+            <w:r>
+              <w:rPr>
+                <w:noProof/>
+                <w:webHidden/>
+              </w:rPr>
+              <w:fldChar w:fldCharType="separate"/>
+            </w:r>
+            <w:r>
+              <w:rPr>
+                <w:noProof/>
+                <w:webHidden/>
+              </w:rPr>
+              <w:t>15</w:t>
+            </w:r>
+            <w:r>
+              <w:rPr>
+                <w:noProof/>
+                <w:webHidden/>
+              </w:rPr>
+              <w:fldChar w:fldCharType="end"/>
+            </w:r>
+          </w:hyperlink>
+        </w:p>
+        <w:p>
+          <w:pPr>
+            <w:pStyle w:val="TOC3"/>
+            <w:tabs>
+              <w:tab w:val="right" w:leader="dot" w:pos="9016"/>
+            </w:tabs>
+            <w:rPr>
+              <w:rFonts w:asciiTheme="minorHAnsi" w:hAnsiTheme="minorHAnsi" w:cstheme="minorBidi"/>
+              <w:noProof/>
+              <w:kern w:val="2"/>
+              <w:sz w:val="24"/>
+              <w:szCs w:val="24"/>
+              <w:lang w:val="en-GB" w:eastAsia="en-GB"/>
+              <w14:ligatures w14:val="standardContextual"/>
+            </w:rPr>
+          </w:pPr>
+          <w:hyperlink w:anchor="_Toc228981256" w:history="1">
+            <w:r>
+              <w:rPr>
+                <w:rStyle w:val="Hyperlink"/>
+                <w:noProof/>
+              </w:rPr>
+              <w:t>3.3.2 AI Controller</w:t>
+            </w:r>
+            <w:r>
+              <w:rPr>
+                <w:noProof/>
+                <w:webHidden/>
+              </w:rPr>
+              <w:tab/>
+            </w:r>
+            <w:r>
+              <w:rPr>
+                <w:noProof/>
+                <w:webHidden/>
+              </w:rPr>
+              <w:fldChar w:fldCharType="begin"/>
+            </w:r>
+            <w:r>
+              <w:rPr>
+                <w:noProof/>
+                <w:webHidden/>
+              </w:rPr>
+              <w:instrText xml:space="preserve"> PAGEREF _Toc228981256 \h </w:instrText>
             </w:r>
             <w:r>
               <w:rPr>
@@ -3824,7 +3980,7 @@
               <w14:ligatures w14:val="standardContextual"/>
             </w:rPr>
           </w:pPr>
-          <w:hyperlink w:anchor="_Toc228979475" w:history="1">
+          <w:hyperlink w:anchor="_Toc228981257" w:history="1">
             <w:r>
               <w:rPr>
                 <w:rStyle w:val="Hyperlink"/>
@@ -3851,7 +4007,7 @@
                 <w:noProof/>
                 <w:webHidden/>
               </w:rPr>
-              <w:instrText xml:space="preserve"> PAGEREF _Toc228979475 \h </w:instrText>
+              <w:instrText xml:space="preserve"> PAGEREF _Toc228981257 \h </w:instrText>
             </w:r>
             <w:r>
               <w:rPr>
@@ -3871,7 +4027,7 @@
                 <w:noProof/>
                 <w:webHidden/>
               </w:rPr>
-              <w:t>15</w:t>
+              <w:t>16</w:t>
             </w:r>
             <w:r>
               <w:rPr>
@@ -3908,7 +4064,7 @@
       <w:pPr>
         <w:pStyle w:val="Heading1"/>
       </w:pPr>
-      <w:bookmarkStart w:id="7" w:name="_Toc228979436"/>
+      <w:bookmarkStart w:id="7" w:name="_Toc228981216"/>
       <w:r>
         <w:t>Table of Figures</w:t>
       </w:r>
@@ -4536,7 +4692,7 @@
       <w:pPr>
         <w:pStyle w:val="Heading1"/>
       </w:pPr>
-      <w:bookmarkStart w:id="8" w:name="_Toc228979437"/>
+      <w:bookmarkStart w:id="8" w:name="_Toc228981217"/>
       <w:r>
         <w:t>Chapter 1</w:t>
       </w:r>
@@ -4564,7 +4720,7 @@
           <w:u w:val="single"/>
         </w:rPr>
       </w:pPr>
-      <w:bookmarkStart w:id="9" w:name="_Toc228979438"/>
+      <w:bookmarkStart w:id="9" w:name="_Toc228981218"/>
       <w:r>
         <w:t>1.1</w:t>
       </w:r>
@@ -4615,7 +4771,7 @@
       <w:pPr>
         <w:pStyle w:val="Heading2"/>
       </w:pPr>
-      <w:bookmarkStart w:id="10" w:name="_Toc228979439"/>
+      <w:bookmarkStart w:id="10" w:name="_Toc228981219"/>
       <w:r>
         <w:t>1.2 Aims</w:t>
       </w:r>
@@ -4631,7 +4787,7 @@
           <w:szCs w:val="28"/>
         </w:rPr>
       </w:pPr>
-      <w:bookmarkStart w:id="11" w:name="_Toc228979440"/>
+      <w:bookmarkStart w:id="11" w:name="_Toc228981220"/>
       <w:r>
         <w:rPr>
           <w:rStyle w:val="Heading2Char"/>
@@ -4676,7 +4832,7 @@
       <w:pPr>
         <w:pStyle w:val="Heading3"/>
       </w:pPr>
-      <w:bookmarkStart w:id="12" w:name="_Toc228979441"/>
+      <w:bookmarkStart w:id="12" w:name="_Toc228981221"/>
       <w:r>
         <w:lastRenderedPageBreak/>
         <w:t>1.2.2 Additional Aims</w:t>
@@ -4746,7 +4902,7 @@
       <w:pPr>
         <w:pStyle w:val="Heading2"/>
       </w:pPr>
-      <w:bookmarkStart w:id="13" w:name="_Toc228979442"/>
+      <w:bookmarkStart w:id="13" w:name="_Toc228981222"/>
       <w:r>
         <w:t>1.3 Objectives</w:t>
       </w:r>
@@ -4756,7 +4912,7 @@
       <w:pPr>
         <w:pStyle w:val="Heading3"/>
       </w:pPr>
-      <w:bookmarkStart w:id="14" w:name="_Toc228979443"/>
+      <w:bookmarkStart w:id="14" w:name="_Toc228981223"/>
       <w:r>
         <w:t>1.3.1 Scope</w:t>
       </w:r>
@@ -4764,7 +4920,15 @@
     </w:p>
     <w:p>
       <w:r>
-        <w:t>The objectives in terms of scope for this project are going to be generally quite broad and consist of specific milestones. The core objectives in regards to the scope are:</w:t>
+        <w:t xml:space="preserve">The objectives in terms of scope for this project are going to be generally quite broad and consist of specific milestones. The core objectives </w:t>
+      </w:r>
+      <w:proofErr w:type="gramStart"/>
+      <w:r>
+        <w:t>in regards to</w:t>
+      </w:r>
+      <w:proofErr w:type="gramEnd"/>
+      <w:r>
+        <w:t xml:space="preserve"> the scope are:</w:t>
       </w:r>
     </w:p>
     <w:p>
@@ -4819,7 +4983,7 @@
       <w:pPr>
         <w:pStyle w:val="Heading3"/>
       </w:pPr>
-      <w:bookmarkStart w:id="15" w:name="_Toc228979444"/>
+      <w:bookmarkStart w:id="15" w:name="_Toc228981224"/>
       <w:r>
         <w:t>1.3.2 Research Objectives</w:t>
       </w:r>
@@ -4827,7 +4991,15 @@
     </w:p>
     <w:p>
       <w:r>
-        <w:t>For the research objectives for the game, research will be conducted into other types of media with similar features. This research will include a comparison of similar games and their features and the overall impact of those features on this project. This will be done to find a balance for the difficulty of the game and to evaluate the necessary features for the game. Some topics of features and mechanics that will be researched include: World Generation, Pathfinding</w:t>
+        <w:t xml:space="preserve">For the research objectives for the game, research will be conducted into other types of media with similar features. This research will include a comparison of similar games and their features and the overall impact of those features on this project. This will be done to find a balance for the difficulty of the game and to evaluate the necessary features for the game. Some topics of features and mechanics that will be researched </w:t>
+      </w:r>
+      <w:proofErr w:type="gramStart"/>
+      <w:r>
+        <w:t>include:</w:t>
+      </w:r>
+      <w:proofErr w:type="gramEnd"/>
+      <w:r>
+        <w:t xml:space="preserve"> World Generation, Pathfinding</w:t>
       </w:r>
       <w:r>
         <w:t xml:space="preserve"> and </w:t>
@@ -4849,7 +5021,7 @@
       <w:pPr>
         <w:pStyle w:val="Heading3"/>
       </w:pPr>
-      <w:bookmarkStart w:id="16" w:name="_Toc228979445"/>
+      <w:bookmarkStart w:id="16" w:name="_Toc228981225"/>
       <w:r>
         <w:lastRenderedPageBreak/>
         <w:t>1.3.3 Design Objectives</w:t>
@@ -4972,7 +5144,7 @@
       <w:pPr>
         <w:pStyle w:val="Heading3"/>
       </w:pPr>
-      <w:bookmarkStart w:id="17" w:name="_Toc228979446"/>
+      <w:bookmarkStart w:id="17" w:name="_Toc228981226"/>
       <w:r>
         <w:t>1.3.4 Implementation Objectives</w:t>
       </w:r>
@@ -5091,7 +5263,7 @@
       <w:pPr>
         <w:pStyle w:val="Heading3"/>
       </w:pPr>
-      <w:bookmarkStart w:id="18" w:name="_Toc228979447"/>
+      <w:bookmarkStart w:id="18" w:name="_Toc228981227"/>
       <w:r>
         <w:t>1.3.5 Results, Evaluation and Playtesting Objectives</w:t>
       </w:r>
@@ -5148,7 +5320,7 @@
       <w:pPr>
         <w:pStyle w:val="Heading1"/>
       </w:pPr>
-      <w:bookmarkStart w:id="19" w:name="_Toc228979448"/>
+      <w:bookmarkStart w:id="19" w:name="_Toc228981228"/>
       <w:r>
         <w:lastRenderedPageBreak/>
         <w:t>Chapter 2 – Literature Survey</w:t>
@@ -5159,7 +5331,7 @@
       <w:pPr>
         <w:pStyle w:val="Heading2"/>
       </w:pPr>
-      <w:bookmarkStart w:id="20" w:name="_Toc228979449"/>
+      <w:bookmarkStart w:id="20" w:name="_Toc228981229"/>
       <w:r>
         <w:t>2.1 Literature Survey Introduction</w:t>
       </w:r>
@@ -5198,7 +5370,7 @@
       <w:pPr>
         <w:pStyle w:val="Heading2"/>
       </w:pPr>
-      <w:bookmarkStart w:id="21" w:name="_Toc228979450"/>
+      <w:bookmarkStart w:id="21" w:name="_Toc228981230"/>
       <w:r>
         <w:t>2.2 Comparative Research</w:t>
       </w:r>
@@ -5216,7 +5388,7 @@
       <w:pPr>
         <w:pStyle w:val="Heading3"/>
       </w:pPr>
-      <w:bookmarkStart w:id="22" w:name="_Toc228979451"/>
+      <w:bookmarkStart w:id="22" w:name="_Toc228981231"/>
       <w:r>
         <w:t xml:space="preserve">2.2.1 </w:t>
       </w:r>
@@ -5292,7 +5464,7 @@
       <w:pPr>
         <w:pStyle w:val="Heading4"/>
       </w:pPr>
-      <w:bookmarkStart w:id="23" w:name="_Toc228979452"/>
+      <w:bookmarkStart w:id="23" w:name="_Toc228981232"/>
       <w:r>
         <w:t>2.2.1.1 Perlin Noise</w:t>
       </w:r>
@@ -5675,7 +5847,7 @@
       <w:pPr>
         <w:pStyle w:val="Heading4"/>
       </w:pPr>
-      <w:bookmarkStart w:id="25" w:name="_Toc228979453"/>
+      <w:bookmarkStart w:id="25" w:name="_Toc228981233"/>
       <w:r>
         <w:t>2.2.1.2 Binary Space Partitioning</w:t>
       </w:r>
@@ -5727,7 +5899,7 @@
       <w:pPr>
         <w:pStyle w:val="Heading4"/>
       </w:pPr>
-      <w:bookmarkStart w:id="26" w:name="_Toc228979454"/>
+      <w:bookmarkStart w:id="26" w:name="_Toc228981234"/>
       <w:r>
         <w:t>2.2.1.3 Cellular Automata</w:t>
       </w:r>
@@ -5789,7 +5961,15 @@
         <w:t>)</w:t>
       </w:r>
       <w:r>
-        <w:t xml:space="preserve"> according to the following two rules: If a cell is alive, it survives to the next generation if it has 2 or 3 live neighbors; otherwise it dies. If a cell is dead, it comes to life in the next generation if it has exactly 3 live neighbors; otherwise it stays dead.” </w:t>
+        <w:t xml:space="preserve"> according to the following two rules: If a cell is alive, it survives to the next generation if it has 2 or 3 live neighbors; otherwise it dies. If a cell is dead, it comes to life in the next generation if it has exactly 3 live neighbors; </w:t>
+      </w:r>
+      <w:proofErr w:type="gramStart"/>
+      <w:r>
+        <w:t>otherwise</w:t>
+      </w:r>
+      <w:proofErr w:type="gramEnd"/>
+      <w:r>
+        <w:t xml:space="preserve"> it stays dead.” </w:t>
       </w:r>
       <w:sdt>
         <w:sdtPr>
@@ -5839,7 +6019,7 @@
       <w:pPr>
         <w:pStyle w:val="Heading3"/>
       </w:pPr>
-      <w:bookmarkStart w:id="27" w:name="_Toc228979455"/>
+      <w:bookmarkStart w:id="27" w:name="_Toc228981235"/>
       <w:r>
         <w:t>2.2.2 Pathfinding</w:t>
       </w:r>
@@ -5875,7 +6055,15 @@
         <w:t xml:space="preserve"> </w:t>
       </w:r>
       <w:r>
-        <w:t>The types of pathfinding I will be evaluating are: A*, Dijkstra</w:t>
+        <w:t xml:space="preserve">The types of pathfinding I will be evaluating </w:t>
+      </w:r>
+      <w:proofErr w:type="gramStart"/>
+      <w:r>
+        <w:t>are:</w:t>
+      </w:r>
+      <w:proofErr w:type="gramEnd"/>
+      <w:r>
+        <w:t xml:space="preserve"> A*, Dijkstra</w:t>
       </w:r>
       <w:r>
         <w:t>,</w:t>
@@ -5894,7 +6082,7 @@
       <w:pPr>
         <w:pStyle w:val="Heading4"/>
       </w:pPr>
-      <w:bookmarkStart w:id="28" w:name="_Toc228979456"/>
+      <w:bookmarkStart w:id="28" w:name="_Toc228981236"/>
       <w:r>
         <w:t>2.2.2.1 Dijkstra</w:t>
       </w:r>
@@ -6067,7 +6255,7 @@
       <w:pPr>
         <w:pStyle w:val="Heading4"/>
       </w:pPr>
-      <w:bookmarkStart w:id="30" w:name="_Toc228979457"/>
+      <w:bookmarkStart w:id="30" w:name="_Toc228981237"/>
       <w:r>
         <w:t>2.2.2.2 A*</w:t>
       </w:r>
@@ -6132,7 +6320,7 @@
       <w:pPr>
         <w:pStyle w:val="Heading4"/>
       </w:pPr>
-      <w:bookmarkStart w:id="31" w:name="_Toc228979458"/>
+      <w:bookmarkStart w:id="31" w:name="_Toc228981238"/>
       <w:r>
         <w:t>2.2.2.3 Jump Point Search</w:t>
       </w:r>
@@ -6182,7 +6370,7 @@
       <w:pPr>
         <w:pStyle w:val="Heading3"/>
       </w:pPr>
-      <w:bookmarkStart w:id="32" w:name="_Toc228979459"/>
+      <w:bookmarkStart w:id="32" w:name="_Toc228981239"/>
       <w:r>
         <w:t>2.2.3 AI Integrations</w:t>
       </w:r>
@@ -6207,7 +6395,7 @@
       <w:pPr>
         <w:pStyle w:val="Heading4"/>
       </w:pPr>
-      <w:bookmarkStart w:id="33" w:name="_Toc228979460"/>
+      <w:bookmarkStart w:id="33" w:name="_Toc228981240"/>
       <w:r>
         <w:t>2.2.3.1 Neural Network</w:t>
       </w:r>
@@ -6230,7 +6418,15 @@
     </w:p>
     <w:p>
       <w:r>
-        <w:t xml:space="preserve">After the initial training phase, if we present the network with a pattern it hasn’t seen before in its training data, it should classify the unseen pattern correctly, only if it has learnt the underlying structure of the problem </w:t>
+        <w:t xml:space="preserve">After the initial training phase, if we present the network with a </w:t>
+      </w:r>
+      <w:proofErr w:type="gramStart"/>
+      <w:r>
+        <w:t>pattern</w:t>
+      </w:r>
+      <w:proofErr w:type="gramEnd"/>
+      <w:r>
+        <w:t xml:space="preserve"> it hasn’t seen before in its training data, it should classify the unseen pattern correctly, only if it has learnt the underlying structure of the problem </w:t>
       </w:r>
       <w:sdt>
         <w:sdtPr>
@@ -6266,7 +6462,7 @@
       <w:pPr>
         <w:pStyle w:val="Heading4"/>
       </w:pPr>
-      <w:bookmarkStart w:id="34" w:name="_Toc228979461"/>
+      <w:bookmarkStart w:id="34" w:name="_Toc228981241"/>
       <w:r>
         <w:t>2.2.3.2 Reinforcement Learning</w:t>
       </w:r>
@@ -6466,7 +6662,7 @@
       <w:pPr>
         <w:pStyle w:val="Heading4"/>
       </w:pPr>
-      <w:bookmarkStart w:id="36" w:name="_Toc228979462"/>
+      <w:bookmarkStart w:id="36" w:name="_Toc228981242"/>
       <w:r>
         <w:t>2.2.3.3 Imitation Learning</w:t>
       </w:r>
@@ -6599,7 +6795,7 @@
       <w:pPr>
         <w:pStyle w:val="Heading1"/>
       </w:pPr>
-      <w:bookmarkStart w:id="37" w:name="_Toc228979463"/>
+      <w:bookmarkStart w:id="37" w:name="_Toc228981243"/>
       <w:r>
         <w:t>Chapter 3 – Design</w:t>
       </w:r>
@@ -6626,7 +6822,7 @@
       <w:pPr>
         <w:pStyle w:val="Heading2"/>
       </w:pPr>
-      <w:bookmarkStart w:id="38" w:name="_Toc228979464"/>
+      <w:bookmarkStart w:id="38" w:name="_Toc228981244"/>
       <w:r>
         <w:t xml:space="preserve">3.1 </w:t>
       </w:r>
@@ -6677,7 +6873,7 @@
       <w:pPr>
         <w:pStyle w:val="Heading3"/>
       </w:pPr>
-      <w:bookmarkStart w:id="39" w:name="_Toc228979465"/>
+      <w:bookmarkStart w:id="39" w:name="_Toc228981245"/>
       <w:r>
         <w:lastRenderedPageBreak/>
         <w:t xml:space="preserve">3.1.1 </w:t>
@@ -7041,7 +7237,7 @@
       <w:pPr>
         <w:pStyle w:val="Heading3"/>
       </w:pPr>
-      <w:bookmarkStart w:id="43" w:name="_Toc228979466"/>
+      <w:bookmarkStart w:id="43" w:name="_Toc228981246"/>
       <w:r>
         <w:t>3.1.2 Biomes</w:t>
       </w:r>
@@ -7263,7 +7459,15 @@
         <w:t xml:space="preserve"> a pixel is, can become the boundaries for biomes. In this example, there are only 3 biomes: ocean, beach, and grass</w:t>
       </w:r>
       <w:r>
-        <w:t xml:space="preserve">. The amount of biomes possible are technically infinite. Although biome separation will be very prevalent as you go past roughly 10 biomes. </w:t>
+        <w:t xml:space="preserve">. The </w:t>
+      </w:r>
+      <w:proofErr w:type="gramStart"/>
+      <w:r>
+        <w:t>amount</w:t>
+      </w:r>
+      <w:proofErr w:type="gramEnd"/>
+      <w:r>
+        <w:t xml:space="preserve"> of biomes possible are technically infinite. Although biome separation will be very prevalent as you go past roughly 10 biomes. </w:t>
       </w:r>
     </w:p>
     <w:p/>
@@ -7272,7 +7476,15 @@
         <w:t xml:space="preserve">For my game, I am choosing to have 5 true biomes: Deep water, shallow water, sand, grass and snow. Each of these biomes are going to be abundant in different resources and </w:t>
       </w:r>
       <w:r>
-        <w:t>have very different base tile variables. For example, grassland tiles will contain more production than a sand tile but a sand tile will have more gold than a grassland tile</w:t>
+        <w:t xml:space="preserve">have very different base tile variables. For example, grassland tiles will contain more production than a sand </w:t>
+      </w:r>
+      <w:proofErr w:type="gramStart"/>
+      <w:r>
+        <w:t>tile</w:t>
+      </w:r>
+      <w:proofErr w:type="gramEnd"/>
+      <w:r>
+        <w:t xml:space="preserve"> but a sand tile will have more gold than a grassland tile</w:t>
       </w:r>
       <w:r>
         <w:t>.</w:t>
@@ -7289,7 +7501,7 @@
       <w:pPr>
         <w:pStyle w:val="Heading3"/>
       </w:pPr>
-      <w:bookmarkStart w:id="45" w:name="_Toc228979467"/>
+      <w:bookmarkStart w:id="45" w:name="_Toc228981247"/>
       <w:r>
         <w:t>3.1.3 Resource Distribution</w:t>
       </w:r>
@@ -7319,7 +7531,7 @@
       <w:pPr>
         <w:pStyle w:val="Heading3"/>
       </w:pPr>
-      <w:bookmarkStart w:id="46" w:name="_Toc228979468"/>
+      <w:bookmarkStart w:id="46" w:name="_Toc228981248"/>
       <w:r>
         <w:t>3.1.4 River generation</w:t>
       </w:r>
@@ -7361,7 +7573,7 @@
       <w:pPr>
         <w:pStyle w:val="Heading3"/>
       </w:pPr>
-      <w:bookmarkStart w:id="47" w:name="_Toc228979469"/>
+      <w:bookmarkStart w:id="47" w:name="_Toc228981249"/>
       <w:r>
         <w:t>3.1.</w:t>
       </w:r>
@@ -7470,7 +7682,7 @@
       <w:pPr>
         <w:pStyle w:val="Heading2"/>
       </w:pPr>
-      <w:bookmarkStart w:id="48" w:name="_Toc228979470"/>
+      <w:bookmarkStart w:id="48" w:name="_Toc228981250"/>
       <w:r>
         <w:t>3.2 Pathfinding</w:t>
       </w:r>
@@ -7488,7 +7700,7 @@
       <w:pPr>
         <w:pStyle w:val="Heading3"/>
       </w:pPr>
-      <w:bookmarkStart w:id="49" w:name="_Toc228979471"/>
+      <w:bookmarkStart w:id="49" w:name="_Toc228981251"/>
       <w:r>
         <w:t xml:space="preserve">3.2.1 </w:t>
       </w:r>
@@ -7511,7 +7723,15 @@
     <w:p/>
     <w:p>
       <w:r>
-        <w:t>The alternative method is to use references on all units, this is better for testing and easier to manage multiple instances of. The cons to this method are that, in Unity, getting references is quite expensive and the pathfinding will be a MonoBehaviour class meaning that the use of Unity’s GetComponent will be mandatory.</w:t>
+        <w:t xml:space="preserve">The alternative method is to use references on all </w:t>
+      </w:r>
+      <w:proofErr w:type="gramStart"/>
+      <w:r>
+        <w:t>units,</w:t>
+      </w:r>
+      <w:proofErr w:type="gramEnd"/>
+      <w:r>
+        <w:t xml:space="preserve"> this is better for testing and easier to manage multiple instances of. The cons to this method are that, in Unity, getting references is quite expensive and the pathfinding will be a MonoBehaviour class meaning that the use of Unity’s GetComponent will be mandatory.</w:t>
       </w:r>
     </w:p>
     <w:p>
@@ -7524,7 +7744,7 @@
       <w:pPr>
         <w:pStyle w:val="Heading3"/>
       </w:pPr>
-      <w:bookmarkStart w:id="50" w:name="_Toc228979472"/>
+      <w:bookmarkStart w:id="50" w:name="_Toc228981252"/>
       <w:r>
         <w:t>3.2.2 Heuristics</w:t>
       </w:r>
@@ -7715,7 +7935,15 @@
         <w:t xml:space="preserve">Euclidean Distance </w:t>
       </w:r>
       <w:r>
-        <w:t xml:space="preserve">is a direct measurement from point A to point B. As shown in figure 8, from the origin, the provided line can be traced to its destination. Inserting all grid tiles that are highlighted into a list, a path can be formed from the origin to the destination. This is almost a perfect solution to this project’s requirements due to the ease of implementation and it </w:t>
+        <w:t xml:space="preserve">is a direct measurement from point A to point B. As shown in figure 8, from the origin, the provided line can be traced to its destination. Inserting all grid tiles that are highlighted into a list, a path can be formed from the origin to the destination. This is almost a perfect solution to this project’s requirements due to the ease of </w:t>
+      </w:r>
+      <w:proofErr w:type="gramStart"/>
+      <w:r>
+        <w:t>implementation</w:t>
+      </w:r>
+      <w:proofErr w:type="gramEnd"/>
+      <w:r>
+        <w:t xml:space="preserve"> and it </w:t>
       </w:r>
       <w:r>
         <w:t>takes</w:t>
@@ -7728,7 +7956,7 @@
       <w:pPr>
         <w:pStyle w:val="Heading3"/>
       </w:pPr>
-      <w:bookmarkStart w:id="52" w:name="_Toc228979473"/>
+      <w:bookmarkStart w:id="52" w:name="_Toc228981253"/>
       <w:r>
         <w:t>3.2.3 Limitations</w:t>
       </w:r>
@@ -7745,7 +7973,15 @@
         <w:t xml:space="preserve">Another limitation of </w:t>
       </w:r>
       <w:r>
-        <w:t xml:space="preserve">pathfinding is that Euclidean heuristics are quite expensive to compute. This is due to a large amount of </w:t>
+        <w:t xml:space="preserve">pathfinding is that Euclidean heuristics are quite expensive to compute. This is due to a large </w:t>
+      </w:r>
+      <w:proofErr w:type="gramStart"/>
+      <w:r>
+        <w:t>amount</w:t>
+      </w:r>
+      <w:proofErr w:type="gramEnd"/>
+      <w:r>
+        <w:t xml:space="preserve"> of </w:t>
       </w:r>
       <w:r>
         <w:t>floating-point</w:t>
@@ -7768,7 +8004,7 @@
       <w:pPr>
         <w:pStyle w:val="Heading2"/>
       </w:pPr>
-      <w:bookmarkStart w:id="53" w:name="_Toc228979474"/>
+      <w:bookmarkStart w:id="53" w:name="_Toc228981254"/>
       <w:r>
         <w:t>3.3 AI Integrations</w:t>
       </w:r>
@@ -7795,9 +8031,11 @@
       <w:pPr>
         <w:pStyle w:val="Heading3"/>
       </w:pPr>
+      <w:bookmarkStart w:id="54" w:name="_Toc228981255"/>
       <w:r>
         <w:t>3.3.1 Unity ML-Agents</w:t>
       </w:r>
+      <w:bookmarkEnd w:id="54"/>
     </w:p>
     <w:p>
       <w:r>
@@ -7860,7 +8098,41 @@
         <w:t xml:space="preserve"> Rewards will also be distributed to the AI for taking actions like movement or even choosing to do an action. These rewards will be miniscule and exist solely to dissuade the AI from doing nothing later in the game. Other rewards such as a reward of -0.15 for not having any cities will be used to deter the AI from stalling at the beginning of the game.</w:t>
       </w:r>
     </w:p>
-    <w:bookmarkStart w:id="54" w:name="_Toc228979475" w:displacedByCustomXml="next"/>
+    <w:p>
+      <w:pPr>
+        <w:pStyle w:val="Heading3"/>
+      </w:pPr>
+      <w:bookmarkStart w:id="55" w:name="_Toc228981256"/>
+      <w:r>
+        <w:t>3.3.2 AI Controller</w:t>
+      </w:r>
+      <w:bookmarkEnd w:id="55"/>
+    </w:p>
+    <w:p>
+      <w:r>
+        <w:t>The AI controller is going to be the interface between the ML-Agents package and the game itself. This is where the sensor observations are going to be applied. The AI controller will have its own bespoke functions for attacking other units and moving towards enemy units. It will also have access to all functions of the unit classes and city class.</w:t>
+      </w:r>
+      <w:r>
+        <w:t xml:space="preserve"> This is to ensure the AI will have complete control over </w:t>
+      </w:r>
+      <w:r>
+        <w:t>its own units.</w:t>
+      </w:r>
+    </w:p>
+    <w:p/>
+    <w:p>
+      <w:r>
+        <w:t>This controller will be using a function to decide at what frequency random moves will be made by the AI. This is in order to ensure that the player feels like the AI is progressing throughout the series.</w:t>
+      </w:r>
+    </w:p>
+    <w:p>
+      <w:r>
+        <w:lastRenderedPageBreak/>
+        <w:t>There is no real drawback other than implementation and training time to giving the AI more options. This will also add to the feeling of immersion due to the player perceiving the AI as a real player.</w:t>
+      </w:r>
+    </w:p>
+    <w:p/>
+    <w:bookmarkStart w:id="56" w:name="_Toc228981257" w:displacedByCustomXml="next"/>
     <w:sdt>
       <w:sdtPr>
         <w:rPr>
@@ -7888,7 +8160,7 @@
           <w:r>
             <w:t>References</w:t>
           </w:r>
-          <w:bookmarkEnd w:id="54"/>
+          <w:bookmarkEnd w:id="56"/>
         </w:p>
         <w:sdt>
           <w:sdtPr>
@@ -8023,7 +8295,6 @@
                 <w:rPr>
                   <w:noProof/>
                 </w:rPr>
-                <w:lastRenderedPageBreak/>
                 <w:t xml:space="preserve">IQ, O., 2018. </w:t>
               </w:r>
               <w:r>
@@ -8353,6 +8624,7 @@
                 <w:rPr>
                   <w:noProof/>
                 </w:rPr>
+                <w:lastRenderedPageBreak/>
                 <w:t xml:space="preserve">Wikipedia, n.d. </w:t>
               </w:r>
               <w:r>

</xml_diff>

<commit_message>
fix: rewrote 3.3.1 ML-Agents to be more academic
</commit_message>
<xml_diff>
--- a/Report.docx
+++ b/Report.docx
@@ -331,15 +331,7 @@
     </w:p>
     <w:p>
       <w:r>
-        <w:t xml:space="preserve">AI is a still growing industry and while the current trend of AI is heading towards the usage of Large Language Models, I believe there is a genuine use case for machine learning models within video games. The focus of this project is to uncover the current reasons behind why the industry doesn’t use machine learning AI for uses such as </w:t>
-      </w:r>
-      <w:proofErr w:type="gramStart"/>
-      <w:r>
-        <w:t>Non-Player Characters</w:t>
-      </w:r>
-      <w:proofErr w:type="gramEnd"/>
-      <w:r>
-        <w:t xml:space="preserve"> or local multiplayer games. This is appro</w:t>
+        <w:t>AI is a still growing industry and while the current trend of AI is heading towards the usage of Large Language Models, I believe there is a genuine use case for machine learning models within video games. The focus of this project is to uncover the current reasons behind why the industry doesn’t use machine learning AI for uses such as Non-Player Characters or local multiplayer games. This is appro</w:t>
       </w:r>
       <w:r>
         <w:t>ached by covering the design choices and code architecture of implementing a machine learning model into the Unity game engine. To evaluate whether the AI is functional, data has been gathered using a mix of qualitative and quantitative research. This research was collected through a short survey given to participants.</w:t>
@@ -4763,7 +4755,7 @@
     <w:p/>
     <w:p>
       <w:r>
-        <w:t>The game will start the player off in a randomly generated world on a roughly equidistant tile from any other players, giving them the freedom to settle their first city immediately or to move them around to somewhere that may be more suited to their playstyle. The player will then be able to farm the lands resources to stimulate city growth, population growth and overall production. I have designed the game in this way to hopefully create a replay-able and fun game for players to enjoy and come back to.</w:t>
+        <w:t>The game will start the player off in a randomly generated world on a roughly equidistant tile from any other players, giving them the freedom to settle their first city immediately or to move them around to somewhere that may be more suited to their playstyle. The player will then be able to farm the lands resources to stimulate city growth, population growth and overall production. I have designed the game in this way to create a replay-able and fun game for players to enjoy and come back to.</w:t>
       </w:r>
     </w:p>
     <w:p/>
@@ -4920,15 +4912,7 @@
     </w:p>
     <w:p>
       <w:r>
-        <w:t xml:space="preserve">The objectives in terms of scope for this project are going to be generally quite broad and consist of specific milestones. The core objectives </w:t>
-      </w:r>
-      <w:proofErr w:type="gramStart"/>
-      <w:r>
-        <w:t>in regards to</w:t>
-      </w:r>
-      <w:proofErr w:type="gramEnd"/>
-      <w:r>
-        <w:t xml:space="preserve"> the scope are:</w:t>
+        <w:t>The objectives in terms of scope for this project are going to be generally quite broad and consist of specific milestones. The core objectives in regards to the scope are:</w:t>
       </w:r>
     </w:p>
     <w:p>
@@ -4991,15 +4975,7 @@
     </w:p>
     <w:p>
       <w:r>
-        <w:t xml:space="preserve">For the research objectives for the game, research will be conducted into other types of media with similar features. This research will include a comparison of similar games and their features and the overall impact of those features on this project. This will be done to find a balance for the difficulty of the game and to evaluate the necessary features for the game. Some topics of features and mechanics that will be researched </w:t>
-      </w:r>
-      <w:proofErr w:type="gramStart"/>
-      <w:r>
-        <w:t>include:</w:t>
-      </w:r>
-      <w:proofErr w:type="gramEnd"/>
-      <w:r>
-        <w:t xml:space="preserve"> World Generation, Pathfinding</w:t>
+        <w:t>For the research objectives for the game, research will be conducted into other types of media with similar features. This research will include a comparison of similar games and their features and the overall impact of those features on this project. This will be done to find a balance for the difficulty of the game and to evaluate the necessary features for the game. Some topics of features and mechanics that will be researched include: World Generation, Pathfinding</w:t>
       </w:r>
       <w:r>
         <w:t xml:space="preserve"> and </w:t>
@@ -5419,9 +5395,8 @@
       <w:r>
         <w:t>, world generation plays a crucial role in shaping how players explore, expand, and interact with the game environment. The structure and distribution of terrain, resources, and starting positions can dramatically influence both gameplay strategies and overall fairness.</w:t>
       </w:r>
-      <w:r>
-        <w:br/>
-      </w:r>
+    </w:p>
+    <w:p>
       <w:r>
         <w:br/>
         <w:t xml:space="preserve">Games that will be researched for this section include </w:t>
@@ -5486,9 +5461,11 @@
       <w:r>
         <w:t>pseudo-random textures, also known as octaves, on top of each other and taking an average of each pixel’s value in the texture. The scale and lacunarity relate to how far you “view” the texture from and how much you “zoom” in on each successive octave.</w:t>
       </w:r>
-      <w:r>
-        <w:br/>
-      </w:r>
+    </w:p>
+    <w:p>
+      <w:pPr>
+        <w:keepNext/>
+      </w:pPr>
       <w:r>
         <w:br/>
       </w:r>
@@ -5767,14 +5744,27 @@
       <w:r>
         <w:t xml:space="preserve">Figure </w:t>
       </w:r>
-      <w:fldSimple w:instr=" SEQ Figure \* ARABIC ">
-        <w:r>
-          <w:rPr>
-            <w:noProof/>
-          </w:rPr>
-          <w:t>1</w:t>
-        </w:r>
-      </w:fldSimple>
+      <w:r>
+        <w:fldChar w:fldCharType="begin"/>
+      </w:r>
+      <w:r>
+        <w:instrText xml:space="preserve"> SEQ Figure \* ARABIC </w:instrText>
+      </w:r>
+      <w:r>
+        <w:fldChar w:fldCharType="separate"/>
+      </w:r>
+      <w:r>
+        <w:rPr>
+          <w:noProof/>
+        </w:rPr>
+        <w:t>1</w:t>
+      </w:r>
+      <w:r>
+        <w:rPr>
+          <w:noProof/>
+        </w:rPr>
+        <w:fldChar w:fldCharType="end"/>
+      </w:r>
       <w:r>
         <w:t xml:space="preserve"> </w:t>
       </w:r>
@@ -5881,9 +5871,8 @@
       <w:r>
         <w:t xml:space="preserve"> to define the side.</w:t>
       </w:r>
-      <w:r>
-        <w:br/>
-      </w:r>
+    </w:p>
+    <w:p>
       <w:r>
         <w:br/>
         <w:t>In The Binding of Isaac (2011), this is used to generate the floor layout</w:t>
@@ -5918,9 +5907,8 @@
       <w:r>
         <w:t>and then randomly placing the cells inside the grid. Then a ruleset can be defined, which in more simple designs, normally only consider the neighbouring tiles in the grid, such as moving towards another neighbour.</w:t>
       </w:r>
-      <w:r>
-        <w:br/>
-      </w:r>
+    </w:p>
+    <w:p>
       <w:r>
         <w:br/>
         <w:t xml:space="preserve">The most famous use of cellular automata is likely to be Conway’s Game of Life (1970) where it </w:t>
@@ -5961,15 +5949,7 @@
         <w:t>)</w:t>
       </w:r>
       <w:r>
-        <w:t xml:space="preserve"> according to the following two rules: If a cell is alive, it survives to the next generation if it has 2 or 3 live neighbors; otherwise it dies. If a cell is dead, it comes to life in the next generation if it has exactly 3 live neighbors; </w:t>
-      </w:r>
-      <w:proofErr w:type="gramStart"/>
-      <w:r>
-        <w:t>otherwise</w:t>
-      </w:r>
-      <w:proofErr w:type="gramEnd"/>
-      <w:r>
-        <w:t xml:space="preserve"> it stays dead.” </w:t>
+        <w:t xml:space="preserve"> according to the following two rules: If a cell is alive, it survives to the next generation if it has 2 or 3 live neighbors; otherwise it dies. If a cell is dead, it comes to life in the next generation if it has exactly 3 live neighbors; otherwise it stays dead.” </w:t>
       </w:r>
       <w:sdt>
         <w:sdtPr>
@@ -5997,10 +5977,10 @@
           </w:r>
         </w:sdtContent>
       </w:sdt>
-      <w:r>
-        <w:br/>
-      </w:r>
-      <w:r>
+    </w:p>
+    <w:p>
+      <w:r>
+        <w:lastRenderedPageBreak/>
         <w:br/>
         <w:t xml:space="preserve">In Terraria (2011), cellular automata </w:t>
       </w:r>
@@ -6008,11 +5988,7 @@
         <w:t>are</w:t>
       </w:r>
       <w:r>
-        <w:t xml:space="preserve"> used in this exact way, the game randomly defines a </w:t>
-      </w:r>
-      <w:r>
-        <w:lastRenderedPageBreak/>
-        <w:t>grid and randomly places alive cells and dead cells in the grid, typically weighted to the bottom of the grid. The game then simulates a given number of ticks, and the output of that is the world map. At this stage, biomes can be identified in one of two ways, randomly allocating sections of the world to each desired biome or using the final “weighting” of the alive cells to create the biomes.</w:t>
+        <w:t xml:space="preserve"> used in this exact way, the game randomly defines a grid and randomly places alive cells and dead cells in the grid, typically weighted to the bottom of the grid. The game then simulates a given number of ticks, and the output of that is the world map. At this stage, biomes can be identified in one of two ways, randomly allocating sections of the world to each desired biome or using the final “weighting” of the alive cells to create the biomes.</w:t>
       </w:r>
     </w:p>
     <w:p>
@@ -6055,15 +6031,7 @@
         <w:t xml:space="preserve"> </w:t>
       </w:r>
       <w:r>
-        <w:t xml:space="preserve">The types of pathfinding I will be evaluating </w:t>
-      </w:r>
-      <w:proofErr w:type="gramStart"/>
-      <w:r>
-        <w:t>are:</w:t>
-      </w:r>
-      <w:proofErr w:type="gramEnd"/>
-      <w:r>
-        <w:t xml:space="preserve"> A*, Dijkstra</w:t>
+        <w:t>The types of pathfinding I will be evaluating are: A*, Dijkstra</w:t>
       </w:r>
       <w:r>
         <w:t>,</w:t>
@@ -6173,14 +6141,27 @@
       <w:r>
         <w:t xml:space="preserve">Figure </w:t>
       </w:r>
-      <w:fldSimple w:instr=" SEQ Figure \* ARABIC ">
-        <w:r>
-          <w:rPr>
-            <w:noProof/>
-          </w:rPr>
-          <w:t>2</w:t>
-        </w:r>
-      </w:fldSimple>
+      <w:r>
+        <w:fldChar w:fldCharType="begin"/>
+      </w:r>
+      <w:r>
+        <w:instrText xml:space="preserve"> SEQ Figure \* ARABIC </w:instrText>
+      </w:r>
+      <w:r>
+        <w:fldChar w:fldCharType="separate"/>
+      </w:r>
+      <w:r>
+        <w:rPr>
+          <w:noProof/>
+        </w:rPr>
+        <w:t>2</w:t>
+      </w:r>
+      <w:r>
+        <w:rPr>
+          <w:noProof/>
+        </w:rPr>
+        <w:fldChar w:fldCharType="end"/>
+      </w:r>
       <w:r>
         <w:t xml:space="preserve"> </w:t>
       </w:r>
@@ -6244,11 +6225,11 @@
         <w:t>”</w:t>
       </w:r>
       <w:r>
-        <w:t xml:space="preserve"> node 2 as it is closer than node 4, and repeats the same process. The distance to node 3 becomes 9 and after node 3 is processed, it makes a step towards node 4, noticing that the cost is </w:t>
+        <w:t xml:space="preserve"> node </w:t>
       </w:r>
       <w:r>
         <w:lastRenderedPageBreak/>
-        <w:t>greater than the path it reached earlier and doesn’t update the distance as a shorter one already exists.</w:t>
+        <w:t>2 as it is closer than node 4, and repeats the same process. The distance to node 3 becomes 9 and after node 3 is processed, it makes a step towards node 4, noticing that the cost is greater than the path it reached earlier and doesn’t update the distance as a shorter one already exists.</w:t>
       </w:r>
     </w:p>
     <w:p>
@@ -6380,9 +6361,8 @@
       <w:r>
         <w:t>AI is one of the core components of this game and as such needs to be meticulously researched before implementing to ensure I get it right. AI will be used within this game to primarily drive the player’s opponent.</w:t>
       </w:r>
-      <w:r>
-        <w:br/>
-      </w:r>
+    </w:p>
+    <w:p>
       <w:r>
         <w:br/>
         <w:t>In this section of research, I will be researching 3 different types of AI for their strengths and weaknesses and their application within my game. The types of AI I will be researching are: Neural Networks, Reinforcement Learning, and Imitation Learning</w:t>
@@ -6397,6 +6377,7 @@
       </w:pPr>
       <w:bookmarkStart w:id="33" w:name="_Toc228981240"/>
       <w:r>
+        <w:lastRenderedPageBreak/>
         <w:t>2.2.3.1 Neural Network</w:t>
       </w:r>
       <w:bookmarkEnd w:id="33"/>
@@ -6409,24 +6390,13 @@
         <w:t>, utilizing artificial neurons and weights to identify patterns and make predictions.</w:t>
       </w:r>
       <w:r>
-        <w:t xml:space="preserve"> Neural networks need </w:t>
-      </w:r>
-      <w:r>
-        <w:lastRenderedPageBreak/>
-        <w:t>training data to be able to recognize patterns and alter behaviours. This training data allows the network to “know” things about its input, for example, positions of objects.</w:t>
-      </w:r>
-    </w:p>
-    <w:p>
-      <w:r>
-        <w:t xml:space="preserve">After the initial training phase, if we present the network with a </w:t>
-      </w:r>
-      <w:proofErr w:type="gramStart"/>
-      <w:r>
-        <w:t>pattern</w:t>
-      </w:r>
-      <w:proofErr w:type="gramEnd"/>
-      <w:r>
-        <w:t xml:space="preserve"> it hasn’t seen before in its training data, it should classify the unseen pattern correctly, only if it has learnt the underlying structure of the problem </w:t>
+        <w:t xml:space="preserve"> Neural networks need training data to be able to recognize patterns and alter behaviours. This training data allows the network to “know” things about its input, for example, positions of objects.</w:t>
+      </w:r>
+    </w:p>
+    <w:p/>
+    <w:p>
+      <w:r>
+        <w:t xml:space="preserve">After the initial training phase, if we present the network with a pattern it hasn’t seen before in its training data, it should classify the unseen pattern correctly, only if it has learnt the underlying structure of the problem </w:t>
       </w:r>
       <w:sdt>
         <w:sdtPr>
@@ -6541,14 +6511,27 @@
       <w:r>
         <w:t xml:space="preserve">Figure </w:t>
       </w:r>
-      <w:fldSimple w:instr=" SEQ Figure \* ARABIC ">
-        <w:r>
-          <w:rPr>
-            <w:noProof/>
-          </w:rPr>
-          <w:t>3</w:t>
-        </w:r>
-      </w:fldSimple>
+      <w:r>
+        <w:fldChar w:fldCharType="begin"/>
+      </w:r>
+      <w:r>
+        <w:instrText xml:space="preserve"> SEQ Figure \* ARABIC </w:instrText>
+      </w:r>
+      <w:r>
+        <w:fldChar w:fldCharType="separate"/>
+      </w:r>
+      <w:r>
+        <w:rPr>
+          <w:noProof/>
+        </w:rPr>
+        <w:t>3</w:t>
+      </w:r>
+      <w:r>
+        <w:rPr>
+          <w:noProof/>
+        </w:rPr>
+        <w:fldChar w:fldCharType="end"/>
+      </w:r>
       <w:r>
         <w:t xml:space="preserve"> </w:t>
       </w:r>
@@ -6664,6 +6647,7 @@
       </w:pPr>
       <w:bookmarkStart w:id="36" w:name="_Toc228981242"/>
       <w:r>
+        <w:lastRenderedPageBreak/>
         <w:t>2.2.3.3 Imitation Learning</w:t>
       </w:r>
       <w:bookmarkEnd w:id="36"/>
@@ -6676,11 +6660,7 @@
         <w:t>“</w:t>
       </w:r>
       <w:r>
-        <w:t xml:space="preserve">supervised learning to predict the expert’s </w:t>
-      </w:r>
-      <w:r>
-        <w:lastRenderedPageBreak/>
-        <w:t>action for any given state</w:t>
+        <w:t>supervised learning to predict the expert’s action for any given state</w:t>
       </w:r>
       <w:r>
         <w:t>”</w:t>
@@ -6717,9 +6697,8 @@
       <w:r>
         <w:t xml:space="preserve">. Behavioural Cloning is often unreliable as prediction errors compound extremely quickly. </w:t>
       </w:r>
-      <w:r>
-        <w:br/>
-      </w:r>
+    </w:p>
+    <w:p>
       <w:r>
         <w:br/>
       </w:r>
@@ -6976,15 +6955,28 @@
       <w:r>
         <w:t xml:space="preserve">Figure </w:t>
       </w:r>
-      <w:fldSimple w:instr=" SEQ Figure \* ARABIC ">
-        <w:r>
-          <w:rPr>
-            <w:noProof/>
-          </w:rPr>
-          <w:t>4</w:t>
-        </w:r>
-        <w:bookmarkEnd w:id="40"/>
-      </w:fldSimple>
+      <w:r>
+        <w:fldChar w:fldCharType="begin"/>
+      </w:r>
+      <w:r>
+        <w:instrText xml:space="preserve"> SEQ Figure \* ARABIC </w:instrText>
+      </w:r>
+      <w:r>
+        <w:fldChar w:fldCharType="separate"/>
+      </w:r>
+      <w:r>
+        <w:rPr>
+          <w:noProof/>
+        </w:rPr>
+        <w:t>4</w:t>
+      </w:r>
+      <w:bookmarkEnd w:id="40"/>
+      <w:r>
+        <w:rPr>
+          <w:noProof/>
+        </w:rPr>
+        <w:fldChar w:fldCharType="end"/>
+      </w:r>
     </w:p>
     <w:p>
       <w:r>
@@ -7090,15 +7082,28 @@
             <w:r>
               <w:t xml:space="preserve">Figure </w:t>
             </w:r>
-            <w:fldSimple w:instr=" SEQ Figure \* ARABIC ">
-              <w:r>
-                <w:rPr>
-                  <w:noProof/>
-                </w:rPr>
-                <w:t>5</w:t>
-              </w:r>
-              <w:bookmarkEnd w:id="41"/>
-            </w:fldSimple>
+            <w:r>
+              <w:fldChar w:fldCharType="begin"/>
+            </w:r>
+            <w:r>
+              <w:instrText xml:space="preserve"> SEQ Figure \* ARABIC </w:instrText>
+            </w:r>
+            <w:r>
+              <w:fldChar w:fldCharType="separate"/>
+            </w:r>
+            <w:r>
+              <w:rPr>
+                <w:noProof/>
+              </w:rPr>
+              <w:t>5</w:t>
+            </w:r>
+            <w:bookmarkEnd w:id="41"/>
+            <w:r>
+              <w:rPr>
+                <w:noProof/>
+              </w:rPr>
+              <w:fldChar w:fldCharType="end"/>
+            </w:r>
           </w:p>
         </w:tc>
         <w:tc>
@@ -7178,15 +7183,28 @@
             <w:r>
               <w:t xml:space="preserve">Figure </w:t>
             </w:r>
-            <w:fldSimple w:instr=" SEQ Figure \* ARABIC ">
-              <w:r>
-                <w:rPr>
-                  <w:noProof/>
-                </w:rPr>
-                <w:t>6</w:t>
-              </w:r>
-              <w:bookmarkEnd w:id="42"/>
-            </w:fldSimple>
+            <w:r>
+              <w:fldChar w:fldCharType="begin"/>
+            </w:r>
+            <w:r>
+              <w:instrText xml:space="preserve"> SEQ Figure \* ARABIC </w:instrText>
+            </w:r>
+            <w:r>
+              <w:fldChar w:fldCharType="separate"/>
+            </w:r>
+            <w:r>
+              <w:rPr>
+                <w:noProof/>
+              </w:rPr>
+              <w:t>6</w:t>
+            </w:r>
+            <w:bookmarkEnd w:id="42"/>
+            <w:r>
+              <w:rPr>
+                <w:noProof/>
+              </w:rPr>
+              <w:fldChar w:fldCharType="end"/>
+            </w:r>
           </w:p>
         </w:tc>
       </w:tr>
@@ -7199,7 +7217,13 @@
     </w:p>
     <w:p>
       <w:r>
-        <w:t xml:space="preserve">Figure 5 is a visualisation of a 3x3 hexagonal grid. There is one glaring issue, there is lots of </w:t>
+        <w:t xml:space="preserve">Figure 5 is a visualisation of a 3x3 hexagonal grid. There </w:t>
+      </w:r>
+      <w:r>
+        <w:t>a key limitation</w:t>
+      </w:r>
+      <w:r>
+        <w:t xml:space="preserve">, there is lots of </w:t>
       </w:r>
       <w:r>
         <w:t xml:space="preserve">dead </w:t>
@@ -7412,14 +7436,27 @@
       <w:r>
         <w:t xml:space="preserve">Figure </w:t>
       </w:r>
-      <w:fldSimple w:instr=" SEQ Figure \* ARABIC ">
-        <w:r>
-          <w:rPr>
-            <w:noProof/>
-          </w:rPr>
-          <w:t>7</w:t>
-        </w:r>
-      </w:fldSimple>
+      <w:r>
+        <w:fldChar w:fldCharType="begin"/>
+      </w:r>
+      <w:r>
+        <w:instrText xml:space="preserve"> SEQ Figure \* ARABIC </w:instrText>
+      </w:r>
+      <w:r>
+        <w:fldChar w:fldCharType="separate"/>
+      </w:r>
+      <w:r>
+        <w:rPr>
+          <w:noProof/>
+        </w:rPr>
+        <w:t>7</w:t>
+      </w:r>
+      <w:r>
+        <w:rPr>
+          <w:noProof/>
+        </w:rPr>
+        <w:fldChar w:fldCharType="end"/>
+      </w:r>
       <w:r>
         <w:t xml:space="preserve"> </w:t>
       </w:r>
@@ -7459,15 +7496,7 @@
         <w:t xml:space="preserve"> a pixel is, can become the boundaries for biomes. In this example, there are only 3 biomes: ocean, beach, and grass</w:t>
       </w:r>
       <w:r>
-        <w:t xml:space="preserve">. The </w:t>
-      </w:r>
-      <w:proofErr w:type="gramStart"/>
-      <w:r>
-        <w:t>amount</w:t>
-      </w:r>
-      <w:proofErr w:type="gramEnd"/>
-      <w:r>
-        <w:t xml:space="preserve"> of biomes possible are technically infinite. Although biome separation will be very prevalent as you go past roughly 10 biomes. </w:t>
+        <w:t xml:space="preserve">. The amount of biomes possible are technically infinite. Although biome separation will be very prevalent as you go past roughly 10 biomes. </w:t>
       </w:r>
     </w:p>
     <w:p/>
@@ -7476,15 +7505,7 @@
         <w:t xml:space="preserve">For my game, I am choosing to have 5 true biomes: Deep water, shallow water, sand, grass and snow. Each of these biomes are going to be abundant in different resources and </w:t>
       </w:r>
       <w:r>
-        <w:t xml:space="preserve">have very different base tile variables. For example, grassland tiles will contain more production than a sand </w:t>
-      </w:r>
-      <w:proofErr w:type="gramStart"/>
-      <w:r>
-        <w:t>tile</w:t>
-      </w:r>
-      <w:proofErr w:type="gramEnd"/>
-      <w:r>
-        <w:t xml:space="preserve"> but a sand tile will have more gold than a grassland tile</w:t>
+        <w:t>have very different base tile variables. For example, grassland tiles will contain more production than a sand tile but a sand tile will have more gold than a grassland tile</w:t>
       </w:r>
       <w:r>
         <w:t>.</w:t>
@@ -7524,7 +7545,13 @@
         <w:t xml:space="preserve">Initially resources will be placed at random with some rules, such as fish only appearing on water tiles and wheat and cows only appearing in grassland. Other resources such as stone and iron will be available on any land tiles. </w:t>
       </w:r>
       <w:r>
-        <w:t>This random resource approach is purely for the development speed of the project and will hopefully be succeeded by a more sophisticated distribution algorithm to ensure both the player and the AI have relatively equal access to resources.</w:t>
+        <w:t xml:space="preserve">This random resource approach is purely for the development speed of the project and </w:t>
+      </w:r>
+      <w:r>
+        <w:t xml:space="preserve">will </w:t>
+      </w:r>
+      <w:r>
+        <w:t>be succeeded by a more sophisticated distribution algorithm to ensure both the player and the AI have relatively equal access to resources.</w:t>
       </w:r>
     </w:p>
     <w:p>
@@ -7723,21 +7750,19 @@
     <w:p/>
     <w:p>
       <w:r>
-        <w:t xml:space="preserve">The alternative method is to use references on all </w:t>
-      </w:r>
-      <w:proofErr w:type="gramStart"/>
-      <w:r>
-        <w:t>units,</w:t>
-      </w:r>
-      <w:proofErr w:type="gramEnd"/>
-      <w:r>
-        <w:t xml:space="preserve"> this is better for testing and easier to manage multiple instances of. The cons to this method are that, in Unity, getting references is quite expensive and the pathfinding will be a MonoBehaviour class meaning that the use of Unity’s GetComponent will be mandatory.</w:t>
+        <w:t>The alternative method is to use references on all units, this is better for testing and easier to manage multiple instances of. The cons to this method are that, in Unity, getting references is quite expensive and the pathfinding will be a MonoBehaviour class meaning that the use of Unity’s GetComponent will be mandatory.</w:t>
       </w:r>
     </w:p>
     <w:p>
       <w:r>
         <w:br/>
-        <w:t>The singleton design pattern seems to be perfect for this use case, allowing all units to access the class without having a reference to it. This eliminates the need to use GetComponent which has its own myriad of drawbacks such as the degradation of performance when units try to access it, NullReference exceptions crashing the pathfinding functions, and making redundant calls.</w:t>
+        <w:t xml:space="preserve">The singleton design pattern seems to be </w:t>
+      </w:r>
+      <w:r>
+        <w:t>well-suited</w:t>
+      </w:r>
+      <w:r>
+        <w:t xml:space="preserve"> for this use case, allowing all units to access the class without having a reference to it. This eliminates the need to use GetComponent which has its own myriad of drawbacks such as the degradation of performance when units try to access it, NullReference exceptions crashing the pathfinding functions, and making redundant calls.</w:t>
       </w:r>
     </w:p>
     <w:p>
@@ -7882,14 +7907,24 @@
       <w:r>
         <w:t xml:space="preserve">Figure </w:t>
       </w:r>
-      <w:fldSimple w:instr=" SEQ Figure \* ARABIC ">
-        <w:r>
-          <w:rPr>
-            <w:noProof/>
-          </w:rPr>
-          <w:t>8</w:t>
-        </w:r>
-      </w:fldSimple>
+      <w:r>
+        <w:fldChar w:fldCharType="begin"/>
+      </w:r>
+      <w:r>
+        <w:instrText xml:space="preserve"> SEQ Figure \* ARABIC </w:instrText>
+      </w:r>
+      <w:r>
+        <w:fldChar w:fldCharType="separate"/>
+      </w:r>
+      <w:r>
+        <w:rPr>
+          <w:noProof/>
+        </w:rPr>
+        <w:t>8</w:t>
+      </w:r>
+      <w:r>
+        <w:fldChar w:fldCharType="end"/>
+      </w:r>
       <w:r>
         <w:t xml:space="preserve"> </w:t>
       </w:r>
@@ -7935,21 +7970,13 @@
         <w:t xml:space="preserve">Euclidean Distance </w:t>
       </w:r>
       <w:r>
-        <w:t xml:space="preserve">is a direct measurement from point A to point B. As shown in figure 8, from the origin, the provided line can be traced to its destination. Inserting all grid tiles that are highlighted into a list, a path can be formed from the origin to the destination. This is almost a perfect solution to this project’s requirements due to the ease of </w:t>
-      </w:r>
-      <w:proofErr w:type="gramStart"/>
-      <w:r>
-        <w:t>implementation</w:t>
-      </w:r>
-      <w:proofErr w:type="gramEnd"/>
-      <w:r>
-        <w:t xml:space="preserve"> and it </w:t>
-      </w:r>
-      <w:r>
-        <w:t>takes</w:t>
-      </w:r>
-      <w:r>
-        <w:t xml:space="preserve"> pathing cost into account. The drawbacks of Euclidean distance are that its relatively computationally expensive due to its handling of square roots.</w:t>
+        <w:t xml:space="preserve">is a direct measurement from point A to point B. As shown in figure 8, from the origin, the provided line can be traced to its destination. Inserting all grid tiles that are highlighted into a list, a path can be formed from the origin to the destination. This is almost a </w:t>
+      </w:r>
+      <w:r>
+        <w:t>well-suited</w:t>
+      </w:r>
+      <w:r>
+        <w:t xml:space="preserve"> solution to this project’s requirements due to the ease of implementation. The drawbacks of Euclidean distance are that its relatively computationally expensive due to its handling of square roots.</w:t>
       </w:r>
     </w:p>
     <w:p>
@@ -7973,15 +8000,7 @@
         <w:t xml:space="preserve">Another limitation of </w:t>
       </w:r>
       <w:r>
-        <w:t xml:space="preserve">pathfinding is that Euclidean heuristics are quite expensive to compute. This is due to a large </w:t>
-      </w:r>
-      <w:proofErr w:type="gramStart"/>
-      <w:r>
-        <w:t>amount</w:t>
-      </w:r>
-      <w:proofErr w:type="gramEnd"/>
-      <w:r>
-        <w:t xml:space="preserve"> of </w:t>
+        <w:t xml:space="preserve">pathfinding is that Euclidean heuristics are quite expensive to compute. This is due to a large amount of </w:t>
       </w:r>
       <w:r>
         <w:t>floating-point</w:t>
@@ -8068,34 +8087,67 @@
         </w:sdtContent>
       </w:sdt>
       <w:r>
-        <w:t xml:space="preserve">. ML-Agents is a framework that allows a Python API to communicate with the Unity game engine, allowing developers to train agents using reinforcement learning algorithms. </w:t>
+        <w:t>. ML-Agents is a framework that allows a Python API to communicate with the Unity game engine, allowing developers to train agents using reinforcement learning algorithms</w:t>
+      </w:r>
+      <w:r>
+        <w:t xml:space="preserve"> such as Proximal Policy Optimi</w:t>
+      </w:r>
+      <w:r>
+        <w:t>s</w:t>
+      </w:r>
+      <w:r>
+        <w:t>ation</w:t>
+      </w:r>
+      <w:r>
+        <w:t xml:space="preserve">. </w:t>
       </w:r>
     </w:p>
     <w:p/>
     <w:p>
       <w:r>
-        <w:t>The training works through adding sensor observations to actions and providing a reward to each action taken. This reward is not necessarily normalized but for the sake of this project should be treated as such. A series win will be treated as a +1</w:t>
-      </w:r>
-      <w:r>
-        <w:t>0 and a series loss will be treated as a -10</w:t>
-      </w:r>
-      <w:r>
-        <w:t xml:space="preserve"> to the sensor observation with actions such as </w:t>
-      </w:r>
-      <w:r>
-        <w:t>destroying units</w:t>
-      </w:r>
-      <w:r>
-        <w:t xml:space="preserve"> be worth +</w:t>
-      </w:r>
-      <w:r>
-        <w:t>1 and losing its own unit will be -0.5</w:t>
-      </w:r>
-      <w:r>
-        <w:t>.</w:t>
-      </w:r>
-      <w:r>
-        <w:t xml:space="preserve"> Rewards will also be distributed to the AI for taking actions like movement or even choosing to do an action. These rewards will be miniscule and exist solely to dissuade the AI from doing nothing later in the game. Other rewards such as a reward of -0.15 for not having any cities will be used to deter the AI from stalling at the beginning of the game.</w:t>
+        <w:t>The</w:t>
+      </w:r>
+      <w:r>
+        <w:t xml:space="preserve"> AI agent operates by observing the game state through a s</w:t>
+      </w:r>
+      <w:r>
+        <w:t>eries</w:t>
+      </w:r>
+      <w:r>
+        <w:t xml:space="preserve"> of defined sensor inputs, performing actions within the environment, and receiving rewards based on the outcomes of those actions. The design of these observations and rewards is critical, as they directly influence the learning behaviour of the agent.</w:t>
+      </w:r>
+    </w:p>
+    <w:p/>
+    <w:p>
+      <w:r>
+        <w:t xml:space="preserve">Additionally, small reward values are assigned to general actions, such as movement, to discourage inactivity and prevent the agent from </w:t>
+      </w:r>
+      <w:r>
+        <w:t>doing nothing</w:t>
+      </w:r>
+      <w:r>
+        <w:t>. A penalty is also applied for failing to establish cities early in the game (−0.15), encouraging the agent to engage with core gameplay mechanics.</w:t>
+      </w:r>
+    </w:p>
+    <w:p/>
+    <w:p>
+      <w:r>
+        <w:t>This reward structure has potential limitations such as</w:t>
+      </w:r>
+      <w:r>
+        <w:t xml:space="preserve"> </w:t>
+      </w:r>
+      <w:r>
+        <w:t>p</w:t>
+      </w:r>
+      <w:r>
+        <w:t>oorly balanced rewards lead</w:t>
+      </w:r>
+      <w:r>
+        <w:t>ing</w:t>
+      </w:r>
+      <w:r>
+        <w:t xml:space="preserve"> to unintended behaviours, such as the agent exploiting reward loops rather than pursuing long-term strategic goals. </w:t>
       </w:r>
     </w:p>
     <w:p>
@@ -8125,12 +8177,21 @@
         <w:t>This controller will be using a function to decide at what frequency random moves will be made by the AI. This is in order to ensure that the player feels like the AI is progressing throughout the series.</w:t>
       </w:r>
     </w:p>
-    <w:p>
-      <w:r>
-        <w:lastRenderedPageBreak/>
+    <w:p/>
+    <w:p>
+      <w:r>
         <w:t>There is no real drawback other than implementation and training time to giving the AI more options. This will also add to the feeling of immersion due to the player perceiving the AI as a real player.</w:t>
       </w:r>
     </w:p>
+    <w:p>
+      <w:pPr>
+        <w:pStyle w:val="Heading3"/>
+      </w:pPr>
+      <w:r>
+        <w:t>3.3.3 Limitations</w:t>
+      </w:r>
+    </w:p>
+    <w:p/>
     <w:p/>
     <w:bookmarkStart w:id="56" w:name="_Toc228981257" w:displacedByCustomXml="next"/>
     <w:sdt>
@@ -8498,6 +8559,7 @@
                 <w:rPr>
                   <w:noProof/>
                 </w:rPr>
+                <w:lastRenderedPageBreak/>
                 <w:t xml:space="preserve">Orsini, M. et al., 2021. </w:t>
               </w:r>
               <w:r>
@@ -8624,7 +8686,6 @@
                 <w:rPr>
                   <w:noProof/>
                 </w:rPr>
-                <w:lastRenderedPageBreak/>
                 <w:t xml:space="preserve">Wikipedia, n.d. </w:t>
               </w:r>
               <w:r>

</xml_diff>

<commit_message>
feat: added 3.3.3 Limitations to AI Integration design chapter
</commit_message>
<xml_diff>
--- a/Report.docx
+++ b/Report.docx
@@ -8191,8 +8191,35 @@
         <w:t>3.3.3 Limitations</w:t>
       </w:r>
     </w:p>
+    <w:p>
+      <w:r>
+        <w:t>Despite all the above mentioned advantages of Reinforcement Learning, several limitations need to be addressed. The most significant challenge is the computational cost associated with the training of the AI, particularly in a game</w:t>
+      </w:r>
+      <w:r>
+        <w:t>,</w:t>
+      </w:r>
+      <w:r>
+        <w:t xml:space="preserve"> like th</w:t>
+      </w:r>
+      <w:r>
+        <w:t>e one featured in this project,</w:t>
+      </w:r>
+      <w:r>
+        <w:t xml:space="preserve"> with a large state space. Training an effective agent may require a </w:t>
+      </w:r>
+      <w:r>
+        <w:t>large number of training sessions</w:t>
+      </w:r>
+      <w:r>
+        <w:t xml:space="preserve">. </w:t>
+      </w:r>
+    </w:p>
     <w:p/>
-    <w:p/>
+    <w:p>
+      <w:r>
+        <w:t>Additionally, reinforcement learning agents are sensitive to reward design. Poorly structured rewards can result in unintended or suboptimal behaviours, requiring iterative refinement and subsequent re-training. There is also a risk of overfitting to specific strategies during training which may reduce the ability to adapt to the players’ novel behaviours.</w:t>
+      </w:r>
+    </w:p>
     <w:bookmarkStart w:id="56" w:name="_Toc228981257" w:displacedByCustomXml="next"/>
     <w:sdt>
       <w:sdtPr>
@@ -8433,6 +8460,7 @@
                 <w:rPr>
                   <w:noProof/>
                 </w:rPr>
+                <w:lastRenderedPageBreak/>
                 <w:t xml:space="preserve">Kartik, 2026. </w:t>
               </w:r>
               <w:r>
@@ -8559,7 +8587,6 @@
                 <w:rPr>
                   <w:noProof/>
                 </w:rPr>
-                <w:lastRenderedPageBreak/>
                 <w:t xml:space="preserve">Orsini, M. et al., 2021. </w:t>
               </w:r>
               <w:r>

</xml_diff>

<commit_message>
feat: Implementation intro written
</commit_message>
<xml_diff>
--- a/Report.docx
+++ b/Report.docx
@@ -8218,6 +8218,25 @@
     <w:p>
       <w:r>
         <w:t>Additionally, reinforcement learning agents are sensitive to reward design. Poorly structured rewards can result in unintended or suboptimal behaviours, requiring iterative refinement and subsequent re-training. There is also a risk of overfitting to specific strategies during training which may reduce the ability to adapt to the players’ novel behaviours.</w:t>
+      </w:r>
+    </w:p>
+    <w:p>
+      <w:pPr>
+        <w:pStyle w:val="Heading1"/>
+      </w:pPr>
+      <w:r>
+        <w:t xml:space="preserve">Chapter 4 </w:t>
+      </w:r>
+      <w:r>
+        <w:t>–</w:t>
+      </w:r>
+      <w:r>
+        <w:t xml:space="preserve"> Implementation</w:t>
+      </w:r>
+    </w:p>
+    <w:p>
+      <w:r>
+        <w:t>The implementation chapter will be an overview of the main features’ implementation into Neural Conquest, including the reasoning behind certain decisions while implementing. The subchapters in this section are labelled after each of the subchapters from the literature survey and design chapter.</w:t>
       </w:r>
     </w:p>
     <w:bookmarkStart w:id="56" w:name="_Toc228981257" w:displacedByCustomXml="next"/>
@@ -8383,6 +8402,7 @@
                 <w:rPr>
                   <w:noProof/>
                 </w:rPr>
+                <w:lastRenderedPageBreak/>
                 <w:t xml:space="preserve">IQ, O., 2018. </w:t>
               </w:r>
               <w:r>
@@ -8460,7 +8480,6 @@
                 <w:rPr>
                   <w:noProof/>
                 </w:rPr>
-                <w:lastRenderedPageBreak/>
                 <w:t xml:space="preserve">Kartik, 2026. </w:t>
               </w:r>
               <w:r>

</xml_diff>

<commit_message>
feat: Creating the colour noise map
</commit_message>
<xml_diff>
--- a/Report.docx
+++ b/Report.docx
@@ -321,7 +321,7 @@
         <w:pStyle w:val="Heading1"/>
       </w:pPr>
       <w:bookmarkStart w:id="1" w:name="_Toc40898999"/>
-      <w:bookmarkStart w:id="2" w:name="_Toc228981212"/>
+      <w:bookmarkStart w:id="2" w:name="_Toc228987075"/>
       <w:r>
         <w:lastRenderedPageBreak/>
         <w:t>Abstract</w:t>
@@ -361,7 +361,7 @@
         <w:spacing w:after="321"/>
         <w:ind w:left="-5"/>
       </w:pPr>
-      <w:bookmarkStart w:id="3" w:name="_Toc228981213"/>
+      <w:bookmarkStart w:id="3" w:name="_Toc228987076"/>
       <w:r>
         <w:lastRenderedPageBreak/>
         <w:t>Declaration</w:t>
@@ -483,7 +483,7 @@
         <w:ind w:left="-5"/>
       </w:pPr>
       <w:bookmarkStart w:id="4" w:name="_Toc40899001"/>
-      <w:bookmarkStart w:id="5" w:name="_Toc228981214"/>
+      <w:bookmarkStart w:id="5" w:name="_Toc228987077"/>
       <w:r>
         <w:lastRenderedPageBreak/>
         <w:t>Acknowledgements</w:t>
@@ -620,7 +620,7 @@
         <w:spacing w:line="259" w:lineRule="auto"/>
       </w:pPr>
     </w:p>
-    <w:bookmarkStart w:id="6" w:name="_Toc228981215" w:displacedByCustomXml="next"/>
+    <w:bookmarkStart w:id="6" w:name="_Toc228987078" w:displacedByCustomXml="next"/>
     <w:sdt>
       <w:sdtPr>
         <w:rPr>
@@ -678,7 +678,7 @@
           <w:r>
             <w:fldChar w:fldCharType="separate"/>
           </w:r>
-          <w:hyperlink w:anchor="_Toc228981212" w:history="1">
+          <w:hyperlink w:anchor="_Toc228987075" w:history="1">
             <w:r>
               <w:rPr>
                 <w:rStyle w:val="Hyperlink"/>
@@ -705,7 +705,7 @@
                 <w:noProof/>
                 <w:webHidden/>
               </w:rPr>
-              <w:instrText xml:space="preserve"> PAGEREF _Toc228981212 \h </w:instrText>
+              <w:instrText xml:space="preserve"> PAGEREF _Toc228987075 \h </w:instrText>
             </w:r>
             <w:r>
               <w:rPr>
@@ -752,7 +752,7 @@
               <w14:ligatures w14:val="standardContextual"/>
             </w:rPr>
           </w:pPr>
-          <w:hyperlink w:anchor="_Toc228981213" w:history="1">
+          <w:hyperlink w:anchor="_Toc228987076" w:history="1">
             <w:r>
               <w:rPr>
                 <w:rStyle w:val="Hyperlink"/>
@@ -779,7 +779,7 @@
                 <w:noProof/>
                 <w:webHidden/>
               </w:rPr>
-              <w:instrText xml:space="preserve"> PAGEREF _Toc228981213 \h </w:instrText>
+              <w:instrText xml:space="preserve"> PAGEREF _Toc228987076 \h </w:instrText>
             </w:r>
             <w:r>
               <w:rPr>
@@ -826,7 +826,7 @@
               <w14:ligatures w14:val="standardContextual"/>
             </w:rPr>
           </w:pPr>
-          <w:hyperlink w:anchor="_Toc228981214" w:history="1">
+          <w:hyperlink w:anchor="_Toc228987077" w:history="1">
             <w:r>
               <w:rPr>
                 <w:rStyle w:val="Hyperlink"/>
@@ -853,7 +853,7 @@
                 <w:noProof/>
                 <w:webHidden/>
               </w:rPr>
-              <w:instrText xml:space="preserve"> PAGEREF _Toc228981214 \h </w:instrText>
+              <w:instrText xml:space="preserve"> PAGEREF _Toc228987077 \h </w:instrText>
             </w:r>
             <w:r>
               <w:rPr>
@@ -900,7 +900,7 @@
               <w14:ligatures w14:val="standardContextual"/>
             </w:rPr>
           </w:pPr>
-          <w:hyperlink w:anchor="_Toc228981215" w:history="1">
+          <w:hyperlink w:anchor="_Toc228987078" w:history="1">
             <w:r>
               <w:rPr>
                 <w:rStyle w:val="Hyperlink"/>
@@ -927,7 +927,7 @@
                 <w:noProof/>
                 <w:webHidden/>
               </w:rPr>
-              <w:instrText xml:space="preserve"> PAGEREF _Toc228981215 \h </w:instrText>
+              <w:instrText xml:space="preserve"> PAGEREF _Toc228987078 \h </w:instrText>
             </w:r>
             <w:r>
               <w:rPr>
@@ -974,7 +974,7 @@
               <w14:ligatures w14:val="standardContextual"/>
             </w:rPr>
           </w:pPr>
-          <w:hyperlink w:anchor="_Toc228981216" w:history="1">
+          <w:hyperlink w:anchor="_Toc228987079" w:history="1">
             <w:r>
               <w:rPr>
                 <w:rStyle w:val="Hyperlink"/>
@@ -1001,7 +1001,7 @@
                 <w:noProof/>
                 <w:webHidden/>
               </w:rPr>
-              <w:instrText xml:space="preserve"> PAGEREF _Toc228981216 \h </w:instrText>
+              <w:instrText xml:space="preserve"> PAGEREF _Toc228987079 \h </w:instrText>
             </w:r>
             <w:r>
               <w:rPr>
@@ -1048,7 +1048,7 @@
               <w14:ligatures w14:val="standardContextual"/>
             </w:rPr>
           </w:pPr>
-          <w:hyperlink w:anchor="_Toc228981217" w:history="1">
+          <w:hyperlink w:anchor="_Toc228987080" w:history="1">
             <w:r>
               <w:rPr>
                 <w:rStyle w:val="Hyperlink"/>
@@ -1075,7 +1075,7 @@
                 <w:noProof/>
                 <w:webHidden/>
               </w:rPr>
-              <w:instrText xml:space="preserve"> PAGEREF _Toc228981217 \h </w:instrText>
+              <w:instrText xml:space="preserve"> PAGEREF _Toc228987080 \h </w:instrText>
             </w:r>
             <w:r>
               <w:rPr>
@@ -1122,7 +1122,7 @@
               <w14:ligatures w14:val="standardContextual"/>
             </w:rPr>
           </w:pPr>
-          <w:hyperlink w:anchor="_Toc228981218" w:history="1">
+          <w:hyperlink w:anchor="_Toc228987081" w:history="1">
             <w:r>
               <w:rPr>
                 <w:rStyle w:val="Hyperlink"/>
@@ -1149,7 +1149,7 @@
                 <w:noProof/>
                 <w:webHidden/>
               </w:rPr>
-              <w:instrText xml:space="preserve"> PAGEREF _Toc228981218 \h </w:instrText>
+              <w:instrText xml:space="preserve"> PAGEREF _Toc228987081 \h </w:instrText>
             </w:r>
             <w:r>
               <w:rPr>
@@ -1196,7 +1196,7 @@
               <w14:ligatures w14:val="standardContextual"/>
             </w:rPr>
           </w:pPr>
-          <w:hyperlink w:anchor="_Toc228981219" w:history="1">
+          <w:hyperlink w:anchor="_Toc228987082" w:history="1">
             <w:r>
               <w:rPr>
                 <w:rStyle w:val="Hyperlink"/>
@@ -1223,7 +1223,7 @@
                 <w:noProof/>
                 <w:webHidden/>
               </w:rPr>
-              <w:instrText xml:space="preserve"> PAGEREF _Toc228981219 \h </w:instrText>
+              <w:instrText xml:space="preserve"> PAGEREF _Toc228987082 \h </w:instrText>
             </w:r>
             <w:r>
               <w:rPr>
@@ -1270,7 +1270,7 @@
               <w14:ligatures w14:val="standardContextual"/>
             </w:rPr>
           </w:pPr>
-          <w:hyperlink w:anchor="_Toc228981220" w:history="1">
+          <w:hyperlink w:anchor="_Toc228987083" w:history="1">
             <w:r>
               <w:rPr>
                 <w:rStyle w:val="Hyperlink"/>
@@ -1297,7 +1297,7 @@
                 <w:noProof/>
                 <w:webHidden/>
               </w:rPr>
-              <w:instrText xml:space="preserve"> PAGEREF _Toc228981220 \h </w:instrText>
+              <w:instrText xml:space="preserve"> PAGEREF _Toc228987083 \h </w:instrText>
             </w:r>
             <w:r>
               <w:rPr>
@@ -1344,7 +1344,7 @@
               <w14:ligatures w14:val="standardContextual"/>
             </w:rPr>
           </w:pPr>
-          <w:hyperlink w:anchor="_Toc228981221" w:history="1">
+          <w:hyperlink w:anchor="_Toc228987084" w:history="1">
             <w:r>
               <w:rPr>
                 <w:rStyle w:val="Hyperlink"/>
@@ -1371,7 +1371,7 @@
                 <w:noProof/>
                 <w:webHidden/>
               </w:rPr>
-              <w:instrText xml:space="preserve"> PAGEREF _Toc228981221 \h </w:instrText>
+              <w:instrText xml:space="preserve"> PAGEREF _Toc228987084 \h </w:instrText>
             </w:r>
             <w:r>
               <w:rPr>
@@ -1418,7 +1418,7 @@
               <w14:ligatures w14:val="standardContextual"/>
             </w:rPr>
           </w:pPr>
-          <w:hyperlink w:anchor="_Toc228981222" w:history="1">
+          <w:hyperlink w:anchor="_Toc228987085" w:history="1">
             <w:r>
               <w:rPr>
                 <w:rStyle w:val="Hyperlink"/>
@@ -1445,7 +1445,7 @@
                 <w:noProof/>
                 <w:webHidden/>
               </w:rPr>
-              <w:instrText xml:space="preserve"> PAGEREF _Toc228981222 \h </w:instrText>
+              <w:instrText xml:space="preserve"> PAGEREF _Toc228987085 \h </w:instrText>
             </w:r>
             <w:r>
               <w:rPr>
@@ -1492,7 +1492,7 @@
               <w14:ligatures w14:val="standardContextual"/>
             </w:rPr>
           </w:pPr>
-          <w:hyperlink w:anchor="_Toc228981223" w:history="1">
+          <w:hyperlink w:anchor="_Toc228987086" w:history="1">
             <w:r>
               <w:rPr>
                 <w:rStyle w:val="Hyperlink"/>
@@ -1519,7 +1519,7 @@
                 <w:noProof/>
                 <w:webHidden/>
               </w:rPr>
-              <w:instrText xml:space="preserve"> PAGEREF _Toc228981223 \h </w:instrText>
+              <w:instrText xml:space="preserve"> PAGEREF _Toc228987086 \h </w:instrText>
             </w:r>
             <w:r>
               <w:rPr>
@@ -1566,7 +1566,7 @@
               <w14:ligatures w14:val="standardContextual"/>
             </w:rPr>
           </w:pPr>
-          <w:hyperlink w:anchor="_Toc228981224" w:history="1">
+          <w:hyperlink w:anchor="_Toc228987087" w:history="1">
             <w:r>
               <w:rPr>
                 <w:rStyle w:val="Hyperlink"/>
@@ -1593,7 +1593,7 @@
                 <w:noProof/>
                 <w:webHidden/>
               </w:rPr>
-              <w:instrText xml:space="preserve"> PAGEREF _Toc228981224 \h </w:instrText>
+              <w:instrText xml:space="preserve"> PAGEREF _Toc228987087 \h </w:instrText>
             </w:r>
             <w:r>
               <w:rPr>
@@ -1640,7 +1640,7 @@
               <w14:ligatures w14:val="standardContextual"/>
             </w:rPr>
           </w:pPr>
-          <w:hyperlink w:anchor="_Toc228981225" w:history="1">
+          <w:hyperlink w:anchor="_Toc228987088" w:history="1">
             <w:r>
               <w:rPr>
                 <w:rStyle w:val="Hyperlink"/>
@@ -1667,7 +1667,7 @@
                 <w:noProof/>
                 <w:webHidden/>
               </w:rPr>
-              <w:instrText xml:space="preserve"> PAGEREF _Toc228981225 \h </w:instrText>
+              <w:instrText xml:space="preserve"> PAGEREF _Toc228987088 \h </w:instrText>
             </w:r>
             <w:r>
               <w:rPr>
@@ -1714,7 +1714,7 @@
               <w14:ligatures w14:val="standardContextual"/>
             </w:rPr>
           </w:pPr>
-          <w:hyperlink w:anchor="_Toc228981226" w:history="1">
+          <w:hyperlink w:anchor="_Toc228987089" w:history="1">
             <w:r>
               <w:rPr>
                 <w:rStyle w:val="Hyperlink"/>
@@ -1741,7 +1741,7 @@
                 <w:noProof/>
                 <w:webHidden/>
               </w:rPr>
-              <w:instrText xml:space="preserve"> PAGEREF _Toc228981226 \h </w:instrText>
+              <w:instrText xml:space="preserve"> PAGEREF _Toc228987089 \h </w:instrText>
             </w:r>
             <w:r>
               <w:rPr>
@@ -1788,7 +1788,7 @@
               <w14:ligatures w14:val="standardContextual"/>
             </w:rPr>
           </w:pPr>
-          <w:hyperlink w:anchor="_Toc228981227" w:history="1">
+          <w:hyperlink w:anchor="_Toc228987090" w:history="1">
             <w:r>
               <w:rPr>
                 <w:rStyle w:val="Hyperlink"/>
@@ -1815,7 +1815,7 @@
                 <w:noProof/>
                 <w:webHidden/>
               </w:rPr>
-              <w:instrText xml:space="preserve"> PAGEREF _Toc228981227 \h </w:instrText>
+              <w:instrText xml:space="preserve"> PAGEREF _Toc228987090 \h </w:instrText>
             </w:r>
             <w:r>
               <w:rPr>
@@ -1862,7 +1862,7 @@
               <w14:ligatures w14:val="standardContextual"/>
             </w:rPr>
           </w:pPr>
-          <w:hyperlink w:anchor="_Toc228981228" w:history="1">
+          <w:hyperlink w:anchor="_Toc228987091" w:history="1">
             <w:r>
               <w:rPr>
                 <w:rStyle w:val="Hyperlink"/>
@@ -1889,7 +1889,7 @@
                 <w:noProof/>
                 <w:webHidden/>
               </w:rPr>
-              <w:instrText xml:space="preserve"> PAGEREF _Toc228981228 \h </w:instrText>
+              <w:instrText xml:space="preserve"> PAGEREF _Toc228987091 \h </w:instrText>
             </w:r>
             <w:r>
               <w:rPr>
@@ -1936,7 +1936,7 @@
               <w14:ligatures w14:val="standardContextual"/>
             </w:rPr>
           </w:pPr>
-          <w:hyperlink w:anchor="_Toc228981229" w:history="1">
+          <w:hyperlink w:anchor="_Toc228987092" w:history="1">
             <w:r>
               <w:rPr>
                 <w:rStyle w:val="Hyperlink"/>
@@ -1963,7 +1963,7 @@
                 <w:noProof/>
                 <w:webHidden/>
               </w:rPr>
-              <w:instrText xml:space="preserve"> PAGEREF _Toc228981229 \h </w:instrText>
+              <w:instrText xml:space="preserve"> PAGEREF _Toc228987092 \h </w:instrText>
             </w:r>
             <w:r>
               <w:rPr>
@@ -2010,7 +2010,7 @@
               <w14:ligatures w14:val="standardContextual"/>
             </w:rPr>
           </w:pPr>
-          <w:hyperlink w:anchor="_Toc228981230" w:history="1">
+          <w:hyperlink w:anchor="_Toc228987093" w:history="1">
             <w:r>
               <w:rPr>
                 <w:rStyle w:val="Hyperlink"/>
@@ -2037,7 +2037,7 @@
                 <w:noProof/>
                 <w:webHidden/>
               </w:rPr>
-              <w:instrText xml:space="preserve"> PAGEREF _Toc228981230 \h </w:instrText>
+              <w:instrText xml:space="preserve"> PAGEREF _Toc228987093 \h </w:instrText>
             </w:r>
             <w:r>
               <w:rPr>
@@ -2084,7 +2084,7 @@
               <w14:ligatures w14:val="standardContextual"/>
             </w:rPr>
           </w:pPr>
-          <w:hyperlink w:anchor="_Toc228981231" w:history="1">
+          <w:hyperlink w:anchor="_Toc228987094" w:history="1">
             <w:r>
               <w:rPr>
                 <w:rStyle w:val="Hyperlink"/>
@@ -2111,7 +2111,7 @@
                 <w:noProof/>
                 <w:webHidden/>
               </w:rPr>
-              <w:instrText xml:space="preserve"> PAGEREF _Toc228981231 \h </w:instrText>
+              <w:instrText xml:space="preserve"> PAGEREF _Toc228987094 \h </w:instrText>
             </w:r>
             <w:r>
               <w:rPr>
@@ -2154,7 +2154,7 @@
               <w:lang w:eastAsia="en-GB"/>
             </w:rPr>
           </w:pPr>
-          <w:hyperlink w:anchor="_Toc228981232" w:history="1">
+          <w:hyperlink w:anchor="_Toc228987095" w:history="1">
             <w:r>
               <w:rPr>
                 <w:rStyle w:val="Hyperlink"/>
@@ -2181,7 +2181,7 @@
                 <w:noProof/>
                 <w:webHidden/>
               </w:rPr>
-              <w:instrText xml:space="preserve"> PAGEREF _Toc228981232 \h </w:instrText>
+              <w:instrText xml:space="preserve"> PAGEREF _Toc228987095 \h </w:instrText>
             </w:r>
             <w:r>
               <w:rPr>
@@ -2224,7 +2224,7 @@
               <w:lang w:eastAsia="en-GB"/>
             </w:rPr>
           </w:pPr>
-          <w:hyperlink w:anchor="_Toc228981233" w:history="1">
+          <w:hyperlink w:anchor="_Toc228987096" w:history="1">
             <w:r>
               <w:rPr>
                 <w:rStyle w:val="Hyperlink"/>
@@ -2251,7 +2251,7 @@
                 <w:noProof/>
                 <w:webHidden/>
               </w:rPr>
-              <w:instrText xml:space="preserve"> PAGEREF _Toc228981233 \h </w:instrText>
+              <w:instrText xml:space="preserve"> PAGEREF _Toc228987096 \h </w:instrText>
             </w:r>
             <w:r>
               <w:rPr>
@@ -2294,7 +2294,7 @@
               <w:lang w:eastAsia="en-GB"/>
             </w:rPr>
           </w:pPr>
-          <w:hyperlink w:anchor="_Toc228981234" w:history="1">
+          <w:hyperlink w:anchor="_Toc228987097" w:history="1">
             <w:r>
               <w:rPr>
                 <w:rStyle w:val="Hyperlink"/>
@@ -2321,7 +2321,7 @@
                 <w:noProof/>
                 <w:webHidden/>
               </w:rPr>
-              <w:instrText xml:space="preserve"> PAGEREF _Toc228981234 \h </w:instrText>
+              <w:instrText xml:space="preserve"> PAGEREF _Toc228987097 \h </w:instrText>
             </w:r>
             <w:r>
               <w:rPr>
@@ -2368,7 +2368,7 @@
               <w14:ligatures w14:val="standardContextual"/>
             </w:rPr>
           </w:pPr>
-          <w:hyperlink w:anchor="_Toc228981235" w:history="1">
+          <w:hyperlink w:anchor="_Toc228987098" w:history="1">
             <w:r>
               <w:rPr>
                 <w:rStyle w:val="Hyperlink"/>
@@ -2395,7 +2395,7 @@
                 <w:noProof/>
                 <w:webHidden/>
               </w:rPr>
-              <w:instrText xml:space="preserve"> PAGEREF _Toc228981235 \h </w:instrText>
+              <w:instrText xml:space="preserve"> PAGEREF _Toc228987098 \h </w:instrText>
             </w:r>
             <w:r>
               <w:rPr>
@@ -2438,7 +2438,7 @@
               <w:lang w:eastAsia="en-GB"/>
             </w:rPr>
           </w:pPr>
-          <w:hyperlink w:anchor="_Toc228981236" w:history="1">
+          <w:hyperlink w:anchor="_Toc228987099" w:history="1">
             <w:r>
               <w:rPr>
                 <w:rStyle w:val="Hyperlink"/>
@@ -2465,7 +2465,7 @@
                 <w:noProof/>
                 <w:webHidden/>
               </w:rPr>
-              <w:instrText xml:space="preserve"> PAGEREF _Toc228981236 \h </w:instrText>
+              <w:instrText xml:space="preserve"> PAGEREF _Toc228987099 \h </w:instrText>
             </w:r>
             <w:r>
               <w:rPr>
@@ -2508,7 +2508,7 @@
               <w:lang w:eastAsia="en-GB"/>
             </w:rPr>
           </w:pPr>
-          <w:hyperlink w:anchor="_Toc228981237" w:history="1">
+          <w:hyperlink w:anchor="_Toc228987100" w:history="1">
             <w:r>
               <w:rPr>
                 <w:rStyle w:val="Hyperlink"/>
@@ -2535,7 +2535,7 @@
                 <w:noProof/>
                 <w:webHidden/>
               </w:rPr>
-              <w:instrText xml:space="preserve"> PAGEREF _Toc228981237 \h </w:instrText>
+              <w:instrText xml:space="preserve"> PAGEREF _Toc228987100 \h </w:instrText>
             </w:r>
             <w:r>
               <w:rPr>
@@ -2578,7 +2578,7 @@
               <w:lang w:eastAsia="en-GB"/>
             </w:rPr>
           </w:pPr>
-          <w:hyperlink w:anchor="_Toc228981238" w:history="1">
+          <w:hyperlink w:anchor="_Toc228987101" w:history="1">
             <w:r>
               <w:rPr>
                 <w:rStyle w:val="Hyperlink"/>
@@ -2605,7 +2605,7 @@
                 <w:noProof/>
                 <w:webHidden/>
               </w:rPr>
-              <w:instrText xml:space="preserve"> PAGEREF _Toc228981238 \h </w:instrText>
+              <w:instrText xml:space="preserve"> PAGEREF _Toc228987101 \h </w:instrText>
             </w:r>
             <w:r>
               <w:rPr>
@@ -2652,7 +2652,7 @@
               <w14:ligatures w14:val="standardContextual"/>
             </w:rPr>
           </w:pPr>
-          <w:hyperlink w:anchor="_Toc228981239" w:history="1">
+          <w:hyperlink w:anchor="_Toc228987102" w:history="1">
             <w:r>
               <w:rPr>
                 <w:rStyle w:val="Hyperlink"/>
@@ -2679,7 +2679,7 @@
                 <w:noProof/>
                 <w:webHidden/>
               </w:rPr>
-              <w:instrText xml:space="preserve"> PAGEREF _Toc228981239 \h </w:instrText>
+              <w:instrText xml:space="preserve"> PAGEREF _Toc228987102 \h </w:instrText>
             </w:r>
             <w:r>
               <w:rPr>
@@ -2722,7 +2722,7 @@
               <w:lang w:eastAsia="en-GB"/>
             </w:rPr>
           </w:pPr>
-          <w:hyperlink w:anchor="_Toc228981240" w:history="1">
+          <w:hyperlink w:anchor="_Toc228987103" w:history="1">
             <w:r>
               <w:rPr>
                 <w:rStyle w:val="Hyperlink"/>
@@ -2749,7 +2749,7 @@
                 <w:noProof/>
                 <w:webHidden/>
               </w:rPr>
-              <w:instrText xml:space="preserve"> PAGEREF _Toc228981240 \h </w:instrText>
+              <w:instrText xml:space="preserve"> PAGEREF _Toc228987103 \h </w:instrText>
             </w:r>
             <w:r>
               <w:rPr>
@@ -2769,7 +2769,7 @@
                 <w:noProof/>
                 <w:webHidden/>
               </w:rPr>
-              <w:t>7</w:t>
+              <w:t>8</w:t>
             </w:r>
             <w:r>
               <w:rPr>
@@ -2792,7 +2792,7 @@
               <w:lang w:eastAsia="en-GB"/>
             </w:rPr>
           </w:pPr>
-          <w:hyperlink w:anchor="_Toc228981241" w:history="1">
+          <w:hyperlink w:anchor="_Toc228987104" w:history="1">
             <w:r>
               <w:rPr>
                 <w:rStyle w:val="Hyperlink"/>
@@ -2819,7 +2819,7 @@
                 <w:noProof/>
                 <w:webHidden/>
               </w:rPr>
-              <w:instrText xml:space="preserve"> PAGEREF _Toc228981241 \h </w:instrText>
+              <w:instrText xml:space="preserve"> PAGEREF _Toc228987104 \h </w:instrText>
             </w:r>
             <w:r>
               <w:rPr>
@@ -2862,7 +2862,7 @@
               <w:lang w:eastAsia="en-GB"/>
             </w:rPr>
           </w:pPr>
-          <w:hyperlink w:anchor="_Toc228981242" w:history="1">
+          <w:hyperlink w:anchor="_Toc228987105" w:history="1">
             <w:r>
               <w:rPr>
                 <w:rStyle w:val="Hyperlink"/>
@@ -2889,7 +2889,7 @@
                 <w:noProof/>
                 <w:webHidden/>
               </w:rPr>
-              <w:instrText xml:space="preserve"> PAGEREF _Toc228981242 \h </w:instrText>
+              <w:instrText xml:space="preserve"> PAGEREF _Toc228987105 \h </w:instrText>
             </w:r>
             <w:r>
               <w:rPr>
@@ -2909,7 +2909,7 @@
                 <w:noProof/>
                 <w:webHidden/>
               </w:rPr>
-              <w:t>8</w:t>
+              <w:t>9</w:t>
             </w:r>
             <w:r>
               <w:rPr>
@@ -2936,7 +2936,7 @@
               <w14:ligatures w14:val="standardContextual"/>
             </w:rPr>
           </w:pPr>
-          <w:hyperlink w:anchor="_Toc228981243" w:history="1">
+          <w:hyperlink w:anchor="_Toc228987106" w:history="1">
             <w:r>
               <w:rPr>
                 <w:rStyle w:val="Hyperlink"/>
@@ -2963,7 +2963,7 @@
                 <w:noProof/>
                 <w:webHidden/>
               </w:rPr>
-              <w:instrText xml:space="preserve"> PAGEREF _Toc228981243 \h </w:instrText>
+              <w:instrText xml:space="preserve"> PAGEREF _Toc228987106 \h </w:instrText>
             </w:r>
             <w:r>
               <w:rPr>
@@ -3010,7 +3010,7 @@
               <w14:ligatures w14:val="standardContextual"/>
             </w:rPr>
           </w:pPr>
-          <w:hyperlink w:anchor="_Toc228981244" w:history="1">
+          <w:hyperlink w:anchor="_Toc228987107" w:history="1">
             <w:r>
               <w:rPr>
                 <w:rStyle w:val="Hyperlink"/>
@@ -3037,7 +3037,7 @@
                 <w:noProof/>
                 <w:webHidden/>
               </w:rPr>
-              <w:instrText xml:space="preserve"> PAGEREF _Toc228981244 \h </w:instrText>
+              <w:instrText xml:space="preserve"> PAGEREF _Toc228987107 \h </w:instrText>
             </w:r>
             <w:r>
               <w:rPr>
@@ -3084,7 +3084,7 @@
               <w14:ligatures w14:val="standardContextual"/>
             </w:rPr>
           </w:pPr>
-          <w:hyperlink w:anchor="_Toc228981245" w:history="1">
+          <w:hyperlink w:anchor="_Toc228987108" w:history="1">
             <w:r>
               <w:rPr>
                 <w:rStyle w:val="Hyperlink"/>
@@ -3111,7 +3111,7 @@
                 <w:noProof/>
                 <w:webHidden/>
               </w:rPr>
-              <w:instrText xml:space="preserve"> PAGEREF _Toc228981245 \h </w:instrText>
+              <w:instrText xml:space="preserve"> PAGEREF _Toc228987108 \h </w:instrText>
             </w:r>
             <w:r>
               <w:rPr>
@@ -3158,7 +3158,7 @@
               <w14:ligatures w14:val="standardContextual"/>
             </w:rPr>
           </w:pPr>
-          <w:hyperlink w:anchor="_Toc228981246" w:history="1">
+          <w:hyperlink w:anchor="_Toc228987109" w:history="1">
             <w:r>
               <w:rPr>
                 <w:rStyle w:val="Hyperlink"/>
@@ -3185,7 +3185,7 @@
                 <w:noProof/>
                 <w:webHidden/>
               </w:rPr>
-              <w:instrText xml:space="preserve"> PAGEREF _Toc228981246 \h </w:instrText>
+              <w:instrText xml:space="preserve"> PAGEREF _Toc228987109 \h </w:instrText>
             </w:r>
             <w:r>
               <w:rPr>
@@ -3232,7 +3232,7 @@
               <w14:ligatures w14:val="standardContextual"/>
             </w:rPr>
           </w:pPr>
-          <w:hyperlink w:anchor="_Toc228981247" w:history="1">
+          <w:hyperlink w:anchor="_Toc228987110" w:history="1">
             <w:r>
               <w:rPr>
                 <w:rStyle w:val="Hyperlink"/>
@@ -3259,7 +3259,7 @@
                 <w:noProof/>
                 <w:webHidden/>
               </w:rPr>
-              <w:instrText xml:space="preserve"> PAGEREF _Toc228981247 \h </w:instrText>
+              <w:instrText xml:space="preserve"> PAGEREF _Toc228987110 \h </w:instrText>
             </w:r>
             <w:r>
               <w:rPr>
@@ -3306,7 +3306,7 @@
               <w14:ligatures w14:val="standardContextual"/>
             </w:rPr>
           </w:pPr>
-          <w:hyperlink w:anchor="_Toc228981248" w:history="1">
+          <w:hyperlink w:anchor="_Toc228987111" w:history="1">
             <w:r>
               <w:rPr>
                 <w:rStyle w:val="Hyperlink"/>
@@ -3333,7 +3333,7 @@
                 <w:noProof/>
                 <w:webHidden/>
               </w:rPr>
-              <w:instrText xml:space="preserve"> PAGEREF _Toc228981248 \h </w:instrText>
+              <w:instrText xml:space="preserve"> PAGEREF _Toc228987111 \h </w:instrText>
             </w:r>
             <w:r>
               <w:rPr>
@@ -3380,7 +3380,7 @@
               <w14:ligatures w14:val="standardContextual"/>
             </w:rPr>
           </w:pPr>
-          <w:hyperlink w:anchor="_Toc228981249" w:history="1">
+          <w:hyperlink w:anchor="_Toc228987112" w:history="1">
             <w:r>
               <w:rPr>
                 <w:rStyle w:val="Hyperlink"/>
@@ -3407,7 +3407,7 @@
                 <w:noProof/>
                 <w:webHidden/>
               </w:rPr>
-              <w:instrText xml:space="preserve"> PAGEREF _Toc228981249 \h </w:instrText>
+              <w:instrText xml:space="preserve"> PAGEREF _Toc228987112 \h </w:instrText>
             </w:r>
             <w:r>
               <w:rPr>
@@ -3454,7 +3454,7 @@
               <w14:ligatures w14:val="standardContextual"/>
             </w:rPr>
           </w:pPr>
-          <w:hyperlink w:anchor="_Toc228981250" w:history="1">
+          <w:hyperlink w:anchor="_Toc228987113" w:history="1">
             <w:r>
               <w:rPr>
                 <w:rStyle w:val="Hyperlink"/>
@@ -3481,7 +3481,7 @@
                 <w:noProof/>
                 <w:webHidden/>
               </w:rPr>
-              <w:instrText xml:space="preserve"> PAGEREF _Toc228981250 \h </w:instrText>
+              <w:instrText xml:space="preserve"> PAGEREF _Toc228987113 \h </w:instrText>
             </w:r>
             <w:r>
               <w:rPr>
@@ -3528,7 +3528,7 @@
               <w14:ligatures w14:val="standardContextual"/>
             </w:rPr>
           </w:pPr>
-          <w:hyperlink w:anchor="_Toc228981251" w:history="1">
+          <w:hyperlink w:anchor="_Toc228987114" w:history="1">
             <w:r>
               <w:rPr>
                 <w:rStyle w:val="Hyperlink"/>
@@ -3555,7 +3555,7 @@
                 <w:noProof/>
                 <w:webHidden/>
               </w:rPr>
-              <w:instrText xml:space="preserve"> PAGEREF _Toc228981251 \h </w:instrText>
+              <w:instrText xml:space="preserve"> PAGEREF _Toc228987114 \h </w:instrText>
             </w:r>
             <w:r>
               <w:rPr>
@@ -3602,7 +3602,7 @@
               <w14:ligatures w14:val="standardContextual"/>
             </w:rPr>
           </w:pPr>
-          <w:hyperlink w:anchor="_Toc228981252" w:history="1">
+          <w:hyperlink w:anchor="_Toc228987115" w:history="1">
             <w:r>
               <w:rPr>
                 <w:rStyle w:val="Hyperlink"/>
@@ -3629,7 +3629,7 @@
                 <w:noProof/>
                 <w:webHidden/>
               </w:rPr>
-              <w:instrText xml:space="preserve"> PAGEREF _Toc228981252 \h </w:instrText>
+              <w:instrText xml:space="preserve"> PAGEREF _Toc228987115 \h </w:instrText>
             </w:r>
             <w:r>
               <w:rPr>
@@ -3676,7 +3676,7 @@
               <w14:ligatures w14:val="standardContextual"/>
             </w:rPr>
           </w:pPr>
-          <w:hyperlink w:anchor="_Toc228981253" w:history="1">
+          <w:hyperlink w:anchor="_Toc228987116" w:history="1">
             <w:r>
               <w:rPr>
                 <w:rStyle w:val="Hyperlink"/>
@@ -3703,7 +3703,7 @@
                 <w:noProof/>
                 <w:webHidden/>
               </w:rPr>
-              <w:instrText xml:space="preserve"> PAGEREF _Toc228981253 \h </w:instrText>
+              <w:instrText xml:space="preserve"> PAGEREF _Toc228987116 \h </w:instrText>
             </w:r>
             <w:r>
               <w:rPr>
@@ -3750,7 +3750,7 @@
               <w14:ligatures w14:val="standardContextual"/>
             </w:rPr>
           </w:pPr>
-          <w:hyperlink w:anchor="_Toc228981254" w:history="1">
+          <w:hyperlink w:anchor="_Toc228987117" w:history="1">
             <w:r>
               <w:rPr>
                 <w:rStyle w:val="Hyperlink"/>
@@ -3777,7 +3777,7 @@
                 <w:noProof/>
                 <w:webHidden/>
               </w:rPr>
-              <w:instrText xml:space="preserve"> PAGEREF _Toc228981254 \h </w:instrText>
+              <w:instrText xml:space="preserve"> PAGEREF _Toc228987117 \h </w:instrText>
             </w:r>
             <w:r>
               <w:rPr>
@@ -3824,7 +3824,7 @@
               <w14:ligatures w14:val="standardContextual"/>
             </w:rPr>
           </w:pPr>
-          <w:hyperlink w:anchor="_Toc228981255" w:history="1">
+          <w:hyperlink w:anchor="_Toc228987118" w:history="1">
             <w:r>
               <w:rPr>
                 <w:rStyle w:val="Hyperlink"/>
@@ -3851,7 +3851,7 @@
                 <w:noProof/>
                 <w:webHidden/>
               </w:rPr>
-              <w:instrText xml:space="preserve"> PAGEREF _Toc228981255 \h </w:instrText>
+              <w:instrText xml:space="preserve"> PAGEREF _Toc228987118 \h </w:instrText>
             </w:r>
             <w:r>
               <w:rPr>
@@ -3898,7 +3898,7 @@
               <w14:ligatures w14:val="standardContextual"/>
             </w:rPr>
           </w:pPr>
-          <w:hyperlink w:anchor="_Toc228981256" w:history="1">
+          <w:hyperlink w:anchor="_Toc228987119" w:history="1">
             <w:r>
               <w:rPr>
                 <w:rStyle w:val="Hyperlink"/>
@@ -3925,7 +3925,7 @@
                 <w:noProof/>
                 <w:webHidden/>
               </w:rPr>
-              <w:instrText xml:space="preserve"> PAGEREF _Toc228981256 \h </w:instrText>
+              <w:instrText xml:space="preserve"> PAGEREF _Toc228987119 \h </w:instrText>
             </w:r>
             <w:r>
               <w:rPr>
@@ -3946,6 +3946,80 @@
                 <w:webHidden/>
               </w:rPr>
               <w:t>15</w:t>
+            </w:r>
+            <w:r>
+              <w:rPr>
+                <w:noProof/>
+                <w:webHidden/>
+              </w:rPr>
+              <w:fldChar w:fldCharType="end"/>
+            </w:r>
+          </w:hyperlink>
+        </w:p>
+        <w:p>
+          <w:pPr>
+            <w:pStyle w:val="TOC3"/>
+            <w:tabs>
+              <w:tab w:val="right" w:leader="dot" w:pos="9016"/>
+            </w:tabs>
+            <w:rPr>
+              <w:rFonts w:asciiTheme="minorHAnsi" w:hAnsiTheme="minorHAnsi" w:cstheme="minorBidi"/>
+              <w:noProof/>
+              <w:kern w:val="2"/>
+              <w:sz w:val="24"/>
+              <w:szCs w:val="24"/>
+              <w:lang w:val="en-GB" w:eastAsia="en-GB"/>
+              <w14:ligatures w14:val="standardContextual"/>
+            </w:rPr>
+          </w:pPr>
+          <w:hyperlink w:anchor="_Toc228987120" w:history="1">
+            <w:r>
+              <w:rPr>
+                <w:rStyle w:val="Hyperlink"/>
+                <w:noProof/>
+              </w:rPr>
+              <w:t>3.3.3 Limitations</w:t>
+            </w:r>
+            <w:r>
+              <w:rPr>
+                <w:noProof/>
+                <w:webHidden/>
+              </w:rPr>
+              <w:tab/>
+            </w:r>
+            <w:r>
+              <w:rPr>
+                <w:noProof/>
+                <w:webHidden/>
+              </w:rPr>
+              <w:fldChar w:fldCharType="begin"/>
+            </w:r>
+            <w:r>
+              <w:rPr>
+                <w:noProof/>
+                <w:webHidden/>
+              </w:rPr>
+              <w:instrText xml:space="preserve"> PAGEREF _Toc228987120 \h </w:instrText>
+            </w:r>
+            <w:r>
+              <w:rPr>
+                <w:noProof/>
+                <w:webHidden/>
+              </w:rPr>
+            </w:r>
+            <w:r>
+              <w:rPr>
+                <w:noProof/>
+                <w:webHidden/>
+              </w:rPr>
+              <w:fldChar w:fldCharType="separate"/>
+            </w:r>
+            <w:r>
+              <w:rPr>
+                <w:noProof/>
+                <w:webHidden/>
+              </w:rPr>
+              <w:t>16</w:t>
             </w:r>
             <w:r>
               <w:rPr>
@@ -3972,12 +4046,86 @@
               <w14:ligatures w14:val="standardContextual"/>
             </w:rPr>
           </w:pPr>
-          <w:hyperlink w:anchor="_Toc228981257" w:history="1">
+          <w:hyperlink w:anchor="_Toc228987121" w:history="1">
             <w:r>
               <w:rPr>
                 <w:rStyle w:val="Hyperlink"/>
                 <w:noProof/>
               </w:rPr>
+              <w:t>Chapter 4 – Implementation</w:t>
+            </w:r>
+            <w:r>
+              <w:rPr>
+                <w:noProof/>
+                <w:webHidden/>
+              </w:rPr>
+              <w:tab/>
+            </w:r>
+            <w:r>
+              <w:rPr>
+                <w:noProof/>
+                <w:webHidden/>
+              </w:rPr>
+              <w:fldChar w:fldCharType="begin"/>
+            </w:r>
+            <w:r>
+              <w:rPr>
+                <w:noProof/>
+                <w:webHidden/>
+              </w:rPr>
+              <w:instrText xml:space="preserve"> PAGEREF _Toc228987121 \h </w:instrText>
+            </w:r>
+            <w:r>
+              <w:rPr>
+                <w:noProof/>
+                <w:webHidden/>
+              </w:rPr>
+            </w:r>
+            <w:r>
+              <w:rPr>
+                <w:noProof/>
+                <w:webHidden/>
+              </w:rPr>
+              <w:fldChar w:fldCharType="separate"/>
+            </w:r>
+            <w:r>
+              <w:rPr>
+                <w:noProof/>
+                <w:webHidden/>
+              </w:rPr>
+              <w:t>16</w:t>
+            </w:r>
+            <w:r>
+              <w:rPr>
+                <w:noProof/>
+                <w:webHidden/>
+              </w:rPr>
+              <w:fldChar w:fldCharType="end"/>
+            </w:r>
+          </w:hyperlink>
+        </w:p>
+        <w:p>
+          <w:pPr>
+            <w:pStyle w:val="TOC1"/>
+            <w:tabs>
+              <w:tab w:val="right" w:leader="dot" w:pos="9016"/>
+            </w:tabs>
+            <w:rPr>
+              <w:rFonts w:asciiTheme="minorHAnsi" w:hAnsiTheme="minorHAnsi" w:cstheme="minorBidi"/>
+              <w:noProof/>
+              <w:kern w:val="2"/>
+              <w:sz w:val="24"/>
+              <w:szCs w:val="24"/>
+              <w:lang w:val="en-GB" w:eastAsia="en-GB"/>
+              <w14:ligatures w14:val="standardContextual"/>
+            </w:rPr>
+          </w:pPr>
+          <w:hyperlink w:anchor="_Toc228987122" w:history="1">
+            <w:r>
+              <w:rPr>
+                <w:rStyle w:val="Hyperlink"/>
+                <w:noProof/>
+              </w:rPr>
               <w:t>References</w:t>
             </w:r>
             <w:r>
@@ -3999,7 +4147,7 @@
                 <w:noProof/>
                 <w:webHidden/>
               </w:rPr>
-              <w:instrText xml:space="preserve"> PAGEREF _Toc228981257 \h </w:instrText>
+              <w:instrText xml:space="preserve"> PAGEREF _Toc228987122 \h </w:instrText>
             </w:r>
             <w:r>
               <w:rPr>
@@ -4056,7 +4204,7 @@
       <w:pPr>
         <w:pStyle w:val="Heading1"/>
       </w:pPr>
-      <w:bookmarkStart w:id="7" w:name="_Toc228981216"/>
+      <w:bookmarkStart w:id="7" w:name="_Toc228987079"/>
       <w:r>
         <w:t>Table of Figures</w:t>
       </w:r>
@@ -4098,7 +4246,7 @@
         </w:rPr>
         <w:fldChar w:fldCharType="separate"/>
       </w:r>
-      <w:hyperlink w:anchor="_Toc228977556" w:history="1">
+      <w:hyperlink w:anchor="_Toc228987123" w:history="1">
         <w:r>
           <w:rPr>
             <w:rStyle w:val="Hyperlink"/>
@@ -4125,7 +4273,7 @@
             <w:noProof/>
             <w:webHidden/>
           </w:rPr>
-          <w:instrText xml:space="preserve"> PAGEREF _Toc228977556 \h </w:instrText>
+          <w:instrText xml:space="preserve"> PAGEREF _Toc228987123 \h </w:instrText>
         </w:r>
         <w:r>
           <w:rPr>
@@ -4168,7 +4316,7 @@
           <w:lang w:eastAsia="en-GB"/>
         </w:rPr>
       </w:pPr>
-      <w:hyperlink w:anchor="_Toc228977557" w:history="1">
+      <w:hyperlink w:anchor="_Toc228987124" w:history="1">
         <w:r>
           <w:rPr>
             <w:rStyle w:val="Hyperlink"/>
@@ -4195,7 +4343,7 @@
             <w:noProof/>
             <w:webHidden/>
           </w:rPr>
-          <w:instrText xml:space="preserve"> PAGEREF _Toc228977557 \h </w:instrText>
+          <w:instrText xml:space="preserve"> PAGEREF _Toc228987124 \h </w:instrText>
         </w:r>
         <w:r>
           <w:rPr>
@@ -4238,7 +4386,7 @@
           <w:lang w:eastAsia="en-GB"/>
         </w:rPr>
       </w:pPr>
-      <w:hyperlink w:anchor="_Toc228977558" w:history="1">
+      <w:hyperlink w:anchor="_Toc228987125" w:history="1">
         <w:r>
           <w:rPr>
             <w:rStyle w:val="Hyperlink"/>
@@ -4265,7 +4413,7 @@
             <w:noProof/>
             <w:webHidden/>
           </w:rPr>
-          <w:instrText xml:space="preserve"> PAGEREF _Toc228977558 \h </w:instrText>
+          <w:instrText xml:space="preserve"> PAGEREF _Toc228987125 \h </w:instrText>
         </w:r>
         <w:r>
           <w:rPr>
@@ -4308,7 +4456,7 @@
           <w:lang w:eastAsia="en-GB"/>
         </w:rPr>
       </w:pPr>
-      <w:hyperlink w:anchor="_Toc228977559" w:history="1">
+      <w:hyperlink w:anchor="_Toc228987126" w:history="1">
         <w:r>
           <w:rPr>
             <w:rStyle w:val="Hyperlink"/>
@@ -4335,7 +4483,7 @@
             <w:noProof/>
             <w:webHidden/>
           </w:rPr>
-          <w:instrText xml:space="preserve"> PAGEREF _Toc228977559 \h </w:instrText>
+          <w:instrText xml:space="preserve"> PAGEREF _Toc228987126 \h </w:instrText>
         </w:r>
         <w:r>
           <w:rPr>
@@ -4378,7 +4526,7 @@
           <w:lang w:eastAsia="en-GB"/>
         </w:rPr>
       </w:pPr>
-      <w:hyperlink w:anchor="_Toc228977560" w:history="1">
+      <w:hyperlink w:anchor="_Toc228987127" w:history="1">
         <w:r>
           <w:rPr>
             <w:rStyle w:val="Hyperlink"/>
@@ -4405,7 +4553,7 @@
             <w:noProof/>
             <w:webHidden/>
           </w:rPr>
-          <w:instrText xml:space="preserve"> PAGEREF _Toc228977560 \h </w:instrText>
+          <w:instrText xml:space="preserve"> PAGEREF _Toc228987127 \h </w:instrText>
         </w:r>
         <w:r>
           <w:rPr>
@@ -4448,7 +4596,7 @@
           <w:lang w:eastAsia="en-GB"/>
         </w:rPr>
       </w:pPr>
-      <w:hyperlink w:anchor="_Toc228977561" w:history="1">
+      <w:hyperlink w:anchor="_Toc228987128" w:history="1">
         <w:r>
           <w:rPr>
             <w:rStyle w:val="Hyperlink"/>
@@ -4475,7 +4623,7 @@
             <w:noProof/>
             <w:webHidden/>
           </w:rPr>
-          <w:instrText xml:space="preserve"> PAGEREF _Toc228977561 \h </w:instrText>
+          <w:instrText xml:space="preserve"> PAGEREF _Toc228987128 \h </w:instrText>
         </w:r>
         <w:r>
           <w:rPr>
@@ -4518,7 +4666,7 @@
           <w:lang w:eastAsia="en-GB"/>
         </w:rPr>
       </w:pPr>
-      <w:hyperlink w:anchor="_Toc228977562" w:history="1">
+      <w:hyperlink w:anchor="_Toc228987129" w:history="1">
         <w:r>
           <w:rPr>
             <w:rStyle w:val="Hyperlink"/>
@@ -4545,7 +4693,7 @@
             <w:noProof/>
             <w:webHidden/>
           </w:rPr>
-          <w:instrText xml:space="preserve"> PAGEREF _Toc228977562 \h </w:instrText>
+          <w:instrText xml:space="preserve"> PAGEREF _Toc228987129 \h </w:instrText>
         </w:r>
         <w:r>
           <w:rPr>
@@ -4588,7 +4736,7 @@
           <w:lang w:eastAsia="en-GB"/>
         </w:rPr>
       </w:pPr>
-      <w:hyperlink w:anchor="_Toc228977563" w:history="1">
+      <w:hyperlink w:anchor="_Toc228987130" w:history="1">
         <w:r>
           <w:rPr>
             <w:rStyle w:val="Hyperlink"/>
@@ -4615,7 +4763,7 @@
             <w:noProof/>
             <w:webHidden/>
           </w:rPr>
-          <w:instrText xml:space="preserve"> PAGEREF _Toc228977563 \h </w:instrText>
+          <w:instrText xml:space="preserve"> PAGEREF _Toc228987130 \h </w:instrText>
         </w:r>
         <w:r>
           <w:rPr>
@@ -4684,7 +4832,7 @@
       <w:pPr>
         <w:pStyle w:val="Heading1"/>
       </w:pPr>
-      <w:bookmarkStart w:id="8" w:name="_Toc228981217"/>
+      <w:bookmarkStart w:id="8" w:name="_Toc228987080"/>
       <w:r>
         <w:t>Chapter 1</w:t>
       </w:r>
@@ -4712,7 +4860,7 @@
           <w:u w:val="single"/>
         </w:rPr>
       </w:pPr>
-      <w:bookmarkStart w:id="9" w:name="_Toc228981218"/>
+      <w:bookmarkStart w:id="9" w:name="_Toc228987081"/>
       <w:r>
         <w:t>1.1</w:t>
       </w:r>
@@ -4763,7 +4911,7 @@
       <w:pPr>
         <w:pStyle w:val="Heading2"/>
       </w:pPr>
-      <w:bookmarkStart w:id="10" w:name="_Toc228981219"/>
+      <w:bookmarkStart w:id="10" w:name="_Toc228987082"/>
       <w:r>
         <w:t>1.2 Aims</w:t>
       </w:r>
@@ -4779,7 +4927,7 @@
           <w:szCs w:val="28"/>
         </w:rPr>
       </w:pPr>
-      <w:bookmarkStart w:id="11" w:name="_Toc228981220"/>
+      <w:bookmarkStart w:id="11" w:name="_Toc228987083"/>
       <w:r>
         <w:rPr>
           <w:rStyle w:val="Heading2Char"/>
@@ -4824,7 +4972,7 @@
       <w:pPr>
         <w:pStyle w:val="Heading3"/>
       </w:pPr>
-      <w:bookmarkStart w:id="12" w:name="_Toc228981221"/>
+      <w:bookmarkStart w:id="12" w:name="_Toc228987084"/>
       <w:r>
         <w:lastRenderedPageBreak/>
         <w:t>1.2.2 Additional Aims</w:t>
@@ -4894,7 +5042,7 @@
       <w:pPr>
         <w:pStyle w:val="Heading2"/>
       </w:pPr>
-      <w:bookmarkStart w:id="13" w:name="_Toc228981222"/>
+      <w:bookmarkStart w:id="13" w:name="_Toc228987085"/>
       <w:r>
         <w:t>1.3 Objectives</w:t>
       </w:r>
@@ -4904,7 +5052,7 @@
       <w:pPr>
         <w:pStyle w:val="Heading3"/>
       </w:pPr>
-      <w:bookmarkStart w:id="14" w:name="_Toc228981223"/>
+      <w:bookmarkStart w:id="14" w:name="_Toc228987086"/>
       <w:r>
         <w:t>1.3.1 Scope</w:t>
       </w:r>
@@ -4967,7 +5115,7 @@
       <w:pPr>
         <w:pStyle w:val="Heading3"/>
       </w:pPr>
-      <w:bookmarkStart w:id="15" w:name="_Toc228981224"/>
+      <w:bookmarkStart w:id="15" w:name="_Toc228987087"/>
       <w:r>
         <w:t>1.3.2 Research Objectives</w:t>
       </w:r>
@@ -4997,7 +5145,7 @@
       <w:pPr>
         <w:pStyle w:val="Heading3"/>
       </w:pPr>
-      <w:bookmarkStart w:id="16" w:name="_Toc228981225"/>
+      <w:bookmarkStart w:id="16" w:name="_Toc228987088"/>
       <w:r>
         <w:lastRenderedPageBreak/>
         <w:t>1.3.3 Design Objectives</w:t>
@@ -5120,7 +5268,7 @@
       <w:pPr>
         <w:pStyle w:val="Heading3"/>
       </w:pPr>
-      <w:bookmarkStart w:id="17" w:name="_Toc228981226"/>
+      <w:bookmarkStart w:id="17" w:name="_Toc228987089"/>
       <w:r>
         <w:t>1.3.4 Implementation Objectives</w:t>
       </w:r>
@@ -5239,7 +5387,7 @@
       <w:pPr>
         <w:pStyle w:val="Heading3"/>
       </w:pPr>
-      <w:bookmarkStart w:id="18" w:name="_Toc228981227"/>
+      <w:bookmarkStart w:id="18" w:name="_Toc228987090"/>
       <w:r>
         <w:t>1.3.5 Results, Evaluation and Playtesting Objectives</w:t>
       </w:r>
@@ -5296,7 +5444,7 @@
       <w:pPr>
         <w:pStyle w:val="Heading1"/>
       </w:pPr>
-      <w:bookmarkStart w:id="19" w:name="_Toc228981228"/>
+      <w:bookmarkStart w:id="19" w:name="_Toc228987091"/>
       <w:r>
         <w:lastRenderedPageBreak/>
         <w:t>Chapter 2 – Literature Survey</w:t>
@@ -5307,7 +5455,7 @@
       <w:pPr>
         <w:pStyle w:val="Heading2"/>
       </w:pPr>
-      <w:bookmarkStart w:id="20" w:name="_Toc228981229"/>
+      <w:bookmarkStart w:id="20" w:name="_Toc228987092"/>
       <w:r>
         <w:t>2.1 Literature Survey Introduction</w:t>
       </w:r>
@@ -5346,7 +5494,7 @@
       <w:pPr>
         <w:pStyle w:val="Heading2"/>
       </w:pPr>
-      <w:bookmarkStart w:id="21" w:name="_Toc228981230"/>
+      <w:bookmarkStart w:id="21" w:name="_Toc228987093"/>
       <w:r>
         <w:t>2.2 Comparative Research</w:t>
       </w:r>
@@ -5364,7 +5512,7 @@
       <w:pPr>
         <w:pStyle w:val="Heading3"/>
       </w:pPr>
-      <w:bookmarkStart w:id="22" w:name="_Toc228981231"/>
+      <w:bookmarkStart w:id="22" w:name="_Toc228987094"/>
       <w:r>
         <w:t xml:space="preserve">2.2.1 </w:t>
       </w:r>
@@ -5439,7 +5587,7 @@
       <w:pPr>
         <w:pStyle w:val="Heading4"/>
       </w:pPr>
-      <w:bookmarkStart w:id="23" w:name="_Toc228981232"/>
+      <w:bookmarkStart w:id="23" w:name="_Toc228987095"/>
       <w:r>
         <w:t>2.2.1.1 Perlin Noise</w:t>
       </w:r>
@@ -5740,31 +5888,18 @@
         <w:pStyle w:val="Caption"/>
         <w:jc w:val="center"/>
       </w:pPr>
-      <w:bookmarkStart w:id="24" w:name="_Toc228977556"/>
+      <w:bookmarkStart w:id="24" w:name="_Toc228987123"/>
       <w:r>
         <w:t xml:space="preserve">Figure </w:t>
       </w:r>
-      <w:r>
-        <w:fldChar w:fldCharType="begin"/>
-      </w:r>
-      <w:r>
-        <w:instrText xml:space="preserve"> SEQ Figure \* ARABIC </w:instrText>
-      </w:r>
-      <w:r>
-        <w:fldChar w:fldCharType="separate"/>
-      </w:r>
-      <w:r>
-        <w:rPr>
-          <w:noProof/>
-        </w:rPr>
-        <w:t>1</w:t>
-      </w:r>
-      <w:r>
-        <w:rPr>
-          <w:noProof/>
-        </w:rPr>
-        <w:fldChar w:fldCharType="end"/>
-      </w:r>
+      <w:fldSimple w:instr=" SEQ Figure \* ARABIC ">
+        <w:r>
+          <w:rPr>
+            <w:noProof/>
+          </w:rPr>
+          <w:t>1</w:t>
+        </w:r>
+      </w:fldSimple>
       <w:r>
         <w:t xml:space="preserve"> </w:t>
       </w:r>
@@ -5837,7 +5972,7 @@
       <w:pPr>
         <w:pStyle w:val="Heading4"/>
       </w:pPr>
-      <w:bookmarkStart w:id="25" w:name="_Toc228981233"/>
+      <w:bookmarkStart w:id="25" w:name="_Toc228987096"/>
       <w:r>
         <w:t>2.2.1.2 Binary Space Partitioning</w:t>
       </w:r>
@@ -5888,7 +6023,7 @@
       <w:pPr>
         <w:pStyle w:val="Heading4"/>
       </w:pPr>
-      <w:bookmarkStart w:id="26" w:name="_Toc228981234"/>
+      <w:bookmarkStart w:id="26" w:name="_Toc228987097"/>
       <w:r>
         <w:t>2.2.1.3 Cellular Automata</w:t>
       </w:r>
@@ -5995,7 +6130,7 @@
       <w:pPr>
         <w:pStyle w:val="Heading3"/>
       </w:pPr>
-      <w:bookmarkStart w:id="27" w:name="_Toc228981235"/>
+      <w:bookmarkStart w:id="27" w:name="_Toc228987098"/>
       <w:r>
         <w:t>2.2.2 Pathfinding</w:t>
       </w:r>
@@ -6050,7 +6185,7 @@
       <w:pPr>
         <w:pStyle w:val="Heading4"/>
       </w:pPr>
-      <w:bookmarkStart w:id="28" w:name="_Toc228981236"/>
+      <w:bookmarkStart w:id="28" w:name="_Toc228987099"/>
       <w:r>
         <w:t>2.2.2.1 Dijkstra</w:t>
       </w:r>
@@ -6137,31 +6272,18 @@
         <w:pStyle w:val="Caption"/>
         <w:jc w:val="center"/>
       </w:pPr>
-      <w:bookmarkStart w:id="29" w:name="_Toc228977557"/>
+      <w:bookmarkStart w:id="29" w:name="_Toc228987124"/>
       <w:r>
         <w:t xml:space="preserve">Figure </w:t>
       </w:r>
-      <w:r>
-        <w:fldChar w:fldCharType="begin"/>
-      </w:r>
-      <w:r>
-        <w:instrText xml:space="preserve"> SEQ Figure \* ARABIC </w:instrText>
-      </w:r>
-      <w:r>
-        <w:fldChar w:fldCharType="separate"/>
-      </w:r>
-      <w:r>
-        <w:rPr>
-          <w:noProof/>
-        </w:rPr>
-        <w:t>2</w:t>
-      </w:r>
-      <w:r>
-        <w:rPr>
-          <w:noProof/>
-        </w:rPr>
-        <w:fldChar w:fldCharType="end"/>
-      </w:r>
+      <w:fldSimple w:instr=" SEQ Figure \* ARABIC ">
+        <w:r>
+          <w:rPr>
+            <w:noProof/>
+          </w:rPr>
+          <w:t>2</w:t>
+        </w:r>
+      </w:fldSimple>
       <w:r>
         <w:t xml:space="preserve"> </w:t>
       </w:r>
@@ -6236,7 +6358,7 @@
       <w:pPr>
         <w:pStyle w:val="Heading4"/>
       </w:pPr>
-      <w:bookmarkStart w:id="30" w:name="_Toc228981237"/>
+      <w:bookmarkStart w:id="30" w:name="_Toc228987100"/>
       <w:r>
         <w:t>2.2.2.2 A*</w:t>
       </w:r>
@@ -6294,14 +6416,22 @@
     <w:p/>
     <w:p>
       <w:r>
-        <w:t>The performance of A* is highly dependant on the quality of the heuristic data. If the heuristic is poorly chosen, the algorithm may degrade towards the performance of Dijkstra’s algorithm. Additionally, A* can incur higher memory usage due to the need to maintain open and closed node lists, which may become significant in large-scale environments.</w:t>
+        <w:t xml:space="preserve">The performance of A* is highly </w:t>
+      </w:r>
+      <w:proofErr w:type="spellStart"/>
+      <w:r>
+        <w:t>dependant</w:t>
+      </w:r>
+      <w:proofErr w:type="spellEnd"/>
+      <w:r>
+        <w:t xml:space="preserve"> on the quality of the heuristic data. If the heuristic is poorly chosen, the algorithm may degrade towards the performance of Dijkstra’s algorithm. Additionally, A* can incur higher memory usage due to the need to maintain open and closed node lists, which may become significant in large-scale environments.</w:t>
       </w:r>
     </w:p>
     <w:p>
       <w:pPr>
         <w:pStyle w:val="Heading4"/>
       </w:pPr>
-      <w:bookmarkStart w:id="31" w:name="_Toc228981238"/>
+      <w:bookmarkStart w:id="31" w:name="_Toc228987101"/>
       <w:r>
         <w:t>2.2.2.3 Jump Point Search</w:t>
       </w:r>
@@ -6351,7 +6481,7 @@
       <w:pPr>
         <w:pStyle w:val="Heading3"/>
       </w:pPr>
-      <w:bookmarkStart w:id="32" w:name="_Toc228981239"/>
+      <w:bookmarkStart w:id="32" w:name="_Toc228987102"/>
       <w:r>
         <w:t>2.2.3 AI Integrations</w:t>
       </w:r>
@@ -6375,7 +6505,7 @@
       <w:pPr>
         <w:pStyle w:val="Heading4"/>
       </w:pPr>
-      <w:bookmarkStart w:id="33" w:name="_Toc228981240"/>
+      <w:bookmarkStart w:id="33" w:name="_Toc228987103"/>
       <w:r>
         <w:lastRenderedPageBreak/>
         <w:t>2.2.3.1 Neural Network</w:t>
@@ -6432,7 +6562,7 @@
       <w:pPr>
         <w:pStyle w:val="Heading4"/>
       </w:pPr>
-      <w:bookmarkStart w:id="34" w:name="_Toc228981241"/>
+      <w:bookmarkStart w:id="34" w:name="_Toc228987104"/>
       <w:r>
         <w:t>2.2.3.2 Reinforcement Learning</w:t>
       </w:r>
@@ -6507,31 +6637,18 @@
         <w:pStyle w:val="Caption"/>
         <w:jc w:val="center"/>
       </w:pPr>
-      <w:bookmarkStart w:id="35" w:name="_Toc228977558"/>
+      <w:bookmarkStart w:id="35" w:name="_Toc228987125"/>
       <w:r>
         <w:t xml:space="preserve">Figure </w:t>
       </w:r>
-      <w:r>
-        <w:fldChar w:fldCharType="begin"/>
-      </w:r>
-      <w:r>
-        <w:instrText xml:space="preserve"> SEQ Figure \* ARABIC </w:instrText>
-      </w:r>
-      <w:r>
-        <w:fldChar w:fldCharType="separate"/>
-      </w:r>
-      <w:r>
-        <w:rPr>
-          <w:noProof/>
-        </w:rPr>
-        <w:t>3</w:t>
-      </w:r>
-      <w:r>
-        <w:rPr>
-          <w:noProof/>
-        </w:rPr>
-        <w:fldChar w:fldCharType="end"/>
-      </w:r>
+      <w:fldSimple w:instr=" SEQ Figure \* ARABIC ">
+        <w:r>
+          <w:rPr>
+            <w:noProof/>
+          </w:rPr>
+          <w:t>3</w:t>
+        </w:r>
+      </w:fldSimple>
       <w:r>
         <w:t xml:space="preserve"> </w:t>
       </w:r>
@@ -6645,7 +6762,7 @@
       <w:pPr>
         <w:pStyle w:val="Heading4"/>
       </w:pPr>
-      <w:bookmarkStart w:id="36" w:name="_Toc228981242"/>
+      <w:bookmarkStart w:id="36" w:name="_Toc228987105"/>
       <w:r>
         <w:lastRenderedPageBreak/>
         <w:t>2.2.3.3 Imitation Learning</w:t>
@@ -6774,7 +6891,7 @@
       <w:pPr>
         <w:pStyle w:val="Heading1"/>
       </w:pPr>
-      <w:bookmarkStart w:id="37" w:name="_Toc228981243"/>
+      <w:bookmarkStart w:id="37" w:name="_Toc228987106"/>
       <w:r>
         <w:t>Chapter 3 – Design</w:t>
       </w:r>
@@ -6801,7 +6918,7 @@
       <w:pPr>
         <w:pStyle w:val="Heading2"/>
       </w:pPr>
-      <w:bookmarkStart w:id="38" w:name="_Toc228981244"/>
+      <w:bookmarkStart w:id="38" w:name="_Toc228987107"/>
       <w:r>
         <w:t xml:space="preserve">3.1 </w:t>
       </w:r>
@@ -6852,7 +6969,7 @@
       <w:pPr>
         <w:pStyle w:val="Heading3"/>
       </w:pPr>
-      <w:bookmarkStart w:id="39" w:name="_Toc228981245"/>
+      <w:bookmarkStart w:id="39" w:name="_Toc228987108"/>
       <w:r>
         <w:lastRenderedPageBreak/>
         <w:t xml:space="preserve">3.1.1 </w:t>
@@ -6892,7 +7009,7 @@
           <w:noProof/>
         </w:rPr>
         <w:drawing>
-          <wp:inline distT="0" distB="0" distL="0" distR="0" wp14:anchorId="7D5A5376" wp14:editId="22A2AC5E">
+          <wp:inline distT="0" distB="0" distL="0" distR="0" wp14:anchorId="7D5A5376" wp14:editId="46C2B26F">
             <wp:extent cx="2479538" cy="2261556"/>
             <wp:effectExtent l="0" t="0" r="0" b="5715"/>
             <wp:docPr id="455141339" name="Picture 4"/>
@@ -6951,32 +7068,19 @@
         <w:pStyle w:val="Caption"/>
         <w:jc w:val="center"/>
       </w:pPr>
-      <w:bookmarkStart w:id="40" w:name="_Toc228977559"/>
+      <w:bookmarkStart w:id="40" w:name="_Toc228987126"/>
       <w:r>
         <w:t xml:space="preserve">Figure </w:t>
       </w:r>
-      <w:r>
-        <w:fldChar w:fldCharType="begin"/>
-      </w:r>
-      <w:r>
-        <w:instrText xml:space="preserve"> SEQ Figure \* ARABIC </w:instrText>
-      </w:r>
-      <w:r>
-        <w:fldChar w:fldCharType="separate"/>
-      </w:r>
-      <w:r>
-        <w:rPr>
-          <w:noProof/>
-        </w:rPr>
-        <w:t>4</w:t>
-      </w:r>
-      <w:bookmarkEnd w:id="40"/>
-      <w:r>
-        <w:rPr>
-          <w:noProof/>
-        </w:rPr>
-        <w:fldChar w:fldCharType="end"/>
-      </w:r>
+      <w:fldSimple w:instr=" SEQ Figure \* ARABIC ">
+        <w:r>
+          <w:rPr>
+            <w:noProof/>
+          </w:rPr>
+          <w:t>4</w:t>
+        </w:r>
+        <w:bookmarkEnd w:id="40"/>
+      </w:fldSimple>
     </w:p>
     <w:p>
       <w:r>
@@ -7022,7 +7126,7 @@
                 <w:noProof/>
               </w:rPr>
               <w:drawing>
-                <wp:inline distT="0" distB="0" distL="0" distR="0" wp14:anchorId="2A67817B" wp14:editId="7A94342D">
+                <wp:inline distT="0" distB="0" distL="0" distR="0" wp14:anchorId="2A67817B" wp14:editId="293A9068">
                   <wp:extent cx="2295525" cy="2105025"/>
                   <wp:effectExtent l="0" t="0" r="0" b="0"/>
                   <wp:docPr id="1070291612" name="Picture 5"/>
@@ -7078,32 +7182,19 @@
               <w:pStyle w:val="Caption"/>
               <w:jc w:val="center"/>
             </w:pPr>
-            <w:bookmarkStart w:id="41" w:name="_Toc228977560"/>
+            <w:bookmarkStart w:id="41" w:name="_Toc228987127"/>
             <w:r>
               <w:t xml:space="preserve">Figure </w:t>
             </w:r>
-            <w:r>
-              <w:fldChar w:fldCharType="begin"/>
-            </w:r>
-            <w:r>
-              <w:instrText xml:space="preserve"> SEQ Figure \* ARABIC </w:instrText>
-            </w:r>
-            <w:r>
-              <w:fldChar w:fldCharType="separate"/>
-            </w:r>
-            <w:r>
-              <w:rPr>
-                <w:noProof/>
-              </w:rPr>
-              <w:t>5</w:t>
-            </w:r>
-            <w:bookmarkEnd w:id="41"/>
-            <w:r>
-              <w:rPr>
-                <w:noProof/>
-              </w:rPr>
-              <w:fldChar w:fldCharType="end"/>
-            </w:r>
+            <w:fldSimple w:instr=" SEQ Figure \* ARABIC ">
+              <w:r>
+                <w:rPr>
+                  <w:noProof/>
+                </w:rPr>
+                <w:t>5</w:t>
+              </w:r>
+              <w:bookmarkEnd w:id="41"/>
+            </w:fldSimple>
           </w:p>
         </w:tc>
         <w:tc>
@@ -7179,32 +7270,19 @@
               <w:pStyle w:val="Caption"/>
               <w:jc w:val="center"/>
             </w:pPr>
-            <w:bookmarkStart w:id="42" w:name="_Toc228977561"/>
+            <w:bookmarkStart w:id="42" w:name="_Toc228987128"/>
             <w:r>
               <w:t xml:space="preserve">Figure </w:t>
             </w:r>
-            <w:r>
-              <w:fldChar w:fldCharType="begin"/>
-            </w:r>
-            <w:r>
-              <w:instrText xml:space="preserve"> SEQ Figure \* ARABIC </w:instrText>
-            </w:r>
-            <w:r>
-              <w:fldChar w:fldCharType="separate"/>
-            </w:r>
-            <w:r>
-              <w:rPr>
-                <w:noProof/>
-              </w:rPr>
-              <w:t>6</w:t>
-            </w:r>
-            <w:bookmarkEnd w:id="42"/>
-            <w:r>
-              <w:rPr>
-                <w:noProof/>
-              </w:rPr>
-              <w:fldChar w:fldCharType="end"/>
-            </w:r>
+            <w:fldSimple w:instr=" SEQ Figure \* ARABIC ">
+              <w:r>
+                <w:rPr>
+                  <w:noProof/>
+                </w:rPr>
+                <w:t>6</w:t>
+              </w:r>
+              <w:bookmarkEnd w:id="42"/>
+            </w:fldSimple>
           </w:p>
         </w:tc>
       </w:tr>
@@ -7239,7 +7317,15 @@
     <w:p>
       <w:r>
         <w:lastRenderedPageBreak/>
-        <w:t>There are 2 ways that I can easily display the tiles to the user: Prefabs, and Mesh Generation. Prefabs would be significantly easier to incorporate, allowing me to create a prefab for each biome and instantiating each prefab where needed. This has many benefits such as making development of this feature very quick, simplicity, code readability and making pathfinding easier through direct ray-casting. This could have potential drawbacks such as performance losses from having thousands to tens of thousands of GameObjects in a scene.</w:t>
+        <w:t xml:space="preserve">There are 2 ways that I can easily display the tiles to the user: Prefabs, and Mesh Generation. Prefabs would be significantly easier to incorporate, allowing me to create a prefab for each biome and instantiating each prefab where needed. This has many benefits such as making development of this feature very quick, simplicity, code readability and making pathfinding easier through direct ray-casting. This could have potential drawbacks such as performance losses from having thousands to tens of thousands of </w:t>
+      </w:r>
+      <w:proofErr w:type="spellStart"/>
+      <w:r>
+        <w:t>GameObjects</w:t>
+      </w:r>
+      <w:proofErr w:type="spellEnd"/>
+      <w:r>
+        <w:t xml:space="preserve"> in a scene.</w:t>
       </w:r>
     </w:p>
     <w:p/>
@@ -7261,7 +7347,7 @@
       <w:pPr>
         <w:pStyle w:val="Heading3"/>
       </w:pPr>
-      <w:bookmarkStart w:id="43" w:name="_Toc228981246"/>
+      <w:bookmarkStart w:id="43" w:name="_Toc228987109"/>
       <w:r>
         <w:t>3.1.2 Biomes</w:t>
       </w:r>
@@ -7432,31 +7518,18 @@
         <w:pStyle w:val="Caption"/>
         <w:jc w:val="center"/>
       </w:pPr>
-      <w:bookmarkStart w:id="44" w:name="_Toc228977562"/>
+      <w:bookmarkStart w:id="44" w:name="_Toc228987129"/>
       <w:r>
         <w:t xml:space="preserve">Figure </w:t>
       </w:r>
-      <w:r>
-        <w:fldChar w:fldCharType="begin"/>
-      </w:r>
-      <w:r>
-        <w:instrText xml:space="preserve"> SEQ Figure \* ARABIC </w:instrText>
-      </w:r>
-      <w:r>
-        <w:fldChar w:fldCharType="separate"/>
-      </w:r>
-      <w:r>
-        <w:rPr>
-          <w:noProof/>
-        </w:rPr>
-        <w:t>7</w:t>
-      </w:r>
-      <w:r>
-        <w:rPr>
-          <w:noProof/>
-        </w:rPr>
-        <w:fldChar w:fldCharType="end"/>
-      </w:r>
+      <w:fldSimple w:instr=" SEQ Figure \* ARABIC ">
+        <w:r>
+          <w:rPr>
+            <w:noProof/>
+          </w:rPr>
+          <w:t>7</w:t>
+        </w:r>
+      </w:fldSimple>
       <w:r>
         <w:t xml:space="preserve"> </w:t>
       </w:r>
@@ -7522,7 +7595,7 @@
       <w:pPr>
         <w:pStyle w:val="Heading3"/>
       </w:pPr>
-      <w:bookmarkStart w:id="45" w:name="_Toc228981247"/>
+      <w:bookmarkStart w:id="45" w:name="_Toc228987110"/>
       <w:r>
         <w:t>3.1.3 Resource Distribution</w:t>
       </w:r>
@@ -7558,7 +7631,7 @@
       <w:pPr>
         <w:pStyle w:val="Heading3"/>
       </w:pPr>
-      <w:bookmarkStart w:id="46" w:name="_Toc228981248"/>
+      <w:bookmarkStart w:id="46" w:name="_Toc228987111"/>
       <w:r>
         <w:t>3.1.4 River generation</w:t>
       </w:r>
@@ -7600,7 +7673,7 @@
       <w:pPr>
         <w:pStyle w:val="Heading3"/>
       </w:pPr>
-      <w:bookmarkStart w:id="47" w:name="_Toc228981249"/>
+      <w:bookmarkStart w:id="47" w:name="_Toc228987112"/>
       <w:r>
         <w:t>3.1.</w:t>
       </w:r>
@@ -7709,7 +7782,7 @@
       <w:pPr>
         <w:pStyle w:val="Heading2"/>
       </w:pPr>
-      <w:bookmarkStart w:id="48" w:name="_Toc228981250"/>
+      <w:bookmarkStart w:id="48" w:name="_Toc228987113"/>
       <w:r>
         <w:t>3.2 Pathfinding</w:t>
       </w:r>
@@ -7727,7 +7800,7 @@
       <w:pPr>
         <w:pStyle w:val="Heading3"/>
       </w:pPr>
-      <w:bookmarkStart w:id="49" w:name="_Toc228981251"/>
+      <w:bookmarkStart w:id="49" w:name="_Toc228987114"/>
       <w:r>
         <w:t xml:space="preserve">3.2.1 </w:t>
       </w:r>
@@ -7769,7 +7842,7 @@
       <w:pPr>
         <w:pStyle w:val="Heading3"/>
       </w:pPr>
-      <w:bookmarkStart w:id="50" w:name="_Toc228981252"/>
+      <w:bookmarkStart w:id="50" w:name="_Toc228987115"/>
       <w:r>
         <w:t>3.2.2 Heuristics</w:t>
       </w:r>
@@ -7903,28 +7976,18 @@
         <w:pStyle w:val="Caption"/>
         <w:jc w:val="center"/>
       </w:pPr>
-      <w:bookmarkStart w:id="51" w:name="_Toc228977563"/>
+      <w:bookmarkStart w:id="51" w:name="_Toc228987130"/>
       <w:r>
         <w:t xml:space="preserve">Figure </w:t>
       </w:r>
-      <w:r>
-        <w:fldChar w:fldCharType="begin"/>
-      </w:r>
-      <w:r>
-        <w:instrText xml:space="preserve"> SEQ Figure \* ARABIC </w:instrText>
-      </w:r>
-      <w:r>
-        <w:fldChar w:fldCharType="separate"/>
-      </w:r>
-      <w:r>
-        <w:rPr>
-          <w:noProof/>
-        </w:rPr>
-        <w:t>8</w:t>
-      </w:r>
-      <w:r>
-        <w:fldChar w:fldCharType="end"/>
-      </w:r>
+      <w:fldSimple w:instr=" SEQ Figure \* ARABIC ">
+        <w:r>
+          <w:rPr>
+            <w:noProof/>
+          </w:rPr>
+          <w:t>8</w:t>
+        </w:r>
+      </w:fldSimple>
       <w:r>
         <w:t xml:space="preserve"> </w:t>
       </w:r>
@@ -7983,7 +8046,7 @@
       <w:pPr>
         <w:pStyle w:val="Heading3"/>
       </w:pPr>
-      <w:bookmarkStart w:id="52" w:name="_Toc228981253"/>
+      <w:bookmarkStart w:id="52" w:name="_Toc228987116"/>
       <w:r>
         <w:t>3.2.3 Limitations</w:t>
       </w:r>
@@ -8023,7 +8086,7 @@
       <w:pPr>
         <w:pStyle w:val="Heading2"/>
       </w:pPr>
-      <w:bookmarkStart w:id="53" w:name="_Toc228981254"/>
+      <w:bookmarkStart w:id="53" w:name="_Toc228987117"/>
       <w:r>
         <w:t>3.3 AI Integrations</w:t>
       </w:r>
@@ -8050,7 +8113,7 @@
       <w:pPr>
         <w:pStyle w:val="Heading3"/>
       </w:pPr>
-      <w:bookmarkStart w:id="54" w:name="_Toc228981255"/>
+      <w:bookmarkStart w:id="54" w:name="_Toc228987118"/>
       <w:r>
         <w:t>3.3.1 Unity ML-Agents</w:t>
       </w:r>
@@ -8154,7 +8217,7 @@
       <w:pPr>
         <w:pStyle w:val="Heading3"/>
       </w:pPr>
-      <w:bookmarkStart w:id="55" w:name="_Toc228981256"/>
+      <w:bookmarkStart w:id="55" w:name="_Toc228987119"/>
       <w:r>
         <w:t>3.3.2 AI Controller</w:t>
       </w:r>
@@ -8187,9 +8250,11 @@
       <w:pPr>
         <w:pStyle w:val="Heading3"/>
       </w:pPr>
+      <w:bookmarkStart w:id="56" w:name="_Toc228987120"/>
       <w:r>
         <w:t>3.3.3 Limitations</w:t>
       </w:r>
+      <w:bookmarkEnd w:id="56"/>
     </w:p>
     <w:p>
       <w:r>
@@ -8224,6 +8289,7 @@
       <w:pPr>
         <w:pStyle w:val="Heading1"/>
       </w:pPr>
+      <w:bookmarkStart w:id="57" w:name="_Toc228987121"/>
       <w:r>
         <w:t xml:space="preserve">Chapter 4 </w:t>
       </w:r>
@@ -8233,13 +8299,686 @@
       <w:r>
         <w:t xml:space="preserve"> Implementation</w:t>
       </w:r>
+      <w:bookmarkEnd w:id="57"/>
     </w:p>
     <w:p>
       <w:r>
         <w:t>The implementation chapter will be an overview of the main features’ implementation into Neural Conquest, including the reasoning behind certain decisions while implementing. The subchapters in this section are labelled after each of the subchapters from the literature survey and design chapter.</w:t>
       </w:r>
     </w:p>
-    <w:bookmarkStart w:id="56" w:name="_Toc228981257" w:displacedByCustomXml="next"/>
+    <w:p>
+      <w:pPr>
+        <w:pStyle w:val="Heading2"/>
+      </w:pPr>
+      <w:r>
+        <w:t>4.1 World Generation</w:t>
+      </w:r>
+    </w:p>
+    <w:p>
+      <w:r>
+        <w:t>After designing the world generation system, I have decided to break the implementation up into 4 subsections: Creating the colour noise map</w:t>
+      </w:r>
+      <w:r>
+        <w:t>,</w:t>
+      </w:r>
+      <w:r>
+        <w:t xml:space="preserve"> </w:t>
+      </w:r>
+      <w:r>
+        <w:t>Creating the world map</w:t>
+      </w:r>
+      <w:r>
+        <w:t>,</w:t>
+      </w:r>
+      <w:r>
+        <w:t xml:space="preserve"> Creating the resource placement</w:t>
+      </w:r>
+      <w:r>
+        <w:t xml:space="preserve"> </w:t>
+      </w:r>
+      <w:r>
+        <w:t>and</w:t>
+      </w:r>
+      <w:r>
+        <w:t xml:space="preserve"> Creating the river generation.</w:t>
+      </w:r>
+    </w:p>
+    <w:p>
+      <w:pPr>
+        <w:pStyle w:val="Heading3"/>
+      </w:pPr>
+      <w:r>
+        <w:t>4.1.1 Creating the colour noise map</w:t>
+      </w:r>
+    </w:p>
+    <w:p>
+      <w:r>
+        <w:t xml:space="preserve">Creating the colour noise map first requires us to have a mono colour noise map. We can generate this by leveraging a mathematical function called Perlin Noise. The Unity Game Engine has a very easy way of creating a random </w:t>
+      </w:r>
+      <w:r>
+        <w:t>Perlin</w:t>
+      </w:r>
+      <w:r>
+        <w:t xml:space="preserve"> </w:t>
+      </w:r>
+      <w:r>
+        <w:t>N</w:t>
+      </w:r>
+      <w:r>
+        <w:t>oise map built into their standard maths library.</w:t>
+      </w:r>
+    </w:p>
+    <w:p>
+      <w:pPr>
+        <w:keepNext/>
+        <w:jc w:val="center"/>
+      </w:pPr>
+    </w:p>
+    <w:tbl>
+      <w:tblPr>
+        <w:tblStyle w:val="TableGrid"/>
+        <w:tblW w:w="0" w:type="auto"/>
+        <w:tblBorders>
+          <w:top w:val="none" w:sz="0" w:space="0" w:color="auto"/>
+          <w:left w:val="none" w:sz="0" w:space="0" w:color="auto"/>
+          <w:bottom w:val="none" w:sz="0" w:space="0" w:color="auto"/>
+          <w:right w:val="none" w:sz="0" w:space="0" w:color="auto"/>
+          <w:insideH w:val="none" w:sz="0" w:space="0" w:color="auto"/>
+          <w:insideV w:val="none" w:sz="0" w:space="0" w:color="auto"/>
+        </w:tblBorders>
+        <w:tblLook w:val="04A0" w:firstRow="1" w:lastRow="0" w:firstColumn="1" w:lastColumn="0" w:noHBand="0" w:noVBand="1"/>
+      </w:tblPr>
+      <w:tblGrid>
+        <w:gridCol w:w="5494"/>
+        <w:gridCol w:w="3532"/>
+      </w:tblGrid>
+      <w:tr>
+        <w:tc>
+          <w:tcPr>
+            <w:tcW w:w="4508" w:type="dxa"/>
+          </w:tcPr>
+          <w:p>
+            <w:pPr>
+              <w:keepNext/>
+              <w:jc w:val="center"/>
+            </w:pPr>
+            <w:r>
+              <w:rPr>
+                <w:noProof/>
+              </w:rPr>
+              <w:drawing>
+                <wp:inline distT="0" distB="0" distL="0" distR="0" wp14:anchorId="0CCAEC2A" wp14:editId="5FD2D15C">
+                  <wp:extent cx="3433313" cy="2182171"/>
+                  <wp:effectExtent l="0" t="0" r="0" b="8890"/>
+                  <wp:docPr id="68181493" name="Picture 3"/>
+                  <wp:cNvGraphicFramePr>
+                    <a:graphicFrameLocks xmlns:a="http://schemas.openxmlformats.org/drawingml/2006/main" noChangeAspect="1"/>
+                  </wp:cNvGraphicFramePr>
+                  <a:graphic xmlns:a="http://schemas.openxmlformats.org/drawingml/2006/main">
+                    <a:graphicData uri="http://schemas.openxmlformats.org/drawingml/2006/picture">
+                      <pic:pic xmlns:pic="http://schemas.openxmlformats.org/drawingml/2006/picture">
+                        <pic:nvPicPr>
+                          <pic:cNvPr id="0" name="Picture 4"/>
+                          <pic:cNvPicPr>
+                            <a:picLocks noChangeAspect="1" noChangeArrowheads="1"/>
+                          </pic:cNvPicPr>
+                        </pic:nvPicPr>
+                        <pic:blipFill>
+                          <a:blip r:embed="rId19">
+                            <a:extLst>
+                              <a:ext uri="{28A0092B-C50C-407E-A947-70E740481C1C}">
+                                <a14:useLocalDpi xmlns:a14="http://schemas.microsoft.com/office/drawing/2010/main" val="0"/>
+                              </a:ext>
+                            </a:extLst>
+                          </a:blip>
+                          <a:srcRect/>
+                          <a:stretch>
+                            <a:fillRect/>
+                          </a:stretch>
+                        </pic:blipFill>
+                        <pic:spPr bwMode="auto">
+                          <a:xfrm>
+                            <a:off x="0" y="0"/>
+                            <a:ext cx="3441209" cy="2187190"/>
+                          </a:xfrm>
+                          <a:prstGeom prst="rect">
+                            <a:avLst/>
+                          </a:prstGeom>
+                          <a:noFill/>
+                          <a:ln>
+                            <a:noFill/>
+                          </a:ln>
+                        </pic:spPr>
+                      </pic:pic>
+                    </a:graphicData>
+                  </a:graphic>
+                </wp:inline>
+              </w:drawing>
+            </w:r>
+          </w:p>
+        </w:tc>
+        <w:tc>
+          <w:tcPr>
+            <w:tcW w:w="4508" w:type="dxa"/>
+          </w:tcPr>
+          <w:p>
+            <w:pPr>
+              <w:keepNext/>
+              <w:jc w:val="center"/>
+            </w:pPr>
+            <w:r>
+              <w:rPr>
+                <w:noProof/>
+              </w:rPr>
+              <w:drawing>
+                <wp:inline distT="0" distB="0" distL="0" distR="0" wp14:anchorId="672AA791" wp14:editId="20E89274">
+                  <wp:extent cx="2156604" cy="2156604"/>
+                  <wp:effectExtent l="0" t="0" r="0" b="0"/>
+                  <wp:docPr id="1734218345" name="Picture 5" descr="Unity - Scripting API: Mathf.PerlinNoise"/>
+                  <wp:cNvGraphicFramePr>
+                    <a:graphicFrameLocks xmlns:a="http://schemas.openxmlformats.org/drawingml/2006/main" noChangeAspect="1"/>
+                  </wp:cNvGraphicFramePr>
+                  <a:graphic xmlns:a="http://schemas.openxmlformats.org/drawingml/2006/main">
+                    <a:graphicData uri="http://schemas.openxmlformats.org/drawingml/2006/picture">
+                      <pic:pic xmlns:pic="http://schemas.openxmlformats.org/drawingml/2006/picture">
+                        <pic:nvPicPr>
+                          <pic:cNvPr id="0" name="Picture 6" descr="Unity - Scripting API: Mathf.PerlinNoise"/>
+                          <pic:cNvPicPr>
+                            <a:picLocks noChangeAspect="1" noChangeArrowheads="1"/>
+                          </pic:cNvPicPr>
+                        </pic:nvPicPr>
+                        <pic:blipFill>
+                          <a:blip r:embed="rId20">
+                            <a:extLst>
+                              <a:ext uri="{28A0092B-C50C-407E-A947-70E740481C1C}">
+                                <a14:useLocalDpi xmlns:a14="http://schemas.microsoft.com/office/drawing/2010/main" val="0"/>
+                              </a:ext>
+                            </a:extLst>
+                          </a:blip>
+                          <a:srcRect/>
+                          <a:stretch>
+                            <a:fillRect/>
+                          </a:stretch>
+                        </pic:blipFill>
+                        <pic:spPr bwMode="auto">
+                          <a:xfrm>
+                            <a:off x="0" y="0"/>
+                            <a:ext cx="2164552" cy="2164552"/>
+                          </a:xfrm>
+                          <a:prstGeom prst="rect">
+                            <a:avLst/>
+                          </a:prstGeom>
+                          <a:noFill/>
+                          <a:ln>
+                            <a:noFill/>
+                          </a:ln>
+                        </pic:spPr>
+                      </pic:pic>
+                    </a:graphicData>
+                  </a:graphic>
+                </wp:inline>
+              </w:drawing>
+            </w:r>
+          </w:p>
+        </w:tc>
+      </w:tr>
+    </w:tbl>
+    <w:p>
+      <w:pPr>
+        <w:pStyle w:val="Caption"/>
+        <w:jc w:val="center"/>
+      </w:pPr>
+      <w:r>
+        <w:t xml:space="preserve">Figure </w:t>
+      </w:r>
+      <w:fldSimple w:instr=" SEQ Figure \* ARABIC ">
+        <w:r>
+          <w:rPr>
+            <w:noProof/>
+          </w:rPr>
+          <w:t>9</w:t>
+        </w:r>
+      </w:fldSimple>
+      <w:r>
+        <w:rPr>
+          <w:noProof/>
+        </w:rPr>
+        <w:t>: Basic Noise Map implementation</w:t>
+      </w:r>
+    </w:p>
+    <w:p>
+      <w:r>
+        <w:t>As shown above in Figure 9, generating a monochrome noise map can be very easy. The above snippet of code will generate a pseudo-random grid of values 1 and 0. Unfortunately, this is not going to be suitable for generating our world so adding in features to make the texture look more terrain-like is required.</w:t>
+      </w:r>
+    </w:p>
+    <w:p>
+      <w:pPr>
+        <w:keepNext/>
+        <w:jc w:val="center"/>
+      </w:pPr>
+    </w:p>
+    <w:tbl>
+      <w:tblPr>
+        <w:tblStyle w:val="TableGrid"/>
+        <w:tblW w:w="0" w:type="auto"/>
+        <w:tblBorders>
+          <w:top w:val="none" w:sz="0" w:space="0" w:color="auto"/>
+          <w:left w:val="none" w:sz="0" w:space="0" w:color="auto"/>
+          <w:bottom w:val="none" w:sz="0" w:space="0" w:color="auto"/>
+          <w:right w:val="none" w:sz="0" w:space="0" w:color="auto"/>
+          <w:insideH w:val="none" w:sz="0" w:space="0" w:color="auto"/>
+          <w:insideV w:val="none" w:sz="0" w:space="0" w:color="auto"/>
+        </w:tblBorders>
+        <w:tblLook w:val="04A0" w:firstRow="1" w:lastRow="0" w:firstColumn="1" w:lastColumn="0" w:noHBand="0" w:noVBand="1"/>
+      </w:tblPr>
+      <w:tblGrid>
+        <w:gridCol w:w="4508"/>
+        <w:gridCol w:w="4508"/>
+      </w:tblGrid>
+      <w:tr>
+        <w:tc>
+          <w:tcPr>
+            <w:tcW w:w="4508" w:type="dxa"/>
+          </w:tcPr>
+          <w:p>
+            <w:pPr>
+              <w:keepNext/>
+              <w:jc w:val="center"/>
+            </w:pPr>
+            <w:r>
+              <w:rPr>
+                <w:noProof/>
+              </w:rPr>
+              <w:drawing>
+                <wp:inline distT="0" distB="0" distL="0" distR="0" wp14:anchorId="2BC58B39" wp14:editId="54AB3B36">
+                  <wp:extent cx="2725947" cy="2545528"/>
+                  <wp:effectExtent l="0" t="0" r="0" b="7620"/>
+                  <wp:docPr id="1902486694" name="Picture 4"/>
+                  <wp:cNvGraphicFramePr>
+                    <a:graphicFrameLocks xmlns:a="http://schemas.openxmlformats.org/drawingml/2006/main" noChangeAspect="1"/>
+                  </wp:cNvGraphicFramePr>
+                  <a:graphic xmlns:a="http://schemas.openxmlformats.org/drawingml/2006/main">
+                    <a:graphicData uri="http://schemas.openxmlformats.org/drawingml/2006/picture">
+                      <pic:pic xmlns:pic="http://schemas.openxmlformats.org/drawingml/2006/picture">
+                        <pic:nvPicPr>
+                          <pic:cNvPr id="0" name="Picture 5"/>
+                          <pic:cNvPicPr>
+                            <a:picLocks noChangeAspect="1" noChangeArrowheads="1"/>
+                          </pic:cNvPicPr>
+                        </pic:nvPicPr>
+                        <pic:blipFill>
+                          <a:blip r:embed="rId21" cstate="print">
+                            <a:extLst>
+                              <a:ext uri="{28A0092B-C50C-407E-A947-70E740481C1C}">
+                                <a14:useLocalDpi xmlns:a14="http://schemas.microsoft.com/office/drawing/2010/main" val="0"/>
+                              </a:ext>
+                            </a:extLst>
+                          </a:blip>
+                          <a:srcRect/>
+                          <a:stretch>
+                            <a:fillRect/>
+                          </a:stretch>
+                        </pic:blipFill>
+                        <pic:spPr bwMode="auto">
+                          <a:xfrm>
+                            <a:off x="0" y="0"/>
+                            <a:ext cx="2734341" cy="2553366"/>
+                          </a:xfrm>
+                          <a:prstGeom prst="rect">
+                            <a:avLst/>
+                          </a:prstGeom>
+                          <a:noFill/>
+                          <a:ln>
+                            <a:noFill/>
+                          </a:ln>
+                        </pic:spPr>
+                      </pic:pic>
+                    </a:graphicData>
+                  </a:graphic>
+                </wp:inline>
+              </w:drawing>
+            </w:r>
+          </w:p>
+        </w:tc>
+        <w:tc>
+          <w:tcPr>
+            <w:tcW w:w="4508" w:type="dxa"/>
+          </w:tcPr>
+          <w:p>
+            <w:pPr>
+              <w:keepNext/>
+              <w:jc w:val="center"/>
+            </w:pPr>
+            <w:r>
+              <w:rPr>
+                <w:noProof/>
+              </w:rPr>
+              <w:drawing>
+                <wp:inline distT="0" distB="0" distL="0" distR="0" wp14:anchorId="54545DAE" wp14:editId="48D50A8D">
+                  <wp:extent cx="2544792" cy="2508123"/>
+                  <wp:effectExtent l="0" t="0" r="8255" b="6985"/>
+                  <wp:docPr id="1563134281" name="Picture 1"/>
+                  <wp:cNvGraphicFramePr>
+                    <a:graphicFrameLocks xmlns:a="http://schemas.openxmlformats.org/drawingml/2006/main" noChangeAspect="1"/>
+                  </wp:cNvGraphicFramePr>
+                  <a:graphic xmlns:a="http://schemas.openxmlformats.org/drawingml/2006/main">
+                    <a:graphicData uri="http://schemas.openxmlformats.org/drawingml/2006/picture">
+                      <pic:pic xmlns:pic="http://schemas.openxmlformats.org/drawingml/2006/picture">
+                        <pic:nvPicPr>
+                          <pic:cNvPr id="1563134281" name=""/>
+                          <pic:cNvPicPr/>
+                        </pic:nvPicPr>
+                        <pic:blipFill>
+                          <a:blip r:embed="rId22"/>
+                          <a:stretch>
+                            <a:fillRect/>
+                          </a:stretch>
+                        </pic:blipFill>
+                        <pic:spPr>
+                          <a:xfrm>
+                            <a:off x="0" y="0"/>
+                            <a:ext cx="2550513" cy="2513761"/>
+                          </a:xfrm>
+                          <a:prstGeom prst="rect">
+                            <a:avLst/>
+                          </a:prstGeom>
+                        </pic:spPr>
+                      </pic:pic>
+                    </a:graphicData>
+                  </a:graphic>
+                </wp:inline>
+              </w:drawing>
+            </w:r>
+          </w:p>
+        </w:tc>
+      </w:tr>
+    </w:tbl>
+    <w:p>
+      <w:pPr>
+        <w:pStyle w:val="Caption"/>
+        <w:jc w:val="center"/>
+      </w:pPr>
+      <w:r>
+        <w:t xml:space="preserve">Figure </w:t>
+      </w:r>
+      <w:fldSimple w:instr=" SEQ Figure \* ARABIC ">
+        <w:r>
+          <w:rPr>
+            <w:noProof/>
+          </w:rPr>
+          <w:t>10</w:t>
+        </w:r>
+      </w:fldSimple>
+      <w:r>
+        <w:t>: Complete Noise Map implementation</w:t>
+      </w:r>
+    </w:p>
+    <w:p>
+      <w:r>
+        <w:t xml:space="preserve">As shown in Figure 10, some adjustments have been made to the algorithm to produce a more terrain like </w:t>
+      </w:r>
+      <w:r>
+        <w:t xml:space="preserve">noise map. This is generated through the use of variables such as frequency, amplitude, persistence and lacunarity. These variables control how much influence each octave has over the overall </w:t>
+      </w:r>
+      <w:r>
+        <w:t>n</w:t>
+      </w:r>
+      <w:r>
+        <w:t>oise</w:t>
+      </w:r>
+      <w:r>
+        <w:t xml:space="preserve"> m</w:t>
+      </w:r>
+      <w:r>
+        <w:t>ap.</w:t>
+      </w:r>
+      <w:r>
+        <w:t xml:space="preserve"> This noise map can then be turned into a colour map by sampling the “pixel depth”, this just refers to the amount of black on any given pixel with fully white being worth 1 and fully black being worth 0.</w:t>
+      </w:r>
+    </w:p>
+    <w:p/>
+    <w:tbl>
+      <w:tblPr>
+        <w:tblStyle w:val="TableGrid"/>
+        <w:tblW w:w="0" w:type="auto"/>
+        <w:jc w:val="center"/>
+        <w:tblBorders>
+          <w:top w:val="none" w:sz="0" w:space="0" w:color="auto"/>
+          <w:left w:val="none" w:sz="0" w:space="0" w:color="auto"/>
+          <w:bottom w:val="none" w:sz="0" w:space="0" w:color="auto"/>
+          <w:right w:val="none" w:sz="0" w:space="0" w:color="auto"/>
+          <w:insideH w:val="none" w:sz="0" w:space="0" w:color="auto"/>
+          <w:insideV w:val="none" w:sz="0" w:space="0" w:color="auto"/>
+        </w:tblBorders>
+        <w:tblLook w:val="04A0" w:firstRow="1" w:lastRow="0" w:firstColumn="1" w:lastColumn="0" w:noHBand="0" w:noVBand="1"/>
+      </w:tblPr>
+      <w:tblGrid>
+        <w:gridCol w:w="4997"/>
+        <w:gridCol w:w="4029"/>
+      </w:tblGrid>
+      <w:tr>
+        <w:trPr>
+          <w:jc w:val="center"/>
+        </w:trPr>
+        <w:tc>
+          <w:tcPr>
+            <w:tcW w:w="4508" w:type="dxa"/>
+          </w:tcPr>
+          <w:p>
+            <w:r>
+              <w:rPr>
+                <w:noProof/>
+              </w:rPr>
+              <w:lastRenderedPageBreak/>
+              <w:drawing>
+                <wp:inline distT="0" distB="0" distL="0" distR="0" wp14:anchorId="7DC12D17" wp14:editId="4CD1D739">
+                  <wp:extent cx="3036498" cy="2216607"/>
+                  <wp:effectExtent l="0" t="0" r="0" b="0"/>
+                  <wp:docPr id="1011988313" name="Picture 3"/>
+                  <wp:cNvGraphicFramePr>
+                    <a:graphicFrameLocks xmlns:a="http://schemas.openxmlformats.org/drawingml/2006/main" noChangeAspect="1"/>
+                  </wp:cNvGraphicFramePr>
+                  <a:graphic xmlns:a="http://schemas.openxmlformats.org/drawingml/2006/main">
+                    <a:graphicData uri="http://schemas.openxmlformats.org/drawingml/2006/picture">
+                      <pic:pic xmlns:pic="http://schemas.openxmlformats.org/drawingml/2006/picture">
+                        <pic:nvPicPr>
+                          <pic:cNvPr id="0" name="Picture 11"/>
+                          <pic:cNvPicPr>
+                            <a:picLocks noChangeAspect="1" noChangeArrowheads="1"/>
+                          </pic:cNvPicPr>
+                        </pic:nvPicPr>
+                        <pic:blipFill>
+                          <a:blip r:embed="rId23" cstate="print">
+                            <a:extLst>
+                              <a:ext uri="{28A0092B-C50C-407E-A947-70E740481C1C}">
+                                <a14:useLocalDpi xmlns:a14="http://schemas.microsoft.com/office/drawing/2010/main" val="0"/>
+                              </a:ext>
+                            </a:extLst>
+                          </a:blip>
+                          <a:srcRect/>
+                          <a:stretch>
+                            <a:fillRect/>
+                          </a:stretch>
+                        </pic:blipFill>
+                        <pic:spPr bwMode="auto">
+                          <a:xfrm>
+                            <a:off x="0" y="0"/>
+                            <a:ext cx="3053579" cy="2229076"/>
+                          </a:xfrm>
+                          <a:prstGeom prst="rect">
+                            <a:avLst/>
+                          </a:prstGeom>
+                          <a:noFill/>
+                          <a:ln>
+                            <a:noFill/>
+                          </a:ln>
+                        </pic:spPr>
+                      </pic:pic>
+                    </a:graphicData>
+                  </a:graphic>
+                </wp:inline>
+              </w:drawing>
+            </w:r>
+          </w:p>
+        </w:tc>
+        <w:tc>
+          <w:tcPr>
+            <w:tcW w:w="4508" w:type="dxa"/>
+          </w:tcPr>
+          <w:p>
+            <w:pPr>
+              <w:keepNext/>
+            </w:pPr>
+            <w:r>
+              <w:rPr>
+                <w:noProof/>
+              </w:rPr>
+              <w:drawing>
+                <wp:inline distT="0" distB="0" distL="0" distR="0" wp14:anchorId="6E5357FF" wp14:editId="391E5321">
+                  <wp:extent cx="2225615" cy="2219183"/>
+                  <wp:effectExtent l="0" t="0" r="3810" b="0"/>
+                  <wp:docPr id="887069272" name="Picture 1"/>
+                  <wp:cNvGraphicFramePr>
+                    <a:graphicFrameLocks xmlns:a="http://schemas.openxmlformats.org/drawingml/2006/main" noChangeAspect="1"/>
+                  </wp:cNvGraphicFramePr>
+                  <a:graphic xmlns:a="http://schemas.openxmlformats.org/drawingml/2006/main">
+                    <a:graphicData uri="http://schemas.openxmlformats.org/drawingml/2006/picture">
+                      <pic:pic xmlns:pic="http://schemas.openxmlformats.org/drawingml/2006/picture">
+                        <pic:nvPicPr>
+                          <pic:cNvPr id="887069272" name=""/>
+                          <pic:cNvPicPr/>
+                        </pic:nvPicPr>
+                        <pic:blipFill>
+                          <a:blip r:embed="rId24"/>
+                          <a:stretch>
+                            <a:fillRect/>
+                          </a:stretch>
+                        </pic:blipFill>
+                        <pic:spPr>
+                          <a:xfrm>
+                            <a:off x="0" y="0"/>
+                            <a:ext cx="2232638" cy="2226186"/>
+                          </a:xfrm>
+                          <a:prstGeom prst="rect">
+                            <a:avLst/>
+                          </a:prstGeom>
+                        </pic:spPr>
+                      </pic:pic>
+                    </a:graphicData>
+                  </a:graphic>
+                </wp:inline>
+              </w:drawing>
+            </w:r>
+          </w:p>
+        </w:tc>
+      </w:tr>
+    </w:tbl>
+    <w:p>
+      <w:pPr>
+        <w:pStyle w:val="Caption"/>
+        <w:jc w:val="center"/>
+      </w:pPr>
+      <w:r>
+        <w:t xml:space="preserve">Figure </w:t>
+      </w:r>
+      <w:fldSimple w:instr=" SEQ Figure \* ARABIC ">
+        <w:r>
+          <w:rPr>
+            <w:noProof/>
+          </w:rPr>
+          <w:t>11</w:t>
+        </w:r>
+      </w:fldSimple>
+      <w:r>
+        <w:t>: Turning Noise Map into Colour Map</w:t>
+      </w:r>
+    </w:p>
+    <w:p>
+      <w:pPr>
+        <w:pStyle w:val="Caption"/>
+        <w:keepNext/>
+        <w:jc w:val="center"/>
+      </w:pPr>
+      <w:r>
+        <w:rPr>
+          <w:noProof/>
+        </w:rPr>
+        <w:drawing>
+          <wp:inline distT="0" distB="0" distL="0" distR="0" wp14:anchorId="01046673" wp14:editId="6BB7936B">
+            <wp:extent cx="2958861" cy="1965248"/>
+            <wp:effectExtent l="0" t="0" r="0" b="0"/>
+            <wp:docPr id="834585634" name="Picture 5"/>
+            <wp:cNvGraphicFramePr>
+              <a:graphicFrameLocks xmlns:a="http://schemas.openxmlformats.org/drawingml/2006/main" noChangeAspect="1"/>
+            </wp:cNvGraphicFramePr>
+            <a:graphic xmlns:a="http://schemas.openxmlformats.org/drawingml/2006/main">
+              <a:graphicData uri="http://schemas.openxmlformats.org/drawingml/2006/picture">
+                <pic:pic xmlns:pic="http://schemas.openxmlformats.org/drawingml/2006/picture">
+                  <pic:nvPicPr>
+                    <pic:cNvPr id="0" name="Picture 13"/>
+                    <pic:cNvPicPr>
+                      <a:picLocks noChangeAspect="1" noChangeArrowheads="1"/>
+                    </pic:cNvPicPr>
+                  </pic:nvPicPr>
+                  <pic:blipFill>
+                    <a:blip r:embed="rId25">
+                      <a:extLst>
+                        <a:ext uri="{28A0092B-C50C-407E-A947-70E740481C1C}">
+                          <a14:useLocalDpi xmlns:a14="http://schemas.microsoft.com/office/drawing/2010/main" val="0"/>
+                        </a:ext>
+                      </a:extLst>
+                    </a:blip>
+                    <a:srcRect/>
+                    <a:stretch>
+                      <a:fillRect/>
+                    </a:stretch>
+                  </pic:blipFill>
+                  <pic:spPr bwMode="auto">
+                    <a:xfrm>
+                      <a:off x="0" y="0"/>
+                      <a:ext cx="2975334" cy="1976189"/>
+                    </a:xfrm>
+                    <a:prstGeom prst="rect">
+                      <a:avLst/>
+                    </a:prstGeom>
+                    <a:noFill/>
+                    <a:ln>
+                      <a:noFill/>
+                    </a:ln>
+                  </pic:spPr>
+                </pic:pic>
+              </a:graphicData>
+            </a:graphic>
+          </wp:inline>
+        </w:drawing>
+      </w:r>
+    </w:p>
+    <w:p>
+      <w:pPr>
+        <w:pStyle w:val="Caption"/>
+        <w:jc w:val="center"/>
+      </w:pPr>
+      <w:r>
+        <w:t xml:space="preserve">Figure </w:t>
+      </w:r>
+      <w:fldSimple w:instr=" SEQ Figure \* ARABIC ">
+        <w:r>
+          <w:rPr>
+            <w:noProof/>
+          </w:rPr>
+          <w:t>12</w:t>
+        </w:r>
+      </w:fldSimple>
+      <w:r>
+        <w:t>: The TerrainType struct used in regions variable</w:t>
+      </w:r>
+    </w:p>
+    <w:p>
+      <w:r>
+        <w:t>Figure 11 shows how the noise map in Figure 10 can be turned into a colour map. The code snippet in Figure 11 shows how a ‘regions’ array of the TerrainType struct, as shown in Figure 12, can be used to turn our map into colour. This colour map can be seeded so that the player can play on the same map if they know the seed for it. This control gives the player the choice of how they can start the game and defines everything from the terrain to the resource distribution.</w:t>
+      </w:r>
+    </w:p>
+    <w:bookmarkStart w:id="58" w:name="_Toc228987122" w:displacedByCustomXml="next"/>
     <w:sdt>
       <w:sdtPr>
         <w:rPr>
@@ -8267,7 +9006,7 @@
           <w:r>
             <w:t>References</w:t>
           </w:r>
-          <w:bookmarkEnd w:id="56"/>
+          <w:bookmarkEnd w:id="58"/>
         </w:p>
         <w:sdt>
           <w:sdtPr>
@@ -10374,6 +11113,7 @@
   <w:style w:type="character" w:default="1" w:styleId="DefaultParagraphFont">
     <w:name w:val="Default Paragraph Font"/>
     <w:uiPriority w:val="1"/>
+    <w:semiHidden/>
     <w:unhideWhenUsed/>
   </w:style>
   <w:style w:type="table" w:default="1" w:styleId="TableNormal">
@@ -10984,6 +11724,18 @@
     <w:rsid w:val="0090506A"/>
     <w:rPr>
       <w:rFonts w:ascii="Times New Roman" w:hAnsi="Times New Roman" w:cs="Times New Roman"/>
+    </w:rPr>
+  </w:style>
+  <w:style w:type="character" w:styleId="UnresolvedMention">
+    <w:name w:val="Unresolved Mention"/>
+    <w:basedOn w:val="DefaultParagraphFont"/>
+    <w:uiPriority w:val="99"/>
+    <w:semiHidden/>
+    <w:unhideWhenUsed/>
+    <w:rsid w:val="006865F9"/>
+    <w:rPr>
+      <w:color w:val="605E5C"/>
+      <w:shd w:val="clear" w:color="auto" w:fill="E1DFDD"/>
     </w:rPr>
   </w:style>
 </w:styles>

</xml_diff>

<commit_message>
feat: written Creating the world map
</commit_message>
<xml_diff>
--- a/Report.docx
+++ b/Report.docx
@@ -321,7 +321,7 @@
         <w:pStyle w:val="Heading1"/>
       </w:pPr>
       <w:bookmarkStart w:id="1" w:name="_Toc40898999"/>
-      <w:bookmarkStart w:id="2" w:name="_Toc228987075"/>
+      <w:bookmarkStart w:id="2" w:name="_Toc229075222"/>
       <w:r>
         <w:lastRenderedPageBreak/>
         <w:t>Abstract</w:t>
@@ -331,7 +331,15 @@
     </w:p>
     <w:p>
       <w:r>
-        <w:t>AI is a still growing industry and while the current trend of AI is heading towards the usage of Large Language Models, I believe there is a genuine use case for machine learning models within video games. The focus of this project is to uncover the current reasons behind why the industry doesn’t use machine learning AI for uses such as Non-Player Characters or local multiplayer games. This is appro</w:t>
+        <w:t xml:space="preserve">AI is a still growing industry and while the current trend of AI is heading towards the usage of Large Language Models, I believe there is a genuine use case for machine learning models within video games. The focus of this project is to uncover the current reasons behind why the industry doesn’t use machine learning AI for uses such as </w:t>
+      </w:r>
+      <w:proofErr w:type="gramStart"/>
+      <w:r>
+        <w:t>Non-Player Characters</w:t>
+      </w:r>
+      <w:proofErr w:type="gramEnd"/>
+      <w:r>
+        <w:t xml:space="preserve"> or local multiplayer games. This is appro</w:t>
       </w:r>
       <w:r>
         <w:t>ached by covering the design choices and code architecture of implementing a machine learning model into the Unity game engine. To evaluate whether the AI is functional, data has been gathered using a mix of qualitative and quantitative research. This research was collected through a short survey given to participants.</w:t>
@@ -361,7 +369,7 @@
         <w:spacing w:after="321"/>
         <w:ind w:left="-5"/>
       </w:pPr>
-      <w:bookmarkStart w:id="3" w:name="_Toc228987076"/>
+      <w:bookmarkStart w:id="3" w:name="_Toc229075223"/>
       <w:r>
         <w:lastRenderedPageBreak/>
         <w:t>Declaration</w:t>
@@ -483,7 +491,7 @@
         <w:ind w:left="-5"/>
       </w:pPr>
       <w:bookmarkStart w:id="4" w:name="_Toc40899001"/>
-      <w:bookmarkStart w:id="5" w:name="_Toc228987077"/>
+      <w:bookmarkStart w:id="5" w:name="_Toc229075224"/>
       <w:r>
         <w:lastRenderedPageBreak/>
         <w:t>Acknowledgements</w:t>
@@ -620,7 +628,7 @@
         <w:spacing w:line="259" w:lineRule="auto"/>
       </w:pPr>
     </w:p>
-    <w:bookmarkStart w:id="6" w:name="_Toc228987078" w:displacedByCustomXml="next"/>
+    <w:bookmarkStart w:id="6" w:name="_Toc229075225" w:displacedByCustomXml="next"/>
     <w:sdt>
       <w:sdtPr>
         <w:rPr>
@@ -678,7 +686,7 @@
           <w:r>
             <w:fldChar w:fldCharType="separate"/>
           </w:r>
-          <w:hyperlink w:anchor="_Toc228987075" w:history="1">
+          <w:hyperlink w:anchor="_Toc229075222" w:history="1">
             <w:r>
               <w:rPr>
                 <w:rStyle w:val="Hyperlink"/>
@@ -705,7 +713,7 @@
                 <w:noProof/>
                 <w:webHidden/>
               </w:rPr>
-              <w:instrText xml:space="preserve"> PAGEREF _Toc228987075 \h </w:instrText>
+              <w:instrText xml:space="preserve"> PAGEREF _Toc229075222 \h </w:instrText>
             </w:r>
             <w:r>
               <w:rPr>
@@ -752,7 +760,7 @@
               <w14:ligatures w14:val="standardContextual"/>
             </w:rPr>
           </w:pPr>
-          <w:hyperlink w:anchor="_Toc228987076" w:history="1">
+          <w:hyperlink w:anchor="_Toc229075223" w:history="1">
             <w:r>
               <w:rPr>
                 <w:rStyle w:val="Hyperlink"/>
@@ -779,7 +787,7 @@
                 <w:noProof/>
                 <w:webHidden/>
               </w:rPr>
-              <w:instrText xml:space="preserve"> PAGEREF _Toc228987076 \h </w:instrText>
+              <w:instrText xml:space="preserve"> PAGEREF _Toc229075223 \h </w:instrText>
             </w:r>
             <w:r>
               <w:rPr>
@@ -826,7 +834,7 @@
               <w14:ligatures w14:val="standardContextual"/>
             </w:rPr>
           </w:pPr>
-          <w:hyperlink w:anchor="_Toc228987077" w:history="1">
+          <w:hyperlink w:anchor="_Toc229075224" w:history="1">
             <w:r>
               <w:rPr>
                 <w:rStyle w:val="Hyperlink"/>
@@ -853,7 +861,7 @@
                 <w:noProof/>
                 <w:webHidden/>
               </w:rPr>
-              <w:instrText xml:space="preserve"> PAGEREF _Toc228987077 \h </w:instrText>
+              <w:instrText xml:space="preserve"> PAGEREF _Toc229075224 \h </w:instrText>
             </w:r>
             <w:r>
               <w:rPr>
@@ -900,7 +908,7 @@
               <w14:ligatures w14:val="standardContextual"/>
             </w:rPr>
           </w:pPr>
-          <w:hyperlink w:anchor="_Toc228987078" w:history="1">
+          <w:hyperlink w:anchor="_Toc229075225" w:history="1">
             <w:r>
               <w:rPr>
                 <w:rStyle w:val="Hyperlink"/>
@@ -927,7 +935,7 @@
                 <w:noProof/>
                 <w:webHidden/>
               </w:rPr>
-              <w:instrText xml:space="preserve"> PAGEREF _Toc228987078 \h </w:instrText>
+              <w:instrText xml:space="preserve"> PAGEREF _Toc229075225 \h </w:instrText>
             </w:r>
             <w:r>
               <w:rPr>
@@ -974,7 +982,7 @@
               <w14:ligatures w14:val="standardContextual"/>
             </w:rPr>
           </w:pPr>
-          <w:hyperlink w:anchor="_Toc228987079" w:history="1">
+          <w:hyperlink w:anchor="_Toc229075226" w:history="1">
             <w:r>
               <w:rPr>
                 <w:rStyle w:val="Hyperlink"/>
@@ -1001,7 +1009,7 @@
                 <w:noProof/>
                 <w:webHidden/>
               </w:rPr>
-              <w:instrText xml:space="preserve"> PAGEREF _Toc228987079 \h </w:instrText>
+              <w:instrText xml:space="preserve"> PAGEREF _Toc229075226 \h </w:instrText>
             </w:r>
             <w:r>
               <w:rPr>
@@ -1048,7 +1056,7 @@
               <w14:ligatures w14:val="standardContextual"/>
             </w:rPr>
           </w:pPr>
-          <w:hyperlink w:anchor="_Toc228987080" w:history="1">
+          <w:hyperlink w:anchor="_Toc229075227" w:history="1">
             <w:r>
               <w:rPr>
                 <w:rStyle w:val="Hyperlink"/>
@@ -1075,7 +1083,7 @@
                 <w:noProof/>
                 <w:webHidden/>
               </w:rPr>
-              <w:instrText xml:space="preserve"> PAGEREF _Toc228987080 \h </w:instrText>
+              <w:instrText xml:space="preserve"> PAGEREF _Toc229075227 \h </w:instrText>
             </w:r>
             <w:r>
               <w:rPr>
@@ -1122,7 +1130,7 @@
               <w14:ligatures w14:val="standardContextual"/>
             </w:rPr>
           </w:pPr>
-          <w:hyperlink w:anchor="_Toc228987081" w:history="1">
+          <w:hyperlink w:anchor="_Toc229075228" w:history="1">
             <w:r>
               <w:rPr>
                 <w:rStyle w:val="Hyperlink"/>
@@ -1149,7 +1157,7 @@
                 <w:noProof/>
                 <w:webHidden/>
               </w:rPr>
-              <w:instrText xml:space="preserve"> PAGEREF _Toc228987081 \h </w:instrText>
+              <w:instrText xml:space="preserve"> PAGEREF _Toc229075228 \h </w:instrText>
             </w:r>
             <w:r>
               <w:rPr>
@@ -1196,7 +1204,7 @@
               <w14:ligatures w14:val="standardContextual"/>
             </w:rPr>
           </w:pPr>
-          <w:hyperlink w:anchor="_Toc228987082" w:history="1">
+          <w:hyperlink w:anchor="_Toc229075229" w:history="1">
             <w:r>
               <w:rPr>
                 <w:rStyle w:val="Hyperlink"/>
@@ -1223,7 +1231,7 @@
                 <w:noProof/>
                 <w:webHidden/>
               </w:rPr>
-              <w:instrText xml:space="preserve"> PAGEREF _Toc228987082 \h </w:instrText>
+              <w:instrText xml:space="preserve"> PAGEREF _Toc229075229 \h </w:instrText>
             </w:r>
             <w:r>
               <w:rPr>
@@ -1270,7 +1278,7 @@
               <w14:ligatures w14:val="standardContextual"/>
             </w:rPr>
           </w:pPr>
-          <w:hyperlink w:anchor="_Toc228987083" w:history="1">
+          <w:hyperlink w:anchor="_Toc229075230" w:history="1">
             <w:r>
               <w:rPr>
                 <w:rStyle w:val="Hyperlink"/>
@@ -1297,7 +1305,7 @@
                 <w:noProof/>
                 <w:webHidden/>
               </w:rPr>
-              <w:instrText xml:space="preserve"> PAGEREF _Toc228987083 \h </w:instrText>
+              <w:instrText xml:space="preserve"> PAGEREF _Toc229075230 \h </w:instrText>
             </w:r>
             <w:r>
               <w:rPr>
@@ -1344,7 +1352,7 @@
               <w14:ligatures w14:val="standardContextual"/>
             </w:rPr>
           </w:pPr>
-          <w:hyperlink w:anchor="_Toc228987084" w:history="1">
+          <w:hyperlink w:anchor="_Toc229075231" w:history="1">
             <w:r>
               <w:rPr>
                 <w:rStyle w:val="Hyperlink"/>
@@ -1371,7 +1379,7 @@
                 <w:noProof/>
                 <w:webHidden/>
               </w:rPr>
-              <w:instrText xml:space="preserve"> PAGEREF _Toc228987084 \h </w:instrText>
+              <w:instrText xml:space="preserve"> PAGEREF _Toc229075231 \h </w:instrText>
             </w:r>
             <w:r>
               <w:rPr>
@@ -1418,7 +1426,7 @@
               <w14:ligatures w14:val="standardContextual"/>
             </w:rPr>
           </w:pPr>
-          <w:hyperlink w:anchor="_Toc228987085" w:history="1">
+          <w:hyperlink w:anchor="_Toc229075232" w:history="1">
             <w:r>
               <w:rPr>
                 <w:rStyle w:val="Hyperlink"/>
@@ -1445,7 +1453,7 @@
                 <w:noProof/>
                 <w:webHidden/>
               </w:rPr>
-              <w:instrText xml:space="preserve"> PAGEREF _Toc228987085 \h </w:instrText>
+              <w:instrText xml:space="preserve"> PAGEREF _Toc229075232 \h </w:instrText>
             </w:r>
             <w:r>
               <w:rPr>
@@ -1492,7 +1500,7 @@
               <w14:ligatures w14:val="standardContextual"/>
             </w:rPr>
           </w:pPr>
-          <w:hyperlink w:anchor="_Toc228987086" w:history="1">
+          <w:hyperlink w:anchor="_Toc229075233" w:history="1">
             <w:r>
               <w:rPr>
                 <w:rStyle w:val="Hyperlink"/>
@@ -1519,7 +1527,7 @@
                 <w:noProof/>
                 <w:webHidden/>
               </w:rPr>
-              <w:instrText xml:space="preserve"> PAGEREF _Toc228987086 \h </w:instrText>
+              <w:instrText xml:space="preserve"> PAGEREF _Toc229075233 \h </w:instrText>
             </w:r>
             <w:r>
               <w:rPr>
@@ -1566,7 +1574,7 @@
               <w14:ligatures w14:val="standardContextual"/>
             </w:rPr>
           </w:pPr>
-          <w:hyperlink w:anchor="_Toc228987087" w:history="1">
+          <w:hyperlink w:anchor="_Toc229075234" w:history="1">
             <w:r>
               <w:rPr>
                 <w:rStyle w:val="Hyperlink"/>
@@ -1593,7 +1601,7 @@
                 <w:noProof/>
                 <w:webHidden/>
               </w:rPr>
-              <w:instrText xml:space="preserve"> PAGEREF _Toc228987087 \h </w:instrText>
+              <w:instrText xml:space="preserve"> PAGEREF _Toc229075234 \h </w:instrText>
             </w:r>
             <w:r>
               <w:rPr>
@@ -1640,7 +1648,7 @@
               <w14:ligatures w14:val="standardContextual"/>
             </w:rPr>
           </w:pPr>
-          <w:hyperlink w:anchor="_Toc228987088" w:history="1">
+          <w:hyperlink w:anchor="_Toc229075235" w:history="1">
             <w:r>
               <w:rPr>
                 <w:rStyle w:val="Hyperlink"/>
@@ -1667,7 +1675,7 @@
                 <w:noProof/>
                 <w:webHidden/>
               </w:rPr>
-              <w:instrText xml:space="preserve"> PAGEREF _Toc228987088 \h </w:instrText>
+              <w:instrText xml:space="preserve"> PAGEREF _Toc229075235 \h </w:instrText>
             </w:r>
             <w:r>
               <w:rPr>
@@ -1714,7 +1722,7 @@
               <w14:ligatures w14:val="standardContextual"/>
             </w:rPr>
           </w:pPr>
-          <w:hyperlink w:anchor="_Toc228987089" w:history="1">
+          <w:hyperlink w:anchor="_Toc229075236" w:history="1">
             <w:r>
               <w:rPr>
                 <w:rStyle w:val="Hyperlink"/>
@@ -1741,7 +1749,7 @@
                 <w:noProof/>
                 <w:webHidden/>
               </w:rPr>
-              <w:instrText xml:space="preserve"> PAGEREF _Toc228987089 \h </w:instrText>
+              <w:instrText xml:space="preserve"> PAGEREF _Toc229075236 \h </w:instrText>
             </w:r>
             <w:r>
               <w:rPr>
@@ -1788,7 +1796,7 @@
               <w14:ligatures w14:val="standardContextual"/>
             </w:rPr>
           </w:pPr>
-          <w:hyperlink w:anchor="_Toc228987090" w:history="1">
+          <w:hyperlink w:anchor="_Toc229075237" w:history="1">
             <w:r>
               <w:rPr>
                 <w:rStyle w:val="Hyperlink"/>
@@ -1815,7 +1823,7 @@
                 <w:noProof/>
                 <w:webHidden/>
               </w:rPr>
-              <w:instrText xml:space="preserve"> PAGEREF _Toc228987090 \h </w:instrText>
+              <w:instrText xml:space="preserve"> PAGEREF _Toc229075237 \h </w:instrText>
             </w:r>
             <w:r>
               <w:rPr>
@@ -1862,7 +1870,7 @@
               <w14:ligatures w14:val="standardContextual"/>
             </w:rPr>
           </w:pPr>
-          <w:hyperlink w:anchor="_Toc228987091" w:history="1">
+          <w:hyperlink w:anchor="_Toc229075238" w:history="1">
             <w:r>
               <w:rPr>
                 <w:rStyle w:val="Hyperlink"/>
@@ -1889,7 +1897,7 @@
                 <w:noProof/>
                 <w:webHidden/>
               </w:rPr>
-              <w:instrText xml:space="preserve"> PAGEREF _Toc228987091 \h </w:instrText>
+              <w:instrText xml:space="preserve"> PAGEREF _Toc229075238 \h </w:instrText>
             </w:r>
             <w:r>
               <w:rPr>
@@ -1936,7 +1944,7 @@
               <w14:ligatures w14:val="standardContextual"/>
             </w:rPr>
           </w:pPr>
-          <w:hyperlink w:anchor="_Toc228987092" w:history="1">
+          <w:hyperlink w:anchor="_Toc229075239" w:history="1">
             <w:r>
               <w:rPr>
                 <w:rStyle w:val="Hyperlink"/>
@@ -1963,7 +1971,7 @@
                 <w:noProof/>
                 <w:webHidden/>
               </w:rPr>
-              <w:instrText xml:space="preserve"> PAGEREF _Toc228987092 \h </w:instrText>
+              <w:instrText xml:space="preserve"> PAGEREF _Toc229075239 \h </w:instrText>
             </w:r>
             <w:r>
               <w:rPr>
@@ -2010,7 +2018,7 @@
               <w14:ligatures w14:val="standardContextual"/>
             </w:rPr>
           </w:pPr>
-          <w:hyperlink w:anchor="_Toc228987093" w:history="1">
+          <w:hyperlink w:anchor="_Toc229075240" w:history="1">
             <w:r>
               <w:rPr>
                 <w:rStyle w:val="Hyperlink"/>
@@ -2037,7 +2045,7 @@
                 <w:noProof/>
                 <w:webHidden/>
               </w:rPr>
-              <w:instrText xml:space="preserve"> PAGEREF _Toc228987093 \h </w:instrText>
+              <w:instrText xml:space="preserve"> PAGEREF _Toc229075240 \h </w:instrText>
             </w:r>
             <w:r>
               <w:rPr>
@@ -2084,7 +2092,7 @@
               <w14:ligatures w14:val="standardContextual"/>
             </w:rPr>
           </w:pPr>
-          <w:hyperlink w:anchor="_Toc228987094" w:history="1">
+          <w:hyperlink w:anchor="_Toc229075241" w:history="1">
             <w:r>
               <w:rPr>
                 <w:rStyle w:val="Hyperlink"/>
@@ -2111,7 +2119,7 @@
                 <w:noProof/>
                 <w:webHidden/>
               </w:rPr>
-              <w:instrText xml:space="preserve"> PAGEREF _Toc228987094 \h </w:instrText>
+              <w:instrText xml:space="preserve"> PAGEREF _Toc229075241 \h </w:instrText>
             </w:r>
             <w:r>
               <w:rPr>
@@ -2154,7 +2162,7 @@
               <w:lang w:eastAsia="en-GB"/>
             </w:rPr>
           </w:pPr>
-          <w:hyperlink w:anchor="_Toc228987095" w:history="1">
+          <w:hyperlink w:anchor="_Toc229075242" w:history="1">
             <w:r>
               <w:rPr>
                 <w:rStyle w:val="Hyperlink"/>
@@ -2181,7 +2189,7 @@
                 <w:noProof/>
                 <w:webHidden/>
               </w:rPr>
-              <w:instrText xml:space="preserve"> PAGEREF _Toc228987095 \h </w:instrText>
+              <w:instrText xml:space="preserve"> PAGEREF _Toc229075242 \h </w:instrText>
             </w:r>
             <w:r>
               <w:rPr>
@@ -2224,7 +2232,7 @@
               <w:lang w:eastAsia="en-GB"/>
             </w:rPr>
           </w:pPr>
-          <w:hyperlink w:anchor="_Toc228987096" w:history="1">
+          <w:hyperlink w:anchor="_Toc229075243" w:history="1">
             <w:r>
               <w:rPr>
                 <w:rStyle w:val="Hyperlink"/>
@@ -2251,7 +2259,7 @@
                 <w:noProof/>
                 <w:webHidden/>
               </w:rPr>
-              <w:instrText xml:space="preserve"> PAGEREF _Toc228987096 \h </w:instrText>
+              <w:instrText xml:space="preserve"> PAGEREF _Toc229075243 \h </w:instrText>
             </w:r>
             <w:r>
               <w:rPr>
@@ -2294,7 +2302,7 @@
               <w:lang w:eastAsia="en-GB"/>
             </w:rPr>
           </w:pPr>
-          <w:hyperlink w:anchor="_Toc228987097" w:history="1">
+          <w:hyperlink w:anchor="_Toc229075244" w:history="1">
             <w:r>
               <w:rPr>
                 <w:rStyle w:val="Hyperlink"/>
@@ -2321,7 +2329,7 @@
                 <w:noProof/>
                 <w:webHidden/>
               </w:rPr>
-              <w:instrText xml:space="preserve"> PAGEREF _Toc228987097 \h </w:instrText>
+              <w:instrText xml:space="preserve"> PAGEREF _Toc229075244 \h </w:instrText>
             </w:r>
             <w:r>
               <w:rPr>
@@ -2368,7 +2376,7 @@
               <w14:ligatures w14:val="standardContextual"/>
             </w:rPr>
           </w:pPr>
-          <w:hyperlink w:anchor="_Toc228987098" w:history="1">
+          <w:hyperlink w:anchor="_Toc229075245" w:history="1">
             <w:r>
               <w:rPr>
                 <w:rStyle w:val="Hyperlink"/>
@@ -2395,7 +2403,7 @@
                 <w:noProof/>
                 <w:webHidden/>
               </w:rPr>
-              <w:instrText xml:space="preserve"> PAGEREF _Toc228987098 \h </w:instrText>
+              <w:instrText xml:space="preserve"> PAGEREF _Toc229075245 \h </w:instrText>
             </w:r>
             <w:r>
               <w:rPr>
@@ -2438,7 +2446,7 @@
               <w:lang w:eastAsia="en-GB"/>
             </w:rPr>
           </w:pPr>
-          <w:hyperlink w:anchor="_Toc228987099" w:history="1">
+          <w:hyperlink w:anchor="_Toc229075246" w:history="1">
             <w:r>
               <w:rPr>
                 <w:rStyle w:val="Hyperlink"/>
@@ -2465,7 +2473,7 @@
                 <w:noProof/>
                 <w:webHidden/>
               </w:rPr>
-              <w:instrText xml:space="preserve"> PAGEREF _Toc228987099 \h </w:instrText>
+              <w:instrText xml:space="preserve"> PAGEREF _Toc229075246 \h </w:instrText>
             </w:r>
             <w:r>
               <w:rPr>
@@ -2508,7 +2516,7 @@
               <w:lang w:eastAsia="en-GB"/>
             </w:rPr>
           </w:pPr>
-          <w:hyperlink w:anchor="_Toc228987100" w:history="1">
+          <w:hyperlink w:anchor="_Toc229075247" w:history="1">
             <w:r>
               <w:rPr>
                 <w:rStyle w:val="Hyperlink"/>
@@ -2535,7 +2543,7 @@
                 <w:noProof/>
                 <w:webHidden/>
               </w:rPr>
-              <w:instrText xml:space="preserve"> PAGEREF _Toc228987100 \h </w:instrText>
+              <w:instrText xml:space="preserve"> PAGEREF _Toc229075247 \h </w:instrText>
             </w:r>
             <w:r>
               <w:rPr>
@@ -2578,7 +2586,7 @@
               <w:lang w:eastAsia="en-GB"/>
             </w:rPr>
           </w:pPr>
-          <w:hyperlink w:anchor="_Toc228987101" w:history="1">
+          <w:hyperlink w:anchor="_Toc229075248" w:history="1">
             <w:r>
               <w:rPr>
                 <w:rStyle w:val="Hyperlink"/>
@@ -2605,7 +2613,7 @@
                 <w:noProof/>
                 <w:webHidden/>
               </w:rPr>
-              <w:instrText xml:space="preserve"> PAGEREF _Toc228987101 \h </w:instrText>
+              <w:instrText xml:space="preserve"> PAGEREF _Toc229075248 \h </w:instrText>
             </w:r>
             <w:r>
               <w:rPr>
@@ -2652,7 +2660,7 @@
               <w14:ligatures w14:val="standardContextual"/>
             </w:rPr>
           </w:pPr>
-          <w:hyperlink w:anchor="_Toc228987102" w:history="1">
+          <w:hyperlink w:anchor="_Toc229075249" w:history="1">
             <w:r>
               <w:rPr>
                 <w:rStyle w:val="Hyperlink"/>
@@ -2679,7 +2687,7 @@
                 <w:noProof/>
                 <w:webHidden/>
               </w:rPr>
-              <w:instrText xml:space="preserve"> PAGEREF _Toc228987102 \h </w:instrText>
+              <w:instrText xml:space="preserve"> PAGEREF _Toc229075249 \h </w:instrText>
             </w:r>
             <w:r>
               <w:rPr>
@@ -2722,7 +2730,7 @@
               <w:lang w:eastAsia="en-GB"/>
             </w:rPr>
           </w:pPr>
-          <w:hyperlink w:anchor="_Toc228987103" w:history="1">
+          <w:hyperlink w:anchor="_Toc229075250" w:history="1">
             <w:r>
               <w:rPr>
                 <w:rStyle w:val="Hyperlink"/>
@@ -2749,7 +2757,7 @@
                 <w:noProof/>
                 <w:webHidden/>
               </w:rPr>
-              <w:instrText xml:space="preserve"> PAGEREF _Toc228987103 \h </w:instrText>
+              <w:instrText xml:space="preserve"> PAGEREF _Toc229075250 \h </w:instrText>
             </w:r>
             <w:r>
               <w:rPr>
@@ -2792,7 +2800,7 @@
               <w:lang w:eastAsia="en-GB"/>
             </w:rPr>
           </w:pPr>
-          <w:hyperlink w:anchor="_Toc228987104" w:history="1">
+          <w:hyperlink w:anchor="_Toc229075251" w:history="1">
             <w:r>
               <w:rPr>
                 <w:rStyle w:val="Hyperlink"/>
@@ -2819,7 +2827,7 @@
                 <w:noProof/>
                 <w:webHidden/>
               </w:rPr>
-              <w:instrText xml:space="preserve"> PAGEREF _Toc228987104 \h </w:instrText>
+              <w:instrText xml:space="preserve"> PAGEREF _Toc229075251 \h </w:instrText>
             </w:r>
             <w:r>
               <w:rPr>
@@ -2862,7 +2870,7 @@
               <w:lang w:eastAsia="en-GB"/>
             </w:rPr>
           </w:pPr>
-          <w:hyperlink w:anchor="_Toc228987105" w:history="1">
+          <w:hyperlink w:anchor="_Toc229075252" w:history="1">
             <w:r>
               <w:rPr>
                 <w:rStyle w:val="Hyperlink"/>
@@ -2889,7 +2897,7 @@
                 <w:noProof/>
                 <w:webHidden/>
               </w:rPr>
-              <w:instrText xml:space="preserve"> PAGEREF _Toc228987105 \h </w:instrText>
+              <w:instrText xml:space="preserve"> PAGEREF _Toc229075252 \h </w:instrText>
             </w:r>
             <w:r>
               <w:rPr>
@@ -2936,7 +2944,7 @@
               <w14:ligatures w14:val="standardContextual"/>
             </w:rPr>
           </w:pPr>
-          <w:hyperlink w:anchor="_Toc228987106" w:history="1">
+          <w:hyperlink w:anchor="_Toc229075253" w:history="1">
             <w:r>
               <w:rPr>
                 <w:rStyle w:val="Hyperlink"/>
@@ -2963,7 +2971,7 @@
                 <w:noProof/>
                 <w:webHidden/>
               </w:rPr>
-              <w:instrText xml:space="preserve"> PAGEREF _Toc228987106 \h </w:instrText>
+              <w:instrText xml:space="preserve"> PAGEREF _Toc229075253 \h </w:instrText>
             </w:r>
             <w:r>
               <w:rPr>
@@ -3010,7 +3018,7 @@
               <w14:ligatures w14:val="standardContextual"/>
             </w:rPr>
           </w:pPr>
-          <w:hyperlink w:anchor="_Toc228987107" w:history="1">
+          <w:hyperlink w:anchor="_Toc229075254" w:history="1">
             <w:r>
               <w:rPr>
                 <w:rStyle w:val="Hyperlink"/>
@@ -3037,7 +3045,7 @@
                 <w:noProof/>
                 <w:webHidden/>
               </w:rPr>
-              <w:instrText xml:space="preserve"> PAGEREF _Toc228987107 \h </w:instrText>
+              <w:instrText xml:space="preserve"> PAGEREF _Toc229075254 \h </w:instrText>
             </w:r>
             <w:r>
               <w:rPr>
@@ -3084,7 +3092,7 @@
               <w14:ligatures w14:val="standardContextual"/>
             </w:rPr>
           </w:pPr>
-          <w:hyperlink w:anchor="_Toc228987108" w:history="1">
+          <w:hyperlink w:anchor="_Toc229075255" w:history="1">
             <w:r>
               <w:rPr>
                 <w:rStyle w:val="Hyperlink"/>
@@ -3111,7 +3119,7 @@
                 <w:noProof/>
                 <w:webHidden/>
               </w:rPr>
-              <w:instrText xml:space="preserve"> PAGEREF _Toc228987108 \h </w:instrText>
+              <w:instrText xml:space="preserve"> PAGEREF _Toc229075255 \h </w:instrText>
             </w:r>
             <w:r>
               <w:rPr>
@@ -3158,7 +3166,7 @@
               <w14:ligatures w14:val="standardContextual"/>
             </w:rPr>
           </w:pPr>
-          <w:hyperlink w:anchor="_Toc228987109" w:history="1">
+          <w:hyperlink w:anchor="_Toc229075256" w:history="1">
             <w:r>
               <w:rPr>
                 <w:rStyle w:val="Hyperlink"/>
@@ -3185,7 +3193,7 @@
                 <w:noProof/>
                 <w:webHidden/>
               </w:rPr>
-              <w:instrText xml:space="preserve"> PAGEREF _Toc228987109 \h </w:instrText>
+              <w:instrText xml:space="preserve"> PAGEREF _Toc229075256 \h </w:instrText>
             </w:r>
             <w:r>
               <w:rPr>
@@ -3232,7 +3240,7 @@
               <w14:ligatures w14:val="standardContextual"/>
             </w:rPr>
           </w:pPr>
-          <w:hyperlink w:anchor="_Toc228987110" w:history="1">
+          <w:hyperlink w:anchor="_Toc229075257" w:history="1">
             <w:r>
               <w:rPr>
                 <w:rStyle w:val="Hyperlink"/>
@@ -3259,7 +3267,7 @@
                 <w:noProof/>
                 <w:webHidden/>
               </w:rPr>
-              <w:instrText xml:space="preserve"> PAGEREF _Toc228987110 \h </w:instrText>
+              <w:instrText xml:space="preserve"> PAGEREF _Toc229075257 \h </w:instrText>
             </w:r>
             <w:r>
               <w:rPr>
@@ -3306,7 +3314,7 @@
               <w14:ligatures w14:val="standardContextual"/>
             </w:rPr>
           </w:pPr>
-          <w:hyperlink w:anchor="_Toc228987111" w:history="1">
+          <w:hyperlink w:anchor="_Toc229075258" w:history="1">
             <w:r>
               <w:rPr>
                 <w:rStyle w:val="Hyperlink"/>
@@ -3333,7 +3341,7 @@
                 <w:noProof/>
                 <w:webHidden/>
               </w:rPr>
-              <w:instrText xml:space="preserve"> PAGEREF _Toc228987111 \h </w:instrText>
+              <w:instrText xml:space="preserve"> PAGEREF _Toc229075258 \h </w:instrText>
             </w:r>
             <w:r>
               <w:rPr>
@@ -3380,7 +3388,7 @@
               <w14:ligatures w14:val="standardContextual"/>
             </w:rPr>
           </w:pPr>
-          <w:hyperlink w:anchor="_Toc228987112" w:history="1">
+          <w:hyperlink w:anchor="_Toc229075259" w:history="1">
             <w:r>
               <w:rPr>
                 <w:rStyle w:val="Hyperlink"/>
@@ -3407,7 +3415,7 @@
                 <w:noProof/>
                 <w:webHidden/>
               </w:rPr>
-              <w:instrText xml:space="preserve"> PAGEREF _Toc228987112 \h </w:instrText>
+              <w:instrText xml:space="preserve"> PAGEREF _Toc229075259 \h </w:instrText>
             </w:r>
             <w:r>
               <w:rPr>
@@ -3454,7 +3462,7 @@
               <w14:ligatures w14:val="standardContextual"/>
             </w:rPr>
           </w:pPr>
-          <w:hyperlink w:anchor="_Toc228987113" w:history="1">
+          <w:hyperlink w:anchor="_Toc229075260" w:history="1">
             <w:r>
               <w:rPr>
                 <w:rStyle w:val="Hyperlink"/>
@@ -3481,7 +3489,7 @@
                 <w:noProof/>
                 <w:webHidden/>
               </w:rPr>
-              <w:instrText xml:space="preserve"> PAGEREF _Toc228987113 \h </w:instrText>
+              <w:instrText xml:space="preserve"> PAGEREF _Toc229075260 \h </w:instrText>
             </w:r>
             <w:r>
               <w:rPr>
@@ -3528,7 +3536,7 @@
               <w14:ligatures w14:val="standardContextual"/>
             </w:rPr>
           </w:pPr>
-          <w:hyperlink w:anchor="_Toc228987114" w:history="1">
+          <w:hyperlink w:anchor="_Toc229075261" w:history="1">
             <w:r>
               <w:rPr>
                 <w:rStyle w:val="Hyperlink"/>
@@ -3555,7 +3563,7 @@
                 <w:noProof/>
                 <w:webHidden/>
               </w:rPr>
-              <w:instrText xml:space="preserve"> PAGEREF _Toc228987114 \h </w:instrText>
+              <w:instrText xml:space="preserve"> PAGEREF _Toc229075261 \h </w:instrText>
             </w:r>
             <w:r>
               <w:rPr>
@@ -3602,7 +3610,7 @@
               <w14:ligatures w14:val="standardContextual"/>
             </w:rPr>
           </w:pPr>
-          <w:hyperlink w:anchor="_Toc228987115" w:history="1">
+          <w:hyperlink w:anchor="_Toc229075262" w:history="1">
             <w:r>
               <w:rPr>
                 <w:rStyle w:val="Hyperlink"/>
@@ -3629,7 +3637,7 @@
                 <w:noProof/>
                 <w:webHidden/>
               </w:rPr>
-              <w:instrText xml:space="preserve"> PAGEREF _Toc228987115 \h </w:instrText>
+              <w:instrText xml:space="preserve"> PAGEREF _Toc229075262 \h </w:instrText>
             </w:r>
             <w:r>
               <w:rPr>
@@ -3676,7 +3684,7 @@
               <w14:ligatures w14:val="standardContextual"/>
             </w:rPr>
           </w:pPr>
-          <w:hyperlink w:anchor="_Toc228987116" w:history="1">
+          <w:hyperlink w:anchor="_Toc229075263" w:history="1">
             <w:r>
               <w:rPr>
                 <w:rStyle w:val="Hyperlink"/>
@@ -3703,7 +3711,7 @@
                 <w:noProof/>
                 <w:webHidden/>
               </w:rPr>
-              <w:instrText xml:space="preserve"> PAGEREF _Toc228987116 \h </w:instrText>
+              <w:instrText xml:space="preserve"> PAGEREF _Toc229075263 \h </w:instrText>
             </w:r>
             <w:r>
               <w:rPr>
@@ -3750,7 +3758,7 @@
               <w14:ligatures w14:val="standardContextual"/>
             </w:rPr>
           </w:pPr>
-          <w:hyperlink w:anchor="_Toc228987117" w:history="1">
+          <w:hyperlink w:anchor="_Toc229075264" w:history="1">
             <w:r>
               <w:rPr>
                 <w:rStyle w:val="Hyperlink"/>
@@ -3777,7 +3785,7 @@
                 <w:noProof/>
                 <w:webHidden/>
               </w:rPr>
-              <w:instrText xml:space="preserve"> PAGEREF _Toc228987117 \h </w:instrText>
+              <w:instrText xml:space="preserve"> PAGEREF _Toc229075264 \h </w:instrText>
             </w:r>
             <w:r>
               <w:rPr>
@@ -3824,7 +3832,7 @@
               <w14:ligatures w14:val="standardContextual"/>
             </w:rPr>
           </w:pPr>
-          <w:hyperlink w:anchor="_Toc228987118" w:history="1">
+          <w:hyperlink w:anchor="_Toc229075265" w:history="1">
             <w:r>
               <w:rPr>
                 <w:rStyle w:val="Hyperlink"/>
@@ -3851,7 +3859,7 @@
                 <w:noProof/>
                 <w:webHidden/>
               </w:rPr>
-              <w:instrText xml:space="preserve"> PAGEREF _Toc228987118 \h </w:instrText>
+              <w:instrText xml:space="preserve"> PAGEREF _Toc229075265 \h </w:instrText>
             </w:r>
             <w:r>
               <w:rPr>
@@ -3898,7 +3906,7 @@
               <w14:ligatures w14:val="standardContextual"/>
             </w:rPr>
           </w:pPr>
-          <w:hyperlink w:anchor="_Toc228987119" w:history="1">
+          <w:hyperlink w:anchor="_Toc229075266" w:history="1">
             <w:r>
               <w:rPr>
                 <w:rStyle w:val="Hyperlink"/>
@@ -3925,7 +3933,7 @@
                 <w:noProof/>
                 <w:webHidden/>
               </w:rPr>
-              <w:instrText xml:space="preserve"> PAGEREF _Toc228987119 \h </w:instrText>
+              <w:instrText xml:space="preserve"> PAGEREF _Toc229075266 \h </w:instrText>
             </w:r>
             <w:r>
               <w:rPr>
@@ -3972,7 +3980,7 @@
               <w14:ligatures w14:val="standardContextual"/>
             </w:rPr>
           </w:pPr>
-          <w:hyperlink w:anchor="_Toc228987120" w:history="1">
+          <w:hyperlink w:anchor="_Toc229075267" w:history="1">
             <w:r>
               <w:rPr>
                 <w:rStyle w:val="Hyperlink"/>
@@ -3999,7 +4007,7 @@
                 <w:noProof/>
                 <w:webHidden/>
               </w:rPr>
-              <w:instrText xml:space="preserve"> PAGEREF _Toc228987120 \h </w:instrText>
+              <w:instrText xml:space="preserve"> PAGEREF _Toc229075267 \h </w:instrText>
             </w:r>
             <w:r>
               <w:rPr>
@@ -4046,7 +4054,7 @@
               <w14:ligatures w14:val="standardContextual"/>
             </w:rPr>
           </w:pPr>
-          <w:hyperlink w:anchor="_Toc228987121" w:history="1">
+          <w:hyperlink w:anchor="_Toc229075268" w:history="1">
             <w:r>
               <w:rPr>
                 <w:rStyle w:val="Hyperlink"/>
@@ -4073,7 +4081,7 @@
                 <w:noProof/>
                 <w:webHidden/>
               </w:rPr>
-              <w:instrText xml:space="preserve"> PAGEREF _Toc228987121 \h </w:instrText>
+              <w:instrText xml:space="preserve"> PAGEREF _Toc229075268 \h </w:instrText>
             </w:r>
             <w:r>
               <w:rPr>
@@ -4094,6 +4102,228 @@
                 <w:webHidden/>
               </w:rPr>
               <w:t>16</w:t>
+            </w:r>
+            <w:r>
+              <w:rPr>
+                <w:noProof/>
+                <w:webHidden/>
+              </w:rPr>
+              <w:fldChar w:fldCharType="end"/>
+            </w:r>
+          </w:hyperlink>
+        </w:p>
+        <w:p>
+          <w:pPr>
+            <w:pStyle w:val="TOC2"/>
+            <w:tabs>
+              <w:tab w:val="right" w:leader="dot" w:pos="9016"/>
+            </w:tabs>
+            <w:rPr>
+              <w:rFonts w:asciiTheme="minorHAnsi" w:hAnsiTheme="minorHAnsi" w:cstheme="minorBidi"/>
+              <w:noProof/>
+              <w:kern w:val="2"/>
+              <w:sz w:val="24"/>
+              <w:szCs w:val="24"/>
+              <w:lang w:val="en-GB" w:eastAsia="en-GB"/>
+              <w14:ligatures w14:val="standardContextual"/>
+            </w:rPr>
+          </w:pPr>
+          <w:hyperlink w:anchor="_Toc229075269" w:history="1">
+            <w:r>
+              <w:rPr>
+                <w:rStyle w:val="Hyperlink"/>
+                <w:noProof/>
+              </w:rPr>
+              <w:t>4.1 World Generation</w:t>
+            </w:r>
+            <w:r>
+              <w:rPr>
+                <w:noProof/>
+                <w:webHidden/>
+              </w:rPr>
+              <w:tab/>
+            </w:r>
+            <w:r>
+              <w:rPr>
+                <w:noProof/>
+                <w:webHidden/>
+              </w:rPr>
+              <w:fldChar w:fldCharType="begin"/>
+            </w:r>
+            <w:r>
+              <w:rPr>
+                <w:noProof/>
+                <w:webHidden/>
+              </w:rPr>
+              <w:instrText xml:space="preserve"> PAGEREF _Toc229075269 \h </w:instrText>
+            </w:r>
+            <w:r>
+              <w:rPr>
+                <w:noProof/>
+                <w:webHidden/>
+              </w:rPr>
+            </w:r>
+            <w:r>
+              <w:rPr>
+                <w:noProof/>
+                <w:webHidden/>
+              </w:rPr>
+              <w:fldChar w:fldCharType="separate"/>
+            </w:r>
+            <w:r>
+              <w:rPr>
+                <w:noProof/>
+                <w:webHidden/>
+              </w:rPr>
+              <w:t>16</w:t>
+            </w:r>
+            <w:r>
+              <w:rPr>
+                <w:noProof/>
+                <w:webHidden/>
+              </w:rPr>
+              <w:fldChar w:fldCharType="end"/>
+            </w:r>
+          </w:hyperlink>
+        </w:p>
+        <w:p>
+          <w:pPr>
+            <w:pStyle w:val="TOC3"/>
+            <w:tabs>
+              <w:tab w:val="right" w:leader="dot" w:pos="9016"/>
+            </w:tabs>
+            <w:rPr>
+              <w:rFonts w:asciiTheme="minorHAnsi" w:hAnsiTheme="minorHAnsi" w:cstheme="minorBidi"/>
+              <w:noProof/>
+              <w:kern w:val="2"/>
+              <w:sz w:val="24"/>
+              <w:szCs w:val="24"/>
+              <w:lang w:val="en-GB" w:eastAsia="en-GB"/>
+              <w14:ligatures w14:val="standardContextual"/>
+            </w:rPr>
+          </w:pPr>
+          <w:hyperlink w:anchor="_Toc229075270" w:history="1">
+            <w:r>
+              <w:rPr>
+                <w:rStyle w:val="Hyperlink"/>
+                <w:noProof/>
+              </w:rPr>
+              <w:t>4.1.1 Creating the colour noise map</w:t>
+            </w:r>
+            <w:r>
+              <w:rPr>
+                <w:noProof/>
+                <w:webHidden/>
+              </w:rPr>
+              <w:tab/>
+            </w:r>
+            <w:r>
+              <w:rPr>
+                <w:noProof/>
+                <w:webHidden/>
+              </w:rPr>
+              <w:fldChar w:fldCharType="begin"/>
+            </w:r>
+            <w:r>
+              <w:rPr>
+                <w:noProof/>
+                <w:webHidden/>
+              </w:rPr>
+              <w:instrText xml:space="preserve"> PAGEREF _Toc229075270 \h </w:instrText>
+            </w:r>
+            <w:r>
+              <w:rPr>
+                <w:noProof/>
+                <w:webHidden/>
+              </w:rPr>
+            </w:r>
+            <w:r>
+              <w:rPr>
+                <w:noProof/>
+                <w:webHidden/>
+              </w:rPr>
+              <w:fldChar w:fldCharType="separate"/>
+            </w:r>
+            <w:r>
+              <w:rPr>
+                <w:noProof/>
+                <w:webHidden/>
+              </w:rPr>
+              <w:t>16</w:t>
+            </w:r>
+            <w:r>
+              <w:rPr>
+                <w:noProof/>
+                <w:webHidden/>
+              </w:rPr>
+              <w:fldChar w:fldCharType="end"/>
+            </w:r>
+          </w:hyperlink>
+        </w:p>
+        <w:p>
+          <w:pPr>
+            <w:pStyle w:val="TOC3"/>
+            <w:tabs>
+              <w:tab w:val="right" w:leader="dot" w:pos="9016"/>
+            </w:tabs>
+            <w:rPr>
+              <w:rFonts w:asciiTheme="minorHAnsi" w:hAnsiTheme="minorHAnsi" w:cstheme="minorBidi"/>
+              <w:noProof/>
+              <w:kern w:val="2"/>
+              <w:sz w:val="24"/>
+              <w:szCs w:val="24"/>
+              <w:lang w:val="en-GB" w:eastAsia="en-GB"/>
+              <w14:ligatures w14:val="standardContextual"/>
+            </w:rPr>
+          </w:pPr>
+          <w:hyperlink w:anchor="_Toc229075271" w:history="1">
+            <w:r>
+              <w:rPr>
+                <w:rStyle w:val="Hyperlink"/>
+                <w:noProof/>
+              </w:rPr>
+              <w:t>4.1.2 Creating the world map</w:t>
+            </w:r>
+            <w:r>
+              <w:rPr>
+                <w:noProof/>
+                <w:webHidden/>
+              </w:rPr>
+              <w:tab/>
+            </w:r>
+            <w:r>
+              <w:rPr>
+                <w:noProof/>
+                <w:webHidden/>
+              </w:rPr>
+              <w:fldChar w:fldCharType="begin"/>
+            </w:r>
+            <w:r>
+              <w:rPr>
+                <w:noProof/>
+                <w:webHidden/>
+              </w:rPr>
+              <w:instrText xml:space="preserve"> PAGEREF _Toc229075271 \h </w:instrText>
+            </w:r>
+            <w:r>
+              <w:rPr>
+                <w:noProof/>
+                <w:webHidden/>
+              </w:rPr>
+            </w:r>
+            <w:r>
+              <w:rPr>
+                <w:noProof/>
+                <w:webHidden/>
+              </w:rPr>
+              <w:fldChar w:fldCharType="separate"/>
+            </w:r>
+            <w:r>
+              <w:rPr>
+                <w:noProof/>
+                <w:webHidden/>
+              </w:rPr>
+              <w:t>18</w:t>
             </w:r>
             <w:r>
               <w:rPr>
@@ -4120,7 +4350,7 @@
               <w14:ligatures w14:val="standardContextual"/>
             </w:rPr>
           </w:pPr>
-          <w:hyperlink w:anchor="_Toc228987122" w:history="1">
+          <w:hyperlink w:anchor="_Toc229075272" w:history="1">
             <w:r>
               <w:rPr>
                 <w:rStyle w:val="Hyperlink"/>
@@ -4147,7 +4377,7 @@
                 <w:noProof/>
                 <w:webHidden/>
               </w:rPr>
-              <w:instrText xml:space="preserve"> PAGEREF _Toc228987122 \h </w:instrText>
+              <w:instrText xml:space="preserve"> PAGEREF _Toc229075272 \h </w:instrText>
             </w:r>
             <w:r>
               <w:rPr>
@@ -4167,7 +4397,7 @@
                 <w:noProof/>
                 <w:webHidden/>
               </w:rPr>
-              <w:t>16</w:t>
+              <w:t>20</w:t>
             </w:r>
             <w:r>
               <w:rPr>
@@ -4204,7 +4434,7 @@
       <w:pPr>
         <w:pStyle w:val="Heading1"/>
       </w:pPr>
-      <w:bookmarkStart w:id="7" w:name="_Toc228987079"/>
+      <w:bookmarkStart w:id="7" w:name="_Toc229075226"/>
       <w:r>
         <w:t>Table of Figures</w:t>
       </w:r>
@@ -4246,7 +4476,7 @@
         </w:rPr>
         <w:fldChar w:fldCharType="separate"/>
       </w:r>
-      <w:hyperlink w:anchor="_Toc228987123" w:history="1">
+      <w:hyperlink w:anchor="_Toc229075273" w:history="1">
         <w:r>
           <w:rPr>
             <w:rStyle w:val="Hyperlink"/>
@@ -4273,7 +4503,7 @@
             <w:noProof/>
             <w:webHidden/>
           </w:rPr>
-          <w:instrText xml:space="preserve"> PAGEREF _Toc228987123 \h </w:instrText>
+          <w:instrText xml:space="preserve"> PAGEREF _Toc229075273 \h </w:instrText>
         </w:r>
         <w:r>
           <w:rPr>
@@ -4316,7 +4546,7 @@
           <w:lang w:eastAsia="en-GB"/>
         </w:rPr>
       </w:pPr>
-      <w:hyperlink w:anchor="_Toc228987124" w:history="1">
+      <w:hyperlink w:anchor="_Toc229075274" w:history="1">
         <w:r>
           <w:rPr>
             <w:rStyle w:val="Hyperlink"/>
@@ -4343,7 +4573,7 @@
             <w:noProof/>
             <w:webHidden/>
           </w:rPr>
-          <w:instrText xml:space="preserve"> PAGEREF _Toc228987124 \h </w:instrText>
+          <w:instrText xml:space="preserve"> PAGEREF _Toc229075274 \h </w:instrText>
         </w:r>
         <w:r>
           <w:rPr>
@@ -4386,7 +4616,7 @@
           <w:lang w:eastAsia="en-GB"/>
         </w:rPr>
       </w:pPr>
-      <w:hyperlink w:anchor="_Toc228987125" w:history="1">
+      <w:hyperlink w:anchor="_Toc229075275" w:history="1">
         <w:r>
           <w:rPr>
             <w:rStyle w:val="Hyperlink"/>
@@ -4413,7 +4643,7 @@
             <w:noProof/>
             <w:webHidden/>
           </w:rPr>
-          <w:instrText xml:space="preserve"> PAGEREF _Toc228987125 \h </w:instrText>
+          <w:instrText xml:space="preserve"> PAGEREF _Toc229075275 \h </w:instrText>
         </w:r>
         <w:r>
           <w:rPr>
@@ -4456,7 +4686,7 @@
           <w:lang w:eastAsia="en-GB"/>
         </w:rPr>
       </w:pPr>
-      <w:hyperlink w:anchor="_Toc228987126" w:history="1">
+      <w:hyperlink w:anchor="_Toc229075276" w:history="1">
         <w:r>
           <w:rPr>
             <w:rStyle w:val="Hyperlink"/>
@@ -4483,7 +4713,7 @@
             <w:noProof/>
             <w:webHidden/>
           </w:rPr>
-          <w:instrText xml:space="preserve"> PAGEREF _Toc228987126 \h </w:instrText>
+          <w:instrText xml:space="preserve"> PAGEREF _Toc229075276 \h </w:instrText>
         </w:r>
         <w:r>
           <w:rPr>
@@ -4526,7 +4756,7 @@
           <w:lang w:eastAsia="en-GB"/>
         </w:rPr>
       </w:pPr>
-      <w:hyperlink w:anchor="_Toc228987127" w:history="1">
+      <w:hyperlink w:anchor="_Toc229075277" w:history="1">
         <w:r>
           <w:rPr>
             <w:rStyle w:val="Hyperlink"/>
@@ -4553,7 +4783,7 @@
             <w:noProof/>
             <w:webHidden/>
           </w:rPr>
-          <w:instrText xml:space="preserve"> PAGEREF _Toc228987127 \h </w:instrText>
+          <w:instrText xml:space="preserve"> PAGEREF _Toc229075277 \h </w:instrText>
         </w:r>
         <w:r>
           <w:rPr>
@@ -4596,7 +4826,7 @@
           <w:lang w:eastAsia="en-GB"/>
         </w:rPr>
       </w:pPr>
-      <w:hyperlink w:anchor="_Toc228987128" w:history="1">
+      <w:hyperlink w:anchor="_Toc229075278" w:history="1">
         <w:r>
           <w:rPr>
             <w:rStyle w:val="Hyperlink"/>
@@ -4623,7 +4853,7 @@
             <w:noProof/>
             <w:webHidden/>
           </w:rPr>
-          <w:instrText xml:space="preserve"> PAGEREF _Toc228987128 \h </w:instrText>
+          <w:instrText xml:space="preserve"> PAGEREF _Toc229075278 \h </w:instrText>
         </w:r>
         <w:r>
           <w:rPr>
@@ -4666,7 +4896,7 @@
           <w:lang w:eastAsia="en-GB"/>
         </w:rPr>
       </w:pPr>
-      <w:hyperlink w:anchor="_Toc228987129" w:history="1">
+      <w:hyperlink w:anchor="_Toc229075279" w:history="1">
         <w:r>
           <w:rPr>
             <w:rStyle w:val="Hyperlink"/>
@@ -4693,7 +4923,7 @@
             <w:noProof/>
             <w:webHidden/>
           </w:rPr>
-          <w:instrText xml:space="preserve"> PAGEREF _Toc228987129 \h </w:instrText>
+          <w:instrText xml:space="preserve"> PAGEREF _Toc229075279 \h </w:instrText>
         </w:r>
         <w:r>
           <w:rPr>
@@ -4736,13 +4966,13 @@
           <w:lang w:eastAsia="en-GB"/>
         </w:rPr>
       </w:pPr>
-      <w:hyperlink w:anchor="_Toc228987130" w:history="1">
+      <w:hyperlink w:anchor="_Toc229075280" w:history="1">
         <w:r>
           <w:rPr>
             <w:rStyle w:val="Hyperlink"/>
             <w:noProof/>
           </w:rPr>
-          <w:t>Figure 8 (IQ, 2018)</w:t>
+          <w:t>Figure 8 (OpenGenus IQ, 2018)</w:t>
         </w:r>
         <w:r>
           <w:rPr>
@@ -4763,7 +4993,7 @@
             <w:noProof/>
             <w:webHidden/>
           </w:rPr>
-          <w:instrText xml:space="preserve"> PAGEREF _Toc228987130 \h </w:instrText>
+          <w:instrText xml:space="preserve"> PAGEREF _Toc229075280 \h </w:instrText>
         </w:r>
         <w:r>
           <w:rPr>
@@ -4796,6 +5026,426 @@
     </w:p>
     <w:p>
       <w:pPr>
+        <w:pStyle w:val="TableofFigures"/>
+        <w:tabs>
+          <w:tab w:val="right" w:leader="dot" w:pos="9016"/>
+        </w:tabs>
+        <w:rPr>
+          <w:rFonts w:asciiTheme="minorHAnsi" w:eastAsiaTheme="minorEastAsia" w:hAnsiTheme="minorHAnsi"/>
+          <w:noProof/>
+          <w:lang w:eastAsia="en-GB"/>
+        </w:rPr>
+      </w:pPr>
+      <w:hyperlink w:anchor="_Toc229075281" w:history="1">
+        <w:r>
+          <w:rPr>
+            <w:rStyle w:val="Hyperlink"/>
+            <w:noProof/>
+          </w:rPr>
+          <w:t>Figure 9: Basic Noise Map implementation</w:t>
+        </w:r>
+        <w:r>
+          <w:rPr>
+            <w:noProof/>
+            <w:webHidden/>
+          </w:rPr>
+          <w:tab/>
+        </w:r>
+        <w:r>
+          <w:rPr>
+            <w:noProof/>
+            <w:webHidden/>
+          </w:rPr>
+          <w:fldChar w:fldCharType="begin"/>
+        </w:r>
+        <w:r>
+          <w:rPr>
+            <w:noProof/>
+            <w:webHidden/>
+          </w:rPr>
+          <w:instrText xml:space="preserve"> PAGEREF _Toc229075281 \h </w:instrText>
+        </w:r>
+        <w:r>
+          <w:rPr>
+            <w:noProof/>
+            <w:webHidden/>
+          </w:rPr>
+        </w:r>
+        <w:r>
+          <w:rPr>
+            <w:noProof/>
+            <w:webHidden/>
+          </w:rPr>
+          <w:fldChar w:fldCharType="separate"/>
+        </w:r>
+        <w:r>
+          <w:rPr>
+            <w:noProof/>
+            <w:webHidden/>
+          </w:rPr>
+          <w:t>17</w:t>
+        </w:r>
+        <w:r>
+          <w:rPr>
+            <w:noProof/>
+            <w:webHidden/>
+          </w:rPr>
+          <w:fldChar w:fldCharType="end"/>
+        </w:r>
+      </w:hyperlink>
+    </w:p>
+    <w:p>
+      <w:pPr>
+        <w:pStyle w:val="TableofFigures"/>
+        <w:tabs>
+          <w:tab w:val="right" w:leader="dot" w:pos="9016"/>
+        </w:tabs>
+        <w:rPr>
+          <w:rFonts w:asciiTheme="minorHAnsi" w:eastAsiaTheme="minorEastAsia" w:hAnsiTheme="minorHAnsi"/>
+          <w:noProof/>
+          <w:lang w:eastAsia="en-GB"/>
+        </w:rPr>
+      </w:pPr>
+      <w:hyperlink w:anchor="_Toc229075282" w:history="1">
+        <w:r>
+          <w:rPr>
+            <w:rStyle w:val="Hyperlink"/>
+            <w:noProof/>
+          </w:rPr>
+          <w:t>Figure 10: Complete Noise Map implementation</w:t>
+        </w:r>
+        <w:r>
+          <w:rPr>
+            <w:noProof/>
+            <w:webHidden/>
+          </w:rPr>
+          <w:tab/>
+        </w:r>
+        <w:r>
+          <w:rPr>
+            <w:noProof/>
+            <w:webHidden/>
+          </w:rPr>
+          <w:fldChar w:fldCharType="begin"/>
+        </w:r>
+        <w:r>
+          <w:rPr>
+            <w:noProof/>
+            <w:webHidden/>
+          </w:rPr>
+          <w:instrText xml:space="preserve"> PAGEREF _Toc229075282 \h </w:instrText>
+        </w:r>
+        <w:r>
+          <w:rPr>
+            <w:noProof/>
+            <w:webHidden/>
+          </w:rPr>
+        </w:r>
+        <w:r>
+          <w:rPr>
+            <w:noProof/>
+            <w:webHidden/>
+          </w:rPr>
+          <w:fldChar w:fldCharType="separate"/>
+        </w:r>
+        <w:r>
+          <w:rPr>
+            <w:noProof/>
+            <w:webHidden/>
+          </w:rPr>
+          <w:t>17</w:t>
+        </w:r>
+        <w:r>
+          <w:rPr>
+            <w:noProof/>
+            <w:webHidden/>
+          </w:rPr>
+          <w:fldChar w:fldCharType="end"/>
+        </w:r>
+      </w:hyperlink>
+    </w:p>
+    <w:p>
+      <w:pPr>
+        <w:pStyle w:val="TableofFigures"/>
+        <w:tabs>
+          <w:tab w:val="right" w:leader="dot" w:pos="9016"/>
+        </w:tabs>
+        <w:rPr>
+          <w:rFonts w:asciiTheme="minorHAnsi" w:eastAsiaTheme="minorEastAsia" w:hAnsiTheme="minorHAnsi"/>
+          <w:noProof/>
+          <w:lang w:eastAsia="en-GB"/>
+        </w:rPr>
+      </w:pPr>
+      <w:hyperlink w:anchor="_Toc229075283" w:history="1">
+        <w:r>
+          <w:rPr>
+            <w:rStyle w:val="Hyperlink"/>
+            <w:noProof/>
+          </w:rPr>
+          <w:t>Figure 11: Turning Noise Map into Colour Map</w:t>
+        </w:r>
+        <w:r>
+          <w:rPr>
+            <w:noProof/>
+            <w:webHidden/>
+          </w:rPr>
+          <w:tab/>
+        </w:r>
+        <w:r>
+          <w:rPr>
+            <w:noProof/>
+            <w:webHidden/>
+          </w:rPr>
+          <w:fldChar w:fldCharType="begin"/>
+        </w:r>
+        <w:r>
+          <w:rPr>
+            <w:noProof/>
+            <w:webHidden/>
+          </w:rPr>
+          <w:instrText xml:space="preserve"> PAGEREF _Toc229075283 \h </w:instrText>
+        </w:r>
+        <w:r>
+          <w:rPr>
+            <w:noProof/>
+            <w:webHidden/>
+          </w:rPr>
+        </w:r>
+        <w:r>
+          <w:rPr>
+            <w:noProof/>
+            <w:webHidden/>
+          </w:rPr>
+          <w:fldChar w:fldCharType="separate"/>
+        </w:r>
+        <w:r>
+          <w:rPr>
+            <w:noProof/>
+            <w:webHidden/>
+          </w:rPr>
+          <w:t>18</w:t>
+        </w:r>
+        <w:r>
+          <w:rPr>
+            <w:noProof/>
+            <w:webHidden/>
+          </w:rPr>
+          <w:fldChar w:fldCharType="end"/>
+        </w:r>
+      </w:hyperlink>
+    </w:p>
+    <w:p>
+      <w:pPr>
+        <w:pStyle w:val="TableofFigures"/>
+        <w:tabs>
+          <w:tab w:val="right" w:leader="dot" w:pos="9016"/>
+        </w:tabs>
+        <w:rPr>
+          <w:rFonts w:asciiTheme="minorHAnsi" w:eastAsiaTheme="minorEastAsia" w:hAnsiTheme="minorHAnsi"/>
+          <w:noProof/>
+          <w:lang w:eastAsia="en-GB"/>
+        </w:rPr>
+      </w:pPr>
+      <w:hyperlink w:anchor="_Toc229075284" w:history="1">
+        <w:r>
+          <w:rPr>
+            <w:rStyle w:val="Hyperlink"/>
+            <w:noProof/>
+          </w:rPr>
+          <w:t>Figure 12: The TerrainType struct used in regions variable</w:t>
+        </w:r>
+        <w:r>
+          <w:rPr>
+            <w:noProof/>
+            <w:webHidden/>
+          </w:rPr>
+          <w:tab/>
+        </w:r>
+        <w:r>
+          <w:rPr>
+            <w:noProof/>
+            <w:webHidden/>
+          </w:rPr>
+          <w:fldChar w:fldCharType="begin"/>
+        </w:r>
+        <w:r>
+          <w:rPr>
+            <w:noProof/>
+            <w:webHidden/>
+          </w:rPr>
+          <w:instrText xml:space="preserve"> PAGEREF _Toc229075284 \h </w:instrText>
+        </w:r>
+        <w:r>
+          <w:rPr>
+            <w:noProof/>
+            <w:webHidden/>
+          </w:rPr>
+        </w:r>
+        <w:r>
+          <w:rPr>
+            <w:noProof/>
+            <w:webHidden/>
+          </w:rPr>
+          <w:fldChar w:fldCharType="separate"/>
+        </w:r>
+        <w:r>
+          <w:rPr>
+            <w:noProof/>
+            <w:webHidden/>
+          </w:rPr>
+          <w:t>18</w:t>
+        </w:r>
+        <w:r>
+          <w:rPr>
+            <w:noProof/>
+            <w:webHidden/>
+          </w:rPr>
+          <w:fldChar w:fldCharType="end"/>
+        </w:r>
+      </w:hyperlink>
+    </w:p>
+    <w:p>
+      <w:pPr>
+        <w:pStyle w:val="TableofFigures"/>
+        <w:tabs>
+          <w:tab w:val="right" w:leader="dot" w:pos="9016"/>
+        </w:tabs>
+        <w:rPr>
+          <w:rFonts w:asciiTheme="minorHAnsi" w:eastAsiaTheme="minorEastAsia" w:hAnsiTheme="minorHAnsi"/>
+          <w:noProof/>
+          <w:lang w:eastAsia="en-GB"/>
+        </w:rPr>
+      </w:pPr>
+      <w:hyperlink w:anchor="_Toc229075285" w:history="1">
+        <w:r>
+          <w:rPr>
+            <w:rStyle w:val="Hyperlink"/>
+            <w:noProof/>
+          </w:rPr>
+          <w:t>Figure 13: Main section of the mesh drawing function</w:t>
+        </w:r>
+        <w:r>
+          <w:rPr>
+            <w:noProof/>
+            <w:webHidden/>
+          </w:rPr>
+          <w:tab/>
+        </w:r>
+        <w:r>
+          <w:rPr>
+            <w:noProof/>
+            <w:webHidden/>
+          </w:rPr>
+          <w:fldChar w:fldCharType="begin"/>
+        </w:r>
+        <w:r>
+          <w:rPr>
+            <w:noProof/>
+            <w:webHidden/>
+          </w:rPr>
+          <w:instrText xml:space="preserve"> PAGEREF _Toc229075285 \h </w:instrText>
+        </w:r>
+        <w:r>
+          <w:rPr>
+            <w:noProof/>
+            <w:webHidden/>
+          </w:rPr>
+        </w:r>
+        <w:r>
+          <w:rPr>
+            <w:noProof/>
+            <w:webHidden/>
+          </w:rPr>
+          <w:fldChar w:fldCharType="separate"/>
+        </w:r>
+        <w:r>
+          <w:rPr>
+            <w:noProof/>
+            <w:webHidden/>
+          </w:rPr>
+          <w:t>19</w:t>
+        </w:r>
+        <w:r>
+          <w:rPr>
+            <w:noProof/>
+            <w:webHidden/>
+          </w:rPr>
+          <w:fldChar w:fldCharType="end"/>
+        </w:r>
+      </w:hyperlink>
+    </w:p>
+    <w:p>
+      <w:pPr>
+        <w:pStyle w:val="TableofFigures"/>
+        <w:tabs>
+          <w:tab w:val="right" w:leader="dot" w:pos="9016"/>
+        </w:tabs>
+        <w:rPr>
+          <w:rFonts w:asciiTheme="minorHAnsi" w:eastAsiaTheme="minorEastAsia" w:hAnsiTheme="minorHAnsi"/>
+          <w:noProof/>
+          <w:lang w:eastAsia="en-GB"/>
+        </w:rPr>
+      </w:pPr>
+      <w:hyperlink w:anchor="_Toc229075286" w:history="1">
+        <w:r>
+          <w:rPr>
+            <w:rStyle w:val="Hyperlink"/>
+            <w:noProof/>
+          </w:rPr>
+          <w:t>Figure 14</w:t>
+        </w:r>
+        <w:r>
+          <w:rPr>
+            <w:noProof/>
+            <w:webHidden/>
+          </w:rPr>
+          <w:tab/>
+        </w:r>
+        <w:r>
+          <w:rPr>
+            <w:noProof/>
+            <w:webHidden/>
+          </w:rPr>
+          <w:fldChar w:fldCharType="begin"/>
+        </w:r>
+        <w:r>
+          <w:rPr>
+            <w:noProof/>
+            <w:webHidden/>
+          </w:rPr>
+          <w:instrText xml:space="preserve"> PAGEREF _Toc229075286 \h </w:instrText>
+        </w:r>
+        <w:r>
+          <w:rPr>
+            <w:noProof/>
+            <w:webHidden/>
+          </w:rPr>
+        </w:r>
+        <w:r>
+          <w:rPr>
+            <w:noProof/>
+            <w:webHidden/>
+          </w:rPr>
+          <w:fldChar w:fldCharType="separate"/>
+        </w:r>
+        <w:r>
+          <w:rPr>
+            <w:noProof/>
+            <w:webHidden/>
+          </w:rPr>
+          <w:t>20</w:t>
+        </w:r>
+        <w:r>
+          <w:rPr>
+            <w:noProof/>
+            <w:webHidden/>
+          </w:rPr>
+          <w:fldChar w:fldCharType="end"/>
+        </w:r>
+      </w:hyperlink>
+    </w:p>
+    <w:p>
+      <w:pPr>
         <w:spacing w:line="259" w:lineRule="auto"/>
         <w:rPr>
           <w:sz w:val="36"/>
@@ -4832,7 +5482,7 @@
       <w:pPr>
         <w:pStyle w:val="Heading1"/>
       </w:pPr>
-      <w:bookmarkStart w:id="8" w:name="_Toc228987080"/>
+      <w:bookmarkStart w:id="8" w:name="_Toc229075227"/>
       <w:r>
         <w:t>Chapter 1</w:t>
       </w:r>
@@ -4860,7 +5510,7 @@
           <w:u w:val="single"/>
         </w:rPr>
       </w:pPr>
-      <w:bookmarkStart w:id="9" w:name="_Toc228987081"/>
+      <w:bookmarkStart w:id="9" w:name="_Toc229075228"/>
       <w:r>
         <w:t>1.1</w:t>
       </w:r>
@@ -4911,7 +5561,7 @@
       <w:pPr>
         <w:pStyle w:val="Heading2"/>
       </w:pPr>
-      <w:bookmarkStart w:id="10" w:name="_Toc228987082"/>
+      <w:bookmarkStart w:id="10" w:name="_Toc229075229"/>
       <w:r>
         <w:t>1.2 Aims</w:t>
       </w:r>
@@ -4927,7 +5577,7 @@
           <w:szCs w:val="28"/>
         </w:rPr>
       </w:pPr>
-      <w:bookmarkStart w:id="11" w:name="_Toc228987083"/>
+      <w:bookmarkStart w:id="11" w:name="_Toc229075230"/>
       <w:r>
         <w:rPr>
           <w:rStyle w:val="Heading2Char"/>
@@ -4972,7 +5622,7 @@
       <w:pPr>
         <w:pStyle w:val="Heading3"/>
       </w:pPr>
-      <w:bookmarkStart w:id="12" w:name="_Toc228987084"/>
+      <w:bookmarkStart w:id="12" w:name="_Toc229075231"/>
       <w:r>
         <w:lastRenderedPageBreak/>
         <w:t>1.2.2 Additional Aims</w:t>
@@ -5042,7 +5692,7 @@
       <w:pPr>
         <w:pStyle w:val="Heading2"/>
       </w:pPr>
-      <w:bookmarkStart w:id="13" w:name="_Toc228987085"/>
+      <w:bookmarkStart w:id="13" w:name="_Toc229075232"/>
       <w:r>
         <w:t>1.3 Objectives</w:t>
       </w:r>
@@ -5052,7 +5702,7 @@
       <w:pPr>
         <w:pStyle w:val="Heading3"/>
       </w:pPr>
-      <w:bookmarkStart w:id="14" w:name="_Toc228987086"/>
+      <w:bookmarkStart w:id="14" w:name="_Toc229075233"/>
       <w:r>
         <w:t>1.3.1 Scope</w:t>
       </w:r>
@@ -5060,7 +5710,15 @@
     </w:p>
     <w:p>
       <w:r>
-        <w:t>The objectives in terms of scope for this project are going to be generally quite broad and consist of specific milestones. The core objectives in regards to the scope are:</w:t>
+        <w:t xml:space="preserve">The objectives in terms of scope for this project are going to be generally quite broad and consist of specific milestones. The core objectives </w:t>
+      </w:r>
+      <w:proofErr w:type="gramStart"/>
+      <w:r>
+        <w:t>in regards to</w:t>
+      </w:r>
+      <w:proofErr w:type="gramEnd"/>
+      <w:r>
+        <w:t xml:space="preserve"> the scope are:</w:t>
       </w:r>
     </w:p>
     <w:p>
@@ -5115,7 +5773,7 @@
       <w:pPr>
         <w:pStyle w:val="Heading3"/>
       </w:pPr>
-      <w:bookmarkStart w:id="15" w:name="_Toc228987087"/>
+      <w:bookmarkStart w:id="15" w:name="_Toc229075234"/>
       <w:r>
         <w:t>1.3.2 Research Objectives</w:t>
       </w:r>
@@ -5123,7 +5781,15 @@
     </w:p>
     <w:p>
       <w:r>
-        <w:t>For the research objectives for the game, research will be conducted into other types of media with similar features. This research will include a comparison of similar games and their features and the overall impact of those features on this project. This will be done to find a balance for the difficulty of the game and to evaluate the necessary features for the game. Some topics of features and mechanics that will be researched include: World Generation, Pathfinding</w:t>
+        <w:t xml:space="preserve">For the research objectives for the game, research will be conducted into other types of media with similar features. This research will include a comparison of similar games and their features and the overall impact of those features on this project. This will be done to find a balance for the difficulty of the game and to evaluate the necessary features for the game. Some topics of features and mechanics that will be researched </w:t>
+      </w:r>
+      <w:proofErr w:type="gramStart"/>
+      <w:r>
+        <w:t>include:</w:t>
+      </w:r>
+      <w:proofErr w:type="gramEnd"/>
+      <w:r>
+        <w:t xml:space="preserve"> World Generation, Pathfinding</w:t>
       </w:r>
       <w:r>
         <w:t xml:space="preserve"> and </w:t>
@@ -5145,7 +5811,7 @@
       <w:pPr>
         <w:pStyle w:val="Heading3"/>
       </w:pPr>
-      <w:bookmarkStart w:id="16" w:name="_Toc228987088"/>
+      <w:bookmarkStart w:id="16" w:name="_Toc229075235"/>
       <w:r>
         <w:lastRenderedPageBreak/>
         <w:t>1.3.3 Design Objectives</w:t>
@@ -5268,7 +5934,7 @@
       <w:pPr>
         <w:pStyle w:val="Heading3"/>
       </w:pPr>
-      <w:bookmarkStart w:id="17" w:name="_Toc228987089"/>
+      <w:bookmarkStart w:id="17" w:name="_Toc229075236"/>
       <w:r>
         <w:t>1.3.4 Implementation Objectives</w:t>
       </w:r>
@@ -5387,7 +6053,7 @@
       <w:pPr>
         <w:pStyle w:val="Heading3"/>
       </w:pPr>
-      <w:bookmarkStart w:id="18" w:name="_Toc228987090"/>
+      <w:bookmarkStart w:id="18" w:name="_Toc229075237"/>
       <w:r>
         <w:t>1.3.5 Results, Evaluation and Playtesting Objectives</w:t>
       </w:r>
@@ -5444,7 +6110,7 @@
       <w:pPr>
         <w:pStyle w:val="Heading1"/>
       </w:pPr>
-      <w:bookmarkStart w:id="19" w:name="_Toc228987091"/>
+      <w:bookmarkStart w:id="19" w:name="_Toc229075238"/>
       <w:r>
         <w:lastRenderedPageBreak/>
         <w:t>Chapter 2 – Literature Survey</w:t>
@@ -5455,7 +6121,7 @@
       <w:pPr>
         <w:pStyle w:val="Heading2"/>
       </w:pPr>
-      <w:bookmarkStart w:id="20" w:name="_Toc228987092"/>
+      <w:bookmarkStart w:id="20" w:name="_Toc229075239"/>
       <w:r>
         <w:t>2.1 Literature Survey Introduction</w:t>
       </w:r>
@@ -5494,7 +6160,7 @@
       <w:pPr>
         <w:pStyle w:val="Heading2"/>
       </w:pPr>
-      <w:bookmarkStart w:id="21" w:name="_Toc228987093"/>
+      <w:bookmarkStart w:id="21" w:name="_Toc229075240"/>
       <w:r>
         <w:t>2.2 Comparative Research</w:t>
       </w:r>
@@ -5512,7 +6178,7 @@
       <w:pPr>
         <w:pStyle w:val="Heading3"/>
       </w:pPr>
-      <w:bookmarkStart w:id="22" w:name="_Toc228987094"/>
+      <w:bookmarkStart w:id="22" w:name="_Toc229075241"/>
       <w:r>
         <w:t xml:space="preserve">2.2.1 </w:t>
       </w:r>
@@ -5587,7 +6253,7 @@
       <w:pPr>
         <w:pStyle w:val="Heading4"/>
       </w:pPr>
-      <w:bookmarkStart w:id="23" w:name="_Toc228987095"/>
+      <w:bookmarkStart w:id="23" w:name="_Toc229075242"/>
       <w:r>
         <w:t>2.2.1.1 Perlin Noise</w:t>
       </w:r>
@@ -5888,7 +6554,7 @@
         <w:pStyle w:val="Caption"/>
         <w:jc w:val="center"/>
       </w:pPr>
-      <w:bookmarkStart w:id="24" w:name="_Toc228987123"/>
+      <w:bookmarkStart w:id="24" w:name="_Toc229075273"/>
       <w:r>
         <w:t xml:space="preserve">Figure </w:t>
       </w:r>
@@ -5913,7 +6579,7 @@
             <w:fldChar w:fldCharType="begin"/>
           </w:r>
           <w:r>
-            <w:instrText xml:space="preserve"> CITATION Wik26 \l 2057 </w:instrText>
+            <w:instrText xml:space="preserve">CITATION Wik26 \l 2057 </w:instrText>
           </w:r>
           <w:r>
             <w:fldChar w:fldCharType="separate"/>
@@ -5972,7 +6638,7 @@
       <w:pPr>
         <w:pStyle w:val="Heading4"/>
       </w:pPr>
-      <w:bookmarkStart w:id="25" w:name="_Toc228987096"/>
+      <w:bookmarkStart w:id="25" w:name="_Toc229075243"/>
       <w:r>
         <w:t>2.2.1.2 Binary Space Partitioning</w:t>
       </w:r>
@@ -6023,7 +6689,7 @@
       <w:pPr>
         <w:pStyle w:val="Heading4"/>
       </w:pPr>
-      <w:bookmarkStart w:id="26" w:name="_Toc228987097"/>
+      <w:bookmarkStart w:id="26" w:name="_Toc229075244"/>
       <w:r>
         <w:t>2.2.1.3 Cellular Automata</w:t>
       </w:r>
@@ -6084,7 +6750,15 @@
         <w:t>)</w:t>
       </w:r>
       <w:r>
-        <w:t xml:space="preserve"> according to the following two rules: If a cell is alive, it survives to the next generation if it has 2 or 3 live neighbors; otherwise it dies. If a cell is dead, it comes to life in the next generation if it has exactly 3 live neighbors; otherwise it stays dead.” </w:t>
+        <w:t xml:space="preserve"> according to the following two rules: If a cell is alive, it survives to the next generation if it has 2 or 3 live neighbors; otherwise it dies. If a cell is dead, it comes to life in the next generation if it has exactly 3 live neighbors; </w:t>
+      </w:r>
+      <w:proofErr w:type="gramStart"/>
+      <w:r>
+        <w:t>otherwise</w:t>
+      </w:r>
+      <w:proofErr w:type="gramEnd"/>
+      <w:r>
+        <w:t xml:space="preserve"> it stays dead.” </w:t>
       </w:r>
       <w:sdt>
         <w:sdtPr>
@@ -6130,7 +6804,7 @@
       <w:pPr>
         <w:pStyle w:val="Heading3"/>
       </w:pPr>
-      <w:bookmarkStart w:id="27" w:name="_Toc228987098"/>
+      <w:bookmarkStart w:id="27" w:name="_Toc229075245"/>
       <w:r>
         <w:t>2.2.2 Pathfinding</w:t>
       </w:r>
@@ -6166,7 +6840,15 @@
         <w:t xml:space="preserve"> </w:t>
       </w:r>
       <w:r>
-        <w:t>The types of pathfinding I will be evaluating are: A*, Dijkstra</w:t>
+        <w:t xml:space="preserve">The types of pathfinding I will be evaluating </w:t>
+      </w:r>
+      <w:proofErr w:type="gramStart"/>
+      <w:r>
+        <w:t>are:</w:t>
+      </w:r>
+      <w:proofErr w:type="gramEnd"/>
+      <w:r>
+        <w:t xml:space="preserve"> A*, Dijkstra</w:t>
       </w:r>
       <w:r>
         <w:t>,</w:t>
@@ -6185,7 +6867,7 @@
       <w:pPr>
         <w:pStyle w:val="Heading4"/>
       </w:pPr>
-      <w:bookmarkStart w:id="28" w:name="_Toc228987099"/>
+      <w:bookmarkStart w:id="28" w:name="_Toc229075246"/>
       <w:r>
         <w:t>2.2.2.1 Dijkstra</w:t>
       </w:r>
@@ -6272,7 +6954,7 @@
         <w:pStyle w:val="Caption"/>
         <w:jc w:val="center"/>
       </w:pPr>
-      <w:bookmarkStart w:id="29" w:name="_Toc228987124"/>
+      <w:bookmarkStart w:id="29" w:name="_Toc229075274"/>
       <w:r>
         <w:t xml:space="preserve">Figure </w:t>
       </w:r>
@@ -6358,7 +7040,7 @@
       <w:pPr>
         <w:pStyle w:val="Heading4"/>
       </w:pPr>
-      <w:bookmarkStart w:id="30" w:name="_Toc228987100"/>
+      <w:bookmarkStart w:id="30" w:name="_Toc229075247"/>
       <w:r>
         <w:t>2.2.2.2 A*</w:t>
       </w:r>
@@ -6431,7 +7113,7 @@
       <w:pPr>
         <w:pStyle w:val="Heading4"/>
       </w:pPr>
-      <w:bookmarkStart w:id="31" w:name="_Toc228987101"/>
+      <w:bookmarkStart w:id="31" w:name="_Toc229075248"/>
       <w:r>
         <w:t>2.2.2.3 Jump Point Search</w:t>
       </w:r>
@@ -6481,7 +7163,7 @@
       <w:pPr>
         <w:pStyle w:val="Heading3"/>
       </w:pPr>
-      <w:bookmarkStart w:id="32" w:name="_Toc228987102"/>
+      <w:bookmarkStart w:id="32" w:name="_Toc229075249"/>
       <w:r>
         <w:t>2.2.3 AI Integrations</w:t>
       </w:r>
@@ -6505,7 +7187,7 @@
       <w:pPr>
         <w:pStyle w:val="Heading4"/>
       </w:pPr>
-      <w:bookmarkStart w:id="33" w:name="_Toc228987103"/>
+      <w:bookmarkStart w:id="33" w:name="_Toc229075250"/>
       <w:r>
         <w:lastRenderedPageBreak/>
         <w:t>2.2.3.1 Neural Network</w:t>
@@ -6526,7 +7208,15 @@
     <w:p/>
     <w:p>
       <w:r>
-        <w:t xml:space="preserve">After the initial training phase, if we present the network with a pattern it hasn’t seen before in its training data, it should classify the unseen pattern correctly, only if it has learnt the underlying structure of the problem </w:t>
+        <w:t xml:space="preserve">After the initial training phase, if we present the network with a </w:t>
+      </w:r>
+      <w:proofErr w:type="gramStart"/>
+      <w:r>
+        <w:t>pattern</w:t>
+      </w:r>
+      <w:proofErr w:type="gramEnd"/>
+      <w:r>
+        <w:t xml:space="preserve"> it hasn’t seen before in its training data, it should classify the unseen pattern correctly, only if it has learnt the underlying structure of the problem </w:t>
       </w:r>
       <w:sdt>
         <w:sdtPr>
@@ -6562,7 +7252,7 @@
       <w:pPr>
         <w:pStyle w:val="Heading4"/>
       </w:pPr>
-      <w:bookmarkStart w:id="34" w:name="_Toc228987104"/>
+      <w:bookmarkStart w:id="34" w:name="_Toc229075251"/>
       <w:r>
         <w:t>2.2.3.2 Reinforcement Learning</w:t>
       </w:r>
@@ -6637,7 +7327,7 @@
         <w:pStyle w:val="Caption"/>
         <w:jc w:val="center"/>
       </w:pPr>
-      <w:bookmarkStart w:id="35" w:name="_Toc228987125"/>
+      <w:bookmarkStart w:id="35" w:name="_Toc229075275"/>
       <w:r>
         <w:t xml:space="preserve">Figure </w:t>
       </w:r>
@@ -6762,7 +7452,7 @@
       <w:pPr>
         <w:pStyle w:val="Heading4"/>
       </w:pPr>
-      <w:bookmarkStart w:id="36" w:name="_Toc228987105"/>
+      <w:bookmarkStart w:id="36" w:name="_Toc229075252"/>
       <w:r>
         <w:lastRenderedPageBreak/>
         <w:t>2.2.3.3 Imitation Learning</w:t>
@@ -6891,7 +7581,7 @@
       <w:pPr>
         <w:pStyle w:val="Heading1"/>
       </w:pPr>
-      <w:bookmarkStart w:id="37" w:name="_Toc228987106"/>
+      <w:bookmarkStart w:id="37" w:name="_Toc229075253"/>
       <w:r>
         <w:t>Chapter 3 – Design</w:t>
       </w:r>
@@ -6918,7 +7608,7 @@
       <w:pPr>
         <w:pStyle w:val="Heading2"/>
       </w:pPr>
-      <w:bookmarkStart w:id="38" w:name="_Toc228987107"/>
+      <w:bookmarkStart w:id="38" w:name="_Toc229075254"/>
       <w:r>
         <w:t xml:space="preserve">3.1 </w:t>
       </w:r>
@@ -6969,7 +7659,7 @@
       <w:pPr>
         <w:pStyle w:val="Heading3"/>
       </w:pPr>
-      <w:bookmarkStart w:id="39" w:name="_Toc228987108"/>
+      <w:bookmarkStart w:id="39" w:name="_Toc229075255"/>
       <w:r>
         <w:lastRenderedPageBreak/>
         <w:t xml:space="preserve">3.1.1 </w:t>
@@ -7009,7 +7699,7 @@
           <w:noProof/>
         </w:rPr>
         <w:drawing>
-          <wp:inline distT="0" distB="0" distL="0" distR="0" wp14:anchorId="7D5A5376" wp14:editId="46C2B26F">
+          <wp:inline distT="0" distB="0" distL="0" distR="0" wp14:anchorId="7D5A5376" wp14:editId="653014DA">
             <wp:extent cx="2479538" cy="2261556"/>
             <wp:effectExtent l="0" t="0" r="0" b="5715"/>
             <wp:docPr id="455141339" name="Picture 4"/>
@@ -7068,7 +7758,7 @@
         <w:pStyle w:val="Caption"/>
         <w:jc w:val="center"/>
       </w:pPr>
-      <w:bookmarkStart w:id="40" w:name="_Toc228987126"/>
+      <w:bookmarkStart w:id="40" w:name="_Toc229075276"/>
       <w:r>
         <w:t xml:space="preserve">Figure </w:t>
       </w:r>
@@ -7126,7 +7816,7 @@
                 <w:noProof/>
               </w:rPr>
               <w:drawing>
-                <wp:inline distT="0" distB="0" distL="0" distR="0" wp14:anchorId="2A67817B" wp14:editId="293A9068">
+                <wp:inline distT="0" distB="0" distL="0" distR="0" wp14:anchorId="2A67817B" wp14:editId="1A9F1D34">
                   <wp:extent cx="2295525" cy="2105025"/>
                   <wp:effectExtent l="0" t="0" r="0" b="0"/>
                   <wp:docPr id="1070291612" name="Picture 5"/>
@@ -7182,7 +7872,7 @@
               <w:pStyle w:val="Caption"/>
               <w:jc w:val="center"/>
             </w:pPr>
-            <w:bookmarkStart w:id="41" w:name="_Toc228987127"/>
+            <w:bookmarkStart w:id="41" w:name="_Toc229075277"/>
             <w:r>
               <w:t xml:space="preserve">Figure </w:t>
             </w:r>
@@ -7270,7 +7960,7 @@
               <w:pStyle w:val="Caption"/>
               <w:jc w:val="center"/>
             </w:pPr>
-            <w:bookmarkStart w:id="42" w:name="_Toc228987128"/>
+            <w:bookmarkStart w:id="42" w:name="_Toc229075278"/>
             <w:r>
               <w:t xml:space="preserve">Figure </w:t>
             </w:r>
@@ -7295,7 +7985,15 @@
     </w:p>
     <w:p>
       <w:r>
-        <w:t xml:space="preserve">Figure 5 is a visualisation of a 3x3 hexagonal grid. There </w:t>
+        <w:t xml:space="preserve">Figure 5 is a visualisation of a 3x3 hexagonal grid. </w:t>
+      </w:r>
+      <w:proofErr w:type="gramStart"/>
+      <w:r>
+        <w:t>There</w:t>
+      </w:r>
+      <w:proofErr w:type="gramEnd"/>
+      <w:r>
+        <w:t xml:space="preserve"> </w:t>
       </w:r>
       <w:r>
         <w:t>a key limitation</w:t>
@@ -7347,7 +8045,7 @@
       <w:pPr>
         <w:pStyle w:val="Heading3"/>
       </w:pPr>
-      <w:bookmarkStart w:id="43" w:name="_Toc228987109"/>
+      <w:bookmarkStart w:id="43" w:name="_Toc229075256"/>
       <w:r>
         <w:t>3.1.2 Biomes</w:t>
       </w:r>
@@ -7518,7 +8216,7 @@
         <w:pStyle w:val="Caption"/>
         <w:jc w:val="center"/>
       </w:pPr>
-      <w:bookmarkStart w:id="44" w:name="_Toc228987129"/>
+      <w:bookmarkStart w:id="44" w:name="_Toc229075279"/>
       <w:r>
         <w:t xml:space="preserve">Figure </w:t>
       </w:r>
@@ -7569,7 +8267,15 @@
         <w:t xml:space="preserve"> a pixel is, can become the boundaries for biomes. In this example, there are only 3 biomes: ocean, beach, and grass</w:t>
       </w:r>
       <w:r>
-        <w:t xml:space="preserve">. The amount of biomes possible are technically infinite. Although biome separation will be very prevalent as you go past roughly 10 biomes. </w:t>
+        <w:t xml:space="preserve">. The </w:t>
+      </w:r>
+      <w:proofErr w:type="gramStart"/>
+      <w:r>
+        <w:t>amount</w:t>
+      </w:r>
+      <w:proofErr w:type="gramEnd"/>
+      <w:r>
+        <w:t xml:space="preserve"> of biomes possible are technically infinite. Although biome separation will be very prevalent as you go past roughly 10 biomes. </w:t>
       </w:r>
     </w:p>
     <w:p/>
@@ -7578,7 +8284,15 @@
         <w:t xml:space="preserve">For my game, I am choosing to have 5 true biomes: Deep water, shallow water, sand, grass and snow. Each of these biomes are going to be abundant in different resources and </w:t>
       </w:r>
       <w:r>
-        <w:t>have very different base tile variables. For example, grassland tiles will contain more production than a sand tile but a sand tile will have more gold than a grassland tile</w:t>
+        <w:t xml:space="preserve">have very different base tile variables. For example, grassland tiles will contain more production than a sand </w:t>
+      </w:r>
+      <w:proofErr w:type="gramStart"/>
+      <w:r>
+        <w:t>tile</w:t>
+      </w:r>
+      <w:proofErr w:type="gramEnd"/>
+      <w:r>
+        <w:t xml:space="preserve"> but a sand tile will have more gold than a grassland tile</w:t>
       </w:r>
       <w:r>
         <w:t>.</w:t>
@@ -7595,7 +8309,7 @@
       <w:pPr>
         <w:pStyle w:val="Heading3"/>
       </w:pPr>
-      <w:bookmarkStart w:id="45" w:name="_Toc228987110"/>
+      <w:bookmarkStart w:id="45" w:name="_Toc229075257"/>
       <w:r>
         <w:t>3.1.3 Resource Distribution</w:t>
       </w:r>
@@ -7631,7 +8345,7 @@
       <w:pPr>
         <w:pStyle w:val="Heading3"/>
       </w:pPr>
-      <w:bookmarkStart w:id="46" w:name="_Toc228987111"/>
+      <w:bookmarkStart w:id="46" w:name="_Toc229075258"/>
       <w:r>
         <w:t>3.1.4 River generation</w:t>
       </w:r>
@@ -7673,7 +8387,7 @@
       <w:pPr>
         <w:pStyle w:val="Heading3"/>
       </w:pPr>
-      <w:bookmarkStart w:id="47" w:name="_Toc228987112"/>
+      <w:bookmarkStart w:id="47" w:name="_Toc229075259"/>
       <w:r>
         <w:t>3.1.</w:t>
       </w:r>
@@ -7782,7 +8496,7 @@
       <w:pPr>
         <w:pStyle w:val="Heading2"/>
       </w:pPr>
-      <w:bookmarkStart w:id="48" w:name="_Toc228987113"/>
+      <w:bookmarkStart w:id="48" w:name="_Toc229075260"/>
       <w:r>
         <w:t>3.2 Pathfinding</w:t>
       </w:r>
@@ -7800,7 +8514,7 @@
       <w:pPr>
         <w:pStyle w:val="Heading3"/>
       </w:pPr>
-      <w:bookmarkStart w:id="49" w:name="_Toc228987114"/>
+      <w:bookmarkStart w:id="49" w:name="_Toc229075261"/>
       <w:r>
         <w:t xml:space="preserve">3.2.1 </w:t>
       </w:r>
@@ -7823,7 +8537,15 @@
     <w:p/>
     <w:p>
       <w:r>
-        <w:t>The alternative method is to use references on all units, this is better for testing and easier to manage multiple instances of. The cons to this method are that, in Unity, getting references is quite expensive and the pathfinding will be a MonoBehaviour class meaning that the use of Unity’s GetComponent will be mandatory.</w:t>
+        <w:t xml:space="preserve">The alternative method is to use references on all </w:t>
+      </w:r>
+      <w:proofErr w:type="gramStart"/>
+      <w:r>
+        <w:t>units,</w:t>
+      </w:r>
+      <w:proofErr w:type="gramEnd"/>
+      <w:r>
+        <w:t xml:space="preserve"> this is better for testing and easier to manage multiple instances of. The cons to this method are that, in Unity, getting references is quite expensive and the pathfinding will be a MonoBehaviour class meaning that the use of Unity’s GetComponent will be mandatory.</w:t>
       </w:r>
     </w:p>
     <w:p>
@@ -7835,14 +8557,22 @@
         <w:t>well-suited</w:t>
       </w:r>
       <w:r>
-        <w:t xml:space="preserve"> for this use case, allowing all units to access the class without having a reference to it. This eliminates the need to use GetComponent which has its own myriad of drawbacks such as the degradation of performance when units try to access it, NullReference exceptions crashing the pathfinding functions, and making redundant calls.</w:t>
+        <w:t xml:space="preserve"> for this use case, allowing all units to access the class without having a reference to it. This eliminates the need to use GetComponent which has its own </w:t>
+      </w:r>
+      <w:proofErr w:type="gramStart"/>
+      <w:r>
+        <w:t>myriad</w:t>
+      </w:r>
+      <w:proofErr w:type="gramEnd"/>
+      <w:r>
+        <w:t xml:space="preserve"> of drawbacks such as the degradation of performance when units try to access it, NullReference exceptions crashing the pathfinding functions, and making redundant calls.</w:t>
       </w:r>
     </w:p>
     <w:p>
       <w:pPr>
         <w:pStyle w:val="Heading3"/>
       </w:pPr>
-      <w:bookmarkStart w:id="50" w:name="_Toc228987115"/>
+      <w:bookmarkStart w:id="50" w:name="_Toc229075262"/>
       <w:r>
         <w:t>3.2.2 Heuristics</w:t>
       </w:r>
@@ -7976,7 +8706,7 @@
         <w:pStyle w:val="Caption"/>
         <w:jc w:val="center"/>
       </w:pPr>
-      <w:bookmarkStart w:id="51" w:name="_Toc228987130"/>
+      <w:bookmarkStart w:id="51" w:name="_Toc229075280"/>
       <w:r>
         <w:t xml:space="preserve">Figure </w:t>
       </w:r>
@@ -8001,7 +8731,7 @@
             <w:fldChar w:fldCharType="begin"/>
           </w:r>
           <w:r>
-            <w:instrText xml:space="preserve"> CITATION Ope18 \l 2057 </w:instrText>
+            <w:instrText xml:space="preserve">CITATION Ope18 \l 2057 </w:instrText>
           </w:r>
           <w:r>
             <w:fldChar w:fldCharType="separate"/>
@@ -8010,7 +8740,7 @@
             <w:rPr>
               <w:noProof/>
             </w:rPr>
-            <w:t>(IQ, 2018)</w:t>
+            <w:t>(OpenGenus IQ, 2018)</w:t>
           </w:r>
           <w:r>
             <w:fldChar w:fldCharType="end"/>
@@ -8046,7 +8776,7 @@
       <w:pPr>
         <w:pStyle w:val="Heading3"/>
       </w:pPr>
-      <w:bookmarkStart w:id="52" w:name="_Toc228987116"/>
+      <w:bookmarkStart w:id="52" w:name="_Toc229075263"/>
       <w:r>
         <w:t>3.2.3 Limitations</w:t>
       </w:r>
@@ -8063,7 +8793,15 @@
         <w:t xml:space="preserve">Another limitation of </w:t>
       </w:r>
       <w:r>
-        <w:t xml:space="preserve">pathfinding is that Euclidean heuristics are quite expensive to compute. This is due to a large amount of </w:t>
+        <w:t xml:space="preserve">pathfinding is that Euclidean heuristics are quite expensive to compute. This is due to a large </w:t>
+      </w:r>
+      <w:proofErr w:type="gramStart"/>
+      <w:r>
+        <w:t>amount</w:t>
+      </w:r>
+      <w:proofErr w:type="gramEnd"/>
+      <w:r>
+        <w:t xml:space="preserve"> of </w:t>
       </w:r>
       <w:r>
         <w:t>floating-point</w:t>
@@ -8086,7 +8824,7 @@
       <w:pPr>
         <w:pStyle w:val="Heading2"/>
       </w:pPr>
-      <w:bookmarkStart w:id="53" w:name="_Toc228987117"/>
+      <w:bookmarkStart w:id="53" w:name="_Toc229075264"/>
       <w:r>
         <w:t>3.3 AI Integrations</w:t>
       </w:r>
@@ -8113,7 +8851,7 @@
       <w:pPr>
         <w:pStyle w:val="Heading3"/>
       </w:pPr>
-      <w:bookmarkStart w:id="54" w:name="_Toc228987118"/>
+      <w:bookmarkStart w:id="54" w:name="_Toc229075265"/>
       <w:r>
         <w:t>3.3.1 Unity ML-Agents</w:t>
       </w:r>
@@ -8133,7 +8871,7 @@
             <w:fldChar w:fldCharType="begin"/>
           </w:r>
           <w:r>
-            <w:instrText xml:space="preserve"> CITATION Uni20 \l 2057 </w:instrText>
+            <w:instrText xml:space="preserve">CITATION Uni20 \l 2057 </w:instrText>
           </w:r>
           <w:r>
             <w:fldChar w:fldCharType="separate"/>
@@ -8217,7 +8955,7 @@
       <w:pPr>
         <w:pStyle w:val="Heading3"/>
       </w:pPr>
-      <w:bookmarkStart w:id="55" w:name="_Toc228987119"/>
+      <w:bookmarkStart w:id="55" w:name="_Toc229075266"/>
       <w:r>
         <w:t>3.3.2 AI Controller</w:t>
       </w:r>
@@ -8250,7 +8988,7 @@
       <w:pPr>
         <w:pStyle w:val="Heading3"/>
       </w:pPr>
-      <w:bookmarkStart w:id="56" w:name="_Toc228987120"/>
+      <w:bookmarkStart w:id="56" w:name="_Toc229075267"/>
       <w:r>
         <w:t>3.3.3 Limitations</w:t>
       </w:r>
@@ -8258,7 +8996,15 @@
     </w:p>
     <w:p>
       <w:r>
-        <w:t>Despite all the above mentioned advantages of Reinforcement Learning, several limitations need to be addressed. The most significant challenge is the computational cost associated with the training of the AI, particularly in a game</w:t>
+        <w:t xml:space="preserve">Despite all the </w:t>
+      </w:r>
+      <w:proofErr w:type="gramStart"/>
+      <w:r>
+        <w:t>above mentioned</w:t>
+      </w:r>
+      <w:proofErr w:type="gramEnd"/>
+      <w:r>
+        <w:t xml:space="preserve"> advantages of Reinforcement Learning, several limitations need to be addressed. The most significant challenge is the computational cost associated with the training of the AI, particularly in a game</w:t>
       </w:r>
       <w:r>
         <w:t>,</w:t>
@@ -8289,7 +9035,7 @@
       <w:pPr>
         <w:pStyle w:val="Heading1"/>
       </w:pPr>
-      <w:bookmarkStart w:id="57" w:name="_Toc228987121"/>
+      <w:bookmarkStart w:id="57" w:name="_Toc229075268"/>
       <w:r>
         <w:t xml:space="preserve">Chapter 4 </w:t>
       </w:r>
@@ -8310,9 +9056,11 @@
       <w:pPr>
         <w:pStyle w:val="Heading2"/>
       </w:pPr>
+      <w:bookmarkStart w:id="58" w:name="_Toc229075269"/>
       <w:r>
         <w:t>4.1 World Generation</w:t>
       </w:r>
+      <w:bookmarkEnd w:id="58"/>
     </w:p>
     <w:p>
       <w:r>
@@ -8340,16 +9088,26 @@
         <w:t>and</w:t>
       </w:r>
       <w:r>
-        <w:t xml:space="preserve"> Creating the river generation.</w:t>
+        <w:t xml:space="preserve"> </w:t>
+      </w:r>
+      <w:proofErr w:type="gramStart"/>
+      <w:r>
+        <w:t>Creating</w:t>
+      </w:r>
+      <w:proofErr w:type="gramEnd"/>
+      <w:r>
+        <w:t xml:space="preserve"> the river generation.</w:t>
       </w:r>
     </w:p>
     <w:p>
       <w:pPr>
         <w:pStyle w:val="Heading3"/>
       </w:pPr>
+      <w:bookmarkStart w:id="59" w:name="_Toc229075270"/>
       <w:r>
         <w:t>4.1.1 Creating the colour noise map</w:t>
       </w:r>
+      <w:bookmarkEnd w:id="59"/>
     </w:p>
     <w:p>
       <w:r>
@@ -8528,6 +9286,7 @@
         <w:pStyle w:val="Caption"/>
         <w:jc w:val="center"/>
       </w:pPr>
+      <w:bookmarkStart w:id="60" w:name="_Toc229075281"/>
       <w:r>
         <w:t xml:space="preserve">Figure </w:t>
       </w:r>
@@ -8545,6 +9304,7 @@
         </w:rPr>
         <w:t>: Basic Noise Map implementation</w:t>
       </w:r>
+      <w:bookmarkEnd w:id="60"/>
     </w:p>
     <w:p>
       <w:r>
@@ -8698,6 +9458,7 @@
         <w:pStyle w:val="Caption"/>
         <w:jc w:val="center"/>
       </w:pPr>
+      <w:bookmarkStart w:id="61" w:name="_Toc229075282"/>
       <w:r>
         <w:t xml:space="preserve">Figure </w:t>
       </w:r>
@@ -8712,6 +9473,7 @@
       <w:r>
         <w:t>: Complete Noise Map implementation</w:t>
       </w:r>
+      <w:bookmarkEnd w:id="61"/>
     </w:p>
     <w:p>
       <w:r>
@@ -8878,6 +9640,7 @@
         <w:pStyle w:val="Caption"/>
         <w:jc w:val="center"/>
       </w:pPr>
+      <w:bookmarkStart w:id="62" w:name="_Toc229075283"/>
       <w:r>
         <w:t xml:space="preserve">Figure </w:t>
       </w:r>
@@ -8892,6 +9655,7 @@
       <w:r>
         <w:t>: Turning Noise Map into Colour Map</w:t>
       </w:r>
+      <w:bookmarkEnd w:id="62"/>
     </w:p>
     <w:p>
       <w:pPr>
@@ -8958,6 +9722,7 @@
         <w:pStyle w:val="Caption"/>
         <w:jc w:val="center"/>
       </w:pPr>
+      <w:bookmarkStart w:id="63" w:name="_Toc229075284"/>
       <w:r>
         <w:t xml:space="preserve">Figure </w:t>
       </w:r>
@@ -8972,13 +9737,239 @@
       <w:r>
         <w:t>: The TerrainType struct used in regions variable</w:t>
       </w:r>
+      <w:bookmarkEnd w:id="63"/>
     </w:p>
     <w:p>
       <w:r>
         <w:t>Figure 11 shows how the noise map in Figure 10 can be turned into a colour map. The code snippet in Figure 11 shows how a ‘regions’ array of the TerrainType struct, as shown in Figure 12, can be used to turn our map into colour. This colour map can be seeded so that the player can play on the same map if they know the seed for it. This control gives the player the choice of how they can start the game and defines everything from the terrain to the resource distribution.</w:t>
       </w:r>
     </w:p>
-    <w:bookmarkStart w:id="58" w:name="_Toc228987122" w:displacedByCustomXml="next"/>
+    <w:p>
+      <w:pPr>
+        <w:pStyle w:val="Heading3"/>
+      </w:pPr>
+      <w:bookmarkStart w:id="64" w:name="_Toc229075271"/>
+      <w:r>
+        <w:t>4.1.2 Creating the world map</w:t>
+      </w:r>
+      <w:bookmarkEnd w:id="64"/>
+    </w:p>
+    <w:p>
+      <w:r>
+        <w:t>Creating the world map requires using the colour map to determine what biome our tile sits in. The tile array is actually generated during the colour map generation. This is done to ensure that each tile is created as the program runs and that we don’t have to hold any memory expensive references to additional tiles.</w:t>
+      </w:r>
+    </w:p>
+    <w:p/>
+    <w:p>
+      <w:r>
+        <w:t xml:space="preserve">Figure 11 shows how we calculate a tile index and we use that variable again to insert a new tile into our tile array with the correct biome. This allows us to create a large array of tiles that can be passed to our world map in order to create a traversable world. </w:t>
+      </w:r>
+    </w:p>
+    <w:p/>
+    <w:p>
+      <w:r>
+        <w:lastRenderedPageBreak/>
+        <w:t>To generate the world map, I am going to create a tile prefab for each biome and instantiate them individually when the tile array is generated. This will allow the player controller to easily send the units to positions and I will not need to use converter functions. After making these changes to the world generation algorithm, I discovered that the game was uncomfortable to play as the performance was massively variable. The game started and 20 frames per second seemed to be the baseline for this method. This was unacceptable and so I started searching for alternatives.</w:t>
+      </w:r>
+    </w:p>
+    <w:p/>
+    <w:p>
+      <w:r>
+        <w:t xml:space="preserve">I eventually landed on a ‘divide and conquer’ approach to the world generation. Taking inspiration from large open world games such as Minecraft </w:t>
+      </w:r>
+      <w:sdt>
+        <w:sdtPr>
+          <w:id w:val="-1126537838"/>
+          <w:citation/>
+        </w:sdtPr>
+        <w:sdtContent>
+          <w:r>
+            <w:fldChar w:fldCharType="begin"/>
+          </w:r>
+          <w:r>
+            <w:instrText xml:space="preserve"> CITATION Moj11 \l 2057 </w:instrText>
+          </w:r>
+          <w:r>
+            <w:fldChar w:fldCharType="separate"/>
+          </w:r>
+          <w:r>
+            <w:rPr>
+              <w:noProof/>
+            </w:rPr>
+            <w:t>(Mojang, 2011)</w:t>
+          </w:r>
+          <w:r>
+            <w:fldChar w:fldCharType="end"/>
+          </w:r>
+        </w:sdtContent>
+      </w:sdt>
+      <w:r>
+        <w:t>, I decided that creating chunks and drawing meshes would be the best approach. To do this, I had to create a chunk prefab with the ‘HexChunkRenderer’ component on it. This allowed me to split the world into chunks and draw and render them uniquely.</w:t>
+      </w:r>
+    </w:p>
+    <w:p>
+      <w:pPr>
+        <w:keepNext/>
+        <w:jc w:val="center"/>
+      </w:pPr>
+      <w:r>
+        <w:rPr>
+          <w:noProof/>
+        </w:rPr>
+        <w:drawing>
+          <wp:inline distT="0" distB="0" distL="0" distR="0" wp14:anchorId="3E480C1B" wp14:editId="2B8A46D6">
+            <wp:extent cx="2518913" cy="2079081"/>
+            <wp:effectExtent l="0" t="0" r="0" b="0"/>
+            <wp:docPr id="289975766" name="Picture 7"/>
+            <wp:cNvGraphicFramePr>
+              <a:graphicFrameLocks xmlns:a="http://schemas.openxmlformats.org/drawingml/2006/main" noChangeAspect="1"/>
+            </wp:cNvGraphicFramePr>
+            <a:graphic xmlns:a="http://schemas.openxmlformats.org/drawingml/2006/main">
+              <a:graphicData uri="http://schemas.openxmlformats.org/drawingml/2006/picture">
+                <pic:pic xmlns:pic="http://schemas.openxmlformats.org/drawingml/2006/picture">
+                  <pic:nvPicPr>
+                    <pic:cNvPr id="0" name="Picture 15"/>
+                    <pic:cNvPicPr>
+                      <a:picLocks noChangeAspect="1" noChangeArrowheads="1"/>
+                    </pic:cNvPicPr>
+                  </pic:nvPicPr>
+                  <pic:blipFill>
+                    <a:blip r:embed="rId26" cstate="print">
+                      <a:extLst>
+                        <a:ext uri="{28A0092B-C50C-407E-A947-70E740481C1C}">
+                          <a14:useLocalDpi xmlns:a14="http://schemas.microsoft.com/office/drawing/2010/main" val="0"/>
+                        </a:ext>
+                      </a:extLst>
+                    </a:blip>
+                    <a:srcRect/>
+                    <a:stretch>
+                      <a:fillRect/>
+                    </a:stretch>
+                  </pic:blipFill>
+                  <pic:spPr bwMode="auto">
+                    <a:xfrm>
+                      <a:off x="0" y="0"/>
+                      <a:ext cx="2530477" cy="2088626"/>
+                    </a:xfrm>
+                    <a:prstGeom prst="rect">
+                      <a:avLst/>
+                    </a:prstGeom>
+                    <a:noFill/>
+                    <a:ln>
+                      <a:noFill/>
+                    </a:ln>
+                  </pic:spPr>
+                </pic:pic>
+              </a:graphicData>
+            </a:graphic>
+          </wp:inline>
+        </w:drawing>
+      </w:r>
+    </w:p>
+    <w:p>
+      <w:pPr>
+        <w:pStyle w:val="Caption"/>
+        <w:jc w:val="center"/>
+      </w:pPr>
+      <w:bookmarkStart w:id="65" w:name="_Toc229075285"/>
+      <w:r>
+        <w:t xml:space="preserve">Figure </w:t>
+      </w:r>
+      <w:fldSimple w:instr=" SEQ Figure \* ARABIC ">
+        <w:r>
+          <w:rPr>
+            <w:noProof/>
+          </w:rPr>
+          <w:t>13</w:t>
+        </w:r>
+      </w:fldSimple>
+      <w:r>
+        <w:t>: Main section of the mesh drawing function</w:t>
+      </w:r>
+      <w:bookmarkEnd w:id="65"/>
+    </w:p>
+    <w:p>
+      <w:r>
+        <w:t>Figure 13 shows the main section of the mesh drawing function. This function adds vertices at every corner on the hexagon, then divides that into 3 triangles. This defines the mesh for each triangle, which then get put together to make a hexagon, this is then done for all hexagons and finally a mesh is generated.</w:t>
+      </w:r>
+    </w:p>
+    <w:p/>
+    <w:p>
+      <w:r>
+        <w:t xml:space="preserve">This mesh is then attached to the individual HexChunk game object. The game then does this same process for all chunks within the game. This led to the game’s performance increasing tenfold. Unfortunately, this performance increase meant that player controller design needed to be tweaked to include converter functions from world space to tile space and vice versa. </w:t>
+      </w:r>
+    </w:p>
+    <w:p>
+      <w:pPr>
+        <w:keepNext/>
+        <w:jc w:val="center"/>
+      </w:pPr>
+      <w:r>
+        <w:lastRenderedPageBreak/>
+        <w:drawing>
+          <wp:inline distT="0" distB="0" distL="0" distR="0" wp14:anchorId="0487571A" wp14:editId="27007B8E">
+            <wp:extent cx="3019245" cy="1847473"/>
+            <wp:effectExtent l="0" t="0" r="0" b="635"/>
+            <wp:docPr id="647295510" name="Picture 1"/>
+            <wp:cNvGraphicFramePr>
+              <a:graphicFrameLocks xmlns:a="http://schemas.openxmlformats.org/drawingml/2006/main" noChangeAspect="1"/>
+            </wp:cNvGraphicFramePr>
+            <a:graphic xmlns:a="http://schemas.openxmlformats.org/drawingml/2006/main">
+              <a:graphicData uri="http://schemas.openxmlformats.org/drawingml/2006/picture">
+                <pic:pic xmlns:pic="http://schemas.openxmlformats.org/drawingml/2006/picture">
+                  <pic:nvPicPr>
+                    <pic:cNvPr id="647295510" name=""/>
+                    <pic:cNvPicPr/>
+                  </pic:nvPicPr>
+                  <pic:blipFill>
+                    <a:blip r:embed="rId27"/>
+                    <a:stretch>
+                      <a:fillRect/>
+                    </a:stretch>
+                  </pic:blipFill>
+                  <pic:spPr>
+                    <a:xfrm>
+                      <a:off x="0" y="0"/>
+                      <a:ext cx="3035773" cy="1857587"/>
+                    </a:xfrm>
+                    <a:prstGeom prst="rect">
+                      <a:avLst/>
+                    </a:prstGeom>
+                  </pic:spPr>
+                </pic:pic>
+              </a:graphicData>
+            </a:graphic>
+          </wp:inline>
+        </w:drawing>
+      </w:r>
+    </w:p>
+    <w:p>
+      <w:pPr>
+        <w:pStyle w:val="Caption"/>
+        <w:jc w:val="center"/>
+      </w:pPr>
+      <w:bookmarkStart w:id="66" w:name="_Toc229075286"/>
+      <w:r>
+        <w:t xml:space="preserve">Figure </w:t>
+      </w:r>
+      <w:fldSimple w:instr=" SEQ Figure \* ARABIC ">
+        <w:r>
+          <w:rPr>
+            <w:noProof/>
+          </w:rPr>
+          <w:t>14</w:t>
+        </w:r>
+        <w:bookmarkEnd w:id="66"/>
+      </w:fldSimple>
+    </w:p>
+    <w:p>
+      <w:r>
+        <w:t>Figure 14 shows how the hex chunks are displayed in the game. Each of the HexChunk game objects have a mesh collider attached to them as well so that the player controller can raycast onto it and retrieve a position.</w:t>
+      </w:r>
+    </w:p>
+    <w:p/>
+    <w:p/>
+    <w:bookmarkStart w:id="67" w:name="_Toc229075272" w:displacedByCustomXml="next"/>
     <w:sdt>
       <w:sdtPr>
         <w:rPr>
@@ -9006,7 +9997,7 @@
           <w:r>
             <w:t>References</w:t>
           </w:r>
-          <w:bookmarkEnd w:id="58"/>
+          <w:bookmarkEnd w:id="67"/>
         </w:p>
         <w:sdt>
           <w:sdtPr>
@@ -9141,56 +10132,6 @@
                 <w:rPr>
                   <w:noProof/>
                 </w:rPr>
-                <w:lastRenderedPageBreak/>
-                <w:t xml:space="preserve">IQ, O., 2018. </w:t>
-              </w:r>
-              <w:r>
-                <w:rPr>
-                  <w:i/>
-                  <w:iCs/>
-                  <w:noProof/>
-                </w:rPr>
-                <w:t xml:space="preserve">Euclidean vs Manhattan vs Chebyshev Distance. </w:t>
-              </w:r>
-              <w:r>
-                <w:rPr>
-                  <w:noProof/>
-                </w:rPr>
-                <w:t xml:space="preserve">[Online] </w:t>
-              </w:r>
-              <w:r>
-                <w:rPr>
-                  <w:noProof/>
-                </w:rPr>
-                <w:br/>
-                <w:t xml:space="preserve">Available at: </w:t>
-              </w:r>
-              <w:r>
-                <w:rPr>
-                  <w:noProof/>
-                  <w:u w:val="single"/>
-                </w:rPr>
-                <w:t>https://iq.opengenus.org/euclidean-vs-manhattan-vs-chebyshev-distance/</w:t>
-              </w:r>
-              <w:r>
-                <w:rPr>
-                  <w:noProof/>
-                </w:rPr>
-                <w:br/>
-                <w:t>[Accessed 06 05 2025].</w:t>
-              </w:r>
-            </w:p>
-            <w:p>
-              <w:pPr>
-                <w:pStyle w:val="Bibliography"/>
-                <w:rPr>
-                  <w:noProof/>
-                </w:rPr>
-              </w:pPr>
-              <w:r>
-                <w:rPr>
-                  <w:noProof/>
-                </w:rPr>
                 <w:t xml:space="preserve">Johnston, N. &amp; Greene, D., 2021. </w:t>
               </w:r>
               <w:r>
@@ -9296,6 +10237,34 @@
                 <w:rPr>
                   <w:noProof/>
                 </w:rPr>
+                <w:t xml:space="preserve">Mojang, 2011. </w:t>
+              </w:r>
+              <w:r>
+                <w:rPr>
+                  <w:i/>
+                  <w:iCs/>
+                  <w:noProof/>
+                </w:rPr>
+                <w:t xml:space="preserve">Minecraft. </w:t>
+              </w:r>
+              <w:r>
+                <w:rPr>
+                  <w:noProof/>
+                </w:rPr>
+                <w:t>Stockholm: s.n.</w:t>
+              </w:r>
+            </w:p>
+            <w:p>
+              <w:pPr>
+                <w:pStyle w:val="Bibliography"/>
+                <w:rPr>
+                  <w:noProof/>
+                </w:rPr>
+              </w:pPr>
+              <w:r>
+                <w:rPr>
+                  <w:noProof/>
+                </w:rPr>
                 <w:t xml:space="preserve">Murel, J. &amp; Kavlakoglu, E., 2024. </w:t>
               </w:r>
               <w:r>
@@ -9332,6 +10301,56 @@
                 </w:rPr>
                 <w:br/>
                 <w:t>[Accessed 16 April 2026].</w:t>
+              </w:r>
+            </w:p>
+            <w:p>
+              <w:pPr>
+                <w:pStyle w:val="Bibliography"/>
+                <w:rPr>
+                  <w:noProof/>
+                </w:rPr>
+              </w:pPr>
+              <w:r>
+                <w:rPr>
+                  <w:noProof/>
+                </w:rPr>
+                <w:lastRenderedPageBreak/>
+                <w:t xml:space="preserve">OpenGenus IQ, 2018. </w:t>
+              </w:r>
+              <w:r>
+                <w:rPr>
+                  <w:i/>
+                  <w:iCs/>
+                  <w:noProof/>
+                </w:rPr>
+                <w:t xml:space="preserve">Euclidean vs Manhattan vs Chebyshev Distance. </w:t>
+              </w:r>
+              <w:r>
+                <w:rPr>
+                  <w:noProof/>
+                </w:rPr>
+                <w:t xml:space="preserve">[Online] </w:t>
+              </w:r>
+              <w:r>
+                <w:rPr>
+                  <w:noProof/>
+                </w:rPr>
+                <w:br/>
+                <w:t xml:space="preserve">Available at: </w:t>
+              </w:r>
+              <w:r>
+                <w:rPr>
+                  <w:noProof/>
+                  <w:u w:val="single"/>
+                </w:rPr>
+                <w:t>https://iq.opengenus.org/euclidean-vs-manhattan-vs-chebyshev-distance/</w:t>
+              </w:r>
+              <w:r>
+                <w:rPr>
+                  <w:noProof/>
+                </w:rPr>
+                <w:br/>
+                <w:t>[Accessed 06 05 2025].</w:t>
               </w:r>
             </w:p>
             <w:p>
@@ -12255,26 +13274,6 @@
     <b:RefOrder>9</b:RefOrder>
   </b:Source>
   <b:Source>
-    <b:Tag>Wik26</b:Tag>
-    <b:SourceType>InternetSite</b:SourceType>
-    <b:Guid>{797B5469-61E6-4B70-B096-D48E61408097}</b:Guid>
-    <b:Title>Perlin noise</b:Title>
-    <b:Author>
-      <b:Author>
-        <b:NameList>
-          <b:Person>
-            <b:Last>Wikipedia</b:Last>
-          </b:Person>
-        </b:NameList>
-      </b:Author>
-    </b:Author>
-    <b:YearAccessed>2026</b:YearAccessed>
-    <b:MonthAccessed>04</b:MonthAccessed>
-    <b:DayAccessed>18</b:DayAccessed>
-    <b:URL>https://en.wikipedia.org/wiki/Perlin_noise</b:URL>
-    <b:RefOrder>1</b:RefOrder>
-  </b:Source>
-  <b:Source>
     <b:Tag>Sch17</b:Tag>
     <b:SourceType>InternetSite</b:SourceType>
     <b:Guid>{4E9548B2-D8FE-404B-82DC-2F1742F288D7}</b:Guid>
@@ -12337,7 +13336,7 @@
       </b:Author>
     </b:Author>
     <b:Month>05</b:Month>
-    <b:RefOrder>14</b:RefOrder>
+    <b:RefOrder>15</b:RefOrder>
   </b:Source>
   <b:Source>
     <b:Tag>Gos25</b:Tag>
@@ -12378,19 +13377,28 @@
     <b:RefOrder>11</b:RefOrder>
   </b:Source>
   <b:Source>
+    <b:Tag>Moj11</b:Tag>
+    <b:SourceType>Misc</b:SourceType>
+    <b:Guid>{89CEE5F7-8B56-417E-A80B-488A13E81E61}</b:Guid>
+    <b:Title>Minecraft</b:Title>
+    <b:Year>2011</b:Year>
+    <b:City>Stockholm</b:City>
+    <b:Author>
+      <b:Author>
+        <b:Corporate>Mojang</b:Corporate>
+      </b:Author>
+    </b:Author>
+    <b:RefOrder>14</b:RefOrder>
+  </b:Source>
+  <b:Source>
     <b:Tag>Ope18</b:Tag>
     <b:SourceType>InternetSite</b:SourceType>
-    <b:Guid>{B2432E8B-6466-4650-BC1A-E44EEEE83B86}</b:Guid>
+    <b:Guid>{7A8165E1-4080-4385-BDC6-B132F4C64503}</b:Guid>
     <b:Title>Euclidean vs Manhattan vs Chebyshev Distance</b:Title>
     <b:Year>2018</b:Year>
     <b:Author>
       <b:Author>
-        <b:NameList>
-          <b:Person>
-            <b:Last>IQ</b:Last>
-            <b:First>OpenGenus</b:First>
-          </b:Person>
-        </b:NameList>
+        <b:Corporate>OpenGenus IQ</b:Corporate>
       </b:Author>
     </b:Author>
     <b:YearAccessed>2025</b:YearAccessed>
@@ -12402,14 +13410,10 @@
   <b:Source>
     <b:Tag>Uni20</b:Tag>
     <b:SourceType>InternetSite</b:SourceType>
-    <b:Guid>{9C77ADB2-BF14-4021-8486-19591B0211B7}</b:Guid>
+    <b:Guid>{F4F8A85B-E27F-43DD-B7C7-B4CE23B4D719}</b:Guid>
     <b:Author>
       <b:Author>
-        <b:NameList>
-          <b:Person>
-            <b:Last>Unity</b:Last>
-          </b:Person>
-        </b:NameList>
+        <b:Corporate>Unity</b:Corporate>
       </b:Author>
     </b:Author>
     <b:Title>What are ML-Agents</b:Title>
@@ -12420,11 +13424,27 @@
     <b:URL>https://unity.com/glossary/ml-agents</b:URL>
     <b:RefOrder>13</b:RefOrder>
   </b:Source>
+  <b:Source>
+    <b:Tag>Wik26</b:Tag>
+    <b:SourceType>InternetSite</b:SourceType>
+    <b:Guid>{1180318A-ECEB-4831-BD31-635630D3F7F8}</b:Guid>
+    <b:Title>Perlin noise</b:Title>
+    <b:Author>
+      <b:Author>
+        <b:Corporate>Wikipedia</b:Corporate>
+      </b:Author>
+    </b:Author>
+    <b:YearAccessed>2026</b:YearAccessed>
+    <b:MonthAccessed>04</b:MonthAccessed>
+    <b:DayAccessed>18</b:DayAccessed>
+    <b:URL>https://en.wikipedia.org/wiki/Perlin_noise</b:URL>
+    <b:RefOrder>1</b:RefOrder>
+  </b:Source>
 </b:Sources>
 </file>
 
 <file path=customXml/itemProps1.xml><?xml version="1.0" encoding="utf-8"?>
-<ds:datastoreItem xmlns:ds="http://schemas.openxmlformats.org/officeDocument/2006/customXml" ds:itemID="{A4BF1837-2BF9-438F-8A12-DD0A3BA7FF8D}">
+<ds:datastoreItem xmlns:ds="http://schemas.openxmlformats.org/officeDocument/2006/customXml" ds:itemID="{EE39B349-738C-452E-9ACA-665CE3D7FD48}">
   <ds:schemaRefs>
     <ds:schemaRef ds:uri="http://schemas.openxmlformats.org/officeDocument/2006/bibliography"/>
   </ds:schemaRefs>

</xml_diff>

<commit_message>
feat: World generation implementation finished
</commit_message>
<xml_diff>
--- a/Report.docx
+++ b/Report.docx
@@ -321,7 +321,7 @@
         <w:pStyle w:val="Heading1"/>
       </w:pPr>
       <w:bookmarkStart w:id="1" w:name="_Toc40898999"/>
-      <w:bookmarkStart w:id="2" w:name="_Toc229075222"/>
+      <w:bookmarkStart w:id="2" w:name="_Toc229085741"/>
       <w:r>
         <w:lastRenderedPageBreak/>
         <w:t>Abstract</w:t>
@@ -369,7 +369,7 @@
         <w:spacing w:after="321"/>
         <w:ind w:left="-5"/>
       </w:pPr>
-      <w:bookmarkStart w:id="3" w:name="_Toc229075223"/>
+      <w:bookmarkStart w:id="3" w:name="_Toc229085742"/>
       <w:r>
         <w:lastRenderedPageBreak/>
         <w:t>Declaration</w:t>
@@ -491,7 +491,7 @@
         <w:ind w:left="-5"/>
       </w:pPr>
       <w:bookmarkStart w:id="4" w:name="_Toc40899001"/>
-      <w:bookmarkStart w:id="5" w:name="_Toc229075224"/>
+      <w:bookmarkStart w:id="5" w:name="_Toc229085743"/>
       <w:r>
         <w:lastRenderedPageBreak/>
         <w:t>Acknowledgements</w:t>
@@ -628,7 +628,7 @@
         <w:spacing w:line="259" w:lineRule="auto"/>
       </w:pPr>
     </w:p>
-    <w:bookmarkStart w:id="6" w:name="_Toc229075225" w:displacedByCustomXml="next"/>
+    <w:bookmarkStart w:id="6" w:name="_Toc229085744" w:displacedByCustomXml="next"/>
     <w:sdt>
       <w:sdtPr>
         <w:rPr>
@@ -686,7 +686,7 @@
           <w:r>
             <w:fldChar w:fldCharType="separate"/>
           </w:r>
-          <w:hyperlink w:anchor="_Toc229075222" w:history="1">
+          <w:hyperlink w:anchor="_Toc229085741" w:history="1">
             <w:r>
               <w:rPr>
                 <w:rStyle w:val="Hyperlink"/>
@@ -713,7 +713,7 @@
                 <w:noProof/>
                 <w:webHidden/>
               </w:rPr>
-              <w:instrText xml:space="preserve"> PAGEREF _Toc229075222 \h </w:instrText>
+              <w:instrText xml:space="preserve"> PAGEREF _Toc229085741 \h </w:instrText>
             </w:r>
             <w:r>
               <w:rPr>
@@ -760,7 +760,7 @@
               <w14:ligatures w14:val="standardContextual"/>
             </w:rPr>
           </w:pPr>
-          <w:hyperlink w:anchor="_Toc229075223" w:history="1">
+          <w:hyperlink w:anchor="_Toc229085742" w:history="1">
             <w:r>
               <w:rPr>
                 <w:rStyle w:val="Hyperlink"/>
@@ -787,7 +787,7 @@
                 <w:noProof/>
                 <w:webHidden/>
               </w:rPr>
-              <w:instrText xml:space="preserve"> PAGEREF _Toc229075223 \h </w:instrText>
+              <w:instrText xml:space="preserve"> PAGEREF _Toc229085742 \h </w:instrText>
             </w:r>
             <w:r>
               <w:rPr>
@@ -834,7 +834,7 @@
               <w14:ligatures w14:val="standardContextual"/>
             </w:rPr>
           </w:pPr>
-          <w:hyperlink w:anchor="_Toc229075224" w:history="1">
+          <w:hyperlink w:anchor="_Toc229085743" w:history="1">
             <w:r>
               <w:rPr>
                 <w:rStyle w:val="Hyperlink"/>
@@ -861,7 +861,7 @@
                 <w:noProof/>
                 <w:webHidden/>
               </w:rPr>
-              <w:instrText xml:space="preserve"> PAGEREF _Toc229075224 \h </w:instrText>
+              <w:instrText xml:space="preserve"> PAGEREF _Toc229085743 \h </w:instrText>
             </w:r>
             <w:r>
               <w:rPr>
@@ -908,7 +908,7 @@
               <w14:ligatures w14:val="standardContextual"/>
             </w:rPr>
           </w:pPr>
-          <w:hyperlink w:anchor="_Toc229075225" w:history="1">
+          <w:hyperlink w:anchor="_Toc229085744" w:history="1">
             <w:r>
               <w:rPr>
                 <w:rStyle w:val="Hyperlink"/>
@@ -935,7 +935,7 @@
                 <w:noProof/>
                 <w:webHidden/>
               </w:rPr>
-              <w:instrText xml:space="preserve"> PAGEREF _Toc229075225 \h </w:instrText>
+              <w:instrText xml:space="preserve"> PAGEREF _Toc229085744 \h </w:instrText>
             </w:r>
             <w:r>
               <w:rPr>
@@ -982,7 +982,7 @@
               <w14:ligatures w14:val="standardContextual"/>
             </w:rPr>
           </w:pPr>
-          <w:hyperlink w:anchor="_Toc229075226" w:history="1">
+          <w:hyperlink w:anchor="_Toc229085745" w:history="1">
             <w:r>
               <w:rPr>
                 <w:rStyle w:val="Hyperlink"/>
@@ -1009,7 +1009,7 @@
                 <w:noProof/>
                 <w:webHidden/>
               </w:rPr>
-              <w:instrText xml:space="preserve"> PAGEREF _Toc229075226 \h </w:instrText>
+              <w:instrText xml:space="preserve"> PAGEREF _Toc229085745 \h </w:instrText>
             </w:r>
             <w:r>
               <w:rPr>
@@ -1029,7 +1029,7 @@
                 <w:noProof/>
                 <w:webHidden/>
               </w:rPr>
-              <w:t>vi</w:t>
+              <w:t>vii</w:t>
             </w:r>
             <w:r>
               <w:rPr>
@@ -1056,7 +1056,7 @@
               <w14:ligatures w14:val="standardContextual"/>
             </w:rPr>
           </w:pPr>
-          <w:hyperlink w:anchor="_Toc229075227" w:history="1">
+          <w:hyperlink w:anchor="_Toc229085746" w:history="1">
             <w:r>
               <w:rPr>
                 <w:rStyle w:val="Hyperlink"/>
@@ -1083,7 +1083,7 @@
                 <w:noProof/>
                 <w:webHidden/>
               </w:rPr>
-              <w:instrText xml:space="preserve"> PAGEREF _Toc229075227 \h </w:instrText>
+              <w:instrText xml:space="preserve"> PAGEREF _Toc229085746 \h </w:instrText>
             </w:r>
             <w:r>
               <w:rPr>
@@ -1130,7 +1130,7 @@
               <w14:ligatures w14:val="standardContextual"/>
             </w:rPr>
           </w:pPr>
-          <w:hyperlink w:anchor="_Toc229075228" w:history="1">
+          <w:hyperlink w:anchor="_Toc229085747" w:history="1">
             <w:r>
               <w:rPr>
                 <w:rStyle w:val="Hyperlink"/>
@@ -1157,7 +1157,7 @@
                 <w:noProof/>
                 <w:webHidden/>
               </w:rPr>
-              <w:instrText xml:space="preserve"> PAGEREF _Toc229075228 \h </w:instrText>
+              <w:instrText xml:space="preserve"> PAGEREF _Toc229085747 \h </w:instrText>
             </w:r>
             <w:r>
               <w:rPr>
@@ -1204,7 +1204,7 @@
               <w14:ligatures w14:val="standardContextual"/>
             </w:rPr>
           </w:pPr>
-          <w:hyperlink w:anchor="_Toc229075229" w:history="1">
+          <w:hyperlink w:anchor="_Toc229085748" w:history="1">
             <w:r>
               <w:rPr>
                 <w:rStyle w:val="Hyperlink"/>
@@ -1231,7 +1231,7 @@
                 <w:noProof/>
                 <w:webHidden/>
               </w:rPr>
-              <w:instrText xml:space="preserve"> PAGEREF _Toc229075229 \h </w:instrText>
+              <w:instrText xml:space="preserve"> PAGEREF _Toc229085748 \h </w:instrText>
             </w:r>
             <w:r>
               <w:rPr>
@@ -1278,7 +1278,7 @@
               <w14:ligatures w14:val="standardContextual"/>
             </w:rPr>
           </w:pPr>
-          <w:hyperlink w:anchor="_Toc229075230" w:history="1">
+          <w:hyperlink w:anchor="_Toc229085749" w:history="1">
             <w:r>
               <w:rPr>
                 <w:rStyle w:val="Hyperlink"/>
@@ -1305,7 +1305,7 @@
                 <w:noProof/>
                 <w:webHidden/>
               </w:rPr>
-              <w:instrText xml:space="preserve"> PAGEREF _Toc229075230 \h </w:instrText>
+              <w:instrText xml:space="preserve"> PAGEREF _Toc229085749 \h </w:instrText>
             </w:r>
             <w:r>
               <w:rPr>
@@ -1352,7 +1352,7 @@
               <w14:ligatures w14:val="standardContextual"/>
             </w:rPr>
           </w:pPr>
-          <w:hyperlink w:anchor="_Toc229075231" w:history="1">
+          <w:hyperlink w:anchor="_Toc229085750" w:history="1">
             <w:r>
               <w:rPr>
                 <w:rStyle w:val="Hyperlink"/>
@@ -1379,7 +1379,7 @@
                 <w:noProof/>
                 <w:webHidden/>
               </w:rPr>
-              <w:instrText xml:space="preserve"> PAGEREF _Toc229075231 \h </w:instrText>
+              <w:instrText xml:space="preserve"> PAGEREF _Toc229085750 \h </w:instrText>
             </w:r>
             <w:r>
               <w:rPr>
@@ -1426,7 +1426,7 @@
               <w14:ligatures w14:val="standardContextual"/>
             </w:rPr>
           </w:pPr>
-          <w:hyperlink w:anchor="_Toc229075232" w:history="1">
+          <w:hyperlink w:anchor="_Toc229085751" w:history="1">
             <w:r>
               <w:rPr>
                 <w:rStyle w:val="Hyperlink"/>
@@ -1453,7 +1453,7 @@
                 <w:noProof/>
                 <w:webHidden/>
               </w:rPr>
-              <w:instrText xml:space="preserve"> PAGEREF _Toc229075232 \h </w:instrText>
+              <w:instrText xml:space="preserve"> PAGEREF _Toc229085751 \h </w:instrText>
             </w:r>
             <w:r>
               <w:rPr>
@@ -1500,7 +1500,7 @@
               <w14:ligatures w14:val="standardContextual"/>
             </w:rPr>
           </w:pPr>
-          <w:hyperlink w:anchor="_Toc229075233" w:history="1">
+          <w:hyperlink w:anchor="_Toc229085752" w:history="1">
             <w:r>
               <w:rPr>
                 <w:rStyle w:val="Hyperlink"/>
@@ -1527,7 +1527,7 @@
                 <w:noProof/>
                 <w:webHidden/>
               </w:rPr>
-              <w:instrText xml:space="preserve"> PAGEREF _Toc229075233 \h </w:instrText>
+              <w:instrText xml:space="preserve"> PAGEREF _Toc229085752 \h </w:instrText>
             </w:r>
             <w:r>
               <w:rPr>
@@ -1574,7 +1574,7 @@
               <w14:ligatures w14:val="standardContextual"/>
             </w:rPr>
           </w:pPr>
-          <w:hyperlink w:anchor="_Toc229075234" w:history="1">
+          <w:hyperlink w:anchor="_Toc229085753" w:history="1">
             <w:r>
               <w:rPr>
                 <w:rStyle w:val="Hyperlink"/>
@@ -1601,7 +1601,7 @@
                 <w:noProof/>
                 <w:webHidden/>
               </w:rPr>
-              <w:instrText xml:space="preserve"> PAGEREF _Toc229075234 \h </w:instrText>
+              <w:instrText xml:space="preserve"> PAGEREF _Toc229085753 \h </w:instrText>
             </w:r>
             <w:r>
               <w:rPr>
@@ -1648,7 +1648,7 @@
               <w14:ligatures w14:val="standardContextual"/>
             </w:rPr>
           </w:pPr>
-          <w:hyperlink w:anchor="_Toc229075235" w:history="1">
+          <w:hyperlink w:anchor="_Toc229085754" w:history="1">
             <w:r>
               <w:rPr>
                 <w:rStyle w:val="Hyperlink"/>
@@ -1675,7 +1675,7 @@
                 <w:noProof/>
                 <w:webHidden/>
               </w:rPr>
-              <w:instrText xml:space="preserve"> PAGEREF _Toc229075235 \h </w:instrText>
+              <w:instrText xml:space="preserve"> PAGEREF _Toc229085754 \h </w:instrText>
             </w:r>
             <w:r>
               <w:rPr>
@@ -1722,7 +1722,7 @@
               <w14:ligatures w14:val="standardContextual"/>
             </w:rPr>
           </w:pPr>
-          <w:hyperlink w:anchor="_Toc229075236" w:history="1">
+          <w:hyperlink w:anchor="_Toc229085755" w:history="1">
             <w:r>
               <w:rPr>
                 <w:rStyle w:val="Hyperlink"/>
@@ -1749,7 +1749,7 @@
                 <w:noProof/>
                 <w:webHidden/>
               </w:rPr>
-              <w:instrText xml:space="preserve"> PAGEREF _Toc229075236 \h </w:instrText>
+              <w:instrText xml:space="preserve"> PAGEREF _Toc229085755 \h </w:instrText>
             </w:r>
             <w:r>
               <w:rPr>
@@ -1796,7 +1796,7 @@
               <w14:ligatures w14:val="standardContextual"/>
             </w:rPr>
           </w:pPr>
-          <w:hyperlink w:anchor="_Toc229075237" w:history="1">
+          <w:hyperlink w:anchor="_Toc229085756" w:history="1">
             <w:r>
               <w:rPr>
                 <w:rStyle w:val="Hyperlink"/>
@@ -1823,7 +1823,7 @@
                 <w:noProof/>
                 <w:webHidden/>
               </w:rPr>
-              <w:instrText xml:space="preserve"> PAGEREF _Toc229075237 \h </w:instrText>
+              <w:instrText xml:space="preserve"> PAGEREF _Toc229085756 \h </w:instrText>
             </w:r>
             <w:r>
               <w:rPr>
@@ -1870,7 +1870,7 @@
               <w14:ligatures w14:val="standardContextual"/>
             </w:rPr>
           </w:pPr>
-          <w:hyperlink w:anchor="_Toc229075238" w:history="1">
+          <w:hyperlink w:anchor="_Toc229085757" w:history="1">
             <w:r>
               <w:rPr>
                 <w:rStyle w:val="Hyperlink"/>
@@ -1897,7 +1897,7 @@
                 <w:noProof/>
                 <w:webHidden/>
               </w:rPr>
-              <w:instrText xml:space="preserve"> PAGEREF _Toc229075238 \h </w:instrText>
+              <w:instrText xml:space="preserve"> PAGEREF _Toc229085757 \h </w:instrText>
             </w:r>
             <w:r>
               <w:rPr>
@@ -1944,7 +1944,7 @@
               <w14:ligatures w14:val="standardContextual"/>
             </w:rPr>
           </w:pPr>
-          <w:hyperlink w:anchor="_Toc229075239" w:history="1">
+          <w:hyperlink w:anchor="_Toc229085758" w:history="1">
             <w:r>
               <w:rPr>
                 <w:rStyle w:val="Hyperlink"/>
@@ -1971,7 +1971,7 @@
                 <w:noProof/>
                 <w:webHidden/>
               </w:rPr>
-              <w:instrText xml:space="preserve"> PAGEREF _Toc229075239 \h </w:instrText>
+              <w:instrText xml:space="preserve"> PAGEREF _Toc229085758 \h </w:instrText>
             </w:r>
             <w:r>
               <w:rPr>
@@ -2018,7 +2018,7 @@
               <w14:ligatures w14:val="standardContextual"/>
             </w:rPr>
           </w:pPr>
-          <w:hyperlink w:anchor="_Toc229075240" w:history="1">
+          <w:hyperlink w:anchor="_Toc229085759" w:history="1">
             <w:r>
               <w:rPr>
                 <w:rStyle w:val="Hyperlink"/>
@@ -2045,7 +2045,7 @@
                 <w:noProof/>
                 <w:webHidden/>
               </w:rPr>
-              <w:instrText xml:space="preserve"> PAGEREF _Toc229075240 \h </w:instrText>
+              <w:instrText xml:space="preserve"> PAGEREF _Toc229085759 \h </w:instrText>
             </w:r>
             <w:r>
               <w:rPr>
@@ -2092,7 +2092,7 @@
               <w14:ligatures w14:val="standardContextual"/>
             </w:rPr>
           </w:pPr>
-          <w:hyperlink w:anchor="_Toc229075241" w:history="1">
+          <w:hyperlink w:anchor="_Toc229085760" w:history="1">
             <w:r>
               <w:rPr>
                 <w:rStyle w:val="Hyperlink"/>
@@ -2119,7 +2119,7 @@
                 <w:noProof/>
                 <w:webHidden/>
               </w:rPr>
-              <w:instrText xml:space="preserve"> PAGEREF _Toc229075241 \h </w:instrText>
+              <w:instrText xml:space="preserve"> PAGEREF _Toc229085760 \h </w:instrText>
             </w:r>
             <w:r>
               <w:rPr>
@@ -2162,7 +2162,7 @@
               <w:lang w:eastAsia="en-GB"/>
             </w:rPr>
           </w:pPr>
-          <w:hyperlink w:anchor="_Toc229075242" w:history="1">
+          <w:hyperlink w:anchor="_Toc229085761" w:history="1">
             <w:r>
               <w:rPr>
                 <w:rStyle w:val="Hyperlink"/>
@@ -2189,7 +2189,7 @@
                 <w:noProof/>
                 <w:webHidden/>
               </w:rPr>
-              <w:instrText xml:space="preserve"> PAGEREF _Toc229075242 \h </w:instrText>
+              <w:instrText xml:space="preserve"> PAGEREF _Toc229085761 \h </w:instrText>
             </w:r>
             <w:r>
               <w:rPr>
@@ -2232,7 +2232,7 @@
               <w:lang w:eastAsia="en-GB"/>
             </w:rPr>
           </w:pPr>
-          <w:hyperlink w:anchor="_Toc229075243" w:history="1">
+          <w:hyperlink w:anchor="_Toc229085762" w:history="1">
             <w:r>
               <w:rPr>
                 <w:rStyle w:val="Hyperlink"/>
@@ -2259,7 +2259,7 @@
                 <w:noProof/>
                 <w:webHidden/>
               </w:rPr>
-              <w:instrText xml:space="preserve"> PAGEREF _Toc229075243 \h </w:instrText>
+              <w:instrText xml:space="preserve"> PAGEREF _Toc229085762 \h </w:instrText>
             </w:r>
             <w:r>
               <w:rPr>
@@ -2302,7 +2302,7 @@
               <w:lang w:eastAsia="en-GB"/>
             </w:rPr>
           </w:pPr>
-          <w:hyperlink w:anchor="_Toc229075244" w:history="1">
+          <w:hyperlink w:anchor="_Toc229085763" w:history="1">
             <w:r>
               <w:rPr>
                 <w:rStyle w:val="Hyperlink"/>
@@ -2329,7 +2329,7 @@
                 <w:noProof/>
                 <w:webHidden/>
               </w:rPr>
-              <w:instrText xml:space="preserve"> PAGEREF _Toc229075244 \h </w:instrText>
+              <w:instrText xml:space="preserve"> PAGEREF _Toc229085763 \h </w:instrText>
             </w:r>
             <w:r>
               <w:rPr>
@@ -2376,7 +2376,7 @@
               <w14:ligatures w14:val="standardContextual"/>
             </w:rPr>
           </w:pPr>
-          <w:hyperlink w:anchor="_Toc229075245" w:history="1">
+          <w:hyperlink w:anchor="_Toc229085764" w:history="1">
             <w:r>
               <w:rPr>
                 <w:rStyle w:val="Hyperlink"/>
@@ -2403,7 +2403,7 @@
                 <w:noProof/>
                 <w:webHidden/>
               </w:rPr>
-              <w:instrText xml:space="preserve"> PAGEREF _Toc229075245 \h </w:instrText>
+              <w:instrText xml:space="preserve"> PAGEREF _Toc229085764 \h </w:instrText>
             </w:r>
             <w:r>
               <w:rPr>
@@ -2446,7 +2446,7 @@
               <w:lang w:eastAsia="en-GB"/>
             </w:rPr>
           </w:pPr>
-          <w:hyperlink w:anchor="_Toc229075246" w:history="1">
+          <w:hyperlink w:anchor="_Toc229085765" w:history="1">
             <w:r>
               <w:rPr>
                 <w:rStyle w:val="Hyperlink"/>
@@ -2473,7 +2473,7 @@
                 <w:noProof/>
                 <w:webHidden/>
               </w:rPr>
-              <w:instrText xml:space="preserve"> PAGEREF _Toc229075246 \h </w:instrText>
+              <w:instrText xml:space="preserve"> PAGEREF _Toc229085765 \h </w:instrText>
             </w:r>
             <w:r>
               <w:rPr>
@@ -2516,7 +2516,7 @@
               <w:lang w:eastAsia="en-GB"/>
             </w:rPr>
           </w:pPr>
-          <w:hyperlink w:anchor="_Toc229075247" w:history="1">
+          <w:hyperlink w:anchor="_Toc229085766" w:history="1">
             <w:r>
               <w:rPr>
                 <w:rStyle w:val="Hyperlink"/>
@@ -2543,7 +2543,7 @@
                 <w:noProof/>
                 <w:webHidden/>
               </w:rPr>
-              <w:instrText xml:space="preserve"> PAGEREF _Toc229075247 \h </w:instrText>
+              <w:instrText xml:space="preserve"> PAGEREF _Toc229085766 \h </w:instrText>
             </w:r>
             <w:r>
               <w:rPr>
@@ -2586,7 +2586,7 @@
               <w:lang w:eastAsia="en-GB"/>
             </w:rPr>
           </w:pPr>
-          <w:hyperlink w:anchor="_Toc229075248" w:history="1">
+          <w:hyperlink w:anchor="_Toc229085767" w:history="1">
             <w:r>
               <w:rPr>
                 <w:rStyle w:val="Hyperlink"/>
@@ -2613,7 +2613,7 @@
                 <w:noProof/>
                 <w:webHidden/>
               </w:rPr>
-              <w:instrText xml:space="preserve"> PAGEREF _Toc229075248 \h </w:instrText>
+              <w:instrText xml:space="preserve"> PAGEREF _Toc229085767 \h </w:instrText>
             </w:r>
             <w:r>
               <w:rPr>
@@ -2660,7 +2660,7 @@
               <w14:ligatures w14:val="standardContextual"/>
             </w:rPr>
           </w:pPr>
-          <w:hyperlink w:anchor="_Toc229075249" w:history="1">
+          <w:hyperlink w:anchor="_Toc229085768" w:history="1">
             <w:r>
               <w:rPr>
                 <w:rStyle w:val="Hyperlink"/>
@@ -2687,7 +2687,7 @@
                 <w:noProof/>
                 <w:webHidden/>
               </w:rPr>
-              <w:instrText xml:space="preserve"> PAGEREF _Toc229075249 \h </w:instrText>
+              <w:instrText xml:space="preserve"> PAGEREF _Toc229085768 \h </w:instrText>
             </w:r>
             <w:r>
               <w:rPr>
@@ -2730,7 +2730,7 @@
               <w:lang w:eastAsia="en-GB"/>
             </w:rPr>
           </w:pPr>
-          <w:hyperlink w:anchor="_Toc229075250" w:history="1">
+          <w:hyperlink w:anchor="_Toc229085769" w:history="1">
             <w:r>
               <w:rPr>
                 <w:rStyle w:val="Hyperlink"/>
@@ -2757,7 +2757,7 @@
                 <w:noProof/>
                 <w:webHidden/>
               </w:rPr>
-              <w:instrText xml:space="preserve"> PAGEREF _Toc229075250 \h </w:instrText>
+              <w:instrText xml:space="preserve"> PAGEREF _Toc229085769 \h </w:instrText>
             </w:r>
             <w:r>
               <w:rPr>
@@ -2800,7 +2800,7 @@
               <w:lang w:eastAsia="en-GB"/>
             </w:rPr>
           </w:pPr>
-          <w:hyperlink w:anchor="_Toc229075251" w:history="1">
+          <w:hyperlink w:anchor="_Toc229085770" w:history="1">
             <w:r>
               <w:rPr>
                 <w:rStyle w:val="Hyperlink"/>
@@ -2827,7 +2827,7 @@
                 <w:noProof/>
                 <w:webHidden/>
               </w:rPr>
-              <w:instrText xml:space="preserve"> PAGEREF _Toc229075251 \h </w:instrText>
+              <w:instrText xml:space="preserve"> PAGEREF _Toc229085770 \h </w:instrText>
             </w:r>
             <w:r>
               <w:rPr>
@@ -2870,7 +2870,7 @@
               <w:lang w:eastAsia="en-GB"/>
             </w:rPr>
           </w:pPr>
-          <w:hyperlink w:anchor="_Toc229075252" w:history="1">
+          <w:hyperlink w:anchor="_Toc229085771" w:history="1">
             <w:r>
               <w:rPr>
                 <w:rStyle w:val="Hyperlink"/>
@@ -2897,7 +2897,7 @@
                 <w:noProof/>
                 <w:webHidden/>
               </w:rPr>
-              <w:instrText xml:space="preserve"> PAGEREF _Toc229075252 \h </w:instrText>
+              <w:instrText xml:space="preserve"> PAGEREF _Toc229085771 \h </w:instrText>
             </w:r>
             <w:r>
               <w:rPr>
@@ -2944,7 +2944,7 @@
               <w14:ligatures w14:val="standardContextual"/>
             </w:rPr>
           </w:pPr>
-          <w:hyperlink w:anchor="_Toc229075253" w:history="1">
+          <w:hyperlink w:anchor="_Toc229085772" w:history="1">
             <w:r>
               <w:rPr>
                 <w:rStyle w:val="Hyperlink"/>
@@ -2971,7 +2971,7 @@
                 <w:noProof/>
                 <w:webHidden/>
               </w:rPr>
-              <w:instrText xml:space="preserve"> PAGEREF _Toc229075253 \h </w:instrText>
+              <w:instrText xml:space="preserve"> PAGEREF _Toc229085772 \h </w:instrText>
             </w:r>
             <w:r>
               <w:rPr>
@@ -2991,7 +2991,7 @@
                 <w:noProof/>
                 <w:webHidden/>
               </w:rPr>
-              <w:t>9</w:t>
+              <w:t>10</w:t>
             </w:r>
             <w:r>
               <w:rPr>
@@ -3018,7 +3018,7 @@
               <w14:ligatures w14:val="standardContextual"/>
             </w:rPr>
           </w:pPr>
-          <w:hyperlink w:anchor="_Toc229075254" w:history="1">
+          <w:hyperlink w:anchor="_Toc229085773" w:history="1">
             <w:r>
               <w:rPr>
                 <w:rStyle w:val="Hyperlink"/>
@@ -3045,7 +3045,7 @@
                 <w:noProof/>
                 <w:webHidden/>
               </w:rPr>
-              <w:instrText xml:space="preserve"> PAGEREF _Toc229075254 \h </w:instrText>
+              <w:instrText xml:space="preserve"> PAGEREF _Toc229085773 \h </w:instrText>
             </w:r>
             <w:r>
               <w:rPr>
@@ -3065,7 +3065,7 @@
                 <w:noProof/>
                 <w:webHidden/>
               </w:rPr>
-              <w:t>9</w:t>
+              <w:t>10</w:t>
             </w:r>
             <w:r>
               <w:rPr>
@@ -3092,7 +3092,7 @@
               <w14:ligatures w14:val="standardContextual"/>
             </w:rPr>
           </w:pPr>
-          <w:hyperlink w:anchor="_Toc229075255" w:history="1">
+          <w:hyperlink w:anchor="_Toc229085774" w:history="1">
             <w:r>
               <w:rPr>
                 <w:rStyle w:val="Hyperlink"/>
@@ -3119,7 +3119,7 @@
                 <w:noProof/>
                 <w:webHidden/>
               </w:rPr>
-              <w:instrText xml:space="preserve"> PAGEREF _Toc229075255 \h </w:instrText>
+              <w:instrText xml:space="preserve"> PAGEREF _Toc229085774 \h </w:instrText>
             </w:r>
             <w:r>
               <w:rPr>
@@ -3166,7 +3166,7 @@
               <w14:ligatures w14:val="standardContextual"/>
             </w:rPr>
           </w:pPr>
-          <w:hyperlink w:anchor="_Toc229075256" w:history="1">
+          <w:hyperlink w:anchor="_Toc229085775" w:history="1">
             <w:r>
               <w:rPr>
                 <w:rStyle w:val="Hyperlink"/>
@@ -3193,7 +3193,7 @@
                 <w:noProof/>
                 <w:webHidden/>
               </w:rPr>
-              <w:instrText xml:space="preserve"> PAGEREF _Toc229075256 \h </w:instrText>
+              <w:instrText xml:space="preserve"> PAGEREF _Toc229085775 \h </w:instrText>
             </w:r>
             <w:r>
               <w:rPr>
@@ -3240,7 +3240,7 @@
               <w14:ligatures w14:val="standardContextual"/>
             </w:rPr>
           </w:pPr>
-          <w:hyperlink w:anchor="_Toc229075257" w:history="1">
+          <w:hyperlink w:anchor="_Toc229085776" w:history="1">
             <w:r>
               <w:rPr>
                 <w:rStyle w:val="Hyperlink"/>
@@ -3267,7 +3267,7 @@
                 <w:noProof/>
                 <w:webHidden/>
               </w:rPr>
-              <w:instrText xml:space="preserve"> PAGEREF _Toc229075257 \h </w:instrText>
+              <w:instrText xml:space="preserve"> PAGEREF _Toc229085776 \h </w:instrText>
             </w:r>
             <w:r>
               <w:rPr>
@@ -3314,7 +3314,7 @@
               <w14:ligatures w14:val="standardContextual"/>
             </w:rPr>
           </w:pPr>
-          <w:hyperlink w:anchor="_Toc229075258" w:history="1">
+          <w:hyperlink w:anchor="_Toc229085777" w:history="1">
             <w:r>
               <w:rPr>
                 <w:rStyle w:val="Hyperlink"/>
@@ -3341,7 +3341,7 @@
                 <w:noProof/>
                 <w:webHidden/>
               </w:rPr>
-              <w:instrText xml:space="preserve"> PAGEREF _Toc229075258 \h </w:instrText>
+              <w:instrText xml:space="preserve"> PAGEREF _Toc229085777 \h </w:instrText>
             </w:r>
             <w:r>
               <w:rPr>
@@ -3388,7 +3388,7 @@
               <w14:ligatures w14:val="standardContextual"/>
             </w:rPr>
           </w:pPr>
-          <w:hyperlink w:anchor="_Toc229075259" w:history="1">
+          <w:hyperlink w:anchor="_Toc229085778" w:history="1">
             <w:r>
               <w:rPr>
                 <w:rStyle w:val="Hyperlink"/>
@@ -3415,7 +3415,7 @@
                 <w:noProof/>
                 <w:webHidden/>
               </w:rPr>
-              <w:instrText xml:space="preserve"> PAGEREF _Toc229075259 \h </w:instrText>
+              <w:instrText xml:space="preserve"> PAGEREF _Toc229085778 \h </w:instrText>
             </w:r>
             <w:r>
               <w:rPr>
@@ -3435,7 +3435,7 @@
                 <w:noProof/>
                 <w:webHidden/>
               </w:rPr>
-              <w:t>12</w:t>
+              <w:t>13</w:t>
             </w:r>
             <w:r>
               <w:rPr>
@@ -3462,7 +3462,7 @@
               <w14:ligatures w14:val="standardContextual"/>
             </w:rPr>
           </w:pPr>
-          <w:hyperlink w:anchor="_Toc229075260" w:history="1">
+          <w:hyperlink w:anchor="_Toc229085779" w:history="1">
             <w:r>
               <w:rPr>
                 <w:rStyle w:val="Hyperlink"/>
@@ -3489,7 +3489,7 @@
                 <w:noProof/>
                 <w:webHidden/>
               </w:rPr>
-              <w:instrText xml:space="preserve"> PAGEREF _Toc229075260 \h </w:instrText>
+              <w:instrText xml:space="preserve"> PAGEREF _Toc229085779 \h </w:instrText>
             </w:r>
             <w:r>
               <w:rPr>
@@ -3536,7 +3536,7 @@
               <w14:ligatures w14:val="standardContextual"/>
             </w:rPr>
           </w:pPr>
-          <w:hyperlink w:anchor="_Toc229075261" w:history="1">
+          <w:hyperlink w:anchor="_Toc229085780" w:history="1">
             <w:r>
               <w:rPr>
                 <w:rStyle w:val="Hyperlink"/>
@@ -3563,7 +3563,7 @@
                 <w:noProof/>
                 <w:webHidden/>
               </w:rPr>
-              <w:instrText xml:space="preserve"> PAGEREF _Toc229075261 \h </w:instrText>
+              <w:instrText xml:space="preserve"> PAGEREF _Toc229085780 \h </w:instrText>
             </w:r>
             <w:r>
               <w:rPr>
@@ -3610,7 +3610,7 @@
               <w14:ligatures w14:val="standardContextual"/>
             </w:rPr>
           </w:pPr>
-          <w:hyperlink w:anchor="_Toc229075262" w:history="1">
+          <w:hyperlink w:anchor="_Toc229085781" w:history="1">
             <w:r>
               <w:rPr>
                 <w:rStyle w:val="Hyperlink"/>
@@ -3637,7 +3637,7 @@
                 <w:noProof/>
                 <w:webHidden/>
               </w:rPr>
-              <w:instrText xml:space="preserve"> PAGEREF _Toc229075262 \h </w:instrText>
+              <w:instrText xml:space="preserve"> PAGEREF _Toc229085781 \h </w:instrText>
             </w:r>
             <w:r>
               <w:rPr>
@@ -3657,7 +3657,7 @@
                 <w:noProof/>
                 <w:webHidden/>
               </w:rPr>
-              <w:t>13</w:t>
+              <w:t>14</w:t>
             </w:r>
             <w:r>
               <w:rPr>
@@ -3684,7 +3684,7 @@
               <w14:ligatures w14:val="standardContextual"/>
             </w:rPr>
           </w:pPr>
-          <w:hyperlink w:anchor="_Toc229075263" w:history="1">
+          <w:hyperlink w:anchor="_Toc229085782" w:history="1">
             <w:r>
               <w:rPr>
                 <w:rStyle w:val="Hyperlink"/>
@@ -3711,7 +3711,7 @@
                 <w:noProof/>
                 <w:webHidden/>
               </w:rPr>
-              <w:instrText xml:space="preserve"> PAGEREF _Toc229075263 \h </w:instrText>
+              <w:instrText xml:space="preserve"> PAGEREF _Toc229085782 \h </w:instrText>
             </w:r>
             <w:r>
               <w:rPr>
@@ -3731,7 +3731,7 @@
                 <w:noProof/>
                 <w:webHidden/>
               </w:rPr>
-              <w:t>14</w:t>
+              <w:t>15</w:t>
             </w:r>
             <w:r>
               <w:rPr>
@@ -3758,7 +3758,7 @@
               <w14:ligatures w14:val="standardContextual"/>
             </w:rPr>
           </w:pPr>
-          <w:hyperlink w:anchor="_Toc229075264" w:history="1">
+          <w:hyperlink w:anchor="_Toc229085783" w:history="1">
             <w:r>
               <w:rPr>
                 <w:rStyle w:val="Hyperlink"/>
@@ -3785,7 +3785,7 @@
                 <w:noProof/>
                 <w:webHidden/>
               </w:rPr>
-              <w:instrText xml:space="preserve"> PAGEREF _Toc229075264 \h </w:instrText>
+              <w:instrText xml:space="preserve"> PAGEREF _Toc229085783 \h </w:instrText>
             </w:r>
             <w:r>
               <w:rPr>
@@ -3832,7 +3832,7 @@
               <w14:ligatures w14:val="standardContextual"/>
             </w:rPr>
           </w:pPr>
-          <w:hyperlink w:anchor="_Toc229075265" w:history="1">
+          <w:hyperlink w:anchor="_Toc229085784" w:history="1">
             <w:r>
               <w:rPr>
                 <w:rStyle w:val="Hyperlink"/>
@@ -3859,7 +3859,7 @@
                 <w:noProof/>
                 <w:webHidden/>
               </w:rPr>
-              <w:instrText xml:space="preserve"> PAGEREF _Toc229075265 \h </w:instrText>
+              <w:instrText xml:space="preserve"> PAGEREF _Toc229085784 \h </w:instrText>
             </w:r>
             <w:r>
               <w:rPr>
@@ -3906,7 +3906,7 @@
               <w14:ligatures w14:val="standardContextual"/>
             </w:rPr>
           </w:pPr>
-          <w:hyperlink w:anchor="_Toc229075266" w:history="1">
+          <w:hyperlink w:anchor="_Toc229085785" w:history="1">
             <w:r>
               <w:rPr>
                 <w:rStyle w:val="Hyperlink"/>
@@ -3933,7 +3933,7 @@
                 <w:noProof/>
                 <w:webHidden/>
               </w:rPr>
-              <w:instrText xml:space="preserve"> PAGEREF _Toc229075266 \h </w:instrText>
+              <w:instrText xml:space="preserve"> PAGEREF _Toc229085785 \h </w:instrText>
             </w:r>
             <w:r>
               <w:rPr>
@@ -3953,7 +3953,7 @@
                 <w:noProof/>
                 <w:webHidden/>
               </w:rPr>
-              <w:t>15</w:t>
+              <w:t>16</w:t>
             </w:r>
             <w:r>
               <w:rPr>
@@ -3980,7 +3980,7 @@
               <w14:ligatures w14:val="standardContextual"/>
             </w:rPr>
           </w:pPr>
-          <w:hyperlink w:anchor="_Toc229075267" w:history="1">
+          <w:hyperlink w:anchor="_Toc229085786" w:history="1">
             <w:r>
               <w:rPr>
                 <w:rStyle w:val="Hyperlink"/>
@@ -4007,7 +4007,7 @@
                 <w:noProof/>
                 <w:webHidden/>
               </w:rPr>
-              <w:instrText xml:space="preserve"> PAGEREF _Toc229075267 \h </w:instrText>
+              <w:instrText xml:space="preserve"> PAGEREF _Toc229085786 \h </w:instrText>
             </w:r>
             <w:r>
               <w:rPr>
@@ -4054,7 +4054,7 @@
               <w14:ligatures w14:val="standardContextual"/>
             </w:rPr>
           </w:pPr>
-          <w:hyperlink w:anchor="_Toc229075268" w:history="1">
+          <w:hyperlink w:anchor="_Toc229085787" w:history="1">
             <w:r>
               <w:rPr>
                 <w:rStyle w:val="Hyperlink"/>
@@ -4081,7 +4081,7 @@
                 <w:noProof/>
                 <w:webHidden/>
               </w:rPr>
-              <w:instrText xml:space="preserve"> PAGEREF _Toc229075268 \h </w:instrText>
+              <w:instrText xml:space="preserve"> PAGEREF _Toc229085787 \h </w:instrText>
             </w:r>
             <w:r>
               <w:rPr>
@@ -4101,7 +4101,7 @@
                 <w:noProof/>
                 <w:webHidden/>
               </w:rPr>
-              <w:t>16</w:t>
+              <w:t>17</w:t>
             </w:r>
             <w:r>
               <w:rPr>
@@ -4128,7 +4128,7 @@
               <w14:ligatures w14:val="standardContextual"/>
             </w:rPr>
           </w:pPr>
-          <w:hyperlink w:anchor="_Toc229075269" w:history="1">
+          <w:hyperlink w:anchor="_Toc229085788" w:history="1">
             <w:r>
               <w:rPr>
                 <w:rStyle w:val="Hyperlink"/>
@@ -4155,7 +4155,7 @@
                 <w:noProof/>
                 <w:webHidden/>
               </w:rPr>
-              <w:instrText xml:space="preserve"> PAGEREF _Toc229075269 \h </w:instrText>
+              <w:instrText xml:space="preserve"> PAGEREF _Toc229085788 \h </w:instrText>
             </w:r>
             <w:r>
               <w:rPr>
@@ -4175,7 +4175,7 @@
                 <w:noProof/>
                 <w:webHidden/>
               </w:rPr>
-              <w:t>16</w:t>
+              <w:t>17</w:t>
             </w:r>
             <w:r>
               <w:rPr>
@@ -4202,7 +4202,7 @@
               <w14:ligatures w14:val="standardContextual"/>
             </w:rPr>
           </w:pPr>
-          <w:hyperlink w:anchor="_Toc229075270" w:history="1">
+          <w:hyperlink w:anchor="_Toc229085789" w:history="1">
             <w:r>
               <w:rPr>
                 <w:rStyle w:val="Hyperlink"/>
@@ -4229,7 +4229,7 @@
                 <w:noProof/>
                 <w:webHidden/>
               </w:rPr>
-              <w:instrText xml:space="preserve"> PAGEREF _Toc229075270 \h </w:instrText>
+              <w:instrText xml:space="preserve"> PAGEREF _Toc229085789 \h </w:instrText>
             </w:r>
             <w:r>
               <w:rPr>
@@ -4249,7 +4249,7 @@
                 <w:noProof/>
                 <w:webHidden/>
               </w:rPr>
-              <w:t>16</w:t>
+              <w:t>17</w:t>
             </w:r>
             <w:r>
               <w:rPr>
@@ -4276,7 +4276,7 @@
               <w14:ligatures w14:val="standardContextual"/>
             </w:rPr>
           </w:pPr>
-          <w:hyperlink w:anchor="_Toc229075271" w:history="1">
+          <w:hyperlink w:anchor="_Toc229085790" w:history="1">
             <w:r>
               <w:rPr>
                 <w:rStyle w:val="Hyperlink"/>
@@ -4303,7 +4303,7 @@
                 <w:noProof/>
                 <w:webHidden/>
               </w:rPr>
-              <w:instrText xml:space="preserve"> PAGEREF _Toc229075271 \h </w:instrText>
+              <w:instrText xml:space="preserve"> PAGEREF _Toc229085790 \h </w:instrText>
             </w:r>
             <w:r>
               <w:rPr>
@@ -4323,7 +4323,81 @@
                 <w:noProof/>
                 <w:webHidden/>
               </w:rPr>
-              <w:t>18</w:t>
+              <w:t>19</w:t>
+            </w:r>
+            <w:r>
+              <w:rPr>
+                <w:noProof/>
+                <w:webHidden/>
+              </w:rPr>
+              <w:fldChar w:fldCharType="end"/>
+            </w:r>
+          </w:hyperlink>
+        </w:p>
+        <w:p>
+          <w:pPr>
+            <w:pStyle w:val="TOC3"/>
+            <w:tabs>
+              <w:tab w:val="right" w:leader="dot" w:pos="9016"/>
+            </w:tabs>
+            <w:rPr>
+              <w:rFonts w:asciiTheme="minorHAnsi" w:hAnsiTheme="minorHAnsi" w:cstheme="minorBidi"/>
+              <w:noProof/>
+              <w:kern w:val="2"/>
+              <w:sz w:val="24"/>
+              <w:szCs w:val="24"/>
+              <w:lang w:val="en-GB" w:eastAsia="en-GB"/>
+              <w14:ligatures w14:val="standardContextual"/>
+            </w:rPr>
+          </w:pPr>
+          <w:hyperlink w:anchor="_Toc229085791" w:history="1">
+            <w:r>
+              <w:rPr>
+                <w:rStyle w:val="Hyperlink"/>
+                <w:noProof/>
+              </w:rPr>
+              <w:t>4.1.3 Creating the River Generation</w:t>
+            </w:r>
+            <w:r>
+              <w:rPr>
+                <w:noProof/>
+                <w:webHidden/>
+              </w:rPr>
+              <w:tab/>
+            </w:r>
+            <w:r>
+              <w:rPr>
+                <w:noProof/>
+                <w:webHidden/>
+              </w:rPr>
+              <w:fldChar w:fldCharType="begin"/>
+            </w:r>
+            <w:r>
+              <w:rPr>
+                <w:noProof/>
+                <w:webHidden/>
+              </w:rPr>
+              <w:instrText xml:space="preserve"> PAGEREF _Toc229085791 \h </w:instrText>
+            </w:r>
+            <w:r>
+              <w:rPr>
+                <w:noProof/>
+                <w:webHidden/>
+              </w:rPr>
+            </w:r>
+            <w:r>
+              <w:rPr>
+                <w:noProof/>
+                <w:webHidden/>
+              </w:rPr>
+              <w:fldChar w:fldCharType="separate"/>
+            </w:r>
+            <w:r>
+              <w:rPr>
+                <w:noProof/>
+                <w:webHidden/>
+              </w:rPr>
+              <w:t>21</w:t>
             </w:r>
             <w:r>
               <w:rPr>
@@ -4350,7 +4424,7 @@
               <w14:ligatures w14:val="standardContextual"/>
             </w:rPr>
           </w:pPr>
-          <w:hyperlink w:anchor="_Toc229075272" w:history="1">
+          <w:hyperlink w:anchor="_Toc229085792" w:history="1">
             <w:r>
               <w:rPr>
                 <w:rStyle w:val="Hyperlink"/>
@@ -4377,7 +4451,7 @@
                 <w:noProof/>
                 <w:webHidden/>
               </w:rPr>
-              <w:instrText xml:space="preserve"> PAGEREF _Toc229075272 \h </w:instrText>
+              <w:instrText xml:space="preserve"> PAGEREF _Toc229085792 \h </w:instrText>
             </w:r>
             <w:r>
               <w:rPr>
@@ -4397,7 +4471,7 @@
                 <w:noProof/>
                 <w:webHidden/>
               </w:rPr>
-              <w:t>20</w:t>
+              <w:t>24</w:t>
             </w:r>
             <w:r>
               <w:rPr>
@@ -4432,10 +4506,24 @@
     </w:sdt>
     <w:p>
       <w:pPr>
+        <w:rPr>
+          <w:rFonts w:eastAsiaTheme="majorEastAsia" w:cstheme="majorBidi"/>
+          <w:color w:val="0F4761" w:themeColor="accent1" w:themeShade="BF"/>
+          <w:sz w:val="40"/>
+          <w:szCs w:val="40"/>
+        </w:rPr>
+      </w:pPr>
+      <w:r>
+        <w:br w:type="page"/>
+      </w:r>
+    </w:p>
+    <w:p>
+      <w:pPr>
         <w:pStyle w:val="Heading1"/>
       </w:pPr>
-      <w:bookmarkStart w:id="7" w:name="_Toc229075226"/>
-      <w:r>
+      <w:bookmarkStart w:id="7" w:name="_Toc229085745"/>
+      <w:r>
+        <w:lastRenderedPageBreak/>
         <w:t>Table of Figures</w:t>
       </w:r>
       <w:bookmarkEnd w:id="7"/>
@@ -4476,7 +4564,7 @@
         </w:rPr>
         <w:fldChar w:fldCharType="separate"/>
       </w:r>
-      <w:hyperlink w:anchor="_Toc229075273" w:history="1">
+      <w:hyperlink w:anchor="_Toc229085723" w:history="1">
         <w:r>
           <w:rPr>
             <w:rStyle w:val="Hyperlink"/>
@@ -4503,7 +4591,7 @@
             <w:noProof/>
             <w:webHidden/>
           </w:rPr>
-          <w:instrText xml:space="preserve"> PAGEREF _Toc229075273 \h </w:instrText>
+          <w:instrText xml:space="preserve"> PAGEREF _Toc229085723 \h </w:instrText>
         </w:r>
         <w:r>
           <w:rPr>
@@ -4546,7 +4634,7 @@
           <w:lang w:eastAsia="en-GB"/>
         </w:rPr>
       </w:pPr>
-      <w:hyperlink w:anchor="_Toc229075274" w:history="1">
+      <w:hyperlink w:anchor="_Toc229085724" w:history="1">
         <w:r>
           <w:rPr>
             <w:rStyle w:val="Hyperlink"/>
@@ -4573,7 +4661,7 @@
             <w:noProof/>
             <w:webHidden/>
           </w:rPr>
-          <w:instrText xml:space="preserve"> PAGEREF _Toc229075274 \h </w:instrText>
+          <w:instrText xml:space="preserve"> PAGEREF _Toc229085724 \h </w:instrText>
         </w:r>
         <w:r>
           <w:rPr>
@@ -4616,7 +4704,7 @@
           <w:lang w:eastAsia="en-GB"/>
         </w:rPr>
       </w:pPr>
-      <w:hyperlink w:anchor="_Toc229075275" w:history="1">
+      <w:hyperlink w:anchor="_Toc229085725" w:history="1">
         <w:r>
           <w:rPr>
             <w:rStyle w:val="Hyperlink"/>
@@ -4643,7 +4731,7 @@
             <w:noProof/>
             <w:webHidden/>
           </w:rPr>
-          <w:instrText xml:space="preserve"> PAGEREF _Toc229075275 \h </w:instrText>
+          <w:instrText xml:space="preserve"> PAGEREF _Toc229085725 \h </w:instrText>
         </w:r>
         <w:r>
           <w:rPr>
@@ -4686,7 +4774,7 @@
           <w:lang w:eastAsia="en-GB"/>
         </w:rPr>
       </w:pPr>
-      <w:hyperlink w:anchor="_Toc229075276" w:history="1">
+      <w:hyperlink w:anchor="_Toc229085726" w:history="1">
         <w:r>
           <w:rPr>
             <w:rStyle w:val="Hyperlink"/>
@@ -4713,7 +4801,7 @@
             <w:noProof/>
             <w:webHidden/>
           </w:rPr>
-          <w:instrText xml:space="preserve"> PAGEREF _Toc229075276 \h </w:instrText>
+          <w:instrText xml:space="preserve"> PAGEREF _Toc229085726 \h </w:instrText>
         </w:r>
         <w:r>
           <w:rPr>
@@ -4756,7 +4844,7 @@
           <w:lang w:eastAsia="en-GB"/>
         </w:rPr>
       </w:pPr>
-      <w:hyperlink w:anchor="_Toc229075277" w:history="1">
+      <w:hyperlink w:anchor="_Toc229085727" w:history="1">
         <w:r>
           <w:rPr>
             <w:rStyle w:val="Hyperlink"/>
@@ -4783,7 +4871,7 @@
             <w:noProof/>
             <w:webHidden/>
           </w:rPr>
-          <w:instrText xml:space="preserve"> PAGEREF _Toc229075277 \h </w:instrText>
+          <w:instrText xml:space="preserve"> PAGEREF _Toc229085727 \h </w:instrText>
         </w:r>
         <w:r>
           <w:rPr>
@@ -4803,7 +4891,7 @@
             <w:noProof/>
             <w:webHidden/>
           </w:rPr>
-          <w:t>10</w:t>
+          <w:t>11</w:t>
         </w:r>
         <w:r>
           <w:rPr>
@@ -4826,7 +4914,7 @@
           <w:lang w:eastAsia="en-GB"/>
         </w:rPr>
       </w:pPr>
-      <w:hyperlink w:anchor="_Toc229075278" w:history="1">
+      <w:hyperlink w:anchor="_Toc229085728" w:history="1">
         <w:r>
           <w:rPr>
             <w:rStyle w:val="Hyperlink"/>
@@ -4853,7 +4941,7 @@
             <w:noProof/>
             <w:webHidden/>
           </w:rPr>
-          <w:instrText xml:space="preserve"> PAGEREF _Toc229075278 \h </w:instrText>
+          <w:instrText xml:space="preserve"> PAGEREF _Toc229085728 \h </w:instrText>
         </w:r>
         <w:r>
           <w:rPr>
@@ -4873,7 +4961,7 @@
             <w:noProof/>
             <w:webHidden/>
           </w:rPr>
-          <w:t>10</w:t>
+          <w:t>11</w:t>
         </w:r>
         <w:r>
           <w:rPr>
@@ -4896,7 +4984,7 @@
           <w:lang w:eastAsia="en-GB"/>
         </w:rPr>
       </w:pPr>
-      <w:hyperlink w:anchor="_Toc229075279" w:history="1">
+      <w:hyperlink w:anchor="_Toc229085729" w:history="1">
         <w:r>
           <w:rPr>
             <w:rStyle w:val="Hyperlink"/>
@@ -4923,7 +5011,7 @@
             <w:noProof/>
             <w:webHidden/>
           </w:rPr>
-          <w:instrText xml:space="preserve"> PAGEREF _Toc229075279 \h </w:instrText>
+          <w:instrText xml:space="preserve"> PAGEREF _Toc229085729 \h </w:instrText>
         </w:r>
         <w:r>
           <w:rPr>
@@ -4943,7 +5031,7 @@
             <w:noProof/>
             <w:webHidden/>
           </w:rPr>
-          <w:t>11</w:t>
+          <w:t>12</w:t>
         </w:r>
         <w:r>
           <w:rPr>
@@ -4966,7 +5054,7 @@
           <w:lang w:eastAsia="en-GB"/>
         </w:rPr>
       </w:pPr>
-      <w:hyperlink w:anchor="_Toc229075280" w:history="1">
+      <w:hyperlink w:anchor="_Toc229085730" w:history="1">
         <w:r>
           <w:rPr>
             <w:rStyle w:val="Hyperlink"/>
@@ -4993,7 +5081,7 @@
             <w:noProof/>
             <w:webHidden/>
           </w:rPr>
-          <w:instrText xml:space="preserve"> PAGEREF _Toc229075280 \h </w:instrText>
+          <w:instrText xml:space="preserve"> PAGEREF _Toc229085730 \h </w:instrText>
         </w:r>
         <w:r>
           <w:rPr>
@@ -5036,7 +5124,7 @@
           <w:lang w:eastAsia="en-GB"/>
         </w:rPr>
       </w:pPr>
-      <w:hyperlink w:anchor="_Toc229075281" w:history="1">
+      <w:hyperlink w:anchor="_Toc229085731" w:history="1">
         <w:r>
           <w:rPr>
             <w:rStyle w:val="Hyperlink"/>
@@ -5063,7 +5151,7 @@
             <w:noProof/>
             <w:webHidden/>
           </w:rPr>
-          <w:instrText xml:space="preserve"> PAGEREF _Toc229075281 \h </w:instrText>
+          <w:instrText xml:space="preserve"> PAGEREF _Toc229085731 \h </w:instrText>
         </w:r>
         <w:r>
           <w:rPr>
@@ -5106,7 +5194,7 @@
           <w:lang w:eastAsia="en-GB"/>
         </w:rPr>
       </w:pPr>
-      <w:hyperlink w:anchor="_Toc229075282" w:history="1">
+      <w:hyperlink w:anchor="_Toc229085732" w:history="1">
         <w:r>
           <w:rPr>
             <w:rStyle w:val="Hyperlink"/>
@@ -5133,7 +5221,7 @@
             <w:noProof/>
             <w:webHidden/>
           </w:rPr>
-          <w:instrText xml:space="preserve"> PAGEREF _Toc229075282 \h </w:instrText>
+          <w:instrText xml:space="preserve"> PAGEREF _Toc229085732 \h </w:instrText>
         </w:r>
         <w:r>
           <w:rPr>
@@ -5153,7 +5241,7 @@
             <w:noProof/>
             <w:webHidden/>
           </w:rPr>
-          <w:t>17</w:t>
+          <w:t>18</w:t>
         </w:r>
         <w:r>
           <w:rPr>
@@ -5176,7 +5264,7 @@
           <w:lang w:eastAsia="en-GB"/>
         </w:rPr>
       </w:pPr>
-      <w:hyperlink w:anchor="_Toc229075283" w:history="1">
+      <w:hyperlink w:anchor="_Toc229085733" w:history="1">
         <w:r>
           <w:rPr>
             <w:rStyle w:val="Hyperlink"/>
@@ -5203,7 +5291,7 @@
             <w:noProof/>
             <w:webHidden/>
           </w:rPr>
-          <w:instrText xml:space="preserve"> PAGEREF _Toc229075283 \h </w:instrText>
+          <w:instrText xml:space="preserve"> PAGEREF _Toc229085733 \h </w:instrText>
         </w:r>
         <w:r>
           <w:rPr>
@@ -5246,7 +5334,7 @@
           <w:lang w:eastAsia="en-GB"/>
         </w:rPr>
       </w:pPr>
-      <w:hyperlink w:anchor="_Toc229075284" w:history="1">
+      <w:hyperlink w:anchor="_Toc229085734" w:history="1">
         <w:r>
           <w:rPr>
             <w:rStyle w:val="Hyperlink"/>
@@ -5273,7 +5361,7 @@
             <w:noProof/>
             <w:webHidden/>
           </w:rPr>
-          <w:instrText xml:space="preserve"> PAGEREF _Toc229075284 \h </w:instrText>
+          <w:instrText xml:space="preserve"> PAGEREF _Toc229085734 \h </w:instrText>
         </w:r>
         <w:r>
           <w:rPr>
@@ -5293,7 +5381,7 @@
             <w:noProof/>
             <w:webHidden/>
           </w:rPr>
-          <w:t>18</w:t>
+          <w:t>19</w:t>
         </w:r>
         <w:r>
           <w:rPr>
@@ -5316,7 +5404,7 @@
           <w:lang w:eastAsia="en-GB"/>
         </w:rPr>
       </w:pPr>
-      <w:hyperlink w:anchor="_Toc229075285" w:history="1">
+      <w:hyperlink w:anchor="_Toc229085735" w:history="1">
         <w:r>
           <w:rPr>
             <w:rStyle w:val="Hyperlink"/>
@@ -5343,7 +5431,7 @@
             <w:noProof/>
             <w:webHidden/>
           </w:rPr>
-          <w:instrText xml:space="preserve"> PAGEREF _Toc229075285 \h </w:instrText>
+          <w:instrText xml:space="preserve"> PAGEREF _Toc229085735 \h </w:instrText>
         </w:r>
         <w:r>
           <w:rPr>
@@ -5363,7 +5451,7 @@
             <w:noProof/>
             <w:webHidden/>
           </w:rPr>
-          <w:t>19</w:t>
+          <w:t>20</w:t>
         </w:r>
         <w:r>
           <w:rPr>
@@ -5386,7 +5474,7 @@
           <w:lang w:eastAsia="en-GB"/>
         </w:rPr>
       </w:pPr>
-      <w:hyperlink w:anchor="_Toc229075286" w:history="1">
+      <w:hyperlink w:anchor="_Toc229085736" w:history="1">
         <w:r>
           <w:rPr>
             <w:rStyle w:val="Hyperlink"/>
@@ -5413,7 +5501,7 @@
             <w:noProof/>
             <w:webHidden/>
           </w:rPr>
-          <w:instrText xml:space="preserve"> PAGEREF _Toc229075286 \h </w:instrText>
+          <w:instrText xml:space="preserve"> PAGEREF _Toc229085736 \h </w:instrText>
         </w:r>
         <w:r>
           <w:rPr>
@@ -5434,6 +5522,286 @@
             <w:webHidden/>
           </w:rPr>
           <w:t>20</w:t>
+        </w:r>
+        <w:r>
+          <w:rPr>
+            <w:noProof/>
+            <w:webHidden/>
+          </w:rPr>
+          <w:fldChar w:fldCharType="end"/>
+        </w:r>
+      </w:hyperlink>
+    </w:p>
+    <w:p>
+      <w:pPr>
+        <w:pStyle w:val="TableofFigures"/>
+        <w:tabs>
+          <w:tab w:val="right" w:leader="dot" w:pos="9016"/>
+        </w:tabs>
+        <w:rPr>
+          <w:rFonts w:asciiTheme="minorHAnsi" w:eastAsiaTheme="minorEastAsia" w:hAnsiTheme="minorHAnsi"/>
+          <w:noProof/>
+          <w:lang w:eastAsia="en-GB"/>
+        </w:rPr>
+      </w:pPr>
+      <w:hyperlink w:anchor="_Toc229085737" w:history="1">
+        <w:r>
+          <w:rPr>
+            <w:rStyle w:val="Hyperlink"/>
+            <w:noProof/>
+          </w:rPr>
+          <w:t>Figure 15</w:t>
+        </w:r>
+        <w:r>
+          <w:rPr>
+            <w:noProof/>
+            <w:webHidden/>
+          </w:rPr>
+          <w:tab/>
+        </w:r>
+        <w:r>
+          <w:rPr>
+            <w:noProof/>
+            <w:webHidden/>
+          </w:rPr>
+          <w:fldChar w:fldCharType="begin"/>
+        </w:r>
+        <w:r>
+          <w:rPr>
+            <w:noProof/>
+            <w:webHidden/>
+          </w:rPr>
+          <w:instrText xml:space="preserve"> PAGEREF _Toc229085737 \h </w:instrText>
+        </w:r>
+        <w:r>
+          <w:rPr>
+            <w:noProof/>
+            <w:webHidden/>
+          </w:rPr>
+        </w:r>
+        <w:r>
+          <w:rPr>
+            <w:noProof/>
+            <w:webHidden/>
+          </w:rPr>
+          <w:fldChar w:fldCharType="separate"/>
+        </w:r>
+        <w:r>
+          <w:rPr>
+            <w:noProof/>
+            <w:webHidden/>
+          </w:rPr>
+          <w:t>21</w:t>
+        </w:r>
+        <w:r>
+          <w:rPr>
+            <w:noProof/>
+            <w:webHidden/>
+          </w:rPr>
+          <w:fldChar w:fldCharType="end"/>
+        </w:r>
+      </w:hyperlink>
+    </w:p>
+    <w:p>
+      <w:pPr>
+        <w:pStyle w:val="TableofFigures"/>
+        <w:tabs>
+          <w:tab w:val="right" w:leader="dot" w:pos="9016"/>
+        </w:tabs>
+        <w:rPr>
+          <w:rFonts w:asciiTheme="minorHAnsi" w:eastAsiaTheme="minorEastAsia" w:hAnsiTheme="minorHAnsi"/>
+          <w:noProof/>
+          <w:lang w:eastAsia="en-GB"/>
+        </w:rPr>
+      </w:pPr>
+      <w:hyperlink w:anchor="_Toc229085738" w:history="1">
+        <w:r>
+          <w:rPr>
+            <w:rStyle w:val="Hyperlink"/>
+            <w:noProof/>
+          </w:rPr>
+          <w:t>Figure 16</w:t>
+        </w:r>
+        <w:r>
+          <w:rPr>
+            <w:noProof/>
+            <w:webHidden/>
+          </w:rPr>
+          <w:tab/>
+        </w:r>
+        <w:r>
+          <w:rPr>
+            <w:noProof/>
+            <w:webHidden/>
+          </w:rPr>
+          <w:fldChar w:fldCharType="begin"/>
+        </w:r>
+        <w:r>
+          <w:rPr>
+            <w:noProof/>
+            <w:webHidden/>
+          </w:rPr>
+          <w:instrText xml:space="preserve"> PAGEREF _Toc229085738 \h </w:instrText>
+        </w:r>
+        <w:r>
+          <w:rPr>
+            <w:noProof/>
+            <w:webHidden/>
+          </w:rPr>
+        </w:r>
+        <w:r>
+          <w:rPr>
+            <w:noProof/>
+            <w:webHidden/>
+          </w:rPr>
+          <w:fldChar w:fldCharType="separate"/>
+        </w:r>
+        <w:r>
+          <w:rPr>
+            <w:noProof/>
+            <w:webHidden/>
+          </w:rPr>
+          <w:t>22</w:t>
+        </w:r>
+        <w:r>
+          <w:rPr>
+            <w:noProof/>
+            <w:webHidden/>
+          </w:rPr>
+          <w:fldChar w:fldCharType="end"/>
+        </w:r>
+      </w:hyperlink>
+    </w:p>
+    <w:p>
+      <w:pPr>
+        <w:pStyle w:val="TableofFigures"/>
+        <w:tabs>
+          <w:tab w:val="right" w:leader="dot" w:pos="9016"/>
+        </w:tabs>
+        <w:rPr>
+          <w:rFonts w:asciiTheme="minorHAnsi" w:eastAsiaTheme="minorEastAsia" w:hAnsiTheme="minorHAnsi"/>
+          <w:noProof/>
+          <w:lang w:eastAsia="en-GB"/>
+        </w:rPr>
+      </w:pPr>
+      <w:hyperlink w:anchor="_Toc229085739" w:history="1">
+        <w:r>
+          <w:rPr>
+            <w:rStyle w:val="Hyperlink"/>
+            <w:noProof/>
+          </w:rPr>
+          <w:t>Figure 17</w:t>
+        </w:r>
+        <w:r>
+          <w:rPr>
+            <w:noProof/>
+            <w:webHidden/>
+          </w:rPr>
+          <w:tab/>
+        </w:r>
+        <w:r>
+          <w:rPr>
+            <w:noProof/>
+            <w:webHidden/>
+          </w:rPr>
+          <w:fldChar w:fldCharType="begin"/>
+        </w:r>
+        <w:r>
+          <w:rPr>
+            <w:noProof/>
+            <w:webHidden/>
+          </w:rPr>
+          <w:instrText xml:space="preserve"> PAGEREF _Toc229085739 \h </w:instrText>
+        </w:r>
+        <w:r>
+          <w:rPr>
+            <w:noProof/>
+            <w:webHidden/>
+          </w:rPr>
+        </w:r>
+        <w:r>
+          <w:rPr>
+            <w:noProof/>
+            <w:webHidden/>
+          </w:rPr>
+          <w:fldChar w:fldCharType="separate"/>
+        </w:r>
+        <w:r>
+          <w:rPr>
+            <w:noProof/>
+            <w:webHidden/>
+          </w:rPr>
+          <w:t>22</w:t>
+        </w:r>
+        <w:r>
+          <w:rPr>
+            <w:noProof/>
+            <w:webHidden/>
+          </w:rPr>
+          <w:fldChar w:fldCharType="end"/>
+        </w:r>
+      </w:hyperlink>
+    </w:p>
+    <w:p>
+      <w:pPr>
+        <w:pStyle w:val="TableofFigures"/>
+        <w:tabs>
+          <w:tab w:val="right" w:leader="dot" w:pos="9016"/>
+        </w:tabs>
+        <w:rPr>
+          <w:rFonts w:asciiTheme="minorHAnsi" w:eastAsiaTheme="minorEastAsia" w:hAnsiTheme="minorHAnsi"/>
+          <w:noProof/>
+          <w:lang w:eastAsia="en-GB"/>
+        </w:rPr>
+      </w:pPr>
+      <w:hyperlink w:anchor="_Toc229085740" w:history="1">
+        <w:r>
+          <w:rPr>
+            <w:rStyle w:val="Hyperlink"/>
+            <w:noProof/>
+          </w:rPr>
+          <w:t>Figure 18</w:t>
+        </w:r>
+        <w:r>
+          <w:rPr>
+            <w:noProof/>
+            <w:webHidden/>
+          </w:rPr>
+          <w:tab/>
+        </w:r>
+        <w:r>
+          <w:rPr>
+            <w:noProof/>
+            <w:webHidden/>
+          </w:rPr>
+          <w:fldChar w:fldCharType="begin"/>
+        </w:r>
+        <w:r>
+          <w:rPr>
+            <w:noProof/>
+            <w:webHidden/>
+          </w:rPr>
+          <w:instrText xml:space="preserve"> PAGEREF _Toc229085740 \h </w:instrText>
+        </w:r>
+        <w:r>
+          <w:rPr>
+            <w:noProof/>
+            <w:webHidden/>
+          </w:rPr>
+        </w:r>
+        <w:r>
+          <w:rPr>
+            <w:noProof/>
+            <w:webHidden/>
+          </w:rPr>
+          <w:fldChar w:fldCharType="separate"/>
+        </w:r>
+        <w:r>
+          <w:rPr>
+            <w:noProof/>
+            <w:webHidden/>
+          </w:rPr>
+          <w:t>23</w:t>
         </w:r>
         <w:r>
           <w:rPr>
@@ -5482,7 +5850,7 @@
       <w:pPr>
         <w:pStyle w:val="Heading1"/>
       </w:pPr>
-      <w:bookmarkStart w:id="8" w:name="_Toc229075227"/>
+      <w:bookmarkStart w:id="8" w:name="_Toc229085746"/>
       <w:r>
         <w:t>Chapter 1</w:t>
       </w:r>
@@ -5510,7 +5878,7 @@
           <w:u w:val="single"/>
         </w:rPr>
       </w:pPr>
-      <w:bookmarkStart w:id="9" w:name="_Toc229075228"/>
+      <w:bookmarkStart w:id="9" w:name="_Toc229085747"/>
       <w:r>
         <w:t>1.1</w:t>
       </w:r>
@@ -5561,7 +5929,7 @@
       <w:pPr>
         <w:pStyle w:val="Heading2"/>
       </w:pPr>
-      <w:bookmarkStart w:id="10" w:name="_Toc229075229"/>
+      <w:bookmarkStart w:id="10" w:name="_Toc229085748"/>
       <w:r>
         <w:t>1.2 Aims</w:t>
       </w:r>
@@ -5577,7 +5945,7 @@
           <w:szCs w:val="28"/>
         </w:rPr>
       </w:pPr>
-      <w:bookmarkStart w:id="11" w:name="_Toc229075230"/>
+      <w:bookmarkStart w:id="11" w:name="_Toc229085749"/>
       <w:r>
         <w:rPr>
           <w:rStyle w:val="Heading2Char"/>
@@ -5622,7 +5990,7 @@
       <w:pPr>
         <w:pStyle w:val="Heading3"/>
       </w:pPr>
-      <w:bookmarkStart w:id="12" w:name="_Toc229075231"/>
+      <w:bookmarkStart w:id="12" w:name="_Toc229085750"/>
       <w:r>
         <w:lastRenderedPageBreak/>
         <w:t>1.2.2 Additional Aims</w:t>
@@ -5692,7 +6060,7 @@
       <w:pPr>
         <w:pStyle w:val="Heading2"/>
       </w:pPr>
-      <w:bookmarkStart w:id="13" w:name="_Toc229075232"/>
+      <w:bookmarkStart w:id="13" w:name="_Toc229085751"/>
       <w:r>
         <w:t>1.3 Objectives</w:t>
       </w:r>
@@ -5702,7 +6070,7 @@
       <w:pPr>
         <w:pStyle w:val="Heading3"/>
       </w:pPr>
-      <w:bookmarkStart w:id="14" w:name="_Toc229075233"/>
+      <w:bookmarkStart w:id="14" w:name="_Toc229085752"/>
       <w:r>
         <w:t>1.3.1 Scope</w:t>
       </w:r>
@@ -5773,7 +6141,7 @@
       <w:pPr>
         <w:pStyle w:val="Heading3"/>
       </w:pPr>
-      <w:bookmarkStart w:id="15" w:name="_Toc229075234"/>
+      <w:bookmarkStart w:id="15" w:name="_Toc229085753"/>
       <w:r>
         <w:t>1.3.2 Research Objectives</w:t>
       </w:r>
@@ -5811,7 +6179,7 @@
       <w:pPr>
         <w:pStyle w:val="Heading3"/>
       </w:pPr>
-      <w:bookmarkStart w:id="16" w:name="_Toc229075235"/>
+      <w:bookmarkStart w:id="16" w:name="_Toc229085754"/>
       <w:r>
         <w:lastRenderedPageBreak/>
         <w:t>1.3.3 Design Objectives</w:t>
@@ -5934,7 +6302,7 @@
       <w:pPr>
         <w:pStyle w:val="Heading3"/>
       </w:pPr>
-      <w:bookmarkStart w:id="17" w:name="_Toc229075236"/>
+      <w:bookmarkStart w:id="17" w:name="_Toc229085755"/>
       <w:r>
         <w:t>1.3.4 Implementation Objectives</w:t>
       </w:r>
@@ -6053,7 +6421,7 @@
       <w:pPr>
         <w:pStyle w:val="Heading3"/>
       </w:pPr>
-      <w:bookmarkStart w:id="18" w:name="_Toc229075237"/>
+      <w:bookmarkStart w:id="18" w:name="_Toc229085756"/>
       <w:r>
         <w:t>1.3.5 Results, Evaluation and Playtesting Objectives</w:t>
       </w:r>
@@ -6110,7 +6478,7 @@
       <w:pPr>
         <w:pStyle w:val="Heading1"/>
       </w:pPr>
-      <w:bookmarkStart w:id="19" w:name="_Toc229075238"/>
+      <w:bookmarkStart w:id="19" w:name="_Toc229085757"/>
       <w:r>
         <w:lastRenderedPageBreak/>
         <w:t>Chapter 2 – Literature Survey</w:t>
@@ -6121,7 +6489,7 @@
       <w:pPr>
         <w:pStyle w:val="Heading2"/>
       </w:pPr>
-      <w:bookmarkStart w:id="20" w:name="_Toc229075239"/>
+      <w:bookmarkStart w:id="20" w:name="_Toc229085758"/>
       <w:r>
         <w:t>2.1 Literature Survey Introduction</w:t>
       </w:r>
@@ -6160,7 +6528,7 @@
       <w:pPr>
         <w:pStyle w:val="Heading2"/>
       </w:pPr>
-      <w:bookmarkStart w:id="21" w:name="_Toc229075240"/>
+      <w:bookmarkStart w:id="21" w:name="_Toc229085759"/>
       <w:r>
         <w:t>2.2 Comparative Research</w:t>
       </w:r>
@@ -6178,7 +6546,7 @@
       <w:pPr>
         <w:pStyle w:val="Heading3"/>
       </w:pPr>
-      <w:bookmarkStart w:id="22" w:name="_Toc229075241"/>
+      <w:bookmarkStart w:id="22" w:name="_Toc229085760"/>
       <w:r>
         <w:t xml:space="preserve">2.2.1 </w:t>
       </w:r>
@@ -6253,7 +6621,7 @@
       <w:pPr>
         <w:pStyle w:val="Heading4"/>
       </w:pPr>
-      <w:bookmarkStart w:id="23" w:name="_Toc229075242"/>
+      <w:bookmarkStart w:id="23" w:name="_Toc229085761"/>
       <w:r>
         <w:t>2.2.1.1 Perlin Noise</w:t>
       </w:r>
@@ -6554,7 +6922,7 @@
         <w:pStyle w:val="Caption"/>
         <w:jc w:val="center"/>
       </w:pPr>
-      <w:bookmarkStart w:id="24" w:name="_Toc229075273"/>
+      <w:bookmarkStart w:id="24" w:name="_Toc229085723"/>
       <w:r>
         <w:t xml:space="preserve">Figure </w:t>
       </w:r>
@@ -6638,7 +7006,7 @@
       <w:pPr>
         <w:pStyle w:val="Heading4"/>
       </w:pPr>
-      <w:bookmarkStart w:id="25" w:name="_Toc229075243"/>
+      <w:bookmarkStart w:id="25" w:name="_Toc229085762"/>
       <w:r>
         <w:t>2.2.1.2 Binary Space Partitioning</w:t>
       </w:r>
@@ -6689,7 +7057,7 @@
       <w:pPr>
         <w:pStyle w:val="Heading4"/>
       </w:pPr>
-      <w:bookmarkStart w:id="26" w:name="_Toc229075244"/>
+      <w:bookmarkStart w:id="26" w:name="_Toc229085763"/>
       <w:r>
         <w:t>2.2.1.3 Cellular Automata</w:t>
       </w:r>
@@ -6804,7 +7172,7 @@
       <w:pPr>
         <w:pStyle w:val="Heading3"/>
       </w:pPr>
-      <w:bookmarkStart w:id="27" w:name="_Toc229075245"/>
+      <w:bookmarkStart w:id="27" w:name="_Toc229085764"/>
       <w:r>
         <w:t>2.2.2 Pathfinding</w:t>
       </w:r>
@@ -6867,7 +7235,7 @@
       <w:pPr>
         <w:pStyle w:val="Heading4"/>
       </w:pPr>
-      <w:bookmarkStart w:id="28" w:name="_Toc229075246"/>
+      <w:bookmarkStart w:id="28" w:name="_Toc229085765"/>
       <w:r>
         <w:t>2.2.2.1 Dijkstra</w:t>
       </w:r>
@@ -6954,7 +7322,7 @@
         <w:pStyle w:val="Caption"/>
         <w:jc w:val="center"/>
       </w:pPr>
-      <w:bookmarkStart w:id="29" w:name="_Toc229075274"/>
+      <w:bookmarkStart w:id="29" w:name="_Toc229085724"/>
       <w:r>
         <w:t xml:space="preserve">Figure </w:t>
       </w:r>
@@ -7040,7 +7408,7 @@
       <w:pPr>
         <w:pStyle w:val="Heading4"/>
       </w:pPr>
-      <w:bookmarkStart w:id="30" w:name="_Toc229075247"/>
+      <w:bookmarkStart w:id="30" w:name="_Toc229085766"/>
       <w:r>
         <w:t>2.2.2.2 A*</w:t>
       </w:r>
@@ -7113,7 +7481,7 @@
       <w:pPr>
         <w:pStyle w:val="Heading4"/>
       </w:pPr>
-      <w:bookmarkStart w:id="31" w:name="_Toc229075248"/>
+      <w:bookmarkStart w:id="31" w:name="_Toc229085767"/>
       <w:r>
         <w:t>2.2.2.3 Jump Point Search</w:t>
       </w:r>
@@ -7163,7 +7531,7 @@
       <w:pPr>
         <w:pStyle w:val="Heading3"/>
       </w:pPr>
-      <w:bookmarkStart w:id="32" w:name="_Toc229075249"/>
+      <w:bookmarkStart w:id="32" w:name="_Toc229085768"/>
       <w:r>
         <w:t>2.2.3 AI Integrations</w:t>
       </w:r>
@@ -7187,7 +7555,7 @@
       <w:pPr>
         <w:pStyle w:val="Heading4"/>
       </w:pPr>
-      <w:bookmarkStart w:id="33" w:name="_Toc229075250"/>
+      <w:bookmarkStart w:id="33" w:name="_Toc229085769"/>
       <w:r>
         <w:lastRenderedPageBreak/>
         <w:t>2.2.3.1 Neural Network</w:t>
@@ -7208,15 +7576,7 @@
     <w:p/>
     <w:p>
       <w:r>
-        <w:t xml:space="preserve">After the initial training phase, if we present the network with a </w:t>
-      </w:r>
-      <w:proofErr w:type="gramStart"/>
-      <w:r>
-        <w:t>pattern</w:t>
-      </w:r>
-      <w:proofErr w:type="gramEnd"/>
-      <w:r>
-        <w:t xml:space="preserve"> it hasn’t seen before in its training data, it should classify the unseen pattern correctly, only if it has learnt the underlying structure of the problem </w:t>
+        <w:t xml:space="preserve">After the initial training phase, if we present the network with a pattern it hasn’t seen before in its training data, it should classify the unseen pattern correctly, only if it has learnt the underlying structure of the problem </w:t>
       </w:r>
       <w:sdt>
         <w:sdtPr>
@@ -7252,7 +7612,7 @@
       <w:pPr>
         <w:pStyle w:val="Heading4"/>
       </w:pPr>
-      <w:bookmarkStart w:id="34" w:name="_Toc229075251"/>
+      <w:bookmarkStart w:id="34" w:name="_Toc229085770"/>
       <w:r>
         <w:t>2.2.3.2 Reinforcement Learning</w:t>
       </w:r>
@@ -7327,7 +7687,7 @@
         <w:pStyle w:val="Caption"/>
         <w:jc w:val="center"/>
       </w:pPr>
-      <w:bookmarkStart w:id="35" w:name="_Toc229075275"/>
+      <w:bookmarkStart w:id="35" w:name="_Toc229085725"/>
       <w:r>
         <w:t xml:space="preserve">Figure </w:t>
       </w:r>
@@ -7452,7 +7812,7 @@
       <w:pPr>
         <w:pStyle w:val="Heading4"/>
       </w:pPr>
-      <w:bookmarkStart w:id="36" w:name="_Toc229075252"/>
+      <w:bookmarkStart w:id="36" w:name="_Toc229085771"/>
       <w:r>
         <w:lastRenderedPageBreak/>
         <w:t>2.2.3.3 Imitation Learning</w:t>
@@ -7579,10 +7939,24 @@
     </w:p>
     <w:p>
       <w:pPr>
+        <w:rPr>
+          <w:rFonts w:eastAsiaTheme="majorEastAsia" w:cstheme="majorBidi"/>
+          <w:color w:val="0F4761" w:themeColor="accent1" w:themeShade="BF"/>
+          <w:sz w:val="40"/>
+          <w:szCs w:val="40"/>
+        </w:rPr>
+      </w:pPr>
+      <w:r>
+        <w:br w:type="page"/>
+      </w:r>
+    </w:p>
+    <w:p>
+      <w:pPr>
         <w:pStyle w:val="Heading1"/>
       </w:pPr>
-      <w:bookmarkStart w:id="37" w:name="_Toc229075253"/>
-      <w:r>
+      <w:bookmarkStart w:id="37" w:name="_Toc229085772"/>
+      <w:r>
+        <w:lastRenderedPageBreak/>
         <w:t>Chapter 3 – Design</w:t>
       </w:r>
       <w:bookmarkEnd w:id="37"/>
@@ -7608,7 +7982,7 @@
       <w:pPr>
         <w:pStyle w:val="Heading2"/>
       </w:pPr>
-      <w:bookmarkStart w:id="38" w:name="_Toc229075254"/>
+      <w:bookmarkStart w:id="38" w:name="_Toc229085773"/>
       <w:r>
         <w:t xml:space="preserve">3.1 </w:t>
       </w:r>
@@ -7659,9 +8033,8 @@
       <w:pPr>
         <w:pStyle w:val="Heading3"/>
       </w:pPr>
-      <w:bookmarkStart w:id="39" w:name="_Toc229075255"/>
-      <w:r>
-        <w:lastRenderedPageBreak/>
+      <w:bookmarkStart w:id="39" w:name="_Toc229085774"/>
+      <w:r>
         <w:t xml:space="preserve">3.1.1 </w:t>
       </w:r>
       <w:r>
@@ -7758,7 +8131,7 @@
         <w:pStyle w:val="Caption"/>
         <w:jc w:val="center"/>
       </w:pPr>
-      <w:bookmarkStart w:id="40" w:name="_Toc229075276"/>
+      <w:bookmarkStart w:id="40" w:name="_Toc229085726"/>
       <w:r>
         <w:t xml:space="preserve">Figure </w:t>
       </w:r>
@@ -7815,6 +8188,7 @@
               <w:rPr>
                 <w:noProof/>
               </w:rPr>
+              <w:lastRenderedPageBreak/>
               <w:drawing>
                 <wp:inline distT="0" distB="0" distL="0" distR="0" wp14:anchorId="2A67817B" wp14:editId="1A9F1D34">
                   <wp:extent cx="2295525" cy="2105025"/>
@@ -7872,7 +8246,7 @@
               <w:pStyle w:val="Caption"/>
               <w:jc w:val="center"/>
             </w:pPr>
-            <w:bookmarkStart w:id="41" w:name="_Toc229075277"/>
+            <w:bookmarkStart w:id="41" w:name="_Toc229085727"/>
             <w:r>
               <w:t xml:space="preserve">Figure </w:t>
             </w:r>
@@ -7960,7 +8334,7 @@
               <w:pStyle w:val="Caption"/>
               <w:jc w:val="center"/>
             </w:pPr>
-            <w:bookmarkStart w:id="42" w:name="_Toc229075278"/>
+            <w:bookmarkStart w:id="42" w:name="_Toc229085728"/>
             <w:r>
               <w:t xml:space="preserve">Figure </w:t>
             </w:r>
@@ -8014,7 +8388,6 @@
     <w:p/>
     <w:p>
       <w:r>
-        <w:lastRenderedPageBreak/>
         <w:t xml:space="preserve">There are 2 ways that I can easily display the tiles to the user: Prefabs, and Mesh Generation. Prefabs would be significantly easier to incorporate, allowing me to create a prefab for each biome and instantiating each prefab where needed. This has many benefits such as making development of this feature very quick, simplicity, code readability and making pathfinding easier through direct ray-casting. This could have potential drawbacks such as performance losses from having thousands to tens of thousands of </w:t>
       </w:r>
       <w:proofErr w:type="spellStart"/>
@@ -8045,7 +8418,7 @@
       <w:pPr>
         <w:pStyle w:val="Heading3"/>
       </w:pPr>
-      <w:bookmarkStart w:id="43" w:name="_Toc229075256"/>
+      <w:bookmarkStart w:id="43" w:name="_Toc229085775"/>
       <w:r>
         <w:t>3.1.2 Biomes</w:t>
       </w:r>
@@ -8216,7 +8589,7 @@
         <w:pStyle w:val="Caption"/>
         <w:jc w:val="center"/>
       </w:pPr>
-      <w:bookmarkStart w:id="44" w:name="_Toc229075279"/>
+      <w:bookmarkStart w:id="44" w:name="_Toc229085729"/>
       <w:r>
         <w:t xml:space="preserve">Figure </w:t>
       </w:r>
@@ -8298,96 +8671,96 @@
         <w:t>.</w:t>
       </w:r>
       <w:r>
-        <w:t xml:space="preserve"> This should balance </w:t>
+        <w:t xml:space="preserve"> This should balance out the resource distribution enough that players seek grassland at the beginning of the game.</w:t>
+      </w:r>
+    </w:p>
+    <w:p>
+      <w:pPr>
+        <w:pStyle w:val="Heading3"/>
+      </w:pPr>
+      <w:bookmarkStart w:id="45" w:name="_Toc229085776"/>
+      <w:r>
+        <w:t>3.1.3 Resource Distribution</w:t>
+      </w:r>
+      <w:bookmarkEnd w:id="45"/>
+    </w:p>
+    <w:p>
+      <w:r>
+        <w:t xml:space="preserve">Every tile in the game has a Resource variable inside its class. This is so that resources can add and remove resources from tiles when needed. This will include the ability for the player to consume the entire tiles resources on 1 turn, destroying the resource on the tile. The list of </w:t>
+      </w:r>
+      <w:r>
+        <w:t>resources available</w:t>
+      </w:r>
+      <w:r>
+        <w:t xml:space="preserve"> is as follows: Wheat, Fish, Cows, Horses, Stone, and Iron.</w:t>
+      </w:r>
+    </w:p>
+    <w:p/>
+    <w:p>
+      <w:r>
+        <w:t xml:space="preserve">Initially resources will be placed at random with some rules, such as fish only appearing on water tiles and wheat and cows only appearing in grassland. Other resources such as stone and iron will be available on any land tiles. </w:t>
+      </w:r>
+      <w:r>
+        <w:t xml:space="preserve">This random resource approach is purely for the development speed of the project and </w:t>
+      </w:r>
+      <w:r>
+        <w:t xml:space="preserve">will </w:t>
+      </w:r>
+      <w:r>
+        <w:t>be succeeded by a more sophisticated distribution algorithm to ensure both the player and the AI have relatively equal access to resources.</w:t>
+      </w:r>
+    </w:p>
+    <w:p>
+      <w:pPr>
+        <w:pStyle w:val="Heading3"/>
+      </w:pPr>
+      <w:bookmarkStart w:id="46" w:name="_Toc229085777"/>
+      <w:r>
+        <w:t>3.1.4 River generation</w:t>
+      </w:r>
+      <w:bookmarkEnd w:id="46"/>
+    </w:p>
+    <w:p>
+      <w:r>
+        <w:t xml:space="preserve">In this game, I want to incorporate river systems to boost food growth, production, gold, and general city prosperity. There are 2 methods for this that I want to explore, edge traversal </w:t>
       </w:r>
       <w:r>
         <w:lastRenderedPageBreak/>
-        <w:t>out the resource distribution enough that players seek grassland at the beginning of the game.</w:t>
+        <w:t>and biome switching. For edge traversal, I will be selecting a random edge on a random tile and building a river from that, labelling each edge on a hexagon from 0 to 6 and making sure they link up correctly.</w:t>
+      </w:r>
+      <w:r>
+        <w:t xml:space="preserve"> This has the hindrance of having to draw new game objects for each river.</w:t>
+      </w:r>
+    </w:p>
+    <w:p/>
+    <w:p>
+      <w:r>
+        <w:t xml:space="preserve">The other possible method is biome switching, this will use 3 biomes: “River Head”, “River”, and “River End”. This method requires that I select a tile, and change its biome to “River Head”, then generate the river path, making it go towards either ocean or an arbitrary length, then switch the body of the river to </w:t>
+      </w:r>
+      <w:r>
+        <w:t xml:space="preserve">the </w:t>
+      </w:r>
+      <w:r>
+        <w:t>“River”</w:t>
+      </w:r>
+      <w:r>
+        <w:t xml:space="preserve"> biome</w:t>
+      </w:r>
+      <w:r>
+        <w:t xml:space="preserve"> and then</w:t>
+      </w:r>
+      <w:r>
+        <w:t xml:space="preserve"> switching the end of the river to the “River End” biome. This has the added benefit of easily switching the tile sprite.</w:t>
+      </w:r>
+      <w:r>
+        <w:t xml:space="preserve"> </w:t>
       </w:r>
     </w:p>
     <w:p>
       <w:pPr>
         <w:pStyle w:val="Heading3"/>
       </w:pPr>
-      <w:bookmarkStart w:id="45" w:name="_Toc229075257"/>
-      <w:r>
-        <w:t>3.1.3 Resource Distribution</w:t>
-      </w:r>
-      <w:bookmarkEnd w:id="45"/>
-    </w:p>
-    <w:p>
-      <w:r>
-        <w:t xml:space="preserve">Every tile in the game has a Resource variable inside its class. This is so that resources can add and remove resources from tiles when needed. This will include the ability for the player to consume the entire tiles resources on 1 turn, destroying the resource on the tile. The list of </w:t>
-      </w:r>
-      <w:r>
-        <w:t>resources available</w:t>
-      </w:r>
-      <w:r>
-        <w:t xml:space="preserve"> is as follows: Wheat, Fish, Cows, Horses, Stone, and Iron.</w:t>
-      </w:r>
-    </w:p>
-    <w:p/>
-    <w:p>
-      <w:r>
-        <w:t xml:space="preserve">Initially resources will be placed at random with some rules, such as fish only appearing on water tiles and wheat and cows only appearing in grassland. Other resources such as stone and iron will be available on any land tiles. </w:t>
-      </w:r>
-      <w:r>
-        <w:t xml:space="preserve">This random resource approach is purely for the development speed of the project and </w:t>
-      </w:r>
-      <w:r>
-        <w:t xml:space="preserve">will </w:t>
-      </w:r>
-      <w:r>
-        <w:t>be succeeded by a more sophisticated distribution algorithm to ensure both the player and the AI have relatively equal access to resources.</w:t>
-      </w:r>
-    </w:p>
-    <w:p>
-      <w:pPr>
-        <w:pStyle w:val="Heading3"/>
-      </w:pPr>
-      <w:bookmarkStart w:id="46" w:name="_Toc229075258"/>
-      <w:r>
-        <w:t>3.1.4 River generation</w:t>
-      </w:r>
-      <w:bookmarkEnd w:id="46"/>
-    </w:p>
-    <w:p>
-      <w:r>
-        <w:t>In this game, I want to incorporate river systems to boost food growth, production, gold, and general city prosperity. There are 2 methods for this that I want to explore, edge traversal and biome switching. For edge traversal, I will be selecting a random edge on a random tile and building a river from that, labelling each edge on a hexagon from 0 to 6 and making sure they link up correctly.</w:t>
-      </w:r>
-      <w:r>
-        <w:t xml:space="preserve"> This has the hindrance of having to draw new game objects for each river.</w:t>
-      </w:r>
-    </w:p>
-    <w:p/>
-    <w:p>
-      <w:r>
-        <w:t xml:space="preserve">The other possible method is biome switching, this will use 3 biomes: “River Head”, “River”, and “River End”. This method requires that I select a tile, and change its biome to “River Head”, then generate the river path, making it go towards either ocean or an arbitrary length, then switch the body of the river to </w:t>
-      </w:r>
-      <w:r>
-        <w:t xml:space="preserve">the </w:t>
-      </w:r>
-      <w:r>
-        <w:t>“River”</w:t>
-      </w:r>
-      <w:r>
-        <w:t xml:space="preserve"> biome</w:t>
-      </w:r>
-      <w:r>
-        <w:t xml:space="preserve"> and then</w:t>
-      </w:r>
-      <w:r>
-        <w:t xml:space="preserve"> switching the end of the river to the “River End” biome. This has the added benefit of easily switching the tile sprite.</w:t>
-      </w:r>
-      <w:r>
-        <w:t xml:space="preserve"> </w:t>
-      </w:r>
-    </w:p>
-    <w:p>
-      <w:pPr>
-        <w:pStyle w:val="Heading3"/>
-      </w:pPr>
-      <w:bookmarkStart w:id="47" w:name="_Toc229075259"/>
+      <w:bookmarkStart w:id="47" w:name="_Toc229085778"/>
       <w:r>
         <w:t>3.1.</w:t>
       </w:r>
@@ -8485,58 +8858,58 @@
     </w:p>
     <w:p>
       <w:r>
+        <w:t>As a result, using additional techniques, such as layering noise maps, applying rule-based biome adjustments and using noise warping for more organic shapes</w:t>
+      </w:r>
+      <w:r>
+        <w:t>, may be required to produce more coherent and strategically meaningful environments.</w:t>
+      </w:r>
+    </w:p>
+    <w:p>
+      <w:pPr>
+        <w:pStyle w:val="Heading2"/>
+      </w:pPr>
+      <w:bookmarkStart w:id="48" w:name="_Toc229085779"/>
+      <w:r>
+        <w:t>3.2 Pathfinding</w:t>
+      </w:r>
+      <w:bookmarkEnd w:id="48"/>
+    </w:p>
+    <w:p>
+      <w:r>
+        <w:t xml:space="preserve">After the research into different pathfinding types, I conclude that the best method for this project is to use the A* algorithm to create my pathfinding system with. I came to this conclusion through the evaluation of Dijkstra, A*, and JPS. While Dijkstra may be better for a single agent and JPS may be better for uniform cost graphs, A* has the best balance between performance across multiple agents whilst still allowing </w:t>
+      </w:r>
+      <w:r>
+        <w:t>different cost pathing.</w:t>
+      </w:r>
+    </w:p>
+    <w:p>
+      <w:pPr>
+        <w:pStyle w:val="Heading3"/>
+      </w:pPr>
+      <w:bookmarkStart w:id="49" w:name="_Toc229085780"/>
+      <w:r>
+        <w:t xml:space="preserve">3.2.1 </w:t>
+      </w:r>
+      <w:r>
+        <w:t>Architecture</w:t>
+      </w:r>
+      <w:bookmarkEnd w:id="49"/>
+    </w:p>
+    <w:p>
+      <w:r>
+        <w:t xml:space="preserve">The preferred method to access the pathfinding functions is through a singleton. This ensures that only one instance of this class can exist at any given time and allows the functions of the class to easily be used by calling the class instance rather than using references on every unit to access the class’s functions. </w:t>
+      </w:r>
+      <w:r>
+        <w:t xml:space="preserve">The cons of using a singleton implementation are that it can be difficult to </w:t>
+      </w:r>
+      <w:r>
+        <w:t>test code due to the instance being globally accessible, meaning that isolating code for testing can be challenging.</w:t>
+      </w:r>
+    </w:p>
+    <w:p/>
+    <w:p>
+      <w:r>
         <w:lastRenderedPageBreak/>
-        <w:t>As a result, using additional techniques, such as layering noise maps, applying rule-based biome adjustments and using noise warping for more organic shapes</w:t>
-      </w:r>
-      <w:r>
-        <w:t>, may be required to produce more coherent and strategically meaningful environments.</w:t>
-      </w:r>
-    </w:p>
-    <w:p>
-      <w:pPr>
-        <w:pStyle w:val="Heading2"/>
-      </w:pPr>
-      <w:bookmarkStart w:id="48" w:name="_Toc229075260"/>
-      <w:r>
-        <w:t>3.2 Pathfinding</w:t>
-      </w:r>
-      <w:bookmarkEnd w:id="48"/>
-    </w:p>
-    <w:p>
-      <w:r>
-        <w:t xml:space="preserve">After the research into different pathfinding types, I conclude that the best method for this project is to use the A* algorithm to create my pathfinding system with. I came to this conclusion through the evaluation of Dijkstra, A*, and JPS. While Dijkstra may be better for a single agent and JPS may be better for uniform cost graphs, A* has the best balance between performance across multiple agents whilst still allowing </w:t>
-      </w:r>
-      <w:r>
-        <w:t>different cost pathing.</w:t>
-      </w:r>
-    </w:p>
-    <w:p>
-      <w:pPr>
-        <w:pStyle w:val="Heading3"/>
-      </w:pPr>
-      <w:bookmarkStart w:id="49" w:name="_Toc229075261"/>
-      <w:r>
-        <w:t xml:space="preserve">3.2.1 </w:t>
-      </w:r>
-      <w:r>
-        <w:t>Architecture</w:t>
-      </w:r>
-      <w:bookmarkEnd w:id="49"/>
-    </w:p>
-    <w:p>
-      <w:r>
-        <w:t xml:space="preserve">The preferred method to access the pathfinding functions is through a singleton. This ensures that only one instance of this class can exist at any given time and allows the functions of the class to easily be used by calling the class instance rather than using references on every unit to access the class’s functions. </w:t>
-      </w:r>
-      <w:r>
-        <w:t xml:space="preserve">The cons of using a singleton implementation are that it can be difficult to </w:t>
-      </w:r>
-      <w:r>
-        <w:t>test code due to the instance being globally accessible, meaning that isolating code for testing can be challenging.</w:t>
-      </w:r>
-    </w:p>
-    <w:p/>
-    <w:p>
-      <w:r>
         <w:t xml:space="preserve">The alternative method is to use references on all </w:t>
       </w:r>
       <w:proofErr w:type="gramStart"/>
@@ -8572,7 +8945,7 @@
       <w:pPr>
         <w:pStyle w:val="Heading3"/>
       </w:pPr>
-      <w:bookmarkStart w:id="50" w:name="_Toc229075262"/>
+      <w:bookmarkStart w:id="50" w:name="_Toc229085781"/>
       <w:r>
         <w:t>3.2.2 Heuristics</w:t>
       </w:r>
@@ -8645,16 +9018,16 @@
     <w:p>
       <w:pPr>
         <w:keepNext/>
+        <w:jc w:val="center"/>
       </w:pPr>
       <w:r>
         <w:rPr>
           <w:noProof/>
         </w:rPr>
-        <w:lastRenderedPageBreak/>
         <w:drawing>
-          <wp:inline distT="0" distB="0" distL="0" distR="0" wp14:anchorId="37293E47" wp14:editId="59A72955">
-            <wp:extent cx="5731510" cy="1860550"/>
-            <wp:effectExtent l="0" t="0" r="2540" b="6350"/>
+          <wp:inline distT="0" distB="0" distL="0" distR="0" wp14:anchorId="37293E47" wp14:editId="428B1552">
+            <wp:extent cx="3640347" cy="1181721"/>
+            <wp:effectExtent l="0" t="0" r="0" b="0"/>
             <wp:docPr id="691597124" name="Picture 1" descr="Euclidean vs Manhattan vs Chebyshev Distance"/>
             <wp:cNvGraphicFramePr>
               <a:graphicFrameLocks xmlns:a="http://schemas.openxmlformats.org/drawingml/2006/main" noChangeAspect="1"/>
@@ -8669,7 +9042,7 @@
                     </pic:cNvPicPr>
                   </pic:nvPicPr>
                   <pic:blipFill>
-                    <a:blip r:embed="rId18">
+                    <a:blip r:embed="rId18" cstate="print">
                       <a:extLst>
                         <a:ext uri="{28A0092B-C50C-407E-A947-70E740481C1C}">
                           <a14:useLocalDpi xmlns:a14="http://schemas.microsoft.com/office/drawing/2010/main" val="0"/>
@@ -8684,7 +9057,7 @@
                   <pic:spPr bwMode="auto">
                     <a:xfrm>
                       <a:off x="0" y="0"/>
-                      <a:ext cx="5731510" cy="1860550"/>
+                      <a:ext cx="3711335" cy="1204765"/>
                     </a:xfrm>
                     <a:prstGeom prst="rect">
                       <a:avLst/>
@@ -8706,7 +9079,7 @@
         <w:pStyle w:val="Caption"/>
         <w:jc w:val="center"/>
       </w:pPr>
-      <w:bookmarkStart w:id="51" w:name="_Toc229075280"/>
+      <w:bookmarkStart w:id="51" w:name="_Toc229085730"/>
       <w:r>
         <w:t xml:space="preserve">Figure </w:t>
       </w:r>
@@ -8776,8 +9149,9 @@
       <w:pPr>
         <w:pStyle w:val="Heading3"/>
       </w:pPr>
-      <w:bookmarkStart w:id="52" w:name="_Toc229075263"/>
-      <w:r>
+      <w:bookmarkStart w:id="52" w:name="_Toc229085782"/>
+      <w:r>
+        <w:lastRenderedPageBreak/>
         <w:t>3.2.3 Limitations</w:t>
       </w:r>
       <w:bookmarkEnd w:id="52"/>
@@ -8813,7 +9187,6 @@
     <w:p/>
     <w:p>
       <w:r>
-        <w:lastRenderedPageBreak/>
         <w:t>Despite these limitations, this project will still be using a singleton architecture and Euclidean heuristics due to the</w:t>
       </w:r>
       <w:r>
@@ -8824,7 +9197,7 @@
       <w:pPr>
         <w:pStyle w:val="Heading2"/>
       </w:pPr>
-      <w:bookmarkStart w:id="53" w:name="_Toc229075264"/>
+      <w:bookmarkStart w:id="53" w:name="_Toc229085783"/>
       <w:r>
         <w:t>3.3 AI Integrations</w:t>
       </w:r>
@@ -8851,7 +9224,7 @@
       <w:pPr>
         <w:pStyle w:val="Heading3"/>
       </w:pPr>
-      <w:bookmarkStart w:id="54" w:name="_Toc229075265"/>
+      <w:bookmarkStart w:id="54" w:name="_Toc229085784"/>
       <w:r>
         <w:t>3.3.1 Unity ML-Agents</w:t>
       </w:r>
@@ -8921,6 +9294,7 @@
     <w:p/>
     <w:p>
       <w:r>
+        <w:lastRenderedPageBreak/>
         <w:t xml:space="preserve">Additionally, small reward values are assigned to general actions, such as movement, to discourage inactivity and prevent the agent from </w:t>
       </w:r>
       <w:r>
@@ -8955,7 +9329,7 @@
       <w:pPr>
         <w:pStyle w:val="Heading3"/>
       </w:pPr>
-      <w:bookmarkStart w:id="55" w:name="_Toc229075266"/>
+      <w:bookmarkStart w:id="55" w:name="_Toc229085785"/>
       <w:r>
         <w:t>3.3.2 AI Controller</w:t>
       </w:r>
@@ -8988,7 +9362,7 @@
       <w:pPr>
         <w:pStyle w:val="Heading3"/>
       </w:pPr>
-      <w:bookmarkStart w:id="56" w:name="_Toc229075267"/>
+      <w:bookmarkStart w:id="56" w:name="_Toc229085786"/>
       <w:r>
         <w:t>3.3.3 Limitations</w:t>
       </w:r>
@@ -9033,10 +9407,24 @@
     </w:p>
     <w:p>
       <w:pPr>
+        <w:rPr>
+          <w:rFonts w:eastAsiaTheme="majorEastAsia" w:cstheme="majorBidi"/>
+          <w:color w:val="0F4761" w:themeColor="accent1" w:themeShade="BF"/>
+          <w:sz w:val="40"/>
+          <w:szCs w:val="40"/>
+        </w:rPr>
+      </w:pPr>
+      <w:r>
+        <w:br w:type="page"/>
+      </w:r>
+    </w:p>
+    <w:p>
+      <w:pPr>
         <w:pStyle w:val="Heading1"/>
       </w:pPr>
-      <w:bookmarkStart w:id="57" w:name="_Toc229075268"/>
-      <w:r>
+      <w:bookmarkStart w:id="57" w:name="_Toc229085787"/>
+      <w:r>
+        <w:lastRenderedPageBreak/>
         <w:t xml:space="preserve">Chapter 4 </w:t>
       </w:r>
       <w:r>
@@ -9056,7 +9444,7 @@
       <w:pPr>
         <w:pStyle w:val="Heading2"/>
       </w:pPr>
-      <w:bookmarkStart w:id="58" w:name="_Toc229075269"/>
+      <w:bookmarkStart w:id="58" w:name="_Toc229085788"/>
       <w:r>
         <w:t>4.1 World Generation</w:t>
       </w:r>
@@ -9064,7 +9452,13 @@
     </w:p>
     <w:p>
       <w:r>
-        <w:t>After designing the world generation system, I have decided to break the implementation up into 4 subsections: Creating the colour noise map</w:t>
+        <w:t xml:space="preserve">After designing the world generation system, I have decided to break the implementation up into </w:t>
+      </w:r>
+      <w:r>
+        <w:t>3</w:t>
+      </w:r>
+      <w:r>
+        <w:t xml:space="preserve"> subsections: Creating the colour noise map</w:t>
       </w:r>
       <w:r>
         <w:t>,</w:t>
@@ -9076,20 +9470,11 @@
         <w:t>Creating the world map</w:t>
       </w:r>
       <w:r>
-        <w:t>,</w:t>
-      </w:r>
-      <w:r>
-        <w:t xml:space="preserve"> Creating the resource placement</w:t>
+        <w:t xml:space="preserve"> and</w:t>
       </w:r>
       <w:r>
         <w:t xml:space="preserve"> </w:t>
       </w:r>
-      <w:r>
-        <w:t>and</w:t>
-      </w:r>
-      <w:r>
-        <w:t xml:space="preserve"> </w:t>
-      </w:r>
       <w:proofErr w:type="gramStart"/>
       <w:r>
         <w:t>Creating</w:t>
@@ -9103,7 +9488,7 @@
       <w:pPr>
         <w:pStyle w:val="Heading3"/>
       </w:pPr>
-      <w:bookmarkStart w:id="59" w:name="_Toc229075270"/>
+      <w:bookmarkStart w:id="59" w:name="_Toc229085789"/>
       <w:r>
         <w:t>4.1.1 Creating the colour noise map</w:t>
       </w:r>
@@ -9286,7 +9671,7 @@
         <w:pStyle w:val="Caption"/>
         <w:jc w:val="center"/>
       </w:pPr>
-      <w:bookmarkStart w:id="60" w:name="_Toc229075281"/>
+      <w:bookmarkStart w:id="60" w:name="_Toc229085731"/>
       <w:r>
         <w:t xml:space="preserve">Figure </w:t>
       </w:r>
@@ -9458,7 +9843,7 @@
         <w:pStyle w:val="Caption"/>
         <w:jc w:val="center"/>
       </w:pPr>
-      <w:bookmarkStart w:id="61" w:name="_Toc229075282"/>
+      <w:bookmarkStart w:id="61" w:name="_Toc229085732"/>
       <w:r>
         <w:t xml:space="preserve">Figure </w:t>
       </w:r>
@@ -9531,7 +9916,6 @@
               <w:rPr>
                 <w:noProof/>
               </w:rPr>
-              <w:lastRenderedPageBreak/>
               <w:drawing>
                 <wp:inline distT="0" distB="0" distL="0" distR="0" wp14:anchorId="7DC12D17" wp14:editId="4CD1D739">
                   <wp:extent cx="3036498" cy="2216607"/>
@@ -9640,7 +10024,7 @@
         <w:pStyle w:val="Caption"/>
         <w:jc w:val="center"/>
       </w:pPr>
-      <w:bookmarkStart w:id="62" w:name="_Toc229075283"/>
+      <w:bookmarkStart w:id="62" w:name="_Toc229085733"/>
       <w:r>
         <w:t xml:space="preserve">Figure </w:t>
       </w:r>
@@ -9667,6 +10051,7 @@
         <w:rPr>
           <w:noProof/>
         </w:rPr>
+        <w:lastRenderedPageBreak/>
         <w:drawing>
           <wp:inline distT="0" distB="0" distL="0" distR="0" wp14:anchorId="01046673" wp14:editId="6BB7936B">
             <wp:extent cx="2958861" cy="1965248"/>
@@ -9722,7 +10107,7 @@
         <w:pStyle w:val="Caption"/>
         <w:jc w:val="center"/>
       </w:pPr>
-      <w:bookmarkStart w:id="63" w:name="_Toc229075284"/>
+      <w:bookmarkStart w:id="63" w:name="_Toc229085734"/>
       <w:r>
         <w:t xml:space="preserve">Figure </w:t>
       </w:r>
@@ -9748,7 +10133,7 @@
       <w:pPr>
         <w:pStyle w:val="Heading3"/>
       </w:pPr>
-      <w:bookmarkStart w:id="64" w:name="_Toc229075271"/>
+      <w:bookmarkStart w:id="64" w:name="_Toc229085790"/>
       <w:r>
         <w:t>4.1.2 Creating the world map</w:t>
       </w:r>
@@ -9758,17 +10143,22 @@
       <w:r>
         <w:t>Creating the world map requires using the colour map to determine what biome our tile sits in. The tile array is actually generated during the colour map generation. This is done to ensure that each tile is created as the program runs and that we don’t have to hold any memory expensive references to additional tiles.</w:t>
       </w:r>
+      <w:r>
+        <w:t xml:space="preserve"> </w:t>
+      </w:r>
+      <w:r>
+        <w:t xml:space="preserve">Figure 11 shows how </w:t>
+      </w:r>
+      <w:r>
+        <w:t>the system</w:t>
+      </w:r>
+      <w:r>
+        <w:t xml:space="preserve"> calculate a tile index and we use that variable again to insert a new tile into our tile array with the correct biome. This allows us to create a large array of tiles that can be passed to our world map in order to create a traversable world. </w:t>
+      </w:r>
     </w:p>
     <w:p/>
     <w:p>
       <w:r>
-        <w:t xml:space="preserve">Figure 11 shows how we calculate a tile index and we use that variable again to insert a new tile into our tile array with the correct biome. This allows us to create a large array of tiles that can be passed to our world map in order to create a traversable world. </w:t>
-      </w:r>
-    </w:p>
-    <w:p/>
-    <w:p>
-      <w:r>
-        <w:lastRenderedPageBreak/>
         <w:t>To generate the world map, I am going to create a tile prefab for each biome and instantiate them individually when the tile array is generated. This will allow the player controller to easily send the units to positions and I will not need to use converter functions. After making these changes to the world generation algorithm, I discovered that the game was uncomfortable to play as the performance was massively variable. The game started and 20 frames per second seemed to be the baseline for this method. This was unacceptable and so I started searching for alternatives.</w:t>
       </w:r>
     </w:p>
@@ -9804,7 +10194,11 @@
         </w:sdtContent>
       </w:sdt>
       <w:r>
-        <w:t>, I decided that creating chunks and drawing meshes would be the best approach. To do this, I had to create a chunk prefab with the ‘HexChunkRenderer’ component on it. This allowed me to split the world into chunks and draw and render them uniquely.</w:t>
+        <w:t xml:space="preserve">, I decided that creating chunks and drawing meshes would be the best approach. To do this, I had to create </w:t>
+      </w:r>
+      <w:r>
+        <w:lastRenderedPageBreak/>
+        <w:t>a chunk prefab with the ‘HexChunkRenderer’ component on it. This allowed me to split the world into chunks and draw and render them uniquely.</w:t>
       </w:r>
     </w:p>
     <w:p>
@@ -9871,7 +10265,7 @@
         <w:pStyle w:val="Caption"/>
         <w:jc w:val="center"/>
       </w:pPr>
-      <w:bookmarkStart w:id="65" w:name="_Toc229075285"/>
+      <w:bookmarkStart w:id="65" w:name="_Toc229085735"/>
       <w:r>
         <w:t xml:space="preserve">Figure </w:t>
       </w:r>
@@ -9896,7 +10290,19 @@
     <w:p/>
     <w:p>
       <w:r>
-        <w:t xml:space="preserve">This mesh is then attached to the individual HexChunk game object. The game then does this same process for all chunks within the game. This led to the game’s performance increasing tenfold. Unfortunately, this performance increase meant that player controller design needed to be tweaked to include converter functions from world space to tile space and vice versa. </w:t>
+        <w:t>This mesh is then attached to the individual HexChunk game object. The game then does this same process for all chunks within the game. This led to the game’s performance increasing tenfold</w:t>
+      </w:r>
+      <w:r>
+        <w:t>, up to 240fps in the editor</w:t>
+      </w:r>
+      <w:r>
+        <w:t>.</w:t>
+      </w:r>
+      <w:r>
+        <w:t xml:space="preserve"> Chunked mesh rendering reduces the number of rendered game objects from 40000, given a 200 by 200 grid, to 2500 game objects, given a chunk size of 16.</w:t>
+      </w:r>
+      <w:r>
+        <w:t xml:space="preserve"> Unfortunately, this performance increase meant that player controller design needed to be tweaked to include converter functions from world space to tile space and vice versa. </w:t>
       </w:r>
     </w:p>
     <w:p>
@@ -9905,7 +10311,6 @@
         <w:jc w:val="center"/>
       </w:pPr>
       <w:r>
-        <w:lastRenderedPageBreak/>
         <w:drawing>
           <wp:inline distT="0" distB="0" distL="0" distR="0" wp14:anchorId="0487571A" wp14:editId="27007B8E">
             <wp:extent cx="3019245" cy="1847473"/>
@@ -9948,7 +10353,7 @@
         <w:pStyle w:val="Caption"/>
         <w:jc w:val="center"/>
       </w:pPr>
-      <w:bookmarkStart w:id="66" w:name="_Toc229075286"/>
+      <w:bookmarkStart w:id="66" w:name="_Toc229085736"/>
       <w:r>
         <w:t xml:space="preserve">Figure </w:t>
       </w:r>
@@ -9967,9 +10372,475 @@
         <w:t>Figure 14 shows how the hex chunks are displayed in the game. Each of the HexChunk game objects have a mesh collider attached to them as well so that the player controller can raycast onto it and retrieve a position.</w:t>
       </w:r>
     </w:p>
+    <w:p>
+      <w:pPr>
+        <w:pStyle w:val="Heading3"/>
+      </w:pPr>
+      <w:bookmarkStart w:id="67" w:name="_Toc229085791"/>
+      <w:r>
+        <w:lastRenderedPageBreak/>
+        <w:t>4.1.3 Creating the River Generation</w:t>
+      </w:r>
+      <w:bookmarkEnd w:id="67"/>
+    </w:p>
+    <w:p>
+      <w:r>
+        <w:t>In order to create rivers within the game, tweaking the world generation system was necessary. Starting in the tile array initialisation, randomly deciding if a river would start on any given tile was the obvious choice. This conclusion was reached due to the time limitations of the project – creating a height-based water system was outside the scope of this project. The downsides of this were that rivers appeared overly straight</w:t>
+      </w:r>
+      <w:r>
+        <w:t>, had a maximum length</w:t>
+      </w:r>
+      <w:r>
+        <w:t xml:space="preserve"> and not indicative of features we come to expect from a river, such as splits, oxbow lakes, and more.</w:t>
+      </w:r>
+    </w:p>
     <w:p/>
+    <w:p>
+      <w:r>
+        <w:t>The defined rules for this generation system were:</w:t>
+      </w:r>
+    </w:p>
+    <w:p>
+      <w:pPr>
+        <w:pStyle w:val="ListParagraph"/>
+        <w:numPr>
+          <w:ilvl w:val="0"/>
+          <w:numId w:val="9"/>
+        </w:numPr>
+      </w:pPr>
+      <w:r>
+        <w:t>A maximum length of 100</w:t>
+      </w:r>
+    </w:p>
+    <w:p>
+      <w:pPr>
+        <w:pStyle w:val="ListParagraph"/>
+        <w:numPr>
+          <w:ilvl w:val="0"/>
+          <w:numId w:val="9"/>
+        </w:numPr>
+      </w:pPr>
+      <w:r>
+        <w:t>If the river hit itself then it stops</w:t>
+      </w:r>
+    </w:p>
+    <w:p>
+      <w:pPr>
+        <w:pStyle w:val="ListParagraph"/>
+        <w:numPr>
+          <w:ilvl w:val="0"/>
+          <w:numId w:val="9"/>
+        </w:numPr>
+      </w:pPr>
+      <w:r>
+        <w:t>If the river reaches sand it stops</w:t>
+      </w:r>
+    </w:p>
     <w:p/>
-    <w:bookmarkStart w:id="67" w:name="_Toc229075272" w:displacedByCustomXml="next"/>
+    <w:p>
+      <w:r>
+        <w:t>The initial plan for the river system was to use edge traversal, starting from a random side on our randomly selected river head</w:t>
+      </w:r>
+      <w:r>
+        <w:t xml:space="preserve">, the system then picks a neighbouring target at random and builds around the hexagon to reach that target. </w:t>
+      </w:r>
+      <w:r>
+        <w:t>W</w:t>
+      </w:r>
+      <w:r>
+        <w:t xml:space="preserve">hen </w:t>
+      </w:r>
+      <w:r>
+        <w:t>the system</w:t>
+      </w:r>
+      <w:r>
+        <w:t xml:space="preserve"> reaches that target, it then picks a new neighbouring target and continues to </w:t>
+      </w:r>
+      <w:r>
+        <w:t xml:space="preserve">build until one of the </w:t>
+      </w:r>
+      <w:r>
+        <w:t>pre</w:t>
+      </w:r>
+      <w:r>
+        <w:t>defined rules had been reached.</w:t>
+      </w:r>
+    </w:p>
+    <w:p/>
+    <w:p>
+      <w:pPr>
+        <w:keepNext/>
+        <w:jc w:val="center"/>
+      </w:pPr>
+      <w:r>
+        <w:rPr>
+          <w:noProof/>
+        </w:rPr>
+        <w:drawing>
+          <wp:inline distT="0" distB="0" distL="0" distR="0" wp14:anchorId="0DB43939" wp14:editId="0AC7863A">
+            <wp:extent cx="3321170" cy="1819164"/>
+            <wp:effectExtent l="0" t="0" r="0" b="0"/>
+            <wp:docPr id="1030550244" name="Picture 1"/>
+            <wp:cNvGraphicFramePr>
+              <a:graphicFrameLocks xmlns:a="http://schemas.openxmlformats.org/drawingml/2006/main" noChangeAspect="1"/>
+            </wp:cNvGraphicFramePr>
+            <a:graphic xmlns:a="http://schemas.openxmlformats.org/drawingml/2006/main">
+              <a:graphicData uri="http://schemas.openxmlformats.org/drawingml/2006/picture">
+                <pic:pic xmlns:pic="http://schemas.openxmlformats.org/drawingml/2006/picture">
+                  <pic:nvPicPr>
+                    <pic:cNvPr id="0" name="Picture 1"/>
+                    <pic:cNvPicPr>
+                      <a:picLocks noChangeAspect="1" noChangeArrowheads="1"/>
+                    </pic:cNvPicPr>
+                  </pic:nvPicPr>
+                  <pic:blipFill>
+                    <a:blip r:embed="rId28">
+                      <a:extLst>
+                        <a:ext uri="{28A0092B-C50C-407E-A947-70E740481C1C}">
+                          <a14:useLocalDpi xmlns:a14="http://schemas.microsoft.com/office/drawing/2010/main" val="0"/>
+                        </a:ext>
+                      </a:extLst>
+                    </a:blip>
+                    <a:srcRect/>
+                    <a:stretch>
+                      <a:fillRect/>
+                    </a:stretch>
+                  </pic:blipFill>
+                  <pic:spPr bwMode="auto">
+                    <a:xfrm>
+                      <a:off x="0" y="0"/>
+                      <a:ext cx="3330555" cy="1824304"/>
+                    </a:xfrm>
+                    <a:prstGeom prst="rect">
+                      <a:avLst/>
+                    </a:prstGeom>
+                    <a:noFill/>
+                    <a:ln>
+                      <a:noFill/>
+                    </a:ln>
+                  </pic:spPr>
+                </pic:pic>
+              </a:graphicData>
+            </a:graphic>
+          </wp:inline>
+        </w:drawing>
+      </w:r>
+    </w:p>
+    <w:p>
+      <w:pPr>
+        <w:pStyle w:val="Caption"/>
+        <w:jc w:val="center"/>
+      </w:pPr>
+      <w:bookmarkStart w:id="68" w:name="_Toc229085737"/>
+      <w:r>
+        <w:t xml:space="preserve">Figure </w:t>
+      </w:r>
+      <w:fldSimple w:instr=" SEQ Figure \* ARABIC ">
+        <w:r>
+          <w:rPr>
+            <w:noProof/>
+          </w:rPr>
+          <w:t>15</w:t>
+        </w:r>
+        <w:bookmarkEnd w:id="68"/>
+      </w:fldSimple>
+    </w:p>
+    <w:p>
+      <w:r>
+        <w:t xml:space="preserve">Figure 15 shows the </w:t>
+      </w:r>
+      <w:r>
+        <w:t xml:space="preserve">initial implementation of </w:t>
+      </w:r>
+      <w:r>
+        <w:t xml:space="preserve">the river systems. This initial implementation had some key limitations, such as </w:t>
+      </w:r>
+      <w:r>
+        <w:t>the river tracing one side of every tile and completely straight. In order to combat these limitations, the system was changed to select a random direction to build around each hexagon in and to randomly attempt to turn away from the current direction at a 20% frequency on every new target.</w:t>
+      </w:r>
+    </w:p>
+    <w:p>
+      <w:pPr>
+        <w:keepNext/>
+        <w:jc w:val="center"/>
+      </w:pPr>
+      <w:r>
+        <w:rPr>
+          <w:noProof/>
+        </w:rPr>
+        <w:lastRenderedPageBreak/>
+        <w:drawing>
+          <wp:inline distT="0" distB="0" distL="0" distR="0" wp14:anchorId="6F57771C" wp14:editId="403558EC">
+            <wp:extent cx="4804913" cy="1577844"/>
+            <wp:effectExtent l="0" t="0" r="0" b="3810"/>
+            <wp:docPr id="122939856" name="Picture 2"/>
+            <wp:cNvGraphicFramePr>
+              <a:graphicFrameLocks xmlns:a="http://schemas.openxmlformats.org/drawingml/2006/main" noChangeAspect="1"/>
+            </wp:cNvGraphicFramePr>
+            <a:graphic xmlns:a="http://schemas.openxmlformats.org/drawingml/2006/main">
+              <a:graphicData uri="http://schemas.openxmlformats.org/drawingml/2006/picture">
+                <pic:pic xmlns:pic="http://schemas.openxmlformats.org/drawingml/2006/picture">
+                  <pic:nvPicPr>
+                    <pic:cNvPr id="0" name="Picture 2"/>
+                    <pic:cNvPicPr>
+                      <a:picLocks noChangeAspect="1" noChangeArrowheads="1"/>
+                    </pic:cNvPicPr>
+                  </pic:nvPicPr>
+                  <pic:blipFill>
+                    <a:blip r:embed="rId29">
+                      <a:extLst>
+                        <a:ext uri="{28A0092B-C50C-407E-A947-70E740481C1C}">
+                          <a14:useLocalDpi xmlns:a14="http://schemas.microsoft.com/office/drawing/2010/main" val="0"/>
+                        </a:ext>
+                      </a:extLst>
+                    </a:blip>
+                    <a:srcRect/>
+                    <a:stretch>
+                      <a:fillRect/>
+                    </a:stretch>
+                  </pic:blipFill>
+                  <pic:spPr bwMode="auto">
+                    <a:xfrm>
+                      <a:off x="0" y="0"/>
+                      <a:ext cx="4845772" cy="1591261"/>
+                    </a:xfrm>
+                    <a:prstGeom prst="rect">
+                      <a:avLst/>
+                    </a:prstGeom>
+                    <a:noFill/>
+                    <a:ln>
+                      <a:noFill/>
+                    </a:ln>
+                  </pic:spPr>
+                </pic:pic>
+              </a:graphicData>
+            </a:graphic>
+          </wp:inline>
+        </w:drawing>
+      </w:r>
+    </w:p>
+    <w:p>
+      <w:pPr>
+        <w:pStyle w:val="Caption"/>
+        <w:jc w:val="center"/>
+      </w:pPr>
+      <w:bookmarkStart w:id="69" w:name="_Toc229085738"/>
+      <w:r>
+        <w:t xml:space="preserve">Figure </w:t>
+      </w:r>
+      <w:fldSimple w:instr=" SEQ Figure \* ARABIC ">
+        <w:r>
+          <w:rPr>
+            <w:noProof/>
+          </w:rPr>
+          <w:t>16</w:t>
+        </w:r>
+        <w:bookmarkEnd w:id="69"/>
+      </w:fldSimple>
+    </w:p>
+    <w:p>
+      <w:r>
+        <w:t xml:space="preserve">Figure 16 shows how the aforementioned changes made the rivers less connected although they did appear to turn now. Unfortunately, after many hours of despair and referring back to other media in the genre, this system was scrapped in favour of a tile-based system. The river would now be randomly selected to start, but the edge traversal will never take place. This edge traversal system was replaced by a </w:t>
+      </w:r>
+      <w:r>
+        <w:t>recursive algorithm that randomly selected a direction from the start tile, changed the tile biome of the current tile to be the river, river head or river turns, then moved in the direction of the next tile, repeating the process until the previously established conditions were met.</w:t>
+      </w:r>
+    </w:p>
+    <w:p>
+      <w:pPr>
+        <w:keepNext/>
+        <w:jc w:val="center"/>
+      </w:pPr>
+    </w:p>
+    <w:p>
+      <w:pPr>
+        <w:pStyle w:val="Caption"/>
+        <w:keepNext/>
+        <w:jc w:val="center"/>
+      </w:pPr>
+      <w:r>
+        <w:rPr>
+          <w:noProof/>
+        </w:rPr>
+        <w:drawing>
+          <wp:inline distT="0" distB="0" distL="0" distR="0" wp14:anchorId="737AEDB6" wp14:editId="43BBA09B">
+            <wp:extent cx="5011948" cy="3008727"/>
+            <wp:effectExtent l="0" t="0" r="0" b="1270"/>
+            <wp:docPr id="640346444" name="Picture 6"/>
+            <wp:cNvGraphicFramePr>
+              <a:graphicFrameLocks xmlns:a="http://schemas.openxmlformats.org/drawingml/2006/main" noChangeAspect="1"/>
+            </wp:cNvGraphicFramePr>
+            <a:graphic xmlns:a="http://schemas.openxmlformats.org/drawingml/2006/main">
+              <a:graphicData uri="http://schemas.openxmlformats.org/drawingml/2006/picture">
+                <pic:pic xmlns:pic="http://schemas.openxmlformats.org/drawingml/2006/picture">
+                  <pic:nvPicPr>
+                    <pic:cNvPr id="0" name="Picture 6"/>
+                    <pic:cNvPicPr>
+                      <a:picLocks noChangeAspect="1" noChangeArrowheads="1"/>
+                    </pic:cNvPicPr>
+                  </pic:nvPicPr>
+                  <pic:blipFill>
+                    <a:blip r:embed="rId30" cstate="print">
+                      <a:extLst>
+                        <a:ext uri="{28A0092B-C50C-407E-A947-70E740481C1C}">
+                          <a14:useLocalDpi xmlns:a14="http://schemas.microsoft.com/office/drawing/2010/main" val="0"/>
+                        </a:ext>
+                      </a:extLst>
+                    </a:blip>
+                    <a:srcRect/>
+                    <a:stretch>
+                      <a:fillRect/>
+                    </a:stretch>
+                  </pic:blipFill>
+                  <pic:spPr bwMode="auto">
+                    <a:xfrm>
+                      <a:off x="0" y="0"/>
+                      <a:ext cx="5018181" cy="3012469"/>
+                    </a:xfrm>
+                    <a:prstGeom prst="rect">
+                      <a:avLst/>
+                    </a:prstGeom>
+                    <a:noFill/>
+                    <a:ln>
+                      <a:noFill/>
+                    </a:ln>
+                  </pic:spPr>
+                </pic:pic>
+              </a:graphicData>
+            </a:graphic>
+          </wp:inline>
+        </w:drawing>
+      </w:r>
+    </w:p>
+    <w:p>
+      <w:pPr>
+        <w:pStyle w:val="Caption"/>
+        <w:jc w:val="center"/>
+      </w:pPr>
+      <w:bookmarkStart w:id="70" w:name="_Toc229085739"/>
+      <w:r>
+        <w:t xml:space="preserve">Figure </w:t>
+      </w:r>
+      <w:fldSimple w:instr=" SEQ Figure \* ARABIC ">
+        <w:r>
+          <w:rPr>
+            <w:noProof/>
+          </w:rPr>
+          <w:t>17</w:t>
+        </w:r>
+        <w:bookmarkEnd w:id="70"/>
+      </w:fldSimple>
+    </w:p>
+    <w:p>
+      <w:pPr>
+        <w:pStyle w:val="Caption"/>
+      </w:pPr>
+    </w:p>
+    <w:p>
+      <w:r>
+        <w:t>Figure 17 shows the code used to generate the rivers. As shown, turns are made at random, and the river will keep moving recursively until the conditions are met. This recursive system has all the standard protections regarding null reference protections, length protections and biome protections. In the case that these protections are triggered, the system still returns the river in order to be drawn later.</w:t>
+      </w:r>
+    </w:p>
+    <w:p>
+      <w:pPr>
+        <w:keepNext/>
+        <w:jc w:val="center"/>
+      </w:pPr>
+      <w:r>
+        <w:rPr>
+          <w:noProof/>
+        </w:rPr>
+        <w:lastRenderedPageBreak/>
+        <w:drawing>
+          <wp:inline distT="0" distB="0" distL="0" distR="0" wp14:anchorId="71323A71" wp14:editId="3D90E985">
+            <wp:extent cx="4123426" cy="3024455"/>
+            <wp:effectExtent l="0" t="0" r="0" b="0"/>
+            <wp:docPr id="1831725379" name="Picture 8"/>
+            <wp:cNvGraphicFramePr>
+              <a:graphicFrameLocks xmlns:a="http://schemas.openxmlformats.org/drawingml/2006/main" noChangeAspect="1"/>
+            </wp:cNvGraphicFramePr>
+            <a:graphic xmlns:a="http://schemas.openxmlformats.org/drawingml/2006/main">
+              <a:graphicData uri="http://schemas.openxmlformats.org/drawingml/2006/picture">
+                <pic:pic xmlns:pic="http://schemas.openxmlformats.org/drawingml/2006/picture">
+                  <pic:nvPicPr>
+                    <pic:cNvPr id="0" name="Picture 8"/>
+                    <pic:cNvPicPr>
+                      <a:picLocks noChangeAspect="1" noChangeArrowheads="1"/>
+                    </pic:cNvPicPr>
+                  </pic:nvPicPr>
+                  <pic:blipFill>
+                    <a:blip r:embed="rId31">
+                      <a:extLst>
+                        <a:ext uri="{28A0092B-C50C-407E-A947-70E740481C1C}">
+                          <a14:useLocalDpi xmlns:a14="http://schemas.microsoft.com/office/drawing/2010/main" val="0"/>
+                        </a:ext>
+                      </a:extLst>
+                    </a:blip>
+                    <a:srcRect/>
+                    <a:stretch>
+                      <a:fillRect/>
+                    </a:stretch>
+                  </pic:blipFill>
+                  <pic:spPr bwMode="auto">
+                    <a:xfrm>
+                      <a:off x="0" y="0"/>
+                      <a:ext cx="4129860" cy="3029174"/>
+                    </a:xfrm>
+                    <a:prstGeom prst="rect">
+                      <a:avLst/>
+                    </a:prstGeom>
+                    <a:noFill/>
+                    <a:ln>
+                      <a:noFill/>
+                    </a:ln>
+                  </pic:spPr>
+                </pic:pic>
+              </a:graphicData>
+            </a:graphic>
+          </wp:inline>
+        </w:drawing>
+      </w:r>
+    </w:p>
+    <w:p>
+      <w:pPr>
+        <w:pStyle w:val="Caption"/>
+        <w:jc w:val="center"/>
+      </w:pPr>
+      <w:bookmarkStart w:id="71" w:name="_Toc229085740"/>
+      <w:r>
+        <w:t xml:space="preserve">Figure </w:t>
+      </w:r>
+      <w:fldSimple w:instr=" SEQ Figure \* ARABIC ">
+        <w:r>
+          <w:rPr>
+            <w:noProof/>
+          </w:rPr>
+          <w:t>18</w:t>
+        </w:r>
+        <w:bookmarkEnd w:id="71"/>
+      </w:fldSimple>
+    </w:p>
+    <w:p/>
+    <w:p>
+      <w:r>
+        <w:t>Figure 18 shows how the new system generates rivers that can bend and still connect to each other. This system required 4 sprites to be created and transformed in order to make the rivers link together. This was deemed as acceptable due to the time already spent on this feature, 22 hours were spent until reaching this point, and that other features were taking priority.</w:t>
+      </w:r>
+    </w:p>
+    <w:p>
+      <w:r>
+        <w:t xml:space="preserve"> </w:t>
+      </w:r>
+    </w:p>
+    <w:p/>
+    <w:p>
+      <w:pPr>
+        <w:jc w:val="center"/>
+      </w:pPr>
+      <w:r>
+        <w:br w:type="page"/>
+      </w:r>
+    </w:p>
+    <w:bookmarkStart w:id="72" w:name="_Toc229085792" w:displacedByCustomXml="next"/>
     <w:sdt>
       <w:sdtPr>
         <w:rPr>
@@ -9997,7 +10868,7 @@
           <w:r>
             <w:t>References</w:t>
           </w:r>
-          <w:bookmarkEnd w:id="67"/>
+          <w:bookmarkEnd w:id="72"/>
         </w:p>
         <w:sdt>
           <w:sdtPr>
@@ -10314,7 +11185,6 @@
                 <w:rPr>
                   <w:noProof/>
                 </w:rPr>
-                <w:lastRenderedPageBreak/>
                 <w:t xml:space="preserve">OpenGenus IQ, 2018. </w:t>
               </w:r>
               <w:r>
@@ -10539,6 +11409,7 @@
                 <w:rPr>
                   <w:noProof/>
                 </w:rPr>
+                <w:lastRenderedPageBreak/>
                 <w:t xml:space="preserve">Yadav, H., 2025. </w:t>
               </w:r>
               <w:r>
@@ -11394,9 +12265,9 @@
     </w:lvl>
   </w:abstractNum>
   <w:abstractNum w:abstractNumId="6" w15:restartNumberingAfterBreak="0">
-    <w:nsid w:val="6F4C07D3"/>
+    <w:nsid w:val="408C74DA"/>
     <w:multiLevelType w:val="hybridMultilevel"/>
-    <w:tmpl w:val="C00ADDF0"/>
+    <w:tmpl w:val="40045936"/>
     <w:lvl w:ilvl="0" w:tplc="08090001">
       <w:start w:val="1"/>
       <w:numFmt w:val="bullet"/>
@@ -11506,11 +12377,237 @@
       </w:rPr>
     </w:lvl>
   </w:abstractNum>
+  <w:abstractNum w:abstractNumId="7" w15:restartNumberingAfterBreak="0">
+    <w:nsid w:val="4CE7033C"/>
+    <w:multiLevelType w:val="hybridMultilevel"/>
+    <w:tmpl w:val="6A06D35C"/>
+    <w:lvl w:ilvl="0" w:tplc="08090001">
+      <w:start w:val="1"/>
+      <w:numFmt w:val="bullet"/>
+      <w:lvlText w:val=""/>
+      <w:lvlJc w:val="left"/>
+      <w:pPr>
+        <w:ind w:left="720" w:hanging="360"/>
+      </w:pPr>
+      <w:rPr>
+        <w:rFonts w:ascii="Symbol" w:hAnsi="Symbol" w:hint="default"/>
+      </w:rPr>
+    </w:lvl>
+    <w:lvl w:ilvl="1" w:tplc="08090003" w:tentative="1">
+      <w:start w:val="1"/>
+      <w:numFmt w:val="bullet"/>
+      <w:lvlText w:val="o"/>
+      <w:lvlJc w:val="left"/>
+      <w:pPr>
+        <w:ind w:left="1440" w:hanging="360"/>
+      </w:pPr>
+      <w:rPr>
+        <w:rFonts w:ascii="Courier New" w:hAnsi="Courier New" w:cs="Courier New" w:hint="default"/>
+      </w:rPr>
+    </w:lvl>
+    <w:lvl w:ilvl="2" w:tplc="08090005" w:tentative="1">
+      <w:start w:val="1"/>
+      <w:numFmt w:val="bullet"/>
+      <w:lvlText w:val=""/>
+      <w:lvlJc w:val="left"/>
+      <w:pPr>
+        <w:ind w:left="2160" w:hanging="360"/>
+      </w:pPr>
+      <w:rPr>
+        <w:rFonts w:ascii="Wingdings" w:hAnsi="Wingdings" w:hint="default"/>
+      </w:rPr>
+    </w:lvl>
+    <w:lvl w:ilvl="3" w:tplc="08090001" w:tentative="1">
+      <w:start w:val="1"/>
+      <w:numFmt w:val="bullet"/>
+      <w:lvlText w:val=""/>
+      <w:lvlJc w:val="left"/>
+      <w:pPr>
+        <w:ind w:left="2880" w:hanging="360"/>
+      </w:pPr>
+      <w:rPr>
+        <w:rFonts w:ascii="Symbol" w:hAnsi="Symbol" w:hint="default"/>
+      </w:rPr>
+    </w:lvl>
+    <w:lvl w:ilvl="4" w:tplc="08090003" w:tentative="1">
+      <w:start w:val="1"/>
+      <w:numFmt w:val="bullet"/>
+      <w:lvlText w:val="o"/>
+      <w:lvlJc w:val="left"/>
+      <w:pPr>
+        <w:ind w:left="3600" w:hanging="360"/>
+      </w:pPr>
+      <w:rPr>
+        <w:rFonts w:ascii="Courier New" w:hAnsi="Courier New" w:cs="Courier New" w:hint="default"/>
+      </w:rPr>
+    </w:lvl>
+    <w:lvl w:ilvl="5" w:tplc="08090005" w:tentative="1">
+      <w:start w:val="1"/>
+      <w:numFmt w:val="bullet"/>
+      <w:lvlText w:val=""/>
+      <w:lvlJc w:val="left"/>
+      <w:pPr>
+        <w:ind w:left="4320" w:hanging="360"/>
+      </w:pPr>
+      <w:rPr>
+        <w:rFonts w:ascii="Wingdings" w:hAnsi="Wingdings" w:hint="default"/>
+      </w:rPr>
+    </w:lvl>
+    <w:lvl w:ilvl="6" w:tplc="08090001" w:tentative="1">
+      <w:start w:val="1"/>
+      <w:numFmt w:val="bullet"/>
+      <w:lvlText w:val=""/>
+      <w:lvlJc w:val="left"/>
+      <w:pPr>
+        <w:ind w:left="5040" w:hanging="360"/>
+      </w:pPr>
+      <w:rPr>
+        <w:rFonts w:ascii="Symbol" w:hAnsi="Symbol" w:hint="default"/>
+      </w:rPr>
+    </w:lvl>
+    <w:lvl w:ilvl="7" w:tplc="08090003" w:tentative="1">
+      <w:start w:val="1"/>
+      <w:numFmt w:val="bullet"/>
+      <w:lvlText w:val="o"/>
+      <w:lvlJc w:val="left"/>
+      <w:pPr>
+        <w:ind w:left="5760" w:hanging="360"/>
+      </w:pPr>
+      <w:rPr>
+        <w:rFonts w:ascii="Courier New" w:hAnsi="Courier New" w:cs="Courier New" w:hint="default"/>
+      </w:rPr>
+    </w:lvl>
+    <w:lvl w:ilvl="8" w:tplc="08090005" w:tentative="1">
+      <w:start w:val="1"/>
+      <w:numFmt w:val="bullet"/>
+      <w:lvlText w:val=""/>
+      <w:lvlJc w:val="left"/>
+      <w:pPr>
+        <w:ind w:left="6480" w:hanging="360"/>
+      </w:pPr>
+      <w:rPr>
+        <w:rFonts w:ascii="Wingdings" w:hAnsi="Wingdings" w:hint="default"/>
+      </w:rPr>
+    </w:lvl>
+  </w:abstractNum>
+  <w:abstractNum w:abstractNumId="8" w15:restartNumberingAfterBreak="0">
+    <w:nsid w:val="6F4C07D3"/>
+    <w:multiLevelType w:val="hybridMultilevel"/>
+    <w:tmpl w:val="C00ADDF0"/>
+    <w:lvl w:ilvl="0" w:tplc="08090001">
+      <w:start w:val="1"/>
+      <w:numFmt w:val="bullet"/>
+      <w:lvlText w:val=""/>
+      <w:lvlJc w:val="left"/>
+      <w:pPr>
+        <w:ind w:left="720" w:hanging="360"/>
+      </w:pPr>
+      <w:rPr>
+        <w:rFonts w:ascii="Symbol" w:hAnsi="Symbol" w:hint="default"/>
+      </w:rPr>
+    </w:lvl>
+    <w:lvl w:ilvl="1" w:tplc="08090003" w:tentative="1">
+      <w:start w:val="1"/>
+      <w:numFmt w:val="bullet"/>
+      <w:lvlText w:val="o"/>
+      <w:lvlJc w:val="left"/>
+      <w:pPr>
+        <w:ind w:left="1440" w:hanging="360"/>
+      </w:pPr>
+      <w:rPr>
+        <w:rFonts w:ascii="Courier New" w:hAnsi="Courier New" w:cs="Courier New" w:hint="default"/>
+      </w:rPr>
+    </w:lvl>
+    <w:lvl w:ilvl="2" w:tplc="08090005" w:tentative="1">
+      <w:start w:val="1"/>
+      <w:numFmt w:val="bullet"/>
+      <w:lvlText w:val=""/>
+      <w:lvlJc w:val="left"/>
+      <w:pPr>
+        <w:ind w:left="2160" w:hanging="360"/>
+      </w:pPr>
+      <w:rPr>
+        <w:rFonts w:ascii="Wingdings" w:hAnsi="Wingdings" w:hint="default"/>
+      </w:rPr>
+    </w:lvl>
+    <w:lvl w:ilvl="3" w:tplc="08090001" w:tentative="1">
+      <w:start w:val="1"/>
+      <w:numFmt w:val="bullet"/>
+      <w:lvlText w:val=""/>
+      <w:lvlJc w:val="left"/>
+      <w:pPr>
+        <w:ind w:left="2880" w:hanging="360"/>
+      </w:pPr>
+      <w:rPr>
+        <w:rFonts w:ascii="Symbol" w:hAnsi="Symbol" w:hint="default"/>
+      </w:rPr>
+    </w:lvl>
+    <w:lvl w:ilvl="4" w:tplc="08090003" w:tentative="1">
+      <w:start w:val="1"/>
+      <w:numFmt w:val="bullet"/>
+      <w:lvlText w:val="o"/>
+      <w:lvlJc w:val="left"/>
+      <w:pPr>
+        <w:ind w:left="3600" w:hanging="360"/>
+      </w:pPr>
+      <w:rPr>
+        <w:rFonts w:ascii="Courier New" w:hAnsi="Courier New" w:cs="Courier New" w:hint="default"/>
+      </w:rPr>
+    </w:lvl>
+    <w:lvl w:ilvl="5" w:tplc="08090005" w:tentative="1">
+      <w:start w:val="1"/>
+      <w:numFmt w:val="bullet"/>
+      <w:lvlText w:val=""/>
+      <w:lvlJc w:val="left"/>
+      <w:pPr>
+        <w:ind w:left="4320" w:hanging="360"/>
+      </w:pPr>
+      <w:rPr>
+        <w:rFonts w:ascii="Wingdings" w:hAnsi="Wingdings" w:hint="default"/>
+      </w:rPr>
+    </w:lvl>
+    <w:lvl w:ilvl="6" w:tplc="08090001" w:tentative="1">
+      <w:start w:val="1"/>
+      <w:numFmt w:val="bullet"/>
+      <w:lvlText w:val=""/>
+      <w:lvlJc w:val="left"/>
+      <w:pPr>
+        <w:ind w:left="5040" w:hanging="360"/>
+      </w:pPr>
+      <w:rPr>
+        <w:rFonts w:ascii="Symbol" w:hAnsi="Symbol" w:hint="default"/>
+      </w:rPr>
+    </w:lvl>
+    <w:lvl w:ilvl="7" w:tplc="08090003" w:tentative="1">
+      <w:start w:val="1"/>
+      <w:numFmt w:val="bullet"/>
+      <w:lvlText w:val="o"/>
+      <w:lvlJc w:val="left"/>
+      <w:pPr>
+        <w:ind w:left="5760" w:hanging="360"/>
+      </w:pPr>
+      <w:rPr>
+        <w:rFonts w:ascii="Courier New" w:hAnsi="Courier New" w:cs="Courier New" w:hint="default"/>
+      </w:rPr>
+    </w:lvl>
+    <w:lvl w:ilvl="8" w:tplc="08090005" w:tentative="1">
+      <w:start w:val="1"/>
+      <w:numFmt w:val="bullet"/>
+      <w:lvlText w:val=""/>
+      <w:lvlJc w:val="left"/>
+      <w:pPr>
+        <w:ind w:left="6480" w:hanging="360"/>
+      </w:pPr>
+      <w:rPr>
+        <w:rFonts w:ascii="Wingdings" w:hAnsi="Wingdings" w:hint="default"/>
+      </w:rPr>
+    </w:lvl>
+  </w:abstractNum>
   <w:num w:numId="1" w16cid:durableId="441345725">
     <w:abstractNumId w:val="4"/>
   </w:num>
   <w:num w:numId="2" w16cid:durableId="800418358">
-    <w:abstractNumId w:val="6"/>
+    <w:abstractNumId w:val="8"/>
   </w:num>
   <w:num w:numId="3" w16cid:durableId="1302493766">
     <w:abstractNumId w:val="3"/>
@@ -11526,6 +12623,12 @@
   </w:num>
   <w:num w:numId="7" w16cid:durableId="1732995949">
     <w:abstractNumId w:val="0"/>
+  </w:num>
+  <w:num w:numId="8" w16cid:durableId="406996837">
+    <w:abstractNumId w:val="6"/>
+  </w:num>
+  <w:num w:numId="9" w16cid:durableId="1612085945">
+    <w:abstractNumId w:val="7"/>
   </w:num>
 </w:numbering>
 </file>

</xml_diff>

<commit_message>
feat: pathfinding implementation finished
</commit_message>
<xml_diff>
--- a/Report.docx
+++ b/Report.docx
@@ -321,7 +321,7 @@
         <w:pStyle w:val="Heading1"/>
       </w:pPr>
       <w:bookmarkStart w:id="1" w:name="_Toc40898999"/>
-      <w:bookmarkStart w:id="2" w:name="_Toc229085741"/>
+      <w:bookmarkStart w:id="2" w:name="_Toc229092984"/>
       <w:r>
         <w:lastRenderedPageBreak/>
         <w:t>Abstract</w:t>
@@ -369,7 +369,7 @@
         <w:spacing w:after="321"/>
         <w:ind w:left="-5"/>
       </w:pPr>
-      <w:bookmarkStart w:id="3" w:name="_Toc229085742"/>
+      <w:bookmarkStart w:id="3" w:name="_Toc229092985"/>
       <w:r>
         <w:lastRenderedPageBreak/>
         <w:t>Declaration</w:t>
@@ -491,7 +491,7 @@
         <w:ind w:left="-5"/>
       </w:pPr>
       <w:bookmarkStart w:id="4" w:name="_Toc40899001"/>
-      <w:bookmarkStart w:id="5" w:name="_Toc229085743"/>
+      <w:bookmarkStart w:id="5" w:name="_Toc229092986"/>
       <w:r>
         <w:lastRenderedPageBreak/>
         <w:t>Acknowledgements</w:t>
@@ -628,7 +628,7 @@
         <w:spacing w:line="259" w:lineRule="auto"/>
       </w:pPr>
     </w:p>
-    <w:bookmarkStart w:id="6" w:name="_Toc229085744" w:displacedByCustomXml="next"/>
+    <w:bookmarkStart w:id="6" w:name="_Toc229092987" w:displacedByCustomXml="next"/>
     <w:sdt>
       <w:sdtPr>
         <w:rPr>
@@ -686,7 +686,7 @@
           <w:r>
             <w:fldChar w:fldCharType="separate"/>
           </w:r>
-          <w:hyperlink w:anchor="_Toc229085741" w:history="1">
+          <w:hyperlink w:anchor="_Toc229092984" w:history="1">
             <w:r>
               <w:rPr>
                 <w:rStyle w:val="Hyperlink"/>
@@ -713,7 +713,7 @@
                 <w:noProof/>
                 <w:webHidden/>
               </w:rPr>
-              <w:instrText xml:space="preserve"> PAGEREF _Toc229085741 \h </w:instrText>
+              <w:instrText xml:space="preserve"> PAGEREF _Toc229092984 \h </w:instrText>
             </w:r>
             <w:r>
               <w:rPr>
@@ -760,7 +760,7 @@
               <w14:ligatures w14:val="standardContextual"/>
             </w:rPr>
           </w:pPr>
-          <w:hyperlink w:anchor="_Toc229085742" w:history="1">
+          <w:hyperlink w:anchor="_Toc229092985" w:history="1">
             <w:r>
               <w:rPr>
                 <w:rStyle w:val="Hyperlink"/>
@@ -787,7 +787,7 @@
                 <w:noProof/>
                 <w:webHidden/>
               </w:rPr>
-              <w:instrText xml:space="preserve"> PAGEREF _Toc229085742 \h </w:instrText>
+              <w:instrText xml:space="preserve"> PAGEREF _Toc229092985 \h </w:instrText>
             </w:r>
             <w:r>
               <w:rPr>
@@ -834,7 +834,7 @@
               <w14:ligatures w14:val="standardContextual"/>
             </w:rPr>
           </w:pPr>
-          <w:hyperlink w:anchor="_Toc229085743" w:history="1">
+          <w:hyperlink w:anchor="_Toc229092986" w:history="1">
             <w:r>
               <w:rPr>
                 <w:rStyle w:val="Hyperlink"/>
@@ -861,7 +861,7 @@
                 <w:noProof/>
                 <w:webHidden/>
               </w:rPr>
-              <w:instrText xml:space="preserve"> PAGEREF _Toc229085743 \h </w:instrText>
+              <w:instrText xml:space="preserve"> PAGEREF _Toc229092986 \h </w:instrText>
             </w:r>
             <w:r>
               <w:rPr>
@@ -908,7 +908,7 @@
               <w14:ligatures w14:val="standardContextual"/>
             </w:rPr>
           </w:pPr>
-          <w:hyperlink w:anchor="_Toc229085744" w:history="1">
+          <w:hyperlink w:anchor="_Toc229092987" w:history="1">
             <w:r>
               <w:rPr>
                 <w:rStyle w:val="Hyperlink"/>
@@ -935,7 +935,7 @@
                 <w:noProof/>
                 <w:webHidden/>
               </w:rPr>
-              <w:instrText xml:space="preserve"> PAGEREF _Toc229085744 \h </w:instrText>
+              <w:instrText xml:space="preserve"> PAGEREF _Toc229092987 \h </w:instrText>
             </w:r>
             <w:r>
               <w:rPr>
@@ -982,7 +982,7 @@
               <w14:ligatures w14:val="standardContextual"/>
             </w:rPr>
           </w:pPr>
-          <w:hyperlink w:anchor="_Toc229085745" w:history="1">
+          <w:hyperlink w:anchor="_Toc229092988" w:history="1">
             <w:r>
               <w:rPr>
                 <w:rStyle w:val="Hyperlink"/>
@@ -1009,7 +1009,7 @@
                 <w:noProof/>
                 <w:webHidden/>
               </w:rPr>
-              <w:instrText xml:space="preserve"> PAGEREF _Toc229085745 \h </w:instrText>
+              <w:instrText xml:space="preserve"> PAGEREF _Toc229092988 \h </w:instrText>
             </w:r>
             <w:r>
               <w:rPr>
@@ -1056,7 +1056,7 @@
               <w14:ligatures w14:val="standardContextual"/>
             </w:rPr>
           </w:pPr>
-          <w:hyperlink w:anchor="_Toc229085746" w:history="1">
+          <w:hyperlink w:anchor="_Toc229092989" w:history="1">
             <w:r>
               <w:rPr>
                 <w:rStyle w:val="Hyperlink"/>
@@ -1083,7 +1083,7 @@
                 <w:noProof/>
                 <w:webHidden/>
               </w:rPr>
-              <w:instrText xml:space="preserve"> PAGEREF _Toc229085746 \h </w:instrText>
+              <w:instrText xml:space="preserve"> PAGEREF _Toc229092989 \h </w:instrText>
             </w:r>
             <w:r>
               <w:rPr>
@@ -1130,7 +1130,7 @@
               <w14:ligatures w14:val="standardContextual"/>
             </w:rPr>
           </w:pPr>
-          <w:hyperlink w:anchor="_Toc229085747" w:history="1">
+          <w:hyperlink w:anchor="_Toc229092990" w:history="1">
             <w:r>
               <w:rPr>
                 <w:rStyle w:val="Hyperlink"/>
@@ -1157,7 +1157,7 @@
                 <w:noProof/>
                 <w:webHidden/>
               </w:rPr>
-              <w:instrText xml:space="preserve"> PAGEREF _Toc229085747 \h </w:instrText>
+              <w:instrText xml:space="preserve"> PAGEREF _Toc229092990 \h </w:instrText>
             </w:r>
             <w:r>
               <w:rPr>
@@ -1204,7 +1204,7 @@
               <w14:ligatures w14:val="standardContextual"/>
             </w:rPr>
           </w:pPr>
-          <w:hyperlink w:anchor="_Toc229085748" w:history="1">
+          <w:hyperlink w:anchor="_Toc229092991" w:history="1">
             <w:r>
               <w:rPr>
                 <w:rStyle w:val="Hyperlink"/>
@@ -1231,7 +1231,7 @@
                 <w:noProof/>
                 <w:webHidden/>
               </w:rPr>
-              <w:instrText xml:space="preserve"> PAGEREF _Toc229085748 \h </w:instrText>
+              <w:instrText xml:space="preserve"> PAGEREF _Toc229092991 \h </w:instrText>
             </w:r>
             <w:r>
               <w:rPr>
@@ -1278,7 +1278,7 @@
               <w14:ligatures w14:val="standardContextual"/>
             </w:rPr>
           </w:pPr>
-          <w:hyperlink w:anchor="_Toc229085749" w:history="1">
+          <w:hyperlink w:anchor="_Toc229092992" w:history="1">
             <w:r>
               <w:rPr>
                 <w:rStyle w:val="Hyperlink"/>
@@ -1305,7 +1305,7 @@
                 <w:noProof/>
                 <w:webHidden/>
               </w:rPr>
-              <w:instrText xml:space="preserve"> PAGEREF _Toc229085749 \h </w:instrText>
+              <w:instrText xml:space="preserve"> PAGEREF _Toc229092992 \h </w:instrText>
             </w:r>
             <w:r>
               <w:rPr>
@@ -1352,7 +1352,7 @@
               <w14:ligatures w14:val="standardContextual"/>
             </w:rPr>
           </w:pPr>
-          <w:hyperlink w:anchor="_Toc229085750" w:history="1">
+          <w:hyperlink w:anchor="_Toc229092993" w:history="1">
             <w:r>
               <w:rPr>
                 <w:rStyle w:val="Hyperlink"/>
@@ -1379,7 +1379,7 @@
                 <w:noProof/>
                 <w:webHidden/>
               </w:rPr>
-              <w:instrText xml:space="preserve"> PAGEREF _Toc229085750 \h </w:instrText>
+              <w:instrText xml:space="preserve"> PAGEREF _Toc229092993 \h </w:instrText>
             </w:r>
             <w:r>
               <w:rPr>
@@ -1426,7 +1426,7 @@
               <w14:ligatures w14:val="standardContextual"/>
             </w:rPr>
           </w:pPr>
-          <w:hyperlink w:anchor="_Toc229085751" w:history="1">
+          <w:hyperlink w:anchor="_Toc229092994" w:history="1">
             <w:r>
               <w:rPr>
                 <w:rStyle w:val="Hyperlink"/>
@@ -1453,7 +1453,7 @@
                 <w:noProof/>
                 <w:webHidden/>
               </w:rPr>
-              <w:instrText xml:space="preserve"> PAGEREF _Toc229085751 \h </w:instrText>
+              <w:instrText xml:space="preserve"> PAGEREF _Toc229092994 \h </w:instrText>
             </w:r>
             <w:r>
               <w:rPr>
@@ -1500,7 +1500,7 @@
               <w14:ligatures w14:val="standardContextual"/>
             </w:rPr>
           </w:pPr>
-          <w:hyperlink w:anchor="_Toc229085752" w:history="1">
+          <w:hyperlink w:anchor="_Toc229092995" w:history="1">
             <w:r>
               <w:rPr>
                 <w:rStyle w:val="Hyperlink"/>
@@ -1527,7 +1527,7 @@
                 <w:noProof/>
                 <w:webHidden/>
               </w:rPr>
-              <w:instrText xml:space="preserve"> PAGEREF _Toc229085752 \h </w:instrText>
+              <w:instrText xml:space="preserve"> PAGEREF _Toc229092995 \h </w:instrText>
             </w:r>
             <w:r>
               <w:rPr>
@@ -1574,7 +1574,7 @@
               <w14:ligatures w14:val="standardContextual"/>
             </w:rPr>
           </w:pPr>
-          <w:hyperlink w:anchor="_Toc229085753" w:history="1">
+          <w:hyperlink w:anchor="_Toc229092996" w:history="1">
             <w:r>
               <w:rPr>
                 <w:rStyle w:val="Hyperlink"/>
@@ -1601,7 +1601,7 @@
                 <w:noProof/>
                 <w:webHidden/>
               </w:rPr>
-              <w:instrText xml:space="preserve"> PAGEREF _Toc229085753 \h </w:instrText>
+              <w:instrText xml:space="preserve"> PAGEREF _Toc229092996 \h </w:instrText>
             </w:r>
             <w:r>
               <w:rPr>
@@ -1648,7 +1648,7 @@
               <w14:ligatures w14:val="standardContextual"/>
             </w:rPr>
           </w:pPr>
-          <w:hyperlink w:anchor="_Toc229085754" w:history="1">
+          <w:hyperlink w:anchor="_Toc229092997" w:history="1">
             <w:r>
               <w:rPr>
                 <w:rStyle w:val="Hyperlink"/>
@@ -1675,7 +1675,7 @@
                 <w:noProof/>
                 <w:webHidden/>
               </w:rPr>
-              <w:instrText xml:space="preserve"> PAGEREF _Toc229085754 \h </w:instrText>
+              <w:instrText xml:space="preserve"> PAGEREF _Toc229092997 \h </w:instrText>
             </w:r>
             <w:r>
               <w:rPr>
@@ -1722,7 +1722,7 @@
               <w14:ligatures w14:val="standardContextual"/>
             </w:rPr>
           </w:pPr>
-          <w:hyperlink w:anchor="_Toc229085755" w:history="1">
+          <w:hyperlink w:anchor="_Toc229092998" w:history="1">
             <w:r>
               <w:rPr>
                 <w:rStyle w:val="Hyperlink"/>
@@ -1749,7 +1749,7 @@
                 <w:noProof/>
                 <w:webHidden/>
               </w:rPr>
-              <w:instrText xml:space="preserve"> PAGEREF _Toc229085755 \h </w:instrText>
+              <w:instrText xml:space="preserve"> PAGEREF _Toc229092998 \h </w:instrText>
             </w:r>
             <w:r>
               <w:rPr>
@@ -1796,7 +1796,7 @@
               <w14:ligatures w14:val="standardContextual"/>
             </w:rPr>
           </w:pPr>
-          <w:hyperlink w:anchor="_Toc229085756" w:history="1">
+          <w:hyperlink w:anchor="_Toc229092999" w:history="1">
             <w:r>
               <w:rPr>
                 <w:rStyle w:val="Hyperlink"/>
@@ -1823,7 +1823,7 @@
                 <w:noProof/>
                 <w:webHidden/>
               </w:rPr>
-              <w:instrText xml:space="preserve"> PAGEREF _Toc229085756 \h </w:instrText>
+              <w:instrText xml:space="preserve"> PAGEREF _Toc229092999 \h </w:instrText>
             </w:r>
             <w:r>
               <w:rPr>
@@ -1870,7 +1870,7 @@
               <w14:ligatures w14:val="standardContextual"/>
             </w:rPr>
           </w:pPr>
-          <w:hyperlink w:anchor="_Toc229085757" w:history="1">
+          <w:hyperlink w:anchor="_Toc229093000" w:history="1">
             <w:r>
               <w:rPr>
                 <w:rStyle w:val="Hyperlink"/>
@@ -1897,7 +1897,7 @@
                 <w:noProof/>
                 <w:webHidden/>
               </w:rPr>
-              <w:instrText xml:space="preserve"> PAGEREF _Toc229085757 \h </w:instrText>
+              <w:instrText xml:space="preserve"> PAGEREF _Toc229093000 \h </w:instrText>
             </w:r>
             <w:r>
               <w:rPr>
@@ -1944,7 +1944,7 @@
               <w14:ligatures w14:val="standardContextual"/>
             </w:rPr>
           </w:pPr>
-          <w:hyperlink w:anchor="_Toc229085758" w:history="1">
+          <w:hyperlink w:anchor="_Toc229093001" w:history="1">
             <w:r>
               <w:rPr>
                 <w:rStyle w:val="Hyperlink"/>
@@ -1971,7 +1971,7 @@
                 <w:noProof/>
                 <w:webHidden/>
               </w:rPr>
-              <w:instrText xml:space="preserve"> PAGEREF _Toc229085758 \h </w:instrText>
+              <w:instrText xml:space="preserve"> PAGEREF _Toc229093001 \h </w:instrText>
             </w:r>
             <w:r>
               <w:rPr>
@@ -2018,7 +2018,7 @@
               <w14:ligatures w14:val="standardContextual"/>
             </w:rPr>
           </w:pPr>
-          <w:hyperlink w:anchor="_Toc229085759" w:history="1">
+          <w:hyperlink w:anchor="_Toc229093002" w:history="1">
             <w:r>
               <w:rPr>
                 <w:rStyle w:val="Hyperlink"/>
@@ -2045,7 +2045,7 @@
                 <w:noProof/>
                 <w:webHidden/>
               </w:rPr>
-              <w:instrText xml:space="preserve"> PAGEREF _Toc229085759 \h </w:instrText>
+              <w:instrText xml:space="preserve"> PAGEREF _Toc229093002 \h </w:instrText>
             </w:r>
             <w:r>
               <w:rPr>
@@ -2092,7 +2092,7 @@
               <w14:ligatures w14:val="standardContextual"/>
             </w:rPr>
           </w:pPr>
-          <w:hyperlink w:anchor="_Toc229085760" w:history="1">
+          <w:hyperlink w:anchor="_Toc229093003" w:history="1">
             <w:r>
               <w:rPr>
                 <w:rStyle w:val="Hyperlink"/>
@@ -2119,7 +2119,7 @@
                 <w:noProof/>
                 <w:webHidden/>
               </w:rPr>
-              <w:instrText xml:space="preserve"> PAGEREF _Toc229085760 \h </w:instrText>
+              <w:instrText xml:space="preserve"> PAGEREF _Toc229093003 \h </w:instrText>
             </w:r>
             <w:r>
               <w:rPr>
@@ -2162,7 +2162,7 @@
               <w:lang w:eastAsia="en-GB"/>
             </w:rPr>
           </w:pPr>
-          <w:hyperlink w:anchor="_Toc229085761" w:history="1">
+          <w:hyperlink w:anchor="_Toc229093004" w:history="1">
             <w:r>
               <w:rPr>
                 <w:rStyle w:val="Hyperlink"/>
@@ -2189,7 +2189,7 @@
                 <w:noProof/>
                 <w:webHidden/>
               </w:rPr>
-              <w:instrText xml:space="preserve"> PAGEREF _Toc229085761 \h </w:instrText>
+              <w:instrText xml:space="preserve"> PAGEREF _Toc229093004 \h </w:instrText>
             </w:r>
             <w:r>
               <w:rPr>
@@ -2232,7 +2232,7 @@
               <w:lang w:eastAsia="en-GB"/>
             </w:rPr>
           </w:pPr>
-          <w:hyperlink w:anchor="_Toc229085762" w:history="1">
+          <w:hyperlink w:anchor="_Toc229093005" w:history="1">
             <w:r>
               <w:rPr>
                 <w:rStyle w:val="Hyperlink"/>
@@ -2259,7 +2259,7 @@
                 <w:noProof/>
                 <w:webHidden/>
               </w:rPr>
-              <w:instrText xml:space="preserve"> PAGEREF _Toc229085762 \h </w:instrText>
+              <w:instrText xml:space="preserve"> PAGEREF _Toc229093005 \h </w:instrText>
             </w:r>
             <w:r>
               <w:rPr>
@@ -2302,7 +2302,7 @@
               <w:lang w:eastAsia="en-GB"/>
             </w:rPr>
           </w:pPr>
-          <w:hyperlink w:anchor="_Toc229085763" w:history="1">
+          <w:hyperlink w:anchor="_Toc229093006" w:history="1">
             <w:r>
               <w:rPr>
                 <w:rStyle w:val="Hyperlink"/>
@@ -2329,7 +2329,7 @@
                 <w:noProof/>
                 <w:webHidden/>
               </w:rPr>
-              <w:instrText xml:space="preserve"> PAGEREF _Toc229085763 \h </w:instrText>
+              <w:instrText xml:space="preserve"> PAGEREF _Toc229093006 \h </w:instrText>
             </w:r>
             <w:r>
               <w:rPr>
@@ -2376,7 +2376,7 @@
               <w14:ligatures w14:val="standardContextual"/>
             </w:rPr>
           </w:pPr>
-          <w:hyperlink w:anchor="_Toc229085764" w:history="1">
+          <w:hyperlink w:anchor="_Toc229093007" w:history="1">
             <w:r>
               <w:rPr>
                 <w:rStyle w:val="Hyperlink"/>
@@ -2403,7 +2403,7 @@
                 <w:noProof/>
                 <w:webHidden/>
               </w:rPr>
-              <w:instrText xml:space="preserve"> PAGEREF _Toc229085764 \h </w:instrText>
+              <w:instrText xml:space="preserve"> PAGEREF _Toc229093007 \h </w:instrText>
             </w:r>
             <w:r>
               <w:rPr>
@@ -2446,7 +2446,7 @@
               <w:lang w:eastAsia="en-GB"/>
             </w:rPr>
           </w:pPr>
-          <w:hyperlink w:anchor="_Toc229085765" w:history="1">
+          <w:hyperlink w:anchor="_Toc229093008" w:history="1">
             <w:r>
               <w:rPr>
                 <w:rStyle w:val="Hyperlink"/>
@@ -2473,7 +2473,7 @@
                 <w:noProof/>
                 <w:webHidden/>
               </w:rPr>
-              <w:instrText xml:space="preserve"> PAGEREF _Toc229085765 \h </w:instrText>
+              <w:instrText xml:space="preserve"> PAGEREF _Toc229093008 \h </w:instrText>
             </w:r>
             <w:r>
               <w:rPr>
@@ -2516,7 +2516,7 @@
               <w:lang w:eastAsia="en-GB"/>
             </w:rPr>
           </w:pPr>
-          <w:hyperlink w:anchor="_Toc229085766" w:history="1">
+          <w:hyperlink w:anchor="_Toc229093009" w:history="1">
             <w:r>
               <w:rPr>
                 <w:rStyle w:val="Hyperlink"/>
@@ -2543,7 +2543,7 @@
                 <w:noProof/>
                 <w:webHidden/>
               </w:rPr>
-              <w:instrText xml:space="preserve"> PAGEREF _Toc229085766 \h </w:instrText>
+              <w:instrText xml:space="preserve"> PAGEREF _Toc229093009 \h </w:instrText>
             </w:r>
             <w:r>
               <w:rPr>
@@ -2586,7 +2586,7 @@
               <w:lang w:eastAsia="en-GB"/>
             </w:rPr>
           </w:pPr>
-          <w:hyperlink w:anchor="_Toc229085767" w:history="1">
+          <w:hyperlink w:anchor="_Toc229093010" w:history="1">
             <w:r>
               <w:rPr>
                 <w:rStyle w:val="Hyperlink"/>
@@ -2613,7 +2613,7 @@
                 <w:noProof/>
                 <w:webHidden/>
               </w:rPr>
-              <w:instrText xml:space="preserve"> PAGEREF _Toc229085767 \h </w:instrText>
+              <w:instrText xml:space="preserve"> PAGEREF _Toc229093010 \h </w:instrText>
             </w:r>
             <w:r>
               <w:rPr>
@@ -2660,7 +2660,7 @@
               <w14:ligatures w14:val="standardContextual"/>
             </w:rPr>
           </w:pPr>
-          <w:hyperlink w:anchor="_Toc229085768" w:history="1">
+          <w:hyperlink w:anchor="_Toc229093011" w:history="1">
             <w:r>
               <w:rPr>
                 <w:rStyle w:val="Hyperlink"/>
@@ -2687,7 +2687,7 @@
                 <w:noProof/>
                 <w:webHidden/>
               </w:rPr>
-              <w:instrText xml:space="preserve"> PAGEREF _Toc229085768 \h </w:instrText>
+              <w:instrText xml:space="preserve"> PAGEREF _Toc229093011 \h </w:instrText>
             </w:r>
             <w:r>
               <w:rPr>
@@ -2730,7 +2730,7 @@
               <w:lang w:eastAsia="en-GB"/>
             </w:rPr>
           </w:pPr>
-          <w:hyperlink w:anchor="_Toc229085769" w:history="1">
+          <w:hyperlink w:anchor="_Toc229093012" w:history="1">
             <w:r>
               <w:rPr>
                 <w:rStyle w:val="Hyperlink"/>
@@ -2757,7 +2757,7 @@
                 <w:noProof/>
                 <w:webHidden/>
               </w:rPr>
-              <w:instrText xml:space="preserve"> PAGEREF _Toc229085769 \h </w:instrText>
+              <w:instrText xml:space="preserve"> PAGEREF _Toc229093012 \h </w:instrText>
             </w:r>
             <w:r>
               <w:rPr>
@@ -2800,7 +2800,7 @@
               <w:lang w:eastAsia="en-GB"/>
             </w:rPr>
           </w:pPr>
-          <w:hyperlink w:anchor="_Toc229085770" w:history="1">
+          <w:hyperlink w:anchor="_Toc229093013" w:history="1">
             <w:r>
               <w:rPr>
                 <w:rStyle w:val="Hyperlink"/>
@@ -2827,7 +2827,7 @@
                 <w:noProof/>
                 <w:webHidden/>
               </w:rPr>
-              <w:instrText xml:space="preserve"> PAGEREF _Toc229085770 \h </w:instrText>
+              <w:instrText xml:space="preserve"> PAGEREF _Toc229093013 \h </w:instrText>
             </w:r>
             <w:r>
               <w:rPr>
@@ -2870,7 +2870,7 @@
               <w:lang w:eastAsia="en-GB"/>
             </w:rPr>
           </w:pPr>
-          <w:hyperlink w:anchor="_Toc229085771" w:history="1">
+          <w:hyperlink w:anchor="_Toc229093014" w:history="1">
             <w:r>
               <w:rPr>
                 <w:rStyle w:val="Hyperlink"/>
@@ -2897,7 +2897,7 @@
                 <w:noProof/>
                 <w:webHidden/>
               </w:rPr>
-              <w:instrText xml:space="preserve"> PAGEREF _Toc229085771 \h </w:instrText>
+              <w:instrText xml:space="preserve"> PAGEREF _Toc229093014 \h </w:instrText>
             </w:r>
             <w:r>
               <w:rPr>
@@ -2944,7 +2944,7 @@
               <w14:ligatures w14:val="standardContextual"/>
             </w:rPr>
           </w:pPr>
-          <w:hyperlink w:anchor="_Toc229085772" w:history="1">
+          <w:hyperlink w:anchor="_Toc229093015" w:history="1">
             <w:r>
               <w:rPr>
                 <w:rStyle w:val="Hyperlink"/>
@@ -2971,7 +2971,7 @@
                 <w:noProof/>
                 <w:webHidden/>
               </w:rPr>
-              <w:instrText xml:space="preserve"> PAGEREF _Toc229085772 \h </w:instrText>
+              <w:instrText xml:space="preserve"> PAGEREF _Toc229093015 \h </w:instrText>
             </w:r>
             <w:r>
               <w:rPr>
@@ -3018,7 +3018,7 @@
               <w14:ligatures w14:val="standardContextual"/>
             </w:rPr>
           </w:pPr>
-          <w:hyperlink w:anchor="_Toc229085773" w:history="1">
+          <w:hyperlink w:anchor="_Toc229093016" w:history="1">
             <w:r>
               <w:rPr>
                 <w:rStyle w:val="Hyperlink"/>
@@ -3045,7 +3045,7 @@
                 <w:noProof/>
                 <w:webHidden/>
               </w:rPr>
-              <w:instrText xml:space="preserve"> PAGEREF _Toc229085773 \h </w:instrText>
+              <w:instrText xml:space="preserve"> PAGEREF _Toc229093016 \h </w:instrText>
             </w:r>
             <w:r>
               <w:rPr>
@@ -3092,7 +3092,7 @@
               <w14:ligatures w14:val="standardContextual"/>
             </w:rPr>
           </w:pPr>
-          <w:hyperlink w:anchor="_Toc229085774" w:history="1">
+          <w:hyperlink w:anchor="_Toc229093017" w:history="1">
             <w:r>
               <w:rPr>
                 <w:rStyle w:val="Hyperlink"/>
@@ -3119,7 +3119,7 @@
                 <w:noProof/>
                 <w:webHidden/>
               </w:rPr>
-              <w:instrText xml:space="preserve"> PAGEREF _Toc229085774 \h </w:instrText>
+              <w:instrText xml:space="preserve"> PAGEREF _Toc229093017 \h </w:instrText>
             </w:r>
             <w:r>
               <w:rPr>
@@ -3166,7 +3166,7 @@
               <w14:ligatures w14:val="standardContextual"/>
             </w:rPr>
           </w:pPr>
-          <w:hyperlink w:anchor="_Toc229085775" w:history="1">
+          <w:hyperlink w:anchor="_Toc229093018" w:history="1">
             <w:r>
               <w:rPr>
                 <w:rStyle w:val="Hyperlink"/>
@@ -3193,7 +3193,7 @@
                 <w:noProof/>
                 <w:webHidden/>
               </w:rPr>
-              <w:instrText xml:space="preserve"> PAGEREF _Toc229085775 \h </w:instrText>
+              <w:instrText xml:space="preserve"> PAGEREF _Toc229093018 \h </w:instrText>
             </w:r>
             <w:r>
               <w:rPr>
@@ -3240,7 +3240,7 @@
               <w14:ligatures w14:val="standardContextual"/>
             </w:rPr>
           </w:pPr>
-          <w:hyperlink w:anchor="_Toc229085776" w:history="1">
+          <w:hyperlink w:anchor="_Toc229093019" w:history="1">
             <w:r>
               <w:rPr>
                 <w:rStyle w:val="Hyperlink"/>
@@ -3267,7 +3267,7 @@
                 <w:noProof/>
                 <w:webHidden/>
               </w:rPr>
-              <w:instrText xml:space="preserve"> PAGEREF _Toc229085776 \h </w:instrText>
+              <w:instrText xml:space="preserve"> PAGEREF _Toc229093019 \h </w:instrText>
             </w:r>
             <w:r>
               <w:rPr>
@@ -3314,7 +3314,7 @@
               <w14:ligatures w14:val="standardContextual"/>
             </w:rPr>
           </w:pPr>
-          <w:hyperlink w:anchor="_Toc229085777" w:history="1">
+          <w:hyperlink w:anchor="_Toc229093020" w:history="1">
             <w:r>
               <w:rPr>
                 <w:rStyle w:val="Hyperlink"/>
@@ -3341,7 +3341,7 @@
                 <w:noProof/>
                 <w:webHidden/>
               </w:rPr>
-              <w:instrText xml:space="preserve"> PAGEREF _Toc229085777 \h </w:instrText>
+              <w:instrText xml:space="preserve"> PAGEREF _Toc229093020 \h </w:instrText>
             </w:r>
             <w:r>
               <w:rPr>
@@ -3388,7 +3388,7 @@
               <w14:ligatures w14:val="standardContextual"/>
             </w:rPr>
           </w:pPr>
-          <w:hyperlink w:anchor="_Toc229085778" w:history="1">
+          <w:hyperlink w:anchor="_Toc229093021" w:history="1">
             <w:r>
               <w:rPr>
                 <w:rStyle w:val="Hyperlink"/>
@@ -3415,7 +3415,7 @@
                 <w:noProof/>
                 <w:webHidden/>
               </w:rPr>
-              <w:instrText xml:space="preserve"> PAGEREF _Toc229085778 \h </w:instrText>
+              <w:instrText xml:space="preserve"> PAGEREF _Toc229093021 \h </w:instrText>
             </w:r>
             <w:r>
               <w:rPr>
@@ -3462,7 +3462,7 @@
               <w14:ligatures w14:val="standardContextual"/>
             </w:rPr>
           </w:pPr>
-          <w:hyperlink w:anchor="_Toc229085779" w:history="1">
+          <w:hyperlink w:anchor="_Toc229093022" w:history="1">
             <w:r>
               <w:rPr>
                 <w:rStyle w:val="Hyperlink"/>
@@ -3489,7 +3489,7 @@
                 <w:noProof/>
                 <w:webHidden/>
               </w:rPr>
-              <w:instrText xml:space="preserve"> PAGEREF _Toc229085779 \h </w:instrText>
+              <w:instrText xml:space="preserve"> PAGEREF _Toc229093022 \h </w:instrText>
             </w:r>
             <w:r>
               <w:rPr>
@@ -3536,7 +3536,7 @@
               <w14:ligatures w14:val="standardContextual"/>
             </w:rPr>
           </w:pPr>
-          <w:hyperlink w:anchor="_Toc229085780" w:history="1">
+          <w:hyperlink w:anchor="_Toc229093023" w:history="1">
             <w:r>
               <w:rPr>
                 <w:rStyle w:val="Hyperlink"/>
@@ -3563,7 +3563,7 @@
                 <w:noProof/>
                 <w:webHidden/>
               </w:rPr>
-              <w:instrText xml:space="preserve"> PAGEREF _Toc229085780 \h </w:instrText>
+              <w:instrText xml:space="preserve"> PAGEREF _Toc229093023 \h </w:instrText>
             </w:r>
             <w:r>
               <w:rPr>
@@ -3610,7 +3610,7 @@
               <w14:ligatures w14:val="standardContextual"/>
             </w:rPr>
           </w:pPr>
-          <w:hyperlink w:anchor="_Toc229085781" w:history="1">
+          <w:hyperlink w:anchor="_Toc229093024" w:history="1">
             <w:r>
               <w:rPr>
                 <w:rStyle w:val="Hyperlink"/>
@@ -3637,7 +3637,7 @@
                 <w:noProof/>
                 <w:webHidden/>
               </w:rPr>
-              <w:instrText xml:space="preserve"> PAGEREF _Toc229085781 \h </w:instrText>
+              <w:instrText xml:space="preserve"> PAGEREF _Toc229093024 \h </w:instrText>
             </w:r>
             <w:r>
               <w:rPr>
@@ -3684,7 +3684,7 @@
               <w14:ligatures w14:val="standardContextual"/>
             </w:rPr>
           </w:pPr>
-          <w:hyperlink w:anchor="_Toc229085782" w:history="1">
+          <w:hyperlink w:anchor="_Toc229093025" w:history="1">
             <w:r>
               <w:rPr>
                 <w:rStyle w:val="Hyperlink"/>
@@ -3711,7 +3711,7 @@
                 <w:noProof/>
                 <w:webHidden/>
               </w:rPr>
-              <w:instrText xml:space="preserve"> PAGEREF _Toc229085782 \h </w:instrText>
+              <w:instrText xml:space="preserve"> PAGEREF _Toc229093025 \h </w:instrText>
             </w:r>
             <w:r>
               <w:rPr>
@@ -3758,7 +3758,7 @@
               <w14:ligatures w14:val="standardContextual"/>
             </w:rPr>
           </w:pPr>
-          <w:hyperlink w:anchor="_Toc229085783" w:history="1">
+          <w:hyperlink w:anchor="_Toc229093026" w:history="1">
             <w:r>
               <w:rPr>
                 <w:rStyle w:val="Hyperlink"/>
@@ -3785,7 +3785,7 @@
                 <w:noProof/>
                 <w:webHidden/>
               </w:rPr>
-              <w:instrText xml:space="preserve"> PAGEREF _Toc229085783 \h </w:instrText>
+              <w:instrText xml:space="preserve"> PAGEREF _Toc229093026 \h </w:instrText>
             </w:r>
             <w:r>
               <w:rPr>
@@ -3832,7 +3832,7 @@
               <w14:ligatures w14:val="standardContextual"/>
             </w:rPr>
           </w:pPr>
-          <w:hyperlink w:anchor="_Toc229085784" w:history="1">
+          <w:hyperlink w:anchor="_Toc229093027" w:history="1">
             <w:r>
               <w:rPr>
                 <w:rStyle w:val="Hyperlink"/>
@@ -3859,7 +3859,7 @@
                 <w:noProof/>
                 <w:webHidden/>
               </w:rPr>
-              <w:instrText xml:space="preserve"> PAGEREF _Toc229085784 \h </w:instrText>
+              <w:instrText xml:space="preserve"> PAGEREF _Toc229093027 \h </w:instrText>
             </w:r>
             <w:r>
               <w:rPr>
@@ -3906,7 +3906,7 @@
               <w14:ligatures w14:val="standardContextual"/>
             </w:rPr>
           </w:pPr>
-          <w:hyperlink w:anchor="_Toc229085785" w:history="1">
+          <w:hyperlink w:anchor="_Toc229093028" w:history="1">
             <w:r>
               <w:rPr>
                 <w:rStyle w:val="Hyperlink"/>
@@ -3933,7 +3933,7 @@
                 <w:noProof/>
                 <w:webHidden/>
               </w:rPr>
-              <w:instrText xml:space="preserve"> PAGEREF _Toc229085785 \h </w:instrText>
+              <w:instrText xml:space="preserve"> PAGEREF _Toc229093028 \h </w:instrText>
             </w:r>
             <w:r>
               <w:rPr>
@@ -3980,7 +3980,7 @@
               <w14:ligatures w14:val="standardContextual"/>
             </w:rPr>
           </w:pPr>
-          <w:hyperlink w:anchor="_Toc229085786" w:history="1">
+          <w:hyperlink w:anchor="_Toc229093029" w:history="1">
             <w:r>
               <w:rPr>
                 <w:rStyle w:val="Hyperlink"/>
@@ -4007,7 +4007,7 @@
                 <w:noProof/>
                 <w:webHidden/>
               </w:rPr>
-              <w:instrText xml:space="preserve"> PAGEREF _Toc229085786 \h </w:instrText>
+              <w:instrText xml:space="preserve"> PAGEREF _Toc229093029 \h </w:instrText>
             </w:r>
             <w:r>
               <w:rPr>
@@ -4054,7 +4054,7 @@
               <w14:ligatures w14:val="standardContextual"/>
             </w:rPr>
           </w:pPr>
-          <w:hyperlink w:anchor="_Toc229085787" w:history="1">
+          <w:hyperlink w:anchor="_Toc229093030" w:history="1">
             <w:r>
               <w:rPr>
                 <w:rStyle w:val="Hyperlink"/>
@@ -4081,7 +4081,7 @@
                 <w:noProof/>
                 <w:webHidden/>
               </w:rPr>
-              <w:instrText xml:space="preserve"> PAGEREF _Toc229085787 \h </w:instrText>
+              <w:instrText xml:space="preserve"> PAGEREF _Toc229093030 \h </w:instrText>
             </w:r>
             <w:r>
               <w:rPr>
@@ -4128,7 +4128,7 @@
               <w14:ligatures w14:val="standardContextual"/>
             </w:rPr>
           </w:pPr>
-          <w:hyperlink w:anchor="_Toc229085788" w:history="1">
+          <w:hyperlink w:anchor="_Toc229093031" w:history="1">
             <w:r>
               <w:rPr>
                 <w:rStyle w:val="Hyperlink"/>
@@ -4155,7 +4155,7 @@
                 <w:noProof/>
                 <w:webHidden/>
               </w:rPr>
-              <w:instrText xml:space="preserve"> PAGEREF _Toc229085788 \h </w:instrText>
+              <w:instrText xml:space="preserve"> PAGEREF _Toc229093031 \h </w:instrText>
             </w:r>
             <w:r>
               <w:rPr>
@@ -4202,7 +4202,7 @@
               <w14:ligatures w14:val="standardContextual"/>
             </w:rPr>
           </w:pPr>
-          <w:hyperlink w:anchor="_Toc229085789" w:history="1">
+          <w:hyperlink w:anchor="_Toc229093032" w:history="1">
             <w:r>
               <w:rPr>
                 <w:rStyle w:val="Hyperlink"/>
@@ -4229,7 +4229,7 @@
                 <w:noProof/>
                 <w:webHidden/>
               </w:rPr>
-              <w:instrText xml:space="preserve"> PAGEREF _Toc229085789 \h </w:instrText>
+              <w:instrText xml:space="preserve"> PAGEREF _Toc229093032 \h </w:instrText>
             </w:r>
             <w:r>
               <w:rPr>
@@ -4276,7 +4276,7 @@
               <w14:ligatures w14:val="standardContextual"/>
             </w:rPr>
           </w:pPr>
-          <w:hyperlink w:anchor="_Toc229085790" w:history="1">
+          <w:hyperlink w:anchor="_Toc229093033" w:history="1">
             <w:r>
               <w:rPr>
                 <w:rStyle w:val="Hyperlink"/>
@@ -4303,7 +4303,7 @@
                 <w:noProof/>
                 <w:webHidden/>
               </w:rPr>
-              <w:instrText xml:space="preserve"> PAGEREF _Toc229085790 \h </w:instrText>
+              <w:instrText xml:space="preserve"> PAGEREF _Toc229093033 \h </w:instrText>
             </w:r>
             <w:r>
               <w:rPr>
@@ -4350,7 +4350,7 @@
               <w14:ligatures w14:val="standardContextual"/>
             </w:rPr>
           </w:pPr>
-          <w:hyperlink w:anchor="_Toc229085791" w:history="1">
+          <w:hyperlink w:anchor="_Toc229093034" w:history="1">
             <w:r>
               <w:rPr>
                 <w:rStyle w:val="Hyperlink"/>
@@ -4377,7 +4377,7 @@
                 <w:noProof/>
                 <w:webHidden/>
               </w:rPr>
-              <w:instrText xml:space="preserve"> PAGEREF _Toc229085791 \h </w:instrText>
+              <w:instrText xml:space="preserve"> PAGEREF _Toc229093034 \h </w:instrText>
             </w:r>
             <w:r>
               <w:rPr>
@@ -4398,6 +4398,228 @@
                 <w:webHidden/>
               </w:rPr>
               <w:t>21</w:t>
+            </w:r>
+            <w:r>
+              <w:rPr>
+                <w:noProof/>
+                <w:webHidden/>
+              </w:rPr>
+              <w:fldChar w:fldCharType="end"/>
+            </w:r>
+          </w:hyperlink>
+        </w:p>
+        <w:p>
+          <w:pPr>
+            <w:pStyle w:val="TOC2"/>
+            <w:tabs>
+              <w:tab w:val="right" w:leader="dot" w:pos="9016"/>
+            </w:tabs>
+            <w:rPr>
+              <w:rFonts w:asciiTheme="minorHAnsi" w:hAnsiTheme="minorHAnsi" w:cstheme="minorBidi"/>
+              <w:noProof/>
+              <w:kern w:val="2"/>
+              <w:sz w:val="24"/>
+              <w:szCs w:val="24"/>
+              <w:lang w:val="en-GB" w:eastAsia="en-GB"/>
+              <w14:ligatures w14:val="standardContextual"/>
+            </w:rPr>
+          </w:pPr>
+          <w:hyperlink w:anchor="_Toc229093035" w:history="1">
+            <w:r>
+              <w:rPr>
+                <w:rStyle w:val="Hyperlink"/>
+                <w:noProof/>
+              </w:rPr>
+              <w:t>4.2 Pathfinding</w:t>
+            </w:r>
+            <w:r>
+              <w:rPr>
+                <w:noProof/>
+                <w:webHidden/>
+              </w:rPr>
+              <w:tab/>
+            </w:r>
+            <w:r>
+              <w:rPr>
+                <w:noProof/>
+                <w:webHidden/>
+              </w:rPr>
+              <w:fldChar w:fldCharType="begin"/>
+            </w:r>
+            <w:r>
+              <w:rPr>
+                <w:noProof/>
+                <w:webHidden/>
+              </w:rPr>
+              <w:instrText xml:space="preserve"> PAGEREF _Toc229093035 \h </w:instrText>
+            </w:r>
+            <w:r>
+              <w:rPr>
+                <w:noProof/>
+                <w:webHidden/>
+              </w:rPr>
+            </w:r>
+            <w:r>
+              <w:rPr>
+                <w:noProof/>
+                <w:webHidden/>
+              </w:rPr>
+              <w:fldChar w:fldCharType="separate"/>
+            </w:r>
+            <w:r>
+              <w:rPr>
+                <w:noProof/>
+                <w:webHidden/>
+              </w:rPr>
+              <w:t>23</w:t>
+            </w:r>
+            <w:r>
+              <w:rPr>
+                <w:noProof/>
+                <w:webHidden/>
+              </w:rPr>
+              <w:fldChar w:fldCharType="end"/>
+            </w:r>
+          </w:hyperlink>
+        </w:p>
+        <w:p>
+          <w:pPr>
+            <w:pStyle w:val="TOC3"/>
+            <w:tabs>
+              <w:tab w:val="right" w:leader="dot" w:pos="9016"/>
+            </w:tabs>
+            <w:rPr>
+              <w:rFonts w:asciiTheme="minorHAnsi" w:hAnsiTheme="minorHAnsi" w:cstheme="minorBidi"/>
+              <w:noProof/>
+              <w:kern w:val="2"/>
+              <w:sz w:val="24"/>
+              <w:szCs w:val="24"/>
+              <w:lang w:val="en-GB" w:eastAsia="en-GB"/>
+              <w14:ligatures w14:val="standardContextual"/>
+            </w:rPr>
+          </w:pPr>
+          <w:hyperlink w:anchor="_Toc229093036" w:history="1">
+            <w:r>
+              <w:rPr>
+                <w:rStyle w:val="Hyperlink"/>
+                <w:noProof/>
+              </w:rPr>
+              <w:t>4.2.1 Creating the Pathfinding Graph</w:t>
+            </w:r>
+            <w:r>
+              <w:rPr>
+                <w:noProof/>
+                <w:webHidden/>
+              </w:rPr>
+              <w:tab/>
+            </w:r>
+            <w:r>
+              <w:rPr>
+                <w:noProof/>
+                <w:webHidden/>
+              </w:rPr>
+              <w:fldChar w:fldCharType="begin"/>
+            </w:r>
+            <w:r>
+              <w:rPr>
+                <w:noProof/>
+                <w:webHidden/>
+              </w:rPr>
+              <w:instrText xml:space="preserve"> PAGEREF _Toc229093036 \h </w:instrText>
+            </w:r>
+            <w:r>
+              <w:rPr>
+                <w:noProof/>
+                <w:webHidden/>
+              </w:rPr>
+            </w:r>
+            <w:r>
+              <w:rPr>
+                <w:noProof/>
+                <w:webHidden/>
+              </w:rPr>
+              <w:fldChar w:fldCharType="separate"/>
+            </w:r>
+            <w:r>
+              <w:rPr>
+                <w:noProof/>
+                <w:webHidden/>
+              </w:rPr>
+              <w:t>23</w:t>
+            </w:r>
+            <w:r>
+              <w:rPr>
+                <w:noProof/>
+                <w:webHidden/>
+              </w:rPr>
+              <w:fldChar w:fldCharType="end"/>
+            </w:r>
+          </w:hyperlink>
+        </w:p>
+        <w:p>
+          <w:pPr>
+            <w:pStyle w:val="TOC3"/>
+            <w:tabs>
+              <w:tab w:val="right" w:leader="dot" w:pos="9016"/>
+            </w:tabs>
+            <w:rPr>
+              <w:rFonts w:asciiTheme="minorHAnsi" w:hAnsiTheme="minorHAnsi" w:cstheme="minorBidi"/>
+              <w:noProof/>
+              <w:kern w:val="2"/>
+              <w:sz w:val="24"/>
+              <w:szCs w:val="24"/>
+              <w:lang w:val="en-GB" w:eastAsia="en-GB"/>
+              <w14:ligatures w14:val="standardContextual"/>
+            </w:rPr>
+          </w:pPr>
+          <w:hyperlink w:anchor="_Toc229093037" w:history="1">
+            <w:r>
+              <w:rPr>
+                <w:rStyle w:val="Hyperlink"/>
+                <w:noProof/>
+              </w:rPr>
+              <w:t>4.2.2 How a path is found</w:t>
+            </w:r>
+            <w:r>
+              <w:rPr>
+                <w:noProof/>
+                <w:webHidden/>
+              </w:rPr>
+              <w:tab/>
+            </w:r>
+            <w:r>
+              <w:rPr>
+                <w:noProof/>
+                <w:webHidden/>
+              </w:rPr>
+              <w:fldChar w:fldCharType="begin"/>
+            </w:r>
+            <w:r>
+              <w:rPr>
+                <w:noProof/>
+                <w:webHidden/>
+              </w:rPr>
+              <w:instrText xml:space="preserve"> PAGEREF _Toc229093037 \h </w:instrText>
+            </w:r>
+            <w:r>
+              <w:rPr>
+                <w:noProof/>
+                <w:webHidden/>
+              </w:rPr>
+            </w:r>
+            <w:r>
+              <w:rPr>
+                <w:noProof/>
+                <w:webHidden/>
+              </w:rPr>
+              <w:fldChar w:fldCharType="separate"/>
+            </w:r>
+            <w:r>
+              <w:rPr>
+                <w:noProof/>
+                <w:webHidden/>
+              </w:rPr>
+              <w:t>24</w:t>
             </w:r>
             <w:r>
               <w:rPr>
@@ -4424,7 +4646,7 @@
               <w14:ligatures w14:val="standardContextual"/>
             </w:rPr>
           </w:pPr>
-          <w:hyperlink w:anchor="_Toc229085792" w:history="1">
+          <w:hyperlink w:anchor="_Toc229093038" w:history="1">
             <w:r>
               <w:rPr>
                 <w:rStyle w:val="Hyperlink"/>
@@ -4451,7 +4673,7 @@
                 <w:noProof/>
                 <w:webHidden/>
               </w:rPr>
-              <w:instrText xml:space="preserve"> PAGEREF _Toc229085792 \h </w:instrText>
+              <w:instrText xml:space="preserve"> PAGEREF _Toc229093038 \h </w:instrText>
             </w:r>
             <w:r>
               <w:rPr>
@@ -4471,7 +4693,7 @@
                 <w:noProof/>
                 <w:webHidden/>
               </w:rPr>
-              <w:t>24</w:t>
+              <w:t>26</w:t>
             </w:r>
             <w:r>
               <w:rPr>
@@ -4521,7 +4743,7 @@
       <w:pPr>
         <w:pStyle w:val="Heading1"/>
       </w:pPr>
-      <w:bookmarkStart w:id="7" w:name="_Toc229085745"/>
+      <w:bookmarkStart w:id="7" w:name="_Toc229092988"/>
       <w:r>
         <w:lastRenderedPageBreak/>
         <w:t>Table of Figures</w:t>
@@ -4564,7 +4786,7 @@
         </w:rPr>
         <w:fldChar w:fldCharType="separate"/>
       </w:r>
-      <w:hyperlink w:anchor="_Toc229085723" w:history="1">
+      <w:hyperlink w:anchor="_Toc229093039" w:history="1">
         <w:r>
           <w:rPr>
             <w:rStyle w:val="Hyperlink"/>
@@ -4591,7 +4813,7 @@
             <w:noProof/>
             <w:webHidden/>
           </w:rPr>
-          <w:instrText xml:space="preserve"> PAGEREF _Toc229085723 \h </w:instrText>
+          <w:instrText xml:space="preserve"> PAGEREF _Toc229093039 \h </w:instrText>
         </w:r>
         <w:r>
           <w:rPr>
@@ -4634,7 +4856,7 @@
           <w:lang w:eastAsia="en-GB"/>
         </w:rPr>
       </w:pPr>
-      <w:hyperlink w:anchor="_Toc229085724" w:history="1">
+      <w:hyperlink w:anchor="_Toc229093040" w:history="1">
         <w:r>
           <w:rPr>
             <w:rStyle w:val="Hyperlink"/>
@@ -4661,7 +4883,7 @@
             <w:noProof/>
             <w:webHidden/>
           </w:rPr>
-          <w:instrText xml:space="preserve"> PAGEREF _Toc229085724 \h </w:instrText>
+          <w:instrText xml:space="preserve"> PAGEREF _Toc229093040 \h </w:instrText>
         </w:r>
         <w:r>
           <w:rPr>
@@ -4704,7 +4926,7 @@
           <w:lang w:eastAsia="en-GB"/>
         </w:rPr>
       </w:pPr>
-      <w:hyperlink w:anchor="_Toc229085725" w:history="1">
+      <w:hyperlink w:anchor="_Toc229093041" w:history="1">
         <w:r>
           <w:rPr>
             <w:rStyle w:val="Hyperlink"/>
@@ -4731,7 +4953,7 @@
             <w:noProof/>
             <w:webHidden/>
           </w:rPr>
-          <w:instrText xml:space="preserve"> PAGEREF _Toc229085725 \h </w:instrText>
+          <w:instrText xml:space="preserve"> PAGEREF _Toc229093041 \h </w:instrText>
         </w:r>
         <w:r>
           <w:rPr>
@@ -4774,7 +4996,7 @@
           <w:lang w:eastAsia="en-GB"/>
         </w:rPr>
       </w:pPr>
-      <w:hyperlink w:anchor="_Toc229085726" w:history="1">
+      <w:hyperlink w:anchor="_Toc229093042" w:history="1">
         <w:r>
           <w:rPr>
             <w:rStyle w:val="Hyperlink"/>
@@ -4801,7 +5023,7 @@
             <w:noProof/>
             <w:webHidden/>
           </w:rPr>
-          <w:instrText xml:space="preserve"> PAGEREF _Toc229085726 \h </w:instrText>
+          <w:instrText xml:space="preserve"> PAGEREF _Toc229093042 \h </w:instrText>
         </w:r>
         <w:r>
           <w:rPr>
@@ -4844,7 +5066,7 @@
           <w:lang w:eastAsia="en-GB"/>
         </w:rPr>
       </w:pPr>
-      <w:hyperlink w:anchor="_Toc229085727" w:history="1">
+      <w:hyperlink w:anchor="_Toc229093043" w:history="1">
         <w:r>
           <w:rPr>
             <w:rStyle w:val="Hyperlink"/>
@@ -4871,7 +5093,7 @@
             <w:noProof/>
             <w:webHidden/>
           </w:rPr>
-          <w:instrText xml:space="preserve"> PAGEREF _Toc229085727 \h </w:instrText>
+          <w:instrText xml:space="preserve"> PAGEREF _Toc229093043 \h </w:instrText>
         </w:r>
         <w:r>
           <w:rPr>
@@ -4914,7 +5136,7 @@
           <w:lang w:eastAsia="en-GB"/>
         </w:rPr>
       </w:pPr>
-      <w:hyperlink w:anchor="_Toc229085728" w:history="1">
+      <w:hyperlink w:anchor="_Toc229093044" w:history="1">
         <w:r>
           <w:rPr>
             <w:rStyle w:val="Hyperlink"/>
@@ -4941,7 +5163,7 @@
             <w:noProof/>
             <w:webHidden/>
           </w:rPr>
-          <w:instrText xml:space="preserve"> PAGEREF _Toc229085728 \h </w:instrText>
+          <w:instrText xml:space="preserve"> PAGEREF _Toc229093044 \h </w:instrText>
         </w:r>
         <w:r>
           <w:rPr>
@@ -4984,7 +5206,7 @@
           <w:lang w:eastAsia="en-GB"/>
         </w:rPr>
       </w:pPr>
-      <w:hyperlink w:anchor="_Toc229085729" w:history="1">
+      <w:hyperlink w:anchor="_Toc229093045" w:history="1">
         <w:r>
           <w:rPr>
             <w:rStyle w:val="Hyperlink"/>
@@ -5011,7 +5233,7 @@
             <w:noProof/>
             <w:webHidden/>
           </w:rPr>
-          <w:instrText xml:space="preserve"> PAGEREF _Toc229085729 \h </w:instrText>
+          <w:instrText xml:space="preserve"> PAGEREF _Toc229093045 \h </w:instrText>
         </w:r>
         <w:r>
           <w:rPr>
@@ -5054,7 +5276,7 @@
           <w:lang w:eastAsia="en-GB"/>
         </w:rPr>
       </w:pPr>
-      <w:hyperlink w:anchor="_Toc229085730" w:history="1">
+      <w:hyperlink w:anchor="_Toc229093046" w:history="1">
         <w:r>
           <w:rPr>
             <w:rStyle w:val="Hyperlink"/>
@@ -5081,7 +5303,7 @@
             <w:noProof/>
             <w:webHidden/>
           </w:rPr>
-          <w:instrText xml:space="preserve"> PAGEREF _Toc229085730 \h </w:instrText>
+          <w:instrText xml:space="preserve"> PAGEREF _Toc229093046 \h </w:instrText>
         </w:r>
         <w:r>
           <w:rPr>
@@ -5124,7 +5346,7 @@
           <w:lang w:eastAsia="en-GB"/>
         </w:rPr>
       </w:pPr>
-      <w:hyperlink w:anchor="_Toc229085731" w:history="1">
+      <w:hyperlink w:anchor="_Toc229093047" w:history="1">
         <w:r>
           <w:rPr>
             <w:rStyle w:val="Hyperlink"/>
@@ -5151,7 +5373,7 @@
             <w:noProof/>
             <w:webHidden/>
           </w:rPr>
-          <w:instrText xml:space="preserve"> PAGEREF _Toc229085731 \h </w:instrText>
+          <w:instrText xml:space="preserve"> PAGEREF _Toc229093047 \h </w:instrText>
         </w:r>
         <w:r>
           <w:rPr>
@@ -5194,7 +5416,7 @@
           <w:lang w:eastAsia="en-GB"/>
         </w:rPr>
       </w:pPr>
-      <w:hyperlink w:anchor="_Toc229085732" w:history="1">
+      <w:hyperlink w:anchor="_Toc229093048" w:history="1">
         <w:r>
           <w:rPr>
             <w:rStyle w:val="Hyperlink"/>
@@ -5221,7 +5443,7 @@
             <w:noProof/>
             <w:webHidden/>
           </w:rPr>
-          <w:instrText xml:space="preserve"> PAGEREF _Toc229085732 \h </w:instrText>
+          <w:instrText xml:space="preserve"> PAGEREF _Toc229093048 \h </w:instrText>
         </w:r>
         <w:r>
           <w:rPr>
@@ -5264,7 +5486,7 @@
           <w:lang w:eastAsia="en-GB"/>
         </w:rPr>
       </w:pPr>
-      <w:hyperlink w:anchor="_Toc229085733" w:history="1">
+      <w:hyperlink w:anchor="_Toc229093049" w:history="1">
         <w:r>
           <w:rPr>
             <w:rStyle w:val="Hyperlink"/>
@@ -5291,7 +5513,7 @@
             <w:noProof/>
             <w:webHidden/>
           </w:rPr>
-          <w:instrText xml:space="preserve"> PAGEREF _Toc229085733 \h </w:instrText>
+          <w:instrText xml:space="preserve"> PAGEREF _Toc229093049 \h </w:instrText>
         </w:r>
         <w:r>
           <w:rPr>
@@ -5334,7 +5556,7 @@
           <w:lang w:eastAsia="en-GB"/>
         </w:rPr>
       </w:pPr>
-      <w:hyperlink w:anchor="_Toc229085734" w:history="1">
+      <w:hyperlink w:anchor="_Toc229093050" w:history="1">
         <w:r>
           <w:rPr>
             <w:rStyle w:val="Hyperlink"/>
@@ -5361,7 +5583,7 @@
             <w:noProof/>
             <w:webHidden/>
           </w:rPr>
-          <w:instrText xml:space="preserve"> PAGEREF _Toc229085734 \h </w:instrText>
+          <w:instrText xml:space="preserve"> PAGEREF _Toc229093050 \h </w:instrText>
         </w:r>
         <w:r>
           <w:rPr>
@@ -5404,7 +5626,7 @@
           <w:lang w:eastAsia="en-GB"/>
         </w:rPr>
       </w:pPr>
-      <w:hyperlink w:anchor="_Toc229085735" w:history="1">
+      <w:hyperlink w:anchor="_Toc229093051" w:history="1">
         <w:r>
           <w:rPr>
             <w:rStyle w:val="Hyperlink"/>
@@ -5431,7 +5653,7 @@
             <w:noProof/>
             <w:webHidden/>
           </w:rPr>
-          <w:instrText xml:space="preserve"> PAGEREF _Toc229085735 \h </w:instrText>
+          <w:instrText xml:space="preserve"> PAGEREF _Toc229093051 \h </w:instrText>
         </w:r>
         <w:r>
           <w:rPr>
@@ -5474,7 +5696,7 @@
           <w:lang w:eastAsia="en-GB"/>
         </w:rPr>
       </w:pPr>
-      <w:hyperlink w:anchor="_Toc229085736" w:history="1">
+      <w:hyperlink w:anchor="_Toc229093052" w:history="1">
         <w:r>
           <w:rPr>
             <w:rStyle w:val="Hyperlink"/>
@@ -5501,7 +5723,7 @@
             <w:noProof/>
             <w:webHidden/>
           </w:rPr>
-          <w:instrText xml:space="preserve"> PAGEREF _Toc229085736 \h </w:instrText>
+          <w:instrText xml:space="preserve"> PAGEREF _Toc229093052 \h </w:instrText>
         </w:r>
         <w:r>
           <w:rPr>
@@ -5544,7 +5766,7 @@
           <w:lang w:eastAsia="en-GB"/>
         </w:rPr>
       </w:pPr>
-      <w:hyperlink w:anchor="_Toc229085737" w:history="1">
+      <w:hyperlink w:anchor="_Toc229093053" w:history="1">
         <w:r>
           <w:rPr>
             <w:rStyle w:val="Hyperlink"/>
@@ -5571,7 +5793,7 @@
             <w:noProof/>
             <w:webHidden/>
           </w:rPr>
-          <w:instrText xml:space="preserve"> PAGEREF _Toc229085737 \h </w:instrText>
+          <w:instrText xml:space="preserve"> PAGEREF _Toc229093053 \h </w:instrText>
         </w:r>
         <w:r>
           <w:rPr>
@@ -5614,7 +5836,7 @@
           <w:lang w:eastAsia="en-GB"/>
         </w:rPr>
       </w:pPr>
-      <w:hyperlink w:anchor="_Toc229085738" w:history="1">
+      <w:hyperlink w:anchor="_Toc229093054" w:history="1">
         <w:r>
           <w:rPr>
             <w:rStyle w:val="Hyperlink"/>
@@ -5641,7 +5863,7 @@
             <w:noProof/>
             <w:webHidden/>
           </w:rPr>
-          <w:instrText xml:space="preserve"> PAGEREF _Toc229085738 \h </w:instrText>
+          <w:instrText xml:space="preserve"> PAGEREF _Toc229093054 \h </w:instrText>
         </w:r>
         <w:r>
           <w:rPr>
@@ -5684,7 +5906,7 @@
           <w:lang w:eastAsia="en-GB"/>
         </w:rPr>
       </w:pPr>
-      <w:hyperlink w:anchor="_Toc229085739" w:history="1">
+      <w:hyperlink w:anchor="_Toc229093055" w:history="1">
         <w:r>
           <w:rPr>
             <w:rStyle w:val="Hyperlink"/>
@@ -5711,7 +5933,7 @@
             <w:noProof/>
             <w:webHidden/>
           </w:rPr>
-          <w:instrText xml:space="preserve"> PAGEREF _Toc229085739 \h </w:instrText>
+          <w:instrText xml:space="preserve"> PAGEREF _Toc229093055 \h </w:instrText>
         </w:r>
         <w:r>
           <w:rPr>
@@ -5754,7 +5976,7 @@
           <w:lang w:eastAsia="en-GB"/>
         </w:rPr>
       </w:pPr>
-      <w:hyperlink w:anchor="_Toc229085740" w:history="1">
+      <w:hyperlink w:anchor="_Toc229093056" w:history="1">
         <w:r>
           <w:rPr>
             <w:rStyle w:val="Hyperlink"/>
@@ -5781,7 +6003,7 @@
             <w:noProof/>
             <w:webHidden/>
           </w:rPr>
-          <w:instrText xml:space="preserve"> PAGEREF _Toc229085740 \h </w:instrText>
+          <w:instrText xml:space="preserve"> PAGEREF _Toc229093056 \h </w:instrText>
         </w:r>
         <w:r>
           <w:rPr>
@@ -5802,6 +6024,286 @@
             <w:webHidden/>
           </w:rPr>
           <w:t>23</w:t>
+        </w:r>
+        <w:r>
+          <w:rPr>
+            <w:noProof/>
+            <w:webHidden/>
+          </w:rPr>
+          <w:fldChar w:fldCharType="end"/>
+        </w:r>
+      </w:hyperlink>
+    </w:p>
+    <w:p>
+      <w:pPr>
+        <w:pStyle w:val="TableofFigures"/>
+        <w:tabs>
+          <w:tab w:val="right" w:leader="dot" w:pos="9016"/>
+        </w:tabs>
+        <w:rPr>
+          <w:rFonts w:asciiTheme="minorHAnsi" w:eastAsiaTheme="minorEastAsia" w:hAnsiTheme="minorHAnsi"/>
+          <w:noProof/>
+          <w:lang w:eastAsia="en-GB"/>
+        </w:rPr>
+      </w:pPr>
+      <w:hyperlink w:anchor="_Toc229093057" w:history="1">
+        <w:r>
+          <w:rPr>
+            <w:rStyle w:val="Hyperlink"/>
+            <w:noProof/>
+          </w:rPr>
+          <w:t>Figure 19</w:t>
+        </w:r>
+        <w:r>
+          <w:rPr>
+            <w:noProof/>
+            <w:webHidden/>
+          </w:rPr>
+          <w:tab/>
+        </w:r>
+        <w:r>
+          <w:rPr>
+            <w:noProof/>
+            <w:webHidden/>
+          </w:rPr>
+          <w:fldChar w:fldCharType="begin"/>
+        </w:r>
+        <w:r>
+          <w:rPr>
+            <w:noProof/>
+            <w:webHidden/>
+          </w:rPr>
+          <w:instrText xml:space="preserve"> PAGEREF _Toc229093057 \h </w:instrText>
+        </w:r>
+        <w:r>
+          <w:rPr>
+            <w:noProof/>
+            <w:webHidden/>
+          </w:rPr>
+        </w:r>
+        <w:r>
+          <w:rPr>
+            <w:noProof/>
+            <w:webHidden/>
+          </w:rPr>
+          <w:fldChar w:fldCharType="separate"/>
+        </w:r>
+        <w:r>
+          <w:rPr>
+            <w:noProof/>
+            <w:webHidden/>
+          </w:rPr>
+          <w:t>23</w:t>
+        </w:r>
+        <w:r>
+          <w:rPr>
+            <w:noProof/>
+            <w:webHidden/>
+          </w:rPr>
+          <w:fldChar w:fldCharType="end"/>
+        </w:r>
+      </w:hyperlink>
+    </w:p>
+    <w:p>
+      <w:pPr>
+        <w:pStyle w:val="TableofFigures"/>
+        <w:tabs>
+          <w:tab w:val="right" w:leader="dot" w:pos="9016"/>
+        </w:tabs>
+        <w:rPr>
+          <w:rFonts w:asciiTheme="minorHAnsi" w:eastAsiaTheme="minorEastAsia" w:hAnsiTheme="minorHAnsi"/>
+          <w:noProof/>
+          <w:lang w:eastAsia="en-GB"/>
+        </w:rPr>
+      </w:pPr>
+      <w:hyperlink w:anchor="_Toc229093058" w:history="1">
+        <w:r>
+          <w:rPr>
+            <w:rStyle w:val="Hyperlink"/>
+            <w:noProof/>
+          </w:rPr>
+          <w:t>Figure 20</w:t>
+        </w:r>
+        <w:r>
+          <w:rPr>
+            <w:noProof/>
+            <w:webHidden/>
+          </w:rPr>
+          <w:tab/>
+        </w:r>
+        <w:r>
+          <w:rPr>
+            <w:noProof/>
+            <w:webHidden/>
+          </w:rPr>
+          <w:fldChar w:fldCharType="begin"/>
+        </w:r>
+        <w:r>
+          <w:rPr>
+            <w:noProof/>
+            <w:webHidden/>
+          </w:rPr>
+          <w:instrText xml:space="preserve"> PAGEREF _Toc229093058 \h </w:instrText>
+        </w:r>
+        <w:r>
+          <w:rPr>
+            <w:noProof/>
+            <w:webHidden/>
+          </w:rPr>
+        </w:r>
+        <w:r>
+          <w:rPr>
+            <w:noProof/>
+            <w:webHidden/>
+          </w:rPr>
+          <w:fldChar w:fldCharType="separate"/>
+        </w:r>
+        <w:r>
+          <w:rPr>
+            <w:noProof/>
+            <w:webHidden/>
+          </w:rPr>
+          <w:t>24</w:t>
+        </w:r>
+        <w:r>
+          <w:rPr>
+            <w:noProof/>
+            <w:webHidden/>
+          </w:rPr>
+          <w:fldChar w:fldCharType="end"/>
+        </w:r>
+      </w:hyperlink>
+    </w:p>
+    <w:p>
+      <w:pPr>
+        <w:pStyle w:val="TableofFigures"/>
+        <w:tabs>
+          <w:tab w:val="right" w:leader="dot" w:pos="9016"/>
+        </w:tabs>
+        <w:rPr>
+          <w:rFonts w:asciiTheme="minorHAnsi" w:eastAsiaTheme="minorEastAsia" w:hAnsiTheme="minorHAnsi"/>
+          <w:noProof/>
+          <w:lang w:eastAsia="en-GB"/>
+        </w:rPr>
+      </w:pPr>
+      <w:hyperlink w:anchor="_Toc229093059" w:history="1">
+        <w:r>
+          <w:rPr>
+            <w:rStyle w:val="Hyperlink"/>
+            <w:noProof/>
+          </w:rPr>
+          <w:t>Figure 21</w:t>
+        </w:r>
+        <w:r>
+          <w:rPr>
+            <w:noProof/>
+            <w:webHidden/>
+          </w:rPr>
+          <w:tab/>
+        </w:r>
+        <w:r>
+          <w:rPr>
+            <w:noProof/>
+            <w:webHidden/>
+          </w:rPr>
+          <w:fldChar w:fldCharType="begin"/>
+        </w:r>
+        <w:r>
+          <w:rPr>
+            <w:noProof/>
+            <w:webHidden/>
+          </w:rPr>
+          <w:instrText xml:space="preserve"> PAGEREF _Toc229093059 \h </w:instrText>
+        </w:r>
+        <w:r>
+          <w:rPr>
+            <w:noProof/>
+            <w:webHidden/>
+          </w:rPr>
+        </w:r>
+        <w:r>
+          <w:rPr>
+            <w:noProof/>
+            <w:webHidden/>
+          </w:rPr>
+          <w:fldChar w:fldCharType="separate"/>
+        </w:r>
+        <w:r>
+          <w:rPr>
+            <w:noProof/>
+            <w:webHidden/>
+          </w:rPr>
+          <w:t>25</w:t>
+        </w:r>
+        <w:r>
+          <w:rPr>
+            <w:noProof/>
+            <w:webHidden/>
+          </w:rPr>
+          <w:fldChar w:fldCharType="end"/>
+        </w:r>
+      </w:hyperlink>
+    </w:p>
+    <w:p>
+      <w:pPr>
+        <w:pStyle w:val="TableofFigures"/>
+        <w:tabs>
+          <w:tab w:val="right" w:leader="dot" w:pos="9016"/>
+        </w:tabs>
+        <w:rPr>
+          <w:rFonts w:asciiTheme="minorHAnsi" w:eastAsiaTheme="minorEastAsia" w:hAnsiTheme="minorHAnsi"/>
+          <w:noProof/>
+          <w:lang w:eastAsia="en-GB"/>
+        </w:rPr>
+      </w:pPr>
+      <w:hyperlink w:anchor="_Toc229093060" w:history="1">
+        <w:r>
+          <w:rPr>
+            <w:rStyle w:val="Hyperlink"/>
+            <w:noProof/>
+          </w:rPr>
+          <w:t>Figure 22</w:t>
+        </w:r>
+        <w:r>
+          <w:rPr>
+            <w:noProof/>
+            <w:webHidden/>
+          </w:rPr>
+          <w:tab/>
+        </w:r>
+        <w:r>
+          <w:rPr>
+            <w:noProof/>
+            <w:webHidden/>
+          </w:rPr>
+          <w:fldChar w:fldCharType="begin"/>
+        </w:r>
+        <w:r>
+          <w:rPr>
+            <w:noProof/>
+            <w:webHidden/>
+          </w:rPr>
+          <w:instrText xml:space="preserve"> PAGEREF _Toc229093060 \h </w:instrText>
+        </w:r>
+        <w:r>
+          <w:rPr>
+            <w:noProof/>
+            <w:webHidden/>
+          </w:rPr>
+        </w:r>
+        <w:r>
+          <w:rPr>
+            <w:noProof/>
+            <w:webHidden/>
+          </w:rPr>
+          <w:fldChar w:fldCharType="separate"/>
+        </w:r>
+        <w:r>
+          <w:rPr>
+            <w:noProof/>
+            <w:webHidden/>
+          </w:rPr>
+          <w:t>25</w:t>
         </w:r>
         <w:r>
           <w:rPr>
@@ -5850,7 +6352,7 @@
       <w:pPr>
         <w:pStyle w:val="Heading1"/>
       </w:pPr>
-      <w:bookmarkStart w:id="8" w:name="_Toc229085746"/>
+      <w:bookmarkStart w:id="8" w:name="_Toc229092989"/>
       <w:r>
         <w:t>Chapter 1</w:t>
       </w:r>
@@ -5878,7 +6380,7 @@
           <w:u w:val="single"/>
         </w:rPr>
       </w:pPr>
-      <w:bookmarkStart w:id="9" w:name="_Toc229085747"/>
+      <w:bookmarkStart w:id="9" w:name="_Toc229092990"/>
       <w:r>
         <w:t>1.1</w:t>
       </w:r>
@@ -5904,7 +6406,13 @@
         <w:t xml:space="preserve">through tasks such as putting the AI on the backfoot, </w:t>
       </w:r>
       <w:r>
-        <w:t xml:space="preserve">pressuring the AI into making mistakes and attacking the AI into submission. The player will be able to play the AI in 5-9 games in which the AI will learn previous player moves and begin to cover them off. For example, if the player attacks early to win game 1, the AI will </w:t>
+        <w:t xml:space="preserve">pressuring the AI into making mistakes and attacking the AI into submission. The player will be able to play the AI </w:t>
+      </w:r>
+      <w:r>
+        <w:t>across 7</w:t>
+      </w:r>
+      <w:r>
+        <w:t xml:space="preserve"> games in which the AI will learn previous player moves and begin to cover them off. For example, if the player attacks early to win game 1, the AI will </w:t>
       </w:r>
       <w:r>
         <w:t>prioritize the defence of their units and structures.</w:t>
@@ -5929,7 +6437,7 @@
       <w:pPr>
         <w:pStyle w:val="Heading2"/>
       </w:pPr>
-      <w:bookmarkStart w:id="10" w:name="_Toc229085748"/>
+      <w:bookmarkStart w:id="10" w:name="_Toc229092991"/>
       <w:r>
         <w:t>1.2 Aims</w:t>
       </w:r>
@@ -5945,7 +6453,7 @@
           <w:szCs w:val="28"/>
         </w:rPr>
       </w:pPr>
-      <w:bookmarkStart w:id="11" w:name="_Toc229085749"/>
+      <w:bookmarkStart w:id="11" w:name="_Toc229092992"/>
       <w:r>
         <w:rPr>
           <w:rStyle w:val="Heading2Char"/>
@@ -5990,7 +6498,7 @@
       <w:pPr>
         <w:pStyle w:val="Heading3"/>
       </w:pPr>
-      <w:bookmarkStart w:id="12" w:name="_Toc229085750"/>
+      <w:bookmarkStart w:id="12" w:name="_Toc229092993"/>
       <w:r>
         <w:lastRenderedPageBreak/>
         <w:t>1.2.2 Additional Aims</w:t>
@@ -6060,7 +6568,7 @@
       <w:pPr>
         <w:pStyle w:val="Heading2"/>
       </w:pPr>
-      <w:bookmarkStart w:id="13" w:name="_Toc229085751"/>
+      <w:bookmarkStart w:id="13" w:name="_Toc229092994"/>
       <w:r>
         <w:t>1.3 Objectives</w:t>
       </w:r>
@@ -6070,7 +6578,7 @@
       <w:pPr>
         <w:pStyle w:val="Heading3"/>
       </w:pPr>
-      <w:bookmarkStart w:id="14" w:name="_Toc229085752"/>
+      <w:bookmarkStart w:id="14" w:name="_Toc229092995"/>
       <w:r>
         <w:t>1.3.1 Scope</w:t>
       </w:r>
@@ -6141,7 +6649,7 @@
       <w:pPr>
         <w:pStyle w:val="Heading3"/>
       </w:pPr>
-      <w:bookmarkStart w:id="15" w:name="_Toc229085753"/>
+      <w:bookmarkStart w:id="15" w:name="_Toc229092996"/>
       <w:r>
         <w:t>1.3.2 Research Objectives</w:t>
       </w:r>
@@ -6179,7 +6687,7 @@
       <w:pPr>
         <w:pStyle w:val="Heading3"/>
       </w:pPr>
-      <w:bookmarkStart w:id="16" w:name="_Toc229085754"/>
+      <w:bookmarkStart w:id="16" w:name="_Toc229092997"/>
       <w:r>
         <w:lastRenderedPageBreak/>
         <w:t>1.3.3 Design Objectives</w:t>
@@ -6302,7 +6810,7 @@
       <w:pPr>
         <w:pStyle w:val="Heading3"/>
       </w:pPr>
-      <w:bookmarkStart w:id="17" w:name="_Toc229085755"/>
+      <w:bookmarkStart w:id="17" w:name="_Toc229092998"/>
       <w:r>
         <w:t>1.3.4 Implementation Objectives</w:t>
       </w:r>
@@ -6421,7 +6929,7 @@
       <w:pPr>
         <w:pStyle w:val="Heading3"/>
       </w:pPr>
-      <w:bookmarkStart w:id="18" w:name="_Toc229085756"/>
+      <w:bookmarkStart w:id="18" w:name="_Toc229092999"/>
       <w:r>
         <w:t>1.3.5 Results, Evaluation and Playtesting Objectives</w:t>
       </w:r>
@@ -6478,7 +6986,7 @@
       <w:pPr>
         <w:pStyle w:val="Heading1"/>
       </w:pPr>
-      <w:bookmarkStart w:id="19" w:name="_Toc229085757"/>
+      <w:bookmarkStart w:id="19" w:name="_Toc229093000"/>
       <w:r>
         <w:lastRenderedPageBreak/>
         <w:t>Chapter 2 – Literature Survey</w:t>
@@ -6489,7 +6997,7 @@
       <w:pPr>
         <w:pStyle w:val="Heading2"/>
       </w:pPr>
-      <w:bookmarkStart w:id="20" w:name="_Toc229085758"/>
+      <w:bookmarkStart w:id="20" w:name="_Toc229093001"/>
       <w:r>
         <w:t>2.1 Literature Survey Introduction</w:t>
       </w:r>
@@ -6528,7 +7036,7 @@
       <w:pPr>
         <w:pStyle w:val="Heading2"/>
       </w:pPr>
-      <w:bookmarkStart w:id="21" w:name="_Toc229085759"/>
+      <w:bookmarkStart w:id="21" w:name="_Toc229093002"/>
       <w:r>
         <w:t>2.2 Comparative Research</w:t>
       </w:r>
@@ -6546,7 +7054,7 @@
       <w:pPr>
         <w:pStyle w:val="Heading3"/>
       </w:pPr>
-      <w:bookmarkStart w:id="22" w:name="_Toc229085760"/>
+      <w:bookmarkStart w:id="22" w:name="_Toc229093003"/>
       <w:r>
         <w:t xml:space="preserve">2.2.1 </w:t>
       </w:r>
@@ -6621,7 +7129,7 @@
       <w:pPr>
         <w:pStyle w:val="Heading4"/>
       </w:pPr>
-      <w:bookmarkStart w:id="23" w:name="_Toc229085761"/>
+      <w:bookmarkStart w:id="23" w:name="_Toc229093004"/>
       <w:r>
         <w:t>2.2.1.1 Perlin Noise</w:t>
       </w:r>
@@ -6922,7 +7430,7 @@
         <w:pStyle w:val="Caption"/>
         <w:jc w:val="center"/>
       </w:pPr>
-      <w:bookmarkStart w:id="24" w:name="_Toc229085723"/>
+      <w:bookmarkStart w:id="24" w:name="_Toc229093039"/>
       <w:r>
         <w:t xml:space="preserve">Figure </w:t>
       </w:r>
@@ -7006,7 +7514,7 @@
       <w:pPr>
         <w:pStyle w:val="Heading4"/>
       </w:pPr>
-      <w:bookmarkStart w:id="25" w:name="_Toc229085762"/>
+      <w:bookmarkStart w:id="25" w:name="_Toc229093005"/>
       <w:r>
         <w:t>2.2.1.2 Binary Space Partitioning</w:t>
       </w:r>
@@ -7057,7 +7565,7 @@
       <w:pPr>
         <w:pStyle w:val="Heading4"/>
       </w:pPr>
-      <w:bookmarkStart w:id="26" w:name="_Toc229085763"/>
+      <w:bookmarkStart w:id="26" w:name="_Toc229093006"/>
       <w:r>
         <w:t>2.2.1.3 Cellular Automata</w:t>
       </w:r>
@@ -7172,7 +7680,7 @@
       <w:pPr>
         <w:pStyle w:val="Heading3"/>
       </w:pPr>
-      <w:bookmarkStart w:id="27" w:name="_Toc229085764"/>
+      <w:bookmarkStart w:id="27" w:name="_Toc229093007"/>
       <w:r>
         <w:t>2.2.2 Pathfinding</w:t>
       </w:r>
@@ -7235,7 +7743,7 @@
       <w:pPr>
         <w:pStyle w:val="Heading4"/>
       </w:pPr>
-      <w:bookmarkStart w:id="28" w:name="_Toc229085765"/>
+      <w:bookmarkStart w:id="28" w:name="_Toc229093008"/>
       <w:r>
         <w:t>2.2.2.1 Dijkstra</w:t>
       </w:r>
@@ -7322,7 +7830,7 @@
         <w:pStyle w:val="Caption"/>
         <w:jc w:val="center"/>
       </w:pPr>
-      <w:bookmarkStart w:id="29" w:name="_Toc229085724"/>
+      <w:bookmarkStart w:id="29" w:name="_Toc229093040"/>
       <w:r>
         <w:t xml:space="preserve">Figure </w:t>
       </w:r>
@@ -7408,7 +7916,7 @@
       <w:pPr>
         <w:pStyle w:val="Heading4"/>
       </w:pPr>
-      <w:bookmarkStart w:id="30" w:name="_Toc229085766"/>
+      <w:bookmarkStart w:id="30" w:name="_Toc229093009"/>
       <w:r>
         <w:t>2.2.2.2 A*</w:t>
       </w:r>
@@ -7481,7 +7989,7 @@
       <w:pPr>
         <w:pStyle w:val="Heading4"/>
       </w:pPr>
-      <w:bookmarkStart w:id="31" w:name="_Toc229085767"/>
+      <w:bookmarkStart w:id="31" w:name="_Toc229093010"/>
       <w:r>
         <w:t>2.2.2.3 Jump Point Search</w:t>
       </w:r>
@@ -7531,7 +8039,7 @@
       <w:pPr>
         <w:pStyle w:val="Heading3"/>
       </w:pPr>
-      <w:bookmarkStart w:id="32" w:name="_Toc229085768"/>
+      <w:bookmarkStart w:id="32" w:name="_Toc229093011"/>
       <w:r>
         <w:t>2.2.3 AI Integrations</w:t>
       </w:r>
@@ -7555,7 +8063,7 @@
       <w:pPr>
         <w:pStyle w:val="Heading4"/>
       </w:pPr>
-      <w:bookmarkStart w:id="33" w:name="_Toc229085769"/>
+      <w:bookmarkStart w:id="33" w:name="_Toc229093012"/>
       <w:r>
         <w:lastRenderedPageBreak/>
         <w:t>2.2.3.1 Neural Network</w:t>
@@ -7612,7 +8120,7 @@
       <w:pPr>
         <w:pStyle w:val="Heading4"/>
       </w:pPr>
-      <w:bookmarkStart w:id="34" w:name="_Toc229085770"/>
+      <w:bookmarkStart w:id="34" w:name="_Toc229093013"/>
       <w:r>
         <w:t>2.2.3.2 Reinforcement Learning</w:t>
       </w:r>
@@ -7687,7 +8195,7 @@
         <w:pStyle w:val="Caption"/>
         <w:jc w:val="center"/>
       </w:pPr>
-      <w:bookmarkStart w:id="35" w:name="_Toc229085725"/>
+      <w:bookmarkStart w:id="35" w:name="_Toc229093041"/>
       <w:r>
         <w:t xml:space="preserve">Figure </w:t>
       </w:r>
@@ -7812,7 +8320,7 @@
       <w:pPr>
         <w:pStyle w:val="Heading4"/>
       </w:pPr>
-      <w:bookmarkStart w:id="36" w:name="_Toc229085771"/>
+      <w:bookmarkStart w:id="36" w:name="_Toc229093014"/>
       <w:r>
         <w:lastRenderedPageBreak/>
         <w:t>2.2.3.3 Imitation Learning</w:t>
@@ -7954,7 +8462,7 @@
       <w:pPr>
         <w:pStyle w:val="Heading1"/>
       </w:pPr>
-      <w:bookmarkStart w:id="37" w:name="_Toc229085772"/>
+      <w:bookmarkStart w:id="37" w:name="_Toc229093015"/>
       <w:r>
         <w:lastRenderedPageBreak/>
         <w:t>Chapter 3 – Design</w:t>
@@ -7982,7 +8490,7 @@
       <w:pPr>
         <w:pStyle w:val="Heading2"/>
       </w:pPr>
-      <w:bookmarkStart w:id="38" w:name="_Toc229085773"/>
+      <w:bookmarkStart w:id="38" w:name="_Toc229093016"/>
       <w:r>
         <w:t xml:space="preserve">3.1 </w:t>
       </w:r>
@@ -8033,7 +8541,7 @@
       <w:pPr>
         <w:pStyle w:val="Heading3"/>
       </w:pPr>
-      <w:bookmarkStart w:id="39" w:name="_Toc229085774"/>
+      <w:bookmarkStart w:id="39" w:name="_Toc229093017"/>
       <w:r>
         <w:t xml:space="preserve">3.1.1 </w:t>
       </w:r>
@@ -8131,7 +8639,7 @@
         <w:pStyle w:val="Caption"/>
         <w:jc w:val="center"/>
       </w:pPr>
-      <w:bookmarkStart w:id="40" w:name="_Toc229085726"/>
+      <w:bookmarkStart w:id="40" w:name="_Toc229093042"/>
       <w:r>
         <w:t xml:space="preserve">Figure </w:t>
       </w:r>
@@ -8246,7 +8754,7 @@
               <w:pStyle w:val="Caption"/>
               <w:jc w:val="center"/>
             </w:pPr>
-            <w:bookmarkStart w:id="41" w:name="_Toc229085727"/>
+            <w:bookmarkStart w:id="41" w:name="_Toc229093043"/>
             <w:r>
               <w:t xml:space="preserve">Figure </w:t>
             </w:r>
@@ -8334,7 +8842,7 @@
               <w:pStyle w:val="Caption"/>
               <w:jc w:val="center"/>
             </w:pPr>
-            <w:bookmarkStart w:id="42" w:name="_Toc229085728"/>
+            <w:bookmarkStart w:id="42" w:name="_Toc229093044"/>
             <w:r>
               <w:t xml:space="preserve">Figure </w:t>
             </w:r>
@@ -8418,7 +8926,7 @@
       <w:pPr>
         <w:pStyle w:val="Heading3"/>
       </w:pPr>
-      <w:bookmarkStart w:id="43" w:name="_Toc229085775"/>
+      <w:bookmarkStart w:id="43" w:name="_Toc229093018"/>
       <w:r>
         <w:t>3.1.2 Biomes</w:t>
       </w:r>
@@ -8589,7 +9097,7 @@
         <w:pStyle w:val="Caption"/>
         <w:jc w:val="center"/>
       </w:pPr>
-      <w:bookmarkStart w:id="44" w:name="_Toc229085729"/>
+      <w:bookmarkStart w:id="44" w:name="_Toc229093045"/>
       <w:r>
         <w:t xml:space="preserve">Figure </w:t>
       </w:r>
@@ -8678,7 +9186,7 @@
       <w:pPr>
         <w:pStyle w:val="Heading3"/>
       </w:pPr>
-      <w:bookmarkStart w:id="45" w:name="_Toc229085776"/>
+      <w:bookmarkStart w:id="45" w:name="_Toc229093019"/>
       <w:r>
         <w:t>3.1.3 Resource Distribution</w:t>
       </w:r>
@@ -8714,7 +9222,7 @@
       <w:pPr>
         <w:pStyle w:val="Heading3"/>
       </w:pPr>
-      <w:bookmarkStart w:id="46" w:name="_Toc229085777"/>
+      <w:bookmarkStart w:id="46" w:name="_Toc229093020"/>
       <w:r>
         <w:t>3.1.4 River generation</w:t>
       </w:r>
@@ -8760,7 +9268,7 @@
       <w:pPr>
         <w:pStyle w:val="Heading3"/>
       </w:pPr>
-      <w:bookmarkStart w:id="47" w:name="_Toc229085778"/>
+      <w:bookmarkStart w:id="47" w:name="_Toc229093021"/>
       <w:r>
         <w:t>3.1.</w:t>
       </w:r>
@@ -8868,7 +9376,7 @@
       <w:pPr>
         <w:pStyle w:val="Heading2"/>
       </w:pPr>
-      <w:bookmarkStart w:id="48" w:name="_Toc229085779"/>
+      <w:bookmarkStart w:id="48" w:name="_Toc229093022"/>
       <w:r>
         <w:t>3.2 Pathfinding</w:t>
       </w:r>
@@ -8886,7 +9394,7 @@
       <w:pPr>
         <w:pStyle w:val="Heading3"/>
       </w:pPr>
-      <w:bookmarkStart w:id="49" w:name="_Toc229085780"/>
+      <w:bookmarkStart w:id="49" w:name="_Toc229093023"/>
       <w:r>
         <w:t xml:space="preserve">3.2.1 </w:t>
       </w:r>
@@ -8945,7 +9453,7 @@
       <w:pPr>
         <w:pStyle w:val="Heading3"/>
       </w:pPr>
-      <w:bookmarkStart w:id="50" w:name="_Toc229085781"/>
+      <w:bookmarkStart w:id="50" w:name="_Toc229093024"/>
       <w:r>
         <w:t>3.2.2 Heuristics</w:t>
       </w:r>
@@ -9079,7 +9587,7 @@
         <w:pStyle w:val="Caption"/>
         <w:jc w:val="center"/>
       </w:pPr>
-      <w:bookmarkStart w:id="51" w:name="_Toc229085730"/>
+      <w:bookmarkStart w:id="51" w:name="_Toc229093046"/>
       <w:r>
         <w:t xml:space="preserve">Figure </w:t>
       </w:r>
@@ -9149,7 +9657,7 @@
       <w:pPr>
         <w:pStyle w:val="Heading3"/>
       </w:pPr>
-      <w:bookmarkStart w:id="52" w:name="_Toc229085782"/>
+      <w:bookmarkStart w:id="52" w:name="_Toc229093025"/>
       <w:r>
         <w:lastRenderedPageBreak/>
         <w:t>3.2.3 Limitations</w:t>
@@ -9197,7 +9705,7 @@
       <w:pPr>
         <w:pStyle w:val="Heading2"/>
       </w:pPr>
-      <w:bookmarkStart w:id="53" w:name="_Toc229085783"/>
+      <w:bookmarkStart w:id="53" w:name="_Toc229093026"/>
       <w:r>
         <w:t>3.3 AI Integrations</w:t>
       </w:r>
@@ -9224,7 +9732,7 @@
       <w:pPr>
         <w:pStyle w:val="Heading3"/>
       </w:pPr>
-      <w:bookmarkStart w:id="54" w:name="_Toc229085784"/>
+      <w:bookmarkStart w:id="54" w:name="_Toc229093027"/>
       <w:r>
         <w:t>3.3.1 Unity ML-Agents</w:t>
       </w:r>
@@ -9329,7 +9837,7 @@
       <w:pPr>
         <w:pStyle w:val="Heading3"/>
       </w:pPr>
-      <w:bookmarkStart w:id="55" w:name="_Toc229085785"/>
+      <w:bookmarkStart w:id="55" w:name="_Toc229093028"/>
       <w:r>
         <w:t>3.3.2 AI Controller</w:t>
       </w:r>
@@ -9362,7 +9870,7 @@
       <w:pPr>
         <w:pStyle w:val="Heading3"/>
       </w:pPr>
-      <w:bookmarkStart w:id="56" w:name="_Toc229085786"/>
+      <w:bookmarkStart w:id="56" w:name="_Toc229093029"/>
       <w:r>
         <w:t>3.3.3 Limitations</w:t>
       </w:r>
@@ -9422,7 +9930,7 @@
       <w:pPr>
         <w:pStyle w:val="Heading1"/>
       </w:pPr>
-      <w:bookmarkStart w:id="57" w:name="_Toc229085787"/>
+      <w:bookmarkStart w:id="57" w:name="_Toc229093030"/>
       <w:r>
         <w:lastRenderedPageBreak/>
         <w:t xml:space="preserve">Chapter 4 </w:t>
@@ -9444,7 +9952,7 @@
       <w:pPr>
         <w:pStyle w:val="Heading2"/>
       </w:pPr>
-      <w:bookmarkStart w:id="58" w:name="_Toc229085788"/>
+      <w:bookmarkStart w:id="58" w:name="_Toc229093031"/>
       <w:r>
         <w:t>4.1 World Generation</w:t>
       </w:r>
@@ -9488,7 +9996,7 @@
       <w:pPr>
         <w:pStyle w:val="Heading3"/>
       </w:pPr>
-      <w:bookmarkStart w:id="59" w:name="_Toc229085789"/>
+      <w:bookmarkStart w:id="59" w:name="_Toc229093032"/>
       <w:r>
         <w:t>4.1.1 Creating the colour noise map</w:t>
       </w:r>
@@ -9671,7 +10179,7 @@
         <w:pStyle w:val="Caption"/>
         <w:jc w:val="center"/>
       </w:pPr>
-      <w:bookmarkStart w:id="60" w:name="_Toc229085731"/>
+      <w:bookmarkStart w:id="60" w:name="_Toc229093047"/>
       <w:r>
         <w:t xml:space="preserve">Figure </w:t>
       </w:r>
@@ -9693,7 +10201,16 @@
     </w:p>
     <w:p>
       <w:r>
-        <w:t>As shown above in Figure 9, generating a monochrome noise map can be very easy. The above snippet of code will generate a pseudo-random grid of values 1 and 0. Unfortunately, this is not going to be suitable for generating our world so adding in features to make the texture look more terrain-like is required.</w:t>
+        <w:t xml:space="preserve">As shown above in Figure 9, generating a monochrome noise map can be very easy. The above snippet of code will generate a pseudo-random grid of values 1 and 0. Unfortunately, this is not going to be suitable for generating our world so adding in features to make the texture look more </w:t>
+      </w:r>
+      <w:r>
+        <w:t>representative of terrain</w:t>
+      </w:r>
+      <w:r>
+        <w:t>`</w:t>
+      </w:r>
+      <w:r>
+        <w:t xml:space="preserve"> is required.</w:t>
       </w:r>
     </w:p>
     <w:p>
@@ -9843,7 +10360,7 @@
         <w:pStyle w:val="Caption"/>
         <w:jc w:val="center"/>
       </w:pPr>
-      <w:bookmarkStart w:id="61" w:name="_Toc229085732"/>
+      <w:bookmarkStart w:id="61" w:name="_Toc229093048"/>
       <w:r>
         <w:t xml:space="preserve">Figure </w:t>
       </w:r>
@@ -10024,7 +10541,7 @@
         <w:pStyle w:val="Caption"/>
         <w:jc w:val="center"/>
       </w:pPr>
-      <w:bookmarkStart w:id="62" w:name="_Toc229085733"/>
+      <w:bookmarkStart w:id="62" w:name="_Toc229093049"/>
       <w:r>
         <w:t xml:space="preserve">Figure </w:t>
       </w:r>
@@ -10107,7 +10624,7 @@
         <w:pStyle w:val="Caption"/>
         <w:jc w:val="center"/>
       </w:pPr>
-      <w:bookmarkStart w:id="63" w:name="_Toc229085734"/>
+      <w:bookmarkStart w:id="63" w:name="_Toc229093050"/>
       <w:r>
         <w:t xml:space="preserve">Figure </w:t>
       </w:r>
@@ -10133,7 +10650,7 @@
       <w:pPr>
         <w:pStyle w:val="Heading3"/>
       </w:pPr>
-      <w:bookmarkStart w:id="64" w:name="_Toc229085790"/>
+      <w:bookmarkStart w:id="64" w:name="_Toc229093033"/>
       <w:r>
         <w:t>4.1.2 Creating the world map</w:t>
       </w:r>
@@ -10265,7 +10782,7 @@
         <w:pStyle w:val="Caption"/>
         <w:jc w:val="center"/>
       </w:pPr>
-      <w:bookmarkStart w:id="65" w:name="_Toc229085735"/>
+      <w:bookmarkStart w:id="65" w:name="_Toc229093051"/>
       <w:r>
         <w:t xml:space="preserve">Figure </w:t>
       </w:r>
@@ -10353,7 +10870,7 @@
         <w:pStyle w:val="Caption"/>
         <w:jc w:val="center"/>
       </w:pPr>
-      <w:bookmarkStart w:id="66" w:name="_Toc229085736"/>
+      <w:bookmarkStart w:id="66" w:name="_Toc229093052"/>
       <w:r>
         <w:t xml:space="preserve">Figure </w:t>
       </w:r>
@@ -10376,7 +10893,7 @@
       <w:pPr>
         <w:pStyle w:val="Heading3"/>
       </w:pPr>
-      <w:bookmarkStart w:id="67" w:name="_Toc229085791"/>
+      <w:bookmarkStart w:id="67" w:name="_Toc229093034"/>
       <w:r>
         <w:lastRenderedPageBreak/>
         <w:t>4.1.3 Creating the River Generation</w:t>
@@ -10385,7 +10902,13 @@
     </w:p>
     <w:p>
       <w:r>
-        <w:t>In order to create rivers within the game, tweaking the world generation system was necessary. Starting in the tile array initialisation, randomly deciding if a river would start on any given tile was the obvious choice. This conclusion was reached due to the time limitations of the project – creating a height-based water system was outside the scope of this project. The downsides of this were that rivers appeared overly straight</w:t>
+        <w:t xml:space="preserve">In order to create rivers within the game, tweaking the world generation system was necessary. Starting in the tile array initialisation, randomly deciding if a river would start on any given tile was the </w:t>
+      </w:r>
+      <w:r>
+        <w:t>most practical solution</w:t>
+      </w:r>
+      <w:r>
+        <w:t>. This conclusion was reached due to the time limitations of the project – creating a height-based water system was outside the scope of this project. The downsides of this were that rivers appeared overly straight</w:t>
       </w:r>
       <w:r>
         <w:t>, had a maximum length</w:t>
@@ -10531,7 +11054,7 @@
         <w:pStyle w:val="Caption"/>
         <w:jc w:val="center"/>
       </w:pPr>
-      <w:bookmarkStart w:id="68" w:name="_Toc229085737"/>
+      <w:bookmarkStart w:id="68" w:name="_Toc229093053"/>
       <w:r>
         <w:t xml:space="preserve">Figure </w:t>
       </w:r>
@@ -10624,7 +11147,7 @@
         <w:pStyle w:val="Caption"/>
         <w:jc w:val="center"/>
       </w:pPr>
-      <w:bookmarkStart w:id="69" w:name="_Toc229085738"/>
+      <w:bookmarkStart w:id="69" w:name="_Toc229093054"/>
       <w:r>
         <w:t xml:space="preserve">Figure </w:t>
       </w:r>
@@ -10640,7 +11163,13 @@
     </w:p>
     <w:p>
       <w:r>
-        <w:t xml:space="preserve">Figure 16 shows how the aforementioned changes made the rivers less connected although they did appear to turn now. Unfortunately, after many hours of despair and referring back to other media in the genre, this system was scrapped in favour of a tile-based system. The river would now be randomly selected to start, but the edge traversal will never take place. This edge traversal system was replaced by a </w:t>
+        <w:t xml:space="preserve">Figure 16 shows how the aforementioned changes made the rivers less connected although they did appear to turn now. Unfortunately, after </w:t>
+      </w:r>
+      <w:r>
+        <w:t>extensive iteration</w:t>
+      </w:r>
+      <w:r>
+        <w:t xml:space="preserve"> and referring back to other media in the genre, this system was scrapped in favour of a tile-based system. The river would now be randomly selected to start, but the edge traversal will never take place. This edge traversal system was replaced by a </w:t>
       </w:r>
       <w:r>
         <w:t>recursive algorithm that randomly selected a direction from the start tile, changed the tile biome of the current tile to be the river, river head or river turns, then moved in the direction of the next tile, repeating the process until the previously established conditions were met.</w:t>
@@ -10717,7 +11246,7 @@
         <w:pStyle w:val="Caption"/>
         <w:jc w:val="center"/>
       </w:pPr>
-      <w:bookmarkStart w:id="70" w:name="_Toc229085739"/>
+      <w:bookmarkStart w:id="70" w:name="_Toc229093055"/>
       <w:r>
         <w:t xml:space="preserve">Figure </w:t>
       </w:r>
@@ -10806,7 +11335,7 @@
         <w:pStyle w:val="Caption"/>
         <w:jc w:val="center"/>
       </w:pPr>
-      <w:bookmarkStart w:id="71" w:name="_Toc229085740"/>
+      <w:bookmarkStart w:id="71" w:name="_Toc229093056"/>
       <w:r>
         <w:t xml:space="preserve">Figure </w:t>
       </w:r>
@@ -10827,6 +11356,166 @@
       </w:r>
     </w:p>
     <w:p>
+      <w:pPr>
+        <w:pStyle w:val="Heading2"/>
+      </w:pPr>
+      <w:bookmarkStart w:id="72" w:name="_Toc229093035"/>
+      <w:r>
+        <w:t>4.2 Pathfinding</w:t>
+      </w:r>
+      <w:bookmarkEnd w:id="72"/>
+    </w:p>
+    <w:p>
+      <w:r>
+        <w:t xml:space="preserve">This section will be split into 2 subsections: Creating the pathfinding graph, and </w:t>
+      </w:r>
+      <w:r>
+        <w:t>a path</w:t>
+      </w:r>
+      <w:r>
+        <w:t xml:space="preserve"> is found</w:t>
+      </w:r>
+      <w:r>
+        <w:t>. This is to ensure full coverage of the feature and will include discussion about why certain decisions were taken.</w:t>
+      </w:r>
+    </w:p>
+    <w:p>
+      <w:pPr>
+        <w:pStyle w:val="Heading3"/>
+      </w:pPr>
+      <w:bookmarkStart w:id="73" w:name="_Toc229093036"/>
+      <w:r>
+        <w:t>4.2.1 Creating the Pathfinding Graph</w:t>
+      </w:r>
+      <w:bookmarkEnd w:id="73"/>
+    </w:p>
+    <w:p>
+      <w:pPr>
+        <w:keepNext/>
+      </w:pPr>
+      <w:r>
+        <w:t xml:space="preserve">Creating the pathfinding grid proved to be more simplistic than initially expected. This is due to the world map tile array already existing. This meant that all that was required to turn this into a graph ready for traversal was label the tiles in the array as nodes. </w:t>
+      </w:r>
+    </w:p>
+    <w:p>
+      <w:pPr>
+        <w:keepNext/>
+        <w:jc w:val="center"/>
+      </w:pPr>
+      <w:r>
+        <w:rPr>
+          <w:noProof/>
+        </w:rPr>
+        <w:drawing>
+          <wp:inline distT="0" distB="0" distL="0" distR="0" wp14:anchorId="5B590FBA" wp14:editId="505DE369">
+            <wp:extent cx="5719445" cy="1440815"/>
+            <wp:effectExtent l="0" t="0" r="0" b="6985"/>
+            <wp:docPr id="329393537" name="Picture 9"/>
+            <wp:cNvGraphicFramePr>
+              <a:graphicFrameLocks xmlns:a="http://schemas.openxmlformats.org/drawingml/2006/main" noChangeAspect="1"/>
+            </wp:cNvGraphicFramePr>
+            <a:graphic xmlns:a="http://schemas.openxmlformats.org/drawingml/2006/main">
+              <a:graphicData uri="http://schemas.openxmlformats.org/drawingml/2006/picture">
+                <pic:pic xmlns:pic="http://schemas.openxmlformats.org/drawingml/2006/picture">
+                  <pic:nvPicPr>
+                    <pic:cNvPr id="0" name="Picture 9"/>
+                    <pic:cNvPicPr>
+                      <a:picLocks noChangeAspect="1" noChangeArrowheads="1"/>
+                    </pic:cNvPicPr>
+                  </pic:nvPicPr>
+                  <pic:blipFill>
+                    <a:blip r:embed="rId32" cstate="print">
+                      <a:extLst>
+                        <a:ext uri="{28A0092B-C50C-407E-A947-70E740481C1C}">
+                          <a14:useLocalDpi xmlns:a14="http://schemas.microsoft.com/office/drawing/2010/main" val="0"/>
+                        </a:ext>
+                      </a:extLst>
+                    </a:blip>
+                    <a:srcRect/>
+                    <a:stretch>
+                      <a:fillRect/>
+                    </a:stretch>
+                  </pic:blipFill>
+                  <pic:spPr bwMode="auto">
+                    <a:xfrm>
+                      <a:off x="0" y="0"/>
+                      <a:ext cx="5719445" cy="1440815"/>
+                    </a:xfrm>
+                    <a:prstGeom prst="rect">
+                      <a:avLst/>
+                    </a:prstGeom>
+                    <a:noFill/>
+                    <a:ln>
+                      <a:noFill/>
+                    </a:ln>
+                  </pic:spPr>
+                </pic:pic>
+              </a:graphicData>
+            </a:graphic>
+          </wp:inline>
+        </w:drawing>
+      </w:r>
+    </w:p>
+    <w:p>
+      <w:pPr>
+        <w:pStyle w:val="Caption"/>
+        <w:jc w:val="center"/>
+      </w:pPr>
+      <w:bookmarkStart w:id="74" w:name="_Toc229093057"/>
+      <w:r>
+        <w:t xml:space="preserve">Figure </w:t>
+      </w:r>
+      <w:fldSimple w:instr=" SEQ Figure \* ARABIC ">
+        <w:r>
+          <w:rPr>
+            <w:noProof/>
+          </w:rPr>
+          <w:t>19</w:t>
+        </w:r>
+        <w:bookmarkEnd w:id="74"/>
+      </w:fldSimple>
+    </w:p>
+    <w:p>
+      <w:r>
+        <w:lastRenderedPageBreak/>
+        <w:t xml:space="preserve">Figure 19 shows </w:t>
+      </w:r>
+      <w:r>
+        <w:t>how the graph is created</w:t>
+      </w:r>
+      <w:r>
+        <w:t>. To build this graph, all that is required is that each tile has a reference to all of its available neighbours. This section of code is executed from the world generation and is executed after the river and resource placement. This is to ensure that only the final tile array is passed to the pathfinding graph.</w:t>
+      </w:r>
+    </w:p>
+    <w:p>
+      <w:pPr>
+        <w:pStyle w:val="Heading3"/>
+      </w:pPr>
+      <w:bookmarkStart w:id="75" w:name="_Toc229093037"/>
+      <w:r>
+        <w:t>4.2.2 How a path is foun</w:t>
+      </w:r>
+      <w:r>
+        <w:t>d</w:t>
+      </w:r>
+      <w:bookmarkEnd w:id="75"/>
+    </w:p>
+    <w:p>
+      <w:r>
+        <w:t xml:space="preserve">When a unit wants to move, it must first contact the pathfinding graph to get its path. This results in a traversal of the previously mentioned graph using the A* algorithm with a </w:t>
+      </w:r>
+      <w:r>
+        <w:t>E</w:t>
+      </w:r>
+      <w:r>
+        <w:t xml:space="preserve">uclidean </w:t>
+      </w:r>
+      <w:r>
+        <w:t>h</w:t>
+      </w:r>
+      <w:r>
+        <w:t>euristic.</w:t>
+      </w:r>
       <w:r>
         <w:t xml:space="preserve"> </w:t>
       </w:r>
@@ -10834,13 +11523,315 @@
     <w:p/>
     <w:p>
       <w:pPr>
+        <w:rPr>
+          <w:noProof/>
+        </w:rPr>
+      </w:pPr>
+      <w:r>
+        <w:t>The FindPath function starts by keeping track of 5 variables: the gCost, which is the distance from the start to the current node; the fCost, which is the total path cost; the cost from where the unit started to the current position; the open set, the tiles that still need to be processed; and the closed set, the tiles that have already been evaluated.</w:t>
+      </w:r>
+      <w:r>
+        <w:t xml:space="preserve"> The function that starts us with a gCost of 0 for the starting tile and an fCost of the value of our Euclidean heuristic, as shown below in Figure 20, for the start tile.</w:t>
+      </w:r>
+      <w:r>
+        <w:rPr>
+          <w:noProof/>
+        </w:rPr>
+        <w:t xml:space="preserve"> </w:t>
+      </w:r>
+    </w:p>
+    <w:p>
+      <w:pPr>
+        <w:rPr>
+          <w:noProof/>
+        </w:rPr>
+      </w:pPr>
+    </w:p>
+    <w:p>
+      <w:pPr>
+        <w:pStyle w:val="Caption"/>
+        <w:keepNext/>
         <w:jc w:val="center"/>
       </w:pPr>
       <w:r>
-        <w:br w:type="page"/>
-      </w:r>
-    </w:p>
-    <w:bookmarkStart w:id="72" w:name="_Toc229085792" w:displacedByCustomXml="next"/>
+        <w:rPr>
+          <w:noProof/>
+        </w:rPr>
+        <w:drawing>
+          <wp:inline distT="0" distB="0" distL="0" distR="0" wp14:anchorId="082D1BA5" wp14:editId="257A709F">
+            <wp:extent cx="5715000" cy="876300"/>
+            <wp:effectExtent l="0" t="0" r="0" b="0"/>
+            <wp:docPr id="91993098" name="Picture 11"/>
+            <wp:cNvGraphicFramePr>
+              <a:graphicFrameLocks xmlns:a="http://schemas.openxmlformats.org/drawingml/2006/main" noChangeAspect="1"/>
+            </wp:cNvGraphicFramePr>
+            <a:graphic xmlns:a="http://schemas.openxmlformats.org/drawingml/2006/main">
+              <a:graphicData uri="http://schemas.openxmlformats.org/drawingml/2006/picture">
+                <pic:pic xmlns:pic="http://schemas.openxmlformats.org/drawingml/2006/picture">
+                  <pic:nvPicPr>
+                    <pic:cNvPr id="0" name="Picture 11"/>
+                    <pic:cNvPicPr>
+                      <a:picLocks noChangeAspect="1" noChangeArrowheads="1"/>
+                    </pic:cNvPicPr>
+                  </pic:nvPicPr>
+                  <pic:blipFill>
+                    <a:blip r:embed="rId33" cstate="print">
+                      <a:extLst>
+                        <a:ext uri="{28A0092B-C50C-407E-A947-70E740481C1C}">
+                          <a14:useLocalDpi xmlns:a14="http://schemas.microsoft.com/office/drawing/2010/main" val="0"/>
+                        </a:ext>
+                      </a:extLst>
+                    </a:blip>
+                    <a:srcRect/>
+                    <a:stretch>
+                      <a:fillRect/>
+                    </a:stretch>
+                  </pic:blipFill>
+                  <pic:spPr bwMode="auto">
+                    <a:xfrm>
+                      <a:off x="0" y="0"/>
+                      <a:ext cx="5715000" cy="876300"/>
+                    </a:xfrm>
+                    <a:prstGeom prst="rect">
+                      <a:avLst/>
+                    </a:prstGeom>
+                    <a:noFill/>
+                    <a:ln>
+                      <a:noFill/>
+                    </a:ln>
+                  </pic:spPr>
+                </pic:pic>
+              </a:graphicData>
+            </a:graphic>
+          </wp:inline>
+        </w:drawing>
+      </w:r>
+    </w:p>
+    <w:p>
+      <w:pPr>
+        <w:pStyle w:val="Caption"/>
+        <w:jc w:val="center"/>
+      </w:pPr>
+      <w:bookmarkStart w:id="76" w:name="_Toc229093058"/>
+      <w:r>
+        <w:t xml:space="preserve">Figure </w:t>
+      </w:r>
+      <w:fldSimple w:instr=" SEQ Figure \* ARABIC ">
+        <w:r>
+          <w:rPr>
+            <w:noProof/>
+          </w:rPr>
+          <w:t>20</w:t>
+        </w:r>
+        <w:bookmarkEnd w:id="76"/>
+      </w:fldSimple>
+    </w:p>
+    <w:p>
+      <w:r>
+        <w:t>The heuristic, shown above in Figure 20, just returns the difference between the position of the first and second inputs. This doesn’t need transforming to tile space as the function takes in tile space positions.</w:t>
+      </w:r>
+      <w:r>
+        <w:t xml:space="preserve"> The function then adds the start tile to the open set and starts our pathfinding. This function gets the lowest fCost tile from the open set and removes it. Then it is added to the closed set and each neighbour tile is checked for its tentativeG, this is just the gCost of the current tile added to the move cost to the neighbour tile, and if it’s lower than the gCost of the neighbour tile, the system adds the neighbour tile to the open set while also adding the tentativeG to the gCost of the neighbour tile and the tentativeG added to the heuristic of the neighbour and the destination to the fCost of the neighbour tile.</w:t>
+      </w:r>
+      <w:r>
+        <w:t xml:space="preserve"> If the current tile is ever equal to the target, the function then begins to reconstruct the path</w:t>
+      </w:r>
+      <w:r>
+        <w:t>,</w:t>
+      </w:r>
+      <w:r>
+        <w:t xml:space="preserve"> as shown </w:t>
+      </w:r>
+      <w:r>
+        <w:t xml:space="preserve">below </w:t>
+      </w:r>
+      <w:r>
+        <w:t>i</w:t>
+      </w:r>
+      <w:r>
+        <w:t xml:space="preserve">n </w:t>
+      </w:r>
+      <w:r>
+        <w:t xml:space="preserve">Figure 21. </w:t>
+      </w:r>
+    </w:p>
+    <w:p>
+      <w:pPr>
+        <w:keepNext/>
+      </w:pPr>
+      <w:r>
+        <w:rPr>
+          <w:noProof/>
+        </w:rPr>
+        <w:lastRenderedPageBreak/>
+        <w:drawing>
+          <wp:inline distT="0" distB="0" distL="0" distR="0" wp14:anchorId="03E817E2" wp14:editId="29C29972">
+            <wp:extent cx="5715000" cy="1762125"/>
+            <wp:effectExtent l="0" t="0" r="0" b="9525"/>
+            <wp:docPr id="2051994196" name="Picture 12"/>
+            <wp:cNvGraphicFramePr>
+              <a:graphicFrameLocks xmlns:a="http://schemas.openxmlformats.org/drawingml/2006/main" noChangeAspect="1"/>
+            </wp:cNvGraphicFramePr>
+            <a:graphic xmlns:a="http://schemas.openxmlformats.org/drawingml/2006/main">
+              <a:graphicData uri="http://schemas.openxmlformats.org/drawingml/2006/picture">
+                <pic:pic xmlns:pic="http://schemas.openxmlformats.org/drawingml/2006/picture">
+                  <pic:nvPicPr>
+                    <pic:cNvPr id="0" name="Picture 12"/>
+                    <pic:cNvPicPr>
+                      <a:picLocks noChangeAspect="1" noChangeArrowheads="1"/>
+                    </pic:cNvPicPr>
+                  </pic:nvPicPr>
+                  <pic:blipFill>
+                    <a:blip r:embed="rId34" cstate="print">
+                      <a:extLst>
+                        <a:ext uri="{28A0092B-C50C-407E-A947-70E740481C1C}">
+                          <a14:useLocalDpi xmlns:a14="http://schemas.microsoft.com/office/drawing/2010/main" val="0"/>
+                        </a:ext>
+                      </a:extLst>
+                    </a:blip>
+                    <a:srcRect/>
+                    <a:stretch>
+                      <a:fillRect/>
+                    </a:stretch>
+                  </pic:blipFill>
+                  <pic:spPr bwMode="auto">
+                    <a:xfrm>
+                      <a:off x="0" y="0"/>
+                      <a:ext cx="5715000" cy="1762125"/>
+                    </a:xfrm>
+                    <a:prstGeom prst="rect">
+                      <a:avLst/>
+                    </a:prstGeom>
+                    <a:noFill/>
+                    <a:ln>
+                      <a:noFill/>
+                    </a:ln>
+                  </pic:spPr>
+                </pic:pic>
+              </a:graphicData>
+            </a:graphic>
+          </wp:inline>
+        </w:drawing>
+      </w:r>
+    </w:p>
+    <w:p>
+      <w:pPr>
+        <w:pStyle w:val="Caption"/>
+        <w:jc w:val="center"/>
+      </w:pPr>
+      <w:bookmarkStart w:id="77" w:name="_Toc229093059"/>
+      <w:r>
+        <w:t xml:space="preserve">Figure </w:t>
+      </w:r>
+      <w:fldSimple w:instr=" SEQ Figure \* ARABIC ">
+        <w:r>
+          <w:rPr>
+            <w:noProof/>
+          </w:rPr>
+          <w:t>21</w:t>
+        </w:r>
+        <w:bookmarkEnd w:id="77"/>
+      </w:fldSimple>
+    </w:p>
+    <w:p>
+      <w:pPr>
+        <w:keepNext/>
+        <w:jc w:val="center"/>
+      </w:pPr>
+      <w:r>
+        <w:rPr>
+          <w:noProof/>
+        </w:rPr>
+        <w:drawing>
+          <wp:inline distT="0" distB="0" distL="0" distR="0" wp14:anchorId="1E5D21C0" wp14:editId="3DC50431">
+            <wp:extent cx="2137331" cy="4572000"/>
+            <wp:effectExtent l="0" t="0" r="0" b="0"/>
+            <wp:docPr id="1482480296" name="Picture 14"/>
+            <wp:cNvGraphicFramePr>
+              <a:graphicFrameLocks xmlns:a="http://schemas.openxmlformats.org/drawingml/2006/main" noChangeAspect="1"/>
+            </wp:cNvGraphicFramePr>
+            <a:graphic xmlns:a="http://schemas.openxmlformats.org/drawingml/2006/main">
+              <a:graphicData uri="http://schemas.openxmlformats.org/drawingml/2006/picture">
+                <pic:pic xmlns:pic="http://schemas.openxmlformats.org/drawingml/2006/picture">
+                  <pic:nvPicPr>
+                    <pic:cNvPr id="0" name="Picture 14"/>
+                    <pic:cNvPicPr>
+                      <a:picLocks noChangeAspect="1" noChangeArrowheads="1"/>
+                    </pic:cNvPicPr>
+                  </pic:nvPicPr>
+                  <pic:blipFill>
+                    <a:blip r:embed="rId35">
+                      <a:extLst>
+                        <a:ext uri="{28A0092B-C50C-407E-A947-70E740481C1C}">
+                          <a14:useLocalDpi xmlns:a14="http://schemas.microsoft.com/office/drawing/2010/main" val="0"/>
+                        </a:ext>
+                      </a:extLst>
+                    </a:blip>
+                    <a:srcRect/>
+                    <a:stretch>
+                      <a:fillRect/>
+                    </a:stretch>
+                  </pic:blipFill>
+                  <pic:spPr bwMode="auto">
+                    <a:xfrm>
+                      <a:off x="0" y="0"/>
+                      <a:ext cx="2148923" cy="4596797"/>
+                    </a:xfrm>
+                    <a:prstGeom prst="rect">
+                      <a:avLst/>
+                    </a:prstGeom>
+                    <a:noFill/>
+                    <a:ln>
+                      <a:noFill/>
+                    </a:ln>
+                  </pic:spPr>
+                </pic:pic>
+              </a:graphicData>
+            </a:graphic>
+          </wp:inline>
+        </w:drawing>
+      </w:r>
+    </w:p>
+    <w:p>
+      <w:pPr>
+        <w:pStyle w:val="Caption"/>
+        <w:jc w:val="center"/>
+      </w:pPr>
+      <w:bookmarkStart w:id="78" w:name="_Toc229093060"/>
+      <w:r>
+        <w:t xml:space="preserve">Figure </w:t>
+      </w:r>
+      <w:fldSimple w:instr=" SEQ Figure \* ARABIC ">
+        <w:r>
+          <w:rPr>
+            <w:noProof/>
+          </w:rPr>
+          <w:t>22</w:t>
+        </w:r>
+        <w:bookmarkEnd w:id="78"/>
+      </w:fldSimple>
+    </w:p>
+    <w:p>
+      <w:r>
+        <w:t>Figure 22 shows the overall flow of how the units move. This flowchart was created to visualize the steps taken by each unit on its path to its destination. The unit considers if the next tile in the path is occupied by another unit and recalculates the path in that case.</w:t>
+      </w:r>
+      <w:r>
+        <w:t xml:space="preserve"> </w:t>
+      </w:r>
+      <w:r>
+        <w:t>Otherwise, it checks if it is at the end, and if it is</w:t>
+      </w:r>
+      <w:r>
+        <w:t>, it clears</w:t>
+      </w:r>
+      <w:r>
+        <w:t xml:space="preserve"> the action queue and allow another action to take place.</w:t>
+      </w:r>
+      <w:r>
+        <w:t xml:space="preserve"> </w:t>
+      </w:r>
+    </w:p>
+    <w:bookmarkStart w:id="79" w:name="_Toc229093038" w:displacedByCustomXml="next"/>
     <w:sdt>
       <w:sdtPr>
         <w:rPr>
@@ -10868,7 +11859,7 @@
           <w:r>
             <w:t>References</w:t>
           </w:r>
-          <w:bookmarkEnd w:id="72"/>
+          <w:bookmarkEnd w:id="79"/>
         </w:p>
         <w:sdt>
           <w:sdtPr>

</xml_diff>

<commit_message>
feat: AI integration written
</commit_message>
<xml_diff>
--- a/Report.docx
+++ b/Report.docx
@@ -9418,15 +9418,7 @@
     <w:p>
       <w:r>
         <w:lastRenderedPageBreak/>
-        <w:t xml:space="preserve">The alternative method is to use references on all </w:t>
-      </w:r>
-      <w:proofErr w:type="gramStart"/>
-      <w:r>
-        <w:t>units,</w:t>
-      </w:r>
-      <w:proofErr w:type="gramEnd"/>
-      <w:r>
-        <w:t xml:space="preserve"> this is better for testing and easier to manage multiple instances of. The cons to this method are that, in Unity, getting references is quite expensive and the pathfinding will be a MonoBehaviour class meaning that the use of Unity’s GetComponent will be mandatory.</w:t>
+        <w:t>The alternative method is to use references on all units, this is better for testing and easier to manage multiple instances of. The cons to this method are that, in Unity, getting references is quite expensive and the pathfinding will be a MonoBehaviour class meaning that the use of Unity’s GetComponent will be mandatory.</w:t>
       </w:r>
     </w:p>
     <w:p>
@@ -11519,6 +11511,9 @@
       <w:r>
         <w:t xml:space="preserve"> </w:t>
       </w:r>
+      <w:r>
+        <w:t>Euclidean distance was retained as the heuristic due to the hexagonal structure of the grid and the non-uniform terrain movement costs.</w:t>
+      </w:r>
     </w:p>
     <w:p/>
     <w:p>
@@ -11658,6 +11653,7 @@
     <w:p>
       <w:pPr>
         <w:keepNext/>
+        <w:jc w:val="center"/>
       </w:pPr>
       <w:r>
         <w:rPr>
@@ -11665,7 +11661,7 @@
         </w:rPr>
         <w:lastRenderedPageBreak/>
         <w:drawing>
-          <wp:inline distT="0" distB="0" distL="0" distR="0" wp14:anchorId="03E817E2" wp14:editId="29C29972">
+          <wp:inline distT="0" distB="0" distL="0" distR="0" wp14:anchorId="03E817E2" wp14:editId="4F303668">
             <wp:extent cx="5715000" cy="1762125"/>
             <wp:effectExtent l="0" t="0" r="0" b="9525"/>
             <wp:docPr id="2051994196" name="Picture 12"/>
@@ -11743,9 +11739,9 @@
           <w:noProof/>
         </w:rPr>
         <w:drawing>
-          <wp:inline distT="0" distB="0" distL="0" distR="0" wp14:anchorId="1E5D21C0" wp14:editId="3DC50431">
-            <wp:extent cx="2137331" cy="4572000"/>
-            <wp:effectExtent l="0" t="0" r="0" b="0"/>
+          <wp:inline distT="0" distB="0" distL="0" distR="0" wp14:anchorId="1E5D21C0" wp14:editId="5D59E0DA">
+            <wp:extent cx="2409825" cy="5154898"/>
+            <wp:effectExtent l="0" t="0" r="0" b="8255"/>
             <wp:docPr id="1482480296" name="Picture 14"/>
             <wp:cNvGraphicFramePr>
               <a:graphicFrameLocks xmlns:a="http://schemas.openxmlformats.org/drawingml/2006/main" noChangeAspect="1"/>
@@ -11775,7 +11771,7 @@
                   <pic:spPr bwMode="auto">
                     <a:xfrm>
                       <a:off x="0" y="0"/>
-                      <a:ext cx="2148923" cy="4596797"/>
+                      <a:ext cx="2425509" cy="5188449"/>
                     </a:xfrm>
                     <a:prstGeom prst="rect">
                       <a:avLst/>
@@ -11831,6 +11827,291 @@
         <w:t xml:space="preserve"> </w:t>
       </w:r>
     </w:p>
+    <w:p>
+      <w:pPr>
+        <w:pStyle w:val="Heading2"/>
+      </w:pPr>
+      <w:r>
+        <w:lastRenderedPageBreak/>
+        <w:t>4.3 AI Integration</w:t>
+      </w:r>
+    </w:p>
+    <w:p>
+      <w:r>
+        <w:t xml:space="preserve">This section will be split into </w:t>
+      </w:r>
+      <w:r>
+        <w:t xml:space="preserve">2 </w:t>
+      </w:r>
+      <w:r>
+        <w:t>subsections: The AI Controller</w:t>
+      </w:r>
+      <w:r>
+        <w:t xml:space="preserve"> and </w:t>
+      </w:r>
+      <w:r>
+        <w:t>the training of the AI</w:t>
+      </w:r>
+      <w:r>
+        <w:t xml:space="preserve">. </w:t>
+      </w:r>
+      <w:r>
+        <w:t>The following subsections will dive into how the AI was integrated into the game and how the AI learns.</w:t>
+      </w:r>
+    </w:p>
+    <w:p>
+      <w:pPr>
+        <w:pStyle w:val="Heading3"/>
+      </w:pPr>
+      <w:r>
+        <w:t>4.3.1 The AI Controller</w:t>
+      </w:r>
+    </w:p>
+    <w:p>
+      <w:r>
+        <w:t>Creating the AI controller was a fairly simple task. Firstly, the ML Agents Package described in the design chapter has its own extensible class which makes creating an agent simple. The AI Controller starts by overriding 4 of the Agent class’s functions: Initialize, OnEpisodeBegin, CollectObservations, and OnActionRecieved</w:t>
+      </w:r>
+      <w:r>
+        <w:t>. These functions are essential in initializing the agent, resetting the agents to a fresh state, collecting observations to be sent to the training model, and receiving actions from the model.</w:t>
+      </w:r>
+    </w:p>
+    <w:p>
+      <w:pPr>
+        <w:keepNext/>
+        <w:jc w:val="center"/>
+      </w:pPr>
+      <w:r>
+        <w:rPr>
+          <w:noProof/>
+        </w:rPr>
+        <w:drawing>
+          <wp:inline distT="0" distB="0" distL="0" distR="0" wp14:anchorId="7E1F6BE2" wp14:editId="51CEDC0D">
+            <wp:extent cx="5715000" cy="2762250"/>
+            <wp:effectExtent l="0" t="0" r="0" b="0"/>
+            <wp:docPr id="587466549" name="Picture 15"/>
+            <wp:cNvGraphicFramePr>
+              <a:graphicFrameLocks xmlns:a="http://schemas.openxmlformats.org/drawingml/2006/main" noChangeAspect="1"/>
+            </wp:cNvGraphicFramePr>
+            <a:graphic xmlns:a="http://schemas.openxmlformats.org/drawingml/2006/main">
+              <a:graphicData uri="http://schemas.openxmlformats.org/drawingml/2006/picture">
+                <pic:pic xmlns:pic="http://schemas.openxmlformats.org/drawingml/2006/picture">
+                  <pic:nvPicPr>
+                    <pic:cNvPr id="0" name="Picture 15"/>
+                    <pic:cNvPicPr>
+                      <a:picLocks noChangeAspect="1" noChangeArrowheads="1"/>
+                    </pic:cNvPicPr>
+                  </pic:nvPicPr>
+                  <pic:blipFill>
+                    <a:blip r:embed="rId36" cstate="print">
+                      <a:extLst>
+                        <a:ext uri="{28A0092B-C50C-407E-A947-70E740481C1C}">
+                          <a14:useLocalDpi xmlns:a14="http://schemas.microsoft.com/office/drawing/2010/main" val="0"/>
+                        </a:ext>
+                      </a:extLst>
+                    </a:blip>
+                    <a:srcRect/>
+                    <a:stretch>
+                      <a:fillRect/>
+                    </a:stretch>
+                  </pic:blipFill>
+                  <pic:spPr bwMode="auto">
+                    <a:xfrm>
+                      <a:off x="0" y="0"/>
+                      <a:ext cx="5715000" cy="2762250"/>
+                    </a:xfrm>
+                    <a:prstGeom prst="rect">
+                      <a:avLst/>
+                    </a:prstGeom>
+                    <a:noFill/>
+                    <a:ln>
+                      <a:noFill/>
+                    </a:ln>
+                  </pic:spPr>
+                </pic:pic>
+              </a:graphicData>
+            </a:graphic>
+          </wp:inline>
+        </w:drawing>
+      </w:r>
+    </w:p>
+    <w:p>
+      <w:pPr>
+        <w:pStyle w:val="Caption"/>
+        <w:jc w:val="center"/>
+      </w:pPr>
+      <w:r>
+        <w:t xml:space="preserve">Figure </w:t>
+      </w:r>
+      <w:fldSimple w:instr=" SEQ Figure \* ARABIC ">
+        <w:r>
+          <w:rPr>
+            <w:noProof/>
+          </w:rPr>
+          <w:t>23</w:t>
+        </w:r>
+      </w:fldSimple>
+    </w:p>
+    <w:p>
+      <w:r>
+        <w:t>Figure 23 shows how the sensor observations can be added to the model. Th</w:t>
+      </w:r>
+      <w:r>
+        <w:t xml:space="preserve">is section of code adds rewards for how close the unit is to the capital and how much health it has in total. This is done to ensure that the AI can play defensively and balance the offense against the </w:t>
+      </w:r>
+      <w:r>
+        <w:t>defence</w:t>
+      </w:r>
+      <w:r>
+        <w:t>.</w:t>
+      </w:r>
+    </w:p>
+    <w:p/>
+    <w:p>
+      <w:r>
+        <w:t>After the model has received the action, it gets all owned units and cities, gives out penalties for no cities and units and then executes the action. There are 5 actions available for units, move towards enemy, attack nearby enemy, skip the turn, sleep and settle city/build if applicable.</w:t>
+      </w:r>
+      <w:r>
+        <w:t xml:space="preserve"> For the cities, there are 8 available actions. These include all productions, fortifying the city or closing the city gates. A reward is added for producing units or districts and a small punishment is given for fortifying or closing the city gates. This is done to ensure that the AI doesn’t stall in the beginning of the game.</w:t>
+      </w:r>
+    </w:p>
+    <w:p>
+      <w:pPr>
+        <w:pStyle w:val="Heading3"/>
+      </w:pPr>
+      <w:r>
+        <w:lastRenderedPageBreak/>
+        <w:t>4.3.2 Training the AI</w:t>
+      </w:r>
+    </w:p>
+    <w:p>
+      <w:r>
+        <w:t xml:space="preserve">Training the AI is fairly simplistic, given that the AI </w:t>
+      </w:r>
+      <w:r>
+        <w:t>Controller operates reliably under the expected gameplay conditions</w:t>
+      </w:r>
+      <w:r>
+        <w:t>. In order to train the AI, a python package needs to be installed that can run the AI training model. This training package is slow and not suitable for real-time use, at least not on low powered hardware. The game saw huge performance losses, going from roughly 250 frames per second to roughly 0.5 frames per second. This penalty meant that</w:t>
+      </w:r>
+      <w:r>
+        <w:t xml:space="preserve"> a redesign of the AI architecture and learning model was necessary</w:t>
+      </w:r>
+      <w:r>
+        <w:t xml:space="preserve">. </w:t>
+      </w:r>
+    </w:p>
+    <w:p>
+      <w:pPr>
+        <w:keepNext/>
+        <w:jc w:val="center"/>
+      </w:pPr>
+      <w:r>
+        <w:rPr>
+          <w:noProof/>
+        </w:rPr>
+        <w:drawing>
+          <wp:inline distT="0" distB="0" distL="0" distR="0" wp14:anchorId="5325C36E" wp14:editId="16A3CFAE">
+            <wp:extent cx="5724525" cy="1238250"/>
+            <wp:effectExtent l="0" t="0" r="9525" b="0"/>
+            <wp:docPr id="836703105" name="Picture 16"/>
+            <wp:cNvGraphicFramePr>
+              <a:graphicFrameLocks xmlns:a="http://schemas.openxmlformats.org/drawingml/2006/main" noChangeAspect="1"/>
+            </wp:cNvGraphicFramePr>
+            <a:graphic xmlns:a="http://schemas.openxmlformats.org/drawingml/2006/main">
+              <a:graphicData uri="http://schemas.openxmlformats.org/drawingml/2006/picture">
+                <pic:pic xmlns:pic="http://schemas.openxmlformats.org/drawingml/2006/picture">
+                  <pic:nvPicPr>
+                    <pic:cNvPr id="0" name="Picture 16"/>
+                    <pic:cNvPicPr>
+                      <a:picLocks noChangeAspect="1" noChangeArrowheads="1"/>
+                    </pic:cNvPicPr>
+                  </pic:nvPicPr>
+                  <pic:blipFill>
+                    <a:blip r:embed="rId37" cstate="print">
+                      <a:extLst>
+                        <a:ext uri="{28A0092B-C50C-407E-A947-70E740481C1C}">
+                          <a14:useLocalDpi xmlns:a14="http://schemas.microsoft.com/office/drawing/2010/main" val="0"/>
+                        </a:ext>
+                      </a:extLst>
+                    </a:blip>
+                    <a:srcRect/>
+                    <a:stretch>
+                      <a:fillRect/>
+                    </a:stretch>
+                  </pic:blipFill>
+                  <pic:spPr bwMode="auto">
+                    <a:xfrm>
+                      <a:off x="0" y="0"/>
+                      <a:ext cx="5724525" cy="1238250"/>
+                    </a:xfrm>
+                    <a:prstGeom prst="rect">
+                      <a:avLst/>
+                    </a:prstGeom>
+                    <a:noFill/>
+                    <a:ln>
+                      <a:noFill/>
+                    </a:ln>
+                  </pic:spPr>
+                </pic:pic>
+              </a:graphicData>
+            </a:graphic>
+          </wp:inline>
+        </w:drawing>
+      </w:r>
+    </w:p>
+    <w:p>
+      <w:pPr>
+        <w:pStyle w:val="Caption"/>
+        <w:jc w:val="center"/>
+      </w:pPr>
+      <w:r>
+        <w:t xml:space="preserve">Figure </w:t>
+      </w:r>
+      <w:fldSimple w:instr=" SEQ Figure \* ARABIC ">
+        <w:r>
+          <w:rPr>
+            <w:noProof/>
+          </w:rPr>
+          <w:t>24</w:t>
+        </w:r>
+      </w:fldSimple>
+    </w:p>
+    <w:p>
+      <w:r>
+        <w:t>Figure 24 shows the solution to the problem. The AI is trained to be at full performance at the beginning of the game. The explorationRate variable is a progression tracker for the game series. If we are on the first game in the series, the explorationRate will be 1 which will always be higher than the value of Random.value. Due to this, the action will be completely random for each unit and city. This is done to ensure the AI doesn’t win every single game and it still gives the player the sense of their opponent progressing and</w:t>
+      </w:r>
+      <w:r>
+        <w:t xml:space="preserve"> reacting to their moves</w:t>
+      </w:r>
+      <w:r>
+        <w:t>. This change saw the frames per second go back up to around 200 frames per second</w:t>
+      </w:r>
+      <w:r>
+        <w:t>, this is due to the AI not learning in real time.</w:t>
+      </w:r>
+    </w:p>
+    <w:p/>
+    <w:p>
+      <w:r>
+        <w:t>The trade-offs of using this solution</w:t>
+      </w:r>
+      <w:r>
+        <w:t xml:space="preserve"> are a key limiting factor in how the AI will play against the player. This model is less adaptable, meaning that the player’s early actions will no longer have as much of an impact on the model’s behaviour.</w:t>
+      </w:r>
+    </w:p>
+    <w:p/>
+    <w:p>
+      <w:r>
+        <w:t>During training, the AI was set to play against a copy of it, allowing thousands of games to take place during a training session. This allowed for a complex model to be developed and for it to still be performant when played against in real time.</w:t>
+      </w:r>
+      <w:r>
+        <w:t xml:space="preserve"> </w:t>
+      </w:r>
+      <w:r>
+        <w:t>The self-play portion of the training was a great insight into the bug report of the game, simulating thousands of sessions revealed many in game bugs that needed to be fixed before a real training session could take place. This process was slow but albeit necessary to the project.</w:t>
+      </w:r>
+    </w:p>
+    <w:p/>
     <w:bookmarkStart w:id="79" w:name="_Toc229093038" w:displacedByCustomXml="next"/>
     <w:sdt>
       <w:sdtPr>
@@ -14226,7 +14507,6 @@
   <w:style w:type="character" w:default="1" w:styleId="DefaultParagraphFont">
     <w:name w:val="Default Paragraph Font"/>
     <w:uiPriority w:val="1"/>
-    <w:semiHidden/>
     <w:unhideWhenUsed/>
   </w:style>
   <w:style w:type="table" w:default="1" w:styleId="TableNormal">

</xml_diff>

<commit_message>
fix: made some parts, mostly in chapter 4, more academic
</commit_message>
<xml_diff>
--- a/Report.docx
+++ b/Report.docx
@@ -321,7 +321,7 @@
         <w:pStyle w:val="Heading1"/>
       </w:pPr>
       <w:bookmarkStart w:id="1" w:name="_Toc40898999"/>
-      <w:bookmarkStart w:id="2" w:name="_Toc229092984"/>
+      <w:bookmarkStart w:id="2" w:name="_Toc229098636"/>
       <w:r>
         <w:lastRenderedPageBreak/>
         <w:t>Abstract</w:t>
@@ -331,15 +331,7 @@
     </w:p>
     <w:p>
       <w:r>
-        <w:t xml:space="preserve">AI is a still growing industry and while the current trend of AI is heading towards the usage of Large Language Models, I believe there is a genuine use case for machine learning models within video games. The focus of this project is to uncover the current reasons behind why the industry doesn’t use machine learning AI for uses such as </w:t>
-      </w:r>
-      <w:proofErr w:type="gramStart"/>
-      <w:r>
-        <w:t>Non-Player Characters</w:t>
-      </w:r>
-      <w:proofErr w:type="gramEnd"/>
-      <w:r>
-        <w:t xml:space="preserve"> or local multiplayer games. This is appro</w:t>
+        <w:t>AI is a still growing industry and while the current trend of AI is heading towards the usage of Large Language Models, I believe there is a genuine use case for machine learning models within video games. The focus of this project is to uncover the current reasons behind why the industry doesn’t use machine learning AI for uses such as Non-Player Characters or local multiplayer games. This is appro</w:t>
       </w:r>
       <w:r>
         <w:t>ached by covering the design choices and code architecture of implementing a machine learning model into the Unity game engine. To evaluate whether the AI is functional, data has been gathered using a mix of qualitative and quantitative research. This research was collected through a short survey given to participants.</w:t>
@@ -369,7 +361,7 @@
         <w:spacing w:after="321"/>
         <w:ind w:left="-5"/>
       </w:pPr>
-      <w:bookmarkStart w:id="3" w:name="_Toc229092985"/>
+      <w:bookmarkStart w:id="3" w:name="_Toc229098637"/>
       <w:r>
         <w:lastRenderedPageBreak/>
         <w:t>Declaration</w:t>
@@ -491,7 +483,7 @@
         <w:ind w:left="-5"/>
       </w:pPr>
       <w:bookmarkStart w:id="4" w:name="_Toc40899001"/>
-      <w:bookmarkStart w:id="5" w:name="_Toc229092986"/>
+      <w:bookmarkStart w:id="5" w:name="_Toc229098638"/>
       <w:r>
         <w:lastRenderedPageBreak/>
         <w:t>Acknowledgements</w:t>
@@ -628,7 +620,7 @@
         <w:spacing w:line="259" w:lineRule="auto"/>
       </w:pPr>
     </w:p>
-    <w:bookmarkStart w:id="6" w:name="_Toc229092987" w:displacedByCustomXml="next"/>
+    <w:bookmarkStart w:id="6" w:name="_Toc229098639" w:displacedByCustomXml="next"/>
     <w:sdt>
       <w:sdtPr>
         <w:rPr>
@@ -686,7 +678,7 @@
           <w:r>
             <w:fldChar w:fldCharType="separate"/>
           </w:r>
-          <w:hyperlink w:anchor="_Toc229092984" w:history="1">
+          <w:hyperlink w:anchor="_Toc229098636" w:history="1">
             <w:r>
               <w:rPr>
                 <w:rStyle w:val="Hyperlink"/>
@@ -713,7 +705,7 @@
                 <w:noProof/>
                 <w:webHidden/>
               </w:rPr>
-              <w:instrText xml:space="preserve"> PAGEREF _Toc229092984 \h </w:instrText>
+              <w:instrText xml:space="preserve"> PAGEREF _Toc229098636 \h </w:instrText>
             </w:r>
             <w:r>
               <w:rPr>
@@ -760,7 +752,7 @@
               <w14:ligatures w14:val="standardContextual"/>
             </w:rPr>
           </w:pPr>
-          <w:hyperlink w:anchor="_Toc229092985" w:history="1">
+          <w:hyperlink w:anchor="_Toc229098637" w:history="1">
             <w:r>
               <w:rPr>
                 <w:rStyle w:val="Hyperlink"/>
@@ -787,7 +779,7 @@
                 <w:noProof/>
                 <w:webHidden/>
               </w:rPr>
-              <w:instrText xml:space="preserve"> PAGEREF _Toc229092985 \h </w:instrText>
+              <w:instrText xml:space="preserve"> PAGEREF _Toc229098637 \h </w:instrText>
             </w:r>
             <w:r>
               <w:rPr>
@@ -834,7 +826,7 @@
               <w14:ligatures w14:val="standardContextual"/>
             </w:rPr>
           </w:pPr>
-          <w:hyperlink w:anchor="_Toc229092986" w:history="1">
+          <w:hyperlink w:anchor="_Toc229098638" w:history="1">
             <w:r>
               <w:rPr>
                 <w:rStyle w:val="Hyperlink"/>
@@ -861,7 +853,7 @@
                 <w:noProof/>
                 <w:webHidden/>
               </w:rPr>
-              <w:instrText xml:space="preserve"> PAGEREF _Toc229092986 \h </w:instrText>
+              <w:instrText xml:space="preserve"> PAGEREF _Toc229098638 \h </w:instrText>
             </w:r>
             <w:r>
               <w:rPr>
@@ -908,7 +900,7 @@
               <w14:ligatures w14:val="standardContextual"/>
             </w:rPr>
           </w:pPr>
-          <w:hyperlink w:anchor="_Toc229092987" w:history="1">
+          <w:hyperlink w:anchor="_Toc229098639" w:history="1">
             <w:r>
               <w:rPr>
                 <w:rStyle w:val="Hyperlink"/>
@@ -935,7 +927,7 @@
                 <w:noProof/>
                 <w:webHidden/>
               </w:rPr>
-              <w:instrText xml:space="preserve"> PAGEREF _Toc229092987 \h </w:instrText>
+              <w:instrText xml:space="preserve"> PAGEREF _Toc229098639 \h </w:instrText>
             </w:r>
             <w:r>
               <w:rPr>
@@ -982,7 +974,7 @@
               <w14:ligatures w14:val="standardContextual"/>
             </w:rPr>
           </w:pPr>
-          <w:hyperlink w:anchor="_Toc229092988" w:history="1">
+          <w:hyperlink w:anchor="_Toc229098640" w:history="1">
             <w:r>
               <w:rPr>
                 <w:rStyle w:val="Hyperlink"/>
@@ -1009,7 +1001,7 @@
                 <w:noProof/>
                 <w:webHidden/>
               </w:rPr>
-              <w:instrText xml:space="preserve"> PAGEREF _Toc229092988 \h </w:instrText>
+              <w:instrText xml:space="preserve"> PAGEREF _Toc229098640 \h </w:instrText>
             </w:r>
             <w:r>
               <w:rPr>
@@ -1056,7 +1048,7 @@
               <w14:ligatures w14:val="standardContextual"/>
             </w:rPr>
           </w:pPr>
-          <w:hyperlink w:anchor="_Toc229092989" w:history="1">
+          <w:hyperlink w:anchor="_Toc229098641" w:history="1">
             <w:r>
               <w:rPr>
                 <w:rStyle w:val="Hyperlink"/>
@@ -1083,7 +1075,7 @@
                 <w:noProof/>
                 <w:webHidden/>
               </w:rPr>
-              <w:instrText xml:space="preserve"> PAGEREF _Toc229092989 \h </w:instrText>
+              <w:instrText xml:space="preserve"> PAGEREF _Toc229098641 \h </w:instrText>
             </w:r>
             <w:r>
               <w:rPr>
@@ -1130,7 +1122,7 @@
               <w14:ligatures w14:val="standardContextual"/>
             </w:rPr>
           </w:pPr>
-          <w:hyperlink w:anchor="_Toc229092990" w:history="1">
+          <w:hyperlink w:anchor="_Toc229098642" w:history="1">
             <w:r>
               <w:rPr>
                 <w:rStyle w:val="Hyperlink"/>
@@ -1157,7 +1149,7 @@
                 <w:noProof/>
                 <w:webHidden/>
               </w:rPr>
-              <w:instrText xml:space="preserve"> PAGEREF _Toc229092990 \h </w:instrText>
+              <w:instrText xml:space="preserve"> PAGEREF _Toc229098642 \h </w:instrText>
             </w:r>
             <w:r>
               <w:rPr>
@@ -1204,7 +1196,7 @@
               <w14:ligatures w14:val="standardContextual"/>
             </w:rPr>
           </w:pPr>
-          <w:hyperlink w:anchor="_Toc229092991" w:history="1">
+          <w:hyperlink w:anchor="_Toc229098643" w:history="1">
             <w:r>
               <w:rPr>
                 <w:rStyle w:val="Hyperlink"/>
@@ -1231,7 +1223,7 @@
                 <w:noProof/>
                 <w:webHidden/>
               </w:rPr>
-              <w:instrText xml:space="preserve"> PAGEREF _Toc229092991 \h </w:instrText>
+              <w:instrText xml:space="preserve"> PAGEREF _Toc229098643 \h </w:instrText>
             </w:r>
             <w:r>
               <w:rPr>
@@ -1278,7 +1270,7 @@
               <w14:ligatures w14:val="standardContextual"/>
             </w:rPr>
           </w:pPr>
-          <w:hyperlink w:anchor="_Toc229092992" w:history="1">
+          <w:hyperlink w:anchor="_Toc229098644" w:history="1">
             <w:r>
               <w:rPr>
                 <w:rStyle w:val="Hyperlink"/>
@@ -1305,7 +1297,7 @@
                 <w:noProof/>
                 <w:webHidden/>
               </w:rPr>
-              <w:instrText xml:space="preserve"> PAGEREF _Toc229092992 \h </w:instrText>
+              <w:instrText xml:space="preserve"> PAGEREF _Toc229098644 \h </w:instrText>
             </w:r>
             <w:r>
               <w:rPr>
@@ -1352,7 +1344,7 @@
               <w14:ligatures w14:val="standardContextual"/>
             </w:rPr>
           </w:pPr>
-          <w:hyperlink w:anchor="_Toc229092993" w:history="1">
+          <w:hyperlink w:anchor="_Toc229098645" w:history="1">
             <w:r>
               <w:rPr>
                 <w:rStyle w:val="Hyperlink"/>
@@ -1379,7 +1371,7 @@
                 <w:noProof/>
                 <w:webHidden/>
               </w:rPr>
-              <w:instrText xml:space="preserve"> PAGEREF _Toc229092993 \h </w:instrText>
+              <w:instrText xml:space="preserve"> PAGEREF _Toc229098645 \h </w:instrText>
             </w:r>
             <w:r>
               <w:rPr>
@@ -1426,7 +1418,7 @@
               <w14:ligatures w14:val="standardContextual"/>
             </w:rPr>
           </w:pPr>
-          <w:hyperlink w:anchor="_Toc229092994" w:history="1">
+          <w:hyperlink w:anchor="_Toc229098646" w:history="1">
             <w:r>
               <w:rPr>
                 <w:rStyle w:val="Hyperlink"/>
@@ -1453,7 +1445,7 @@
                 <w:noProof/>
                 <w:webHidden/>
               </w:rPr>
-              <w:instrText xml:space="preserve"> PAGEREF _Toc229092994 \h </w:instrText>
+              <w:instrText xml:space="preserve"> PAGEREF _Toc229098646 \h </w:instrText>
             </w:r>
             <w:r>
               <w:rPr>
@@ -1500,7 +1492,7 @@
               <w14:ligatures w14:val="standardContextual"/>
             </w:rPr>
           </w:pPr>
-          <w:hyperlink w:anchor="_Toc229092995" w:history="1">
+          <w:hyperlink w:anchor="_Toc229098647" w:history="1">
             <w:r>
               <w:rPr>
                 <w:rStyle w:val="Hyperlink"/>
@@ -1527,7 +1519,7 @@
                 <w:noProof/>
                 <w:webHidden/>
               </w:rPr>
-              <w:instrText xml:space="preserve"> PAGEREF _Toc229092995 \h </w:instrText>
+              <w:instrText xml:space="preserve"> PAGEREF _Toc229098647 \h </w:instrText>
             </w:r>
             <w:r>
               <w:rPr>
@@ -1574,7 +1566,7 @@
               <w14:ligatures w14:val="standardContextual"/>
             </w:rPr>
           </w:pPr>
-          <w:hyperlink w:anchor="_Toc229092996" w:history="1">
+          <w:hyperlink w:anchor="_Toc229098648" w:history="1">
             <w:r>
               <w:rPr>
                 <w:rStyle w:val="Hyperlink"/>
@@ -1601,7 +1593,7 @@
                 <w:noProof/>
                 <w:webHidden/>
               </w:rPr>
-              <w:instrText xml:space="preserve"> PAGEREF _Toc229092996 \h </w:instrText>
+              <w:instrText xml:space="preserve"> PAGEREF _Toc229098648 \h </w:instrText>
             </w:r>
             <w:r>
               <w:rPr>
@@ -1648,7 +1640,7 @@
               <w14:ligatures w14:val="standardContextual"/>
             </w:rPr>
           </w:pPr>
-          <w:hyperlink w:anchor="_Toc229092997" w:history="1">
+          <w:hyperlink w:anchor="_Toc229098649" w:history="1">
             <w:r>
               <w:rPr>
                 <w:rStyle w:val="Hyperlink"/>
@@ -1675,7 +1667,7 @@
                 <w:noProof/>
                 <w:webHidden/>
               </w:rPr>
-              <w:instrText xml:space="preserve"> PAGEREF _Toc229092997 \h </w:instrText>
+              <w:instrText xml:space="preserve"> PAGEREF _Toc229098649 \h </w:instrText>
             </w:r>
             <w:r>
               <w:rPr>
@@ -1722,7 +1714,7 @@
               <w14:ligatures w14:val="standardContextual"/>
             </w:rPr>
           </w:pPr>
-          <w:hyperlink w:anchor="_Toc229092998" w:history="1">
+          <w:hyperlink w:anchor="_Toc229098650" w:history="1">
             <w:r>
               <w:rPr>
                 <w:rStyle w:val="Hyperlink"/>
@@ -1749,7 +1741,7 @@
                 <w:noProof/>
                 <w:webHidden/>
               </w:rPr>
-              <w:instrText xml:space="preserve"> PAGEREF _Toc229092998 \h </w:instrText>
+              <w:instrText xml:space="preserve"> PAGEREF _Toc229098650 \h </w:instrText>
             </w:r>
             <w:r>
               <w:rPr>
@@ -1796,7 +1788,7 @@
               <w14:ligatures w14:val="standardContextual"/>
             </w:rPr>
           </w:pPr>
-          <w:hyperlink w:anchor="_Toc229092999" w:history="1">
+          <w:hyperlink w:anchor="_Toc229098651" w:history="1">
             <w:r>
               <w:rPr>
                 <w:rStyle w:val="Hyperlink"/>
@@ -1823,7 +1815,7 @@
                 <w:noProof/>
                 <w:webHidden/>
               </w:rPr>
-              <w:instrText xml:space="preserve"> PAGEREF _Toc229092999 \h </w:instrText>
+              <w:instrText xml:space="preserve"> PAGEREF _Toc229098651 \h </w:instrText>
             </w:r>
             <w:r>
               <w:rPr>
@@ -1870,7 +1862,7 @@
               <w14:ligatures w14:val="standardContextual"/>
             </w:rPr>
           </w:pPr>
-          <w:hyperlink w:anchor="_Toc229093000" w:history="1">
+          <w:hyperlink w:anchor="_Toc229098652" w:history="1">
             <w:r>
               <w:rPr>
                 <w:rStyle w:val="Hyperlink"/>
@@ -1897,7 +1889,7 @@
                 <w:noProof/>
                 <w:webHidden/>
               </w:rPr>
-              <w:instrText xml:space="preserve"> PAGEREF _Toc229093000 \h </w:instrText>
+              <w:instrText xml:space="preserve"> PAGEREF _Toc229098652 \h </w:instrText>
             </w:r>
             <w:r>
               <w:rPr>
@@ -1944,7 +1936,7 @@
               <w14:ligatures w14:val="standardContextual"/>
             </w:rPr>
           </w:pPr>
-          <w:hyperlink w:anchor="_Toc229093001" w:history="1">
+          <w:hyperlink w:anchor="_Toc229098653" w:history="1">
             <w:r>
               <w:rPr>
                 <w:rStyle w:val="Hyperlink"/>
@@ -1971,7 +1963,7 @@
                 <w:noProof/>
                 <w:webHidden/>
               </w:rPr>
-              <w:instrText xml:space="preserve"> PAGEREF _Toc229093001 \h </w:instrText>
+              <w:instrText xml:space="preserve"> PAGEREF _Toc229098653 \h </w:instrText>
             </w:r>
             <w:r>
               <w:rPr>
@@ -2018,7 +2010,7 @@
               <w14:ligatures w14:val="standardContextual"/>
             </w:rPr>
           </w:pPr>
-          <w:hyperlink w:anchor="_Toc229093002" w:history="1">
+          <w:hyperlink w:anchor="_Toc229098654" w:history="1">
             <w:r>
               <w:rPr>
                 <w:rStyle w:val="Hyperlink"/>
@@ -2045,7 +2037,7 @@
                 <w:noProof/>
                 <w:webHidden/>
               </w:rPr>
-              <w:instrText xml:space="preserve"> PAGEREF _Toc229093002 \h </w:instrText>
+              <w:instrText xml:space="preserve"> PAGEREF _Toc229098654 \h </w:instrText>
             </w:r>
             <w:r>
               <w:rPr>
@@ -2092,7 +2084,7 @@
               <w14:ligatures w14:val="standardContextual"/>
             </w:rPr>
           </w:pPr>
-          <w:hyperlink w:anchor="_Toc229093003" w:history="1">
+          <w:hyperlink w:anchor="_Toc229098655" w:history="1">
             <w:r>
               <w:rPr>
                 <w:rStyle w:val="Hyperlink"/>
@@ -2119,7 +2111,7 @@
                 <w:noProof/>
                 <w:webHidden/>
               </w:rPr>
-              <w:instrText xml:space="preserve"> PAGEREF _Toc229093003 \h </w:instrText>
+              <w:instrText xml:space="preserve"> PAGEREF _Toc229098655 \h </w:instrText>
             </w:r>
             <w:r>
               <w:rPr>
@@ -2162,7 +2154,7 @@
               <w:lang w:eastAsia="en-GB"/>
             </w:rPr>
           </w:pPr>
-          <w:hyperlink w:anchor="_Toc229093004" w:history="1">
+          <w:hyperlink w:anchor="_Toc229098656" w:history="1">
             <w:r>
               <w:rPr>
                 <w:rStyle w:val="Hyperlink"/>
@@ -2189,7 +2181,7 @@
                 <w:noProof/>
                 <w:webHidden/>
               </w:rPr>
-              <w:instrText xml:space="preserve"> PAGEREF _Toc229093004 \h </w:instrText>
+              <w:instrText xml:space="preserve"> PAGEREF _Toc229098656 \h </w:instrText>
             </w:r>
             <w:r>
               <w:rPr>
@@ -2232,7 +2224,7 @@
               <w:lang w:eastAsia="en-GB"/>
             </w:rPr>
           </w:pPr>
-          <w:hyperlink w:anchor="_Toc229093005" w:history="1">
+          <w:hyperlink w:anchor="_Toc229098657" w:history="1">
             <w:r>
               <w:rPr>
                 <w:rStyle w:val="Hyperlink"/>
@@ -2259,7 +2251,7 @@
                 <w:noProof/>
                 <w:webHidden/>
               </w:rPr>
-              <w:instrText xml:space="preserve"> PAGEREF _Toc229093005 \h </w:instrText>
+              <w:instrText xml:space="preserve"> PAGEREF _Toc229098657 \h </w:instrText>
             </w:r>
             <w:r>
               <w:rPr>
@@ -2302,7 +2294,7 @@
               <w:lang w:eastAsia="en-GB"/>
             </w:rPr>
           </w:pPr>
-          <w:hyperlink w:anchor="_Toc229093006" w:history="1">
+          <w:hyperlink w:anchor="_Toc229098658" w:history="1">
             <w:r>
               <w:rPr>
                 <w:rStyle w:val="Hyperlink"/>
@@ -2329,7 +2321,7 @@
                 <w:noProof/>
                 <w:webHidden/>
               </w:rPr>
-              <w:instrText xml:space="preserve"> PAGEREF _Toc229093006 \h </w:instrText>
+              <w:instrText xml:space="preserve"> PAGEREF _Toc229098658 \h </w:instrText>
             </w:r>
             <w:r>
               <w:rPr>
@@ -2376,7 +2368,7 @@
               <w14:ligatures w14:val="standardContextual"/>
             </w:rPr>
           </w:pPr>
-          <w:hyperlink w:anchor="_Toc229093007" w:history="1">
+          <w:hyperlink w:anchor="_Toc229098659" w:history="1">
             <w:r>
               <w:rPr>
                 <w:rStyle w:val="Hyperlink"/>
@@ -2403,7 +2395,7 @@
                 <w:noProof/>
                 <w:webHidden/>
               </w:rPr>
-              <w:instrText xml:space="preserve"> PAGEREF _Toc229093007 \h </w:instrText>
+              <w:instrText xml:space="preserve"> PAGEREF _Toc229098659 \h </w:instrText>
             </w:r>
             <w:r>
               <w:rPr>
@@ -2446,7 +2438,7 @@
               <w:lang w:eastAsia="en-GB"/>
             </w:rPr>
           </w:pPr>
-          <w:hyperlink w:anchor="_Toc229093008" w:history="1">
+          <w:hyperlink w:anchor="_Toc229098660" w:history="1">
             <w:r>
               <w:rPr>
                 <w:rStyle w:val="Hyperlink"/>
@@ -2473,7 +2465,7 @@
                 <w:noProof/>
                 <w:webHidden/>
               </w:rPr>
-              <w:instrText xml:space="preserve"> PAGEREF _Toc229093008 \h </w:instrText>
+              <w:instrText xml:space="preserve"> PAGEREF _Toc229098660 \h </w:instrText>
             </w:r>
             <w:r>
               <w:rPr>
@@ -2516,7 +2508,7 @@
               <w:lang w:eastAsia="en-GB"/>
             </w:rPr>
           </w:pPr>
-          <w:hyperlink w:anchor="_Toc229093009" w:history="1">
+          <w:hyperlink w:anchor="_Toc229098661" w:history="1">
             <w:r>
               <w:rPr>
                 <w:rStyle w:val="Hyperlink"/>
@@ -2543,7 +2535,7 @@
                 <w:noProof/>
                 <w:webHidden/>
               </w:rPr>
-              <w:instrText xml:space="preserve"> PAGEREF _Toc229093009 \h </w:instrText>
+              <w:instrText xml:space="preserve"> PAGEREF _Toc229098661 \h </w:instrText>
             </w:r>
             <w:r>
               <w:rPr>
@@ -2586,7 +2578,7 @@
               <w:lang w:eastAsia="en-GB"/>
             </w:rPr>
           </w:pPr>
-          <w:hyperlink w:anchor="_Toc229093010" w:history="1">
+          <w:hyperlink w:anchor="_Toc229098662" w:history="1">
             <w:r>
               <w:rPr>
                 <w:rStyle w:val="Hyperlink"/>
@@ -2613,7 +2605,7 @@
                 <w:noProof/>
                 <w:webHidden/>
               </w:rPr>
-              <w:instrText xml:space="preserve"> PAGEREF _Toc229093010 \h </w:instrText>
+              <w:instrText xml:space="preserve"> PAGEREF _Toc229098662 \h </w:instrText>
             </w:r>
             <w:r>
               <w:rPr>
@@ -2660,7 +2652,7 @@
               <w14:ligatures w14:val="standardContextual"/>
             </w:rPr>
           </w:pPr>
-          <w:hyperlink w:anchor="_Toc229093011" w:history="1">
+          <w:hyperlink w:anchor="_Toc229098663" w:history="1">
             <w:r>
               <w:rPr>
                 <w:rStyle w:val="Hyperlink"/>
@@ -2687,7 +2679,7 @@
                 <w:noProof/>
                 <w:webHidden/>
               </w:rPr>
-              <w:instrText xml:space="preserve"> PAGEREF _Toc229093011 \h </w:instrText>
+              <w:instrText xml:space="preserve"> PAGEREF _Toc229098663 \h </w:instrText>
             </w:r>
             <w:r>
               <w:rPr>
@@ -2730,7 +2722,7 @@
               <w:lang w:eastAsia="en-GB"/>
             </w:rPr>
           </w:pPr>
-          <w:hyperlink w:anchor="_Toc229093012" w:history="1">
+          <w:hyperlink w:anchor="_Toc229098664" w:history="1">
             <w:r>
               <w:rPr>
                 <w:rStyle w:val="Hyperlink"/>
@@ -2757,7 +2749,7 @@
                 <w:noProof/>
                 <w:webHidden/>
               </w:rPr>
-              <w:instrText xml:space="preserve"> PAGEREF _Toc229093012 \h </w:instrText>
+              <w:instrText xml:space="preserve"> PAGEREF _Toc229098664 \h </w:instrText>
             </w:r>
             <w:r>
               <w:rPr>
@@ -2800,7 +2792,7 @@
               <w:lang w:eastAsia="en-GB"/>
             </w:rPr>
           </w:pPr>
-          <w:hyperlink w:anchor="_Toc229093013" w:history="1">
+          <w:hyperlink w:anchor="_Toc229098665" w:history="1">
             <w:r>
               <w:rPr>
                 <w:rStyle w:val="Hyperlink"/>
@@ -2827,7 +2819,7 @@
                 <w:noProof/>
                 <w:webHidden/>
               </w:rPr>
-              <w:instrText xml:space="preserve"> PAGEREF _Toc229093013 \h </w:instrText>
+              <w:instrText xml:space="preserve"> PAGEREF _Toc229098665 \h </w:instrText>
             </w:r>
             <w:r>
               <w:rPr>
@@ -2870,7 +2862,7 @@
               <w:lang w:eastAsia="en-GB"/>
             </w:rPr>
           </w:pPr>
-          <w:hyperlink w:anchor="_Toc229093014" w:history="1">
+          <w:hyperlink w:anchor="_Toc229098666" w:history="1">
             <w:r>
               <w:rPr>
                 <w:rStyle w:val="Hyperlink"/>
@@ -2897,7 +2889,7 @@
                 <w:noProof/>
                 <w:webHidden/>
               </w:rPr>
-              <w:instrText xml:space="preserve"> PAGEREF _Toc229093014 \h </w:instrText>
+              <w:instrText xml:space="preserve"> PAGEREF _Toc229098666 \h </w:instrText>
             </w:r>
             <w:r>
               <w:rPr>
@@ -2944,7 +2936,7 @@
               <w14:ligatures w14:val="standardContextual"/>
             </w:rPr>
           </w:pPr>
-          <w:hyperlink w:anchor="_Toc229093015" w:history="1">
+          <w:hyperlink w:anchor="_Toc229098667" w:history="1">
             <w:r>
               <w:rPr>
                 <w:rStyle w:val="Hyperlink"/>
@@ -2971,7 +2963,7 @@
                 <w:noProof/>
                 <w:webHidden/>
               </w:rPr>
-              <w:instrText xml:space="preserve"> PAGEREF _Toc229093015 \h </w:instrText>
+              <w:instrText xml:space="preserve"> PAGEREF _Toc229098667 \h </w:instrText>
             </w:r>
             <w:r>
               <w:rPr>
@@ -3018,7 +3010,7 @@
               <w14:ligatures w14:val="standardContextual"/>
             </w:rPr>
           </w:pPr>
-          <w:hyperlink w:anchor="_Toc229093016" w:history="1">
+          <w:hyperlink w:anchor="_Toc229098668" w:history="1">
             <w:r>
               <w:rPr>
                 <w:rStyle w:val="Hyperlink"/>
@@ -3045,7 +3037,7 @@
                 <w:noProof/>
                 <w:webHidden/>
               </w:rPr>
-              <w:instrText xml:space="preserve"> PAGEREF _Toc229093016 \h </w:instrText>
+              <w:instrText xml:space="preserve"> PAGEREF _Toc229098668 \h </w:instrText>
             </w:r>
             <w:r>
               <w:rPr>
@@ -3092,7 +3084,7 @@
               <w14:ligatures w14:val="standardContextual"/>
             </w:rPr>
           </w:pPr>
-          <w:hyperlink w:anchor="_Toc229093017" w:history="1">
+          <w:hyperlink w:anchor="_Toc229098669" w:history="1">
             <w:r>
               <w:rPr>
                 <w:rStyle w:val="Hyperlink"/>
@@ -3119,7 +3111,7 @@
                 <w:noProof/>
                 <w:webHidden/>
               </w:rPr>
-              <w:instrText xml:space="preserve"> PAGEREF _Toc229093017 \h </w:instrText>
+              <w:instrText xml:space="preserve"> PAGEREF _Toc229098669 \h </w:instrText>
             </w:r>
             <w:r>
               <w:rPr>
@@ -3166,7 +3158,7 @@
               <w14:ligatures w14:val="standardContextual"/>
             </w:rPr>
           </w:pPr>
-          <w:hyperlink w:anchor="_Toc229093018" w:history="1">
+          <w:hyperlink w:anchor="_Toc229098670" w:history="1">
             <w:r>
               <w:rPr>
                 <w:rStyle w:val="Hyperlink"/>
@@ -3193,7 +3185,7 @@
                 <w:noProof/>
                 <w:webHidden/>
               </w:rPr>
-              <w:instrText xml:space="preserve"> PAGEREF _Toc229093018 \h </w:instrText>
+              <w:instrText xml:space="preserve"> PAGEREF _Toc229098670 \h </w:instrText>
             </w:r>
             <w:r>
               <w:rPr>
@@ -3240,7 +3232,7 @@
               <w14:ligatures w14:val="standardContextual"/>
             </w:rPr>
           </w:pPr>
-          <w:hyperlink w:anchor="_Toc229093019" w:history="1">
+          <w:hyperlink w:anchor="_Toc229098671" w:history="1">
             <w:r>
               <w:rPr>
                 <w:rStyle w:val="Hyperlink"/>
@@ -3267,7 +3259,7 @@
                 <w:noProof/>
                 <w:webHidden/>
               </w:rPr>
-              <w:instrText xml:space="preserve"> PAGEREF _Toc229093019 \h </w:instrText>
+              <w:instrText xml:space="preserve"> PAGEREF _Toc229098671 \h </w:instrText>
             </w:r>
             <w:r>
               <w:rPr>
@@ -3314,7 +3306,7 @@
               <w14:ligatures w14:val="standardContextual"/>
             </w:rPr>
           </w:pPr>
-          <w:hyperlink w:anchor="_Toc229093020" w:history="1">
+          <w:hyperlink w:anchor="_Toc229098672" w:history="1">
             <w:r>
               <w:rPr>
                 <w:rStyle w:val="Hyperlink"/>
@@ -3341,7 +3333,7 @@
                 <w:noProof/>
                 <w:webHidden/>
               </w:rPr>
-              <w:instrText xml:space="preserve"> PAGEREF _Toc229093020 \h </w:instrText>
+              <w:instrText xml:space="preserve"> PAGEREF _Toc229098672 \h </w:instrText>
             </w:r>
             <w:r>
               <w:rPr>
@@ -3388,7 +3380,7 @@
               <w14:ligatures w14:val="standardContextual"/>
             </w:rPr>
           </w:pPr>
-          <w:hyperlink w:anchor="_Toc229093021" w:history="1">
+          <w:hyperlink w:anchor="_Toc229098673" w:history="1">
             <w:r>
               <w:rPr>
                 <w:rStyle w:val="Hyperlink"/>
@@ -3415,7 +3407,7 @@
                 <w:noProof/>
                 <w:webHidden/>
               </w:rPr>
-              <w:instrText xml:space="preserve"> PAGEREF _Toc229093021 \h </w:instrText>
+              <w:instrText xml:space="preserve"> PAGEREF _Toc229098673 \h </w:instrText>
             </w:r>
             <w:r>
               <w:rPr>
@@ -3462,7 +3454,7 @@
               <w14:ligatures w14:val="standardContextual"/>
             </w:rPr>
           </w:pPr>
-          <w:hyperlink w:anchor="_Toc229093022" w:history="1">
+          <w:hyperlink w:anchor="_Toc229098674" w:history="1">
             <w:r>
               <w:rPr>
                 <w:rStyle w:val="Hyperlink"/>
@@ -3489,7 +3481,7 @@
                 <w:noProof/>
                 <w:webHidden/>
               </w:rPr>
-              <w:instrText xml:space="preserve"> PAGEREF _Toc229093022 \h </w:instrText>
+              <w:instrText xml:space="preserve"> PAGEREF _Toc229098674 \h </w:instrText>
             </w:r>
             <w:r>
               <w:rPr>
@@ -3536,7 +3528,7 @@
               <w14:ligatures w14:val="standardContextual"/>
             </w:rPr>
           </w:pPr>
-          <w:hyperlink w:anchor="_Toc229093023" w:history="1">
+          <w:hyperlink w:anchor="_Toc229098675" w:history="1">
             <w:r>
               <w:rPr>
                 <w:rStyle w:val="Hyperlink"/>
@@ -3563,7 +3555,7 @@
                 <w:noProof/>
                 <w:webHidden/>
               </w:rPr>
-              <w:instrText xml:space="preserve"> PAGEREF _Toc229093023 \h </w:instrText>
+              <w:instrText xml:space="preserve"> PAGEREF _Toc229098675 \h </w:instrText>
             </w:r>
             <w:r>
               <w:rPr>
@@ -3610,7 +3602,7 @@
               <w14:ligatures w14:val="standardContextual"/>
             </w:rPr>
           </w:pPr>
-          <w:hyperlink w:anchor="_Toc229093024" w:history="1">
+          <w:hyperlink w:anchor="_Toc229098676" w:history="1">
             <w:r>
               <w:rPr>
                 <w:rStyle w:val="Hyperlink"/>
@@ -3637,7 +3629,7 @@
                 <w:noProof/>
                 <w:webHidden/>
               </w:rPr>
-              <w:instrText xml:space="preserve"> PAGEREF _Toc229093024 \h </w:instrText>
+              <w:instrText xml:space="preserve"> PAGEREF _Toc229098676 \h </w:instrText>
             </w:r>
             <w:r>
               <w:rPr>
@@ -3684,7 +3676,7 @@
               <w14:ligatures w14:val="standardContextual"/>
             </w:rPr>
           </w:pPr>
-          <w:hyperlink w:anchor="_Toc229093025" w:history="1">
+          <w:hyperlink w:anchor="_Toc229098677" w:history="1">
             <w:r>
               <w:rPr>
                 <w:rStyle w:val="Hyperlink"/>
@@ -3711,7 +3703,7 @@
                 <w:noProof/>
                 <w:webHidden/>
               </w:rPr>
-              <w:instrText xml:space="preserve"> PAGEREF _Toc229093025 \h </w:instrText>
+              <w:instrText xml:space="preserve"> PAGEREF _Toc229098677 \h </w:instrText>
             </w:r>
             <w:r>
               <w:rPr>
@@ -3758,7 +3750,7 @@
               <w14:ligatures w14:val="standardContextual"/>
             </w:rPr>
           </w:pPr>
-          <w:hyperlink w:anchor="_Toc229093026" w:history="1">
+          <w:hyperlink w:anchor="_Toc229098678" w:history="1">
             <w:r>
               <w:rPr>
                 <w:rStyle w:val="Hyperlink"/>
@@ -3785,7 +3777,7 @@
                 <w:noProof/>
                 <w:webHidden/>
               </w:rPr>
-              <w:instrText xml:space="preserve"> PAGEREF _Toc229093026 \h </w:instrText>
+              <w:instrText xml:space="preserve"> PAGEREF _Toc229098678 \h </w:instrText>
             </w:r>
             <w:r>
               <w:rPr>
@@ -3832,7 +3824,7 @@
               <w14:ligatures w14:val="standardContextual"/>
             </w:rPr>
           </w:pPr>
-          <w:hyperlink w:anchor="_Toc229093027" w:history="1">
+          <w:hyperlink w:anchor="_Toc229098679" w:history="1">
             <w:r>
               <w:rPr>
                 <w:rStyle w:val="Hyperlink"/>
@@ -3859,7 +3851,7 @@
                 <w:noProof/>
                 <w:webHidden/>
               </w:rPr>
-              <w:instrText xml:space="preserve"> PAGEREF _Toc229093027 \h </w:instrText>
+              <w:instrText xml:space="preserve"> PAGEREF _Toc229098679 \h </w:instrText>
             </w:r>
             <w:r>
               <w:rPr>
@@ -3906,7 +3898,7 @@
               <w14:ligatures w14:val="standardContextual"/>
             </w:rPr>
           </w:pPr>
-          <w:hyperlink w:anchor="_Toc229093028" w:history="1">
+          <w:hyperlink w:anchor="_Toc229098680" w:history="1">
             <w:r>
               <w:rPr>
                 <w:rStyle w:val="Hyperlink"/>
@@ -3933,7 +3925,7 @@
                 <w:noProof/>
                 <w:webHidden/>
               </w:rPr>
-              <w:instrText xml:space="preserve"> PAGEREF _Toc229093028 \h </w:instrText>
+              <w:instrText xml:space="preserve"> PAGEREF _Toc229098680 \h </w:instrText>
             </w:r>
             <w:r>
               <w:rPr>
@@ -3980,7 +3972,7 @@
               <w14:ligatures w14:val="standardContextual"/>
             </w:rPr>
           </w:pPr>
-          <w:hyperlink w:anchor="_Toc229093029" w:history="1">
+          <w:hyperlink w:anchor="_Toc229098681" w:history="1">
             <w:r>
               <w:rPr>
                 <w:rStyle w:val="Hyperlink"/>
@@ -4007,7 +3999,7 @@
                 <w:noProof/>
                 <w:webHidden/>
               </w:rPr>
-              <w:instrText xml:space="preserve"> PAGEREF _Toc229093029 \h </w:instrText>
+              <w:instrText xml:space="preserve"> PAGEREF _Toc229098681 \h </w:instrText>
             </w:r>
             <w:r>
               <w:rPr>
@@ -4054,7 +4046,7 @@
               <w14:ligatures w14:val="standardContextual"/>
             </w:rPr>
           </w:pPr>
-          <w:hyperlink w:anchor="_Toc229093030" w:history="1">
+          <w:hyperlink w:anchor="_Toc229098682" w:history="1">
             <w:r>
               <w:rPr>
                 <w:rStyle w:val="Hyperlink"/>
@@ -4081,7 +4073,7 @@
                 <w:noProof/>
                 <w:webHidden/>
               </w:rPr>
-              <w:instrText xml:space="preserve"> PAGEREF _Toc229093030 \h </w:instrText>
+              <w:instrText xml:space="preserve"> PAGEREF _Toc229098682 \h </w:instrText>
             </w:r>
             <w:r>
               <w:rPr>
@@ -4128,7 +4120,7 @@
               <w14:ligatures w14:val="standardContextual"/>
             </w:rPr>
           </w:pPr>
-          <w:hyperlink w:anchor="_Toc229093031" w:history="1">
+          <w:hyperlink w:anchor="_Toc229098683" w:history="1">
             <w:r>
               <w:rPr>
                 <w:rStyle w:val="Hyperlink"/>
@@ -4155,7 +4147,7 @@
                 <w:noProof/>
                 <w:webHidden/>
               </w:rPr>
-              <w:instrText xml:space="preserve"> PAGEREF _Toc229093031 \h </w:instrText>
+              <w:instrText xml:space="preserve"> PAGEREF _Toc229098683 \h </w:instrText>
             </w:r>
             <w:r>
               <w:rPr>
@@ -4202,7 +4194,7 @@
               <w14:ligatures w14:val="standardContextual"/>
             </w:rPr>
           </w:pPr>
-          <w:hyperlink w:anchor="_Toc229093032" w:history="1">
+          <w:hyperlink w:anchor="_Toc229098684" w:history="1">
             <w:r>
               <w:rPr>
                 <w:rStyle w:val="Hyperlink"/>
@@ -4229,7 +4221,7 @@
                 <w:noProof/>
                 <w:webHidden/>
               </w:rPr>
-              <w:instrText xml:space="preserve"> PAGEREF _Toc229093032 \h </w:instrText>
+              <w:instrText xml:space="preserve"> PAGEREF _Toc229098684 \h </w:instrText>
             </w:r>
             <w:r>
               <w:rPr>
@@ -4276,7 +4268,7 @@
               <w14:ligatures w14:val="standardContextual"/>
             </w:rPr>
           </w:pPr>
-          <w:hyperlink w:anchor="_Toc229093033" w:history="1">
+          <w:hyperlink w:anchor="_Toc229098685" w:history="1">
             <w:r>
               <w:rPr>
                 <w:rStyle w:val="Hyperlink"/>
@@ -4303,7 +4295,7 @@
                 <w:noProof/>
                 <w:webHidden/>
               </w:rPr>
-              <w:instrText xml:space="preserve"> PAGEREF _Toc229093033 \h </w:instrText>
+              <w:instrText xml:space="preserve"> PAGEREF _Toc229098685 \h </w:instrText>
             </w:r>
             <w:r>
               <w:rPr>
@@ -4350,7 +4342,7 @@
               <w14:ligatures w14:val="standardContextual"/>
             </w:rPr>
           </w:pPr>
-          <w:hyperlink w:anchor="_Toc229093034" w:history="1">
+          <w:hyperlink w:anchor="_Toc229098686" w:history="1">
             <w:r>
               <w:rPr>
                 <w:rStyle w:val="Hyperlink"/>
@@ -4377,7 +4369,7 @@
                 <w:noProof/>
                 <w:webHidden/>
               </w:rPr>
-              <w:instrText xml:space="preserve"> PAGEREF _Toc229093034 \h </w:instrText>
+              <w:instrText xml:space="preserve"> PAGEREF _Toc229098686 \h </w:instrText>
             </w:r>
             <w:r>
               <w:rPr>
@@ -4424,7 +4416,7 @@
               <w14:ligatures w14:val="standardContextual"/>
             </w:rPr>
           </w:pPr>
-          <w:hyperlink w:anchor="_Toc229093035" w:history="1">
+          <w:hyperlink w:anchor="_Toc229098687" w:history="1">
             <w:r>
               <w:rPr>
                 <w:rStyle w:val="Hyperlink"/>
@@ -4451,7 +4443,7 @@
                 <w:noProof/>
                 <w:webHidden/>
               </w:rPr>
-              <w:instrText xml:space="preserve"> PAGEREF _Toc229093035 \h </w:instrText>
+              <w:instrText xml:space="preserve"> PAGEREF _Toc229098687 \h </w:instrText>
             </w:r>
             <w:r>
               <w:rPr>
@@ -4498,7 +4490,7 @@
               <w14:ligatures w14:val="standardContextual"/>
             </w:rPr>
           </w:pPr>
-          <w:hyperlink w:anchor="_Toc229093036" w:history="1">
+          <w:hyperlink w:anchor="_Toc229098688" w:history="1">
             <w:r>
               <w:rPr>
                 <w:rStyle w:val="Hyperlink"/>
@@ -4525,7 +4517,7 @@
                 <w:noProof/>
                 <w:webHidden/>
               </w:rPr>
-              <w:instrText xml:space="preserve"> PAGEREF _Toc229093036 \h </w:instrText>
+              <w:instrText xml:space="preserve"> PAGEREF _Toc229098688 \h </w:instrText>
             </w:r>
             <w:r>
               <w:rPr>
@@ -4572,7 +4564,7 @@
               <w14:ligatures w14:val="standardContextual"/>
             </w:rPr>
           </w:pPr>
-          <w:hyperlink w:anchor="_Toc229093037" w:history="1">
+          <w:hyperlink w:anchor="_Toc229098689" w:history="1">
             <w:r>
               <w:rPr>
                 <w:rStyle w:val="Hyperlink"/>
@@ -4599,7 +4591,7 @@
                 <w:noProof/>
                 <w:webHidden/>
               </w:rPr>
-              <w:instrText xml:space="preserve"> PAGEREF _Toc229093037 \h </w:instrText>
+              <w:instrText xml:space="preserve"> PAGEREF _Toc229098689 \h </w:instrText>
             </w:r>
             <w:r>
               <w:rPr>
@@ -4620,6 +4612,228 @@
                 <w:webHidden/>
               </w:rPr>
               <w:t>24</w:t>
+            </w:r>
+            <w:r>
+              <w:rPr>
+                <w:noProof/>
+                <w:webHidden/>
+              </w:rPr>
+              <w:fldChar w:fldCharType="end"/>
+            </w:r>
+          </w:hyperlink>
+        </w:p>
+        <w:p>
+          <w:pPr>
+            <w:pStyle w:val="TOC2"/>
+            <w:tabs>
+              <w:tab w:val="right" w:leader="dot" w:pos="9016"/>
+            </w:tabs>
+            <w:rPr>
+              <w:rFonts w:asciiTheme="minorHAnsi" w:hAnsiTheme="minorHAnsi" w:cstheme="minorBidi"/>
+              <w:noProof/>
+              <w:kern w:val="2"/>
+              <w:sz w:val="24"/>
+              <w:szCs w:val="24"/>
+              <w:lang w:val="en-GB" w:eastAsia="en-GB"/>
+              <w14:ligatures w14:val="standardContextual"/>
+            </w:rPr>
+          </w:pPr>
+          <w:hyperlink w:anchor="_Toc229098690" w:history="1">
+            <w:r>
+              <w:rPr>
+                <w:rStyle w:val="Hyperlink"/>
+                <w:noProof/>
+              </w:rPr>
+              <w:t>4.3 AI Integration</w:t>
+            </w:r>
+            <w:r>
+              <w:rPr>
+                <w:noProof/>
+                <w:webHidden/>
+              </w:rPr>
+              <w:tab/>
+            </w:r>
+            <w:r>
+              <w:rPr>
+                <w:noProof/>
+                <w:webHidden/>
+              </w:rPr>
+              <w:fldChar w:fldCharType="begin"/>
+            </w:r>
+            <w:r>
+              <w:rPr>
+                <w:noProof/>
+                <w:webHidden/>
+              </w:rPr>
+              <w:instrText xml:space="preserve"> PAGEREF _Toc229098690 \h </w:instrText>
+            </w:r>
+            <w:r>
+              <w:rPr>
+                <w:noProof/>
+                <w:webHidden/>
+              </w:rPr>
+            </w:r>
+            <w:r>
+              <w:rPr>
+                <w:noProof/>
+                <w:webHidden/>
+              </w:rPr>
+              <w:fldChar w:fldCharType="separate"/>
+            </w:r>
+            <w:r>
+              <w:rPr>
+                <w:noProof/>
+                <w:webHidden/>
+              </w:rPr>
+              <w:t>26</w:t>
+            </w:r>
+            <w:r>
+              <w:rPr>
+                <w:noProof/>
+                <w:webHidden/>
+              </w:rPr>
+              <w:fldChar w:fldCharType="end"/>
+            </w:r>
+          </w:hyperlink>
+        </w:p>
+        <w:p>
+          <w:pPr>
+            <w:pStyle w:val="TOC3"/>
+            <w:tabs>
+              <w:tab w:val="right" w:leader="dot" w:pos="9016"/>
+            </w:tabs>
+            <w:rPr>
+              <w:rFonts w:asciiTheme="minorHAnsi" w:hAnsiTheme="minorHAnsi" w:cstheme="minorBidi"/>
+              <w:noProof/>
+              <w:kern w:val="2"/>
+              <w:sz w:val="24"/>
+              <w:szCs w:val="24"/>
+              <w:lang w:val="en-GB" w:eastAsia="en-GB"/>
+              <w14:ligatures w14:val="standardContextual"/>
+            </w:rPr>
+          </w:pPr>
+          <w:hyperlink w:anchor="_Toc229098691" w:history="1">
+            <w:r>
+              <w:rPr>
+                <w:rStyle w:val="Hyperlink"/>
+                <w:noProof/>
+              </w:rPr>
+              <w:t>4.3.1 The AI Controller</w:t>
+            </w:r>
+            <w:r>
+              <w:rPr>
+                <w:noProof/>
+                <w:webHidden/>
+              </w:rPr>
+              <w:tab/>
+            </w:r>
+            <w:r>
+              <w:rPr>
+                <w:noProof/>
+                <w:webHidden/>
+              </w:rPr>
+              <w:fldChar w:fldCharType="begin"/>
+            </w:r>
+            <w:r>
+              <w:rPr>
+                <w:noProof/>
+                <w:webHidden/>
+              </w:rPr>
+              <w:instrText xml:space="preserve"> PAGEREF _Toc229098691 \h </w:instrText>
+            </w:r>
+            <w:r>
+              <w:rPr>
+                <w:noProof/>
+                <w:webHidden/>
+              </w:rPr>
+            </w:r>
+            <w:r>
+              <w:rPr>
+                <w:noProof/>
+                <w:webHidden/>
+              </w:rPr>
+              <w:fldChar w:fldCharType="separate"/>
+            </w:r>
+            <w:r>
+              <w:rPr>
+                <w:noProof/>
+                <w:webHidden/>
+              </w:rPr>
+              <w:t>26</w:t>
+            </w:r>
+            <w:r>
+              <w:rPr>
+                <w:noProof/>
+                <w:webHidden/>
+              </w:rPr>
+              <w:fldChar w:fldCharType="end"/>
+            </w:r>
+          </w:hyperlink>
+        </w:p>
+        <w:p>
+          <w:pPr>
+            <w:pStyle w:val="TOC3"/>
+            <w:tabs>
+              <w:tab w:val="right" w:leader="dot" w:pos="9016"/>
+            </w:tabs>
+            <w:rPr>
+              <w:rFonts w:asciiTheme="minorHAnsi" w:hAnsiTheme="minorHAnsi" w:cstheme="minorBidi"/>
+              <w:noProof/>
+              <w:kern w:val="2"/>
+              <w:sz w:val="24"/>
+              <w:szCs w:val="24"/>
+              <w:lang w:val="en-GB" w:eastAsia="en-GB"/>
+              <w14:ligatures w14:val="standardContextual"/>
+            </w:rPr>
+          </w:pPr>
+          <w:hyperlink w:anchor="_Toc229098692" w:history="1">
+            <w:r>
+              <w:rPr>
+                <w:rStyle w:val="Hyperlink"/>
+                <w:noProof/>
+              </w:rPr>
+              <w:t>4.3.2 Training the AI</w:t>
+            </w:r>
+            <w:r>
+              <w:rPr>
+                <w:noProof/>
+                <w:webHidden/>
+              </w:rPr>
+              <w:tab/>
+            </w:r>
+            <w:r>
+              <w:rPr>
+                <w:noProof/>
+                <w:webHidden/>
+              </w:rPr>
+              <w:fldChar w:fldCharType="begin"/>
+            </w:r>
+            <w:r>
+              <w:rPr>
+                <w:noProof/>
+                <w:webHidden/>
+              </w:rPr>
+              <w:instrText xml:space="preserve"> PAGEREF _Toc229098692 \h </w:instrText>
+            </w:r>
+            <w:r>
+              <w:rPr>
+                <w:noProof/>
+                <w:webHidden/>
+              </w:rPr>
+            </w:r>
+            <w:r>
+              <w:rPr>
+                <w:noProof/>
+                <w:webHidden/>
+              </w:rPr>
+              <w:fldChar w:fldCharType="separate"/>
+            </w:r>
+            <w:r>
+              <w:rPr>
+                <w:noProof/>
+                <w:webHidden/>
+              </w:rPr>
+              <w:t>27</w:t>
             </w:r>
             <w:r>
               <w:rPr>
@@ -4646,7 +4860,7 @@
               <w14:ligatures w14:val="standardContextual"/>
             </w:rPr>
           </w:pPr>
-          <w:hyperlink w:anchor="_Toc229093038" w:history="1">
+          <w:hyperlink w:anchor="_Toc229098693" w:history="1">
             <w:r>
               <w:rPr>
                 <w:rStyle w:val="Hyperlink"/>
@@ -4673,7 +4887,7 @@
                 <w:noProof/>
                 <w:webHidden/>
               </w:rPr>
-              <w:instrText xml:space="preserve"> PAGEREF _Toc229093038 \h </w:instrText>
+              <w:instrText xml:space="preserve"> PAGEREF _Toc229098693 \h </w:instrText>
             </w:r>
             <w:r>
               <w:rPr>
@@ -4693,7 +4907,7 @@
                 <w:noProof/>
                 <w:webHidden/>
               </w:rPr>
-              <w:t>26</w:t>
+              <w:t>28</w:t>
             </w:r>
             <w:r>
               <w:rPr>
@@ -4743,7 +4957,7 @@
       <w:pPr>
         <w:pStyle w:val="Heading1"/>
       </w:pPr>
-      <w:bookmarkStart w:id="7" w:name="_Toc229092988"/>
+      <w:bookmarkStart w:id="7" w:name="_Toc229098640"/>
       <w:r>
         <w:lastRenderedPageBreak/>
         <w:t>Table of Figures</w:t>
@@ -4786,7 +5000,7 @@
         </w:rPr>
         <w:fldChar w:fldCharType="separate"/>
       </w:r>
-      <w:hyperlink w:anchor="_Toc229093039" w:history="1">
+      <w:hyperlink w:anchor="_Toc229098612" w:history="1">
         <w:r>
           <w:rPr>
             <w:rStyle w:val="Hyperlink"/>
@@ -4813,7 +5027,7 @@
             <w:noProof/>
             <w:webHidden/>
           </w:rPr>
-          <w:instrText xml:space="preserve"> PAGEREF _Toc229093039 \h </w:instrText>
+          <w:instrText xml:space="preserve"> PAGEREF _Toc229098612 \h </w:instrText>
         </w:r>
         <w:r>
           <w:rPr>
@@ -4856,7 +5070,7 @@
           <w:lang w:eastAsia="en-GB"/>
         </w:rPr>
       </w:pPr>
-      <w:hyperlink w:anchor="_Toc229093040" w:history="1">
+      <w:hyperlink w:anchor="_Toc229098613" w:history="1">
         <w:r>
           <w:rPr>
             <w:rStyle w:val="Hyperlink"/>
@@ -4883,7 +5097,7 @@
             <w:noProof/>
             <w:webHidden/>
           </w:rPr>
-          <w:instrText xml:space="preserve"> PAGEREF _Toc229093040 \h </w:instrText>
+          <w:instrText xml:space="preserve"> PAGEREF _Toc229098613 \h </w:instrText>
         </w:r>
         <w:r>
           <w:rPr>
@@ -4926,7 +5140,7 @@
           <w:lang w:eastAsia="en-GB"/>
         </w:rPr>
       </w:pPr>
-      <w:hyperlink w:anchor="_Toc229093041" w:history="1">
+      <w:hyperlink w:anchor="_Toc229098614" w:history="1">
         <w:r>
           <w:rPr>
             <w:rStyle w:val="Hyperlink"/>
@@ -4953,7 +5167,7 @@
             <w:noProof/>
             <w:webHidden/>
           </w:rPr>
-          <w:instrText xml:space="preserve"> PAGEREF _Toc229093041 \h </w:instrText>
+          <w:instrText xml:space="preserve"> PAGEREF _Toc229098614 \h </w:instrText>
         </w:r>
         <w:r>
           <w:rPr>
@@ -4996,7 +5210,7 @@
           <w:lang w:eastAsia="en-GB"/>
         </w:rPr>
       </w:pPr>
-      <w:hyperlink w:anchor="_Toc229093042" w:history="1">
+      <w:hyperlink w:anchor="_Toc229098615" w:history="1">
         <w:r>
           <w:rPr>
             <w:rStyle w:val="Hyperlink"/>
@@ -5023,7 +5237,7 @@
             <w:noProof/>
             <w:webHidden/>
           </w:rPr>
-          <w:instrText xml:space="preserve"> PAGEREF _Toc229093042 \h </w:instrText>
+          <w:instrText xml:space="preserve"> PAGEREF _Toc229098615 \h </w:instrText>
         </w:r>
         <w:r>
           <w:rPr>
@@ -5066,7 +5280,7 @@
           <w:lang w:eastAsia="en-GB"/>
         </w:rPr>
       </w:pPr>
-      <w:hyperlink w:anchor="_Toc229093043" w:history="1">
+      <w:hyperlink w:anchor="_Toc229098616" w:history="1">
         <w:r>
           <w:rPr>
             <w:rStyle w:val="Hyperlink"/>
@@ -5093,7 +5307,7 @@
             <w:noProof/>
             <w:webHidden/>
           </w:rPr>
-          <w:instrText xml:space="preserve"> PAGEREF _Toc229093043 \h </w:instrText>
+          <w:instrText xml:space="preserve"> PAGEREF _Toc229098616 \h </w:instrText>
         </w:r>
         <w:r>
           <w:rPr>
@@ -5136,7 +5350,7 @@
           <w:lang w:eastAsia="en-GB"/>
         </w:rPr>
       </w:pPr>
-      <w:hyperlink w:anchor="_Toc229093044" w:history="1">
+      <w:hyperlink w:anchor="_Toc229098617" w:history="1">
         <w:r>
           <w:rPr>
             <w:rStyle w:val="Hyperlink"/>
@@ -5163,7 +5377,7 @@
             <w:noProof/>
             <w:webHidden/>
           </w:rPr>
-          <w:instrText xml:space="preserve"> PAGEREF _Toc229093044 \h </w:instrText>
+          <w:instrText xml:space="preserve"> PAGEREF _Toc229098617 \h </w:instrText>
         </w:r>
         <w:r>
           <w:rPr>
@@ -5206,7 +5420,7 @@
           <w:lang w:eastAsia="en-GB"/>
         </w:rPr>
       </w:pPr>
-      <w:hyperlink w:anchor="_Toc229093045" w:history="1">
+      <w:hyperlink w:anchor="_Toc229098618" w:history="1">
         <w:r>
           <w:rPr>
             <w:rStyle w:val="Hyperlink"/>
@@ -5233,7 +5447,7 @@
             <w:noProof/>
             <w:webHidden/>
           </w:rPr>
-          <w:instrText xml:space="preserve"> PAGEREF _Toc229093045 \h </w:instrText>
+          <w:instrText xml:space="preserve"> PAGEREF _Toc229098618 \h </w:instrText>
         </w:r>
         <w:r>
           <w:rPr>
@@ -5276,7 +5490,7 @@
           <w:lang w:eastAsia="en-GB"/>
         </w:rPr>
       </w:pPr>
-      <w:hyperlink w:anchor="_Toc229093046" w:history="1">
+      <w:hyperlink w:anchor="_Toc229098619" w:history="1">
         <w:r>
           <w:rPr>
             <w:rStyle w:val="Hyperlink"/>
@@ -5303,7 +5517,7 @@
             <w:noProof/>
             <w:webHidden/>
           </w:rPr>
-          <w:instrText xml:space="preserve"> PAGEREF _Toc229093046 \h </w:instrText>
+          <w:instrText xml:space="preserve"> PAGEREF _Toc229098619 \h </w:instrText>
         </w:r>
         <w:r>
           <w:rPr>
@@ -5346,7 +5560,7 @@
           <w:lang w:eastAsia="en-GB"/>
         </w:rPr>
       </w:pPr>
-      <w:hyperlink w:anchor="_Toc229093047" w:history="1">
+      <w:hyperlink w:anchor="_Toc229098620" w:history="1">
         <w:r>
           <w:rPr>
             <w:rStyle w:val="Hyperlink"/>
@@ -5373,7 +5587,7 @@
             <w:noProof/>
             <w:webHidden/>
           </w:rPr>
-          <w:instrText xml:space="preserve"> PAGEREF _Toc229093047 \h </w:instrText>
+          <w:instrText xml:space="preserve"> PAGEREF _Toc229098620 \h </w:instrText>
         </w:r>
         <w:r>
           <w:rPr>
@@ -5416,7 +5630,7 @@
           <w:lang w:eastAsia="en-GB"/>
         </w:rPr>
       </w:pPr>
-      <w:hyperlink w:anchor="_Toc229093048" w:history="1">
+      <w:hyperlink w:anchor="_Toc229098621" w:history="1">
         <w:r>
           <w:rPr>
             <w:rStyle w:val="Hyperlink"/>
@@ -5443,7 +5657,7 @@
             <w:noProof/>
             <w:webHidden/>
           </w:rPr>
-          <w:instrText xml:space="preserve"> PAGEREF _Toc229093048 \h </w:instrText>
+          <w:instrText xml:space="preserve"> PAGEREF _Toc229098621 \h </w:instrText>
         </w:r>
         <w:r>
           <w:rPr>
@@ -5486,7 +5700,7 @@
           <w:lang w:eastAsia="en-GB"/>
         </w:rPr>
       </w:pPr>
-      <w:hyperlink w:anchor="_Toc229093049" w:history="1">
+      <w:hyperlink w:anchor="_Toc229098622" w:history="1">
         <w:r>
           <w:rPr>
             <w:rStyle w:val="Hyperlink"/>
@@ -5513,7 +5727,7 @@
             <w:noProof/>
             <w:webHidden/>
           </w:rPr>
-          <w:instrText xml:space="preserve"> PAGEREF _Toc229093049 \h </w:instrText>
+          <w:instrText xml:space="preserve"> PAGEREF _Toc229098622 \h </w:instrText>
         </w:r>
         <w:r>
           <w:rPr>
@@ -5556,7 +5770,7 @@
           <w:lang w:eastAsia="en-GB"/>
         </w:rPr>
       </w:pPr>
-      <w:hyperlink w:anchor="_Toc229093050" w:history="1">
+      <w:hyperlink w:anchor="_Toc229098623" w:history="1">
         <w:r>
           <w:rPr>
             <w:rStyle w:val="Hyperlink"/>
@@ -5583,7 +5797,7 @@
             <w:noProof/>
             <w:webHidden/>
           </w:rPr>
-          <w:instrText xml:space="preserve"> PAGEREF _Toc229093050 \h </w:instrText>
+          <w:instrText xml:space="preserve"> PAGEREF _Toc229098623 \h </w:instrText>
         </w:r>
         <w:r>
           <w:rPr>
@@ -5626,7 +5840,7 @@
           <w:lang w:eastAsia="en-GB"/>
         </w:rPr>
       </w:pPr>
-      <w:hyperlink w:anchor="_Toc229093051" w:history="1">
+      <w:hyperlink w:anchor="_Toc229098624" w:history="1">
         <w:r>
           <w:rPr>
             <w:rStyle w:val="Hyperlink"/>
@@ -5653,7 +5867,7 @@
             <w:noProof/>
             <w:webHidden/>
           </w:rPr>
-          <w:instrText xml:space="preserve"> PAGEREF _Toc229093051 \h </w:instrText>
+          <w:instrText xml:space="preserve"> PAGEREF _Toc229098624 \h </w:instrText>
         </w:r>
         <w:r>
           <w:rPr>
@@ -5696,7 +5910,7 @@
           <w:lang w:eastAsia="en-GB"/>
         </w:rPr>
       </w:pPr>
-      <w:hyperlink w:anchor="_Toc229093052" w:history="1">
+      <w:hyperlink w:anchor="_Toc229098625" w:history="1">
         <w:r>
           <w:rPr>
             <w:rStyle w:val="Hyperlink"/>
@@ -5723,7 +5937,7 @@
             <w:noProof/>
             <w:webHidden/>
           </w:rPr>
-          <w:instrText xml:space="preserve"> PAGEREF _Toc229093052 \h </w:instrText>
+          <w:instrText xml:space="preserve"> PAGEREF _Toc229098625 \h </w:instrText>
         </w:r>
         <w:r>
           <w:rPr>
@@ -5766,7 +5980,7 @@
           <w:lang w:eastAsia="en-GB"/>
         </w:rPr>
       </w:pPr>
-      <w:hyperlink w:anchor="_Toc229093053" w:history="1">
+      <w:hyperlink w:anchor="_Toc229098626" w:history="1">
         <w:r>
           <w:rPr>
             <w:rStyle w:val="Hyperlink"/>
@@ -5793,7 +6007,7 @@
             <w:noProof/>
             <w:webHidden/>
           </w:rPr>
-          <w:instrText xml:space="preserve"> PAGEREF _Toc229093053 \h </w:instrText>
+          <w:instrText xml:space="preserve"> PAGEREF _Toc229098626 \h </w:instrText>
         </w:r>
         <w:r>
           <w:rPr>
@@ -5836,7 +6050,7 @@
           <w:lang w:eastAsia="en-GB"/>
         </w:rPr>
       </w:pPr>
-      <w:hyperlink w:anchor="_Toc229093054" w:history="1">
+      <w:hyperlink w:anchor="_Toc229098627" w:history="1">
         <w:r>
           <w:rPr>
             <w:rStyle w:val="Hyperlink"/>
@@ -5863,7 +6077,7 @@
             <w:noProof/>
             <w:webHidden/>
           </w:rPr>
-          <w:instrText xml:space="preserve"> PAGEREF _Toc229093054 \h </w:instrText>
+          <w:instrText xml:space="preserve"> PAGEREF _Toc229098627 \h </w:instrText>
         </w:r>
         <w:r>
           <w:rPr>
@@ -5906,7 +6120,7 @@
           <w:lang w:eastAsia="en-GB"/>
         </w:rPr>
       </w:pPr>
-      <w:hyperlink w:anchor="_Toc229093055" w:history="1">
+      <w:hyperlink w:anchor="_Toc229098628" w:history="1">
         <w:r>
           <w:rPr>
             <w:rStyle w:val="Hyperlink"/>
@@ -5933,7 +6147,7 @@
             <w:noProof/>
             <w:webHidden/>
           </w:rPr>
-          <w:instrText xml:space="preserve"> PAGEREF _Toc229093055 \h </w:instrText>
+          <w:instrText xml:space="preserve"> PAGEREF _Toc229098628 \h </w:instrText>
         </w:r>
         <w:r>
           <w:rPr>
@@ -5976,7 +6190,7 @@
           <w:lang w:eastAsia="en-GB"/>
         </w:rPr>
       </w:pPr>
-      <w:hyperlink w:anchor="_Toc229093056" w:history="1">
+      <w:hyperlink w:anchor="_Toc229098629" w:history="1">
         <w:r>
           <w:rPr>
             <w:rStyle w:val="Hyperlink"/>
@@ -6003,7 +6217,7 @@
             <w:noProof/>
             <w:webHidden/>
           </w:rPr>
-          <w:instrText xml:space="preserve"> PAGEREF _Toc229093056 \h </w:instrText>
+          <w:instrText xml:space="preserve"> PAGEREF _Toc229098629 \h </w:instrText>
         </w:r>
         <w:r>
           <w:rPr>
@@ -6046,7 +6260,7 @@
           <w:lang w:eastAsia="en-GB"/>
         </w:rPr>
       </w:pPr>
-      <w:hyperlink w:anchor="_Toc229093057" w:history="1">
+      <w:hyperlink w:anchor="_Toc229098630" w:history="1">
         <w:r>
           <w:rPr>
             <w:rStyle w:val="Hyperlink"/>
@@ -6073,7 +6287,7 @@
             <w:noProof/>
             <w:webHidden/>
           </w:rPr>
-          <w:instrText xml:space="preserve"> PAGEREF _Toc229093057 \h </w:instrText>
+          <w:instrText xml:space="preserve"> PAGEREF _Toc229098630 \h </w:instrText>
         </w:r>
         <w:r>
           <w:rPr>
@@ -6116,7 +6330,7 @@
           <w:lang w:eastAsia="en-GB"/>
         </w:rPr>
       </w:pPr>
-      <w:hyperlink w:anchor="_Toc229093058" w:history="1">
+      <w:hyperlink w:anchor="_Toc229098631" w:history="1">
         <w:r>
           <w:rPr>
             <w:rStyle w:val="Hyperlink"/>
@@ -6143,7 +6357,7 @@
             <w:noProof/>
             <w:webHidden/>
           </w:rPr>
-          <w:instrText xml:space="preserve"> PAGEREF _Toc229093058 \h </w:instrText>
+          <w:instrText xml:space="preserve"> PAGEREF _Toc229098631 \h </w:instrText>
         </w:r>
         <w:r>
           <w:rPr>
@@ -6186,7 +6400,7 @@
           <w:lang w:eastAsia="en-GB"/>
         </w:rPr>
       </w:pPr>
-      <w:hyperlink w:anchor="_Toc229093059" w:history="1">
+      <w:hyperlink w:anchor="_Toc229098632" w:history="1">
         <w:r>
           <w:rPr>
             <w:rStyle w:val="Hyperlink"/>
@@ -6213,7 +6427,7 @@
             <w:noProof/>
             <w:webHidden/>
           </w:rPr>
-          <w:instrText xml:space="preserve"> PAGEREF _Toc229093059 \h </w:instrText>
+          <w:instrText xml:space="preserve"> PAGEREF _Toc229098632 \h </w:instrText>
         </w:r>
         <w:r>
           <w:rPr>
@@ -6256,7 +6470,7 @@
           <w:lang w:eastAsia="en-GB"/>
         </w:rPr>
       </w:pPr>
-      <w:hyperlink w:anchor="_Toc229093060" w:history="1">
+      <w:hyperlink w:anchor="_Toc229098633" w:history="1">
         <w:r>
           <w:rPr>
             <w:rStyle w:val="Hyperlink"/>
@@ -6283,7 +6497,7 @@
             <w:noProof/>
             <w:webHidden/>
           </w:rPr>
-          <w:instrText xml:space="preserve"> PAGEREF _Toc229093060 \h </w:instrText>
+          <w:instrText xml:space="preserve"> PAGEREF _Toc229098633 \h </w:instrText>
         </w:r>
         <w:r>
           <w:rPr>
@@ -6304,6 +6518,146 @@
             <w:webHidden/>
           </w:rPr>
           <w:t>25</w:t>
+        </w:r>
+        <w:r>
+          <w:rPr>
+            <w:noProof/>
+            <w:webHidden/>
+          </w:rPr>
+          <w:fldChar w:fldCharType="end"/>
+        </w:r>
+      </w:hyperlink>
+    </w:p>
+    <w:p>
+      <w:pPr>
+        <w:pStyle w:val="TableofFigures"/>
+        <w:tabs>
+          <w:tab w:val="right" w:leader="dot" w:pos="9016"/>
+        </w:tabs>
+        <w:rPr>
+          <w:rFonts w:asciiTheme="minorHAnsi" w:eastAsiaTheme="minorEastAsia" w:hAnsiTheme="minorHAnsi"/>
+          <w:noProof/>
+          <w:lang w:eastAsia="en-GB"/>
+        </w:rPr>
+      </w:pPr>
+      <w:hyperlink w:anchor="_Toc229098634" w:history="1">
+        <w:r>
+          <w:rPr>
+            <w:rStyle w:val="Hyperlink"/>
+            <w:noProof/>
+          </w:rPr>
+          <w:t>Figure 23</w:t>
+        </w:r>
+        <w:r>
+          <w:rPr>
+            <w:noProof/>
+            <w:webHidden/>
+          </w:rPr>
+          <w:tab/>
+        </w:r>
+        <w:r>
+          <w:rPr>
+            <w:noProof/>
+            <w:webHidden/>
+          </w:rPr>
+          <w:fldChar w:fldCharType="begin"/>
+        </w:r>
+        <w:r>
+          <w:rPr>
+            <w:noProof/>
+            <w:webHidden/>
+          </w:rPr>
+          <w:instrText xml:space="preserve"> PAGEREF _Toc229098634 \h </w:instrText>
+        </w:r>
+        <w:r>
+          <w:rPr>
+            <w:noProof/>
+            <w:webHidden/>
+          </w:rPr>
+        </w:r>
+        <w:r>
+          <w:rPr>
+            <w:noProof/>
+            <w:webHidden/>
+          </w:rPr>
+          <w:fldChar w:fldCharType="separate"/>
+        </w:r>
+        <w:r>
+          <w:rPr>
+            <w:noProof/>
+            <w:webHidden/>
+          </w:rPr>
+          <w:t>26</w:t>
+        </w:r>
+        <w:r>
+          <w:rPr>
+            <w:noProof/>
+            <w:webHidden/>
+          </w:rPr>
+          <w:fldChar w:fldCharType="end"/>
+        </w:r>
+      </w:hyperlink>
+    </w:p>
+    <w:p>
+      <w:pPr>
+        <w:pStyle w:val="TableofFigures"/>
+        <w:tabs>
+          <w:tab w:val="right" w:leader="dot" w:pos="9016"/>
+        </w:tabs>
+        <w:rPr>
+          <w:rFonts w:asciiTheme="minorHAnsi" w:eastAsiaTheme="minorEastAsia" w:hAnsiTheme="minorHAnsi"/>
+          <w:noProof/>
+          <w:lang w:eastAsia="en-GB"/>
+        </w:rPr>
+      </w:pPr>
+      <w:hyperlink w:anchor="_Toc229098635" w:history="1">
+        <w:r>
+          <w:rPr>
+            <w:rStyle w:val="Hyperlink"/>
+            <w:noProof/>
+          </w:rPr>
+          <w:t>Figure 24</w:t>
+        </w:r>
+        <w:r>
+          <w:rPr>
+            <w:noProof/>
+            <w:webHidden/>
+          </w:rPr>
+          <w:tab/>
+        </w:r>
+        <w:r>
+          <w:rPr>
+            <w:noProof/>
+            <w:webHidden/>
+          </w:rPr>
+          <w:fldChar w:fldCharType="begin"/>
+        </w:r>
+        <w:r>
+          <w:rPr>
+            <w:noProof/>
+            <w:webHidden/>
+          </w:rPr>
+          <w:instrText xml:space="preserve"> PAGEREF _Toc229098635 \h </w:instrText>
+        </w:r>
+        <w:r>
+          <w:rPr>
+            <w:noProof/>
+            <w:webHidden/>
+          </w:rPr>
+        </w:r>
+        <w:r>
+          <w:rPr>
+            <w:noProof/>
+            <w:webHidden/>
+          </w:rPr>
+          <w:fldChar w:fldCharType="separate"/>
+        </w:r>
+        <w:r>
+          <w:rPr>
+            <w:noProof/>
+            <w:webHidden/>
+          </w:rPr>
+          <w:t>27</w:t>
         </w:r>
         <w:r>
           <w:rPr>
@@ -6352,7 +6706,7 @@
       <w:pPr>
         <w:pStyle w:val="Heading1"/>
       </w:pPr>
-      <w:bookmarkStart w:id="8" w:name="_Toc229092989"/>
+      <w:bookmarkStart w:id="8" w:name="_Toc229098641"/>
       <w:r>
         <w:t>Chapter 1</w:t>
       </w:r>
@@ -6380,7 +6734,7 @@
           <w:u w:val="single"/>
         </w:rPr>
       </w:pPr>
-      <w:bookmarkStart w:id="9" w:name="_Toc229092990"/>
+      <w:bookmarkStart w:id="9" w:name="_Toc229098642"/>
       <w:r>
         <w:t>1.1</w:t>
       </w:r>
@@ -6437,7 +6791,7 @@
       <w:pPr>
         <w:pStyle w:val="Heading2"/>
       </w:pPr>
-      <w:bookmarkStart w:id="10" w:name="_Toc229092991"/>
+      <w:bookmarkStart w:id="10" w:name="_Toc229098643"/>
       <w:r>
         <w:t>1.2 Aims</w:t>
       </w:r>
@@ -6453,7 +6807,7 @@
           <w:szCs w:val="28"/>
         </w:rPr>
       </w:pPr>
-      <w:bookmarkStart w:id="11" w:name="_Toc229092992"/>
+      <w:bookmarkStart w:id="11" w:name="_Toc229098644"/>
       <w:r>
         <w:rPr>
           <w:rStyle w:val="Heading2Char"/>
@@ -6498,7 +6852,7 @@
       <w:pPr>
         <w:pStyle w:val="Heading3"/>
       </w:pPr>
-      <w:bookmarkStart w:id="12" w:name="_Toc229092993"/>
+      <w:bookmarkStart w:id="12" w:name="_Toc229098645"/>
       <w:r>
         <w:lastRenderedPageBreak/>
         <w:t>1.2.2 Additional Aims</w:t>
@@ -6568,7 +6922,7 @@
       <w:pPr>
         <w:pStyle w:val="Heading2"/>
       </w:pPr>
-      <w:bookmarkStart w:id="13" w:name="_Toc229092994"/>
+      <w:bookmarkStart w:id="13" w:name="_Toc229098646"/>
       <w:r>
         <w:t>1.3 Objectives</w:t>
       </w:r>
@@ -6578,7 +6932,7 @@
       <w:pPr>
         <w:pStyle w:val="Heading3"/>
       </w:pPr>
-      <w:bookmarkStart w:id="14" w:name="_Toc229092995"/>
+      <w:bookmarkStart w:id="14" w:name="_Toc229098647"/>
       <w:r>
         <w:t>1.3.1 Scope</w:t>
       </w:r>
@@ -6586,15 +6940,7 @@
     </w:p>
     <w:p>
       <w:r>
-        <w:t xml:space="preserve">The objectives in terms of scope for this project are going to be generally quite broad and consist of specific milestones. The core objectives </w:t>
-      </w:r>
-      <w:proofErr w:type="gramStart"/>
-      <w:r>
-        <w:t>in regards to</w:t>
-      </w:r>
-      <w:proofErr w:type="gramEnd"/>
-      <w:r>
-        <w:t xml:space="preserve"> the scope are:</w:t>
+        <w:t>The objectives in terms of scope for this project are going to be generally quite broad and consist of specific milestones. The core objectives in regards to the scope are:</w:t>
       </w:r>
     </w:p>
     <w:p>
@@ -6649,7 +6995,7 @@
       <w:pPr>
         <w:pStyle w:val="Heading3"/>
       </w:pPr>
-      <w:bookmarkStart w:id="15" w:name="_Toc229092996"/>
+      <w:bookmarkStart w:id="15" w:name="_Toc229098648"/>
       <w:r>
         <w:t>1.3.2 Research Objectives</w:t>
       </w:r>
@@ -6657,15 +7003,7 @@
     </w:p>
     <w:p>
       <w:r>
-        <w:t xml:space="preserve">For the research objectives for the game, research will be conducted into other types of media with similar features. This research will include a comparison of similar games and their features and the overall impact of those features on this project. This will be done to find a balance for the difficulty of the game and to evaluate the necessary features for the game. Some topics of features and mechanics that will be researched </w:t>
-      </w:r>
-      <w:proofErr w:type="gramStart"/>
-      <w:r>
-        <w:t>include:</w:t>
-      </w:r>
-      <w:proofErr w:type="gramEnd"/>
-      <w:r>
-        <w:t xml:space="preserve"> World Generation, Pathfinding</w:t>
+        <w:t>For the research objectives for the game, research will be conducted into other types of media with similar features. This research will include a comparison of similar games and their features and the overall impact of those features on this project. This will be done to find a balance for the difficulty of the game and to evaluate the necessary features for the game. Some topics of features and mechanics that will be researched include: World Generation, Pathfinding</w:t>
       </w:r>
       <w:r>
         <w:t xml:space="preserve"> and </w:t>
@@ -6687,7 +7025,7 @@
       <w:pPr>
         <w:pStyle w:val="Heading3"/>
       </w:pPr>
-      <w:bookmarkStart w:id="16" w:name="_Toc229092997"/>
+      <w:bookmarkStart w:id="16" w:name="_Toc229098649"/>
       <w:r>
         <w:lastRenderedPageBreak/>
         <w:t>1.3.3 Design Objectives</w:t>
@@ -6810,7 +7148,7 @@
       <w:pPr>
         <w:pStyle w:val="Heading3"/>
       </w:pPr>
-      <w:bookmarkStart w:id="17" w:name="_Toc229092998"/>
+      <w:bookmarkStart w:id="17" w:name="_Toc229098650"/>
       <w:r>
         <w:t>1.3.4 Implementation Objectives</w:t>
       </w:r>
@@ -6929,7 +7267,7 @@
       <w:pPr>
         <w:pStyle w:val="Heading3"/>
       </w:pPr>
-      <w:bookmarkStart w:id="18" w:name="_Toc229092999"/>
+      <w:bookmarkStart w:id="18" w:name="_Toc229098651"/>
       <w:r>
         <w:t>1.3.5 Results, Evaluation and Playtesting Objectives</w:t>
       </w:r>
@@ -6986,7 +7324,7 @@
       <w:pPr>
         <w:pStyle w:val="Heading1"/>
       </w:pPr>
-      <w:bookmarkStart w:id="19" w:name="_Toc229093000"/>
+      <w:bookmarkStart w:id="19" w:name="_Toc229098652"/>
       <w:r>
         <w:lastRenderedPageBreak/>
         <w:t>Chapter 2 – Literature Survey</w:t>
@@ -6997,7 +7335,7 @@
       <w:pPr>
         <w:pStyle w:val="Heading2"/>
       </w:pPr>
-      <w:bookmarkStart w:id="20" w:name="_Toc229093001"/>
+      <w:bookmarkStart w:id="20" w:name="_Toc229098653"/>
       <w:r>
         <w:t>2.1 Literature Survey Introduction</w:t>
       </w:r>
@@ -7036,7 +7374,7 @@
       <w:pPr>
         <w:pStyle w:val="Heading2"/>
       </w:pPr>
-      <w:bookmarkStart w:id="21" w:name="_Toc229093002"/>
+      <w:bookmarkStart w:id="21" w:name="_Toc229098654"/>
       <w:r>
         <w:t>2.2 Comparative Research</w:t>
       </w:r>
@@ -7054,7 +7392,7 @@
       <w:pPr>
         <w:pStyle w:val="Heading3"/>
       </w:pPr>
-      <w:bookmarkStart w:id="22" w:name="_Toc229093003"/>
+      <w:bookmarkStart w:id="22" w:name="_Toc229098655"/>
       <w:r>
         <w:t xml:space="preserve">2.2.1 </w:t>
       </w:r>
@@ -7129,7 +7467,7 @@
       <w:pPr>
         <w:pStyle w:val="Heading4"/>
       </w:pPr>
-      <w:bookmarkStart w:id="23" w:name="_Toc229093004"/>
+      <w:bookmarkStart w:id="23" w:name="_Toc229098656"/>
       <w:r>
         <w:t>2.2.1.1 Perlin Noise</w:t>
       </w:r>
@@ -7430,7 +7768,7 @@
         <w:pStyle w:val="Caption"/>
         <w:jc w:val="center"/>
       </w:pPr>
-      <w:bookmarkStart w:id="24" w:name="_Toc229093039"/>
+      <w:bookmarkStart w:id="24" w:name="_Toc229098612"/>
       <w:r>
         <w:t xml:space="preserve">Figure </w:t>
       </w:r>
@@ -7514,7 +7852,7 @@
       <w:pPr>
         <w:pStyle w:val="Heading4"/>
       </w:pPr>
-      <w:bookmarkStart w:id="25" w:name="_Toc229093005"/>
+      <w:bookmarkStart w:id="25" w:name="_Toc229098657"/>
       <w:r>
         <w:t>2.2.1.2 Binary Space Partitioning</w:t>
       </w:r>
@@ -7565,7 +7903,7 @@
       <w:pPr>
         <w:pStyle w:val="Heading4"/>
       </w:pPr>
-      <w:bookmarkStart w:id="26" w:name="_Toc229093006"/>
+      <w:bookmarkStart w:id="26" w:name="_Toc229098658"/>
       <w:r>
         <w:t>2.2.1.3 Cellular Automata</w:t>
       </w:r>
@@ -7626,15 +7964,7 @@
         <w:t>)</w:t>
       </w:r>
       <w:r>
-        <w:t xml:space="preserve"> according to the following two rules: If a cell is alive, it survives to the next generation if it has 2 or 3 live neighbors; otherwise it dies. If a cell is dead, it comes to life in the next generation if it has exactly 3 live neighbors; </w:t>
-      </w:r>
-      <w:proofErr w:type="gramStart"/>
-      <w:r>
-        <w:t>otherwise</w:t>
-      </w:r>
-      <w:proofErr w:type="gramEnd"/>
-      <w:r>
-        <w:t xml:space="preserve"> it stays dead.” </w:t>
+        <w:t xml:space="preserve"> according to the following two rules: If a cell is alive, it survives to the next generation if it has 2 or 3 live neighbors; otherwise it dies. If a cell is dead, it comes to life in the next generation if it has exactly 3 live neighbors; otherwise it stays dead.” </w:t>
       </w:r>
       <w:sdt>
         <w:sdtPr>
@@ -7680,7 +8010,7 @@
       <w:pPr>
         <w:pStyle w:val="Heading3"/>
       </w:pPr>
-      <w:bookmarkStart w:id="27" w:name="_Toc229093007"/>
+      <w:bookmarkStart w:id="27" w:name="_Toc229098659"/>
       <w:r>
         <w:t>2.2.2 Pathfinding</w:t>
       </w:r>
@@ -7716,15 +8046,7 @@
         <w:t xml:space="preserve"> </w:t>
       </w:r>
       <w:r>
-        <w:t xml:space="preserve">The types of pathfinding I will be evaluating </w:t>
-      </w:r>
-      <w:proofErr w:type="gramStart"/>
-      <w:r>
-        <w:t>are:</w:t>
-      </w:r>
-      <w:proofErr w:type="gramEnd"/>
-      <w:r>
-        <w:t xml:space="preserve"> A*, Dijkstra</w:t>
+        <w:t>The types of pathfinding I will be evaluating are: A*, Dijkstra</w:t>
       </w:r>
       <w:r>
         <w:t>,</w:t>
@@ -7743,7 +8065,7 @@
       <w:pPr>
         <w:pStyle w:val="Heading4"/>
       </w:pPr>
-      <w:bookmarkStart w:id="28" w:name="_Toc229093008"/>
+      <w:bookmarkStart w:id="28" w:name="_Toc229098660"/>
       <w:r>
         <w:t>2.2.2.1 Dijkstra</w:t>
       </w:r>
@@ -7830,7 +8152,7 @@
         <w:pStyle w:val="Caption"/>
         <w:jc w:val="center"/>
       </w:pPr>
-      <w:bookmarkStart w:id="29" w:name="_Toc229093040"/>
+      <w:bookmarkStart w:id="29" w:name="_Toc229098613"/>
       <w:r>
         <w:t xml:space="preserve">Figure </w:t>
       </w:r>
@@ -7916,7 +8238,7 @@
       <w:pPr>
         <w:pStyle w:val="Heading4"/>
       </w:pPr>
-      <w:bookmarkStart w:id="30" w:name="_Toc229093009"/>
+      <w:bookmarkStart w:id="30" w:name="_Toc229098661"/>
       <w:r>
         <w:t>2.2.2.2 A*</w:t>
       </w:r>
@@ -7974,22 +8296,14 @@
     <w:p/>
     <w:p>
       <w:r>
-        <w:t xml:space="preserve">The performance of A* is highly </w:t>
-      </w:r>
-      <w:proofErr w:type="spellStart"/>
-      <w:r>
-        <w:t>dependant</w:t>
-      </w:r>
-      <w:proofErr w:type="spellEnd"/>
-      <w:r>
-        <w:t xml:space="preserve"> on the quality of the heuristic data. If the heuristic is poorly chosen, the algorithm may degrade towards the performance of Dijkstra’s algorithm. Additionally, A* can incur higher memory usage due to the need to maintain open and closed node lists, which may become significant in large-scale environments.</w:t>
+        <w:t>The performance of A* is highly dependant on the quality of the heuristic data. If the heuristic is poorly chosen, the algorithm may degrade towards the performance of Dijkstra’s algorithm. Additionally, A* can incur higher memory usage due to the need to maintain open and closed node lists, which may become significant in large-scale environments.</w:t>
       </w:r>
     </w:p>
     <w:p>
       <w:pPr>
         <w:pStyle w:val="Heading4"/>
       </w:pPr>
-      <w:bookmarkStart w:id="31" w:name="_Toc229093010"/>
+      <w:bookmarkStart w:id="31" w:name="_Toc229098662"/>
       <w:r>
         <w:t>2.2.2.3 Jump Point Search</w:t>
       </w:r>
@@ -8039,7 +8353,7 @@
       <w:pPr>
         <w:pStyle w:val="Heading3"/>
       </w:pPr>
-      <w:bookmarkStart w:id="32" w:name="_Toc229093011"/>
+      <w:bookmarkStart w:id="32" w:name="_Toc229098663"/>
       <w:r>
         <w:t>2.2.3 AI Integrations</w:t>
       </w:r>
@@ -8063,7 +8377,7 @@
       <w:pPr>
         <w:pStyle w:val="Heading4"/>
       </w:pPr>
-      <w:bookmarkStart w:id="33" w:name="_Toc229093012"/>
+      <w:bookmarkStart w:id="33" w:name="_Toc229098664"/>
       <w:r>
         <w:lastRenderedPageBreak/>
         <w:t>2.2.3.1 Neural Network</w:t>
@@ -8120,7 +8434,7 @@
       <w:pPr>
         <w:pStyle w:val="Heading4"/>
       </w:pPr>
-      <w:bookmarkStart w:id="34" w:name="_Toc229093013"/>
+      <w:bookmarkStart w:id="34" w:name="_Toc229098665"/>
       <w:r>
         <w:t>2.2.3.2 Reinforcement Learning</w:t>
       </w:r>
@@ -8195,7 +8509,7 @@
         <w:pStyle w:val="Caption"/>
         <w:jc w:val="center"/>
       </w:pPr>
-      <w:bookmarkStart w:id="35" w:name="_Toc229093041"/>
+      <w:bookmarkStart w:id="35" w:name="_Toc229098614"/>
       <w:r>
         <w:t xml:space="preserve">Figure </w:t>
       </w:r>
@@ -8320,7 +8634,7 @@
       <w:pPr>
         <w:pStyle w:val="Heading4"/>
       </w:pPr>
-      <w:bookmarkStart w:id="36" w:name="_Toc229093014"/>
+      <w:bookmarkStart w:id="36" w:name="_Toc229098666"/>
       <w:r>
         <w:lastRenderedPageBreak/>
         <w:t>2.2.3.3 Imitation Learning</w:t>
@@ -8462,7 +8776,7 @@
       <w:pPr>
         <w:pStyle w:val="Heading1"/>
       </w:pPr>
-      <w:bookmarkStart w:id="37" w:name="_Toc229093015"/>
+      <w:bookmarkStart w:id="37" w:name="_Toc229098667"/>
       <w:r>
         <w:lastRenderedPageBreak/>
         <w:t>Chapter 3 – Design</w:t>
@@ -8490,7 +8804,7 @@
       <w:pPr>
         <w:pStyle w:val="Heading2"/>
       </w:pPr>
-      <w:bookmarkStart w:id="38" w:name="_Toc229093016"/>
+      <w:bookmarkStart w:id="38" w:name="_Toc229098668"/>
       <w:r>
         <w:t xml:space="preserve">3.1 </w:t>
       </w:r>
@@ -8541,7 +8855,7 @@
       <w:pPr>
         <w:pStyle w:val="Heading3"/>
       </w:pPr>
-      <w:bookmarkStart w:id="39" w:name="_Toc229093017"/>
+      <w:bookmarkStart w:id="39" w:name="_Toc229098669"/>
       <w:r>
         <w:t xml:space="preserve">3.1.1 </w:t>
       </w:r>
@@ -8639,7 +8953,7 @@
         <w:pStyle w:val="Caption"/>
         <w:jc w:val="center"/>
       </w:pPr>
-      <w:bookmarkStart w:id="40" w:name="_Toc229093042"/>
+      <w:bookmarkStart w:id="40" w:name="_Toc229098615"/>
       <w:r>
         <w:t xml:space="preserve">Figure </w:t>
       </w:r>
@@ -8754,7 +9068,7 @@
               <w:pStyle w:val="Caption"/>
               <w:jc w:val="center"/>
             </w:pPr>
-            <w:bookmarkStart w:id="41" w:name="_Toc229093043"/>
+            <w:bookmarkStart w:id="41" w:name="_Toc229098616"/>
             <w:r>
               <w:t xml:space="preserve">Figure </w:t>
             </w:r>
@@ -8842,7 +9156,7 @@
               <w:pStyle w:val="Caption"/>
               <w:jc w:val="center"/>
             </w:pPr>
-            <w:bookmarkStart w:id="42" w:name="_Toc229093044"/>
+            <w:bookmarkStart w:id="42" w:name="_Toc229098617"/>
             <w:r>
               <w:t xml:space="preserve">Figure </w:t>
             </w:r>
@@ -8867,15 +9181,7 @@
     </w:p>
     <w:p>
       <w:r>
-        <w:t xml:space="preserve">Figure 5 is a visualisation of a 3x3 hexagonal grid. </w:t>
-      </w:r>
-      <w:proofErr w:type="gramStart"/>
-      <w:r>
-        <w:t>There</w:t>
-      </w:r>
-      <w:proofErr w:type="gramEnd"/>
-      <w:r>
-        <w:t xml:space="preserve"> </w:t>
+        <w:t xml:space="preserve">Figure 5 is a visualisation of a 3x3 hexagonal grid. There </w:t>
       </w:r>
       <w:r>
         <w:t>a key limitation</w:t>
@@ -8896,15 +9202,7 @@
     <w:p/>
     <w:p>
       <w:r>
-        <w:t xml:space="preserve">There are 2 ways that I can easily display the tiles to the user: Prefabs, and Mesh Generation. Prefabs would be significantly easier to incorporate, allowing me to create a prefab for each biome and instantiating each prefab where needed. This has many benefits such as making development of this feature very quick, simplicity, code readability and making pathfinding easier through direct ray-casting. This could have potential drawbacks such as performance losses from having thousands to tens of thousands of </w:t>
-      </w:r>
-      <w:proofErr w:type="spellStart"/>
-      <w:r>
-        <w:t>GameObjects</w:t>
-      </w:r>
-      <w:proofErr w:type="spellEnd"/>
-      <w:r>
-        <w:t xml:space="preserve"> in a scene.</w:t>
+        <w:t>There are 2 ways that I can easily display the tiles to the user: Prefabs, and Mesh Generation. Prefabs would be significantly easier to incorporate, allowing me to create a prefab for each biome and instantiating each prefab where needed. This has many benefits such as making development of this feature very quick, simplicity, code readability and making pathfinding easier through direct ray-casting. This could have potential drawbacks such as performance losses from having thousands to tens of thousands of GameObjects in a scene.</w:t>
       </w:r>
     </w:p>
     <w:p/>
@@ -8926,7 +9224,7 @@
       <w:pPr>
         <w:pStyle w:val="Heading3"/>
       </w:pPr>
-      <w:bookmarkStart w:id="43" w:name="_Toc229093018"/>
+      <w:bookmarkStart w:id="43" w:name="_Toc229098670"/>
       <w:r>
         <w:t>3.1.2 Biomes</w:t>
       </w:r>
@@ -9097,7 +9395,7 @@
         <w:pStyle w:val="Caption"/>
         <w:jc w:val="center"/>
       </w:pPr>
-      <w:bookmarkStart w:id="44" w:name="_Toc229093045"/>
+      <w:bookmarkStart w:id="44" w:name="_Toc229098618"/>
       <w:r>
         <w:t xml:space="preserve">Figure </w:t>
       </w:r>
@@ -9148,15 +9446,7 @@
         <w:t xml:space="preserve"> a pixel is, can become the boundaries for biomes. In this example, there are only 3 biomes: ocean, beach, and grass</w:t>
       </w:r>
       <w:r>
-        <w:t xml:space="preserve">. The </w:t>
-      </w:r>
-      <w:proofErr w:type="gramStart"/>
-      <w:r>
-        <w:t>amount</w:t>
-      </w:r>
-      <w:proofErr w:type="gramEnd"/>
-      <w:r>
-        <w:t xml:space="preserve"> of biomes possible are technically infinite. Although biome separation will be very prevalent as you go past roughly 10 biomes. </w:t>
+        <w:t xml:space="preserve">. The amount of biomes possible are technically infinite. Although biome separation will be very prevalent as you go past roughly 10 biomes. </w:t>
       </w:r>
     </w:p>
     <w:p/>
@@ -9165,15 +9455,7 @@
         <w:t xml:space="preserve">For my game, I am choosing to have 5 true biomes: Deep water, shallow water, sand, grass and snow. Each of these biomes are going to be abundant in different resources and </w:t>
       </w:r>
       <w:r>
-        <w:t xml:space="preserve">have very different base tile variables. For example, grassland tiles will contain more production than a sand </w:t>
-      </w:r>
-      <w:proofErr w:type="gramStart"/>
-      <w:r>
-        <w:t>tile</w:t>
-      </w:r>
-      <w:proofErr w:type="gramEnd"/>
-      <w:r>
-        <w:t xml:space="preserve"> but a sand tile will have more gold than a grassland tile</w:t>
+        <w:t>have very different base tile variables. For example, grassland tiles will contain more production than a sand tile but a sand tile will have more gold than a grassland tile</w:t>
       </w:r>
       <w:r>
         <w:t>.</w:t>
@@ -9186,7 +9468,7 @@
       <w:pPr>
         <w:pStyle w:val="Heading3"/>
       </w:pPr>
-      <w:bookmarkStart w:id="45" w:name="_Toc229093019"/>
+      <w:bookmarkStart w:id="45" w:name="_Toc229098671"/>
       <w:r>
         <w:t>3.1.3 Resource Distribution</w:t>
       </w:r>
@@ -9222,7 +9504,7 @@
       <w:pPr>
         <w:pStyle w:val="Heading3"/>
       </w:pPr>
-      <w:bookmarkStart w:id="46" w:name="_Toc229093020"/>
+      <w:bookmarkStart w:id="46" w:name="_Toc229098672"/>
       <w:r>
         <w:t>3.1.4 River generation</w:t>
       </w:r>
@@ -9268,7 +9550,7 @@
       <w:pPr>
         <w:pStyle w:val="Heading3"/>
       </w:pPr>
-      <w:bookmarkStart w:id="47" w:name="_Toc229093021"/>
+      <w:bookmarkStart w:id="47" w:name="_Toc229098673"/>
       <w:r>
         <w:t>3.1.</w:t>
       </w:r>
@@ -9376,7 +9658,7 @@
       <w:pPr>
         <w:pStyle w:val="Heading2"/>
       </w:pPr>
-      <w:bookmarkStart w:id="48" w:name="_Toc229093022"/>
+      <w:bookmarkStart w:id="48" w:name="_Toc229098674"/>
       <w:r>
         <w:t>3.2 Pathfinding</w:t>
       </w:r>
@@ -9394,7 +9676,7 @@
       <w:pPr>
         <w:pStyle w:val="Heading3"/>
       </w:pPr>
-      <w:bookmarkStart w:id="49" w:name="_Toc229093023"/>
+      <w:bookmarkStart w:id="49" w:name="_Toc229098675"/>
       <w:r>
         <w:t xml:space="preserve">3.2.1 </w:t>
       </w:r>
@@ -9430,22 +9712,14 @@
         <w:t>well-suited</w:t>
       </w:r>
       <w:r>
-        <w:t xml:space="preserve"> for this use case, allowing all units to access the class without having a reference to it. This eliminates the need to use GetComponent which has its own </w:t>
-      </w:r>
-      <w:proofErr w:type="gramStart"/>
-      <w:r>
-        <w:t>myriad</w:t>
-      </w:r>
-      <w:proofErr w:type="gramEnd"/>
-      <w:r>
-        <w:t xml:space="preserve"> of drawbacks such as the degradation of performance when units try to access it, NullReference exceptions crashing the pathfinding functions, and making redundant calls.</w:t>
+        <w:t xml:space="preserve"> for this use case, allowing all units to access the class without having a reference to it. This eliminates the need to use GetComponent which has its own myriad of drawbacks such as the degradation of performance when units try to access it, NullReference exceptions crashing the pathfinding functions, and making redundant calls.</w:t>
       </w:r>
     </w:p>
     <w:p>
       <w:pPr>
         <w:pStyle w:val="Heading3"/>
       </w:pPr>
-      <w:bookmarkStart w:id="50" w:name="_Toc229093024"/>
+      <w:bookmarkStart w:id="50" w:name="_Toc229098676"/>
       <w:r>
         <w:t>3.2.2 Heuristics</w:t>
       </w:r>
@@ -9579,7 +9853,7 @@
         <w:pStyle w:val="Caption"/>
         <w:jc w:val="center"/>
       </w:pPr>
-      <w:bookmarkStart w:id="51" w:name="_Toc229093046"/>
+      <w:bookmarkStart w:id="51" w:name="_Toc229098619"/>
       <w:r>
         <w:t xml:space="preserve">Figure </w:t>
       </w:r>
@@ -9649,7 +9923,7 @@
       <w:pPr>
         <w:pStyle w:val="Heading3"/>
       </w:pPr>
-      <w:bookmarkStart w:id="52" w:name="_Toc229093025"/>
+      <w:bookmarkStart w:id="52" w:name="_Toc229098677"/>
       <w:r>
         <w:lastRenderedPageBreak/>
         <w:t>3.2.3 Limitations</w:t>
@@ -9667,15 +9941,7 @@
         <w:t xml:space="preserve">Another limitation of </w:t>
       </w:r>
       <w:r>
-        <w:t xml:space="preserve">pathfinding is that Euclidean heuristics are quite expensive to compute. This is due to a large </w:t>
-      </w:r>
-      <w:proofErr w:type="gramStart"/>
-      <w:r>
-        <w:t>amount</w:t>
-      </w:r>
-      <w:proofErr w:type="gramEnd"/>
-      <w:r>
-        <w:t xml:space="preserve"> of </w:t>
+        <w:t xml:space="preserve">pathfinding is that Euclidean heuristics are quite expensive to compute. This is due to a large amount of </w:t>
       </w:r>
       <w:r>
         <w:t>floating-point</w:t>
@@ -9697,7 +9963,7 @@
       <w:pPr>
         <w:pStyle w:val="Heading2"/>
       </w:pPr>
-      <w:bookmarkStart w:id="53" w:name="_Toc229093026"/>
+      <w:bookmarkStart w:id="53" w:name="_Toc229098678"/>
       <w:r>
         <w:t>3.3 AI Integrations</w:t>
       </w:r>
@@ -9724,7 +9990,7 @@
       <w:pPr>
         <w:pStyle w:val="Heading3"/>
       </w:pPr>
-      <w:bookmarkStart w:id="54" w:name="_Toc229093027"/>
+      <w:bookmarkStart w:id="54" w:name="_Toc229098679"/>
       <w:r>
         <w:t>3.3.1 Unity ML-Agents</w:t>
       </w:r>
@@ -9829,7 +10095,7 @@
       <w:pPr>
         <w:pStyle w:val="Heading3"/>
       </w:pPr>
-      <w:bookmarkStart w:id="55" w:name="_Toc229093028"/>
+      <w:bookmarkStart w:id="55" w:name="_Toc229098680"/>
       <w:r>
         <w:t>3.3.2 AI Controller</w:t>
       </w:r>
@@ -9862,7 +10128,7 @@
       <w:pPr>
         <w:pStyle w:val="Heading3"/>
       </w:pPr>
-      <w:bookmarkStart w:id="56" w:name="_Toc229093029"/>
+      <w:bookmarkStart w:id="56" w:name="_Toc229098681"/>
       <w:r>
         <w:t>3.3.3 Limitations</w:t>
       </w:r>
@@ -9870,15 +10136,7 @@
     </w:p>
     <w:p>
       <w:r>
-        <w:t xml:space="preserve">Despite all the </w:t>
-      </w:r>
-      <w:proofErr w:type="gramStart"/>
-      <w:r>
-        <w:t>above mentioned</w:t>
-      </w:r>
-      <w:proofErr w:type="gramEnd"/>
-      <w:r>
-        <w:t xml:space="preserve"> advantages of Reinforcement Learning, several limitations need to be addressed. The most significant challenge is the computational cost associated with the training of the AI, particularly in a game</w:t>
+        <w:t>Despite all the above mentioned advantages of Reinforcement Learning, several limitations need to be addressed. The most significant challenge is the computational cost associated with the training of the AI, particularly in a game</w:t>
       </w:r>
       <w:r>
         <w:t>,</w:t>
@@ -9922,7 +10180,7 @@
       <w:pPr>
         <w:pStyle w:val="Heading1"/>
       </w:pPr>
-      <w:bookmarkStart w:id="57" w:name="_Toc229093030"/>
+      <w:bookmarkStart w:id="57" w:name="_Toc229098682"/>
       <w:r>
         <w:lastRenderedPageBreak/>
         <w:t xml:space="preserve">Chapter 4 </w:t>
@@ -9944,7 +10202,7 @@
       <w:pPr>
         <w:pStyle w:val="Heading2"/>
       </w:pPr>
-      <w:bookmarkStart w:id="58" w:name="_Toc229093031"/>
+      <w:bookmarkStart w:id="58" w:name="_Toc229098683"/>
       <w:r>
         <w:t>4.1 World Generation</w:t>
       </w:r>
@@ -9975,20 +10233,15 @@
       <w:r>
         <w:t xml:space="preserve"> </w:t>
       </w:r>
-      <w:proofErr w:type="gramStart"/>
-      <w:r>
-        <w:t>Creating</w:t>
-      </w:r>
-      <w:proofErr w:type="gramEnd"/>
-      <w:r>
-        <w:t xml:space="preserve"> the river generation.</w:t>
+      <w:r>
+        <w:t>Creating the river generation.</w:t>
       </w:r>
     </w:p>
     <w:p>
       <w:pPr>
         <w:pStyle w:val="Heading3"/>
       </w:pPr>
-      <w:bookmarkStart w:id="59" w:name="_Toc229093032"/>
+      <w:bookmarkStart w:id="59" w:name="_Toc229098684"/>
       <w:r>
         <w:t>4.1.1 Creating the colour noise map</w:t>
       </w:r>
@@ -10171,7 +10424,7 @@
         <w:pStyle w:val="Caption"/>
         <w:jc w:val="center"/>
       </w:pPr>
-      <w:bookmarkStart w:id="60" w:name="_Toc229093047"/>
+      <w:bookmarkStart w:id="60" w:name="_Toc229098620"/>
       <w:r>
         <w:t xml:space="preserve">Figure </w:t>
       </w:r>
@@ -10352,7 +10605,7 @@
         <w:pStyle w:val="Caption"/>
         <w:jc w:val="center"/>
       </w:pPr>
-      <w:bookmarkStart w:id="61" w:name="_Toc229093048"/>
+      <w:bookmarkStart w:id="61" w:name="_Toc229098621"/>
       <w:r>
         <w:t xml:space="preserve">Figure </w:t>
       </w:r>
@@ -10533,7 +10786,7 @@
         <w:pStyle w:val="Caption"/>
         <w:jc w:val="center"/>
       </w:pPr>
-      <w:bookmarkStart w:id="62" w:name="_Toc229093049"/>
+      <w:bookmarkStart w:id="62" w:name="_Toc229098622"/>
       <w:r>
         <w:t xml:space="preserve">Figure </w:t>
       </w:r>
@@ -10616,7 +10869,7 @@
         <w:pStyle w:val="Caption"/>
         <w:jc w:val="center"/>
       </w:pPr>
-      <w:bookmarkStart w:id="63" w:name="_Toc229093050"/>
+      <w:bookmarkStart w:id="63" w:name="_Toc229098623"/>
       <w:r>
         <w:t xml:space="preserve">Figure </w:t>
       </w:r>
@@ -10642,7 +10895,7 @@
       <w:pPr>
         <w:pStyle w:val="Heading3"/>
       </w:pPr>
-      <w:bookmarkStart w:id="64" w:name="_Toc229093033"/>
+      <w:bookmarkStart w:id="64" w:name="_Toc229098685"/>
       <w:r>
         <w:t>4.1.2 Creating the world map</w:t>
       </w:r>
@@ -10668,13 +10921,22 @@
     <w:p/>
     <w:p>
       <w:r>
-        <w:t>To generate the world map, I am going to create a tile prefab for each biome and instantiate them individually when the tile array is generated. This will allow the player controller to easily send the units to positions and I will not need to use converter functions. After making these changes to the world generation algorithm, I discovered that the game was uncomfortable to play as the performance was massively variable. The game started and 20 frames per second seemed to be the baseline for this method. This was unacceptable and so I started searching for alternatives.</w:t>
+        <w:t xml:space="preserve">To generate the world map, I am going to create a tile prefab for each biome and instantiate them individually when the tile array is generated. This will allow the player controller to easily send the units to positions and I will not need to use converter functions. After making these changes to the world generation algorithm, I discovered that the game was uncomfortable to play as the performance was </w:t>
+      </w:r>
+      <w:r>
+        <w:t>highly inconsistent</w:t>
+      </w:r>
+      <w:r>
+        <w:t>. The game started and 20 frames per second seemed to be the baseline for this method. This was unacceptable and so I started searching for alternatives.</w:t>
       </w:r>
     </w:p>
     <w:p/>
     <w:p>
       <w:r>
-        <w:t xml:space="preserve">I eventually landed on a ‘divide and conquer’ approach to the world generation. Taking inspiration from large open world games such as Minecraft </w:t>
+        <w:t>The final solution adopted was</w:t>
+      </w:r>
+      <w:r>
+        <w:t xml:space="preserve"> a ‘divide and conquer’ approach to the world generation. Taking inspiration from large open world games such as Minecraft </w:t>
       </w:r>
       <w:sdt>
         <w:sdtPr>
@@ -10703,11 +10965,11 @@
         </w:sdtContent>
       </w:sdt>
       <w:r>
-        <w:t xml:space="preserve">, I decided that creating chunks and drawing meshes would be the best approach. To do this, I had to create </w:t>
+        <w:t xml:space="preserve">, I decided that creating chunks and drawing meshes would be the best approach. To do this, I had to </w:t>
       </w:r>
       <w:r>
         <w:lastRenderedPageBreak/>
-        <w:t>a chunk prefab with the ‘HexChunkRenderer’ component on it. This allowed me to split the world into chunks and draw and render them uniquely.</w:t>
+        <w:t>create a chunk prefab with the ‘HexChunkRenderer’ component on it. This allowed me to split the world into chunks and draw and render them uniquely.</w:t>
       </w:r>
     </w:p>
     <w:p>
@@ -10774,7 +11036,7 @@
         <w:pStyle w:val="Caption"/>
         <w:jc w:val="center"/>
       </w:pPr>
-      <w:bookmarkStart w:id="65" w:name="_Toc229093051"/>
+      <w:bookmarkStart w:id="65" w:name="_Toc229098624"/>
       <w:r>
         <w:t xml:space="preserve">Figure </w:t>
       </w:r>
@@ -10862,7 +11124,7 @@
         <w:pStyle w:val="Caption"/>
         <w:jc w:val="center"/>
       </w:pPr>
-      <w:bookmarkStart w:id="66" w:name="_Toc229093052"/>
+      <w:bookmarkStart w:id="66" w:name="_Toc229098625"/>
       <w:r>
         <w:t xml:space="preserve">Figure </w:t>
       </w:r>
@@ -10885,7 +11147,7 @@
       <w:pPr>
         <w:pStyle w:val="Heading3"/>
       </w:pPr>
-      <w:bookmarkStart w:id="67" w:name="_Toc229093034"/>
+      <w:bookmarkStart w:id="67" w:name="_Toc229098686"/>
       <w:r>
         <w:lastRenderedPageBreak/>
         <w:t>4.1.3 Creating the River Generation</w:t>
@@ -11046,7 +11308,7 @@
         <w:pStyle w:val="Caption"/>
         <w:jc w:val="center"/>
       </w:pPr>
-      <w:bookmarkStart w:id="68" w:name="_Toc229093053"/>
+      <w:bookmarkStart w:id="68" w:name="_Toc229098626"/>
       <w:r>
         <w:t xml:space="preserve">Figure </w:t>
       </w:r>
@@ -11139,7 +11401,7 @@
         <w:pStyle w:val="Caption"/>
         <w:jc w:val="center"/>
       </w:pPr>
-      <w:bookmarkStart w:id="69" w:name="_Toc229093054"/>
+      <w:bookmarkStart w:id="69" w:name="_Toc229098627"/>
       <w:r>
         <w:t xml:space="preserve">Figure </w:t>
       </w:r>
@@ -11238,7 +11500,7 @@
         <w:pStyle w:val="Caption"/>
         <w:jc w:val="center"/>
       </w:pPr>
-      <w:bookmarkStart w:id="70" w:name="_Toc229093055"/>
+      <w:bookmarkStart w:id="70" w:name="_Toc229098628"/>
       <w:r>
         <w:t xml:space="preserve">Figure </w:t>
       </w:r>
@@ -11327,7 +11589,7 @@
         <w:pStyle w:val="Caption"/>
         <w:jc w:val="center"/>
       </w:pPr>
-      <w:bookmarkStart w:id="71" w:name="_Toc229093056"/>
+      <w:bookmarkStart w:id="71" w:name="_Toc229098629"/>
       <w:r>
         <w:t xml:space="preserve">Figure </w:t>
       </w:r>
@@ -11351,7 +11613,7 @@
       <w:pPr>
         <w:pStyle w:val="Heading2"/>
       </w:pPr>
-      <w:bookmarkStart w:id="72" w:name="_Toc229093035"/>
+      <w:bookmarkStart w:id="72" w:name="_Toc229098687"/>
       <w:r>
         <w:t>4.2 Pathfinding</w:t>
       </w:r>
@@ -11375,7 +11637,7 @@
       <w:pPr>
         <w:pStyle w:val="Heading3"/>
       </w:pPr>
-      <w:bookmarkStart w:id="73" w:name="_Toc229093036"/>
+      <w:bookmarkStart w:id="73" w:name="_Toc229098688"/>
       <w:r>
         <w:t>4.2.1 Creating the Pathfinding Graph</w:t>
       </w:r>
@@ -11453,7 +11715,7 @@
         <w:pStyle w:val="Caption"/>
         <w:jc w:val="center"/>
       </w:pPr>
-      <w:bookmarkStart w:id="74" w:name="_Toc229093057"/>
+      <w:bookmarkStart w:id="74" w:name="_Toc229098630"/>
       <w:r>
         <w:t xml:space="preserve">Figure </w:t>
       </w:r>
@@ -11483,7 +11745,7 @@
       <w:pPr>
         <w:pStyle w:val="Heading3"/>
       </w:pPr>
-      <w:bookmarkStart w:id="75" w:name="_Toc229093037"/>
+      <w:bookmarkStart w:id="75" w:name="_Toc229098689"/>
       <w:r>
         <w:t>4.2.2 How a path is foun</w:t>
       </w:r>
@@ -11607,7 +11869,7 @@
         <w:pStyle w:val="Caption"/>
         <w:jc w:val="center"/>
       </w:pPr>
-      <w:bookmarkStart w:id="76" w:name="_Toc229093058"/>
+      <w:bookmarkStart w:id="76" w:name="_Toc229098631"/>
       <w:r>
         <w:t xml:space="preserve">Figure </w:t>
       </w:r>
@@ -11715,7 +11977,7 @@
         <w:pStyle w:val="Caption"/>
         <w:jc w:val="center"/>
       </w:pPr>
-      <w:bookmarkStart w:id="77" w:name="_Toc229093059"/>
+      <w:bookmarkStart w:id="77" w:name="_Toc229098632"/>
       <w:r>
         <w:t xml:space="preserve">Figure </w:t>
       </w:r>
@@ -11793,7 +12055,7 @@
         <w:pStyle w:val="Caption"/>
         <w:jc w:val="center"/>
       </w:pPr>
-      <w:bookmarkStart w:id="78" w:name="_Toc229093060"/>
+      <w:bookmarkStart w:id="78" w:name="_Toc229098633"/>
       <w:r>
         <w:t xml:space="preserve">Figure </w:t>
       </w:r>
@@ -11831,10 +12093,12 @@
       <w:pPr>
         <w:pStyle w:val="Heading2"/>
       </w:pPr>
+      <w:bookmarkStart w:id="79" w:name="_Toc229098690"/>
       <w:r>
         <w:lastRenderedPageBreak/>
         <w:t>4.3 AI Integration</w:t>
       </w:r>
+      <w:bookmarkEnd w:id="79"/>
     </w:p>
     <w:p>
       <w:r>
@@ -11863,9 +12127,11 @@
       <w:pPr>
         <w:pStyle w:val="Heading3"/>
       </w:pPr>
+      <w:bookmarkStart w:id="80" w:name="_Toc229098691"/>
       <w:r>
         <w:t>4.3.1 The AI Controller</w:t>
       </w:r>
+      <w:bookmarkEnd w:id="80"/>
     </w:p>
     <w:p>
       <w:r>
@@ -11939,6 +12205,7 @@
         <w:pStyle w:val="Caption"/>
         <w:jc w:val="center"/>
       </w:pPr>
+      <w:bookmarkStart w:id="81" w:name="_Toc229098634"/>
       <w:r>
         <w:t xml:space="preserve">Figure </w:t>
       </w:r>
@@ -11949,6 +12216,7 @@
           </w:rPr>
           <w:t>23</w:t>
         </w:r>
+        <w:bookmarkEnd w:id="81"/>
       </w:fldSimple>
     </w:p>
     <w:p>
@@ -11978,20 +12246,40 @@
       <w:pPr>
         <w:pStyle w:val="Heading3"/>
       </w:pPr>
+      <w:bookmarkStart w:id="82" w:name="_Toc229098692"/>
       <w:r>
         <w:lastRenderedPageBreak/>
         <w:t>4.3.2 Training the AI</w:t>
       </w:r>
-    </w:p>
-    <w:p>
-      <w:r>
-        <w:t xml:space="preserve">Training the AI is fairly simplistic, given that the AI </w:t>
+      <w:bookmarkEnd w:id="82"/>
+    </w:p>
+    <w:p>
+      <w:r>
+        <w:t xml:space="preserve">Training the AI </w:t>
+      </w:r>
+      <w:r>
+        <w:t>is relatively straightforward</w:t>
+      </w:r>
+      <w:r>
+        <w:t xml:space="preserve">, given that the AI </w:t>
       </w:r>
       <w:r>
         <w:t>Controller operates reliably under the expected gameplay conditions</w:t>
       </w:r>
       <w:r>
-        <w:t>. In order to train the AI, a python package needs to be installed that can run the AI training model. This training package is slow and not suitable for real-time use, at least not on low powered hardware. The game saw huge performance losses, going from roughly 250 frames per second to roughly 0.5 frames per second. This penalty meant that</w:t>
+        <w:t xml:space="preserve">. In order to train the AI, a python package needs to be installed that can run the AI training model. This training package is slow and not suitable for real-time use, at least not on low powered hardware. The game saw </w:t>
+      </w:r>
+      <w:r>
+        <w:t>significant</w:t>
+      </w:r>
+      <w:r>
+        <w:t xml:space="preserve"> performance </w:t>
+      </w:r>
+      <w:r>
+        <w:t>degradation</w:t>
+      </w:r>
+      <w:r>
+        <w:t>, going from roughly 250 frames per second to roughly 0.5 frames per second. This penalty meant that</w:t>
       </w:r>
       <w:r>
         <w:t xml:space="preserve"> a redesign of the AI architecture and learning model was necessary</w:t>
@@ -12064,6 +12352,7 @@
         <w:pStyle w:val="Caption"/>
         <w:jc w:val="center"/>
       </w:pPr>
+      <w:bookmarkStart w:id="83" w:name="_Toc229098635"/>
       <w:r>
         <w:t xml:space="preserve">Figure </w:t>
       </w:r>
@@ -12074,6 +12363,7 @@
           </w:rPr>
           <w:t>24</w:t>
         </w:r>
+        <w:bookmarkEnd w:id="83"/>
       </w:fldSimple>
     </w:p>
     <w:p>
@@ -12112,7 +12402,7 @@
       </w:r>
     </w:p>
     <w:p/>
-    <w:bookmarkStart w:id="79" w:name="_Toc229093038" w:displacedByCustomXml="next"/>
+    <w:bookmarkStart w:id="84" w:name="_Toc229098693" w:displacedByCustomXml="next"/>
     <w:sdt>
       <w:sdtPr>
         <w:rPr>
@@ -12140,7 +12430,7 @@
           <w:r>
             <w:t>References</w:t>
           </w:r>
-          <w:bookmarkEnd w:id="79"/>
+          <w:bookmarkEnd w:id="84"/>
         </w:p>
         <w:sdt>
           <w:sdtPr>

</xml_diff>

<commit_message>
feat: added a short section about PPO models and the specifics of the AI
</commit_message>
<xml_diff>
--- a/Report.docx
+++ b/Report.docx
@@ -8894,7 +8894,7 @@
           <w:noProof/>
         </w:rPr>
         <w:drawing>
-          <wp:inline distT="0" distB="0" distL="0" distR="0" wp14:anchorId="7D5A5376" wp14:editId="653014DA">
+          <wp:inline distT="0" distB="0" distL="0" distR="0" wp14:anchorId="7D5A5376" wp14:editId="0D6BA8DC">
             <wp:extent cx="2479538" cy="2261556"/>
             <wp:effectExtent l="0" t="0" r="0" b="5715"/>
             <wp:docPr id="455141339" name="Picture 4"/>
@@ -9012,7 +9012,7 @@
               </w:rPr>
               <w:lastRenderedPageBreak/>
               <w:drawing>
-                <wp:inline distT="0" distB="0" distL="0" distR="0" wp14:anchorId="2A67817B" wp14:editId="1A9F1D34">
+                <wp:inline distT="0" distB="0" distL="0" distR="0" wp14:anchorId="2A67817B" wp14:editId="6CC645AB">
                   <wp:extent cx="2295525" cy="2105025"/>
                   <wp:effectExtent l="0" t="0" r="0" b="0"/>
                   <wp:docPr id="1070291612" name="Picture 5"/>
@@ -11082,6 +11082,9 @@
         <w:jc w:val="center"/>
       </w:pPr>
       <w:r>
+        <w:rPr>
+          <w:noProof/>
+        </w:rPr>
         <w:drawing>
           <wp:inline distT="0" distB="0" distL="0" distR="0" wp14:anchorId="0487571A" wp14:editId="27007B8E">
             <wp:extent cx="3019245" cy="1847473"/>
@@ -11885,7 +11888,25 @@
     </w:p>
     <w:p>
       <w:r>
-        <w:t>The heuristic, shown above in Figure 20, just returns the difference between the position of the first and second inputs. This doesn’t need transforming to tile space as the function takes in tile space positions.</w:t>
+        <w:t xml:space="preserve">The heuristic, shown above in Figure 20, </w:t>
+      </w:r>
+      <w:r>
+        <w:t>calculates the Euclidean distance between two tile positions</w:t>
+      </w:r>
+      <w:r>
+        <w:t xml:space="preserve">, </w:t>
+      </w:r>
+      <w:r>
+        <w:t>Unity provides a built-in implementation for this</w:t>
+      </w:r>
+      <w:r>
+        <w:t xml:space="preserve"> with Vector2.Distance</w:t>
+      </w:r>
+      <w:r>
+        <w:t>.</w:t>
+      </w:r>
+      <w:r>
+        <w:t xml:space="preserve"> This doesn’t need transforming to tile space as the function takes in tile space positions.</w:t>
       </w:r>
       <w:r>
         <w:t xml:space="preserve"> The function then adds the start tile to the open set and starts our pathfinding. This function gets the lowest fCost tile from the open set and removes it. Then it is added to the closed set and each neighbour tile is checked for its tentativeG, this is just the gCost of the current tile added to the move cost to the neighbour tile, and if it’s lower than the gCost of the neighbour tile, the system adds the neighbour tile to the open set while also adding the tentativeG to the gCost of the neighbour tile and the tentativeG added to the heuristic of the neighbour and the destination to the fCost of the neighbour tile.</w:t>
@@ -12135,7 +12156,13 @@
     </w:p>
     <w:p>
       <w:r>
-        <w:t>Creating the AI controller was a fairly simple task. Firstly, the ML Agents Package described in the design chapter has its own extensible class which makes creating an agent simple. The AI Controller starts by overriding 4 of the Agent class’s functions: Initialize, OnEpisodeBegin, CollectObservations, and OnActionRecieved</w:t>
+        <w:t xml:space="preserve">Creating the AI controller was a </w:t>
+      </w:r>
+      <w:r>
+        <w:t>relatively straightforward to implement</w:t>
+      </w:r>
+      <w:r>
+        <w:t>. Firstly, the ML Agents Package described in the design chapter has its own extensible class which makes creating an agent simple. The AI Controller starts by overriding 4 of the Agent class’s functions: Initialize, OnEpisodeBegin, CollectObservations, and OnActionRecieved</w:t>
       </w:r>
       <w:r>
         <w:t>. These functions are essential in initializing the agent, resetting the agents to a fresh state, collecting observations to be sent to the training model, and receiving actions from the model.</w:t>
@@ -12239,7 +12266,11 @@
         <w:t>After the model has received the action, it gets all owned units and cities, gives out penalties for no cities and units and then executes the action. There are 5 actions available for units, move towards enemy, attack nearby enemy, skip the turn, sleep and settle city/build if applicable.</w:t>
       </w:r>
       <w:r>
-        <w:t xml:space="preserve"> For the cities, there are 8 available actions. These include all productions, fortifying the city or closing the city gates. A reward is added for producing units or districts and a small punishment is given for fortifying or closing the city gates. This is done to ensure that the AI doesn’t stall in the beginning of the game.</w:t>
+        <w:t xml:space="preserve"> For the cities, there are 8 available actions. These include all productions, fortifying the city or closing the city gates. A reward is added for producing units or districts </w:t>
+      </w:r>
+      <w:r>
+        <w:lastRenderedPageBreak/>
+        <w:t>and a small punishment is given for fortifying or closing the city gates. This is done to ensure that the AI doesn’t stall in the beginning of the game.</w:t>
       </w:r>
     </w:p>
     <w:p>
@@ -12248,7 +12279,6 @@
       </w:pPr>
       <w:bookmarkStart w:id="82" w:name="_Toc229098692"/>
       <w:r>
-        <w:lastRenderedPageBreak/>
         <w:t>4.3.2 Training the AI</w:t>
       </w:r>
       <w:bookmarkEnd w:id="82"/>
@@ -12298,7 +12328,7 @@
           <w:noProof/>
         </w:rPr>
         <w:drawing>
-          <wp:inline distT="0" distB="0" distL="0" distR="0" wp14:anchorId="5325C36E" wp14:editId="16A3CFAE">
+          <wp:inline distT="0" distB="0" distL="0" distR="0" wp14:anchorId="5325C36E" wp14:editId="1118501E">
             <wp:extent cx="5724525" cy="1238250"/>
             <wp:effectExtent l="0" t="0" r="9525" b="0"/>
             <wp:docPr id="836703105" name="Picture 16"/>
@@ -12383,10 +12413,7 @@
     <w:p/>
     <w:p>
       <w:r>
-        <w:t>The trade-offs of using this solution</w:t>
-      </w:r>
-      <w:r>
-        <w:t xml:space="preserve"> are a key limiting factor in how the AI will play against the player. This model is less adaptable, meaning that the player’s early actions will no longer have as much of an impact on the model’s behaviour.</w:t>
+        <w:t>The trade-offs of using this solution are a key limiting factor in how the AI will play against the player. This model is less adaptable, meaning that the player’s early actions will no longer have as much of an impact on the model’s behaviour.</w:t>
       </w:r>
     </w:p>
     <w:p/>
@@ -12402,6 +12429,11 @@
       </w:r>
     </w:p>
     <w:p/>
+    <w:p>
+      <w:r>
+        <w:t>The AI used a PPO model with a space size of 125, 1 discrete branch with a size of 8. This allowed the model to take in 125 observations, allowing for a large quantity of units. The size of 8 allows the model to recognize that there are 8 actions that can be taken at any given time.</w:t>
+      </w:r>
+    </w:p>
     <w:bookmarkStart w:id="84" w:name="_Toc229098693" w:displacedByCustomXml="next"/>
     <w:sdt>
       <w:sdtPr>
@@ -12873,6 +12905,7 @@
                 <w:rPr>
                   <w:noProof/>
                 </w:rPr>
+                <w:lastRenderedPageBreak/>
                 <w:t xml:space="preserve">Unity, 2020. </w:t>
               </w:r>
               <w:r>
@@ -12971,7 +13004,6 @@
                 <w:rPr>
                   <w:noProof/>
                 </w:rPr>
-                <w:lastRenderedPageBreak/>
                 <w:t xml:space="preserve">Yadav, H., 2025. </w:t>
               </w:r>
               <w:r>
@@ -14797,6 +14829,7 @@
   <w:style w:type="character" w:default="1" w:styleId="DefaultParagraphFont">
     <w:name w:val="Default Paragraph Font"/>
     <w:uiPriority w:val="1"/>
+    <w:semiHidden/>
     <w:unhideWhenUsed/>
   </w:style>
   <w:style w:type="table" w:default="1" w:styleId="TableNormal">

</xml_diff>

<commit_message>
feat: wrote results and evaluation into and final outcome for the game
</commit_message>
<xml_diff>
--- a/Report.docx
+++ b/Report.docx
@@ -331,7 +331,15 @@
     </w:p>
     <w:p>
       <w:r>
-        <w:t>AI is a still growing industry and while the current trend of AI is heading towards the usage of Large Language Models, I believe there is a genuine use case for machine learning models within video games. The focus of this project is to uncover the current reasons behind why the industry doesn’t use machine learning AI for uses such as Non-Player Characters or local multiplayer games. This is appro</w:t>
+        <w:t xml:space="preserve">AI is a still growing industry and while the current trend of AI is heading towards the usage of Large Language Models, I believe there is a genuine use case for machine learning models within video games. The focus of this project is to uncover the current reasons behind why the industry doesn’t use machine learning AI for uses such as </w:t>
+      </w:r>
+      <w:proofErr w:type="gramStart"/>
+      <w:r>
+        <w:t>Non-Player Characters</w:t>
+      </w:r>
+      <w:proofErr w:type="gramEnd"/>
+      <w:r>
+        <w:t xml:space="preserve"> or local multiplayer games. This is appro</w:t>
       </w:r>
       <w:r>
         <w:t>ached by covering the design choices and code architecture of implementing a machine learning model into the Unity game engine. To evaluate whether the AI is functional, data has been gathered using a mix of qualitative and quantitative research. This research was collected through a short survey given to participants.</w:t>
@@ -6940,7 +6948,15 @@
     </w:p>
     <w:p>
       <w:r>
-        <w:t>The objectives in terms of scope for this project are going to be generally quite broad and consist of specific milestones. The core objectives in regards to the scope are:</w:t>
+        <w:t xml:space="preserve">The objectives in terms of scope for this project are going to be generally quite broad and consist of specific milestones. The core objectives </w:t>
+      </w:r>
+      <w:proofErr w:type="gramStart"/>
+      <w:r>
+        <w:t>in regards to</w:t>
+      </w:r>
+      <w:proofErr w:type="gramEnd"/>
+      <w:r>
+        <w:t xml:space="preserve"> the scope are:</w:t>
       </w:r>
     </w:p>
     <w:p>
@@ -7003,7 +7019,15 @@
     </w:p>
     <w:p>
       <w:r>
-        <w:t>For the research objectives for the game, research will be conducted into other types of media with similar features. This research will include a comparison of similar games and their features and the overall impact of those features on this project. This will be done to find a balance for the difficulty of the game and to evaluate the necessary features for the game. Some topics of features and mechanics that will be researched include: World Generation, Pathfinding</w:t>
+        <w:t xml:space="preserve">For the research objectives for the game, research will be conducted into other types of media with similar features. This research will include a comparison of similar games and their features and the overall impact of those features on this project. This will be done to find a balance for the difficulty of the game and to evaluate the necessary features for the game. Some topics of features and mechanics that will be researched </w:t>
+      </w:r>
+      <w:proofErr w:type="gramStart"/>
+      <w:r>
+        <w:t>include:</w:t>
+      </w:r>
+      <w:proofErr w:type="gramEnd"/>
+      <w:r>
+        <w:t xml:space="preserve"> World Generation, Pathfinding</w:t>
       </w:r>
       <w:r>
         <w:t xml:space="preserve"> and </w:t>
@@ -7964,7 +7988,23 @@
         <w:t>)</w:t>
       </w:r>
       <w:r>
-        <w:t xml:space="preserve"> according to the following two rules: If a cell is alive, it survives to the next generation if it has 2 or 3 live neighbors; otherwise it dies. If a cell is dead, it comes to life in the next generation if it has exactly 3 live neighbors; otherwise it stays dead.” </w:t>
+        <w:t xml:space="preserve"> according to the following two rules: If a cell is alive, it survives to the next generation if it has 2 or 3 live neighbors; </w:t>
+      </w:r>
+      <w:proofErr w:type="gramStart"/>
+      <w:r>
+        <w:t>otherwise</w:t>
+      </w:r>
+      <w:proofErr w:type="gramEnd"/>
+      <w:r>
+        <w:t xml:space="preserve"> it dies. If a cell is dead, it comes to life in the next generation if it has exactly 3 live neighbors; </w:t>
+      </w:r>
+      <w:proofErr w:type="gramStart"/>
+      <w:r>
+        <w:t>otherwise</w:t>
+      </w:r>
+      <w:proofErr w:type="gramEnd"/>
+      <w:r>
+        <w:t xml:space="preserve"> it stays dead.” </w:t>
       </w:r>
       <w:sdt>
         <w:sdtPr>
@@ -8046,7 +8086,15 @@
         <w:t xml:space="preserve"> </w:t>
       </w:r>
       <w:r>
-        <w:t>The types of pathfinding I will be evaluating are: A*, Dijkstra</w:t>
+        <w:t xml:space="preserve">The types of pathfinding I will be evaluating </w:t>
+      </w:r>
+      <w:proofErr w:type="gramStart"/>
+      <w:r>
+        <w:t>are:</w:t>
+      </w:r>
+      <w:proofErr w:type="gramEnd"/>
+      <w:r>
+        <w:t xml:space="preserve"> A*, Dijkstra</w:t>
       </w:r>
       <w:r>
         <w:t>,</w:t>
@@ -8296,7 +8344,15 @@
     <w:p/>
     <w:p>
       <w:r>
-        <w:t>The performance of A* is highly dependant on the quality of the heuristic data. If the heuristic is poorly chosen, the algorithm may degrade towards the performance of Dijkstra’s algorithm. Additionally, A* can incur higher memory usage due to the need to maintain open and closed node lists, which may become significant in large-scale environments.</w:t>
+        <w:t xml:space="preserve">The performance of A* is highly </w:t>
+      </w:r>
+      <w:proofErr w:type="spellStart"/>
+      <w:r>
+        <w:t>dependant</w:t>
+      </w:r>
+      <w:proofErr w:type="spellEnd"/>
+      <w:r>
+        <w:t xml:space="preserve"> on the quality of the heuristic data. If the heuristic is poorly chosen, the algorithm may degrade towards the performance of Dijkstra’s algorithm. Additionally, A* can incur higher memory usage due to the need to maintain open and closed node lists, which may become significant in large-scale environments.</w:t>
       </w:r>
     </w:p>
     <w:p>
@@ -8894,7 +8950,7 @@
           <w:noProof/>
         </w:rPr>
         <w:drawing>
-          <wp:inline distT="0" distB="0" distL="0" distR="0" wp14:anchorId="7D5A5376" wp14:editId="0D6BA8DC">
+          <wp:inline distT="0" distB="0" distL="0" distR="0" wp14:anchorId="7D5A5376" wp14:editId="7D18A556">
             <wp:extent cx="2479538" cy="2261556"/>
             <wp:effectExtent l="0" t="0" r="0" b="5715"/>
             <wp:docPr id="455141339" name="Picture 4"/>
@@ -9012,7 +9068,7 @@
               </w:rPr>
               <w:lastRenderedPageBreak/>
               <w:drawing>
-                <wp:inline distT="0" distB="0" distL="0" distR="0" wp14:anchorId="2A67817B" wp14:editId="6CC645AB">
+                <wp:inline distT="0" distB="0" distL="0" distR="0" wp14:anchorId="2A67817B" wp14:editId="0E05519D">
                   <wp:extent cx="2295525" cy="2105025"/>
                   <wp:effectExtent l="0" t="0" r="0" b="0"/>
                   <wp:docPr id="1070291612" name="Picture 5"/>
@@ -9181,7 +9237,15 @@
     </w:p>
     <w:p>
       <w:r>
-        <w:t xml:space="preserve">Figure 5 is a visualisation of a 3x3 hexagonal grid. There </w:t>
+        <w:t xml:space="preserve">Figure 5 is a visualisation of a 3x3 hexagonal grid. </w:t>
+      </w:r>
+      <w:proofErr w:type="gramStart"/>
+      <w:r>
+        <w:t>There</w:t>
+      </w:r>
+      <w:proofErr w:type="gramEnd"/>
+      <w:r>
+        <w:t xml:space="preserve"> </w:t>
       </w:r>
       <w:r>
         <w:t>a key limitation</w:t>
@@ -9202,7 +9266,15 @@
     <w:p/>
     <w:p>
       <w:r>
-        <w:t>There are 2 ways that I can easily display the tiles to the user: Prefabs, and Mesh Generation. Prefabs would be significantly easier to incorporate, allowing me to create a prefab for each biome and instantiating each prefab where needed. This has many benefits such as making development of this feature very quick, simplicity, code readability and making pathfinding easier through direct ray-casting. This could have potential drawbacks such as performance losses from having thousands to tens of thousands of GameObjects in a scene.</w:t>
+        <w:t xml:space="preserve">There are 2 ways that I can easily display the tiles to the user: Prefabs, and Mesh Generation. Prefabs would be significantly easier to incorporate, allowing me to create a prefab for each biome and instantiating each prefab where needed. This has many benefits such as making development of this feature very quick, simplicity, code readability and making pathfinding easier through direct ray-casting. This could have potential drawbacks such as performance losses from having thousands to tens of thousands of </w:t>
+      </w:r>
+      <w:proofErr w:type="spellStart"/>
+      <w:r>
+        <w:t>GameObjects</w:t>
+      </w:r>
+      <w:proofErr w:type="spellEnd"/>
+      <w:r>
+        <w:t xml:space="preserve"> in a scene.</w:t>
       </w:r>
     </w:p>
     <w:p/>
@@ -9455,7 +9527,15 @@
         <w:t xml:space="preserve">For my game, I am choosing to have 5 true biomes: Deep water, shallow water, sand, grass and snow. Each of these biomes are going to be abundant in different resources and </w:t>
       </w:r>
       <w:r>
-        <w:t>have very different base tile variables. For example, grassland tiles will contain more production than a sand tile but a sand tile will have more gold than a grassland tile</w:t>
+        <w:t xml:space="preserve">have very different base tile variables. For example, grassland tiles will contain more production than a sand </w:t>
+      </w:r>
+      <w:proofErr w:type="gramStart"/>
+      <w:r>
+        <w:t>tile</w:t>
+      </w:r>
+      <w:proofErr w:type="gramEnd"/>
+      <w:r>
+        <w:t xml:space="preserve"> but a sand tile will have more gold than a grassland tile</w:t>
       </w:r>
       <w:r>
         <w:t>.</w:t>
@@ -9712,7 +9792,15 @@
         <w:t>well-suited</w:t>
       </w:r>
       <w:r>
-        <w:t xml:space="preserve"> for this use case, allowing all units to access the class without having a reference to it. This eliminates the need to use GetComponent which has its own myriad of drawbacks such as the degradation of performance when units try to access it, NullReference exceptions crashing the pathfinding functions, and making redundant calls.</w:t>
+        <w:t xml:space="preserve"> for this use case, allowing all units to access the class without having a reference to it. This eliminates the need to use GetComponent which has its own </w:t>
+      </w:r>
+      <w:proofErr w:type="gramStart"/>
+      <w:r>
+        <w:t>myriad</w:t>
+      </w:r>
+      <w:proofErr w:type="gramEnd"/>
+      <w:r>
+        <w:t xml:space="preserve"> of drawbacks such as the degradation of performance when units try to access it, NullReference exceptions crashing the pathfinding functions, and making redundant calls.</w:t>
       </w:r>
     </w:p>
     <w:p>
@@ -10136,7 +10224,15 @@
     </w:p>
     <w:p>
       <w:r>
-        <w:t>Despite all the above mentioned advantages of Reinforcement Learning, several limitations need to be addressed. The most significant challenge is the computational cost associated with the training of the AI, particularly in a game</w:t>
+        <w:t xml:space="preserve">Despite all the </w:t>
+      </w:r>
+      <w:proofErr w:type="gramStart"/>
+      <w:r>
+        <w:t>above mentioned</w:t>
+      </w:r>
+      <w:proofErr w:type="gramEnd"/>
+      <w:r>
+        <w:t xml:space="preserve"> advantages of Reinforcement Learning, several limitations need to be addressed. The most significant challenge is the computational cost associated with the training of the AI, particularly in a game</w:t>
       </w:r>
       <w:r>
         <w:t>,</w:t>
@@ -10233,8 +10329,13 @@
       <w:r>
         <w:t xml:space="preserve"> </w:t>
       </w:r>
-      <w:r>
-        <w:t>Creating the river generation.</w:t>
+      <w:proofErr w:type="gramStart"/>
+      <w:r>
+        <w:t>Creating</w:t>
+      </w:r>
+      <w:proofErr w:type="gramEnd"/>
+      <w:r>
+        <w:t xml:space="preserve"> the river generation.</w:t>
       </w:r>
     </w:p>
     <w:p>
@@ -12328,7 +12429,7 @@
           <w:noProof/>
         </w:rPr>
         <w:drawing>
-          <wp:inline distT="0" distB="0" distL="0" distR="0" wp14:anchorId="5325C36E" wp14:editId="1118501E">
+          <wp:inline distT="0" distB="0" distL="0" distR="0" wp14:anchorId="5325C36E" wp14:editId="276FFB38">
             <wp:extent cx="5724525" cy="1238250"/>
             <wp:effectExtent l="0" t="0" r="9525" b="0"/>
             <wp:docPr id="836703105" name="Picture 16"/>
@@ -12434,6 +12535,86 @@
         <w:t>The AI used a PPO model with a space size of 125, 1 discrete branch with a size of 8. This allowed the model to take in 125 observations, allowing for a large quantity of units. The size of 8 allows the model to recognize that there are 8 actions that can be taken at any given time.</w:t>
       </w:r>
     </w:p>
+    <w:p>
+      <w:pPr>
+        <w:pStyle w:val="Heading1"/>
+      </w:pPr>
+      <w:r>
+        <w:t>Chapter 5 – Results and Evaluation</w:t>
+      </w:r>
+    </w:p>
+    <w:p>
+      <w:r>
+        <w:t>The results and evaluation chapter will talk about the final outcomes and state of the delivered game, what initially planned features didn’t make it into the game and why these features didn’t make it into the game. To evaluate the game and compare against the initial aims of the project, an anonymous questionnaire was designed. This questionnaire was made with 5 questions and was made available to all the participants who took part in my playtesting sessions. The 5 questions were designed to evaluate the players enjoyability and to take feedback on systems the player wanted to report on.</w:t>
+      </w:r>
+    </w:p>
+    <w:p>
+      <w:pPr>
+        <w:pStyle w:val="Heading2"/>
+      </w:pPr>
+      <w:r>
+        <w:t>5.1 Final Outcome for the Game</w:t>
+      </w:r>
+    </w:p>
+    <w:p>
+      <w:r>
+        <w:t>The final outcome for the game resulted in:</w:t>
+      </w:r>
+    </w:p>
+    <w:p>
+      <w:pPr>
+        <w:pStyle w:val="ListParagraph"/>
+        <w:numPr>
+          <w:ilvl w:val="0"/>
+          <w:numId w:val="10"/>
+        </w:numPr>
+      </w:pPr>
+      <w:r>
+        <w:t>A functional 4x game with basic unit and city actions</w:t>
+      </w:r>
+    </w:p>
+    <w:p>
+      <w:pPr>
+        <w:pStyle w:val="ListParagraph"/>
+        <w:numPr>
+          <w:ilvl w:val="0"/>
+          <w:numId w:val="10"/>
+        </w:numPr>
+      </w:pPr>
+      <w:r>
+        <w:t>A functional learning AI system to play against</w:t>
+      </w:r>
+    </w:p>
+    <w:p>
+      <w:pPr>
+        <w:pStyle w:val="ListParagraph"/>
+        <w:numPr>
+          <w:ilvl w:val="0"/>
+          <w:numId w:val="10"/>
+        </w:numPr>
+      </w:pPr>
+      <w:r>
+        <w:t>A working combat system between units</w:t>
+      </w:r>
+    </w:p>
+    <w:p>
+      <w:pPr>
+        <w:pStyle w:val="ListParagraph"/>
+        <w:numPr>
+          <w:ilvl w:val="0"/>
+          <w:numId w:val="10"/>
+        </w:numPr>
+      </w:pPr>
+      <w:r>
+        <w:t>A working series game format</w:t>
+      </w:r>
+    </w:p>
+    <w:p>
+      <w:pPr>
+        <w:pStyle w:val="ListParagraph"/>
+      </w:pPr>
+    </w:p>
+    <w:p/>
     <w:bookmarkStart w:id="84" w:name="_Toc229098693" w:displacedByCustomXml="next"/>
     <w:sdt>
       <w:sdtPr>
@@ -12625,6 +12806,7 @@
                 <w:rPr>
                   <w:noProof/>
                 </w:rPr>
+                <w:lastRenderedPageBreak/>
                 <w:t xml:space="preserve">Kartik, 2026. </w:t>
               </w:r>
               <w:r>
@@ -12905,7 +13087,6 @@
                 <w:rPr>
                   <w:noProof/>
                 </w:rPr>
-                <w:lastRenderedPageBreak/>
                 <w:t xml:space="preserve">Unity, 2020. </w:t>
               </w:r>
               <w:r>
@@ -13520,9 +13701,9 @@
     </w:lvl>
   </w:abstractNum>
   <w:abstractNum w:abstractNumId="3" w15:restartNumberingAfterBreak="0">
-    <w:nsid w:val="2AAA6573"/>
+    <w:nsid w:val="156B6593"/>
     <w:multiLevelType w:val="hybridMultilevel"/>
-    <w:tmpl w:val="792ABFEC"/>
+    <w:tmpl w:val="F3803EE4"/>
     <w:lvl w:ilvl="0" w:tplc="08090001">
       <w:start w:val="1"/>
       <w:numFmt w:val="bullet"/>
@@ -13633,9 +13814,9 @@
     </w:lvl>
   </w:abstractNum>
   <w:abstractNum w:abstractNumId="4" w15:restartNumberingAfterBreak="0">
-    <w:nsid w:val="2CAE47EC"/>
+    <w:nsid w:val="2AAA6573"/>
     <w:multiLevelType w:val="hybridMultilevel"/>
-    <w:tmpl w:val="B3C2CD1A"/>
+    <w:tmpl w:val="792ABFEC"/>
     <w:lvl w:ilvl="0" w:tplc="08090001">
       <w:start w:val="1"/>
       <w:numFmt w:val="bullet"/>
@@ -13746,9 +13927,9 @@
     </w:lvl>
   </w:abstractNum>
   <w:abstractNum w:abstractNumId="5" w15:restartNumberingAfterBreak="0">
-    <w:nsid w:val="304C1E5E"/>
+    <w:nsid w:val="2CAE47EC"/>
     <w:multiLevelType w:val="hybridMultilevel"/>
-    <w:tmpl w:val="82AA2DDC"/>
+    <w:tmpl w:val="B3C2CD1A"/>
     <w:lvl w:ilvl="0" w:tplc="08090001">
       <w:start w:val="1"/>
       <w:numFmt w:val="bullet"/>
@@ -13859,9 +14040,9 @@
     </w:lvl>
   </w:abstractNum>
   <w:abstractNum w:abstractNumId="6" w15:restartNumberingAfterBreak="0">
-    <w:nsid w:val="408C74DA"/>
+    <w:nsid w:val="304C1E5E"/>
     <w:multiLevelType w:val="hybridMultilevel"/>
-    <w:tmpl w:val="40045936"/>
+    <w:tmpl w:val="82AA2DDC"/>
     <w:lvl w:ilvl="0" w:tplc="08090001">
       <w:start w:val="1"/>
       <w:numFmt w:val="bullet"/>
@@ -13972,9 +14153,9 @@
     </w:lvl>
   </w:abstractNum>
   <w:abstractNum w:abstractNumId="7" w15:restartNumberingAfterBreak="0">
-    <w:nsid w:val="4CE7033C"/>
+    <w:nsid w:val="408C74DA"/>
     <w:multiLevelType w:val="hybridMultilevel"/>
-    <w:tmpl w:val="6A06D35C"/>
+    <w:tmpl w:val="40045936"/>
     <w:lvl w:ilvl="0" w:tplc="08090001">
       <w:start w:val="1"/>
       <w:numFmt w:val="bullet"/>
@@ -14085,9 +14266,9 @@
     </w:lvl>
   </w:abstractNum>
   <w:abstractNum w:abstractNumId="8" w15:restartNumberingAfterBreak="0">
-    <w:nsid w:val="6F4C07D3"/>
+    <w:nsid w:val="4CE7033C"/>
     <w:multiLevelType w:val="hybridMultilevel"/>
-    <w:tmpl w:val="C00ADDF0"/>
+    <w:tmpl w:val="6A06D35C"/>
     <w:lvl w:ilvl="0" w:tplc="08090001">
       <w:start w:val="1"/>
       <w:numFmt w:val="bullet"/>
@@ -14197,14 +14378,127 @@
       </w:rPr>
     </w:lvl>
   </w:abstractNum>
+  <w:abstractNum w:abstractNumId="9" w15:restartNumberingAfterBreak="0">
+    <w:nsid w:val="6F4C07D3"/>
+    <w:multiLevelType w:val="hybridMultilevel"/>
+    <w:tmpl w:val="C00ADDF0"/>
+    <w:lvl w:ilvl="0" w:tplc="08090001">
+      <w:start w:val="1"/>
+      <w:numFmt w:val="bullet"/>
+      <w:lvlText w:val=""/>
+      <w:lvlJc w:val="left"/>
+      <w:pPr>
+        <w:ind w:left="720" w:hanging="360"/>
+      </w:pPr>
+      <w:rPr>
+        <w:rFonts w:ascii="Symbol" w:hAnsi="Symbol" w:hint="default"/>
+      </w:rPr>
+    </w:lvl>
+    <w:lvl w:ilvl="1" w:tplc="08090003" w:tentative="1">
+      <w:start w:val="1"/>
+      <w:numFmt w:val="bullet"/>
+      <w:lvlText w:val="o"/>
+      <w:lvlJc w:val="left"/>
+      <w:pPr>
+        <w:ind w:left="1440" w:hanging="360"/>
+      </w:pPr>
+      <w:rPr>
+        <w:rFonts w:ascii="Courier New" w:hAnsi="Courier New" w:cs="Courier New" w:hint="default"/>
+      </w:rPr>
+    </w:lvl>
+    <w:lvl w:ilvl="2" w:tplc="08090005" w:tentative="1">
+      <w:start w:val="1"/>
+      <w:numFmt w:val="bullet"/>
+      <w:lvlText w:val=""/>
+      <w:lvlJc w:val="left"/>
+      <w:pPr>
+        <w:ind w:left="2160" w:hanging="360"/>
+      </w:pPr>
+      <w:rPr>
+        <w:rFonts w:ascii="Wingdings" w:hAnsi="Wingdings" w:hint="default"/>
+      </w:rPr>
+    </w:lvl>
+    <w:lvl w:ilvl="3" w:tplc="08090001" w:tentative="1">
+      <w:start w:val="1"/>
+      <w:numFmt w:val="bullet"/>
+      <w:lvlText w:val=""/>
+      <w:lvlJc w:val="left"/>
+      <w:pPr>
+        <w:ind w:left="2880" w:hanging="360"/>
+      </w:pPr>
+      <w:rPr>
+        <w:rFonts w:ascii="Symbol" w:hAnsi="Symbol" w:hint="default"/>
+      </w:rPr>
+    </w:lvl>
+    <w:lvl w:ilvl="4" w:tplc="08090003" w:tentative="1">
+      <w:start w:val="1"/>
+      <w:numFmt w:val="bullet"/>
+      <w:lvlText w:val="o"/>
+      <w:lvlJc w:val="left"/>
+      <w:pPr>
+        <w:ind w:left="3600" w:hanging="360"/>
+      </w:pPr>
+      <w:rPr>
+        <w:rFonts w:ascii="Courier New" w:hAnsi="Courier New" w:cs="Courier New" w:hint="default"/>
+      </w:rPr>
+    </w:lvl>
+    <w:lvl w:ilvl="5" w:tplc="08090005" w:tentative="1">
+      <w:start w:val="1"/>
+      <w:numFmt w:val="bullet"/>
+      <w:lvlText w:val=""/>
+      <w:lvlJc w:val="left"/>
+      <w:pPr>
+        <w:ind w:left="4320" w:hanging="360"/>
+      </w:pPr>
+      <w:rPr>
+        <w:rFonts w:ascii="Wingdings" w:hAnsi="Wingdings" w:hint="default"/>
+      </w:rPr>
+    </w:lvl>
+    <w:lvl w:ilvl="6" w:tplc="08090001" w:tentative="1">
+      <w:start w:val="1"/>
+      <w:numFmt w:val="bullet"/>
+      <w:lvlText w:val=""/>
+      <w:lvlJc w:val="left"/>
+      <w:pPr>
+        <w:ind w:left="5040" w:hanging="360"/>
+      </w:pPr>
+      <w:rPr>
+        <w:rFonts w:ascii="Symbol" w:hAnsi="Symbol" w:hint="default"/>
+      </w:rPr>
+    </w:lvl>
+    <w:lvl w:ilvl="7" w:tplc="08090003" w:tentative="1">
+      <w:start w:val="1"/>
+      <w:numFmt w:val="bullet"/>
+      <w:lvlText w:val="o"/>
+      <w:lvlJc w:val="left"/>
+      <w:pPr>
+        <w:ind w:left="5760" w:hanging="360"/>
+      </w:pPr>
+      <w:rPr>
+        <w:rFonts w:ascii="Courier New" w:hAnsi="Courier New" w:cs="Courier New" w:hint="default"/>
+      </w:rPr>
+    </w:lvl>
+    <w:lvl w:ilvl="8" w:tplc="08090005" w:tentative="1">
+      <w:start w:val="1"/>
+      <w:numFmt w:val="bullet"/>
+      <w:lvlText w:val=""/>
+      <w:lvlJc w:val="left"/>
+      <w:pPr>
+        <w:ind w:left="6480" w:hanging="360"/>
+      </w:pPr>
+      <w:rPr>
+        <w:rFonts w:ascii="Wingdings" w:hAnsi="Wingdings" w:hint="def